<commit_message>
docs(user-guide): follow the UTC times and the setup_dev script from develop
</commit_message>
<xml_diff>
--- a/docs/user-guide/QLTTTA_User_Guide.docx
+++ b/docs/user-guide/QLTTTA_User_Guide.docx
@@ -1402,7 +1402,7 @@
       <w:r>
         <w:fldChar w:fldCharType="separate"/>
       </w:r>
-      <w:hyperlink w:anchor="_Toc241910046" w:history="1">
+      <w:hyperlink w:anchor="_Toc241916403" w:history="1">
         <w:r>
           <w:rPr>
             <w:rStyle w:val="Hyperlink"/>
@@ -1429,7 +1429,7 @@
             <w:noProof/>
             <w:webHidden/>
           </w:rPr>
-          <w:instrText xml:space="preserve"> PAGEREF _Toc241910046 \h </w:instrText>
+          <w:instrText xml:space="preserve"> PAGEREF _Toc241916403 \h </w:instrText>
         </w:r>
         <w:r>
           <w:rPr>
@@ -1476,7 +1476,7 @@
           <w14:ligatures w14:val="standardContextual"/>
         </w:rPr>
       </w:pPr>
-      <w:hyperlink w:anchor="_Toc241910047" w:history="1">
+      <w:hyperlink w:anchor="_Toc241916404" w:history="1">
         <w:r>
           <w:rPr>
             <w:rStyle w:val="Hyperlink"/>
@@ -1503,7 +1503,7 @@
             <w:noProof/>
             <w:webHidden/>
           </w:rPr>
-          <w:instrText xml:space="preserve"> PAGEREF _Toc241910047 \h </w:instrText>
+          <w:instrText xml:space="preserve"> PAGEREF _Toc241916404 \h </w:instrText>
         </w:r>
         <w:r>
           <w:rPr>
@@ -1550,7 +1550,7 @@
           <w14:ligatures w14:val="standardContextual"/>
         </w:rPr>
       </w:pPr>
-      <w:hyperlink w:anchor="_Toc241910048" w:history="1">
+      <w:hyperlink w:anchor="_Toc241916405" w:history="1">
         <w:r>
           <w:rPr>
             <w:rStyle w:val="Hyperlink"/>
@@ -1577,7 +1577,7 @@
             <w:noProof/>
             <w:webHidden/>
           </w:rPr>
-          <w:instrText xml:space="preserve"> PAGEREF _Toc241910048 \h </w:instrText>
+          <w:instrText xml:space="preserve"> PAGEREF _Toc241916405 \h </w:instrText>
         </w:r>
         <w:r>
           <w:rPr>
@@ -1624,7 +1624,7 @@
           <w14:ligatures w14:val="standardContextual"/>
         </w:rPr>
       </w:pPr>
-      <w:hyperlink w:anchor="_Toc241910049" w:history="1">
+      <w:hyperlink w:anchor="_Toc241916406" w:history="1">
         <w:r>
           <w:rPr>
             <w:rStyle w:val="Hyperlink"/>
@@ -1651,7 +1651,7 @@
             <w:noProof/>
             <w:webHidden/>
           </w:rPr>
-          <w:instrText xml:space="preserve"> PAGEREF _Toc241910049 \h </w:instrText>
+          <w:instrText xml:space="preserve"> PAGEREF _Toc241916406 \h </w:instrText>
         </w:r>
         <w:r>
           <w:rPr>
@@ -1698,7 +1698,7 @@
           <w14:ligatures w14:val="standardContextual"/>
         </w:rPr>
       </w:pPr>
-      <w:hyperlink w:anchor="_Toc241910050" w:history="1">
+      <w:hyperlink w:anchor="_Toc241916407" w:history="1">
         <w:r>
           <w:rPr>
             <w:rStyle w:val="Hyperlink"/>
@@ -1725,7 +1725,7 @@
             <w:noProof/>
             <w:webHidden/>
           </w:rPr>
-          <w:instrText xml:space="preserve"> PAGEREF _Toc241910050 \h </w:instrText>
+          <w:instrText xml:space="preserve"> PAGEREF _Toc241916407 \h </w:instrText>
         </w:r>
         <w:r>
           <w:rPr>
@@ -1772,7 +1772,7 @@
           <w14:ligatures w14:val="standardContextual"/>
         </w:rPr>
       </w:pPr>
-      <w:hyperlink w:anchor="_Toc241910051" w:history="1">
+      <w:hyperlink w:anchor="_Toc241916408" w:history="1">
         <w:r>
           <w:rPr>
             <w:rStyle w:val="Hyperlink"/>
@@ -1799,7 +1799,7 @@
             <w:noProof/>
             <w:webHidden/>
           </w:rPr>
-          <w:instrText xml:space="preserve"> PAGEREF _Toc241910051 \h </w:instrText>
+          <w:instrText xml:space="preserve"> PAGEREF _Toc241916408 \h </w:instrText>
         </w:r>
         <w:r>
           <w:rPr>
@@ -1846,7 +1846,7 @@
           <w14:ligatures w14:val="standardContextual"/>
         </w:rPr>
       </w:pPr>
-      <w:hyperlink w:anchor="_Toc241910052" w:history="1">
+      <w:hyperlink w:anchor="_Toc241916409" w:history="1">
         <w:r>
           <w:rPr>
             <w:rStyle w:val="Hyperlink"/>
@@ -1873,7 +1873,7 @@
             <w:noProof/>
             <w:webHidden/>
           </w:rPr>
-          <w:instrText xml:space="preserve"> PAGEREF _Toc241910052 \h </w:instrText>
+          <w:instrText xml:space="preserve"> PAGEREF _Toc241916409 \h </w:instrText>
         </w:r>
         <w:r>
           <w:rPr>
@@ -1920,7 +1920,7 @@
           <w14:ligatures w14:val="standardContextual"/>
         </w:rPr>
       </w:pPr>
-      <w:hyperlink w:anchor="_Toc241910053" w:history="1">
+      <w:hyperlink w:anchor="_Toc241916410" w:history="1">
         <w:r>
           <w:rPr>
             <w:rStyle w:val="Hyperlink"/>
@@ -1947,7 +1947,7 @@
             <w:noProof/>
             <w:webHidden/>
           </w:rPr>
-          <w:instrText xml:space="preserve"> PAGEREF _Toc241910053 \h </w:instrText>
+          <w:instrText xml:space="preserve"> PAGEREF _Toc241916410 \h </w:instrText>
         </w:r>
         <w:r>
           <w:rPr>
@@ -1994,7 +1994,7 @@
           <w14:ligatures w14:val="standardContextual"/>
         </w:rPr>
       </w:pPr>
-      <w:hyperlink w:anchor="_Toc241910054" w:history="1">
+      <w:hyperlink w:anchor="_Toc241916411" w:history="1">
         <w:r>
           <w:rPr>
             <w:rStyle w:val="Hyperlink"/>
@@ -2021,7 +2021,7 @@
             <w:noProof/>
             <w:webHidden/>
           </w:rPr>
-          <w:instrText xml:space="preserve"> PAGEREF _Toc241910054 \h </w:instrText>
+          <w:instrText xml:space="preserve"> PAGEREF _Toc241916411 \h </w:instrText>
         </w:r>
         <w:r>
           <w:rPr>
@@ -2068,7 +2068,7 @@
           <w14:ligatures w14:val="standardContextual"/>
         </w:rPr>
       </w:pPr>
-      <w:hyperlink w:anchor="_Toc241910055" w:history="1">
+      <w:hyperlink w:anchor="_Toc241916412" w:history="1">
         <w:r>
           <w:rPr>
             <w:rStyle w:val="Hyperlink"/>
@@ -2095,7 +2095,7 @@
             <w:noProof/>
             <w:webHidden/>
           </w:rPr>
-          <w:instrText xml:space="preserve"> PAGEREF _Toc241910055 \h </w:instrText>
+          <w:instrText xml:space="preserve"> PAGEREF _Toc241916412 \h </w:instrText>
         </w:r>
         <w:r>
           <w:rPr>
@@ -2142,7 +2142,7 @@
           <w14:ligatures w14:val="standardContextual"/>
         </w:rPr>
       </w:pPr>
-      <w:hyperlink w:anchor="_Toc241910056" w:history="1">
+      <w:hyperlink w:anchor="_Toc241916413" w:history="1">
         <w:r>
           <w:rPr>
             <w:rStyle w:val="Hyperlink"/>
@@ -2169,7 +2169,7 @@
             <w:noProof/>
             <w:webHidden/>
           </w:rPr>
-          <w:instrText xml:space="preserve"> PAGEREF _Toc241910056 \h </w:instrText>
+          <w:instrText xml:space="preserve"> PAGEREF _Toc241916413 \h </w:instrText>
         </w:r>
         <w:r>
           <w:rPr>
@@ -2216,7 +2216,7 @@
           <w14:ligatures w14:val="standardContextual"/>
         </w:rPr>
       </w:pPr>
-      <w:hyperlink w:anchor="_Toc241910057" w:history="1">
+      <w:hyperlink w:anchor="_Toc241916414" w:history="1">
         <w:r>
           <w:rPr>
             <w:rStyle w:val="Hyperlink"/>
@@ -2243,7 +2243,7 @@
             <w:noProof/>
             <w:webHidden/>
           </w:rPr>
-          <w:instrText xml:space="preserve"> PAGEREF _Toc241910057 \h </w:instrText>
+          <w:instrText xml:space="preserve"> PAGEREF _Toc241916414 \h </w:instrText>
         </w:r>
         <w:r>
           <w:rPr>
@@ -2290,7 +2290,7 @@
           <w14:ligatures w14:val="standardContextual"/>
         </w:rPr>
       </w:pPr>
-      <w:hyperlink w:anchor="_Toc241910058" w:history="1">
+      <w:hyperlink w:anchor="_Toc241916415" w:history="1">
         <w:r>
           <w:rPr>
             <w:rStyle w:val="Hyperlink"/>
@@ -2317,7 +2317,7 @@
             <w:noProof/>
             <w:webHidden/>
           </w:rPr>
-          <w:instrText xml:space="preserve"> PAGEREF _Toc241910058 \h </w:instrText>
+          <w:instrText xml:space="preserve"> PAGEREF _Toc241916415 \h </w:instrText>
         </w:r>
         <w:r>
           <w:rPr>
@@ -2364,7 +2364,7 @@
           <w14:ligatures w14:val="standardContextual"/>
         </w:rPr>
       </w:pPr>
-      <w:hyperlink w:anchor="_Toc241910059" w:history="1">
+      <w:hyperlink w:anchor="_Toc241916416" w:history="1">
         <w:r>
           <w:rPr>
             <w:rStyle w:val="Hyperlink"/>
@@ -2391,7 +2391,7 @@
             <w:noProof/>
             <w:webHidden/>
           </w:rPr>
-          <w:instrText xml:space="preserve"> PAGEREF _Toc241910059 \h </w:instrText>
+          <w:instrText xml:space="preserve"> PAGEREF _Toc241916416 \h </w:instrText>
         </w:r>
         <w:r>
           <w:rPr>
@@ -2438,7 +2438,7 @@
           <w14:ligatures w14:val="standardContextual"/>
         </w:rPr>
       </w:pPr>
-      <w:hyperlink w:anchor="_Toc241910060" w:history="1">
+      <w:hyperlink w:anchor="_Toc241916417" w:history="1">
         <w:r>
           <w:rPr>
             <w:rStyle w:val="Hyperlink"/>
@@ -2465,7 +2465,7 @@
             <w:noProof/>
             <w:webHidden/>
           </w:rPr>
-          <w:instrText xml:space="preserve"> PAGEREF _Toc241910060 \h </w:instrText>
+          <w:instrText xml:space="preserve"> PAGEREF _Toc241916417 \h </w:instrText>
         </w:r>
         <w:r>
           <w:rPr>
@@ -2512,7 +2512,7 @@
           <w14:ligatures w14:val="standardContextual"/>
         </w:rPr>
       </w:pPr>
-      <w:hyperlink w:anchor="_Toc241910061" w:history="1">
+      <w:hyperlink w:anchor="_Toc241916418" w:history="1">
         <w:r>
           <w:rPr>
             <w:rStyle w:val="Hyperlink"/>
@@ -2539,7 +2539,7 @@
             <w:noProof/>
             <w:webHidden/>
           </w:rPr>
-          <w:instrText xml:space="preserve"> PAGEREF _Toc241910061 \h </w:instrText>
+          <w:instrText xml:space="preserve"> PAGEREF _Toc241916418 \h </w:instrText>
         </w:r>
         <w:r>
           <w:rPr>
@@ -2586,7 +2586,7 @@
           <w14:ligatures w14:val="standardContextual"/>
         </w:rPr>
       </w:pPr>
-      <w:hyperlink w:anchor="_Toc241910062" w:history="1">
+      <w:hyperlink w:anchor="_Toc241916419" w:history="1">
         <w:r>
           <w:rPr>
             <w:rStyle w:val="Hyperlink"/>
@@ -2613,7 +2613,7 @@
             <w:noProof/>
             <w:webHidden/>
           </w:rPr>
-          <w:instrText xml:space="preserve"> PAGEREF _Toc241910062 \h </w:instrText>
+          <w:instrText xml:space="preserve"> PAGEREF _Toc241916419 \h </w:instrText>
         </w:r>
         <w:r>
           <w:rPr>
@@ -2660,7 +2660,7 @@
           <w14:ligatures w14:val="standardContextual"/>
         </w:rPr>
       </w:pPr>
-      <w:hyperlink w:anchor="_Toc241910063" w:history="1">
+      <w:hyperlink w:anchor="_Toc241916420" w:history="1">
         <w:r>
           <w:rPr>
             <w:rStyle w:val="Hyperlink"/>
@@ -2687,7 +2687,7 @@
             <w:noProof/>
             <w:webHidden/>
           </w:rPr>
-          <w:instrText xml:space="preserve"> PAGEREF _Toc241910063 \h </w:instrText>
+          <w:instrText xml:space="preserve"> PAGEREF _Toc241916420 \h </w:instrText>
         </w:r>
         <w:r>
           <w:rPr>
@@ -2734,7 +2734,7 @@
           <w14:ligatures w14:val="standardContextual"/>
         </w:rPr>
       </w:pPr>
-      <w:hyperlink w:anchor="_Toc241910064" w:history="1">
+      <w:hyperlink w:anchor="_Toc241916421" w:history="1">
         <w:r>
           <w:rPr>
             <w:rStyle w:val="Hyperlink"/>
@@ -2761,7 +2761,7 @@
             <w:noProof/>
             <w:webHidden/>
           </w:rPr>
-          <w:instrText xml:space="preserve"> PAGEREF _Toc241910064 \h </w:instrText>
+          <w:instrText xml:space="preserve"> PAGEREF _Toc241916421 \h </w:instrText>
         </w:r>
         <w:r>
           <w:rPr>
@@ -2781,7 +2781,7 @@
             <w:noProof/>
             <w:webHidden/>
           </w:rPr>
-          <w:t>12</w:t>
+          <w:t>13</w:t>
         </w:r>
         <w:r>
           <w:rPr>
@@ -2808,7 +2808,7 @@
           <w14:ligatures w14:val="standardContextual"/>
         </w:rPr>
       </w:pPr>
-      <w:hyperlink w:anchor="_Toc241910065" w:history="1">
+      <w:hyperlink w:anchor="_Toc241916422" w:history="1">
         <w:r>
           <w:rPr>
             <w:rStyle w:val="Hyperlink"/>
@@ -2835,7 +2835,7 @@
             <w:noProof/>
             <w:webHidden/>
           </w:rPr>
-          <w:instrText xml:space="preserve"> PAGEREF _Toc241910065 \h </w:instrText>
+          <w:instrText xml:space="preserve"> PAGEREF _Toc241916422 \h </w:instrText>
         </w:r>
         <w:r>
           <w:rPr>
@@ -2882,7 +2882,7 @@
           <w14:ligatures w14:val="standardContextual"/>
         </w:rPr>
       </w:pPr>
-      <w:hyperlink w:anchor="_Toc241910066" w:history="1">
+      <w:hyperlink w:anchor="_Toc241916423" w:history="1">
         <w:r>
           <w:rPr>
             <w:rStyle w:val="Hyperlink"/>
@@ -2909,7 +2909,7 @@
             <w:noProof/>
             <w:webHidden/>
           </w:rPr>
-          <w:instrText xml:space="preserve"> PAGEREF _Toc241910066 \h </w:instrText>
+          <w:instrText xml:space="preserve"> PAGEREF _Toc241916423 \h </w:instrText>
         </w:r>
         <w:r>
           <w:rPr>
@@ -2956,7 +2956,7 @@
           <w14:ligatures w14:val="standardContextual"/>
         </w:rPr>
       </w:pPr>
-      <w:hyperlink w:anchor="_Toc241910067" w:history="1">
+      <w:hyperlink w:anchor="_Toc241916424" w:history="1">
         <w:r>
           <w:rPr>
             <w:rStyle w:val="Hyperlink"/>
@@ -2983,7 +2983,7 @@
             <w:noProof/>
             <w:webHidden/>
           </w:rPr>
-          <w:instrText xml:space="preserve"> PAGEREF _Toc241910067 \h </w:instrText>
+          <w:instrText xml:space="preserve"> PAGEREF _Toc241916424 \h </w:instrText>
         </w:r>
         <w:r>
           <w:rPr>
@@ -3030,7 +3030,7 @@
           <w14:ligatures w14:val="standardContextual"/>
         </w:rPr>
       </w:pPr>
-      <w:hyperlink w:anchor="_Toc241910068" w:history="1">
+      <w:hyperlink w:anchor="_Toc241916425" w:history="1">
         <w:r>
           <w:rPr>
             <w:rStyle w:val="Hyperlink"/>
@@ -3057,7 +3057,7 @@
             <w:noProof/>
             <w:webHidden/>
           </w:rPr>
-          <w:instrText xml:space="preserve"> PAGEREF _Toc241910068 \h </w:instrText>
+          <w:instrText xml:space="preserve"> PAGEREF _Toc241916425 \h </w:instrText>
         </w:r>
         <w:r>
           <w:rPr>
@@ -3104,7 +3104,7 @@
           <w14:ligatures w14:val="standardContextual"/>
         </w:rPr>
       </w:pPr>
-      <w:hyperlink w:anchor="_Toc241910069" w:history="1">
+      <w:hyperlink w:anchor="_Toc241916426" w:history="1">
         <w:r>
           <w:rPr>
             <w:rStyle w:val="Hyperlink"/>
@@ -3131,7 +3131,7 @@
             <w:noProof/>
             <w:webHidden/>
           </w:rPr>
-          <w:instrText xml:space="preserve"> PAGEREF _Toc241910069 \h </w:instrText>
+          <w:instrText xml:space="preserve"> PAGEREF _Toc241916426 \h </w:instrText>
         </w:r>
         <w:r>
           <w:rPr>
@@ -3178,7 +3178,7 @@
           <w14:ligatures w14:val="standardContextual"/>
         </w:rPr>
       </w:pPr>
-      <w:hyperlink w:anchor="_Toc241910070" w:history="1">
+      <w:hyperlink w:anchor="_Toc241916427" w:history="1">
         <w:r>
           <w:rPr>
             <w:rStyle w:val="Hyperlink"/>
@@ -3205,7 +3205,7 @@
             <w:noProof/>
             <w:webHidden/>
           </w:rPr>
-          <w:instrText xml:space="preserve"> PAGEREF _Toc241910070 \h </w:instrText>
+          <w:instrText xml:space="preserve"> PAGEREF _Toc241916427 \h </w:instrText>
         </w:r>
         <w:r>
           <w:rPr>
@@ -3252,7 +3252,7 @@
           <w14:ligatures w14:val="standardContextual"/>
         </w:rPr>
       </w:pPr>
-      <w:hyperlink w:anchor="_Toc241910071" w:history="1">
+      <w:hyperlink w:anchor="_Toc241916428" w:history="1">
         <w:r>
           <w:rPr>
             <w:rStyle w:val="Hyperlink"/>
@@ -3279,7 +3279,7 @@
             <w:noProof/>
             <w:webHidden/>
           </w:rPr>
-          <w:instrText xml:space="preserve"> PAGEREF _Toc241910071 \h </w:instrText>
+          <w:instrText xml:space="preserve"> PAGEREF _Toc241916428 \h </w:instrText>
         </w:r>
         <w:r>
           <w:rPr>
@@ -3326,7 +3326,7 @@
           <w14:ligatures w14:val="standardContextual"/>
         </w:rPr>
       </w:pPr>
-      <w:hyperlink w:anchor="_Toc241910072" w:history="1">
+      <w:hyperlink w:anchor="_Toc241916429" w:history="1">
         <w:r>
           <w:rPr>
             <w:rStyle w:val="Hyperlink"/>
@@ -3353,7 +3353,7 @@
             <w:noProof/>
             <w:webHidden/>
           </w:rPr>
-          <w:instrText xml:space="preserve"> PAGEREF _Toc241910072 \h </w:instrText>
+          <w:instrText xml:space="preserve"> PAGEREF _Toc241916429 \h </w:instrText>
         </w:r>
         <w:r>
           <w:rPr>
@@ -3400,7 +3400,7 @@
           <w14:ligatures w14:val="standardContextual"/>
         </w:rPr>
       </w:pPr>
-      <w:hyperlink w:anchor="_Toc241910073" w:history="1">
+      <w:hyperlink w:anchor="_Toc241916430" w:history="1">
         <w:r>
           <w:rPr>
             <w:rStyle w:val="Hyperlink"/>
@@ -3427,7 +3427,7 @@
             <w:noProof/>
             <w:webHidden/>
           </w:rPr>
-          <w:instrText xml:space="preserve"> PAGEREF _Toc241910073 \h </w:instrText>
+          <w:instrText xml:space="preserve"> PAGEREF _Toc241916430 \h </w:instrText>
         </w:r>
         <w:r>
           <w:rPr>
@@ -3474,7 +3474,7 @@
           <w14:ligatures w14:val="standardContextual"/>
         </w:rPr>
       </w:pPr>
-      <w:hyperlink w:anchor="_Toc241910074" w:history="1">
+      <w:hyperlink w:anchor="_Toc241916431" w:history="1">
         <w:r>
           <w:rPr>
             <w:rStyle w:val="Hyperlink"/>
@@ -3501,7 +3501,7 @@
             <w:noProof/>
             <w:webHidden/>
           </w:rPr>
-          <w:instrText xml:space="preserve"> PAGEREF _Toc241910074 \h </w:instrText>
+          <w:instrText xml:space="preserve"> PAGEREF _Toc241916431 \h </w:instrText>
         </w:r>
         <w:r>
           <w:rPr>
@@ -3548,7 +3548,7 @@
           <w14:ligatures w14:val="standardContextual"/>
         </w:rPr>
       </w:pPr>
-      <w:hyperlink w:anchor="_Toc241910075" w:history="1">
+      <w:hyperlink w:anchor="_Toc241916432" w:history="1">
         <w:r>
           <w:rPr>
             <w:rStyle w:val="Hyperlink"/>
@@ -3575,7 +3575,7 @@
             <w:noProof/>
             <w:webHidden/>
           </w:rPr>
-          <w:instrText xml:space="preserve"> PAGEREF _Toc241910075 \h </w:instrText>
+          <w:instrText xml:space="preserve"> PAGEREF _Toc241916432 \h </w:instrText>
         </w:r>
         <w:r>
           <w:rPr>
@@ -3622,7 +3622,7 @@
           <w14:ligatures w14:val="standardContextual"/>
         </w:rPr>
       </w:pPr>
-      <w:hyperlink w:anchor="_Toc241910076" w:history="1">
+      <w:hyperlink w:anchor="_Toc241916433" w:history="1">
         <w:r>
           <w:rPr>
             <w:rStyle w:val="Hyperlink"/>
@@ -3649,7 +3649,7 @@
             <w:noProof/>
             <w:webHidden/>
           </w:rPr>
-          <w:instrText xml:space="preserve"> PAGEREF _Toc241910076 \h </w:instrText>
+          <w:instrText xml:space="preserve"> PAGEREF _Toc241916433 \h </w:instrText>
         </w:r>
         <w:r>
           <w:rPr>
@@ -3696,7 +3696,7 @@
           <w14:ligatures w14:val="standardContextual"/>
         </w:rPr>
       </w:pPr>
-      <w:hyperlink w:anchor="_Toc241910077" w:history="1">
+      <w:hyperlink w:anchor="_Toc241916434" w:history="1">
         <w:r>
           <w:rPr>
             <w:rStyle w:val="Hyperlink"/>
@@ -3723,7 +3723,7 @@
             <w:noProof/>
             <w:webHidden/>
           </w:rPr>
-          <w:instrText xml:space="preserve"> PAGEREF _Toc241910077 \h </w:instrText>
+          <w:instrText xml:space="preserve"> PAGEREF _Toc241916434 \h </w:instrText>
         </w:r>
         <w:r>
           <w:rPr>
@@ -3770,7 +3770,7 @@
           <w14:ligatures w14:val="standardContextual"/>
         </w:rPr>
       </w:pPr>
-      <w:hyperlink w:anchor="_Toc241910078" w:history="1">
+      <w:hyperlink w:anchor="_Toc241916435" w:history="1">
         <w:r>
           <w:rPr>
             <w:rStyle w:val="Hyperlink"/>
@@ -3797,7 +3797,7 @@
             <w:noProof/>
             <w:webHidden/>
           </w:rPr>
-          <w:instrText xml:space="preserve"> PAGEREF _Toc241910078 \h </w:instrText>
+          <w:instrText xml:space="preserve"> PAGEREF _Toc241916435 \h </w:instrText>
         </w:r>
         <w:r>
           <w:rPr>
@@ -3844,7 +3844,7 @@
           <w14:ligatures w14:val="standardContextual"/>
         </w:rPr>
       </w:pPr>
-      <w:hyperlink w:anchor="_Toc241910079" w:history="1">
+      <w:hyperlink w:anchor="_Toc241916436" w:history="1">
         <w:r>
           <w:rPr>
             <w:rStyle w:val="Hyperlink"/>
@@ -3871,7 +3871,7 @@
             <w:noProof/>
             <w:webHidden/>
           </w:rPr>
-          <w:instrText xml:space="preserve"> PAGEREF _Toc241910079 \h </w:instrText>
+          <w:instrText xml:space="preserve"> PAGEREF _Toc241916436 \h </w:instrText>
         </w:r>
         <w:r>
           <w:rPr>
@@ -3918,7 +3918,7 @@
           <w14:ligatures w14:val="standardContextual"/>
         </w:rPr>
       </w:pPr>
-      <w:hyperlink w:anchor="_Toc241910080" w:history="1">
+      <w:hyperlink w:anchor="_Toc241916437" w:history="1">
         <w:r>
           <w:rPr>
             <w:rStyle w:val="Hyperlink"/>
@@ -3945,7 +3945,7 @@
             <w:noProof/>
             <w:webHidden/>
           </w:rPr>
-          <w:instrText xml:space="preserve"> PAGEREF _Toc241910080 \h </w:instrText>
+          <w:instrText xml:space="preserve"> PAGEREF _Toc241916437 \h </w:instrText>
         </w:r>
         <w:r>
           <w:rPr>
@@ -3992,7 +3992,7 @@
           <w14:ligatures w14:val="standardContextual"/>
         </w:rPr>
       </w:pPr>
-      <w:hyperlink w:anchor="_Toc241910081" w:history="1">
+      <w:hyperlink w:anchor="_Toc241916438" w:history="1">
         <w:r>
           <w:rPr>
             <w:rStyle w:val="Hyperlink"/>
@@ -4019,7 +4019,7 @@
             <w:noProof/>
             <w:webHidden/>
           </w:rPr>
-          <w:instrText xml:space="preserve"> PAGEREF _Toc241910081 \h </w:instrText>
+          <w:instrText xml:space="preserve"> PAGEREF _Toc241916438 \h </w:instrText>
         </w:r>
         <w:r>
           <w:rPr>
@@ -4066,7 +4066,7 @@
           <w14:ligatures w14:val="standardContextual"/>
         </w:rPr>
       </w:pPr>
-      <w:hyperlink w:anchor="_Toc241910082" w:history="1">
+      <w:hyperlink w:anchor="_Toc241916439" w:history="1">
         <w:r>
           <w:rPr>
             <w:rStyle w:val="Hyperlink"/>
@@ -4093,7 +4093,7 @@
             <w:noProof/>
             <w:webHidden/>
           </w:rPr>
-          <w:instrText xml:space="preserve"> PAGEREF _Toc241910082 \h </w:instrText>
+          <w:instrText xml:space="preserve"> PAGEREF _Toc241916439 \h </w:instrText>
         </w:r>
         <w:r>
           <w:rPr>
@@ -4140,7 +4140,7 @@
           <w14:ligatures w14:val="standardContextual"/>
         </w:rPr>
       </w:pPr>
-      <w:hyperlink w:anchor="_Toc241910083" w:history="1">
+      <w:hyperlink w:anchor="_Toc241916440" w:history="1">
         <w:r>
           <w:rPr>
             <w:rStyle w:val="Hyperlink"/>
@@ -4167,7 +4167,7 @@
             <w:noProof/>
             <w:webHidden/>
           </w:rPr>
-          <w:instrText xml:space="preserve"> PAGEREF _Toc241910083 \h </w:instrText>
+          <w:instrText xml:space="preserve"> PAGEREF _Toc241916440 \h </w:instrText>
         </w:r>
         <w:r>
           <w:rPr>
@@ -4214,7 +4214,7 @@
           <w14:ligatures w14:val="standardContextual"/>
         </w:rPr>
       </w:pPr>
-      <w:hyperlink w:anchor="_Toc241910084" w:history="1">
+      <w:hyperlink w:anchor="_Toc241916441" w:history="1">
         <w:r>
           <w:rPr>
             <w:rStyle w:val="Hyperlink"/>
@@ -4241,7 +4241,7 @@
             <w:noProof/>
             <w:webHidden/>
           </w:rPr>
-          <w:instrText xml:space="preserve"> PAGEREF _Toc241910084 \h </w:instrText>
+          <w:instrText xml:space="preserve"> PAGEREF _Toc241916441 \h </w:instrText>
         </w:r>
         <w:r>
           <w:rPr>
@@ -4288,7 +4288,7 @@
           <w14:ligatures w14:val="standardContextual"/>
         </w:rPr>
       </w:pPr>
-      <w:hyperlink w:anchor="_Toc241910085" w:history="1">
+      <w:hyperlink w:anchor="_Toc241916442" w:history="1">
         <w:r>
           <w:rPr>
             <w:rStyle w:val="Hyperlink"/>
@@ -4315,7 +4315,7 @@
             <w:noProof/>
             <w:webHidden/>
           </w:rPr>
-          <w:instrText xml:space="preserve"> PAGEREF _Toc241910085 \h </w:instrText>
+          <w:instrText xml:space="preserve"> PAGEREF _Toc241916442 \h </w:instrText>
         </w:r>
         <w:r>
           <w:rPr>
@@ -4362,7 +4362,7 @@
           <w14:ligatures w14:val="standardContextual"/>
         </w:rPr>
       </w:pPr>
-      <w:hyperlink w:anchor="_Toc241910086" w:history="1">
+      <w:hyperlink w:anchor="_Toc241916443" w:history="1">
         <w:r>
           <w:rPr>
             <w:rStyle w:val="Hyperlink"/>
@@ -4389,7 +4389,7 @@
             <w:noProof/>
             <w:webHidden/>
           </w:rPr>
-          <w:instrText xml:space="preserve"> PAGEREF _Toc241910086 \h </w:instrText>
+          <w:instrText xml:space="preserve"> PAGEREF _Toc241916443 \h </w:instrText>
         </w:r>
         <w:r>
           <w:rPr>
@@ -4436,7 +4436,7 @@
           <w14:ligatures w14:val="standardContextual"/>
         </w:rPr>
       </w:pPr>
-      <w:hyperlink w:anchor="_Toc241910087" w:history="1">
+      <w:hyperlink w:anchor="_Toc241916444" w:history="1">
         <w:r>
           <w:rPr>
             <w:rStyle w:val="Hyperlink"/>
@@ -4463,7 +4463,7 @@
             <w:noProof/>
             <w:webHidden/>
           </w:rPr>
-          <w:instrText xml:space="preserve"> PAGEREF _Toc241910087 \h </w:instrText>
+          <w:instrText xml:space="preserve"> PAGEREF _Toc241916444 \h </w:instrText>
         </w:r>
         <w:r>
           <w:rPr>
@@ -4510,7 +4510,7 @@
           <w14:ligatures w14:val="standardContextual"/>
         </w:rPr>
       </w:pPr>
-      <w:hyperlink w:anchor="_Toc241910088" w:history="1">
+      <w:hyperlink w:anchor="_Toc241916445" w:history="1">
         <w:r>
           <w:rPr>
             <w:rStyle w:val="Hyperlink"/>
@@ -4537,7 +4537,7 @@
             <w:noProof/>
             <w:webHidden/>
           </w:rPr>
-          <w:instrText xml:space="preserve"> PAGEREF _Toc241910088 \h </w:instrText>
+          <w:instrText xml:space="preserve"> PAGEREF _Toc241916445 \h </w:instrText>
         </w:r>
         <w:r>
           <w:rPr>
@@ -4584,7 +4584,7 @@
           <w14:ligatures w14:val="standardContextual"/>
         </w:rPr>
       </w:pPr>
-      <w:hyperlink w:anchor="_Toc241910089" w:history="1">
+      <w:hyperlink w:anchor="_Toc241916446" w:history="1">
         <w:r>
           <w:rPr>
             <w:rStyle w:val="Hyperlink"/>
@@ -4611,7 +4611,7 @@
             <w:noProof/>
             <w:webHidden/>
           </w:rPr>
-          <w:instrText xml:space="preserve"> PAGEREF _Toc241910089 \h </w:instrText>
+          <w:instrText xml:space="preserve"> PAGEREF _Toc241916446 \h </w:instrText>
         </w:r>
         <w:r>
           <w:rPr>
@@ -4658,7 +4658,7 @@
           <w14:ligatures w14:val="standardContextual"/>
         </w:rPr>
       </w:pPr>
-      <w:hyperlink w:anchor="_Toc241910090" w:history="1">
+      <w:hyperlink w:anchor="_Toc241916447" w:history="1">
         <w:r>
           <w:rPr>
             <w:rStyle w:val="Hyperlink"/>
@@ -4685,7 +4685,7 @@
             <w:noProof/>
             <w:webHidden/>
           </w:rPr>
-          <w:instrText xml:space="preserve"> PAGEREF _Toc241910090 \h </w:instrText>
+          <w:instrText xml:space="preserve"> PAGEREF _Toc241916447 \h </w:instrText>
         </w:r>
         <w:r>
           <w:rPr>
@@ -4732,7 +4732,7 @@
           <w14:ligatures w14:val="standardContextual"/>
         </w:rPr>
       </w:pPr>
-      <w:hyperlink w:anchor="_Toc241910091" w:history="1">
+      <w:hyperlink w:anchor="_Toc241916448" w:history="1">
         <w:r>
           <w:rPr>
             <w:rStyle w:val="Hyperlink"/>
@@ -4759,7 +4759,7 @@
             <w:noProof/>
             <w:webHidden/>
           </w:rPr>
-          <w:instrText xml:space="preserve"> PAGEREF _Toc241910091 \h </w:instrText>
+          <w:instrText xml:space="preserve"> PAGEREF _Toc241916448 \h </w:instrText>
         </w:r>
         <w:r>
           <w:rPr>
@@ -4806,7 +4806,7 @@
           <w14:ligatures w14:val="standardContextual"/>
         </w:rPr>
       </w:pPr>
-      <w:hyperlink w:anchor="_Toc241910092" w:history="1">
+      <w:hyperlink w:anchor="_Toc241916449" w:history="1">
         <w:r>
           <w:rPr>
             <w:rStyle w:val="Hyperlink"/>
@@ -4833,7 +4833,7 @@
             <w:noProof/>
             <w:webHidden/>
           </w:rPr>
-          <w:instrText xml:space="preserve"> PAGEREF _Toc241910092 \h </w:instrText>
+          <w:instrText xml:space="preserve"> PAGEREF _Toc241916449 \h </w:instrText>
         </w:r>
         <w:r>
           <w:rPr>
@@ -4880,7 +4880,7 @@
           <w14:ligatures w14:val="standardContextual"/>
         </w:rPr>
       </w:pPr>
-      <w:hyperlink w:anchor="_Toc241910093" w:history="1">
+      <w:hyperlink w:anchor="_Toc241916450" w:history="1">
         <w:r>
           <w:rPr>
             <w:rStyle w:val="Hyperlink"/>
@@ -4907,7 +4907,7 @@
             <w:noProof/>
             <w:webHidden/>
           </w:rPr>
-          <w:instrText xml:space="preserve"> PAGEREF _Toc241910093 \h </w:instrText>
+          <w:instrText xml:space="preserve"> PAGEREF _Toc241916450 \h </w:instrText>
         </w:r>
         <w:r>
           <w:rPr>
@@ -4954,7 +4954,7 @@
           <w14:ligatures w14:val="standardContextual"/>
         </w:rPr>
       </w:pPr>
-      <w:hyperlink w:anchor="_Toc241910094" w:history="1">
+      <w:hyperlink w:anchor="_Toc241916451" w:history="1">
         <w:r>
           <w:rPr>
             <w:rStyle w:val="Hyperlink"/>
@@ -4981,7 +4981,7 @@
             <w:noProof/>
             <w:webHidden/>
           </w:rPr>
-          <w:instrText xml:space="preserve"> PAGEREF _Toc241910094 \h </w:instrText>
+          <w:instrText xml:space="preserve"> PAGEREF _Toc241916451 \h </w:instrText>
         </w:r>
         <w:r>
           <w:rPr>
@@ -5028,7 +5028,7 @@
           <w14:ligatures w14:val="standardContextual"/>
         </w:rPr>
       </w:pPr>
-      <w:hyperlink w:anchor="_Toc241910095" w:history="1">
+      <w:hyperlink w:anchor="_Toc241916452" w:history="1">
         <w:r>
           <w:rPr>
             <w:rStyle w:val="Hyperlink"/>
@@ -5055,7 +5055,7 @@
             <w:noProof/>
             <w:webHidden/>
           </w:rPr>
-          <w:instrText xml:space="preserve"> PAGEREF _Toc241910095 \h </w:instrText>
+          <w:instrText xml:space="preserve"> PAGEREF _Toc241916452 \h </w:instrText>
         </w:r>
         <w:r>
           <w:rPr>
@@ -5102,7 +5102,7 @@
           <w14:ligatures w14:val="standardContextual"/>
         </w:rPr>
       </w:pPr>
-      <w:hyperlink w:anchor="_Toc241910096" w:history="1">
+      <w:hyperlink w:anchor="_Toc241916453" w:history="1">
         <w:r>
           <w:rPr>
             <w:rStyle w:val="Hyperlink"/>
@@ -5129,7 +5129,7 @@
             <w:noProof/>
             <w:webHidden/>
           </w:rPr>
-          <w:instrText xml:space="preserve"> PAGEREF _Toc241910096 \h </w:instrText>
+          <w:instrText xml:space="preserve"> PAGEREF _Toc241916453 \h </w:instrText>
         </w:r>
         <w:r>
           <w:rPr>
@@ -5176,7 +5176,7 @@
           <w14:ligatures w14:val="standardContextual"/>
         </w:rPr>
       </w:pPr>
-      <w:hyperlink w:anchor="_Toc241910097" w:history="1">
+      <w:hyperlink w:anchor="_Toc241916454" w:history="1">
         <w:r>
           <w:rPr>
             <w:rStyle w:val="Hyperlink"/>
@@ -5203,7 +5203,7 @@
             <w:noProof/>
             <w:webHidden/>
           </w:rPr>
-          <w:instrText xml:space="preserve"> PAGEREF _Toc241910097 \h </w:instrText>
+          <w:instrText xml:space="preserve"> PAGEREF _Toc241916454 \h </w:instrText>
         </w:r>
         <w:r>
           <w:rPr>
@@ -5250,7 +5250,7 @@
           <w14:ligatures w14:val="standardContextual"/>
         </w:rPr>
       </w:pPr>
-      <w:hyperlink w:anchor="_Toc241910098" w:history="1">
+      <w:hyperlink w:anchor="_Toc241916455" w:history="1">
         <w:r>
           <w:rPr>
             <w:rStyle w:val="Hyperlink"/>
@@ -5277,7 +5277,7 @@
             <w:noProof/>
             <w:webHidden/>
           </w:rPr>
-          <w:instrText xml:space="preserve"> PAGEREF _Toc241910098 \h </w:instrText>
+          <w:instrText xml:space="preserve"> PAGEREF _Toc241916455 \h </w:instrText>
         </w:r>
         <w:r>
           <w:rPr>
@@ -5324,7 +5324,7 @@
           <w14:ligatures w14:val="standardContextual"/>
         </w:rPr>
       </w:pPr>
-      <w:hyperlink w:anchor="_Toc241910099" w:history="1">
+      <w:hyperlink w:anchor="_Toc241916456" w:history="1">
         <w:r>
           <w:rPr>
             <w:rStyle w:val="Hyperlink"/>
@@ -5351,7 +5351,7 @@
             <w:noProof/>
             <w:webHidden/>
           </w:rPr>
-          <w:instrText xml:space="preserve"> PAGEREF _Toc241910099 \h </w:instrText>
+          <w:instrText xml:space="preserve"> PAGEREF _Toc241916456 \h </w:instrText>
         </w:r>
         <w:r>
           <w:rPr>
@@ -5398,7 +5398,7 @@
           <w14:ligatures w14:val="standardContextual"/>
         </w:rPr>
       </w:pPr>
-      <w:hyperlink w:anchor="_Toc241910100" w:history="1">
+      <w:hyperlink w:anchor="_Toc241916457" w:history="1">
         <w:r>
           <w:rPr>
             <w:rStyle w:val="Hyperlink"/>
@@ -5425,7 +5425,7 @@
             <w:noProof/>
             <w:webHidden/>
           </w:rPr>
-          <w:instrText xml:space="preserve"> PAGEREF _Toc241910100 \h </w:instrText>
+          <w:instrText xml:space="preserve"> PAGEREF _Toc241916457 \h </w:instrText>
         </w:r>
         <w:r>
           <w:rPr>
@@ -5445,7 +5445,7 @@
             <w:noProof/>
             <w:webHidden/>
           </w:rPr>
-          <w:t>30</w:t>
+          <w:t>31</w:t>
         </w:r>
         <w:r>
           <w:rPr>
@@ -5472,7 +5472,7 @@
           <w14:ligatures w14:val="standardContextual"/>
         </w:rPr>
       </w:pPr>
-      <w:hyperlink w:anchor="_Toc241910101" w:history="1">
+      <w:hyperlink w:anchor="_Toc241916458" w:history="1">
         <w:r>
           <w:rPr>
             <w:rStyle w:val="Hyperlink"/>
@@ -5499,7 +5499,7 @@
             <w:noProof/>
             <w:webHidden/>
           </w:rPr>
-          <w:instrText xml:space="preserve"> PAGEREF _Toc241910101 \h </w:instrText>
+          <w:instrText xml:space="preserve"> PAGEREF _Toc241916458 \h </w:instrText>
         </w:r>
         <w:r>
           <w:rPr>
@@ -5546,7 +5546,7 @@
           <w14:ligatures w14:val="standardContextual"/>
         </w:rPr>
       </w:pPr>
-      <w:hyperlink w:anchor="_Toc241910102" w:history="1">
+      <w:hyperlink w:anchor="_Toc241916459" w:history="1">
         <w:r>
           <w:rPr>
             <w:rStyle w:val="Hyperlink"/>
@@ -5573,7 +5573,7 @@
             <w:noProof/>
             <w:webHidden/>
           </w:rPr>
-          <w:instrText xml:space="preserve"> PAGEREF _Toc241910102 \h </w:instrText>
+          <w:instrText xml:space="preserve"> PAGEREF _Toc241916459 \h </w:instrText>
         </w:r>
         <w:r>
           <w:rPr>
@@ -5620,7 +5620,7 @@
           <w14:ligatures w14:val="standardContextual"/>
         </w:rPr>
       </w:pPr>
-      <w:hyperlink w:anchor="_Toc241910103" w:history="1">
+      <w:hyperlink w:anchor="_Toc241916460" w:history="1">
         <w:r>
           <w:rPr>
             <w:rStyle w:val="Hyperlink"/>
@@ -5647,7 +5647,7 @@
             <w:noProof/>
             <w:webHidden/>
           </w:rPr>
-          <w:instrText xml:space="preserve"> PAGEREF _Toc241910103 \h </w:instrText>
+          <w:instrText xml:space="preserve"> PAGEREF _Toc241916460 \h </w:instrText>
         </w:r>
         <w:r>
           <w:rPr>
@@ -5694,7 +5694,7 @@
           <w14:ligatures w14:val="standardContextual"/>
         </w:rPr>
       </w:pPr>
-      <w:hyperlink w:anchor="_Toc241910104" w:history="1">
+      <w:hyperlink w:anchor="_Toc241916461" w:history="1">
         <w:r>
           <w:rPr>
             <w:rStyle w:val="Hyperlink"/>
@@ -5721,7 +5721,7 @@
             <w:noProof/>
             <w:webHidden/>
           </w:rPr>
-          <w:instrText xml:space="preserve"> PAGEREF _Toc241910104 \h </w:instrText>
+          <w:instrText xml:space="preserve"> PAGEREF _Toc241916461 \h </w:instrText>
         </w:r>
         <w:r>
           <w:rPr>
@@ -5768,7 +5768,7 @@
           <w14:ligatures w14:val="standardContextual"/>
         </w:rPr>
       </w:pPr>
-      <w:hyperlink w:anchor="_Toc241910105" w:history="1">
+      <w:hyperlink w:anchor="_Toc241916462" w:history="1">
         <w:r>
           <w:rPr>
             <w:rStyle w:val="Hyperlink"/>
@@ -5795,7 +5795,7 @@
             <w:noProof/>
             <w:webHidden/>
           </w:rPr>
-          <w:instrText xml:space="preserve"> PAGEREF _Toc241910105 \h </w:instrText>
+          <w:instrText xml:space="preserve"> PAGEREF _Toc241916462 \h </w:instrText>
         </w:r>
         <w:r>
           <w:rPr>
@@ -5842,7 +5842,7 @@
           <w14:ligatures w14:val="standardContextual"/>
         </w:rPr>
       </w:pPr>
-      <w:hyperlink w:anchor="_Toc241910106" w:history="1">
+      <w:hyperlink w:anchor="_Toc241916463" w:history="1">
         <w:r>
           <w:rPr>
             <w:rStyle w:val="Hyperlink"/>
@@ -5869,7 +5869,7 @@
             <w:noProof/>
             <w:webHidden/>
           </w:rPr>
-          <w:instrText xml:space="preserve"> PAGEREF _Toc241910106 \h </w:instrText>
+          <w:instrText xml:space="preserve"> PAGEREF _Toc241916463 \h </w:instrText>
         </w:r>
         <w:r>
           <w:rPr>
@@ -5946,7 +5946,7 @@
       <w:r>
         <w:fldChar w:fldCharType="separate"/>
       </w:r>
-      <w:hyperlink w:anchor="_Toc241910107" w:history="1">
+      <w:hyperlink w:anchor="_Toc241916464" w:history="1">
         <w:r>
           <w:rPr>
             <w:rStyle w:val="Hyperlink"/>
@@ -5973,7 +5973,7 @@
             <w:noProof/>
             <w:webHidden/>
           </w:rPr>
-          <w:instrText xml:space="preserve"> PAGEREF _Toc241910107 \h </w:instrText>
+          <w:instrText xml:space="preserve"> PAGEREF _Toc241916464 \h </w:instrText>
         </w:r>
         <w:r>
           <w:rPr>
@@ -6020,7 +6020,7 @@
           <w14:ligatures w14:val="standardContextual"/>
         </w:rPr>
       </w:pPr>
-      <w:hyperlink w:anchor="_Toc241910108" w:history="1">
+      <w:hyperlink w:anchor="_Toc241916465" w:history="1">
         <w:r>
           <w:rPr>
             <w:rStyle w:val="Hyperlink"/>
@@ -6047,7 +6047,7 @@
             <w:noProof/>
             <w:webHidden/>
           </w:rPr>
-          <w:instrText xml:space="preserve"> PAGEREF _Toc241910108 \h </w:instrText>
+          <w:instrText xml:space="preserve"> PAGEREF _Toc241916465 \h </w:instrText>
         </w:r>
         <w:r>
           <w:rPr>
@@ -6094,7 +6094,7 @@
           <w14:ligatures w14:val="standardContextual"/>
         </w:rPr>
       </w:pPr>
-      <w:hyperlink w:anchor="_Toc241910109" w:history="1">
+      <w:hyperlink w:anchor="_Toc241916466" w:history="1">
         <w:r>
           <w:rPr>
             <w:rStyle w:val="Hyperlink"/>
@@ -6121,7 +6121,7 @@
             <w:noProof/>
             <w:webHidden/>
           </w:rPr>
-          <w:instrText xml:space="preserve"> PAGEREF _Toc241910109 \h </w:instrText>
+          <w:instrText xml:space="preserve"> PAGEREF _Toc241916466 \h </w:instrText>
         </w:r>
         <w:r>
           <w:rPr>
@@ -6168,7 +6168,7 @@
           <w14:ligatures w14:val="standardContextual"/>
         </w:rPr>
       </w:pPr>
-      <w:hyperlink w:anchor="_Toc241910110" w:history="1">
+      <w:hyperlink w:anchor="_Toc241916467" w:history="1">
         <w:r>
           <w:rPr>
             <w:rStyle w:val="Hyperlink"/>
@@ -6195,7 +6195,7 @@
             <w:noProof/>
             <w:webHidden/>
           </w:rPr>
-          <w:instrText xml:space="preserve"> PAGEREF _Toc241910110 \h </w:instrText>
+          <w:instrText xml:space="preserve"> PAGEREF _Toc241916467 \h </w:instrText>
         </w:r>
         <w:r>
           <w:rPr>
@@ -6242,7 +6242,7 @@
           <w14:ligatures w14:val="standardContextual"/>
         </w:rPr>
       </w:pPr>
-      <w:hyperlink w:anchor="_Toc241910111" w:history="1">
+      <w:hyperlink w:anchor="_Toc241916468" w:history="1">
         <w:r>
           <w:rPr>
             <w:rStyle w:val="Hyperlink"/>
@@ -6269,7 +6269,7 @@
             <w:noProof/>
             <w:webHidden/>
           </w:rPr>
-          <w:instrText xml:space="preserve"> PAGEREF _Toc241910111 \h </w:instrText>
+          <w:instrText xml:space="preserve"> PAGEREF _Toc241916468 \h </w:instrText>
         </w:r>
         <w:r>
           <w:rPr>
@@ -6316,7 +6316,7 @@
           <w14:ligatures w14:val="standardContextual"/>
         </w:rPr>
       </w:pPr>
-      <w:hyperlink w:anchor="_Toc241910112" w:history="1">
+      <w:hyperlink w:anchor="_Toc241916469" w:history="1">
         <w:r>
           <w:rPr>
             <w:rStyle w:val="Hyperlink"/>
@@ -6343,7 +6343,7 @@
             <w:noProof/>
             <w:webHidden/>
           </w:rPr>
-          <w:instrText xml:space="preserve"> PAGEREF _Toc241910112 \h </w:instrText>
+          <w:instrText xml:space="preserve"> PAGEREF _Toc241916469 \h </w:instrText>
         </w:r>
         <w:r>
           <w:rPr>
@@ -6390,7 +6390,7 @@
           <w14:ligatures w14:val="standardContextual"/>
         </w:rPr>
       </w:pPr>
-      <w:hyperlink w:anchor="_Toc241910113" w:history="1">
+      <w:hyperlink w:anchor="_Toc241916470" w:history="1">
         <w:r>
           <w:rPr>
             <w:rStyle w:val="Hyperlink"/>
@@ -6417,7 +6417,7 @@
             <w:noProof/>
             <w:webHidden/>
           </w:rPr>
-          <w:instrText xml:space="preserve"> PAGEREF _Toc241910113 \h </w:instrText>
+          <w:instrText xml:space="preserve"> PAGEREF _Toc241916470 \h </w:instrText>
         </w:r>
         <w:r>
           <w:rPr>
@@ -6464,7 +6464,7 @@
           <w14:ligatures w14:val="standardContextual"/>
         </w:rPr>
       </w:pPr>
-      <w:hyperlink w:anchor="_Toc241910114" w:history="1">
+      <w:hyperlink w:anchor="_Toc241916471" w:history="1">
         <w:r>
           <w:rPr>
             <w:rStyle w:val="Hyperlink"/>
@@ -6491,7 +6491,7 @@
             <w:noProof/>
             <w:webHidden/>
           </w:rPr>
-          <w:instrText xml:space="preserve"> PAGEREF _Toc241910114 \h </w:instrText>
+          <w:instrText xml:space="preserve"> PAGEREF _Toc241916471 \h </w:instrText>
         </w:r>
         <w:r>
           <w:rPr>
@@ -6538,7 +6538,7 @@
           <w14:ligatures w14:val="standardContextual"/>
         </w:rPr>
       </w:pPr>
-      <w:hyperlink w:anchor="_Toc241910115" w:history="1">
+      <w:hyperlink w:anchor="_Toc241916472" w:history="1">
         <w:r>
           <w:rPr>
             <w:rStyle w:val="Hyperlink"/>
@@ -6565,7 +6565,7 @@
             <w:noProof/>
             <w:webHidden/>
           </w:rPr>
-          <w:instrText xml:space="preserve"> PAGEREF _Toc241910115 \h </w:instrText>
+          <w:instrText xml:space="preserve"> PAGEREF _Toc241916472 \h </w:instrText>
         </w:r>
         <w:r>
           <w:rPr>
@@ -6612,7 +6612,7 @@
           <w14:ligatures w14:val="standardContextual"/>
         </w:rPr>
       </w:pPr>
-      <w:hyperlink w:anchor="_Toc241910116" w:history="1">
+      <w:hyperlink w:anchor="_Toc241916473" w:history="1">
         <w:r>
           <w:rPr>
             <w:rStyle w:val="Hyperlink"/>
@@ -6639,7 +6639,7 @@
             <w:noProof/>
             <w:webHidden/>
           </w:rPr>
-          <w:instrText xml:space="preserve"> PAGEREF _Toc241910116 \h </w:instrText>
+          <w:instrText xml:space="preserve"> PAGEREF _Toc241916473 \h </w:instrText>
         </w:r>
         <w:r>
           <w:rPr>
@@ -6686,7 +6686,7 @@
           <w14:ligatures w14:val="standardContextual"/>
         </w:rPr>
       </w:pPr>
-      <w:hyperlink w:anchor="_Toc241910117" w:history="1">
+      <w:hyperlink w:anchor="_Toc241916474" w:history="1">
         <w:r>
           <w:rPr>
             <w:rStyle w:val="Hyperlink"/>
@@ -6713,7 +6713,7 @@
             <w:noProof/>
             <w:webHidden/>
           </w:rPr>
-          <w:instrText xml:space="preserve"> PAGEREF _Toc241910117 \h </w:instrText>
+          <w:instrText xml:space="preserve"> PAGEREF _Toc241916474 \h </w:instrText>
         </w:r>
         <w:r>
           <w:rPr>
@@ -6760,7 +6760,7 @@
           <w14:ligatures w14:val="standardContextual"/>
         </w:rPr>
       </w:pPr>
-      <w:hyperlink w:anchor="_Toc241910118" w:history="1">
+      <w:hyperlink w:anchor="_Toc241916475" w:history="1">
         <w:r>
           <w:rPr>
             <w:rStyle w:val="Hyperlink"/>
@@ -6787,7 +6787,7 @@
             <w:noProof/>
             <w:webHidden/>
           </w:rPr>
-          <w:instrText xml:space="preserve"> PAGEREF _Toc241910118 \h </w:instrText>
+          <w:instrText xml:space="preserve"> PAGEREF _Toc241916475 \h </w:instrText>
         </w:r>
         <w:r>
           <w:rPr>
@@ -6834,7 +6834,7 @@
           <w14:ligatures w14:val="standardContextual"/>
         </w:rPr>
       </w:pPr>
-      <w:hyperlink w:anchor="_Toc241910119" w:history="1">
+      <w:hyperlink w:anchor="_Toc241916476" w:history="1">
         <w:r>
           <w:rPr>
             <w:rStyle w:val="Hyperlink"/>
@@ -6861,7 +6861,7 @@
             <w:noProof/>
             <w:webHidden/>
           </w:rPr>
-          <w:instrText xml:space="preserve"> PAGEREF _Toc241910119 \h </w:instrText>
+          <w:instrText xml:space="preserve"> PAGEREF _Toc241916476 \h </w:instrText>
         </w:r>
         <w:r>
           <w:rPr>
@@ -6908,7 +6908,7 @@
           <w14:ligatures w14:val="standardContextual"/>
         </w:rPr>
       </w:pPr>
-      <w:hyperlink w:anchor="_Toc241910120" w:history="1">
+      <w:hyperlink w:anchor="_Toc241916477" w:history="1">
         <w:r>
           <w:rPr>
             <w:rStyle w:val="Hyperlink"/>
@@ -6935,7 +6935,7 @@
             <w:noProof/>
             <w:webHidden/>
           </w:rPr>
-          <w:instrText xml:space="preserve"> PAGEREF _Toc241910120 \h </w:instrText>
+          <w:instrText xml:space="preserve"> PAGEREF _Toc241916477 \h </w:instrText>
         </w:r>
         <w:r>
           <w:rPr>
@@ -6955,7 +6955,7 @@
             <w:noProof/>
             <w:webHidden/>
           </w:rPr>
-          <w:t>29</w:t>
+          <w:t>30</w:t>
         </w:r>
         <w:r>
           <w:rPr>
@@ -6982,7 +6982,7 @@
           <w14:ligatures w14:val="standardContextual"/>
         </w:rPr>
       </w:pPr>
-      <w:hyperlink w:anchor="_Toc241910121" w:history="1">
+      <w:hyperlink w:anchor="_Toc241916478" w:history="1">
         <w:r>
           <w:rPr>
             <w:rStyle w:val="Hyperlink"/>
@@ -7009,7 +7009,7 @@
             <w:noProof/>
             <w:webHidden/>
           </w:rPr>
-          <w:instrText xml:space="preserve"> PAGEREF _Toc241910121 \h </w:instrText>
+          <w:instrText xml:space="preserve"> PAGEREF _Toc241916478 \h </w:instrText>
         </w:r>
         <w:r>
           <w:rPr>
@@ -7029,7 +7029,7 @@
             <w:noProof/>
             <w:webHidden/>
           </w:rPr>
-          <w:t>30</w:t>
+          <w:t>31</w:t>
         </w:r>
         <w:r>
           <w:rPr>
@@ -7084,7 +7084,7 @@
       <w:r>
         <w:fldChar w:fldCharType="separate"/>
       </w:r>
-      <w:hyperlink w:anchor="_Toc241910122" w:history="1">
+      <w:hyperlink w:anchor="_Toc241916479" w:history="1">
         <w:r>
           <w:rPr>
             <w:rStyle w:val="Hyperlink"/>
@@ -7111,7 +7111,7 @@
             <w:noProof/>
             <w:webHidden/>
           </w:rPr>
-          <w:instrText xml:space="preserve"> PAGEREF _Toc241910122 \h </w:instrText>
+          <w:instrText xml:space="preserve"> PAGEREF _Toc241916479 \h </w:instrText>
         </w:r>
         <w:r>
           <w:rPr>
@@ -7158,7 +7158,7 @@
           <w14:ligatures w14:val="standardContextual"/>
         </w:rPr>
       </w:pPr>
-      <w:hyperlink w:anchor="_Toc241910123" w:history="1">
+      <w:hyperlink w:anchor="_Toc241916480" w:history="1">
         <w:r>
           <w:rPr>
             <w:rStyle w:val="Hyperlink"/>
@@ -7185,7 +7185,7 @@
             <w:noProof/>
             <w:webHidden/>
           </w:rPr>
-          <w:instrText xml:space="preserve"> PAGEREF _Toc241910123 \h </w:instrText>
+          <w:instrText xml:space="preserve"> PAGEREF _Toc241916480 \h </w:instrText>
         </w:r>
         <w:r>
           <w:rPr>
@@ -7232,7 +7232,7 @@
           <w14:ligatures w14:val="standardContextual"/>
         </w:rPr>
       </w:pPr>
-      <w:hyperlink w:anchor="_Toc241910124" w:history="1">
+      <w:hyperlink w:anchor="_Toc241916481" w:history="1">
         <w:r>
           <w:rPr>
             <w:rStyle w:val="Hyperlink"/>
@@ -7259,7 +7259,7 @@
             <w:noProof/>
             <w:webHidden/>
           </w:rPr>
-          <w:instrText xml:space="preserve"> PAGEREF _Toc241910124 \h </w:instrText>
+          <w:instrText xml:space="preserve"> PAGEREF _Toc241916481 \h </w:instrText>
         </w:r>
         <w:r>
           <w:rPr>
@@ -7306,7 +7306,7 @@
           <w14:ligatures w14:val="standardContextual"/>
         </w:rPr>
       </w:pPr>
-      <w:hyperlink w:anchor="_Toc241910125" w:history="1">
+      <w:hyperlink w:anchor="_Toc241916482" w:history="1">
         <w:r>
           <w:rPr>
             <w:rStyle w:val="Hyperlink"/>
@@ -7333,7 +7333,7 @@
             <w:noProof/>
             <w:webHidden/>
           </w:rPr>
-          <w:instrText xml:space="preserve"> PAGEREF _Toc241910125 \h </w:instrText>
+          <w:instrText xml:space="preserve"> PAGEREF _Toc241916482 \h </w:instrText>
         </w:r>
         <w:r>
           <w:rPr>
@@ -7380,7 +7380,7 @@
           <w14:ligatures w14:val="standardContextual"/>
         </w:rPr>
       </w:pPr>
-      <w:hyperlink w:anchor="_Toc241910126" w:history="1">
+      <w:hyperlink w:anchor="_Toc241916483" w:history="1">
         <w:r>
           <w:rPr>
             <w:rStyle w:val="Hyperlink"/>
@@ -7407,7 +7407,7 @@
             <w:noProof/>
             <w:webHidden/>
           </w:rPr>
-          <w:instrText xml:space="preserve"> PAGEREF _Toc241910126 \h </w:instrText>
+          <w:instrText xml:space="preserve"> PAGEREF _Toc241916483 \h </w:instrText>
         </w:r>
         <w:r>
           <w:rPr>
@@ -7454,7 +7454,7 @@
           <w14:ligatures w14:val="standardContextual"/>
         </w:rPr>
       </w:pPr>
-      <w:hyperlink w:anchor="_Toc241910127" w:history="1">
+      <w:hyperlink w:anchor="_Toc241916484" w:history="1">
         <w:r>
           <w:rPr>
             <w:rStyle w:val="Hyperlink"/>
@@ -7481,7 +7481,7 @@
             <w:noProof/>
             <w:webHidden/>
           </w:rPr>
-          <w:instrText xml:space="preserve"> PAGEREF _Toc241910127 \h </w:instrText>
+          <w:instrText xml:space="preserve"> PAGEREF _Toc241916484 \h </w:instrText>
         </w:r>
         <w:r>
           <w:rPr>
@@ -7528,7 +7528,7 @@
           <w14:ligatures w14:val="standardContextual"/>
         </w:rPr>
       </w:pPr>
-      <w:hyperlink w:anchor="_Toc241910128" w:history="1">
+      <w:hyperlink w:anchor="_Toc241916485" w:history="1">
         <w:r>
           <w:rPr>
             <w:rStyle w:val="Hyperlink"/>
@@ -7555,7 +7555,7 @@
             <w:noProof/>
             <w:webHidden/>
           </w:rPr>
-          <w:instrText xml:space="preserve"> PAGEREF _Toc241910128 \h </w:instrText>
+          <w:instrText xml:space="preserve"> PAGEREF _Toc241916485 \h </w:instrText>
         </w:r>
         <w:r>
           <w:rPr>
@@ -7602,7 +7602,7 @@
           <w14:ligatures w14:val="standardContextual"/>
         </w:rPr>
       </w:pPr>
-      <w:hyperlink w:anchor="_Toc241910129" w:history="1">
+      <w:hyperlink w:anchor="_Toc241916486" w:history="1">
         <w:r>
           <w:rPr>
             <w:rStyle w:val="Hyperlink"/>
@@ -7629,7 +7629,7 @@
             <w:noProof/>
             <w:webHidden/>
           </w:rPr>
-          <w:instrText xml:space="preserve"> PAGEREF _Toc241910129 \h </w:instrText>
+          <w:instrText xml:space="preserve"> PAGEREF _Toc241916486 \h </w:instrText>
         </w:r>
         <w:r>
           <w:rPr>
@@ -7676,7 +7676,7 @@
           <w14:ligatures w14:val="standardContextual"/>
         </w:rPr>
       </w:pPr>
-      <w:hyperlink w:anchor="_Toc241910130" w:history="1">
+      <w:hyperlink w:anchor="_Toc241916487" w:history="1">
         <w:r>
           <w:rPr>
             <w:rStyle w:val="Hyperlink"/>
@@ -7703,7 +7703,7 @@
             <w:noProof/>
             <w:webHidden/>
           </w:rPr>
-          <w:instrText xml:space="preserve"> PAGEREF _Toc241910130 \h </w:instrText>
+          <w:instrText xml:space="preserve"> PAGEREF _Toc241916487 \h </w:instrText>
         </w:r>
         <w:r>
           <w:rPr>
@@ -7750,7 +7750,7 @@
           <w14:ligatures w14:val="standardContextual"/>
         </w:rPr>
       </w:pPr>
-      <w:hyperlink w:anchor="_Toc241910131" w:history="1">
+      <w:hyperlink w:anchor="_Toc241916488" w:history="1">
         <w:r>
           <w:rPr>
             <w:rStyle w:val="Hyperlink"/>
@@ -7777,7 +7777,7 @@
             <w:noProof/>
             <w:webHidden/>
           </w:rPr>
-          <w:instrText xml:space="preserve"> PAGEREF _Toc241910131 \h </w:instrText>
+          <w:instrText xml:space="preserve"> PAGEREF _Toc241916488 \h </w:instrText>
         </w:r>
         <w:r>
           <w:rPr>
@@ -7824,7 +7824,7 @@
           <w14:ligatures w14:val="standardContextual"/>
         </w:rPr>
       </w:pPr>
-      <w:hyperlink w:anchor="_Toc241910132" w:history="1">
+      <w:hyperlink w:anchor="_Toc241916489" w:history="1">
         <w:r>
           <w:rPr>
             <w:rStyle w:val="Hyperlink"/>
@@ -7851,7 +7851,7 @@
             <w:noProof/>
             <w:webHidden/>
           </w:rPr>
-          <w:instrText xml:space="preserve"> PAGEREF _Toc241910132 \h </w:instrText>
+          <w:instrText xml:space="preserve"> PAGEREF _Toc241916489 \h </w:instrText>
         </w:r>
         <w:r>
           <w:rPr>
@@ -7898,7 +7898,7 @@
           <w14:ligatures w14:val="standardContextual"/>
         </w:rPr>
       </w:pPr>
-      <w:hyperlink w:anchor="_Toc241910133" w:history="1">
+      <w:hyperlink w:anchor="_Toc241916490" w:history="1">
         <w:r>
           <w:rPr>
             <w:rStyle w:val="Hyperlink"/>
@@ -7925,7 +7925,7 @@
             <w:noProof/>
             <w:webHidden/>
           </w:rPr>
-          <w:instrText xml:space="preserve"> PAGEREF _Toc241910133 \h </w:instrText>
+          <w:instrText xml:space="preserve"> PAGEREF _Toc241916490 \h </w:instrText>
         </w:r>
         <w:r>
           <w:rPr>
@@ -7972,7 +7972,7 @@
           <w14:ligatures w14:val="standardContextual"/>
         </w:rPr>
       </w:pPr>
-      <w:hyperlink w:anchor="_Toc241910134" w:history="1">
+      <w:hyperlink w:anchor="_Toc241916491" w:history="1">
         <w:r>
           <w:rPr>
             <w:rStyle w:val="Hyperlink"/>
@@ -7999,7 +7999,7 @@
             <w:noProof/>
             <w:webHidden/>
           </w:rPr>
-          <w:instrText xml:space="preserve"> PAGEREF _Toc241910134 \h </w:instrText>
+          <w:instrText xml:space="preserve"> PAGEREF _Toc241916491 \h </w:instrText>
         </w:r>
         <w:r>
           <w:rPr>
@@ -8019,7 +8019,7 @@
             <w:noProof/>
             <w:webHidden/>
           </w:rPr>
-          <w:t>30</w:t>
+          <w:t>31</w:t>
         </w:r>
         <w:r>
           <w:rPr>
@@ -8046,7 +8046,7 @@
           <w14:ligatures w14:val="standardContextual"/>
         </w:rPr>
       </w:pPr>
-      <w:hyperlink w:anchor="_Toc241910135" w:history="1">
+      <w:hyperlink w:anchor="_Toc241916492" w:history="1">
         <w:r>
           <w:rPr>
             <w:rStyle w:val="Hyperlink"/>
@@ -8073,7 +8073,7 @@
             <w:noProof/>
             <w:webHidden/>
           </w:rPr>
-          <w:instrText xml:space="preserve"> PAGEREF _Toc241910135 \h </w:instrText>
+          <w:instrText xml:space="preserve"> PAGEREF _Toc241916492 \h </w:instrText>
         </w:r>
         <w:r>
           <w:rPr>
@@ -8114,7 +8114,7 @@
         <w:pStyle w:val="Heading1"/>
         <w:pageBreakBefore/>
       </w:pPr>
-      <w:bookmarkStart w:id="0" w:name="_Toc241910046"/>
+      <w:bookmarkStart w:id="0" w:name="_Toc241916403"/>
       <w:r>
         <w:lastRenderedPageBreak/>
         <w:t>CHƯƠNG 1. GIỚI THIỆU</w:t>
@@ -8125,7 +8125,7 @@
       <w:pPr>
         <w:pStyle w:val="Heading2"/>
       </w:pPr>
-      <w:bookmarkStart w:id="1" w:name="_Toc241910047"/>
+      <w:bookmarkStart w:id="1" w:name="_Toc241916404"/>
       <w:r>
         <w:t>1.1. Mục đích của tài liệu</w:t>
       </w:r>
@@ -8172,7 +8172,7 @@
       <w:pPr>
         <w:pStyle w:val="Heading2"/>
       </w:pPr>
-      <w:bookmarkStart w:id="2" w:name="_Toc241910048"/>
+      <w:bookmarkStart w:id="2" w:name="_Toc241916405"/>
       <w:r>
         <w:t>1.2. Tổng quan phần mềm</w:t>
       </w:r>
@@ -8319,7 +8319,7 @@
       <w:pPr>
         <w:pStyle w:val="Heading2"/>
       </w:pPr>
-      <w:bookmarkStart w:id="3" w:name="_Toc241910049"/>
+      <w:bookmarkStart w:id="3" w:name="_Toc241916406"/>
       <w:r>
         <w:t>1.3. Vai trò người dùng và chức năng</w:t>
       </w:r>
@@ -8357,7 +8357,7 @@
       <w:pPr>
         <w:pStyle w:val="TableCaption"/>
       </w:pPr>
-      <w:bookmarkStart w:id="4" w:name="_Toc241910122"/>
+      <w:bookmarkStart w:id="4" w:name="_Toc241916479"/>
       <w:r>
         <w:t>Bảng 1.1. Chức năng hiển thị theo vai trò</w:t>
       </w:r>
@@ -10687,7 +10687,7 @@
       <w:pPr>
         <w:pStyle w:val="Heading2"/>
       </w:pPr>
-      <w:bookmarkStart w:id="5" w:name="_Toc241910050"/>
+      <w:bookmarkStart w:id="5" w:name="_Toc241916407"/>
       <w:r>
         <w:t>1.4. Yêu cầu hệ thống</w:t>
       </w:r>
@@ -10697,7 +10697,7 @@
       <w:pPr>
         <w:pStyle w:val="TableCaption"/>
       </w:pPr>
-      <w:bookmarkStart w:id="6" w:name="_Toc241910123"/>
+      <w:bookmarkStart w:id="6" w:name="_Toc241916480"/>
       <w:r>
         <w:t>Bảng 1.2. Yêu cầu phần cứng và phần mềm</w:t>
       </w:r>
@@ -11288,7 +11288,7 @@
       <w:pPr>
         <w:pStyle w:val="Heading2"/>
       </w:pPr>
-      <w:bookmarkStart w:id="7" w:name="_Toc241910051"/>
+      <w:bookmarkStart w:id="7" w:name="_Toc241916408"/>
       <w:r>
         <w:t>1.5. Các bước cài đặt tổng quát</w:t>
       </w:r>
@@ -11440,7 +11440,7 @@
       <w:pPr>
         <w:pStyle w:val="TableCaption"/>
       </w:pPr>
-      <w:bookmarkStart w:id="8" w:name="_Toc241910124"/>
+      <w:bookmarkStart w:id="8" w:name="_Toc241916481"/>
       <w:r>
         <w:lastRenderedPageBreak/>
         <w:t>Bảng 1.3. Chọn phương án SQL Server theo máy</w:t>
@@ -12045,7 +12045,7 @@
       <w:pPr>
         <w:pStyle w:val="Heading2"/>
       </w:pPr>
-      <w:bookmarkStart w:id="9" w:name="_Toc241910052"/>
+      <w:bookmarkStart w:id="9" w:name="_Toc241916409"/>
       <w:r>
         <w:t>1.6. Quy ước trình bày</w:t>
       </w:r>
@@ -12293,7 +12293,7 @@
         <w:pStyle w:val="Heading1"/>
         <w:pageBreakBefore/>
       </w:pPr>
-      <w:bookmarkStart w:id="10" w:name="_Toc241910053"/>
+      <w:bookmarkStart w:id="10" w:name="_Toc241916410"/>
       <w:r>
         <w:lastRenderedPageBreak/>
         <w:t>CHƯƠNG 2. CÀI ĐẶT SQL SERVER VÀ KHỞI TẠO CƠ SỞ DỮ LIỆU</w:t>
@@ -12350,7 +12350,7 @@
       <w:pPr>
         <w:pStyle w:val="Heading2"/>
       </w:pPr>
-      <w:bookmarkStart w:id="11" w:name="_Toc241910054"/>
+      <w:bookmarkStart w:id="11" w:name="_Toc241916411"/>
       <w:r>
         <w:t>2.1. Tải mã nguồn</w:t>
       </w:r>
@@ -12471,7 +12471,7 @@
       <w:pPr>
         <w:pStyle w:val="Heading2"/>
       </w:pPr>
-      <w:bookmarkStart w:id="12" w:name="_Toc241910055"/>
+      <w:bookmarkStart w:id="12" w:name="_Toc241916412"/>
       <w:r>
         <w:t>2.2. Phương án A - SQL Server trong Docker</w:t>
       </w:r>
@@ -12481,7 +12481,7 @@
       <w:pPr>
         <w:pStyle w:val="Heading3"/>
       </w:pPr>
-      <w:bookmarkStart w:id="13" w:name="_Toc241910056"/>
+      <w:bookmarkStart w:id="13" w:name="_Toc241916413"/>
       <w:r>
         <w:t>2.2.1. Cài Docker Desktop</w:t>
       </w:r>
@@ -12810,7 +12810,7 @@
       <w:pPr>
         <w:pStyle w:val="Heading3"/>
       </w:pPr>
-      <w:bookmarkStart w:id="14" w:name="_Toc241910057"/>
+      <w:bookmarkStart w:id="14" w:name="_Toc241916414"/>
       <w:r>
         <w:t>2.2.2. Khởi động SQL Server</w:t>
       </w:r>
@@ -12841,7 +12841,7 @@
         <w:t>imcp-mssql</w:t>
       </w:r>
       <w:r>
-        <w:t xml:space="preserve"> (cổng 1433, múi giờ Việt Nam, dữ liệu lưu trong volume </w:t>
+        <w:t xml:space="preserve"> (cổng 1433, dữ liệu lưu trong volume </w:t>
       </w:r>
       <w:r>
         <w:rPr>
@@ -12850,7 +12850,7 @@
         <w:t>mssql-data</w:t>
       </w:r>
       <w:r>
-        <w:t>).</w:t>
+        <w:t>). Múi giờ của container không ảnh hưởng: CSDL lưu thời điểm theo giờ UTC và tự tính ngày theo giờ của trung tâm.</w:t>
       </w:r>
     </w:p>
     <w:p>
@@ -13238,7 +13238,7 @@
       <w:pPr>
         <w:pStyle w:val="Heading3"/>
       </w:pPr>
-      <w:bookmarkStart w:id="15" w:name="_Toc241910058"/>
+      <w:bookmarkStart w:id="15" w:name="_Toc241916415"/>
       <w:r>
         <w:t>2.2.3. Khởi tạo CSDL</w:t>
       </w:r>
@@ -13466,6 +13466,7 @@
                 <w:color w:val="1F3864"/>
                 <w:sz w:val="22"/>
               </w:rPr>
+              <w:lastRenderedPageBreak/>
               <w:t>PowerShell (Windows)</w:t>
             </w:r>
           </w:p>
@@ -13541,7 +13542,6 @@
                 <w:color w:val="000000"/>
                 <w:sz w:val="19"/>
               </w:rPr>
-              <w:lastRenderedPageBreak/>
               <w:t>.\scripts\db_init.ps1 -Docker imcp-mssql</w:t>
             </w:r>
           </w:p>
@@ -13658,7 +13658,7 @@
       <w:pPr>
         <w:pStyle w:val="Heading3"/>
       </w:pPr>
-      <w:bookmarkStart w:id="16" w:name="_Toc241910059"/>
+      <w:bookmarkStart w:id="16" w:name="_Toc241916416"/>
       <w:r>
         <w:t>2.2.4. Bật, tắt SQL Server hằng ngày</w:t>
       </w:r>
@@ -13668,7 +13668,7 @@
       <w:pPr>
         <w:pStyle w:val="TableCaption"/>
       </w:pPr>
-      <w:bookmarkStart w:id="17" w:name="_Toc241910125"/>
+      <w:bookmarkStart w:id="17" w:name="_Toc241916482"/>
       <w:r>
         <w:t>Bảng 2.1. Các lệnh Docker thường dùng</w:t>
       </w:r>
@@ -14085,7 +14085,7 @@
       <w:pPr>
         <w:pStyle w:val="Heading2"/>
       </w:pPr>
-      <w:bookmarkStart w:id="18" w:name="_Toc241910060"/>
+      <w:bookmarkStart w:id="18" w:name="_Toc241916417"/>
       <w:r>
         <w:t>2.3. Phương án B - SQL Server cài trực tiếp trên Windows</w:t>
       </w:r>
@@ -14095,7 +14095,7 @@
       <w:pPr>
         <w:pStyle w:val="Heading3"/>
       </w:pPr>
-      <w:bookmarkStart w:id="19" w:name="_Toc241910061"/>
+      <w:bookmarkStart w:id="19" w:name="_Toc241916418"/>
       <w:r>
         <w:t>2.3.1. Cài SQL Server</w:t>
       </w:r>
@@ -14238,7 +14238,14 @@
               <w:rPr>
                 <w:sz w:val="23"/>
               </w:rPr>
-              <w:t xml:space="preserve"> Các bước chi tiết của trình cài SQL Server 2022 Express/Developer trên Windows: chọn kiểu cài Basic hay Custom, màn hình Instance Configuration (tên instance), Database Engine Configuration (Mixed Mode, mật khẩu sa, Add Current User). Kiểm tra: tài khoản demo có đăng nhập được khi máy chủ chỉ bật Windows Authentication hay bắt buộc Mixed Mode.</w:t>
+              <w:t xml:space="preserve"> Các bước chi tiết của trình cài SQL Server 2022 Express/Developer trên Windows: chọn kiểu cài Basic hay Custom, màn hình Instance Configuration (tên instance), Database Engine Configuration (Mixed Mode, mật khẩu sa, Add </w:t>
+            </w:r>
+            <w:r>
+              <w:rPr>
+                <w:sz w:val="23"/>
+              </w:rPr>
+              <w:lastRenderedPageBreak/>
+              <w:t>Current User). Kiểm tra: tài khoản demo có đăng nhập được khi máy chủ chỉ bật Windows Authentication hay bắt buộc Mixed Mode.</w:t>
             </w:r>
           </w:p>
         </w:tc>
@@ -14288,7 +14295,6 @@
                 <w:b/>
                 <w:sz w:val="23"/>
               </w:rPr>
-              <w:lastRenderedPageBreak/>
               <w:t>[CẦN BỔ SUNG - Windows]</w:t>
             </w:r>
             <w:r>
@@ -14347,7 +14353,7 @@
       <w:pPr>
         <w:pStyle w:val="Heading3"/>
       </w:pPr>
-      <w:bookmarkStart w:id="20" w:name="_Toc241910062"/>
+      <w:bookmarkStart w:id="20" w:name="_Toc241916419"/>
       <w:r>
         <w:t>2.3.2. Cài công cụ quản trị và driver</w:t>
       </w:r>
@@ -14453,7 +14459,7 @@
       <w:pPr>
         <w:pStyle w:val="Heading3"/>
       </w:pPr>
-      <w:bookmarkStart w:id="21" w:name="_Toc241910063"/>
+      <w:bookmarkStart w:id="21" w:name="_Toc241916420"/>
       <w:r>
         <w:t>2.3.3. Bật kết nối TCP/IP</w:t>
       </w:r>
@@ -14680,8 +14686,9 @@
       <w:pPr>
         <w:pStyle w:val="Heading3"/>
       </w:pPr>
-      <w:bookmarkStart w:id="22" w:name="_Toc241910064"/>
-      <w:r>
+      <w:bookmarkStart w:id="22" w:name="_Toc241916421"/>
+      <w:r>
+        <w:lastRenderedPageBreak/>
         <w:t>2.3.4. Khởi tạo CSDL</w:t>
       </w:r>
       <w:bookmarkEnd w:id="22"/>
@@ -14837,7 +14844,6 @@
                 <w:color w:val="000000"/>
                 <w:sz w:val="19"/>
               </w:rPr>
-              <w:lastRenderedPageBreak/>
               <w:t># B</w:t>
             </w:r>
             <w:r>
@@ -15244,7 +15250,7 @@
       <w:pPr>
         <w:pStyle w:val="Heading3"/>
       </w:pPr>
-      <w:bookmarkStart w:id="23" w:name="_Toc241910065"/>
+      <w:bookmarkStart w:id="23" w:name="_Toc241916422"/>
       <w:r>
         <w:t>2.3.5. Cho máy khác kết nối tới (không bắt buộc)</w:t>
       </w:r>
@@ -15336,7 +15342,7 @@
       <w:pPr>
         <w:pStyle w:val="Heading2"/>
       </w:pPr>
-      <w:bookmarkStart w:id="24" w:name="_Toc241910066"/>
+      <w:bookmarkStart w:id="24" w:name="_Toc241916423"/>
       <w:r>
         <w:t>2.4. Nạp lại dữ liệu mẫu trước buổi demo</w:t>
       </w:r>
@@ -15448,8 +15454,9 @@
         <w:pStyle w:val="Heading1"/>
         <w:pageBreakBefore/>
       </w:pPr>
-      <w:bookmarkStart w:id="25" w:name="_Toc241910067"/>
-      <w:r>
+      <w:bookmarkStart w:id="25" w:name="_Toc241916424"/>
+      <w:r>
+        <w:lastRenderedPageBreak/>
         <w:t>CHƯƠNG 3. CÀI ĐẶT ỨNG DỤNG</w:t>
       </w:r>
       <w:bookmarkEnd w:id="25"/>
@@ -15458,7 +15465,7 @@
       <w:pPr>
         <w:pStyle w:val="Heading2"/>
       </w:pPr>
-      <w:bookmarkStart w:id="26" w:name="_Toc241910068"/>
+      <w:bookmarkStart w:id="26" w:name="_Toc241916425"/>
       <w:r>
         <w:t>3.1. Tải bộ cài</w:t>
       </w:r>
@@ -15496,7 +15503,7 @@
       <w:pPr>
         <w:pStyle w:val="TableCaption"/>
       </w:pPr>
-      <w:bookmarkStart w:id="27" w:name="_Toc241910126"/>
+      <w:bookmarkStart w:id="27" w:name="_Toc241916483"/>
       <w:r>
         <w:t>Bảng 3.1. Các file cài đặt</w:t>
       </w:r>
@@ -15939,7 +15946,7 @@
       <w:pPr>
         <w:pStyle w:val="Heading2"/>
       </w:pPr>
-      <w:bookmarkStart w:id="28" w:name="_Toc241910069"/>
+      <w:bookmarkStart w:id="28" w:name="_Toc241916426"/>
       <w:r>
         <w:t>3.2. Cài đặt trên macOS</w:t>
       </w:r>
@@ -16171,7 +16178,7 @@
       <w:pPr>
         <w:pStyle w:val="Heading2"/>
       </w:pPr>
-      <w:bookmarkStart w:id="29" w:name="_Toc241910070"/>
+      <w:bookmarkStart w:id="29" w:name="_Toc241916427"/>
       <w:r>
         <w:t>3.3. Cài đặt trên Windows</w:t>
       </w:r>
@@ -16181,7 +16188,7 @@
       <w:pPr>
         <w:pStyle w:val="Heading3"/>
       </w:pPr>
-      <w:bookmarkStart w:id="30" w:name="_Toc241910071"/>
+      <w:bookmarkStart w:id="30" w:name="_Toc241916428"/>
       <w:r>
         <w:t>3.3.1. Dùng bộ cài setup.exe</w:t>
       </w:r>
@@ -16277,6 +16284,7 @@
         <w:rPr>
           <w:b/>
         </w:rPr>
+        <w:lastRenderedPageBreak/>
         <w:t>Bước 4.</w:t>
       </w:r>
       <w:r>
@@ -16610,7 +16618,7 @@
       <w:pPr>
         <w:pStyle w:val="Heading3"/>
       </w:pPr>
-      <w:bookmarkStart w:id="31" w:name="_Toc241910072"/>
+      <w:bookmarkStart w:id="31" w:name="_Toc241916429"/>
       <w:r>
         <w:t>3.3.2. Dùng bản portable</w:t>
       </w:r>
@@ -16657,7 +16665,7 @@
       <w:pPr>
         <w:pStyle w:val="Heading3"/>
       </w:pPr>
-      <w:bookmarkStart w:id="32" w:name="_Toc241910073"/>
+      <w:bookmarkStart w:id="32" w:name="_Toc241916430"/>
       <w:r>
         <w:t>3.3.3. Driver kết nối</w:t>
       </w:r>
@@ -16713,7 +16721,7 @@
       <w:pPr>
         <w:pStyle w:val="Heading2"/>
       </w:pPr>
-      <w:bookmarkStart w:id="33" w:name="_Toc241910074"/>
+      <w:bookmarkStart w:id="33" w:name="_Toc241916431"/>
       <w:r>
         <w:t>3.4. Nơi lưu cấu hình và gỡ cài đặt</w:t>
       </w:r>
@@ -16733,7 +16741,7 @@
       <w:pPr>
         <w:pStyle w:val="TableCaption"/>
       </w:pPr>
-      <w:bookmarkStart w:id="34" w:name="_Toc241910127"/>
+      <w:bookmarkStart w:id="34" w:name="_Toc241916484"/>
       <w:r>
         <w:t>Bảng 3.2. Cấu hình đã lưu và cách gỡ ứng dụng</w:t>
       </w:r>
@@ -17130,7 +17138,7 @@
       <w:pPr>
         <w:pStyle w:val="Heading2"/>
       </w:pPr>
-      <w:bookmarkStart w:id="35" w:name="_Toc241910075"/>
+      <w:bookmarkStart w:id="35" w:name="_Toc241916432"/>
       <w:r>
         <w:t>3.5. Chạy từ mã nguồn (dành cho nhóm phát triển)</w:t>
       </w:r>
@@ -17143,16 +17151,34 @@
         <w:jc w:val="both"/>
       </w:pPr>
       <w:r>
-        <w:t xml:space="preserve">Thành viên nhóm có thể build ứng dụng bằng Qt 6, CMake và Ninja thay vì dùng bộ cài; các bước chi tiết cho macOS và Windows nằm trong </w:t>
+        <w:t xml:space="preserve">Thành viên nhóm có thể build ứng dụng bằng Qt 6, CMake và Ninja thay vì dùng bộ cài. Script </w:t>
       </w:r>
       <w:r>
         <w:rPr>
           <w:color w:val="C7254E"/>
         </w:rPr>
+        <w:t>scripts/setup_dev</w:t>
+      </w:r>
+      <w:r>
+        <w:t xml:space="preserve"> kiểm tra máy và chỉ cài những gì còn thiếu: bộ công cụ build, SQL Server (macOS: container Docker; Windows: instance đã cài, container đang chạy hoặc SQL Server 2022 Developer), khởi tạo CSDL rồi chạy toàn bộ kiểm thử. Trong Claude Code, gõ </w:t>
+      </w:r>
+      <w:r>
+        <w:rPr>
+          <w:color w:val="C7254E"/>
+        </w:rPr>
+        <w:t>/imcp-setup</w:t>
+      </w:r>
+      <w:r>
+        <w:t xml:space="preserve"> để chạy script này. Chi tiết và các tùy chọn nằm trong </w:t>
+      </w:r>
+      <w:r>
+        <w:rPr>
+          <w:color w:val="C7254E"/>
+        </w:rPr>
         <w:t>docs/SETUP.md</w:t>
       </w:r>
       <w:r>
-        <w:t xml:space="preserve"> (mục 3). Ví dụ trên macOS:</w:t>
+        <w:t xml:space="preserve"> (mục 3).</w:t>
       </w:r>
     </w:p>
     <w:tbl>
@@ -17229,27 +17255,73 @@
                 <w:color w:val="000000"/>
                 <w:sz w:val="19"/>
               </w:rPr>
-              <w:t>cmake --preset macos-debug</w:t>
-            </w:r>
-          </w:p>
-          <w:p>
+              <w:t>./scripts/setup_dev.sh --check             # ch</w:t>
+            </w:r>
             <w:r>
               <w:rPr>
                 <w:rFonts w:ascii="Consolas" w:eastAsia="Consolas" w:hAnsi="Consolas" w:cs="Consolas"/>
                 <w:color w:val="000000"/>
                 <w:sz w:val="19"/>
               </w:rPr>
-              <w:t>cmake --build --preset macos-debug</w:t>
-            </w:r>
-          </w:p>
-          <w:p>
+              <w:t>ỉ</w:t>
+            </w:r>
             <w:r>
               <w:rPr>
                 <w:rFonts w:ascii="Consolas" w:eastAsia="Consolas" w:hAnsi="Consolas" w:cs="Consolas"/>
                 <w:color w:val="000000"/>
                 <w:sz w:val="19"/>
               </w:rPr>
-              <w:t>open build/macos-debug/src/app/QLTTTA.app</w:t>
+              <w:t xml:space="preserve"> báo còn thi</w:t>
+            </w:r>
+            <w:r>
+              <w:rPr>
+                <w:rFonts w:ascii="Consolas" w:eastAsia="Consolas" w:hAnsi="Consolas" w:cs="Consolas"/>
+                <w:color w:val="000000"/>
+                <w:sz w:val="19"/>
+              </w:rPr>
+              <w:t>ế</w:t>
+            </w:r>
+            <w:r>
+              <w:rPr>
+                <w:rFonts w:ascii="Consolas" w:eastAsia="Consolas" w:hAnsi="Consolas" w:cs="Consolas"/>
+                <w:color w:val="000000"/>
+                <w:sz w:val="19"/>
+              </w:rPr>
+              <w:t>u gì</w:t>
+            </w:r>
+          </w:p>
+          <w:p>
+            <w:r>
+              <w:rPr>
+                <w:rFonts w:ascii="Consolas" w:eastAsia="Consolas" w:hAnsi="Consolas" w:cs="Consolas"/>
+                <w:color w:val="000000"/>
+                <w:sz w:val="19"/>
+              </w:rPr>
+              <w:t>./scripts/setup_dev.sh --accept-licenses   # cài đ</w:t>
+            </w:r>
+            <w:r>
+              <w:rPr>
+                <w:rFonts w:ascii="Consolas" w:eastAsia="Consolas" w:hAnsi="Consolas" w:cs="Consolas"/>
+                <w:color w:val="000000"/>
+                <w:sz w:val="19"/>
+              </w:rPr>
+              <w:t>ặ</w:t>
+            </w:r>
+            <w:r>
+              <w:rPr>
+                <w:rFonts w:ascii="Consolas" w:eastAsia="Consolas" w:hAnsi="Consolas" w:cs="Consolas"/>
+                <w:color w:val="000000"/>
+                <w:sz w:val="19"/>
+              </w:rPr>
+              <w:t>t toàn b</w:t>
+            </w:r>
+            <w:r>
+              <w:rPr>
+                <w:rFonts w:ascii="Consolas" w:eastAsia="Consolas" w:hAnsi="Consolas" w:cs="Consolas"/>
+                <w:color w:val="000000"/>
+                <w:sz w:val="19"/>
+              </w:rPr>
+              <w:t>ộ</w:t>
             </w:r>
           </w:p>
         </w:tc>
@@ -17260,13 +17332,242 @@
         <w:spacing w:after="80"/>
       </w:pPr>
     </w:p>
+    <w:tbl>
+      <w:tblPr>
+        <w:tblW w:w="0" w:type="auto"/>
+        <w:jc w:val="center"/>
+        <w:tblLook w:val="04A0" w:firstRow="1" w:lastRow="0" w:firstColumn="1" w:lastColumn="0" w:noHBand="0" w:noVBand="1"/>
+      </w:tblPr>
+      <w:tblGrid>
+        <w:gridCol w:w="9060"/>
+      </w:tblGrid>
+      <w:tr>
+        <w:trPr>
+          <w:cantSplit/>
+          <w:jc w:val="center"/>
+        </w:trPr>
+        <w:tc>
+          <w:tcPr>
+            <w:tcW w:w="9070" w:type="dxa"/>
+            <w:tcBorders>
+              <w:top w:val="single" w:sz="4" w:space="0" w:color="BFBFBF"/>
+              <w:left w:val="single" w:sz="4" w:space="0" w:color="BFBFBF"/>
+              <w:bottom w:val="single" w:sz="4" w:space="0" w:color="BFBFBF"/>
+              <w:right w:val="single" w:sz="4" w:space="0" w:color="BFBFBF"/>
+            </w:tcBorders>
+            <w:shd w:val="clear" w:color="auto" w:fill="E7ECF5"/>
+            <w:tcMar>
+              <w:top w:w="40" w:type="dxa"/>
+              <w:left w:w="140" w:type="dxa"/>
+              <w:bottom w:w="40" w:type="dxa"/>
+              <w:right w:w="140" w:type="dxa"/>
+            </w:tcMar>
+          </w:tcPr>
+          <w:p>
+            <w:pPr>
+              <w:keepNext/>
+            </w:pPr>
+            <w:r>
+              <w:rPr>
+                <w:b/>
+                <w:color w:val="1F3864"/>
+                <w:sz w:val="22"/>
+              </w:rPr>
+              <w:t>PowerShell (Windows)</w:t>
+            </w:r>
+          </w:p>
+        </w:tc>
+      </w:tr>
+      <w:tr>
+        <w:trPr>
+          <w:jc w:val="center"/>
+        </w:trPr>
+        <w:tc>
+          <w:tcPr>
+            <w:tcW w:w="9070" w:type="dxa"/>
+            <w:tcBorders>
+              <w:top w:val="single" w:sz="4" w:space="0" w:color="BFBFBF"/>
+              <w:left w:val="single" w:sz="4" w:space="0" w:color="BFBFBF"/>
+              <w:bottom w:val="single" w:sz="4" w:space="0" w:color="BFBFBF"/>
+              <w:right w:val="single" w:sz="4" w:space="0" w:color="BFBFBF"/>
+            </w:tcBorders>
+            <w:shd w:val="clear" w:color="auto" w:fill="F7F7F7"/>
+            <w:tcMar>
+              <w:top w:w="80" w:type="dxa"/>
+              <w:left w:w="140" w:type="dxa"/>
+              <w:bottom w:w="80" w:type="dxa"/>
+              <w:right w:w="140" w:type="dxa"/>
+            </w:tcMar>
+          </w:tcPr>
+          <w:p>
+            <w:r>
+              <w:rPr>
+                <w:rFonts w:ascii="Consolas" w:eastAsia="Consolas" w:hAnsi="Consolas" w:cs="Consolas"/>
+                <w:color w:val="000000"/>
+                <w:sz w:val="19"/>
+              </w:rPr>
+              <w:t>powershell -ExecutionPolicy Bypass -File scripts\setup_dev.ps1 -Check</w:t>
+            </w:r>
+          </w:p>
+          <w:p>
+            <w:r>
+              <w:rPr>
+                <w:rFonts w:ascii="Consolas" w:eastAsia="Consolas" w:hAnsi="Consolas" w:cs="Consolas"/>
+                <w:color w:val="000000"/>
+                <w:sz w:val="19"/>
+              </w:rPr>
+              <w:t>powershell -ExecutionPolicy Bypass -File scripts\setup_dev.ps1 -AcceptLicenses</w:t>
+            </w:r>
+          </w:p>
+        </w:tc>
+      </w:tr>
+    </w:tbl>
+    <w:p>
+      <w:pPr>
+        <w:spacing w:after="80"/>
+      </w:pPr>
+    </w:p>
+    <w:p>
+      <w:pPr>
+        <w:spacing w:after="120" w:line="276" w:lineRule="auto"/>
+        <w:ind w:firstLine="284"/>
+        <w:jc w:val="both"/>
+      </w:pPr>
+      <w:r>
+        <w:t xml:space="preserve">Tham số </w:t>
+      </w:r>
+      <w:r>
+        <w:rPr>
+          <w:color w:val="C7254E"/>
+        </w:rPr>
+        <w:t>--accept-licenses</w:t>
+      </w:r>
+      <w:r>
+        <w:t xml:space="preserve"> (</w:t>
+      </w:r>
+      <w:r>
+        <w:rPr>
+          <w:color w:val="C7254E"/>
+        </w:rPr>
+        <w:t>-AcceptLicenses</w:t>
+      </w:r>
+      <w:r>
+        <w:t>) nghĩa là bạn đồng ý giấy phép SQL Server Developer Edition (và điều khoản Docker Desktop trên macOS). Sau đó build và chạy ứng dụng, ví dụ trên macOS:</w:t>
+      </w:r>
+    </w:p>
+    <w:tbl>
+      <w:tblPr>
+        <w:tblW w:w="0" w:type="auto"/>
+        <w:jc w:val="center"/>
+        <w:tblLook w:val="04A0" w:firstRow="1" w:lastRow="0" w:firstColumn="1" w:lastColumn="0" w:noHBand="0" w:noVBand="1"/>
+      </w:tblPr>
+      <w:tblGrid>
+        <w:gridCol w:w="9060"/>
+      </w:tblGrid>
+      <w:tr>
+        <w:trPr>
+          <w:cantSplit/>
+          <w:jc w:val="center"/>
+        </w:trPr>
+        <w:tc>
+          <w:tcPr>
+            <w:tcW w:w="9070" w:type="dxa"/>
+            <w:tcBorders>
+              <w:top w:val="single" w:sz="4" w:space="0" w:color="BFBFBF"/>
+              <w:left w:val="single" w:sz="4" w:space="0" w:color="BFBFBF"/>
+              <w:bottom w:val="single" w:sz="4" w:space="0" w:color="BFBFBF"/>
+              <w:right w:val="single" w:sz="4" w:space="0" w:color="BFBFBF"/>
+            </w:tcBorders>
+            <w:shd w:val="clear" w:color="auto" w:fill="E7ECF5"/>
+            <w:tcMar>
+              <w:top w:w="40" w:type="dxa"/>
+              <w:left w:w="140" w:type="dxa"/>
+              <w:bottom w:w="40" w:type="dxa"/>
+              <w:right w:w="140" w:type="dxa"/>
+            </w:tcMar>
+          </w:tcPr>
+          <w:p>
+            <w:pPr>
+              <w:keepNext/>
+            </w:pPr>
+            <w:r>
+              <w:rPr>
+                <w:b/>
+                <w:color w:val="1F3864"/>
+                <w:sz w:val="22"/>
+              </w:rPr>
+              <w:t>Terminal (macOS)</w:t>
+            </w:r>
+          </w:p>
+        </w:tc>
+      </w:tr>
+      <w:tr>
+        <w:trPr>
+          <w:jc w:val="center"/>
+        </w:trPr>
+        <w:tc>
+          <w:tcPr>
+            <w:tcW w:w="9070" w:type="dxa"/>
+            <w:tcBorders>
+              <w:top w:val="single" w:sz="4" w:space="0" w:color="BFBFBF"/>
+              <w:left w:val="single" w:sz="4" w:space="0" w:color="BFBFBF"/>
+              <w:bottom w:val="single" w:sz="4" w:space="0" w:color="BFBFBF"/>
+              <w:right w:val="single" w:sz="4" w:space="0" w:color="BFBFBF"/>
+            </w:tcBorders>
+            <w:shd w:val="clear" w:color="auto" w:fill="F7F7F7"/>
+            <w:tcMar>
+              <w:top w:w="80" w:type="dxa"/>
+              <w:left w:w="140" w:type="dxa"/>
+              <w:bottom w:w="80" w:type="dxa"/>
+              <w:right w:w="140" w:type="dxa"/>
+            </w:tcMar>
+          </w:tcPr>
+          <w:p>
+            <w:r>
+              <w:rPr>
+                <w:rFonts w:ascii="Consolas" w:eastAsia="Consolas" w:hAnsi="Consolas" w:cs="Consolas"/>
+                <w:color w:val="000000"/>
+                <w:sz w:val="19"/>
+              </w:rPr>
+              <w:t>cmake --preset macos-debug</w:t>
+            </w:r>
+          </w:p>
+          <w:p>
+            <w:r>
+              <w:rPr>
+                <w:rFonts w:ascii="Consolas" w:eastAsia="Consolas" w:hAnsi="Consolas" w:cs="Consolas"/>
+                <w:color w:val="000000"/>
+                <w:sz w:val="19"/>
+              </w:rPr>
+              <w:t>cmake --build --preset macos-debug</w:t>
+            </w:r>
+          </w:p>
+          <w:p>
+            <w:r>
+              <w:rPr>
+                <w:rFonts w:ascii="Consolas" w:eastAsia="Consolas" w:hAnsi="Consolas" w:cs="Consolas"/>
+                <w:color w:val="000000"/>
+                <w:sz w:val="19"/>
+              </w:rPr>
+              <w:t>open build/macos-debug/src/app/QLTTTA.app</w:t>
+            </w:r>
+          </w:p>
+        </w:tc>
+      </w:tr>
+    </w:tbl>
+    <w:p>
+      <w:pPr>
+        <w:spacing w:after="80"/>
+      </w:pPr>
+    </w:p>
     <w:p>
       <w:pPr>
         <w:pStyle w:val="Heading1"/>
         <w:pageBreakBefore/>
       </w:pPr>
-      <w:bookmarkStart w:id="36" w:name="_Toc241910076"/>
-      <w:r>
+      <w:bookmarkStart w:id="36" w:name="_Toc241916433"/>
+      <w:r>
+        <w:lastRenderedPageBreak/>
         <w:t>CHƯƠNG 4. ĐĂNG NHẬP VÀ GIAO DIỆN CHUNG</w:t>
       </w:r>
       <w:bookmarkEnd w:id="36"/>
@@ -17275,7 +17576,7 @@
       <w:pPr>
         <w:pStyle w:val="Heading2"/>
       </w:pPr>
-      <w:bookmarkStart w:id="37" w:name="_Toc241910077"/>
+      <w:bookmarkStart w:id="37" w:name="_Toc241916434"/>
       <w:r>
         <w:t>4.1. Mở ứng dụng</w:t>
       </w:r>
@@ -17432,7 +17733,7 @@
           <w:noProof/>
         </w:rPr>
         <w:drawing>
-          <wp:inline distT="0" distB="0" distL="0" distR="0" wp14:anchorId="49A39E5A" wp14:editId="24FEBE09">
+          <wp:inline distT="0" distB="0" distL="0" distR="0" wp14:anchorId="7A41355F" wp14:editId="32A97C97">
             <wp:extent cx="4860000" cy="2938605"/>
             <wp:effectExtent l="0" t="0" r="0" b="0"/>
             <wp:docPr id="522444761" name="Picture 522444761"/>
@@ -17472,7 +17773,7 @@
       <w:pPr>
         <w:pStyle w:val="FigureCaption"/>
       </w:pPr>
-      <w:bookmarkStart w:id="38" w:name="_Toc241910107"/>
+      <w:bookmarkStart w:id="38" w:name="_Toc241916464"/>
       <w:r>
         <w:t>Hình 4.1. Màn hình đăng nhập</w:t>
       </w:r>
@@ -17482,7 +17783,7 @@
       <w:pPr>
         <w:pStyle w:val="Heading2"/>
       </w:pPr>
-      <w:bookmarkStart w:id="39" w:name="_Toc241910078"/>
+      <w:bookmarkStart w:id="39" w:name="_Toc241916435"/>
       <w:r>
         <w:t>4.2. Cấu hình máy chủ (lần chạy đầu tiên)</w:t>
       </w:r>
@@ -17631,8 +17932,9 @@
         <w:rPr>
           <w:noProof/>
         </w:rPr>
+        <w:lastRenderedPageBreak/>
         <w:drawing>
-          <wp:inline distT="0" distB="0" distL="0" distR="0" wp14:anchorId="5BCD22DA" wp14:editId="67BEFF40">
+          <wp:inline distT="0" distB="0" distL="0" distR="0" wp14:anchorId="2B1D8918" wp14:editId="27212833">
             <wp:extent cx="5040000" cy="3360000"/>
             <wp:effectExtent l="0" t="0" r="0" b="0"/>
             <wp:docPr id="522444762" name="Picture 522444762"/>
@@ -17672,7 +17974,7 @@
       <w:pPr>
         <w:pStyle w:val="FigureCaption"/>
       </w:pPr>
-      <w:bookmarkStart w:id="40" w:name="_Toc241910108"/>
+      <w:bookmarkStart w:id="40" w:name="_Toc241916465"/>
       <w:r>
         <w:t>Hình 4.2. Khung cấu hình máy chủ SQL Server</w:t>
       </w:r>
@@ -17682,7 +17984,7 @@
       <w:pPr>
         <w:pStyle w:val="TableCaption"/>
       </w:pPr>
-      <w:bookmarkStart w:id="41" w:name="_Toc241910128"/>
+      <w:bookmarkStart w:id="41" w:name="_Toc241916485"/>
       <w:r>
         <w:t>Bảng 4.1. Giá trị ô Máy chủ theo cách cài SQL Server</w:t>
       </w:r>
@@ -18122,7 +18424,7 @@
       <w:pPr>
         <w:pStyle w:val="Heading2"/>
       </w:pPr>
-      <w:bookmarkStart w:id="42" w:name="_Toc241910079"/>
+      <w:bookmarkStart w:id="42" w:name="_Toc241916436"/>
       <w:r>
         <w:t>4.3. Đăng nhập</w:t>
       </w:r>
@@ -18196,7 +18498,7 @@
       <w:pPr>
         <w:pStyle w:val="TableCaption"/>
       </w:pPr>
-      <w:bookmarkStart w:id="43" w:name="_Toc241910129"/>
+      <w:bookmarkStart w:id="43" w:name="_Toc241916486"/>
       <w:r>
         <w:t>Bảng 4.2. Tài khoản demo trong dữ liệu mẫu</w:t>
       </w:r>
@@ -18744,6 +19046,7 @@
                 <w:color w:val="C7254E"/>
                 <w:sz w:val="20"/>
               </w:rPr>
+              <w:lastRenderedPageBreak/>
               <w:t>kt_minh</w:t>
             </w:r>
           </w:p>
@@ -19521,7 +19824,7 @@
       <w:pPr>
         <w:pStyle w:val="TableCaption"/>
       </w:pPr>
-      <w:bookmarkStart w:id="44" w:name="_Toc241910130"/>
+      <w:bookmarkStart w:id="44" w:name="_Toc241916487"/>
       <w:r>
         <w:t>Bảng 4.3. Thông báo lỗi khi đăng nhập</w:t>
       </w:r>
@@ -19945,7 +20248,7 @@
       <w:pPr>
         <w:pStyle w:val="Heading2"/>
       </w:pPr>
-      <w:bookmarkStart w:id="45" w:name="_Toc241910080"/>
+      <w:bookmarkStart w:id="45" w:name="_Toc241916437"/>
       <w:r>
         <w:t>4.4. Màn hình chính</w:t>
       </w:r>
@@ -20094,8 +20397,9 @@
         <w:rPr>
           <w:noProof/>
         </w:rPr>
+        <w:lastRenderedPageBreak/>
         <w:drawing>
-          <wp:inline distT="0" distB="0" distL="0" distR="0" wp14:anchorId="25533655" wp14:editId="04582CEE">
+          <wp:inline distT="0" distB="0" distL="0" distR="0" wp14:anchorId="3E0FF522" wp14:editId="053BF392">
             <wp:extent cx="5580000" cy="3332500"/>
             <wp:effectExtent l="0" t="0" r="0" b="0"/>
             <wp:docPr id="522444763" name="Picture 522444763"/>
@@ -20135,7 +20439,7 @@
       <w:pPr>
         <w:pStyle w:val="FigureCaption"/>
       </w:pPr>
-      <w:bookmarkStart w:id="46" w:name="_Toc241910109"/>
+      <w:bookmarkStart w:id="46" w:name="_Toc241916466"/>
       <w:r>
         <w:t>Hình 4.3. Màn hình chính của vai trò Quản lý (trang Tổng quan)</w:t>
       </w:r>
@@ -20145,7 +20449,7 @@
       <w:pPr>
         <w:pStyle w:val="Heading2"/>
       </w:pPr>
-      <w:bookmarkStart w:id="47" w:name="_Toc241910081"/>
+      <w:bookmarkStart w:id="47" w:name="_Toc241916438"/>
       <w:r>
         <w:t>4.5. Đổi ngôn ngữ giao diện</w:t>
       </w:r>
@@ -20183,7 +20487,7 @@
       <w:pPr>
         <w:pStyle w:val="Heading2"/>
       </w:pPr>
-      <w:bookmarkStart w:id="48" w:name="_Toc241910082"/>
+      <w:bookmarkStart w:id="48" w:name="_Toc241916439"/>
       <w:r>
         <w:t>4.6. Đổi mật khẩu</w:t>
       </w:r>
@@ -20299,7 +20603,7 @@
           <w:noProof/>
         </w:rPr>
         <w:drawing>
-          <wp:inline distT="0" distB="0" distL="0" distR="0" wp14:anchorId="45C055F7" wp14:editId="7EAEC4B6">
+          <wp:inline distT="0" distB="0" distL="0" distR="0" wp14:anchorId="67FBCFD3" wp14:editId="4260BCCD">
             <wp:extent cx="3420000" cy="1368000"/>
             <wp:effectExtent l="0" t="0" r="0" b="0"/>
             <wp:docPr id="522444764" name="Picture 522444764"/>
@@ -20339,7 +20643,7 @@
       <w:pPr>
         <w:pStyle w:val="FigureCaption"/>
       </w:pPr>
-      <w:bookmarkStart w:id="49" w:name="_Toc241910110"/>
+      <w:bookmarkStart w:id="49" w:name="_Toc241916467"/>
       <w:r>
         <w:t>Hình 4.4. Hộp thoại đổi mật khẩu</w:t>
       </w:r>
@@ -20361,7 +20665,11 @@
         <w:t>ít nhất 8 ký tự</w:t>
       </w:r>
       <w:r>
-        <w:t xml:space="preserve">, khác mật khẩu cũ và hai lần nhập phải giống nhau. SQL Server còn có thể từ chối mật khẩu quá đơn giản theo chính sách mật khẩu của máy chủ: nên dùng cả chữ hoa, chữ thường, chữ số và ký hiệu (ví dụ dạng </w:t>
+        <w:t xml:space="preserve">, khác mật khẩu cũ và hai lần nhập phải giống nhau. SQL Server còn có thể từ chối mật khẩu quá đơn giản theo chính sách mật khẩu </w:t>
+      </w:r>
+      <w:r>
+        <w:lastRenderedPageBreak/>
+        <w:t xml:space="preserve">của máy chủ: nên dùng cả chữ hoa, chữ thường, chữ số và ký hiệu (ví dụ dạng </w:t>
       </w:r>
       <w:r>
         <w:rPr>
@@ -20377,7 +20685,7 @@
       <w:pPr>
         <w:pStyle w:val="Heading2"/>
       </w:pPr>
-      <w:bookmarkStart w:id="50" w:name="_Toc241910083"/>
+      <w:bookmarkStart w:id="50" w:name="_Toc241916440"/>
       <w:r>
         <w:t>4.7. Đăng xuất và thoát</w:t>
       </w:r>
@@ -20424,7 +20732,7 @@
       <w:pPr>
         <w:pStyle w:val="Heading2"/>
       </w:pPr>
-      <w:bookmarkStart w:id="51" w:name="_Toc241910084"/>
+      <w:bookmarkStart w:id="51" w:name="_Toc241916441"/>
       <w:r>
         <w:t>4.8. Thao tác chung trên các danh sách</w:t>
       </w:r>
@@ -20451,7 +20759,7 @@
           <w:noProof/>
         </w:rPr>
         <w:drawing>
-          <wp:inline distT="0" distB="0" distL="0" distR="0" wp14:anchorId="11BD6E1C" wp14:editId="2B35E28B">
+          <wp:inline distT="0" distB="0" distL="0" distR="0" wp14:anchorId="1437D493" wp14:editId="3CE2C58C">
             <wp:extent cx="5580000" cy="3332500"/>
             <wp:effectExtent l="0" t="0" r="0" b="0"/>
             <wp:docPr id="522444765" name="Picture 522444765"/>
@@ -20491,7 +20799,7 @@
       <w:pPr>
         <w:pStyle w:val="FigureCaption"/>
       </w:pPr>
-      <w:bookmarkStart w:id="52" w:name="_Toc241910111"/>
+      <w:bookmarkStart w:id="52" w:name="_Toc241916468"/>
       <w:r>
         <w:t>Hình 4.5. Một màn hình danh sách: Công nợ học phí</w:t>
       </w:r>
@@ -20501,7 +20809,7 @@
       <w:pPr>
         <w:pStyle w:val="TableCaption"/>
       </w:pPr>
-      <w:bookmarkStart w:id="53" w:name="_Toc241910131"/>
+      <w:bookmarkStart w:id="53" w:name="_Toc241916488"/>
       <w:r>
         <w:t>Bảng 4.4. Các thành phần của màn hình danh sách</w:t>
       </w:r>
@@ -20992,6 +21300,7 @@
               <w:rPr>
                 <w:sz w:val="21"/>
               </w:rPr>
+              <w:lastRenderedPageBreak/>
               <w:t xml:space="preserve">Nút </w:t>
             </w:r>
             <w:r>
@@ -21126,8 +21435,9 @@
         <w:pStyle w:val="Heading1"/>
         <w:pageBreakBefore/>
       </w:pPr>
-      <w:bookmarkStart w:id="54" w:name="_Toc241910085"/>
-      <w:r>
+      <w:bookmarkStart w:id="54" w:name="_Toc241916442"/>
+      <w:r>
+        <w:lastRenderedPageBreak/>
         <w:t>CHƯƠNG 5. HƯỚNG DẪN THEO CHỨC NĂNG</w:t>
       </w:r>
       <w:bookmarkEnd w:id="54"/>
@@ -21146,7 +21456,7 @@
       <w:pPr>
         <w:pStyle w:val="Heading2"/>
       </w:pPr>
-      <w:bookmarkStart w:id="55" w:name="_Toc241910086"/>
+      <w:bookmarkStart w:id="55" w:name="_Toc241916443"/>
       <w:r>
         <w:t>5.1. Tổng quan</w:t>
       </w:r>
@@ -21181,7 +21491,7 @@
       <w:pPr>
         <w:pStyle w:val="TableCaption"/>
       </w:pPr>
-      <w:bookmarkStart w:id="56" w:name="_Toc241910132"/>
+      <w:bookmarkStart w:id="56" w:name="_Toc241916489"/>
       <w:r>
         <w:t>Bảng 5.1. Các thẻ số liệu trên trang Tổng quan</w:t>
       </w:r>
@@ -21663,7 +21973,7 @@
           <w:noProof/>
         </w:rPr>
         <w:drawing>
-          <wp:inline distT="0" distB="0" distL="0" distR="0" wp14:anchorId="4D40B514" wp14:editId="466F9E27">
+          <wp:inline distT="0" distB="0" distL="0" distR="0" wp14:anchorId="62C163E6" wp14:editId="302258CE">
             <wp:extent cx="5580000" cy="3332500"/>
             <wp:effectExtent l="0" t="0" r="0" b="0"/>
             <wp:docPr id="522444766" name="Picture 522444766"/>
@@ -21703,7 +22013,7 @@
       <w:pPr>
         <w:pStyle w:val="FigureCaption"/>
       </w:pPr>
-      <w:bookmarkStart w:id="57" w:name="_Toc241910112"/>
+      <w:bookmarkStart w:id="57" w:name="_Toc241916469"/>
       <w:r>
         <w:t>Hình 5.1. Trang Tổng quan của Giáo vụ: không có quyền xem doanh thu nên biểu đồ để trống</w:t>
       </w:r>
@@ -21713,7 +22023,7 @@
       <w:pPr>
         <w:pStyle w:val="Heading2"/>
       </w:pPr>
-      <w:bookmarkStart w:id="58" w:name="_Toc241910087"/>
+      <w:bookmarkStart w:id="58" w:name="_Toc241916444"/>
       <w:r>
         <w:t>5.2. Học viên</w:t>
       </w:r>
@@ -21745,8 +22055,9 @@
         <w:rPr>
           <w:noProof/>
         </w:rPr>
+        <w:lastRenderedPageBreak/>
         <w:drawing>
-          <wp:inline distT="0" distB="0" distL="0" distR="0" wp14:anchorId="4313087F" wp14:editId="4C39D12B">
+          <wp:inline distT="0" distB="0" distL="0" distR="0" wp14:anchorId="30B5A00B" wp14:editId="42C98B3B">
             <wp:extent cx="5580000" cy="3332500"/>
             <wp:effectExtent l="0" t="0" r="0" b="0"/>
             <wp:docPr id="522444767" name="Picture 522444767"/>
@@ -21786,7 +22097,7 @@
       <w:pPr>
         <w:pStyle w:val="FigureCaption"/>
       </w:pPr>
-      <w:bookmarkStart w:id="59" w:name="_Toc241910113"/>
+      <w:bookmarkStart w:id="59" w:name="_Toc241916470"/>
       <w:r>
         <w:t>Hình 5.2. Danh sách học viên</w:t>
       </w:r>
@@ -21796,7 +22107,7 @@
       <w:pPr>
         <w:pStyle w:val="Heading3"/>
       </w:pPr>
-      <w:bookmarkStart w:id="60" w:name="_Toc241910088"/>
+      <w:bookmarkStart w:id="60" w:name="_Toc241916445"/>
       <w:r>
         <w:t>5.2.1. Tìm kiếm</w:t>
       </w:r>
@@ -21893,7 +22204,7 @@
       <w:pPr>
         <w:pStyle w:val="Heading3"/>
       </w:pPr>
-      <w:bookmarkStart w:id="61" w:name="_Toc241910089"/>
+      <w:bookmarkStart w:id="61" w:name="_Toc241916446"/>
       <w:r>
         <w:t>5.2.2. Thêm học viên</w:t>
       </w:r>
@@ -22098,7 +22409,7 @@
       <w:pPr>
         <w:pStyle w:val="Heading3"/>
       </w:pPr>
-      <w:bookmarkStart w:id="62" w:name="_Toc241910090"/>
+      <w:bookmarkStart w:id="62" w:name="_Toc241916447"/>
       <w:r>
         <w:t>5.2.3. Sửa thông tin</w:t>
       </w:r>
@@ -22187,8 +22498,9 @@
         <w:rPr>
           <w:noProof/>
         </w:rPr>
+        <w:lastRenderedPageBreak/>
         <w:drawing>
-          <wp:inline distT="0" distB="0" distL="0" distR="0" wp14:anchorId="611A4113" wp14:editId="473F69AB">
+          <wp:inline distT="0" distB="0" distL="0" distR="0" wp14:anchorId="48EF29FA" wp14:editId="1A2A49F8">
             <wp:extent cx="3780000" cy="4785968"/>
             <wp:effectExtent l="0" t="0" r="0" b="0"/>
             <wp:docPr id="522444768" name="Picture 522444768"/>
@@ -22228,7 +22540,7 @@
       <w:pPr>
         <w:pStyle w:val="FigureCaption"/>
       </w:pPr>
-      <w:bookmarkStart w:id="63" w:name="_Toc241910114"/>
+      <w:bookmarkStart w:id="63" w:name="_Toc241916471"/>
       <w:r>
         <w:t>Hình 5.3. Hộp thoại sửa thông tin học viên</w:t>
       </w:r>
@@ -22248,7 +22560,7 @@
       <w:pPr>
         <w:pStyle w:val="TableCaption"/>
       </w:pPr>
-      <w:bookmarkStart w:id="64" w:name="_Toc241910133"/>
+      <w:bookmarkStart w:id="64" w:name="_Toc241916490"/>
       <w:r>
         <w:t>Bảng 5.2. Quy tắc kiểm tra thông tin học viên</w:t>
       </w:r>
@@ -22849,8 +23161,9 @@
       <w:pPr>
         <w:pStyle w:val="Heading3"/>
       </w:pPr>
-      <w:bookmarkStart w:id="65" w:name="_Toc241910091"/>
-      <w:r>
+      <w:bookmarkStart w:id="65" w:name="_Toc241916448"/>
+      <w:r>
+        <w:lastRenderedPageBreak/>
         <w:t>5.2.4. Xóa học viên</w:t>
       </w:r>
       <w:bookmarkEnd w:id="65"/>
@@ -22970,7 +23283,7 @@
       <w:pPr>
         <w:pStyle w:val="Heading2"/>
       </w:pPr>
-      <w:bookmarkStart w:id="66" w:name="_Toc241910092"/>
+      <w:bookmarkStart w:id="66" w:name="_Toc241916449"/>
       <w:r>
         <w:t>5.3. Lớp học</w:t>
       </w:r>
@@ -23021,7 +23334,7 @@
           <w:noProof/>
         </w:rPr>
         <w:drawing>
-          <wp:inline distT="0" distB="0" distL="0" distR="0" wp14:anchorId="66C590F2" wp14:editId="44568D39">
+          <wp:inline distT="0" distB="0" distL="0" distR="0" wp14:anchorId="63646304" wp14:editId="1D378BF0">
             <wp:extent cx="5580000" cy="3332500"/>
             <wp:effectExtent l="0" t="0" r="0" b="0"/>
             <wp:docPr id="522444769" name="Picture 522444769"/>
@@ -23061,7 +23374,7 @@
       <w:pPr>
         <w:pStyle w:val="FigureCaption"/>
       </w:pPr>
-      <w:bookmarkStart w:id="67" w:name="_Toc241910115"/>
+      <w:bookmarkStart w:id="67" w:name="_Toc241916472"/>
       <w:r>
         <w:t>Hình 5.4. Danh sách lớp học</w:t>
       </w:r>
@@ -23071,7 +23384,7 @@
       <w:pPr>
         <w:pStyle w:val="Heading2"/>
       </w:pPr>
-      <w:bookmarkStart w:id="68" w:name="_Toc241910093"/>
+      <w:bookmarkStart w:id="68" w:name="_Toc241916450"/>
       <w:r>
         <w:t>5.4. Lịch học tuần này</w:t>
       </w:r>
@@ -23121,8 +23434,9 @@
         <w:rPr>
           <w:noProof/>
         </w:rPr>
+        <w:lastRenderedPageBreak/>
         <w:drawing>
-          <wp:inline distT="0" distB="0" distL="0" distR="0" wp14:anchorId="4774A078" wp14:editId="603CF07C">
+          <wp:inline distT="0" distB="0" distL="0" distR="0" wp14:anchorId="770036D9" wp14:editId="5E4519AB">
             <wp:extent cx="5580000" cy="3332500"/>
             <wp:effectExtent l="0" t="0" r="0" b="0"/>
             <wp:docPr id="522444770" name="Picture 522444770"/>
@@ -23162,7 +23476,7 @@
       <w:pPr>
         <w:pStyle w:val="FigureCaption"/>
       </w:pPr>
-      <w:bookmarkStart w:id="69" w:name="_Toc241910116"/>
+      <w:bookmarkStart w:id="69" w:name="_Toc241916473"/>
       <w:r>
         <w:t>Hình 5.5. Lịch học tuần này</w:t>
       </w:r>
@@ -23172,7 +23486,7 @@
       <w:pPr>
         <w:pStyle w:val="Heading2"/>
       </w:pPr>
-      <w:bookmarkStart w:id="70" w:name="_Toc241910094"/>
+      <w:bookmarkStart w:id="70" w:name="_Toc241916451"/>
       <w:r>
         <w:t>5.5. Kết quả học tập</w:t>
       </w:r>
@@ -23232,7 +23546,7 @@
           <w:noProof/>
         </w:rPr>
         <w:drawing>
-          <wp:inline distT="0" distB="0" distL="0" distR="0" wp14:anchorId="1CE2BD89" wp14:editId="418DE73E">
+          <wp:inline distT="0" distB="0" distL="0" distR="0" wp14:anchorId="1BF6921C" wp14:editId="5D4FFF9B">
             <wp:extent cx="5580000" cy="3332500"/>
             <wp:effectExtent l="0" t="0" r="0" b="0"/>
             <wp:docPr id="522444771" name="Picture 522444771"/>
@@ -23272,7 +23586,7 @@
       <w:pPr>
         <w:pStyle w:val="FigureCaption"/>
       </w:pPr>
-      <w:bookmarkStart w:id="71" w:name="_Toc241910117"/>
+      <w:bookmarkStart w:id="71" w:name="_Toc241916474"/>
       <w:r>
         <w:t>Hình 5.6. Kết quả học tập</w:t>
       </w:r>
@@ -23282,8 +23596,9 @@
       <w:pPr>
         <w:pStyle w:val="Heading2"/>
       </w:pPr>
-      <w:bookmarkStart w:id="72" w:name="_Toc241910095"/>
-      <w:r>
+      <w:bookmarkStart w:id="72" w:name="_Toc241916452"/>
+      <w:r>
+        <w:lastRenderedPageBreak/>
         <w:t>5.6. Công nợ học phí</w:t>
       </w:r>
       <w:bookmarkEnd w:id="72"/>
@@ -23335,7 +23650,7 @@
       <w:pPr>
         <w:pStyle w:val="Heading2"/>
       </w:pPr>
-      <w:bookmarkStart w:id="73" w:name="_Toc241910096"/>
+      <w:bookmarkStart w:id="73" w:name="_Toc241916453"/>
       <w:r>
         <w:t>5.7. Doanh thu</w:t>
       </w:r>
@@ -23404,7 +23719,7 @@
           <w:noProof/>
         </w:rPr>
         <w:drawing>
-          <wp:inline distT="0" distB="0" distL="0" distR="0" wp14:anchorId="7BED1162" wp14:editId="50C0D0F7">
+          <wp:inline distT="0" distB="0" distL="0" distR="0" wp14:anchorId="610DC96E" wp14:editId="68F55EEB">
             <wp:extent cx="5580000" cy="3332500"/>
             <wp:effectExtent l="0" t="0" r="0" b="0"/>
             <wp:docPr id="522444772" name="Picture 522444772"/>
@@ -23444,7 +23759,7 @@
       <w:pPr>
         <w:pStyle w:val="FigureCaption"/>
       </w:pPr>
-      <w:bookmarkStart w:id="74" w:name="_Toc241910118"/>
+      <w:bookmarkStart w:id="74" w:name="_Toc241916475"/>
       <w:r>
         <w:t>Hình 5.7. Doanh thu theo tháng và chi nhánh (Kế toán)</w:t>
       </w:r>
@@ -23454,7 +23769,7 @@
       <w:pPr>
         <w:pStyle w:val="Heading2"/>
       </w:pPr>
-      <w:bookmarkStart w:id="75" w:name="_Toc241910097"/>
+      <w:bookmarkStart w:id="75" w:name="_Toc241916454"/>
       <w:r>
         <w:t>5.8. Lương giáo viên</w:t>
       </w:r>
@@ -23504,8 +23819,9 @@
         <w:rPr>
           <w:noProof/>
         </w:rPr>
+        <w:lastRenderedPageBreak/>
         <w:drawing>
-          <wp:inline distT="0" distB="0" distL="0" distR="0" wp14:anchorId="101D7105" wp14:editId="548585C3">
+          <wp:inline distT="0" distB="0" distL="0" distR="0" wp14:anchorId="28475509" wp14:editId="5395F0D1">
             <wp:extent cx="5580000" cy="3332500"/>
             <wp:effectExtent l="0" t="0" r="0" b="0"/>
             <wp:docPr id="522444773" name="Picture 522444773"/>
@@ -23545,7 +23861,7 @@
       <w:pPr>
         <w:pStyle w:val="FigureCaption"/>
       </w:pPr>
-      <w:bookmarkStart w:id="76" w:name="_Toc241910119"/>
+      <w:bookmarkStart w:id="76" w:name="_Toc241916476"/>
       <w:r>
         <w:t>Hình 5.8. Bảng lương giáo viên (Kế toán)</w:t>
       </w:r>
@@ -23555,7 +23871,7 @@
       <w:pPr>
         <w:pStyle w:val="Heading2"/>
       </w:pPr>
-      <w:bookmarkStart w:id="77" w:name="_Toc241910098"/>
+      <w:bookmarkStart w:id="77" w:name="_Toc241916455"/>
       <w:r>
         <w:t>5.9. Tài khoản</w:t>
       </w:r>
@@ -23592,7 +23908,7 @@
         <w:t>Đã khóa</w:t>
       </w:r>
       <w:r>
-        <w:t xml:space="preserve">), ngày tạo và lần đăng nhập cuối. Màn hình này chỉ để tra cứu; việc tạo, khóa/mở khóa tài khoản và đặt lại mật khẩu do quản lý thực hiện trong SSMS (đăng nhập bằng tài khoản quản lý, chọn CSDL </w:t>
+        <w:t xml:space="preserve">), ngày tạo và lần đăng nhập cuối (hiển thị theo múi giờ của máy tính đang chạy ứng dụng). Màn hình này chỉ để tra cứu; việc tạo, khóa/mở khóa tài khoản và đặt lại mật khẩu do quản lý thực hiện trong SSMS (đăng nhập bằng tài khoản quản lý, chọn CSDL </w:t>
       </w:r>
       <w:r>
         <w:rPr>
@@ -23650,8 +23966,9 @@
         <w:rPr>
           <w:noProof/>
         </w:rPr>
+        <w:lastRenderedPageBreak/>
         <w:drawing>
-          <wp:inline distT="0" distB="0" distL="0" distR="0" wp14:anchorId="2169657B" wp14:editId="6366D8C7">
+          <wp:inline distT="0" distB="0" distL="0" distR="0" wp14:anchorId="3A4464C2" wp14:editId="6CDA305A">
             <wp:extent cx="5580000" cy="3332500"/>
             <wp:effectExtent l="0" t="0" r="0" b="0"/>
             <wp:docPr id="522444774" name="Picture 522444774"/>
@@ -23691,7 +24008,7 @@
       <w:pPr>
         <w:pStyle w:val="FigureCaption"/>
       </w:pPr>
-      <w:bookmarkStart w:id="78" w:name="_Toc241910120"/>
+      <w:bookmarkStart w:id="78" w:name="_Toc241916477"/>
       <w:r>
         <w:t>Hình 5.9. Danh sách tài khoản (Quản lý)</w:t>
       </w:r>
@@ -23701,7 +24018,7 @@
       <w:pPr>
         <w:pStyle w:val="Heading2"/>
       </w:pPr>
-      <w:bookmarkStart w:id="79" w:name="_Toc241910099"/>
+      <w:bookmarkStart w:id="79" w:name="_Toc241916456"/>
       <w:r>
         <w:t>5.10. Chức năng dành cho giáo viên</w:t>
       </w:r>
@@ -23793,8 +24110,9 @@
         <w:rPr>
           <w:noProof/>
         </w:rPr>
+        <w:lastRenderedPageBreak/>
         <w:drawing>
-          <wp:inline distT="0" distB="0" distL="0" distR="0" wp14:anchorId="7B9733DD" wp14:editId="72ADA2DD">
+          <wp:inline distT="0" distB="0" distL="0" distR="0" wp14:anchorId="097DF0A6" wp14:editId="3F85BED6">
             <wp:extent cx="5580000" cy="3332500"/>
             <wp:effectExtent l="0" t="0" r="0" b="0"/>
             <wp:docPr id="522444775" name="Picture 522444775"/>
@@ -23834,7 +24152,7 @@
       <w:pPr>
         <w:pStyle w:val="FigureCaption"/>
       </w:pPr>
-      <w:bookmarkStart w:id="80" w:name="_Toc241910121"/>
+      <w:bookmarkStart w:id="80" w:name="_Toc241916478"/>
       <w:r>
         <w:t>Hình 5.10. Lịch dạy của giáo viên</w:t>
       </w:r>
@@ -23844,7 +24162,7 @@
       <w:pPr>
         <w:pStyle w:val="Heading2"/>
       </w:pPr>
-      <w:bookmarkStart w:id="81" w:name="_Toc241910100"/>
+      <w:bookmarkStart w:id="81" w:name="_Toc241916457"/>
       <w:r>
         <w:t>5.11. Nghiệp vụ thực hiện trực tiếp trong CSDL</w:t>
       </w:r>
@@ -23873,7 +24191,7 @@
       <w:pPr>
         <w:pStyle w:val="TableCaption"/>
       </w:pPr>
-      <w:bookmarkStart w:id="82" w:name="_Toc241910134"/>
+      <w:bookmarkStart w:id="82" w:name="_Toc241916491"/>
       <w:r>
         <w:t>Bảng 5.3. Nghiệp vụ thực hiện bằng thủ tục trong CSDL</w:t>
       </w:r>
@@ -24523,8 +24841,9 @@
         <w:pStyle w:val="Heading1"/>
         <w:pageBreakBefore/>
       </w:pPr>
-      <w:bookmarkStart w:id="83" w:name="_Toc241910101"/>
-      <w:r>
+      <w:bookmarkStart w:id="83" w:name="_Toc241916458"/>
+      <w:r>
+        <w:lastRenderedPageBreak/>
         <w:t>CHƯƠNG 6. XỬ LÝ SỰ CỐ</w:t>
       </w:r>
       <w:bookmarkEnd w:id="83"/>
@@ -24533,7 +24852,7 @@
       <w:pPr>
         <w:pStyle w:val="Heading2"/>
       </w:pPr>
-      <w:bookmarkStart w:id="84" w:name="_Toc241910102"/>
+      <w:bookmarkStart w:id="84" w:name="_Toc241916459"/>
       <w:r>
         <w:t>6.1. Kiểm tra kết nối không cần giao diện</w:t>
       </w:r>
@@ -24789,7 +25108,7 @@
       <w:pPr>
         <w:pStyle w:val="Heading2"/>
       </w:pPr>
-      <w:bookmarkStart w:id="85" w:name="_Toc241910103"/>
+      <w:bookmarkStart w:id="85" w:name="_Toc241916460"/>
       <w:r>
         <w:t>6.2. Lỗi thường gặp</w:t>
       </w:r>
@@ -24799,7 +25118,7 @@
       <w:pPr>
         <w:pStyle w:val="TableCaption"/>
       </w:pPr>
-      <w:bookmarkStart w:id="86" w:name="_Toc241910135"/>
+      <w:bookmarkStart w:id="86" w:name="_Toc241916492"/>
       <w:r>
         <w:t>Bảng 6.1. Lỗi thường gặp và cách xử lý</w:t>
       </w:r>
@@ -25823,7 +26142,8 @@
               <w:rPr>
                 <w:sz w:val="19"/>
               </w:rPr>
-              <w:t>Trang Tổng quan: buổi học hôm nay, doanh thu tháng này bằng 0 hoặc lệch ngày</w:t>
+              <w:lastRenderedPageBreak/>
+              <w:t>Trang Tổng quan: buổi học hôm nay, doanh thu tháng này bằng 0; lịch học tuần này trống</w:t>
             </w:r>
           </w:p>
         </w:tc>
@@ -25851,7 +26171,7 @@
               <w:rPr>
                 <w:sz w:val="19"/>
               </w:rPr>
-              <w:t>Dữ liệu mẫu đã cũ; container SQL Server chạy giờ UTC</w:t>
+              <w:t>Dữ liệu mẫu đã cũ (ngày tính theo lần chạy script khởi tạo)</w:t>
             </w:r>
           </w:p>
         </w:tc>
@@ -25879,46 +26199,7 @@
               <w:rPr>
                 <w:sz w:val="19"/>
               </w:rPr>
-              <w:t xml:space="preserve">Chạy lại bước khởi tạo CSDL (mục 2.4). Container tạo bằng </w:t>
-            </w:r>
-            <w:r>
-              <w:rPr>
-                <w:color w:val="C7254E"/>
-                <w:sz w:val="19"/>
-              </w:rPr>
-              <w:t>docker run</w:t>
-            </w:r>
-            <w:r>
-              <w:rPr>
-                <w:sz w:val="19"/>
-              </w:rPr>
-              <w:t xml:space="preserve"> cần thêm </w:t>
-            </w:r>
-            <w:r>
-              <w:rPr>
-                <w:color w:val="C7254E"/>
-                <w:sz w:val="19"/>
-              </w:rPr>
-              <w:t>-e TZ=Asia/Ho_Chi_Minh</w:t>
-            </w:r>
-            <w:r>
-              <w:rPr>
-                <w:sz w:val="19"/>
-              </w:rPr>
-              <w:t xml:space="preserve"> (</w:t>
-            </w:r>
-            <w:r>
-              <w:rPr>
-                <w:color w:val="C7254E"/>
-                <w:sz w:val="19"/>
-              </w:rPr>
-              <w:t>docker-compose.yml</w:t>
-            </w:r>
-            <w:r>
-              <w:rPr>
-                <w:sz w:val="19"/>
-              </w:rPr>
-              <w:t xml:space="preserve"> đã đặt sẵn).</w:t>
+              <w:t>Chạy lại bước khởi tạo CSDL (mục 2.4).</w:t>
             </w:r>
           </w:p>
         </w:tc>
@@ -25951,10 +26232,9 @@
             </w:pPr>
             <w:r>
               <w:rPr>
-                <w:b/>
                 <w:sz w:val="19"/>
               </w:rPr>
-              <w:t>Bạn không có quyền thực hiện thao tác này (SQL Server từ chối)</w:t>
+              <w:t>Giờ tạo tài khoản, giờ đăng nhập cuối lệch vài tiếng</w:t>
             </w:r>
           </w:p>
         </w:tc>
@@ -25983,7 +26263,7 @@
               <w:rPr>
                 <w:sz w:val="19"/>
               </w:rPr>
-              <w:t>Vai trò không được phép thao tác đó</w:t>
+              <w:t>Thời điểm được lưu theo giờ UTC và hiển thị theo múi giờ của máy chạy ứng dụng</w:t>
             </w:r>
           </w:p>
         </w:tc>
@@ -26012,7 +26292,7 @@
               <w:rPr>
                 <w:sz w:val="19"/>
               </w:rPr>
-              <w:t>Đăng nhập bằng tài khoản có vai trò phù hợp (Bảng 1.1).</w:t>
+              <w:t>Kiểm tra cài đặt múi giờ (time zone) của máy tính.</w:t>
             </w:r>
           </w:p>
         </w:tc>
@@ -26047,7 +26327,7 @@
                 <w:b/>
                 <w:sz w:val="19"/>
               </w:rPr>
-              <w:t>Học viên đang có dữ liệu ghi danh, không thể xóa</w:t>
+              <w:t>Bạn không có quyền thực hiện thao tác này (SQL Server từ chối)</w:t>
             </w:r>
           </w:p>
         </w:tc>
@@ -26075,7 +26355,7 @@
               <w:rPr>
                 <w:sz w:val="19"/>
               </w:rPr>
-              <w:t>Học viên đã ghi danh lớp</w:t>
+              <w:t>Vai trò không được phép thao tác đó</w:t>
             </w:r>
           </w:p>
         </w:tc>
@@ -26103,20 +26383,7 @@
               <w:rPr>
                 <w:sz w:val="19"/>
               </w:rPr>
-              <w:t xml:space="preserve">Không xóa; sửa trạng thái học viên thành </w:t>
-            </w:r>
-            <w:r>
-              <w:rPr>
-                <w:b/>
-                <w:sz w:val="19"/>
-              </w:rPr>
-              <w:t>Ngừng học</w:t>
-            </w:r>
-            <w:r>
-              <w:rPr>
-                <w:sz w:val="19"/>
-              </w:rPr>
-              <w:t xml:space="preserve"> (mục 5.2.4).</w:t>
+              <w:t>Đăng nhập bằng tài khoản có vai trò phù hợp (Bảng 1.1).</w:t>
             </w:r>
           </w:p>
         </w:tc>
@@ -26149,119 +26416,81 @@
             </w:pPr>
             <w:r>
               <w:rPr>
+                <w:b/>
                 <w:sz w:val="19"/>
               </w:rPr>
-              <w:t xml:space="preserve">Script </w:t>
-            </w:r>
-            <w:r>
-              <w:rPr>
-                <w:color w:val="C7254E"/>
+              <w:t>Học viên đang có dữ liệu ghi danh, không thể xóa</w:t>
+            </w:r>
+          </w:p>
+        </w:tc>
+        <w:tc>
+          <w:tcPr>
+            <w:tcW w:w="2381" w:type="dxa"/>
+            <w:tcBorders>
+              <w:top w:val="single" w:sz="4" w:space="0" w:color="BFBFBF"/>
+              <w:left w:val="single" w:sz="4" w:space="0" w:color="BFBFBF"/>
+              <w:bottom w:val="single" w:sz="4" w:space="0" w:color="BFBFBF"/>
+              <w:right w:val="single" w:sz="4" w:space="0" w:color="BFBFBF"/>
+            </w:tcBorders>
+            <w:shd w:val="clear" w:color="auto" w:fill="F5F8FC"/>
+            <w:tcMar>
+              <w:top w:w="40" w:type="dxa"/>
+              <w:left w:w="100" w:type="dxa"/>
+              <w:bottom w:w="40" w:type="dxa"/>
+              <w:right w:w="100" w:type="dxa"/>
+            </w:tcMar>
+          </w:tcPr>
+          <w:p>
+            <w:pPr>
+              <w:spacing w:line="252" w:lineRule="auto"/>
+            </w:pPr>
+            <w:r>
+              <w:rPr>
                 <w:sz w:val="19"/>
               </w:rPr>
-              <w:t>db_init</w:t>
-            </w:r>
+              <w:t>Học viên đã ghi danh lớp</w:t>
+            </w:r>
+          </w:p>
+        </w:tc>
+        <w:tc>
+          <w:tcPr>
+            <w:tcW w:w="4082" w:type="dxa"/>
+            <w:tcBorders>
+              <w:top w:val="single" w:sz="4" w:space="0" w:color="BFBFBF"/>
+              <w:left w:val="single" w:sz="4" w:space="0" w:color="BFBFBF"/>
+              <w:bottom w:val="single" w:sz="4" w:space="0" w:color="BFBFBF"/>
+              <w:right w:val="single" w:sz="4" w:space="0" w:color="BFBFBF"/>
+            </w:tcBorders>
+            <w:shd w:val="clear" w:color="auto" w:fill="F5F8FC"/>
+            <w:tcMar>
+              <w:top w:w="40" w:type="dxa"/>
+              <w:left w:w="100" w:type="dxa"/>
+              <w:bottom w:w="40" w:type="dxa"/>
+              <w:right w:w="100" w:type="dxa"/>
+            </w:tcMar>
+          </w:tcPr>
+          <w:p>
+            <w:pPr>
+              <w:spacing w:line="252" w:lineRule="auto"/>
+            </w:pPr>
             <w:r>
               <w:rPr>
                 <w:sz w:val="19"/>
               </w:rPr>
-              <w:t xml:space="preserve"> dừng giữa chừng</w:t>
-            </w:r>
-          </w:p>
-        </w:tc>
-        <w:tc>
-          <w:tcPr>
-            <w:tcW w:w="2381" w:type="dxa"/>
-            <w:tcBorders>
-              <w:top w:val="single" w:sz="4" w:space="0" w:color="BFBFBF"/>
-              <w:left w:val="single" w:sz="4" w:space="0" w:color="BFBFBF"/>
-              <w:bottom w:val="single" w:sz="4" w:space="0" w:color="BFBFBF"/>
-              <w:right w:val="single" w:sz="4" w:space="0" w:color="BFBFBF"/>
-            </w:tcBorders>
-            <w:shd w:val="clear" w:color="auto" w:fill="F5F8FC"/>
-            <w:tcMar>
-              <w:top w:w="40" w:type="dxa"/>
-              <w:left w:w="100" w:type="dxa"/>
-              <w:bottom w:w="40" w:type="dxa"/>
-              <w:right w:w="100" w:type="dxa"/>
-            </w:tcMar>
-          </w:tcPr>
-          <w:p>
-            <w:pPr>
-              <w:spacing w:line="252" w:lineRule="auto"/>
-            </w:pPr>
-            <w:r>
-              <w:rPr>
+              <w:t xml:space="preserve">Không xóa; sửa trạng thái học viên thành </w:t>
+            </w:r>
+            <w:r>
+              <w:rPr>
+                <w:b/>
                 <w:sz w:val="19"/>
               </w:rPr>
-              <w:t xml:space="preserve">Sai mật khẩu </w:t>
-            </w:r>
-            <w:r>
-              <w:rPr>
-                <w:color w:val="C7254E"/>
+              <w:t>Ngừng học</w:t>
+            </w:r>
+            <w:r>
+              <w:rPr>
                 <w:sz w:val="19"/>
               </w:rPr>
-              <w:t>sa</w:t>
-            </w:r>
-            <w:r>
-              <w:rPr>
-                <w:sz w:val="19"/>
-              </w:rPr>
-              <w:t>; SQL Server chưa khởi động xong; chạy không phải từ thư mục mã nguồn</w:t>
-            </w:r>
-          </w:p>
-        </w:tc>
-        <w:tc>
-          <w:tcPr>
-            <w:tcW w:w="4082" w:type="dxa"/>
-            <w:tcBorders>
-              <w:top w:val="single" w:sz="4" w:space="0" w:color="BFBFBF"/>
-              <w:left w:val="single" w:sz="4" w:space="0" w:color="BFBFBF"/>
-              <w:bottom w:val="single" w:sz="4" w:space="0" w:color="BFBFBF"/>
-              <w:right w:val="single" w:sz="4" w:space="0" w:color="BFBFBF"/>
-            </w:tcBorders>
-            <w:shd w:val="clear" w:color="auto" w:fill="F5F8FC"/>
-            <w:tcMar>
-              <w:top w:w="40" w:type="dxa"/>
-              <w:left w:w="100" w:type="dxa"/>
-              <w:bottom w:w="40" w:type="dxa"/>
-              <w:right w:w="100" w:type="dxa"/>
-            </w:tcMar>
-          </w:tcPr>
-          <w:p>
-            <w:pPr>
-              <w:spacing w:line="252" w:lineRule="auto"/>
-            </w:pPr>
-            <w:r>
-              <w:rPr>
-                <w:sz w:val="19"/>
-              </w:rPr>
-              <w:t xml:space="preserve">Chờ 20-30 giây sau </w:t>
-            </w:r>
-            <w:r>
-              <w:rPr>
-                <w:color w:val="C7254E"/>
-                <w:sz w:val="19"/>
-              </w:rPr>
-              <w:t>docker compose up -d</w:t>
-            </w:r>
-            <w:r>
-              <w:rPr>
-                <w:sz w:val="19"/>
-              </w:rPr>
-              <w:t xml:space="preserve"> rồi chạy lại; kiểm tra mật khẩu trong </w:t>
-            </w:r>
-            <w:r>
-              <w:rPr>
-                <w:color w:val="C7254E"/>
-                <w:sz w:val="19"/>
-              </w:rPr>
-              <w:t>.env</w:t>
-            </w:r>
-            <w:r>
-              <w:rPr>
-                <w:sz w:val="19"/>
-              </w:rPr>
-              <w:t>; đứng ở thư mục gốc mã nguồn.</w:t>
+              <w:t xml:space="preserve"> (mục 5.2.4).</w:t>
             </w:r>
           </w:p>
         </w:tc>
@@ -26295,13 +26524,156 @@
               <w:rPr>
                 <w:sz w:val="19"/>
               </w:rPr>
-              <w:t xml:space="preserve">Chữ tiếng Việt bị lỗi khi tự chạy script bằng </w:t>
+              <w:t xml:space="preserve">Script </w:t>
             </w:r>
             <w:r>
               <w:rPr>
                 <w:color w:val="C7254E"/>
                 <w:sz w:val="19"/>
               </w:rPr>
+              <w:t>db_init</w:t>
+            </w:r>
+            <w:r>
+              <w:rPr>
+                <w:sz w:val="19"/>
+              </w:rPr>
+              <w:t xml:space="preserve"> dừng giữa chừng</w:t>
+            </w:r>
+          </w:p>
+        </w:tc>
+        <w:tc>
+          <w:tcPr>
+            <w:tcW w:w="2381" w:type="dxa"/>
+            <w:tcBorders>
+              <w:top w:val="single" w:sz="4" w:space="0" w:color="BFBFBF"/>
+              <w:left w:val="single" w:sz="4" w:space="0" w:color="BFBFBF"/>
+              <w:bottom w:val="single" w:sz="4" w:space="0" w:color="BFBFBF"/>
+              <w:right w:val="single" w:sz="4" w:space="0" w:color="BFBFBF"/>
+            </w:tcBorders>
+            <w:tcMar>
+              <w:top w:w="40" w:type="dxa"/>
+              <w:left w:w="100" w:type="dxa"/>
+              <w:bottom w:w="40" w:type="dxa"/>
+              <w:right w:w="100" w:type="dxa"/>
+            </w:tcMar>
+          </w:tcPr>
+          <w:p>
+            <w:pPr>
+              <w:spacing w:line="252" w:lineRule="auto"/>
+            </w:pPr>
+            <w:r>
+              <w:rPr>
+                <w:sz w:val="19"/>
+              </w:rPr>
+              <w:t xml:space="preserve">Sai mật khẩu </w:t>
+            </w:r>
+            <w:r>
+              <w:rPr>
+                <w:color w:val="C7254E"/>
+                <w:sz w:val="19"/>
+              </w:rPr>
+              <w:t>sa</w:t>
+            </w:r>
+            <w:r>
+              <w:rPr>
+                <w:sz w:val="19"/>
+              </w:rPr>
+              <w:t>; SQL Server chưa khởi động xong; chạy không phải từ thư mục mã nguồn</w:t>
+            </w:r>
+          </w:p>
+        </w:tc>
+        <w:tc>
+          <w:tcPr>
+            <w:tcW w:w="4082" w:type="dxa"/>
+            <w:tcBorders>
+              <w:top w:val="single" w:sz="4" w:space="0" w:color="BFBFBF"/>
+              <w:left w:val="single" w:sz="4" w:space="0" w:color="BFBFBF"/>
+              <w:bottom w:val="single" w:sz="4" w:space="0" w:color="BFBFBF"/>
+              <w:right w:val="single" w:sz="4" w:space="0" w:color="BFBFBF"/>
+            </w:tcBorders>
+            <w:tcMar>
+              <w:top w:w="40" w:type="dxa"/>
+              <w:left w:w="100" w:type="dxa"/>
+              <w:bottom w:w="40" w:type="dxa"/>
+              <w:right w:w="100" w:type="dxa"/>
+            </w:tcMar>
+          </w:tcPr>
+          <w:p>
+            <w:pPr>
+              <w:spacing w:line="252" w:lineRule="auto"/>
+            </w:pPr>
+            <w:r>
+              <w:rPr>
+                <w:sz w:val="19"/>
+              </w:rPr>
+              <w:t xml:space="preserve">Chờ 20-30 giây sau </w:t>
+            </w:r>
+            <w:r>
+              <w:rPr>
+                <w:color w:val="C7254E"/>
+                <w:sz w:val="19"/>
+              </w:rPr>
+              <w:t>docker compose up -d</w:t>
+            </w:r>
+            <w:r>
+              <w:rPr>
+                <w:sz w:val="19"/>
+              </w:rPr>
+              <w:t xml:space="preserve"> rồi chạy lại; kiểm tra mật khẩu trong </w:t>
+            </w:r>
+            <w:r>
+              <w:rPr>
+                <w:color w:val="C7254E"/>
+                <w:sz w:val="19"/>
+              </w:rPr>
+              <w:t>.env</w:t>
+            </w:r>
+            <w:r>
+              <w:rPr>
+                <w:sz w:val="19"/>
+              </w:rPr>
+              <w:t>; đứng ở thư mục gốc mã nguồn.</w:t>
+            </w:r>
+          </w:p>
+        </w:tc>
+      </w:tr>
+      <w:tr>
+        <w:trPr>
+          <w:cantSplit/>
+          <w:jc w:val="center"/>
+        </w:trPr>
+        <w:tc>
+          <w:tcPr>
+            <w:tcW w:w="2608" w:type="dxa"/>
+            <w:tcBorders>
+              <w:top w:val="single" w:sz="4" w:space="0" w:color="BFBFBF"/>
+              <w:left w:val="single" w:sz="4" w:space="0" w:color="BFBFBF"/>
+              <w:bottom w:val="single" w:sz="4" w:space="0" w:color="BFBFBF"/>
+              <w:right w:val="single" w:sz="4" w:space="0" w:color="BFBFBF"/>
+            </w:tcBorders>
+            <w:shd w:val="clear" w:color="auto" w:fill="F5F8FC"/>
+            <w:tcMar>
+              <w:top w:w="40" w:type="dxa"/>
+              <w:left w:w="100" w:type="dxa"/>
+              <w:bottom w:w="40" w:type="dxa"/>
+              <w:right w:w="100" w:type="dxa"/>
+            </w:tcMar>
+          </w:tcPr>
+          <w:p>
+            <w:pPr>
+              <w:spacing w:line="252" w:lineRule="auto"/>
+            </w:pPr>
+            <w:r>
+              <w:rPr>
+                <w:sz w:val="19"/>
+              </w:rPr>
+              <w:t xml:space="preserve">Chữ tiếng Việt bị lỗi khi tự chạy script bằng </w:t>
+            </w:r>
+            <w:r>
+              <w:rPr>
+                <w:color w:val="C7254E"/>
+                <w:sz w:val="19"/>
+              </w:rPr>
               <w:t>sqlcmd</w:t>
             </w:r>
           </w:p>
@@ -26315,6 +26687,7 @@
               <w:bottom w:val="single" w:sz="4" w:space="0" w:color="BFBFBF"/>
               <w:right w:val="single" w:sz="4" w:space="0" w:color="BFBFBF"/>
             </w:tcBorders>
+            <w:shd w:val="clear" w:color="auto" w:fill="F5F8FC"/>
             <w:tcMar>
               <w:top w:w="40" w:type="dxa"/>
               <w:left w:w="100" w:type="dxa"/>
@@ -26343,6 +26716,7 @@
               <w:bottom w:val="single" w:sz="4" w:space="0" w:color="BFBFBF"/>
               <w:right w:val="single" w:sz="4" w:space="0" w:color="BFBFBF"/>
             </w:tcBorders>
+            <w:shd w:val="clear" w:color="auto" w:fill="F5F8FC"/>
             <w:tcMar>
               <w:top w:w="40" w:type="dxa"/>
               <w:left w:w="100" w:type="dxa"/>
@@ -26481,7 +26855,7 @@
       <w:pPr>
         <w:pStyle w:val="Heading2"/>
       </w:pPr>
-      <w:bookmarkStart w:id="87" w:name="_Toc241910104"/>
+      <w:bookmarkStart w:id="87" w:name="_Toc241916461"/>
       <w:r>
         <w:t>6.3. Khi cần hỗ trợ thêm</w:t>
       </w:r>
@@ -26529,8 +26903,9 @@
         <w:pStyle w:val="Heading1"/>
         <w:pageBreakBefore/>
       </w:pPr>
-      <w:bookmarkStart w:id="88" w:name="_Toc241910105"/>
-      <w:r>
+      <w:bookmarkStart w:id="88" w:name="_Toc241916462"/>
+      <w:r>
+        <w:lastRenderedPageBreak/>
         <w:t>PHỤ LỤC A. TÓM TẮT LỆNH</w:t>
       </w:r>
       <w:bookmarkEnd w:id="88"/>
@@ -27255,8 +27630,9 @@
         <w:pStyle w:val="Heading1"/>
         <w:pageBreakBefore/>
       </w:pPr>
-      <w:bookmarkStart w:id="89" w:name="_Toc241910106"/>
-      <w:r>
+      <w:bookmarkStart w:id="89" w:name="_Toc241916463"/>
+      <w:r>
+        <w:lastRenderedPageBreak/>
         <w:t>PHỤ LỤC B. CÁC MỤC CẦN BỔ SUNG</w:t>
       </w:r>
       <w:bookmarkEnd w:id="89"/>
@@ -29164,6 +29540,7 @@
               <w:rPr>
                 <w:sz w:val="19"/>
               </w:rPr>
+              <w:lastRenderedPageBreak/>
               <w:t>13</w:t>
             </w:r>
           </w:p>

</xml_diff>

<commit_message>
docs(user-guide): document the account and enrollment rules of the procedures
The review fixes merged into develop added rules that a manager or academic
staff member meets when running the procedures in SSMS: a transfer applies
the tuition of the new class and is refused when the student paid more
(50028), attendance of a finished class is locked (50046), usp_Account_Lock
needs an explicit 1 or 0 (50068) and usernames may not contain diacritics.

Section 5.9 now shows how to create, lock, unlock and reset an account
(example checked as ql_quan in a rolled-back transaction) with the username,
role and lock rules; the role codes are read from ROLE_CODES. Section 5.11
gets table 5.4 with the rules checked when enrolling, transferring, taking
attendance and entering grades. Screenshots are unchanged: the new run only
differed in the remembered username of the login screen.
</commit_message>
<xml_diff>
--- a/docs/user-guide/QLTTTA_User_Guide.docx
+++ b/docs/user-guide/QLTTTA_User_Guide.docx
@@ -1402,7 +1402,7 @@
       <w:r>
         <w:fldChar w:fldCharType="separate"/>
       </w:r>
-      <w:hyperlink w:anchor="_Toc241916403" w:history="1">
+      <w:hyperlink w:anchor="_Toc241958177" w:history="1">
         <w:r>
           <w:rPr>
             <w:rStyle w:val="Hyperlink"/>
@@ -1429,7 +1429,7 @@
             <w:noProof/>
             <w:webHidden/>
           </w:rPr>
-          <w:instrText xml:space="preserve"> PAGEREF _Toc241916403 \h </w:instrText>
+          <w:instrText xml:space="preserve"> PAGEREF _Toc241958177 \h </w:instrText>
         </w:r>
         <w:r>
           <w:rPr>
@@ -1476,7 +1476,7 @@
           <w14:ligatures w14:val="standardContextual"/>
         </w:rPr>
       </w:pPr>
-      <w:hyperlink w:anchor="_Toc241916404" w:history="1">
+      <w:hyperlink w:anchor="_Toc241958178" w:history="1">
         <w:r>
           <w:rPr>
             <w:rStyle w:val="Hyperlink"/>
@@ -1503,7 +1503,7 @@
             <w:noProof/>
             <w:webHidden/>
           </w:rPr>
-          <w:instrText xml:space="preserve"> PAGEREF _Toc241916404 \h </w:instrText>
+          <w:instrText xml:space="preserve"> PAGEREF _Toc241958178 \h </w:instrText>
         </w:r>
         <w:r>
           <w:rPr>
@@ -1550,7 +1550,7 @@
           <w14:ligatures w14:val="standardContextual"/>
         </w:rPr>
       </w:pPr>
-      <w:hyperlink w:anchor="_Toc241916405" w:history="1">
+      <w:hyperlink w:anchor="_Toc241958179" w:history="1">
         <w:r>
           <w:rPr>
             <w:rStyle w:val="Hyperlink"/>
@@ -1577,7 +1577,7 @@
             <w:noProof/>
             <w:webHidden/>
           </w:rPr>
-          <w:instrText xml:space="preserve"> PAGEREF _Toc241916405 \h </w:instrText>
+          <w:instrText xml:space="preserve"> PAGEREF _Toc241958179 \h </w:instrText>
         </w:r>
         <w:r>
           <w:rPr>
@@ -1624,7 +1624,7 @@
           <w14:ligatures w14:val="standardContextual"/>
         </w:rPr>
       </w:pPr>
-      <w:hyperlink w:anchor="_Toc241916406" w:history="1">
+      <w:hyperlink w:anchor="_Toc241958180" w:history="1">
         <w:r>
           <w:rPr>
             <w:rStyle w:val="Hyperlink"/>
@@ -1651,7 +1651,7 @@
             <w:noProof/>
             <w:webHidden/>
           </w:rPr>
-          <w:instrText xml:space="preserve"> PAGEREF _Toc241916406 \h </w:instrText>
+          <w:instrText xml:space="preserve"> PAGEREF _Toc241958180 \h </w:instrText>
         </w:r>
         <w:r>
           <w:rPr>
@@ -1698,7 +1698,7 @@
           <w14:ligatures w14:val="standardContextual"/>
         </w:rPr>
       </w:pPr>
-      <w:hyperlink w:anchor="_Toc241916407" w:history="1">
+      <w:hyperlink w:anchor="_Toc241958181" w:history="1">
         <w:r>
           <w:rPr>
             <w:rStyle w:val="Hyperlink"/>
@@ -1725,7 +1725,7 @@
             <w:noProof/>
             <w:webHidden/>
           </w:rPr>
-          <w:instrText xml:space="preserve"> PAGEREF _Toc241916407 \h </w:instrText>
+          <w:instrText xml:space="preserve"> PAGEREF _Toc241958181 \h </w:instrText>
         </w:r>
         <w:r>
           <w:rPr>
@@ -1772,7 +1772,7 @@
           <w14:ligatures w14:val="standardContextual"/>
         </w:rPr>
       </w:pPr>
-      <w:hyperlink w:anchor="_Toc241916408" w:history="1">
+      <w:hyperlink w:anchor="_Toc241958182" w:history="1">
         <w:r>
           <w:rPr>
             <w:rStyle w:val="Hyperlink"/>
@@ -1799,7 +1799,7 @@
             <w:noProof/>
             <w:webHidden/>
           </w:rPr>
-          <w:instrText xml:space="preserve"> PAGEREF _Toc241916408 \h </w:instrText>
+          <w:instrText xml:space="preserve"> PAGEREF _Toc241958182 \h </w:instrText>
         </w:r>
         <w:r>
           <w:rPr>
@@ -1846,7 +1846,7 @@
           <w14:ligatures w14:val="standardContextual"/>
         </w:rPr>
       </w:pPr>
-      <w:hyperlink w:anchor="_Toc241916409" w:history="1">
+      <w:hyperlink w:anchor="_Toc241958183" w:history="1">
         <w:r>
           <w:rPr>
             <w:rStyle w:val="Hyperlink"/>
@@ -1873,7 +1873,7 @@
             <w:noProof/>
             <w:webHidden/>
           </w:rPr>
-          <w:instrText xml:space="preserve"> PAGEREF _Toc241916409 \h </w:instrText>
+          <w:instrText xml:space="preserve"> PAGEREF _Toc241958183 \h </w:instrText>
         </w:r>
         <w:r>
           <w:rPr>
@@ -1920,7 +1920,7 @@
           <w14:ligatures w14:val="standardContextual"/>
         </w:rPr>
       </w:pPr>
-      <w:hyperlink w:anchor="_Toc241916410" w:history="1">
+      <w:hyperlink w:anchor="_Toc241958184" w:history="1">
         <w:r>
           <w:rPr>
             <w:rStyle w:val="Hyperlink"/>
@@ -1947,7 +1947,7 @@
             <w:noProof/>
             <w:webHidden/>
           </w:rPr>
-          <w:instrText xml:space="preserve"> PAGEREF _Toc241916410 \h </w:instrText>
+          <w:instrText xml:space="preserve"> PAGEREF _Toc241958184 \h </w:instrText>
         </w:r>
         <w:r>
           <w:rPr>
@@ -1994,7 +1994,7 @@
           <w14:ligatures w14:val="standardContextual"/>
         </w:rPr>
       </w:pPr>
-      <w:hyperlink w:anchor="_Toc241916411" w:history="1">
+      <w:hyperlink w:anchor="_Toc241958185" w:history="1">
         <w:r>
           <w:rPr>
             <w:rStyle w:val="Hyperlink"/>
@@ -2021,7 +2021,7 @@
             <w:noProof/>
             <w:webHidden/>
           </w:rPr>
-          <w:instrText xml:space="preserve"> PAGEREF _Toc241916411 \h </w:instrText>
+          <w:instrText xml:space="preserve"> PAGEREF _Toc241958185 \h </w:instrText>
         </w:r>
         <w:r>
           <w:rPr>
@@ -2068,7 +2068,7 @@
           <w14:ligatures w14:val="standardContextual"/>
         </w:rPr>
       </w:pPr>
-      <w:hyperlink w:anchor="_Toc241916412" w:history="1">
+      <w:hyperlink w:anchor="_Toc241958186" w:history="1">
         <w:r>
           <w:rPr>
             <w:rStyle w:val="Hyperlink"/>
@@ -2095,7 +2095,7 @@
             <w:noProof/>
             <w:webHidden/>
           </w:rPr>
-          <w:instrText xml:space="preserve"> PAGEREF _Toc241916412 \h </w:instrText>
+          <w:instrText xml:space="preserve"> PAGEREF _Toc241958186 \h </w:instrText>
         </w:r>
         <w:r>
           <w:rPr>
@@ -2142,7 +2142,7 @@
           <w14:ligatures w14:val="standardContextual"/>
         </w:rPr>
       </w:pPr>
-      <w:hyperlink w:anchor="_Toc241916413" w:history="1">
+      <w:hyperlink w:anchor="_Toc241958187" w:history="1">
         <w:r>
           <w:rPr>
             <w:rStyle w:val="Hyperlink"/>
@@ -2169,7 +2169,7 @@
             <w:noProof/>
             <w:webHidden/>
           </w:rPr>
-          <w:instrText xml:space="preserve"> PAGEREF _Toc241916413 \h </w:instrText>
+          <w:instrText xml:space="preserve"> PAGEREF _Toc241958187 \h </w:instrText>
         </w:r>
         <w:r>
           <w:rPr>
@@ -2216,7 +2216,7 @@
           <w14:ligatures w14:val="standardContextual"/>
         </w:rPr>
       </w:pPr>
-      <w:hyperlink w:anchor="_Toc241916414" w:history="1">
+      <w:hyperlink w:anchor="_Toc241958188" w:history="1">
         <w:r>
           <w:rPr>
             <w:rStyle w:val="Hyperlink"/>
@@ -2243,7 +2243,7 @@
             <w:noProof/>
             <w:webHidden/>
           </w:rPr>
-          <w:instrText xml:space="preserve"> PAGEREF _Toc241916414 \h </w:instrText>
+          <w:instrText xml:space="preserve"> PAGEREF _Toc241958188 \h </w:instrText>
         </w:r>
         <w:r>
           <w:rPr>
@@ -2290,7 +2290,7 @@
           <w14:ligatures w14:val="standardContextual"/>
         </w:rPr>
       </w:pPr>
-      <w:hyperlink w:anchor="_Toc241916415" w:history="1">
+      <w:hyperlink w:anchor="_Toc241958189" w:history="1">
         <w:r>
           <w:rPr>
             <w:rStyle w:val="Hyperlink"/>
@@ -2317,7 +2317,7 @@
             <w:noProof/>
             <w:webHidden/>
           </w:rPr>
-          <w:instrText xml:space="preserve"> PAGEREF _Toc241916415 \h </w:instrText>
+          <w:instrText xml:space="preserve"> PAGEREF _Toc241958189 \h </w:instrText>
         </w:r>
         <w:r>
           <w:rPr>
@@ -2364,7 +2364,7 @@
           <w14:ligatures w14:val="standardContextual"/>
         </w:rPr>
       </w:pPr>
-      <w:hyperlink w:anchor="_Toc241916416" w:history="1">
+      <w:hyperlink w:anchor="_Toc241958190" w:history="1">
         <w:r>
           <w:rPr>
             <w:rStyle w:val="Hyperlink"/>
@@ -2391,7 +2391,7 @@
             <w:noProof/>
             <w:webHidden/>
           </w:rPr>
-          <w:instrText xml:space="preserve"> PAGEREF _Toc241916416 \h </w:instrText>
+          <w:instrText xml:space="preserve"> PAGEREF _Toc241958190 \h </w:instrText>
         </w:r>
         <w:r>
           <w:rPr>
@@ -2438,7 +2438,7 @@
           <w14:ligatures w14:val="standardContextual"/>
         </w:rPr>
       </w:pPr>
-      <w:hyperlink w:anchor="_Toc241916417" w:history="1">
+      <w:hyperlink w:anchor="_Toc241958191" w:history="1">
         <w:r>
           <w:rPr>
             <w:rStyle w:val="Hyperlink"/>
@@ -2465,7 +2465,7 @@
             <w:noProof/>
             <w:webHidden/>
           </w:rPr>
-          <w:instrText xml:space="preserve"> PAGEREF _Toc241916417 \h </w:instrText>
+          <w:instrText xml:space="preserve"> PAGEREF _Toc241958191 \h </w:instrText>
         </w:r>
         <w:r>
           <w:rPr>
@@ -2512,7 +2512,7 @@
           <w14:ligatures w14:val="standardContextual"/>
         </w:rPr>
       </w:pPr>
-      <w:hyperlink w:anchor="_Toc241916418" w:history="1">
+      <w:hyperlink w:anchor="_Toc241958192" w:history="1">
         <w:r>
           <w:rPr>
             <w:rStyle w:val="Hyperlink"/>
@@ -2539,7 +2539,7 @@
             <w:noProof/>
             <w:webHidden/>
           </w:rPr>
-          <w:instrText xml:space="preserve"> PAGEREF _Toc241916418 \h </w:instrText>
+          <w:instrText xml:space="preserve"> PAGEREF _Toc241958192 \h </w:instrText>
         </w:r>
         <w:r>
           <w:rPr>
@@ -2586,7 +2586,7 @@
           <w14:ligatures w14:val="standardContextual"/>
         </w:rPr>
       </w:pPr>
-      <w:hyperlink w:anchor="_Toc241916419" w:history="1">
+      <w:hyperlink w:anchor="_Toc241958193" w:history="1">
         <w:r>
           <w:rPr>
             <w:rStyle w:val="Hyperlink"/>
@@ -2613,7 +2613,7 @@
             <w:noProof/>
             <w:webHidden/>
           </w:rPr>
-          <w:instrText xml:space="preserve"> PAGEREF _Toc241916419 \h </w:instrText>
+          <w:instrText xml:space="preserve"> PAGEREF _Toc241958193 \h </w:instrText>
         </w:r>
         <w:r>
           <w:rPr>
@@ -2660,7 +2660,7 @@
           <w14:ligatures w14:val="standardContextual"/>
         </w:rPr>
       </w:pPr>
-      <w:hyperlink w:anchor="_Toc241916420" w:history="1">
+      <w:hyperlink w:anchor="_Toc241958194" w:history="1">
         <w:r>
           <w:rPr>
             <w:rStyle w:val="Hyperlink"/>
@@ -2687,7 +2687,7 @@
             <w:noProof/>
             <w:webHidden/>
           </w:rPr>
-          <w:instrText xml:space="preserve"> PAGEREF _Toc241916420 \h </w:instrText>
+          <w:instrText xml:space="preserve"> PAGEREF _Toc241958194 \h </w:instrText>
         </w:r>
         <w:r>
           <w:rPr>
@@ -2734,7 +2734,7 @@
           <w14:ligatures w14:val="standardContextual"/>
         </w:rPr>
       </w:pPr>
-      <w:hyperlink w:anchor="_Toc241916421" w:history="1">
+      <w:hyperlink w:anchor="_Toc241958195" w:history="1">
         <w:r>
           <w:rPr>
             <w:rStyle w:val="Hyperlink"/>
@@ -2761,7 +2761,7 @@
             <w:noProof/>
             <w:webHidden/>
           </w:rPr>
-          <w:instrText xml:space="preserve"> PAGEREF _Toc241916421 \h </w:instrText>
+          <w:instrText xml:space="preserve"> PAGEREF _Toc241958195 \h </w:instrText>
         </w:r>
         <w:r>
           <w:rPr>
@@ -2808,7 +2808,7 @@
           <w14:ligatures w14:val="standardContextual"/>
         </w:rPr>
       </w:pPr>
-      <w:hyperlink w:anchor="_Toc241916422" w:history="1">
+      <w:hyperlink w:anchor="_Toc241958196" w:history="1">
         <w:r>
           <w:rPr>
             <w:rStyle w:val="Hyperlink"/>
@@ -2835,7 +2835,7 @@
             <w:noProof/>
             <w:webHidden/>
           </w:rPr>
-          <w:instrText xml:space="preserve"> PAGEREF _Toc241916422 \h </w:instrText>
+          <w:instrText xml:space="preserve"> PAGEREF _Toc241958196 \h </w:instrText>
         </w:r>
         <w:r>
           <w:rPr>
@@ -2882,7 +2882,7 @@
           <w14:ligatures w14:val="standardContextual"/>
         </w:rPr>
       </w:pPr>
-      <w:hyperlink w:anchor="_Toc241916423" w:history="1">
+      <w:hyperlink w:anchor="_Toc241958197" w:history="1">
         <w:r>
           <w:rPr>
             <w:rStyle w:val="Hyperlink"/>
@@ -2909,7 +2909,7 @@
             <w:noProof/>
             <w:webHidden/>
           </w:rPr>
-          <w:instrText xml:space="preserve"> PAGEREF _Toc241916423 \h </w:instrText>
+          <w:instrText xml:space="preserve"> PAGEREF _Toc241958197 \h </w:instrText>
         </w:r>
         <w:r>
           <w:rPr>
@@ -2956,7 +2956,7 @@
           <w14:ligatures w14:val="standardContextual"/>
         </w:rPr>
       </w:pPr>
-      <w:hyperlink w:anchor="_Toc241916424" w:history="1">
+      <w:hyperlink w:anchor="_Toc241958198" w:history="1">
         <w:r>
           <w:rPr>
             <w:rStyle w:val="Hyperlink"/>
@@ -2983,7 +2983,7 @@
             <w:noProof/>
             <w:webHidden/>
           </w:rPr>
-          <w:instrText xml:space="preserve"> PAGEREF _Toc241916424 \h </w:instrText>
+          <w:instrText xml:space="preserve"> PAGEREF _Toc241958198 \h </w:instrText>
         </w:r>
         <w:r>
           <w:rPr>
@@ -3030,7 +3030,7 @@
           <w14:ligatures w14:val="standardContextual"/>
         </w:rPr>
       </w:pPr>
-      <w:hyperlink w:anchor="_Toc241916425" w:history="1">
+      <w:hyperlink w:anchor="_Toc241958199" w:history="1">
         <w:r>
           <w:rPr>
             <w:rStyle w:val="Hyperlink"/>
@@ -3057,7 +3057,7 @@
             <w:noProof/>
             <w:webHidden/>
           </w:rPr>
-          <w:instrText xml:space="preserve"> PAGEREF _Toc241916425 \h </w:instrText>
+          <w:instrText xml:space="preserve"> PAGEREF _Toc241958199 \h </w:instrText>
         </w:r>
         <w:r>
           <w:rPr>
@@ -3104,7 +3104,7 @@
           <w14:ligatures w14:val="standardContextual"/>
         </w:rPr>
       </w:pPr>
-      <w:hyperlink w:anchor="_Toc241916426" w:history="1">
+      <w:hyperlink w:anchor="_Toc241958200" w:history="1">
         <w:r>
           <w:rPr>
             <w:rStyle w:val="Hyperlink"/>
@@ -3131,7 +3131,7 @@
             <w:noProof/>
             <w:webHidden/>
           </w:rPr>
-          <w:instrText xml:space="preserve"> PAGEREF _Toc241916426 \h </w:instrText>
+          <w:instrText xml:space="preserve"> PAGEREF _Toc241958200 \h </w:instrText>
         </w:r>
         <w:r>
           <w:rPr>
@@ -3178,7 +3178,7 @@
           <w14:ligatures w14:val="standardContextual"/>
         </w:rPr>
       </w:pPr>
-      <w:hyperlink w:anchor="_Toc241916427" w:history="1">
+      <w:hyperlink w:anchor="_Toc241958201" w:history="1">
         <w:r>
           <w:rPr>
             <w:rStyle w:val="Hyperlink"/>
@@ -3205,7 +3205,7 @@
             <w:noProof/>
             <w:webHidden/>
           </w:rPr>
-          <w:instrText xml:space="preserve"> PAGEREF _Toc241916427 \h </w:instrText>
+          <w:instrText xml:space="preserve"> PAGEREF _Toc241958201 \h </w:instrText>
         </w:r>
         <w:r>
           <w:rPr>
@@ -3252,7 +3252,7 @@
           <w14:ligatures w14:val="standardContextual"/>
         </w:rPr>
       </w:pPr>
-      <w:hyperlink w:anchor="_Toc241916428" w:history="1">
+      <w:hyperlink w:anchor="_Toc241958202" w:history="1">
         <w:r>
           <w:rPr>
             <w:rStyle w:val="Hyperlink"/>
@@ -3279,7 +3279,7 @@
             <w:noProof/>
             <w:webHidden/>
           </w:rPr>
-          <w:instrText xml:space="preserve"> PAGEREF _Toc241916428 \h </w:instrText>
+          <w:instrText xml:space="preserve"> PAGEREF _Toc241958202 \h </w:instrText>
         </w:r>
         <w:r>
           <w:rPr>
@@ -3326,7 +3326,7 @@
           <w14:ligatures w14:val="standardContextual"/>
         </w:rPr>
       </w:pPr>
-      <w:hyperlink w:anchor="_Toc241916429" w:history="1">
+      <w:hyperlink w:anchor="_Toc241958203" w:history="1">
         <w:r>
           <w:rPr>
             <w:rStyle w:val="Hyperlink"/>
@@ -3353,7 +3353,7 @@
             <w:noProof/>
             <w:webHidden/>
           </w:rPr>
-          <w:instrText xml:space="preserve"> PAGEREF _Toc241916429 \h </w:instrText>
+          <w:instrText xml:space="preserve"> PAGEREF _Toc241958203 \h </w:instrText>
         </w:r>
         <w:r>
           <w:rPr>
@@ -3400,7 +3400,7 @@
           <w14:ligatures w14:val="standardContextual"/>
         </w:rPr>
       </w:pPr>
-      <w:hyperlink w:anchor="_Toc241916430" w:history="1">
+      <w:hyperlink w:anchor="_Toc241958204" w:history="1">
         <w:r>
           <w:rPr>
             <w:rStyle w:val="Hyperlink"/>
@@ -3427,7 +3427,7 @@
             <w:noProof/>
             <w:webHidden/>
           </w:rPr>
-          <w:instrText xml:space="preserve"> PAGEREF _Toc241916430 \h </w:instrText>
+          <w:instrText xml:space="preserve"> PAGEREF _Toc241958204 \h </w:instrText>
         </w:r>
         <w:r>
           <w:rPr>
@@ -3474,7 +3474,7 @@
           <w14:ligatures w14:val="standardContextual"/>
         </w:rPr>
       </w:pPr>
-      <w:hyperlink w:anchor="_Toc241916431" w:history="1">
+      <w:hyperlink w:anchor="_Toc241958205" w:history="1">
         <w:r>
           <w:rPr>
             <w:rStyle w:val="Hyperlink"/>
@@ -3501,7 +3501,7 @@
             <w:noProof/>
             <w:webHidden/>
           </w:rPr>
-          <w:instrText xml:space="preserve"> PAGEREF _Toc241916431 \h </w:instrText>
+          <w:instrText xml:space="preserve"> PAGEREF _Toc241958205 \h </w:instrText>
         </w:r>
         <w:r>
           <w:rPr>
@@ -3548,7 +3548,7 @@
           <w14:ligatures w14:val="standardContextual"/>
         </w:rPr>
       </w:pPr>
-      <w:hyperlink w:anchor="_Toc241916432" w:history="1">
+      <w:hyperlink w:anchor="_Toc241958206" w:history="1">
         <w:r>
           <w:rPr>
             <w:rStyle w:val="Hyperlink"/>
@@ -3575,7 +3575,7 @@
             <w:noProof/>
             <w:webHidden/>
           </w:rPr>
-          <w:instrText xml:space="preserve"> PAGEREF _Toc241916432 \h </w:instrText>
+          <w:instrText xml:space="preserve"> PAGEREF _Toc241958206 \h </w:instrText>
         </w:r>
         <w:r>
           <w:rPr>
@@ -3622,7 +3622,7 @@
           <w14:ligatures w14:val="standardContextual"/>
         </w:rPr>
       </w:pPr>
-      <w:hyperlink w:anchor="_Toc241916433" w:history="1">
+      <w:hyperlink w:anchor="_Toc241958207" w:history="1">
         <w:r>
           <w:rPr>
             <w:rStyle w:val="Hyperlink"/>
@@ -3649,7 +3649,7 @@
             <w:noProof/>
             <w:webHidden/>
           </w:rPr>
-          <w:instrText xml:space="preserve"> PAGEREF _Toc241916433 \h </w:instrText>
+          <w:instrText xml:space="preserve"> PAGEREF _Toc241958207 \h </w:instrText>
         </w:r>
         <w:r>
           <w:rPr>
@@ -3696,7 +3696,7 @@
           <w14:ligatures w14:val="standardContextual"/>
         </w:rPr>
       </w:pPr>
-      <w:hyperlink w:anchor="_Toc241916434" w:history="1">
+      <w:hyperlink w:anchor="_Toc241958208" w:history="1">
         <w:r>
           <w:rPr>
             <w:rStyle w:val="Hyperlink"/>
@@ -3723,7 +3723,7 @@
             <w:noProof/>
             <w:webHidden/>
           </w:rPr>
-          <w:instrText xml:space="preserve"> PAGEREF _Toc241916434 \h </w:instrText>
+          <w:instrText xml:space="preserve"> PAGEREF _Toc241958208 \h </w:instrText>
         </w:r>
         <w:r>
           <w:rPr>
@@ -3770,7 +3770,7 @@
           <w14:ligatures w14:val="standardContextual"/>
         </w:rPr>
       </w:pPr>
-      <w:hyperlink w:anchor="_Toc241916435" w:history="1">
+      <w:hyperlink w:anchor="_Toc241958209" w:history="1">
         <w:r>
           <w:rPr>
             <w:rStyle w:val="Hyperlink"/>
@@ -3797,7 +3797,7 @@
             <w:noProof/>
             <w:webHidden/>
           </w:rPr>
-          <w:instrText xml:space="preserve"> PAGEREF _Toc241916435 \h </w:instrText>
+          <w:instrText xml:space="preserve"> PAGEREF _Toc241958209 \h </w:instrText>
         </w:r>
         <w:r>
           <w:rPr>
@@ -3844,7 +3844,7 @@
           <w14:ligatures w14:val="standardContextual"/>
         </w:rPr>
       </w:pPr>
-      <w:hyperlink w:anchor="_Toc241916436" w:history="1">
+      <w:hyperlink w:anchor="_Toc241958210" w:history="1">
         <w:r>
           <w:rPr>
             <w:rStyle w:val="Hyperlink"/>
@@ -3871,7 +3871,7 @@
             <w:noProof/>
             <w:webHidden/>
           </w:rPr>
-          <w:instrText xml:space="preserve"> PAGEREF _Toc241916436 \h </w:instrText>
+          <w:instrText xml:space="preserve"> PAGEREF _Toc241958210 \h </w:instrText>
         </w:r>
         <w:r>
           <w:rPr>
@@ -3918,7 +3918,7 @@
           <w14:ligatures w14:val="standardContextual"/>
         </w:rPr>
       </w:pPr>
-      <w:hyperlink w:anchor="_Toc241916437" w:history="1">
+      <w:hyperlink w:anchor="_Toc241958211" w:history="1">
         <w:r>
           <w:rPr>
             <w:rStyle w:val="Hyperlink"/>
@@ -3945,7 +3945,7 @@
             <w:noProof/>
             <w:webHidden/>
           </w:rPr>
-          <w:instrText xml:space="preserve"> PAGEREF _Toc241916437 \h </w:instrText>
+          <w:instrText xml:space="preserve"> PAGEREF _Toc241958211 \h </w:instrText>
         </w:r>
         <w:r>
           <w:rPr>
@@ -3992,7 +3992,7 @@
           <w14:ligatures w14:val="standardContextual"/>
         </w:rPr>
       </w:pPr>
-      <w:hyperlink w:anchor="_Toc241916438" w:history="1">
+      <w:hyperlink w:anchor="_Toc241958212" w:history="1">
         <w:r>
           <w:rPr>
             <w:rStyle w:val="Hyperlink"/>
@@ -4019,7 +4019,7 @@
             <w:noProof/>
             <w:webHidden/>
           </w:rPr>
-          <w:instrText xml:space="preserve"> PAGEREF _Toc241916438 \h </w:instrText>
+          <w:instrText xml:space="preserve"> PAGEREF _Toc241958212 \h </w:instrText>
         </w:r>
         <w:r>
           <w:rPr>
@@ -4066,7 +4066,7 @@
           <w14:ligatures w14:val="standardContextual"/>
         </w:rPr>
       </w:pPr>
-      <w:hyperlink w:anchor="_Toc241916439" w:history="1">
+      <w:hyperlink w:anchor="_Toc241958213" w:history="1">
         <w:r>
           <w:rPr>
             <w:rStyle w:val="Hyperlink"/>
@@ -4093,7 +4093,7 @@
             <w:noProof/>
             <w:webHidden/>
           </w:rPr>
-          <w:instrText xml:space="preserve"> PAGEREF _Toc241916439 \h </w:instrText>
+          <w:instrText xml:space="preserve"> PAGEREF _Toc241958213 \h </w:instrText>
         </w:r>
         <w:r>
           <w:rPr>
@@ -4140,7 +4140,7 @@
           <w14:ligatures w14:val="standardContextual"/>
         </w:rPr>
       </w:pPr>
-      <w:hyperlink w:anchor="_Toc241916440" w:history="1">
+      <w:hyperlink w:anchor="_Toc241958214" w:history="1">
         <w:r>
           <w:rPr>
             <w:rStyle w:val="Hyperlink"/>
@@ -4167,7 +4167,7 @@
             <w:noProof/>
             <w:webHidden/>
           </w:rPr>
-          <w:instrText xml:space="preserve"> PAGEREF _Toc241916440 \h </w:instrText>
+          <w:instrText xml:space="preserve"> PAGEREF _Toc241958214 \h </w:instrText>
         </w:r>
         <w:r>
           <w:rPr>
@@ -4214,7 +4214,7 @@
           <w14:ligatures w14:val="standardContextual"/>
         </w:rPr>
       </w:pPr>
-      <w:hyperlink w:anchor="_Toc241916441" w:history="1">
+      <w:hyperlink w:anchor="_Toc241958215" w:history="1">
         <w:r>
           <w:rPr>
             <w:rStyle w:val="Hyperlink"/>
@@ -4241,7 +4241,7 @@
             <w:noProof/>
             <w:webHidden/>
           </w:rPr>
-          <w:instrText xml:space="preserve"> PAGEREF _Toc241916441 \h </w:instrText>
+          <w:instrText xml:space="preserve"> PAGEREF _Toc241958215 \h </w:instrText>
         </w:r>
         <w:r>
           <w:rPr>
@@ -4288,7 +4288,7 @@
           <w14:ligatures w14:val="standardContextual"/>
         </w:rPr>
       </w:pPr>
-      <w:hyperlink w:anchor="_Toc241916442" w:history="1">
+      <w:hyperlink w:anchor="_Toc241958216" w:history="1">
         <w:r>
           <w:rPr>
             <w:rStyle w:val="Hyperlink"/>
@@ -4315,7 +4315,7 @@
             <w:noProof/>
             <w:webHidden/>
           </w:rPr>
-          <w:instrText xml:space="preserve"> PAGEREF _Toc241916442 \h </w:instrText>
+          <w:instrText xml:space="preserve"> PAGEREF _Toc241958216 \h </w:instrText>
         </w:r>
         <w:r>
           <w:rPr>
@@ -4362,7 +4362,7 @@
           <w14:ligatures w14:val="standardContextual"/>
         </w:rPr>
       </w:pPr>
-      <w:hyperlink w:anchor="_Toc241916443" w:history="1">
+      <w:hyperlink w:anchor="_Toc241958217" w:history="1">
         <w:r>
           <w:rPr>
             <w:rStyle w:val="Hyperlink"/>
@@ -4389,7 +4389,7 @@
             <w:noProof/>
             <w:webHidden/>
           </w:rPr>
-          <w:instrText xml:space="preserve"> PAGEREF _Toc241916443 \h </w:instrText>
+          <w:instrText xml:space="preserve"> PAGEREF _Toc241958217 \h </w:instrText>
         </w:r>
         <w:r>
           <w:rPr>
@@ -4436,7 +4436,7 @@
           <w14:ligatures w14:val="standardContextual"/>
         </w:rPr>
       </w:pPr>
-      <w:hyperlink w:anchor="_Toc241916444" w:history="1">
+      <w:hyperlink w:anchor="_Toc241958218" w:history="1">
         <w:r>
           <w:rPr>
             <w:rStyle w:val="Hyperlink"/>
@@ -4463,7 +4463,7 @@
             <w:noProof/>
             <w:webHidden/>
           </w:rPr>
-          <w:instrText xml:space="preserve"> PAGEREF _Toc241916444 \h </w:instrText>
+          <w:instrText xml:space="preserve"> PAGEREF _Toc241958218 \h </w:instrText>
         </w:r>
         <w:r>
           <w:rPr>
@@ -4510,7 +4510,7 @@
           <w14:ligatures w14:val="standardContextual"/>
         </w:rPr>
       </w:pPr>
-      <w:hyperlink w:anchor="_Toc241916445" w:history="1">
+      <w:hyperlink w:anchor="_Toc241958219" w:history="1">
         <w:r>
           <w:rPr>
             <w:rStyle w:val="Hyperlink"/>
@@ -4537,7 +4537,7 @@
             <w:noProof/>
             <w:webHidden/>
           </w:rPr>
-          <w:instrText xml:space="preserve"> PAGEREF _Toc241916445 \h </w:instrText>
+          <w:instrText xml:space="preserve"> PAGEREF _Toc241958219 \h </w:instrText>
         </w:r>
         <w:r>
           <w:rPr>
@@ -4584,7 +4584,7 @@
           <w14:ligatures w14:val="standardContextual"/>
         </w:rPr>
       </w:pPr>
-      <w:hyperlink w:anchor="_Toc241916446" w:history="1">
+      <w:hyperlink w:anchor="_Toc241958220" w:history="1">
         <w:r>
           <w:rPr>
             <w:rStyle w:val="Hyperlink"/>
@@ -4611,7 +4611,7 @@
             <w:noProof/>
             <w:webHidden/>
           </w:rPr>
-          <w:instrText xml:space="preserve"> PAGEREF _Toc241916446 \h </w:instrText>
+          <w:instrText xml:space="preserve"> PAGEREF _Toc241958220 \h </w:instrText>
         </w:r>
         <w:r>
           <w:rPr>
@@ -4658,7 +4658,7 @@
           <w14:ligatures w14:val="standardContextual"/>
         </w:rPr>
       </w:pPr>
-      <w:hyperlink w:anchor="_Toc241916447" w:history="1">
+      <w:hyperlink w:anchor="_Toc241958221" w:history="1">
         <w:r>
           <w:rPr>
             <w:rStyle w:val="Hyperlink"/>
@@ -4685,7 +4685,7 @@
             <w:noProof/>
             <w:webHidden/>
           </w:rPr>
-          <w:instrText xml:space="preserve"> PAGEREF _Toc241916447 \h </w:instrText>
+          <w:instrText xml:space="preserve"> PAGEREF _Toc241958221 \h </w:instrText>
         </w:r>
         <w:r>
           <w:rPr>
@@ -4732,7 +4732,7 @@
           <w14:ligatures w14:val="standardContextual"/>
         </w:rPr>
       </w:pPr>
-      <w:hyperlink w:anchor="_Toc241916448" w:history="1">
+      <w:hyperlink w:anchor="_Toc241958222" w:history="1">
         <w:r>
           <w:rPr>
             <w:rStyle w:val="Hyperlink"/>
@@ -4759,7 +4759,7 @@
             <w:noProof/>
             <w:webHidden/>
           </w:rPr>
-          <w:instrText xml:space="preserve"> PAGEREF _Toc241916448 \h </w:instrText>
+          <w:instrText xml:space="preserve"> PAGEREF _Toc241958222 \h </w:instrText>
         </w:r>
         <w:r>
           <w:rPr>
@@ -4806,7 +4806,7 @@
           <w14:ligatures w14:val="standardContextual"/>
         </w:rPr>
       </w:pPr>
-      <w:hyperlink w:anchor="_Toc241916449" w:history="1">
+      <w:hyperlink w:anchor="_Toc241958223" w:history="1">
         <w:r>
           <w:rPr>
             <w:rStyle w:val="Hyperlink"/>
@@ -4833,7 +4833,7 @@
             <w:noProof/>
             <w:webHidden/>
           </w:rPr>
-          <w:instrText xml:space="preserve"> PAGEREF _Toc241916449 \h </w:instrText>
+          <w:instrText xml:space="preserve"> PAGEREF _Toc241958223 \h </w:instrText>
         </w:r>
         <w:r>
           <w:rPr>
@@ -4880,7 +4880,7 @@
           <w14:ligatures w14:val="standardContextual"/>
         </w:rPr>
       </w:pPr>
-      <w:hyperlink w:anchor="_Toc241916450" w:history="1">
+      <w:hyperlink w:anchor="_Toc241958224" w:history="1">
         <w:r>
           <w:rPr>
             <w:rStyle w:val="Hyperlink"/>
@@ -4907,7 +4907,7 @@
             <w:noProof/>
             <w:webHidden/>
           </w:rPr>
-          <w:instrText xml:space="preserve"> PAGEREF _Toc241916450 \h </w:instrText>
+          <w:instrText xml:space="preserve"> PAGEREF _Toc241958224 \h </w:instrText>
         </w:r>
         <w:r>
           <w:rPr>
@@ -4954,7 +4954,7 @@
           <w14:ligatures w14:val="standardContextual"/>
         </w:rPr>
       </w:pPr>
-      <w:hyperlink w:anchor="_Toc241916451" w:history="1">
+      <w:hyperlink w:anchor="_Toc241958225" w:history="1">
         <w:r>
           <w:rPr>
             <w:rStyle w:val="Hyperlink"/>
@@ -4981,7 +4981,7 @@
             <w:noProof/>
             <w:webHidden/>
           </w:rPr>
-          <w:instrText xml:space="preserve"> PAGEREF _Toc241916451 \h </w:instrText>
+          <w:instrText xml:space="preserve"> PAGEREF _Toc241958225 \h </w:instrText>
         </w:r>
         <w:r>
           <w:rPr>
@@ -5028,7 +5028,7 @@
           <w14:ligatures w14:val="standardContextual"/>
         </w:rPr>
       </w:pPr>
-      <w:hyperlink w:anchor="_Toc241916452" w:history="1">
+      <w:hyperlink w:anchor="_Toc241958226" w:history="1">
         <w:r>
           <w:rPr>
             <w:rStyle w:val="Hyperlink"/>
@@ -5055,7 +5055,7 @@
             <w:noProof/>
             <w:webHidden/>
           </w:rPr>
-          <w:instrText xml:space="preserve"> PAGEREF _Toc241916452 \h </w:instrText>
+          <w:instrText xml:space="preserve"> PAGEREF _Toc241958226 \h </w:instrText>
         </w:r>
         <w:r>
           <w:rPr>
@@ -5102,7 +5102,7 @@
           <w14:ligatures w14:val="standardContextual"/>
         </w:rPr>
       </w:pPr>
-      <w:hyperlink w:anchor="_Toc241916453" w:history="1">
+      <w:hyperlink w:anchor="_Toc241958227" w:history="1">
         <w:r>
           <w:rPr>
             <w:rStyle w:val="Hyperlink"/>
@@ -5129,7 +5129,7 @@
             <w:noProof/>
             <w:webHidden/>
           </w:rPr>
-          <w:instrText xml:space="preserve"> PAGEREF _Toc241916453 \h </w:instrText>
+          <w:instrText xml:space="preserve"> PAGEREF _Toc241958227 \h </w:instrText>
         </w:r>
         <w:r>
           <w:rPr>
@@ -5176,7 +5176,7 @@
           <w14:ligatures w14:val="standardContextual"/>
         </w:rPr>
       </w:pPr>
-      <w:hyperlink w:anchor="_Toc241916454" w:history="1">
+      <w:hyperlink w:anchor="_Toc241958228" w:history="1">
         <w:r>
           <w:rPr>
             <w:rStyle w:val="Hyperlink"/>
@@ -5203,7 +5203,7 @@
             <w:noProof/>
             <w:webHidden/>
           </w:rPr>
-          <w:instrText xml:space="preserve"> PAGEREF _Toc241916454 \h </w:instrText>
+          <w:instrText xml:space="preserve"> PAGEREF _Toc241958228 \h </w:instrText>
         </w:r>
         <w:r>
           <w:rPr>
@@ -5250,7 +5250,7 @@
           <w14:ligatures w14:val="standardContextual"/>
         </w:rPr>
       </w:pPr>
-      <w:hyperlink w:anchor="_Toc241916455" w:history="1">
+      <w:hyperlink w:anchor="_Toc241958229" w:history="1">
         <w:r>
           <w:rPr>
             <w:rStyle w:val="Hyperlink"/>
@@ -5277,7 +5277,7 @@
             <w:noProof/>
             <w:webHidden/>
           </w:rPr>
-          <w:instrText xml:space="preserve"> PAGEREF _Toc241916455 \h </w:instrText>
+          <w:instrText xml:space="preserve"> PAGEREF _Toc241958229 \h </w:instrText>
         </w:r>
         <w:r>
           <w:rPr>
@@ -5324,7 +5324,7 @@
           <w14:ligatures w14:val="standardContextual"/>
         </w:rPr>
       </w:pPr>
-      <w:hyperlink w:anchor="_Toc241916456" w:history="1">
+      <w:hyperlink w:anchor="_Toc241958230" w:history="1">
         <w:r>
           <w:rPr>
             <w:rStyle w:val="Hyperlink"/>
@@ -5351,7 +5351,7 @@
             <w:noProof/>
             <w:webHidden/>
           </w:rPr>
-          <w:instrText xml:space="preserve"> PAGEREF _Toc241916456 \h </w:instrText>
+          <w:instrText xml:space="preserve"> PAGEREF _Toc241958230 \h </w:instrText>
         </w:r>
         <w:r>
           <w:rPr>
@@ -5398,7 +5398,7 @@
           <w14:ligatures w14:val="standardContextual"/>
         </w:rPr>
       </w:pPr>
-      <w:hyperlink w:anchor="_Toc241916457" w:history="1">
+      <w:hyperlink w:anchor="_Toc241958231" w:history="1">
         <w:r>
           <w:rPr>
             <w:rStyle w:val="Hyperlink"/>
@@ -5425,7 +5425,7 @@
             <w:noProof/>
             <w:webHidden/>
           </w:rPr>
-          <w:instrText xml:space="preserve"> PAGEREF _Toc241916457 \h </w:instrText>
+          <w:instrText xml:space="preserve"> PAGEREF _Toc241958231 \h </w:instrText>
         </w:r>
         <w:r>
           <w:rPr>
@@ -5472,7 +5472,7 @@
           <w14:ligatures w14:val="standardContextual"/>
         </w:rPr>
       </w:pPr>
-      <w:hyperlink w:anchor="_Toc241916458" w:history="1">
+      <w:hyperlink w:anchor="_Toc241958232" w:history="1">
         <w:r>
           <w:rPr>
             <w:rStyle w:val="Hyperlink"/>
@@ -5499,7 +5499,7 @@
             <w:noProof/>
             <w:webHidden/>
           </w:rPr>
-          <w:instrText xml:space="preserve"> PAGEREF _Toc241916458 \h </w:instrText>
+          <w:instrText xml:space="preserve"> PAGEREF _Toc241958232 \h </w:instrText>
         </w:r>
         <w:r>
           <w:rPr>
@@ -5519,7 +5519,7 @@
             <w:noProof/>
             <w:webHidden/>
           </w:rPr>
-          <w:t>32</w:t>
+          <w:t>33</w:t>
         </w:r>
         <w:r>
           <w:rPr>
@@ -5546,7 +5546,7 @@
           <w14:ligatures w14:val="standardContextual"/>
         </w:rPr>
       </w:pPr>
-      <w:hyperlink w:anchor="_Toc241916459" w:history="1">
+      <w:hyperlink w:anchor="_Toc241958233" w:history="1">
         <w:r>
           <w:rPr>
             <w:rStyle w:val="Hyperlink"/>
@@ -5573,7 +5573,7 @@
             <w:noProof/>
             <w:webHidden/>
           </w:rPr>
-          <w:instrText xml:space="preserve"> PAGEREF _Toc241916459 \h </w:instrText>
+          <w:instrText xml:space="preserve"> PAGEREF _Toc241958233 \h </w:instrText>
         </w:r>
         <w:r>
           <w:rPr>
@@ -5593,7 +5593,7 @@
             <w:noProof/>
             <w:webHidden/>
           </w:rPr>
-          <w:t>32</w:t>
+          <w:t>33</w:t>
         </w:r>
         <w:r>
           <w:rPr>
@@ -5620,7 +5620,7 @@
           <w14:ligatures w14:val="standardContextual"/>
         </w:rPr>
       </w:pPr>
-      <w:hyperlink w:anchor="_Toc241916460" w:history="1">
+      <w:hyperlink w:anchor="_Toc241958234" w:history="1">
         <w:r>
           <w:rPr>
             <w:rStyle w:val="Hyperlink"/>
@@ -5647,7 +5647,7 @@
             <w:noProof/>
             <w:webHidden/>
           </w:rPr>
-          <w:instrText xml:space="preserve"> PAGEREF _Toc241916460 \h </w:instrText>
+          <w:instrText xml:space="preserve"> PAGEREF _Toc241958234 \h </w:instrText>
         </w:r>
         <w:r>
           <w:rPr>
@@ -5667,7 +5667,7 @@
             <w:noProof/>
             <w:webHidden/>
           </w:rPr>
-          <w:t>32</w:t>
+          <w:t>33</w:t>
         </w:r>
         <w:r>
           <w:rPr>
@@ -5694,7 +5694,7 @@
           <w14:ligatures w14:val="standardContextual"/>
         </w:rPr>
       </w:pPr>
-      <w:hyperlink w:anchor="_Toc241916461" w:history="1">
+      <w:hyperlink w:anchor="_Toc241958235" w:history="1">
         <w:r>
           <w:rPr>
             <w:rStyle w:val="Hyperlink"/>
@@ -5721,7 +5721,7 @@
             <w:noProof/>
             <w:webHidden/>
           </w:rPr>
-          <w:instrText xml:space="preserve"> PAGEREF _Toc241916461 \h </w:instrText>
+          <w:instrText xml:space="preserve"> PAGEREF _Toc241958235 \h </w:instrText>
         </w:r>
         <w:r>
           <w:rPr>
@@ -5741,7 +5741,7 @@
             <w:noProof/>
             <w:webHidden/>
           </w:rPr>
-          <w:t>33</w:t>
+          <w:t>34</w:t>
         </w:r>
         <w:r>
           <w:rPr>
@@ -5768,7 +5768,7 @@
           <w14:ligatures w14:val="standardContextual"/>
         </w:rPr>
       </w:pPr>
-      <w:hyperlink w:anchor="_Toc241916462" w:history="1">
+      <w:hyperlink w:anchor="_Toc241958236" w:history="1">
         <w:r>
           <w:rPr>
             <w:rStyle w:val="Hyperlink"/>
@@ -5795,7 +5795,7 @@
             <w:noProof/>
             <w:webHidden/>
           </w:rPr>
-          <w:instrText xml:space="preserve"> PAGEREF _Toc241916462 \h </w:instrText>
+          <w:instrText xml:space="preserve"> PAGEREF _Toc241958236 \h </w:instrText>
         </w:r>
         <w:r>
           <w:rPr>
@@ -5815,7 +5815,7 @@
             <w:noProof/>
             <w:webHidden/>
           </w:rPr>
-          <w:t>34</w:t>
+          <w:t>35</w:t>
         </w:r>
         <w:r>
           <w:rPr>
@@ -5842,7 +5842,7 @@
           <w14:ligatures w14:val="standardContextual"/>
         </w:rPr>
       </w:pPr>
-      <w:hyperlink w:anchor="_Toc241916463" w:history="1">
+      <w:hyperlink w:anchor="_Toc241958237" w:history="1">
         <w:r>
           <w:rPr>
             <w:rStyle w:val="Hyperlink"/>
@@ -5869,7 +5869,7 @@
             <w:noProof/>
             <w:webHidden/>
           </w:rPr>
-          <w:instrText xml:space="preserve"> PAGEREF _Toc241916463 \h </w:instrText>
+          <w:instrText xml:space="preserve"> PAGEREF _Toc241958237 \h </w:instrText>
         </w:r>
         <w:r>
           <w:rPr>
@@ -5889,7 +5889,7 @@
             <w:noProof/>
             <w:webHidden/>
           </w:rPr>
-          <w:t>35</w:t>
+          <w:t>36</w:t>
         </w:r>
         <w:r>
           <w:rPr>
@@ -5946,7 +5946,7 @@
       <w:r>
         <w:fldChar w:fldCharType="separate"/>
       </w:r>
-      <w:hyperlink w:anchor="_Toc241916464" w:history="1">
+      <w:hyperlink w:anchor="_Toc241958238" w:history="1">
         <w:r>
           <w:rPr>
             <w:rStyle w:val="Hyperlink"/>
@@ -5973,7 +5973,7 @@
             <w:noProof/>
             <w:webHidden/>
           </w:rPr>
-          <w:instrText xml:space="preserve"> PAGEREF _Toc241916464 \h </w:instrText>
+          <w:instrText xml:space="preserve"> PAGEREF _Toc241958238 \h </w:instrText>
         </w:r>
         <w:r>
           <w:rPr>
@@ -6020,7 +6020,7 @@
           <w14:ligatures w14:val="standardContextual"/>
         </w:rPr>
       </w:pPr>
-      <w:hyperlink w:anchor="_Toc241916465" w:history="1">
+      <w:hyperlink w:anchor="_Toc241958239" w:history="1">
         <w:r>
           <w:rPr>
             <w:rStyle w:val="Hyperlink"/>
@@ -6047,7 +6047,7 @@
             <w:noProof/>
             <w:webHidden/>
           </w:rPr>
-          <w:instrText xml:space="preserve"> PAGEREF _Toc241916465 \h </w:instrText>
+          <w:instrText xml:space="preserve"> PAGEREF _Toc241958239 \h </w:instrText>
         </w:r>
         <w:r>
           <w:rPr>
@@ -6094,7 +6094,7 @@
           <w14:ligatures w14:val="standardContextual"/>
         </w:rPr>
       </w:pPr>
-      <w:hyperlink w:anchor="_Toc241916466" w:history="1">
+      <w:hyperlink w:anchor="_Toc241958240" w:history="1">
         <w:r>
           <w:rPr>
             <w:rStyle w:val="Hyperlink"/>
@@ -6121,7 +6121,7 @@
             <w:noProof/>
             <w:webHidden/>
           </w:rPr>
-          <w:instrText xml:space="preserve"> PAGEREF _Toc241916466 \h </w:instrText>
+          <w:instrText xml:space="preserve"> PAGEREF _Toc241958240 \h </w:instrText>
         </w:r>
         <w:r>
           <w:rPr>
@@ -6168,7 +6168,7 @@
           <w14:ligatures w14:val="standardContextual"/>
         </w:rPr>
       </w:pPr>
-      <w:hyperlink w:anchor="_Toc241916467" w:history="1">
+      <w:hyperlink w:anchor="_Toc241958241" w:history="1">
         <w:r>
           <w:rPr>
             <w:rStyle w:val="Hyperlink"/>
@@ -6195,7 +6195,7 @@
             <w:noProof/>
             <w:webHidden/>
           </w:rPr>
-          <w:instrText xml:space="preserve"> PAGEREF _Toc241916467 \h </w:instrText>
+          <w:instrText xml:space="preserve"> PAGEREF _Toc241958241 \h </w:instrText>
         </w:r>
         <w:r>
           <w:rPr>
@@ -6242,7 +6242,7 @@
           <w14:ligatures w14:val="standardContextual"/>
         </w:rPr>
       </w:pPr>
-      <w:hyperlink w:anchor="_Toc241916468" w:history="1">
+      <w:hyperlink w:anchor="_Toc241958242" w:history="1">
         <w:r>
           <w:rPr>
             <w:rStyle w:val="Hyperlink"/>
@@ -6269,7 +6269,7 @@
             <w:noProof/>
             <w:webHidden/>
           </w:rPr>
-          <w:instrText xml:space="preserve"> PAGEREF _Toc241916468 \h </w:instrText>
+          <w:instrText xml:space="preserve"> PAGEREF _Toc241958242 \h </w:instrText>
         </w:r>
         <w:r>
           <w:rPr>
@@ -6316,7 +6316,7 @@
           <w14:ligatures w14:val="standardContextual"/>
         </w:rPr>
       </w:pPr>
-      <w:hyperlink w:anchor="_Toc241916469" w:history="1">
+      <w:hyperlink w:anchor="_Toc241958243" w:history="1">
         <w:r>
           <w:rPr>
             <w:rStyle w:val="Hyperlink"/>
@@ -6343,7 +6343,7 @@
             <w:noProof/>
             <w:webHidden/>
           </w:rPr>
-          <w:instrText xml:space="preserve"> PAGEREF _Toc241916469 \h </w:instrText>
+          <w:instrText xml:space="preserve"> PAGEREF _Toc241958243 \h </w:instrText>
         </w:r>
         <w:r>
           <w:rPr>
@@ -6390,7 +6390,7 @@
           <w14:ligatures w14:val="standardContextual"/>
         </w:rPr>
       </w:pPr>
-      <w:hyperlink w:anchor="_Toc241916470" w:history="1">
+      <w:hyperlink w:anchor="_Toc241958244" w:history="1">
         <w:r>
           <w:rPr>
             <w:rStyle w:val="Hyperlink"/>
@@ -6417,7 +6417,7 @@
             <w:noProof/>
             <w:webHidden/>
           </w:rPr>
-          <w:instrText xml:space="preserve"> PAGEREF _Toc241916470 \h </w:instrText>
+          <w:instrText xml:space="preserve"> PAGEREF _Toc241958244 \h </w:instrText>
         </w:r>
         <w:r>
           <w:rPr>
@@ -6464,7 +6464,7 @@
           <w14:ligatures w14:val="standardContextual"/>
         </w:rPr>
       </w:pPr>
-      <w:hyperlink w:anchor="_Toc241916471" w:history="1">
+      <w:hyperlink w:anchor="_Toc241958245" w:history="1">
         <w:r>
           <w:rPr>
             <w:rStyle w:val="Hyperlink"/>
@@ -6491,7 +6491,7 @@
             <w:noProof/>
             <w:webHidden/>
           </w:rPr>
-          <w:instrText xml:space="preserve"> PAGEREF _Toc241916471 \h </w:instrText>
+          <w:instrText xml:space="preserve"> PAGEREF _Toc241958245 \h </w:instrText>
         </w:r>
         <w:r>
           <w:rPr>
@@ -6538,7 +6538,7 @@
           <w14:ligatures w14:val="standardContextual"/>
         </w:rPr>
       </w:pPr>
-      <w:hyperlink w:anchor="_Toc241916472" w:history="1">
+      <w:hyperlink w:anchor="_Toc241958246" w:history="1">
         <w:r>
           <w:rPr>
             <w:rStyle w:val="Hyperlink"/>
@@ -6565,7 +6565,7 @@
             <w:noProof/>
             <w:webHidden/>
           </w:rPr>
-          <w:instrText xml:space="preserve"> PAGEREF _Toc241916472 \h </w:instrText>
+          <w:instrText xml:space="preserve"> PAGEREF _Toc241958246 \h </w:instrText>
         </w:r>
         <w:r>
           <w:rPr>
@@ -6612,7 +6612,7 @@
           <w14:ligatures w14:val="standardContextual"/>
         </w:rPr>
       </w:pPr>
-      <w:hyperlink w:anchor="_Toc241916473" w:history="1">
+      <w:hyperlink w:anchor="_Toc241958247" w:history="1">
         <w:r>
           <w:rPr>
             <w:rStyle w:val="Hyperlink"/>
@@ -6639,7 +6639,7 @@
             <w:noProof/>
             <w:webHidden/>
           </w:rPr>
-          <w:instrText xml:space="preserve"> PAGEREF _Toc241916473 \h </w:instrText>
+          <w:instrText xml:space="preserve"> PAGEREF _Toc241958247 \h </w:instrText>
         </w:r>
         <w:r>
           <w:rPr>
@@ -6686,7 +6686,7 @@
           <w14:ligatures w14:val="standardContextual"/>
         </w:rPr>
       </w:pPr>
-      <w:hyperlink w:anchor="_Toc241916474" w:history="1">
+      <w:hyperlink w:anchor="_Toc241958248" w:history="1">
         <w:r>
           <w:rPr>
             <w:rStyle w:val="Hyperlink"/>
@@ -6713,7 +6713,7 @@
             <w:noProof/>
             <w:webHidden/>
           </w:rPr>
-          <w:instrText xml:space="preserve"> PAGEREF _Toc241916474 \h </w:instrText>
+          <w:instrText xml:space="preserve"> PAGEREF _Toc241958248 \h </w:instrText>
         </w:r>
         <w:r>
           <w:rPr>
@@ -6760,7 +6760,7 @@
           <w14:ligatures w14:val="standardContextual"/>
         </w:rPr>
       </w:pPr>
-      <w:hyperlink w:anchor="_Toc241916475" w:history="1">
+      <w:hyperlink w:anchor="_Toc241958249" w:history="1">
         <w:r>
           <w:rPr>
             <w:rStyle w:val="Hyperlink"/>
@@ -6787,7 +6787,7 @@
             <w:noProof/>
             <w:webHidden/>
           </w:rPr>
-          <w:instrText xml:space="preserve"> PAGEREF _Toc241916475 \h </w:instrText>
+          <w:instrText xml:space="preserve"> PAGEREF _Toc241958249 \h </w:instrText>
         </w:r>
         <w:r>
           <w:rPr>
@@ -6834,7 +6834,7 @@
           <w14:ligatures w14:val="standardContextual"/>
         </w:rPr>
       </w:pPr>
-      <w:hyperlink w:anchor="_Toc241916476" w:history="1">
+      <w:hyperlink w:anchor="_Toc241958250" w:history="1">
         <w:r>
           <w:rPr>
             <w:rStyle w:val="Hyperlink"/>
@@ -6861,7 +6861,7 @@
             <w:noProof/>
             <w:webHidden/>
           </w:rPr>
-          <w:instrText xml:space="preserve"> PAGEREF _Toc241916476 \h </w:instrText>
+          <w:instrText xml:space="preserve"> PAGEREF _Toc241958250 \h </w:instrText>
         </w:r>
         <w:r>
           <w:rPr>
@@ -6908,7 +6908,7 @@
           <w14:ligatures w14:val="standardContextual"/>
         </w:rPr>
       </w:pPr>
-      <w:hyperlink w:anchor="_Toc241916477" w:history="1">
+      <w:hyperlink w:anchor="_Toc241958251" w:history="1">
         <w:r>
           <w:rPr>
             <w:rStyle w:val="Hyperlink"/>
@@ -6935,7 +6935,7 @@
             <w:noProof/>
             <w:webHidden/>
           </w:rPr>
-          <w:instrText xml:space="preserve"> PAGEREF _Toc241916477 \h </w:instrText>
+          <w:instrText xml:space="preserve"> PAGEREF _Toc241958251 \h </w:instrText>
         </w:r>
         <w:r>
           <w:rPr>
@@ -6982,7 +6982,7 @@
           <w14:ligatures w14:val="standardContextual"/>
         </w:rPr>
       </w:pPr>
-      <w:hyperlink w:anchor="_Toc241916478" w:history="1">
+      <w:hyperlink w:anchor="_Toc241958252" w:history="1">
         <w:r>
           <w:rPr>
             <w:rStyle w:val="Hyperlink"/>
@@ -7009,7 +7009,7 @@
             <w:noProof/>
             <w:webHidden/>
           </w:rPr>
-          <w:instrText xml:space="preserve"> PAGEREF _Toc241916478 \h </w:instrText>
+          <w:instrText xml:space="preserve"> PAGEREF _Toc241958252 \h </w:instrText>
         </w:r>
         <w:r>
           <w:rPr>
@@ -7084,7 +7084,7 @@
       <w:r>
         <w:fldChar w:fldCharType="separate"/>
       </w:r>
-      <w:hyperlink w:anchor="_Toc241916479" w:history="1">
+      <w:hyperlink w:anchor="_Toc241958253" w:history="1">
         <w:r>
           <w:rPr>
             <w:rStyle w:val="Hyperlink"/>
@@ -7111,7 +7111,7 @@
             <w:noProof/>
             <w:webHidden/>
           </w:rPr>
-          <w:instrText xml:space="preserve"> PAGEREF _Toc241916479 \h </w:instrText>
+          <w:instrText xml:space="preserve"> PAGEREF _Toc241958253 \h </w:instrText>
         </w:r>
         <w:r>
           <w:rPr>
@@ -7131,7 +7131,7 @@
             <w:noProof/>
             <w:webHidden/>
           </w:rPr>
-          <w:t>6</w:t>
+          <w:t>7</w:t>
         </w:r>
         <w:r>
           <w:rPr>
@@ -7158,7 +7158,7 @@
           <w14:ligatures w14:val="standardContextual"/>
         </w:rPr>
       </w:pPr>
-      <w:hyperlink w:anchor="_Toc241916480" w:history="1">
+      <w:hyperlink w:anchor="_Toc241958254" w:history="1">
         <w:r>
           <w:rPr>
             <w:rStyle w:val="Hyperlink"/>
@@ -7185,7 +7185,7 @@
             <w:noProof/>
             <w:webHidden/>
           </w:rPr>
-          <w:instrText xml:space="preserve"> PAGEREF _Toc241916480 \h </w:instrText>
+          <w:instrText xml:space="preserve"> PAGEREF _Toc241958254 \h </w:instrText>
         </w:r>
         <w:r>
           <w:rPr>
@@ -7205,7 +7205,7 @@
             <w:noProof/>
             <w:webHidden/>
           </w:rPr>
-          <w:t>7</w:t>
+          <w:t>8</w:t>
         </w:r>
         <w:r>
           <w:rPr>
@@ -7232,7 +7232,7 @@
           <w14:ligatures w14:val="standardContextual"/>
         </w:rPr>
       </w:pPr>
-      <w:hyperlink w:anchor="_Toc241916481" w:history="1">
+      <w:hyperlink w:anchor="_Toc241958255" w:history="1">
         <w:r>
           <w:rPr>
             <w:rStyle w:val="Hyperlink"/>
@@ -7259,7 +7259,7 @@
             <w:noProof/>
             <w:webHidden/>
           </w:rPr>
-          <w:instrText xml:space="preserve"> PAGEREF _Toc241916481 \h </w:instrText>
+          <w:instrText xml:space="preserve"> PAGEREF _Toc241958255 \h </w:instrText>
         </w:r>
         <w:r>
           <w:rPr>
@@ -7279,7 +7279,7 @@
             <w:noProof/>
             <w:webHidden/>
           </w:rPr>
-          <w:t>8</w:t>
+          <w:t>9</w:t>
         </w:r>
         <w:r>
           <w:rPr>
@@ -7306,7 +7306,7 @@
           <w14:ligatures w14:val="standardContextual"/>
         </w:rPr>
       </w:pPr>
-      <w:hyperlink w:anchor="_Toc241916482" w:history="1">
+      <w:hyperlink w:anchor="_Toc241958256" w:history="1">
         <w:r>
           <w:rPr>
             <w:rStyle w:val="Hyperlink"/>
@@ -7333,7 +7333,7 @@
             <w:noProof/>
             <w:webHidden/>
           </w:rPr>
-          <w:instrText xml:space="preserve"> PAGEREF _Toc241916482 \h </w:instrText>
+          <w:instrText xml:space="preserve"> PAGEREF _Toc241958256 \h </w:instrText>
         </w:r>
         <w:r>
           <w:rPr>
@@ -7353,7 +7353,7 @@
             <w:noProof/>
             <w:webHidden/>
           </w:rPr>
-          <w:t>11</w:t>
+          <w:t>12</w:t>
         </w:r>
         <w:r>
           <w:rPr>
@@ -7380,7 +7380,7 @@
           <w14:ligatures w14:val="standardContextual"/>
         </w:rPr>
       </w:pPr>
-      <w:hyperlink w:anchor="_Toc241916483" w:history="1">
+      <w:hyperlink w:anchor="_Toc241958257" w:history="1">
         <w:r>
           <w:rPr>
             <w:rStyle w:val="Hyperlink"/>
@@ -7407,7 +7407,7 @@
             <w:noProof/>
             <w:webHidden/>
           </w:rPr>
-          <w:instrText xml:space="preserve"> PAGEREF _Toc241916483 \h </w:instrText>
+          <w:instrText xml:space="preserve"> PAGEREF _Toc241958257 \h </w:instrText>
         </w:r>
         <w:r>
           <w:rPr>
@@ -7427,7 +7427,7 @@
             <w:noProof/>
             <w:webHidden/>
           </w:rPr>
-          <w:t>14</w:t>
+          <w:t>15</w:t>
         </w:r>
         <w:r>
           <w:rPr>
@@ -7454,7 +7454,7 @@
           <w14:ligatures w14:val="standardContextual"/>
         </w:rPr>
       </w:pPr>
-      <w:hyperlink w:anchor="_Toc241916484" w:history="1">
+      <w:hyperlink w:anchor="_Toc241958258" w:history="1">
         <w:r>
           <w:rPr>
             <w:rStyle w:val="Hyperlink"/>
@@ -7481,7 +7481,7 @@
             <w:noProof/>
             <w:webHidden/>
           </w:rPr>
-          <w:instrText xml:space="preserve"> PAGEREF _Toc241916484 \h </w:instrText>
+          <w:instrText xml:space="preserve"> PAGEREF _Toc241958258 \h </w:instrText>
         </w:r>
         <w:r>
           <w:rPr>
@@ -7501,7 +7501,7 @@
             <w:noProof/>
             <w:webHidden/>
           </w:rPr>
-          <w:t>15</w:t>
+          <w:t>16</w:t>
         </w:r>
         <w:r>
           <w:rPr>
@@ -7528,7 +7528,7 @@
           <w14:ligatures w14:val="standardContextual"/>
         </w:rPr>
       </w:pPr>
-      <w:hyperlink w:anchor="_Toc241916485" w:history="1">
+      <w:hyperlink w:anchor="_Toc241958259" w:history="1">
         <w:r>
           <w:rPr>
             <w:rStyle w:val="Hyperlink"/>
@@ -7555,7 +7555,7 @@
             <w:noProof/>
             <w:webHidden/>
           </w:rPr>
-          <w:instrText xml:space="preserve"> PAGEREF _Toc241916485 \h </w:instrText>
+          <w:instrText xml:space="preserve"> PAGEREF _Toc241958259 \h </w:instrText>
         </w:r>
         <w:r>
           <w:rPr>
@@ -7575,7 +7575,7 @@
             <w:noProof/>
             <w:webHidden/>
           </w:rPr>
-          <w:t>18</w:t>
+          <w:t>19</w:t>
         </w:r>
         <w:r>
           <w:rPr>
@@ -7602,7 +7602,7 @@
           <w14:ligatures w14:val="standardContextual"/>
         </w:rPr>
       </w:pPr>
-      <w:hyperlink w:anchor="_Toc241916486" w:history="1">
+      <w:hyperlink w:anchor="_Toc241958260" w:history="1">
         <w:r>
           <w:rPr>
             <w:rStyle w:val="Hyperlink"/>
@@ -7629,7 +7629,7 @@
             <w:noProof/>
             <w:webHidden/>
           </w:rPr>
-          <w:instrText xml:space="preserve"> PAGEREF _Toc241916486 \h </w:instrText>
+          <w:instrText xml:space="preserve"> PAGEREF _Toc241958260 \h </w:instrText>
         </w:r>
         <w:r>
           <w:rPr>
@@ -7649,7 +7649,7 @@
             <w:noProof/>
             <w:webHidden/>
           </w:rPr>
-          <w:t>18</w:t>
+          <w:t>19</w:t>
         </w:r>
         <w:r>
           <w:rPr>
@@ -7676,7 +7676,7 @@
           <w14:ligatures w14:val="standardContextual"/>
         </w:rPr>
       </w:pPr>
-      <w:hyperlink w:anchor="_Toc241916487" w:history="1">
+      <w:hyperlink w:anchor="_Toc241958261" w:history="1">
         <w:r>
           <w:rPr>
             <w:rStyle w:val="Hyperlink"/>
@@ -7703,7 +7703,7 @@
             <w:noProof/>
             <w:webHidden/>
           </w:rPr>
-          <w:instrText xml:space="preserve"> PAGEREF _Toc241916487 \h </w:instrText>
+          <w:instrText xml:space="preserve"> PAGEREF _Toc241958261 \h </w:instrText>
         </w:r>
         <w:r>
           <w:rPr>
@@ -7723,7 +7723,7 @@
             <w:noProof/>
             <w:webHidden/>
           </w:rPr>
-          <w:t>19</w:t>
+          <w:t>20</w:t>
         </w:r>
         <w:r>
           <w:rPr>
@@ -7750,7 +7750,7 @@
           <w14:ligatures w14:val="standardContextual"/>
         </w:rPr>
       </w:pPr>
-      <w:hyperlink w:anchor="_Toc241916488" w:history="1">
+      <w:hyperlink w:anchor="_Toc241958262" w:history="1">
         <w:r>
           <w:rPr>
             <w:rStyle w:val="Hyperlink"/>
@@ -7777,7 +7777,7 @@
             <w:noProof/>
             <w:webHidden/>
           </w:rPr>
-          <w:instrText xml:space="preserve"> PAGEREF _Toc241916488 \h </w:instrText>
+          <w:instrText xml:space="preserve"> PAGEREF _Toc241958262 \h </w:instrText>
         </w:r>
         <w:r>
           <w:rPr>
@@ -7797,7 +7797,7 @@
             <w:noProof/>
             <w:webHidden/>
           </w:rPr>
-          <w:t>21</w:t>
+          <w:t>22</w:t>
         </w:r>
         <w:r>
           <w:rPr>
@@ -7824,7 +7824,7 @@
           <w14:ligatures w14:val="standardContextual"/>
         </w:rPr>
       </w:pPr>
-      <w:hyperlink w:anchor="_Toc241916489" w:history="1">
+      <w:hyperlink w:anchor="_Toc241958263" w:history="1">
         <w:r>
           <w:rPr>
             <w:rStyle w:val="Hyperlink"/>
@@ -7851,7 +7851,7 @@
             <w:noProof/>
             <w:webHidden/>
           </w:rPr>
-          <w:instrText xml:space="preserve"> PAGEREF _Toc241916489 \h </w:instrText>
+          <w:instrText xml:space="preserve"> PAGEREF _Toc241958263 \h </w:instrText>
         </w:r>
         <w:r>
           <w:rPr>
@@ -7871,7 +7871,7 @@
             <w:noProof/>
             <w:webHidden/>
           </w:rPr>
-          <w:t>23</w:t>
+          <w:t>24</w:t>
         </w:r>
         <w:r>
           <w:rPr>
@@ -7898,7 +7898,7 @@
           <w14:ligatures w14:val="standardContextual"/>
         </w:rPr>
       </w:pPr>
-      <w:hyperlink w:anchor="_Toc241916490" w:history="1">
+      <w:hyperlink w:anchor="_Toc241958264" w:history="1">
         <w:r>
           <w:rPr>
             <w:rStyle w:val="Hyperlink"/>
@@ -7925,7 +7925,7 @@
             <w:noProof/>
             <w:webHidden/>
           </w:rPr>
-          <w:instrText xml:space="preserve"> PAGEREF _Toc241916490 \h </w:instrText>
+          <w:instrText xml:space="preserve"> PAGEREF _Toc241958264 \h </w:instrText>
         </w:r>
         <w:r>
           <w:rPr>
@@ -7945,7 +7945,7 @@
             <w:noProof/>
             <w:webHidden/>
           </w:rPr>
-          <w:t>25</w:t>
+          <w:t>26</w:t>
         </w:r>
         <w:r>
           <w:rPr>
@@ -7972,7 +7972,7 @@
           <w14:ligatures w14:val="standardContextual"/>
         </w:rPr>
       </w:pPr>
-      <w:hyperlink w:anchor="_Toc241916491" w:history="1">
+      <w:hyperlink w:anchor="_Toc241958265" w:history="1">
         <w:r>
           <w:rPr>
             <w:rStyle w:val="Hyperlink"/>
@@ -7999,7 +7999,7 @@
             <w:noProof/>
             <w:webHidden/>
           </w:rPr>
-          <w:instrText xml:space="preserve"> PAGEREF _Toc241916491 \h </w:instrText>
+          <w:instrText xml:space="preserve"> PAGEREF _Toc241958265 \h </w:instrText>
         </w:r>
         <w:r>
           <w:rPr>
@@ -8019,7 +8019,7 @@
             <w:noProof/>
             <w:webHidden/>
           </w:rPr>
-          <w:t>31</w:t>
+          <w:t>32</w:t>
         </w:r>
         <w:r>
           <w:rPr>
@@ -8046,12 +8046,86 @@
           <w14:ligatures w14:val="standardContextual"/>
         </w:rPr>
       </w:pPr>
-      <w:hyperlink w:anchor="_Toc241916492" w:history="1">
+      <w:hyperlink w:anchor="_Toc241958266" w:history="1">
         <w:r>
           <w:rPr>
             <w:rStyle w:val="Hyperlink"/>
             <w:noProof/>
           </w:rPr>
+          <w:t>Bảng 5.4. Quy tắc CSDL kiểm tra khi ghi danh, chuyển lớp, điểm danh và nhập điểm</w:t>
+        </w:r>
+        <w:r>
+          <w:rPr>
+            <w:noProof/>
+            <w:webHidden/>
+          </w:rPr>
+          <w:tab/>
+        </w:r>
+        <w:r>
+          <w:rPr>
+            <w:noProof/>
+            <w:webHidden/>
+          </w:rPr>
+          <w:fldChar w:fldCharType="begin"/>
+        </w:r>
+        <w:r>
+          <w:rPr>
+            <w:noProof/>
+            <w:webHidden/>
+          </w:rPr>
+          <w:instrText xml:space="preserve"> PAGEREF _Toc241958266 \h </w:instrText>
+        </w:r>
+        <w:r>
+          <w:rPr>
+            <w:noProof/>
+            <w:webHidden/>
+          </w:rPr>
+        </w:r>
+        <w:r>
+          <w:rPr>
+            <w:noProof/>
+            <w:webHidden/>
+          </w:rPr>
+          <w:fldChar w:fldCharType="separate"/>
+        </w:r>
+        <w:r>
+          <w:rPr>
+            <w:noProof/>
+            <w:webHidden/>
+          </w:rPr>
+          <w:t>33</w:t>
+        </w:r>
+        <w:r>
+          <w:rPr>
+            <w:noProof/>
+            <w:webHidden/>
+          </w:rPr>
+          <w:fldChar w:fldCharType="end"/>
+        </w:r>
+      </w:hyperlink>
+    </w:p>
+    <w:p>
+      <w:pPr>
+        <w:pStyle w:val="TOC1"/>
+        <w:tabs>
+          <w:tab w:val="right" w:leader="dot" w:pos="9060"/>
+        </w:tabs>
+        <w:rPr>
+          <w:rFonts w:asciiTheme="minorHAnsi" w:eastAsiaTheme="minorEastAsia" w:hAnsiTheme="minorHAnsi" w:cstheme="minorBidi"/>
+          <w:noProof/>
+          <w:kern w:val="2"/>
+          <w:sz w:val="24"/>
+          <w:szCs w:val="24"/>
+          <w:lang w:val="en-VN" w:eastAsia="en-US"/>
+          <w14:ligatures w14:val="standardContextual"/>
+        </w:rPr>
+      </w:pPr>
+      <w:hyperlink w:anchor="_Toc241958267" w:history="1">
+        <w:r>
+          <w:rPr>
+            <w:rStyle w:val="Hyperlink"/>
+            <w:noProof/>
+          </w:rPr>
           <w:t>Bảng 6.1. Lỗi thường gặp và cách xử lý</w:t>
         </w:r>
         <w:r>
@@ -8073,7 +8147,7 @@
             <w:noProof/>
             <w:webHidden/>
           </w:rPr>
-          <w:instrText xml:space="preserve"> PAGEREF _Toc241916492 \h </w:instrText>
+          <w:instrText xml:space="preserve"> PAGEREF _Toc241958267 \h </w:instrText>
         </w:r>
         <w:r>
           <w:rPr>
@@ -8093,7 +8167,7 @@
             <w:noProof/>
             <w:webHidden/>
           </w:rPr>
-          <w:t>32</w:t>
+          <w:t>34</w:t>
         </w:r>
         <w:r>
           <w:rPr>
@@ -8114,7 +8188,7 @@
         <w:pStyle w:val="Heading1"/>
         <w:pageBreakBefore/>
       </w:pPr>
-      <w:bookmarkStart w:id="0" w:name="_Toc241916403"/>
+      <w:bookmarkStart w:id="0" w:name="_Toc241958177"/>
       <w:r>
         <w:lastRenderedPageBreak/>
         <w:t>CHƯƠNG 1. GIỚI THIỆU</w:t>
@@ -8125,7 +8199,7 @@
       <w:pPr>
         <w:pStyle w:val="Heading2"/>
       </w:pPr>
-      <w:bookmarkStart w:id="1" w:name="_Toc241916404"/>
+      <w:bookmarkStart w:id="1" w:name="_Toc241958178"/>
       <w:r>
         <w:t>1.1. Mục đích của tài liệu</w:t>
       </w:r>
@@ -8172,7 +8246,7 @@
       <w:pPr>
         <w:pStyle w:val="Heading2"/>
       </w:pPr>
-      <w:bookmarkStart w:id="2" w:name="_Toc241916405"/>
+      <w:bookmarkStart w:id="2" w:name="_Toc241958179"/>
       <w:r>
         <w:t>1.2. Tổng quan phần mềm</w:t>
       </w:r>
@@ -8319,7 +8393,7 @@
       <w:pPr>
         <w:pStyle w:val="Heading2"/>
       </w:pPr>
-      <w:bookmarkStart w:id="3" w:name="_Toc241916406"/>
+      <w:bookmarkStart w:id="3" w:name="_Toc241958180"/>
       <w:r>
         <w:t>1.3. Vai trò người dùng và chức năng</w:t>
       </w:r>
@@ -8357,7 +8431,7 @@
       <w:pPr>
         <w:pStyle w:val="TableCaption"/>
       </w:pPr>
-      <w:bookmarkStart w:id="4" w:name="_Toc241916479"/>
+      <w:bookmarkStart w:id="4" w:name="_Toc241958253"/>
       <w:r>
         <w:t>Bảng 1.1. Chức năng hiển thị theo vai trò</w:t>
       </w:r>
@@ -10687,7 +10761,7 @@
       <w:pPr>
         <w:pStyle w:val="Heading2"/>
       </w:pPr>
-      <w:bookmarkStart w:id="5" w:name="_Toc241916407"/>
+      <w:bookmarkStart w:id="5" w:name="_Toc241958181"/>
       <w:r>
         <w:t>1.4. Yêu cầu hệ thống</w:t>
       </w:r>
@@ -10697,7 +10771,7 @@
       <w:pPr>
         <w:pStyle w:val="TableCaption"/>
       </w:pPr>
-      <w:bookmarkStart w:id="6" w:name="_Toc241916480"/>
+      <w:bookmarkStart w:id="6" w:name="_Toc241958254"/>
       <w:r>
         <w:t>Bảng 1.2. Yêu cầu phần cứng và phần mềm</w:t>
       </w:r>
@@ -11288,7 +11362,7 @@
       <w:pPr>
         <w:pStyle w:val="Heading2"/>
       </w:pPr>
-      <w:bookmarkStart w:id="7" w:name="_Toc241916408"/>
+      <w:bookmarkStart w:id="7" w:name="_Toc241958182"/>
       <w:r>
         <w:t>1.5. Các bước cài đặt tổng quát</w:t>
       </w:r>
@@ -11440,7 +11514,7 @@
       <w:pPr>
         <w:pStyle w:val="TableCaption"/>
       </w:pPr>
-      <w:bookmarkStart w:id="8" w:name="_Toc241916481"/>
+      <w:bookmarkStart w:id="8" w:name="_Toc241958255"/>
       <w:r>
         <w:lastRenderedPageBreak/>
         <w:t>Bảng 1.3. Chọn phương án SQL Server theo máy</w:t>
@@ -12045,7 +12119,7 @@
       <w:pPr>
         <w:pStyle w:val="Heading2"/>
       </w:pPr>
-      <w:bookmarkStart w:id="9" w:name="_Toc241916409"/>
+      <w:bookmarkStart w:id="9" w:name="_Toc241958183"/>
       <w:r>
         <w:t>1.6. Quy ước trình bày</w:t>
       </w:r>
@@ -12293,7 +12367,7 @@
         <w:pStyle w:val="Heading1"/>
         <w:pageBreakBefore/>
       </w:pPr>
-      <w:bookmarkStart w:id="10" w:name="_Toc241916410"/>
+      <w:bookmarkStart w:id="10" w:name="_Toc241958184"/>
       <w:r>
         <w:lastRenderedPageBreak/>
         <w:t>CHƯƠNG 2. CÀI ĐẶT SQL SERVER VÀ KHỞI TẠO CƠ SỞ DỮ LIỆU</w:t>
@@ -12350,7 +12424,7 @@
       <w:pPr>
         <w:pStyle w:val="Heading2"/>
       </w:pPr>
-      <w:bookmarkStart w:id="11" w:name="_Toc241916411"/>
+      <w:bookmarkStart w:id="11" w:name="_Toc241958185"/>
       <w:r>
         <w:t>2.1. Tải mã nguồn</w:t>
       </w:r>
@@ -12471,7 +12545,7 @@
       <w:pPr>
         <w:pStyle w:val="Heading2"/>
       </w:pPr>
-      <w:bookmarkStart w:id="12" w:name="_Toc241916412"/>
+      <w:bookmarkStart w:id="12" w:name="_Toc241958186"/>
       <w:r>
         <w:t>2.2. Phương án A - SQL Server trong Docker</w:t>
       </w:r>
@@ -12481,7 +12555,7 @@
       <w:pPr>
         <w:pStyle w:val="Heading3"/>
       </w:pPr>
-      <w:bookmarkStart w:id="13" w:name="_Toc241916413"/>
+      <w:bookmarkStart w:id="13" w:name="_Toc241958187"/>
       <w:r>
         <w:t>2.2.1. Cài Docker Desktop</w:t>
       </w:r>
@@ -12810,7 +12884,7 @@
       <w:pPr>
         <w:pStyle w:val="Heading3"/>
       </w:pPr>
-      <w:bookmarkStart w:id="14" w:name="_Toc241916414"/>
+      <w:bookmarkStart w:id="14" w:name="_Toc241958188"/>
       <w:r>
         <w:t>2.2.2. Khởi động SQL Server</w:t>
       </w:r>
@@ -13238,7 +13312,7 @@
       <w:pPr>
         <w:pStyle w:val="Heading3"/>
       </w:pPr>
-      <w:bookmarkStart w:id="15" w:name="_Toc241916415"/>
+      <w:bookmarkStart w:id="15" w:name="_Toc241958189"/>
       <w:r>
         <w:t>2.2.3. Khởi tạo CSDL</w:t>
       </w:r>
@@ -13658,7 +13732,7 @@
       <w:pPr>
         <w:pStyle w:val="Heading3"/>
       </w:pPr>
-      <w:bookmarkStart w:id="16" w:name="_Toc241916416"/>
+      <w:bookmarkStart w:id="16" w:name="_Toc241958190"/>
       <w:r>
         <w:t>2.2.4. Bật, tắt SQL Server hằng ngày</w:t>
       </w:r>
@@ -13668,7 +13742,7 @@
       <w:pPr>
         <w:pStyle w:val="TableCaption"/>
       </w:pPr>
-      <w:bookmarkStart w:id="17" w:name="_Toc241916482"/>
+      <w:bookmarkStart w:id="17" w:name="_Toc241958256"/>
       <w:r>
         <w:t>Bảng 2.1. Các lệnh Docker thường dùng</w:t>
       </w:r>
@@ -14085,7 +14159,7 @@
       <w:pPr>
         <w:pStyle w:val="Heading2"/>
       </w:pPr>
-      <w:bookmarkStart w:id="18" w:name="_Toc241916417"/>
+      <w:bookmarkStart w:id="18" w:name="_Toc241958191"/>
       <w:r>
         <w:t>2.3. Phương án B - SQL Server cài trực tiếp trên Windows</w:t>
       </w:r>
@@ -14095,7 +14169,7 @@
       <w:pPr>
         <w:pStyle w:val="Heading3"/>
       </w:pPr>
-      <w:bookmarkStart w:id="19" w:name="_Toc241916418"/>
+      <w:bookmarkStart w:id="19" w:name="_Toc241958192"/>
       <w:r>
         <w:t>2.3.1. Cài SQL Server</w:t>
       </w:r>
@@ -14353,7 +14427,7 @@
       <w:pPr>
         <w:pStyle w:val="Heading3"/>
       </w:pPr>
-      <w:bookmarkStart w:id="20" w:name="_Toc241916419"/>
+      <w:bookmarkStart w:id="20" w:name="_Toc241958193"/>
       <w:r>
         <w:t>2.3.2. Cài công cụ quản trị và driver</w:t>
       </w:r>
@@ -14459,7 +14533,7 @@
       <w:pPr>
         <w:pStyle w:val="Heading3"/>
       </w:pPr>
-      <w:bookmarkStart w:id="21" w:name="_Toc241916420"/>
+      <w:bookmarkStart w:id="21" w:name="_Toc241958194"/>
       <w:r>
         <w:t>2.3.3. Bật kết nối TCP/IP</w:t>
       </w:r>
@@ -14686,7 +14760,7 @@
       <w:pPr>
         <w:pStyle w:val="Heading3"/>
       </w:pPr>
-      <w:bookmarkStart w:id="22" w:name="_Toc241916421"/>
+      <w:bookmarkStart w:id="22" w:name="_Toc241958195"/>
       <w:r>
         <w:lastRenderedPageBreak/>
         <w:t>2.3.4. Khởi tạo CSDL</w:t>
@@ -15250,7 +15324,7 @@
       <w:pPr>
         <w:pStyle w:val="Heading3"/>
       </w:pPr>
-      <w:bookmarkStart w:id="23" w:name="_Toc241916422"/>
+      <w:bookmarkStart w:id="23" w:name="_Toc241958196"/>
       <w:r>
         <w:t>2.3.5. Cho máy khác kết nối tới (không bắt buộc)</w:t>
       </w:r>
@@ -15342,7 +15416,7 @@
       <w:pPr>
         <w:pStyle w:val="Heading2"/>
       </w:pPr>
-      <w:bookmarkStart w:id="24" w:name="_Toc241916423"/>
+      <w:bookmarkStart w:id="24" w:name="_Toc241958197"/>
       <w:r>
         <w:t>2.4. Nạp lại dữ liệu mẫu trước buổi demo</w:t>
       </w:r>
@@ -15454,7 +15528,7 @@
         <w:pStyle w:val="Heading1"/>
         <w:pageBreakBefore/>
       </w:pPr>
-      <w:bookmarkStart w:id="25" w:name="_Toc241916424"/>
+      <w:bookmarkStart w:id="25" w:name="_Toc241958198"/>
       <w:r>
         <w:lastRenderedPageBreak/>
         <w:t>CHƯƠNG 3. CÀI ĐẶT ỨNG DỤNG</w:t>
@@ -15465,7 +15539,7 @@
       <w:pPr>
         <w:pStyle w:val="Heading2"/>
       </w:pPr>
-      <w:bookmarkStart w:id="26" w:name="_Toc241916425"/>
+      <w:bookmarkStart w:id="26" w:name="_Toc241958199"/>
       <w:r>
         <w:t>3.1. Tải bộ cài</w:t>
       </w:r>
@@ -15503,7 +15577,7 @@
       <w:pPr>
         <w:pStyle w:val="TableCaption"/>
       </w:pPr>
-      <w:bookmarkStart w:id="27" w:name="_Toc241916483"/>
+      <w:bookmarkStart w:id="27" w:name="_Toc241958257"/>
       <w:r>
         <w:t>Bảng 3.1. Các file cài đặt</w:t>
       </w:r>
@@ -15946,7 +16020,7 @@
       <w:pPr>
         <w:pStyle w:val="Heading2"/>
       </w:pPr>
-      <w:bookmarkStart w:id="28" w:name="_Toc241916426"/>
+      <w:bookmarkStart w:id="28" w:name="_Toc241958200"/>
       <w:r>
         <w:t>3.2. Cài đặt trên macOS</w:t>
       </w:r>
@@ -16178,7 +16252,7 @@
       <w:pPr>
         <w:pStyle w:val="Heading2"/>
       </w:pPr>
-      <w:bookmarkStart w:id="29" w:name="_Toc241916427"/>
+      <w:bookmarkStart w:id="29" w:name="_Toc241958201"/>
       <w:r>
         <w:t>3.3. Cài đặt trên Windows</w:t>
       </w:r>
@@ -16188,7 +16262,7 @@
       <w:pPr>
         <w:pStyle w:val="Heading3"/>
       </w:pPr>
-      <w:bookmarkStart w:id="30" w:name="_Toc241916428"/>
+      <w:bookmarkStart w:id="30" w:name="_Toc241958202"/>
       <w:r>
         <w:t>3.3.1. Dùng bộ cài setup.exe</w:t>
       </w:r>
@@ -16618,7 +16692,7 @@
       <w:pPr>
         <w:pStyle w:val="Heading3"/>
       </w:pPr>
-      <w:bookmarkStart w:id="31" w:name="_Toc241916429"/>
+      <w:bookmarkStart w:id="31" w:name="_Toc241958203"/>
       <w:r>
         <w:t>3.3.2. Dùng bản portable</w:t>
       </w:r>
@@ -16665,7 +16739,7 @@
       <w:pPr>
         <w:pStyle w:val="Heading3"/>
       </w:pPr>
-      <w:bookmarkStart w:id="32" w:name="_Toc241916430"/>
+      <w:bookmarkStart w:id="32" w:name="_Toc241958204"/>
       <w:r>
         <w:t>3.3.3. Driver kết nối</w:t>
       </w:r>
@@ -16721,7 +16795,7 @@
       <w:pPr>
         <w:pStyle w:val="Heading2"/>
       </w:pPr>
-      <w:bookmarkStart w:id="33" w:name="_Toc241916431"/>
+      <w:bookmarkStart w:id="33" w:name="_Toc241958205"/>
       <w:r>
         <w:t>3.4. Nơi lưu cấu hình và gỡ cài đặt</w:t>
       </w:r>
@@ -16741,7 +16815,7 @@
       <w:pPr>
         <w:pStyle w:val="TableCaption"/>
       </w:pPr>
-      <w:bookmarkStart w:id="34" w:name="_Toc241916484"/>
+      <w:bookmarkStart w:id="34" w:name="_Toc241958258"/>
       <w:r>
         <w:t>Bảng 3.2. Cấu hình đã lưu và cách gỡ ứng dụng</w:t>
       </w:r>
@@ -17138,7 +17212,7 @@
       <w:pPr>
         <w:pStyle w:val="Heading2"/>
       </w:pPr>
-      <w:bookmarkStart w:id="35" w:name="_Toc241916432"/>
+      <w:bookmarkStart w:id="35" w:name="_Toc241958206"/>
       <w:r>
         <w:t>3.5. Chạy từ mã nguồn (dành cho nhóm phát triển)</w:t>
       </w:r>
@@ -17565,7 +17639,7 @@
         <w:pStyle w:val="Heading1"/>
         <w:pageBreakBefore/>
       </w:pPr>
-      <w:bookmarkStart w:id="36" w:name="_Toc241916433"/>
+      <w:bookmarkStart w:id="36" w:name="_Toc241958207"/>
       <w:r>
         <w:lastRenderedPageBreak/>
         <w:t>CHƯƠNG 4. ĐĂNG NHẬP VÀ GIAO DIỆN CHUNG</w:t>
@@ -17576,7 +17650,7 @@
       <w:pPr>
         <w:pStyle w:val="Heading2"/>
       </w:pPr>
-      <w:bookmarkStart w:id="37" w:name="_Toc241916434"/>
+      <w:bookmarkStart w:id="37" w:name="_Toc241958208"/>
       <w:r>
         <w:t>4.1. Mở ứng dụng</w:t>
       </w:r>
@@ -17733,7 +17807,7 @@
           <w:noProof/>
         </w:rPr>
         <w:drawing>
-          <wp:inline distT="0" distB="0" distL="0" distR="0" wp14:anchorId="7A41355F" wp14:editId="32A97C97">
+          <wp:inline distT="0" distB="0" distL="0" distR="0" wp14:anchorId="4CBD598A" wp14:editId="1720CEBD">
             <wp:extent cx="4860000" cy="2938605"/>
             <wp:effectExtent l="0" t="0" r="0" b="0"/>
             <wp:docPr id="522444761" name="Picture 522444761"/>
@@ -17773,7 +17847,7 @@
       <w:pPr>
         <w:pStyle w:val="FigureCaption"/>
       </w:pPr>
-      <w:bookmarkStart w:id="38" w:name="_Toc241916464"/>
+      <w:bookmarkStart w:id="38" w:name="_Toc241958238"/>
       <w:r>
         <w:t>Hình 4.1. Màn hình đăng nhập</w:t>
       </w:r>
@@ -17783,7 +17857,7 @@
       <w:pPr>
         <w:pStyle w:val="Heading2"/>
       </w:pPr>
-      <w:bookmarkStart w:id="39" w:name="_Toc241916435"/>
+      <w:bookmarkStart w:id="39" w:name="_Toc241958209"/>
       <w:r>
         <w:t>4.2. Cấu hình máy chủ (lần chạy đầu tiên)</w:t>
       </w:r>
@@ -17934,7 +18008,7 @@
         </w:rPr>
         <w:lastRenderedPageBreak/>
         <w:drawing>
-          <wp:inline distT="0" distB="0" distL="0" distR="0" wp14:anchorId="2B1D8918" wp14:editId="27212833">
+          <wp:inline distT="0" distB="0" distL="0" distR="0" wp14:anchorId="60A7E6B3" wp14:editId="244A4A27">
             <wp:extent cx="5040000" cy="3360000"/>
             <wp:effectExtent l="0" t="0" r="0" b="0"/>
             <wp:docPr id="522444762" name="Picture 522444762"/>
@@ -17974,7 +18048,7 @@
       <w:pPr>
         <w:pStyle w:val="FigureCaption"/>
       </w:pPr>
-      <w:bookmarkStart w:id="40" w:name="_Toc241916465"/>
+      <w:bookmarkStart w:id="40" w:name="_Toc241958239"/>
       <w:r>
         <w:t>Hình 4.2. Khung cấu hình máy chủ SQL Server</w:t>
       </w:r>
@@ -17984,7 +18058,7 @@
       <w:pPr>
         <w:pStyle w:val="TableCaption"/>
       </w:pPr>
-      <w:bookmarkStart w:id="41" w:name="_Toc241916485"/>
+      <w:bookmarkStart w:id="41" w:name="_Toc241958259"/>
       <w:r>
         <w:t>Bảng 4.1. Giá trị ô Máy chủ theo cách cài SQL Server</w:t>
       </w:r>
@@ -18424,7 +18498,7 @@
       <w:pPr>
         <w:pStyle w:val="Heading2"/>
       </w:pPr>
-      <w:bookmarkStart w:id="42" w:name="_Toc241916436"/>
+      <w:bookmarkStart w:id="42" w:name="_Toc241958210"/>
       <w:r>
         <w:t>4.3. Đăng nhập</w:t>
       </w:r>
@@ -18498,7 +18572,7 @@
       <w:pPr>
         <w:pStyle w:val="TableCaption"/>
       </w:pPr>
-      <w:bookmarkStart w:id="43" w:name="_Toc241916486"/>
+      <w:bookmarkStart w:id="43" w:name="_Toc241958260"/>
       <w:r>
         <w:t>Bảng 4.2. Tài khoản demo trong dữ liệu mẫu</w:t>
       </w:r>
@@ -19824,7 +19898,7 @@
       <w:pPr>
         <w:pStyle w:val="TableCaption"/>
       </w:pPr>
-      <w:bookmarkStart w:id="44" w:name="_Toc241916487"/>
+      <w:bookmarkStart w:id="44" w:name="_Toc241958261"/>
       <w:r>
         <w:t>Bảng 4.3. Thông báo lỗi khi đăng nhập</w:t>
       </w:r>
@@ -20248,7 +20322,7 @@
       <w:pPr>
         <w:pStyle w:val="Heading2"/>
       </w:pPr>
-      <w:bookmarkStart w:id="45" w:name="_Toc241916437"/>
+      <w:bookmarkStart w:id="45" w:name="_Toc241958211"/>
       <w:r>
         <w:t>4.4. Màn hình chính</w:t>
       </w:r>
@@ -20399,7 +20473,7 @@
         </w:rPr>
         <w:lastRenderedPageBreak/>
         <w:drawing>
-          <wp:inline distT="0" distB="0" distL="0" distR="0" wp14:anchorId="3E0FF522" wp14:editId="053BF392">
+          <wp:inline distT="0" distB="0" distL="0" distR="0" wp14:anchorId="510B8DF0" wp14:editId="43510CE0">
             <wp:extent cx="5580000" cy="3332500"/>
             <wp:effectExtent l="0" t="0" r="0" b="0"/>
             <wp:docPr id="522444763" name="Picture 522444763"/>
@@ -20439,7 +20513,7 @@
       <w:pPr>
         <w:pStyle w:val="FigureCaption"/>
       </w:pPr>
-      <w:bookmarkStart w:id="46" w:name="_Toc241916466"/>
+      <w:bookmarkStart w:id="46" w:name="_Toc241958240"/>
       <w:r>
         <w:t>Hình 4.3. Màn hình chính của vai trò Quản lý (trang Tổng quan)</w:t>
       </w:r>
@@ -20449,7 +20523,7 @@
       <w:pPr>
         <w:pStyle w:val="Heading2"/>
       </w:pPr>
-      <w:bookmarkStart w:id="47" w:name="_Toc241916438"/>
+      <w:bookmarkStart w:id="47" w:name="_Toc241958212"/>
       <w:r>
         <w:t>4.5. Đổi ngôn ngữ giao diện</w:t>
       </w:r>
@@ -20487,7 +20561,7 @@
       <w:pPr>
         <w:pStyle w:val="Heading2"/>
       </w:pPr>
-      <w:bookmarkStart w:id="48" w:name="_Toc241916439"/>
+      <w:bookmarkStart w:id="48" w:name="_Toc241958213"/>
       <w:r>
         <w:t>4.6. Đổi mật khẩu</w:t>
       </w:r>
@@ -20603,7 +20677,7 @@
           <w:noProof/>
         </w:rPr>
         <w:drawing>
-          <wp:inline distT="0" distB="0" distL="0" distR="0" wp14:anchorId="67FBCFD3" wp14:editId="4260BCCD">
+          <wp:inline distT="0" distB="0" distL="0" distR="0" wp14:anchorId="1767BB4E" wp14:editId="01894F38">
             <wp:extent cx="3420000" cy="1368000"/>
             <wp:effectExtent l="0" t="0" r="0" b="0"/>
             <wp:docPr id="522444764" name="Picture 522444764"/>
@@ -20643,7 +20717,7 @@
       <w:pPr>
         <w:pStyle w:val="FigureCaption"/>
       </w:pPr>
-      <w:bookmarkStart w:id="49" w:name="_Toc241916467"/>
+      <w:bookmarkStart w:id="49" w:name="_Toc241958241"/>
       <w:r>
         <w:t>Hình 4.4. Hộp thoại đổi mật khẩu</w:t>
       </w:r>
@@ -20685,7 +20759,7 @@
       <w:pPr>
         <w:pStyle w:val="Heading2"/>
       </w:pPr>
-      <w:bookmarkStart w:id="50" w:name="_Toc241916440"/>
+      <w:bookmarkStart w:id="50" w:name="_Toc241958214"/>
       <w:r>
         <w:t>4.7. Đăng xuất và thoát</w:t>
       </w:r>
@@ -20732,7 +20806,7 @@
       <w:pPr>
         <w:pStyle w:val="Heading2"/>
       </w:pPr>
-      <w:bookmarkStart w:id="51" w:name="_Toc241916441"/>
+      <w:bookmarkStart w:id="51" w:name="_Toc241958215"/>
       <w:r>
         <w:t>4.8. Thao tác chung trên các danh sách</w:t>
       </w:r>
@@ -20759,7 +20833,7 @@
           <w:noProof/>
         </w:rPr>
         <w:drawing>
-          <wp:inline distT="0" distB="0" distL="0" distR="0" wp14:anchorId="1437D493" wp14:editId="3CE2C58C">
+          <wp:inline distT="0" distB="0" distL="0" distR="0" wp14:anchorId="0BB0CD72" wp14:editId="18C64770">
             <wp:extent cx="5580000" cy="3332500"/>
             <wp:effectExtent l="0" t="0" r="0" b="0"/>
             <wp:docPr id="522444765" name="Picture 522444765"/>
@@ -20799,7 +20873,7 @@
       <w:pPr>
         <w:pStyle w:val="FigureCaption"/>
       </w:pPr>
-      <w:bookmarkStart w:id="52" w:name="_Toc241916468"/>
+      <w:bookmarkStart w:id="52" w:name="_Toc241958242"/>
       <w:r>
         <w:t>Hình 4.5. Một màn hình danh sách: Công nợ học phí</w:t>
       </w:r>
@@ -20809,7 +20883,7 @@
       <w:pPr>
         <w:pStyle w:val="TableCaption"/>
       </w:pPr>
-      <w:bookmarkStart w:id="53" w:name="_Toc241916488"/>
+      <w:bookmarkStart w:id="53" w:name="_Toc241958262"/>
       <w:r>
         <w:t>Bảng 4.4. Các thành phần của màn hình danh sách</w:t>
       </w:r>
@@ -21435,7 +21509,7 @@
         <w:pStyle w:val="Heading1"/>
         <w:pageBreakBefore/>
       </w:pPr>
-      <w:bookmarkStart w:id="54" w:name="_Toc241916442"/>
+      <w:bookmarkStart w:id="54" w:name="_Toc241958216"/>
       <w:r>
         <w:lastRenderedPageBreak/>
         <w:t>CHƯƠNG 5. HƯỚNG DẪN THEO CHỨC NĂNG</w:t>
@@ -21456,7 +21530,7 @@
       <w:pPr>
         <w:pStyle w:val="Heading2"/>
       </w:pPr>
-      <w:bookmarkStart w:id="55" w:name="_Toc241916443"/>
+      <w:bookmarkStart w:id="55" w:name="_Toc241958217"/>
       <w:r>
         <w:t>5.1. Tổng quan</w:t>
       </w:r>
@@ -21491,7 +21565,7 @@
       <w:pPr>
         <w:pStyle w:val="TableCaption"/>
       </w:pPr>
-      <w:bookmarkStart w:id="56" w:name="_Toc241916489"/>
+      <w:bookmarkStart w:id="56" w:name="_Toc241958263"/>
       <w:r>
         <w:t>Bảng 5.1. Các thẻ số liệu trên trang Tổng quan</w:t>
       </w:r>
@@ -21973,7 +22047,7 @@
           <w:noProof/>
         </w:rPr>
         <w:drawing>
-          <wp:inline distT="0" distB="0" distL="0" distR="0" wp14:anchorId="62C163E6" wp14:editId="302258CE">
+          <wp:inline distT="0" distB="0" distL="0" distR="0" wp14:anchorId="09AF5B6F" wp14:editId="275374F3">
             <wp:extent cx="5580000" cy="3332500"/>
             <wp:effectExtent l="0" t="0" r="0" b="0"/>
             <wp:docPr id="522444766" name="Picture 522444766"/>
@@ -22013,7 +22087,7 @@
       <w:pPr>
         <w:pStyle w:val="FigureCaption"/>
       </w:pPr>
-      <w:bookmarkStart w:id="57" w:name="_Toc241916469"/>
+      <w:bookmarkStart w:id="57" w:name="_Toc241958243"/>
       <w:r>
         <w:t>Hình 5.1. Trang Tổng quan của Giáo vụ: không có quyền xem doanh thu nên biểu đồ để trống</w:t>
       </w:r>
@@ -22023,7 +22097,7 @@
       <w:pPr>
         <w:pStyle w:val="Heading2"/>
       </w:pPr>
-      <w:bookmarkStart w:id="58" w:name="_Toc241916444"/>
+      <w:bookmarkStart w:id="58" w:name="_Toc241958218"/>
       <w:r>
         <w:t>5.2. Học viên</w:t>
       </w:r>
@@ -22057,7 +22131,7 @@
         </w:rPr>
         <w:lastRenderedPageBreak/>
         <w:drawing>
-          <wp:inline distT="0" distB="0" distL="0" distR="0" wp14:anchorId="30B5A00B" wp14:editId="42C98B3B">
+          <wp:inline distT="0" distB="0" distL="0" distR="0" wp14:anchorId="47BA5246" wp14:editId="51F32E45">
             <wp:extent cx="5580000" cy="3332500"/>
             <wp:effectExtent l="0" t="0" r="0" b="0"/>
             <wp:docPr id="522444767" name="Picture 522444767"/>
@@ -22097,7 +22171,7 @@
       <w:pPr>
         <w:pStyle w:val="FigureCaption"/>
       </w:pPr>
-      <w:bookmarkStart w:id="59" w:name="_Toc241916470"/>
+      <w:bookmarkStart w:id="59" w:name="_Toc241958244"/>
       <w:r>
         <w:t>Hình 5.2. Danh sách học viên</w:t>
       </w:r>
@@ -22107,7 +22181,7 @@
       <w:pPr>
         <w:pStyle w:val="Heading3"/>
       </w:pPr>
-      <w:bookmarkStart w:id="60" w:name="_Toc241916445"/>
+      <w:bookmarkStart w:id="60" w:name="_Toc241958219"/>
       <w:r>
         <w:t>5.2.1. Tìm kiếm</w:t>
       </w:r>
@@ -22204,7 +22278,7 @@
       <w:pPr>
         <w:pStyle w:val="Heading3"/>
       </w:pPr>
-      <w:bookmarkStart w:id="61" w:name="_Toc241916446"/>
+      <w:bookmarkStart w:id="61" w:name="_Toc241958220"/>
       <w:r>
         <w:t>5.2.2. Thêm học viên</w:t>
       </w:r>
@@ -22409,7 +22483,7 @@
       <w:pPr>
         <w:pStyle w:val="Heading3"/>
       </w:pPr>
-      <w:bookmarkStart w:id="62" w:name="_Toc241916447"/>
+      <w:bookmarkStart w:id="62" w:name="_Toc241958221"/>
       <w:r>
         <w:t>5.2.3. Sửa thông tin</w:t>
       </w:r>
@@ -22500,7 +22574,7 @@
         </w:rPr>
         <w:lastRenderedPageBreak/>
         <w:drawing>
-          <wp:inline distT="0" distB="0" distL="0" distR="0" wp14:anchorId="48EF29FA" wp14:editId="1A2A49F8">
+          <wp:inline distT="0" distB="0" distL="0" distR="0" wp14:anchorId="7942DF56" wp14:editId="157ED105">
             <wp:extent cx="3780000" cy="4785968"/>
             <wp:effectExtent l="0" t="0" r="0" b="0"/>
             <wp:docPr id="522444768" name="Picture 522444768"/>
@@ -22540,7 +22614,7 @@
       <w:pPr>
         <w:pStyle w:val="FigureCaption"/>
       </w:pPr>
-      <w:bookmarkStart w:id="63" w:name="_Toc241916471"/>
+      <w:bookmarkStart w:id="63" w:name="_Toc241958245"/>
       <w:r>
         <w:t>Hình 5.3. Hộp thoại sửa thông tin học viên</w:t>
       </w:r>
@@ -22560,7 +22634,7 @@
       <w:pPr>
         <w:pStyle w:val="TableCaption"/>
       </w:pPr>
-      <w:bookmarkStart w:id="64" w:name="_Toc241916490"/>
+      <w:bookmarkStart w:id="64" w:name="_Toc241958264"/>
       <w:r>
         <w:t>Bảng 5.2. Quy tắc kiểm tra thông tin học viên</w:t>
       </w:r>
@@ -23161,7 +23235,7 @@
       <w:pPr>
         <w:pStyle w:val="Heading3"/>
       </w:pPr>
-      <w:bookmarkStart w:id="65" w:name="_Toc241916448"/>
+      <w:bookmarkStart w:id="65" w:name="_Toc241958222"/>
       <w:r>
         <w:lastRenderedPageBreak/>
         <w:t>5.2.4. Xóa học viên</w:t>
@@ -23283,7 +23357,7 @@
       <w:pPr>
         <w:pStyle w:val="Heading2"/>
       </w:pPr>
-      <w:bookmarkStart w:id="66" w:name="_Toc241916449"/>
+      <w:bookmarkStart w:id="66" w:name="_Toc241958223"/>
       <w:r>
         <w:t>5.3. Lớp học</w:t>
       </w:r>
@@ -23334,7 +23408,7 @@
           <w:noProof/>
         </w:rPr>
         <w:drawing>
-          <wp:inline distT="0" distB="0" distL="0" distR="0" wp14:anchorId="63646304" wp14:editId="1D378BF0">
+          <wp:inline distT="0" distB="0" distL="0" distR="0" wp14:anchorId="3D255A26" wp14:editId="5D003985">
             <wp:extent cx="5580000" cy="3332500"/>
             <wp:effectExtent l="0" t="0" r="0" b="0"/>
             <wp:docPr id="522444769" name="Picture 522444769"/>
@@ -23374,7 +23448,7 @@
       <w:pPr>
         <w:pStyle w:val="FigureCaption"/>
       </w:pPr>
-      <w:bookmarkStart w:id="67" w:name="_Toc241916472"/>
+      <w:bookmarkStart w:id="67" w:name="_Toc241958246"/>
       <w:r>
         <w:t>Hình 5.4. Danh sách lớp học</w:t>
       </w:r>
@@ -23384,7 +23458,7 @@
       <w:pPr>
         <w:pStyle w:val="Heading2"/>
       </w:pPr>
-      <w:bookmarkStart w:id="68" w:name="_Toc241916450"/>
+      <w:bookmarkStart w:id="68" w:name="_Toc241958224"/>
       <w:r>
         <w:t>5.4. Lịch học tuần này</w:t>
       </w:r>
@@ -23436,7 +23510,7 @@
         </w:rPr>
         <w:lastRenderedPageBreak/>
         <w:drawing>
-          <wp:inline distT="0" distB="0" distL="0" distR="0" wp14:anchorId="770036D9" wp14:editId="5E4519AB">
+          <wp:inline distT="0" distB="0" distL="0" distR="0" wp14:anchorId="6CAB9BB9" wp14:editId="0E820471">
             <wp:extent cx="5580000" cy="3332500"/>
             <wp:effectExtent l="0" t="0" r="0" b="0"/>
             <wp:docPr id="522444770" name="Picture 522444770"/>
@@ -23476,7 +23550,7 @@
       <w:pPr>
         <w:pStyle w:val="FigureCaption"/>
       </w:pPr>
-      <w:bookmarkStart w:id="69" w:name="_Toc241916473"/>
+      <w:bookmarkStart w:id="69" w:name="_Toc241958247"/>
       <w:r>
         <w:t>Hình 5.5. Lịch học tuần này</w:t>
       </w:r>
@@ -23486,7 +23560,7 @@
       <w:pPr>
         <w:pStyle w:val="Heading2"/>
       </w:pPr>
-      <w:bookmarkStart w:id="70" w:name="_Toc241916451"/>
+      <w:bookmarkStart w:id="70" w:name="_Toc241958225"/>
       <w:r>
         <w:t>5.5. Kết quả học tập</w:t>
       </w:r>
@@ -23546,7 +23620,7 @@
           <w:noProof/>
         </w:rPr>
         <w:drawing>
-          <wp:inline distT="0" distB="0" distL="0" distR="0" wp14:anchorId="1BF6921C" wp14:editId="5D4FFF9B">
+          <wp:inline distT="0" distB="0" distL="0" distR="0" wp14:anchorId="2CF11CAC" wp14:editId="38E5C01C">
             <wp:extent cx="5580000" cy="3332500"/>
             <wp:effectExtent l="0" t="0" r="0" b="0"/>
             <wp:docPr id="522444771" name="Picture 522444771"/>
@@ -23586,7 +23660,7 @@
       <w:pPr>
         <w:pStyle w:val="FigureCaption"/>
       </w:pPr>
-      <w:bookmarkStart w:id="71" w:name="_Toc241916474"/>
+      <w:bookmarkStart w:id="71" w:name="_Toc241958248"/>
       <w:r>
         <w:t>Hình 5.6. Kết quả học tập</w:t>
       </w:r>
@@ -23596,7 +23670,7 @@
       <w:pPr>
         <w:pStyle w:val="Heading2"/>
       </w:pPr>
-      <w:bookmarkStart w:id="72" w:name="_Toc241916452"/>
+      <w:bookmarkStart w:id="72" w:name="_Toc241958226"/>
       <w:r>
         <w:lastRenderedPageBreak/>
         <w:t>5.6. Công nợ học phí</w:t>
@@ -23650,7 +23724,7 @@
       <w:pPr>
         <w:pStyle w:val="Heading2"/>
       </w:pPr>
-      <w:bookmarkStart w:id="73" w:name="_Toc241916453"/>
+      <w:bookmarkStart w:id="73" w:name="_Toc241958227"/>
       <w:r>
         <w:t>5.7. Doanh thu</w:t>
       </w:r>
@@ -23719,7 +23793,7 @@
           <w:noProof/>
         </w:rPr>
         <w:drawing>
-          <wp:inline distT="0" distB="0" distL="0" distR="0" wp14:anchorId="610DC96E" wp14:editId="68F55EEB">
+          <wp:inline distT="0" distB="0" distL="0" distR="0" wp14:anchorId="6107D2E7" wp14:editId="0432D4DE">
             <wp:extent cx="5580000" cy="3332500"/>
             <wp:effectExtent l="0" t="0" r="0" b="0"/>
             <wp:docPr id="522444772" name="Picture 522444772"/>
@@ -23759,7 +23833,7 @@
       <w:pPr>
         <w:pStyle w:val="FigureCaption"/>
       </w:pPr>
-      <w:bookmarkStart w:id="74" w:name="_Toc241916475"/>
+      <w:bookmarkStart w:id="74" w:name="_Toc241958249"/>
       <w:r>
         <w:t>Hình 5.7. Doanh thu theo tháng và chi nhánh (Kế toán)</w:t>
       </w:r>
@@ -23769,7 +23843,7 @@
       <w:pPr>
         <w:pStyle w:val="Heading2"/>
       </w:pPr>
-      <w:bookmarkStart w:id="75" w:name="_Toc241916454"/>
+      <w:bookmarkStart w:id="75" w:name="_Toc241958228"/>
       <w:r>
         <w:t>5.8. Lương giáo viên</w:t>
       </w:r>
@@ -23821,7 +23895,7 @@
         </w:rPr>
         <w:lastRenderedPageBreak/>
         <w:drawing>
-          <wp:inline distT="0" distB="0" distL="0" distR="0" wp14:anchorId="28475509" wp14:editId="5395F0D1">
+          <wp:inline distT="0" distB="0" distL="0" distR="0" wp14:anchorId="2D1D002C" wp14:editId="4C9C6250">
             <wp:extent cx="5580000" cy="3332500"/>
             <wp:effectExtent l="0" t="0" r="0" b="0"/>
             <wp:docPr id="522444773" name="Picture 522444773"/>
@@ -23861,7 +23935,7 @@
       <w:pPr>
         <w:pStyle w:val="FigureCaption"/>
       </w:pPr>
-      <w:bookmarkStart w:id="76" w:name="_Toc241916476"/>
+      <w:bookmarkStart w:id="76" w:name="_Toc241958250"/>
       <w:r>
         <w:t>Hình 5.8. Bảng lương giáo viên (Kế toán)</w:t>
       </w:r>
@@ -23871,7 +23945,7 @@
       <w:pPr>
         <w:pStyle w:val="Heading2"/>
       </w:pPr>
-      <w:bookmarkStart w:id="77" w:name="_Toc241916455"/>
+      <w:bookmarkStart w:id="77" w:name="_Toc241958229"/>
       <w:r>
         <w:t>5.9. Tài khoản</w:t>
       </w:r>
@@ -23968,7 +24042,7 @@
         </w:rPr>
         <w:lastRenderedPageBreak/>
         <w:drawing>
-          <wp:inline distT="0" distB="0" distL="0" distR="0" wp14:anchorId="3A4464C2" wp14:editId="6CDA305A">
+          <wp:inline distT="0" distB="0" distL="0" distR="0" wp14:anchorId="26747819" wp14:editId="5D30132C">
             <wp:extent cx="5580000" cy="3332500"/>
             <wp:effectExtent l="0" t="0" r="0" b="0"/>
             <wp:docPr id="522444774" name="Picture 522444774"/>
@@ -24008,37 +24082,743 @@
       <w:pPr>
         <w:pStyle w:val="FigureCaption"/>
       </w:pPr>
-      <w:bookmarkStart w:id="78" w:name="_Toc241916477"/>
+      <w:bookmarkStart w:id="78" w:name="_Toc241958251"/>
       <w:r>
         <w:t>Hình 5.9. Danh sách tài khoản (Quản lý)</w:t>
       </w:r>
       <w:bookmarkEnd w:id="78"/>
     </w:p>
-    <w:p>
-      <w:pPr>
-        <w:pStyle w:val="Heading2"/>
-      </w:pPr>
-      <w:bookmarkStart w:id="79" w:name="_Toc241916456"/>
-      <w:r>
-        <w:t>5.10. Chức năng dành cho giáo viên</w:t>
-      </w:r>
-      <w:bookmarkEnd w:id="79"/>
-    </w:p>
-    <w:p>
-      <w:pPr>
-        <w:spacing w:after="120" w:line="276" w:lineRule="auto"/>
-        <w:ind w:firstLine="284"/>
-        <w:jc w:val="both"/>
-      </w:pPr>
-      <w:r>
-        <w:rPr>
-          <w:i/>
-        </w:rPr>
-        <w:t>Vai trò: Giáo viên.</w:t>
-      </w:r>
-      <w:r>
-        <w:t xml:space="preserve"> Giáo viên chỉ thấy dữ liệu của chính mình (CSDL lọc theo tài khoản đăng nhập):</w:t>
-      </w:r>
+    <w:tbl>
+      <w:tblPr>
+        <w:tblW w:w="0" w:type="auto"/>
+        <w:jc w:val="center"/>
+        <w:tblLook w:val="04A0" w:firstRow="1" w:lastRow="0" w:firstColumn="1" w:lastColumn="0" w:noHBand="0" w:noVBand="1"/>
+      </w:tblPr>
+      <w:tblGrid>
+        <w:gridCol w:w="9060"/>
+      </w:tblGrid>
+      <w:tr>
+        <w:trPr>
+          <w:cantSplit/>
+          <w:jc w:val="center"/>
+        </w:trPr>
+        <w:tc>
+          <w:tcPr>
+            <w:tcW w:w="9070" w:type="dxa"/>
+            <w:tcBorders>
+              <w:top w:val="single" w:sz="4" w:space="0" w:color="BFBFBF"/>
+              <w:left w:val="single" w:sz="4" w:space="0" w:color="BFBFBF"/>
+              <w:bottom w:val="single" w:sz="4" w:space="0" w:color="BFBFBF"/>
+              <w:right w:val="single" w:sz="4" w:space="0" w:color="BFBFBF"/>
+            </w:tcBorders>
+            <w:shd w:val="clear" w:color="auto" w:fill="E7ECF5"/>
+            <w:tcMar>
+              <w:top w:w="40" w:type="dxa"/>
+              <w:left w:w="140" w:type="dxa"/>
+              <w:bottom w:w="40" w:type="dxa"/>
+              <w:right w:w="140" w:type="dxa"/>
+            </w:tcMar>
+          </w:tcPr>
+          <w:p>
+            <w:pPr>
+              <w:keepNext/>
+            </w:pPr>
+            <w:r>
+              <w:rPr>
+                <w:b/>
+                <w:color w:val="1F3864"/>
+                <w:sz w:val="22"/>
+              </w:rPr>
+              <w:t>SSMS (đăng nhập bằng tài khoản quản lý)</w:t>
+            </w:r>
+          </w:p>
+        </w:tc>
+      </w:tr>
+      <w:tr>
+        <w:trPr>
+          <w:jc w:val="center"/>
+        </w:trPr>
+        <w:tc>
+          <w:tcPr>
+            <w:tcW w:w="9070" w:type="dxa"/>
+            <w:tcBorders>
+              <w:top w:val="single" w:sz="4" w:space="0" w:color="BFBFBF"/>
+              <w:left w:val="single" w:sz="4" w:space="0" w:color="BFBFBF"/>
+              <w:bottom w:val="single" w:sz="4" w:space="0" w:color="BFBFBF"/>
+              <w:right w:val="single" w:sz="4" w:space="0" w:color="BFBFBF"/>
+            </w:tcBorders>
+            <w:shd w:val="clear" w:color="auto" w:fill="F7F7F7"/>
+            <w:tcMar>
+              <w:top w:w="80" w:type="dxa"/>
+              <w:left w:w="140" w:type="dxa"/>
+              <w:bottom w:w="80" w:type="dxa"/>
+              <w:right w:w="140" w:type="dxa"/>
+            </w:tcMar>
+          </w:tcPr>
+          <w:p>
+            <w:r>
+              <w:rPr>
+                <w:rFonts w:ascii="Consolas" w:eastAsia="Consolas" w:hAnsi="Consolas" w:cs="Consolas"/>
+                <w:color w:val="008000"/>
+                <w:sz w:val="19"/>
+              </w:rPr>
+              <w:t>-- T</w:t>
+            </w:r>
+            <w:r>
+              <w:rPr>
+                <w:rFonts w:ascii="Consolas" w:eastAsia="Consolas" w:hAnsi="Consolas" w:cs="Consolas"/>
+                <w:color w:val="008000"/>
+                <w:sz w:val="19"/>
+              </w:rPr>
+              <w:t>ạ</w:t>
+            </w:r>
+            <w:r>
+              <w:rPr>
+                <w:rFonts w:ascii="Consolas" w:eastAsia="Consolas" w:hAnsi="Consolas" w:cs="Consolas"/>
+                <w:color w:val="008000"/>
+                <w:sz w:val="19"/>
+              </w:rPr>
+              <w:t>o tài kho</w:t>
+            </w:r>
+            <w:r>
+              <w:rPr>
+                <w:rFonts w:ascii="Consolas" w:eastAsia="Consolas" w:hAnsi="Consolas" w:cs="Consolas"/>
+                <w:color w:val="008000"/>
+                <w:sz w:val="19"/>
+              </w:rPr>
+              <w:t>ả</w:t>
+            </w:r>
+            <w:r>
+              <w:rPr>
+                <w:rFonts w:ascii="Consolas" w:eastAsia="Consolas" w:hAnsi="Consolas" w:cs="Consolas"/>
+                <w:color w:val="008000"/>
+                <w:sz w:val="19"/>
+              </w:rPr>
+              <w:t>n cho giáo viên TE0004</w:t>
+            </w:r>
+          </w:p>
+          <w:p>
+            <w:r>
+              <w:rPr>
+                <w:rFonts w:ascii="Consolas" w:eastAsia="Consolas" w:hAnsi="Consolas" w:cs="Consolas"/>
+                <w:color w:val="0000FF"/>
+                <w:sz w:val="19"/>
+              </w:rPr>
+              <w:t>EXEC</w:t>
+            </w:r>
+            <w:r>
+              <w:rPr>
+                <w:rFonts w:ascii="Consolas" w:eastAsia="Consolas" w:hAnsi="Consolas" w:cs="Consolas"/>
+                <w:sz w:val="19"/>
+              </w:rPr>
+              <w:t xml:space="preserve"> </w:t>
+            </w:r>
+            <w:r>
+              <w:rPr>
+                <w:rFonts w:ascii="Consolas" w:eastAsia="Consolas" w:hAnsi="Consolas" w:cs="Consolas"/>
+                <w:color w:val="000000"/>
+                <w:sz w:val="19"/>
+              </w:rPr>
+              <w:t>dbo</w:t>
+            </w:r>
+            <w:r>
+              <w:rPr>
+                <w:rFonts w:ascii="Consolas" w:eastAsia="Consolas" w:hAnsi="Consolas" w:cs="Consolas"/>
+                <w:color w:val="808080"/>
+                <w:sz w:val="19"/>
+              </w:rPr>
+              <w:t>.</w:t>
+            </w:r>
+            <w:r>
+              <w:rPr>
+                <w:rFonts w:ascii="Consolas" w:eastAsia="Consolas" w:hAnsi="Consolas" w:cs="Consolas"/>
+                <w:color w:val="000000"/>
+                <w:sz w:val="19"/>
+              </w:rPr>
+              <w:t>usp_Account_Create</w:t>
+            </w:r>
+            <w:r>
+              <w:rPr>
+                <w:rFonts w:ascii="Consolas" w:eastAsia="Consolas" w:hAnsi="Consolas" w:cs="Consolas"/>
+                <w:sz w:val="19"/>
+              </w:rPr>
+              <w:t xml:space="preserve"> </w:t>
+            </w:r>
+            <w:r>
+              <w:rPr>
+                <w:rFonts w:ascii="Consolas" w:eastAsia="Consolas" w:hAnsi="Consolas" w:cs="Consolas"/>
+                <w:color w:val="A31515"/>
+                <w:sz w:val="19"/>
+              </w:rPr>
+              <w:t>N'gv_emily'</w:t>
+            </w:r>
+            <w:r>
+              <w:rPr>
+                <w:rFonts w:ascii="Consolas" w:eastAsia="Consolas" w:hAnsi="Consolas" w:cs="Consolas"/>
+                <w:color w:val="808080"/>
+                <w:sz w:val="19"/>
+              </w:rPr>
+              <w:t>,</w:t>
+            </w:r>
+            <w:r>
+              <w:rPr>
+                <w:rFonts w:ascii="Consolas" w:eastAsia="Consolas" w:hAnsi="Consolas" w:cs="Consolas"/>
+                <w:sz w:val="19"/>
+              </w:rPr>
+              <w:t xml:space="preserve"> </w:t>
+            </w:r>
+            <w:r>
+              <w:rPr>
+                <w:rFonts w:ascii="Consolas" w:eastAsia="Consolas" w:hAnsi="Consolas" w:cs="Consolas"/>
+                <w:color w:val="A31515"/>
+                <w:sz w:val="19"/>
+              </w:rPr>
+              <w:t>N'&lt;m</w:t>
+            </w:r>
+            <w:r>
+              <w:rPr>
+                <w:rFonts w:ascii="Consolas" w:eastAsia="Consolas" w:hAnsi="Consolas" w:cs="Consolas"/>
+                <w:color w:val="A31515"/>
+                <w:sz w:val="19"/>
+              </w:rPr>
+              <w:t>ậ</w:t>
+            </w:r>
+            <w:r>
+              <w:rPr>
+                <w:rFonts w:ascii="Consolas" w:eastAsia="Consolas" w:hAnsi="Consolas" w:cs="Consolas"/>
+                <w:color w:val="A31515"/>
+                <w:sz w:val="19"/>
+              </w:rPr>
+              <w:t>t kh</w:t>
+            </w:r>
+            <w:r>
+              <w:rPr>
+                <w:rFonts w:ascii="Consolas" w:eastAsia="Consolas" w:hAnsi="Consolas" w:cs="Consolas"/>
+                <w:color w:val="A31515"/>
+                <w:sz w:val="19"/>
+              </w:rPr>
+              <w:t>ẩ</w:t>
+            </w:r>
+            <w:r>
+              <w:rPr>
+                <w:rFonts w:ascii="Consolas" w:eastAsia="Consolas" w:hAnsi="Consolas" w:cs="Consolas"/>
+                <w:color w:val="A31515"/>
+                <w:sz w:val="19"/>
+              </w:rPr>
+              <w:t>u&gt;'</w:t>
+            </w:r>
+            <w:r>
+              <w:rPr>
+                <w:rFonts w:ascii="Consolas" w:eastAsia="Consolas" w:hAnsi="Consolas" w:cs="Consolas"/>
+                <w:color w:val="808080"/>
+                <w:sz w:val="19"/>
+              </w:rPr>
+              <w:t>,</w:t>
+            </w:r>
+            <w:r>
+              <w:rPr>
+                <w:rFonts w:ascii="Consolas" w:eastAsia="Consolas" w:hAnsi="Consolas" w:cs="Consolas"/>
+                <w:sz w:val="19"/>
+              </w:rPr>
+              <w:t xml:space="preserve"> </w:t>
+            </w:r>
+            <w:r>
+              <w:rPr>
+                <w:rFonts w:ascii="Consolas" w:eastAsia="Consolas" w:hAnsi="Consolas" w:cs="Consolas"/>
+                <w:color w:val="A31515"/>
+                <w:sz w:val="19"/>
+              </w:rPr>
+              <w:t>'TEACHER'</w:t>
+            </w:r>
+            <w:r>
+              <w:rPr>
+                <w:rFonts w:ascii="Consolas" w:eastAsia="Consolas" w:hAnsi="Consolas" w:cs="Consolas"/>
+                <w:color w:val="808080"/>
+                <w:sz w:val="19"/>
+              </w:rPr>
+              <w:t>,</w:t>
+            </w:r>
+          </w:p>
+          <w:p>
+            <w:r>
+              <w:rPr>
+                <w:rFonts w:ascii="Consolas" w:eastAsia="Consolas" w:hAnsi="Consolas" w:cs="Consolas"/>
+                <w:sz w:val="19"/>
+              </w:rPr>
+              <w:t xml:space="preserve">     </w:t>
+            </w:r>
+            <w:r>
+              <w:rPr>
+                <w:rFonts w:ascii="Consolas" w:eastAsia="Consolas" w:hAnsi="Consolas" w:cs="Consolas"/>
+                <w:color w:val="0000FF"/>
+                <w:sz w:val="19"/>
+              </w:rPr>
+              <w:t>NULL</w:t>
+            </w:r>
+            <w:r>
+              <w:rPr>
+                <w:rFonts w:ascii="Consolas" w:eastAsia="Consolas" w:hAnsi="Consolas" w:cs="Consolas"/>
+                <w:color w:val="808080"/>
+                <w:sz w:val="19"/>
+              </w:rPr>
+              <w:t>,</w:t>
+            </w:r>
+            <w:r>
+              <w:rPr>
+                <w:rFonts w:ascii="Consolas" w:eastAsia="Consolas" w:hAnsi="Consolas" w:cs="Consolas"/>
+                <w:sz w:val="19"/>
+              </w:rPr>
+              <w:t xml:space="preserve"> </w:t>
+            </w:r>
+            <w:r>
+              <w:rPr>
+                <w:rFonts w:ascii="Consolas" w:eastAsia="Consolas" w:hAnsi="Consolas" w:cs="Consolas"/>
+                <w:color w:val="A31515"/>
+                <w:sz w:val="19"/>
+              </w:rPr>
+              <w:t>'TE0004'</w:t>
+            </w:r>
+            <w:r>
+              <w:rPr>
+                <w:rFonts w:ascii="Consolas" w:eastAsia="Consolas" w:hAnsi="Consolas" w:cs="Consolas"/>
+                <w:color w:val="808080"/>
+                <w:sz w:val="19"/>
+              </w:rPr>
+              <w:t>;</w:t>
+            </w:r>
+          </w:p>
+          <w:p>
+            <w:r>
+              <w:rPr>
+                <w:rFonts w:ascii="Consolas" w:eastAsia="Consolas" w:hAnsi="Consolas" w:cs="Consolas"/>
+                <w:color w:val="008000"/>
+                <w:sz w:val="19"/>
+              </w:rPr>
+              <w:t>-- Khóa (1) r</w:t>
+            </w:r>
+            <w:r>
+              <w:rPr>
+                <w:rFonts w:ascii="Consolas" w:eastAsia="Consolas" w:hAnsi="Consolas" w:cs="Consolas"/>
+                <w:color w:val="008000"/>
+                <w:sz w:val="19"/>
+              </w:rPr>
+              <w:t>ồ</w:t>
+            </w:r>
+            <w:r>
+              <w:rPr>
+                <w:rFonts w:ascii="Consolas" w:eastAsia="Consolas" w:hAnsi="Consolas" w:cs="Consolas"/>
+                <w:color w:val="008000"/>
+                <w:sz w:val="19"/>
+              </w:rPr>
+              <w:t>i m</w:t>
+            </w:r>
+            <w:r>
+              <w:rPr>
+                <w:rFonts w:ascii="Consolas" w:eastAsia="Consolas" w:hAnsi="Consolas" w:cs="Consolas"/>
+                <w:color w:val="008000"/>
+                <w:sz w:val="19"/>
+              </w:rPr>
+              <w:t>ở</w:t>
+            </w:r>
+            <w:r>
+              <w:rPr>
+                <w:rFonts w:ascii="Consolas" w:eastAsia="Consolas" w:hAnsi="Consolas" w:cs="Consolas"/>
+                <w:color w:val="008000"/>
+                <w:sz w:val="19"/>
+              </w:rPr>
+              <w:t xml:space="preserve"> khóa (0)</w:t>
+            </w:r>
+          </w:p>
+          <w:p>
+            <w:r>
+              <w:rPr>
+                <w:rFonts w:ascii="Consolas" w:eastAsia="Consolas" w:hAnsi="Consolas" w:cs="Consolas"/>
+                <w:color w:val="0000FF"/>
+                <w:sz w:val="19"/>
+              </w:rPr>
+              <w:t>EXEC</w:t>
+            </w:r>
+            <w:r>
+              <w:rPr>
+                <w:rFonts w:ascii="Consolas" w:eastAsia="Consolas" w:hAnsi="Consolas" w:cs="Consolas"/>
+                <w:sz w:val="19"/>
+              </w:rPr>
+              <w:t xml:space="preserve"> </w:t>
+            </w:r>
+            <w:r>
+              <w:rPr>
+                <w:rFonts w:ascii="Consolas" w:eastAsia="Consolas" w:hAnsi="Consolas" w:cs="Consolas"/>
+                <w:color w:val="000000"/>
+                <w:sz w:val="19"/>
+              </w:rPr>
+              <w:t>dbo</w:t>
+            </w:r>
+            <w:r>
+              <w:rPr>
+                <w:rFonts w:ascii="Consolas" w:eastAsia="Consolas" w:hAnsi="Consolas" w:cs="Consolas"/>
+                <w:color w:val="808080"/>
+                <w:sz w:val="19"/>
+              </w:rPr>
+              <w:t>.</w:t>
+            </w:r>
+            <w:r>
+              <w:rPr>
+                <w:rFonts w:ascii="Consolas" w:eastAsia="Consolas" w:hAnsi="Consolas" w:cs="Consolas"/>
+                <w:color w:val="000000"/>
+                <w:sz w:val="19"/>
+              </w:rPr>
+              <w:t>usp_Account_Lock</w:t>
+            </w:r>
+            <w:r>
+              <w:rPr>
+                <w:rFonts w:ascii="Consolas" w:eastAsia="Consolas" w:hAnsi="Consolas" w:cs="Consolas"/>
+                <w:sz w:val="19"/>
+              </w:rPr>
+              <w:t xml:space="preserve"> </w:t>
+            </w:r>
+            <w:r>
+              <w:rPr>
+                <w:rFonts w:ascii="Consolas" w:eastAsia="Consolas" w:hAnsi="Consolas" w:cs="Consolas"/>
+                <w:color w:val="A31515"/>
+                <w:sz w:val="19"/>
+              </w:rPr>
+              <w:t>N'gv_emily'</w:t>
+            </w:r>
+            <w:r>
+              <w:rPr>
+                <w:rFonts w:ascii="Consolas" w:eastAsia="Consolas" w:hAnsi="Consolas" w:cs="Consolas"/>
+                <w:color w:val="808080"/>
+                <w:sz w:val="19"/>
+              </w:rPr>
+              <w:t>,</w:t>
+            </w:r>
+            <w:r>
+              <w:rPr>
+                <w:rFonts w:ascii="Consolas" w:eastAsia="Consolas" w:hAnsi="Consolas" w:cs="Consolas"/>
+                <w:sz w:val="19"/>
+              </w:rPr>
+              <w:t xml:space="preserve"> </w:t>
+            </w:r>
+            <w:r>
+              <w:rPr>
+                <w:rFonts w:ascii="Consolas" w:eastAsia="Consolas" w:hAnsi="Consolas" w:cs="Consolas"/>
+                <w:color w:val="098658"/>
+                <w:sz w:val="19"/>
+              </w:rPr>
+              <w:t>1</w:t>
+            </w:r>
+            <w:r>
+              <w:rPr>
+                <w:rFonts w:ascii="Consolas" w:eastAsia="Consolas" w:hAnsi="Consolas" w:cs="Consolas"/>
+                <w:color w:val="808080"/>
+                <w:sz w:val="19"/>
+              </w:rPr>
+              <w:t>;</w:t>
+            </w:r>
+          </w:p>
+          <w:p>
+            <w:r>
+              <w:rPr>
+                <w:rFonts w:ascii="Consolas" w:eastAsia="Consolas" w:hAnsi="Consolas" w:cs="Consolas"/>
+                <w:color w:val="0000FF"/>
+                <w:sz w:val="19"/>
+              </w:rPr>
+              <w:t>EXEC</w:t>
+            </w:r>
+            <w:r>
+              <w:rPr>
+                <w:rFonts w:ascii="Consolas" w:eastAsia="Consolas" w:hAnsi="Consolas" w:cs="Consolas"/>
+                <w:sz w:val="19"/>
+              </w:rPr>
+              <w:t xml:space="preserve"> </w:t>
+            </w:r>
+            <w:r>
+              <w:rPr>
+                <w:rFonts w:ascii="Consolas" w:eastAsia="Consolas" w:hAnsi="Consolas" w:cs="Consolas"/>
+                <w:color w:val="000000"/>
+                <w:sz w:val="19"/>
+              </w:rPr>
+              <w:t>dbo</w:t>
+            </w:r>
+            <w:r>
+              <w:rPr>
+                <w:rFonts w:ascii="Consolas" w:eastAsia="Consolas" w:hAnsi="Consolas" w:cs="Consolas"/>
+                <w:color w:val="808080"/>
+                <w:sz w:val="19"/>
+              </w:rPr>
+              <w:t>.</w:t>
+            </w:r>
+            <w:r>
+              <w:rPr>
+                <w:rFonts w:ascii="Consolas" w:eastAsia="Consolas" w:hAnsi="Consolas" w:cs="Consolas"/>
+                <w:color w:val="000000"/>
+                <w:sz w:val="19"/>
+              </w:rPr>
+              <w:t>usp_Account_Lock</w:t>
+            </w:r>
+            <w:r>
+              <w:rPr>
+                <w:rFonts w:ascii="Consolas" w:eastAsia="Consolas" w:hAnsi="Consolas" w:cs="Consolas"/>
+                <w:sz w:val="19"/>
+              </w:rPr>
+              <w:t xml:space="preserve"> </w:t>
+            </w:r>
+            <w:r>
+              <w:rPr>
+                <w:rFonts w:ascii="Consolas" w:eastAsia="Consolas" w:hAnsi="Consolas" w:cs="Consolas"/>
+                <w:color w:val="A31515"/>
+                <w:sz w:val="19"/>
+              </w:rPr>
+              <w:t>N'gv_emily'</w:t>
+            </w:r>
+            <w:r>
+              <w:rPr>
+                <w:rFonts w:ascii="Consolas" w:eastAsia="Consolas" w:hAnsi="Consolas" w:cs="Consolas"/>
+                <w:color w:val="808080"/>
+                <w:sz w:val="19"/>
+              </w:rPr>
+              <w:t>,</w:t>
+            </w:r>
+            <w:r>
+              <w:rPr>
+                <w:rFonts w:ascii="Consolas" w:eastAsia="Consolas" w:hAnsi="Consolas" w:cs="Consolas"/>
+                <w:sz w:val="19"/>
+              </w:rPr>
+              <w:t xml:space="preserve"> </w:t>
+            </w:r>
+            <w:r>
+              <w:rPr>
+                <w:rFonts w:ascii="Consolas" w:eastAsia="Consolas" w:hAnsi="Consolas" w:cs="Consolas"/>
+                <w:color w:val="098658"/>
+                <w:sz w:val="19"/>
+              </w:rPr>
+              <w:t>0</w:t>
+            </w:r>
+            <w:r>
+              <w:rPr>
+                <w:rFonts w:ascii="Consolas" w:eastAsia="Consolas" w:hAnsi="Consolas" w:cs="Consolas"/>
+                <w:color w:val="808080"/>
+                <w:sz w:val="19"/>
+              </w:rPr>
+              <w:t>;</w:t>
+            </w:r>
+          </w:p>
+          <w:p>
+            <w:r>
+              <w:rPr>
+                <w:rFonts w:ascii="Consolas" w:eastAsia="Consolas" w:hAnsi="Consolas" w:cs="Consolas"/>
+                <w:color w:val="008000"/>
+                <w:sz w:val="19"/>
+              </w:rPr>
+              <w:t>-- Đ</w:t>
+            </w:r>
+            <w:r>
+              <w:rPr>
+                <w:rFonts w:ascii="Consolas" w:eastAsia="Consolas" w:hAnsi="Consolas" w:cs="Consolas"/>
+                <w:color w:val="008000"/>
+                <w:sz w:val="19"/>
+              </w:rPr>
+              <w:t>ặ</w:t>
+            </w:r>
+            <w:r>
+              <w:rPr>
+                <w:rFonts w:ascii="Consolas" w:eastAsia="Consolas" w:hAnsi="Consolas" w:cs="Consolas"/>
+                <w:color w:val="008000"/>
+                <w:sz w:val="19"/>
+              </w:rPr>
+              <w:t>t l</w:t>
+            </w:r>
+            <w:r>
+              <w:rPr>
+                <w:rFonts w:ascii="Consolas" w:eastAsia="Consolas" w:hAnsi="Consolas" w:cs="Consolas"/>
+                <w:color w:val="008000"/>
+                <w:sz w:val="19"/>
+              </w:rPr>
+              <w:t>ạ</w:t>
+            </w:r>
+            <w:r>
+              <w:rPr>
+                <w:rFonts w:ascii="Consolas" w:eastAsia="Consolas" w:hAnsi="Consolas" w:cs="Consolas"/>
+                <w:color w:val="008000"/>
+                <w:sz w:val="19"/>
+              </w:rPr>
+              <w:t>i m</w:t>
+            </w:r>
+            <w:r>
+              <w:rPr>
+                <w:rFonts w:ascii="Consolas" w:eastAsia="Consolas" w:hAnsi="Consolas" w:cs="Consolas"/>
+                <w:color w:val="008000"/>
+                <w:sz w:val="19"/>
+              </w:rPr>
+              <w:t>ậ</w:t>
+            </w:r>
+            <w:r>
+              <w:rPr>
+                <w:rFonts w:ascii="Consolas" w:eastAsia="Consolas" w:hAnsi="Consolas" w:cs="Consolas"/>
+                <w:color w:val="008000"/>
+                <w:sz w:val="19"/>
+              </w:rPr>
+              <w:t>t kh</w:t>
+            </w:r>
+            <w:r>
+              <w:rPr>
+                <w:rFonts w:ascii="Consolas" w:eastAsia="Consolas" w:hAnsi="Consolas" w:cs="Consolas"/>
+                <w:color w:val="008000"/>
+                <w:sz w:val="19"/>
+              </w:rPr>
+              <w:t>ẩ</w:t>
+            </w:r>
+            <w:r>
+              <w:rPr>
+                <w:rFonts w:ascii="Consolas" w:eastAsia="Consolas" w:hAnsi="Consolas" w:cs="Consolas"/>
+                <w:color w:val="008000"/>
+                <w:sz w:val="19"/>
+              </w:rPr>
+              <w:t>u</w:t>
+            </w:r>
+          </w:p>
+          <w:p>
+            <w:r>
+              <w:rPr>
+                <w:rFonts w:ascii="Consolas" w:eastAsia="Consolas" w:hAnsi="Consolas" w:cs="Consolas"/>
+                <w:color w:val="0000FF"/>
+                <w:sz w:val="19"/>
+              </w:rPr>
+              <w:t>EXEC</w:t>
+            </w:r>
+            <w:r>
+              <w:rPr>
+                <w:rFonts w:ascii="Consolas" w:eastAsia="Consolas" w:hAnsi="Consolas" w:cs="Consolas"/>
+                <w:sz w:val="19"/>
+              </w:rPr>
+              <w:t xml:space="preserve"> </w:t>
+            </w:r>
+            <w:r>
+              <w:rPr>
+                <w:rFonts w:ascii="Consolas" w:eastAsia="Consolas" w:hAnsi="Consolas" w:cs="Consolas"/>
+                <w:color w:val="000000"/>
+                <w:sz w:val="19"/>
+              </w:rPr>
+              <w:t>dbo</w:t>
+            </w:r>
+            <w:r>
+              <w:rPr>
+                <w:rFonts w:ascii="Consolas" w:eastAsia="Consolas" w:hAnsi="Consolas" w:cs="Consolas"/>
+                <w:color w:val="808080"/>
+                <w:sz w:val="19"/>
+              </w:rPr>
+              <w:t>.</w:t>
+            </w:r>
+            <w:r>
+              <w:rPr>
+                <w:rFonts w:ascii="Consolas" w:eastAsia="Consolas" w:hAnsi="Consolas" w:cs="Consolas"/>
+                <w:color w:val="000000"/>
+                <w:sz w:val="19"/>
+              </w:rPr>
+              <w:t>usp_Account_ResetPassword</w:t>
+            </w:r>
+            <w:r>
+              <w:rPr>
+                <w:rFonts w:ascii="Consolas" w:eastAsia="Consolas" w:hAnsi="Consolas" w:cs="Consolas"/>
+                <w:sz w:val="19"/>
+              </w:rPr>
+              <w:t xml:space="preserve"> </w:t>
+            </w:r>
+            <w:r>
+              <w:rPr>
+                <w:rFonts w:ascii="Consolas" w:eastAsia="Consolas" w:hAnsi="Consolas" w:cs="Consolas"/>
+                <w:color w:val="A31515"/>
+                <w:sz w:val="19"/>
+              </w:rPr>
+              <w:t>N'gv_emily'</w:t>
+            </w:r>
+            <w:r>
+              <w:rPr>
+                <w:rFonts w:ascii="Consolas" w:eastAsia="Consolas" w:hAnsi="Consolas" w:cs="Consolas"/>
+                <w:color w:val="808080"/>
+                <w:sz w:val="19"/>
+              </w:rPr>
+              <w:t>,</w:t>
+            </w:r>
+            <w:r>
+              <w:rPr>
+                <w:rFonts w:ascii="Consolas" w:eastAsia="Consolas" w:hAnsi="Consolas" w:cs="Consolas"/>
+                <w:sz w:val="19"/>
+              </w:rPr>
+              <w:t xml:space="preserve"> </w:t>
+            </w:r>
+            <w:r>
+              <w:rPr>
+                <w:rFonts w:ascii="Consolas" w:eastAsia="Consolas" w:hAnsi="Consolas" w:cs="Consolas"/>
+                <w:color w:val="A31515"/>
+                <w:sz w:val="19"/>
+              </w:rPr>
+              <w:t>N'&lt;m</w:t>
+            </w:r>
+            <w:r>
+              <w:rPr>
+                <w:rFonts w:ascii="Consolas" w:eastAsia="Consolas" w:hAnsi="Consolas" w:cs="Consolas"/>
+                <w:color w:val="A31515"/>
+                <w:sz w:val="19"/>
+              </w:rPr>
+              <w:t>ậ</w:t>
+            </w:r>
+            <w:r>
+              <w:rPr>
+                <w:rFonts w:ascii="Consolas" w:eastAsia="Consolas" w:hAnsi="Consolas" w:cs="Consolas"/>
+                <w:color w:val="A31515"/>
+                <w:sz w:val="19"/>
+              </w:rPr>
+              <w:t>t kh</w:t>
+            </w:r>
+            <w:r>
+              <w:rPr>
+                <w:rFonts w:ascii="Consolas" w:eastAsia="Consolas" w:hAnsi="Consolas" w:cs="Consolas"/>
+                <w:color w:val="A31515"/>
+                <w:sz w:val="19"/>
+              </w:rPr>
+              <w:t>ẩ</w:t>
+            </w:r>
+            <w:r>
+              <w:rPr>
+                <w:rFonts w:ascii="Consolas" w:eastAsia="Consolas" w:hAnsi="Consolas" w:cs="Consolas"/>
+                <w:color w:val="A31515"/>
+                <w:sz w:val="19"/>
+              </w:rPr>
+              <w:t>u m</w:t>
+            </w:r>
+            <w:r>
+              <w:rPr>
+                <w:rFonts w:ascii="Consolas" w:eastAsia="Consolas" w:hAnsi="Consolas" w:cs="Consolas"/>
+                <w:color w:val="A31515"/>
+                <w:sz w:val="19"/>
+              </w:rPr>
+              <w:t>ớ</w:t>
+            </w:r>
+            <w:r>
+              <w:rPr>
+                <w:rFonts w:ascii="Consolas" w:eastAsia="Consolas" w:hAnsi="Consolas" w:cs="Consolas"/>
+                <w:color w:val="A31515"/>
+                <w:sz w:val="19"/>
+              </w:rPr>
+              <w:t>i&gt;'</w:t>
+            </w:r>
+            <w:r>
+              <w:rPr>
+                <w:rFonts w:ascii="Consolas" w:eastAsia="Consolas" w:hAnsi="Consolas" w:cs="Consolas"/>
+                <w:color w:val="808080"/>
+                <w:sz w:val="19"/>
+              </w:rPr>
+              <w:t>;</w:t>
+            </w:r>
+          </w:p>
+        </w:tc>
+      </w:tr>
+    </w:tbl>
+    <w:p>
+      <w:pPr>
+        <w:spacing w:after="80"/>
+      </w:pPr>
     </w:p>
     <w:p>
       <w:pPr>
@@ -24054,10 +24834,28 @@
         <w:rPr>
           <w:b/>
         </w:rPr>
-        <w:t>Lớp của tôi</w:t>
-      </w:r>
-      <w:r>
-        <w:t>: các lớp được phân công, kèm khóa học, phòng, chi nhánh, ngày khai giảng/kết thúc, sĩ số và trạng thái.</w:t>
+        <w:t>Tên đăng nhập</w:t>
+      </w:r>
+      <w:r>
+        <w:t xml:space="preserve">: chỉ gồm chữ cái không dấu, chữ số, dấu chấm và dấu gạch dưới, ít nhất 3 ký tự (tên có dấu như </w:t>
+      </w:r>
+      <w:r>
+        <w:rPr>
+          <w:color w:val="C7254E"/>
+        </w:rPr>
+        <w:t>gv_ánh</w:t>
+      </w:r>
+      <w:r>
+        <w:t xml:space="preserve"> bị từ chối) và chưa có tài khoản nào dùng. </w:t>
+      </w:r>
+      <w:r>
+        <w:rPr>
+          <w:b/>
+        </w:rPr>
+        <w:t>Mật khẩu</w:t>
+      </w:r>
+      <w:r>
+        <w:t xml:space="preserve"> ít nhất 8 ký tự.</w:t>
       </w:r>
     </w:p>
     <w:p>
@@ -24074,10 +24872,64 @@
         <w:rPr>
           <w:b/>
         </w:rPr>
-        <w:t>Lịch dạy</w:t>
-      </w:r>
-      <w:r>
-        <w:t>: các buổi dạy từ thứ Hai của tuần hiện tại trở đi, theo ngày và giờ.</w:t>
+        <w:t>Vai trò</w:t>
+      </w:r>
+      <w:r>
+        <w:t xml:space="preserve">: </w:t>
+      </w:r>
+      <w:r>
+        <w:rPr>
+          <w:color w:val="C7254E"/>
+        </w:rPr>
+        <w:t>MANAGER</w:t>
+      </w:r>
+      <w:r>
+        <w:t xml:space="preserve"> (Quản lý), </w:t>
+      </w:r>
+      <w:r>
+        <w:rPr>
+          <w:color w:val="C7254E"/>
+        </w:rPr>
+        <w:t>ACADEMIC_STAFF</w:t>
+      </w:r>
+      <w:r>
+        <w:t xml:space="preserve"> (Giáo vụ), </w:t>
+      </w:r>
+      <w:r>
+        <w:rPr>
+          <w:color w:val="C7254E"/>
+        </w:rPr>
+        <w:t>ACCOUNTANT</w:t>
+      </w:r>
+      <w:r>
+        <w:t xml:space="preserve"> (Kế toán), </w:t>
+      </w:r>
+      <w:r>
+        <w:rPr>
+          <w:color w:val="C7254E"/>
+        </w:rPr>
+        <w:t>TEACHER</w:t>
+      </w:r>
+      <w:r>
+        <w:t xml:space="preserve"> (Giáo viên). Tài khoản giáo viên cần mã giáo viên (</w:t>
+      </w:r>
+      <w:r>
+        <w:rPr>
+          <w:color w:val="C7254E"/>
+        </w:rPr>
+        <w:t>TE...</w:t>
+      </w:r>
+      <w:r>
+        <w:t>, tham số thứ năm); các vai trò khác cần mã nhân viên (</w:t>
+      </w:r>
+      <w:r>
+        <w:rPr>
+          <w:color w:val="C7254E"/>
+        </w:rPr>
+        <w:t>EM...</w:t>
+      </w:r>
+      <w:r>
+        <w:t>, tham số thứ tư).</w:t>
       </w:r>
     </w:p>
     <w:p>
@@ -24094,6 +24946,120 @@
         <w:rPr>
           <w:b/>
         </w:rPr>
+        <w:t>Khóa / mở khóa</w:t>
+      </w:r>
+      <w:r>
+        <w:t xml:space="preserve">: tham số thứ hai bắt buộc là </w:t>
+      </w:r>
+      <w:r>
+        <w:rPr>
+          <w:color w:val="C7254E"/>
+        </w:rPr>
+        <w:t>1</w:t>
+      </w:r>
+      <w:r>
+        <w:t xml:space="preserve"> (khóa) hoặc </w:t>
+      </w:r>
+      <w:r>
+        <w:rPr>
+          <w:color w:val="C7254E"/>
+        </w:rPr>
+        <w:t>0</w:t>
+      </w:r>
+      <w:r>
+        <w:t xml:space="preserve"> (mở khóa). Không khóa được tài khoản đang dùng để đăng nhập. Tài khoản bị khóa không đăng nhập được nữa (thông báo ở mục 4.3) và hiện </w:t>
+      </w:r>
+      <w:r>
+        <w:rPr>
+          <w:b/>
+        </w:rPr>
+        <w:t>Đã khóa</w:t>
+      </w:r>
+      <w:r>
+        <w:t xml:space="preserve"> trong danh sách.</w:t>
+      </w:r>
+    </w:p>
+    <w:p>
+      <w:pPr>
+        <w:pStyle w:val="Heading2"/>
+      </w:pPr>
+      <w:bookmarkStart w:id="79" w:name="_Toc241958230"/>
+      <w:r>
+        <w:t>5.10. Chức năng dành cho giáo viên</w:t>
+      </w:r>
+      <w:bookmarkEnd w:id="79"/>
+    </w:p>
+    <w:p>
+      <w:pPr>
+        <w:spacing w:after="120" w:line="276" w:lineRule="auto"/>
+        <w:ind w:firstLine="284"/>
+        <w:jc w:val="both"/>
+      </w:pPr>
+      <w:r>
+        <w:rPr>
+          <w:i/>
+        </w:rPr>
+        <w:t>Vai trò: Giáo viên.</w:t>
+      </w:r>
+      <w:r>
+        <w:t xml:space="preserve"> Giáo viên chỉ thấy dữ liệu của chính mình (CSDL lọc theo tài khoản đăng nhập):</w:t>
+      </w:r>
+    </w:p>
+    <w:p>
+      <w:pPr>
+        <w:pStyle w:val="ListParagraph"/>
+        <w:numPr>
+          <w:ilvl w:val="0"/>
+          <w:numId w:val="2"/>
+        </w:numPr>
+        <w:spacing w:after="60" w:line="276" w:lineRule="auto"/>
+        <w:jc w:val="both"/>
+      </w:pPr>
+      <w:r>
+        <w:rPr>
+          <w:b/>
+        </w:rPr>
+        <w:lastRenderedPageBreak/>
+        <w:t>Lớp của tôi</w:t>
+      </w:r>
+      <w:r>
+        <w:t>: các lớp được phân công, kèm khóa học, phòng, chi nhánh, ngày khai giảng/kết thúc, sĩ số và trạng thái.</w:t>
+      </w:r>
+    </w:p>
+    <w:p>
+      <w:pPr>
+        <w:pStyle w:val="ListParagraph"/>
+        <w:numPr>
+          <w:ilvl w:val="0"/>
+          <w:numId w:val="2"/>
+        </w:numPr>
+        <w:spacing w:after="60" w:line="276" w:lineRule="auto"/>
+        <w:jc w:val="both"/>
+      </w:pPr>
+      <w:r>
+        <w:rPr>
+          <w:b/>
+        </w:rPr>
+        <w:t>Lịch dạy</w:t>
+      </w:r>
+      <w:r>
+        <w:t>: các buổi dạy từ thứ Hai của tuần hiện tại trở đi, theo ngày và giờ.</w:t>
+      </w:r>
+    </w:p>
+    <w:p>
+      <w:pPr>
+        <w:pStyle w:val="ListParagraph"/>
+        <w:numPr>
+          <w:ilvl w:val="0"/>
+          <w:numId w:val="2"/>
+        </w:numPr>
+        <w:spacing w:after="60" w:line="276" w:lineRule="auto"/>
+        <w:jc w:val="both"/>
+      </w:pPr>
+      <w:r>
+        <w:rPr>
+          <w:b/>
+        </w:rPr>
         <w:t>Lương của tôi</w:t>
       </w:r>
       <w:r>
@@ -24110,9 +25076,8 @@
         <w:rPr>
           <w:noProof/>
         </w:rPr>
-        <w:lastRenderedPageBreak/>
         <w:drawing>
-          <wp:inline distT="0" distB="0" distL="0" distR="0" wp14:anchorId="097DF0A6" wp14:editId="3F85BED6">
+          <wp:inline distT="0" distB="0" distL="0" distR="0" wp14:anchorId="185C72C0" wp14:editId="2DAAFB94">
             <wp:extent cx="5580000" cy="3332500"/>
             <wp:effectExtent l="0" t="0" r="0" b="0"/>
             <wp:docPr id="522444775" name="Picture 522444775"/>
@@ -24152,7 +25117,7 @@
       <w:pPr>
         <w:pStyle w:val="FigureCaption"/>
       </w:pPr>
-      <w:bookmarkStart w:id="80" w:name="_Toc241916478"/>
+      <w:bookmarkStart w:id="80" w:name="_Toc241958252"/>
       <w:r>
         <w:t>Hình 5.10. Lịch dạy của giáo viên</w:t>
       </w:r>
@@ -24162,7 +25127,7 @@
       <w:pPr>
         <w:pStyle w:val="Heading2"/>
       </w:pPr>
-      <w:bookmarkStart w:id="81" w:name="_Toc241916457"/>
+      <w:bookmarkStart w:id="81" w:name="_Toc241958231"/>
       <w:r>
         <w:t>5.11. Nghiệp vụ thực hiện trực tiếp trong CSDL</w:t>
       </w:r>
@@ -24191,7 +25156,7 @@
       <w:pPr>
         <w:pStyle w:val="TableCaption"/>
       </w:pPr>
-      <w:bookmarkStart w:id="82" w:name="_Toc241916491"/>
+      <w:bookmarkStart w:id="82" w:name="_Toc241958265"/>
       <w:r>
         <w:t>Bảng 5.3. Nghiệp vụ thực hiện bằng thủ tục trong CSDL</w:t>
       </w:r>
@@ -24824,6 +25789,415 @@
         <w:jc w:val="both"/>
       </w:pPr>
       <w:r>
+        <w:t xml:space="preserve">Mỗi thủ tục tự kiểm tra quy tắc nghiệp vụ trước khi ghi. Khi vi phạm, SSMS hiện thông báo lỗi (tiếng Anh, ví dụ </w:t>
+      </w:r>
+      <w:r>
+        <w:rPr>
+          <w:color w:val="C7254E"/>
+        </w:rPr>
+        <w:t>The student is already enrolled in this class.</w:t>
+      </w:r>
+      <w:r>
+        <w:t>) và dữ liệu không thay đổi. Các quy tắc người dùng hay gặp:</w:t>
+      </w:r>
+    </w:p>
+    <w:p>
+      <w:pPr>
+        <w:pStyle w:val="TableCaption"/>
+      </w:pPr>
+      <w:bookmarkStart w:id="83" w:name="_Toc241958266"/>
+      <w:r>
+        <w:lastRenderedPageBreak/>
+        <w:t>Bảng 5.4. Quy tắc CSDL kiểm tra khi ghi danh, chuyển lớp, điểm danh và nhập điểm</w:t>
+      </w:r>
+      <w:bookmarkEnd w:id="83"/>
+    </w:p>
+    <w:tbl>
+      <w:tblPr>
+        <w:tblW w:w="0" w:type="auto"/>
+        <w:jc w:val="center"/>
+        <w:tblLayout w:type="fixed"/>
+        <w:tblLook w:val="04A0" w:firstRow="1" w:lastRow="0" w:firstColumn="1" w:lastColumn="0" w:noHBand="0" w:noVBand="1"/>
+      </w:tblPr>
+      <w:tblGrid>
+        <w:gridCol w:w="2041"/>
+        <w:gridCol w:w="7030"/>
+      </w:tblGrid>
+      <w:tr>
+        <w:trPr>
+          <w:tblHeader/>
+          <w:jc w:val="center"/>
+        </w:trPr>
+        <w:tc>
+          <w:tcPr>
+            <w:tcW w:w="2041" w:type="dxa"/>
+            <w:tcBorders>
+              <w:top w:val="single" w:sz="4" w:space="0" w:color="BFBFBF"/>
+              <w:left w:val="single" w:sz="4" w:space="0" w:color="BFBFBF"/>
+              <w:bottom w:val="single" w:sz="4" w:space="0" w:color="BFBFBF"/>
+              <w:right w:val="single" w:sz="4" w:space="0" w:color="BFBFBF"/>
+            </w:tcBorders>
+            <w:shd w:val="clear" w:color="auto" w:fill="1F3864"/>
+            <w:tcMar>
+              <w:top w:w="40" w:type="dxa"/>
+              <w:left w:w="100" w:type="dxa"/>
+              <w:bottom w:w="40" w:type="dxa"/>
+              <w:right w:w="100" w:type="dxa"/>
+            </w:tcMar>
+          </w:tcPr>
+          <w:p>
+            <w:pPr>
+              <w:spacing w:line="252" w:lineRule="auto"/>
+              <w:jc w:val="center"/>
+            </w:pPr>
+            <w:r>
+              <w:rPr>
+                <w:b/>
+                <w:color w:val="FFFFFF"/>
+                <w:sz w:val="20"/>
+              </w:rPr>
+              <w:t>Nghiệp vụ</w:t>
+            </w:r>
+          </w:p>
+        </w:tc>
+        <w:tc>
+          <w:tcPr>
+            <w:tcW w:w="7030" w:type="dxa"/>
+            <w:tcBorders>
+              <w:top w:val="single" w:sz="4" w:space="0" w:color="BFBFBF"/>
+              <w:left w:val="single" w:sz="4" w:space="0" w:color="BFBFBF"/>
+              <w:bottom w:val="single" w:sz="4" w:space="0" w:color="BFBFBF"/>
+              <w:right w:val="single" w:sz="4" w:space="0" w:color="BFBFBF"/>
+            </w:tcBorders>
+            <w:shd w:val="clear" w:color="auto" w:fill="1F3864"/>
+            <w:tcMar>
+              <w:top w:w="40" w:type="dxa"/>
+              <w:left w:w="100" w:type="dxa"/>
+              <w:bottom w:w="40" w:type="dxa"/>
+              <w:right w:w="100" w:type="dxa"/>
+            </w:tcMar>
+          </w:tcPr>
+          <w:p>
+            <w:pPr>
+              <w:spacing w:line="252" w:lineRule="auto"/>
+              <w:jc w:val="center"/>
+            </w:pPr>
+            <w:r>
+              <w:rPr>
+                <w:b/>
+                <w:color w:val="FFFFFF"/>
+                <w:sz w:val="20"/>
+              </w:rPr>
+              <w:t>Quy tắc CSDL kiểm tra</w:t>
+            </w:r>
+          </w:p>
+        </w:tc>
+      </w:tr>
+      <w:tr>
+        <w:trPr>
+          <w:cantSplit/>
+          <w:jc w:val="center"/>
+        </w:trPr>
+        <w:tc>
+          <w:tcPr>
+            <w:tcW w:w="2041" w:type="dxa"/>
+            <w:tcBorders>
+              <w:top w:val="single" w:sz="4" w:space="0" w:color="BFBFBF"/>
+              <w:left w:val="single" w:sz="4" w:space="0" w:color="BFBFBF"/>
+              <w:bottom w:val="single" w:sz="4" w:space="0" w:color="BFBFBF"/>
+              <w:right w:val="single" w:sz="4" w:space="0" w:color="BFBFBF"/>
+            </w:tcBorders>
+            <w:tcMar>
+              <w:top w:w="40" w:type="dxa"/>
+              <w:left w:w="100" w:type="dxa"/>
+              <w:bottom w:w="40" w:type="dxa"/>
+              <w:right w:w="100" w:type="dxa"/>
+            </w:tcMar>
+          </w:tcPr>
+          <w:p>
+            <w:pPr>
+              <w:spacing w:line="252" w:lineRule="auto"/>
+            </w:pPr>
+            <w:r>
+              <w:rPr>
+                <w:sz w:val="20"/>
+              </w:rPr>
+              <w:t>Ghi danh</w:t>
+            </w:r>
+          </w:p>
+        </w:tc>
+        <w:tc>
+          <w:tcPr>
+            <w:tcW w:w="7030" w:type="dxa"/>
+            <w:tcBorders>
+              <w:top w:val="single" w:sz="4" w:space="0" w:color="BFBFBF"/>
+              <w:left w:val="single" w:sz="4" w:space="0" w:color="BFBFBF"/>
+              <w:bottom w:val="single" w:sz="4" w:space="0" w:color="BFBFBF"/>
+              <w:right w:val="single" w:sz="4" w:space="0" w:color="BFBFBF"/>
+            </w:tcBorders>
+            <w:tcMar>
+              <w:top w:w="40" w:type="dxa"/>
+              <w:left w:w="100" w:type="dxa"/>
+              <w:bottom w:w="40" w:type="dxa"/>
+              <w:right w:w="100" w:type="dxa"/>
+            </w:tcMar>
+          </w:tcPr>
+          <w:p>
+            <w:pPr>
+              <w:spacing w:line="252" w:lineRule="auto"/>
+            </w:pPr>
+            <w:r>
+              <w:rPr>
+                <w:sz w:val="20"/>
+              </w:rPr>
+              <w:t xml:space="preserve">Học viên chưa </w:t>
+            </w:r>
+            <w:r>
+              <w:rPr>
+                <w:b/>
+                <w:sz w:val="20"/>
+              </w:rPr>
+              <w:t>Ngừng học</w:t>
+            </w:r>
+            <w:r>
+              <w:rPr>
+                <w:sz w:val="20"/>
+              </w:rPr>
+              <w:t xml:space="preserve"> và chưa có trong lớp; lớp </w:t>
+            </w:r>
+            <w:r>
+              <w:rPr>
+                <w:b/>
+                <w:sz w:val="20"/>
+              </w:rPr>
+              <w:t>Đang tuyển sinh</w:t>
+            </w:r>
+            <w:r>
+              <w:rPr>
+                <w:sz w:val="20"/>
+              </w:rPr>
+              <w:t xml:space="preserve"> hoặc </w:t>
+            </w:r>
+            <w:r>
+              <w:rPr>
+                <w:b/>
+                <w:sz w:val="20"/>
+              </w:rPr>
+              <w:t>Đang học</w:t>
+            </w:r>
+            <w:r>
+              <w:rPr>
+                <w:sz w:val="20"/>
+              </w:rPr>
+              <w:t xml:space="preserve"> và còn chỗ; không trùng giờ với lớp khác học viên đang học; mã khuyến mãi còn hiệu lực. Khóa có điều kiện đầu vào: học viên phải </w:t>
+            </w:r>
+            <w:r>
+              <w:rPr>
+                <w:b/>
+                <w:sz w:val="20"/>
+              </w:rPr>
+              <w:t>Đạt</w:t>
+            </w:r>
+            <w:r>
+              <w:rPr>
+                <w:sz w:val="20"/>
+              </w:rPr>
+              <w:t xml:space="preserve"> khóa tiên quyết, hoặc có bài kiểm tra xếp lớp gần nhất đủ điểm tối thiểu (chỉ khi khóa có quy định điểm tối thiểu).</w:t>
+            </w:r>
+          </w:p>
+        </w:tc>
+      </w:tr>
+      <w:tr>
+        <w:trPr>
+          <w:cantSplit/>
+          <w:jc w:val="center"/>
+        </w:trPr>
+        <w:tc>
+          <w:tcPr>
+            <w:tcW w:w="2041" w:type="dxa"/>
+            <w:tcBorders>
+              <w:top w:val="single" w:sz="4" w:space="0" w:color="BFBFBF"/>
+              <w:left w:val="single" w:sz="4" w:space="0" w:color="BFBFBF"/>
+              <w:bottom w:val="single" w:sz="4" w:space="0" w:color="BFBFBF"/>
+              <w:right w:val="single" w:sz="4" w:space="0" w:color="BFBFBF"/>
+            </w:tcBorders>
+            <w:shd w:val="clear" w:color="auto" w:fill="F5F8FC"/>
+            <w:tcMar>
+              <w:top w:w="40" w:type="dxa"/>
+              <w:left w:w="100" w:type="dxa"/>
+              <w:bottom w:w="40" w:type="dxa"/>
+              <w:right w:w="100" w:type="dxa"/>
+            </w:tcMar>
+          </w:tcPr>
+          <w:p>
+            <w:pPr>
+              <w:spacing w:line="252" w:lineRule="auto"/>
+            </w:pPr>
+            <w:r>
+              <w:rPr>
+                <w:sz w:val="20"/>
+              </w:rPr>
+              <w:t>Chuyển lớp</w:t>
+            </w:r>
+          </w:p>
+        </w:tc>
+        <w:tc>
+          <w:tcPr>
+            <w:tcW w:w="7030" w:type="dxa"/>
+            <w:tcBorders>
+              <w:top w:val="single" w:sz="4" w:space="0" w:color="BFBFBF"/>
+              <w:left w:val="single" w:sz="4" w:space="0" w:color="BFBFBF"/>
+              <w:bottom w:val="single" w:sz="4" w:space="0" w:color="BFBFBF"/>
+              <w:right w:val="single" w:sz="4" w:space="0" w:color="BFBFBF"/>
+            </w:tcBorders>
+            <w:shd w:val="clear" w:color="auto" w:fill="F5F8FC"/>
+            <w:tcMar>
+              <w:top w:w="40" w:type="dxa"/>
+              <w:left w:w="100" w:type="dxa"/>
+              <w:bottom w:w="40" w:type="dxa"/>
+              <w:right w:w="100" w:type="dxa"/>
+            </w:tcMar>
+          </w:tcPr>
+          <w:p>
+            <w:pPr>
+              <w:spacing w:line="252" w:lineRule="auto"/>
+            </w:pPr>
+            <w:r>
+              <w:rPr>
+                <w:sz w:val="20"/>
+              </w:rPr>
+              <w:t xml:space="preserve">Chỉ chuyển lượt ghi danh </w:t>
+            </w:r>
+            <w:r>
+              <w:rPr>
+                <w:b/>
+                <w:sz w:val="20"/>
+              </w:rPr>
+              <w:t>Đang học</w:t>
+            </w:r>
+            <w:r>
+              <w:rPr>
+                <w:sz w:val="20"/>
+              </w:rPr>
+              <w:t xml:space="preserve"> hoặc </w:t>
+            </w:r>
+            <w:r>
+              <w:rPr>
+                <w:b/>
+                <w:sz w:val="20"/>
+              </w:rPr>
+              <w:t>Bảo lưu</w:t>
+            </w:r>
+            <w:r>
+              <w:rPr>
+                <w:sz w:val="20"/>
+              </w:rPr>
+              <w:t xml:space="preserve">, sang lớp </w:t>
+            </w:r>
+            <w:r>
+              <w:rPr>
+                <w:b/>
+                <w:sz w:val="20"/>
+              </w:rPr>
+              <w:t>cùng khóa học</w:t>
+            </w:r>
+            <w:r>
+              <w:rPr>
+                <w:sz w:val="20"/>
+              </w:rPr>
+              <w:t xml:space="preserve"> đang tuyển sinh hoặc đang học, còn chỗ và không trùng giờ. Học phí tính lại theo lớp mới (áp dụng lại khuyến mãi của lượt ghi danh); nếu học viên đã đóng nhiều hơn học phí mới thì phải hủy bớt phiếu thu trước. Phiếu thu và điểm được giữ, điểm danh ở lớp cũ bị xóa.</w:t>
+            </w:r>
+          </w:p>
+        </w:tc>
+      </w:tr>
+      <w:tr>
+        <w:trPr>
+          <w:cantSplit/>
+          <w:jc w:val="center"/>
+        </w:trPr>
+        <w:tc>
+          <w:tcPr>
+            <w:tcW w:w="2041" w:type="dxa"/>
+            <w:tcBorders>
+              <w:top w:val="single" w:sz="4" w:space="0" w:color="BFBFBF"/>
+              <w:left w:val="single" w:sz="4" w:space="0" w:color="BFBFBF"/>
+              <w:bottom w:val="single" w:sz="4" w:space="0" w:color="BFBFBF"/>
+              <w:right w:val="single" w:sz="4" w:space="0" w:color="BFBFBF"/>
+            </w:tcBorders>
+            <w:tcMar>
+              <w:top w:w="40" w:type="dxa"/>
+              <w:left w:w="100" w:type="dxa"/>
+              <w:bottom w:w="40" w:type="dxa"/>
+              <w:right w:w="100" w:type="dxa"/>
+            </w:tcMar>
+          </w:tcPr>
+          <w:p>
+            <w:pPr>
+              <w:spacing w:line="252" w:lineRule="auto"/>
+            </w:pPr>
+            <w:r>
+              <w:rPr>
+                <w:sz w:val="20"/>
+              </w:rPr>
+              <w:t>Điểm danh, nhập điểm</w:t>
+            </w:r>
+          </w:p>
+        </w:tc>
+        <w:tc>
+          <w:tcPr>
+            <w:tcW w:w="7030" w:type="dxa"/>
+            <w:tcBorders>
+              <w:top w:val="single" w:sz="4" w:space="0" w:color="BFBFBF"/>
+              <w:left w:val="single" w:sz="4" w:space="0" w:color="BFBFBF"/>
+              <w:bottom w:val="single" w:sz="4" w:space="0" w:color="BFBFBF"/>
+              <w:right w:val="single" w:sz="4" w:space="0" w:color="BFBFBF"/>
+            </w:tcBorders>
+            <w:tcMar>
+              <w:top w:w="40" w:type="dxa"/>
+              <w:left w:w="100" w:type="dxa"/>
+              <w:bottom w:w="40" w:type="dxa"/>
+              <w:right w:w="100" w:type="dxa"/>
+            </w:tcMar>
+          </w:tcPr>
+          <w:p>
+            <w:pPr>
+              <w:spacing w:line="252" w:lineRule="auto"/>
+            </w:pPr>
+            <w:r>
+              <w:rPr>
+                <w:sz w:val="20"/>
+              </w:rPr>
+              <w:t xml:space="preserve">Giáo viên chỉ điểm danh các buổi mình dạy và chỉ nhập điểm lớp mình dạy. Lớp </w:t>
+            </w:r>
+            <w:r>
+              <w:rPr>
+                <w:b/>
+                <w:sz w:val="20"/>
+              </w:rPr>
+              <w:t>Đã kết thúc</w:t>
+            </w:r>
+            <w:r>
+              <w:rPr>
+                <w:sz w:val="20"/>
+              </w:rPr>
+              <w:t xml:space="preserve"> đã được xét kết quả nên không sửa điểm danh và điểm được nữa.</w:t>
+            </w:r>
+          </w:p>
+        </w:tc>
+      </w:tr>
+    </w:tbl>
+    <w:p>
+      <w:pPr>
+        <w:spacing w:after="80"/>
+      </w:pPr>
+    </w:p>
+    <w:p>
+      <w:pPr>
+        <w:spacing w:after="120" w:line="276" w:lineRule="auto"/>
+        <w:ind w:firstLine="284"/>
+        <w:jc w:val="both"/>
+      </w:pPr>
+      <w:r>
         <w:t xml:space="preserve">Tham số và ví dụ của từng thủ tục nằm trong </w:t>
       </w:r>
       <w:r>
@@ -24841,22 +26215,22 @@
         <w:pStyle w:val="Heading1"/>
         <w:pageBreakBefore/>
       </w:pPr>
-      <w:bookmarkStart w:id="83" w:name="_Toc241916458"/>
+      <w:bookmarkStart w:id="84" w:name="_Toc241958232"/>
       <w:r>
         <w:lastRenderedPageBreak/>
         <w:t>CHƯƠNG 6. XỬ LÝ SỰ CỐ</w:t>
       </w:r>
-      <w:bookmarkEnd w:id="83"/>
+      <w:bookmarkEnd w:id="84"/>
     </w:p>
     <w:p>
       <w:pPr>
         <w:pStyle w:val="Heading2"/>
       </w:pPr>
-      <w:bookmarkStart w:id="84" w:name="_Toc241916459"/>
+      <w:bookmarkStart w:id="85" w:name="_Toc241958233"/>
       <w:r>
         <w:t>6.1. Kiểm tra kết nối không cần giao diện</w:t>
       </w:r>
-      <w:bookmarkEnd w:id="84"/>
+      <w:bookmarkEnd w:id="85"/>
     </w:p>
     <w:p>
       <w:pPr>
@@ -25108,21 +26482,21 @@
       <w:pPr>
         <w:pStyle w:val="Heading2"/>
       </w:pPr>
-      <w:bookmarkStart w:id="85" w:name="_Toc241916460"/>
+      <w:bookmarkStart w:id="86" w:name="_Toc241958234"/>
       <w:r>
         <w:t>6.2. Lỗi thường gặp</w:t>
       </w:r>
-      <w:bookmarkEnd w:id="85"/>
+      <w:bookmarkEnd w:id="86"/>
     </w:p>
     <w:p>
       <w:pPr>
         <w:pStyle w:val="TableCaption"/>
       </w:pPr>
-      <w:bookmarkStart w:id="86" w:name="_Toc241916492"/>
+      <w:bookmarkStart w:id="87" w:name="_Toc241958267"/>
       <w:r>
         <w:t>Bảng 6.1. Lỗi thường gặp và cách xử lý</w:t>
       </w:r>
-      <w:bookmarkEnd w:id="86"/>
+      <w:bookmarkEnd w:id="87"/>
     </w:p>
     <w:tbl>
       <w:tblPr>
@@ -26855,11 +28229,11 @@
       <w:pPr>
         <w:pStyle w:val="Heading2"/>
       </w:pPr>
-      <w:bookmarkStart w:id="87" w:name="_Toc241916461"/>
+      <w:bookmarkStart w:id="88" w:name="_Toc241958235"/>
       <w:r>
         <w:t>6.3. Khi cần hỗ trợ thêm</w:t>
       </w:r>
-      <w:bookmarkEnd w:id="87"/>
+      <w:bookmarkEnd w:id="88"/>
     </w:p>
     <w:p>
       <w:pPr>
@@ -26903,12 +28277,12 @@
         <w:pStyle w:val="Heading1"/>
         <w:pageBreakBefore/>
       </w:pPr>
-      <w:bookmarkStart w:id="88" w:name="_Toc241916462"/>
+      <w:bookmarkStart w:id="89" w:name="_Toc241958236"/>
       <w:r>
         <w:lastRenderedPageBreak/>
         <w:t>PHỤ LỤC A. TÓM TẮT LỆNH</w:t>
       </w:r>
-      <w:bookmarkEnd w:id="88"/>
+      <w:bookmarkEnd w:id="89"/>
     </w:p>
     <w:tbl>
       <w:tblPr>
@@ -27630,12 +29004,12 @@
         <w:pStyle w:val="Heading1"/>
         <w:pageBreakBefore/>
       </w:pPr>
-      <w:bookmarkStart w:id="89" w:name="_Toc241916463"/>
+      <w:bookmarkStart w:id="90" w:name="_Toc241958237"/>
       <w:r>
         <w:lastRenderedPageBreak/>
         <w:t>PHỤ LỤC B. CÁC MỤC CẦN BỔ SUNG</w:t>
       </w:r>
-      <w:bookmarkEnd w:id="89"/>
+      <w:bookmarkEnd w:id="90"/>
     </w:p>
     <w:p>
       <w:pPr>

</xml_diff>

<commit_message>
docs(user-guide): follow the codebase review changes
The Dashboard card counts the students taking a class; the Completed
student status and when it is set; the length limits of the student form;
the class life cycle (a finished or cancelled class is replaced by a new
one), transfers within the course and branch, attendance from the
transfer day and the session rules in the table of chapter 5.11; the
certificate option (no fallback to drivers that skip the check, FreeTDS
does not check it); the apostrophe in exported CSV cells; a new
troubleshooting row for exports that cannot be saved. Same page count
(38) and placeholders (18); the screenshots are the ones refreshed for
the report.
</commit_message>
<xml_diff>
--- a/docs/user-guide/QLTTTA_User_Guide.docx
+++ b/docs/user-guide/QLTTTA_User_Guide.docx
@@ -1255,7 +1255,7 @@
               <w:rPr>
                 <w:sz w:val="22"/>
               </w:rPr>
-              <w:t>03/10/2026</w:t>
+              <w:t>04/10/2026</w:t>
             </w:r>
           </w:p>
         </w:tc>
@@ -1402,7 +1402,7 @@
       <w:r>
         <w:fldChar w:fldCharType="separate"/>
       </w:r>
-      <w:hyperlink w:anchor="_Toc241962300" w:history="1">
+      <w:hyperlink w:anchor="_Toc241965404" w:history="1">
         <w:r>
           <w:rPr>
             <w:rStyle w:val="Hyperlink"/>
@@ -1429,7 +1429,7 @@
             <w:noProof/>
             <w:webHidden/>
           </w:rPr>
-          <w:instrText xml:space="preserve"> PAGEREF _Toc241962300 \h </w:instrText>
+          <w:instrText xml:space="preserve"> PAGEREF _Toc241965404 \h </w:instrText>
         </w:r>
         <w:r>
           <w:rPr>
@@ -1476,7 +1476,7 @@
           <w14:ligatures w14:val="standardContextual"/>
         </w:rPr>
       </w:pPr>
-      <w:hyperlink w:anchor="_Toc241962301" w:history="1">
+      <w:hyperlink w:anchor="_Toc241965405" w:history="1">
         <w:r>
           <w:rPr>
             <w:rStyle w:val="Hyperlink"/>
@@ -1503,7 +1503,7 @@
             <w:noProof/>
             <w:webHidden/>
           </w:rPr>
-          <w:instrText xml:space="preserve"> PAGEREF _Toc241962301 \h </w:instrText>
+          <w:instrText xml:space="preserve"> PAGEREF _Toc241965405 \h </w:instrText>
         </w:r>
         <w:r>
           <w:rPr>
@@ -1550,7 +1550,7 @@
           <w14:ligatures w14:val="standardContextual"/>
         </w:rPr>
       </w:pPr>
-      <w:hyperlink w:anchor="_Toc241962302" w:history="1">
+      <w:hyperlink w:anchor="_Toc241965406" w:history="1">
         <w:r>
           <w:rPr>
             <w:rStyle w:val="Hyperlink"/>
@@ -1577,7 +1577,7 @@
             <w:noProof/>
             <w:webHidden/>
           </w:rPr>
-          <w:instrText xml:space="preserve"> PAGEREF _Toc241962302 \h </w:instrText>
+          <w:instrText xml:space="preserve"> PAGEREF _Toc241965406 \h </w:instrText>
         </w:r>
         <w:r>
           <w:rPr>
@@ -1624,7 +1624,7 @@
           <w14:ligatures w14:val="standardContextual"/>
         </w:rPr>
       </w:pPr>
-      <w:hyperlink w:anchor="_Toc241962303" w:history="1">
+      <w:hyperlink w:anchor="_Toc241965407" w:history="1">
         <w:r>
           <w:rPr>
             <w:rStyle w:val="Hyperlink"/>
@@ -1651,7 +1651,7 @@
             <w:noProof/>
             <w:webHidden/>
           </w:rPr>
-          <w:instrText xml:space="preserve"> PAGEREF _Toc241962303 \h </w:instrText>
+          <w:instrText xml:space="preserve"> PAGEREF _Toc241965407 \h </w:instrText>
         </w:r>
         <w:r>
           <w:rPr>
@@ -1698,7 +1698,7 @@
           <w14:ligatures w14:val="standardContextual"/>
         </w:rPr>
       </w:pPr>
-      <w:hyperlink w:anchor="_Toc241962304" w:history="1">
+      <w:hyperlink w:anchor="_Toc241965408" w:history="1">
         <w:r>
           <w:rPr>
             <w:rStyle w:val="Hyperlink"/>
@@ -1725,7 +1725,7 @@
             <w:noProof/>
             <w:webHidden/>
           </w:rPr>
-          <w:instrText xml:space="preserve"> PAGEREF _Toc241962304 \h </w:instrText>
+          <w:instrText xml:space="preserve"> PAGEREF _Toc241965408 \h </w:instrText>
         </w:r>
         <w:r>
           <w:rPr>
@@ -1772,7 +1772,7 @@
           <w14:ligatures w14:val="standardContextual"/>
         </w:rPr>
       </w:pPr>
-      <w:hyperlink w:anchor="_Toc241962305" w:history="1">
+      <w:hyperlink w:anchor="_Toc241965409" w:history="1">
         <w:r>
           <w:rPr>
             <w:rStyle w:val="Hyperlink"/>
@@ -1799,7 +1799,7 @@
             <w:noProof/>
             <w:webHidden/>
           </w:rPr>
-          <w:instrText xml:space="preserve"> PAGEREF _Toc241962305 \h </w:instrText>
+          <w:instrText xml:space="preserve"> PAGEREF _Toc241965409 \h </w:instrText>
         </w:r>
         <w:r>
           <w:rPr>
@@ -1846,7 +1846,7 @@
           <w14:ligatures w14:val="standardContextual"/>
         </w:rPr>
       </w:pPr>
-      <w:hyperlink w:anchor="_Toc241962306" w:history="1">
+      <w:hyperlink w:anchor="_Toc241965410" w:history="1">
         <w:r>
           <w:rPr>
             <w:rStyle w:val="Hyperlink"/>
@@ -1873,7 +1873,7 @@
             <w:noProof/>
             <w:webHidden/>
           </w:rPr>
-          <w:instrText xml:space="preserve"> PAGEREF _Toc241962306 \h </w:instrText>
+          <w:instrText xml:space="preserve"> PAGEREF _Toc241965410 \h </w:instrText>
         </w:r>
         <w:r>
           <w:rPr>
@@ -1920,7 +1920,7 @@
           <w14:ligatures w14:val="standardContextual"/>
         </w:rPr>
       </w:pPr>
-      <w:hyperlink w:anchor="_Toc241962307" w:history="1">
+      <w:hyperlink w:anchor="_Toc241965411" w:history="1">
         <w:r>
           <w:rPr>
             <w:rStyle w:val="Hyperlink"/>
@@ -1947,7 +1947,7 @@
             <w:noProof/>
             <w:webHidden/>
           </w:rPr>
-          <w:instrText xml:space="preserve"> PAGEREF _Toc241962307 \h </w:instrText>
+          <w:instrText xml:space="preserve"> PAGEREF _Toc241965411 \h </w:instrText>
         </w:r>
         <w:r>
           <w:rPr>
@@ -1994,7 +1994,7 @@
           <w14:ligatures w14:val="standardContextual"/>
         </w:rPr>
       </w:pPr>
-      <w:hyperlink w:anchor="_Toc241962308" w:history="1">
+      <w:hyperlink w:anchor="_Toc241965412" w:history="1">
         <w:r>
           <w:rPr>
             <w:rStyle w:val="Hyperlink"/>
@@ -2021,7 +2021,7 @@
             <w:noProof/>
             <w:webHidden/>
           </w:rPr>
-          <w:instrText xml:space="preserve"> PAGEREF _Toc241962308 \h </w:instrText>
+          <w:instrText xml:space="preserve"> PAGEREF _Toc241965412 \h </w:instrText>
         </w:r>
         <w:r>
           <w:rPr>
@@ -2068,7 +2068,7 @@
           <w14:ligatures w14:val="standardContextual"/>
         </w:rPr>
       </w:pPr>
-      <w:hyperlink w:anchor="_Toc241962309" w:history="1">
+      <w:hyperlink w:anchor="_Toc241965413" w:history="1">
         <w:r>
           <w:rPr>
             <w:rStyle w:val="Hyperlink"/>
@@ -2095,7 +2095,7 @@
             <w:noProof/>
             <w:webHidden/>
           </w:rPr>
-          <w:instrText xml:space="preserve"> PAGEREF _Toc241962309 \h </w:instrText>
+          <w:instrText xml:space="preserve"> PAGEREF _Toc241965413 \h </w:instrText>
         </w:r>
         <w:r>
           <w:rPr>
@@ -2142,7 +2142,7 @@
           <w14:ligatures w14:val="standardContextual"/>
         </w:rPr>
       </w:pPr>
-      <w:hyperlink w:anchor="_Toc241962310" w:history="1">
+      <w:hyperlink w:anchor="_Toc241965414" w:history="1">
         <w:r>
           <w:rPr>
             <w:rStyle w:val="Hyperlink"/>
@@ -2169,7 +2169,7 @@
             <w:noProof/>
             <w:webHidden/>
           </w:rPr>
-          <w:instrText xml:space="preserve"> PAGEREF _Toc241962310 \h </w:instrText>
+          <w:instrText xml:space="preserve"> PAGEREF _Toc241965414 \h </w:instrText>
         </w:r>
         <w:r>
           <w:rPr>
@@ -2216,7 +2216,7 @@
           <w14:ligatures w14:val="standardContextual"/>
         </w:rPr>
       </w:pPr>
-      <w:hyperlink w:anchor="_Toc241962311" w:history="1">
+      <w:hyperlink w:anchor="_Toc241965415" w:history="1">
         <w:r>
           <w:rPr>
             <w:rStyle w:val="Hyperlink"/>
@@ -2243,7 +2243,7 @@
             <w:noProof/>
             <w:webHidden/>
           </w:rPr>
-          <w:instrText xml:space="preserve"> PAGEREF _Toc241962311 \h </w:instrText>
+          <w:instrText xml:space="preserve"> PAGEREF _Toc241965415 \h </w:instrText>
         </w:r>
         <w:r>
           <w:rPr>
@@ -2290,7 +2290,7 @@
           <w14:ligatures w14:val="standardContextual"/>
         </w:rPr>
       </w:pPr>
-      <w:hyperlink w:anchor="_Toc241962312" w:history="1">
+      <w:hyperlink w:anchor="_Toc241965416" w:history="1">
         <w:r>
           <w:rPr>
             <w:rStyle w:val="Hyperlink"/>
@@ -2317,7 +2317,7 @@
             <w:noProof/>
             <w:webHidden/>
           </w:rPr>
-          <w:instrText xml:space="preserve"> PAGEREF _Toc241962312 \h </w:instrText>
+          <w:instrText xml:space="preserve"> PAGEREF _Toc241965416 \h </w:instrText>
         </w:r>
         <w:r>
           <w:rPr>
@@ -2364,7 +2364,7 @@
           <w14:ligatures w14:val="standardContextual"/>
         </w:rPr>
       </w:pPr>
-      <w:hyperlink w:anchor="_Toc241962313" w:history="1">
+      <w:hyperlink w:anchor="_Toc241965417" w:history="1">
         <w:r>
           <w:rPr>
             <w:rStyle w:val="Hyperlink"/>
@@ -2391,7 +2391,7 @@
             <w:noProof/>
             <w:webHidden/>
           </w:rPr>
-          <w:instrText xml:space="preserve"> PAGEREF _Toc241962313 \h </w:instrText>
+          <w:instrText xml:space="preserve"> PAGEREF _Toc241965417 \h </w:instrText>
         </w:r>
         <w:r>
           <w:rPr>
@@ -2438,7 +2438,7 @@
           <w14:ligatures w14:val="standardContextual"/>
         </w:rPr>
       </w:pPr>
-      <w:hyperlink w:anchor="_Toc241962314" w:history="1">
+      <w:hyperlink w:anchor="_Toc241965418" w:history="1">
         <w:r>
           <w:rPr>
             <w:rStyle w:val="Hyperlink"/>
@@ -2465,7 +2465,7 @@
             <w:noProof/>
             <w:webHidden/>
           </w:rPr>
-          <w:instrText xml:space="preserve"> PAGEREF _Toc241962314 \h </w:instrText>
+          <w:instrText xml:space="preserve"> PAGEREF _Toc241965418 \h </w:instrText>
         </w:r>
         <w:r>
           <w:rPr>
@@ -2512,7 +2512,7 @@
           <w14:ligatures w14:val="standardContextual"/>
         </w:rPr>
       </w:pPr>
-      <w:hyperlink w:anchor="_Toc241962315" w:history="1">
+      <w:hyperlink w:anchor="_Toc241965419" w:history="1">
         <w:r>
           <w:rPr>
             <w:rStyle w:val="Hyperlink"/>
@@ -2539,7 +2539,7 @@
             <w:noProof/>
             <w:webHidden/>
           </w:rPr>
-          <w:instrText xml:space="preserve"> PAGEREF _Toc241962315 \h </w:instrText>
+          <w:instrText xml:space="preserve"> PAGEREF _Toc241965419 \h </w:instrText>
         </w:r>
         <w:r>
           <w:rPr>
@@ -2586,7 +2586,7 @@
           <w14:ligatures w14:val="standardContextual"/>
         </w:rPr>
       </w:pPr>
-      <w:hyperlink w:anchor="_Toc241962316" w:history="1">
+      <w:hyperlink w:anchor="_Toc241965420" w:history="1">
         <w:r>
           <w:rPr>
             <w:rStyle w:val="Hyperlink"/>
@@ -2613,7 +2613,7 @@
             <w:noProof/>
             <w:webHidden/>
           </w:rPr>
-          <w:instrText xml:space="preserve"> PAGEREF _Toc241962316 \h </w:instrText>
+          <w:instrText xml:space="preserve"> PAGEREF _Toc241965420 \h </w:instrText>
         </w:r>
         <w:r>
           <w:rPr>
@@ -2660,7 +2660,7 @@
           <w14:ligatures w14:val="standardContextual"/>
         </w:rPr>
       </w:pPr>
-      <w:hyperlink w:anchor="_Toc241962317" w:history="1">
+      <w:hyperlink w:anchor="_Toc241965421" w:history="1">
         <w:r>
           <w:rPr>
             <w:rStyle w:val="Hyperlink"/>
@@ -2687,7 +2687,7 @@
             <w:noProof/>
             <w:webHidden/>
           </w:rPr>
-          <w:instrText xml:space="preserve"> PAGEREF _Toc241962317 \h </w:instrText>
+          <w:instrText xml:space="preserve"> PAGEREF _Toc241965421 \h </w:instrText>
         </w:r>
         <w:r>
           <w:rPr>
@@ -2734,7 +2734,7 @@
           <w14:ligatures w14:val="standardContextual"/>
         </w:rPr>
       </w:pPr>
-      <w:hyperlink w:anchor="_Toc241962318" w:history="1">
+      <w:hyperlink w:anchor="_Toc241965422" w:history="1">
         <w:r>
           <w:rPr>
             <w:rStyle w:val="Hyperlink"/>
@@ -2761,7 +2761,7 @@
             <w:noProof/>
             <w:webHidden/>
           </w:rPr>
-          <w:instrText xml:space="preserve"> PAGEREF _Toc241962318 \h </w:instrText>
+          <w:instrText xml:space="preserve"> PAGEREF _Toc241965422 \h </w:instrText>
         </w:r>
         <w:r>
           <w:rPr>
@@ -2808,7 +2808,7 @@
           <w14:ligatures w14:val="standardContextual"/>
         </w:rPr>
       </w:pPr>
-      <w:hyperlink w:anchor="_Toc241962319" w:history="1">
+      <w:hyperlink w:anchor="_Toc241965423" w:history="1">
         <w:r>
           <w:rPr>
             <w:rStyle w:val="Hyperlink"/>
@@ -2835,7 +2835,7 @@
             <w:noProof/>
             <w:webHidden/>
           </w:rPr>
-          <w:instrText xml:space="preserve"> PAGEREF _Toc241962319 \h </w:instrText>
+          <w:instrText xml:space="preserve"> PAGEREF _Toc241965423 \h </w:instrText>
         </w:r>
         <w:r>
           <w:rPr>
@@ -2882,7 +2882,7 @@
           <w14:ligatures w14:val="standardContextual"/>
         </w:rPr>
       </w:pPr>
-      <w:hyperlink w:anchor="_Toc241962320" w:history="1">
+      <w:hyperlink w:anchor="_Toc241965424" w:history="1">
         <w:r>
           <w:rPr>
             <w:rStyle w:val="Hyperlink"/>
@@ -2909,7 +2909,7 @@
             <w:noProof/>
             <w:webHidden/>
           </w:rPr>
-          <w:instrText xml:space="preserve"> PAGEREF _Toc241962320 \h </w:instrText>
+          <w:instrText xml:space="preserve"> PAGEREF _Toc241965424 \h </w:instrText>
         </w:r>
         <w:r>
           <w:rPr>
@@ -2956,7 +2956,7 @@
           <w14:ligatures w14:val="standardContextual"/>
         </w:rPr>
       </w:pPr>
-      <w:hyperlink w:anchor="_Toc241962321" w:history="1">
+      <w:hyperlink w:anchor="_Toc241965425" w:history="1">
         <w:r>
           <w:rPr>
             <w:rStyle w:val="Hyperlink"/>
@@ -2983,7 +2983,7 @@
             <w:noProof/>
             <w:webHidden/>
           </w:rPr>
-          <w:instrText xml:space="preserve"> PAGEREF _Toc241962321 \h </w:instrText>
+          <w:instrText xml:space="preserve"> PAGEREF _Toc241965425 \h </w:instrText>
         </w:r>
         <w:r>
           <w:rPr>
@@ -3030,7 +3030,7 @@
           <w14:ligatures w14:val="standardContextual"/>
         </w:rPr>
       </w:pPr>
-      <w:hyperlink w:anchor="_Toc241962322" w:history="1">
+      <w:hyperlink w:anchor="_Toc241965426" w:history="1">
         <w:r>
           <w:rPr>
             <w:rStyle w:val="Hyperlink"/>
@@ -3057,7 +3057,7 @@
             <w:noProof/>
             <w:webHidden/>
           </w:rPr>
-          <w:instrText xml:space="preserve"> PAGEREF _Toc241962322 \h </w:instrText>
+          <w:instrText xml:space="preserve"> PAGEREF _Toc241965426 \h </w:instrText>
         </w:r>
         <w:r>
           <w:rPr>
@@ -3104,7 +3104,7 @@
           <w14:ligatures w14:val="standardContextual"/>
         </w:rPr>
       </w:pPr>
-      <w:hyperlink w:anchor="_Toc241962323" w:history="1">
+      <w:hyperlink w:anchor="_Toc241965427" w:history="1">
         <w:r>
           <w:rPr>
             <w:rStyle w:val="Hyperlink"/>
@@ -3131,7 +3131,7 @@
             <w:noProof/>
             <w:webHidden/>
           </w:rPr>
-          <w:instrText xml:space="preserve"> PAGEREF _Toc241962323 \h </w:instrText>
+          <w:instrText xml:space="preserve"> PAGEREF _Toc241965427 \h </w:instrText>
         </w:r>
         <w:r>
           <w:rPr>
@@ -3178,7 +3178,7 @@
           <w14:ligatures w14:val="standardContextual"/>
         </w:rPr>
       </w:pPr>
-      <w:hyperlink w:anchor="_Toc241962324" w:history="1">
+      <w:hyperlink w:anchor="_Toc241965428" w:history="1">
         <w:r>
           <w:rPr>
             <w:rStyle w:val="Hyperlink"/>
@@ -3205,7 +3205,7 @@
             <w:noProof/>
             <w:webHidden/>
           </w:rPr>
-          <w:instrText xml:space="preserve"> PAGEREF _Toc241962324 \h </w:instrText>
+          <w:instrText xml:space="preserve"> PAGEREF _Toc241965428 \h </w:instrText>
         </w:r>
         <w:r>
           <w:rPr>
@@ -3252,7 +3252,7 @@
           <w14:ligatures w14:val="standardContextual"/>
         </w:rPr>
       </w:pPr>
-      <w:hyperlink w:anchor="_Toc241962325" w:history="1">
+      <w:hyperlink w:anchor="_Toc241965429" w:history="1">
         <w:r>
           <w:rPr>
             <w:rStyle w:val="Hyperlink"/>
@@ -3279,7 +3279,7 @@
             <w:noProof/>
             <w:webHidden/>
           </w:rPr>
-          <w:instrText xml:space="preserve"> PAGEREF _Toc241962325 \h </w:instrText>
+          <w:instrText xml:space="preserve"> PAGEREF _Toc241965429 \h </w:instrText>
         </w:r>
         <w:r>
           <w:rPr>
@@ -3326,7 +3326,7 @@
           <w14:ligatures w14:val="standardContextual"/>
         </w:rPr>
       </w:pPr>
-      <w:hyperlink w:anchor="_Toc241962326" w:history="1">
+      <w:hyperlink w:anchor="_Toc241965430" w:history="1">
         <w:r>
           <w:rPr>
             <w:rStyle w:val="Hyperlink"/>
@@ -3353,7 +3353,7 @@
             <w:noProof/>
             <w:webHidden/>
           </w:rPr>
-          <w:instrText xml:space="preserve"> PAGEREF _Toc241962326 \h </w:instrText>
+          <w:instrText xml:space="preserve"> PAGEREF _Toc241965430 \h </w:instrText>
         </w:r>
         <w:r>
           <w:rPr>
@@ -3400,7 +3400,7 @@
           <w14:ligatures w14:val="standardContextual"/>
         </w:rPr>
       </w:pPr>
-      <w:hyperlink w:anchor="_Toc241962327" w:history="1">
+      <w:hyperlink w:anchor="_Toc241965431" w:history="1">
         <w:r>
           <w:rPr>
             <w:rStyle w:val="Hyperlink"/>
@@ -3427,7 +3427,7 @@
             <w:noProof/>
             <w:webHidden/>
           </w:rPr>
-          <w:instrText xml:space="preserve"> PAGEREF _Toc241962327 \h </w:instrText>
+          <w:instrText xml:space="preserve"> PAGEREF _Toc241965431 \h </w:instrText>
         </w:r>
         <w:r>
           <w:rPr>
@@ -3474,7 +3474,7 @@
           <w14:ligatures w14:val="standardContextual"/>
         </w:rPr>
       </w:pPr>
-      <w:hyperlink w:anchor="_Toc241962328" w:history="1">
+      <w:hyperlink w:anchor="_Toc241965432" w:history="1">
         <w:r>
           <w:rPr>
             <w:rStyle w:val="Hyperlink"/>
@@ -3501,7 +3501,7 @@
             <w:noProof/>
             <w:webHidden/>
           </w:rPr>
-          <w:instrText xml:space="preserve"> PAGEREF _Toc241962328 \h </w:instrText>
+          <w:instrText xml:space="preserve"> PAGEREF _Toc241965432 \h </w:instrText>
         </w:r>
         <w:r>
           <w:rPr>
@@ -3548,7 +3548,7 @@
           <w14:ligatures w14:val="standardContextual"/>
         </w:rPr>
       </w:pPr>
-      <w:hyperlink w:anchor="_Toc241962329" w:history="1">
+      <w:hyperlink w:anchor="_Toc241965433" w:history="1">
         <w:r>
           <w:rPr>
             <w:rStyle w:val="Hyperlink"/>
@@ -3575,7 +3575,7 @@
             <w:noProof/>
             <w:webHidden/>
           </w:rPr>
-          <w:instrText xml:space="preserve"> PAGEREF _Toc241962329 \h </w:instrText>
+          <w:instrText xml:space="preserve"> PAGEREF _Toc241965433 \h </w:instrText>
         </w:r>
         <w:r>
           <w:rPr>
@@ -3622,7 +3622,7 @@
           <w14:ligatures w14:val="standardContextual"/>
         </w:rPr>
       </w:pPr>
-      <w:hyperlink w:anchor="_Toc241962330" w:history="1">
+      <w:hyperlink w:anchor="_Toc241965434" w:history="1">
         <w:r>
           <w:rPr>
             <w:rStyle w:val="Hyperlink"/>
@@ -3649,7 +3649,7 @@
             <w:noProof/>
             <w:webHidden/>
           </w:rPr>
-          <w:instrText xml:space="preserve"> PAGEREF _Toc241962330 \h </w:instrText>
+          <w:instrText xml:space="preserve"> PAGEREF _Toc241965434 \h </w:instrText>
         </w:r>
         <w:r>
           <w:rPr>
@@ -3696,7 +3696,7 @@
           <w14:ligatures w14:val="standardContextual"/>
         </w:rPr>
       </w:pPr>
-      <w:hyperlink w:anchor="_Toc241962331" w:history="1">
+      <w:hyperlink w:anchor="_Toc241965435" w:history="1">
         <w:r>
           <w:rPr>
             <w:rStyle w:val="Hyperlink"/>
@@ -3723,7 +3723,7 @@
             <w:noProof/>
             <w:webHidden/>
           </w:rPr>
-          <w:instrText xml:space="preserve"> PAGEREF _Toc241962331 \h </w:instrText>
+          <w:instrText xml:space="preserve"> PAGEREF _Toc241965435 \h </w:instrText>
         </w:r>
         <w:r>
           <w:rPr>
@@ -3770,7 +3770,7 @@
           <w14:ligatures w14:val="standardContextual"/>
         </w:rPr>
       </w:pPr>
-      <w:hyperlink w:anchor="_Toc241962332" w:history="1">
+      <w:hyperlink w:anchor="_Toc241965436" w:history="1">
         <w:r>
           <w:rPr>
             <w:rStyle w:val="Hyperlink"/>
@@ -3797,7 +3797,7 @@
             <w:noProof/>
             <w:webHidden/>
           </w:rPr>
-          <w:instrText xml:space="preserve"> PAGEREF _Toc241962332 \h </w:instrText>
+          <w:instrText xml:space="preserve"> PAGEREF _Toc241965436 \h </w:instrText>
         </w:r>
         <w:r>
           <w:rPr>
@@ -3844,7 +3844,7 @@
           <w14:ligatures w14:val="standardContextual"/>
         </w:rPr>
       </w:pPr>
-      <w:hyperlink w:anchor="_Toc241962333" w:history="1">
+      <w:hyperlink w:anchor="_Toc241965437" w:history="1">
         <w:r>
           <w:rPr>
             <w:rStyle w:val="Hyperlink"/>
@@ -3871,7 +3871,7 @@
             <w:noProof/>
             <w:webHidden/>
           </w:rPr>
-          <w:instrText xml:space="preserve"> PAGEREF _Toc241962333 \h </w:instrText>
+          <w:instrText xml:space="preserve"> PAGEREF _Toc241965437 \h </w:instrText>
         </w:r>
         <w:r>
           <w:rPr>
@@ -3918,7 +3918,7 @@
           <w14:ligatures w14:val="standardContextual"/>
         </w:rPr>
       </w:pPr>
-      <w:hyperlink w:anchor="_Toc241962334" w:history="1">
+      <w:hyperlink w:anchor="_Toc241965438" w:history="1">
         <w:r>
           <w:rPr>
             <w:rStyle w:val="Hyperlink"/>
@@ -3945,7 +3945,7 @@
             <w:noProof/>
             <w:webHidden/>
           </w:rPr>
-          <w:instrText xml:space="preserve"> PAGEREF _Toc241962334 \h </w:instrText>
+          <w:instrText xml:space="preserve"> PAGEREF _Toc241965438 \h </w:instrText>
         </w:r>
         <w:r>
           <w:rPr>
@@ -3992,7 +3992,7 @@
           <w14:ligatures w14:val="standardContextual"/>
         </w:rPr>
       </w:pPr>
-      <w:hyperlink w:anchor="_Toc241962335" w:history="1">
+      <w:hyperlink w:anchor="_Toc241965439" w:history="1">
         <w:r>
           <w:rPr>
             <w:rStyle w:val="Hyperlink"/>
@@ -4019,7 +4019,7 @@
             <w:noProof/>
             <w:webHidden/>
           </w:rPr>
-          <w:instrText xml:space="preserve"> PAGEREF _Toc241962335 \h </w:instrText>
+          <w:instrText xml:space="preserve"> PAGEREF _Toc241965439 \h </w:instrText>
         </w:r>
         <w:r>
           <w:rPr>
@@ -4066,7 +4066,7 @@
           <w14:ligatures w14:val="standardContextual"/>
         </w:rPr>
       </w:pPr>
-      <w:hyperlink w:anchor="_Toc241962336" w:history="1">
+      <w:hyperlink w:anchor="_Toc241965440" w:history="1">
         <w:r>
           <w:rPr>
             <w:rStyle w:val="Hyperlink"/>
@@ -4093,7 +4093,7 @@
             <w:noProof/>
             <w:webHidden/>
           </w:rPr>
-          <w:instrText xml:space="preserve"> PAGEREF _Toc241962336 \h </w:instrText>
+          <w:instrText xml:space="preserve"> PAGEREF _Toc241965440 \h </w:instrText>
         </w:r>
         <w:r>
           <w:rPr>
@@ -4140,7 +4140,7 @@
           <w14:ligatures w14:val="standardContextual"/>
         </w:rPr>
       </w:pPr>
-      <w:hyperlink w:anchor="_Toc241962337" w:history="1">
+      <w:hyperlink w:anchor="_Toc241965441" w:history="1">
         <w:r>
           <w:rPr>
             <w:rStyle w:val="Hyperlink"/>
@@ -4167,7 +4167,7 @@
             <w:noProof/>
             <w:webHidden/>
           </w:rPr>
-          <w:instrText xml:space="preserve"> PAGEREF _Toc241962337 \h </w:instrText>
+          <w:instrText xml:space="preserve"> PAGEREF _Toc241965441 \h </w:instrText>
         </w:r>
         <w:r>
           <w:rPr>
@@ -4214,7 +4214,7 @@
           <w14:ligatures w14:val="standardContextual"/>
         </w:rPr>
       </w:pPr>
-      <w:hyperlink w:anchor="_Toc241962338" w:history="1">
+      <w:hyperlink w:anchor="_Toc241965442" w:history="1">
         <w:r>
           <w:rPr>
             <w:rStyle w:val="Hyperlink"/>
@@ -4241,7 +4241,7 @@
             <w:noProof/>
             <w:webHidden/>
           </w:rPr>
-          <w:instrText xml:space="preserve"> PAGEREF _Toc241962338 \h </w:instrText>
+          <w:instrText xml:space="preserve"> PAGEREF _Toc241965442 \h </w:instrText>
         </w:r>
         <w:r>
           <w:rPr>
@@ -4288,7 +4288,7 @@
           <w14:ligatures w14:val="standardContextual"/>
         </w:rPr>
       </w:pPr>
-      <w:hyperlink w:anchor="_Toc241962339" w:history="1">
+      <w:hyperlink w:anchor="_Toc241965443" w:history="1">
         <w:r>
           <w:rPr>
             <w:rStyle w:val="Hyperlink"/>
@@ -4315,7 +4315,7 @@
             <w:noProof/>
             <w:webHidden/>
           </w:rPr>
-          <w:instrText xml:space="preserve"> PAGEREF _Toc241962339 \h </w:instrText>
+          <w:instrText xml:space="preserve"> PAGEREF _Toc241965443 \h </w:instrText>
         </w:r>
         <w:r>
           <w:rPr>
@@ -4362,7 +4362,7 @@
           <w14:ligatures w14:val="standardContextual"/>
         </w:rPr>
       </w:pPr>
-      <w:hyperlink w:anchor="_Toc241962340" w:history="1">
+      <w:hyperlink w:anchor="_Toc241965444" w:history="1">
         <w:r>
           <w:rPr>
             <w:rStyle w:val="Hyperlink"/>
@@ -4389,7 +4389,7 @@
             <w:noProof/>
             <w:webHidden/>
           </w:rPr>
-          <w:instrText xml:space="preserve"> PAGEREF _Toc241962340 \h </w:instrText>
+          <w:instrText xml:space="preserve"> PAGEREF _Toc241965444 \h </w:instrText>
         </w:r>
         <w:r>
           <w:rPr>
@@ -4436,7 +4436,7 @@
           <w14:ligatures w14:val="standardContextual"/>
         </w:rPr>
       </w:pPr>
-      <w:hyperlink w:anchor="_Toc241962341" w:history="1">
+      <w:hyperlink w:anchor="_Toc241965445" w:history="1">
         <w:r>
           <w:rPr>
             <w:rStyle w:val="Hyperlink"/>
@@ -4463,7 +4463,7 @@
             <w:noProof/>
             <w:webHidden/>
           </w:rPr>
-          <w:instrText xml:space="preserve"> PAGEREF _Toc241962341 \h </w:instrText>
+          <w:instrText xml:space="preserve"> PAGEREF _Toc241965445 \h </w:instrText>
         </w:r>
         <w:r>
           <w:rPr>
@@ -4510,7 +4510,7 @@
           <w14:ligatures w14:val="standardContextual"/>
         </w:rPr>
       </w:pPr>
-      <w:hyperlink w:anchor="_Toc241962342" w:history="1">
+      <w:hyperlink w:anchor="_Toc241965446" w:history="1">
         <w:r>
           <w:rPr>
             <w:rStyle w:val="Hyperlink"/>
@@ -4537,7 +4537,7 @@
             <w:noProof/>
             <w:webHidden/>
           </w:rPr>
-          <w:instrText xml:space="preserve"> PAGEREF _Toc241962342 \h </w:instrText>
+          <w:instrText xml:space="preserve"> PAGEREF _Toc241965446 \h </w:instrText>
         </w:r>
         <w:r>
           <w:rPr>
@@ -4584,7 +4584,7 @@
           <w14:ligatures w14:val="standardContextual"/>
         </w:rPr>
       </w:pPr>
-      <w:hyperlink w:anchor="_Toc241962343" w:history="1">
+      <w:hyperlink w:anchor="_Toc241965447" w:history="1">
         <w:r>
           <w:rPr>
             <w:rStyle w:val="Hyperlink"/>
@@ -4611,7 +4611,7 @@
             <w:noProof/>
             <w:webHidden/>
           </w:rPr>
-          <w:instrText xml:space="preserve"> PAGEREF _Toc241962343 \h </w:instrText>
+          <w:instrText xml:space="preserve"> PAGEREF _Toc241965447 \h </w:instrText>
         </w:r>
         <w:r>
           <w:rPr>
@@ -4658,7 +4658,7 @@
           <w14:ligatures w14:val="standardContextual"/>
         </w:rPr>
       </w:pPr>
-      <w:hyperlink w:anchor="_Toc241962344" w:history="1">
+      <w:hyperlink w:anchor="_Toc241965448" w:history="1">
         <w:r>
           <w:rPr>
             <w:rStyle w:val="Hyperlink"/>
@@ -4685,7 +4685,7 @@
             <w:noProof/>
             <w:webHidden/>
           </w:rPr>
-          <w:instrText xml:space="preserve"> PAGEREF _Toc241962344 \h </w:instrText>
+          <w:instrText xml:space="preserve"> PAGEREF _Toc241965448 \h </w:instrText>
         </w:r>
         <w:r>
           <w:rPr>
@@ -4732,7 +4732,7 @@
           <w14:ligatures w14:val="standardContextual"/>
         </w:rPr>
       </w:pPr>
-      <w:hyperlink w:anchor="_Toc241962345" w:history="1">
+      <w:hyperlink w:anchor="_Toc241965449" w:history="1">
         <w:r>
           <w:rPr>
             <w:rStyle w:val="Hyperlink"/>
@@ -4759,7 +4759,7 @@
             <w:noProof/>
             <w:webHidden/>
           </w:rPr>
-          <w:instrText xml:space="preserve"> PAGEREF _Toc241962345 \h </w:instrText>
+          <w:instrText xml:space="preserve"> PAGEREF _Toc241965449 \h </w:instrText>
         </w:r>
         <w:r>
           <w:rPr>
@@ -4806,7 +4806,7 @@
           <w14:ligatures w14:val="standardContextual"/>
         </w:rPr>
       </w:pPr>
-      <w:hyperlink w:anchor="_Toc241962346" w:history="1">
+      <w:hyperlink w:anchor="_Toc241965450" w:history="1">
         <w:r>
           <w:rPr>
             <w:rStyle w:val="Hyperlink"/>
@@ -4833,7 +4833,7 @@
             <w:noProof/>
             <w:webHidden/>
           </w:rPr>
-          <w:instrText xml:space="preserve"> PAGEREF _Toc241962346 \h </w:instrText>
+          <w:instrText xml:space="preserve"> PAGEREF _Toc241965450 \h </w:instrText>
         </w:r>
         <w:r>
           <w:rPr>
@@ -4880,7 +4880,7 @@
           <w14:ligatures w14:val="standardContextual"/>
         </w:rPr>
       </w:pPr>
-      <w:hyperlink w:anchor="_Toc241962347" w:history="1">
+      <w:hyperlink w:anchor="_Toc241965451" w:history="1">
         <w:r>
           <w:rPr>
             <w:rStyle w:val="Hyperlink"/>
@@ -4907,7 +4907,7 @@
             <w:noProof/>
             <w:webHidden/>
           </w:rPr>
-          <w:instrText xml:space="preserve"> PAGEREF _Toc241962347 \h </w:instrText>
+          <w:instrText xml:space="preserve"> PAGEREF _Toc241965451 \h </w:instrText>
         </w:r>
         <w:r>
           <w:rPr>
@@ -4954,7 +4954,7 @@
           <w14:ligatures w14:val="standardContextual"/>
         </w:rPr>
       </w:pPr>
-      <w:hyperlink w:anchor="_Toc241962348" w:history="1">
+      <w:hyperlink w:anchor="_Toc241965452" w:history="1">
         <w:r>
           <w:rPr>
             <w:rStyle w:val="Hyperlink"/>
@@ -4981,7 +4981,7 @@
             <w:noProof/>
             <w:webHidden/>
           </w:rPr>
-          <w:instrText xml:space="preserve"> PAGEREF _Toc241962348 \h </w:instrText>
+          <w:instrText xml:space="preserve"> PAGEREF _Toc241965452 \h </w:instrText>
         </w:r>
         <w:r>
           <w:rPr>
@@ -5028,7 +5028,7 @@
           <w14:ligatures w14:val="standardContextual"/>
         </w:rPr>
       </w:pPr>
-      <w:hyperlink w:anchor="_Toc241962349" w:history="1">
+      <w:hyperlink w:anchor="_Toc241965453" w:history="1">
         <w:r>
           <w:rPr>
             <w:rStyle w:val="Hyperlink"/>
@@ -5055,7 +5055,7 @@
             <w:noProof/>
             <w:webHidden/>
           </w:rPr>
-          <w:instrText xml:space="preserve"> PAGEREF _Toc241962349 \h </w:instrText>
+          <w:instrText xml:space="preserve"> PAGEREF _Toc241965453 \h </w:instrText>
         </w:r>
         <w:r>
           <w:rPr>
@@ -5102,7 +5102,7 @@
           <w14:ligatures w14:val="standardContextual"/>
         </w:rPr>
       </w:pPr>
-      <w:hyperlink w:anchor="_Toc241962350" w:history="1">
+      <w:hyperlink w:anchor="_Toc241965454" w:history="1">
         <w:r>
           <w:rPr>
             <w:rStyle w:val="Hyperlink"/>
@@ -5129,7 +5129,7 @@
             <w:noProof/>
             <w:webHidden/>
           </w:rPr>
-          <w:instrText xml:space="preserve"> PAGEREF _Toc241962350 \h </w:instrText>
+          <w:instrText xml:space="preserve"> PAGEREF _Toc241965454 \h </w:instrText>
         </w:r>
         <w:r>
           <w:rPr>
@@ -5176,7 +5176,7 @@
           <w14:ligatures w14:val="standardContextual"/>
         </w:rPr>
       </w:pPr>
-      <w:hyperlink w:anchor="_Toc241962351" w:history="1">
+      <w:hyperlink w:anchor="_Toc241965455" w:history="1">
         <w:r>
           <w:rPr>
             <w:rStyle w:val="Hyperlink"/>
@@ -5203,7 +5203,7 @@
             <w:noProof/>
             <w:webHidden/>
           </w:rPr>
-          <w:instrText xml:space="preserve"> PAGEREF _Toc241962351 \h </w:instrText>
+          <w:instrText xml:space="preserve"> PAGEREF _Toc241965455 \h </w:instrText>
         </w:r>
         <w:r>
           <w:rPr>
@@ -5250,7 +5250,7 @@
           <w14:ligatures w14:val="standardContextual"/>
         </w:rPr>
       </w:pPr>
-      <w:hyperlink w:anchor="_Toc241962352" w:history="1">
+      <w:hyperlink w:anchor="_Toc241965456" w:history="1">
         <w:r>
           <w:rPr>
             <w:rStyle w:val="Hyperlink"/>
@@ -5277,7 +5277,7 @@
             <w:noProof/>
             <w:webHidden/>
           </w:rPr>
-          <w:instrText xml:space="preserve"> PAGEREF _Toc241962352 \h </w:instrText>
+          <w:instrText xml:space="preserve"> PAGEREF _Toc241965456 \h </w:instrText>
         </w:r>
         <w:r>
           <w:rPr>
@@ -5324,7 +5324,7 @@
           <w14:ligatures w14:val="standardContextual"/>
         </w:rPr>
       </w:pPr>
-      <w:hyperlink w:anchor="_Toc241962353" w:history="1">
+      <w:hyperlink w:anchor="_Toc241965457" w:history="1">
         <w:r>
           <w:rPr>
             <w:rStyle w:val="Hyperlink"/>
@@ -5351,7 +5351,7 @@
             <w:noProof/>
             <w:webHidden/>
           </w:rPr>
-          <w:instrText xml:space="preserve"> PAGEREF _Toc241962353 \h </w:instrText>
+          <w:instrText xml:space="preserve"> PAGEREF _Toc241965457 \h </w:instrText>
         </w:r>
         <w:r>
           <w:rPr>
@@ -5398,7 +5398,7 @@
           <w14:ligatures w14:val="standardContextual"/>
         </w:rPr>
       </w:pPr>
-      <w:hyperlink w:anchor="_Toc241962354" w:history="1">
+      <w:hyperlink w:anchor="_Toc241965458" w:history="1">
         <w:r>
           <w:rPr>
             <w:rStyle w:val="Hyperlink"/>
@@ -5425,7 +5425,7 @@
             <w:noProof/>
             <w:webHidden/>
           </w:rPr>
-          <w:instrText xml:space="preserve"> PAGEREF _Toc241962354 \h </w:instrText>
+          <w:instrText xml:space="preserve"> PAGEREF _Toc241965458 \h </w:instrText>
         </w:r>
         <w:r>
           <w:rPr>
@@ -5472,7 +5472,7 @@
           <w14:ligatures w14:val="standardContextual"/>
         </w:rPr>
       </w:pPr>
-      <w:hyperlink w:anchor="_Toc241962355" w:history="1">
+      <w:hyperlink w:anchor="_Toc241965459" w:history="1">
         <w:r>
           <w:rPr>
             <w:rStyle w:val="Hyperlink"/>
@@ -5499,7 +5499,7 @@
             <w:noProof/>
             <w:webHidden/>
           </w:rPr>
-          <w:instrText xml:space="preserve"> PAGEREF _Toc241962355 \h </w:instrText>
+          <w:instrText xml:space="preserve"> PAGEREF _Toc241965459 \h </w:instrText>
         </w:r>
         <w:r>
           <w:rPr>
@@ -5546,7 +5546,7 @@
           <w14:ligatures w14:val="standardContextual"/>
         </w:rPr>
       </w:pPr>
-      <w:hyperlink w:anchor="_Toc241962356" w:history="1">
+      <w:hyperlink w:anchor="_Toc241965460" w:history="1">
         <w:r>
           <w:rPr>
             <w:rStyle w:val="Hyperlink"/>
@@ -5573,7 +5573,7 @@
             <w:noProof/>
             <w:webHidden/>
           </w:rPr>
-          <w:instrText xml:space="preserve"> PAGEREF _Toc241962356 \h </w:instrText>
+          <w:instrText xml:space="preserve"> PAGEREF _Toc241965460 \h </w:instrText>
         </w:r>
         <w:r>
           <w:rPr>
@@ -5620,7 +5620,7 @@
           <w14:ligatures w14:val="standardContextual"/>
         </w:rPr>
       </w:pPr>
-      <w:hyperlink w:anchor="_Toc241962357" w:history="1">
+      <w:hyperlink w:anchor="_Toc241965461" w:history="1">
         <w:r>
           <w:rPr>
             <w:rStyle w:val="Hyperlink"/>
@@ -5647,7 +5647,7 @@
             <w:noProof/>
             <w:webHidden/>
           </w:rPr>
-          <w:instrText xml:space="preserve"> PAGEREF _Toc241962357 \h </w:instrText>
+          <w:instrText xml:space="preserve"> PAGEREF _Toc241965461 \h </w:instrText>
         </w:r>
         <w:r>
           <w:rPr>
@@ -5694,7 +5694,7 @@
           <w14:ligatures w14:val="standardContextual"/>
         </w:rPr>
       </w:pPr>
-      <w:hyperlink w:anchor="_Toc241962358" w:history="1">
+      <w:hyperlink w:anchor="_Toc241965462" w:history="1">
         <w:r>
           <w:rPr>
             <w:rStyle w:val="Hyperlink"/>
@@ -5721,7 +5721,7 @@
             <w:noProof/>
             <w:webHidden/>
           </w:rPr>
-          <w:instrText xml:space="preserve"> PAGEREF _Toc241962358 \h </w:instrText>
+          <w:instrText xml:space="preserve"> PAGEREF _Toc241965462 \h </w:instrText>
         </w:r>
         <w:r>
           <w:rPr>
@@ -5768,7 +5768,7 @@
           <w14:ligatures w14:val="standardContextual"/>
         </w:rPr>
       </w:pPr>
-      <w:hyperlink w:anchor="_Toc241962359" w:history="1">
+      <w:hyperlink w:anchor="_Toc241965463" w:history="1">
         <w:r>
           <w:rPr>
             <w:rStyle w:val="Hyperlink"/>
@@ -5795,7 +5795,7 @@
             <w:noProof/>
             <w:webHidden/>
           </w:rPr>
-          <w:instrText xml:space="preserve"> PAGEREF _Toc241962359 \h </w:instrText>
+          <w:instrText xml:space="preserve"> PAGEREF _Toc241965463 \h </w:instrText>
         </w:r>
         <w:r>
           <w:rPr>
@@ -5842,7 +5842,7 @@
           <w14:ligatures w14:val="standardContextual"/>
         </w:rPr>
       </w:pPr>
-      <w:hyperlink w:anchor="_Toc241962360" w:history="1">
+      <w:hyperlink w:anchor="_Toc241965464" w:history="1">
         <w:r>
           <w:rPr>
             <w:rStyle w:val="Hyperlink"/>
@@ -5869,7 +5869,7 @@
             <w:noProof/>
             <w:webHidden/>
           </w:rPr>
-          <w:instrText xml:space="preserve"> PAGEREF _Toc241962360 \h </w:instrText>
+          <w:instrText xml:space="preserve"> PAGEREF _Toc241965464 \h </w:instrText>
         </w:r>
         <w:r>
           <w:rPr>
@@ -5917,6 +5917,7 @@
           <w:color w:val="1F3864"/>
           <w:sz w:val="32"/>
         </w:rPr>
+        <w:lastRenderedPageBreak/>
         <w:t>DANH MỤC HÌNH ẢNH</w:t>
       </w:r>
     </w:p>
@@ -5945,7 +5946,7 @@
       <w:r>
         <w:fldChar w:fldCharType="separate"/>
       </w:r>
-      <w:hyperlink w:anchor="_Toc241962361" w:history="1">
+      <w:hyperlink w:anchor="_Toc241965465" w:history="1">
         <w:r>
           <w:rPr>
             <w:rStyle w:val="Hyperlink"/>
@@ -5972,7 +5973,7 @@
             <w:noProof/>
             <w:webHidden/>
           </w:rPr>
-          <w:instrText xml:space="preserve"> PAGEREF _Toc241962361 \h </w:instrText>
+          <w:instrText xml:space="preserve"> PAGEREF _Toc241965465 \h </w:instrText>
         </w:r>
         <w:r>
           <w:rPr>
@@ -6019,7 +6020,7 @@
           <w14:ligatures w14:val="standardContextual"/>
         </w:rPr>
       </w:pPr>
-      <w:hyperlink w:anchor="_Toc241962362" w:history="1">
+      <w:hyperlink w:anchor="_Toc241965466" w:history="1">
         <w:r>
           <w:rPr>
             <w:rStyle w:val="Hyperlink"/>
@@ -6046,7 +6047,7 @@
             <w:noProof/>
             <w:webHidden/>
           </w:rPr>
-          <w:instrText xml:space="preserve"> PAGEREF _Toc241962362 \h </w:instrText>
+          <w:instrText xml:space="preserve"> PAGEREF _Toc241965466 \h </w:instrText>
         </w:r>
         <w:r>
           <w:rPr>
@@ -6093,7 +6094,7 @@
           <w14:ligatures w14:val="standardContextual"/>
         </w:rPr>
       </w:pPr>
-      <w:hyperlink w:anchor="_Toc241962363" w:history="1">
+      <w:hyperlink w:anchor="_Toc241965467" w:history="1">
         <w:r>
           <w:rPr>
             <w:rStyle w:val="Hyperlink"/>
@@ -6120,7 +6121,7 @@
             <w:noProof/>
             <w:webHidden/>
           </w:rPr>
-          <w:instrText xml:space="preserve"> PAGEREF _Toc241962363 \h </w:instrText>
+          <w:instrText xml:space="preserve"> PAGEREF _Toc241965467 \h </w:instrText>
         </w:r>
         <w:r>
           <w:rPr>
@@ -6167,7 +6168,7 @@
           <w14:ligatures w14:val="standardContextual"/>
         </w:rPr>
       </w:pPr>
-      <w:hyperlink w:anchor="_Toc241962364" w:history="1">
+      <w:hyperlink w:anchor="_Toc241965468" w:history="1">
         <w:r>
           <w:rPr>
             <w:rStyle w:val="Hyperlink"/>
@@ -6194,7 +6195,7 @@
             <w:noProof/>
             <w:webHidden/>
           </w:rPr>
-          <w:instrText xml:space="preserve"> PAGEREF _Toc241962364 \h </w:instrText>
+          <w:instrText xml:space="preserve"> PAGEREF _Toc241965468 \h </w:instrText>
         </w:r>
         <w:r>
           <w:rPr>
@@ -6241,7 +6242,7 @@
           <w14:ligatures w14:val="standardContextual"/>
         </w:rPr>
       </w:pPr>
-      <w:hyperlink w:anchor="_Toc241962365" w:history="1">
+      <w:hyperlink w:anchor="_Toc241965469" w:history="1">
         <w:r>
           <w:rPr>
             <w:rStyle w:val="Hyperlink"/>
@@ -6268,7 +6269,7 @@
             <w:noProof/>
             <w:webHidden/>
           </w:rPr>
-          <w:instrText xml:space="preserve"> PAGEREF _Toc241962365 \h </w:instrText>
+          <w:instrText xml:space="preserve"> PAGEREF _Toc241965469 \h </w:instrText>
         </w:r>
         <w:r>
           <w:rPr>
@@ -6315,7 +6316,7 @@
           <w14:ligatures w14:val="standardContextual"/>
         </w:rPr>
       </w:pPr>
-      <w:hyperlink w:anchor="_Toc241962366" w:history="1">
+      <w:hyperlink w:anchor="_Toc241965470" w:history="1">
         <w:r>
           <w:rPr>
             <w:rStyle w:val="Hyperlink"/>
@@ -6342,7 +6343,7 @@
             <w:noProof/>
             <w:webHidden/>
           </w:rPr>
-          <w:instrText xml:space="preserve"> PAGEREF _Toc241962366 \h </w:instrText>
+          <w:instrText xml:space="preserve"> PAGEREF _Toc241965470 \h </w:instrText>
         </w:r>
         <w:r>
           <w:rPr>
@@ -6389,7 +6390,7 @@
           <w14:ligatures w14:val="standardContextual"/>
         </w:rPr>
       </w:pPr>
-      <w:hyperlink w:anchor="_Toc241962367" w:history="1">
+      <w:hyperlink w:anchor="_Toc241965471" w:history="1">
         <w:r>
           <w:rPr>
             <w:rStyle w:val="Hyperlink"/>
@@ -6416,7 +6417,7 @@
             <w:noProof/>
             <w:webHidden/>
           </w:rPr>
-          <w:instrText xml:space="preserve"> PAGEREF _Toc241962367 \h </w:instrText>
+          <w:instrText xml:space="preserve"> PAGEREF _Toc241965471 \h </w:instrText>
         </w:r>
         <w:r>
           <w:rPr>
@@ -6463,7 +6464,7 @@
           <w14:ligatures w14:val="standardContextual"/>
         </w:rPr>
       </w:pPr>
-      <w:hyperlink w:anchor="_Toc241962368" w:history="1">
+      <w:hyperlink w:anchor="_Toc241965472" w:history="1">
         <w:r>
           <w:rPr>
             <w:rStyle w:val="Hyperlink"/>
@@ -6490,7 +6491,7 @@
             <w:noProof/>
             <w:webHidden/>
           </w:rPr>
-          <w:instrText xml:space="preserve"> PAGEREF _Toc241962368 \h </w:instrText>
+          <w:instrText xml:space="preserve"> PAGEREF _Toc241965472 \h </w:instrText>
         </w:r>
         <w:r>
           <w:rPr>
@@ -6537,7 +6538,7 @@
           <w14:ligatures w14:val="standardContextual"/>
         </w:rPr>
       </w:pPr>
-      <w:hyperlink w:anchor="_Toc241962369" w:history="1">
+      <w:hyperlink w:anchor="_Toc241965473" w:history="1">
         <w:r>
           <w:rPr>
             <w:rStyle w:val="Hyperlink"/>
@@ -6564,7 +6565,7 @@
             <w:noProof/>
             <w:webHidden/>
           </w:rPr>
-          <w:instrText xml:space="preserve"> PAGEREF _Toc241962369 \h </w:instrText>
+          <w:instrText xml:space="preserve"> PAGEREF _Toc241965473 \h </w:instrText>
         </w:r>
         <w:r>
           <w:rPr>
@@ -6611,7 +6612,7 @@
           <w14:ligatures w14:val="standardContextual"/>
         </w:rPr>
       </w:pPr>
-      <w:hyperlink w:anchor="_Toc241962370" w:history="1">
+      <w:hyperlink w:anchor="_Toc241965474" w:history="1">
         <w:r>
           <w:rPr>
             <w:rStyle w:val="Hyperlink"/>
@@ -6638,7 +6639,7 @@
             <w:noProof/>
             <w:webHidden/>
           </w:rPr>
-          <w:instrText xml:space="preserve"> PAGEREF _Toc241962370 \h </w:instrText>
+          <w:instrText xml:space="preserve"> PAGEREF _Toc241965474 \h </w:instrText>
         </w:r>
         <w:r>
           <w:rPr>
@@ -6685,7 +6686,7 @@
           <w14:ligatures w14:val="standardContextual"/>
         </w:rPr>
       </w:pPr>
-      <w:hyperlink w:anchor="_Toc241962371" w:history="1">
+      <w:hyperlink w:anchor="_Toc241965475" w:history="1">
         <w:r>
           <w:rPr>
             <w:rStyle w:val="Hyperlink"/>
@@ -6712,7 +6713,7 @@
             <w:noProof/>
             <w:webHidden/>
           </w:rPr>
-          <w:instrText xml:space="preserve"> PAGEREF _Toc241962371 \h </w:instrText>
+          <w:instrText xml:space="preserve"> PAGEREF _Toc241965475 \h </w:instrText>
         </w:r>
         <w:r>
           <w:rPr>
@@ -6759,7 +6760,7 @@
           <w14:ligatures w14:val="standardContextual"/>
         </w:rPr>
       </w:pPr>
-      <w:hyperlink w:anchor="_Toc241962372" w:history="1">
+      <w:hyperlink w:anchor="_Toc241965476" w:history="1">
         <w:r>
           <w:rPr>
             <w:rStyle w:val="Hyperlink"/>
@@ -6786,7 +6787,7 @@
             <w:noProof/>
             <w:webHidden/>
           </w:rPr>
-          <w:instrText xml:space="preserve"> PAGEREF _Toc241962372 \h </w:instrText>
+          <w:instrText xml:space="preserve"> PAGEREF _Toc241965476 \h </w:instrText>
         </w:r>
         <w:r>
           <w:rPr>
@@ -6833,7 +6834,7 @@
           <w14:ligatures w14:val="standardContextual"/>
         </w:rPr>
       </w:pPr>
-      <w:hyperlink w:anchor="_Toc241962373" w:history="1">
+      <w:hyperlink w:anchor="_Toc241965477" w:history="1">
         <w:r>
           <w:rPr>
             <w:rStyle w:val="Hyperlink"/>
@@ -6860,7 +6861,7 @@
             <w:noProof/>
             <w:webHidden/>
           </w:rPr>
-          <w:instrText xml:space="preserve"> PAGEREF _Toc241962373 \h </w:instrText>
+          <w:instrText xml:space="preserve"> PAGEREF _Toc241965477 \h </w:instrText>
         </w:r>
         <w:r>
           <w:rPr>
@@ -6907,7 +6908,7 @@
           <w14:ligatures w14:val="standardContextual"/>
         </w:rPr>
       </w:pPr>
-      <w:hyperlink w:anchor="_Toc241962374" w:history="1">
+      <w:hyperlink w:anchor="_Toc241965478" w:history="1">
         <w:r>
           <w:rPr>
             <w:rStyle w:val="Hyperlink"/>
@@ -6934,7 +6935,7 @@
             <w:noProof/>
             <w:webHidden/>
           </w:rPr>
-          <w:instrText xml:space="preserve"> PAGEREF _Toc241962374 \h </w:instrText>
+          <w:instrText xml:space="preserve"> PAGEREF _Toc241965478 \h </w:instrText>
         </w:r>
         <w:r>
           <w:rPr>
@@ -6981,7 +6982,7 @@
           <w14:ligatures w14:val="standardContextual"/>
         </w:rPr>
       </w:pPr>
-      <w:hyperlink w:anchor="_Toc241962375" w:history="1">
+      <w:hyperlink w:anchor="_Toc241965479" w:history="1">
         <w:r>
           <w:rPr>
             <w:rStyle w:val="Hyperlink"/>
@@ -7008,7 +7009,7 @@
             <w:noProof/>
             <w:webHidden/>
           </w:rPr>
-          <w:instrText xml:space="preserve"> PAGEREF _Toc241962375 \h </w:instrText>
+          <w:instrText xml:space="preserve"> PAGEREF _Toc241965479 \h </w:instrText>
         </w:r>
         <w:r>
           <w:rPr>
@@ -7083,7 +7084,7 @@
       <w:r>
         <w:fldChar w:fldCharType="separate"/>
       </w:r>
-      <w:hyperlink w:anchor="_Toc241962376" w:history="1">
+      <w:hyperlink w:anchor="_Toc241965480" w:history="1">
         <w:r>
           <w:rPr>
             <w:rStyle w:val="Hyperlink"/>
@@ -7110,7 +7111,7 @@
             <w:noProof/>
             <w:webHidden/>
           </w:rPr>
-          <w:instrText xml:space="preserve"> PAGEREF _Toc241962376 \h </w:instrText>
+          <w:instrText xml:space="preserve"> PAGEREF _Toc241965480 \h </w:instrText>
         </w:r>
         <w:r>
           <w:rPr>
@@ -7157,7 +7158,7 @@
           <w14:ligatures w14:val="standardContextual"/>
         </w:rPr>
       </w:pPr>
-      <w:hyperlink w:anchor="_Toc241962377" w:history="1">
+      <w:hyperlink w:anchor="_Toc241965481" w:history="1">
         <w:r>
           <w:rPr>
             <w:rStyle w:val="Hyperlink"/>
@@ -7184,7 +7185,7 @@
             <w:noProof/>
             <w:webHidden/>
           </w:rPr>
-          <w:instrText xml:space="preserve"> PAGEREF _Toc241962377 \h </w:instrText>
+          <w:instrText xml:space="preserve"> PAGEREF _Toc241965481 \h </w:instrText>
         </w:r>
         <w:r>
           <w:rPr>
@@ -7231,7 +7232,7 @@
           <w14:ligatures w14:val="standardContextual"/>
         </w:rPr>
       </w:pPr>
-      <w:hyperlink w:anchor="_Toc241962378" w:history="1">
+      <w:hyperlink w:anchor="_Toc241965482" w:history="1">
         <w:r>
           <w:rPr>
             <w:rStyle w:val="Hyperlink"/>
@@ -7258,7 +7259,7 @@
             <w:noProof/>
             <w:webHidden/>
           </w:rPr>
-          <w:instrText xml:space="preserve"> PAGEREF _Toc241962378 \h </w:instrText>
+          <w:instrText xml:space="preserve"> PAGEREF _Toc241965482 \h </w:instrText>
         </w:r>
         <w:r>
           <w:rPr>
@@ -7305,7 +7306,7 @@
           <w14:ligatures w14:val="standardContextual"/>
         </w:rPr>
       </w:pPr>
-      <w:hyperlink w:anchor="_Toc241962379" w:history="1">
+      <w:hyperlink w:anchor="_Toc241965483" w:history="1">
         <w:r>
           <w:rPr>
             <w:rStyle w:val="Hyperlink"/>
@@ -7332,7 +7333,7 @@
             <w:noProof/>
             <w:webHidden/>
           </w:rPr>
-          <w:instrText xml:space="preserve"> PAGEREF _Toc241962379 \h </w:instrText>
+          <w:instrText xml:space="preserve"> PAGEREF _Toc241965483 \h </w:instrText>
         </w:r>
         <w:r>
           <w:rPr>
@@ -7379,7 +7380,7 @@
           <w14:ligatures w14:val="standardContextual"/>
         </w:rPr>
       </w:pPr>
-      <w:hyperlink w:anchor="_Toc241962380" w:history="1">
+      <w:hyperlink w:anchor="_Toc241965484" w:history="1">
         <w:r>
           <w:rPr>
             <w:rStyle w:val="Hyperlink"/>
@@ -7406,7 +7407,7 @@
             <w:noProof/>
             <w:webHidden/>
           </w:rPr>
-          <w:instrText xml:space="preserve"> PAGEREF _Toc241962380 \h </w:instrText>
+          <w:instrText xml:space="preserve"> PAGEREF _Toc241965484 \h </w:instrText>
         </w:r>
         <w:r>
           <w:rPr>
@@ -7453,7 +7454,7 @@
           <w14:ligatures w14:val="standardContextual"/>
         </w:rPr>
       </w:pPr>
-      <w:hyperlink w:anchor="_Toc241962381" w:history="1">
+      <w:hyperlink w:anchor="_Toc241965485" w:history="1">
         <w:r>
           <w:rPr>
             <w:rStyle w:val="Hyperlink"/>
@@ -7480,7 +7481,7 @@
             <w:noProof/>
             <w:webHidden/>
           </w:rPr>
-          <w:instrText xml:space="preserve"> PAGEREF _Toc241962381 \h </w:instrText>
+          <w:instrText xml:space="preserve"> PAGEREF _Toc241965485 \h </w:instrText>
         </w:r>
         <w:r>
           <w:rPr>
@@ -7527,7 +7528,7 @@
           <w14:ligatures w14:val="standardContextual"/>
         </w:rPr>
       </w:pPr>
-      <w:hyperlink w:anchor="_Toc241962382" w:history="1">
+      <w:hyperlink w:anchor="_Toc241965486" w:history="1">
         <w:r>
           <w:rPr>
             <w:rStyle w:val="Hyperlink"/>
@@ -7554,7 +7555,7 @@
             <w:noProof/>
             <w:webHidden/>
           </w:rPr>
-          <w:instrText xml:space="preserve"> PAGEREF _Toc241962382 \h </w:instrText>
+          <w:instrText xml:space="preserve"> PAGEREF _Toc241965486 \h </w:instrText>
         </w:r>
         <w:r>
           <w:rPr>
@@ -7601,7 +7602,7 @@
           <w14:ligatures w14:val="standardContextual"/>
         </w:rPr>
       </w:pPr>
-      <w:hyperlink w:anchor="_Toc241962383" w:history="1">
+      <w:hyperlink w:anchor="_Toc241965487" w:history="1">
         <w:r>
           <w:rPr>
             <w:rStyle w:val="Hyperlink"/>
@@ -7628,7 +7629,7 @@
             <w:noProof/>
             <w:webHidden/>
           </w:rPr>
-          <w:instrText xml:space="preserve"> PAGEREF _Toc241962383 \h </w:instrText>
+          <w:instrText xml:space="preserve"> PAGEREF _Toc241965487 \h </w:instrText>
         </w:r>
         <w:r>
           <w:rPr>
@@ -7675,7 +7676,7 @@
           <w14:ligatures w14:val="standardContextual"/>
         </w:rPr>
       </w:pPr>
-      <w:hyperlink w:anchor="_Toc241962384" w:history="1">
+      <w:hyperlink w:anchor="_Toc241965488" w:history="1">
         <w:r>
           <w:rPr>
             <w:rStyle w:val="Hyperlink"/>
@@ -7702,7 +7703,7 @@
             <w:noProof/>
             <w:webHidden/>
           </w:rPr>
-          <w:instrText xml:space="preserve"> PAGEREF _Toc241962384 \h </w:instrText>
+          <w:instrText xml:space="preserve"> PAGEREF _Toc241965488 \h </w:instrText>
         </w:r>
         <w:r>
           <w:rPr>
@@ -7749,7 +7750,7 @@
           <w14:ligatures w14:val="standardContextual"/>
         </w:rPr>
       </w:pPr>
-      <w:hyperlink w:anchor="_Toc241962385" w:history="1">
+      <w:hyperlink w:anchor="_Toc241965489" w:history="1">
         <w:r>
           <w:rPr>
             <w:rStyle w:val="Hyperlink"/>
@@ -7776,7 +7777,7 @@
             <w:noProof/>
             <w:webHidden/>
           </w:rPr>
-          <w:instrText xml:space="preserve"> PAGEREF _Toc241962385 \h </w:instrText>
+          <w:instrText xml:space="preserve"> PAGEREF _Toc241965489 \h </w:instrText>
         </w:r>
         <w:r>
           <w:rPr>
@@ -7823,7 +7824,7 @@
           <w14:ligatures w14:val="standardContextual"/>
         </w:rPr>
       </w:pPr>
-      <w:hyperlink w:anchor="_Toc241962386" w:history="1">
+      <w:hyperlink w:anchor="_Toc241965490" w:history="1">
         <w:r>
           <w:rPr>
             <w:rStyle w:val="Hyperlink"/>
@@ -7850,7 +7851,7 @@
             <w:noProof/>
             <w:webHidden/>
           </w:rPr>
-          <w:instrText xml:space="preserve"> PAGEREF _Toc241962386 \h </w:instrText>
+          <w:instrText xml:space="preserve"> PAGEREF _Toc241965490 \h </w:instrText>
         </w:r>
         <w:r>
           <w:rPr>
@@ -7897,7 +7898,7 @@
           <w14:ligatures w14:val="standardContextual"/>
         </w:rPr>
       </w:pPr>
-      <w:hyperlink w:anchor="_Toc241962387" w:history="1">
+      <w:hyperlink w:anchor="_Toc241965491" w:history="1">
         <w:r>
           <w:rPr>
             <w:rStyle w:val="Hyperlink"/>
@@ -7924,7 +7925,7 @@
             <w:noProof/>
             <w:webHidden/>
           </w:rPr>
-          <w:instrText xml:space="preserve"> PAGEREF _Toc241962387 \h </w:instrText>
+          <w:instrText xml:space="preserve"> PAGEREF _Toc241965491 \h </w:instrText>
         </w:r>
         <w:r>
           <w:rPr>
@@ -7971,7 +7972,7 @@
           <w14:ligatures w14:val="standardContextual"/>
         </w:rPr>
       </w:pPr>
-      <w:hyperlink w:anchor="_Toc241962388" w:history="1">
+      <w:hyperlink w:anchor="_Toc241965492" w:history="1">
         <w:r>
           <w:rPr>
             <w:rStyle w:val="Hyperlink"/>
@@ -7998,7 +7999,7 @@
             <w:noProof/>
             <w:webHidden/>
           </w:rPr>
-          <w:instrText xml:space="preserve"> PAGEREF _Toc241962388 \h </w:instrText>
+          <w:instrText xml:space="preserve"> PAGEREF _Toc241965492 \h </w:instrText>
         </w:r>
         <w:r>
           <w:rPr>
@@ -8045,13 +8046,13 @@
           <w14:ligatures w14:val="standardContextual"/>
         </w:rPr>
       </w:pPr>
-      <w:hyperlink w:anchor="_Toc241962389" w:history="1">
+      <w:hyperlink w:anchor="_Toc241965493" w:history="1">
         <w:r>
           <w:rPr>
             <w:rStyle w:val="Hyperlink"/>
             <w:noProof/>
           </w:rPr>
-          <w:t>Bảng 5.4. Quy tắc CSDL kiểm tra khi ghi danh, chuyển lớp, điểm danh và nhập điểm</w:t>
+          <w:t>Bảng 5.4. Quy tắc CSDL kiểm tra khi ghi danh, chuyển lớp, mở/hủy lớp, điểm danh và nhập điểm</w:t>
         </w:r>
         <w:r>
           <w:rPr>
@@ -8072,7 +8073,7 @@
             <w:noProof/>
             <w:webHidden/>
           </w:rPr>
-          <w:instrText xml:space="preserve"> PAGEREF _Toc241962389 \h </w:instrText>
+          <w:instrText xml:space="preserve"> PAGEREF _Toc241965493 \h </w:instrText>
         </w:r>
         <w:r>
           <w:rPr>
@@ -8119,7 +8120,7 @@
           <w14:ligatures w14:val="standardContextual"/>
         </w:rPr>
       </w:pPr>
-      <w:hyperlink w:anchor="_Toc241962390" w:history="1">
+      <w:hyperlink w:anchor="_Toc241965494" w:history="1">
         <w:r>
           <w:rPr>
             <w:rStyle w:val="Hyperlink"/>
@@ -8146,7 +8147,7 @@
             <w:noProof/>
             <w:webHidden/>
           </w:rPr>
-          <w:instrText xml:space="preserve"> PAGEREF _Toc241962390 \h </w:instrText>
+          <w:instrText xml:space="preserve"> PAGEREF _Toc241965494 \h </w:instrText>
         </w:r>
         <w:r>
           <w:rPr>
@@ -8187,7 +8188,7 @@
         <w:pStyle w:val="Heading1"/>
         <w:pageBreakBefore/>
       </w:pPr>
-      <w:bookmarkStart w:id="0" w:name="_Toc241962300"/>
+      <w:bookmarkStart w:id="0" w:name="_Toc241965404"/>
       <w:r>
         <w:lastRenderedPageBreak/>
         <w:t>CHƯƠNG 1. GIỚI THIỆU</w:t>
@@ -8198,7 +8199,7 @@
       <w:pPr>
         <w:pStyle w:val="Heading2"/>
       </w:pPr>
-      <w:bookmarkStart w:id="1" w:name="_Toc241962301"/>
+      <w:bookmarkStart w:id="1" w:name="_Toc241965405"/>
       <w:r>
         <w:t>1.1. Mục đích của tài liệu</w:t>
       </w:r>
@@ -8245,7 +8246,7 @@
       <w:pPr>
         <w:pStyle w:val="Heading2"/>
       </w:pPr>
-      <w:bookmarkStart w:id="2" w:name="_Toc241962302"/>
+      <w:bookmarkStart w:id="2" w:name="_Toc241965406"/>
       <w:r>
         <w:t>1.2. Tổng quan phần mềm</w:t>
       </w:r>
@@ -8392,7 +8393,7 @@
       <w:pPr>
         <w:pStyle w:val="Heading2"/>
       </w:pPr>
-      <w:bookmarkStart w:id="3" w:name="_Toc241962303"/>
+      <w:bookmarkStart w:id="3" w:name="_Toc241965407"/>
       <w:r>
         <w:t>1.3. Vai trò người dùng và chức năng</w:t>
       </w:r>
@@ -8430,7 +8431,7 @@
       <w:pPr>
         <w:pStyle w:val="TableCaption"/>
       </w:pPr>
-      <w:bookmarkStart w:id="4" w:name="_Toc241962376"/>
+      <w:bookmarkStart w:id="4" w:name="_Toc241965480"/>
       <w:r>
         <w:t>Bảng 1.1. Chức năng hiển thị theo vai trò</w:t>
       </w:r>
@@ -10760,7 +10761,7 @@
       <w:pPr>
         <w:pStyle w:val="Heading2"/>
       </w:pPr>
-      <w:bookmarkStart w:id="5" w:name="_Toc241962304"/>
+      <w:bookmarkStart w:id="5" w:name="_Toc241965408"/>
       <w:r>
         <w:t>1.4. Yêu cầu hệ thống</w:t>
       </w:r>
@@ -10770,7 +10771,7 @@
       <w:pPr>
         <w:pStyle w:val="TableCaption"/>
       </w:pPr>
-      <w:bookmarkStart w:id="6" w:name="_Toc241962377"/>
+      <w:bookmarkStart w:id="6" w:name="_Toc241965481"/>
       <w:r>
         <w:t>Bảng 1.2. Yêu cầu phần cứng và phần mềm</w:t>
       </w:r>
@@ -11361,7 +11362,7 @@
       <w:pPr>
         <w:pStyle w:val="Heading2"/>
       </w:pPr>
-      <w:bookmarkStart w:id="7" w:name="_Toc241962305"/>
+      <w:bookmarkStart w:id="7" w:name="_Toc241965409"/>
       <w:r>
         <w:t>1.5. Các bước cài đặt tổng quát</w:t>
       </w:r>
@@ -11513,7 +11514,7 @@
       <w:pPr>
         <w:pStyle w:val="TableCaption"/>
       </w:pPr>
-      <w:bookmarkStart w:id="8" w:name="_Toc241962378"/>
+      <w:bookmarkStart w:id="8" w:name="_Toc241965482"/>
       <w:r>
         <w:lastRenderedPageBreak/>
         <w:t>Bảng 1.3. Chọn phương án SQL Server theo máy</w:t>
@@ -12118,7 +12119,7 @@
       <w:pPr>
         <w:pStyle w:val="Heading2"/>
       </w:pPr>
-      <w:bookmarkStart w:id="9" w:name="_Toc241962306"/>
+      <w:bookmarkStart w:id="9" w:name="_Toc241965410"/>
       <w:r>
         <w:t>1.6. Quy ước trình bày</w:t>
       </w:r>
@@ -12366,7 +12367,7 @@
         <w:pStyle w:val="Heading1"/>
         <w:pageBreakBefore/>
       </w:pPr>
-      <w:bookmarkStart w:id="10" w:name="_Toc241962307"/>
+      <w:bookmarkStart w:id="10" w:name="_Toc241965411"/>
       <w:r>
         <w:lastRenderedPageBreak/>
         <w:t>CHƯƠNG 2. CÀI ĐẶT SQL SERVER VÀ KHỞI TẠO CƠ SỞ DỮ LIỆU</w:t>
@@ -12423,7 +12424,7 @@
       <w:pPr>
         <w:pStyle w:val="Heading2"/>
       </w:pPr>
-      <w:bookmarkStart w:id="11" w:name="_Toc241962308"/>
+      <w:bookmarkStart w:id="11" w:name="_Toc241965412"/>
       <w:r>
         <w:t>2.1. Tải mã nguồn</w:t>
       </w:r>
@@ -12544,7 +12545,7 @@
       <w:pPr>
         <w:pStyle w:val="Heading2"/>
       </w:pPr>
-      <w:bookmarkStart w:id="12" w:name="_Toc241962309"/>
+      <w:bookmarkStart w:id="12" w:name="_Toc241965413"/>
       <w:r>
         <w:t>2.2. Phương án A - SQL Server trong Docker</w:t>
       </w:r>
@@ -12554,7 +12555,7 @@
       <w:pPr>
         <w:pStyle w:val="Heading3"/>
       </w:pPr>
-      <w:bookmarkStart w:id="13" w:name="_Toc241962310"/>
+      <w:bookmarkStart w:id="13" w:name="_Toc241965414"/>
       <w:r>
         <w:t>2.2.1. Cài Docker Desktop</w:t>
       </w:r>
@@ -12883,7 +12884,7 @@
       <w:pPr>
         <w:pStyle w:val="Heading3"/>
       </w:pPr>
-      <w:bookmarkStart w:id="14" w:name="_Toc241962311"/>
+      <w:bookmarkStart w:id="14" w:name="_Toc241965415"/>
       <w:r>
         <w:t>2.2.2. Khởi động SQL Server</w:t>
       </w:r>
@@ -13311,7 +13312,7 @@
       <w:pPr>
         <w:pStyle w:val="Heading3"/>
       </w:pPr>
-      <w:bookmarkStart w:id="15" w:name="_Toc241962312"/>
+      <w:bookmarkStart w:id="15" w:name="_Toc241965416"/>
       <w:r>
         <w:t>2.2.3. Khởi tạo CSDL</w:t>
       </w:r>
@@ -13731,7 +13732,7 @@
       <w:pPr>
         <w:pStyle w:val="Heading3"/>
       </w:pPr>
-      <w:bookmarkStart w:id="16" w:name="_Toc241962313"/>
+      <w:bookmarkStart w:id="16" w:name="_Toc241965417"/>
       <w:r>
         <w:t>2.2.4. Bật, tắt SQL Server hằng ngày</w:t>
       </w:r>
@@ -13741,7 +13742,7 @@
       <w:pPr>
         <w:pStyle w:val="TableCaption"/>
       </w:pPr>
-      <w:bookmarkStart w:id="17" w:name="_Toc241962379"/>
+      <w:bookmarkStart w:id="17" w:name="_Toc241965483"/>
       <w:r>
         <w:t>Bảng 2.1. Các lệnh Docker thường dùng</w:t>
       </w:r>
@@ -14158,7 +14159,7 @@
       <w:pPr>
         <w:pStyle w:val="Heading2"/>
       </w:pPr>
-      <w:bookmarkStart w:id="18" w:name="_Toc241962314"/>
+      <w:bookmarkStart w:id="18" w:name="_Toc241965418"/>
       <w:r>
         <w:t>2.3. Phương án B - SQL Server cài trực tiếp trên Windows</w:t>
       </w:r>
@@ -14168,7 +14169,7 @@
       <w:pPr>
         <w:pStyle w:val="Heading3"/>
       </w:pPr>
-      <w:bookmarkStart w:id="19" w:name="_Toc241962315"/>
+      <w:bookmarkStart w:id="19" w:name="_Toc241965419"/>
       <w:r>
         <w:t>2.3.1. Cài SQL Server</w:t>
       </w:r>
@@ -14426,7 +14427,7 @@
       <w:pPr>
         <w:pStyle w:val="Heading3"/>
       </w:pPr>
-      <w:bookmarkStart w:id="20" w:name="_Toc241962316"/>
+      <w:bookmarkStart w:id="20" w:name="_Toc241965420"/>
       <w:r>
         <w:t>2.3.2. Cài công cụ quản trị và driver</w:t>
       </w:r>
@@ -14532,7 +14533,7 @@
       <w:pPr>
         <w:pStyle w:val="Heading3"/>
       </w:pPr>
-      <w:bookmarkStart w:id="21" w:name="_Toc241962317"/>
+      <w:bookmarkStart w:id="21" w:name="_Toc241965421"/>
       <w:r>
         <w:t>2.3.3. Bật kết nối TCP/IP</w:t>
       </w:r>
@@ -14759,7 +14760,7 @@
       <w:pPr>
         <w:pStyle w:val="Heading3"/>
       </w:pPr>
-      <w:bookmarkStart w:id="22" w:name="_Toc241962318"/>
+      <w:bookmarkStart w:id="22" w:name="_Toc241965422"/>
       <w:r>
         <w:lastRenderedPageBreak/>
         <w:t>2.3.4. Khởi tạo CSDL</w:t>
@@ -15323,7 +15324,7 @@
       <w:pPr>
         <w:pStyle w:val="Heading3"/>
       </w:pPr>
-      <w:bookmarkStart w:id="23" w:name="_Toc241962319"/>
+      <w:bookmarkStart w:id="23" w:name="_Toc241965423"/>
       <w:r>
         <w:t>2.3.5. Cho máy khác kết nối tới (không bắt buộc)</w:t>
       </w:r>
@@ -15415,7 +15416,7 @@
       <w:pPr>
         <w:pStyle w:val="Heading2"/>
       </w:pPr>
-      <w:bookmarkStart w:id="24" w:name="_Toc241962320"/>
+      <w:bookmarkStart w:id="24" w:name="_Toc241965424"/>
       <w:r>
         <w:t>2.4. Nạp lại dữ liệu mẫu trước buổi demo</w:t>
       </w:r>
@@ -15527,7 +15528,7 @@
         <w:pStyle w:val="Heading1"/>
         <w:pageBreakBefore/>
       </w:pPr>
-      <w:bookmarkStart w:id="25" w:name="_Toc241962321"/>
+      <w:bookmarkStart w:id="25" w:name="_Toc241965425"/>
       <w:r>
         <w:lastRenderedPageBreak/>
         <w:t>CHƯƠNG 3. CÀI ĐẶT ỨNG DỤNG</w:t>
@@ -15538,7 +15539,7 @@
       <w:pPr>
         <w:pStyle w:val="Heading2"/>
       </w:pPr>
-      <w:bookmarkStart w:id="26" w:name="_Toc241962322"/>
+      <w:bookmarkStart w:id="26" w:name="_Toc241965426"/>
       <w:r>
         <w:t>3.1. Tải bộ cài</w:t>
       </w:r>
@@ -15576,7 +15577,7 @@
       <w:pPr>
         <w:pStyle w:val="TableCaption"/>
       </w:pPr>
-      <w:bookmarkStart w:id="27" w:name="_Toc241962380"/>
+      <w:bookmarkStart w:id="27" w:name="_Toc241965484"/>
       <w:r>
         <w:t>Bảng 3.1. Các file cài đặt</w:t>
       </w:r>
@@ -16019,7 +16020,7 @@
       <w:pPr>
         <w:pStyle w:val="Heading2"/>
       </w:pPr>
-      <w:bookmarkStart w:id="28" w:name="_Toc241962323"/>
+      <w:bookmarkStart w:id="28" w:name="_Toc241965427"/>
       <w:r>
         <w:t>3.2. Cài đặt trên macOS</w:t>
       </w:r>
@@ -16251,7 +16252,7 @@
       <w:pPr>
         <w:pStyle w:val="Heading2"/>
       </w:pPr>
-      <w:bookmarkStart w:id="29" w:name="_Toc241962324"/>
+      <w:bookmarkStart w:id="29" w:name="_Toc241965428"/>
       <w:r>
         <w:t>3.3. Cài đặt trên Windows</w:t>
       </w:r>
@@ -16261,7 +16262,7 @@
       <w:pPr>
         <w:pStyle w:val="Heading3"/>
       </w:pPr>
-      <w:bookmarkStart w:id="30" w:name="_Toc241962325"/>
+      <w:bookmarkStart w:id="30" w:name="_Toc241965429"/>
       <w:r>
         <w:t>3.3.1. Dùng bộ cài setup.exe</w:t>
       </w:r>
@@ -16691,7 +16692,7 @@
       <w:pPr>
         <w:pStyle w:val="Heading3"/>
       </w:pPr>
-      <w:bookmarkStart w:id="31" w:name="_Toc241962326"/>
+      <w:bookmarkStart w:id="31" w:name="_Toc241965430"/>
       <w:r>
         <w:t>3.3.2. Dùng bản portable</w:t>
       </w:r>
@@ -16738,7 +16739,7 @@
       <w:pPr>
         <w:pStyle w:val="Heading3"/>
       </w:pPr>
-      <w:bookmarkStart w:id="32" w:name="_Toc241962327"/>
+      <w:bookmarkStart w:id="32" w:name="_Toc241965431"/>
       <w:r>
         <w:t>3.3.3. Driver kết nối</w:t>
       </w:r>
@@ -16794,7 +16795,7 @@
       <w:pPr>
         <w:pStyle w:val="Heading2"/>
       </w:pPr>
-      <w:bookmarkStart w:id="33" w:name="_Toc241962328"/>
+      <w:bookmarkStart w:id="33" w:name="_Toc241965432"/>
       <w:r>
         <w:t>3.4. Nơi lưu cấu hình và gỡ cài đặt</w:t>
       </w:r>
@@ -16814,7 +16815,7 @@
       <w:pPr>
         <w:pStyle w:val="TableCaption"/>
       </w:pPr>
-      <w:bookmarkStart w:id="34" w:name="_Toc241962381"/>
+      <w:bookmarkStart w:id="34" w:name="_Toc241965485"/>
       <w:r>
         <w:t>Bảng 3.2. Cấu hình đã lưu và cách gỡ ứng dụng</w:t>
       </w:r>
@@ -17211,7 +17212,7 @@
       <w:pPr>
         <w:pStyle w:val="Heading2"/>
       </w:pPr>
-      <w:bookmarkStart w:id="35" w:name="_Toc241962329"/>
+      <w:bookmarkStart w:id="35" w:name="_Toc241965433"/>
       <w:r>
         <w:t>3.5. Chạy từ mã nguồn (dành cho nhóm phát triển)</w:t>
       </w:r>
@@ -17638,7 +17639,7 @@
         <w:pStyle w:val="Heading1"/>
         <w:pageBreakBefore/>
       </w:pPr>
-      <w:bookmarkStart w:id="36" w:name="_Toc241962330"/>
+      <w:bookmarkStart w:id="36" w:name="_Toc241965434"/>
       <w:r>
         <w:lastRenderedPageBreak/>
         <w:t>CHƯƠNG 4. ĐĂNG NHẬP VÀ GIAO DIỆN CHUNG</w:t>
@@ -17649,7 +17650,7 @@
       <w:pPr>
         <w:pStyle w:val="Heading2"/>
       </w:pPr>
-      <w:bookmarkStart w:id="37" w:name="_Toc241962331"/>
+      <w:bookmarkStart w:id="37" w:name="_Toc241965435"/>
       <w:r>
         <w:t>4.1. Mở ứng dụng</w:t>
       </w:r>
@@ -17806,7 +17807,7 @@
           <w:noProof/>
         </w:rPr>
         <w:drawing>
-          <wp:inline distT="0" distB="0" distL="0" distR="0" wp14:anchorId="5929274B" wp14:editId="1AD554E6">
+          <wp:inline distT="0" distB="0" distL="0" distR="0" wp14:anchorId="14F7D3C9" wp14:editId="02847A79">
             <wp:extent cx="4860000" cy="2938605"/>
             <wp:effectExtent l="0" t="0" r="0" b="0"/>
             <wp:docPr id="522444761" name="Picture 522444761"/>
@@ -17846,7 +17847,7 @@
       <w:pPr>
         <w:pStyle w:val="FigureCaption"/>
       </w:pPr>
-      <w:bookmarkStart w:id="38" w:name="_Toc241962361"/>
+      <w:bookmarkStart w:id="38" w:name="_Toc241965465"/>
       <w:r>
         <w:t>Hình 4.1. Màn hình đăng nhập</w:t>
       </w:r>
@@ -17856,7 +17857,7 @@
       <w:pPr>
         <w:pStyle w:val="Heading2"/>
       </w:pPr>
-      <w:bookmarkStart w:id="39" w:name="_Toc241962332"/>
+      <w:bookmarkStart w:id="39" w:name="_Toc241965436"/>
       <w:r>
         <w:t>4.2. Cấu hình máy chủ (lần chạy đầu tiên)</w:t>
       </w:r>
@@ -17992,7 +17993,7 @@
         <w:t>bật</w:t>
       </w:r>
       <w:r>
-        <w:t xml:space="preserve"> khi dùng Docker hoặc SQL Server cài trên máy (chứng chỉ tự ký). Chỉ tắt khi máy chủ có chứng chỉ do tổ chức tin cậy cấp.</w:t>
+        <w:t xml:space="preserve"> khi dùng Docker hoặc SQL Server cài trên máy (chứng chỉ tự ký). Chỉ tắt khi máy chủ có chứng chỉ do tổ chức tin cậy cấp. Khi đã tắt, ứng dụng không tự chuyển sang driver khác để bỏ qua bước kiểm tra chứng chỉ. Bản macOS dùng driver FreeTDS: kết nối vẫn được mã hóa nhưng driver này không kiểm tra chứng chỉ, nên ô này không có tác dụng.</w:t>
       </w:r>
     </w:p>
     <w:p>
@@ -18007,7 +18008,7 @@
         </w:rPr>
         <w:lastRenderedPageBreak/>
         <w:drawing>
-          <wp:inline distT="0" distB="0" distL="0" distR="0" wp14:anchorId="0526AE36" wp14:editId="37F5F900">
+          <wp:inline distT="0" distB="0" distL="0" distR="0" wp14:anchorId="2F5B2D21" wp14:editId="57DF152B">
             <wp:extent cx="5040000" cy="3360000"/>
             <wp:effectExtent l="0" t="0" r="0" b="0"/>
             <wp:docPr id="522444762" name="Picture 522444762"/>
@@ -18047,7 +18048,7 @@
       <w:pPr>
         <w:pStyle w:val="FigureCaption"/>
       </w:pPr>
-      <w:bookmarkStart w:id="40" w:name="_Toc241962362"/>
+      <w:bookmarkStart w:id="40" w:name="_Toc241965466"/>
       <w:r>
         <w:t>Hình 4.2. Khung cấu hình máy chủ SQL Server</w:t>
       </w:r>
@@ -18057,7 +18058,7 @@
       <w:pPr>
         <w:pStyle w:val="TableCaption"/>
       </w:pPr>
-      <w:bookmarkStart w:id="41" w:name="_Toc241962382"/>
+      <w:bookmarkStart w:id="41" w:name="_Toc241965486"/>
       <w:r>
         <w:t>Bảng 4.1. Giá trị ô Máy chủ theo cách cài SQL Server</w:t>
       </w:r>
@@ -18497,7 +18498,7 @@
       <w:pPr>
         <w:pStyle w:val="Heading2"/>
       </w:pPr>
-      <w:bookmarkStart w:id="42" w:name="_Toc241962333"/>
+      <w:bookmarkStart w:id="42" w:name="_Toc241965437"/>
       <w:r>
         <w:t>4.3. Đăng nhập</w:t>
       </w:r>
@@ -18571,7 +18572,7 @@
       <w:pPr>
         <w:pStyle w:val="TableCaption"/>
       </w:pPr>
-      <w:bookmarkStart w:id="43" w:name="_Toc241962383"/>
+      <w:bookmarkStart w:id="43" w:name="_Toc241965487"/>
       <w:r>
         <w:t>Bảng 4.2. Tài khoản demo trong dữ liệu mẫu</w:t>
       </w:r>
@@ -19897,7 +19898,7 @@
       <w:pPr>
         <w:pStyle w:val="TableCaption"/>
       </w:pPr>
-      <w:bookmarkStart w:id="44" w:name="_Toc241962384"/>
+      <w:bookmarkStart w:id="44" w:name="_Toc241965488"/>
       <w:r>
         <w:t>Bảng 4.3. Thông báo lỗi khi đăng nhập</w:t>
       </w:r>
@@ -20321,7 +20322,7 @@
       <w:pPr>
         <w:pStyle w:val="Heading2"/>
       </w:pPr>
-      <w:bookmarkStart w:id="45" w:name="_Toc241962334"/>
+      <w:bookmarkStart w:id="45" w:name="_Toc241965438"/>
       <w:r>
         <w:t>4.4. Màn hình chính</w:t>
       </w:r>
@@ -20472,7 +20473,7 @@
         </w:rPr>
         <w:lastRenderedPageBreak/>
         <w:drawing>
-          <wp:inline distT="0" distB="0" distL="0" distR="0" wp14:anchorId="725E555B" wp14:editId="27FD7487">
+          <wp:inline distT="0" distB="0" distL="0" distR="0" wp14:anchorId="243BFCB9" wp14:editId="2C5B007A">
             <wp:extent cx="5580000" cy="3332500"/>
             <wp:effectExtent l="0" t="0" r="0" b="0"/>
             <wp:docPr id="522444763" name="Picture 522444763"/>
@@ -20512,7 +20513,7 @@
       <w:pPr>
         <w:pStyle w:val="FigureCaption"/>
       </w:pPr>
-      <w:bookmarkStart w:id="46" w:name="_Toc241962363"/>
+      <w:bookmarkStart w:id="46" w:name="_Toc241965467"/>
       <w:r>
         <w:t>Hình 4.3. Màn hình chính của vai trò Quản lý (trang Tổng quan)</w:t>
       </w:r>
@@ -20522,7 +20523,7 @@
       <w:pPr>
         <w:pStyle w:val="Heading2"/>
       </w:pPr>
-      <w:bookmarkStart w:id="47" w:name="_Toc241962335"/>
+      <w:bookmarkStart w:id="47" w:name="_Toc241965439"/>
       <w:r>
         <w:t>4.5. Đổi ngôn ngữ giao diện</w:t>
       </w:r>
@@ -20560,7 +20561,7 @@
       <w:pPr>
         <w:pStyle w:val="Heading2"/>
       </w:pPr>
-      <w:bookmarkStart w:id="48" w:name="_Toc241962336"/>
+      <w:bookmarkStart w:id="48" w:name="_Toc241965440"/>
       <w:r>
         <w:t>4.6. Đổi mật khẩu</w:t>
       </w:r>
@@ -20676,7 +20677,7 @@
           <w:noProof/>
         </w:rPr>
         <w:drawing>
-          <wp:inline distT="0" distB="0" distL="0" distR="0" wp14:anchorId="416C2B3F" wp14:editId="6DC3DF4F">
+          <wp:inline distT="0" distB="0" distL="0" distR="0" wp14:anchorId="3A2E15CC" wp14:editId="150705E8">
             <wp:extent cx="3420000" cy="1368000"/>
             <wp:effectExtent l="0" t="0" r="0" b="0"/>
             <wp:docPr id="522444764" name="Picture 522444764"/>
@@ -20716,7 +20717,7 @@
       <w:pPr>
         <w:pStyle w:val="FigureCaption"/>
       </w:pPr>
-      <w:bookmarkStart w:id="49" w:name="_Toc241962364"/>
+      <w:bookmarkStart w:id="49" w:name="_Toc241965468"/>
       <w:r>
         <w:t>Hình 4.4. Hộp thoại đổi mật khẩu</w:t>
       </w:r>
@@ -20758,7 +20759,7 @@
       <w:pPr>
         <w:pStyle w:val="Heading2"/>
       </w:pPr>
-      <w:bookmarkStart w:id="50" w:name="_Toc241962337"/>
+      <w:bookmarkStart w:id="50" w:name="_Toc241965441"/>
       <w:r>
         <w:t>4.7. Đăng xuất và thoát</w:t>
       </w:r>
@@ -20805,7 +20806,7 @@
       <w:pPr>
         <w:pStyle w:val="Heading2"/>
       </w:pPr>
-      <w:bookmarkStart w:id="51" w:name="_Toc241962338"/>
+      <w:bookmarkStart w:id="51" w:name="_Toc241965442"/>
       <w:r>
         <w:t>4.8. Thao tác chung trên các danh sách</w:t>
       </w:r>
@@ -20832,7 +20833,7 @@
           <w:noProof/>
         </w:rPr>
         <w:drawing>
-          <wp:inline distT="0" distB="0" distL="0" distR="0" wp14:anchorId="0E5AC839" wp14:editId="4BBFE32F">
+          <wp:inline distT="0" distB="0" distL="0" distR="0" wp14:anchorId="497A641B" wp14:editId="775F3CF1">
             <wp:extent cx="5580000" cy="3332500"/>
             <wp:effectExtent l="0" t="0" r="0" b="0"/>
             <wp:docPr id="522444765" name="Picture 522444765"/>
@@ -20872,7 +20873,7 @@
       <w:pPr>
         <w:pStyle w:val="FigureCaption"/>
       </w:pPr>
-      <w:bookmarkStart w:id="52" w:name="_Toc241962365"/>
+      <w:bookmarkStart w:id="52" w:name="_Toc241965469"/>
       <w:r>
         <w:t>Hình 4.5. Một màn hình danh sách: Công nợ học phí</w:t>
       </w:r>
@@ -20882,7 +20883,7 @@
       <w:pPr>
         <w:pStyle w:val="TableCaption"/>
       </w:pPr>
-      <w:bookmarkStart w:id="53" w:name="_Toc241962385"/>
+      <w:bookmarkStart w:id="53" w:name="_Toc241965489"/>
       <w:r>
         <w:t>Bảng 4.4. Các thành phần của màn hình danh sách</w:t>
       </w:r>
@@ -21338,7 +21339,59 @@
               <w:rPr>
                 <w:sz w:val="21"/>
               </w:rPr>
-              <w:t xml:space="preserve"> (mặc định trong thư mục Documents/Tài liệu) rồi mở bằng Excel hoặc ứng dụng bảng tính mặc định. File dùng mã UTF-8 nên Excel hiển thị đúng tiếng Việt.</w:t>
+              <w:t xml:space="preserve"> (mặc định trong thư mục Documents/Tài liệu) rồi mở bằng Excel hoặc ứng dụng bảng tính mặc định. File dùng mã UTF-8 nên Excel hiển thị đúng tiếng Việt. Ô bắt đầu bằng </w:t>
+            </w:r>
+            <w:r>
+              <w:rPr>
+                <w:color w:val="C7254E"/>
+                <w:sz w:val="21"/>
+              </w:rPr>
+              <w:t>=</w:t>
+            </w:r>
+            <w:r>
+              <w:rPr>
+                <w:sz w:val="21"/>
+              </w:rPr>
+              <w:t xml:space="preserve">, </w:t>
+            </w:r>
+            <w:r>
+              <w:rPr>
+                <w:color w:val="C7254E"/>
+                <w:sz w:val="21"/>
+              </w:rPr>
+              <w:t>+</w:t>
+            </w:r>
+            <w:r>
+              <w:rPr>
+                <w:sz w:val="21"/>
+              </w:rPr>
+              <w:t xml:space="preserve"> hoặc </w:t>
+            </w:r>
+            <w:r>
+              <w:rPr>
+                <w:color w:val="C7254E"/>
+                <w:sz w:val="21"/>
+              </w:rPr>
+              <w:t>@</w:t>
+            </w:r>
+            <w:r>
+              <w:rPr>
+                <w:sz w:val="21"/>
+              </w:rPr>
+              <w:t xml:space="preserve"> được thêm dấu </w:t>
+            </w:r>
+            <w:r>
+              <w:rPr>
+                <w:color w:val="C7254E"/>
+                <w:sz w:val="21"/>
+              </w:rPr>
+              <w:t>'</w:t>
+            </w:r>
+            <w:r>
+              <w:rPr>
+                <w:sz w:val="21"/>
+              </w:rPr>
+              <w:t xml:space="preserve"> ở đầu để Excel không chạy nội dung đó như công thức.</w:t>
             </w:r>
           </w:p>
         </w:tc>
@@ -21508,7 +21561,7 @@
         <w:pStyle w:val="Heading1"/>
         <w:pageBreakBefore/>
       </w:pPr>
-      <w:bookmarkStart w:id="54" w:name="_Toc241962339"/>
+      <w:bookmarkStart w:id="54" w:name="_Toc241965443"/>
       <w:r>
         <w:lastRenderedPageBreak/>
         <w:t>CHƯƠNG 5. HƯỚNG DẪN THEO CHỨC NĂNG</w:t>
@@ -21529,7 +21582,7 @@
       <w:pPr>
         <w:pStyle w:val="Heading2"/>
       </w:pPr>
-      <w:bookmarkStart w:id="55" w:name="_Toc241962340"/>
+      <w:bookmarkStart w:id="55" w:name="_Toc241965444"/>
       <w:r>
         <w:t>5.1. Tổng quan</w:t>
       </w:r>
@@ -21564,7 +21617,7 @@
       <w:pPr>
         <w:pStyle w:val="TableCaption"/>
       </w:pPr>
-      <w:bookmarkStart w:id="56" w:name="_Toc241962386"/>
+      <w:bookmarkStart w:id="56" w:name="_Toc241965490"/>
       <w:r>
         <w:t>Bảng 5.1. Các thẻ số liệu trên trang Tổng quan</w:t>
       </w:r>
@@ -21708,7 +21761,7 @@
               <w:rPr>
                 <w:sz w:val="21"/>
               </w:rPr>
-              <w:t>Số học viên có trạng thái Đang học</w:t>
+              <w:t>Số học viên đang theo học ít nhất một lớp (có lượt ghi danh Đang học)</w:t>
             </w:r>
           </w:p>
         </w:tc>
@@ -22046,7 +22099,7 @@
           <w:noProof/>
         </w:rPr>
         <w:drawing>
-          <wp:inline distT="0" distB="0" distL="0" distR="0" wp14:anchorId="1B7B6FEC" wp14:editId="69816F26">
+          <wp:inline distT="0" distB="0" distL="0" distR="0" wp14:anchorId="1BB1E14A" wp14:editId="121C9167">
             <wp:extent cx="5580000" cy="3332500"/>
             <wp:effectExtent l="0" t="0" r="0" b="0"/>
             <wp:docPr id="522444766" name="Picture 522444766"/>
@@ -22086,7 +22139,7 @@
       <w:pPr>
         <w:pStyle w:val="FigureCaption"/>
       </w:pPr>
-      <w:bookmarkStart w:id="57" w:name="_Toc241962366"/>
+      <w:bookmarkStart w:id="57" w:name="_Toc241965470"/>
       <w:r>
         <w:t>Hình 5.1. Trang Tổng quan của Giáo vụ: không có quyền xem doanh thu nên biểu đồ để trống</w:t>
       </w:r>
@@ -22096,7 +22149,7 @@
       <w:pPr>
         <w:pStyle w:val="Heading2"/>
       </w:pPr>
-      <w:bookmarkStart w:id="58" w:name="_Toc241962341"/>
+      <w:bookmarkStart w:id="58" w:name="_Toc241965445"/>
       <w:r>
         <w:t>5.2. Học viên</w:t>
       </w:r>
@@ -22130,7 +22183,7 @@
         </w:rPr>
         <w:lastRenderedPageBreak/>
         <w:drawing>
-          <wp:inline distT="0" distB="0" distL="0" distR="0" wp14:anchorId="2591EA69" wp14:editId="69DA7D4F">
+          <wp:inline distT="0" distB="0" distL="0" distR="0" wp14:anchorId="6D02D4C3" wp14:editId="20A92D76">
             <wp:extent cx="5580000" cy="3332500"/>
             <wp:effectExtent l="0" t="0" r="0" b="0"/>
             <wp:docPr id="522444767" name="Picture 522444767"/>
@@ -22170,7 +22223,7 @@
       <w:pPr>
         <w:pStyle w:val="FigureCaption"/>
       </w:pPr>
-      <w:bookmarkStart w:id="59" w:name="_Toc241962367"/>
+      <w:bookmarkStart w:id="59" w:name="_Toc241965471"/>
       <w:r>
         <w:t>Hình 5.2. Danh sách học viên</w:t>
       </w:r>
@@ -22180,7 +22233,7 @@
       <w:pPr>
         <w:pStyle w:val="Heading3"/>
       </w:pPr>
-      <w:bookmarkStart w:id="60" w:name="_Toc241962342"/>
+      <w:bookmarkStart w:id="60" w:name="_Toc241965446"/>
       <w:r>
         <w:t>5.2.1. Tìm kiếm</w:t>
       </w:r>
@@ -22238,7 +22291,7 @@
         <w:t>Tất cả trạng thái</w:t>
       </w:r>
       <w:r>
-        <w:t xml:space="preserve"> (Tiềm năng, Đang học, Bảo lưu, Ngừng học) để thu hẹp kết quả.</w:t>
+        <w:t xml:space="preserve"> (Tiềm năng, Đang học, Bảo lưu, Ngừng học, Hoàn thành) để thu hẹp kết quả.</w:t>
       </w:r>
     </w:p>
     <w:p>
@@ -22277,7 +22330,7 @@
       <w:pPr>
         <w:pStyle w:val="Heading3"/>
       </w:pPr>
-      <w:bookmarkStart w:id="61" w:name="_Toc241962343"/>
+      <w:bookmarkStart w:id="61" w:name="_Toc241965447"/>
       <w:r>
         <w:t>5.2.2. Thêm học viên</w:t>
       </w:r>
@@ -22482,7 +22535,7 @@
       <w:pPr>
         <w:pStyle w:val="Heading3"/>
       </w:pPr>
-      <w:bookmarkStart w:id="62" w:name="_Toc241962344"/>
+      <w:bookmarkStart w:id="62" w:name="_Toc241965448"/>
       <w:r>
         <w:t>5.2.3. Sửa thông tin</w:t>
       </w:r>
@@ -22558,7 +22611,25 @@
         <w:t>Hủy</w:t>
       </w:r>
       <w:r>
-        <w:t xml:space="preserve"> để bỏ qua.</w:t>
+        <w:t xml:space="preserve"> để bỏ qua. Trạng thái </w:t>
+      </w:r>
+      <w:r>
+        <w:rPr>
+          <w:b/>
+        </w:rPr>
+        <w:t>Hoàn thành</w:t>
+      </w:r>
+      <w:r>
+        <w:t xml:space="preserve"> do hệ thống tự đặt khi học viên học xong lớp cuối cùng (không còn lớp nào đang học); khi ghi danh lớp mới, học viên tự chuyển lại </w:t>
+      </w:r>
+      <w:r>
+        <w:rPr>
+          <w:b/>
+        </w:rPr>
+        <w:t>Đang học</w:t>
+      </w:r>
+      <w:r>
+        <w:t>. Các ô chữ không cho gõ quá độ dài tối đa của CSDL.</w:t>
       </w:r>
     </w:p>
     <w:p>
@@ -22573,7 +22644,7 @@
         </w:rPr>
         <w:lastRenderedPageBreak/>
         <w:drawing>
-          <wp:inline distT="0" distB="0" distL="0" distR="0" wp14:anchorId="7E061E41" wp14:editId="4BC3ACA8">
+          <wp:inline distT="0" distB="0" distL="0" distR="0" wp14:anchorId="1541BBA5" wp14:editId="15C87020">
             <wp:extent cx="3780000" cy="4785968"/>
             <wp:effectExtent l="0" t="0" r="0" b="0"/>
             <wp:docPr id="522444768" name="Picture 522444768"/>
@@ -22613,7 +22684,7 @@
       <w:pPr>
         <w:pStyle w:val="FigureCaption"/>
       </w:pPr>
-      <w:bookmarkStart w:id="63" w:name="_Toc241962368"/>
+      <w:bookmarkStart w:id="63" w:name="_Toc241965472"/>
       <w:r>
         <w:t>Hình 5.3. Hộp thoại sửa thông tin học viên</w:t>
       </w:r>
@@ -22633,7 +22704,7 @@
       <w:pPr>
         <w:pStyle w:val="TableCaption"/>
       </w:pPr>
-      <w:bookmarkStart w:id="64" w:name="_Toc241962387"/>
+      <w:bookmarkStart w:id="64" w:name="_Toc241965491"/>
       <w:r>
         <w:t>Bảng 5.2. Quy tắc kiểm tra thông tin học viên</w:t>
       </w:r>
@@ -23064,7 +23135,7 @@
               <w:rPr>
                 <w:sz w:val="20"/>
               </w:rPr>
-              <w:t>Email đúng định dạng</w:t>
+              <w:t>Email đúng định dạng, không dấu, tối đa 100 ký tự</w:t>
             </w:r>
           </w:p>
         </w:tc>
@@ -23127,7 +23198,7 @@
               <w:rPr>
                 <w:sz w:val="20"/>
               </w:rPr>
-              <w:t>Số điện thoại, email không trùng với học viên khác</w:t>
+              <w:t>Địa chỉ tối đa 200 ký tự, nghề nghiệp tối đa 50 ký tự, họ tên phụ huynh tối đa 100 ký tự, ghi chú tối đa 500 ký tự</w:t>
             </w:r>
           </w:p>
         </w:tc>
@@ -23155,7 +23226,7 @@
               <w:rPr>
                 <w:sz w:val="20"/>
               </w:rPr>
-              <w:t>Số điện thoại đã được dùng cho học viên khác. / Email đã được dùng cho học viên khác.</w:t>
+              <w:t>Địa chỉ tối đa 200 ký tự. / Nghề nghiệp tối đa 50 ký tự. / Họ tên phụ huynh tối đa 100 ký tự. / Ghi chú tối đa 500 ký tự.</w:t>
             </w:r>
           </w:p>
         </w:tc>
@@ -23190,6 +23261,70 @@
               <w:rPr>
                 <w:sz w:val="20"/>
               </w:rPr>
+              <w:t>Số điện thoại, email không trùng với học viên khác</w:t>
+            </w:r>
+          </w:p>
+        </w:tc>
+        <w:tc>
+          <w:tcPr>
+            <w:tcW w:w="5103" w:type="dxa"/>
+            <w:tcBorders>
+              <w:top w:val="single" w:sz="4" w:space="0" w:color="BFBFBF"/>
+              <w:left w:val="single" w:sz="4" w:space="0" w:color="BFBFBF"/>
+              <w:bottom w:val="single" w:sz="4" w:space="0" w:color="BFBFBF"/>
+              <w:right w:val="single" w:sz="4" w:space="0" w:color="BFBFBF"/>
+            </w:tcBorders>
+            <w:shd w:val="clear" w:color="auto" w:fill="F5F8FC"/>
+            <w:tcMar>
+              <w:top w:w="40" w:type="dxa"/>
+              <w:left w:w="100" w:type="dxa"/>
+              <w:bottom w:w="40" w:type="dxa"/>
+              <w:right w:w="100" w:type="dxa"/>
+            </w:tcMar>
+          </w:tcPr>
+          <w:p>
+            <w:pPr>
+              <w:spacing w:line="252" w:lineRule="auto"/>
+            </w:pPr>
+            <w:r>
+              <w:rPr>
+                <w:sz w:val="20"/>
+              </w:rPr>
+              <w:t>Số điện thoại đã được dùng cho học viên khác. / Email đã được dùng cho học viên khác.</w:t>
+            </w:r>
+          </w:p>
+        </w:tc>
+      </w:tr>
+      <w:tr>
+        <w:trPr>
+          <w:cantSplit/>
+          <w:jc w:val="center"/>
+        </w:trPr>
+        <w:tc>
+          <w:tcPr>
+            <w:tcW w:w="3969" w:type="dxa"/>
+            <w:tcBorders>
+              <w:top w:val="single" w:sz="4" w:space="0" w:color="BFBFBF"/>
+              <w:left w:val="single" w:sz="4" w:space="0" w:color="BFBFBF"/>
+              <w:bottom w:val="single" w:sz="4" w:space="0" w:color="BFBFBF"/>
+              <w:right w:val="single" w:sz="4" w:space="0" w:color="BFBFBF"/>
+            </w:tcBorders>
+            <w:tcMar>
+              <w:top w:w="40" w:type="dxa"/>
+              <w:left w:w="100" w:type="dxa"/>
+              <w:bottom w:w="40" w:type="dxa"/>
+              <w:right w:w="100" w:type="dxa"/>
+            </w:tcMar>
+          </w:tcPr>
+          <w:p>
+            <w:pPr>
+              <w:spacing w:line="252" w:lineRule="auto"/>
+            </w:pPr>
+            <w:r>
+              <w:rPr>
+                <w:sz w:val="20"/>
+              </w:rPr>
+              <w:lastRenderedPageBreak/>
               <w:t>Phải chọn chi nhánh</w:t>
             </w:r>
           </w:p>
@@ -23203,7 +23338,6 @@
               <w:bottom w:val="single" w:sz="4" w:space="0" w:color="BFBFBF"/>
               <w:right w:val="single" w:sz="4" w:space="0" w:color="BFBFBF"/>
             </w:tcBorders>
-            <w:shd w:val="clear" w:color="auto" w:fill="F5F8FC"/>
             <w:tcMar>
               <w:top w:w="40" w:type="dxa"/>
               <w:left w:w="100" w:type="dxa"/>
@@ -23234,9 +23368,8 @@
       <w:pPr>
         <w:pStyle w:val="Heading3"/>
       </w:pPr>
-      <w:bookmarkStart w:id="65" w:name="_Toc241962345"/>
-      <w:r>
-        <w:lastRenderedPageBreak/>
+      <w:bookmarkStart w:id="65" w:name="_Toc241965449"/>
+      <w:r>
         <w:t>5.2.4. Xóa học viên</w:t>
       </w:r>
       <w:bookmarkEnd w:id="65"/>
@@ -23356,7 +23489,7 @@
       <w:pPr>
         <w:pStyle w:val="Heading2"/>
       </w:pPr>
-      <w:bookmarkStart w:id="66" w:name="_Toc241962346"/>
+      <w:bookmarkStart w:id="66" w:name="_Toc241965450"/>
       <w:r>
         <w:t>5.3. Lớp học</w:t>
       </w:r>
@@ -23407,7 +23540,7 @@
           <w:noProof/>
         </w:rPr>
         <w:drawing>
-          <wp:inline distT="0" distB="0" distL="0" distR="0" wp14:anchorId="2CC38B6A" wp14:editId="64C827F0">
+          <wp:inline distT="0" distB="0" distL="0" distR="0" wp14:anchorId="45824488" wp14:editId="318BE522">
             <wp:extent cx="5580000" cy="3332500"/>
             <wp:effectExtent l="0" t="0" r="0" b="0"/>
             <wp:docPr id="522444769" name="Picture 522444769"/>
@@ -23447,7 +23580,7 @@
       <w:pPr>
         <w:pStyle w:val="FigureCaption"/>
       </w:pPr>
-      <w:bookmarkStart w:id="67" w:name="_Toc241962369"/>
+      <w:bookmarkStart w:id="67" w:name="_Toc241965473"/>
       <w:r>
         <w:t>Hình 5.4. Danh sách lớp học</w:t>
       </w:r>
@@ -23457,7 +23590,7 @@
       <w:pPr>
         <w:pStyle w:val="Heading2"/>
       </w:pPr>
-      <w:bookmarkStart w:id="68" w:name="_Toc241962347"/>
+      <w:bookmarkStart w:id="68" w:name="_Toc241965451"/>
       <w:r>
         <w:t>5.4. Lịch học tuần này</w:t>
       </w:r>
@@ -23509,7 +23642,7 @@
         </w:rPr>
         <w:lastRenderedPageBreak/>
         <w:drawing>
-          <wp:inline distT="0" distB="0" distL="0" distR="0" wp14:anchorId="6DB1187F" wp14:editId="3E05B912">
+          <wp:inline distT="0" distB="0" distL="0" distR="0" wp14:anchorId="5EE20704" wp14:editId="2034111A">
             <wp:extent cx="5580000" cy="3332500"/>
             <wp:effectExtent l="0" t="0" r="0" b="0"/>
             <wp:docPr id="522444770" name="Picture 522444770"/>
@@ -23549,7 +23682,7 @@
       <w:pPr>
         <w:pStyle w:val="FigureCaption"/>
       </w:pPr>
-      <w:bookmarkStart w:id="69" w:name="_Toc241962370"/>
+      <w:bookmarkStart w:id="69" w:name="_Toc241965474"/>
       <w:r>
         <w:t>Hình 5.5. Lịch học tuần này</w:t>
       </w:r>
@@ -23559,7 +23692,7 @@
       <w:pPr>
         <w:pStyle w:val="Heading2"/>
       </w:pPr>
-      <w:bookmarkStart w:id="70" w:name="_Toc241962348"/>
+      <w:bookmarkStart w:id="70" w:name="_Toc241965452"/>
       <w:r>
         <w:t>5.5. Kết quả học tập</w:t>
       </w:r>
@@ -23619,7 +23752,7 @@
           <w:noProof/>
         </w:rPr>
         <w:drawing>
-          <wp:inline distT="0" distB="0" distL="0" distR="0" wp14:anchorId="7C99C7D2" wp14:editId="3293ACCA">
+          <wp:inline distT="0" distB="0" distL="0" distR="0" wp14:anchorId="0880D476" wp14:editId="51636751">
             <wp:extent cx="5580000" cy="3332500"/>
             <wp:effectExtent l="0" t="0" r="0" b="0"/>
             <wp:docPr id="522444771" name="Picture 522444771"/>
@@ -23659,7 +23792,7 @@
       <w:pPr>
         <w:pStyle w:val="FigureCaption"/>
       </w:pPr>
-      <w:bookmarkStart w:id="71" w:name="_Toc241962371"/>
+      <w:bookmarkStart w:id="71" w:name="_Toc241965475"/>
       <w:r>
         <w:t>Hình 5.6. Kết quả học tập</w:t>
       </w:r>
@@ -23669,7 +23802,7 @@
       <w:pPr>
         <w:pStyle w:val="Heading2"/>
       </w:pPr>
-      <w:bookmarkStart w:id="72" w:name="_Toc241962349"/>
+      <w:bookmarkStart w:id="72" w:name="_Toc241965453"/>
       <w:r>
         <w:lastRenderedPageBreak/>
         <w:t>5.6. Công nợ học phí</w:t>
@@ -23723,7 +23856,7 @@
       <w:pPr>
         <w:pStyle w:val="Heading2"/>
       </w:pPr>
-      <w:bookmarkStart w:id="73" w:name="_Toc241962350"/>
+      <w:bookmarkStart w:id="73" w:name="_Toc241965454"/>
       <w:r>
         <w:t>5.7. Doanh thu</w:t>
       </w:r>
@@ -23792,7 +23925,7 @@
           <w:noProof/>
         </w:rPr>
         <w:drawing>
-          <wp:inline distT="0" distB="0" distL="0" distR="0" wp14:anchorId="665891A1" wp14:editId="6ED7BBEE">
+          <wp:inline distT="0" distB="0" distL="0" distR="0" wp14:anchorId="6D7F6DF5" wp14:editId="4CAA408C">
             <wp:extent cx="5580000" cy="3332500"/>
             <wp:effectExtent l="0" t="0" r="0" b="0"/>
             <wp:docPr id="522444772" name="Picture 522444772"/>
@@ -23832,7 +23965,7 @@
       <w:pPr>
         <w:pStyle w:val="FigureCaption"/>
       </w:pPr>
-      <w:bookmarkStart w:id="74" w:name="_Toc241962372"/>
+      <w:bookmarkStart w:id="74" w:name="_Toc241965476"/>
       <w:r>
         <w:t>Hình 5.7. Doanh thu theo tháng và chi nhánh (Kế toán)</w:t>
       </w:r>
@@ -23842,7 +23975,7 @@
       <w:pPr>
         <w:pStyle w:val="Heading2"/>
       </w:pPr>
-      <w:bookmarkStart w:id="75" w:name="_Toc241962351"/>
+      <w:bookmarkStart w:id="75" w:name="_Toc241965455"/>
       <w:r>
         <w:t>5.8. Lương giáo viên</w:t>
       </w:r>
@@ -23894,7 +24027,7 @@
         </w:rPr>
         <w:lastRenderedPageBreak/>
         <w:drawing>
-          <wp:inline distT="0" distB="0" distL="0" distR="0" wp14:anchorId="65518F9F" wp14:editId="04FFB1D7">
+          <wp:inline distT="0" distB="0" distL="0" distR="0" wp14:anchorId="3A7B0DF5" wp14:editId="1DD33457">
             <wp:extent cx="5580000" cy="3332500"/>
             <wp:effectExtent l="0" t="0" r="0" b="0"/>
             <wp:docPr id="522444773" name="Picture 522444773"/>
@@ -23934,7 +24067,7 @@
       <w:pPr>
         <w:pStyle w:val="FigureCaption"/>
       </w:pPr>
-      <w:bookmarkStart w:id="76" w:name="_Toc241962373"/>
+      <w:bookmarkStart w:id="76" w:name="_Toc241965477"/>
       <w:r>
         <w:t>Hình 5.8. Bảng lương giáo viên (Kế toán)</w:t>
       </w:r>
@@ -23944,7 +24077,7 @@
       <w:pPr>
         <w:pStyle w:val="Heading2"/>
       </w:pPr>
-      <w:bookmarkStart w:id="77" w:name="_Toc241962352"/>
+      <w:bookmarkStart w:id="77" w:name="_Toc241965456"/>
       <w:r>
         <w:t>5.9. Tài khoản</w:t>
       </w:r>
@@ -24041,7 +24174,7 @@
         </w:rPr>
         <w:lastRenderedPageBreak/>
         <w:drawing>
-          <wp:inline distT="0" distB="0" distL="0" distR="0" wp14:anchorId="605627DF" wp14:editId="64447AA3">
+          <wp:inline distT="0" distB="0" distL="0" distR="0" wp14:anchorId="4A8BBA42" wp14:editId="6D7548D8">
             <wp:extent cx="5580000" cy="3332500"/>
             <wp:effectExtent l="0" t="0" r="0" b="0"/>
             <wp:docPr id="522444774" name="Picture 522444774"/>
@@ -24081,7 +24214,7 @@
       <w:pPr>
         <w:pStyle w:val="FigureCaption"/>
       </w:pPr>
-      <w:bookmarkStart w:id="78" w:name="_Toc241962374"/>
+      <w:bookmarkStart w:id="78" w:name="_Toc241965478"/>
       <w:r>
         <w:t>Hình 5.9. Danh sách tài khoản (Quản lý)</w:t>
       </w:r>
@@ -24982,7 +25115,7 @@
       <w:pPr>
         <w:pStyle w:val="Heading2"/>
       </w:pPr>
-      <w:bookmarkStart w:id="79" w:name="_Toc241962353"/>
+      <w:bookmarkStart w:id="79" w:name="_Toc241965457"/>
       <w:r>
         <w:t>5.10. Chức năng dành cho giáo viên</w:t>
       </w:r>
@@ -25076,7 +25209,7 @@
           <w:noProof/>
         </w:rPr>
         <w:drawing>
-          <wp:inline distT="0" distB="0" distL="0" distR="0" wp14:anchorId="3221BD3F" wp14:editId="5365E14B">
+          <wp:inline distT="0" distB="0" distL="0" distR="0" wp14:anchorId="477882A0" wp14:editId="75380D36">
             <wp:extent cx="5580000" cy="3332500"/>
             <wp:effectExtent l="0" t="0" r="0" b="0"/>
             <wp:docPr id="522444775" name="Picture 522444775"/>
@@ -25116,7 +25249,7 @@
       <w:pPr>
         <w:pStyle w:val="FigureCaption"/>
       </w:pPr>
-      <w:bookmarkStart w:id="80" w:name="_Toc241962375"/>
+      <w:bookmarkStart w:id="80" w:name="_Toc241965479"/>
       <w:r>
         <w:t>Hình 5.10. Lịch dạy của giáo viên</w:t>
       </w:r>
@@ -25126,7 +25259,7 @@
       <w:pPr>
         <w:pStyle w:val="Heading2"/>
       </w:pPr>
-      <w:bookmarkStart w:id="81" w:name="_Toc241962354"/>
+      <w:bookmarkStart w:id="81" w:name="_Toc241965458"/>
       <w:r>
         <w:t>5.11. Nghiệp vụ thực hiện trực tiếp trong CSDL</w:t>
       </w:r>
@@ -25155,7 +25288,7 @@
       <w:pPr>
         <w:pStyle w:val="TableCaption"/>
       </w:pPr>
-      <w:bookmarkStart w:id="82" w:name="_Toc241962388"/>
+      <w:bookmarkStart w:id="82" w:name="_Toc241965492"/>
       <w:r>
         <w:t>Bảng 5.3. Nghiệp vụ thực hiện bằng thủ tục trong CSDL</w:t>
       </w:r>
@@ -25775,6 +25908,191 @@
           </w:p>
         </w:tc>
       </w:tr>
+      <w:tr>
+        <w:trPr>
+          <w:cantSplit/>
+          <w:jc w:val="center"/>
+        </w:trPr>
+        <w:tc>
+          <w:tcPr>
+            <w:tcW w:w="2835" w:type="dxa"/>
+            <w:tcBorders>
+              <w:top w:val="single" w:sz="4" w:space="0" w:color="BFBFBF"/>
+              <w:left w:val="single" w:sz="4" w:space="0" w:color="BFBFBF"/>
+              <w:bottom w:val="single" w:sz="4" w:space="0" w:color="BFBFBF"/>
+              <w:right w:val="single" w:sz="4" w:space="0" w:color="BFBFBF"/>
+            </w:tcBorders>
+            <w:shd w:val="clear" w:color="auto" w:fill="F5F8FC"/>
+            <w:tcMar>
+              <w:top w:w="40" w:type="dxa"/>
+              <w:left w:w="100" w:type="dxa"/>
+              <w:bottom w:w="40" w:type="dxa"/>
+              <w:right w:w="100" w:type="dxa"/>
+            </w:tcMar>
+          </w:tcPr>
+          <w:p>
+            <w:pPr>
+              <w:spacing w:line="252" w:lineRule="auto"/>
+            </w:pPr>
+            <w:r>
+              <w:rPr>
+                <w:sz w:val="20"/>
+              </w:rPr>
+              <w:t>Bắt đầu / hủy lớp</w:t>
+            </w:r>
+          </w:p>
+        </w:tc>
+        <w:tc>
+          <w:tcPr>
+            <w:tcW w:w="3969" w:type="dxa"/>
+            <w:tcBorders>
+              <w:top w:val="single" w:sz="4" w:space="0" w:color="BFBFBF"/>
+              <w:left w:val="single" w:sz="4" w:space="0" w:color="BFBFBF"/>
+              <w:bottom w:val="single" w:sz="4" w:space="0" w:color="BFBFBF"/>
+              <w:right w:val="single" w:sz="4" w:space="0" w:color="BFBFBF"/>
+            </w:tcBorders>
+            <w:shd w:val="clear" w:color="auto" w:fill="F5F8FC"/>
+            <w:tcMar>
+              <w:top w:w="40" w:type="dxa"/>
+              <w:left w:w="100" w:type="dxa"/>
+              <w:bottom w:w="40" w:type="dxa"/>
+              <w:right w:w="100" w:type="dxa"/>
+            </w:tcMar>
+          </w:tcPr>
+          <w:p>
+            <w:pPr>
+              <w:spacing w:line="252" w:lineRule="auto"/>
+            </w:pPr>
+            <w:r>
+              <w:rPr>
+                <w:color w:val="C7254E"/>
+                <w:sz w:val="20"/>
+              </w:rPr>
+              <w:t>usp_Class_UpdateStatus</w:t>
+            </w:r>
+          </w:p>
+        </w:tc>
+        <w:tc>
+          <w:tcPr>
+            <w:tcW w:w="2268" w:type="dxa"/>
+            <w:tcBorders>
+              <w:top w:val="single" w:sz="4" w:space="0" w:color="BFBFBF"/>
+              <w:left w:val="single" w:sz="4" w:space="0" w:color="BFBFBF"/>
+              <w:bottom w:val="single" w:sz="4" w:space="0" w:color="BFBFBF"/>
+              <w:right w:val="single" w:sz="4" w:space="0" w:color="BFBFBF"/>
+            </w:tcBorders>
+            <w:shd w:val="clear" w:color="auto" w:fill="F5F8FC"/>
+            <w:tcMar>
+              <w:top w:w="40" w:type="dxa"/>
+              <w:left w:w="100" w:type="dxa"/>
+              <w:bottom w:w="40" w:type="dxa"/>
+              <w:right w:w="100" w:type="dxa"/>
+            </w:tcMar>
+          </w:tcPr>
+          <w:p>
+            <w:pPr>
+              <w:spacing w:line="252" w:lineRule="auto"/>
+            </w:pPr>
+            <w:r>
+              <w:rPr>
+                <w:sz w:val="20"/>
+              </w:rPr>
+              <w:t>Quản lý, Giáo vụ</w:t>
+            </w:r>
+          </w:p>
+        </w:tc>
+      </w:tr>
+      <w:tr>
+        <w:trPr>
+          <w:cantSplit/>
+          <w:jc w:val="center"/>
+        </w:trPr>
+        <w:tc>
+          <w:tcPr>
+            <w:tcW w:w="2835" w:type="dxa"/>
+            <w:tcBorders>
+              <w:top w:val="single" w:sz="4" w:space="0" w:color="BFBFBF"/>
+              <w:left w:val="single" w:sz="4" w:space="0" w:color="BFBFBF"/>
+              <w:bottom w:val="single" w:sz="4" w:space="0" w:color="BFBFBF"/>
+              <w:right w:val="single" w:sz="4" w:space="0" w:color="BFBFBF"/>
+            </w:tcBorders>
+            <w:tcMar>
+              <w:top w:w="40" w:type="dxa"/>
+              <w:left w:w="100" w:type="dxa"/>
+              <w:bottom w:w="40" w:type="dxa"/>
+              <w:right w:w="100" w:type="dxa"/>
+            </w:tcMar>
+          </w:tcPr>
+          <w:p>
+            <w:pPr>
+              <w:spacing w:line="252" w:lineRule="auto"/>
+            </w:pPr>
+            <w:r>
+              <w:rPr>
+                <w:sz w:val="20"/>
+              </w:rPr>
+              <w:t>Xét kết quả cuối khóa, cấp chứng nhận</w:t>
+            </w:r>
+          </w:p>
+        </w:tc>
+        <w:tc>
+          <w:tcPr>
+            <w:tcW w:w="3969" w:type="dxa"/>
+            <w:tcBorders>
+              <w:top w:val="single" w:sz="4" w:space="0" w:color="BFBFBF"/>
+              <w:left w:val="single" w:sz="4" w:space="0" w:color="BFBFBF"/>
+              <w:bottom w:val="single" w:sz="4" w:space="0" w:color="BFBFBF"/>
+              <w:right w:val="single" w:sz="4" w:space="0" w:color="BFBFBF"/>
+            </w:tcBorders>
+            <w:tcMar>
+              <w:top w:w="40" w:type="dxa"/>
+              <w:left w:w="100" w:type="dxa"/>
+              <w:bottom w:w="40" w:type="dxa"/>
+              <w:right w:w="100" w:type="dxa"/>
+            </w:tcMar>
+          </w:tcPr>
+          <w:p>
+            <w:pPr>
+              <w:spacing w:line="252" w:lineRule="auto"/>
+            </w:pPr>
+            <w:r>
+              <w:rPr>
+                <w:color w:val="C7254E"/>
+                <w:sz w:val="20"/>
+              </w:rPr>
+              <w:t>usp_Class_EvaluateResults</w:t>
+            </w:r>
+          </w:p>
+        </w:tc>
+        <w:tc>
+          <w:tcPr>
+            <w:tcW w:w="2268" w:type="dxa"/>
+            <w:tcBorders>
+              <w:top w:val="single" w:sz="4" w:space="0" w:color="BFBFBF"/>
+              <w:left w:val="single" w:sz="4" w:space="0" w:color="BFBFBF"/>
+              <w:bottom w:val="single" w:sz="4" w:space="0" w:color="BFBFBF"/>
+              <w:right w:val="single" w:sz="4" w:space="0" w:color="BFBFBF"/>
+            </w:tcBorders>
+            <w:tcMar>
+              <w:top w:w="40" w:type="dxa"/>
+              <w:left w:w="100" w:type="dxa"/>
+              <w:bottom w:w="40" w:type="dxa"/>
+              <w:right w:w="100" w:type="dxa"/>
+            </w:tcMar>
+          </w:tcPr>
+          <w:p>
+            <w:pPr>
+              <w:spacing w:line="252" w:lineRule="auto"/>
+            </w:pPr>
+            <w:r>
+              <w:rPr>
+                <w:sz w:val="20"/>
+              </w:rPr>
+              <w:t>Quản lý, Giáo vụ</w:t>
+            </w:r>
+          </w:p>
+        </w:tc>
+      </w:tr>
     </w:tbl>
     <w:p>
       <w:pPr>
@@ -25788,6 +26106,7 @@
         <w:jc w:val="both"/>
       </w:pPr>
       <w:r>
+        <w:lastRenderedPageBreak/>
         <w:t xml:space="preserve">Mỗi thủ tục tự kiểm tra quy tắc nghiệp vụ trước khi ghi. Khi vi phạm, SSMS hiện thông báo lỗi (tiếng Anh, ví dụ </w:t>
       </w:r>
       <w:r>
@@ -25804,10 +26123,9 @@
       <w:pPr>
         <w:pStyle w:val="TableCaption"/>
       </w:pPr>
-      <w:bookmarkStart w:id="83" w:name="_Toc241962389"/>
-      <w:r>
-        <w:lastRenderedPageBreak/>
-        <w:t>Bảng 5.4. Quy tắc CSDL kiểm tra khi ghi danh, chuyển lớp, điểm danh và nhập điểm</w:t>
+      <w:bookmarkStart w:id="83" w:name="_Toc241965493"/>
+      <w:r>
+        <w:t>Bảng 5.4. Quy tắc CSDL kiểm tra khi ghi danh, chuyển lớp, mở/hủy lớp, điểm danh và nhập điểm</w:t>
       </w:r>
       <w:bookmarkEnd w:id="83"/>
     </w:p>
@@ -26098,13 +26416,13 @@
                 <w:b/>
                 <w:sz w:val="20"/>
               </w:rPr>
-              <w:t>cùng khóa học</w:t>
+              <w:t>cùng khóa học và cùng chi nhánh</w:t>
             </w:r>
             <w:r>
               <w:rPr>
                 <w:sz w:val="20"/>
               </w:rPr>
-              <w:t xml:space="preserve"> đang tuyển sinh hoặc đang học, còn chỗ và không trùng giờ. Học phí tính lại theo lớp mới (áp dụng lại khuyến mãi của lượt ghi danh); nếu học viên đã đóng nhiều hơn học phí mới thì phải hủy bớt phiếu thu trước. Phiếu thu và điểm được giữ, điểm danh ở lớp cũ bị xóa.</w:t>
+              <w:t xml:space="preserve"> đang tuyển sinh hoặc đang học, còn chỗ và không trùng giờ. Học phí tính lại theo lớp mới (áp dụng lại khuyến mãi của lượt ghi danh); nếu học viên đã đóng nhiều hơn học phí mới thì phải hủy bớt phiếu thu trước. Phiếu thu và điểm được giữ, điểm danh ở lớp cũ bị xóa; tỷ lệ chuyên cần ở lớp mới tính từ ngày chuyển.</w:t>
             </w:r>
           </w:p>
         </w:tc>
@@ -26138,7 +26456,7 @@
               <w:rPr>
                 <w:sz w:val="20"/>
               </w:rPr>
-              <w:t>Điểm danh, nhập điểm</w:t>
+              <w:t>Bắt đầu / hủy lớp</w:t>
             </w:r>
           </w:p>
         </w:tc>
@@ -26166,20 +26484,175 @@
               <w:rPr>
                 <w:sz w:val="20"/>
               </w:rPr>
-              <w:t xml:space="preserve">Giáo viên chỉ điểm danh các buổi mình dạy và chỉ nhập điểm lớp mình dạy. Lớp </w:t>
+              <w:t xml:space="preserve">Lớp đi theo thứ tự </w:t>
             </w:r>
             <w:r>
               <w:rPr>
                 <w:b/>
                 <w:sz w:val="20"/>
               </w:rPr>
+              <w:t>Đang tuyển sinh</w:t>
+            </w:r>
+            <w:r>
+              <w:rPr>
+                <w:sz w:val="20"/>
+              </w:rPr>
+              <w:t xml:space="preserve"> → </w:t>
+            </w:r>
+            <w:r>
+              <w:rPr>
+                <w:b/>
+                <w:sz w:val="20"/>
+              </w:rPr>
+              <w:t>Đang học</w:t>
+            </w:r>
+            <w:r>
+              <w:rPr>
+                <w:sz w:val="20"/>
+              </w:rPr>
+              <w:t xml:space="preserve"> → </w:t>
+            </w:r>
+            <w:r>
+              <w:rPr>
+                <w:b/>
+                <w:sz w:val="20"/>
+              </w:rPr>
               <w:t>Đã kết thúc</w:t>
             </w:r>
             <w:r>
               <w:rPr>
                 <w:sz w:val="20"/>
               </w:rPr>
-              <w:t xml:space="preserve"> đã được xét kết quả nên không sửa điểm danh và điểm được nữa.</w:t>
+              <w:t xml:space="preserve"> (khi xét kết quả), hoặc </w:t>
+            </w:r>
+            <w:r>
+              <w:rPr>
+                <w:b/>
+                <w:sz w:val="20"/>
+              </w:rPr>
+              <w:t>Đã hủy</w:t>
+            </w:r>
+            <w:r>
+              <w:rPr>
+                <w:sz w:val="20"/>
+              </w:rPr>
+              <w:t xml:space="preserve">. Lớp đã kết thúc hoặc đã hủy không mở lại được: hãy mở lớp mới. Không hủy được lớp đã có học viên đóng tiền; khi hủy, các lượt ghi danh còn lại chuyển sang </w:t>
+            </w:r>
+            <w:r>
+              <w:rPr>
+                <w:b/>
+                <w:sz w:val="20"/>
+              </w:rPr>
+              <w:t>Đã nghỉ</w:t>
+            </w:r>
+            <w:r>
+              <w:rPr>
+                <w:sz w:val="20"/>
+              </w:rPr>
+              <w:t>.</w:t>
+            </w:r>
+          </w:p>
+        </w:tc>
+      </w:tr>
+      <w:tr>
+        <w:trPr>
+          <w:cantSplit/>
+          <w:jc w:val="center"/>
+        </w:trPr>
+        <w:tc>
+          <w:tcPr>
+            <w:tcW w:w="2041" w:type="dxa"/>
+            <w:tcBorders>
+              <w:top w:val="single" w:sz="4" w:space="0" w:color="BFBFBF"/>
+              <w:left w:val="single" w:sz="4" w:space="0" w:color="BFBFBF"/>
+              <w:bottom w:val="single" w:sz="4" w:space="0" w:color="BFBFBF"/>
+              <w:right w:val="single" w:sz="4" w:space="0" w:color="BFBFBF"/>
+            </w:tcBorders>
+            <w:shd w:val="clear" w:color="auto" w:fill="F5F8FC"/>
+            <w:tcMar>
+              <w:top w:w="40" w:type="dxa"/>
+              <w:left w:w="100" w:type="dxa"/>
+              <w:bottom w:w="40" w:type="dxa"/>
+              <w:right w:w="100" w:type="dxa"/>
+            </w:tcMar>
+          </w:tcPr>
+          <w:p>
+            <w:pPr>
+              <w:spacing w:line="252" w:lineRule="auto"/>
+            </w:pPr>
+            <w:r>
+              <w:rPr>
+                <w:sz w:val="20"/>
+              </w:rPr>
+              <w:t>Điểm danh, nhập điểm</w:t>
+            </w:r>
+          </w:p>
+        </w:tc>
+        <w:tc>
+          <w:tcPr>
+            <w:tcW w:w="7030" w:type="dxa"/>
+            <w:tcBorders>
+              <w:top w:val="single" w:sz="4" w:space="0" w:color="BFBFBF"/>
+              <w:left w:val="single" w:sz="4" w:space="0" w:color="BFBFBF"/>
+              <w:bottom w:val="single" w:sz="4" w:space="0" w:color="BFBFBF"/>
+              <w:right w:val="single" w:sz="4" w:space="0" w:color="BFBFBF"/>
+            </w:tcBorders>
+            <w:shd w:val="clear" w:color="auto" w:fill="F5F8FC"/>
+            <w:tcMar>
+              <w:top w:w="40" w:type="dxa"/>
+              <w:left w:w="100" w:type="dxa"/>
+              <w:bottom w:w="40" w:type="dxa"/>
+              <w:right w:w="100" w:type="dxa"/>
+            </w:tcMar>
+          </w:tcPr>
+          <w:p>
+            <w:pPr>
+              <w:spacing w:line="252" w:lineRule="auto"/>
+            </w:pPr>
+            <w:r>
+              <w:rPr>
+                <w:sz w:val="20"/>
+              </w:rPr>
+              <w:t xml:space="preserve">Giáo viên chỉ điểm danh các buổi mình dạy và chỉ nhập điểm lớp mình dạy. Buổi học chỉ được đánh dấu </w:t>
+            </w:r>
+            <w:r>
+              <w:rPr>
+                <w:b/>
+                <w:sz w:val="20"/>
+              </w:rPr>
+              <w:t>Đã dạy</w:t>
+            </w:r>
+            <w:r>
+              <w:rPr>
+                <w:sz w:val="20"/>
+              </w:rPr>
+              <w:t xml:space="preserve"> từ ngày học trở đi và không đổi lại được. Lớp </w:t>
+            </w:r>
+            <w:r>
+              <w:rPr>
+                <w:b/>
+                <w:sz w:val="20"/>
+              </w:rPr>
+              <w:t>Đã kết thúc</w:t>
+            </w:r>
+            <w:r>
+              <w:rPr>
+                <w:sz w:val="20"/>
+              </w:rPr>
+              <w:t xml:space="preserve"> đã được xét kết quả nên không sửa buổi học, điểm danh và điểm được nữa; chỉ xét kết quả khi lớp không còn buổi </w:t>
+            </w:r>
+            <w:r>
+              <w:rPr>
+                <w:b/>
+                <w:sz w:val="20"/>
+              </w:rPr>
+              <w:t>Chưa dạy</w:t>
+            </w:r>
+            <w:r>
+              <w:rPr>
+                <w:sz w:val="20"/>
+              </w:rPr>
+              <w:t>.</w:t>
             </w:r>
           </w:p>
         </w:tc>
@@ -26214,7 +26687,7 @@
         <w:pStyle w:val="Heading1"/>
         <w:pageBreakBefore/>
       </w:pPr>
-      <w:bookmarkStart w:id="84" w:name="_Toc241962355"/>
+      <w:bookmarkStart w:id="84" w:name="_Toc241965459"/>
       <w:r>
         <w:lastRenderedPageBreak/>
         <w:t>CHƯƠNG 6. XỬ LÝ SỰ CỐ</w:t>
@@ -26225,7 +26698,7 @@
       <w:pPr>
         <w:pStyle w:val="Heading2"/>
       </w:pPr>
-      <w:bookmarkStart w:id="85" w:name="_Toc241962356"/>
+      <w:bookmarkStart w:id="85" w:name="_Toc241965460"/>
       <w:r>
         <w:t>6.1. Kiểm tra kết nối không cần giao diện</w:t>
       </w:r>
@@ -26481,7 +26954,7 @@
       <w:pPr>
         <w:pStyle w:val="Heading2"/>
       </w:pPr>
-      <w:bookmarkStart w:id="86" w:name="_Toc241962357"/>
+      <w:bookmarkStart w:id="86" w:name="_Toc241965461"/>
       <w:r>
         <w:t>6.2. Lỗi thường gặp</w:t>
       </w:r>
@@ -26491,7 +26964,7 @@
       <w:pPr>
         <w:pStyle w:val="TableCaption"/>
       </w:pPr>
-      <w:bookmarkStart w:id="87" w:name="_Toc241962390"/>
+      <w:bookmarkStart w:id="87" w:name="_Toc241965494"/>
       <w:r>
         <w:t>Bảng 6.1. Lỗi thường gặp và cách xử lý</w:t>
       </w:r>
@@ -27086,16 +27559,9 @@
             </w:pPr>
             <w:r>
               <w:rPr>
-                <w:b/>
-                <w:sz w:val="19"/>
-              </w:rPr>
-              <w:t>Không tìm thấy ODBC Driver cho SQL Server trên máy</w:t>
-            </w:r>
-            <w:r>
-              <w:rPr>
-                <w:sz w:val="19"/>
-              </w:rPr>
-              <w:t xml:space="preserve"> (Windows)</w:t>
+                <w:sz w:val="19"/>
+              </w:rPr>
+              <w:t>Không lưu được file Excel/PDF (hiện thông báo lỗi khi xuất)</w:t>
             </w:r>
           </w:p>
         </w:tc>
@@ -27123,7 +27589,7 @@
               <w:rPr>
                 <w:sz w:val="19"/>
               </w:rPr>
-              <w:t>Máy không có driver phù hợp</w:t>
+              <w:t>File cùng tên đang mở trong Excel/trình đọc PDF, hoặc thư mục không cho ghi</w:t>
             </w:r>
           </w:p>
         </w:tc>
@@ -27151,20 +27617,7 @@
               <w:rPr>
                 <w:sz w:val="19"/>
               </w:rPr>
-              <w:t xml:space="preserve">Cài </w:t>
-            </w:r>
-            <w:r>
-              <w:rPr>
-                <w:b/>
-                <w:sz w:val="19"/>
-              </w:rPr>
-              <w:t>Microsoft ODBC Driver 18 for SQL Server</w:t>
-            </w:r>
-            <w:r>
-              <w:rPr>
-                <w:sz w:val="19"/>
-              </w:rPr>
-              <w:t xml:space="preserve"> rồi mở lại ứng dụng.</w:t>
+              <w:t>Đóng file đang mở hoặc chọn thư mục khác rồi xuất lại.</w:t>
             </w:r>
           </w:p>
         </w:tc>
@@ -27200,7 +27653,13 @@
                 <w:b/>
                 <w:sz w:val="19"/>
               </w:rPr>
-              <w:t>Thiếu plugin Qt ODBC (qsqlodbc)</w:t>
+              <w:t>Không tìm thấy ODBC Driver cho SQL Server trên máy</w:t>
+            </w:r>
+            <w:r>
+              <w:rPr>
+                <w:sz w:val="19"/>
+              </w:rPr>
+              <w:t xml:space="preserve"> (Windows)</w:t>
             </w:r>
           </w:p>
         </w:tc>
@@ -27229,7 +27688,7 @@
               <w:rPr>
                 <w:sz w:val="19"/>
               </w:rPr>
-              <w:t>Bộ cài bị hỏng hoặc thiếu file</w:t>
+              <w:t>Máy không có driver phù hợp</w:t>
             </w:r>
           </w:p>
         </w:tc>
@@ -27258,7 +27717,20 @@
               <w:rPr>
                 <w:sz w:val="19"/>
               </w:rPr>
-              <w:t>Cài lại ứng dụng (hoặc giải nén lại bản portable).</w:t>
+              <w:t xml:space="preserve">Cài </w:t>
+            </w:r>
+            <w:r>
+              <w:rPr>
+                <w:b/>
+                <w:sz w:val="19"/>
+              </w:rPr>
+              <w:t>Microsoft ODBC Driver 18 for SQL Server</w:t>
+            </w:r>
+            <w:r>
+              <w:rPr>
+                <w:sz w:val="19"/>
+              </w:rPr>
+              <w:t xml:space="preserve"> rồi mở lại ứng dụng.</w:t>
             </w:r>
           </w:p>
         </w:tc>
@@ -27290,9 +27762,10 @@
             </w:pPr>
             <w:r>
               <w:rPr>
-                <w:sz w:val="19"/>
-              </w:rPr>
-              <w:t>macOS báo không mở được QLTTTA</w:t>
+                <w:b/>
+                <w:sz w:val="19"/>
+              </w:rPr>
+              <w:t>Thiếu plugin Qt ODBC (qsqlodbc)</w:t>
             </w:r>
           </w:p>
         </w:tc>
@@ -27320,7 +27793,7 @@
               <w:rPr>
                 <w:sz w:val="19"/>
               </w:rPr>
-              <w:t>Ứng dụng không đăng ký với Apple (Gatekeeper)</w:t>
+              <w:t>Bộ cài bị hỏng hoặc thiếu file</w:t>
             </w:r>
           </w:p>
         </w:tc>
@@ -27346,29 +27819,9 @@
             </w:pPr>
             <w:r>
               <w:rPr>
-                <w:b/>
-                <w:sz w:val="19"/>
-              </w:rPr>
-              <w:t>System Settings &gt; Privacy &amp; Security &gt; Open Anyway</w:t>
-            </w:r>
-            <w:r>
-              <w:rPr>
-                <w:sz w:val="19"/>
-              </w:rPr>
-              <w:t xml:space="preserve">, hoặc lệnh </w:t>
-            </w:r>
-            <w:r>
-              <w:rPr>
-                <w:color w:val="C7254E"/>
-                <w:sz w:val="19"/>
-              </w:rPr>
-              <w:t>xattr</w:t>
-            </w:r>
-            <w:r>
-              <w:rPr>
-                <w:sz w:val="19"/>
-              </w:rPr>
-              <w:t xml:space="preserve"> ở mục 3.2.</w:t>
+                <w:sz w:val="19"/>
+              </w:rPr>
+              <w:t>Cài lại ứng dụng (hoặc giải nén lại bản portable).</w:t>
             </w:r>
           </w:p>
         </w:tc>
@@ -27403,85 +27856,85 @@
               <w:rPr>
                 <w:sz w:val="19"/>
               </w:rPr>
-              <w:t xml:space="preserve">Windows hiện </w:t>
-            </w:r>
+              <w:t>macOS báo không mở được QLTTTA</w:t>
+            </w:r>
+          </w:p>
+        </w:tc>
+        <w:tc>
+          <w:tcPr>
+            <w:tcW w:w="2381" w:type="dxa"/>
+            <w:tcBorders>
+              <w:top w:val="single" w:sz="4" w:space="0" w:color="BFBFBF"/>
+              <w:left w:val="single" w:sz="4" w:space="0" w:color="BFBFBF"/>
+              <w:bottom w:val="single" w:sz="4" w:space="0" w:color="BFBFBF"/>
+              <w:right w:val="single" w:sz="4" w:space="0" w:color="BFBFBF"/>
+            </w:tcBorders>
+            <w:shd w:val="clear" w:color="auto" w:fill="F5F8FC"/>
+            <w:tcMar>
+              <w:top w:w="40" w:type="dxa"/>
+              <w:left w:w="100" w:type="dxa"/>
+              <w:bottom w:w="40" w:type="dxa"/>
+              <w:right w:w="100" w:type="dxa"/>
+            </w:tcMar>
+          </w:tcPr>
+          <w:p>
+            <w:pPr>
+              <w:spacing w:line="252" w:lineRule="auto"/>
+            </w:pPr>
+            <w:r>
+              <w:rPr>
+                <w:sz w:val="19"/>
+              </w:rPr>
+              <w:t>Ứng dụng không đăng ký với Apple (Gatekeeper)</w:t>
+            </w:r>
+          </w:p>
+        </w:tc>
+        <w:tc>
+          <w:tcPr>
+            <w:tcW w:w="4082" w:type="dxa"/>
+            <w:tcBorders>
+              <w:top w:val="single" w:sz="4" w:space="0" w:color="BFBFBF"/>
+              <w:left w:val="single" w:sz="4" w:space="0" w:color="BFBFBF"/>
+              <w:bottom w:val="single" w:sz="4" w:space="0" w:color="BFBFBF"/>
+              <w:right w:val="single" w:sz="4" w:space="0" w:color="BFBFBF"/>
+            </w:tcBorders>
+            <w:shd w:val="clear" w:color="auto" w:fill="F5F8FC"/>
+            <w:tcMar>
+              <w:top w:w="40" w:type="dxa"/>
+              <w:left w:w="100" w:type="dxa"/>
+              <w:bottom w:w="40" w:type="dxa"/>
+              <w:right w:w="100" w:type="dxa"/>
+            </w:tcMar>
+          </w:tcPr>
+          <w:p>
+            <w:pPr>
+              <w:spacing w:line="252" w:lineRule="auto"/>
+            </w:pPr>
             <w:r>
               <w:rPr>
                 <w:b/>
                 <w:sz w:val="19"/>
               </w:rPr>
-              <w:t>Windows protected your PC</w:t>
-            </w:r>
-          </w:p>
-        </w:tc>
-        <w:tc>
-          <w:tcPr>
-            <w:tcW w:w="2381" w:type="dxa"/>
-            <w:tcBorders>
-              <w:top w:val="single" w:sz="4" w:space="0" w:color="BFBFBF"/>
-              <w:left w:val="single" w:sz="4" w:space="0" w:color="BFBFBF"/>
-              <w:bottom w:val="single" w:sz="4" w:space="0" w:color="BFBFBF"/>
-              <w:right w:val="single" w:sz="4" w:space="0" w:color="BFBFBF"/>
-            </w:tcBorders>
-            <w:shd w:val="clear" w:color="auto" w:fill="F5F8FC"/>
-            <w:tcMar>
-              <w:top w:w="40" w:type="dxa"/>
-              <w:left w:w="100" w:type="dxa"/>
-              <w:bottom w:w="40" w:type="dxa"/>
-              <w:right w:w="100" w:type="dxa"/>
-            </w:tcMar>
-          </w:tcPr>
-          <w:p>
-            <w:pPr>
-              <w:spacing w:line="252" w:lineRule="auto"/>
-            </w:pPr>
-            <w:r>
-              <w:rPr>
-                <w:sz w:val="19"/>
-              </w:rPr>
-              <w:t>SmartScreen chặn ứng dụng chưa ký số</w:t>
-            </w:r>
-          </w:p>
-        </w:tc>
-        <w:tc>
-          <w:tcPr>
-            <w:tcW w:w="4082" w:type="dxa"/>
-            <w:tcBorders>
-              <w:top w:val="single" w:sz="4" w:space="0" w:color="BFBFBF"/>
-              <w:left w:val="single" w:sz="4" w:space="0" w:color="BFBFBF"/>
-              <w:bottom w:val="single" w:sz="4" w:space="0" w:color="BFBFBF"/>
-              <w:right w:val="single" w:sz="4" w:space="0" w:color="BFBFBF"/>
-            </w:tcBorders>
-            <w:shd w:val="clear" w:color="auto" w:fill="F5F8FC"/>
-            <w:tcMar>
-              <w:top w:w="40" w:type="dxa"/>
-              <w:left w:w="100" w:type="dxa"/>
-              <w:bottom w:w="40" w:type="dxa"/>
-              <w:right w:w="100" w:type="dxa"/>
-            </w:tcMar>
-          </w:tcPr>
-          <w:p>
-            <w:pPr>
-              <w:spacing w:line="252" w:lineRule="auto"/>
-            </w:pPr>
-            <w:r>
-              <w:rPr>
-                <w:sz w:val="19"/>
-              </w:rPr>
-              <w:t xml:space="preserve">Bấm </w:t>
-            </w:r>
-            <w:r>
-              <w:rPr>
-                <w:b/>
-                <w:sz w:val="19"/>
-              </w:rPr>
-              <w:t>More info &gt; Run anyway</w:t>
-            </w:r>
-            <w:r>
-              <w:rPr>
-                <w:sz w:val="19"/>
-              </w:rPr>
-              <w:t>.</w:t>
+              <w:t>System Settings &gt; Privacy &amp; Security &gt; Open Anyway</w:t>
+            </w:r>
+            <w:r>
+              <w:rPr>
+                <w:sz w:val="19"/>
+              </w:rPr>
+              <w:t xml:space="preserve">, hoặc lệnh </w:t>
+            </w:r>
+            <w:r>
+              <w:rPr>
+                <w:color w:val="C7254E"/>
+                <w:sz w:val="19"/>
+              </w:rPr>
+              <w:t>xattr</w:t>
+            </w:r>
+            <w:r>
+              <w:rPr>
+                <w:sz w:val="19"/>
+              </w:rPr>
+              <w:t xml:space="preserve"> ở mục 3.2.</w:t>
             </w:r>
           </w:p>
         </w:tc>
@@ -27516,7 +27969,14 @@
                 <w:sz w:val="19"/>
               </w:rPr>
               <w:lastRenderedPageBreak/>
-              <w:t>Trang Tổng quan: buổi học hôm nay, doanh thu tháng này bằng 0; lịch học tuần này trống</w:t>
+              <w:t xml:space="preserve">Windows hiện </w:t>
+            </w:r>
+            <w:r>
+              <w:rPr>
+                <w:b/>
+                <w:sz w:val="19"/>
+              </w:rPr>
+              <w:t>Windows protected your PC</w:t>
             </w:r>
           </w:p>
         </w:tc>
@@ -27544,7 +28004,7 @@
               <w:rPr>
                 <w:sz w:val="19"/>
               </w:rPr>
-              <w:t>Dữ liệu mẫu đã cũ (ngày tính theo lần chạy script khởi tạo)</w:t>
+              <w:t>SmartScreen chặn ứng dụng chưa ký số</w:t>
             </w:r>
           </w:p>
         </w:tc>
@@ -27572,7 +28032,20 @@
               <w:rPr>
                 <w:sz w:val="19"/>
               </w:rPr>
-              <w:t>Chạy lại bước khởi tạo CSDL (mục 2.4).</w:t>
+              <w:t xml:space="preserve">Bấm </w:t>
+            </w:r>
+            <w:r>
+              <w:rPr>
+                <w:b/>
+                <w:sz w:val="19"/>
+              </w:rPr>
+              <w:t>More info &gt; Run anyway</w:t>
+            </w:r>
+            <w:r>
+              <w:rPr>
+                <w:sz w:val="19"/>
+              </w:rPr>
+              <w:t>.</w:t>
             </w:r>
           </w:p>
         </w:tc>
@@ -27607,7 +28080,7 @@
               <w:rPr>
                 <w:sz w:val="19"/>
               </w:rPr>
-              <w:t>Giờ tạo tài khoản, giờ đăng nhập cuối lệch vài tiếng</w:t>
+              <w:t>Trang Tổng quan: buổi học hôm nay, doanh thu tháng này bằng 0; lịch học tuần này trống</w:t>
             </w:r>
           </w:p>
         </w:tc>
@@ -27636,7 +28109,7 @@
               <w:rPr>
                 <w:sz w:val="19"/>
               </w:rPr>
-              <w:t>Thời điểm được lưu theo giờ UTC và hiển thị theo múi giờ của máy chạy ứng dụng</w:t>
+              <w:t>Dữ liệu mẫu đã cũ (ngày tính theo lần chạy script khởi tạo)</w:t>
             </w:r>
           </w:p>
         </w:tc>
@@ -27665,7 +28138,7 @@
               <w:rPr>
                 <w:sz w:val="19"/>
               </w:rPr>
-              <w:t>Kiểm tra cài đặt múi giờ (time zone) của máy tính.</w:t>
+              <w:t>Chạy lại bước khởi tạo CSDL (mục 2.4).</w:t>
             </w:r>
           </w:p>
         </w:tc>
@@ -27697,10 +28170,9 @@
             </w:pPr>
             <w:r>
               <w:rPr>
-                <w:b/>
-                <w:sz w:val="19"/>
-              </w:rPr>
-              <w:t>Bạn không có quyền thực hiện thao tác này (SQL Server từ chối)</w:t>
+                <w:sz w:val="19"/>
+              </w:rPr>
+              <w:t>Giờ tạo tài khoản, giờ đăng nhập cuối lệch vài tiếng</w:t>
             </w:r>
           </w:p>
         </w:tc>
@@ -27728,7 +28200,7 @@
               <w:rPr>
                 <w:sz w:val="19"/>
               </w:rPr>
-              <w:t>Vai trò không được phép thao tác đó</w:t>
+              <w:t>Thời điểm được lưu theo giờ UTC và hiển thị theo múi giờ của máy chạy ứng dụng</w:t>
             </w:r>
           </w:p>
         </w:tc>
@@ -27756,7 +28228,7 @@
               <w:rPr>
                 <w:sz w:val="19"/>
               </w:rPr>
-              <w:t>Đăng nhập bằng tài khoản có vai trò phù hợp (Bảng 1.1).</w:t>
+              <w:t>Kiểm tra cài đặt múi giờ (time zone) của máy tính.</w:t>
             </w:r>
           </w:p>
         </w:tc>
@@ -27792,7 +28264,7 @@
                 <w:b/>
                 <w:sz w:val="19"/>
               </w:rPr>
-              <w:t>Học viên đang có dữ liệu ghi danh, không thể xóa</w:t>
+              <w:t>Bạn không có quyền thực hiện thao tác này (SQL Server từ chối)</w:t>
             </w:r>
           </w:p>
         </w:tc>
@@ -27821,7 +28293,7 @@
               <w:rPr>
                 <w:sz w:val="19"/>
               </w:rPr>
-              <w:t>Học viên đã ghi danh lớp</w:t>
+              <w:t>Vai trò không được phép thao tác đó</w:t>
             </w:r>
           </w:p>
         </w:tc>
@@ -27850,20 +28322,7 @@
               <w:rPr>
                 <w:sz w:val="19"/>
               </w:rPr>
-              <w:t xml:space="preserve">Không xóa; sửa trạng thái học viên thành </w:t>
-            </w:r>
-            <w:r>
-              <w:rPr>
-                <w:b/>
-                <w:sz w:val="19"/>
-              </w:rPr>
-              <w:t>Ngừng học</w:t>
-            </w:r>
-            <w:r>
-              <w:rPr>
-                <w:sz w:val="19"/>
-              </w:rPr>
-              <w:t xml:space="preserve"> (mục 5.2.4).</w:t>
+              <w:t>Đăng nhập bằng tài khoản có vai trò phù hợp (Bảng 1.1).</w:t>
             </w:r>
           </w:p>
         </w:tc>
@@ -27895,22 +28354,10 @@
             </w:pPr>
             <w:r>
               <w:rPr>
-                <w:sz w:val="19"/>
-              </w:rPr>
-              <w:t xml:space="preserve">Script </w:t>
-            </w:r>
-            <w:r>
-              <w:rPr>
-                <w:color w:val="C7254E"/>
-                <w:sz w:val="19"/>
-              </w:rPr>
-              <w:t>db_init</w:t>
-            </w:r>
-            <w:r>
-              <w:rPr>
-                <w:sz w:val="19"/>
-              </w:rPr>
-              <w:t xml:space="preserve"> dừng giữa chừng</w:t>
+                <w:b/>
+                <w:sz w:val="19"/>
+              </w:rPr>
+              <w:t>Học viên đang có dữ liệu ghi danh, không thể xóa</w:t>
             </w:r>
           </w:p>
         </w:tc>
@@ -27938,20 +28385,7 @@
               <w:rPr>
                 <w:sz w:val="19"/>
               </w:rPr>
-              <w:t xml:space="preserve">Sai mật khẩu </w:t>
-            </w:r>
-            <w:r>
-              <w:rPr>
-                <w:color w:val="C7254E"/>
-                <w:sz w:val="19"/>
-              </w:rPr>
-              <w:t>sa</w:t>
-            </w:r>
-            <w:r>
-              <w:rPr>
-                <w:sz w:val="19"/>
-              </w:rPr>
-              <w:t>; SQL Server chưa khởi động xong; chạy không phải từ thư mục mã nguồn</w:t>
+              <w:t>Học viên đã ghi danh lớp</w:t>
             </w:r>
           </w:p>
         </w:tc>
@@ -27979,33 +28413,20 @@
               <w:rPr>
                 <w:sz w:val="19"/>
               </w:rPr>
-              <w:t xml:space="preserve">Chờ 20-30 giây sau </w:t>
-            </w:r>
-            <w:r>
-              <w:rPr>
-                <w:color w:val="C7254E"/>
-                <w:sz w:val="19"/>
-              </w:rPr>
-              <w:t>docker compose up -d</w:t>
-            </w:r>
-            <w:r>
-              <w:rPr>
-                <w:sz w:val="19"/>
-              </w:rPr>
-              <w:t xml:space="preserve"> rồi chạy lại; kiểm tra mật khẩu trong </w:t>
-            </w:r>
-            <w:r>
-              <w:rPr>
-                <w:color w:val="C7254E"/>
-                <w:sz w:val="19"/>
-              </w:rPr>
-              <w:t>.env</w:t>
-            </w:r>
-            <w:r>
-              <w:rPr>
-                <w:sz w:val="19"/>
-              </w:rPr>
-              <w:t>; đứng ở thư mục gốc mã nguồn.</w:t>
+              <w:t xml:space="preserve">Không xóa; sửa trạng thái học viên thành </w:t>
+            </w:r>
+            <w:r>
+              <w:rPr>
+                <w:b/>
+                <w:sz w:val="19"/>
+              </w:rPr>
+              <w:t>Ngừng học</w:t>
+            </w:r>
+            <w:r>
+              <w:rPr>
+                <w:sz w:val="19"/>
+              </w:rPr>
+              <w:t xml:space="preserve"> (mục 5.2.4).</w:t>
             </w:r>
           </w:p>
         </w:tc>
@@ -28040,6 +28461,150 @@
               <w:rPr>
                 <w:sz w:val="19"/>
               </w:rPr>
+              <w:t xml:space="preserve">Script </w:t>
+            </w:r>
+            <w:r>
+              <w:rPr>
+                <w:color w:val="C7254E"/>
+                <w:sz w:val="19"/>
+              </w:rPr>
+              <w:t>db_init</w:t>
+            </w:r>
+            <w:r>
+              <w:rPr>
+                <w:sz w:val="19"/>
+              </w:rPr>
+              <w:t xml:space="preserve"> dừng giữa chừng</w:t>
+            </w:r>
+          </w:p>
+        </w:tc>
+        <w:tc>
+          <w:tcPr>
+            <w:tcW w:w="2381" w:type="dxa"/>
+            <w:tcBorders>
+              <w:top w:val="single" w:sz="4" w:space="0" w:color="BFBFBF"/>
+              <w:left w:val="single" w:sz="4" w:space="0" w:color="BFBFBF"/>
+              <w:bottom w:val="single" w:sz="4" w:space="0" w:color="BFBFBF"/>
+              <w:right w:val="single" w:sz="4" w:space="0" w:color="BFBFBF"/>
+            </w:tcBorders>
+            <w:shd w:val="clear" w:color="auto" w:fill="F5F8FC"/>
+            <w:tcMar>
+              <w:top w:w="40" w:type="dxa"/>
+              <w:left w:w="100" w:type="dxa"/>
+              <w:bottom w:w="40" w:type="dxa"/>
+              <w:right w:w="100" w:type="dxa"/>
+            </w:tcMar>
+          </w:tcPr>
+          <w:p>
+            <w:pPr>
+              <w:spacing w:line="252" w:lineRule="auto"/>
+            </w:pPr>
+            <w:r>
+              <w:rPr>
+                <w:sz w:val="19"/>
+              </w:rPr>
+              <w:t xml:space="preserve">Sai mật khẩu </w:t>
+            </w:r>
+            <w:r>
+              <w:rPr>
+                <w:color w:val="C7254E"/>
+                <w:sz w:val="19"/>
+              </w:rPr>
+              <w:t>sa</w:t>
+            </w:r>
+            <w:r>
+              <w:rPr>
+                <w:sz w:val="19"/>
+              </w:rPr>
+              <w:t>; SQL Server chưa khởi động xong; chạy không phải từ thư mục mã nguồn</w:t>
+            </w:r>
+          </w:p>
+        </w:tc>
+        <w:tc>
+          <w:tcPr>
+            <w:tcW w:w="4082" w:type="dxa"/>
+            <w:tcBorders>
+              <w:top w:val="single" w:sz="4" w:space="0" w:color="BFBFBF"/>
+              <w:left w:val="single" w:sz="4" w:space="0" w:color="BFBFBF"/>
+              <w:bottom w:val="single" w:sz="4" w:space="0" w:color="BFBFBF"/>
+              <w:right w:val="single" w:sz="4" w:space="0" w:color="BFBFBF"/>
+            </w:tcBorders>
+            <w:shd w:val="clear" w:color="auto" w:fill="F5F8FC"/>
+            <w:tcMar>
+              <w:top w:w="40" w:type="dxa"/>
+              <w:left w:w="100" w:type="dxa"/>
+              <w:bottom w:w="40" w:type="dxa"/>
+              <w:right w:w="100" w:type="dxa"/>
+            </w:tcMar>
+          </w:tcPr>
+          <w:p>
+            <w:pPr>
+              <w:spacing w:line="252" w:lineRule="auto"/>
+            </w:pPr>
+            <w:r>
+              <w:rPr>
+                <w:sz w:val="19"/>
+              </w:rPr>
+              <w:t xml:space="preserve">Chờ 20-30 giây sau </w:t>
+            </w:r>
+            <w:r>
+              <w:rPr>
+                <w:color w:val="C7254E"/>
+                <w:sz w:val="19"/>
+              </w:rPr>
+              <w:t>docker compose up -d</w:t>
+            </w:r>
+            <w:r>
+              <w:rPr>
+                <w:sz w:val="19"/>
+              </w:rPr>
+              <w:t xml:space="preserve"> rồi chạy lại; kiểm tra mật khẩu trong </w:t>
+            </w:r>
+            <w:r>
+              <w:rPr>
+                <w:color w:val="C7254E"/>
+                <w:sz w:val="19"/>
+              </w:rPr>
+              <w:t>.env</w:t>
+            </w:r>
+            <w:r>
+              <w:rPr>
+                <w:sz w:val="19"/>
+              </w:rPr>
+              <w:t>; đứng ở thư mục gốc mã nguồn.</w:t>
+            </w:r>
+          </w:p>
+        </w:tc>
+      </w:tr>
+      <w:tr>
+        <w:trPr>
+          <w:cantSplit/>
+          <w:jc w:val="center"/>
+        </w:trPr>
+        <w:tc>
+          <w:tcPr>
+            <w:tcW w:w="2608" w:type="dxa"/>
+            <w:tcBorders>
+              <w:top w:val="single" w:sz="4" w:space="0" w:color="BFBFBF"/>
+              <w:left w:val="single" w:sz="4" w:space="0" w:color="BFBFBF"/>
+              <w:bottom w:val="single" w:sz="4" w:space="0" w:color="BFBFBF"/>
+              <w:right w:val="single" w:sz="4" w:space="0" w:color="BFBFBF"/>
+            </w:tcBorders>
+            <w:tcMar>
+              <w:top w:w="40" w:type="dxa"/>
+              <w:left w:w="100" w:type="dxa"/>
+              <w:bottom w:w="40" w:type="dxa"/>
+              <w:right w:w="100" w:type="dxa"/>
+            </w:tcMar>
+          </w:tcPr>
+          <w:p>
+            <w:pPr>
+              <w:spacing w:line="252" w:lineRule="auto"/>
+            </w:pPr>
+            <w:r>
+              <w:rPr>
+                <w:sz w:val="19"/>
+              </w:rPr>
               <w:t xml:space="preserve">Chữ tiếng Việt bị lỗi khi tự chạy script bằng </w:t>
             </w:r>
             <w:r>
@@ -28060,7 +28625,6 @@
               <w:bottom w:val="single" w:sz="4" w:space="0" w:color="BFBFBF"/>
               <w:right w:val="single" w:sz="4" w:space="0" w:color="BFBFBF"/>
             </w:tcBorders>
-            <w:shd w:val="clear" w:color="auto" w:fill="F5F8FC"/>
             <w:tcMar>
               <w:top w:w="40" w:type="dxa"/>
               <w:left w:w="100" w:type="dxa"/>
@@ -28089,7 +28653,6 @@
               <w:bottom w:val="single" w:sz="4" w:space="0" w:color="BFBFBF"/>
               <w:right w:val="single" w:sz="4" w:space="0" w:color="BFBFBF"/>
             </w:tcBorders>
-            <w:shd w:val="clear" w:color="auto" w:fill="F5F8FC"/>
             <w:tcMar>
               <w:top w:w="40" w:type="dxa"/>
               <w:left w:w="100" w:type="dxa"/>
@@ -28228,7 +28791,7 @@
       <w:pPr>
         <w:pStyle w:val="Heading2"/>
       </w:pPr>
-      <w:bookmarkStart w:id="88" w:name="_Toc241962358"/>
+      <w:bookmarkStart w:id="88" w:name="_Toc241965462"/>
       <w:r>
         <w:t>6.3. Khi cần hỗ trợ thêm</w:t>
       </w:r>
@@ -28276,7 +28839,7 @@
         <w:pStyle w:val="Heading1"/>
         <w:pageBreakBefore/>
       </w:pPr>
-      <w:bookmarkStart w:id="89" w:name="_Toc241962359"/>
+      <w:bookmarkStart w:id="89" w:name="_Toc241965463"/>
       <w:r>
         <w:lastRenderedPageBreak/>
         <w:t>PHỤ LỤC A. TÓM TẮT LỆNH</w:t>
@@ -29003,7 +29566,7 @@
         <w:pStyle w:val="Heading1"/>
         <w:pageBreakBefore/>
       </w:pPr>
-      <w:bookmarkStart w:id="90" w:name="_Toc241962360"/>
+      <w:bookmarkStart w:id="90" w:name="_Toc241965464"/>
       <w:r>
         <w:lastRenderedPageBreak/>
         <w:t>PHỤ LỤC B. CÁC MỤC CẦN BỔ SUNG</w:t>

</xml_diff>

<commit_message>
docs(user-guide): describe the Windows installer checked with a silent install
setup.exe was built and installed silently for the current user on
Windows 11: the app goes to %LOCALAPPDATA%\Programs\QLTTTA without
administrator rights, the Start menu gets QLTTTA and Installation guide,
check-connection signs in from the installed copy, and the uninstaller
removes the program but keeps the settings key HKCU\Software\UIT-IE103\
QLTTTA. The guide now says so, with the silent install command and the
command that deletes the settings; the two placeholders keep only what
needs the installer's own windows.
</commit_message>
<xml_diff>
--- a/docs/user-guide/QLTTTA_User_Guide.docx
+++ b/docs/user-guide/QLTTTA_User_Guide.docx
@@ -1401,7 +1401,7 @@
       <w:r>
         <w:fldChar w:fldCharType="separate"/>
       </w:r>
-      <w:hyperlink w:anchor="_Toc242043682" w:history="1">
+      <w:hyperlink w:anchor="_Toc242044384" w:history="1">
         <w:r>
           <w:rPr>
             <w:rStyle w:val="Hyperlink"/>
@@ -1428,7 +1428,7 @@
             <w:noProof/>
             <w:webHidden/>
           </w:rPr>
-          <w:instrText xml:space="preserve"> PAGEREF _Toc242043682 \h </w:instrText>
+          <w:instrText xml:space="preserve"> PAGEREF _Toc242044384 \h </w:instrText>
         </w:r>
         <w:r>
           <w:rPr>
@@ -1474,7 +1474,7 @@
           <w14:ligatures w14:val="standardContextual"/>
         </w:rPr>
       </w:pPr>
-      <w:hyperlink w:anchor="_Toc242043683" w:history="1">
+      <w:hyperlink w:anchor="_Toc242044385" w:history="1">
         <w:r>
           <w:rPr>
             <w:rStyle w:val="Hyperlink"/>
@@ -1501,7 +1501,7 @@
             <w:noProof/>
             <w:webHidden/>
           </w:rPr>
-          <w:instrText xml:space="preserve"> PAGEREF _Toc242043683 \h </w:instrText>
+          <w:instrText xml:space="preserve"> PAGEREF _Toc242044385 \h </w:instrText>
         </w:r>
         <w:r>
           <w:rPr>
@@ -1547,7 +1547,7 @@
           <w14:ligatures w14:val="standardContextual"/>
         </w:rPr>
       </w:pPr>
-      <w:hyperlink w:anchor="_Toc242043684" w:history="1">
+      <w:hyperlink w:anchor="_Toc242044386" w:history="1">
         <w:r>
           <w:rPr>
             <w:rStyle w:val="Hyperlink"/>
@@ -1574,7 +1574,7 @@
             <w:noProof/>
             <w:webHidden/>
           </w:rPr>
-          <w:instrText xml:space="preserve"> PAGEREF _Toc242043684 \h </w:instrText>
+          <w:instrText xml:space="preserve"> PAGEREF _Toc242044386 \h </w:instrText>
         </w:r>
         <w:r>
           <w:rPr>
@@ -1620,7 +1620,7 @@
           <w14:ligatures w14:val="standardContextual"/>
         </w:rPr>
       </w:pPr>
-      <w:hyperlink w:anchor="_Toc242043685" w:history="1">
+      <w:hyperlink w:anchor="_Toc242044387" w:history="1">
         <w:r>
           <w:rPr>
             <w:rStyle w:val="Hyperlink"/>
@@ -1647,7 +1647,7 @@
             <w:noProof/>
             <w:webHidden/>
           </w:rPr>
-          <w:instrText xml:space="preserve"> PAGEREF _Toc242043685 \h </w:instrText>
+          <w:instrText xml:space="preserve"> PAGEREF _Toc242044387 \h </w:instrText>
         </w:r>
         <w:r>
           <w:rPr>
@@ -1693,7 +1693,7 @@
           <w14:ligatures w14:val="standardContextual"/>
         </w:rPr>
       </w:pPr>
-      <w:hyperlink w:anchor="_Toc242043686" w:history="1">
+      <w:hyperlink w:anchor="_Toc242044388" w:history="1">
         <w:r>
           <w:rPr>
             <w:rStyle w:val="Hyperlink"/>
@@ -1720,7 +1720,7 @@
             <w:noProof/>
             <w:webHidden/>
           </w:rPr>
-          <w:instrText xml:space="preserve"> PAGEREF _Toc242043686 \h </w:instrText>
+          <w:instrText xml:space="preserve"> PAGEREF _Toc242044388 \h </w:instrText>
         </w:r>
         <w:r>
           <w:rPr>
@@ -1766,7 +1766,7 @@
           <w14:ligatures w14:val="standardContextual"/>
         </w:rPr>
       </w:pPr>
-      <w:hyperlink w:anchor="_Toc242043687" w:history="1">
+      <w:hyperlink w:anchor="_Toc242044389" w:history="1">
         <w:r>
           <w:rPr>
             <w:rStyle w:val="Hyperlink"/>
@@ -1793,7 +1793,7 @@
             <w:noProof/>
             <w:webHidden/>
           </w:rPr>
-          <w:instrText xml:space="preserve"> PAGEREF _Toc242043687 \h </w:instrText>
+          <w:instrText xml:space="preserve"> PAGEREF _Toc242044389 \h </w:instrText>
         </w:r>
         <w:r>
           <w:rPr>
@@ -1839,7 +1839,7 @@
           <w14:ligatures w14:val="standardContextual"/>
         </w:rPr>
       </w:pPr>
-      <w:hyperlink w:anchor="_Toc242043688" w:history="1">
+      <w:hyperlink w:anchor="_Toc242044390" w:history="1">
         <w:r>
           <w:rPr>
             <w:rStyle w:val="Hyperlink"/>
@@ -1866,7 +1866,7 @@
             <w:noProof/>
             <w:webHidden/>
           </w:rPr>
-          <w:instrText xml:space="preserve"> PAGEREF _Toc242043688 \h </w:instrText>
+          <w:instrText xml:space="preserve"> PAGEREF _Toc242044390 \h </w:instrText>
         </w:r>
         <w:r>
           <w:rPr>
@@ -1912,7 +1912,7 @@
           <w14:ligatures w14:val="standardContextual"/>
         </w:rPr>
       </w:pPr>
-      <w:hyperlink w:anchor="_Toc242043689" w:history="1">
+      <w:hyperlink w:anchor="_Toc242044391" w:history="1">
         <w:r>
           <w:rPr>
             <w:rStyle w:val="Hyperlink"/>
@@ -1939,7 +1939,7 @@
             <w:noProof/>
             <w:webHidden/>
           </w:rPr>
-          <w:instrText xml:space="preserve"> PAGEREF _Toc242043689 \h </w:instrText>
+          <w:instrText xml:space="preserve"> PAGEREF _Toc242044391 \h </w:instrText>
         </w:r>
         <w:r>
           <w:rPr>
@@ -1985,7 +1985,7 @@
           <w14:ligatures w14:val="standardContextual"/>
         </w:rPr>
       </w:pPr>
-      <w:hyperlink w:anchor="_Toc242043690" w:history="1">
+      <w:hyperlink w:anchor="_Toc242044392" w:history="1">
         <w:r>
           <w:rPr>
             <w:rStyle w:val="Hyperlink"/>
@@ -2012,7 +2012,7 @@
             <w:noProof/>
             <w:webHidden/>
           </w:rPr>
-          <w:instrText xml:space="preserve"> PAGEREF _Toc242043690 \h </w:instrText>
+          <w:instrText xml:space="preserve"> PAGEREF _Toc242044392 \h </w:instrText>
         </w:r>
         <w:r>
           <w:rPr>
@@ -2058,7 +2058,7 @@
           <w14:ligatures w14:val="standardContextual"/>
         </w:rPr>
       </w:pPr>
-      <w:hyperlink w:anchor="_Toc242043691" w:history="1">
+      <w:hyperlink w:anchor="_Toc242044393" w:history="1">
         <w:r>
           <w:rPr>
             <w:rStyle w:val="Hyperlink"/>
@@ -2085,7 +2085,7 @@
             <w:noProof/>
             <w:webHidden/>
           </w:rPr>
-          <w:instrText xml:space="preserve"> PAGEREF _Toc242043691 \h </w:instrText>
+          <w:instrText xml:space="preserve"> PAGEREF _Toc242044393 \h </w:instrText>
         </w:r>
         <w:r>
           <w:rPr>
@@ -2131,7 +2131,7 @@
           <w14:ligatures w14:val="standardContextual"/>
         </w:rPr>
       </w:pPr>
-      <w:hyperlink w:anchor="_Toc242043692" w:history="1">
+      <w:hyperlink w:anchor="_Toc242044394" w:history="1">
         <w:r>
           <w:rPr>
             <w:rStyle w:val="Hyperlink"/>
@@ -2158,7 +2158,7 @@
             <w:noProof/>
             <w:webHidden/>
           </w:rPr>
-          <w:instrText xml:space="preserve"> PAGEREF _Toc242043692 \h </w:instrText>
+          <w:instrText xml:space="preserve"> PAGEREF _Toc242044394 \h </w:instrText>
         </w:r>
         <w:r>
           <w:rPr>
@@ -2204,7 +2204,7 @@
           <w14:ligatures w14:val="standardContextual"/>
         </w:rPr>
       </w:pPr>
-      <w:hyperlink w:anchor="_Toc242043693" w:history="1">
+      <w:hyperlink w:anchor="_Toc242044395" w:history="1">
         <w:r>
           <w:rPr>
             <w:rStyle w:val="Hyperlink"/>
@@ -2231,7 +2231,7 @@
             <w:noProof/>
             <w:webHidden/>
           </w:rPr>
-          <w:instrText xml:space="preserve"> PAGEREF _Toc242043693 \h </w:instrText>
+          <w:instrText xml:space="preserve"> PAGEREF _Toc242044395 \h </w:instrText>
         </w:r>
         <w:r>
           <w:rPr>
@@ -2277,7 +2277,7 @@
           <w14:ligatures w14:val="standardContextual"/>
         </w:rPr>
       </w:pPr>
-      <w:hyperlink w:anchor="_Toc242043694" w:history="1">
+      <w:hyperlink w:anchor="_Toc242044396" w:history="1">
         <w:r>
           <w:rPr>
             <w:rStyle w:val="Hyperlink"/>
@@ -2304,7 +2304,7 @@
             <w:noProof/>
             <w:webHidden/>
           </w:rPr>
-          <w:instrText xml:space="preserve"> PAGEREF _Toc242043694 \h </w:instrText>
+          <w:instrText xml:space="preserve"> PAGEREF _Toc242044396 \h </w:instrText>
         </w:r>
         <w:r>
           <w:rPr>
@@ -2350,7 +2350,7 @@
           <w14:ligatures w14:val="standardContextual"/>
         </w:rPr>
       </w:pPr>
-      <w:hyperlink w:anchor="_Toc242043695" w:history="1">
+      <w:hyperlink w:anchor="_Toc242044397" w:history="1">
         <w:r>
           <w:rPr>
             <w:rStyle w:val="Hyperlink"/>
@@ -2377,7 +2377,7 @@
             <w:noProof/>
             <w:webHidden/>
           </w:rPr>
-          <w:instrText xml:space="preserve"> PAGEREF _Toc242043695 \h </w:instrText>
+          <w:instrText xml:space="preserve"> PAGEREF _Toc242044397 \h </w:instrText>
         </w:r>
         <w:r>
           <w:rPr>
@@ -2423,7 +2423,7 @@
           <w14:ligatures w14:val="standardContextual"/>
         </w:rPr>
       </w:pPr>
-      <w:hyperlink w:anchor="_Toc242043696" w:history="1">
+      <w:hyperlink w:anchor="_Toc242044398" w:history="1">
         <w:r>
           <w:rPr>
             <w:rStyle w:val="Hyperlink"/>
@@ -2450,7 +2450,7 @@
             <w:noProof/>
             <w:webHidden/>
           </w:rPr>
-          <w:instrText xml:space="preserve"> PAGEREF _Toc242043696 \h </w:instrText>
+          <w:instrText xml:space="preserve"> PAGEREF _Toc242044398 \h </w:instrText>
         </w:r>
         <w:r>
           <w:rPr>
@@ -2496,7 +2496,7 @@
           <w14:ligatures w14:val="standardContextual"/>
         </w:rPr>
       </w:pPr>
-      <w:hyperlink w:anchor="_Toc242043697" w:history="1">
+      <w:hyperlink w:anchor="_Toc242044399" w:history="1">
         <w:r>
           <w:rPr>
             <w:rStyle w:val="Hyperlink"/>
@@ -2523,7 +2523,7 @@
             <w:noProof/>
             <w:webHidden/>
           </w:rPr>
-          <w:instrText xml:space="preserve"> PAGEREF _Toc242043697 \h </w:instrText>
+          <w:instrText xml:space="preserve"> PAGEREF _Toc242044399 \h </w:instrText>
         </w:r>
         <w:r>
           <w:rPr>
@@ -2569,7 +2569,7 @@
           <w14:ligatures w14:val="standardContextual"/>
         </w:rPr>
       </w:pPr>
-      <w:hyperlink w:anchor="_Toc242043698" w:history="1">
+      <w:hyperlink w:anchor="_Toc242044400" w:history="1">
         <w:r>
           <w:rPr>
             <w:rStyle w:val="Hyperlink"/>
@@ -2596,7 +2596,7 @@
             <w:noProof/>
             <w:webHidden/>
           </w:rPr>
-          <w:instrText xml:space="preserve"> PAGEREF _Toc242043698 \h </w:instrText>
+          <w:instrText xml:space="preserve"> PAGEREF _Toc242044400 \h </w:instrText>
         </w:r>
         <w:r>
           <w:rPr>
@@ -2642,7 +2642,7 @@
           <w14:ligatures w14:val="standardContextual"/>
         </w:rPr>
       </w:pPr>
-      <w:hyperlink w:anchor="_Toc242043699" w:history="1">
+      <w:hyperlink w:anchor="_Toc242044401" w:history="1">
         <w:r>
           <w:rPr>
             <w:rStyle w:val="Hyperlink"/>
@@ -2669,7 +2669,7 @@
             <w:noProof/>
             <w:webHidden/>
           </w:rPr>
-          <w:instrText xml:space="preserve"> PAGEREF _Toc242043699 \h </w:instrText>
+          <w:instrText xml:space="preserve"> PAGEREF _Toc242044401 \h </w:instrText>
         </w:r>
         <w:r>
           <w:rPr>
@@ -2715,7 +2715,7 @@
           <w14:ligatures w14:val="standardContextual"/>
         </w:rPr>
       </w:pPr>
-      <w:hyperlink w:anchor="_Toc242043700" w:history="1">
+      <w:hyperlink w:anchor="_Toc242044402" w:history="1">
         <w:r>
           <w:rPr>
             <w:rStyle w:val="Hyperlink"/>
@@ -2742,7 +2742,7 @@
             <w:noProof/>
             <w:webHidden/>
           </w:rPr>
-          <w:instrText xml:space="preserve"> PAGEREF _Toc242043700 \h </w:instrText>
+          <w:instrText xml:space="preserve"> PAGEREF _Toc242044402 \h </w:instrText>
         </w:r>
         <w:r>
           <w:rPr>
@@ -2788,7 +2788,7 @@
           <w14:ligatures w14:val="standardContextual"/>
         </w:rPr>
       </w:pPr>
-      <w:hyperlink w:anchor="_Toc242043701" w:history="1">
+      <w:hyperlink w:anchor="_Toc242044403" w:history="1">
         <w:r>
           <w:rPr>
             <w:rStyle w:val="Hyperlink"/>
@@ -2815,7 +2815,7 @@
             <w:noProof/>
             <w:webHidden/>
           </w:rPr>
-          <w:instrText xml:space="preserve"> PAGEREF _Toc242043701 \h </w:instrText>
+          <w:instrText xml:space="preserve"> PAGEREF _Toc242044403 \h </w:instrText>
         </w:r>
         <w:r>
           <w:rPr>
@@ -2861,7 +2861,7 @@
           <w14:ligatures w14:val="standardContextual"/>
         </w:rPr>
       </w:pPr>
-      <w:hyperlink w:anchor="_Toc242043702" w:history="1">
+      <w:hyperlink w:anchor="_Toc242044404" w:history="1">
         <w:r>
           <w:rPr>
             <w:rStyle w:val="Hyperlink"/>
@@ -2888,7 +2888,7 @@
             <w:noProof/>
             <w:webHidden/>
           </w:rPr>
-          <w:instrText xml:space="preserve"> PAGEREF _Toc242043702 \h </w:instrText>
+          <w:instrText xml:space="preserve"> PAGEREF _Toc242044404 \h </w:instrText>
         </w:r>
         <w:r>
           <w:rPr>
@@ -2934,7 +2934,7 @@
           <w14:ligatures w14:val="standardContextual"/>
         </w:rPr>
       </w:pPr>
-      <w:hyperlink w:anchor="_Toc242043703" w:history="1">
+      <w:hyperlink w:anchor="_Toc242044405" w:history="1">
         <w:r>
           <w:rPr>
             <w:rStyle w:val="Hyperlink"/>
@@ -2961,7 +2961,7 @@
             <w:noProof/>
             <w:webHidden/>
           </w:rPr>
-          <w:instrText xml:space="preserve"> PAGEREF _Toc242043703 \h </w:instrText>
+          <w:instrText xml:space="preserve"> PAGEREF _Toc242044405 \h </w:instrText>
         </w:r>
         <w:r>
           <w:rPr>
@@ -3007,7 +3007,7 @@
           <w14:ligatures w14:val="standardContextual"/>
         </w:rPr>
       </w:pPr>
-      <w:hyperlink w:anchor="_Toc242043704" w:history="1">
+      <w:hyperlink w:anchor="_Toc242044406" w:history="1">
         <w:r>
           <w:rPr>
             <w:rStyle w:val="Hyperlink"/>
@@ -3034,7 +3034,7 @@
             <w:noProof/>
             <w:webHidden/>
           </w:rPr>
-          <w:instrText xml:space="preserve"> PAGEREF _Toc242043704 \h </w:instrText>
+          <w:instrText xml:space="preserve"> PAGEREF _Toc242044406 \h </w:instrText>
         </w:r>
         <w:r>
           <w:rPr>
@@ -3080,7 +3080,7 @@
           <w14:ligatures w14:val="standardContextual"/>
         </w:rPr>
       </w:pPr>
-      <w:hyperlink w:anchor="_Toc242043705" w:history="1">
+      <w:hyperlink w:anchor="_Toc242044407" w:history="1">
         <w:r>
           <w:rPr>
             <w:rStyle w:val="Hyperlink"/>
@@ -3107,7 +3107,7 @@
             <w:noProof/>
             <w:webHidden/>
           </w:rPr>
-          <w:instrText xml:space="preserve"> PAGEREF _Toc242043705 \h </w:instrText>
+          <w:instrText xml:space="preserve"> PAGEREF _Toc242044407 \h </w:instrText>
         </w:r>
         <w:r>
           <w:rPr>
@@ -3153,7 +3153,7 @@
           <w14:ligatures w14:val="standardContextual"/>
         </w:rPr>
       </w:pPr>
-      <w:hyperlink w:anchor="_Toc242043706" w:history="1">
+      <w:hyperlink w:anchor="_Toc242044408" w:history="1">
         <w:r>
           <w:rPr>
             <w:rStyle w:val="Hyperlink"/>
@@ -3180,7 +3180,7 @@
             <w:noProof/>
             <w:webHidden/>
           </w:rPr>
-          <w:instrText xml:space="preserve"> PAGEREF _Toc242043706 \h </w:instrText>
+          <w:instrText xml:space="preserve"> PAGEREF _Toc242044408 \h </w:instrText>
         </w:r>
         <w:r>
           <w:rPr>
@@ -3226,7 +3226,7 @@
           <w14:ligatures w14:val="standardContextual"/>
         </w:rPr>
       </w:pPr>
-      <w:hyperlink w:anchor="_Toc242043707" w:history="1">
+      <w:hyperlink w:anchor="_Toc242044409" w:history="1">
         <w:r>
           <w:rPr>
             <w:rStyle w:val="Hyperlink"/>
@@ -3253,7 +3253,7 @@
             <w:noProof/>
             <w:webHidden/>
           </w:rPr>
-          <w:instrText xml:space="preserve"> PAGEREF _Toc242043707 \h </w:instrText>
+          <w:instrText xml:space="preserve"> PAGEREF _Toc242044409 \h </w:instrText>
         </w:r>
         <w:r>
           <w:rPr>
@@ -3299,7 +3299,7 @@
           <w14:ligatures w14:val="standardContextual"/>
         </w:rPr>
       </w:pPr>
-      <w:hyperlink w:anchor="_Toc242043708" w:history="1">
+      <w:hyperlink w:anchor="_Toc242044410" w:history="1">
         <w:r>
           <w:rPr>
             <w:rStyle w:val="Hyperlink"/>
@@ -3326,7 +3326,7 @@
             <w:noProof/>
             <w:webHidden/>
           </w:rPr>
-          <w:instrText xml:space="preserve"> PAGEREF _Toc242043708 \h </w:instrText>
+          <w:instrText xml:space="preserve"> PAGEREF _Toc242044410 \h </w:instrText>
         </w:r>
         <w:r>
           <w:rPr>
@@ -3372,7 +3372,7 @@
           <w14:ligatures w14:val="standardContextual"/>
         </w:rPr>
       </w:pPr>
-      <w:hyperlink w:anchor="_Toc242043709" w:history="1">
+      <w:hyperlink w:anchor="_Toc242044411" w:history="1">
         <w:r>
           <w:rPr>
             <w:rStyle w:val="Hyperlink"/>
@@ -3399,7 +3399,7 @@
             <w:noProof/>
             <w:webHidden/>
           </w:rPr>
-          <w:instrText xml:space="preserve"> PAGEREF _Toc242043709 \h </w:instrText>
+          <w:instrText xml:space="preserve"> PAGEREF _Toc242044411 \h </w:instrText>
         </w:r>
         <w:r>
           <w:rPr>
@@ -3445,7 +3445,7 @@
           <w14:ligatures w14:val="standardContextual"/>
         </w:rPr>
       </w:pPr>
-      <w:hyperlink w:anchor="_Toc242043710" w:history="1">
+      <w:hyperlink w:anchor="_Toc242044412" w:history="1">
         <w:r>
           <w:rPr>
             <w:rStyle w:val="Hyperlink"/>
@@ -3472,7 +3472,7 @@
             <w:noProof/>
             <w:webHidden/>
           </w:rPr>
-          <w:instrText xml:space="preserve"> PAGEREF _Toc242043710 \h </w:instrText>
+          <w:instrText xml:space="preserve"> PAGEREF _Toc242044412 \h </w:instrText>
         </w:r>
         <w:r>
           <w:rPr>
@@ -3518,7 +3518,7 @@
           <w14:ligatures w14:val="standardContextual"/>
         </w:rPr>
       </w:pPr>
-      <w:hyperlink w:anchor="_Toc242043711" w:history="1">
+      <w:hyperlink w:anchor="_Toc242044413" w:history="1">
         <w:r>
           <w:rPr>
             <w:rStyle w:val="Hyperlink"/>
@@ -3545,7 +3545,7 @@
             <w:noProof/>
             <w:webHidden/>
           </w:rPr>
-          <w:instrText xml:space="preserve"> PAGEREF _Toc242043711 \h </w:instrText>
+          <w:instrText xml:space="preserve"> PAGEREF _Toc242044413 \h </w:instrText>
         </w:r>
         <w:r>
           <w:rPr>
@@ -3591,7 +3591,7 @@
           <w14:ligatures w14:val="standardContextual"/>
         </w:rPr>
       </w:pPr>
-      <w:hyperlink w:anchor="_Toc242043712" w:history="1">
+      <w:hyperlink w:anchor="_Toc242044414" w:history="1">
         <w:r>
           <w:rPr>
             <w:rStyle w:val="Hyperlink"/>
@@ -3618,7 +3618,7 @@
             <w:noProof/>
             <w:webHidden/>
           </w:rPr>
-          <w:instrText xml:space="preserve"> PAGEREF _Toc242043712 \h </w:instrText>
+          <w:instrText xml:space="preserve"> PAGEREF _Toc242044414 \h </w:instrText>
         </w:r>
         <w:r>
           <w:rPr>
@@ -3638,7 +3638,7 @@
             <w:noProof/>
             <w:webHidden/>
           </w:rPr>
-          <w:t>21</w:t>
+          <w:t>22</w:t>
         </w:r>
         <w:r>
           <w:rPr>
@@ -3664,7 +3664,7 @@
           <w14:ligatures w14:val="standardContextual"/>
         </w:rPr>
       </w:pPr>
-      <w:hyperlink w:anchor="_Toc242043713" w:history="1">
+      <w:hyperlink w:anchor="_Toc242044415" w:history="1">
         <w:r>
           <w:rPr>
             <w:rStyle w:val="Hyperlink"/>
@@ -3691,7 +3691,7 @@
             <w:noProof/>
             <w:webHidden/>
           </w:rPr>
-          <w:instrText xml:space="preserve"> PAGEREF _Toc242043713 \h </w:instrText>
+          <w:instrText xml:space="preserve"> PAGEREF _Toc242044415 \h </w:instrText>
         </w:r>
         <w:r>
           <w:rPr>
@@ -3711,7 +3711,7 @@
             <w:noProof/>
             <w:webHidden/>
           </w:rPr>
-          <w:t>21</w:t>
+          <w:t>22</w:t>
         </w:r>
         <w:r>
           <w:rPr>
@@ -3737,7 +3737,7 @@
           <w14:ligatures w14:val="standardContextual"/>
         </w:rPr>
       </w:pPr>
-      <w:hyperlink w:anchor="_Toc242043714" w:history="1">
+      <w:hyperlink w:anchor="_Toc242044416" w:history="1">
         <w:r>
           <w:rPr>
             <w:rStyle w:val="Hyperlink"/>
@@ -3764,7 +3764,7 @@
             <w:noProof/>
             <w:webHidden/>
           </w:rPr>
-          <w:instrText xml:space="preserve"> PAGEREF _Toc242043714 \h </w:instrText>
+          <w:instrText xml:space="preserve"> PAGEREF _Toc242044416 \h </w:instrText>
         </w:r>
         <w:r>
           <w:rPr>
@@ -3784,7 +3784,7 @@
             <w:noProof/>
             <w:webHidden/>
           </w:rPr>
-          <w:t>21</w:t>
+          <w:t>22</w:t>
         </w:r>
         <w:r>
           <w:rPr>
@@ -3810,7 +3810,7 @@
           <w14:ligatures w14:val="standardContextual"/>
         </w:rPr>
       </w:pPr>
-      <w:hyperlink w:anchor="_Toc242043715" w:history="1">
+      <w:hyperlink w:anchor="_Toc242044417" w:history="1">
         <w:r>
           <w:rPr>
             <w:rStyle w:val="Hyperlink"/>
@@ -3837,7 +3837,7 @@
             <w:noProof/>
             <w:webHidden/>
           </w:rPr>
-          <w:instrText xml:space="preserve"> PAGEREF _Toc242043715 \h </w:instrText>
+          <w:instrText xml:space="preserve"> PAGEREF _Toc242044417 \h </w:instrText>
         </w:r>
         <w:r>
           <w:rPr>
@@ -3857,7 +3857,7 @@
             <w:noProof/>
             <w:webHidden/>
           </w:rPr>
-          <w:t>22</w:t>
+          <w:t>23</w:t>
         </w:r>
         <w:r>
           <w:rPr>
@@ -3883,7 +3883,7 @@
           <w14:ligatures w14:val="standardContextual"/>
         </w:rPr>
       </w:pPr>
-      <w:hyperlink w:anchor="_Toc242043716" w:history="1">
+      <w:hyperlink w:anchor="_Toc242044418" w:history="1">
         <w:r>
           <w:rPr>
             <w:rStyle w:val="Hyperlink"/>
@@ -3910,7 +3910,7 @@
             <w:noProof/>
             <w:webHidden/>
           </w:rPr>
-          <w:instrText xml:space="preserve"> PAGEREF _Toc242043716 \h </w:instrText>
+          <w:instrText xml:space="preserve"> PAGEREF _Toc242044418 \h </w:instrText>
         </w:r>
         <w:r>
           <w:rPr>
@@ -3930,7 +3930,7 @@
             <w:noProof/>
             <w:webHidden/>
           </w:rPr>
-          <w:t>23</w:t>
+          <w:t>24</w:t>
         </w:r>
         <w:r>
           <w:rPr>
@@ -3956,7 +3956,7 @@
           <w14:ligatures w14:val="standardContextual"/>
         </w:rPr>
       </w:pPr>
-      <w:hyperlink w:anchor="_Toc242043717" w:history="1">
+      <w:hyperlink w:anchor="_Toc242044419" w:history="1">
         <w:r>
           <w:rPr>
             <w:rStyle w:val="Hyperlink"/>
@@ -3983,7 +3983,7 @@
             <w:noProof/>
             <w:webHidden/>
           </w:rPr>
-          <w:instrText xml:space="preserve"> PAGEREF _Toc242043717 \h </w:instrText>
+          <w:instrText xml:space="preserve"> PAGEREF _Toc242044419 \h </w:instrText>
         </w:r>
         <w:r>
           <w:rPr>
@@ -4003,7 +4003,7 @@
             <w:noProof/>
             <w:webHidden/>
           </w:rPr>
-          <w:t>24</w:t>
+          <w:t>25</w:t>
         </w:r>
         <w:r>
           <w:rPr>
@@ -4029,7 +4029,7 @@
           <w14:ligatures w14:val="standardContextual"/>
         </w:rPr>
       </w:pPr>
-      <w:hyperlink w:anchor="_Toc242043718" w:history="1">
+      <w:hyperlink w:anchor="_Toc242044420" w:history="1">
         <w:r>
           <w:rPr>
             <w:rStyle w:val="Hyperlink"/>
@@ -4056,7 +4056,7 @@
             <w:noProof/>
             <w:webHidden/>
           </w:rPr>
-          <w:instrText xml:space="preserve"> PAGEREF _Toc242043718 \h </w:instrText>
+          <w:instrText xml:space="preserve"> PAGEREF _Toc242044420 \h </w:instrText>
         </w:r>
         <w:r>
           <w:rPr>
@@ -4076,7 +4076,7 @@
             <w:noProof/>
             <w:webHidden/>
           </w:rPr>
-          <w:t>24</w:t>
+          <w:t>25</w:t>
         </w:r>
         <w:r>
           <w:rPr>
@@ -4102,7 +4102,7 @@
           <w14:ligatures w14:val="standardContextual"/>
         </w:rPr>
       </w:pPr>
-      <w:hyperlink w:anchor="_Toc242043719" w:history="1">
+      <w:hyperlink w:anchor="_Toc242044421" w:history="1">
         <w:r>
           <w:rPr>
             <w:rStyle w:val="Hyperlink"/>
@@ -4129,7 +4129,7 @@
             <w:noProof/>
             <w:webHidden/>
           </w:rPr>
-          <w:instrText xml:space="preserve"> PAGEREF _Toc242043719 \h </w:instrText>
+          <w:instrText xml:space="preserve"> PAGEREF _Toc242044421 \h </w:instrText>
         </w:r>
         <w:r>
           <w:rPr>
@@ -4149,7 +4149,7 @@
             <w:noProof/>
             <w:webHidden/>
           </w:rPr>
-          <w:t>25</w:t>
+          <w:t>26</w:t>
         </w:r>
         <w:r>
           <w:rPr>
@@ -4175,7 +4175,7 @@
           <w14:ligatures w14:val="standardContextual"/>
         </w:rPr>
       </w:pPr>
-      <w:hyperlink w:anchor="_Toc242043720" w:history="1">
+      <w:hyperlink w:anchor="_Toc242044422" w:history="1">
         <w:r>
           <w:rPr>
             <w:rStyle w:val="Hyperlink"/>
@@ -4202,7 +4202,7 @@
             <w:noProof/>
             <w:webHidden/>
           </w:rPr>
-          <w:instrText xml:space="preserve"> PAGEREF _Toc242043720 \h </w:instrText>
+          <w:instrText xml:space="preserve"> PAGEREF _Toc242044422 \h </w:instrText>
         </w:r>
         <w:r>
           <w:rPr>
@@ -4222,7 +4222,7 @@
             <w:noProof/>
             <w:webHidden/>
           </w:rPr>
-          <w:t>25</w:t>
+          <w:t>26</w:t>
         </w:r>
         <w:r>
           <w:rPr>
@@ -4248,7 +4248,7 @@
           <w14:ligatures w14:val="standardContextual"/>
         </w:rPr>
       </w:pPr>
-      <w:hyperlink w:anchor="_Toc242043721" w:history="1">
+      <w:hyperlink w:anchor="_Toc242044423" w:history="1">
         <w:r>
           <w:rPr>
             <w:rStyle w:val="Hyperlink"/>
@@ -4275,7 +4275,7 @@
             <w:noProof/>
             <w:webHidden/>
           </w:rPr>
-          <w:instrText xml:space="preserve"> PAGEREF _Toc242043721 \h </w:instrText>
+          <w:instrText xml:space="preserve"> PAGEREF _Toc242044423 \h </w:instrText>
         </w:r>
         <w:r>
           <w:rPr>
@@ -4295,7 +4295,7 @@
             <w:noProof/>
             <w:webHidden/>
           </w:rPr>
-          <w:t>26</w:t>
+          <w:t>27</w:t>
         </w:r>
         <w:r>
           <w:rPr>
@@ -4321,7 +4321,7 @@
           <w14:ligatures w14:val="standardContextual"/>
         </w:rPr>
       </w:pPr>
-      <w:hyperlink w:anchor="_Toc242043722" w:history="1">
+      <w:hyperlink w:anchor="_Toc242044424" w:history="1">
         <w:r>
           <w:rPr>
             <w:rStyle w:val="Hyperlink"/>
@@ -4348,7 +4348,7 @@
             <w:noProof/>
             <w:webHidden/>
           </w:rPr>
-          <w:instrText xml:space="preserve"> PAGEREF _Toc242043722 \h </w:instrText>
+          <w:instrText xml:space="preserve"> PAGEREF _Toc242044424 \h </w:instrText>
         </w:r>
         <w:r>
           <w:rPr>
@@ -4368,7 +4368,7 @@
             <w:noProof/>
             <w:webHidden/>
           </w:rPr>
-          <w:t>27</w:t>
+          <w:t>28</w:t>
         </w:r>
         <w:r>
           <w:rPr>
@@ -4394,7 +4394,7 @@
           <w14:ligatures w14:val="standardContextual"/>
         </w:rPr>
       </w:pPr>
-      <w:hyperlink w:anchor="_Toc242043723" w:history="1">
+      <w:hyperlink w:anchor="_Toc242044425" w:history="1">
         <w:r>
           <w:rPr>
             <w:rStyle w:val="Hyperlink"/>
@@ -4421,7 +4421,7 @@
             <w:noProof/>
             <w:webHidden/>
           </w:rPr>
-          <w:instrText xml:space="preserve"> PAGEREF _Toc242043723 \h </w:instrText>
+          <w:instrText xml:space="preserve"> PAGEREF _Toc242044425 \h </w:instrText>
         </w:r>
         <w:r>
           <w:rPr>
@@ -4441,7 +4441,7 @@
             <w:noProof/>
             <w:webHidden/>
           </w:rPr>
-          <w:t>27</w:t>
+          <w:t>28</w:t>
         </w:r>
         <w:r>
           <w:rPr>
@@ -4467,7 +4467,7 @@
           <w14:ligatures w14:val="standardContextual"/>
         </w:rPr>
       </w:pPr>
-      <w:hyperlink w:anchor="_Toc242043724" w:history="1">
+      <w:hyperlink w:anchor="_Toc242044426" w:history="1">
         <w:r>
           <w:rPr>
             <w:rStyle w:val="Hyperlink"/>
@@ -4494,7 +4494,7 @@
             <w:noProof/>
             <w:webHidden/>
           </w:rPr>
-          <w:instrText xml:space="preserve"> PAGEREF _Toc242043724 \h </w:instrText>
+          <w:instrText xml:space="preserve"> PAGEREF _Toc242044426 \h </w:instrText>
         </w:r>
         <w:r>
           <w:rPr>
@@ -4514,7 +4514,7 @@
             <w:noProof/>
             <w:webHidden/>
           </w:rPr>
-          <w:t>28</w:t>
+          <w:t>29</w:t>
         </w:r>
         <w:r>
           <w:rPr>
@@ -4540,7 +4540,7 @@
           <w14:ligatures w14:val="standardContextual"/>
         </w:rPr>
       </w:pPr>
-      <w:hyperlink w:anchor="_Toc242043725" w:history="1">
+      <w:hyperlink w:anchor="_Toc242044427" w:history="1">
         <w:r>
           <w:rPr>
             <w:rStyle w:val="Hyperlink"/>
@@ -4567,7 +4567,7 @@
             <w:noProof/>
             <w:webHidden/>
           </w:rPr>
-          <w:instrText xml:space="preserve"> PAGEREF _Toc242043725 \h </w:instrText>
+          <w:instrText xml:space="preserve"> PAGEREF _Toc242044427 \h </w:instrText>
         </w:r>
         <w:r>
           <w:rPr>
@@ -4587,7 +4587,7 @@
             <w:noProof/>
             <w:webHidden/>
           </w:rPr>
-          <w:t>28</w:t>
+          <w:t>29</w:t>
         </w:r>
         <w:r>
           <w:rPr>
@@ -4613,7 +4613,7 @@
           <w14:ligatures w14:val="standardContextual"/>
         </w:rPr>
       </w:pPr>
-      <w:hyperlink w:anchor="_Toc242043726" w:history="1">
+      <w:hyperlink w:anchor="_Toc242044428" w:history="1">
         <w:r>
           <w:rPr>
             <w:rStyle w:val="Hyperlink"/>
@@ -4640,7 +4640,7 @@
             <w:noProof/>
             <w:webHidden/>
           </w:rPr>
-          <w:instrText xml:space="preserve"> PAGEREF _Toc242043726 \h </w:instrText>
+          <w:instrText xml:space="preserve"> PAGEREF _Toc242044428 \h </w:instrText>
         </w:r>
         <w:r>
           <w:rPr>
@@ -4660,7 +4660,7 @@
             <w:noProof/>
             <w:webHidden/>
           </w:rPr>
-          <w:t>28</w:t>
+          <w:t>29</w:t>
         </w:r>
         <w:r>
           <w:rPr>
@@ -4686,7 +4686,7 @@
           <w14:ligatures w14:val="standardContextual"/>
         </w:rPr>
       </w:pPr>
-      <w:hyperlink w:anchor="_Toc242043727" w:history="1">
+      <w:hyperlink w:anchor="_Toc242044429" w:history="1">
         <w:r>
           <w:rPr>
             <w:rStyle w:val="Hyperlink"/>
@@ -4713,7 +4713,7 @@
             <w:noProof/>
             <w:webHidden/>
           </w:rPr>
-          <w:instrText xml:space="preserve"> PAGEREF _Toc242043727 \h </w:instrText>
+          <w:instrText xml:space="preserve"> PAGEREF _Toc242044429 \h </w:instrText>
         </w:r>
         <w:r>
           <w:rPr>
@@ -4733,7 +4733,7 @@
             <w:noProof/>
             <w:webHidden/>
           </w:rPr>
-          <w:t>28</w:t>
+          <w:t>29</w:t>
         </w:r>
         <w:r>
           <w:rPr>
@@ -4759,7 +4759,7 @@
           <w14:ligatures w14:val="standardContextual"/>
         </w:rPr>
       </w:pPr>
-      <w:hyperlink w:anchor="_Toc242043728" w:history="1">
+      <w:hyperlink w:anchor="_Toc242044430" w:history="1">
         <w:r>
           <w:rPr>
             <w:rStyle w:val="Hyperlink"/>
@@ -4786,7 +4786,7 @@
             <w:noProof/>
             <w:webHidden/>
           </w:rPr>
-          <w:instrText xml:space="preserve"> PAGEREF _Toc242043728 \h </w:instrText>
+          <w:instrText xml:space="preserve"> PAGEREF _Toc242044430 \h </w:instrText>
         </w:r>
         <w:r>
           <w:rPr>
@@ -4806,7 +4806,7 @@
             <w:noProof/>
             <w:webHidden/>
           </w:rPr>
-          <w:t>30</w:t>
+          <w:t>31</w:t>
         </w:r>
         <w:r>
           <w:rPr>
@@ -4832,7 +4832,7 @@
           <w14:ligatures w14:val="standardContextual"/>
         </w:rPr>
       </w:pPr>
-      <w:hyperlink w:anchor="_Toc242043729" w:history="1">
+      <w:hyperlink w:anchor="_Toc242044431" w:history="1">
         <w:r>
           <w:rPr>
             <w:rStyle w:val="Hyperlink"/>
@@ -4859,7 +4859,7 @@
             <w:noProof/>
             <w:webHidden/>
           </w:rPr>
-          <w:instrText xml:space="preserve"> PAGEREF _Toc242043729 \h </w:instrText>
+          <w:instrText xml:space="preserve"> PAGEREF _Toc242044431 \h </w:instrText>
         </w:r>
         <w:r>
           <w:rPr>
@@ -4879,7 +4879,7 @@
             <w:noProof/>
             <w:webHidden/>
           </w:rPr>
-          <w:t>30</w:t>
+          <w:t>31</w:t>
         </w:r>
         <w:r>
           <w:rPr>
@@ -4905,7 +4905,7 @@
           <w14:ligatures w14:val="standardContextual"/>
         </w:rPr>
       </w:pPr>
-      <w:hyperlink w:anchor="_Toc242043730" w:history="1">
+      <w:hyperlink w:anchor="_Toc242044432" w:history="1">
         <w:r>
           <w:rPr>
             <w:rStyle w:val="Hyperlink"/>
@@ -4932,7 +4932,7 @@
             <w:noProof/>
             <w:webHidden/>
           </w:rPr>
-          <w:instrText xml:space="preserve"> PAGEREF _Toc242043730 \h </w:instrText>
+          <w:instrText xml:space="preserve"> PAGEREF _Toc242044432 \h </w:instrText>
         </w:r>
         <w:r>
           <w:rPr>
@@ -4952,7 +4952,7 @@
             <w:noProof/>
             <w:webHidden/>
           </w:rPr>
-          <w:t>30</w:t>
+          <w:t>31</w:t>
         </w:r>
         <w:r>
           <w:rPr>
@@ -4978,7 +4978,7 @@
           <w14:ligatures w14:val="standardContextual"/>
         </w:rPr>
       </w:pPr>
-      <w:hyperlink w:anchor="_Toc242043731" w:history="1">
+      <w:hyperlink w:anchor="_Toc242044433" w:history="1">
         <w:r>
           <w:rPr>
             <w:rStyle w:val="Hyperlink"/>
@@ -5005,7 +5005,7 @@
             <w:noProof/>
             <w:webHidden/>
           </w:rPr>
-          <w:instrText xml:space="preserve"> PAGEREF _Toc242043731 \h </w:instrText>
+          <w:instrText xml:space="preserve"> PAGEREF _Toc242044433 \h </w:instrText>
         </w:r>
         <w:r>
           <w:rPr>
@@ -5025,7 +5025,7 @@
             <w:noProof/>
             <w:webHidden/>
           </w:rPr>
-          <w:t>30</w:t>
+          <w:t>31</w:t>
         </w:r>
         <w:r>
           <w:rPr>
@@ -5051,7 +5051,7 @@
           <w14:ligatures w14:val="standardContextual"/>
         </w:rPr>
       </w:pPr>
-      <w:hyperlink w:anchor="_Toc242043732" w:history="1">
+      <w:hyperlink w:anchor="_Toc242044434" w:history="1">
         <w:r>
           <w:rPr>
             <w:rStyle w:val="Hyperlink"/>
@@ -5078,7 +5078,7 @@
             <w:noProof/>
             <w:webHidden/>
           </w:rPr>
-          <w:instrText xml:space="preserve"> PAGEREF _Toc242043732 \h </w:instrText>
+          <w:instrText xml:space="preserve"> PAGEREF _Toc242044434 \h </w:instrText>
         </w:r>
         <w:r>
           <w:rPr>
@@ -5098,7 +5098,7 @@
             <w:noProof/>
             <w:webHidden/>
           </w:rPr>
-          <w:t>31</w:t>
+          <w:t>32</w:t>
         </w:r>
         <w:r>
           <w:rPr>
@@ -5124,7 +5124,7 @@
           <w14:ligatures w14:val="standardContextual"/>
         </w:rPr>
       </w:pPr>
-      <w:hyperlink w:anchor="_Toc242043733" w:history="1">
+      <w:hyperlink w:anchor="_Toc242044435" w:history="1">
         <w:r>
           <w:rPr>
             <w:rStyle w:val="Hyperlink"/>
@@ -5151,7 +5151,7 @@
             <w:noProof/>
             <w:webHidden/>
           </w:rPr>
-          <w:instrText xml:space="preserve"> PAGEREF _Toc242043733 \h </w:instrText>
+          <w:instrText xml:space="preserve"> PAGEREF _Toc242044435 \h </w:instrText>
         </w:r>
         <w:r>
           <w:rPr>
@@ -5171,7 +5171,7 @@
             <w:noProof/>
             <w:webHidden/>
           </w:rPr>
-          <w:t>33</w:t>
+          <w:t>34</w:t>
         </w:r>
         <w:r>
           <w:rPr>
@@ -5197,7 +5197,7 @@
           <w14:ligatures w14:val="standardContextual"/>
         </w:rPr>
       </w:pPr>
-      <w:hyperlink w:anchor="_Toc242043734" w:history="1">
+      <w:hyperlink w:anchor="_Toc242044436" w:history="1">
         <w:r>
           <w:rPr>
             <w:rStyle w:val="Hyperlink"/>
@@ -5224,7 +5224,7 @@
             <w:noProof/>
             <w:webHidden/>
           </w:rPr>
-          <w:instrText xml:space="preserve"> PAGEREF _Toc242043734 \h </w:instrText>
+          <w:instrText xml:space="preserve"> PAGEREF _Toc242044436 \h </w:instrText>
         </w:r>
         <w:r>
           <w:rPr>
@@ -5244,7 +5244,7 @@
             <w:noProof/>
             <w:webHidden/>
           </w:rPr>
-          <w:t>34</w:t>
+          <w:t>35</w:t>
         </w:r>
         <w:r>
           <w:rPr>
@@ -5270,7 +5270,7 @@
           <w14:ligatures w14:val="standardContextual"/>
         </w:rPr>
       </w:pPr>
-      <w:hyperlink w:anchor="_Toc242043735" w:history="1">
+      <w:hyperlink w:anchor="_Toc242044437" w:history="1">
         <w:r>
           <w:rPr>
             <w:rStyle w:val="Hyperlink"/>
@@ -5297,7 +5297,7 @@
             <w:noProof/>
             <w:webHidden/>
           </w:rPr>
-          <w:instrText xml:space="preserve"> PAGEREF _Toc242043735 \h </w:instrText>
+          <w:instrText xml:space="preserve"> PAGEREF _Toc242044437 \h </w:instrText>
         </w:r>
         <w:r>
           <w:rPr>
@@ -5317,7 +5317,7 @@
             <w:noProof/>
             <w:webHidden/>
           </w:rPr>
-          <w:t>35</w:t>
+          <w:t>36</w:t>
         </w:r>
         <w:r>
           <w:rPr>
@@ -5343,7 +5343,7 @@
           <w14:ligatures w14:val="standardContextual"/>
         </w:rPr>
       </w:pPr>
-      <w:hyperlink w:anchor="_Toc242043736" w:history="1">
+      <w:hyperlink w:anchor="_Toc242044438" w:history="1">
         <w:r>
           <w:rPr>
             <w:rStyle w:val="Hyperlink"/>
@@ -5370,7 +5370,7 @@
             <w:noProof/>
             <w:webHidden/>
           </w:rPr>
-          <w:instrText xml:space="preserve"> PAGEREF _Toc242043736 \h </w:instrText>
+          <w:instrText xml:space="preserve"> PAGEREF _Toc242044438 \h </w:instrText>
         </w:r>
         <w:r>
           <w:rPr>
@@ -5390,7 +5390,7 @@
             <w:noProof/>
             <w:webHidden/>
           </w:rPr>
-          <w:t>36</w:t>
+          <w:t>37</w:t>
         </w:r>
         <w:r>
           <w:rPr>
@@ -5416,7 +5416,7 @@
           <w14:ligatures w14:val="standardContextual"/>
         </w:rPr>
       </w:pPr>
-      <w:hyperlink w:anchor="_Toc242043737" w:history="1">
+      <w:hyperlink w:anchor="_Toc242044439" w:history="1">
         <w:r>
           <w:rPr>
             <w:rStyle w:val="Hyperlink"/>
@@ -5443,7 +5443,7 @@
             <w:noProof/>
             <w:webHidden/>
           </w:rPr>
-          <w:instrText xml:space="preserve"> PAGEREF _Toc242043737 \h </w:instrText>
+          <w:instrText xml:space="preserve"> PAGEREF _Toc242044439 \h </w:instrText>
         </w:r>
         <w:r>
           <w:rPr>
@@ -5463,7 +5463,7 @@
             <w:noProof/>
             <w:webHidden/>
           </w:rPr>
-          <w:t>37</w:t>
+          <w:t>38</w:t>
         </w:r>
         <w:r>
           <w:rPr>
@@ -5489,7 +5489,7 @@
           <w14:ligatures w14:val="standardContextual"/>
         </w:rPr>
       </w:pPr>
-      <w:hyperlink w:anchor="_Toc242043738" w:history="1">
+      <w:hyperlink w:anchor="_Toc242044440" w:history="1">
         <w:r>
           <w:rPr>
             <w:rStyle w:val="Hyperlink"/>
@@ -5516,7 +5516,7 @@
             <w:noProof/>
             <w:webHidden/>
           </w:rPr>
-          <w:instrText xml:space="preserve"> PAGEREF _Toc242043738 \h </w:instrText>
+          <w:instrText xml:space="preserve"> PAGEREF _Toc242044440 \h </w:instrText>
         </w:r>
         <w:r>
           <w:rPr>
@@ -5536,7 +5536,7 @@
             <w:noProof/>
             <w:webHidden/>
           </w:rPr>
-          <w:t>38</w:t>
+          <w:t>39</w:t>
         </w:r>
         <w:r>
           <w:rPr>
@@ -5562,7 +5562,7 @@
           <w14:ligatures w14:val="standardContextual"/>
         </w:rPr>
       </w:pPr>
-      <w:hyperlink w:anchor="_Toc242043739" w:history="1">
+      <w:hyperlink w:anchor="_Toc242044441" w:history="1">
         <w:r>
           <w:rPr>
             <w:rStyle w:val="Hyperlink"/>
@@ -5589,7 +5589,7 @@
             <w:noProof/>
             <w:webHidden/>
           </w:rPr>
-          <w:instrText xml:space="preserve"> PAGEREF _Toc242043739 \h </w:instrText>
+          <w:instrText xml:space="preserve"> PAGEREF _Toc242044441 \h </w:instrText>
         </w:r>
         <w:r>
           <w:rPr>
@@ -5609,7 +5609,7 @@
             <w:noProof/>
             <w:webHidden/>
           </w:rPr>
-          <w:t>38</w:t>
+          <w:t>39</w:t>
         </w:r>
         <w:r>
           <w:rPr>
@@ -5635,7 +5635,7 @@
           <w14:ligatures w14:val="standardContextual"/>
         </w:rPr>
       </w:pPr>
-      <w:hyperlink w:anchor="_Toc242043740" w:history="1">
+      <w:hyperlink w:anchor="_Toc242044442" w:history="1">
         <w:r>
           <w:rPr>
             <w:rStyle w:val="Hyperlink"/>
@@ -5662,7 +5662,7 @@
             <w:noProof/>
             <w:webHidden/>
           </w:rPr>
-          <w:instrText xml:space="preserve"> PAGEREF _Toc242043740 \h </w:instrText>
+          <w:instrText xml:space="preserve"> PAGEREF _Toc242044442 \h </w:instrText>
         </w:r>
         <w:r>
           <w:rPr>
@@ -5682,7 +5682,7 @@
             <w:noProof/>
             <w:webHidden/>
           </w:rPr>
-          <w:t>39</w:t>
+          <w:t>40</w:t>
         </w:r>
         <w:r>
           <w:rPr>
@@ -5708,7 +5708,7 @@
           <w14:ligatures w14:val="standardContextual"/>
         </w:rPr>
       </w:pPr>
-      <w:hyperlink w:anchor="_Toc242043741" w:history="1">
+      <w:hyperlink w:anchor="_Toc242044443" w:history="1">
         <w:r>
           <w:rPr>
             <w:rStyle w:val="Hyperlink"/>
@@ -5735,7 +5735,7 @@
             <w:noProof/>
             <w:webHidden/>
           </w:rPr>
-          <w:instrText xml:space="preserve"> PAGEREF _Toc242043741 \h </w:instrText>
+          <w:instrText xml:space="preserve"> PAGEREF _Toc242044443 \h </w:instrText>
         </w:r>
         <w:r>
           <w:rPr>
@@ -5755,7 +5755,7 @@
             <w:noProof/>
             <w:webHidden/>
           </w:rPr>
-          <w:t>40</w:t>
+          <w:t>41</w:t>
         </w:r>
         <w:r>
           <w:rPr>
@@ -5781,7 +5781,7 @@
           <w14:ligatures w14:val="standardContextual"/>
         </w:rPr>
       </w:pPr>
-      <w:hyperlink w:anchor="_Toc242043742" w:history="1">
+      <w:hyperlink w:anchor="_Toc242044444" w:history="1">
         <w:r>
           <w:rPr>
             <w:rStyle w:val="Hyperlink"/>
@@ -5808,7 +5808,7 @@
             <w:noProof/>
             <w:webHidden/>
           </w:rPr>
-          <w:instrText xml:space="preserve"> PAGEREF _Toc242043742 \h </w:instrText>
+          <w:instrText xml:space="preserve"> PAGEREF _Toc242044444 \h </w:instrText>
         </w:r>
         <w:r>
           <w:rPr>
@@ -5828,7 +5828,7 @@
             <w:noProof/>
             <w:webHidden/>
           </w:rPr>
-          <w:t>40</w:t>
+          <w:t>41</w:t>
         </w:r>
         <w:r>
           <w:rPr>
@@ -5854,7 +5854,7 @@
           <w14:ligatures w14:val="standardContextual"/>
         </w:rPr>
       </w:pPr>
-      <w:hyperlink w:anchor="_Toc242043743" w:history="1">
+      <w:hyperlink w:anchor="_Toc242044445" w:history="1">
         <w:r>
           <w:rPr>
             <w:rStyle w:val="Hyperlink"/>
@@ -5881,7 +5881,7 @@
             <w:noProof/>
             <w:webHidden/>
           </w:rPr>
-          <w:instrText xml:space="preserve"> PAGEREF _Toc242043743 \h </w:instrText>
+          <w:instrText xml:space="preserve"> PAGEREF _Toc242044445 \h </w:instrText>
         </w:r>
         <w:r>
           <w:rPr>
@@ -5901,7 +5901,7 @@
             <w:noProof/>
             <w:webHidden/>
           </w:rPr>
-          <w:t>41</w:t>
+          <w:t>42</w:t>
         </w:r>
         <w:r>
           <w:rPr>
@@ -5927,7 +5927,7 @@
           <w14:ligatures w14:val="standardContextual"/>
         </w:rPr>
       </w:pPr>
-      <w:hyperlink w:anchor="_Toc242043744" w:history="1">
+      <w:hyperlink w:anchor="_Toc242044446" w:history="1">
         <w:r>
           <w:rPr>
             <w:rStyle w:val="Hyperlink"/>
@@ -5954,7 +5954,7 @@
             <w:noProof/>
             <w:webHidden/>
           </w:rPr>
-          <w:instrText xml:space="preserve"> PAGEREF _Toc242043744 \h </w:instrText>
+          <w:instrText xml:space="preserve"> PAGEREF _Toc242044446 \h </w:instrText>
         </w:r>
         <w:r>
           <w:rPr>
@@ -5974,7 +5974,7 @@
             <w:noProof/>
             <w:webHidden/>
           </w:rPr>
-          <w:t>41</w:t>
+          <w:t>42</w:t>
         </w:r>
         <w:r>
           <w:rPr>
@@ -6000,7 +6000,7 @@
           <w14:ligatures w14:val="standardContextual"/>
         </w:rPr>
       </w:pPr>
-      <w:hyperlink w:anchor="_Toc242043745" w:history="1">
+      <w:hyperlink w:anchor="_Toc242044447" w:history="1">
         <w:r>
           <w:rPr>
             <w:rStyle w:val="Hyperlink"/>
@@ -6027,7 +6027,7 @@
             <w:noProof/>
             <w:webHidden/>
           </w:rPr>
-          <w:instrText xml:space="preserve"> PAGEREF _Toc242043745 \h </w:instrText>
+          <w:instrText xml:space="preserve"> PAGEREF _Toc242044447 \h </w:instrText>
         </w:r>
         <w:r>
           <w:rPr>
@@ -6047,7 +6047,7 @@
             <w:noProof/>
             <w:webHidden/>
           </w:rPr>
-          <w:t>42</w:t>
+          <w:t>43</w:t>
         </w:r>
         <w:r>
           <w:rPr>
@@ -6073,7 +6073,7 @@
           <w14:ligatures w14:val="standardContextual"/>
         </w:rPr>
       </w:pPr>
-      <w:hyperlink w:anchor="_Toc242043746" w:history="1">
+      <w:hyperlink w:anchor="_Toc242044448" w:history="1">
         <w:r>
           <w:rPr>
             <w:rStyle w:val="Hyperlink"/>
@@ -6100,7 +6100,7 @@
             <w:noProof/>
             <w:webHidden/>
           </w:rPr>
-          <w:instrText xml:space="preserve"> PAGEREF _Toc242043746 \h </w:instrText>
+          <w:instrText xml:space="preserve"> PAGEREF _Toc242044448 \h </w:instrText>
         </w:r>
         <w:r>
           <w:rPr>
@@ -6120,7 +6120,7 @@
             <w:noProof/>
             <w:webHidden/>
           </w:rPr>
-          <w:t>43</w:t>
+          <w:t>44</w:t>
         </w:r>
         <w:r>
           <w:rPr>
@@ -6146,7 +6146,7 @@
           <w14:ligatures w14:val="standardContextual"/>
         </w:rPr>
       </w:pPr>
-      <w:hyperlink w:anchor="_Toc242043747" w:history="1">
+      <w:hyperlink w:anchor="_Toc242044449" w:history="1">
         <w:r>
           <w:rPr>
             <w:rStyle w:val="Hyperlink"/>
@@ -6173,7 +6173,7 @@
             <w:noProof/>
             <w:webHidden/>
           </w:rPr>
-          <w:instrText xml:space="preserve"> PAGEREF _Toc242043747 \h </w:instrText>
+          <w:instrText xml:space="preserve"> PAGEREF _Toc242044449 \h </w:instrText>
         </w:r>
         <w:r>
           <w:rPr>
@@ -6193,7 +6193,7 @@
             <w:noProof/>
             <w:webHidden/>
           </w:rPr>
-          <w:t>44</w:t>
+          <w:t>45</w:t>
         </w:r>
         <w:r>
           <w:rPr>
@@ -6219,7 +6219,7 @@
           <w14:ligatures w14:val="standardContextual"/>
         </w:rPr>
       </w:pPr>
-      <w:hyperlink w:anchor="_Toc242043748" w:history="1">
+      <w:hyperlink w:anchor="_Toc242044450" w:history="1">
         <w:r>
           <w:rPr>
             <w:rStyle w:val="Hyperlink"/>
@@ -6246,7 +6246,7 @@
             <w:noProof/>
             <w:webHidden/>
           </w:rPr>
-          <w:instrText xml:space="preserve"> PAGEREF _Toc242043748 \h </w:instrText>
+          <w:instrText xml:space="preserve"> PAGEREF _Toc242044450 \h </w:instrText>
         </w:r>
         <w:r>
           <w:rPr>
@@ -6266,7 +6266,7 @@
             <w:noProof/>
             <w:webHidden/>
           </w:rPr>
-          <w:t>45</w:t>
+          <w:t>46</w:t>
         </w:r>
         <w:r>
           <w:rPr>
@@ -6292,7 +6292,7 @@
           <w14:ligatures w14:val="standardContextual"/>
         </w:rPr>
       </w:pPr>
-      <w:hyperlink w:anchor="_Toc242043749" w:history="1">
+      <w:hyperlink w:anchor="_Toc242044451" w:history="1">
         <w:r>
           <w:rPr>
             <w:rStyle w:val="Hyperlink"/>
@@ -6319,7 +6319,7 @@
             <w:noProof/>
             <w:webHidden/>
           </w:rPr>
-          <w:instrText xml:space="preserve"> PAGEREF _Toc242043749 \h </w:instrText>
+          <w:instrText xml:space="preserve"> PAGEREF _Toc242044451 \h </w:instrText>
         </w:r>
         <w:r>
           <w:rPr>
@@ -6339,7 +6339,7 @@
             <w:noProof/>
             <w:webHidden/>
           </w:rPr>
-          <w:t>46</w:t>
+          <w:t>47</w:t>
         </w:r>
         <w:r>
           <w:rPr>
@@ -6365,7 +6365,7 @@
           <w14:ligatures w14:val="standardContextual"/>
         </w:rPr>
       </w:pPr>
-      <w:hyperlink w:anchor="_Toc242043750" w:history="1">
+      <w:hyperlink w:anchor="_Toc242044452" w:history="1">
         <w:r>
           <w:rPr>
             <w:rStyle w:val="Hyperlink"/>
@@ -6392,7 +6392,7 @@
             <w:noProof/>
             <w:webHidden/>
           </w:rPr>
-          <w:instrText xml:space="preserve"> PAGEREF _Toc242043750 \h </w:instrText>
+          <w:instrText xml:space="preserve"> PAGEREF _Toc242044452 \h </w:instrText>
         </w:r>
         <w:r>
           <w:rPr>
@@ -6412,7 +6412,7 @@
             <w:noProof/>
             <w:webHidden/>
           </w:rPr>
-          <w:t>46</w:t>
+          <w:t>47</w:t>
         </w:r>
         <w:r>
           <w:rPr>
@@ -6438,7 +6438,7 @@
           <w14:ligatures w14:val="standardContextual"/>
         </w:rPr>
       </w:pPr>
-      <w:hyperlink w:anchor="_Toc242043751" w:history="1">
+      <w:hyperlink w:anchor="_Toc242044453" w:history="1">
         <w:r>
           <w:rPr>
             <w:rStyle w:val="Hyperlink"/>
@@ -6465,7 +6465,7 @@
             <w:noProof/>
             <w:webHidden/>
           </w:rPr>
-          <w:instrText xml:space="preserve"> PAGEREF _Toc242043751 \h </w:instrText>
+          <w:instrText xml:space="preserve"> PAGEREF _Toc242044453 \h </w:instrText>
         </w:r>
         <w:r>
           <w:rPr>
@@ -6485,7 +6485,7 @@
             <w:noProof/>
             <w:webHidden/>
           </w:rPr>
-          <w:t>46</w:t>
+          <w:t>47</w:t>
         </w:r>
         <w:r>
           <w:rPr>
@@ -6511,7 +6511,7 @@
           <w14:ligatures w14:val="standardContextual"/>
         </w:rPr>
       </w:pPr>
-      <w:hyperlink w:anchor="_Toc242043752" w:history="1">
+      <w:hyperlink w:anchor="_Toc242044454" w:history="1">
         <w:r>
           <w:rPr>
             <w:rStyle w:val="Hyperlink"/>
@@ -6538,7 +6538,7 @@
             <w:noProof/>
             <w:webHidden/>
           </w:rPr>
-          <w:instrText xml:space="preserve"> PAGEREF _Toc242043752 \h </w:instrText>
+          <w:instrText xml:space="preserve"> PAGEREF _Toc242044454 \h </w:instrText>
         </w:r>
         <w:r>
           <w:rPr>
@@ -6558,7 +6558,7 @@
             <w:noProof/>
             <w:webHidden/>
           </w:rPr>
-          <w:t>47</w:t>
+          <w:t>48</w:t>
         </w:r>
         <w:r>
           <w:rPr>
@@ -6584,7 +6584,7 @@
           <w14:ligatures w14:val="standardContextual"/>
         </w:rPr>
       </w:pPr>
-      <w:hyperlink w:anchor="_Toc242043753" w:history="1">
+      <w:hyperlink w:anchor="_Toc242044455" w:history="1">
         <w:r>
           <w:rPr>
             <w:rStyle w:val="Hyperlink"/>
@@ -6611,7 +6611,7 @@
             <w:noProof/>
             <w:webHidden/>
           </w:rPr>
-          <w:instrText xml:space="preserve"> PAGEREF _Toc242043753 \h </w:instrText>
+          <w:instrText xml:space="preserve"> PAGEREF _Toc242044455 \h </w:instrText>
         </w:r>
         <w:r>
           <w:rPr>
@@ -6631,7 +6631,7 @@
             <w:noProof/>
             <w:webHidden/>
           </w:rPr>
-          <w:t>49</w:t>
+          <w:t>50</w:t>
         </w:r>
         <w:r>
           <w:rPr>
@@ -6657,7 +6657,7 @@
           <w14:ligatures w14:val="standardContextual"/>
         </w:rPr>
       </w:pPr>
-      <w:hyperlink w:anchor="_Toc242043754" w:history="1">
+      <w:hyperlink w:anchor="_Toc242044456" w:history="1">
         <w:r>
           <w:rPr>
             <w:rStyle w:val="Hyperlink"/>
@@ -6684,7 +6684,7 @@
             <w:noProof/>
             <w:webHidden/>
           </w:rPr>
-          <w:instrText xml:space="preserve"> PAGEREF _Toc242043754 \h </w:instrText>
+          <w:instrText xml:space="preserve"> PAGEREF _Toc242044456 \h </w:instrText>
         </w:r>
         <w:r>
           <w:rPr>
@@ -6704,7 +6704,7 @@
             <w:noProof/>
             <w:webHidden/>
           </w:rPr>
-          <w:t>50</w:t>
+          <w:t>51</w:t>
         </w:r>
         <w:r>
           <w:rPr>
@@ -6760,7 +6760,7 @@
       <w:r>
         <w:fldChar w:fldCharType="separate"/>
       </w:r>
-      <w:hyperlink w:anchor="_Toc242043755" w:history="1">
+      <w:hyperlink w:anchor="_Toc242044457" w:history="1">
         <w:r>
           <w:rPr>
             <w:rStyle w:val="Hyperlink"/>
@@ -6787,7 +6787,7 @@
             <w:noProof/>
             <w:webHidden/>
           </w:rPr>
-          <w:instrText xml:space="preserve"> PAGEREF _Toc242043755 \h </w:instrText>
+          <w:instrText xml:space="preserve"> PAGEREF _Toc242044457 \h </w:instrText>
         </w:r>
         <w:r>
           <w:rPr>
@@ -6807,7 +6807,7 @@
             <w:noProof/>
             <w:webHidden/>
           </w:rPr>
-          <w:t>21</w:t>
+          <w:t>22</w:t>
         </w:r>
         <w:r>
           <w:rPr>
@@ -6833,7 +6833,7 @@
           <w14:ligatures w14:val="standardContextual"/>
         </w:rPr>
       </w:pPr>
-      <w:hyperlink w:anchor="_Toc242043756" w:history="1">
+      <w:hyperlink w:anchor="_Toc242044458" w:history="1">
         <w:r>
           <w:rPr>
             <w:rStyle w:val="Hyperlink"/>
@@ -6860,7 +6860,7 @@
             <w:noProof/>
             <w:webHidden/>
           </w:rPr>
-          <w:instrText xml:space="preserve"> PAGEREF _Toc242043756 \h </w:instrText>
+          <w:instrText xml:space="preserve"> PAGEREF _Toc242044458 \h </w:instrText>
         </w:r>
         <w:r>
           <w:rPr>
@@ -6880,7 +6880,7 @@
             <w:noProof/>
             <w:webHidden/>
           </w:rPr>
-          <w:t>22</w:t>
+          <w:t>23</w:t>
         </w:r>
         <w:r>
           <w:rPr>
@@ -6906,7 +6906,7 @@
           <w14:ligatures w14:val="standardContextual"/>
         </w:rPr>
       </w:pPr>
-      <w:hyperlink w:anchor="_Toc242043757" w:history="1">
+      <w:hyperlink w:anchor="_Toc242044459" w:history="1">
         <w:r>
           <w:rPr>
             <w:rStyle w:val="Hyperlink"/>
@@ -6933,7 +6933,7 @@
             <w:noProof/>
             <w:webHidden/>
           </w:rPr>
-          <w:instrText xml:space="preserve"> PAGEREF _Toc242043757 \h </w:instrText>
+          <w:instrText xml:space="preserve"> PAGEREF _Toc242044459 \h </w:instrText>
         </w:r>
         <w:r>
           <w:rPr>
@@ -6953,7 +6953,7 @@
             <w:noProof/>
             <w:webHidden/>
           </w:rPr>
-          <w:t>24</w:t>
+          <w:t>25</w:t>
         </w:r>
         <w:r>
           <w:rPr>
@@ -6979,7 +6979,7 @@
           <w14:ligatures w14:val="standardContextual"/>
         </w:rPr>
       </w:pPr>
-      <w:hyperlink w:anchor="_Toc242043758" w:history="1">
+      <w:hyperlink w:anchor="_Toc242044460" w:history="1">
         <w:r>
           <w:rPr>
             <w:rStyle w:val="Hyperlink"/>
@@ -7006,7 +7006,7 @@
             <w:noProof/>
             <w:webHidden/>
           </w:rPr>
-          <w:instrText xml:space="preserve"> PAGEREF _Toc242043758 \h </w:instrText>
+          <w:instrText xml:space="preserve"> PAGEREF _Toc242044460 \h </w:instrText>
         </w:r>
         <w:r>
           <w:rPr>
@@ -7026,7 +7026,7 @@
             <w:noProof/>
             <w:webHidden/>
           </w:rPr>
-          <w:t>24</w:t>
+          <w:t>25</w:t>
         </w:r>
         <w:r>
           <w:rPr>
@@ -7052,7 +7052,7 @@
           <w14:ligatures w14:val="standardContextual"/>
         </w:rPr>
       </w:pPr>
-      <w:hyperlink w:anchor="_Toc242043759" w:history="1">
+      <w:hyperlink w:anchor="_Toc242044461" w:history="1">
         <w:r>
           <w:rPr>
             <w:rStyle w:val="Hyperlink"/>
@@ -7079,7 +7079,7 @@
             <w:noProof/>
             <w:webHidden/>
           </w:rPr>
-          <w:instrText xml:space="preserve"> PAGEREF _Toc242043759 \h </w:instrText>
+          <w:instrText xml:space="preserve"> PAGEREF _Toc242044461 \h </w:instrText>
         </w:r>
         <w:r>
           <w:rPr>
@@ -7099,7 +7099,7 @@
             <w:noProof/>
             <w:webHidden/>
           </w:rPr>
-          <w:t>25</w:t>
+          <w:t>26</w:t>
         </w:r>
         <w:r>
           <w:rPr>
@@ -7125,7 +7125,7 @@
           <w14:ligatures w14:val="standardContextual"/>
         </w:rPr>
       </w:pPr>
-      <w:hyperlink w:anchor="_Toc242043760" w:history="1">
+      <w:hyperlink w:anchor="_Toc242044462" w:history="1">
         <w:r>
           <w:rPr>
             <w:rStyle w:val="Hyperlink"/>
@@ -7152,7 +7152,7 @@
             <w:noProof/>
             <w:webHidden/>
           </w:rPr>
-          <w:instrText xml:space="preserve"> PAGEREF _Toc242043760 \h </w:instrText>
+          <w:instrText xml:space="preserve"> PAGEREF _Toc242044462 \h </w:instrText>
         </w:r>
         <w:r>
           <w:rPr>
@@ -7172,7 +7172,7 @@
             <w:noProof/>
             <w:webHidden/>
           </w:rPr>
-          <w:t>27</w:t>
+          <w:t>28</w:t>
         </w:r>
         <w:r>
           <w:rPr>
@@ -7198,7 +7198,7 @@
           <w14:ligatures w14:val="standardContextual"/>
         </w:rPr>
       </w:pPr>
-      <w:hyperlink w:anchor="_Toc242043761" w:history="1">
+      <w:hyperlink w:anchor="_Toc242044463" w:history="1">
         <w:r>
           <w:rPr>
             <w:rStyle w:val="Hyperlink"/>
@@ -7225,7 +7225,7 @@
             <w:noProof/>
             <w:webHidden/>
           </w:rPr>
-          <w:instrText xml:space="preserve"> PAGEREF _Toc242043761 \h </w:instrText>
+          <w:instrText xml:space="preserve"> PAGEREF _Toc242044463 \h </w:instrText>
         </w:r>
         <w:r>
           <w:rPr>
@@ -7245,7 +7245,7 @@
             <w:noProof/>
             <w:webHidden/>
           </w:rPr>
-          <w:t>28</w:t>
+          <w:t>29</w:t>
         </w:r>
         <w:r>
           <w:rPr>
@@ -7271,7 +7271,7 @@
           <w14:ligatures w14:val="standardContextual"/>
         </w:rPr>
       </w:pPr>
-      <w:hyperlink w:anchor="_Toc242043762" w:history="1">
+      <w:hyperlink w:anchor="_Toc242044464" w:history="1">
         <w:r>
           <w:rPr>
             <w:rStyle w:val="Hyperlink"/>
@@ -7298,7 +7298,7 @@
             <w:noProof/>
             <w:webHidden/>
           </w:rPr>
-          <w:instrText xml:space="preserve"> PAGEREF _Toc242043762 \h </w:instrText>
+          <w:instrText xml:space="preserve"> PAGEREF _Toc242044464 \h </w:instrText>
         </w:r>
         <w:r>
           <w:rPr>
@@ -7318,7 +7318,7 @@
             <w:noProof/>
             <w:webHidden/>
           </w:rPr>
-          <w:t>29</w:t>
+          <w:t>30</w:t>
         </w:r>
         <w:r>
           <w:rPr>
@@ -7344,7 +7344,7 @@
           <w14:ligatures w14:val="standardContextual"/>
         </w:rPr>
       </w:pPr>
-      <w:hyperlink w:anchor="_Toc242043763" w:history="1">
+      <w:hyperlink w:anchor="_Toc242044465" w:history="1">
         <w:r>
           <w:rPr>
             <w:rStyle w:val="Hyperlink"/>
@@ -7371,7 +7371,7 @@
             <w:noProof/>
             <w:webHidden/>
           </w:rPr>
-          <w:instrText xml:space="preserve"> PAGEREF _Toc242043763 \h </w:instrText>
+          <w:instrText xml:space="preserve"> PAGEREF _Toc242044465 \h </w:instrText>
         </w:r>
         <w:r>
           <w:rPr>
@@ -7391,7 +7391,7 @@
             <w:noProof/>
             <w:webHidden/>
           </w:rPr>
-          <w:t>31</w:t>
+          <w:t>32</w:t>
         </w:r>
         <w:r>
           <w:rPr>
@@ -7417,7 +7417,7 @@
           <w14:ligatures w14:val="standardContextual"/>
         </w:rPr>
       </w:pPr>
-      <w:hyperlink w:anchor="_Toc242043764" w:history="1">
+      <w:hyperlink w:anchor="_Toc242044466" w:history="1">
         <w:r>
           <w:rPr>
             <w:rStyle w:val="Hyperlink"/>
@@ -7444,7 +7444,7 @@
             <w:noProof/>
             <w:webHidden/>
           </w:rPr>
-          <w:instrText xml:space="preserve"> PAGEREF _Toc242043764 \h </w:instrText>
+          <w:instrText xml:space="preserve"> PAGEREF _Toc242044466 \h </w:instrText>
         </w:r>
         <w:r>
           <w:rPr>
@@ -7464,7 +7464,7 @@
             <w:noProof/>
             <w:webHidden/>
           </w:rPr>
-          <w:t>32</w:t>
+          <w:t>33</w:t>
         </w:r>
         <w:r>
           <w:rPr>
@@ -7490,7 +7490,7 @@
           <w14:ligatures w14:val="standardContextual"/>
         </w:rPr>
       </w:pPr>
-      <w:hyperlink w:anchor="_Toc242043765" w:history="1">
+      <w:hyperlink w:anchor="_Toc242044467" w:history="1">
         <w:r>
           <w:rPr>
             <w:rStyle w:val="Hyperlink"/>
@@ -7517,7 +7517,7 @@
             <w:noProof/>
             <w:webHidden/>
           </w:rPr>
-          <w:instrText xml:space="preserve"> PAGEREF _Toc242043765 \h </w:instrText>
+          <w:instrText xml:space="preserve"> PAGEREF _Toc242044467 \h </w:instrText>
         </w:r>
         <w:r>
           <w:rPr>
@@ -7537,7 +7537,7 @@
             <w:noProof/>
             <w:webHidden/>
           </w:rPr>
-          <w:t>33</w:t>
+          <w:t>34</w:t>
         </w:r>
         <w:r>
           <w:rPr>
@@ -7563,7 +7563,7 @@
           <w14:ligatures w14:val="standardContextual"/>
         </w:rPr>
       </w:pPr>
-      <w:hyperlink w:anchor="_Toc242043766" w:history="1">
+      <w:hyperlink w:anchor="_Toc242044468" w:history="1">
         <w:r>
           <w:rPr>
             <w:rStyle w:val="Hyperlink"/>
@@ -7590,7 +7590,7 @@
             <w:noProof/>
             <w:webHidden/>
           </w:rPr>
-          <w:instrText xml:space="preserve"> PAGEREF _Toc242043766 \h </w:instrText>
+          <w:instrText xml:space="preserve"> PAGEREF _Toc242044468 \h </w:instrText>
         </w:r>
         <w:r>
           <w:rPr>
@@ -7610,7 +7610,7 @@
             <w:noProof/>
             <w:webHidden/>
           </w:rPr>
-          <w:t>35</w:t>
+          <w:t>36</w:t>
         </w:r>
         <w:r>
           <w:rPr>
@@ -7636,7 +7636,7 @@
           <w14:ligatures w14:val="standardContextual"/>
         </w:rPr>
       </w:pPr>
-      <w:hyperlink w:anchor="_Toc242043767" w:history="1">
+      <w:hyperlink w:anchor="_Toc242044469" w:history="1">
         <w:r>
           <w:rPr>
             <w:rStyle w:val="Hyperlink"/>
@@ -7663,7 +7663,7 @@
             <w:noProof/>
             <w:webHidden/>
           </w:rPr>
-          <w:instrText xml:space="preserve"> PAGEREF _Toc242043767 \h </w:instrText>
+          <w:instrText xml:space="preserve"> PAGEREF _Toc242044469 \h </w:instrText>
         </w:r>
         <w:r>
           <w:rPr>
@@ -7683,7 +7683,7 @@
             <w:noProof/>
             <w:webHidden/>
           </w:rPr>
-          <w:t>36</w:t>
+          <w:t>37</w:t>
         </w:r>
         <w:r>
           <w:rPr>
@@ -7709,7 +7709,7 @@
           <w14:ligatures w14:val="standardContextual"/>
         </w:rPr>
       </w:pPr>
-      <w:hyperlink w:anchor="_Toc242043768" w:history="1">
+      <w:hyperlink w:anchor="_Toc242044470" w:history="1">
         <w:r>
           <w:rPr>
             <w:rStyle w:val="Hyperlink"/>
@@ -7736,7 +7736,7 @@
             <w:noProof/>
             <w:webHidden/>
           </w:rPr>
-          <w:instrText xml:space="preserve"> PAGEREF _Toc242043768 \h </w:instrText>
+          <w:instrText xml:space="preserve"> PAGEREF _Toc242044470 \h </w:instrText>
         </w:r>
         <w:r>
           <w:rPr>
@@ -7756,7 +7756,7 @@
             <w:noProof/>
             <w:webHidden/>
           </w:rPr>
-          <w:t>37</w:t>
+          <w:t>38</w:t>
         </w:r>
         <w:r>
           <w:rPr>
@@ -7782,7 +7782,7 @@
           <w14:ligatures w14:val="standardContextual"/>
         </w:rPr>
       </w:pPr>
-      <w:hyperlink w:anchor="_Toc242043769" w:history="1">
+      <w:hyperlink w:anchor="_Toc242044471" w:history="1">
         <w:r>
           <w:rPr>
             <w:rStyle w:val="Hyperlink"/>
@@ -7809,7 +7809,7 @@
             <w:noProof/>
             <w:webHidden/>
           </w:rPr>
-          <w:instrText xml:space="preserve"> PAGEREF _Toc242043769 \h </w:instrText>
+          <w:instrText xml:space="preserve"> PAGEREF _Toc242044471 \h </w:instrText>
         </w:r>
         <w:r>
           <w:rPr>
@@ -7829,7 +7829,7 @@
             <w:noProof/>
             <w:webHidden/>
           </w:rPr>
-          <w:t>37</w:t>
+          <w:t>38</w:t>
         </w:r>
         <w:r>
           <w:rPr>
@@ -7855,7 +7855,7 @@
           <w14:ligatures w14:val="standardContextual"/>
         </w:rPr>
       </w:pPr>
-      <w:hyperlink w:anchor="_Toc242043770" w:history="1">
+      <w:hyperlink w:anchor="_Toc242044472" w:history="1">
         <w:r>
           <w:rPr>
             <w:rStyle w:val="Hyperlink"/>
@@ -7882,7 +7882,7 @@
             <w:noProof/>
             <w:webHidden/>
           </w:rPr>
-          <w:instrText xml:space="preserve"> PAGEREF _Toc242043770 \h </w:instrText>
+          <w:instrText xml:space="preserve"> PAGEREF _Toc242044472 \h </w:instrText>
         </w:r>
         <w:r>
           <w:rPr>
@@ -7902,7 +7902,7 @@
             <w:noProof/>
             <w:webHidden/>
           </w:rPr>
-          <w:t>39</w:t>
+          <w:t>40</w:t>
         </w:r>
         <w:r>
           <w:rPr>
@@ -7928,7 +7928,7 @@
           <w14:ligatures w14:val="standardContextual"/>
         </w:rPr>
       </w:pPr>
-      <w:hyperlink w:anchor="_Toc242043771" w:history="1">
+      <w:hyperlink w:anchor="_Toc242044473" w:history="1">
         <w:r>
           <w:rPr>
             <w:rStyle w:val="Hyperlink"/>
@@ -7955,7 +7955,7 @@
             <w:noProof/>
             <w:webHidden/>
           </w:rPr>
-          <w:instrText xml:space="preserve"> PAGEREF _Toc242043771 \h </w:instrText>
+          <w:instrText xml:space="preserve"> PAGEREF _Toc242044473 \h </w:instrText>
         </w:r>
         <w:r>
           <w:rPr>
@@ -7975,7 +7975,7 @@
             <w:noProof/>
             <w:webHidden/>
           </w:rPr>
-          <w:t>39</w:t>
+          <w:t>40</w:t>
         </w:r>
         <w:r>
           <w:rPr>
@@ -8001,7 +8001,7 @@
           <w14:ligatures w14:val="standardContextual"/>
         </w:rPr>
       </w:pPr>
-      <w:hyperlink w:anchor="_Toc242043772" w:history="1">
+      <w:hyperlink w:anchor="_Toc242044474" w:history="1">
         <w:r>
           <w:rPr>
             <w:rStyle w:val="Hyperlink"/>
@@ -8028,7 +8028,7 @@
             <w:noProof/>
             <w:webHidden/>
           </w:rPr>
-          <w:instrText xml:space="preserve"> PAGEREF _Toc242043772 \h </w:instrText>
+          <w:instrText xml:space="preserve"> PAGEREF _Toc242044474 \h </w:instrText>
         </w:r>
         <w:r>
           <w:rPr>
@@ -8048,7 +8048,7 @@
             <w:noProof/>
             <w:webHidden/>
           </w:rPr>
-          <w:t>40</w:t>
+          <w:t>41</w:t>
         </w:r>
         <w:r>
           <w:rPr>
@@ -8074,7 +8074,7 @@
           <w14:ligatures w14:val="standardContextual"/>
         </w:rPr>
       </w:pPr>
-      <w:hyperlink w:anchor="_Toc242043773" w:history="1">
+      <w:hyperlink w:anchor="_Toc242044475" w:history="1">
         <w:r>
           <w:rPr>
             <w:rStyle w:val="Hyperlink"/>
@@ -8101,7 +8101,7 @@
             <w:noProof/>
             <w:webHidden/>
           </w:rPr>
-          <w:instrText xml:space="preserve"> PAGEREF _Toc242043773 \h </w:instrText>
+          <w:instrText xml:space="preserve"> PAGEREF _Toc242044475 \h </w:instrText>
         </w:r>
         <w:r>
           <w:rPr>
@@ -8121,7 +8121,7 @@
             <w:noProof/>
             <w:webHidden/>
           </w:rPr>
-          <w:t>42</w:t>
+          <w:t>43</w:t>
         </w:r>
         <w:r>
           <w:rPr>
@@ -8147,7 +8147,7 @@
           <w14:ligatures w14:val="standardContextual"/>
         </w:rPr>
       </w:pPr>
-      <w:hyperlink w:anchor="_Toc242043774" w:history="1">
+      <w:hyperlink w:anchor="_Toc242044476" w:history="1">
         <w:r>
           <w:rPr>
             <w:rStyle w:val="Hyperlink"/>
@@ -8174,7 +8174,7 @@
             <w:noProof/>
             <w:webHidden/>
           </w:rPr>
-          <w:instrText xml:space="preserve"> PAGEREF _Toc242043774 \h </w:instrText>
+          <w:instrText xml:space="preserve"> PAGEREF _Toc242044476 \h </w:instrText>
         </w:r>
         <w:r>
           <w:rPr>
@@ -8194,7 +8194,7 @@
             <w:noProof/>
             <w:webHidden/>
           </w:rPr>
-          <w:t>42</w:t>
+          <w:t>43</w:t>
         </w:r>
         <w:r>
           <w:rPr>
@@ -8220,7 +8220,7 @@
           <w14:ligatures w14:val="standardContextual"/>
         </w:rPr>
       </w:pPr>
-      <w:hyperlink w:anchor="_Toc242043775" w:history="1">
+      <w:hyperlink w:anchor="_Toc242044477" w:history="1">
         <w:r>
           <w:rPr>
             <w:rStyle w:val="Hyperlink"/>
@@ -8247,7 +8247,7 @@
             <w:noProof/>
             <w:webHidden/>
           </w:rPr>
-          <w:instrText xml:space="preserve"> PAGEREF _Toc242043775 \h </w:instrText>
+          <w:instrText xml:space="preserve"> PAGEREF _Toc242044477 \h </w:instrText>
         </w:r>
         <w:r>
           <w:rPr>
@@ -8267,7 +8267,7 @@
             <w:noProof/>
             <w:webHidden/>
           </w:rPr>
-          <w:t>43</w:t>
+          <w:t>44</w:t>
         </w:r>
         <w:r>
           <w:rPr>
@@ -8293,7 +8293,7 @@
           <w14:ligatures w14:val="standardContextual"/>
         </w:rPr>
       </w:pPr>
-      <w:hyperlink w:anchor="_Toc242043776" w:history="1">
+      <w:hyperlink w:anchor="_Toc242044478" w:history="1">
         <w:r>
           <w:rPr>
             <w:rStyle w:val="Hyperlink"/>
@@ -8320,7 +8320,7 @@
             <w:noProof/>
             <w:webHidden/>
           </w:rPr>
-          <w:instrText xml:space="preserve"> PAGEREF _Toc242043776 \h </w:instrText>
+          <w:instrText xml:space="preserve"> PAGEREF _Toc242044478 \h </w:instrText>
         </w:r>
         <w:r>
           <w:rPr>
@@ -8340,7 +8340,7 @@
             <w:noProof/>
             <w:webHidden/>
           </w:rPr>
-          <w:t>44</w:t>
+          <w:t>45</w:t>
         </w:r>
         <w:r>
           <w:rPr>
@@ -8366,7 +8366,7 @@
           <w14:ligatures w14:val="standardContextual"/>
         </w:rPr>
       </w:pPr>
-      <w:hyperlink w:anchor="_Toc242043777" w:history="1">
+      <w:hyperlink w:anchor="_Toc242044479" w:history="1">
         <w:r>
           <w:rPr>
             <w:rStyle w:val="Hyperlink"/>
@@ -8393,7 +8393,7 @@
             <w:noProof/>
             <w:webHidden/>
           </w:rPr>
-          <w:instrText xml:space="preserve"> PAGEREF _Toc242043777 \h </w:instrText>
+          <w:instrText xml:space="preserve"> PAGEREF _Toc242044479 \h </w:instrText>
         </w:r>
         <w:r>
           <w:rPr>
@@ -8413,7 +8413,7 @@
             <w:noProof/>
             <w:webHidden/>
           </w:rPr>
-          <w:t>45</w:t>
+          <w:t>46</w:t>
         </w:r>
         <w:r>
           <w:rPr>
@@ -8467,7 +8467,7 @@
       <w:r>
         <w:fldChar w:fldCharType="separate"/>
       </w:r>
-      <w:hyperlink w:anchor="_Toc242043778" w:history="1">
+      <w:hyperlink w:anchor="_Toc242044480" w:history="1">
         <w:r>
           <w:rPr>
             <w:rStyle w:val="Hyperlink"/>
@@ -8494,7 +8494,7 @@
             <w:noProof/>
             <w:webHidden/>
           </w:rPr>
-          <w:instrText xml:space="preserve"> PAGEREF _Toc242043778 \h </w:instrText>
+          <w:instrText xml:space="preserve"> PAGEREF _Toc242044480 \h </w:instrText>
         </w:r>
         <w:r>
           <w:rPr>
@@ -8540,7 +8540,7 @@
           <w14:ligatures w14:val="standardContextual"/>
         </w:rPr>
       </w:pPr>
-      <w:hyperlink w:anchor="_Toc242043779" w:history="1">
+      <w:hyperlink w:anchor="_Toc242044481" w:history="1">
         <w:r>
           <w:rPr>
             <w:rStyle w:val="Hyperlink"/>
@@ -8567,7 +8567,7 @@
             <w:noProof/>
             <w:webHidden/>
           </w:rPr>
-          <w:instrText xml:space="preserve"> PAGEREF _Toc242043779 \h </w:instrText>
+          <w:instrText xml:space="preserve"> PAGEREF _Toc242044481 \h </w:instrText>
         </w:r>
         <w:r>
           <w:rPr>
@@ -8613,7 +8613,7 @@
           <w14:ligatures w14:val="standardContextual"/>
         </w:rPr>
       </w:pPr>
-      <w:hyperlink w:anchor="_Toc242043780" w:history="1">
+      <w:hyperlink w:anchor="_Toc242044482" w:history="1">
         <w:r>
           <w:rPr>
             <w:rStyle w:val="Hyperlink"/>
@@ -8640,7 +8640,7 @@
             <w:noProof/>
             <w:webHidden/>
           </w:rPr>
-          <w:instrText xml:space="preserve"> PAGEREF _Toc242043780 \h </w:instrText>
+          <w:instrText xml:space="preserve"> PAGEREF _Toc242044482 \h </w:instrText>
         </w:r>
         <w:r>
           <w:rPr>
@@ -8686,7 +8686,7 @@
           <w14:ligatures w14:val="standardContextual"/>
         </w:rPr>
       </w:pPr>
-      <w:hyperlink w:anchor="_Toc242043781" w:history="1">
+      <w:hyperlink w:anchor="_Toc242044483" w:history="1">
         <w:r>
           <w:rPr>
             <w:rStyle w:val="Hyperlink"/>
@@ -8713,7 +8713,7 @@
             <w:noProof/>
             <w:webHidden/>
           </w:rPr>
-          <w:instrText xml:space="preserve"> PAGEREF _Toc242043781 \h </w:instrText>
+          <w:instrText xml:space="preserve"> PAGEREF _Toc242044483 \h </w:instrText>
         </w:r>
         <w:r>
           <w:rPr>
@@ -8759,7 +8759,7 @@
           <w14:ligatures w14:val="standardContextual"/>
         </w:rPr>
       </w:pPr>
-      <w:hyperlink w:anchor="_Toc242043782" w:history="1">
+      <w:hyperlink w:anchor="_Toc242044484" w:history="1">
         <w:r>
           <w:rPr>
             <w:rStyle w:val="Hyperlink"/>
@@ -8786,7 +8786,7 @@
             <w:noProof/>
             <w:webHidden/>
           </w:rPr>
-          <w:instrText xml:space="preserve"> PAGEREF _Toc242043782 \h </w:instrText>
+          <w:instrText xml:space="preserve"> PAGEREF _Toc242044484 \h </w:instrText>
         </w:r>
         <w:r>
           <w:rPr>
@@ -8832,7 +8832,7 @@
           <w14:ligatures w14:val="standardContextual"/>
         </w:rPr>
       </w:pPr>
-      <w:hyperlink w:anchor="_Toc242043783" w:history="1">
+      <w:hyperlink w:anchor="_Toc242044485" w:history="1">
         <w:r>
           <w:rPr>
             <w:rStyle w:val="Hyperlink"/>
@@ -8859,7 +8859,7 @@
             <w:noProof/>
             <w:webHidden/>
           </w:rPr>
-          <w:instrText xml:space="preserve"> PAGEREF _Toc242043783 \h </w:instrText>
+          <w:instrText xml:space="preserve"> PAGEREF _Toc242044485 \h </w:instrText>
         </w:r>
         <w:r>
           <w:rPr>
@@ -8879,7 +8879,7 @@
             <w:noProof/>
             <w:webHidden/>
           </w:rPr>
-          <w:t>19</w:t>
+          <w:t>20</w:t>
         </w:r>
         <w:r>
           <w:rPr>
@@ -8905,7 +8905,7 @@
           <w14:ligatures w14:val="standardContextual"/>
         </w:rPr>
       </w:pPr>
-      <w:hyperlink w:anchor="_Toc242043784" w:history="1">
+      <w:hyperlink w:anchor="_Toc242044486" w:history="1">
         <w:r>
           <w:rPr>
             <w:rStyle w:val="Hyperlink"/>
@@ -8940,7 +8940,7 @@
             <w:noProof/>
             <w:webHidden/>
           </w:rPr>
-          <w:instrText xml:space="preserve"> PAGEREF _Toc242043784 \h </w:instrText>
+          <w:instrText xml:space="preserve"> PAGEREF _Toc242044486 \h </w:instrText>
         </w:r>
         <w:r>
           <w:rPr>
@@ -8960,7 +8960,7 @@
             <w:noProof/>
             <w:webHidden/>
           </w:rPr>
-          <w:t>22</w:t>
+          <w:t>23</w:t>
         </w:r>
         <w:r>
           <w:rPr>
@@ -8986,7 +8986,7 @@
           <w14:ligatures w14:val="standardContextual"/>
         </w:rPr>
       </w:pPr>
-      <w:hyperlink w:anchor="_Toc242043785" w:history="1">
+      <w:hyperlink w:anchor="_Toc242044487" w:history="1">
         <w:r>
           <w:rPr>
             <w:rStyle w:val="Hyperlink"/>
@@ -9013,7 +9013,7 @@
             <w:noProof/>
             <w:webHidden/>
           </w:rPr>
-          <w:instrText xml:space="preserve"> PAGEREF _Toc242043785 \h </w:instrText>
+          <w:instrText xml:space="preserve"> PAGEREF _Toc242044487 \h </w:instrText>
         </w:r>
         <w:r>
           <w:rPr>
@@ -9033,7 +9033,7 @@
             <w:noProof/>
             <w:webHidden/>
           </w:rPr>
-          <w:t>22</w:t>
+          <w:t>23</w:t>
         </w:r>
         <w:r>
           <w:rPr>
@@ -9059,7 +9059,7 @@
           <w14:ligatures w14:val="standardContextual"/>
         </w:rPr>
       </w:pPr>
-      <w:hyperlink w:anchor="_Toc242043786" w:history="1">
+      <w:hyperlink w:anchor="_Toc242044488" w:history="1">
         <w:r>
           <w:rPr>
             <w:rStyle w:val="Hyperlink"/>
@@ -9086,7 +9086,7 @@
             <w:noProof/>
             <w:webHidden/>
           </w:rPr>
-          <w:instrText xml:space="preserve"> PAGEREF _Toc242043786 \h </w:instrText>
+          <w:instrText xml:space="preserve"> PAGEREF _Toc242044488 \h </w:instrText>
         </w:r>
         <w:r>
           <w:rPr>
@@ -9106,7 +9106,7 @@
             <w:noProof/>
             <w:webHidden/>
           </w:rPr>
-          <w:t>23</w:t>
+          <w:t>24</w:t>
         </w:r>
         <w:r>
           <w:rPr>
@@ -9132,7 +9132,7 @@
           <w14:ligatures w14:val="standardContextual"/>
         </w:rPr>
       </w:pPr>
-      <w:hyperlink w:anchor="_Toc242043787" w:history="1">
+      <w:hyperlink w:anchor="_Toc242044489" w:history="1">
         <w:r>
           <w:rPr>
             <w:rStyle w:val="Hyperlink"/>
@@ -9159,7 +9159,7 @@
             <w:noProof/>
             <w:webHidden/>
           </w:rPr>
-          <w:instrText xml:space="preserve"> PAGEREF _Toc242043787 \h </w:instrText>
+          <w:instrText xml:space="preserve"> PAGEREF _Toc242044489 \h </w:instrText>
         </w:r>
         <w:r>
           <w:rPr>
@@ -9179,7 +9179,7 @@
             <w:noProof/>
             <w:webHidden/>
           </w:rPr>
-          <w:t>25</w:t>
+          <w:t>26</w:t>
         </w:r>
         <w:r>
           <w:rPr>
@@ -9205,7 +9205,7 @@
           <w14:ligatures w14:val="standardContextual"/>
         </w:rPr>
       </w:pPr>
-      <w:hyperlink w:anchor="_Toc242043788" w:history="1">
+      <w:hyperlink w:anchor="_Toc242044490" w:history="1">
         <w:r>
           <w:rPr>
             <w:rStyle w:val="Hyperlink"/>
@@ -9232,7 +9232,7 @@
             <w:noProof/>
             <w:webHidden/>
           </w:rPr>
-          <w:instrText xml:space="preserve"> PAGEREF _Toc242043788 \h </w:instrText>
+          <w:instrText xml:space="preserve"> PAGEREF _Toc242044490 \h </w:instrText>
         </w:r>
         <w:r>
           <w:rPr>
@@ -9252,7 +9252,7 @@
             <w:noProof/>
             <w:webHidden/>
           </w:rPr>
-          <w:t>27</w:t>
+          <w:t>28</w:t>
         </w:r>
         <w:r>
           <w:rPr>
@@ -9278,7 +9278,7 @@
           <w14:ligatures w14:val="standardContextual"/>
         </w:rPr>
       </w:pPr>
-      <w:hyperlink w:anchor="_Toc242043789" w:history="1">
+      <w:hyperlink w:anchor="_Toc242044491" w:history="1">
         <w:r>
           <w:rPr>
             <w:rStyle w:val="Hyperlink"/>
@@ -9305,7 +9305,7 @@
             <w:noProof/>
             <w:webHidden/>
           </w:rPr>
-          <w:instrText xml:space="preserve"> PAGEREF _Toc242043789 \h </w:instrText>
+          <w:instrText xml:space="preserve"> PAGEREF _Toc242044491 \h </w:instrText>
         </w:r>
         <w:r>
           <w:rPr>
@@ -9325,7 +9325,7 @@
             <w:noProof/>
             <w:webHidden/>
           </w:rPr>
-          <w:t>29</w:t>
+          <w:t>30</w:t>
         </w:r>
         <w:r>
           <w:rPr>
@@ -9351,7 +9351,7 @@
           <w14:ligatures w14:val="standardContextual"/>
         </w:rPr>
       </w:pPr>
-      <w:hyperlink w:anchor="_Toc242043790" w:history="1">
+      <w:hyperlink w:anchor="_Toc242044492" w:history="1">
         <w:r>
           <w:rPr>
             <w:rStyle w:val="Hyperlink"/>
@@ -9378,7 +9378,7 @@
             <w:noProof/>
             <w:webHidden/>
           </w:rPr>
-          <w:instrText xml:space="preserve"> PAGEREF _Toc242043790 \h </w:instrText>
+          <w:instrText xml:space="preserve"> PAGEREF _Toc242044492 \h </w:instrText>
         </w:r>
         <w:r>
           <w:rPr>
@@ -9398,7 +9398,7 @@
             <w:noProof/>
             <w:webHidden/>
           </w:rPr>
-          <w:t>33</w:t>
+          <w:t>34</w:t>
         </w:r>
         <w:r>
           <w:rPr>
@@ -9424,7 +9424,7 @@
           <w14:ligatures w14:val="standardContextual"/>
         </w:rPr>
       </w:pPr>
-      <w:hyperlink w:anchor="_Toc242043791" w:history="1">
+      <w:hyperlink w:anchor="_Toc242044493" w:history="1">
         <w:r>
           <w:rPr>
             <w:rStyle w:val="Hyperlink"/>
@@ -9451,7 +9451,7 @@
             <w:noProof/>
             <w:webHidden/>
           </w:rPr>
-          <w:instrText xml:space="preserve"> PAGEREF _Toc242043791 \h </w:instrText>
+          <w:instrText xml:space="preserve"> PAGEREF _Toc242044493 \h </w:instrText>
         </w:r>
         <w:r>
           <w:rPr>
@@ -9471,7 +9471,7 @@
             <w:noProof/>
             <w:webHidden/>
           </w:rPr>
-          <w:t>34</w:t>
+          <w:t>35</w:t>
         </w:r>
         <w:r>
           <w:rPr>
@@ -9497,7 +9497,7 @@
           <w14:ligatures w14:val="standardContextual"/>
         </w:rPr>
       </w:pPr>
-      <w:hyperlink w:anchor="_Toc242043792" w:history="1">
+      <w:hyperlink w:anchor="_Toc242044494" w:history="1">
         <w:r>
           <w:rPr>
             <w:rStyle w:val="Hyperlink"/>
@@ -9524,7 +9524,7 @@
             <w:noProof/>
             <w:webHidden/>
           </w:rPr>
-          <w:instrText xml:space="preserve"> PAGEREF _Toc242043792 \h </w:instrText>
+          <w:instrText xml:space="preserve"> PAGEREF _Toc242044494 \h </w:instrText>
         </w:r>
         <w:r>
           <w:rPr>
@@ -9544,7 +9544,7 @@
             <w:noProof/>
             <w:webHidden/>
           </w:rPr>
-          <w:t>46</w:t>
+          <w:t>47</w:t>
         </w:r>
         <w:r>
           <w:rPr>
@@ -9565,7 +9565,7 @@
         <w:pStyle w:val="Heading1"/>
         <w:pageBreakBefore/>
       </w:pPr>
-      <w:bookmarkStart w:id="0" w:name="_Toc242043682"/>
+      <w:bookmarkStart w:id="0" w:name="_Toc242044384"/>
       <w:r>
         <w:lastRenderedPageBreak/>
         <w:t>CHƯƠNG 1. GIỚI THIỆU</w:t>
@@ -9576,7 +9576,7 @@
       <w:pPr>
         <w:pStyle w:val="Heading2"/>
       </w:pPr>
-      <w:bookmarkStart w:id="1" w:name="_Toc242043683"/>
+      <w:bookmarkStart w:id="1" w:name="_Toc242044385"/>
       <w:r>
         <w:t>1.1. Mục đích của tài liệu</w:t>
       </w:r>
@@ -9623,7 +9623,7 @@
       <w:pPr>
         <w:pStyle w:val="Heading2"/>
       </w:pPr>
-      <w:bookmarkStart w:id="2" w:name="_Toc242043684"/>
+      <w:bookmarkStart w:id="2" w:name="_Toc242044386"/>
       <w:r>
         <w:t>1.2. Tổng quan phần mềm</w:t>
       </w:r>
@@ -9770,7 +9770,7 @@
       <w:pPr>
         <w:pStyle w:val="Heading2"/>
       </w:pPr>
-      <w:bookmarkStart w:id="3" w:name="_Toc242043685"/>
+      <w:bookmarkStart w:id="3" w:name="_Toc242044387"/>
       <w:r>
         <w:t>1.3. Vai trò người dùng và chức năng</w:t>
       </w:r>
@@ -9808,7 +9808,7 @@
       <w:pPr>
         <w:pStyle w:val="TableCaption"/>
       </w:pPr>
-      <w:bookmarkStart w:id="4" w:name="_Toc242043778"/>
+      <w:bookmarkStart w:id="4" w:name="_Toc242044480"/>
       <w:r>
         <w:t>Bảng 1.1. Chức năng hiển thị theo vai trò</w:t>
       </w:r>
@@ -14011,7 +14011,7 @@
       <w:pPr>
         <w:pStyle w:val="Heading2"/>
       </w:pPr>
-      <w:bookmarkStart w:id="5" w:name="_Toc242043686"/>
+      <w:bookmarkStart w:id="5" w:name="_Toc242044388"/>
       <w:r>
         <w:t>1.4. Yêu cầu hệ thống</w:t>
       </w:r>
@@ -14021,7 +14021,7 @@
       <w:pPr>
         <w:pStyle w:val="TableCaption"/>
       </w:pPr>
-      <w:bookmarkStart w:id="6" w:name="_Toc242043779"/>
+      <w:bookmarkStart w:id="6" w:name="_Toc242044481"/>
       <w:r>
         <w:t>Bảng 1.2. Yêu cầu phần cứng và phần mềm</w:t>
       </w:r>
@@ -14613,7 +14613,7 @@
       <w:pPr>
         <w:pStyle w:val="Heading2"/>
       </w:pPr>
-      <w:bookmarkStart w:id="7" w:name="_Toc242043687"/>
+      <w:bookmarkStart w:id="7" w:name="_Toc242044389"/>
       <w:r>
         <w:t>1.5. Các bước cài đặt tổng quát</w:t>
       </w:r>
@@ -14765,7 +14765,7 @@
       <w:pPr>
         <w:pStyle w:val="TableCaption"/>
       </w:pPr>
-      <w:bookmarkStart w:id="8" w:name="_Toc242043780"/>
+      <w:bookmarkStart w:id="8" w:name="_Toc242044482"/>
       <w:r>
         <w:t>Bảng 1.3. Chọn phương án SQL Server theo máy</w:t>
       </w:r>
@@ -15369,7 +15369,7 @@
       <w:pPr>
         <w:pStyle w:val="Heading2"/>
       </w:pPr>
-      <w:bookmarkStart w:id="9" w:name="_Toc242043688"/>
+      <w:bookmarkStart w:id="9" w:name="_Toc242044390"/>
       <w:r>
         <w:t>1.6. Quy ước trình bày</w:t>
       </w:r>
@@ -15618,7 +15618,7 @@
         <w:pStyle w:val="Heading1"/>
         <w:pageBreakBefore/>
       </w:pPr>
-      <w:bookmarkStart w:id="10" w:name="_Toc242043689"/>
+      <w:bookmarkStart w:id="10" w:name="_Toc242044391"/>
       <w:r>
         <w:lastRenderedPageBreak/>
         <w:t>CHƯƠNG 2. CÀI ĐẶT SQL SERVER VÀ KHỞI TẠO CƠ SỞ DỮ LIỆU</w:t>
@@ -15675,7 +15675,7 @@
       <w:pPr>
         <w:pStyle w:val="Heading2"/>
       </w:pPr>
-      <w:bookmarkStart w:id="11" w:name="_Toc242043690"/>
+      <w:bookmarkStart w:id="11" w:name="_Toc242044392"/>
       <w:r>
         <w:t>2.1. Tải mã nguồn</w:t>
       </w:r>
@@ -15796,7 +15796,7 @@
       <w:pPr>
         <w:pStyle w:val="Heading2"/>
       </w:pPr>
-      <w:bookmarkStart w:id="12" w:name="_Toc242043691"/>
+      <w:bookmarkStart w:id="12" w:name="_Toc242044393"/>
       <w:r>
         <w:t>2.2. Phương án A - SQL Server trong Docker</w:t>
       </w:r>
@@ -15806,7 +15806,7 @@
       <w:pPr>
         <w:pStyle w:val="Heading3"/>
       </w:pPr>
-      <w:bookmarkStart w:id="13" w:name="_Toc242043692"/>
+      <w:bookmarkStart w:id="13" w:name="_Toc242044394"/>
       <w:r>
         <w:t>2.2.1. Cài Docker Desktop</w:t>
       </w:r>
@@ -16135,7 +16135,7 @@
       <w:pPr>
         <w:pStyle w:val="Heading3"/>
       </w:pPr>
-      <w:bookmarkStart w:id="14" w:name="_Toc242043693"/>
+      <w:bookmarkStart w:id="14" w:name="_Toc242044395"/>
       <w:r>
         <w:t>2.2.2. Khởi động SQL Server</w:t>
       </w:r>
@@ -16563,7 +16563,7 @@
       <w:pPr>
         <w:pStyle w:val="Heading3"/>
       </w:pPr>
-      <w:bookmarkStart w:id="15" w:name="_Toc242043694"/>
+      <w:bookmarkStart w:id="15" w:name="_Toc242044396"/>
       <w:r>
         <w:t>2.2.3. Khởi tạo CSDL</w:t>
       </w:r>
@@ -16996,7 +16996,7 @@
       <w:pPr>
         <w:pStyle w:val="Heading3"/>
       </w:pPr>
-      <w:bookmarkStart w:id="16" w:name="_Toc242043695"/>
+      <w:bookmarkStart w:id="16" w:name="_Toc242044397"/>
       <w:r>
         <w:t>2.2.4. Bật, tắt SQL Server hằng ngày</w:t>
       </w:r>
@@ -17006,7 +17006,7 @@
       <w:pPr>
         <w:pStyle w:val="TableCaption"/>
       </w:pPr>
-      <w:bookmarkStart w:id="17" w:name="_Toc242043781"/>
+      <w:bookmarkStart w:id="17" w:name="_Toc242044483"/>
       <w:r>
         <w:t>Bảng 2.1. Các lệnh Docker thường dùng</w:t>
       </w:r>
@@ -17423,7 +17423,7 @@
       <w:pPr>
         <w:pStyle w:val="Heading2"/>
       </w:pPr>
-      <w:bookmarkStart w:id="18" w:name="_Toc242043696"/>
+      <w:bookmarkStart w:id="18" w:name="_Toc242044398"/>
       <w:r>
         <w:t>2.3. Phương án B - SQL Server cài trực tiếp trên Windows</w:t>
       </w:r>
@@ -17433,7 +17433,7 @@
       <w:pPr>
         <w:pStyle w:val="Heading3"/>
       </w:pPr>
-      <w:bookmarkStart w:id="19" w:name="_Toc242043697"/>
+      <w:bookmarkStart w:id="19" w:name="_Toc242044399"/>
       <w:r>
         <w:t>2.3.1. Cài SQL Server</w:t>
       </w:r>
@@ -18077,7 +18077,7 @@
       <w:pPr>
         <w:pStyle w:val="Heading3"/>
       </w:pPr>
-      <w:bookmarkStart w:id="20" w:name="_Toc242043698"/>
+      <w:bookmarkStart w:id="20" w:name="_Toc242044400"/>
       <w:r>
         <w:t>2.3.2. Cài công cụ quản trị và driver</w:t>
       </w:r>
@@ -18274,7 +18274,7 @@
       <w:pPr>
         <w:pStyle w:val="Heading3"/>
       </w:pPr>
-      <w:bookmarkStart w:id="21" w:name="_Toc242043699"/>
+      <w:bookmarkStart w:id="21" w:name="_Toc242044401"/>
       <w:r>
         <w:t>2.3.3. Bật kết nối TCP/IP</w:t>
       </w:r>
@@ -18610,7 +18610,7 @@
       <w:pPr>
         <w:pStyle w:val="Heading3"/>
       </w:pPr>
-      <w:bookmarkStart w:id="22" w:name="_Toc242043700"/>
+      <w:bookmarkStart w:id="22" w:name="_Toc242044402"/>
       <w:r>
         <w:t>2.3.4. Khởi tạo CSDL</w:t>
       </w:r>
@@ -19148,7 +19148,7 @@
       <w:pPr>
         <w:pStyle w:val="Heading3"/>
       </w:pPr>
-      <w:bookmarkStart w:id="23" w:name="_Toc242043701"/>
+      <w:bookmarkStart w:id="23" w:name="_Toc242044403"/>
       <w:r>
         <w:t>2.3.5. Cho máy khác kết nối tới (không bắt buộc)</w:t>
       </w:r>
@@ -19240,7 +19240,7 @@
       <w:pPr>
         <w:pStyle w:val="Heading2"/>
       </w:pPr>
-      <w:bookmarkStart w:id="24" w:name="_Toc242043702"/>
+      <w:bookmarkStart w:id="24" w:name="_Toc242044404"/>
       <w:r>
         <w:t>2.4. Nạp lại dữ liệu mẫu trước buổi demo</w:t>
       </w:r>
@@ -19352,7 +19352,7 @@
         <w:pStyle w:val="Heading1"/>
         <w:pageBreakBefore/>
       </w:pPr>
-      <w:bookmarkStart w:id="25" w:name="_Toc242043703"/>
+      <w:bookmarkStart w:id="25" w:name="_Toc242044405"/>
       <w:r>
         <w:lastRenderedPageBreak/>
         <w:t>CHƯƠNG 3. CÀI ĐẶT ỨNG DỤNG</w:t>
@@ -19363,7 +19363,7 @@
       <w:pPr>
         <w:pStyle w:val="Heading2"/>
       </w:pPr>
-      <w:bookmarkStart w:id="26" w:name="_Toc242043704"/>
+      <w:bookmarkStart w:id="26" w:name="_Toc242044406"/>
       <w:r>
         <w:t>3.1. Tải bộ cài</w:t>
       </w:r>
@@ -19401,7 +19401,7 @@
       <w:pPr>
         <w:pStyle w:val="TableCaption"/>
       </w:pPr>
-      <w:bookmarkStart w:id="27" w:name="_Toc242043782"/>
+      <w:bookmarkStart w:id="27" w:name="_Toc242044484"/>
       <w:r>
         <w:t>Bảng 3.1. Các file cài đặt</w:t>
       </w:r>
@@ -19844,7 +19844,7 @@
       <w:pPr>
         <w:pStyle w:val="Heading2"/>
       </w:pPr>
-      <w:bookmarkStart w:id="28" w:name="_Toc242043705"/>
+      <w:bookmarkStart w:id="28" w:name="_Toc242044407"/>
       <w:r>
         <w:t>3.2. Cài đặt trên macOS</w:t>
       </w:r>
@@ -20076,7 +20076,7 @@
       <w:pPr>
         <w:pStyle w:val="Heading2"/>
       </w:pPr>
-      <w:bookmarkStart w:id="29" w:name="_Toc242043706"/>
+      <w:bookmarkStart w:id="29" w:name="_Toc242044408"/>
       <w:r>
         <w:t>3.3. Cài đặt trên Windows</w:t>
       </w:r>
@@ -20086,7 +20086,7 @@
       <w:pPr>
         <w:pStyle w:val="Heading3"/>
       </w:pPr>
-      <w:bookmarkStart w:id="30" w:name="_Toc242043707"/>
+      <w:bookmarkStart w:id="30" w:name="_Toc242044409"/>
       <w:r>
         <w:t>3.3.1. Dùng bộ cài setup.exe</w:t>
       </w:r>
@@ -20241,7 +20241,16 @@
         <w:t>Installation guide</w:t>
       </w:r>
       <w:r>
-        <w:t xml:space="preserve"> (hướng dẫn ngắn bằng tiếng Anh) trong menu Start.</w:t>
+        <w:t xml:space="preserve"> (hướng dẫn ngắn bằng tiếng Anh) trong menu Start. Cài cho riêng người dùng hiện tại thì ứng dụng nằm ở </w:t>
+      </w:r>
+      <w:r>
+        <w:rPr>
+          <w:color w:val="C7254E"/>
+        </w:rPr>
+        <w:t>%LOCALAPPDATA%\Programs\QLTTTA</w:t>
+      </w:r>
+      <w:r>
+        <w:t xml:space="preserve"> và không cần quyền Administrator.</w:t>
       </w:r>
     </w:p>
     <w:tbl>
@@ -20261,12 +20270,12 @@
           <w:tcPr>
             <w:tcW w:w="9070" w:type="dxa"/>
             <w:tcBorders>
-              <w:top w:val="single" w:sz="8" w:space="0" w:color="E0B000"/>
-              <w:left w:val="single" w:sz="8" w:space="0" w:color="E0B000"/>
-              <w:bottom w:val="single" w:sz="8" w:space="0" w:color="E0B000"/>
-              <w:right w:val="single" w:sz="8" w:space="0" w:color="E0B000"/>
-            </w:tcBorders>
-            <w:shd w:val="clear" w:color="auto" w:fill="FFF4CE"/>
+              <w:top w:val="single" w:sz="8" w:space="0" w:color="86EFAC"/>
+              <w:left w:val="single" w:sz="8" w:space="0" w:color="86EFAC"/>
+              <w:bottom w:val="single" w:sz="8" w:space="0" w:color="86EFAC"/>
+              <w:right w:val="single" w:sz="8" w:space="0" w:color="86EFAC"/>
+            </w:tcBorders>
+            <w:shd w:val="clear" w:color="auto" w:fill="ECFDF5"/>
             <w:tcMar>
               <w:top w:w="80" w:type="dxa"/>
               <w:left w:w="140" w:type="dxa"/>
@@ -20283,39 +20292,39 @@
                 <w:b/>
                 <w:sz w:val="23"/>
               </w:rPr>
-              <w:t>[CẦN BỔ SUNG - Windows]</w:t>
+              <w:t>Mẹo:</w:t>
             </w:r>
             <w:r>
               <w:rPr>
                 <w:sz w:val="23"/>
               </w:rPr>
-              <w:t xml:space="preserve"> Kiểm tra trên Windows và cập nhật các bước trên: tên chính xác của các nút/hộp thoại trong bộ cài, thư mục cài mặc định khi cài cho riêng người dùng (dự kiến </w:t>
+              <w:t xml:space="preserve"> Cài không hiện hộp thoại (ví dụ cài sẵn cho nhiều máy phòng thực hành), cho riêng người dùng, không tạo biểu tượng ngoài màn hình: </w:t>
             </w:r>
             <w:r>
               <w:rPr>
                 <w:color w:val="C7254E"/>
                 <w:sz w:val="23"/>
               </w:rPr>
-              <w:t>%LOCALAPPDATA%\Programs\QLTTTA</w:t>
+              <w:t>QLTTTA-0.1.0-windows-x64-setup.exe /VERYSILENT /CURRENTUSER /MERGETASKS="!desktopicon"</w:t>
             </w:r>
             <w:r>
               <w:rPr>
                 <w:sz w:val="23"/>
               </w:rPr>
-              <w:t>) và khi cài cho mọi người dùng (</w:t>
+              <w:t xml:space="preserve">. Gỡ im lặng: </w:t>
             </w:r>
             <w:r>
               <w:rPr>
                 <w:color w:val="C7254E"/>
                 <w:sz w:val="23"/>
               </w:rPr>
-              <w:t>C:\Program Files\QLTTTA</w:t>
+              <w:t>unins000.exe /VERYSILENT</w:t>
             </w:r>
             <w:r>
               <w:rPr>
                 <w:sz w:val="23"/>
               </w:rPr>
-              <w:t>).</w:t>
+              <w:t xml:space="preserve"> trong thư mục cài.</w:t>
             </w:r>
           </w:p>
         </w:tc>
@@ -20371,44 +20380,20 @@
               <w:rPr>
                 <w:sz w:val="23"/>
               </w:rPr>
-              <w:t xml:space="preserve"> Ảnh: hộp thoại Windows protected your PC sau khi bấm More info (thấy nút Run anyway).</w:t>
-            </w:r>
-          </w:p>
-          <w:p>
-            <w:pPr>
-              <w:spacing w:after="40" w:line="276" w:lineRule="auto"/>
-            </w:pPr>
-            <w:r>
-              <w:rPr>
-                <w:sz w:val="23"/>
-              </w:rPr>
-              <w:t xml:space="preserve">Lưu ảnh vào </w:t>
+              <w:t xml:space="preserve"> Kiểm tra trên Windows bằng giao diện: tên chính xác của các nút/hộp thoại trong bộ cài và thư mục cài mặc định khi chọn cài cho mọi người dùng (dự kiến </w:t>
             </w:r>
             <w:r>
               <w:rPr>
                 <w:color w:val="C7254E"/>
                 <w:sz w:val="23"/>
               </w:rPr>
-              <w:t>docs/user-guide/images/windows/installer_smartscreen.png</w:t>
+              <w:t>C:\Program Files\QLTTTA</w:t>
             </w:r>
             <w:r>
               <w:rPr>
                 <w:sz w:val="23"/>
               </w:rPr>
-              <w:t xml:space="preserve"> rồi chạy lại </w:t>
-            </w:r>
-            <w:r>
-              <w:rPr>
-                <w:color w:val="C7254E"/>
-                <w:sz w:val="23"/>
-              </w:rPr>
-              <w:t>build_user_guide.py</w:t>
-            </w:r>
-            <w:r>
-              <w:rPr>
-                <w:sz w:val="23"/>
-              </w:rPr>
-              <w:t xml:space="preserve"> (chú thích: "Cảnh báo SmartScreen khi chạy bộ cài").</w:t>
+              <w:t>, cần quyền Administrator).</w:t>
             </w:r>
           </w:p>
         </w:tc>
@@ -20464,7 +20449,7 @@
               <w:rPr>
                 <w:sz w:val="23"/>
               </w:rPr>
-              <w:t xml:space="preserve"> Ảnh: màn hình cuối của bộ cài QLTTTA (Launch QLTTTA, nút Finish).</w:t>
+              <w:t xml:space="preserve"> Ảnh: hộp thoại Windows protected your PC sau khi bấm More info (thấy nút Run anyway).</w:t>
             </w:r>
           </w:p>
           <w:p>
@@ -20482,7 +20467,7 @@
                 <w:color w:val="C7254E"/>
                 <w:sz w:val="23"/>
               </w:rPr>
-              <w:t>docs/user-guide/images/windows/installer_finish.png</w:t>
+              <w:t>docs/user-guide/images/windows/installer_smartscreen.png</w:t>
             </w:r>
             <w:r>
               <w:rPr>
@@ -20501,7 +20486,7 @@
               <w:rPr>
                 <w:sz w:val="23"/>
               </w:rPr>
-              <w:t xml:space="preserve"> (chú thích: "Bước cuối của bộ cài QLTTTA trên Windows").</w:t>
+              <w:t xml:space="preserve"> (chú thích: "Cảnh báo SmartScreen khi chạy bộ cài").</w:t>
             </w:r>
           </w:p>
         </w:tc>
@@ -20512,11 +20497,104 @@
         <w:spacing w:after="40"/>
       </w:pPr>
     </w:p>
+    <w:tbl>
+      <w:tblPr>
+        <w:tblW w:w="0" w:type="auto"/>
+        <w:jc w:val="center"/>
+        <w:tblLook w:val="04A0" w:firstRow="1" w:lastRow="0" w:firstColumn="1" w:lastColumn="0" w:noHBand="0" w:noVBand="1"/>
+      </w:tblPr>
+      <w:tblGrid>
+        <w:gridCol w:w="9050"/>
+      </w:tblGrid>
+      <w:tr>
+        <w:trPr>
+          <w:jc w:val="center"/>
+        </w:trPr>
+        <w:tc>
+          <w:tcPr>
+            <w:tcW w:w="9070" w:type="dxa"/>
+            <w:tcBorders>
+              <w:top w:val="single" w:sz="8" w:space="0" w:color="E0B000"/>
+              <w:left w:val="single" w:sz="8" w:space="0" w:color="E0B000"/>
+              <w:bottom w:val="single" w:sz="8" w:space="0" w:color="E0B000"/>
+              <w:right w:val="single" w:sz="8" w:space="0" w:color="E0B000"/>
+            </w:tcBorders>
+            <w:shd w:val="clear" w:color="auto" w:fill="FFF4CE"/>
+            <w:tcMar>
+              <w:top w:w="80" w:type="dxa"/>
+              <w:left w:w="140" w:type="dxa"/>
+              <w:bottom w:w="80" w:type="dxa"/>
+              <w:right w:w="140" w:type="dxa"/>
+            </w:tcMar>
+          </w:tcPr>
+          <w:p>
+            <w:pPr>
+              <w:spacing w:after="40" w:line="276" w:lineRule="auto"/>
+            </w:pPr>
+            <w:r>
+              <w:rPr>
+                <w:b/>
+                <w:sz w:val="23"/>
+              </w:rPr>
+              <w:t>[CẦN BỔ SUNG - Windows]</w:t>
+            </w:r>
+            <w:r>
+              <w:rPr>
+                <w:sz w:val="23"/>
+              </w:rPr>
+              <w:t xml:space="preserve"> Ảnh: màn hình cuối của bộ cài QLTTTA (Launch QLTTTA, nút Finish).</w:t>
+            </w:r>
+          </w:p>
+          <w:p>
+            <w:pPr>
+              <w:spacing w:after="40" w:line="276" w:lineRule="auto"/>
+            </w:pPr>
+            <w:r>
+              <w:rPr>
+                <w:sz w:val="23"/>
+              </w:rPr>
+              <w:t xml:space="preserve">Lưu ảnh vào </w:t>
+            </w:r>
+            <w:r>
+              <w:rPr>
+                <w:color w:val="C7254E"/>
+                <w:sz w:val="23"/>
+              </w:rPr>
+              <w:t>docs/user-guide/images/windows/installer_finish.png</w:t>
+            </w:r>
+            <w:r>
+              <w:rPr>
+                <w:sz w:val="23"/>
+              </w:rPr>
+              <w:t xml:space="preserve"> rồi chạy lại </w:t>
+            </w:r>
+            <w:r>
+              <w:rPr>
+                <w:color w:val="C7254E"/>
+                <w:sz w:val="23"/>
+              </w:rPr>
+              <w:t>build_user_guide.py</w:t>
+            </w:r>
+            <w:r>
+              <w:rPr>
+                <w:sz w:val="23"/>
+              </w:rPr>
+              <w:t xml:space="preserve"> (chú thích: "Bước cuối của bộ cài QLTTTA trên Windows").</w:t>
+            </w:r>
+          </w:p>
+        </w:tc>
+      </w:tr>
+    </w:tbl>
+    <w:p>
+      <w:pPr>
+        <w:spacing w:after="40"/>
+      </w:pPr>
+    </w:p>
     <w:p>
       <w:pPr>
         <w:pStyle w:val="Heading3"/>
       </w:pPr>
-      <w:bookmarkStart w:id="31" w:name="_Toc242043708"/>
+      <w:bookmarkStart w:id="31" w:name="_Toc242044410"/>
       <w:r>
         <w:t>3.3.2. Dùng bản portable</w:t>
       </w:r>
@@ -20563,7 +20641,7 @@
       <w:pPr>
         <w:pStyle w:val="Heading3"/>
       </w:pPr>
-      <w:bookmarkStart w:id="32" w:name="_Toc242043709"/>
+      <w:bookmarkStart w:id="32" w:name="_Toc242044411"/>
       <w:r>
         <w:t>3.3.3. Driver kết nối</w:t>
       </w:r>
@@ -20619,7 +20697,7 @@
       <w:pPr>
         <w:pStyle w:val="Heading2"/>
       </w:pPr>
-      <w:bookmarkStart w:id="33" w:name="_Toc242043710"/>
+      <w:bookmarkStart w:id="33" w:name="_Toc242044412"/>
       <w:r>
         <w:t>3.4. Nơi lưu cấu hình và gỡ cài đặt</w:t>
       </w:r>
@@ -20639,8 +20717,9 @@
       <w:pPr>
         <w:pStyle w:val="TableCaption"/>
       </w:pPr>
-      <w:bookmarkStart w:id="34" w:name="_Toc242043783"/>
-      <w:r>
+      <w:bookmarkStart w:id="34" w:name="_Toc242044485"/>
+      <w:r>
+        <w:lastRenderedPageBreak/>
         <w:t>Bảng 3.2. Cấu hình đã lưu và cách gỡ ứng dụng</w:t>
       </w:r>
       <w:bookmarkEnd w:id="34"/>
@@ -20893,7 +20972,6 @@
               <w:rPr>
                 <w:sz w:val="21"/>
               </w:rPr>
-              <w:lastRenderedPageBreak/>
               <w:t>Windows</w:t>
             </w:r>
           </w:p>
@@ -20976,72 +21054,6 @@
       <w:pPr>
         <w:spacing w:after="80"/>
       </w:pPr>
-    </w:p>
-    <w:tbl>
-      <w:tblPr>
-        <w:tblW w:w="0" w:type="auto"/>
-        <w:jc w:val="center"/>
-        <w:tblLook w:val="04A0" w:firstRow="1" w:lastRow="0" w:firstColumn="1" w:lastColumn="0" w:noHBand="0" w:noVBand="1"/>
-      </w:tblPr>
-      <w:tblGrid>
-        <w:gridCol w:w="9050"/>
-      </w:tblGrid>
-      <w:tr>
-        <w:trPr>
-          <w:jc w:val="center"/>
-        </w:trPr>
-        <w:tc>
-          <w:tcPr>
-            <w:tcW w:w="9070" w:type="dxa"/>
-            <w:tcBorders>
-              <w:top w:val="single" w:sz="8" w:space="0" w:color="E0B000"/>
-              <w:left w:val="single" w:sz="8" w:space="0" w:color="E0B000"/>
-              <w:bottom w:val="single" w:sz="8" w:space="0" w:color="E0B000"/>
-              <w:right w:val="single" w:sz="8" w:space="0" w:color="E0B000"/>
-            </w:tcBorders>
-            <w:shd w:val="clear" w:color="auto" w:fill="FFF4CE"/>
-            <w:tcMar>
-              <w:top w:w="80" w:type="dxa"/>
-              <w:left w:w="140" w:type="dxa"/>
-              <w:bottom w:w="80" w:type="dxa"/>
-              <w:right w:w="140" w:type="dxa"/>
-            </w:tcMar>
-          </w:tcPr>
-          <w:p>
-            <w:pPr>
-              <w:spacing w:after="40" w:line="276" w:lineRule="auto"/>
-            </w:pPr>
-            <w:r>
-              <w:rPr>
-                <w:b/>
-                <w:sz w:val="23"/>
-              </w:rPr>
-              <w:t>[CẦN BỔ SUNG - Windows]</w:t>
-            </w:r>
-            <w:r>
-              <w:rPr>
-                <w:sz w:val="23"/>
-              </w:rPr>
-              <w:t xml:space="preserve"> Xác nhận trên Windows đường dẫn gỡ cài đặt trong Settings (Windows 10 và 11 khác nhau) và khóa registry ở trên.</w:t>
-            </w:r>
-          </w:p>
-        </w:tc>
-      </w:tr>
-    </w:tbl>
-    <w:p>
-      <w:pPr>
-        <w:spacing w:after="40"/>
-      </w:pPr>
-    </w:p>
-    <w:p>
-      <w:pPr>
-        <w:pStyle w:val="Heading2"/>
-      </w:pPr>
-      <w:bookmarkStart w:id="35" w:name="_Toc242043711"/>
-      <w:r>
-        <w:t>3.5. Chạy từ mã nguồn (dành cho nhóm phát triển)</w:t>
-      </w:r>
-      <w:bookmarkEnd w:id="35"/>
     </w:p>
     <w:p>
       <w:pPr>
@@ -21050,34 +21062,16 @@
         <w:jc w:val="both"/>
       </w:pPr>
       <w:r>
-        <w:t xml:space="preserve">Thành viên nhóm có thể build ứng dụng bằng Qt 6, CMake và Ninja thay vì dùng bộ cài. Script </w:t>
-      </w:r>
-      <w:r>
-        <w:rPr>
-          <w:color w:val="C7254E"/>
-        </w:rPr>
-        <w:t>scripts/setup_dev</w:t>
-      </w:r>
-      <w:r>
-        <w:t xml:space="preserve"> kiểm tra máy và chỉ cài những gì còn thiếu: bộ công cụ build, SQL Server (macOS: container Docker; Windows: instance đã cài, container đang chạy hoặc SQL Server 2025 Developer), khởi tạo CSDL rồi chạy toàn bộ kiểm thử. Trong Claude Code, gõ </w:t>
-      </w:r>
-      <w:r>
-        <w:rPr>
-          <w:color w:val="C7254E"/>
-        </w:rPr>
-        <w:t>/imcp-setup</w:t>
-      </w:r>
-      <w:r>
-        <w:t xml:space="preserve"> để chạy script này. Chi tiết và các tùy chọn nằm trong </w:t>
-      </w:r>
-      <w:r>
-        <w:rPr>
-          <w:color w:val="C7254E"/>
-        </w:rPr>
-        <w:t>docs/SETUP.md</w:t>
-      </w:r>
-      <w:r>
-        <w:t xml:space="preserve"> (mục 3).</w:t>
+        <w:t xml:space="preserve">Gỡ cài đặt xóa thư mục ứng dụng và các mục trong menu Start nhưng </w:t>
+      </w:r>
+      <w:r>
+        <w:rPr>
+          <w:b/>
+        </w:rPr>
+        <w:t>giữ lại cấu hình</w:t>
+      </w:r>
+      <w:r>
+        <w:t xml:space="preserve"> đã lưu trong registry, nên cài lại vẫn nhớ máy chủ cũ. Muốn xóa hẳn cấu hình (Windows), chạy trong PowerShell:</w:t>
       </w:r>
     </w:p>
     <w:tbl>
@@ -21121,7 +21115,7 @@
                 <w:color w:val="1F3864"/>
                 <w:sz w:val="22"/>
               </w:rPr>
-              <w:t>Terminal (macOS)</w:t>
+              <w:t>PowerShell (Windows)</w:t>
             </w:r>
           </w:p>
         </w:tc>
@@ -21154,73 +21148,7 @@
                 <w:color w:val="000000"/>
                 <w:sz w:val="19"/>
               </w:rPr>
-              <w:t>./scripts/setup_dev.sh --check             # ch</w:t>
-            </w:r>
-            <w:r>
-              <w:rPr>
-                <w:rFonts w:ascii="Consolas" w:eastAsia="Consolas" w:hAnsi="Consolas" w:cs="Consolas"/>
-                <w:color w:val="000000"/>
-                <w:sz w:val="19"/>
-              </w:rPr>
-              <w:t>ỉ</w:t>
-            </w:r>
-            <w:r>
-              <w:rPr>
-                <w:rFonts w:ascii="Consolas" w:eastAsia="Consolas" w:hAnsi="Consolas" w:cs="Consolas"/>
-                <w:color w:val="000000"/>
-                <w:sz w:val="19"/>
-              </w:rPr>
-              <w:t xml:space="preserve"> báo còn thi</w:t>
-            </w:r>
-            <w:r>
-              <w:rPr>
-                <w:rFonts w:ascii="Consolas" w:eastAsia="Consolas" w:hAnsi="Consolas" w:cs="Consolas"/>
-                <w:color w:val="000000"/>
-                <w:sz w:val="19"/>
-              </w:rPr>
-              <w:t>ế</w:t>
-            </w:r>
-            <w:r>
-              <w:rPr>
-                <w:rFonts w:ascii="Consolas" w:eastAsia="Consolas" w:hAnsi="Consolas" w:cs="Consolas"/>
-                <w:color w:val="000000"/>
-                <w:sz w:val="19"/>
-              </w:rPr>
-              <w:t>u gì</w:t>
-            </w:r>
-          </w:p>
-          <w:p>
-            <w:r>
-              <w:rPr>
-                <w:rFonts w:ascii="Consolas" w:eastAsia="Consolas" w:hAnsi="Consolas" w:cs="Consolas"/>
-                <w:color w:val="000000"/>
-                <w:sz w:val="19"/>
-              </w:rPr>
-              <w:t>./scripts/setup_dev.sh --accept-licenses   # cài đ</w:t>
-            </w:r>
-            <w:r>
-              <w:rPr>
-                <w:rFonts w:ascii="Consolas" w:eastAsia="Consolas" w:hAnsi="Consolas" w:cs="Consolas"/>
-                <w:color w:val="000000"/>
-                <w:sz w:val="19"/>
-              </w:rPr>
-              <w:t>ặ</w:t>
-            </w:r>
-            <w:r>
-              <w:rPr>
-                <w:rFonts w:ascii="Consolas" w:eastAsia="Consolas" w:hAnsi="Consolas" w:cs="Consolas"/>
-                <w:color w:val="000000"/>
-                <w:sz w:val="19"/>
-              </w:rPr>
-              <w:t>t toàn b</w:t>
-            </w:r>
-            <w:r>
-              <w:rPr>
-                <w:rFonts w:ascii="Consolas" w:eastAsia="Consolas" w:hAnsi="Consolas" w:cs="Consolas"/>
-                <w:color w:val="000000"/>
-                <w:sz w:val="19"/>
-              </w:rPr>
-              <w:t>ộ</w:t>
+              <w:t>Remove-Item -Path 'HKCU:\Software\UIT-IE103\QLTTTA' -Recurse</w:t>
             </w:r>
           </w:p>
         </w:tc>
@@ -21230,6 +21158,109 @@
       <w:pPr>
         <w:spacing w:after="80"/>
       </w:pPr>
+    </w:p>
+    <w:tbl>
+      <w:tblPr>
+        <w:tblW w:w="0" w:type="auto"/>
+        <w:jc w:val="center"/>
+        <w:tblLook w:val="04A0" w:firstRow="1" w:lastRow="0" w:firstColumn="1" w:lastColumn="0" w:noHBand="0" w:noVBand="1"/>
+      </w:tblPr>
+      <w:tblGrid>
+        <w:gridCol w:w="9050"/>
+      </w:tblGrid>
+      <w:tr>
+        <w:trPr>
+          <w:jc w:val="center"/>
+        </w:trPr>
+        <w:tc>
+          <w:tcPr>
+            <w:tcW w:w="9070" w:type="dxa"/>
+            <w:tcBorders>
+              <w:top w:val="single" w:sz="8" w:space="0" w:color="E0B000"/>
+              <w:left w:val="single" w:sz="8" w:space="0" w:color="E0B000"/>
+              <w:bottom w:val="single" w:sz="8" w:space="0" w:color="E0B000"/>
+              <w:right w:val="single" w:sz="8" w:space="0" w:color="E0B000"/>
+            </w:tcBorders>
+            <w:shd w:val="clear" w:color="auto" w:fill="FFF4CE"/>
+            <w:tcMar>
+              <w:top w:w="80" w:type="dxa"/>
+              <w:left w:w="140" w:type="dxa"/>
+              <w:bottom w:w="80" w:type="dxa"/>
+              <w:right w:w="140" w:type="dxa"/>
+            </w:tcMar>
+          </w:tcPr>
+          <w:p>
+            <w:pPr>
+              <w:spacing w:after="40" w:line="276" w:lineRule="auto"/>
+            </w:pPr>
+            <w:r>
+              <w:rPr>
+                <w:b/>
+                <w:sz w:val="23"/>
+              </w:rPr>
+              <w:t>[CẦN BỔ SUNG - Windows]</w:t>
+            </w:r>
+            <w:r>
+              <w:rPr>
+                <w:sz w:val="23"/>
+              </w:rPr>
+              <w:t xml:space="preserve"> Xác nhận trên Windows đường dẫn gỡ cài đặt trong Settings (Windows 10 và 11 khác nhau).</w:t>
+            </w:r>
+          </w:p>
+        </w:tc>
+      </w:tr>
+    </w:tbl>
+    <w:p>
+      <w:pPr>
+        <w:spacing w:after="40"/>
+      </w:pPr>
+    </w:p>
+    <w:p>
+      <w:pPr>
+        <w:pStyle w:val="Heading2"/>
+      </w:pPr>
+      <w:bookmarkStart w:id="35" w:name="_Toc242044413"/>
+      <w:r>
+        <w:t>3.5. Chạy từ mã nguồn (dành cho nhóm phát triển)</w:t>
+      </w:r>
+      <w:bookmarkEnd w:id="35"/>
+    </w:p>
+    <w:p>
+      <w:pPr>
+        <w:spacing w:after="120" w:line="276" w:lineRule="auto"/>
+        <w:ind w:firstLine="284"/>
+        <w:jc w:val="both"/>
+      </w:pPr>
+      <w:r>
+        <w:t xml:space="preserve">Thành viên nhóm có thể build ứng dụng bằng Qt 6, CMake và Ninja thay vì dùng bộ cài. Script </w:t>
+      </w:r>
+      <w:r>
+        <w:rPr>
+          <w:color w:val="C7254E"/>
+        </w:rPr>
+        <w:t>scripts/setup_dev</w:t>
+      </w:r>
+      <w:r>
+        <w:t xml:space="preserve"> kiểm tra máy và chỉ cài những gì còn thiếu: bộ công cụ build, SQL Server (macOS: container Docker; Windows: instance đã cài, container đang chạy hoặc SQL Server 2025 Developer), khởi tạo CSDL rồi chạy toàn bộ kiểm thử. Trong Claude Code, gõ </w:t>
+      </w:r>
+      <w:r>
+        <w:rPr>
+          <w:color w:val="C7254E"/>
+        </w:rPr>
+        <w:t>/imcp-setup</w:t>
+      </w:r>
+      <w:r>
+        <w:t xml:space="preserve"> để chạy script này. Chi tiết và các tùy chọn nằm trong </w:t>
+      </w:r>
+      <w:r>
+        <w:rPr>
+          <w:color w:val="C7254E"/>
+        </w:rPr>
+        <w:t>docs/SETUP.md</w:t>
+      </w:r>
+      <w:r>
+        <w:t xml:space="preserve"> (mục 3).</w:t>
+      </w:r>
     </w:p>
     <w:tbl>
       <w:tblPr>
@@ -21272,7 +21303,7 @@
                 <w:color w:val="1F3864"/>
                 <w:sz w:val="22"/>
               </w:rPr>
-              <w:t>PowerShell (Windows)</w:t>
+              <w:t>Terminal (macOS)</w:t>
             </w:r>
           </w:p>
         </w:tc>
@@ -21305,17 +21336,73 @@
                 <w:color w:val="000000"/>
                 <w:sz w:val="19"/>
               </w:rPr>
-              <w:t>powershell -ExecutionPolicy Bypass -File scripts\setup_dev.ps1 -Check</w:t>
-            </w:r>
-          </w:p>
-          <w:p>
+              <w:t>./scripts/setup_dev.sh --check             # ch</w:t>
+            </w:r>
             <w:r>
               <w:rPr>
                 <w:rFonts w:ascii="Consolas" w:eastAsia="Consolas" w:hAnsi="Consolas" w:cs="Consolas"/>
                 <w:color w:val="000000"/>
                 <w:sz w:val="19"/>
               </w:rPr>
-              <w:t>powershell -ExecutionPolicy Bypass -File scripts\setup_dev.ps1 -AcceptLicenses</w:t>
+              <w:t>ỉ</w:t>
+            </w:r>
+            <w:r>
+              <w:rPr>
+                <w:rFonts w:ascii="Consolas" w:eastAsia="Consolas" w:hAnsi="Consolas" w:cs="Consolas"/>
+                <w:color w:val="000000"/>
+                <w:sz w:val="19"/>
+              </w:rPr>
+              <w:t xml:space="preserve"> báo còn thi</w:t>
+            </w:r>
+            <w:r>
+              <w:rPr>
+                <w:rFonts w:ascii="Consolas" w:eastAsia="Consolas" w:hAnsi="Consolas" w:cs="Consolas"/>
+                <w:color w:val="000000"/>
+                <w:sz w:val="19"/>
+              </w:rPr>
+              <w:t>ế</w:t>
+            </w:r>
+            <w:r>
+              <w:rPr>
+                <w:rFonts w:ascii="Consolas" w:eastAsia="Consolas" w:hAnsi="Consolas" w:cs="Consolas"/>
+                <w:color w:val="000000"/>
+                <w:sz w:val="19"/>
+              </w:rPr>
+              <w:t>u gì</w:t>
+            </w:r>
+          </w:p>
+          <w:p>
+            <w:r>
+              <w:rPr>
+                <w:rFonts w:ascii="Consolas" w:eastAsia="Consolas" w:hAnsi="Consolas" w:cs="Consolas"/>
+                <w:color w:val="000000"/>
+                <w:sz w:val="19"/>
+              </w:rPr>
+              <w:t>./scripts/setup_dev.sh --accept-licenses   # cài đ</w:t>
+            </w:r>
+            <w:r>
+              <w:rPr>
+                <w:rFonts w:ascii="Consolas" w:eastAsia="Consolas" w:hAnsi="Consolas" w:cs="Consolas"/>
+                <w:color w:val="000000"/>
+                <w:sz w:val="19"/>
+              </w:rPr>
+              <w:t>ặ</w:t>
+            </w:r>
+            <w:r>
+              <w:rPr>
+                <w:rFonts w:ascii="Consolas" w:eastAsia="Consolas" w:hAnsi="Consolas" w:cs="Consolas"/>
+                <w:color w:val="000000"/>
+                <w:sz w:val="19"/>
+              </w:rPr>
+              <w:t>t toàn b</w:t>
+            </w:r>
+            <w:r>
+              <w:rPr>
+                <w:rFonts w:ascii="Consolas" w:eastAsia="Consolas" w:hAnsi="Consolas" w:cs="Consolas"/>
+                <w:color w:val="000000"/>
+                <w:sz w:val="19"/>
+              </w:rPr>
+              <w:t>ộ</w:t>
             </w:r>
           </w:p>
         </w:tc>
@@ -21325,34 +21412,6 @@
       <w:pPr>
         <w:spacing w:after="80"/>
       </w:pPr>
-    </w:p>
-    <w:p>
-      <w:pPr>
-        <w:spacing w:after="120" w:line="276" w:lineRule="auto"/>
-        <w:ind w:firstLine="284"/>
-        <w:jc w:val="both"/>
-      </w:pPr>
-      <w:r>
-        <w:t xml:space="preserve">Tham số </w:t>
-      </w:r>
-      <w:r>
-        <w:rPr>
-          <w:color w:val="C7254E"/>
-        </w:rPr>
-        <w:t>--accept-licenses</w:t>
-      </w:r>
-      <w:r>
-        <w:t xml:space="preserve"> (</w:t>
-      </w:r>
-      <w:r>
-        <w:rPr>
-          <w:color w:val="C7254E"/>
-        </w:rPr>
-        <w:t>-AcceptLicenses</w:t>
-      </w:r>
-      <w:r>
-        <w:t>) nghĩa là bạn đồng ý giấy phép SQL Server Developer Edition (và điều khoản Docker Desktop trên macOS). Sau đó build và chạy ứng dụng:</w:t>
-      </w:r>
     </w:p>
     <w:tbl>
       <w:tblPr>
@@ -21395,7 +21454,7 @@
                 <w:color w:val="1F3864"/>
                 <w:sz w:val="22"/>
               </w:rPr>
-              <w:t>Terminal (macOS)</w:t>
+              <w:t>PowerShell (Windows)</w:t>
             </w:r>
           </w:p>
         </w:tc>
@@ -21428,7 +21487,7 @@
                 <w:color w:val="000000"/>
                 <w:sz w:val="19"/>
               </w:rPr>
-              <w:t>cmake --preset macos-debug</w:t>
+              <w:t>powershell -ExecutionPolicy Bypass -File scripts\setup_dev.ps1 -Check</w:t>
             </w:r>
           </w:p>
           <w:p>
@@ -21438,17 +21497,7 @@
                 <w:color w:val="000000"/>
                 <w:sz w:val="19"/>
               </w:rPr>
-              <w:t>cmake --build --preset macos-debug</w:t>
-            </w:r>
-          </w:p>
-          <w:p>
-            <w:r>
-              <w:rPr>
-                <w:rFonts w:ascii="Consolas" w:eastAsia="Consolas" w:hAnsi="Consolas" w:cs="Consolas"/>
-                <w:color w:val="000000"/>
-                <w:sz w:val="19"/>
-              </w:rPr>
-              <w:t>open build/macos-debug/src/app/QLTTTA.app</w:t>
+              <w:t>powershell -ExecutionPolicy Bypass -File scripts\setup_dev.ps1 -AcceptLicenses</w:t>
             </w:r>
           </w:p>
         </w:tc>
@@ -21458,6 +21507,34 @@
       <w:pPr>
         <w:spacing w:after="80"/>
       </w:pPr>
+    </w:p>
+    <w:p>
+      <w:pPr>
+        <w:spacing w:after="120" w:line="276" w:lineRule="auto"/>
+        <w:ind w:firstLine="284"/>
+        <w:jc w:val="both"/>
+      </w:pPr>
+      <w:r>
+        <w:t xml:space="preserve">Tham số </w:t>
+      </w:r>
+      <w:r>
+        <w:rPr>
+          <w:color w:val="C7254E"/>
+        </w:rPr>
+        <w:t>--accept-licenses</w:t>
+      </w:r>
+      <w:r>
+        <w:t xml:space="preserve"> (</w:t>
+      </w:r>
+      <w:r>
+        <w:rPr>
+          <w:color w:val="C7254E"/>
+        </w:rPr>
+        <w:t>-AcceptLicenses</w:t>
+      </w:r>
+      <w:r>
+        <w:t>) nghĩa là bạn đồng ý giấy phép SQL Server Developer Edition (và điều khoản Docker Desktop trên macOS). Sau đó build và chạy ứng dụng:</w:t>
+      </w:r>
     </w:p>
     <w:tbl>
       <w:tblPr>
@@ -21500,7 +21577,7 @@
                 <w:color w:val="1F3864"/>
                 <w:sz w:val="22"/>
               </w:rPr>
-              <w:t>PowerShell (Windows, cửa sổ mới sau setup_dev)</w:t>
+              <w:t>Terminal (macOS)</w:t>
             </w:r>
           </w:p>
         </w:tc>
@@ -21533,7 +21610,7 @@
                 <w:color w:val="000000"/>
                 <w:sz w:val="19"/>
               </w:rPr>
-              <w:t>cmake --preset windows-debug</w:t>
+              <w:t>cmake --preset macos-debug</w:t>
             </w:r>
           </w:p>
           <w:p>
@@ -21543,7 +21620,7 @@
                 <w:color w:val="000000"/>
                 <w:sz w:val="19"/>
               </w:rPr>
-              <w:t>cmake --build --preset windows-debug</w:t>
+              <w:t>cmake --build --preset macos-debug</w:t>
             </w:r>
           </w:p>
           <w:p>
@@ -21553,7 +21630,7 @@
                 <w:color w:val="000000"/>
                 <w:sz w:val="19"/>
               </w:rPr>
-              <w:t>.\build\windows-debug\QLTTTA.exe</w:t>
+              <w:t>open build/macos-debug/src/app/QLTTTA.app</w:t>
             </w:r>
           </w:p>
         </w:tc>
@@ -21564,12 +21641,117 @@
         <w:spacing w:after="80"/>
       </w:pPr>
     </w:p>
+    <w:tbl>
+      <w:tblPr>
+        <w:tblW w:w="0" w:type="auto"/>
+        <w:jc w:val="center"/>
+        <w:tblLook w:val="04A0" w:firstRow="1" w:lastRow="0" w:firstColumn="1" w:lastColumn="0" w:noHBand="0" w:noVBand="1"/>
+      </w:tblPr>
+      <w:tblGrid>
+        <w:gridCol w:w="9060"/>
+      </w:tblGrid>
+      <w:tr>
+        <w:trPr>
+          <w:cantSplit/>
+          <w:jc w:val="center"/>
+        </w:trPr>
+        <w:tc>
+          <w:tcPr>
+            <w:tcW w:w="9070" w:type="dxa"/>
+            <w:tcBorders>
+              <w:top w:val="single" w:sz="4" w:space="0" w:color="BFBFBF"/>
+              <w:left w:val="single" w:sz="4" w:space="0" w:color="BFBFBF"/>
+              <w:bottom w:val="single" w:sz="4" w:space="0" w:color="BFBFBF"/>
+              <w:right w:val="single" w:sz="4" w:space="0" w:color="BFBFBF"/>
+            </w:tcBorders>
+            <w:shd w:val="clear" w:color="auto" w:fill="E7ECF5"/>
+            <w:tcMar>
+              <w:top w:w="40" w:type="dxa"/>
+              <w:left w:w="140" w:type="dxa"/>
+              <w:bottom w:w="40" w:type="dxa"/>
+              <w:right w:w="140" w:type="dxa"/>
+            </w:tcMar>
+          </w:tcPr>
+          <w:p>
+            <w:pPr>
+              <w:keepNext/>
+            </w:pPr>
+            <w:r>
+              <w:rPr>
+                <w:b/>
+                <w:color w:val="1F3864"/>
+                <w:sz w:val="22"/>
+              </w:rPr>
+              <w:t>PowerShell (Windows, cửa sổ mới sau setup_dev)</w:t>
+            </w:r>
+          </w:p>
+        </w:tc>
+      </w:tr>
+      <w:tr>
+        <w:trPr>
+          <w:jc w:val="center"/>
+        </w:trPr>
+        <w:tc>
+          <w:tcPr>
+            <w:tcW w:w="9070" w:type="dxa"/>
+            <w:tcBorders>
+              <w:top w:val="single" w:sz="4" w:space="0" w:color="BFBFBF"/>
+              <w:left w:val="single" w:sz="4" w:space="0" w:color="BFBFBF"/>
+              <w:bottom w:val="single" w:sz="4" w:space="0" w:color="BFBFBF"/>
+              <w:right w:val="single" w:sz="4" w:space="0" w:color="BFBFBF"/>
+            </w:tcBorders>
+            <w:shd w:val="clear" w:color="auto" w:fill="F7F7F7"/>
+            <w:tcMar>
+              <w:top w:w="80" w:type="dxa"/>
+              <w:left w:w="140" w:type="dxa"/>
+              <w:bottom w:w="80" w:type="dxa"/>
+              <w:right w:w="140" w:type="dxa"/>
+            </w:tcMar>
+          </w:tcPr>
+          <w:p>
+            <w:r>
+              <w:rPr>
+                <w:rFonts w:ascii="Consolas" w:eastAsia="Consolas" w:hAnsi="Consolas" w:cs="Consolas"/>
+                <w:color w:val="000000"/>
+                <w:sz w:val="19"/>
+              </w:rPr>
+              <w:t>cmake --preset windows-debug</w:t>
+            </w:r>
+          </w:p>
+          <w:p>
+            <w:r>
+              <w:rPr>
+                <w:rFonts w:ascii="Consolas" w:eastAsia="Consolas" w:hAnsi="Consolas" w:cs="Consolas"/>
+                <w:color w:val="000000"/>
+                <w:sz w:val="19"/>
+              </w:rPr>
+              <w:t>cmake --build --preset windows-debug</w:t>
+            </w:r>
+          </w:p>
+          <w:p>
+            <w:r>
+              <w:rPr>
+                <w:rFonts w:ascii="Consolas" w:eastAsia="Consolas" w:hAnsi="Consolas" w:cs="Consolas"/>
+                <w:color w:val="000000"/>
+                <w:sz w:val="19"/>
+              </w:rPr>
+              <w:t>.\build\windows-debug\QLTTTA.exe</w:t>
+            </w:r>
+          </w:p>
+        </w:tc>
+      </w:tr>
+    </w:tbl>
+    <w:p>
+      <w:pPr>
+        <w:spacing w:after="80"/>
+      </w:pPr>
+    </w:p>
     <w:p>
       <w:pPr>
         <w:pStyle w:val="Heading1"/>
         <w:pageBreakBefore/>
       </w:pPr>
-      <w:bookmarkStart w:id="36" w:name="_Toc242043712"/>
+      <w:bookmarkStart w:id="36" w:name="_Toc242044414"/>
       <w:r>
         <w:lastRenderedPageBreak/>
         <w:t>CHƯƠNG 4. ĐĂNG NHẬP VÀ GIAO DIỆN CHUNG</w:t>
@@ -21580,7 +21762,7 @@
       <w:pPr>
         <w:pStyle w:val="Heading2"/>
       </w:pPr>
-      <w:bookmarkStart w:id="37" w:name="_Toc242043713"/>
+      <w:bookmarkStart w:id="37" w:name="_Toc242044415"/>
       <w:r>
         <w:t>4.1. Mở ứng dụng</w:t>
       </w:r>
@@ -21737,7 +21919,7 @@
           <w:noProof/>
         </w:rPr>
         <w:drawing>
-          <wp:inline distT="0" distB="0" distL="0" distR="0" wp14:anchorId="4DD768FB" wp14:editId="5BE333B5">
+          <wp:inline distT="0" distB="0" distL="0" distR="0" wp14:anchorId="55B263E4" wp14:editId="37AEFBBE">
             <wp:extent cx="4860000" cy="2938605"/>
             <wp:effectExtent l="0" t="0" r="0" b="0"/>
             <wp:docPr id="522444761" name="Picture 522444761"/>
@@ -21777,7 +21959,7 @@
       <w:pPr>
         <w:pStyle w:val="FigureCaption"/>
       </w:pPr>
-      <w:bookmarkStart w:id="38" w:name="_Toc242043755"/>
+      <w:bookmarkStart w:id="38" w:name="_Toc242044457"/>
       <w:r>
         <w:t>Hình 4.1. Màn hình đăng nhập</w:t>
       </w:r>
@@ -21787,7 +21969,7 @@
       <w:pPr>
         <w:pStyle w:val="Heading2"/>
       </w:pPr>
-      <w:bookmarkStart w:id="39" w:name="_Toc242043714"/>
+      <w:bookmarkStart w:id="39" w:name="_Toc242044416"/>
       <w:r>
         <w:t>4.2. Cấu hình máy chủ (lần chạy đầu tiên)</w:t>
       </w:r>
@@ -21938,7 +22120,7 @@
         </w:rPr>
         <w:lastRenderedPageBreak/>
         <w:drawing>
-          <wp:inline distT="0" distB="0" distL="0" distR="0" wp14:anchorId="36438E61" wp14:editId="58BA0118">
+          <wp:inline distT="0" distB="0" distL="0" distR="0" wp14:anchorId="4EFC80AA" wp14:editId="47E0CF07">
             <wp:extent cx="5040000" cy="3360000"/>
             <wp:effectExtent l="0" t="0" r="0" b="0"/>
             <wp:docPr id="522444762" name="Picture 522444762"/>
@@ -21978,7 +22160,7 @@
       <w:pPr>
         <w:pStyle w:val="FigureCaption"/>
       </w:pPr>
-      <w:bookmarkStart w:id="40" w:name="_Toc242043756"/>
+      <w:bookmarkStart w:id="40" w:name="_Toc242044458"/>
       <w:r>
         <w:t>Hình 4.2. Khung cấu hình máy chủ SQL Server</w:t>
       </w:r>
@@ -21988,7 +22170,7 @@
       <w:pPr>
         <w:pStyle w:val="TableCaption"/>
       </w:pPr>
-      <w:bookmarkStart w:id="41" w:name="_Toc242043784"/>
+      <w:bookmarkStart w:id="41" w:name="_Toc242044486"/>
       <w:r>
         <w:t>Bảng 4.1. Giá trị ô Máy chủ theo cách cài SQL Server</w:t>
       </w:r>
@@ -22428,7 +22610,7 @@
       <w:pPr>
         <w:pStyle w:val="Heading2"/>
       </w:pPr>
-      <w:bookmarkStart w:id="42" w:name="_Toc242043715"/>
+      <w:bookmarkStart w:id="42" w:name="_Toc242044417"/>
       <w:r>
         <w:t>4.3. Đăng nhập</w:t>
       </w:r>
@@ -22502,7 +22684,7 @@
       <w:pPr>
         <w:pStyle w:val="TableCaption"/>
       </w:pPr>
-      <w:bookmarkStart w:id="43" w:name="_Toc242043785"/>
+      <w:bookmarkStart w:id="43" w:name="_Toc242044487"/>
       <w:r>
         <w:t>Bảng 4.2. Tài khoản demo trong dữ liệu mẫu</w:t>
       </w:r>
@@ -23828,7 +24010,7 @@
       <w:pPr>
         <w:pStyle w:val="TableCaption"/>
       </w:pPr>
-      <w:bookmarkStart w:id="44" w:name="_Toc242043786"/>
+      <w:bookmarkStart w:id="44" w:name="_Toc242044488"/>
       <w:r>
         <w:t>Bảng 4.3. Thông báo lỗi khi đăng nhập</w:t>
       </w:r>
@@ -24252,7 +24434,7 @@
       <w:pPr>
         <w:pStyle w:val="Heading2"/>
       </w:pPr>
-      <w:bookmarkStart w:id="45" w:name="_Toc242043716"/>
+      <w:bookmarkStart w:id="45" w:name="_Toc242044418"/>
       <w:r>
         <w:t>4.4. Màn hình chính</w:t>
       </w:r>
@@ -24412,7 +24594,7 @@
           <w:noProof/>
         </w:rPr>
         <w:drawing>
-          <wp:inline distT="0" distB="0" distL="0" distR="0" wp14:anchorId="72C8D819" wp14:editId="1E1723E1">
+          <wp:inline distT="0" distB="0" distL="0" distR="0" wp14:anchorId="16730E25" wp14:editId="56F269AC">
             <wp:extent cx="5580000" cy="3332500"/>
             <wp:effectExtent l="0" t="0" r="0" b="0"/>
             <wp:docPr id="522444763" name="Picture 522444763"/>
@@ -24452,7 +24634,7 @@
       <w:pPr>
         <w:pStyle w:val="FigureCaption"/>
       </w:pPr>
-      <w:bookmarkStart w:id="46" w:name="_Toc242043757"/>
+      <w:bookmarkStart w:id="46" w:name="_Toc242044459"/>
       <w:r>
         <w:t>Hình 4.3. Màn hình chính của vai trò Quản lý (trang Tổng quan)</w:t>
       </w:r>
@@ -24462,7 +24644,7 @@
       <w:pPr>
         <w:pStyle w:val="Heading2"/>
       </w:pPr>
-      <w:bookmarkStart w:id="47" w:name="_Toc242043717"/>
+      <w:bookmarkStart w:id="47" w:name="_Toc242044419"/>
       <w:r>
         <w:t>4.5. Đổi ngôn ngữ giao diện</w:t>
       </w:r>
@@ -24500,7 +24682,7 @@
       <w:pPr>
         <w:pStyle w:val="Heading2"/>
       </w:pPr>
-      <w:bookmarkStart w:id="48" w:name="_Toc242043718"/>
+      <w:bookmarkStart w:id="48" w:name="_Toc242044420"/>
       <w:r>
         <w:t>4.6. Đổi mật khẩu</w:t>
       </w:r>
@@ -24616,7 +24798,7 @@
           <w:noProof/>
         </w:rPr>
         <w:drawing>
-          <wp:inline distT="0" distB="0" distL="0" distR="0" wp14:anchorId="78C83EAF" wp14:editId="3519B882">
+          <wp:inline distT="0" distB="0" distL="0" distR="0" wp14:anchorId="2CCCC939" wp14:editId="47504C19">
             <wp:extent cx="3420000" cy="1368000"/>
             <wp:effectExtent l="0" t="0" r="0" b="0"/>
             <wp:docPr id="522444764" name="Picture 522444764"/>
@@ -24656,7 +24838,7 @@
       <w:pPr>
         <w:pStyle w:val="FigureCaption"/>
       </w:pPr>
-      <w:bookmarkStart w:id="49" w:name="_Toc242043758"/>
+      <w:bookmarkStart w:id="49" w:name="_Toc242044460"/>
       <w:r>
         <w:t>Hình 4.4. Hộp thoại đổi mật khẩu</w:t>
       </w:r>
@@ -24698,7 +24880,7 @@
       <w:pPr>
         <w:pStyle w:val="Heading2"/>
       </w:pPr>
-      <w:bookmarkStart w:id="50" w:name="_Toc242043719"/>
+      <w:bookmarkStart w:id="50" w:name="_Toc242044421"/>
       <w:r>
         <w:t>4.7. Đăng xuất và thoát</w:t>
       </w:r>
@@ -24745,7 +24927,7 @@
       <w:pPr>
         <w:pStyle w:val="Heading2"/>
       </w:pPr>
-      <w:bookmarkStart w:id="51" w:name="_Toc242043720"/>
+      <w:bookmarkStart w:id="51" w:name="_Toc242044422"/>
       <w:r>
         <w:t>4.8. Thao tác chung trên các màn hình danh sách</w:t>
       </w:r>
@@ -24772,7 +24954,7 @@
           <w:noProof/>
         </w:rPr>
         <w:drawing>
-          <wp:inline distT="0" distB="0" distL="0" distR="0" wp14:anchorId="36C833A9" wp14:editId="3972AB78">
+          <wp:inline distT="0" distB="0" distL="0" distR="0" wp14:anchorId="6E84445B" wp14:editId="633F38C3">
             <wp:extent cx="5580000" cy="3332500"/>
             <wp:effectExtent l="0" t="0" r="0" b="0"/>
             <wp:docPr id="522444765" name="Picture 522444765"/>
@@ -24812,7 +24994,7 @@
       <w:pPr>
         <w:pStyle w:val="FigureCaption"/>
       </w:pPr>
-      <w:bookmarkStart w:id="52" w:name="_Toc242043759"/>
+      <w:bookmarkStart w:id="52" w:name="_Toc242044461"/>
       <w:r>
         <w:t>Hình 4.5. Một màn hình danh sách: Công nợ học phí</w:t>
       </w:r>
@@ -24822,7 +25004,7 @@
       <w:pPr>
         <w:pStyle w:val="TableCaption"/>
       </w:pPr>
-      <w:bookmarkStart w:id="53" w:name="_Toc242043787"/>
+      <w:bookmarkStart w:id="53" w:name="_Toc242044489"/>
       <w:r>
         <w:t>Bảng 4.4. Các thành phần của màn hình danh sách</w:t>
       </w:r>
@@ -25664,7 +25846,7 @@
       <w:pPr>
         <w:pStyle w:val="Heading2"/>
       </w:pPr>
-      <w:bookmarkStart w:id="54" w:name="_Toc242043721"/>
+      <w:bookmarkStart w:id="54" w:name="_Toc242044423"/>
       <w:r>
         <w:t>4.9. Form nhập liệu và hộp xác nhận</w:t>
       </w:r>
@@ -25827,7 +26009,7 @@
         <w:pStyle w:val="Heading1"/>
         <w:pageBreakBefore/>
       </w:pPr>
-      <w:bookmarkStart w:id="55" w:name="_Toc242043722"/>
+      <w:bookmarkStart w:id="55" w:name="_Toc242044424"/>
       <w:r>
         <w:lastRenderedPageBreak/>
         <w:t>CHƯƠNG 5. HƯỚNG DẪN THEO CHỨC NĂNG</w:t>
@@ -25848,7 +26030,7 @@
       <w:pPr>
         <w:pStyle w:val="Heading2"/>
       </w:pPr>
-      <w:bookmarkStart w:id="56" w:name="_Toc242043723"/>
+      <w:bookmarkStart w:id="56" w:name="_Toc242044425"/>
       <w:r>
         <w:t>5.1. Tổng quan</w:t>
       </w:r>
@@ -25892,7 +26074,7 @@
       <w:pPr>
         <w:pStyle w:val="TableCaption"/>
       </w:pPr>
-      <w:bookmarkStart w:id="57" w:name="_Toc242043788"/>
+      <w:bookmarkStart w:id="57" w:name="_Toc242044490"/>
       <w:r>
         <w:t>Bảng 5.1. Các thẻ số liệu trên trang Tổng quan</w:t>
       </w:r>
@@ -26374,7 +26556,7 @@
           <w:noProof/>
         </w:rPr>
         <w:drawing>
-          <wp:inline distT="0" distB="0" distL="0" distR="0" wp14:anchorId="7F28E299" wp14:editId="5E89F6C6">
+          <wp:inline distT="0" distB="0" distL="0" distR="0" wp14:anchorId="0B718BA7" wp14:editId="1E072DFB">
             <wp:extent cx="5580000" cy="3332500"/>
             <wp:effectExtent l="0" t="0" r="0" b="0"/>
             <wp:docPr id="522444766" name="Picture 522444766"/>
@@ -26414,7 +26596,7 @@
       <w:pPr>
         <w:pStyle w:val="FigureCaption"/>
       </w:pPr>
-      <w:bookmarkStart w:id="58" w:name="_Toc242043760"/>
+      <w:bookmarkStart w:id="58" w:name="_Toc242044462"/>
       <w:r>
         <w:t>Hình 5.1. Trang Tổng quan của Giáo vụ: không có quyền xem doanh thu nên biểu đồ để trống</w:t>
       </w:r>
@@ -26424,7 +26606,7 @@
       <w:pPr>
         <w:pStyle w:val="Heading2"/>
       </w:pPr>
-      <w:bookmarkStart w:id="59" w:name="_Toc242043724"/>
+      <w:bookmarkStart w:id="59" w:name="_Toc242044426"/>
       <w:r>
         <w:lastRenderedPageBreak/>
         <w:t>5.2. Học viên</w:t>
@@ -26458,7 +26640,7 @@
           <w:noProof/>
         </w:rPr>
         <w:drawing>
-          <wp:inline distT="0" distB="0" distL="0" distR="0" wp14:anchorId="6DCCF90C" wp14:editId="6B7B2982">
+          <wp:inline distT="0" distB="0" distL="0" distR="0" wp14:anchorId="147BC563" wp14:editId="6B501A37">
             <wp:extent cx="5580000" cy="3332500"/>
             <wp:effectExtent l="0" t="0" r="0" b="0"/>
             <wp:docPr id="522444767" name="Picture 522444767"/>
@@ -26498,7 +26680,7 @@
       <w:pPr>
         <w:pStyle w:val="FigureCaption"/>
       </w:pPr>
-      <w:bookmarkStart w:id="60" w:name="_Toc242043761"/>
+      <w:bookmarkStart w:id="60" w:name="_Toc242044463"/>
       <w:r>
         <w:t>Hình 5.2. Danh sách học viên</w:t>
       </w:r>
@@ -26508,7 +26690,7 @@
       <w:pPr>
         <w:pStyle w:val="Heading3"/>
       </w:pPr>
-      <w:bookmarkStart w:id="61" w:name="_Toc242043725"/>
+      <w:bookmarkStart w:id="61" w:name="_Toc242044427"/>
       <w:r>
         <w:t>5.2.1. Tìm kiếm</w:t>
       </w:r>
@@ -26605,7 +26787,7 @@
       <w:pPr>
         <w:pStyle w:val="Heading3"/>
       </w:pPr>
-      <w:bookmarkStart w:id="62" w:name="_Toc242043726"/>
+      <w:bookmarkStart w:id="62" w:name="_Toc242044428"/>
       <w:r>
         <w:t>5.2.2. Thêm học viên</w:t>
       </w:r>
@@ -26810,7 +26992,7 @@
       <w:pPr>
         <w:pStyle w:val="Heading3"/>
       </w:pPr>
-      <w:bookmarkStart w:id="63" w:name="_Toc242043727"/>
+      <w:bookmarkStart w:id="63" w:name="_Toc242044429"/>
       <w:r>
         <w:t>5.2.3. Sửa thông tin</w:t>
       </w:r>
@@ -26931,7 +27113,7 @@
           <w:noProof/>
         </w:rPr>
         <w:drawing>
-          <wp:inline distT="0" distB="0" distL="0" distR="0" wp14:anchorId="6EF44CA5" wp14:editId="2D2D4FDA">
+          <wp:inline distT="0" distB="0" distL="0" distR="0" wp14:anchorId="7B0A931B" wp14:editId="5FBA7EFF">
             <wp:extent cx="3780000" cy="5048129"/>
             <wp:effectExtent l="0" t="0" r="0" b="0"/>
             <wp:docPr id="522444768" name="Picture 522444768"/>
@@ -26971,7 +27153,7 @@
       <w:pPr>
         <w:pStyle w:val="FigureCaption"/>
       </w:pPr>
-      <w:bookmarkStart w:id="64" w:name="_Toc242043762"/>
+      <w:bookmarkStart w:id="64" w:name="_Toc242044464"/>
       <w:r>
         <w:t>Hình 5.3. Hộp thoại sửa thông tin học viên</w:t>
       </w:r>
@@ -26991,7 +27173,7 @@
       <w:pPr>
         <w:pStyle w:val="TableCaption"/>
       </w:pPr>
-      <w:bookmarkStart w:id="65" w:name="_Toc242043789"/>
+      <w:bookmarkStart w:id="65" w:name="_Toc242044491"/>
       <w:r>
         <w:t>Bảng 5.2. Quy tắc kiểm tra thông tin học viên</w:t>
       </w:r>
@@ -27655,7 +27837,7 @@
       <w:pPr>
         <w:pStyle w:val="Heading3"/>
       </w:pPr>
-      <w:bookmarkStart w:id="66" w:name="_Toc242043728"/>
+      <w:bookmarkStart w:id="66" w:name="_Toc242044430"/>
       <w:r>
         <w:t>5.2.4. Xóa học viên</w:t>
       </w:r>
@@ -27776,7 +27958,7 @@
       <w:pPr>
         <w:pStyle w:val="Heading3"/>
       </w:pPr>
-      <w:bookmarkStart w:id="67" w:name="_Toc242043729"/>
+      <w:bookmarkStart w:id="67" w:name="_Toc242044431"/>
       <w:r>
         <w:t>5.2.5. Hồ sơ, ghi danh và kiểm tra xếp lớp từ danh sách học viên</w:t>
       </w:r>
@@ -27846,7 +28028,7 @@
       <w:pPr>
         <w:pStyle w:val="Heading3"/>
       </w:pPr>
-      <w:bookmarkStart w:id="68" w:name="_Toc242043730"/>
+      <w:bookmarkStart w:id="68" w:name="_Toc242044432"/>
       <w:r>
         <w:t>5.2.6. Xuất, nhập danh sách bằng XML</w:t>
       </w:r>
@@ -27932,7 +28114,7 @@
       <w:pPr>
         <w:pStyle w:val="Heading2"/>
       </w:pPr>
-      <w:bookmarkStart w:id="69" w:name="_Toc242043731"/>
+      <w:bookmarkStart w:id="69" w:name="_Toc242044433"/>
       <w:r>
         <w:t>5.3. Kiểm tra xếp lớp</w:t>
       </w:r>
@@ -28020,7 +28202,7 @@
         </w:rPr>
         <w:lastRenderedPageBreak/>
         <w:drawing>
-          <wp:inline distT="0" distB="0" distL="0" distR="0" wp14:anchorId="3E5D260D" wp14:editId="1689A1FC">
+          <wp:inline distT="0" distB="0" distL="0" distR="0" wp14:anchorId="10A6F726" wp14:editId="70641F9A">
             <wp:extent cx="5580000" cy="3332500"/>
             <wp:effectExtent l="0" t="0" r="0" b="0"/>
             <wp:docPr id="522444769" name="Picture 522444769"/>
@@ -28060,7 +28242,7 @@
       <w:pPr>
         <w:pStyle w:val="FigureCaption"/>
       </w:pPr>
-      <w:bookmarkStart w:id="70" w:name="_Toc242043763"/>
+      <w:bookmarkStart w:id="70" w:name="_Toc242044465"/>
       <w:r>
         <w:t>Hình 5.4. Danh sách bài kiểm tra xếp lớp</w:t>
       </w:r>
@@ -28325,7 +28507,7 @@
       <w:pPr>
         <w:pStyle w:val="Heading2"/>
       </w:pPr>
-      <w:bookmarkStart w:id="71" w:name="_Toc242043732"/>
+      <w:bookmarkStart w:id="71" w:name="_Toc242044434"/>
       <w:r>
         <w:t>5.4. Lớp học</w:t>
       </w:r>
@@ -28377,7 +28559,7 @@
         </w:rPr>
         <w:lastRenderedPageBreak/>
         <w:drawing>
-          <wp:inline distT="0" distB="0" distL="0" distR="0" wp14:anchorId="3917EB2F" wp14:editId="65A62B1C">
+          <wp:inline distT="0" distB="0" distL="0" distR="0" wp14:anchorId="4C1D5CFE" wp14:editId="1D855477">
             <wp:extent cx="5580000" cy="3332500"/>
             <wp:effectExtent l="0" t="0" r="0" b="0"/>
             <wp:docPr id="522444770" name="Picture 522444770"/>
@@ -28417,7 +28599,7 @@
       <w:pPr>
         <w:pStyle w:val="FigureCaption"/>
       </w:pPr>
-      <w:bookmarkStart w:id="72" w:name="_Toc242043764"/>
+      <w:bookmarkStart w:id="72" w:name="_Toc242044466"/>
       <w:r>
         <w:t>Hình 5.5. Màn hình Lớp học và các nút quản lý vòng đời lớp</w:t>
       </w:r>
@@ -28843,7 +29025,7 @@
       <w:pPr>
         <w:pStyle w:val="TableCaption"/>
       </w:pPr>
-      <w:bookmarkStart w:id="73" w:name="_Toc242043790"/>
+      <w:bookmarkStart w:id="73" w:name="_Toc242044492"/>
       <w:r>
         <w:t>Bảng 5.3. Quy tắc CSDL kiểm tra khi quản lý lớp học</w:t>
       </w:r>
@@ -29322,7 +29504,7 @@
       <w:pPr>
         <w:pStyle w:val="Heading2"/>
       </w:pPr>
-      <w:bookmarkStart w:id="74" w:name="_Toc242043733"/>
+      <w:bookmarkStart w:id="74" w:name="_Toc242044435"/>
       <w:r>
         <w:t>5.5. Ghi danh</w:t>
       </w:r>
@@ -29382,7 +29564,7 @@
           <w:noProof/>
         </w:rPr>
         <w:drawing>
-          <wp:inline distT="0" distB="0" distL="0" distR="0" wp14:anchorId="32D0C47D" wp14:editId="0E0EB7CB">
+          <wp:inline distT="0" distB="0" distL="0" distR="0" wp14:anchorId="1F062B0E" wp14:editId="4AAE790C">
             <wp:extent cx="5580000" cy="3332500"/>
             <wp:effectExtent l="0" t="0" r="0" b="0"/>
             <wp:docPr id="522444771" name="Picture 522444771"/>
@@ -29422,7 +29604,7 @@
       <w:pPr>
         <w:pStyle w:val="FigureCaption"/>
       </w:pPr>
-      <w:bookmarkStart w:id="75" w:name="_Toc242043765"/>
+      <w:bookmarkStart w:id="75" w:name="_Toc242044467"/>
       <w:r>
         <w:t>Hình 5.6. Danh sách ghi danh</w:t>
       </w:r>
@@ -29695,7 +29877,7 @@
       <w:pPr>
         <w:pStyle w:val="TableCaption"/>
       </w:pPr>
-      <w:bookmarkStart w:id="76" w:name="_Toc242043791"/>
+      <w:bookmarkStart w:id="76" w:name="_Toc242044493"/>
       <w:r>
         <w:t>Bảng 5.4. Quy tắc CSDL kiểm tra khi ghi danh và chuyển lớp</w:t>
       </w:r>
@@ -30084,7 +30266,7 @@
       <w:pPr>
         <w:pStyle w:val="Heading2"/>
       </w:pPr>
-      <w:bookmarkStart w:id="77" w:name="_Toc242043734"/>
+      <w:bookmarkStart w:id="77" w:name="_Toc242044436"/>
       <w:r>
         <w:t>5.6. Lịch học - điểm danh</w:t>
       </w:r>
@@ -30172,7 +30354,7 @@
         </w:rPr>
         <w:lastRenderedPageBreak/>
         <w:drawing>
-          <wp:inline distT="0" distB="0" distL="0" distR="0" wp14:anchorId="65ADAC0E" wp14:editId="52AE6F99">
+          <wp:inline distT="0" distB="0" distL="0" distR="0" wp14:anchorId="2266ADB5" wp14:editId="5822C541">
             <wp:extent cx="5580000" cy="3332500"/>
             <wp:effectExtent l="0" t="0" r="0" b="0"/>
             <wp:docPr id="522444772" name="Picture 522444772"/>
@@ -30212,7 +30394,7 @@
       <w:pPr>
         <w:pStyle w:val="FigureCaption"/>
       </w:pPr>
-      <w:bookmarkStart w:id="78" w:name="_Toc242043766"/>
+      <w:bookmarkStart w:id="78" w:name="_Toc242044468"/>
       <w:r>
         <w:t>Hình 5.7. Lịch học - điểm danh của một tuần</w:t>
       </w:r>
@@ -30452,7 +30634,7 @@
       <w:pPr>
         <w:pStyle w:val="Heading2"/>
       </w:pPr>
-      <w:bookmarkStart w:id="79" w:name="_Toc242043735"/>
+      <w:bookmarkStart w:id="79" w:name="_Toc242044437"/>
       <w:r>
         <w:t>5.7. Sổ điểm</w:t>
       </w:r>
@@ -30495,7 +30677,7 @@
         </w:rPr>
         <w:lastRenderedPageBreak/>
         <w:drawing>
-          <wp:inline distT="0" distB="0" distL="0" distR="0" wp14:anchorId="08FC2A9C" wp14:editId="4CFB56F9">
+          <wp:inline distT="0" distB="0" distL="0" distR="0" wp14:anchorId="48F639E9" wp14:editId="29187DAE">
             <wp:extent cx="5580000" cy="3332500"/>
             <wp:effectExtent l="0" t="0" r="0" b="0"/>
             <wp:docPr id="522444773" name="Picture 522444773"/>
@@ -30535,7 +30717,7 @@
       <w:pPr>
         <w:pStyle w:val="FigureCaption"/>
       </w:pPr>
-      <w:bookmarkStart w:id="80" w:name="_Toc242043767"/>
+      <w:bookmarkStart w:id="80" w:name="_Toc242044469"/>
       <w:r>
         <w:t>Hình 5.8. Sổ điểm của một lớp</w:t>
       </w:r>
@@ -30659,7 +30841,7 @@
       <w:pPr>
         <w:pStyle w:val="Heading2"/>
       </w:pPr>
-      <w:bookmarkStart w:id="81" w:name="_Toc242043736"/>
+      <w:bookmarkStart w:id="81" w:name="_Toc242044438"/>
       <w:r>
         <w:t>5.8. Kết quả học tập</w:t>
       </w:r>
@@ -30720,7 +30902,7 @@
         </w:rPr>
         <w:lastRenderedPageBreak/>
         <w:drawing>
-          <wp:inline distT="0" distB="0" distL="0" distR="0" wp14:anchorId="6144600D" wp14:editId="1725CB83">
+          <wp:inline distT="0" distB="0" distL="0" distR="0" wp14:anchorId="2B9A547A" wp14:editId="5AA7A51C">
             <wp:extent cx="5580000" cy="3332500"/>
             <wp:effectExtent l="0" t="0" r="0" b="0"/>
             <wp:docPr id="522444774" name="Picture 522444774"/>
@@ -30760,7 +30942,7 @@
       <w:pPr>
         <w:pStyle w:val="FigureCaption"/>
       </w:pPr>
-      <w:bookmarkStart w:id="82" w:name="_Toc242043768"/>
+      <w:bookmarkStart w:id="82" w:name="_Toc242044470"/>
       <w:r>
         <w:t>Hình 5.9. Kết quả học tập</w:t>
       </w:r>
@@ -30770,7 +30952,7 @@
       <w:pPr>
         <w:pStyle w:val="Heading2"/>
       </w:pPr>
-      <w:bookmarkStart w:id="83" w:name="_Toc242043737"/>
+      <w:bookmarkStart w:id="83" w:name="_Toc242044439"/>
       <w:r>
         <w:t>5.9. Thu học phí</w:t>
       </w:r>
@@ -30839,7 +31021,7 @@
           <w:noProof/>
         </w:rPr>
         <w:drawing>
-          <wp:inline distT="0" distB="0" distL="0" distR="0" wp14:anchorId="1FFD0C93" wp14:editId="49D82EC8">
+          <wp:inline distT="0" distB="0" distL="0" distR="0" wp14:anchorId="6C760660" wp14:editId="06DF7D9A">
             <wp:extent cx="5580000" cy="3332500"/>
             <wp:effectExtent l="0" t="0" r="0" b="0"/>
             <wp:docPr id="522444775" name="Picture 522444775"/>
@@ -30879,7 +31061,7 @@
       <w:pPr>
         <w:pStyle w:val="FigureCaption"/>
       </w:pPr>
-      <w:bookmarkStart w:id="84" w:name="_Toc242043769"/>
+      <w:bookmarkStart w:id="84" w:name="_Toc242044471"/>
       <w:r>
         <w:t>Hình 5.10. Danh sách phiếu thu (Kế toán)</w:t>
       </w:r>
@@ -31190,7 +31372,7 @@
       <w:pPr>
         <w:pStyle w:val="Heading2"/>
       </w:pPr>
-      <w:bookmarkStart w:id="85" w:name="_Toc242043738"/>
+      <w:bookmarkStart w:id="85" w:name="_Toc242044440"/>
       <w:r>
         <w:t>5.10. Công nợ học phí</w:t>
       </w:r>
@@ -31243,7 +31425,7 @@
       <w:pPr>
         <w:pStyle w:val="Heading2"/>
       </w:pPr>
-      <w:bookmarkStart w:id="86" w:name="_Toc242043739"/>
+      <w:bookmarkStart w:id="86" w:name="_Toc242044441"/>
       <w:r>
         <w:t>5.11. Doanh thu</w:t>
       </w:r>
@@ -31345,7 +31527,7 @@
         </w:rPr>
         <w:lastRenderedPageBreak/>
         <w:drawing>
-          <wp:inline distT="0" distB="0" distL="0" distR="0" wp14:anchorId="05877E29" wp14:editId="39FF93A8">
+          <wp:inline distT="0" distB="0" distL="0" distR="0" wp14:anchorId="46E21FA3" wp14:editId="6BE48DDF">
             <wp:extent cx="5580000" cy="3332500"/>
             <wp:effectExtent l="0" t="0" r="0" b="0"/>
             <wp:docPr id="522444776" name="Picture 522444776"/>
@@ -31385,7 +31567,7 @@
       <w:pPr>
         <w:pStyle w:val="FigureCaption"/>
       </w:pPr>
-      <w:bookmarkStart w:id="87" w:name="_Toc242043770"/>
+      <w:bookmarkStart w:id="87" w:name="_Toc242044472"/>
       <w:r>
         <w:t>Hình 5.11. Doanh thu theo tháng và chi nhánh (Kế toán)</w:t>
       </w:r>
@@ -31395,7 +31577,7 @@
       <w:pPr>
         <w:pStyle w:val="Heading2"/>
       </w:pPr>
-      <w:bookmarkStart w:id="88" w:name="_Toc242043740"/>
+      <w:bookmarkStart w:id="88" w:name="_Toc242044442"/>
       <w:r>
         <w:t>5.12. Lương giáo viên</w:t>
       </w:r>
@@ -31446,7 +31628,7 @@
           <w:noProof/>
         </w:rPr>
         <w:drawing>
-          <wp:inline distT="0" distB="0" distL="0" distR="0" wp14:anchorId="1CD066AE" wp14:editId="01FFE21A">
+          <wp:inline distT="0" distB="0" distL="0" distR="0" wp14:anchorId="3A23A62A" wp14:editId="04AA605E">
             <wp:extent cx="5580000" cy="3332500"/>
             <wp:effectExtent l="0" t="0" r="0" b="0"/>
             <wp:docPr id="522444777" name="Picture 522444777"/>
@@ -31486,7 +31668,7 @@
       <w:pPr>
         <w:pStyle w:val="FigureCaption"/>
       </w:pPr>
-      <w:bookmarkStart w:id="89" w:name="_Toc242043771"/>
+      <w:bookmarkStart w:id="89" w:name="_Toc242044473"/>
       <w:r>
         <w:t>Hình 5.12. Bảng lương giáo viên (Kế toán)</w:t>
       </w:r>
@@ -31593,7 +31775,7 @@
       <w:pPr>
         <w:pStyle w:val="Heading2"/>
       </w:pPr>
-      <w:bookmarkStart w:id="90" w:name="_Toc242043741"/>
+      <w:bookmarkStart w:id="90" w:name="_Toc242044443"/>
       <w:r>
         <w:t>5.13. Danh mục</w:t>
       </w:r>
@@ -31646,7 +31828,7 @@
       <w:pPr>
         <w:pStyle w:val="Heading3"/>
       </w:pPr>
-      <w:bookmarkStart w:id="91" w:name="_Toc242043742"/>
+      <w:bookmarkStart w:id="91" w:name="_Toc242044444"/>
       <w:r>
         <w:t>5.13.1. Khóa học</w:t>
       </w:r>
@@ -31682,7 +31864,7 @@
           <w:noProof/>
         </w:rPr>
         <w:drawing>
-          <wp:inline distT="0" distB="0" distL="0" distR="0" wp14:anchorId="5091BE76" wp14:editId="0244857F">
+          <wp:inline distT="0" distB="0" distL="0" distR="0" wp14:anchorId="173FB817" wp14:editId="0285F7D7">
             <wp:extent cx="5580000" cy="3332500"/>
             <wp:effectExtent l="0" t="0" r="0" b="0"/>
             <wp:docPr id="522444778" name="Picture 522444778"/>
@@ -31722,7 +31904,7 @@
       <w:pPr>
         <w:pStyle w:val="FigureCaption"/>
       </w:pPr>
-      <w:bookmarkStart w:id="92" w:name="_Toc242043772"/>
+      <w:bookmarkStart w:id="92" w:name="_Toc242044474"/>
       <w:r>
         <w:t>Hình 5.13. Danh mục khóa học và cột điểm của khóa đang chọn</w:t>
       </w:r>
@@ -31926,7 +32108,7 @@
       <w:pPr>
         <w:pStyle w:val="Heading3"/>
       </w:pPr>
-      <w:bookmarkStart w:id="93" w:name="_Toc242043743"/>
+      <w:bookmarkStart w:id="93" w:name="_Toc242044445"/>
       <w:r>
         <w:t>5.13.2. Giáo viên, Nhân viên</w:t>
       </w:r>
@@ -32053,7 +32235,7 @@
       <w:pPr>
         <w:pStyle w:val="Heading3"/>
       </w:pPr>
-      <w:bookmarkStart w:id="94" w:name="_Toc242043744"/>
+      <w:bookmarkStart w:id="94" w:name="_Toc242044446"/>
       <w:r>
         <w:t>5.13.3. Chi nhánh - phòng học, Khuyến mãi</w:t>
       </w:r>
@@ -32251,7 +32433,7 @@
         </w:rPr>
         <w:lastRenderedPageBreak/>
         <w:drawing>
-          <wp:inline distT="0" distB="0" distL="0" distR="0" wp14:anchorId="19C20E57" wp14:editId="44ACD1BC">
+          <wp:inline distT="0" distB="0" distL="0" distR="0" wp14:anchorId="6881B065" wp14:editId="525902DC">
             <wp:extent cx="5580000" cy="3332500"/>
             <wp:effectExtent l="0" t="0" r="0" b="0"/>
             <wp:docPr id="522444779" name="Picture 522444779"/>
@@ -32291,7 +32473,7 @@
       <w:pPr>
         <w:pStyle w:val="FigureCaption"/>
       </w:pPr>
-      <w:bookmarkStart w:id="95" w:name="_Toc242043773"/>
+      <w:bookmarkStart w:id="95" w:name="_Toc242044475"/>
       <w:r>
         <w:t>Hình 5.14. Chi nhánh và phòng học của chi nhánh đang chọn</w:t>
       </w:r>
@@ -32301,7 +32483,7 @@
       <w:pPr>
         <w:pStyle w:val="Heading2"/>
       </w:pPr>
-      <w:bookmarkStart w:id="96" w:name="_Toc242043745"/>
+      <w:bookmarkStart w:id="96" w:name="_Toc242044447"/>
       <w:r>
         <w:t>5.14. Tài khoản</w:t>
       </w:r>
@@ -32352,7 +32534,7 @@
           <w:noProof/>
         </w:rPr>
         <w:drawing>
-          <wp:inline distT="0" distB="0" distL="0" distR="0" wp14:anchorId="34F6F7A2" wp14:editId="0186CFA2">
+          <wp:inline distT="0" distB="0" distL="0" distR="0" wp14:anchorId="3BCF9F8B" wp14:editId="2728675F">
             <wp:extent cx="5580000" cy="3332500"/>
             <wp:effectExtent l="0" t="0" r="0" b="0"/>
             <wp:docPr id="522444780" name="Picture 522444780"/>
@@ -32392,7 +32574,7 @@
       <w:pPr>
         <w:pStyle w:val="FigureCaption"/>
       </w:pPr>
-      <w:bookmarkStart w:id="97" w:name="_Toc242043774"/>
+      <w:bookmarkStart w:id="97" w:name="_Toc242044476"/>
       <w:r>
         <w:t>Hình 5.15. Danh sách tài khoản (Quản lý)</w:t>
       </w:r>
@@ -32552,7 +32734,7 @@
       <w:pPr>
         <w:pStyle w:val="Heading2"/>
       </w:pPr>
-      <w:bookmarkStart w:id="98" w:name="_Toc242043746"/>
+      <w:bookmarkStart w:id="98" w:name="_Toc242044448"/>
       <w:r>
         <w:t>5.15. Sao lưu</w:t>
       </w:r>
@@ -32702,7 +32884,7 @@
           <w:noProof/>
         </w:rPr>
         <w:drawing>
-          <wp:inline distT="0" distB="0" distL="0" distR="0" wp14:anchorId="2BD81BCC" wp14:editId="1CAF1F74">
+          <wp:inline distT="0" distB="0" distL="0" distR="0" wp14:anchorId="5412731D" wp14:editId="62D703F0">
             <wp:extent cx="5580000" cy="3332500"/>
             <wp:effectExtent l="0" t="0" r="0" b="0"/>
             <wp:docPr id="522444781" name="Picture 522444781"/>
@@ -32742,7 +32924,7 @@
       <w:pPr>
         <w:pStyle w:val="FigureCaption"/>
       </w:pPr>
-      <w:bookmarkStart w:id="99" w:name="_Toc242043775"/>
+      <w:bookmarkStart w:id="99" w:name="_Toc242044477"/>
       <w:r>
         <w:t>Hình 5.16. Màn hình sao lưu cơ sở dữ liệu</w:t>
       </w:r>
@@ -32771,7 +32953,7 @@
       <w:pPr>
         <w:pStyle w:val="Heading2"/>
       </w:pPr>
-      <w:bookmarkStart w:id="100" w:name="_Toc242043747"/>
+      <w:bookmarkStart w:id="100" w:name="_Toc242044449"/>
       <w:r>
         <w:lastRenderedPageBreak/>
         <w:t>5.16. Chức năng dành cho giáo viên</w:t>
@@ -32921,7 +33103,7 @@
           <w:noProof/>
         </w:rPr>
         <w:drawing>
-          <wp:inline distT="0" distB="0" distL="0" distR="0" wp14:anchorId="055668EB" wp14:editId="5F03AAF1">
+          <wp:inline distT="0" distB="0" distL="0" distR="0" wp14:anchorId="6DBEF74F" wp14:editId="52228BD5">
             <wp:extent cx="5580000" cy="3332500"/>
             <wp:effectExtent l="0" t="0" r="0" b="0"/>
             <wp:docPr id="522444782" name="Picture 522444782"/>
@@ -32961,7 +33143,7 @@
       <w:pPr>
         <w:pStyle w:val="FigureCaption"/>
       </w:pPr>
-      <w:bookmarkStart w:id="101" w:name="_Toc242043776"/>
+      <w:bookmarkStart w:id="101" w:name="_Toc242044478"/>
       <w:r>
         <w:t>Hình 5.17. Lịch dạy của giáo viên</w:t>
       </w:r>
@@ -32979,7 +33161,7 @@
         </w:rPr>
         <w:lastRenderedPageBreak/>
         <w:drawing>
-          <wp:inline distT="0" distB="0" distL="0" distR="0" wp14:anchorId="2AC1BE26" wp14:editId="65A88AD3">
+          <wp:inline distT="0" distB="0" distL="0" distR="0" wp14:anchorId="125B4738" wp14:editId="52C7E4D7">
             <wp:extent cx="5580000" cy="3332500"/>
             <wp:effectExtent l="0" t="0" r="0" b="0"/>
             <wp:docPr id="522444783" name="Picture 522444783"/>
@@ -33019,7 +33201,7 @@
       <w:pPr>
         <w:pStyle w:val="FigureCaption"/>
       </w:pPr>
-      <w:bookmarkStart w:id="102" w:name="_Toc242043777"/>
+      <w:bookmarkStart w:id="102" w:name="_Toc242044479"/>
       <w:r>
         <w:t>Hình 5.18. Sổ điểm của giáo viên</w:t>
       </w:r>
@@ -33029,7 +33211,7 @@
       <w:pPr>
         <w:pStyle w:val="Heading2"/>
       </w:pPr>
-      <w:bookmarkStart w:id="103" w:name="_Toc242043748"/>
+      <w:bookmarkStart w:id="103" w:name="_Toc242044450"/>
       <w:r>
         <w:t>5.17. Việc vẫn làm trong SSMS</w:t>
       </w:r>
@@ -33129,7 +33311,7 @@
         <w:pStyle w:val="Heading1"/>
         <w:pageBreakBefore/>
       </w:pPr>
-      <w:bookmarkStart w:id="104" w:name="_Toc242043749"/>
+      <w:bookmarkStart w:id="104" w:name="_Toc242044451"/>
       <w:r>
         <w:lastRenderedPageBreak/>
         <w:t>CHƯƠNG 6. XỬ LÝ SỰ CỐ</w:t>
@@ -33140,7 +33322,7 @@
       <w:pPr>
         <w:pStyle w:val="Heading2"/>
       </w:pPr>
-      <w:bookmarkStart w:id="105" w:name="_Toc242043750"/>
+      <w:bookmarkStart w:id="105" w:name="_Toc242044452"/>
       <w:r>
         <w:t>6.1. Kiểm tra kết nối không cần giao diện</w:t>
       </w:r>
@@ -33547,7 +33729,7 @@
       <w:pPr>
         <w:pStyle w:val="Heading2"/>
       </w:pPr>
-      <w:bookmarkStart w:id="106" w:name="_Toc242043751"/>
+      <w:bookmarkStart w:id="106" w:name="_Toc242044453"/>
       <w:r>
         <w:t>6.2. Lỗi thường gặp</w:t>
       </w:r>
@@ -33557,7 +33739,7 @@
       <w:pPr>
         <w:pStyle w:val="TableCaption"/>
       </w:pPr>
-      <w:bookmarkStart w:id="107" w:name="_Toc242043792"/>
+      <w:bookmarkStart w:id="107" w:name="_Toc242044494"/>
       <w:r>
         <w:t>Bảng 6.1. Lỗi thường gặp và cách xử lý</w:t>
       </w:r>
@@ -36017,7 +36199,7 @@
       <w:pPr>
         <w:pStyle w:val="Heading2"/>
       </w:pPr>
-      <w:bookmarkStart w:id="108" w:name="_Toc242043752"/>
+      <w:bookmarkStart w:id="108" w:name="_Toc242044454"/>
       <w:r>
         <w:t>6.3. Khi cần hỗ trợ thêm</w:t>
       </w:r>
@@ -36069,7 +36251,7 @@
         <w:pStyle w:val="Heading1"/>
         <w:pageBreakBefore/>
       </w:pPr>
-      <w:bookmarkStart w:id="109" w:name="_Toc242043753"/>
+      <w:bookmarkStart w:id="109" w:name="_Toc242044455"/>
       <w:r>
         <w:lastRenderedPageBreak/>
         <w:t>PHỤ LỤC A. TÓM TẮT LỆNH</w:t>
@@ -36820,7 +37002,7 @@
         <w:pStyle w:val="Heading1"/>
         <w:pageBreakBefore/>
       </w:pPr>
-      <w:bookmarkStart w:id="110" w:name="_Toc242043754"/>
+      <w:bookmarkStart w:id="110" w:name="_Toc242044456"/>
       <w:r>
         <w:lastRenderedPageBreak/>
         <w:t>PHỤ LỤC B. CÁC MỤC CẦN BỔ SUNG</w:t>
@@ -38371,33 +38553,20 @@
               <w:rPr>
                 <w:sz w:val="19"/>
               </w:rPr>
-              <w:t xml:space="preserve">Kiểm tra trên Windows và cập nhật các bước trên: tên chính xác của các nút/hộp thoại trong bộ cài, thư mục cài mặc định khi cài cho riêng người dùng (dự kiến </w:t>
+              <w:t xml:space="preserve">Kiểm tra trên Windows bằng giao diện: tên chính xác của các nút/hộp thoại trong bộ cài và thư mục cài mặc định khi chọn cài cho mọi người dùng (dự kiến </w:t>
             </w:r>
             <w:r>
               <w:rPr>
                 <w:color w:val="C7254E"/>
                 <w:sz w:val="19"/>
               </w:rPr>
-              <w:t>%LOCALAPPDATA%\Programs\QLTTTA</w:t>
+              <w:t>C:\Program Files\QLTTTA</w:t>
             </w:r>
             <w:r>
               <w:rPr>
                 <w:sz w:val="19"/>
               </w:rPr>
-              <w:t>) và khi cài cho mọi người dùng (</w:t>
-            </w:r>
-            <w:r>
-              <w:rPr>
-                <w:color w:val="C7254E"/>
-                <w:sz w:val="19"/>
-              </w:rPr>
-              <w:t>C:\Program Files\QLTTTA</w:t>
-            </w:r>
-            <w:r>
-              <w:rPr>
-                <w:sz w:val="19"/>
-              </w:rPr>
-              <w:t>).</w:t>
+              <w:t>, cần quyền Administrator).</w:t>
             </w:r>
           </w:p>
         </w:tc>
@@ -38764,7 +38933,7 @@
               <w:rPr>
                 <w:sz w:val="19"/>
               </w:rPr>
-              <w:t>Xác nhận trên Windows đường dẫn gỡ cài đặt trong Settings (Windows 10 và 11 khác nhau) và khóa registry ở trên.</w:t>
+              <w:t>Xác nhận trên Windows đường dẫn gỡ cài đặt trong Settings (Windows 10 và 11 khác nhau).</w:t>
             </w:r>
           </w:p>
         </w:tc>

</xml_diff>

<commit_message>
docs: keep every entry of the lists of figures on one line
Eight figure captions wrapped in the list of figures (report figures
6.3, 6.4 and 6.8-6.12, user guide figure 5.1), which pushed the page
number to a second line. Shorten them, and the two report captions
that only just fit (6.7, 6.13), to at most 60 characters while keeping
what they describe; the longest caption that still fit had 70.

report_lib.figure() now stops the build on a longer caption, and
Guide.figure_or_placeholder() checks it even before the Windows
screenshot exists, so a new caption cannot wrap again unnoticed.
Regenerate the docx and PDF of the report and the user guide.
</commit_message>
<xml_diff>
--- a/docs/user-guide/QLTTTA_User_Guide.docx
+++ b/docs/user-guide/QLTTTA_User_Guide.docx
@@ -1255,7 +1255,7 @@
               <w:rPr>
                 <w:sz w:val="22"/>
               </w:rPr>
-              <w:t>04/10/2026</w:t>
+              <w:t>05/10/2026</w:t>
             </w:r>
           </w:p>
         </w:tc>
@@ -1401,7 +1401,7 @@
       <w:r>
         <w:fldChar w:fldCharType="separate"/>
       </w:r>
-      <w:hyperlink w:anchor="_Toc242048911" w:history="1">
+      <w:hyperlink w:anchor="_Toc242052284" w:history="1">
         <w:r>
           <w:rPr>
             <w:rStyle w:val="Hyperlink"/>
@@ -1428,7 +1428,7 @@
             <w:noProof/>
             <w:webHidden/>
           </w:rPr>
-          <w:instrText xml:space="preserve"> PAGEREF _Toc242048911 \h </w:instrText>
+          <w:instrText xml:space="preserve"> PAGEREF _Toc242052284 \h </w:instrText>
         </w:r>
         <w:r>
           <w:rPr>
@@ -1474,7 +1474,7 @@
           <w14:ligatures w14:val="standardContextual"/>
         </w:rPr>
       </w:pPr>
-      <w:hyperlink w:anchor="_Toc242048912" w:history="1">
+      <w:hyperlink w:anchor="_Toc242052285" w:history="1">
         <w:r>
           <w:rPr>
             <w:rStyle w:val="Hyperlink"/>
@@ -1501,7 +1501,7 @@
             <w:noProof/>
             <w:webHidden/>
           </w:rPr>
-          <w:instrText xml:space="preserve"> PAGEREF _Toc242048912 \h </w:instrText>
+          <w:instrText xml:space="preserve"> PAGEREF _Toc242052285 \h </w:instrText>
         </w:r>
         <w:r>
           <w:rPr>
@@ -1547,7 +1547,7 @@
           <w14:ligatures w14:val="standardContextual"/>
         </w:rPr>
       </w:pPr>
-      <w:hyperlink w:anchor="_Toc242048913" w:history="1">
+      <w:hyperlink w:anchor="_Toc242052286" w:history="1">
         <w:r>
           <w:rPr>
             <w:rStyle w:val="Hyperlink"/>
@@ -1574,7 +1574,7 @@
             <w:noProof/>
             <w:webHidden/>
           </w:rPr>
-          <w:instrText xml:space="preserve"> PAGEREF _Toc242048913 \h </w:instrText>
+          <w:instrText xml:space="preserve"> PAGEREF _Toc242052286 \h </w:instrText>
         </w:r>
         <w:r>
           <w:rPr>
@@ -1620,7 +1620,7 @@
           <w14:ligatures w14:val="standardContextual"/>
         </w:rPr>
       </w:pPr>
-      <w:hyperlink w:anchor="_Toc242048914" w:history="1">
+      <w:hyperlink w:anchor="_Toc242052287" w:history="1">
         <w:r>
           <w:rPr>
             <w:rStyle w:val="Hyperlink"/>
@@ -1647,7 +1647,7 @@
             <w:noProof/>
             <w:webHidden/>
           </w:rPr>
-          <w:instrText xml:space="preserve"> PAGEREF _Toc242048914 \h </w:instrText>
+          <w:instrText xml:space="preserve"> PAGEREF _Toc242052287 \h </w:instrText>
         </w:r>
         <w:r>
           <w:rPr>
@@ -1693,7 +1693,7 @@
           <w14:ligatures w14:val="standardContextual"/>
         </w:rPr>
       </w:pPr>
-      <w:hyperlink w:anchor="_Toc242048915" w:history="1">
+      <w:hyperlink w:anchor="_Toc242052288" w:history="1">
         <w:r>
           <w:rPr>
             <w:rStyle w:val="Hyperlink"/>
@@ -1720,7 +1720,7 @@
             <w:noProof/>
             <w:webHidden/>
           </w:rPr>
-          <w:instrText xml:space="preserve"> PAGEREF _Toc242048915 \h </w:instrText>
+          <w:instrText xml:space="preserve"> PAGEREF _Toc242052288 \h </w:instrText>
         </w:r>
         <w:r>
           <w:rPr>
@@ -1766,7 +1766,7 @@
           <w14:ligatures w14:val="standardContextual"/>
         </w:rPr>
       </w:pPr>
-      <w:hyperlink w:anchor="_Toc242048916" w:history="1">
+      <w:hyperlink w:anchor="_Toc242052289" w:history="1">
         <w:r>
           <w:rPr>
             <w:rStyle w:val="Hyperlink"/>
@@ -1793,7 +1793,7 @@
             <w:noProof/>
             <w:webHidden/>
           </w:rPr>
-          <w:instrText xml:space="preserve"> PAGEREF _Toc242048916 \h </w:instrText>
+          <w:instrText xml:space="preserve"> PAGEREF _Toc242052289 \h </w:instrText>
         </w:r>
         <w:r>
           <w:rPr>
@@ -1839,7 +1839,7 @@
           <w14:ligatures w14:val="standardContextual"/>
         </w:rPr>
       </w:pPr>
-      <w:hyperlink w:anchor="_Toc242048917" w:history="1">
+      <w:hyperlink w:anchor="_Toc242052290" w:history="1">
         <w:r>
           <w:rPr>
             <w:rStyle w:val="Hyperlink"/>
@@ -1866,7 +1866,7 @@
             <w:noProof/>
             <w:webHidden/>
           </w:rPr>
-          <w:instrText xml:space="preserve"> PAGEREF _Toc242048917 \h </w:instrText>
+          <w:instrText xml:space="preserve"> PAGEREF _Toc242052290 \h </w:instrText>
         </w:r>
         <w:r>
           <w:rPr>
@@ -1912,7 +1912,7 @@
           <w14:ligatures w14:val="standardContextual"/>
         </w:rPr>
       </w:pPr>
-      <w:hyperlink w:anchor="_Toc242048918" w:history="1">
+      <w:hyperlink w:anchor="_Toc242052291" w:history="1">
         <w:r>
           <w:rPr>
             <w:rStyle w:val="Hyperlink"/>
@@ -1939,7 +1939,7 @@
             <w:noProof/>
             <w:webHidden/>
           </w:rPr>
-          <w:instrText xml:space="preserve"> PAGEREF _Toc242048918 \h </w:instrText>
+          <w:instrText xml:space="preserve"> PAGEREF _Toc242052291 \h </w:instrText>
         </w:r>
         <w:r>
           <w:rPr>
@@ -1985,7 +1985,7 @@
           <w14:ligatures w14:val="standardContextual"/>
         </w:rPr>
       </w:pPr>
-      <w:hyperlink w:anchor="_Toc242048919" w:history="1">
+      <w:hyperlink w:anchor="_Toc242052292" w:history="1">
         <w:r>
           <w:rPr>
             <w:rStyle w:val="Hyperlink"/>
@@ -2012,7 +2012,7 @@
             <w:noProof/>
             <w:webHidden/>
           </w:rPr>
-          <w:instrText xml:space="preserve"> PAGEREF _Toc242048919 \h </w:instrText>
+          <w:instrText xml:space="preserve"> PAGEREF _Toc242052292 \h </w:instrText>
         </w:r>
         <w:r>
           <w:rPr>
@@ -2058,7 +2058,7 @@
           <w14:ligatures w14:val="standardContextual"/>
         </w:rPr>
       </w:pPr>
-      <w:hyperlink w:anchor="_Toc242048920" w:history="1">
+      <w:hyperlink w:anchor="_Toc242052293" w:history="1">
         <w:r>
           <w:rPr>
             <w:rStyle w:val="Hyperlink"/>
@@ -2085,7 +2085,7 @@
             <w:noProof/>
             <w:webHidden/>
           </w:rPr>
-          <w:instrText xml:space="preserve"> PAGEREF _Toc242048920 \h </w:instrText>
+          <w:instrText xml:space="preserve"> PAGEREF _Toc242052293 \h </w:instrText>
         </w:r>
         <w:r>
           <w:rPr>
@@ -2131,7 +2131,7 @@
           <w14:ligatures w14:val="standardContextual"/>
         </w:rPr>
       </w:pPr>
-      <w:hyperlink w:anchor="_Toc242048921" w:history="1">
+      <w:hyperlink w:anchor="_Toc242052294" w:history="1">
         <w:r>
           <w:rPr>
             <w:rStyle w:val="Hyperlink"/>
@@ -2158,7 +2158,7 @@
             <w:noProof/>
             <w:webHidden/>
           </w:rPr>
-          <w:instrText xml:space="preserve"> PAGEREF _Toc242048921 \h </w:instrText>
+          <w:instrText xml:space="preserve"> PAGEREF _Toc242052294 \h </w:instrText>
         </w:r>
         <w:r>
           <w:rPr>
@@ -2204,7 +2204,7 @@
           <w14:ligatures w14:val="standardContextual"/>
         </w:rPr>
       </w:pPr>
-      <w:hyperlink w:anchor="_Toc242048922" w:history="1">
+      <w:hyperlink w:anchor="_Toc242052295" w:history="1">
         <w:r>
           <w:rPr>
             <w:rStyle w:val="Hyperlink"/>
@@ -2231,7 +2231,7 @@
             <w:noProof/>
             <w:webHidden/>
           </w:rPr>
-          <w:instrText xml:space="preserve"> PAGEREF _Toc242048922 \h </w:instrText>
+          <w:instrText xml:space="preserve"> PAGEREF _Toc242052295 \h </w:instrText>
         </w:r>
         <w:r>
           <w:rPr>
@@ -2277,7 +2277,7 @@
           <w14:ligatures w14:val="standardContextual"/>
         </w:rPr>
       </w:pPr>
-      <w:hyperlink w:anchor="_Toc242048923" w:history="1">
+      <w:hyperlink w:anchor="_Toc242052296" w:history="1">
         <w:r>
           <w:rPr>
             <w:rStyle w:val="Hyperlink"/>
@@ -2304,7 +2304,7 @@
             <w:noProof/>
             <w:webHidden/>
           </w:rPr>
-          <w:instrText xml:space="preserve"> PAGEREF _Toc242048923 \h </w:instrText>
+          <w:instrText xml:space="preserve"> PAGEREF _Toc242052296 \h </w:instrText>
         </w:r>
         <w:r>
           <w:rPr>
@@ -2350,7 +2350,7 @@
           <w14:ligatures w14:val="standardContextual"/>
         </w:rPr>
       </w:pPr>
-      <w:hyperlink w:anchor="_Toc242048924" w:history="1">
+      <w:hyperlink w:anchor="_Toc242052297" w:history="1">
         <w:r>
           <w:rPr>
             <w:rStyle w:val="Hyperlink"/>
@@ -2377,7 +2377,7 @@
             <w:noProof/>
             <w:webHidden/>
           </w:rPr>
-          <w:instrText xml:space="preserve"> PAGEREF _Toc242048924 \h </w:instrText>
+          <w:instrText xml:space="preserve"> PAGEREF _Toc242052297 \h </w:instrText>
         </w:r>
         <w:r>
           <w:rPr>
@@ -2423,7 +2423,7 @@
           <w14:ligatures w14:val="standardContextual"/>
         </w:rPr>
       </w:pPr>
-      <w:hyperlink w:anchor="_Toc242048925" w:history="1">
+      <w:hyperlink w:anchor="_Toc242052298" w:history="1">
         <w:r>
           <w:rPr>
             <w:rStyle w:val="Hyperlink"/>
@@ -2450,7 +2450,7 @@
             <w:noProof/>
             <w:webHidden/>
           </w:rPr>
-          <w:instrText xml:space="preserve"> PAGEREF _Toc242048925 \h </w:instrText>
+          <w:instrText xml:space="preserve"> PAGEREF _Toc242052298 \h </w:instrText>
         </w:r>
         <w:r>
           <w:rPr>
@@ -2496,7 +2496,7 @@
           <w14:ligatures w14:val="standardContextual"/>
         </w:rPr>
       </w:pPr>
-      <w:hyperlink w:anchor="_Toc242048926" w:history="1">
+      <w:hyperlink w:anchor="_Toc242052299" w:history="1">
         <w:r>
           <w:rPr>
             <w:rStyle w:val="Hyperlink"/>
@@ -2523,7 +2523,7 @@
             <w:noProof/>
             <w:webHidden/>
           </w:rPr>
-          <w:instrText xml:space="preserve"> PAGEREF _Toc242048926 \h </w:instrText>
+          <w:instrText xml:space="preserve"> PAGEREF _Toc242052299 \h </w:instrText>
         </w:r>
         <w:r>
           <w:rPr>
@@ -2569,7 +2569,7 @@
           <w14:ligatures w14:val="standardContextual"/>
         </w:rPr>
       </w:pPr>
-      <w:hyperlink w:anchor="_Toc242048927" w:history="1">
+      <w:hyperlink w:anchor="_Toc242052300" w:history="1">
         <w:r>
           <w:rPr>
             <w:rStyle w:val="Hyperlink"/>
@@ -2596,7 +2596,7 @@
             <w:noProof/>
             <w:webHidden/>
           </w:rPr>
-          <w:instrText xml:space="preserve"> PAGEREF _Toc242048927 \h </w:instrText>
+          <w:instrText xml:space="preserve"> PAGEREF _Toc242052300 \h </w:instrText>
         </w:r>
         <w:r>
           <w:rPr>
@@ -2642,7 +2642,7 @@
           <w14:ligatures w14:val="standardContextual"/>
         </w:rPr>
       </w:pPr>
-      <w:hyperlink w:anchor="_Toc242048928" w:history="1">
+      <w:hyperlink w:anchor="_Toc242052301" w:history="1">
         <w:r>
           <w:rPr>
             <w:rStyle w:val="Hyperlink"/>
@@ -2669,7 +2669,7 @@
             <w:noProof/>
             <w:webHidden/>
           </w:rPr>
-          <w:instrText xml:space="preserve"> PAGEREF _Toc242048928 \h </w:instrText>
+          <w:instrText xml:space="preserve"> PAGEREF _Toc242052301 \h </w:instrText>
         </w:r>
         <w:r>
           <w:rPr>
@@ -2715,7 +2715,7 @@
           <w14:ligatures w14:val="standardContextual"/>
         </w:rPr>
       </w:pPr>
-      <w:hyperlink w:anchor="_Toc242048929" w:history="1">
+      <w:hyperlink w:anchor="_Toc242052302" w:history="1">
         <w:r>
           <w:rPr>
             <w:rStyle w:val="Hyperlink"/>
@@ -2742,7 +2742,7 @@
             <w:noProof/>
             <w:webHidden/>
           </w:rPr>
-          <w:instrText xml:space="preserve"> PAGEREF _Toc242048929 \h </w:instrText>
+          <w:instrText xml:space="preserve"> PAGEREF _Toc242052302 \h </w:instrText>
         </w:r>
         <w:r>
           <w:rPr>
@@ -2788,7 +2788,7 @@
           <w14:ligatures w14:val="standardContextual"/>
         </w:rPr>
       </w:pPr>
-      <w:hyperlink w:anchor="_Toc242048930" w:history="1">
+      <w:hyperlink w:anchor="_Toc242052303" w:history="1">
         <w:r>
           <w:rPr>
             <w:rStyle w:val="Hyperlink"/>
@@ -2815,7 +2815,7 @@
             <w:noProof/>
             <w:webHidden/>
           </w:rPr>
-          <w:instrText xml:space="preserve"> PAGEREF _Toc242048930 \h </w:instrText>
+          <w:instrText xml:space="preserve"> PAGEREF _Toc242052303 \h </w:instrText>
         </w:r>
         <w:r>
           <w:rPr>
@@ -2861,7 +2861,7 @@
           <w14:ligatures w14:val="standardContextual"/>
         </w:rPr>
       </w:pPr>
-      <w:hyperlink w:anchor="_Toc242048931" w:history="1">
+      <w:hyperlink w:anchor="_Toc242052304" w:history="1">
         <w:r>
           <w:rPr>
             <w:rStyle w:val="Hyperlink"/>
@@ -2888,7 +2888,7 @@
             <w:noProof/>
             <w:webHidden/>
           </w:rPr>
-          <w:instrText xml:space="preserve"> PAGEREF _Toc242048931 \h </w:instrText>
+          <w:instrText xml:space="preserve"> PAGEREF _Toc242052304 \h </w:instrText>
         </w:r>
         <w:r>
           <w:rPr>
@@ -2934,7 +2934,7 @@
           <w14:ligatures w14:val="standardContextual"/>
         </w:rPr>
       </w:pPr>
-      <w:hyperlink w:anchor="_Toc242048932" w:history="1">
+      <w:hyperlink w:anchor="_Toc242052305" w:history="1">
         <w:r>
           <w:rPr>
             <w:rStyle w:val="Hyperlink"/>
@@ -2961,7 +2961,7 @@
             <w:noProof/>
             <w:webHidden/>
           </w:rPr>
-          <w:instrText xml:space="preserve"> PAGEREF _Toc242048932 \h </w:instrText>
+          <w:instrText xml:space="preserve"> PAGEREF _Toc242052305 \h </w:instrText>
         </w:r>
         <w:r>
           <w:rPr>
@@ -3007,7 +3007,7 @@
           <w14:ligatures w14:val="standardContextual"/>
         </w:rPr>
       </w:pPr>
-      <w:hyperlink w:anchor="_Toc242048933" w:history="1">
+      <w:hyperlink w:anchor="_Toc242052306" w:history="1">
         <w:r>
           <w:rPr>
             <w:rStyle w:val="Hyperlink"/>
@@ -3034,7 +3034,7 @@
             <w:noProof/>
             <w:webHidden/>
           </w:rPr>
-          <w:instrText xml:space="preserve"> PAGEREF _Toc242048933 \h </w:instrText>
+          <w:instrText xml:space="preserve"> PAGEREF _Toc242052306 \h </w:instrText>
         </w:r>
         <w:r>
           <w:rPr>
@@ -3080,7 +3080,7 @@
           <w14:ligatures w14:val="standardContextual"/>
         </w:rPr>
       </w:pPr>
-      <w:hyperlink w:anchor="_Toc242048934" w:history="1">
+      <w:hyperlink w:anchor="_Toc242052307" w:history="1">
         <w:r>
           <w:rPr>
             <w:rStyle w:val="Hyperlink"/>
@@ -3107,7 +3107,7 @@
             <w:noProof/>
             <w:webHidden/>
           </w:rPr>
-          <w:instrText xml:space="preserve"> PAGEREF _Toc242048934 \h </w:instrText>
+          <w:instrText xml:space="preserve"> PAGEREF _Toc242052307 \h </w:instrText>
         </w:r>
         <w:r>
           <w:rPr>
@@ -3153,7 +3153,7 @@
           <w14:ligatures w14:val="standardContextual"/>
         </w:rPr>
       </w:pPr>
-      <w:hyperlink w:anchor="_Toc242048935" w:history="1">
+      <w:hyperlink w:anchor="_Toc242052308" w:history="1">
         <w:r>
           <w:rPr>
             <w:rStyle w:val="Hyperlink"/>
@@ -3180,7 +3180,7 @@
             <w:noProof/>
             <w:webHidden/>
           </w:rPr>
-          <w:instrText xml:space="preserve"> PAGEREF _Toc242048935 \h </w:instrText>
+          <w:instrText xml:space="preserve"> PAGEREF _Toc242052308 \h </w:instrText>
         </w:r>
         <w:r>
           <w:rPr>
@@ -3226,7 +3226,7 @@
           <w14:ligatures w14:val="standardContextual"/>
         </w:rPr>
       </w:pPr>
-      <w:hyperlink w:anchor="_Toc242048936" w:history="1">
+      <w:hyperlink w:anchor="_Toc242052309" w:history="1">
         <w:r>
           <w:rPr>
             <w:rStyle w:val="Hyperlink"/>
@@ -3253,7 +3253,7 @@
             <w:noProof/>
             <w:webHidden/>
           </w:rPr>
-          <w:instrText xml:space="preserve"> PAGEREF _Toc242048936 \h </w:instrText>
+          <w:instrText xml:space="preserve"> PAGEREF _Toc242052309 \h </w:instrText>
         </w:r>
         <w:r>
           <w:rPr>
@@ -3299,7 +3299,7 @@
           <w14:ligatures w14:val="standardContextual"/>
         </w:rPr>
       </w:pPr>
-      <w:hyperlink w:anchor="_Toc242048937" w:history="1">
+      <w:hyperlink w:anchor="_Toc242052310" w:history="1">
         <w:r>
           <w:rPr>
             <w:rStyle w:val="Hyperlink"/>
@@ -3326,7 +3326,7 @@
             <w:noProof/>
             <w:webHidden/>
           </w:rPr>
-          <w:instrText xml:space="preserve"> PAGEREF _Toc242048937 \h </w:instrText>
+          <w:instrText xml:space="preserve"> PAGEREF _Toc242052310 \h </w:instrText>
         </w:r>
         <w:r>
           <w:rPr>
@@ -3372,7 +3372,7 @@
           <w14:ligatures w14:val="standardContextual"/>
         </w:rPr>
       </w:pPr>
-      <w:hyperlink w:anchor="_Toc242048938" w:history="1">
+      <w:hyperlink w:anchor="_Toc242052311" w:history="1">
         <w:r>
           <w:rPr>
             <w:rStyle w:val="Hyperlink"/>
@@ -3399,7 +3399,7 @@
             <w:noProof/>
             <w:webHidden/>
           </w:rPr>
-          <w:instrText xml:space="preserve"> PAGEREF _Toc242048938 \h </w:instrText>
+          <w:instrText xml:space="preserve"> PAGEREF _Toc242052311 \h </w:instrText>
         </w:r>
         <w:r>
           <w:rPr>
@@ -3445,7 +3445,7 @@
           <w14:ligatures w14:val="standardContextual"/>
         </w:rPr>
       </w:pPr>
-      <w:hyperlink w:anchor="_Toc242048939" w:history="1">
+      <w:hyperlink w:anchor="_Toc242052312" w:history="1">
         <w:r>
           <w:rPr>
             <w:rStyle w:val="Hyperlink"/>
@@ -3472,7 +3472,7 @@
             <w:noProof/>
             <w:webHidden/>
           </w:rPr>
-          <w:instrText xml:space="preserve"> PAGEREF _Toc242048939 \h </w:instrText>
+          <w:instrText xml:space="preserve"> PAGEREF _Toc242052312 \h </w:instrText>
         </w:r>
         <w:r>
           <w:rPr>
@@ -3518,7 +3518,7 @@
           <w14:ligatures w14:val="standardContextual"/>
         </w:rPr>
       </w:pPr>
-      <w:hyperlink w:anchor="_Toc242048940" w:history="1">
+      <w:hyperlink w:anchor="_Toc242052313" w:history="1">
         <w:r>
           <w:rPr>
             <w:rStyle w:val="Hyperlink"/>
@@ -3545,7 +3545,7 @@
             <w:noProof/>
             <w:webHidden/>
           </w:rPr>
-          <w:instrText xml:space="preserve"> PAGEREF _Toc242048940 \h </w:instrText>
+          <w:instrText xml:space="preserve"> PAGEREF _Toc242052313 \h </w:instrText>
         </w:r>
         <w:r>
           <w:rPr>
@@ -3591,7 +3591,7 @@
           <w14:ligatures w14:val="standardContextual"/>
         </w:rPr>
       </w:pPr>
-      <w:hyperlink w:anchor="_Toc242048941" w:history="1">
+      <w:hyperlink w:anchor="_Toc242052314" w:history="1">
         <w:r>
           <w:rPr>
             <w:rStyle w:val="Hyperlink"/>
@@ -3618,7 +3618,7 @@
             <w:noProof/>
             <w:webHidden/>
           </w:rPr>
-          <w:instrText xml:space="preserve"> PAGEREF _Toc242048941 \h </w:instrText>
+          <w:instrText xml:space="preserve"> PAGEREF _Toc242052314 \h </w:instrText>
         </w:r>
         <w:r>
           <w:rPr>
@@ -3664,7 +3664,7 @@
           <w14:ligatures w14:val="standardContextual"/>
         </w:rPr>
       </w:pPr>
-      <w:hyperlink w:anchor="_Toc242048942" w:history="1">
+      <w:hyperlink w:anchor="_Toc242052315" w:history="1">
         <w:r>
           <w:rPr>
             <w:rStyle w:val="Hyperlink"/>
@@ -3691,7 +3691,7 @@
             <w:noProof/>
             <w:webHidden/>
           </w:rPr>
-          <w:instrText xml:space="preserve"> PAGEREF _Toc242048942 \h </w:instrText>
+          <w:instrText xml:space="preserve"> PAGEREF _Toc242052315 \h </w:instrText>
         </w:r>
         <w:r>
           <w:rPr>
@@ -3737,7 +3737,7 @@
           <w14:ligatures w14:val="standardContextual"/>
         </w:rPr>
       </w:pPr>
-      <w:hyperlink w:anchor="_Toc242048943" w:history="1">
+      <w:hyperlink w:anchor="_Toc242052316" w:history="1">
         <w:r>
           <w:rPr>
             <w:rStyle w:val="Hyperlink"/>
@@ -3764,7 +3764,7 @@
             <w:noProof/>
             <w:webHidden/>
           </w:rPr>
-          <w:instrText xml:space="preserve"> PAGEREF _Toc242048943 \h </w:instrText>
+          <w:instrText xml:space="preserve"> PAGEREF _Toc242052316 \h </w:instrText>
         </w:r>
         <w:r>
           <w:rPr>
@@ -3810,7 +3810,7 @@
           <w14:ligatures w14:val="standardContextual"/>
         </w:rPr>
       </w:pPr>
-      <w:hyperlink w:anchor="_Toc242048944" w:history="1">
+      <w:hyperlink w:anchor="_Toc242052317" w:history="1">
         <w:r>
           <w:rPr>
             <w:rStyle w:val="Hyperlink"/>
@@ -3837,7 +3837,7 @@
             <w:noProof/>
             <w:webHidden/>
           </w:rPr>
-          <w:instrText xml:space="preserve"> PAGEREF _Toc242048944 \h </w:instrText>
+          <w:instrText xml:space="preserve"> PAGEREF _Toc242052317 \h </w:instrText>
         </w:r>
         <w:r>
           <w:rPr>
@@ -3883,7 +3883,7 @@
           <w14:ligatures w14:val="standardContextual"/>
         </w:rPr>
       </w:pPr>
-      <w:hyperlink w:anchor="_Toc242048945" w:history="1">
+      <w:hyperlink w:anchor="_Toc242052318" w:history="1">
         <w:r>
           <w:rPr>
             <w:rStyle w:val="Hyperlink"/>
@@ -3910,7 +3910,7 @@
             <w:noProof/>
             <w:webHidden/>
           </w:rPr>
-          <w:instrText xml:space="preserve"> PAGEREF _Toc242048945 \h </w:instrText>
+          <w:instrText xml:space="preserve"> PAGEREF _Toc242052318 \h </w:instrText>
         </w:r>
         <w:r>
           <w:rPr>
@@ -3956,7 +3956,7 @@
           <w14:ligatures w14:val="standardContextual"/>
         </w:rPr>
       </w:pPr>
-      <w:hyperlink w:anchor="_Toc242048946" w:history="1">
+      <w:hyperlink w:anchor="_Toc242052319" w:history="1">
         <w:r>
           <w:rPr>
             <w:rStyle w:val="Hyperlink"/>
@@ -3983,7 +3983,7 @@
             <w:noProof/>
             <w:webHidden/>
           </w:rPr>
-          <w:instrText xml:space="preserve"> PAGEREF _Toc242048946 \h </w:instrText>
+          <w:instrText xml:space="preserve"> PAGEREF _Toc242052319 \h </w:instrText>
         </w:r>
         <w:r>
           <w:rPr>
@@ -4029,7 +4029,7 @@
           <w14:ligatures w14:val="standardContextual"/>
         </w:rPr>
       </w:pPr>
-      <w:hyperlink w:anchor="_Toc242048947" w:history="1">
+      <w:hyperlink w:anchor="_Toc242052320" w:history="1">
         <w:r>
           <w:rPr>
             <w:rStyle w:val="Hyperlink"/>
@@ -4056,7 +4056,7 @@
             <w:noProof/>
             <w:webHidden/>
           </w:rPr>
-          <w:instrText xml:space="preserve"> PAGEREF _Toc242048947 \h </w:instrText>
+          <w:instrText xml:space="preserve"> PAGEREF _Toc242052320 \h </w:instrText>
         </w:r>
         <w:r>
           <w:rPr>
@@ -4102,7 +4102,7 @@
           <w14:ligatures w14:val="standardContextual"/>
         </w:rPr>
       </w:pPr>
-      <w:hyperlink w:anchor="_Toc242048948" w:history="1">
+      <w:hyperlink w:anchor="_Toc242052321" w:history="1">
         <w:r>
           <w:rPr>
             <w:rStyle w:val="Hyperlink"/>
@@ -4129,7 +4129,7 @@
             <w:noProof/>
             <w:webHidden/>
           </w:rPr>
-          <w:instrText xml:space="preserve"> PAGEREF _Toc242048948 \h </w:instrText>
+          <w:instrText xml:space="preserve"> PAGEREF _Toc242052321 \h </w:instrText>
         </w:r>
         <w:r>
           <w:rPr>
@@ -4175,7 +4175,7 @@
           <w14:ligatures w14:val="standardContextual"/>
         </w:rPr>
       </w:pPr>
-      <w:hyperlink w:anchor="_Toc242048949" w:history="1">
+      <w:hyperlink w:anchor="_Toc242052322" w:history="1">
         <w:r>
           <w:rPr>
             <w:rStyle w:val="Hyperlink"/>
@@ -4202,7 +4202,7 @@
             <w:noProof/>
             <w:webHidden/>
           </w:rPr>
-          <w:instrText xml:space="preserve"> PAGEREF _Toc242048949 \h </w:instrText>
+          <w:instrText xml:space="preserve"> PAGEREF _Toc242052322 \h </w:instrText>
         </w:r>
         <w:r>
           <w:rPr>
@@ -4248,7 +4248,7 @@
           <w14:ligatures w14:val="standardContextual"/>
         </w:rPr>
       </w:pPr>
-      <w:hyperlink w:anchor="_Toc242048950" w:history="1">
+      <w:hyperlink w:anchor="_Toc242052323" w:history="1">
         <w:r>
           <w:rPr>
             <w:rStyle w:val="Hyperlink"/>
@@ -4275,7 +4275,7 @@
             <w:noProof/>
             <w:webHidden/>
           </w:rPr>
-          <w:instrText xml:space="preserve"> PAGEREF _Toc242048950 \h </w:instrText>
+          <w:instrText xml:space="preserve"> PAGEREF _Toc242052323 \h </w:instrText>
         </w:r>
         <w:r>
           <w:rPr>
@@ -4321,7 +4321,7 @@
           <w14:ligatures w14:val="standardContextual"/>
         </w:rPr>
       </w:pPr>
-      <w:hyperlink w:anchor="_Toc242048951" w:history="1">
+      <w:hyperlink w:anchor="_Toc242052324" w:history="1">
         <w:r>
           <w:rPr>
             <w:rStyle w:val="Hyperlink"/>
@@ -4348,7 +4348,7 @@
             <w:noProof/>
             <w:webHidden/>
           </w:rPr>
-          <w:instrText xml:space="preserve"> PAGEREF _Toc242048951 \h </w:instrText>
+          <w:instrText xml:space="preserve"> PAGEREF _Toc242052324 \h </w:instrText>
         </w:r>
         <w:r>
           <w:rPr>
@@ -4394,7 +4394,7 @@
           <w14:ligatures w14:val="standardContextual"/>
         </w:rPr>
       </w:pPr>
-      <w:hyperlink w:anchor="_Toc242048952" w:history="1">
+      <w:hyperlink w:anchor="_Toc242052325" w:history="1">
         <w:r>
           <w:rPr>
             <w:rStyle w:val="Hyperlink"/>
@@ -4421,7 +4421,7 @@
             <w:noProof/>
             <w:webHidden/>
           </w:rPr>
-          <w:instrText xml:space="preserve"> PAGEREF _Toc242048952 \h </w:instrText>
+          <w:instrText xml:space="preserve"> PAGEREF _Toc242052325 \h </w:instrText>
         </w:r>
         <w:r>
           <w:rPr>
@@ -4467,7 +4467,7 @@
           <w14:ligatures w14:val="standardContextual"/>
         </w:rPr>
       </w:pPr>
-      <w:hyperlink w:anchor="_Toc242048953" w:history="1">
+      <w:hyperlink w:anchor="_Toc242052326" w:history="1">
         <w:r>
           <w:rPr>
             <w:rStyle w:val="Hyperlink"/>
@@ -4494,7 +4494,7 @@
             <w:noProof/>
             <w:webHidden/>
           </w:rPr>
-          <w:instrText xml:space="preserve"> PAGEREF _Toc242048953 \h </w:instrText>
+          <w:instrText xml:space="preserve"> PAGEREF _Toc242052326 \h </w:instrText>
         </w:r>
         <w:r>
           <w:rPr>
@@ -4540,7 +4540,7 @@
           <w14:ligatures w14:val="standardContextual"/>
         </w:rPr>
       </w:pPr>
-      <w:hyperlink w:anchor="_Toc242048954" w:history="1">
+      <w:hyperlink w:anchor="_Toc242052327" w:history="1">
         <w:r>
           <w:rPr>
             <w:rStyle w:val="Hyperlink"/>
@@ -4567,7 +4567,7 @@
             <w:noProof/>
             <w:webHidden/>
           </w:rPr>
-          <w:instrText xml:space="preserve"> PAGEREF _Toc242048954 \h </w:instrText>
+          <w:instrText xml:space="preserve"> PAGEREF _Toc242052327 \h </w:instrText>
         </w:r>
         <w:r>
           <w:rPr>
@@ -4613,7 +4613,7 @@
           <w14:ligatures w14:val="standardContextual"/>
         </w:rPr>
       </w:pPr>
-      <w:hyperlink w:anchor="_Toc242048955" w:history="1">
+      <w:hyperlink w:anchor="_Toc242052328" w:history="1">
         <w:r>
           <w:rPr>
             <w:rStyle w:val="Hyperlink"/>
@@ -4640,7 +4640,7 @@
             <w:noProof/>
             <w:webHidden/>
           </w:rPr>
-          <w:instrText xml:space="preserve"> PAGEREF _Toc242048955 \h </w:instrText>
+          <w:instrText xml:space="preserve"> PAGEREF _Toc242052328 \h </w:instrText>
         </w:r>
         <w:r>
           <w:rPr>
@@ -4686,7 +4686,7 @@
           <w14:ligatures w14:val="standardContextual"/>
         </w:rPr>
       </w:pPr>
-      <w:hyperlink w:anchor="_Toc242048956" w:history="1">
+      <w:hyperlink w:anchor="_Toc242052329" w:history="1">
         <w:r>
           <w:rPr>
             <w:rStyle w:val="Hyperlink"/>
@@ -4713,7 +4713,7 @@
             <w:noProof/>
             <w:webHidden/>
           </w:rPr>
-          <w:instrText xml:space="preserve"> PAGEREF _Toc242048956 \h </w:instrText>
+          <w:instrText xml:space="preserve"> PAGEREF _Toc242052329 \h </w:instrText>
         </w:r>
         <w:r>
           <w:rPr>
@@ -4759,7 +4759,7 @@
           <w14:ligatures w14:val="standardContextual"/>
         </w:rPr>
       </w:pPr>
-      <w:hyperlink w:anchor="_Toc242048957" w:history="1">
+      <w:hyperlink w:anchor="_Toc242052330" w:history="1">
         <w:r>
           <w:rPr>
             <w:rStyle w:val="Hyperlink"/>
@@ -4786,7 +4786,7 @@
             <w:noProof/>
             <w:webHidden/>
           </w:rPr>
-          <w:instrText xml:space="preserve"> PAGEREF _Toc242048957 \h </w:instrText>
+          <w:instrText xml:space="preserve"> PAGEREF _Toc242052330 \h </w:instrText>
         </w:r>
         <w:r>
           <w:rPr>
@@ -4832,7 +4832,7 @@
           <w14:ligatures w14:val="standardContextual"/>
         </w:rPr>
       </w:pPr>
-      <w:hyperlink w:anchor="_Toc242048958" w:history="1">
+      <w:hyperlink w:anchor="_Toc242052331" w:history="1">
         <w:r>
           <w:rPr>
             <w:rStyle w:val="Hyperlink"/>
@@ -4859,7 +4859,7 @@
             <w:noProof/>
             <w:webHidden/>
           </w:rPr>
-          <w:instrText xml:space="preserve"> PAGEREF _Toc242048958 \h </w:instrText>
+          <w:instrText xml:space="preserve"> PAGEREF _Toc242052331 \h </w:instrText>
         </w:r>
         <w:r>
           <w:rPr>
@@ -4905,7 +4905,7 @@
           <w14:ligatures w14:val="standardContextual"/>
         </w:rPr>
       </w:pPr>
-      <w:hyperlink w:anchor="_Toc242048959" w:history="1">
+      <w:hyperlink w:anchor="_Toc242052332" w:history="1">
         <w:r>
           <w:rPr>
             <w:rStyle w:val="Hyperlink"/>
@@ -4932,7 +4932,7 @@
             <w:noProof/>
             <w:webHidden/>
           </w:rPr>
-          <w:instrText xml:space="preserve"> PAGEREF _Toc242048959 \h </w:instrText>
+          <w:instrText xml:space="preserve"> PAGEREF _Toc242052332 \h </w:instrText>
         </w:r>
         <w:r>
           <w:rPr>
@@ -4978,7 +4978,7 @@
           <w14:ligatures w14:val="standardContextual"/>
         </w:rPr>
       </w:pPr>
-      <w:hyperlink w:anchor="_Toc242048960" w:history="1">
+      <w:hyperlink w:anchor="_Toc242052333" w:history="1">
         <w:r>
           <w:rPr>
             <w:rStyle w:val="Hyperlink"/>
@@ -5005,7 +5005,7 @@
             <w:noProof/>
             <w:webHidden/>
           </w:rPr>
-          <w:instrText xml:space="preserve"> PAGEREF _Toc242048960 \h </w:instrText>
+          <w:instrText xml:space="preserve"> PAGEREF _Toc242052333 \h </w:instrText>
         </w:r>
         <w:r>
           <w:rPr>
@@ -5051,7 +5051,7 @@
           <w14:ligatures w14:val="standardContextual"/>
         </w:rPr>
       </w:pPr>
-      <w:hyperlink w:anchor="_Toc242048961" w:history="1">
+      <w:hyperlink w:anchor="_Toc242052334" w:history="1">
         <w:r>
           <w:rPr>
             <w:rStyle w:val="Hyperlink"/>
@@ -5078,7 +5078,7 @@
             <w:noProof/>
             <w:webHidden/>
           </w:rPr>
-          <w:instrText xml:space="preserve"> PAGEREF _Toc242048961 \h </w:instrText>
+          <w:instrText xml:space="preserve"> PAGEREF _Toc242052334 \h </w:instrText>
         </w:r>
         <w:r>
           <w:rPr>
@@ -5124,7 +5124,7 @@
           <w14:ligatures w14:val="standardContextual"/>
         </w:rPr>
       </w:pPr>
-      <w:hyperlink w:anchor="_Toc242048962" w:history="1">
+      <w:hyperlink w:anchor="_Toc242052335" w:history="1">
         <w:r>
           <w:rPr>
             <w:rStyle w:val="Hyperlink"/>
@@ -5151,7 +5151,7 @@
             <w:noProof/>
             <w:webHidden/>
           </w:rPr>
-          <w:instrText xml:space="preserve"> PAGEREF _Toc242048962 \h </w:instrText>
+          <w:instrText xml:space="preserve"> PAGEREF _Toc242052335 \h </w:instrText>
         </w:r>
         <w:r>
           <w:rPr>
@@ -5197,7 +5197,7 @@
           <w14:ligatures w14:val="standardContextual"/>
         </w:rPr>
       </w:pPr>
-      <w:hyperlink w:anchor="_Toc242048963" w:history="1">
+      <w:hyperlink w:anchor="_Toc242052336" w:history="1">
         <w:r>
           <w:rPr>
             <w:rStyle w:val="Hyperlink"/>
@@ -5224,7 +5224,7 @@
             <w:noProof/>
             <w:webHidden/>
           </w:rPr>
-          <w:instrText xml:space="preserve"> PAGEREF _Toc242048963 \h </w:instrText>
+          <w:instrText xml:space="preserve"> PAGEREF _Toc242052336 \h </w:instrText>
         </w:r>
         <w:r>
           <w:rPr>
@@ -5270,7 +5270,7 @@
           <w14:ligatures w14:val="standardContextual"/>
         </w:rPr>
       </w:pPr>
-      <w:hyperlink w:anchor="_Toc242048964" w:history="1">
+      <w:hyperlink w:anchor="_Toc242052337" w:history="1">
         <w:r>
           <w:rPr>
             <w:rStyle w:val="Hyperlink"/>
@@ -5297,7 +5297,7 @@
             <w:noProof/>
             <w:webHidden/>
           </w:rPr>
-          <w:instrText xml:space="preserve"> PAGEREF _Toc242048964 \h </w:instrText>
+          <w:instrText xml:space="preserve"> PAGEREF _Toc242052337 \h </w:instrText>
         </w:r>
         <w:r>
           <w:rPr>
@@ -5343,7 +5343,7 @@
           <w14:ligatures w14:val="standardContextual"/>
         </w:rPr>
       </w:pPr>
-      <w:hyperlink w:anchor="_Toc242048965" w:history="1">
+      <w:hyperlink w:anchor="_Toc242052338" w:history="1">
         <w:r>
           <w:rPr>
             <w:rStyle w:val="Hyperlink"/>
@@ -5370,7 +5370,7 @@
             <w:noProof/>
             <w:webHidden/>
           </w:rPr>
-          <w:instrText xml:space="preserve"> PAGEREF _Toc242048965 \h </w:instrText>
+          <w:instrText xml:space="preserve"> PAGEREF _Toc242052338 \h </w:instrText>
         </w:r>
         <w:r>
           <w:rPr>
@@ -5416,7 +5416,7 @@
           <w14:ligatures w14:val="standardContextual"/>
         </w:rPr>
       </w:pPr>
-      <w:hyperlink w:anchor="_Toc242048966" w:history="1">
+      <w:hyperlink w:anchor="_Toc242052339" w:history="1">
         <w:r>
           <w:rPr>
             <w:rStyle w:val="Hyperlink"/>
@@ -5443,7 +5443,7 @@
             <w:noProof/>
             <w:webHidden/>
           </w:rPr>
-          <w:instrText xml:space="preserve"> PAGEREF _Toc242048966 \h </w:instrText>
+          <w:instrText xml:space="preserve"> PAGEREF _Toc242052339 \h </w:instrText>
         </w:r>
         <w:r>
           <w:rPr>
@@ -5489,7 +5489,7 @@
           <w14:ligatures w14:val="standardContextual"/>
         </w:rPr>
       </w:pPr>
-      <w:hyperlink w:anchor="_Toc242048967" w:history="1">
+      <w:hyperlink w:anchor="_Toc242052340" w:history="1">
         <w:r>
           <w:rPr>
             <w:rStyle w:val="Hyperlink"/>
@@ -5516,7 +5516,7 @@
             <w:noProof/>
             <w:webHidden/>
           </w:rPr>
-          <w:instrText xml:space="preserve"> PAGEREF _Toc242048967 \h </w:instrText>
+          <w:instrText xml:space="preserve"> PAGEREF _Toc242052340 \h </w:instrText>
         </w:r>
         <w:r>
           <w:rPr>
@@ -5562,7 +5562,7 @@
           <w14:ligatures w14:val="standardContextual"/>
         </w:rPr>
       </w:pPr>
-      <w:hyperlink w:anchor="_Toc242048968" w:history="1">
+      <w:hyperlink w:anchor="_Toc242052341" w:history="1">
         <w:r>
           <w:rPr>
             <w:rStyle w:val="Hyperlink"/>
@@ -5589,7 +5589,7 @@
             <w:noProof/>
             <w:webHidden/>
           </w:rPr>
-          <w:instrText xml:space="preserve"> PAGEREF _Toc242048968 \h </w:instrText>
+          <w:instrText xml:space="preserve"> PAGEREF _Toc242052341 \h </w:instrText>
         </w:r>
         <w:r>
           <w:rPr>
@@ -5635,7 +5635,7 @@
           <w14:ligatures w14:val="standardContextual"/>
         </w:rPr>
       </w:pPr>
-      <w:hyperlink w:anchor="_Toc242048969" w:history="1">
+      <w:hyperlink w:anchor="_Toc242052342" w:history="1">
         <w:r>
           <w:rPr>
             <w:rStyle w:val="Hyperlink"/>
@@ -5662,7 +5662,7 @@
             <w:noProof/>
             <w:webHidden/>
           </w:rPr>
-          <w:instrText xml:space="preserve"> PAGEREF _Toc242048969 \h </w:instrText>
+          <w:instrText xml:space="preserve"> PAGEREF _Toc242052342 \h </w:instrText>
         </w:r>
         <w:r>
           <w:rPr>
@@ -5708,7 +5708,7 @@
           <w14:ligatures w14:val="standardContextual"/>
         </w:rPr>
       </w:pPr>
-      <w:hyperlink w:anchor="_Toc242048970" w:history="1">
+      <w:hyperlink w:anchor="_Toc242052343" w:history="1">
         <w:r>
           <w:rPr>
             <w:rStyle w:val="Hyperlink"/>
@@ -5735,7 +5735,7 @@
             <w:noProof/>
             <w:webHidden/>
           </w:rPr>
-          <w:instrText xml:space="preserve"> PAGEREF _Toc242048970 \h </w:instrText>
+          <w:instrText xml:space="preserve"> PAGEREF _Toc242052343 \h </w:instrText>
         </w:r>
         <w:r>
           <w:rPr>
@@ -5781,7 +5781,7 @@
           <w14:ligatures w14:val="standardContextual"/>
         </w:rPr>
       </w:pPr>
-      <w:hyperlink w:anchor="_Toc242048971" w:history="1">
+      <w:hyperlink w:anchor="_Toc242052344" w:history="1">
         <w:r>
           <w:rPr>
             <w:rStyle w:val="Hyperlink"/>
@@ -5808,7 +5808,7 @@
             <w:noProof/>
             <w:webHidden/>
           </w:rPr>
-          <w:instrText xml:space="preserve"> PAGEREF _Toc242048971 \h </w:instrText>
+          <w:instrText xml:space="preserve"> PAGEREF _Toc242052344 \h </w:instrText>
         </w:r>
         <w:r>
           <w:rPr>
@@ -5854,7 +5854,7 @@
           <w14:ligatures w14:val="standardContextual"/>
         </w:rPr>
       </w:pPr>
-      <w:hyperlink w:anchor="_Toc242048972" w:history="1">
+      <w:hyperlink w:anchor="_Toc242052345" w:history="1">
         <w:r>
           <w:rPr>
             <w:rStyle w:val="Hyperlink"/>
@@ -5881,7 +5881,7 @@
             <w:noProof/>
             <w:webHidden/>
           </w:rPr>
-          <w:instrText xml:space="preserve"> PAGEREF _Toc242048972 \h </w:instrText>
+          <w:instrText xml:space="preserve"> PAGEREF _Toc242052345 \h </w:instrText>
         </w:r>
         <w:r>
           <w:rPr>
@@ -5927,7 +5927,7 @@
           <w14:ligatures w14:val="standardContextual"/>
         </w:rPr>
       </w:pPr>
-      <w:hyperlink w:anchor="_Toc242048973" w:history="1">
+      <w:hyperlink w:anchor="_Toc242052346" w:history="1">
         <w:r>
           <w:rPr>
             <w:rStyle w:val="Hyperlink"/>
@@ -5954,7 +5954,7 @@
             <w:noProof/>
             <w:webHidden/>
           </w:rPr>
-          <w:instrText xml:space="preserve"> PAGEREF _Toc242048973 \h </w:instrText>
+          <w:instrText xml:space="preserve"> PAGEREF _Toc242052346 \h </w:instrText>
         </w:r>
         <w:r>
           <w:rPr>
@@ -6000,7 +6000,7 @@
           <w14:ligatures w14:val="standardContextual"/>
         </w:rPr>
       </w:pPr>
-      <w:hyperlink w:anchor="_Toc242048974" w:history="1">
+      <w:hyperlink w:anchor="_Toc242052347" w:history="1">
         <w:r>
           <w:rPr>
             <w:rStyle w:val="Hyperlink"/>
@@ -6027,7 +6027,7 @@
             <w:noProof/>
             <w:webHidden/>
           </w:rPr>
-          <w:instrText xml:space="preserve"> PAGEREF _Toc242048974 \h </w:instrText>
+          <w:instrText xml:space="preserve"> PAGEREF _Toc242052347 \h </w:instrText>
         </w:r>
         <w:r>
           <w:rPr>
@@ -6073,7 +6073,7 @@
           <w14:ligatures w14:val="standardContextual"/>
         </w:rPr>
       </w:pPr>
-      <w:hyperlink w:anchor="_Toc242048975" w:history="1">
+      <w:hyperlink w:anchor="_Toc242052348" w:history="1">
         <w:r>
           <w:rPr>
             <w:rStyle w:val="Hyperlink"/>
@@ -6100,7 +6100,7 @@
             <w:noProof/>
             <w:webHidden/>
           </w:rPr>
-          <w:instrText xml:space="preserve"> PAGEREF _Toc242048975 \h </w:instrText>
+          <w:instrText xml:space="preserve"> PAGEREF _Toc242052348 \h </w:instrText>
         </w:r>
         <w:r>
           <w:rPr>
@@ -6146,7 +6146,7 @@
           <w14:ligatures w14:val="standardContextual"/>
         </w:rPr>
       </w:pPr>
-      <w:hyperlink w:anchor="_Toc242048976" w:history="1">
+      <w:hyperlink w:anchor="_Toc242052349" w:history="1">
         <w:r>
           <w:rPr>
             <w:rStyle w:val="Hyperlink"/>
@@ -6173,7 +6173,7 @@
             <w:noProof/>
             <w:webHidden/>
           </w:rPr>
-          <w:instrText xml:space="preserve"> PAGEREF _Toc242048976 \h </w:instrText>
+          <w:instrText xml:space="preserve"> PAGEREF _Toc242052349 \h </w:instrText>
         </w:r>
         <w:r>
           <w:rPr>
@@ -6219,7 +6219,7 @@
           <w14:ligatures w14:val="standardContextual"/>
         </w:rPr>
       </w:pPr>
-      <w:hyperlink w:anchor="_Toc242048977" w:history="1">
+      <w:hyperlink w:anchor="_Toc242052350" w:history="1">
         <w:r>
           <w:rPr>
             <w:rStyle w:val="Hyperlink"/>
@@ -6246,7 +6246,7 @@
             <w:noProof/>
             <w:webHidden/>
           </w:rPr>
-          <w:instrText xml:space="preserve"> PAGEREF _Toc242048977 \h </w:instrText>
+          <w:instrText xml:space="preserve"> PAGEREF _Toc242052350 \h </w:instrText>
         </w:r>
         <w:r>
           <w:rPr>
@@ -6292,7 +6292,7 @@
           <w14:ligatures w14:val="standardContextual"/>
         </w:rPr>
       </w:pPr>
-      <w:hyperlink w:anchor="_Toc242048978" w:history="1">
+      <w:hyperlink w:anchor="_Toc242052351" w:history="1">
         <w:r>
           <w:rPr>
             <w:rStyle w:val="Hyperlink"/>
@@ -6319,7 +6319,7 @@
             <w:noProof/>
             <w:webHidden/>
           </w:rPr>
-          <w:instrText xml:space="preserve"> PAGEREF _Toc242048978 \h </w:instrText>
+          <w:instrText xml:space="preserve"> PAGEREF _Toc242052351 \h </w:instrText>
         </w:r>
         <w:r>
           <w:rPr>
@@ -6365,7 +6365,7 @@
           <w14:ligatures w14:val="standardContextual"/>
         </w:rPr>
       </w:pPr>
-      <w:hyperlink w:anchor="_Toc242048979" w:history="1">
+      <w:hyperlink w:anchor="_Toc242052352" w:history="1">
         <w:r>
           <w:rPr>
             <w:rStyle w:val="Hyperlink"/>
@@ -6392,7 +6392,7 @@
             <w:noProof/>
             <w:webHidden/>
           </w:rPr>
-          <w:instrText xml:space="preserve"> PAGEREF _Toc242048979 \h </w:instrText>
+          <w:instrText xml:space="preserve"> PAGEREF _Toc242052352 \h </w:instrText>
         </w:r>
         <w:r>
           <w:rPr>
@@ -6438,7 +6438,7 @@
           <w14:ligatures w14:val="standardContextual"/>
         </w:rPr>
       </w:pPr>
-      <w:hyperlink w:anchor="_Toc242048980" w:history="1">
+      <w:hyperlink w:anchor="_Toc242052353" w:history="1">
         <w:r>
           <w:rPr>
             <w:rStyle w:val="Hyperlink"/>
@@ -6465,7 +6465,7 @@
             <w:noProof/>
             <w:webHidden/>
           </w:rPr>
-          <w:instrText xml:space="preserve"> PAGEREF _Toc242048980 \h </w:instrText>
+          <w:instrText xml:space="preserve"> PAGEREF _Toc242052353 \h </w:instrText>
         </w:r>
         <w:r>
           <w:rPr>
@@ -6511,7 +6511,7 @@
           <w14:ligatures w14:val="standardContextual"/>
         </w:rPr>
       </w:pPr>
-      <w:hyperlink w:anchor="_Toc242048981" w:history="1">
+      <w:hyperlink w:anchor="_Toc242052354" w:history="1">
         <w:r>
           <w:rPr>
             <w:rStyle w:val="Hyperlink"/>
@@ -6538,7 +6538,7 @@
             <w:noProof/>
             <w:webHidden/>
           </w:rPr>
-          <w:instrText xml:space="preserve"> PAGEREF _Toc242048981 \h </w:instrText>
+          <w:instrText xml:space="preserve"> PAGEREF _Toc242052354 \h </w:instrText>
         </w:r>
         <w:r>
           <w:rPr>
@@ -6584,7 +6584,7 @@
           <w14:ligatures w14:val="standardContextual"/>
         </w:rPr>
       </w:pPr>
-      <w:hyperlink w:anchor="_Toc242048982" w:history="1">
+      <w:hyperlink w:anchor="_Toc242052355" w:history="1">
         <w:r>
           <w:rPr>
             <w:rStyle w:val="Hyperlink"/>
@@ -6611,7 +6611,7 @@
             <w:noProof/>
             <w:webHidden/>
           </w:rPr>
-          <w:instrText xml:space="preserve"> PAGEREF _Toc242048982 \h </w:instrText>
+          <w:instrText xml:space="preserve"> PAGEREF _Toc242052355 \h </w:instrText>
         </w:r>
         <w:r>
           <w:rPr>
@@ -6657,7 +6657,7 @@
           <w14:ligatures w14:val="standardContextual"/>
         </w:rPr>
       </w:pPr>
-      <w:hyperlink w:anchor="_Toc242048983" w:history="1">
+      <w:hyperlink w:anchor="_Toc242052356" w:history="1">
         <w:r>
           <w:rPr>
             <w:rStyle w:val="Hyperlink"/>
@@ -6684,7 +6684,7 @@
             <w:noProof/>
             <w:webHidden/>
           </w:rPr>
-          <w:instrText xml:space="preserve"> PAGEREF _Toc242048983 \h </w:instrText>
+          <w:instrText xml:space="preserve"> PAGEREF _Toc242052356 \h </w:instrText>
         </w:r>
         <w:r>
           <w:rPr>
@@ -6760,7 +6760,7 @@
       <w:r>
         <w:fldChar w:fldCharType="separate"/>
       </w:r>
-      <w:hyperlink w:anchor="_Toc242048984" w:history="1">
+      <w:hyperlink w:anchor="_Toc242052357" w:history="1">
         <w:r>
           <w:rPr>
             <w:rStyle w:val="Hyperlink"/>
@@ -6787,7 +6787,7 @@
             <w:noProof/>
             <w:webHidden/>
           </w:rPr>
-          <w:instrText xml:space="preserve"> PAGEREF _Toc242048984 \h </w:instrText>
+          <w:instrText xml:space="preserve"> PAGEREF _Toc242052357 \h </w:instrText>
         </w:r>
         <w:r>
           <w:rPr>
@@ -6833,7 +6833,7 @@
           <w14:ligatures w14:val="standardContextual"/>
         </w:rPr>
       </w:pPr>
-      <w:hyperlink w:anchor="_Toc242048985" w:history="1">
+      <w:hyperlink w:anchor="_Toc242052358" w:history="1">
         <w:r>
           <w:rPr>
             <w:rStyle w:val="Hyperlink"/>
@@ -6860,7 +6860,7 @@
             <w:noProof/>
             <w:webHidden/>
           </w:rPr>
-          <w:instrText xml:space="preserve"> PAGEREF _Toc242048985 \h </w:instrText>
+          <w:instrText xml:space="preserve"> PAGEREF _Toc242052358 \h </w:instrText>
         </w:r>
         <w:r>
           <w:rPr>
@@ -6906,7 +6906,7 @@
           <w14:ligatures w14:val="standardContextual"/>
         </w:rPr>
       </w:pPr>
-      <w:hyperlink w:anchor="_Toc242048986" w:history="1">
+      <w:hyperlink w:anchor="_Toc242052359" w:history="1">
         <w:r>
           <w:rPr>
             <w:rStyle w:val="Hyperlink"/>
@@ -6933,7 +6933,7 @@
             <w:noProof/>
             <w:webHidden/>
           </w:rPr>
-          <w:instrText xml:space="preserve"> PAGEREF _Toc242048986 \h </w:instrText>
+          <w:instrText xml:space="preserve"> PAGEREF _Toc242052359 \h </w:instrText>
         </w:r>
         <w:r>
           <w:rPr>
@@ -6979,7 +6979,7 @@
           <w14:ligatures w14:val="standardContextual"/>
         </w:rPr>
       </w:pPr>
-      <w:hyperlink w:anchor="_Toc242048987" w:history="1">
+      <w:hyperlink w:anchor="_Toc242052360" w:history="1">
         <w:r>
           <w:rPr>
             <w:rStyle w:val="Hyperlink"/>
@@ -7006,7 +7006,7 @@
             <w:noProof/>
             <w:webHidden/>
           </w:rPr>
-          <w:instrText xml:space="preserve"> PAGEREF _Toc242048987 \h </w:instrText>
+          <w:instrText xml:space="preserve"> PAGEREF _Toc242052360 \h </w:instrText>
         </w:r>
         <w:r>
           <w:rPr>
@@ -7052,7 +7052,7 @@
           <w14:ligatures w14:val="standardContextual"/>
         </w:rPr>
       </w:pPr>
-      <w:hyperlink w:anchor="_Toc242048988" w:history="1">
+      <w:hyperlink w:anchor="_Toc242052361" w:history="1">
         <w:r>
           <w:rPr>
             <w:rStyle w:val="Hyperlink"/>
@@ -7079,7 +7079,7 @@
             <w:noProof/>
             <w:webHidden/>
           </w:rPr>
-          <w:instrText xml:space="preserve"> PAGEREF _Toc242048988 \h </w:instrText>
+          <w:instrText xml:space="preserve"> PAGEREF _Toc242052361 \h </w:instrText>
         </w:r>
         <w:r>
           <w:rPr>
@@ -7125,7 +7125,7 @@
           <w14:ligatures w14:val="standardContextual"/>
         </w:rPr>
       </w:pPr>
-      <w:hyperlink w:anchor="_Toc242048989" w:history="1">
+      <w:hyperlink w:anchor="_Toc242052362" w:history="1">
         <w:r>
           <w:rPr>
             <w:rStyle w:val="Hyperlink"/>
@@ -7152,7 +7152,7 @@
             <w:noProof/>
             <w:webHidden/>
           </w:rPr>
-          <w:instrText xml:space="preserve"> PAGEREF _Toc242048989 \h </w:instrText>
+          <w:instrText xml:space="preserve"> PAGEREF _Toc242052362 \h </w:instrText>
         </w:r>
         <w:r>
           <w:rPr>
@@ -7198,7 +7198,7 @@
           <w14:ligatures w14:val="standardContextual"/>
         </w:rPr>
       </w:pPr>
-      <w:hyperlink w:anchor="_Toc242048990" w:history="1">
+      <w:hyperlink w:anchor="_Toc242052363" w:history="1">
         <w:r>
           <w:rPr>
             <w:rStyle w:val="Hyperlink"/>
@@ -7225,7 +7225,7 @@
             <w:noProof/>
             <w:webHidden/>
           </w:rPr>
-          <w:instrText xml:space="preserve"> PAGEREF _Toc242048990 \h </w:instrText>
+          <w:instrText xml:space="preserve"> PAGEREF _Toc242052363 \h </w:instrText>
         </w:r>
         <w:r>
           <w:rPr>
@@ -7271,13 +7271,13 @@
           <w14:ligatures w14:val="standardContextual"/>
         </w:rPr>
       </w:pPr>
-      <w:hyperlink w:anchor="_Toc242048991" w:history="1">
+      <w:hyperlink w:anchor="_Toc242052364" w:history="1">
         <w:r>
           <w:rPr>
             <w:rStyle w:val="Hyperlink"/>
             <w:noProof/>
           </w:rPr>
-          <w:t>Hình 5.1. Trang Tổng quan của Giáo vụ: không có quyền xem doanh thu nên biểu đồ để trống</w:t>
+          <w:t>Hình 5.1. Trang Tổng quan của Giáo vụ: không có quyền xem doanh thu</w:t>
         </w:r>
         <w:r>
           <w:rPr>
@@ -7298,7 +7298,7 @@
             <w:noProof/>
             <w:webHidden/>
           </w:rPr>
-          <w:instrText xml:space="preserve"> PAGEREF _Toc242048991 \h </w:instrText>
+          <w:instrText xml:space="preserve"> PAGEREF _Toc242052364 \h </w:instrText>
         </w:r>
         <w:r>
           <w:rPr>
@@ -7344,7 +7344,7 @@
           <w14:ligatures w14:val="standardContextual"/>
         </w:rPr>
       </w:pPr>
-      <w:hyperlink w:anchor="_Toc242048992" w:history="1">
+      <w:hyperlink w:anchor="_Toc242052365" w:history="1">
         <w:r>
           <w:rPr>
             <w:rStyle w:val="Hyperlink"/>
@@ -7371,7 +7371,7 @@
             <w:noProof/>
             <w:webHidden/>
           </w:rPr>
-          <w:instrText xml:space="preserve"> PAGEREF _Toc242048992 \h </w:instrText>
+          <w:instrText xml:space="preserve"> PAGEREF _Toc242052365 \h </w:instrText>
         </w:r>
         <w:r>
           <w:rPr>
@@ -7417,7 +7417,7 @@
           <w14:ligatures w14:val="standardContextual"/>
         </w:rPr>
       </w:pPr>
-      <w:hyperlink w:anchor="_Toc242048993" w:history="1">
+      <w:hyperlink w:anchor="_Toc242052366" w:history="1">
         <w:r>
           <w:rPr>
             <w:rStyle w:val="Hyperlink"/>
@@ -7444,7 +7444,7 @@
             <w:noProof/>
             <w:webHidden/>
           </w:rPr>
-          <w:instrText xml:space="preserve"> PAGEREF _Toc242048993 \h </w:instrText>
+          <w:instrText xml:space="preserve"> PAGEREF _Toc242052366 \h </w:instrText>
         </w:r>
         <w:r>
           <w:rPr>
@@ -7490,7 +7490,7 @@
           <w14:ligatures w14:val="standardContextual"/>
         </w:rPr>
       </w:pPr>
-      <w:hyperlink w:anchor="_Toc242048994" w:history="1">
+      <w:hyperlink w:anchor="_Toc242052367" w:history="1">
         <w:r>
           <w:rPr>
             <w:rStyle w:val="Hyperlink"/>
@@ -7517,7 +7517,7 @@
             <w:noProof/>
             <w:webHidden/>
           </w:rPr>
-          <w:instrText xml:space="preserve"> PAGEREF _Toc242048994 \h </w:instrText>
+          <w:instrText xml:space="preserve"> PAGEREF _Toc242052367 \h </w:instrText>
         </w:r>
         <w:r>
           <w:rPr>
@@ -7563,7 +7563,7 @@
           <w14:ligatures w14:val="standardContextual"/>
         </w:rPr>
       </w:pPr>
-      <w:hyperlink w:anchor="_Toc242048995" w:history="1">
+      <w:hyperlink w:anchor="_Toc242052368" w:history="1">
         <w:r>
           <w:rPr>
             <w:rStyle w:val="Hyperlink"/>
@@ -7590,7 +7590,7 @@
             <w:noProof/>
             <w:webHidden/>
           </w:rPr>
-          <w:instrText xml:space="preserve"> PAGEREF _Toc242048995 \h </w:instrText>
+          <w:instrText xml:space="preserve"> PAGEREF _Toc242052368 \h </w:instrText>
         </w:r>
         <w:r>
           <w:rPr>
@@ -7636,7 +7636,7 @@
           <w14:ligatures w14:val="standardContextual"/>
         </w:rPr>
       </w:pPr>
-      <w:hyperlink w:anchor="_Toc242048996" w:history="1">
+      <w:hyperlink w:anchor="_Toc242052369" w:history="1">
         <w:r>
           <w:rPr>
             <w:rStyle w:val="Hyperlink"/>
@@ -7663,7 +7663,7 @@
             <w:noProof/>
             <w:webHidden/>
           </w:rPr>
-          <w:instrText xml:space="preserve"> PAGEREF _Toc242048996 \h </w:instrText>
+          <w:instrText xml:space="preserve"> PAGEREF _Toc242052369 \h </w:instrText>
         </w:r>
         <w:r>
           <w:rPr>
@@ -7709,7 +7709,7 @@
           <w14:ligatures w14:val="standardContextual"/>
         </w:rPr>
       </w:pPr>
-      <w:hyperlink w:anchor="_Toc242048997" w:history="1">
+      <w:hyperlink w:anchor="_Toc242052370" w:history="1">
         <w:r>
           <w:rPr>
             <w:rStyle w:val="Hyperlink"/>
@@ -7736,7 +7736,7 @@
             <w:noProof/>
             <w:webHidden/>
           </w:rPr>
-          <w:instrText xml:space="preserve"> PAGEREF _Toc242048997 \h </w:instrText>
+          <w:instrText xml:space="preserve"> PAGEREF _Toc242052370 \h </w:instrText>
         </w:r>
         <w:r>
           <w:rPr>
@@ -7782,7 +7782,7 @@
           <w14:ligatures w14:val="standardContextual"/>
         </w:rPr>
       </w:pPr>
-      <w:hyperlink w:anchor="_Toc242048998" w:history="1">
+      <w:hyperlink w:anchor="_Toc242052371" w:history="1">
         <w:r>
           <w:rPr>
             <w:rStyle w:val="Hyperlink"/>
@@ -7809,7 +7809,7 @@
             <w:noProof/>
             <w:webHidden/>
           </w:rPr>
-          <w:instrText xml:space="preserve"> PAGEREF _Toc242048998 \h </w:instrText>
+          <w:instrText xml:space="preserve"> PAGEREF _Toc242052371 \h </w:instrText>
         </w:r>
         <w:r>
           <w:rPr>
@@ -7855,7 +7855,7 @@
           <w14:ligatures w14:val="standardContextual"/>
         </w:rPr>
       </w:pPr>
-      <w:hyperlink w:anchor="_Toc242048999" w:history="1">
+      <w:hyperlink w:anchor="_Toc242052372" w:history="1">
         <w:r>
           <w:rPr>
             <w:rStyle w:val="Hyperlink"/>
@@ -7882,7 +7882,7 @@
             <w:noProof/>
             <w:webHidden/>
           </w:rPr>
-          <w:instrText xml:space="preserve"> PAGEREF _Toc242048999 \h </w:instrText>
+          <w:instrText xml:space="preserve"> PAGEREF _Toc242052372 \h </w:instrText>
         </w:r>
         <w:r>
           <w:rPr>
@@ -7928,7 +7928,7 @@
           <w14:ligatures w14:val="standardContextual"/>
         </w:rPr>
       </w:pPr>
-      <w:hyperlink w:anchor="_Toc242049000" w:history="1">
+      <w:hyperlink w:anchor="_Toc242052373" w:history="1">
         <w:r>
           <w:rPr>
             <w:rStyle w:val="Hyperlink"/>
@@ -7955,7 +7955,7 @@
             <w:noProof/>
             <w:webHidden/>
           </w:rPr>
-          <w:instrText xml:space="preserve"> PAGEREF _Toc242049000 \h </w:instrText>
+          <w:instrText xml:space="preserve"> PAGEREF _Toc242052373 \h </w:instrText>
         </w:r>
         <w:r>
           <w:rPr>
@@ -8001,7 +8001,7 @@
           <w14:ligatures w14:val="standardContextual"/>
         </w:rPr>
       </w:pPr>
-      <w:hyperlink w:anchor="_Toc242049001" w:history="1">
+      <w:hyperlink w:anchor="_Toc242052374" w:history="1">
         <w:r>
           <w:rPr>
             <w:rStyle w:val="Hyperlink"/>
@@ -8028,7 +8028,7 @@
             <w:noProof/>
             <w:webHidden/>
           </w:rPr>
-          <w:instrText xml:space="preserve"> PAGEREF _Toc242049001 \h </w:instrText>
+          <w:instrText xml:space="preserve"> PAGEREF _Toc242052374 \h </w:instrText>
         </w:r>
         <w:r>
           <w:rPr>
@@ -8074,7 +8074,7 @@
           <w14:ligatures w14:val="standardContextual"/>
         </w:rPr>
       </w:pPr>
-      <w:hyperlink w:anchor="_Toc242049002" w:history="1">
+      <w:hyperlink w:anchor="_Toc242052375" w:history="1">
         <w:r>
           <w:rPr>
             <w:rStyle w:val="Hyperlink"/>
@@ -8101,7 +8101,7 @@
             <w:noProof/>
             <w:webHidden/>
           </w:rPr>
-          <w:instrText xml:space="preserve"> PAGEREF _Toc242049002 \h </w:instrText>
+          <w:instrText xml:space="preserve"> PAGEREF _Toc242052375 \h </w:instrText>
         </w:r>
         <w:r>
           <w:rPr>
@@ -8147,7 +8147,7 @@
           <w14:ligatures w14:val="standardContextual"/>
         </w:rPr>
       </w:pPr>
-      <w:hyperlink w:anchor="_Toc242049003" w:history="1">
+      <w:hyperlink w:anchor="_Toc242052376" w:history="1">
         <w:r>
           <w:rPr>
             <w:rStyle w:val="Hyperlink"/>
@@ -8174,7 +8174,7 @@
             <w:noProof/>
             <w:webHidden/>
           </w:rPr>
-          <w:instrText xml:space="preserve"> PAGEREF _Toc242049003 \h </w:instrText>
+          <w:instrText xml:space="preserve"> PAGEREF _Toc242052376 \h </w:instrText>
         </w:r>
         <w:r>
           <w:rPr>
@@ -8220,7 +8220,7 @@
           <w14:ligatures w14:val="standardContextual"/>
         </w:rPr>
       </w:pPr>
-      <w:hyperlink w:anchor="_Toc242049004" w:history="1">
+      <w:hyperlink w:anchor="_Toc242052377" w:history="1">
         <w:r>
           <w:rPr>
             <w:rStyle w:val="Hyperlink"/>
@@ -8247,7 +8247,7 @@
             <w:noProof/>
             <w:webHidden/>
           </w:rPr>
-          <w:instrText xml:space="preserve"> PAGEREF _Toc242049004 \h </w:instrText>
+          <w:instrText xml:space="preserve"> PAGEREF _Toc242052377 \h </w:instrText>
         </w:r>
         <w:r>
           <w:rPr>
@@ -8293,7 +8293,7 @@
           <w14:ligatures w14:val="standardContextual"/>
         </w:rPr>
       </w:pPr>
-      <w:hyperlink w:anchor="_Toc242049005" w:history="1">
+      <w:hyperlink w:anchor="_Toc242052378" w:history="1">
         <w:r>
           <w:rPr>
             <w:rStyle w:val="Hyperlink"/>
@@ -8320,7 +8320,7 @@
             <w:noProof/>
             <w:webHidden/>
           </w:rPr>
-          <w:instrText xml:space="preserve"> PAGEREF _Toc242049005 \h </w:instrText>
+          <w:instrText xml:space="preserve"> PAGEREF _Toc242052378 \h </w:instrText>
         </w:r>
         <w:r>
           <w:rPr>
@@ -8366,7 +8366,7 @@
           <w14:ligatures w14:val="standardContextual"/>
         </w:rPr>
       </w:pPr>
-      <w:hyperlink w:anchor="_Toc242049006" w:history="1">
+      <w:hyperlink w:anchor="_Toc242052379" w:history="1">
         <w:r>
           <w:rPr>
             <w:rStyle w:val="Hyperlink"/>
@@ -8393,7 +8393,7 @@
             <w:noProof/>
             <w:webHidden/>
           </w:rPr>
-          <w:instrText xml:space="preserve"> PAGEREF _Toc242049006 \h </w:instrText>
+          <w:instrText xml:space="preserve"> PAGEREF _Toc242052379 \h </w:instrText>
         </w:r>
         <w:r>
           <w:rPr>
@@ -8439,7 +8439,7 @@
           <w14:ligatures w14:val="standardContextual"/>
         </w:rPr>
       </w:pPr>
-      <w:hyperlink w:anchor="_Toc242049007" w:history="1">
+      <w:hyperlink w:anchor="_Toc242052380" w:history="1">
         <w:r>
           <w:rPr>
             <w:rStyle w:val="Hyperlink"/>
@@ -8466,7 +8466,7 @@
             <w:noProof/>
             <w:webHidden/>
           </w:rPr>
-          <w:instrText xml:space="preserve"> PAGEREF _Toc242049007 \h </w:instrText>
+          <w:instrText xml:space="preserve"> PAGEREF _Toc242052380 \h </w:instrText>
         </w:r>
         <w:r>
           <w:rPr>
@@ -8512,7 +8512,7 @@
           <w14:ligatures w14:val="standardContextual"/>
         </w:rPr>
       </w:pPr>
-      <w:hyperlink w:anchor="_Toc242049008" w:history="1">
+      <w:hyperlink w:anchor="_Toc242052381" w:history="1">
         <w:r>
           <w:rPr>
             <w:rStyle w:val="Hyperlink"/>
@@ -8539,7 +8539,7 @@
             <w:noProof/>
             <w:webHidden/>
           </w:rPr>
-          <w:instrText xml:space="preserve"> PAGEREF _Toc242049008 \h </w:instrText>
+          <w:instrText xml:space="preserve"> PAGEREF _Toc242052381 \h </w:instrText>
         </w:r>
         <w:r>
           <w:rPr>
@@ -8613,7 +8613,7 @@
       <w:r>
         <w:fldChar w:fldCharType="separate"/>
       </w:r>
-      <w:hyperlink w:anchor="_Toc242049009" w:history="1">
+      <w:hyperlink w:anchor="_Toc242052382" w:history="1">
         <w:r>
           <w:rPr>
             <w:rStyle w:val="Hyperlink"/>
@@ -8640,7 +8640,7 @@
             <w:noProof/>
             <w:webHidden/>
           </w:rPr>
-          <w:instrText xml:space="preserve"> PAGEREF _Toc242049009 \h </w:instrText>
+          <w:instrText xml:space="preserve"> PAGEREF _Toc242052382 \h </w:instrText>
         </w:r>
         <w:r>
           <w:rPr>
@@ -8686,7 +8686,7 @@
           <w14:ligatures w14:val="standardContextual"/>
         </w:rPr>
       </w:pPr>
-      <w:hyperlink w:anchor="_Toc242049010" w:history="1">
+      <w:hyperlink w:anchor="_Toc242052383" w:history="1">
         <w:r>
           <w:rPr>
             <w:rStyle w:val="Hyperlink"/>
@@ -8713,7 +8713,7 @@
             <w:noProof/>
             <w:webHidden/>
           </w:rPr>
-          <w:instrText xml:space="preserve"> PAGEREF _Toc242049010 \h </w:instrText>
+          <w:instrText xml:space="preserve"> PAGEREF _Toc242052383 \h </w:instrText>
         </w:r>
         <w:r>
           <w:rPr>
@@ -8759,7 +8759,7 @@
           <w14:ligatures w14:val="standardContextual"/>
         </w:rPr>
       </w:pPr>
-      <w:hyperlink w:anchor="_Toc242049011" w:history="1">
+      <w:hyperlink w:anchor="_Toc242052384" w:history="1">
         <w:r>
           <w:rPr>
             <w:rStyle w:val="Hyperlink"/>
@@ -8786,7 +8786,7 @@
             <w:noProof/>
             <w:webHidden/>
           </w:rPr>
-          <w:instrText xml:space="preserve"> PAGEREF _Toc242049011 \h </w:instrText>
+          <w:instrText xml:space="preserve"> PAGEREF _Toc242052384 \h </w:instrText>
         </w:r>
         <w:r>
           <w:rPr>
@@ -8832,7 +8832,7 @@
           <w14:ligatures w14:val="standardContextual"/>
         </w:rPr>
       </w:pPr>
-      <w:hyperlink w:anchor="_Toc242049012" w:history="1">
+      <w:hyperlink w:anchor="_Toc242052385" w:history="1">
         <w:r>
           <w:rPr>
             <w:rStyle w:val="Hyperlink"/>
@@ -8859,7 +8859,7 @@
             <w:noProof/>
             <w:webHidden/>
           </w:rPr>
-          <w:instrText xml:space="preserve"> PAGEREF _Toc242049012 \h </w:instrText>
+          <w:instrText xml:space="preserve"> PAGEREF _Toc242052385 \h </w:instrText>
         </w:r>
         <w:r>
           <w:rPr>
@@ -8905,21 +8905,13 @@
           <w14:ligatures w14:val="standardContextual"/>
         </w:rPr>
       </w:pPr>
-      <w:hyperlink w:anchor="_Toc242049013" w:history="1">
+      <w:hyperlink w:anchor="_Toc242052386" w:history="1">
         <w:r>
           <w:rPr>
             <w:rStyle w:val="Hyperlink"/>
             <w:noProof/>
           </w:rPr>
-          <w:t>Bảng 3.1. Các fi</w:t>
-        </w:r>
-        <w:r>
-          <w:rPr>
-            <w:rStyle w:val="Hyperlink"/>
-            <w:noProof/>
-          </w:rPr>
-          <w:lastRenderedPageBreak/>
-          <w:t>le cài đặt</w:t>
+          <w:t>Bảng 3.1. Các file cài đặt</w:t>
         </w:r>
         <w:r>
           <w:rPr>
@@ -8940,7 +8932,7 @@
             <w:noProof/>
             <w:webHidden/>
           </w:rPr>
-          <w:instrText xml:space="preserve"> PAGEREF _Toc242049013 \h </w:instrText>
+          <w:instrText xml:space="preserve"> PAGEREF _Toc242052386 \h </w:instrText>
         </w:r>
         <w:r>
           <w:rPr>
@@ -8986,13 +8978,21 @@
           <w14:ligatures w14:val="standardContextual"/>
         </w:rPr>
       </w:pPr>
-      <w:hyperlink w:anchor="_Toc242049014" w:history="1">
+      <w:hyperlink w:anchor="_Toc242052387" w:history="1">
         <w:r>
           <w:rPr>
             <w:rStyle w:val="Hyperlink"/>
             <w:noProof/>
           </w:rPr>
-          <w:t>Bảng 3.2. Cấu hình đã lưu và cách gỡ ứng dụng</w:t>
+          <w:t>Bảng 3.2. Cấu hình đã lưu và cách g</w:t>
+        </w:r>
+        <w:r>
+          <w:rPr>
+            <w:rStyle w:val="Hyperlink"/>
+            <w:noProof/>
+          </w:rPr>
+          <w:lastRenderedPageBreak/>
+          <w:t>ỡ ứng dụng</w:t>
         </w:r>
         <w:r>
           <w:rPr>
@@ -9013,7 +9013,7 @@
             <w:noProof/>
             <w:webHidden/>
           </w:rPr>
-          <w:instrText xml:space="preserve"> PAGEREF _Toc242049014 \h </w:instrText>
+          <w:instrText xml:space="preserve"> PAGEREF _Toc242052387 \h </w:instrText>
         </w:r>
         <w:r>
           <w:rPr>
@@ -9059,7 +9059,7 @@
           <w14:ligatures w14:val="standardContextual"/>
         </w:rPr>
       </w:pPr>
-      <w:hyperlink w:anchor="_Toc242049015" w:history="1">
+      <w:hyperlink w:anchor="_Toc242052388" w:history="1">
         <w:r>
           <w:rPr>
             <w:rStyle w:val="Hyperlink"/>
@@ -9086,7 +9086,7 @@
             <w:noProof/>
             <w:webHidden/>
           </w:rPr>
-          <w:instrText xml:space="preserve"> PAGEREF _Toc242049015 \h </w:instrText>
+          <w:instrText xml:space="preserve"> PAGEREF _Toc242052388 \h </w:instrText>
         </w:r>
         <w:r>
           <w:rPr>
@@ -9132,7 +9132,7 @@
           <w14:ligatures w14:val="standardContextual"/>
         </w:rPr>
       </w:pPr>
-      <w:hyperlink w:anchor="_Toc242049016" w:history="1">
+      <w:hyperlink w:anchor="_Toc242052389" w:history="1">
         <w:r>
           <w:rPr>
             <w:rStyle w:val="Hyperlink"/>
@@ -9159,7 +9159,7 @@
             <w:noProof/>
             <w:webHidden/>
           </w:rPr>
-          <w:instrText xml:space="preserve"> PAGEREF _Toc242049016 \h </w:instrText>
+          <w:instrText xml:space="preserve"> PAGEREF _Toc242052389 \h </w:instrText>
         </w:r>
         <w:r>
           <w:rPr>
@@ -9205,7 +9205,7 @@
           <w14:ligatures w14:val="standardContextual"/>
         </w:rPr>
       </w:pPr>
-      <w:hyperlink w:anchor="_Toc242049017" w:history="1">
+      <w:hyperlink w:anchor="_Toc242052390" w:history="1">
         <w:r>
           <w:rPr>
             <w:rStyle w:val="Hyperlink"/>
@@ -9232,7 +9232,7 @@
             <w:noProof/>
             <w:webHidden/>
           </w:rPr>
-          <w:instrText xml:space="preserve"> PAGEREF _Toc242049017 \h </w:instrText>
+          <w:instrText xml:space="preserve"> PAGEREF _Toc242052390 \h </w:instrText>
         </w:r>
         <w:r>
           <w:rPr>
@@ -9278,7 +9278,7 @@
           <w14:ligatures w14:val="standardContextual"/>
         </w:rPr>
       </w:pPr>
-      <w:hyperlink w:anchor="_Toc242049018" w:history="1">
+      <w:hyperlink w:anchor="_Toc242052391" w:history="1">
         <w:r>
           <w:rPr>
             <w:rStyle w:val="Hyperlink"/>
@@ -9305,7 +9305,7 @@
             <w:noProof/>
             <w:webHidden/>
           </w:rPr>
-          <w:instrText xml:space="preserve"> PAGEREF _Toc242049018 \h </w:instrText>
+          <w:instrText xml:space="preserve"> PAGEREF _Toc242052391 \h </w:instrText>
         </w:r>
         <w:r>
           <w:rPr>
@@ -9351,7 +9351,7 @@
           <w14:ligatures w14:val="standardContextual"/>
         </w:rPr>
       </w:pPr>
-      <w:hyperlink w:anchor="_Toc242049019" w:history="1">
+      <w:hyperlink w:anchor="_Toc242052392" w:history="1">
         <w:r>
           <w:rPr>
             <w:rStyle w:val="Hyperlink"/>
@@ -9378,7 +9378,7 @@
             <w:noProof/>
             <w:webHidden/>
           </w:rPr>
-          <w:instrText xml:space="preserve"> PAGEREF _Toc242049019 \h </w:instrText>
+          <w:instrText xml:space="preserve"> PAGEREF _Toc242052392 \h </w:instrText>
         </w:r>
         <w:r>
           <w:rPr>
@@ -9424,7 +9424,7 @@
           <w14:ligatures w14:val="standardContextual"/>
         </w:rPr>
       </w:pPr>
-      <w:hyperlink w:anchor="_Toc242049020" w:history="1">
+      <w:hyperlink w:anchor="_Toc242052393" w:history="1">
         <w:r>
           <w:rPr>
             <w:rStyle w:val="Hyperlink"/>
@@ -9451,7 +9451,7 @@
             <w:noProof/>
             <w:webHidden/>
           </w:rPr>
-          <w:instrText xml:space="preserve"> PAGEREF _Toc242049020 \h </w:instrText>
+          <w:instrText xml:space="preserve"> PAGEREF _Toc242052393 \h </w:instrText>
         </w:r>
         <w:r>
           <w:rPr>
@@ -9497,7 +9497,7 @@
           <w14:ligatures w14:val="standardContextual"/>
         </w:rPr>
       </w:pPr>
-      <w:hyperlink w:anchor="_Toc242049021" w:history="1">
+      <w:hyperlink w:anchor="_Toc242052394" w:history="1">
         <w:r>
           <w:rPr>
             <w:rStyle w:val="Hyperlink"/>
@@ -9524,7 +9524,7 @@
             <w:noProof/>
             <w:webHidden/>
           </w:rPr>
-          <w:instrText xml:space="preserve"> PAGEREF _Toc242049021 \h </w:instrText>
+          <w:instrText xml:space="preserve"> PAGEREF _Toc242052394 \h </w:instrText>
         </w:r>
         <w:r>
           <w:rPr>
@@ -9570,7 +9570,7 @@
           <w14:ligatures w14:val="standardContextual"/>
         </w:rPr>
       </w:pPr>
-      <w:hyperlink w:anchor="_Toc242049022" w:history="1">
+      <w:hyperlink w:anchor="_Toc242052395" w:history="1">
         <w:r>
           <w:rPr>
             <w:rStyle w:val="Hyperlink"/>
@@ -9597,7 +9597,7 @@
             <w:noProof/>
             <w:webHidden/>
           </w:rPr>
-          <w:instrText xml:space="preserve"> PAGEREF _Toc242049022 \h </w:instrText>
+          <w:instrText xml:space="preserve"> PAGEREF _Toc242052395 \h </w:instrText>
         </w:r>
         <w:r>
           <w:rPr>
@@ -9643,7 +9643,7 @@
           <w14:ligatures w14:val="standardContextual"/>
         </w:rPr>
       </w:pPr>
-      <w:hyperlink w:anchor="_Toc242049023" w:history="1">
+      <w:hyperlink w:anchor="_Toc242052396" w:history="1">
         <w:r>
           <w:rPr>
             <w:rStyle w:val="Hyperlink"/>
@@ -9670,7 +9670,7 @@
             <w:noProof/>
             <w:webHidden/>
           </w:rPr>
-          <w:instrText xml:space="preserve"> PAGEREF _Toc242049023 \h </w:instrText>
+          <w:instrText xml:space="preserve"> PAGEREF _Toc242052396 \h </w:instrText>
         </w:r>
         <w:r>
           <w:rPr>
@@ -9711,7 +9711,7 @@
         <w:pStyle w:val="Heading1"/>
         <w:pageBreakBefore/>
       </w:pPr>
-      <w:bookmarkStart w:id="0" w:name="_Toc242048911"/>
+      <w:bookmarkStart w:id="0" w:name="_Toc242052284"/>
       <w:r>
         <w:lastRenderedPageBreak/>
         <w:t>CHƯƠNG 1. GIỚI THIỆU</w:t>
@@ -9722,7 +9722,7 @@
       <w:pPr>
         <w:pStyle w:val="Heading2"/>
       </w:pPr>
-      <w:bookmarkStart w:id="1" w:name="_Toc242048912"/>
+      <w:bookmarkStart w:id="1" w:name="_Toc242052285"/>
       <w:r>
         <w:t>1.1. Mục đích của tài liệu</w:t>
       </w:r>
@@ -9769,7 +9769,7 @@
       <w:pPr>
         <w:pStyle w:val="Heading2"/>
       </w:pPr>
-      <w:bookmarkStart w:id="2" w:name="_Toc242048913"/>
+      <w:bookmarkStart w:id="2" w:name="_Toc242052286"/>
       <w:r>
         <w:t>1.2. Tổng quan phần mềm</w:t>
       </w:r>
@@ -9916,7 +9916,7 @@
       <w:pPr>
         <w:pStyle w:val="Heading2"/>
       </w:pPr>
-      <w:bookmarkStart w:id="3" w:name="_Toc242048914"/>
+      <w:bookmarkStart w:id="3" w:name="_Toc242052287"/>
       <w:r>
         <w:t>1.3. Vai trò người dùng và chức năng</w:t>
       </w:r>
@@ -9954,7 +9954,7 @@
       <w:pPr>
         <w:pStyle w:val="TableCaption"/>
       </w:pPr>
-      <w:bookmarkStart w:id="4" w:name="_Toc242049009"/>
+      <w:bookmarkStart w:id="4" w:name="_Toc242052382"/>
       <w:r>
         <w:t>Bảng 1.1. Chức năng hiển thị theo vai trò</w:t>
       </w:r>
@@ -14157,7 +14157,7 @@
       <w:pPr>
         <w:pStyle w:val="Heading2"/>
       </w:pPr>
-      <w:bookmarkStart w:id="5" w:name="_Toc242048915"/>
+      <w:bookmarkStart w:id="5" w:name="_Toc242052288"/>
       <w:r>
         <w:t>1.4. Yêu cầu hệ thống</w:t>
       </w:r>
@@ -14167,7 +14167,7 @@
       <w:pPr>
         <w:pStyle w:val="TableCaption"/>
       </w:pPr>
-      <w:bookmarkStart w:id="6" w:name="_Toc242049010"/>
+      <w:bookmarkStart w:id="6" w:name="_Toc242052383"/>
       <w:r>
         <w:t>Bảng 1.2. Yêu cầu phần cứng và phần mềm</w:t>
       </w:r>
@@ -14759,7 +14759,7 @@
       <w:pPr>
         <w:pStyle w:val="Heading2"/>
       </w:pPr>
-      <w:bookmarkStart w:id="7" w:name="_Toc242048916"/>
+      <w:bookmarkStart w:id="7" w:name="_Toc242052289"/>
       <w:r>
         <w:t>1.5. Các bước cài đặt tổng quát</w:t>
       </w:r>
@@ -14911,7 +14911,7 @@
       <w:pPr>
         <w:pStyle w:val="TableCaption"/>
       </w:pPr>
-      <w:bookmarkStart w:id="8" w:name="_Toc242049011"/>
+      <w:bookmarkStart w:id="8" w:name="_Toc242052384"/>
       <w:r>
         <w:t>Bảng 1.3. Chọn phương án SQL Server theo máy</w:t>
       </w:r>
@@ -15515,7 +15515,7 @@
       <w:pPr>
         <w:pStyle w:val="Heading2"/>
       </w:pPr>
-      <w:bookmarkStart w:id="9" w:name="_Toc242048917"/>
+      <w:bookmarkStart w:id="9" w:name="_Toc242052290"/>
       <w:r>
         <w:t>1.6. Quy ước trình bày</w:t>
       </w:r>
@@ -15764,7 +15764,7 @@
         <w:pStyle w:val="Heading1"/>
         <w:pageBreakBefore/>
       </w:pPr>
-      <w:bookmarkStart w:id="10" w:name="_Toc242048918"/>
+      <w:bookmarkStart w:id="10" w:name="_Toc242052291"/>
       <w:r>
         <w:lastRenderedPageBreak/>
         <w:t>CHƯƠNG 2. CÀI ĐẶT SQL SERVER VÀ KHỞI TẠO CƠ SỞ DỮ LIỆU</w:t>
@@ -15821,7 +15821,7 @@
       <w:pPr>
         <w:pStyle w:val="Heading2"/>
       </w:pPr>
-      <w:bookmarkStart w:id="11" w:name="_Toc242048919"/>
+      <w:bookmarkStart w:id="11" w:name="_Toc242052292"/>
       <w:r>
         <w:t>2.1. Tải mã nguồn</w:t>
       </w:r>
@@ -15942,7 +15942,7 @@
       <w:pPr>
         <w:pStyle w:val="Heading2"/>
       </w:pPr>
-      <w:bookmarkStart w:id="12" w:name="_Toc242048920"/>
+      <w:bookmarkStart w:id="12" w:name="_Toc242052293"/>
       <w:r>
         <w:t>2.2. Phương án A - SQL Server trong Docker</w:t>
       </w:r>
@@ -15952,7 +15952,7 @@
       <w:pPr>
         <w:pStyle w:val="Heading3"/>
       </w:pPr>
-      <w:bookmarkStart w:id="13" w:name="_Toc242048921"/>
+      <w:bookmarkStart w:id="13" w:name="_Toc242052294"/>
       <w:r>
         <w:t>2.2.1. Cài Docker Desktop</w:t>
       </w:r>
@@ -16294,7 +16294,7 @@
       <w:pPr>
         <w:pStyle w:val="Heading3"/>
       </w:pPr>
-      <w:bookmarkStart w:id="14" w:name="_Toc242048922"/>
+      <w:bookmarkStart w:id="14" w:name="_Toc242052295"/>
       <w:r>
         <w:t>2.2.2. Khởi động SQL Server</w:t>
       </w:r>
@@ -16722,7 +16722,7 @@
       <w:pPr>
         <w:pStyle w:val="Heading3"/>
       </w:pPr>
-      <w:bookmarkStart w:id="15" w:name="_Toc242048923"/>
+      <w:bookmarkStart w:id="15" w:name="_Toc242052296"/>
       <w:r>
         <w:t>2.2.3. Khởi tạo CSDL</w:t>
       </w:r>
@@ -17154,7 +17154,7 @@
       <w:pPr>
         <w:pStyle w:val="Heading3"/>
       </w:pPr>
-      <w:bookmarkStart w:id="16" w:name="_Toc242048924"/>
+      <w:bookmarkStart w:id="16" w:name="_Toc242052297"/>
       <w:r>
         <w:t>2.2.4. Bật, tắt SQL Server hằng ngày</w:t>
       </w:r>
@@ -17164,7 +17164,7 @@
       <w:pPr>
         <w:pStyle w:val="TableCaption"/>
       </w:pPr>
-      <w:bookmarkStart w:id="17" w:name="_Toc242049012"/>
+      <w:bookmarkStart w:id="17" w:name="_Toc242052385"/>
       <w:r>
         <w:t>Bảng 2.1. Các lệnh Docker thường dùng</w:t>
       </w:r>
@@ -17581,7 +17581,7 @@
       <w:pPr>
         <w:pStyle w:val="Heading2"/>
       </w:pPr>
-      <w:bookmarkStart w:id="18" w:name="_Toc242048925"/>
+      <w:bookmarkStart w:id="18" w:name="_Toc242052298"/>
       <w:r>
         <w:t>2.3. Phương án B - SQL Server cài trực tiếp trên Windows</w:t>
       </w:r>
@@ -17591,7 +17591,7 @@
       <w:pPr>
         <w:pStyle w:val="Heading3"/>
       </w:pPr>
-      <w:bookmarkStart w:id="19" w:name="_Toc242048926"/>
+      <w:bookmarkStart w:id="19" w:name="_Toc242052299"/>
       <w:r>
         <w:t>2.3.1. Cài SQL Server</w:t>
       </w:r>
@@ -18372,7 +18372,7 @@
       <w:pPr>
         <w:pStyle w:val="Heading3"/>
       </w:pPr>
-      <w:bookmarkStart w:id="20" w:name="_Toc242048927"/>
+      <w:bookmarkStart w:id="20" w:name="_Toc242052300"/>
       <w:r>
         <w:lastRenderedPageBreak/>
         <w:t>2.3.2. Cài công cụ quản trị và driver</w:t>
@@ -18563,7 +18563,7 @@
       <w:pPr>
         <w:pStyle w:val="Heading3"/>
       </w:pPr>
-      <w:bookmarkStart w:id="21" w:name="_Toc242048928"/>
+      <w:bookmarkStart w:id="21" w:name="_Toc242052301"/>
       <w:r>
         <w:t>2.3.3. Bật kết nối TCP/IP</w:t>
       </w:r>
@@ -18964,7 +18964,7 @@
       <w:pPr>
         <w:pStyle w:val="Heading3"/>
       </w:pPr>
-      <w:bookmarkStart w:id="22" w:name="_Toc242048929"/>
+      <w:bookmarkStart w:id="22" w:name="_Toc242052302"/>
       <w:r>
         <w:t>2.3.4. Khởi tạo CSDL</w:t>
       </w:r>
@@ -19514,7 +19514,7 @@
       <w:pPr>
         <w:pStyle w:val="Heading3"/>
       </w:pPr>
-      <w:bookmarkStart w:id="23" w:name="_Toc242048930"/>
+      <w:bookmarkStart w:id="23" w:name="_Toc242052303"/>
       <w:r>
         <w:lastRenderedPageBreak/>
         <w:t>2.3.5. Cho máy khác kết nối tới (không bắt buộc)</w:t>
@@ -19607,7 +19607,7 @@
       <w:pPr>
         <w:pStyle w:val="Heading2"/>
       </w:pPr>
-      <w:bookmarkStart w:id="24" w:name="_Toc242048931"/>
+      <w:bookmarkStart w:id="24" w:name="_Toc242052304"/>
       <w:r>
         <w:t>2.4. Nạp lại dữ liệu mẫu trước buổi demo</w:t>
       </w:r>
@@ -19719,7 +19719,7 @@
         <w:pStyle w:val="Heading1"/>
         <w:pageBreakBefore/>
       </w:pPr>
-      <w:bookmarkStart w:id="25" w:name="_Toc242048932"/>
+      <w:bookmarkStart w:id="25" w:name="_Toc242052305"/>
       <w:r>
         <w:lastRenderedPageBreak/>
         <w:t>CHƯƠNG 3. CÀI ĐẶT ỨNG DỤNG</w:t>
@@ -19730,7 +19730,7 @@
       <w:pPr>
         <w:pStyle w:val="Heading2"/>
       </w:pPr>
-      <w:bookmarkStart w:id="26" w:name="_Toc242048933"/>
+      <w:bookmarkStart w:id="26" w:name="_Toc242052306"/>
       <w:r>
         <w:t>3.1. Tải bộ cài</w:t>
       </w:r>
@@ -19768,7 +19768,7 @@
       <w:pPr>
         <w:pStyle w:val="TableCaption"/>
       </w:pPr>
-      <w:bookmarkStart w:id="27" w:name="_Toc242049013"/>
+      <w:bookmarkStart w:id="27" w:name="_Toc242052386"/>
       <w:r>
         <w:t>Bảng 3.1. Các file cài đặt</w:t>
       </w:r>
@@ -20211,7 +20211,7 @@
       <w:pPr>
         <w:pStyle w:val="Heading2"/>
       </w:pPr>
-      <w:bookmarkStart w:id="28" w:name="_Toc242048934"/>
+      <w:bookmarkStart w:id="28" w:name="_Toc242052307"/>
       <w:r>
         <w:t>3.2. Cài đặt trên macOS</w:t>
       </w:r>
@@ -20443,7 +20443,7 @@
       <w:pPr>
         <w:pStyle w:val="Heading2"/>
       </w:pPr>
-      <w:bookmarkStart w:id="29" w:name="_Toc242048935"/>
+      <w:bookmarkStart w:id="29" w:name="_Toc242052308"/>
       <w:r>
         <w:t>3.3. Cài đặt trên Windows</w:t>
       </w:r>
@@ -20453,7 +20453,7 @@
       <w:pPr>
         <w:pStyle w:val="Heading3"/>
       </w:pPr>
-      <w:bookmarkStart w:id="30" w:name="_Toc242048936"/>
+      <w:bookmarkStart w:id="30" w:name="_Toc242052309"/>
       <w:r>
         <w:t>3.3.1. Dùng bộ cài setup.exe</w:t>
       </w:r>
@@ -20871,7 +20871,7 @@
           <w:noProof/>
         </w:rPr>
         <w:drawing>
-          <wp:inline distT="0" distB="0" distL="0" distR="0" wp14:anchorId="3A894A1F" wp14:editId="3FED6213">
+          <wp:inline distT="0" distB="0" distL="0" distR="0" wp14:anchorId="7B742A2F" wp14:editId="32835179">
             <wp:extent cx="3420000" cy="3198254"/>
             <wp:effectExtent l="0" t="0" r="0" b="0"/>
             <wp:docPr id="522444761" name="Picture 522444761"/>
@@ -20911,7 +20911,7 @@
       <w:pPr>
         <w:pStyle w:val="FigureCaption"/>
       </w:pPr>
-      <w:bookmarkStart w:id="31" w:name="_Toc242048984"/>
+      <w:bookmarkStart w:id="31" w:name="_Toc242052357"/>
       <w:r>
         <w:t>Hình 3.1. Cảnh báo SmartScreen khi chạy bộ cài</w:t>
       </w:r>
@@ -20929,7 +20929,7 @@
         </w:rPr>
         <w:lastRenderedPageBreak/>
         <w:drawing>
-          <wp:inline distT="0" distB="0" distL="0" distR="0" wp14:anchorId="10D85270" wp14:editId="55DF5CDE">
+          <wp:inline distT="0" distB="0" distL="0" distR="0" wp14:anchorId="72D9674B" wp14:editId="195CAE5F">
             <wp:extent cx="4500000" cy="3458417"/>
             <wp:effectExtent l="0" t="0" r="0" b="0"/>
             <wp:docPr id="522444762" name="Picture 522444762"/>
@@ -20969,7 +20969,7 @@
       <w:pPr>
         <w:pStyle w:val="FigureCaption"/>
       </w:pPr>
-      <w:bookmarkStart w:id="32" w:name="_Toc242048985"/>
+      <w:bookmarkStart w:id="32" w:name="_Toc242052358"/>
       <w:r>
         <w:t>Hình 3.2. Bước cuối của bộ cài QLTTTA trên Windows</w:t>
       </w:r>
@@ -20979,7 +20979,7 @@
       <w:pPr>
         <w:pStyle w:val="Heading3"/>
       </w:pPr>
-      <w:bookmarkStart w:id="33" w:name="_Toc242048937"/>
+      <w:bookmarkStart w:id="33" w:name="_Toc242052310"/>
       <w:r>
         <w:t>3.3.2. Dùng bản portable</w:t>
       </w:r>
@@ -21026,7 +21026,7 @@
       <w:pPr>
         <w:pStyle w:val="Heading3"/>
       </w:pPr>
-      <w:bookmarkStart w:id="34" w:name="_Toc242048938"/>
+      <w:bookmarkStart w:id="34" w:name="_Toc242052311"/>
       <w:r>
         <w:t>3.3.3. Driver kết nối</w:t>
       </w:r>
@@ -21082,7 +21082,7 @@
       <w:pPr>
         <w:pStyle w:val="Heading2"/>
       </w:pPr>
-      <w:bookmarkStart w:id="35" w:name="_Toc242048939"/>
+      <w:bookmarkStart w:id="35" w:name="_Toc242052312"/>
       <w:r>
         <w:t>3.4. Nơi lưu cấu hình và gỡ cài đặt</w:t>
       </w:r>
@@ -21102,7 +21102,7 @@
       <w:pPr>
         <w:pStyle w:val="TableCaption"/>
       </w:pPr>
-      <w:bookmarkStart w:id="36" w:name="_Toc242049014"/>
+      <w:bookmarkStart w:id="36" w:name="_Toc242052387"/>
       <w:r>
         <w:t>Bảng 3.2. Cấu hình đã lưu và cách gỡ ứng dụng</w:t>
       </w:r>
@@ -21672,7 +21672,7 @@
       <w:pPr>
         <w:pStyle w:val="Heading2"/>
       </w:pPr>
-      <w:bookmarkStart w:id="37" w:name="_Toc242048940"/>
+      <w:bookmarkStart w:id="37" w:name="_Toc242052313"/>
       <w:r>
         <w:t>3.5. Chạy từ mã nguồn (dành cho nhóm phát triển)</w:t>
       </w:r>
@@ -22205,7 +22205,7 @@
         <w:pStyle w:val="Heading1"/>
         <w:pageBreakBefore/>
       </w:pPr>
-      <w:bookmarkStart w:id="38" w:name="_Toc242048941"/>
+      <w:bookmarkStart w:id="38" w:name="_Toc242052314"/>
       <w:r>
         <w:lastRenderedPageBreak/>
         <w:t>CHƯƠNG 4. ĐĂNG NHẬP VÀ GIAO DIỆN CHUNG</w:t>
@@ -22216,7 +22216,7 @@
       <w:pPr>
         <w:pStyle w:val="Heading2"/>
       </w:pPr>
-      <w:bookmarkStart w:id="39" w:name="_Toc242048942"/>
+      <w:bookmarkStart w:id="39" w:name="_Toc242052315"/>
       <w:r>
         <w:t>4.1. Mở ứng dụng</w:t>
       </w:r>
@@ -22373,7 +22373,7 @@
           <w:noProof/>
         </w:rPr>
         <w:drawing>
-          <wp:inline distT="0" distB="0" distL="0" distR="0" wp14:anchorId="74FA83BE" wp14:editId="499CFAB9">
+          <wp:inline distT="0" distB="0" distL="0" distR="0" wp14:anchorId="139A2B63" wp14:editId="1C7F2346">
             <wp:extent cx="4860000" cy="2938605"/>
             <wp:effectExtent l="0" t="0" r="0" b="0"/>
             <wp:docPr id="522444763" name="Picture 522444763"/>
@@ -22413,7 +22413,7 @@
       <w:pPr>
         <w:pStyle w:val="FigureCaption"/>
       </w:pPr>
-      <w:bookmarkStart w:id="40" w:name="_Toc242048986"/>
+      <w:bookmarkStart w:id="40" w:name="_Toc242052359"/>
       <w:r>
         <w:t>Hình 4.1. Màn hình đăng nhập</w:t>
       </w:r>
@@ -22423,7 +22423,7 @@
       <w:pPr>
         <w:pStyle w:val="Heading2"/>
       </w:pPr>
-      <w:bookmarkStart w:id="41" w:name="_Toc242048943"/>
+      <w:bookmarkStart w:id="41" w:name="_Toc242052316"/>
       <w:r>
         <w:t>4.2. Cấu hình máy chủ (lần chạy đầu tiên)</w:t>
       </w:r>
@@ -22574,7 +22574,7 @@
         </w:rPr>
         <w:lastRenderedPageBreak/>
         <w:drawing>
-          <wp:inline distT="0" distB="0" distL="0" distR="0" wp14:anchorId="264B57DC" wp14:editId="337665CB">
+          <wp:inline distT="0" distB="0" distL="0" distR="0" wp14:anchorId="5478F1A5" wp14:editId="3EDB3024">
             <wp:extent cx="5040000" cy="3360000"/>
             <wp:effectExtent l="0" t="0" r="0" b="0"/>
             <wp:docPr id="522444764" name="Picture 522444764"/>
@@ -22614,7 +22614,7 @@
       <w:pPr>
         <w:pStyle w:val="FigureCaption"/>
       </w:pPr>
-      <w:bookmarkStart w:id="42" w:name="_Toc242048987"/>
+      <w:bookmarkStart w:id="42" w:name="_Toc242052360"/>
       <w:r>
         <w:t>Hình 4.2. Khung cấu hình máy chủ SQL Server</w:t>
       </w:r>
@@ -22624,7 +22624,7 @@
       <w:pPr>
         <w:pStyle w:val="TableCaption"/>
       </w:pPr>
-      <w:bookmarkStart w:id="43" w:name="_Toc242049015"/>
+      <w:bookmarkStart w:id="43" w:name="_Toc242052388"/>
       <w:r>
         <w:t>Bảng 4.1. Giá trị ô Máy chủ theo cách cài SQL Server</w:t>
       </w:r>
@@ -23064,7 +23064,7 @@
       <w:pPr>
         <w:pStyle w:val="Heading2"/>
       </w:pPr>
-      <w:bookmarkStart w:id="44" w:name="_Toc242048944"/>
+      <w:bookmarkStart w:id="44" w:name="_Toc242052317"/>
       <w:r>
         <w:t>4.3. Đăng nhập</w:t>
       </w:r>
@@ -23138,7 +23138,7 @@
       <w:pPr>
         <w:pStyle w:val="TableCaption"/>
       </w:pPr>
-      <w:bookmarkStart w:id="45" w:name="_Toc242049016"/>
+      <w:bookmarkStart w:id="45" w:name="_Toc242052389"/>
       <w:r>
         <w:t>Bảng 4.2. Tài khoản demo trong dữ liệu mẫu</w:t>
       </w:r>
@@ -24464,7 +24464,7 @@
       <w:pPr>
         <w:pStyle w:val="TableCaption"/>
       </w:pPr>
-      <w:bookmarkStart w:id="46" w:name="_Toc242049017"/>
+      <w:bookmarkStart w:id="46" w:name="_Toc242052390"/>
       <w:r>
         <w:t>Bảng 4.3. Thông báo lỗi khi đăng nhập</w:t>
       </w:r>
@@ -24888,7 +24888,7 @@
       <w:pPr>
         <w:pStyle w:val="Heading2"/>
       </w:pPr>
-      <w:bookmarkStart w:id="47" w:name="_Toc242048945"/>
+      <w:bookmarkStart w:id="47" w:name="_Toc242052318"/>
       <w:r>
         <w:t>4.4. Màn hình chính</w:t>
       </w:r>
@@ -25048,7 +25048,7 @@
           <w:noProof/>
         </w:rPr>
         <w:drawing>
-          <wp:inline distT="0" distB="0" distL="0" distR="0" wp14:anchorId="602BF28A" wp14:editId="11047127">
+          <wp:inline distT="0" distB="0" distL="0" distR="0" wp14:anchorId="79D2AFD0" wp14:editId="22AFBD7E">
             <wp:extent cx="5580000" cy="3332500"/>
             <wp:effectExtent l="0" t="0" r="0" b="0"/>
             <wp:docPr id="522444765" name="Picture 522444765"/>
@@ -25088,7 +25088,7 @@
       <w:pPr>
         <w:pStyle w:val="FigureCaption"/>
       </w:pPr>
-      <w:bookmarkStart w:id="48" w:name="_Toc242048988"/>
+      <w:bookmarkStart w:id="48" w:name="_Toc242052361"/>
       <w:r>
         <w:t>Hình 4.3. Màn hình chính của vai trò Quản lý (trang Tổng quan)</w:t>
       </w:r>
@@ -25098,7 +25098,7 @@
       <w:pPr>
         <w:pStyle w:val="Heading2"/>
       </w:pPr>
-      <w:bookmarkStart w:id="49" w:name="_Toc242048946"/>
+      <w:bookmarkStart w:id="49" w:name="_Toc242052319"/>
       <w:r>
         <w:t>4.5. Đổi ngôn ngữ giao diện</w:t>
       </w:r>
@@ -25136,7 +25136,7 @@
       <w:pPr>
         <w:pStyle w:val="Heading2"/>
       </w:pPr>
-      <w:bookmarkStart w:id="50" w:name="_Toc242048947"/>
+      <w:bookmarkStart w:id="50" w:name="_Toc242052320"/>
       <w:r>
         <w:t>4.6. Đổi mật khẩu</w:t>
       </w:r>
@@ -25252,7 +25252,7 @@
           <w:noProof/>
         </w:rPr>
         <w:drawing>
-          <wp:inline distT="0" distB="0" distL="0" distR="0" wp14:anchorId="7275908C" wp14:editId="23375195">
+          <wp:inline distT="0" distB="0" distL="0" distR="0" wp14:anchorId="4B055939" wp14:editId="273CC05E">
             <wp:extent cx="3420000" cy="1368000"/>
             <wp:effectExtent l="0" t="0" r="0" b="0"/>
             <wp:docPr id="522444766" name="Picture 522444766"/>
@@ -25292,7 +25292,7 @@
       <w:pPr>
         <w:pStyle w:val="FigureCaption"/>
       </w:pPr>
-      <w:bookmarkStart w:id="51" w:name="_Toc242048989"/>
+      <w:bookmarkStart w:id="51" w:name="_Toc242052362"/>
       <w:r>
         <w:t>Hình 4.4. Hộp thoại đổi mật khẩu</w:t>
       </w:r>
@@ -25334,7 +25334,7 @@
       <w:pPr>
         <w:pStyle w:val="Heading2"/>
       </w:pPr>
-      <w:bookmarkStart w:id="52" w:name="_Toc242048948"/>
+      <w:bookmarkStart w:id="52" w:name="_Toc242052321"/>
       <w:r>
         <w:t>4.7. Đăng xuất và thoát</w:t>
       </w:r>
@@ -25381,7 +25381,7 @@
       <w:pPr>
         <w:pStyle w:val="Heading2"/>
       </w:pPr>
-      <w:bookmarkStart w:id="53" w:name="_Toc242048949"/>
+      <w:bookmarkStart w:id="53" w:name="_Toc242052322"/>
       <w:r>
         <w:t>4.8. Thao tác chung trên các màn hình danh sách</w:t>
       </w:r>
@@ -25408,7 +25408,7 @@
           <w:noProof/>
         </w:rPr>
         <w:drawing>
-          <wp:inline distT="0" distB="0" distL="0" distR="0" wp14:anchorId="1C418B63" wp14:editId="198D08AB">
+          <wp:inline distT="0" distB="0" distL="0" distR="0" wp14:anchorId="60AC95C3" wp14:editId="57FA3BD8">
             <wp:extent cx="5580000" cy="3332500"/>
             <wp:effectExtent l="0" t="0" r="0" b="0"/>
             <wp:docPr id="522444767" name="Picture 522444767"/>
@@ -25448,7 +25448,7 @@
       <w:pPr>
         <w:pStyle w:val="FigureCaption"/>
       </w:pPr>
-      <w:bookmarkStart w:id="54" w:name="_Toc242048990"/>
+      <w:bookmarkStart w:id="54" w:name="_Toc242052363"/>
       <w:r>
         <w:t>Hình 4.5. Một màn hình danh sách: Công nợ học phí</w:t>
       </w:r>
@@ -25458,7 +25458,7 @@
       <w:pPr>
         <w:pStyle w:val="TableCaption"/>
       </w:pPr>
-      <w:bookmarkStart w:id="55" w:name="_Toc242049018"/>
+      <w:bookmarkStart w:id="55" w:name="_Toc242052391"/>
       <w:r>
         <w:t>Bảng 4.4. Các thành phần của màn hình danh sách</w:t>
       </w:r>
@@ -26300,7 +26300,7 @@
       <w:pPr>
         <w:pStyle w:val="Heading2"/>
       </w:pPr>
-      <w:bookmarkStart w:id="56" w:name="_Toc242048950"/>
+      <w:bookmarkStart w:id="56" w:name="_Toc242052323"/>
       <w:r>
         <w:t>4.9. Form nhập liệu và hộp xác nhận</w:t>
       </w:r>
@@ -26463,7 +26463,7 @@
         <w:pStyle w:val="Heading1"/>
         <w:pageBreakBefore/>
       </w:pPr>
-      <w:bookmarkStart w:id="57" w:name="_Toc242048951"/>
+      <w:bookmarkStart w:id="57" w:name="_Toc242052324"/>
       <w:r>
         <w:lastRenderedPageBreak/>
         <w:t>CHƯƠNG 5. HƯỚNG DẪN THEO CHỨC NĂNG</w:t>
@@ -26484,7 +26484,7 @@
       <w:pPr>
         <w:pStyle w:val="Heading2"/>
       </w:pPr>
-      <w:bookmarkStart w:id="58" w:name="_Toc242048952"/>
+      <w:bookmarkStart w:id="58" w:name="_Toc242052325"/>
       <w:r>
         <w:t>5.1. Tổng quan</w:t>
       </w:r>
@@ -26528,7 +26528,7 @@
       <w:pPr>
         <w:pStyle w:val="TableCaption"/>
       </w:pPr>
-      <w:bookmarkStart w:id="59" w:name="_Toc242049019"/>
+      <w:bookmarkStart w:id="59" w:name="_Toc242052392"/>
       <w:r>
         <w:t>Bảng 5.1. Các thẻ số liệu trên trang Tổng quan</w:t>
       </w:r>
@@ -27010,7 +27010,7 @@
           <w:noProof/>
         </w:rPr>
         <w:drawing>
-          <wp:inline distT="0" distB="0" distL="0" distR="0" wp14:anchorId="52924855" wp14:editId="50EDD845">
+          <wp:inline distT="0" distB="0" distL="0" distR="0" wp14:anchorId="35D6BDCA" wp14:editId="0A3BAC94">
             <wp:extent cx="5580000" cy="3332500"/>
             <wp:effectExtent l="0" t="0" r="0" b="0"/>
             <wp:docPr id="522444768" name="Picture 522444768"/>
@@ -27050,9 +27050,9 @@
       <w:pPr>
         <w:pStyle w:val="FigureCaption"/>
       </w:pPr>
-      <w:bookmarkStart w:id="60" w:name="_Toc242048991"/>
-      <w:r>
-        <w:t>Hình 5.1. Trang Tổng quan của Giáo vụ: không có quyền xem doanh thu nên biểu đồ để trống</w:t>
+      <w:bookmarkStart w:id="60" w:name="_Toc242052364"/>
+      <w:r>
+        <w:t>Hình 5.1. Trang Tổng quan của Giáo vụ: không có quyền xem doanh thu</w:t>
       </w:r>
       <w:bookmarkEnd w:id="60"/>
     </w:p>
@@ -27060,7 +27060,7 @@
       <w:pPr>
         <w:pStyle w:val="Heading2"/>
       </w:pPr>
-      <w:bookmarkStart w:id="61" w:name="_Toc242048953"/>
+      <w:bookmarkStart w:id="61" w:name="_Toc242052326"/>
       <w:r>
         <w:lastRenderedPageBreak/>
         <w:t>5.2. Học viên</w:t>
@@ -27094,7 +27094,7 @@
           <w:noProof/>
         </w:rPr>
         <w:drawing>
-          <wp:inline distT="0" distB="0" distL="0" distR="0" wp14:anchorId="4F8E9E6A" wp14:editId="2D60300F">
+          <wp:inline distT="0" distB="0" distL="0" distR="0" wp14:anchorId="2E58541A" wp14:editId="0D9F34FA">
             <wp:extent cx="5580000" cy="3332500"/>
             <wp:effectExtent l="0" t="0" r="0" b="0"/>
             <wp:docPr id="522444769" name="Picture 522444769"/>
@@ -27134,7 +27134,7 @@
       <w:pPr>
         <w:pStyle w:val="FigureCaption"/>
       </w:pPr>
-      <w:bookmarkStart w:id="62" w:name="_Toc242048992"/>
+      <w:bookmarkStart w:id="62" w:name="_Toc242052365"/>
       <w:r>
         <w:t>Hình 5.2. Danh sách học viên</w:t>
       </w:r>
@@ -27144,7 +27144,7 @@
       <w:pPr>
         <w:pStyle w:val="Heading3"/>
       </w:pPr>
-      <w:bookmarkStart w:id="63" w:name="_Toc242048954"/>
+      <w:bookmarkStart w:id="63" w:name="_Toc242052327"/>
       <w:r>
         <w:t>5.2.1. Tìm kiếm</w:t>
       </w:r>
@@ -27241,7 +27241,7 @@
       <w:pPr>
         <w:pStyle w:val="Heading3"/>
       </w:pPr>
-      <w:bookmarkStart w:id="64" w:name="_Toc242048955"/>
+      <w:bookmarkStart w:id="64" w:name="_Toc242052328"/>
       <w:r>
         <w:t>5.2.2. Thêm học viên</w:t>
       </w:r>
@@ -27446,7 +27446,7 @@
       <w:pPr>
         <w:pStyle w:val="Heading3"/>
       </w:pPr>
-      <w:bookmarkStart w:id="65" w:name="_Toc242048956"/>
+      <w:bookmarkStart w:id="65" w:name="_Toc242052329"/>
       <w:r>
         <w:t>5.2.3. Sửa thông tin</w:t>
       </w:r>
@@ -27567,7 +27567,7 @@
           <w:noProof/>
         </w:rPr>
         <w:drawing>
-          <wp:inline distT="0" distB="0" distL="0" distR="0" wp14:anchorId="5E208A56" wp14:editId="2167EBBF">
+          <wp:inline distT="0" distB="0" distL="0" distR="0" wp14:anchorId="2FC011E5" wp14:editId="767B4512">
             <wp:extent cx="3780000" cy="5048129"/>
             <wp:effectExtent l="0" t="0" r="0" b="0"/>
             <wp:docPr id="522444770" name="Picture 522444770"/>
@@ -27607,7 +27607,7 @@
       <w:pPr>
         <w:pStyle w:val="FigureCaption"/>
       </w:pPr>
-      <w:bookmarkStart w:id="66" w:name="_Toc242048993"/>
+      <w:bookmarkStart w:id="66" w:name="_Toc242052366"/>
       <w:r>
         <w:t>Hình 5.3. Hộp thoại sửa thông tin học viên</w:t>
       </w:r>
@@ -27627,7 +27627,7 @@
       <w:pPr>
         <w:pStyle w:val="TableCaption"/>
       </w:pPr>
-      <w:bookmarkStart w:id="67" w:name="_Toc242049020"/>
+      <w:bookmarkStart w:id="67" w:name="_Toc242052393"/>
       <w:r>
         <w:t>Bảng 5.2. Quy tắc kiểm tra thông tin học viên</w:t>
       </w:r>
@@ -28291,7 +28291,7 @@
       <w:pPr>
         <w:pStyle w:val="Heading3"/>
       </w:pPr>
-      <w:bookmarkStart w:id="68" w:name="_Toc242048957"/>
+      <w:bookmarkStart w:id="68" w:name="_Toc242052330"/>
       <w:r>
         <w:t>5.2.4. Xóa học viên</w:t>
       </w:r>
@@ -28412,7 +28412,7 @@
       <w:pPr>
         <w:pStyle w:val="Heading3"/>
       </w:pPr>
-      <w:bookmarkStart w:id="69" w:name="_Toc242048958"/>
+      <w:bookmarkStart w:id="69" w:name="_Toc242052331"/>
       <w:r>
         <w:t>5.2.5. Hồ sơ, ghi danh và kiểm tra xếp lớp từ danh sách học viên</w:t>
       </w:r>
@@ -28482,7 +28482,7 @@
       <w:pPr>
         <w:pStyle w:val="Heading3"/>
       </w:pPr>
-      <w:bookmarkStart w:id="70" w:name="_Toc242048959"/>
+      <w:bookmarkStart w:id="70" w:name="_Toc242052332"/>
       <w:r>
         <w:t>5.2.6. Xuất, nhập danh sách bằng XML</w:t>
       </w:r>
@@ -28568,7 +28568,7 @@
       <w:pPr>
         <w:pStyle w:val="Heading2"/>
       </w:pPr>
-      <w:bookmarkStart w:id="71" w:name="_Toc242048960"/>
+      <w:bookmarkStart w:id="71" w:name="_Toc242052333"/>
       <w:r>
         <w:t>5.3. Kiểm tra xếp lớp</w:t>
       </w:r>
@@ -28656,7 +28656,7 @@
         </w:rPr>
         <w:lastRenderedPageBreak/>
         <w:drawing>
-          <wp:inline distT="0" distB="0" distL="0" distR="0" wp14:anchorId="2ACBC472" wp14:editId="663C1CE2">
+          <wp:inline distT="0" distB="0" distL="0" distR="0" wp14:anchorId="7215BD4B" wp14:editId="470BECE4">
             <wp:extent cx="5580000" cy="3332500"/>
             <wp:effectExtent l="0" t="0" r="0" b="0"/>
             <wp:docPr id="522444771" name="Picture 522444771"/>
@@ -28696,7 +28696,7 @@
       <w:pPr>
         <w:pStyle w:val="FigureCaption"/>
       </w:pPr>
-      <w:bookmarkStart w:id="72" w:name="_Toc242048994"/>
+      <w:bookmarkStart w:id="72" w:name="_Toc242052367"/>
       <w:r>
         <w:t>Hình 5.4. Danh sách bài kiểm tra xếp lớp</w:t>
       </w:r>
@@ -28961,7 +28961,7 @@
       <w:pPr>
         <w:pStyle w:val="Heading2"/>
       </w:pPr>
-      <w:bookmarkStart w:id="73" w:name="_Toc242048961"/>
+      <w:bookmarkStart w:id="73" w:name="_Toc242052334"/>
       <w:r>
         <w:t>5.4. Lớp học</w:t>
       </w:r>
@@ -29013,7 +29013,7 @@
         </w:rPr>
         <w:lastRenderedPageBreak/>
         <w:drawing>
-          <wp:inline distT="0" distB="0" distL="0" distR="0" wp14:anchorId="2B2CF148" wp14:editId="76310F33">
+          <wp:inline distT="0" distB="0" distL="0" distR="0" wp14:anchorId="2F8BD067" wp14:editId="21C6D6A3">
             <wp:extent cx="5580000" cy="3332500"/>
             <wp:effectExtent l="0" t="0" r="0" b="0"/>
             <wp:docPr id="522444772" name="Picture 522444772"/>
@@ -29053,7 +29053,7 @@
       <w:pPr>
         <w:pStyle w:val="FigureCaption"/>
       </w:pPr>
-      <w:bookmarkStart w:id="74" w:name="_Toc242048995"/>
+      <w:bookmarkStart w:id="74" w:name="_Toc242052368"/>
       <w:r>
         <w:t>Hình 5.5. Màn hình Lớp học và các nút quản lý vòng đời lớp</w:t>
       </w:r>
@@ -29479,7 +29479,7 @@
       <w:pPr>
         <w:pStyle w:val="TableCaption"/>
       </w:pPr>
-      <w:bookmarkStart w:id="75" w:name="_Toc242049021"/>
+      <w:bookmarkStart w:id="75" w:name="_Toc242052394"/>
       <w:r>
         <w:t>Bảng 5.3. Quy tắc CSDL kiểm tra khi quản lý lớp học</w:t>
       </w:r>
@@ -29958,7 +29958,7 @@
       <w:pPr>
         <w:pStyle w:val="Heading2"/>
       </w:pPr>
-      <w:bookmarkStart w:id="76" w:name="_Toc242048962"/>
+      <w:bookmarkStart w:id="76" w:name="_Toc242052335"/>
       <w:r>
         <w:t>5.5. Ghi danh</w:t>
       </w:r>
@@ -30018,7 +30018,7 @@
           <w:noProof/>
         </w:rPr>
         <w:drawing>
-          <wp:inline distT="0" distB="0" distL="0" distR="0" wp14:anchorId="532112A2" wp14:editId="36D4BB7A">
+          <wp:inline distT="0" distB="0" distL="0" distR="0" wp14:anchorId="6424EF2C" wp14:editId="77F86185">
             <wp:extent cx="5580000" cy="3332500"/>
             <wp:effectExtent l="0" t="0" r="0" b="0"/>
             <wp:docPr id="522444773" name="Picture 522444773"/>
@@ -30058,7 +30058,7 @@
       <w:pPr>
         <w:pStyle w:val="FigureCaption"/>
       </w:pPr>
-      <w:bookmarkStart w:id="77" w:name="_Toc242048996"/>
+      <w:bookmarkStart w:id="77" w:name="_Toc242052369"/>
       <w:r>
         <w:t>Hình 5.6. Danh sách ghi danh</w:t>
       </w:r>
@@ -30331,7 +30331,7 @@
       <w:pPr>
         <w:pStyle w:val="TableCaption"/>
       </w:pPr>
-      <w:bookmarkStart w:id="78" w:name="_Toc242049022"/>
+      <w:bookmarkStart w:id="78" w:name="_Toc242052395"/>
       <w:r>
         <w:t>Bảng 5.4. Quy tắc CSDL kiểm tra khi ghi danh và chuyển lớp</w:t>
       </w:r>
@@ -30720,7 +30720,7 @@
       <w:pPr>
         <w:pStyle w:val="Heading2"/>
       </w:pPr>
-      <w:bookmarkStart w:id="79" w:name="_Toc242048963"/>
+      <w:bookmarkStart w:id="79" w:name="_Toc242052336"/>
       <w:r>
         <w:t>5.6. Lịch học - điểm danh</w:t>
       </w:r>
@@ -30808,7 +30808,7 @@
         </w:rPr>
         <w:lastRenderedPageBreak/>
         <w:drawing>
-          <wp:inline distT="0" distB="0" distL="0" distR="0" wp14:anchorId="1A28FD02" wp14:editId="317EE65B">
+          <wp:inline distT="0" distB="0" distL="0" distR="0" wp14:anchorId="0EC212CC" wp14:editId="4657C9BE">
             <wp:extent cx="5580000" cy="3332500"/>
             <wp:effectExtent l="0" t="0" r="0" b="0"/>
             <wp:docPr id="522444774" name="Picture 522444774"/>
@@ -30848,7 +30848,7 @@
       <w:pPr>
         <w:pStyle w:val="FigureCaption"/>
       </w:pPr>
-      <w:bookmarkStart w:id="80" w:name="_Toc242048997"/>
+      <w:bookmarkStart w:id="80" w:name="_Toc242052370"/>
       <w:r>
         <w:t>Hình 5.7. Lịch học - điểm danh của một tuần</w:t>
       </w:r>
@@ -31088,7 +31088,7 @@
       <w:pPr>
         <w:pStyle w:val="Heading2"/>
       </w:pPr>
-      <w:bookmarkStart w:id="81" w:name="_Toc242048964"/>
+      <w:bookmarkStart w:id="81" w:name="_Toc242052337"/>
       <w:r>
         <w:t>5.7. Sổ điểm</w:t>
       </w:r>
@@ -31131,7 +31131,7 @@
         </w:rPr>
         <w:lastRenderedPageBreak/>
         <w:drawing>
-          <wp:inline distT="0" distB="0" distL="0" distR="0" wp14:anchorId="6C580679" wp14:editId="07FD52DC">
+          <wp:inline distT="0" distB="0" distL="0" distR="0" wp14:anchorId="30E34941" wp14:editId="1A7E042E">
             <wp:extent cx="5580000" cy="3332500"/>
             <wp:effectExtent l="0" t="0" r="0" b="0"/>
             <wp:docPr id="522444775" name="Picture 522444775"/>
@@ -31171,7 +31171,7 @@
       <w:pPr>
         <w:pStyle w:val="FigureCaption"/>
       </w:pPr>
-      <w:bookmarkStart w:id="82" w:name="_Toc242048998"/>
+      <w:bookmarkStart w:id="82" w:name="_Toc242052371"/>
       <w:r>
         <w:t>Hình 5.8. Sổ điểm của một lớp</w:t>
       </w:r>
@@ -31295,7 +31295,7 @@
       <w:pPr>
         <w:pStyle w:val="Heading2"/>
       </w:pPr>
-      <w:bookmarkStart w:id="83" w:name="_Toc242048965"/>
+      <w:bookmarkStart w:id="83" w:name="_Toc242052338"/>
       <w:r>
         <w:t>5.8. Kết quả học tập</w:t>
       </w:r>
@@ -31356,7 +31356,7 @@
         </w:rPr>
         <w:lastRenderedPageBreak/>
         <w:drawing>
-          <wp:inline distT="0" distB="0" distL="0" distR="0" wp14:anchorId="1C6081FD" wp14:editId="3D678600">
+          <wp:inline distT="0" distB="0" distL="0" distR="0" wp14:anchorId="6F7309B6" wp14:editId="2B488361">
             <wp:extent cx="5580000" cy="3332500"/>
             <wp:effectExtent l="0" t="0" r="0" b="0"/>
             <wp:docPr id="522444776" name="Picture 522444776"/>
@@ -31396,7 +31396,7 @@
       <w:pPr>
         <w:pStyle w:val="FigureCaption"/>
       </w:pPr>
-      <w:bookmarkStart w:id="84" w:name="_Toc242048999"/>
+      <w:bookmarkStart w:id="84" w:name="_Toc242052372"/>
       <w:r>
         <w:t>Hình 5.9. Kết quả học tập</w:t>
       </w:r>
@@ -31406,7 +31406,7 @@
       <w:pPr>
         <w:pStyle w:val="Heading2"/>
       </w:pPr>
-      <w:bookmarkStart w:id="85" w:name="_Toc242048966"/>
+      <w:bookmarkStart w:id="85" w:name="_Toc242052339"/>
       <w:r>
         <w:t>5.9. Thu học phí</w:t>
       </w:r>
@@ -31475,7 +31475,7 @@
           <w:noProof/>
         </w:rPr>
         <w:drawing>
-          <wp:inline distT="0" distB="0" distL="0" distR="0" wp14:anchorId="478C8597" wp14:editId="74EDD8A7">
+          <wp:inline distT="0" distB="0" distL="0" distR="0" wp14:anchorId="17E4E83F" wp14:editId="43AE81B8">
             <wp:extent cx="5580000" cy="3332500"/>
             <wp:effectExtent l="0" t="0" r="0" b="0"/>
             <wp:docPr id="522444777" name="Picture 522444777"/>
@@ -31515,7 +31515,7 @@
       <w:pPr>
         <w:pStyle w:val="FigureCaption"/>
       </w:pPr>
-      <w:bookmarkStart w:id="86" w:name="_Toc242049000"/>
+      <w:bookmarkStart w:id="86" w:name="_Toc242052373"/>
       <w:r>
         <w:t>Hình 5.10. Danh sách phiếu thu (Kế toán)</w:t>
       </w:r>
@@ -31826,7 +31826,7 @@
       <w:pPr>
         <w:pStyle w:val="Heading2"/>
       </w:pPr>
-      <w:bookmarkStart w:id="87" w:name="_Toc242048967"/>
+      <w:bookmarkStart w:id="87" w:name="_Toc242052340"/>
       <w:r>
         <w:t>5.10. Công nợ học phí</w:t>
       </w:r>
@@ -31879,7 +31879,7 @@
       <w:pPr>
         <w:pStyle w:val="Heading2"/>
       </w:pPr>
-      <w:bookmarkStart w:id="88" w:name="_Toc242048968"/>
+      <w:bookmarkStart w:id="88" w:name="_Toc242052341"/>
       <w:r>
         <w:t>5.11. Doanh thu</w:t>
       </w:r>
@@ -31981,7 +31981,7 @@
         </w:rPr>
         <w:lastRenderedPageBreak/>
         <w:drawing>
-          <wp:inline distT="0" distB="0" distL="0" distR="0" wp14:anchorId="639D86F6" wp14:editId="2D4F74CB">
+          <wp:inline distT="0" distB="0" distL="0" distR="0" wp14:anchorId="18B3389A" wp14:editId="2E8F2DBC">
             <wp:extent cx="5580000" cy="3332500"/>
             <wp:effectExtent l="0" t="0" r="0" b="0"/>
             <wp:docPr id="522444778" name="Picture 522444778"/>
@@ -32021,7 +32021,7 @@
       <w:pPr>
         <w:pStyle w:val="FigureCaption"/>
       </w:pPr>
-      <w:bookmarkStart w:id="89" w:name="_Toc242049001"/>
+      <w:bookmarkStart w:id="89" w:name="_Toc242052374"/>
       <w:r>
         <w:t>Hình 5.11. Doanh thu theo tháng và chi nhánh (Kế toán)</w:t>
       </w:r>
@@ -32031,7 +32031,7 @@
       <w:pPr>
         <w:pStyle w:val="Heading2"/>
       </w:pPr>
-      <w:bookmarkStart w:id="90" w:name="_Toc242048969"/>
+      <w:bookmarkStart w:id="90" w:name="_Toc242052342"/>
       <w:r>
         <w:t>5.12. Lương giáo viên</w:t>
       </w:r>
@@ -32082,7 +32082,7 @@
           <w:noProof/>
         </w:rPr>
         <w:drawing>
-          <wp:inline distT="0" distB="0" distL="0" distR="0" wp14:anchorId="5C405906" wp14:editId="2BA42DBF">
+          <wp:inline distT="0" distB="0" distL="0" distR="0" wp14:anchorId="45DA4B34" wp14:editId="6283F5C9">
             <wp:extent cx="5580000" cy="3332500"/>
             <wp:effectExtent l="0" t="0" r="0" b="0"/>
             <wp:docPr id="522444779" name="Picture 522444779"/>
@@ -32122,7 +32122,7 @@
       <w:pPr>
         <w:pStyle w:val="FigureCaption"/>
       </w:pPr>
-      <w:bookmarkStart w:id="91" w:name="_Toc242049002"/>
+      <w:bookmarkStart w:id="91" w:name="_Toc242052375"/>
       <w:r>
         <w:t>Hình 5.12. Bảng lương giáo viên (Kế toán)</w:t>
       </w:r>
@@ -32229,7 +32229,7 @@
       <w:pPr>
         <w:pStyle w:val="Heading2"/>
       </w:pPr>
-      <w:bookmarkStart w:id="92" w:name="_Toc242048970"/>
+      <w:bookmarkStart w:id="92" w:name="_Toc242052343"/>
       <w:r>
         <w:t>5.13. Danh mục</w:t>
       </w:r>
@@ -32282,7 +32282,7 @@
       <w:pPr>
         <w:pStyle w:val="Heading3"/>
       </w:pPr>
-      <w:bookmarkStart w:id="93" w:name="_Toc242048971"/>
+      <w:bookmarkStart w:id="93" w:name="_Toc242052344"/>
       <w:r>
         <w:t>5.13.1. Khóa học</w:t>
       </w:r>
@@ -32318,7 +32318,7 @@
           <w:noProof/>
         </w:rPr>
         <w:drawing>
-          <wp:inline distT="0" distB="0" distL="0" distR="0" wp14:anchorId="547BC7CF" wp14:editId="2BAD3EB8">
+          <wp:inline distT="0" distB="0" distL="0" distR="0" wp14:anchorId="7B790F6F" wp14:editId="6E521958">
             <wp:extent cx="5580000" cy="3332500"/>
             <wp:effectExtent l="0" t="0" r="0" b="0"/>
             <wp:docPr id="522444780" name="Picture 522444780"/>
@@ -32358,7 +32358,7 @@
       <w:pPr>
         <w:pStyle w:val="FigureCaption"/>
       </w:pPr>
-      <w:bookmarkStart w:id="94" w:name="_Toc242049003"/>
+      <w:bookmarkStart w:id="94" w:name="_Toc242052376"/>
       <w:r>
         <w:t>Hình 5.13. Danh mục khóa học và cột điểm của khóa đang chọn</w:t>
       </w:r>
@@ -32562,7 +32562,7 @@
       <w:pPr>
         <w:pStyle w:val="Heading3"/>
       </w:pPr>
-      <w:bookmarkStart w:id="95" w:name="_Toc242048972"/>
+      <w:bookmarkStart w:id="95" w:name="_Toc242052345"/>
       <w:r>
         <w:t>5.13.2. Giáo viên, Nhân viên</w:t>
       </w:r>
@@ -32689,7 +32689,7 @@
       <w:pPr>
         <w:pStyle w:val="Heading3"/>
       </w:pPr>
-      <w:bookmarkStart w:id="96" w:name="_Toc242048973"/>
+      <w:bookmarkStart w:id="96" w:name="_Toc242052346"/>
       <w:r>
         <w:t>5.13.3. Chi nhánh - phòng học, Khuyến mãi</w:t>
       </w:r>
@@ -32887,7 +32887,7 @@
         </w:rPr>
         <w:lastRenderedPageBreak/>
         <w:drawing>
-          <wp:inline distT="0" distB="0" distL="0" distR="0" wp14:anchorId="304BEF9D" wp14:editId="6C341A8C">
+          <wp:inline distT="0" distB="0" distL="0" distR="0" wp14:anchorId="5EA34744" wp14:editId="38F1F71C">
             <wp:extent cx="5580000" cy="3332500"/>
             <wp:effectExtent l="0" t="0" r="0" b="0"/>
             <wp:docPr id="522444781" name="Picture 522444781"/>
@@ -32927,7 +32927,7 @@
       <w:pPr>
         <w:pStyle w:val="FigureCaption"/>
       </w:pPr>
-      <w:bookmarkStart w:id="97" w:name="_Toc242049004"/>
+      <w:bookmarkStart w:id="97" w:name="_Toc242052377"/>
       <w:r>
         <w:t>Hình 5.14. Chi nhánh và phòng học của chi nhánh đang chọn</w:t>
       </w:r>
@@ -32937,7 +32937,7 @@
       <w:pPr>
         <w:pStyle w:val="Heading2"/>
       </w:pPr>
-      <w:bookmarkStart w:id="98" w:name="_Toc242048974"/>
+      <w:bookmarkStart w:id="98" w:name="_Toc242052347"/>
       <w:r>
         <w:t>5.14. Tài khoản</w:t>
       </w:r>
@@ -32988,7 +32988,7 @@
           <w:noProof/>
         </w:rPr>
         <w:drawing>
-          <wp:inline distT="0" distB="0" distL="0" distR="0" wp14:anchorId="25EB55C3" wp14:editId="5045D8B4">
+          <wp:inline distT="0" distB="0" distL="0" distR="0" wp14:anchorId="35A1CD3B" wp14:editId="1B4B2508">
             <wp:extent cx="5580000" cy="3332500"/>
             <wp:effectExtent l="0" t="0" r="0" b="0"/>
             <wp:docPr id="522444782" name="Picture 522444782"/>
@@ -33028,7 +33028,7 @@
       <w:pPr>
         <w:pStyle w:val="FigureCaption"/>
       </w:pPr>
-      <w:bookmarkStart w:id="99" w:name="_Toc242049005"/>
+      <w:bookmarkStart w:id="99" w:name="_Toc242052378"/>
       <w:r>
         <w:t>Hình 5.15. Danh sách tài khoản (Quản lý)</w:t>
       </w:r>
@@ -33188,7 +33188,7 @@
       <w:pPr>
         <w:pStyle w:val="Heading2"/>
       </w:pPr>
-      <w:bookmarkStart w:id="100" w:name="_Toc242048975"/>
+      <w:bookmarkStart w:id="100" w:name="_Toc242052348"/>
       <w:r>
         <w:t>5.15. Sao lưu</w:t>
       </w:r>
@@ -33338,7 +33338,7 @@
           <w:noProof/>
         </w:rPr>
         <w:drawing>
-          <wp:inline distT="0" distB="0" distL="0" distR="0" wp14:anchorId="22975A71" wp14:editId="23756DDB">
+          <wp:inline distT="0" distB="0" distL="0" distR="0" wp14:anchorId="2CD85A28" wp14:editId="0307777E">
             <wp:extent cx="5580000" cy="3332500"/>
             <wp:effectExtent l="0" t="0" r="0" b="0"/>
             <wp:docPr id="522444783" name="Picture 522444783"/>
@@ -33378,7 +33378,7 @@
       <w:pPr>
         <w:pStyle w:val="FigureCaption"/>
       </w:pPr>
-      <w:bookmarkStart w:id="101" w:name="_Toc242049006"/>
+      <w:bookmarkStart w:id="101" w:name="_Toc242052379"/>
       <w:r>
         <w:t>Hình 5.16. Màn hình sao lưu cơ sở dữ liệu</w:t>
       </w:r>
@@ -33407,7 +33407,7 @@
       <w:pPr>
         <w:pStyle w:val="Heading2"/>
       </w:pPr>
-      <w:bookmarkStart w:id="102" w:name="_Toc242048976"/>
+      <w:bookmarkStart w:id="102" w:name="_Toc242052349"/>
       <w:r>
         <w:lastRenderedPageBreak/>
         <w:t>5.16. Chức năng dành cho giáo viên</w:t>
@@ -33557,7 +33557,7 @@
           <w:noProof/>
         </w:rPr>
         <w:drawing>
-          <wp:inline distT="0" distB="0" distL="0" distR="0" wp14:anchorId="6B042500" wp14:editId="190C64EB">
+          <wp:inline distT="0" distB="0" distL="0" distR="0" wp14:anchorId="507FD0C6" wp14:editId="52791805">
             <wp:extent cx="5580000" cy="3332500"/>
             <wp:effectExtent l="0" t="0" r="0" b="0"/>
             <wp:docPr id="522444784" name="Picture 522444784"/>
@@ -33597,7 +33597,7 @@
       <w:pPr>
         <w:pStyle w:val="FigureCaption"/>
       </w:pPr>
-      <w:bookmarkStart w:id="103" w:name="_Toc242049007"/>
+      <w:bookmarkStart w:id="103" w:name="_Toc242052380"/>
       <w:r>
         <w:t>Hình 5.17. Lịch dạy của giáo viên</w:t>
       </w:r>
@@ -33615,7 +33615,7 @@
         </w:rPr>
         <w:lastRenderedPageBreak/>
         <w:drawing>
-          <wp:inline distT="0" distB="0" distL="0" distR="0" wp14:anchorId="0B883EDA" wp14:editId="04DFDC82">
+          <wp:inline distT="0" distB="0" distL="0" distR="0" wp14:anchorId="0A9B4B5D" wp14:editId="02A6F692">
             <wp:extent cx="5580000" cy="3332500"/>
             <wp:effectExtent l="0" t="0" r="0" b="0"/>
             <wp:docPr id="522444785" name="Picture 522444785"/>
@@ -33655,7 +33655,7 @@
       <w:pPr>
         <w:pStyle w:val="FigureCaption"/>
       </w:pPr>
-      <w:bookmarkStart w:id="104" w:name="_Toc242049008"/>
+      <w:bookmarkStart w:id="104" w:name="_Toc242052381"/>
       <w:r>
         <w:t>Hình 5.18. Sổ điểm của giáo viên</w:t>
       </w:r>
@@ -33665,7 +33665,7 @@
       <w:pPr>
         <w:pStyle w:val="Heading2"/>
       </w:pPr>
-      <w:bookmarkStart w:id="105" w:name="_Toc242048977"/>
+      <w:bookmarkStart w:id="105" w:name="_Toc242052350"/>
       <w:r>
         <w:t>5.17. Việc vẫn làm trong SSMS</w:t>
       </w:r>
@@ -33765,7 +33765,7 @@
         <w:pStyle w:val="Heading1"/>
         <w:pageBreakBefore/>
       </w:pPr>
-      <w:bookmarkStart w:id="106" w:name="_Toc242048978"/>
+      <w:bookmarkStart w:id="106" w:name="_Toc242052351"/>
       <w:r>
         <w:lastRenderedPageBreak/>
         <w:t>CHƯƠNG 6. XỬ LÝ SỰ CỐ</w:t>
@@ -33776,7 +33776,7 @@
       <w:pPr>
         <w:pStyle w:val="Heading2"/>
       </w:pPr>
-      <w:bookmarkStart w:id="107" w:name="_Toc242048979"/>
+      <w:bookmarkStart w:id="107" w:name="_Toc242052352"/>
       <w:r>
         <w:t>6.1. Kiểm tra kết nối không cần giao diện</w:t>
       </w:r>
@@ -34183,7 +34183,7 @@
       <w:pPr>
         <w:pStyle w:val="Heading2"/>
       </w:pPr>
-      <w:bookmarkStart w:id="108" w:name="_Toc242048980"/>
+      <w:bookmarkStart w:id="108" w:name="_Toc242052353"/>
       <w:r>
         <w:t>6.2. Lỗi thường gặp</w:t>
       </w:r>
@@ -34193,7 +34193,7 @@
       <w:pPr>
         <w:pStyle w:val="TableCaption"/>
       </w:pPr>
-      <w:bookmarkStart w:id="109" w:name="_Toc242049023"/>
+      <w:bookmarkStart w:id="109" w:name="_Toc242052396"/>
       <w:r>
         <w:t>Bảng 6.1. Lỗi thường gặp và cách xử lý</w:t>
       </w:r>
@@ -36660,7 +36660,7 @@
       <w:pPr>
         <w:pStyle w:val="Heading2"/>
       </w:pPr>
-      <w:bookmarkStart w:id="110" w:name="_Toc242048981"/>
+      <w:bookmarkStart w:id="110" w:name="_Toc242052354"/>
       <w:r>
         <w:lastRenderedPageBreak/>
         <w:t>6.3. Khi cần hỗ trợ thêm</w:t>
@@ -36709,7 +36709,7 @@
         <w:pStyle w:val="Heading1"/>
         <w:pageBreakBefore/>
       </w:pPr>
-      <w:bookmarkStart w:id="111" w:name="_Toc242048982"/>
+      <w:bookmarkStart w:id="111" w:name="_Toc242052355"/>
       <w:r>
         <w:lastRenderedPageBreak/>
         <w:t>PHỤ LỤC A. TÓM TẮT LỆNH</w:t>
@@ -37460,7 +37460,7 @@
         <w:pStyle w:val="Heading1"/>
         <w:pageBreakBefore/>
       </w:pPr>
-      <w:bookmarkStart w:id="112" w:name="_Toc242048983"/>
+      <w:bookmarkStart w:id="112" w:name="_Toc242052356"/>
       <w:r>
         <w:lastRenderedPageBreak/>
         <w:t>PHỤ LỤC B. CÁC MỤC CẦN BỔ SUNG</w:t>

</xml_diff>

<commit_message>
docs(user-guide): describe the class, timetable and export rules after the review fixes
Section 4.8: an Excel export writes amounts as plain numbers. Section
5.2.5: Enroll and Placement test follow the permission of their own
feature. Section 5.4: a class needs an active branch and a room that is
not under maintenance; a timetable change removes the generated
sessions, the app offers to generate them again, and the timetable is
fixed once a session was taught or cancelled (table 5.3 quotes the
messages). Screenshots unchanged; 53 pages, 8 placeholders as before.
</commit_message>
<xml_diff>
--- a/docs/user-guide/QLTTTA_User_Guide.docx
+++ b/docs/user-guide/QLTTTA_User_Guide.docx
@@ -1401,7 +1401,7 @@
       <w:r>
         <w:fldChar w:fldCharType="separate"/>
       </w:r>
-      <w:hyperlink w:anchor="_Toc242052528" w:history="1">
+      <w:hyperlink w:anchor="_Toc242096369" w:history="1">
         <w:r>
           <w:rPr>
             <w:rStyle w:val="Hyperlink"/>
@@ -1428,7 +1428,7 @@
             <w:noProof/>
             <w:webHidden/>
           </w:rPr>
-          <w:instrText xml:space="preserve"> PAGEREF _Toc242052528 \h </w:instrText>
+          <w:instrText xml:space="preserve"> PAGEREF _Toc242096369 \h </w:instrText>
         </w:r>
         <w:r>
           <w:rPr>
@@ -1474,7 +1474,7 @@
           <w14:ligatures w14:val="standardContextual"/>
         </w:rPr>
       </w:pPr>
-      <w:hyperlink w:anchor="_Toc242052529" w:history="1">
+      <w:hyperlink w:anchor="_Toc242096370" w:history="1">
         <w:r>
           <w:rPr>
             <w:rStyle w:val="Hyperlink"/>
@@ -1501,7 +1501,7 @@
             <w:noProof/>
             <w:webHidden/>
           </w:rPr>
-          <w:instrText xml:space="preserve"> PAGEREF _Toc242052529 \h </w:instrText>
+          <w:instrText xml:space="preserve"> PAGEREF _Toc242096370 \h </w:instrText>
         </w:r>
         <w:r>
           <w:rPr>
@@ -1547,7 +1547,7 @@
           <w14:ligatures w14:val="standardContextual"/>
         </w:rPr>
       </w:pPr>
-      <w:hyperlink w:anchor="_Toc242052530" w:history="1">
+      <w:hyperlink w:anchor="_Toc242096371" w:history="1">
         <w:r>
           <w:rPr>
             <w:rStyle w:val="Hyperlink"/>
@@ -1574,7 +1574,7 @@
             <w:noProof/>
             <w:webHidden/>
           </w:rPr>
-          <w:instrText xml:space="preserve"> PAGEREF _Toc242052530 \h </w:instrText>
+          <w:instrText xml:space="preserve"> PAGEREF _Toc242096371 \h </w:instrText>
         </w:r>
         <w:r>
           <w:rPr>
@@ -1620,7 +1620,7 @@
           <w14:ligatures w14:val="standardContextual"/>
         </w:rPr>
       </w:pPr>
-      <w:hyperlink w:anchor="_Toc242052531" w:history="1">
+      <w:hyperlink w:anchor="_Toc242096372" w:history="1">
         <w:r>
           <w:rPr>
             <w:rStyle w:val="Hyperlink"/>
@@ -1647,7 +1647,7 @@
             <w:noProof/>
             <w:webHidden/>
           </w:rPr>
-          <w:instrText xml:space="preserve"> PAGEREF _Toc242052531 \h </w:instrText>
+          <w:instrText xml:space="preserve"> PAGEREF _Toc242096372 \h </w:instrText>
         </w:r>
         <w:r>
           <w:rPr>
@@ -1693,7 +1693,7 @@
           <w14:ligatures w14:val="standardContextual"/>
         </w:rPr>
       </w:pPr>
-      <w:hyperlink w:anchor="_Toc242052532" w:history="1">
+      <w:hyperlink w:anchor="_Toc242096373" w:history="1">
         <w:r>
           <w:rPr>
             <w:rStyle w:val="Hyperlink"/>
@@ -1720,7 +1720,7 @@
             <w:noProof/>
             <w:webHidden/>
           </w:rPr>
-          <w:instrText xml:space="preserve"> PAGEREF _Toc242052532 \h </w:instrText>
+          <w:instrText xml:space="preserve"> PAGEREF _Toc242096373 \h </w:instrText>
         </w:r>
         <w:r>
           <w:rPr>
@@ -1766,7 +1766,7 @@
           <w14:ligatures w14:val="standardContextual"/>
         </w:rPr>
       </w:pPr>
-      <w:hyperlink w:anchor="_Toc242052533" w:history="1">
+      <w:hyperlink w:anchor="_Toc242096374" w:history="1">
         <w:r>
           <w:rPr>
             <w:rStyle w:val="Hyperlink"/>
@@ -1793,7 +1793,7 @@
             <w:noProof/>
             <w:webHidden/>
           </w:rPr>
-          <w:instrText xml:space="preserve"> PAGEREF _Toc242052533 \h </w:instrText>
+          <w:instrText xml:space="preserve"> PAGEREF _Toc242096374 \h </w:instrText>
         </w:r>
         <w:r>
           <w:rPr>
@@ -1839,7 +1839,7 @@
           <w14:ligatures w14:val="standardContextual"/>
         </w:rPr>
       </w:pPr>
-      <w:hyperlink w:anchor="_Toc242052534" w:history="1">
+      <w:hyperlink w:anchor="_Toc242096375" w:history="1">
         <w:r>
           <w:rPr>
             <w:rStyle w:val="Hyperlink"/>
@@ -1866,7 +1866,7 @@
             <w:noProof/>
             <w:webHidden/>
           </w:rPr>
-          <w:instrText xml:space="preserve"> PAGEREF _Toc242052534 \h </w:instrText>
+          <w:instrText xml:space="preserve"> PAGEREF _Toc242096375 \h </w:instrText>
         </w:r>
         <w:r>
           <w:rPr>
@@ -1912,7 +1912,7 @@
           <w14:ligatures w14:val="standardContextual"/>
         </w:rPr>
       </w:pPr>
-      <w:hyperlink w:anchor="_Toc242052535" w:history="1">
+      <w:hyperlink w:anchor="_Toc242096376" w:history="1">
         <w:r>
           <w:rPr>
             <w:rStyle w:val="Hyperlink"/>
@@ -1939,7 +1939,7 @@
             <w:noProof/>
             <w:webHidden/>
           </w:rPr>
-          <w:instrText xml:space="preserve"> PAGEREF _Toc242052535 \h </w:instrText>
+          <w:instrText xml:space="preserve"> PAGEREF _Toc242096376 \h </w:instrText>
         </w:r>
         <w:r>
           <w:rPr>
@@ -1985,7 +1985,7 @@
           <w14:ligatures w14:val="standardContextual"/>
         </w:rPr>
       </w:pPr>
-      <w:hyperlink w:anchor="_Toc242052536" w:history="1">
+      <w:hyperlink w:anchor="_Toc242096377" w:history="1">
         <w:r>
           <w:rPr>
             <w:rStyle w:val="Hyperlink"/>
@@ -2012,7 +2012,7 @@
             <w:noProof/>
             <w:webHidden/>
           </w:rPr>
-          <w:instrText xml:space="preserve"> PAGEREF _Toc242052536 \h </w:instrText>
+          <w:instrText xml:space="preserve"> PAGEREF _Toc242096377 \h </w:instrText>
         </w:r>
         <w:r>
           <w:rPr>
@@ -2058,7 +2058,7 @@
           <w14:ligatures w14:val="standardContextual"/>
         </w:rPr>
       </w:pPr>
-      <w:hyperlink w:anchor="_Toc242052537" w:history="1">
+      <w:hyperlink w:anchor="_Toc242096378" w:history="1">
         <w:r>
           <w:rPr>
             <w:rStyle w:val="Hyperlink"/>
@@ -2085,7 +2085,7 @@
             <w:noProof/>
             <w:webHidden/>
           </w:rPr>
-          <w:instrText xml:space="preserve"> PAGEREF _Toc242052537 \h </w:instrText>
+          <w:instrText xml:space="preserve"> PAGEREF _Toc242096378 \h </w:instrText>
         </w:r>
         <w:r>
           <w:rPr>
@@ -2131,7 +2131,7 @@
           <w14:ligatures w14:val="standardContextual"/>
         </w:rPr>
       </w:pPr>
-      <w:hyperlink w:anchor="_Toc242052538" w:history="1">
+      <w:hyperlink w:anchor="_Toc242096379" w:history="1">
         <w:r>
           <w:rPr>
             <w:rStyle w:val="Hyperlink"/>
@@ -2158,7 +2158,7 @@
             <w:noProof/>
             <w:webHidden/>
           </w:rPr>
-          <w:instrText xml:space="preserve"> PAGEREF _Toc242052538 \h </w:instrText>
+          <w:instrText xml:space="preserve"> PAGEREF _Toc242096379 \h </w:instrText>
         </w:r>
         <w:r>
           <w:rPr>
@@ -2204,7 +2204,7 @@
           <w14:ligatures w14:val="standardContextual"/>
         </w:rPr>
       </w:pPr>
-      <w:hyperlink w:anchor="_Toc242052539" w:history="1">
+      <w:hyperlink w:anchor="_Toc242096380" w:history="1">
         <w:r>
           <w:rPr>
             <w:rStyle w:val="Hyperlink"/>
@@ -2231,7 +2231,7 @@
             <w:noProof/>
             <w:webHidden/>
           </w:rPr>
-          <w:instrText xml:space="preserve"> PAGEREF _Toc242052539 \h </w:instrText>
+          <w:instrText xml:space="preserve"> PAGEREF _Toc242096380 \h </w:instrText>
         </w:r>
         <w:r>
           <w:rPr>
@@ -2277,7 +2277,7 @@
           <w14:ligatures w14:val="standardContextual"/>
         </w:rPr>
       </w:pPr>
-      <w:hyperlink w:anchor="_Toc242052540" w:history="1">
+      <w:hyperlink w:anchor="_Toc242096381" w:history="1">
         <w:r>
           <w:rPr>
             <w:rStyle w:val="Hyperlink"/>
@@ -2304,7 +2304,7 @@
             <w:noProof/>
             <w:webHidden/>
           </w:rPr>
-          <w:instrText xml:space="preserve"> PAGEREF _Toc242052540 \h </w:instrText>
+          <w:instrText xml:space="preserve"> PAGEREF _Toc242096381 \h </w:instrText>
         </w:r>
         <w:r>
           <w:rPr>
@@ -2350,7 +2350,7 @@
           <w14:ligatures w14:val="standardContextual"/>
         </w:rPr>
       </w:pPr>
-      <w:hyperlink w:anchor="_Toc242052541" w:history="1">
+      <w:hyperlink w:anchor="_Toc242096382" w:history="1">
         <w:r>
           <w:rPr>
             <w:rStyle w:val="Hyperlink"/>
@@ -2377,7 +2377,7 @@
             <w:noProof/>
             <w:webHidden/>
           </w:rPr>
-          <w:instrText xml:space="preserve"> PAGEREF _Toc242052541 \h </w:instrText>
+          <w:instrText xml:space="preserve"> PAGEREF _Toc242096382 \h </w:instrText>
         </w:r>
         <w:r>
           <w:rPr>
@@ -2423,7 +2423,7 @@
           <w14:ligatures w14:val="standardContextual"/>
         </w:rPr>
       </w:pPr>
-      <w:hyperlink w:anchor="_Toc242052542" w:history="1">
+      <w:hyperlink w:anchor="_Toc242096383" w:history="1">
         <w:r>
           <w:rPr>
             <w:rStyle w:val="Hyperlink"/>
@@ -2450,7 +2450,7 @@
             <w:noProof/>
             <w:webHidden/>
           </w:rPr>
-          <w:instrText xml:space="preserve"> PAGEREF _Toc242052542 \h </w:instrText>
+          <w:instrText xml:space="preserve"> PAGEREF _Toc242096383 \h </w:instrText>
         </w:r>
         <w:r>
           <w:rPr>
@@ -2496,7 +2496,7 @@
           <w14:ligatures w14:val="standardContextual"/>
         </w:rPr>
       </w:pPr>
-      <w:hyperlink w:anchor="_Toc242052543" w:history="1">
+      <w:hyperlink w:anchor="_Toc242096384" w:history="1">
         <w:r>
           <w:rPr>
             <w:rStyle w:val="Hyperlink"/>
@@ -2523,7 +2523,7 @@
             <w:noProof/>
             <w:webHidden/>
           </w:rPr>
-          <w:instrText xml:space="preserve"> PAGEREF _Toc242052543 \h </w:instrText>
+          <w:instrText xml:space="preserve"> PAGEREF _Toc242096384 \h </w:instrText>
         </w:r>
         <w:r>
           <w:rPr>
@@ -2569,7 +2569,7 @@
           <w14:ligatures w14:val="standardContextual"/>
         </w:rPr>
       </w:pPr>
-      <w:hyperlink w:anchor="_Toc242052544" w:history="1">
+      <w:hyperlink w:anchor="_Toc242096385" w:history="1">
         <w:r>
           <w:rPr>
             <w:rStyle w:val="Hyperlink"/>
@@ -2596,7 +2596,7 @@
             <w:noProof/>
             <w:webHidden/>
           </w:rPr>
-          <w:instrText xml:space="preserve"> PAGEREF _Toc242052544 \h </w:instrText>
+          <w:instrText xml:space="preserve"> PAGEREF _Toc242096385 \h </w:instrText>
         </w:r>
         <w:r>
           <w:rPr>
@@ -2642,7 +2642,7 @@
           <w14:ligatures w14:val="standardContextual"/>
         </w:rPr>
       </w:pPr>
-      <w:hyperlink w:anchor="_Toc242052545" w:history="1">
+      <w:hyperlink w:anchor="_Toc242096386" w:history="1">
         <w:r>
           <w:rPr>
             <w:rStyle w:val="Hyperlink"/>
@@ -2669,7 +2669,7 @@
             <w:noProof/>
             <w:webHidden/>
           </w:rPr>
-          <w:instrText xml:space="preserve"> PAGEREF _Toc242052545 \h </w:instrText>
+          <w:instrText xml:space="preserve"> PAGEREF _Toc242096386 \h </w:instrText>
         </w:r>
         <w:r>
           <w:rPr>
@@ -2715,7 +2715,7 @@
           <w14:ligatures w14:val="standardContextual"/>
         </w:rPr>
       </w:pPr>
-      <w:hyperlink w:anchor="_Toc242052546" w:history="1">
+      <w:hyperlink w:anchor="_Toc242096387" w:history="1">
         <w:r>
           <w:rPr>
             <w:rStyle w:val="Hyperlink"/>
@@ -2742,7 +2742,7 @@
             <w:noProof/>
             <w:webHidden/>
           </w:rPr>
-          <w:instrText xml:space="preserve"> PAGEREF _Toc242052546 \h </w:instrText>
+          <w:instrText xml:space="preserve"> PAGEREF _Toc242096387 \h </w:instrText>
         </w:r>
         <w:r>
           <w:rPr>
@@ -2788,7 +2788,7 @@
           <w14:ligatures w14:val="standardContextual"/>
         </w:rPr>
       </w:pPr>
-      <w:hyperlink w:anchor="_Toc242052547" w:history="1">
+      <w:hyperlink w:anchor="_Toc242096388" w:history="1">
         <w:r>
           <w:rPr>
             <w:rStyle w:val="Hyperlink"/>
@@ -2815,7 +2815,7 @@
             <w:noProof/>
             <w:webHidden/>
           </w:rPr>
-          <w:instrText xml:space="preserve"> PAGEREF _Toc242052547 \h </w:instrText>
+          <w:instrText xml:space="preserve"> PAGEREF _Toc242096388 \h </w:instrText>
         </w:r>
         <w:r>
           <w:rPr>
@@ -2861,7 +2861,7 @@
           <w14:ligatures w14:val="standardContextual"/>
         </w:rPr>
       </w:pPr>
-      <w:hyperlink w:anchor="_Toc242052548" w:history="1">
+      <w:hyperlink w:anchor="_Toc242096389" w:history="1">
         <w:r>
           <w:rPr>
             <w:rStyle w:val="Hyperlink"/>
@@ -2888,7 +2888,7 @@
             <w:noProof/>
             <w:webHidden/>
           </w:rPr>
-          <w:instrText xml:space="preserve"> PAGEREF _Toc242052548 \h </w:instrText>
+          <w:instrText xml:space="preserve"> PAGEREF _Toc242096389 \h </w:instrText>
         </w:r>
         <w:r>
           <w:rPr>
@@ -2934,7 +2934,7 @@
           <w14:ligatures w14:val="standardContextual"/>
         </w:rPr>
       </w:pPr>
-      <w:hyperlink w:anchor="_Toc242052549" w:history="1">
+      <w:hyperlink w:anchor="_Toc242096390" w:history="1">
         <w:r>
           <w:rPr>
             <w:rStyle w:val="Hyperlink"/>
@@ -2961,7 +2961,7 @@
             <w:noProof/>
             <w:webHidden/>
           </w:rPr>
-          <w:instrText xml:space="preserve"> PAGEREF _Toc242052549 \h </w:instrText>
+          <w:instrText xml:space="preserve"> PAGEREF _Toc242096390 \h </w:instrText>
         </w:r>
         <w:r>
           <w:rPr>
@@ -3007,7 +3007,7 @@
           <w14:ligatures w14:val="standardContextual"/>
         </w:rPr>
       </w:pPr>
-      <w:hyperlink w:anchor="_Toc242052550" w:history="1">
+      <w:hyperlink w:anchor="_Toc242096391" w:history="1">
         <w:r>
           <w:rPr>
             <w:rStyle w:val="Hyperlink"/>
@@ -3034,7 +3034,7 @@
             <w:noProof/>
             <w:webHidden/>
           </w:rPr>
-          <w:instrText xml:space="preserve"> PAGEREF _Toc242052550 \h </w:instrText>
+          <w:instrText xml:space="preserve"> PAGEREF _Toc242096391 \h </w:instrText>
         </w:r>
         <w:r>
           <w:rPr>
@@ -3080,7 +3080,7 @@
           <w14:ligatures w14:val="standardContextual"/>
         </w:rPr>
       </w:pPr>
-      <w:hyperlink w:anchor="_Toc242052551" w:history="1">
+      <w:hyperlink w:anchor="_Toc242096392" w:history="1">
         <w:r>
           <w:rPr>
             <w:rStyle w:val="Hyperlink"/>
@@ -3107,7 +3107,7 @@
             <w:noProof/>
             <w:webHidden/>
           </w:rPr>
-          <w:instrText xml:space="preserve"> PAGEREF _Toc242052551 \h </w:instrText>
+          <w:instrText xml:space="preserve"> PAGEREF _Toc242096392 \h </w:instrText>
         </w:r>
         <w:r>
           <w:rPr>
@@ -3153,7 +3153,7 @@
           <w14:ligatures w14:val="standardContextual"/>
         </w:rPr>
       </w:pPr>
-      <w:hyperlink w:anchor="_Toc242052552" w:history="1">
+      <w:hyperlink w:anchor="_Toc242096393" w:history="1">
         <w:r>
           <w:rPr>
             <w:rStyle w:val="Hyperlink"/>
@@ -3180,7 +3180,7 @@
             <w:noProof/>
             <w:webHidden/>
           </w:rPr>
-          <w:instrText xml:space="preserve"> PAGEREF _Toc242052552 \h </w:instrText>
+          <w:instrText xml:space="preserve"> PAGEREF _Toc242096393 \h </w:instrText>
         </w:r>
         <w:r>
           <w:rPr>
@@ -3226,7 +3226,7 @@
           <w14:ligatures w14:val="standardContextual"/>
         </w:rPr>
       </w:pPr>
-      <w:hyperlink w:anchor="_Toc242052553" w:history="1">
+      <w:hyperlink w:anchor="_Toc242096394" w:history="1">
         <w:r>
           <w:rPr>
             <w:rStyle w:val="Hyperlink"/>
@@ -3253,7 +3253,7 @@
             <w:noProof/>
             <w:webHidden/>
           </w:rPr>
-          <w:instrText xml:space="preserve"> PAGEREF _Toc242052553 \h </w:instrText>
+          <w:instrText xml:space="preserve"> PAGEREF _Toc242096394 \h </w:instrText>
         </w:r>
         <w:r>
           <w:rPr>
@@ -3299,7 +3299,7 @@
           <w14:ligatures w14:val="standardContextual"/>
         </w:rPr>
       </w:pPr>
-      <w:hyperlink w:anchor="_Toc242052554" w:history="1">
+      <w:hyperlink w:anchor="_Toc242096395" w:history="1">
         <w:r>
           <w:rPr>
             <w:rStyle w:val="Hyperlink"/>
@@ -3326,7 +3326,7 @@
             <w:noProof/>
             <w:webHidden/>
           </w:rPr>
-          <w:instrText xml:space="preserve"> PAGEREF _Toc242052554 \h </w:instrText>
+          <w:instrText xml:space="preserve"> PAGEREF _Toc242096395 \h </w:instrText>
         </w:r>
         <w:r>
           <w:rPr>
@@ -3372,7 +3372,7 @@
           <w14:ligatures w14:val="standardContextual"/>
         </w:rPr>
       </w:pPr>
-      <w:hyperlink w:anchor="_Toc242052555" w:history="1">
+      <w:hyperlink w:anchor="_Toc242096396" w:history="1">
         <w:r>
           <w:rPr>
             <w:rStyle w:val="Hyperlink"/>
@@ -3399,7 +3399,7 @@
             <w:noProof/>
             <w:webHidden/>
           </w:rPr>
-          <w:instrText xml:space="preserve"> PAGEREF _Toc242052555 \h </w:instrText>
+          <w:instrText xml:space="preserve"> PAGEREF _Toc242096396 \h </w:instrText>
         </w:r>
         <w:r>
           <w:rPr>
@@ -3445,7 +3445,7 @@
           <w14:ligatures w14:val="standardContextual"/>
         </w:rPr>
       </w:pPr>
-      <w:hyperlink w:anchor="_Toc242052556" w:history="1">
+      <w:hyperlink w:anchor="_Toc242096397" w:history="1">
         <w:r>
           <w:rPr>
             <w:rStyle w:val="Hyperlink"/>
@@ -3472,7 +3472,7 @@
             <w:noProof/>
             <w:webHidden/>
           </w:rPr>
-          <w:instrText xml:space="preserve"> PAGEREF _Toc242052556 \h </w:instrText>
+          <w:instrText xml:space="preserve"> PAGEREF _Toc242096397 \h </w:instrText>
         </w:r>
         <w:r>
           <w:rPr>
@@ -3518,7 +3518,7 @@
           <w14:ligatures w14:val="standardContextual"/>
         </w:rPr>
       </w:pPr>
-      <w:hyperlink w:anchor="_Toc242052557" w:history="1">
+      <w:hyperlink w:anchor="_Toc242096398" w:history="1">
         <w:r>
           <w:rPr>
             <w:rStyle w:val="Hyperlink"/>
@@ -3545,7 +3545,7 @@
             <w:noProof/>
             <w:webHidden/>
           </w:rPr>
-          <w:instrText xml:space="preserve"> PAGEREF _Toc242052557 \h </w:instrText>
+          <w:instrText xml:space="preserve"> PAGEREF _Toc242096398 \h </w:instrText>
         </w:r>
         <w:r>
           <w:rPr>
@@ -3591,7 +3591,7 @@
           <w14:ligatures w14:val="standardContextual"/>
         </w:rPr>
       </w:pPr>
-      <w:hyperlink w:anchor="_Toc242052558" w:history="1">
+      <w:hyperlink w:anchor="_Toc242096399" w:history="1">
         <w:r>
           <w:rPr>
             <w:rStyle w:val="Hyperlink"/>
@@ -3618,7 +3618,7 @@
             <w:noProof/>
             <w:webHidden/>
           </w:rPr>
-          <w:instrText xml:space="preserve"> PAGEREF _Toc242052558 \h </w:instrText>
+          <w:instrText xml:space="preserve"> PAGEREF _Toc242096399 \h </w:instrText>
         </w:r>
         <w:r>
           <w:rPr>
@@ -3664,7 +3664,7 @@
           <w14:ligatures w14:val="standardContextual"/>
         </w:rPr>
       </w:pPr>
-      <w:hyperlink w:anchor="_Toc242052559" w:history="1">
+      <w:hyperlink w:anchor="_Toc242096400" w:history="1">
         <w:r>
           <w:rPr>
             <w:rStyle w:val="Hyperlink"/>
@@ -3691,7 +3691,7 @@
             <w:noProof/>
             <w:webHidden/>
           </w:rPr>
-          <w:instrText xml:space="preserve"> PAGEREF _Toc242052559 \h </w:instrText>
+          <w:instrText xml:space="preserve"> PAGEREF _Toc242096400 \h </w:instrText>
         </w:r>
         <w:r>
           <w:rPr>
@@ -3737,7 +3737,7 @@
           <w14:ligatures w14:val="standardContextual"/>
         </w:rPr>
       </w:pPr>
-      <w:hyperlink w:anchor="_Toc242052560" w:history="1">
+      <w:hyperlink w:anchor="_Toc242096401" w:history="1">
         <w:r>
           <w:rPr>
             <w:rStyle w:val="Hyperlink"/>
@@ -3764,7 +3764,7 @@
             <w:noProof/>
             <w:webHidden/>
           </w:rPr>
-          <w:instrText xml:space="preserve"> PAGEREF _Toc242052560 \h </w:instrText>
+          <w:instrText xml:space="preserve"> PAGEREF _Toc242096401 \h </w:instrText>
         </w:r>
         <w:r>
           <w:rPr>
@@ -3810,7 +3810,7 @@
           <w14:ligatures w14:val="standardContextual"/>
         </w:rPr>
       </w:pPr>
-      <w:hyperlink w:anchor="_Toc242052561" w:history="1">
+      <w:hyperlink w:anchor="_Toc242096402" w:history="1">
         <w:r>
           <w:rPr>
             <w:rStyle w:val="Hyperlink"/>
@@ -3837,7 +3837,7 @@
             <w:noProof/>
             <w:webHidden/>
           </w:rPr>
-          <w:instrText xml:space="preserve"> PAGEREF _Toc242052561 \h </w:instrText>
+          <w:instrText xml:space="preserve"> PAGEREF _Toc242096402 \h </w:instrText>
         </w:r>
         <w:r>
           <w:rPr>
@@ -3883,7 +3883,7 @@
           <w14:ligatures w14:val="standardContextual"/>
         </w:rPr>
       </w:pPr>
-      <w:hyperlink w:anchor="_Toc242052562" w:history="1">
+      <w:hyperlink w:anchor="_Toc242096403" w:history="1">
         <w:r>
           <w:rPr>
             <w:rStyle w:val="Hyperlink"/>
@@ -3910,7 +3910,7 @@
             <w:noProof/>
             <w:webHidden/>
           </w:rPr>
-          <w:instrText xml:space="preserve"> PAGEREF _Toc242052562 \h </w:instrText>
+          <w:instrText xml:space="preserve"> PAGEREF _Toc242096403 \h </w:instrText>
         </w:r>
         <w:r>
           <w:rPr>
@@ -3956,7 +3956,7 @@
           <w14:ligatures w14:val="standardContextual"/>
         </w:rPr>
       </w:pPr>
-      <w:hyperlink w:anchor="_Toc242052563" w:history="1">
+      <w:hyperlink w:anchor="_Toc242096404" w:history="1">
         <w:r>
           <w:rPr>
             <w:rStyle w:val="Hyperlink"/>
@@ -3983,7 +3983,7 @@
             <w:noProof/>
             <w:webHidden/>
           </w:rPr>
-          <w:instrText xml:space="preserve"> PAGEREF _Toc242052563 \h </w:instrText>
+          <w:instrText xml:space="preserve"> PAGEREF _Toc242096404 \h </w:instrText>
         </w:r>
         <w:r>
           <w:rPr>
@@ -4029,7 +4029,7 @@
           <w14:ligatures w14:val="standardContextual"/>
         </w:rPr>
       </w:pPr>
-      <w:hyperlink w:anchor="_Toc242052564" w:history="1">
+      <w:hyperlink w:anchor="_Toc242096405" w:history="1">
         <w:r>
           <w:rPr>
             <w:rStyle w:val="Hyperlink"/>
@@ -4056,7 +4056,7 @@
             <w:noProof/>
             <w:webHidden/>
           </w:rPr>
-          <w:instrText xml:space="preserve"> PAGEREF _Toc242052564 \h </w:instrText>
+          <w:instrText xml:space="preserve"> PAGEREF _Toc242096405 \h </w:instrText>
         </w:r>
         <w:r>
           <w:rPr>
@@ -4102,7 +4102,7 @@
           <w14:ligatures w14:val="standardContextual"/>
         </w:rPr>
       </w:pPr>
-      <w:hyperlink w:anchor="_Toc242052565" w:history="1">
+      <w:hyperlink w:anchor="_Toc242096406" w:history="1">
         <w:r>
           <w:rPr>
             <w:rStyle w:val="Hyperlink"/>
@@ -4129,7 +4129,7 @@
             <w:noProof/>
             <w:webHidden/>
           </w:rPr>
-          <w:instrText xml:space="preserve"> PAGEREF _Toc242052565 \h </w:instrText>
+          <w:instrText xml:space="preserve"> PAGEREF _Toc242096406 \h </w:instrText>
         </w:r>
         <w:r>
           <w:rPr>
@@ -4175,7 +4175,7 @@
           <w14:ligatures w14:val="standardContextual"/>
         </w:rPr>
       </w:pPr>
-      <w:hyperlink w:anchor="_Toc242052566" w:history="1">
+      <w:hyperlink w:anchor="_Toc242096407" w:history="1">
         <w:r>
           <w:rPr>
             <w:rStyle w:val="Hyperlink"/>
@@ -4202,7 +4202,7 @@
             <w:noProof/>
             <w:webHidden/>
           </w:rPr>
-          <w:instrText xml:space="preserve"> PAGEREF _Toc242052566 \h </w:instrText>
+          <w:instrText xml:space="preserve"> PAGEREF _Toc242096407 \h </w:instrText>
         </w:r>
         <w:r>
           <w:rPr>
@@ -4248,7 +4248,7 @@
           <w14:ligatures w14:val="standardContextual"/>
         </w:rPr>
       </w:pPr>
-      <w:hyperlink w:anchor="_Toc242052567" w:history="1">
+      <w:hyperlink w:anchor="_Toc242096408" w:history="1">
         <w:r>
           <w:rPr>
             <w:rStyle w:val="Hyperlink"/>
@@ -4275,7 +4275,7 @@
             <w:noProof/>
             <w:webHidden/>
           </w:rPr>
-          <w:instrText xml:space="preserve"> PAGEREF _Toc242052567 \h </w:instrText>
+          <w:instrText xml:space="preserve"> PAGEREF _Toc242096408 \h </w:instrText>
         </w:r>
         <w:r>
           <w:rPr>
@@ -4321,7 +4321,7 @@
           <w14:ligatures w14:val="standardContextual"/>
         </w:rPr>
       </w:pPr>
-      <w:hyperlink w:anchor="_Toc242052568" w:history="1">
+      <w:hyperlink w:anchor="_Toc242096409" w:history="1">
         <w:r>
           <w:rPr>
             <w:rStyle w:val="Hyperlink"/>
@@ -4348,7 +4348,7 @@
             <w:noProof/>
             <w:webHidden/>
           </w:rPr>
-          <w:instrText xml:space="preserve"> PAGEREF _Toc242052568 \h </w:instrText>
+          <w:instrText xml:space="preserve"> PAGEREF _Toc242096409 \h </w:instrText>
         </w:r>
         <w:r>
           <w:rPr>
@@ -4394,7 +4394,7 @@
           <w14:ligatures w14:val="standardContextual"/>
         </w:rPr>
       </w:pPr>
-      <w:hyperlink w:anchor="_Toc242052569" w:history="1">
+      <w:hyperlink w:anchor="_Toc242096410" w:history="1">
         <w:r>
           <w:rPr>
             <w:rStyle w:val="Hyperlink"/>
@@ -4421,7 +4421,7 @@
             <w:noProof/>
             <w:webHidden/>
           </w:rPr>
-          <w:instrText xml:space="preserve"> PAGEREF _Toc242052569 \h </w:instrText>
+          <w:instrText xml:space="preserve"> PAGEREF _Toc242096410 \h </w:instrText>
         </w:r>
         <w:r>
           <w:rPr>
@@ -4467,7 +4467,7 @@
           <w14:ligatures w14:val="standardContextual"/>
         </w:rPr>
       </w:pPr>
-      <w:hyperlink w:anchor="_Toc242052570" w:history="1">
+      <w:hyperlink w:anchor="_Toc242096411" w:history="1">
         <w:r>
           <w:rPr>
             <w:rStyle w:val="Hyperlink"/>
@@ -4494,7 +4494,7 @@
             <w:noProof/>
             <w:webHidden/>
           </w:rPr>
-          <w:instrText xml:space="preserve"> PAGEREF _Toc242052570 \h </w:instrText>
+          <w:instrText xml:space="preserve"> PAGEREF _Toc242096411 \h </w:instrText>
         </w:r>
         <w:r>
           <w:rPr>
@@ -4540,7 +4540,7 @@
           <w14:ligatures w14:val="standardContextual"/>
         </w:rPr>
       </w:pPr>
-      <w:hyperlink w:anchor="_Toc242052571" w:history="1">
+      <w:hyperlink w:anchor="_Toc242096412" w:history="1">
         <w:r>
           <w:rPr>
             <w:rStyle w:val="Hyperlink"/>
@@ -4567,7 +4567,7 @@
             <w:noProof/>
             <w:webHidden/>
           </w:rPr>
-          <w:instrText xml:space="preserve"> PAGEREF _Toc242052571 \h </w:instrText>
+          <w:instrText xml:space="preserve"> PAGEREF _Toc242096412 \h </w:instrText>
         </w:r>
         <w:r>
           <w:rPr>
@@ -4613,7 +4613,7 @@
           <w14:ligatures w14:val="standardContextual"/>
         </w:rPr>
       </w:pPr>
-      <w:hyperlink w:anchor="_Toc242052572" w:history="1">
+      <w:hyperlink w:anchor="_Toc242096413" w:history="1">
         <w:r>
           <w:rPr>
             <w:rStyle w:val="Hyperlink"/>
@@ -4640,7 +4640,7 @@
             <w:noProof/>
             <w:webHidden/>
           </w:rPr>
-          <w:instrText xml:space="preserve"> PAGEREF _Toc242052572 \h </w:instrText>
+          <w:instrText xml:space="preserve"> PAGEREF _Toc242096413 \h </w:instrText>
         </w:r>
         <w:r>
           <w:rPr>
@@ -4686,7 +4686,7 @@
           <w14:ligatures w14:val="standardContextual"/>
         </w:rPr>
       </w:pPr>
-      <w:hyperlink w:anchor="_Toc242052573" w:history="1">
+      <w:hyperlink w:anchor="_Toc242096414" w:history="1">
         <w:r>
           <w:rPr>
             <w:rStyle w:val="Hyperlink"/>
@@ -4713,7 +4713,7 @@
             <w:noProof/>
             <w:webHidden/>
           </w:rPr>
-          <w:instrText xml:space="preserve"> PAGEREF _Toc242052573 \h </w:instrText>
+          <w:instrText xml:space="preserve"> PAGEREF _Toc242096414 \h </w:instrText>
         </w:r>
         <w:r>
           <w:rPr>
@@ -4759,7 +4759,7 @@
           <w14:ligatures w14:val="standardContextual"/>
         </w:rPr>
       </w:pPr>
-      <w:hyperlink w:anchor="_Toc242052574" w:history="1">
+      <w:hyperlink w:anchor="_Toc242096415" w:history="1">
         <w:r>
           <w:rPr>
             <w:rStyle w:val="Hyperlink"/>
@@ -4786,7 +4786,7 @@
             <w:noProof/>
             <w:webHidden/>
           </w:rPr>
-          <w:instrText xml:space="preserve"> PAGEREF _Toc242052574 \h </w:instrText>
+          <w:instrText xml:space="preserve"> PAGEREF _Toc242096415 \h </w:instrText>
         </w:r>
         <w:r>
           <w:rPr>
@@ -4832,7 +4832,7 @@
           <w14:ligatures w14:val="standardContextual"/>
         </w:rPr>
       </w:pPr>
-      <w:hyperlink w:anchor="_Toc242052575" w:history="1">
+      <w:hyperlink w:anchor="_Toc242096416" w:history="1">
         <w:r>
           <w:rPr>
             <w:rStyle w:val="Hyperlink"/>
@@ -4859,7 +4859,7 @@
             <w:noProof/>
             <w:webHidden/>
           </w:rPr>
-          <w:instrText xml:space="preserve"> PAGEREF _Toc242052575 \h </w:instrText>
+          <w:instrText xml:space="preserve"> PAGEREF _Toc242096416 \h </w:instrText>
         </w:r>
         <w:r>
           <w:rPr>
@@ -4905,7 +4905,7 @@
           <w14:ligatures w14:val="standardContextual"/>
         </w:rPr>
       </w:pPr>
-      <w:hyperlink w:anchor="_Toc242052576" w:history="1">
+      <w:hyperlink w:anchor="_Toc242096417" w:history="1">
         <w:r>
           <w:rPr>
             <w:rStyle w:val="Hyperlink"/>
@@ -4932,7 +4932,7 @@
             <w:noProof/>
             <w:webHidden/>
           </w:rPr>
-          <w:instrText xml:space="preserve"> PAGEREF _Toc242052576 \h </w:instrText>
+          <w:instrText xml:space="preserve"> PAGEREF _Toc242096417 \h </w:instrText>
         </w:r>
         <w:r>
           <w:rPr>
@@ -4978,7 +4978,7 @@
           <w14:ligatures w14:val="standardContextual"/>
         </w:rPr>
       </w:pPr>
-      <w:hyperlink w:anchor="_Toc242052577" w:history="1">
+      <w:hyperlink w:anchor="_Toc242096418" w:history="1">
         <w:r>
           <w:rPr>
             <w:rStyle w:val="Hyperlink"/>
@@ -5005,7 +5005,7 @@
             <w:noProof/>
             <w:webHidden/>
           </w:rPr>
-          <w:instrText xml:space="preserve"> PAGEREF _Toc242052577 \h </w:instrText>
+          <w:instrText xml:space="preserve"> PAGEREF _Toc242096418 \h </w:instrText>
         </w:r>
         <w:r>
           <w:rPr>
@@ -5051,7 +5051,7 @@
           <w14:ligatures w14:val="standardContextual"/>
         </w:rPr>
       </w:pPr>
-      <w:hyperlink w:anchor="_Toc242052578" w:history="1">
+      <w:hyperlink w:anchor="_Toc242096419" w:history="1">
         <w:r>
           <w:rPr>
             <w:rStyle w:val="Hyperlink"/>
@@ -5078,7 +5078,7 @@
             <w:noProof/>
             <w:webHidden/>
           </w:rPr>
-          <w:instrText xml:space="preserve"> PAGEREF _Toc242052578 \h </w:instrText>
+          <w:instrText xml:space="preserve"> PAGEREF _Toc242096419 \h </w:instrText>
         </w:r>
         <w:r>
           <w:rPr>
@@ -5124,7 +5124,7 @@
           <w14:ligatures w14:val="standardContextual"/>
         </w:rPr>
       </w:pPr>
-      <w:hyperlink w:anchor="_Toc242052579" w:history="1">
+      <w:hyperlink w:anchor="_Toc242096420" w:history="1">
         <w:r>
           <w:rPr>
             <w:rStyle w:val="Hyperlink"/>
@@ -5151,7 +5151,7 @@
             <w:noProof/>
             <w:webHidden/>
           </w:rPr>
-          <w:instrText xml:space="preserve"> PAGEREF _Toc242052579 \h </w:instrText>
+          <w:instrText xml:space="preserve"> PAGEREF _Toc242096420 \h </w:instrText>
         </w:r>
         <w:r>
           <w:rPr>
@@ -5197,7 +5197,7 @@
           <w14:ligatures w14:val="standardContextual"/>
         </w:rPr>
       </w:pPr>
-      <w:hyperlink w:anchor="_Toc242052580" w:history="1">
+      <w:hyperlink w:anchor="_Toc242096421" w:history="1">
         <w:r>
           <w:rPr>
             <w:rStyle w:val="Hyperlink"/>
@@ -5224,7 +5224,7 @@
             <w:noProof/>
             <w:webHidden/>
           </w:rPr>
-          <w:instrText xml:space="preserve"> PAGEREF _Toc242052580 \h </w:instrText>
+          <w:instrText xml:space="preserve"> PAGEREF _Toc242096421 \h </w:instrText>
         </w:r>
         <w:r>
           <w:rPr>
@@ -5244,7 +5244,7 @@
             <w:noProof/>
             <w:webHidden/>
           </w:rPr>
-          <w:t>37</w:t>
+          <w:t>38</w:t>
         </w:r>
         <w:r>
           <w:rPr>
@@ -5270,7 +5270,7 @@
           <w14:ligatures w14:val="standardContextual"/>
         </w:rPr>
       </w:pPr>
-      <w:hyperlink w:anchor="_Toc242052581" w:history="1">
+      <w:hyperlink w:anchor="_Toc242096422" w:history="1">
         <w:r>
           <w:rPr>
             <w:rStyle w:val="Hyperlink"/>
@@ -5297,7 +5297,7 @@
             <w:noProof/>
             <w:webHidden/>
           </w:rPr>
-          <w:instrText xml:space="preserve"> PAGEREF _Toc242052581 \h </w:instrText>
+          <w:instrText xml:space="preserve"> PAGEREF _Toc242096422 \h </w:instrText>
         </w:r>
         <w:r>
           <w:rPr>
@@ -5317,7 +5317,7 @@
             <w:noProof/>
             <w:webHidden/>
           </w:rPr>
-          <w:t>38</w:t>
+          <w:t>39</w:t>
         </w:r>
         <w:r>
           <w:rPr>
@@ -5343,7 +5343,7 @@
           <w14:ligatures w14:val="standardContextual"/>
         </w:rPr>
       </w:pPr>
-      <w:hyperlink w:anchor="_Toc242052582" w:history="1">
+      <w:hyperlink w:anchor="_Toc242096423" w:history="1">
         <w:r>
           <w:rPr>
             <w:rStyle w:val="Hyperlink"/>
@@ -5370,7 +5370,7 @@
             <w:noProof/>
             <w:webHidden/>
           </w:rPr>
-          <w:instrText xml:space="preserve"> PAGEREF _Toc242052582 \h </w:instrText>
+          <w:instrText xml:space="preserve"> PAGEREF _Toc242096423 \h </w:instrText>
         </w:r>
         <w:r>
           <w:rPr>
@@ -5416,7 +5416,7 @@
           <w14:ligatures w14:val="standardContextual"/>
         </w:rPr>
       </w:pPr>
-      <w:hyperlink w:anchor="_Toc242052583" w:history="1">
+      <w:hyperlink w:anchor="_Toc242096424" w:history="1">
         <w:r>
           <w:rPr>
             <w:rStyle w:val="Hyperlink"/>
@@ -5443,7 +5443,7 @@
             <w:noProof/>
             <w:webHidden/>
           </w:rPr>
-          <w:instrText xml:space="preserve"> PAGEREF _Toc242052583 \h </w:instrText>
+          <w:instrText xml:space="preserve"> PAGEREF _Toc242096424 \h </w:instrText>
         </w:r>
         <w:r>
           <w:rPr>
@@ -5489,7 +5489,7 @@
           <w14:ligatures w14:val="standardContextual"/>
         </w:rPr>
       </w:pPr>
-      <w:hyperlink w:anchor="_Toc242052584" w:history="1">
+      <w:hyperlink w:anchor="_Toc242096425" w:history="1">
         <w:r>
           <w:rPr>
             <w:rStyle w:val="Hyperlink"/>
@@ -5516,7 +5516,7 @@
             <w:noProof/>
             <w:webHidden/>
           </w:rPr>
-          <w:instrText xml:space="preserve"> PAGEREF _Toc242052584 \h </w:instrText>
+          <w:instrText xml:space="preserve"> PAGEREF _Toc242096425 \h </w:instrText>
         </w:r>
         <w:r>
           <w:rPr>
@@ -5562,7 +5562,7 @@
           <w14:ligatures w14:val="standardContextual"/>
         </w:rPr>
       </w:pPr>
-      <w:hyperlink w:anchor="_Toc242052585" w:history="1">
+      <w:hyperlink w:anchor="_Toc242096426" w:history="1">
         <w:r>
           <w:rPr>
             <w:rStyle w:val="Hyperlink"/>
@@ -5589,7 +5589,7 @@
             <w:noProof/>
             <w:webHidden/>
           </w:rPr>
-          <w:instrText xml:space="preserve"> PAGEREF _Toc242052585 \h </w:instrText>
+          <w:instrText xml:space="preserve"> PAGEREF _Toc242096426 \h </w:instrText>
         </w:r>
         <w:r>
           <w:rPr>
@@ -5635,7 +5635,7 @@
           <w14:ligatures w14:val="standardContextual"/>
         </w:rPr>
       </w:pPr>
-      <w:hyperlink w:anchor="_Toc242052586" w:history="1">
+      <w:hyperlink w:anchor="_Toc242096427" w:history="1">
         <w:r>
           <w:rPr>
             <w:rStyle w:val="Hyperlink"/>
@@ -5662,7 +5662,7 @@
             <w:noProof/>
             <w:webHidden/>
           </w:rPr>
-          <w:instrText xml:space="preserve"> PAGEREF _Toc242052586 \h </w:instrText>
+          <w:instrText xml:space="preserve"> PAGEREF _Toc242096427 \h </w:instrText>
         </w:r>
         <w:r>
           <w:rPr>
@@ -5708,7 +5708,7 @@
           <w14:ligatures w14:val="standardContextual"/>
         </w:rPr>
       </w:pPr>
-      <w:hyperlink w:anchor="_Toc242052587" w:history="1">
+      <w:hyperlink w:anchor="_Toc242096428" w:history="1">
         <w:r>
           <w:rPr>
             <w:rStyle w:val="Hyperlink"/>
@@ -5735,7 +5735,7 @@
             <w:noProof/>
             <w:webHidden/>
           </w:rPr>
-          <w:instrText xml:space="preserve"> PAGEREF _Toc242052587 \h </w:instrText>
+          <w:instrText xml:space="preserve"> PAGEREF _Toc242096428 \h </w:instrText>
         </w:r>
         <w:r>
           <w:rPr>
@@ -5781,7 +5781,7 @@
           <w14:ligatures w14:val="standardContextual"/>
         </w:rPr>
       </w:pPr>
-      <w:hyperlink w:anchor="_Toc242052588" w:history="1">
+      <w:hyperlink w:anchor="_Toc242096429" w:history="1">
         <w:r>
           <w:rPr>
             <w:rStyle w:val="Hyperlink"/>
@@ -5808,7 +5808,7 @@
             <w:noProof/>
             <w:webHidden/>
           </w:rPr>
-          <w:instrText xml:space="preserve"> PAGEREF _Toc242052588 \h </w:instrText>
+          <w:instrText xml:space="preserve"> PAGEREF _Toc242096429 \h </w:instrText>
         </w:r>
         <w:r>
           <w:rPr>
@@ -5854,7 +5854,7 @@
           <w14:ligatures w14:val="standardContextual"/>
         </w:rPr>
       </w:pPr>
-      <w:hyperlink w:anchor="_Toc242052589" w:history="1">
+      <w:hyperlink w:anchor="_Toc242096430" w:history="1">
         <w:r>
           <w:rPr>
             <w:rStyle w:val="Hyperlink"/>
@@ -5881,7 +5881,7 @@
             <w:noProof/>
             <w:webHidden/>
           </w:rPr>
-          <w:instrText xml:space="preserve"> PAGEREF _Toc242052589 \h </w:instrText>
+          <w:instrText xml:space="preserve"> PAGEREF _Toc242096430 \h </w:instrText>
         </w:r>
         <w:r>
           <w:rPr>
@@ -5927,7 +5927,7 @@
           <w14:ligatures w14:val="standardContextual"/>
         </w:rPr>
       </w:pPr>
-      <w:hyperlink w:anchor="_Toc242052590" w:history="1">
+      <w:hyperlink w:anchor="_Toc242096431" w:history="1">
         <w:r>
           <w:rPr>
             <w:rStyle w:val="Hyperlink"/>
@@ -5954,7 +5954,7 @@
             <w:noProof/>
             <w:webHidden/>
           </w:rPr>
-          <w:instrText xml:space="preserve"> PAGEREF _Toc242052590 \h </w:instrText>
+          <w:instrText xml:space="preserve"> PAGEREF _Toc242096431 \h </w:instrText>
         </w:r>
         <w:r>
           <w:rPr>
@@ -6000,7 +6000,7 @@
           <w14:ligatures w14:val="standardContextual"/>
         </w:rPr>
       </w:pPr>
-      <w:hyperlink w:anchor="_Toc242052591" w:history="1">
+      <w:hyperlink w:anchor="_Toc242096432" w:history="1">
         <w:r>
           <w:rPr>
             <w:rStyle w:val="Hyperlink"/>
@@ -6027,7 +6027,7 @@
             <w:noProof/>
             <w:webHidden/>
           </w:rPr>
-          <w:instrText xml:space="preserve"> PAGEREF _Toc242052591 \h </w:instrText>
+          <w:instrText xml:space="preserve"> PAGEREF _Toc242096432 \h </w:instrText>
         </w:r>
         <w:r>
           <w:rPr>
@@ -6073,7 +6073,7 @@
           <w14:ligatures w14:val="standardContextual"/>
         </w:rPr>
       </w:pPr>
-      <w:hyperlink w:anchor="_Toc242052592" w:history="1">
+      <w:hyperlink w:anchor="_Toc242096433" w:history="1">
         <w:r>
           <w:rPr>
             <w:rStyle w:val="Hyperlink"/>
@@ -6100,7 +6100,7 @@
             <w:noProof/>
             <w:webHidden/>
           </w:rPr>
-          <w:instrText xml:space="preserve"> PAGEREF _Toc242052592 \h </w:instrText>
+          <w:instrText xml:space="preserve"> PAGEREF _Toc242096433 \h </w:instrText>
         </w:r>
         <w:r>
           <w:rPr>
@@ -6146,7 +6146,7 @@
           <w14:ligatures w14:val="standardContextual"/>
         </w:rPr>
       </w:pPr>
-      <w:hyperlink w:anchor="_Toc242052593" w:history="1">
+      <w:hyperlink w:anchor="_Toc242096434" w:history="1">
         <w:r>
           <w:rPr>
             <w:rStyle w:val="Hyperlink"/>
@@ -6173,7 +6173,7 @@
             <w:noProof/>
             <w:webHidden/>
           </w:rPr>
-          <w:instrText xml:space="preserve"> PAGEREF _Toc242052593 \h </w:instrText>
+          <w:instrText xml:space="preserve"> PAGEREF _Toc242096434 \h </w:instrText>
         </w:r>
         <w:r>
           <w:rPr>
@@ -6219,7 +6219,7 @@
           <w14:ligatures w14:val="standardContextual"/>
         </w:rPr>
       </w:pPr>
-      <w:hyperlink w:anchor="_Toc242052594" w:history="1">
+      <w:hyperlink w:anchor="_Toc242096435" w:history="1">
         <w:r>
           <w:rPr>
             <w:rStyle w:val="Hyperlink"/>
@@ -6246,7 +6246,7 @@
             <w:noProof/>
             <w:webHidden/>
           </w:rPr>
-          <w:instrText xml:space="preserve"> PAGEREF _Toc242052594 \h </w:instrText>
+          <w:instrText xml:space="preserve"> PAGEREF _Toc242096435 \h </w:instrText>
         </w:r>
         <w:r>
           <w:rPr>
@@ -6292,7 +6292,7 @@
           <w14:ligatures w14:val="standardContextual"/>
         </w:rPr>
       </w:pPr>
-      <w:hyperlink w:anchor="_Toc242052595" w:history="1">
+      <w:hyperlink w:anchor="_Toc242096436" w:history="1">
         <w:r>
           <w:rPr>
             <w:rStyle w:val="Hyperlink"/>
@@ -6319,7 +6319,7 @@
             <w:noProof/>
             <w:webHidden/>
           </w:rPr>
-          <w:instrText xml:space="preserve"> PAGEREF _Toc242052595 \h </w:instrText>
+          <w:instrText xml:space="preserve"> PAGEREF _Toc242096436 \h </w:instrText>
         </w:r>
         <w:r>
           <w:rPr>
@@ -6365,7 +6365,7 @@
           <w14:ligatures w14:val="standardContextual"/>
         </w:rPr>
       </w:pPr>
-      <w:hyperlink w:anchor="_Toc242052596" w:history="1">
+      <w:hyperlink w:anchor="_Toc242096437" w:history="1">
         <w:r>
           <w:rPr>
             <w:rStyle w:val="Hyperlink"/>
@@ -6392,7 +6392,7 @@
             <w:noProof/>
             <w:webHidden/>
           </w:rPr>
-          <w:instrText xml:space="preserve"> PAGEREF _Toc242052596 \h </w:instrText>
+          <w:instrText xml:space="preserve"> PAGEREF _Toc242096437 \h </w:instrText>
         </w:r>
         <w:r>
           <w:rPr>
@@ -6438,7 +6438,7 @@
           <w14:ligatures w14:val="standardContextual"/>
         </w:rPr>
       </w:pPr>
-      <w:hyperlink w:anchor="_Toc242052597" w:history="1">
+      <w:hyperlink w:anchor="_Toc242096438" w:history="1">
         <w:r>
           <w:rPr>
             <w:rStyle w:val="Hyperlink"/>
@@ -6465,7 +6465,7 @@
             <w:noProof/>
             <w:webHidden/>
           </w:rPr>
-          <w:instrText xml:space="preserve"> PAGEREF _Toc242052597 \h </w:instrText>
+          <w:instrText xml:space="preserve"> PAGEREF _Toc242096438 \h </w:instrText>
         </w:r>
         <w:r>
           <w:rPr>
@@ -6511,7 +6511,7 @@
           <w14:ligatures w14:val="standardContextual"/>
         </w:rPr>
       </w:pPr>
-      <w:hyperlink w:anchor="_Toc242052598" w:history="1">
+      <w:hyperlink w:anchor="_Toc242096439" w:history="1">
         <w:r>
           <w:rPr>
             <w:rStyle w:val="Hyperlink"/>
@@ -6538,7 +6538,7 @@
             <w:noProof/>
             <w:webHidden/>
           </w:rPr>
-          <w:instrText xml:space="preserve"> PAGEREF _Toc242052598 \h </w:instrText>
+          <w:instrText xml:space="preserve"> PAGEREF _Toc242096439 \h </w:instrText>
         </w:r>
         <w:r>
           <w:rPr>
@@ -6584,7 +6584,7 @@
           <w14:ligatures w14:val="standardContextual"/>
         </w:rPr>
       </w:pPr>
-      <w:hyperlink w:anchor="_Toc242052599" w:history="1">
+      <w:hyperlink w:anchor="_Toc242096440" w:history="1">
         <w:r>
           <w:rPr>
             <w:rStyle w:val="Hyperlink"/>
@@ -6611,7 +6611,7 @@
             <w:noProof/>
             <w:webHidden/>
           </w:rPr>
-          <w:instrText xml:space="preserve"> PAGEREF _Toc242052599 \h </w:instrText>
+          <w:instrText xml:space="preserve"> PAGEREF _Toc242096440 \h </w:instrText>
         </w:r>
         <w:r>
           <w:rPr>
@@ -6657,7 +6657,7 @@
           <w14:ligatures w14:val="standardContextual"/>
         </w:rPr>
       </w:pPr>
-      <w:hyperlink w:anchor="_Toc242052600" w:history="1">
+      <w:hyperlink w:anchor="_Toc242096441" w:history="1">
         <w:r>
           <w:rPr>
             <w:rStyle w:val="Hyperlink"/>
@@ -6684,7 +6684,7 @@
             <w:noProof/>
             <w:webHidden/>
           </w:rPr>
-          <w:instrText xml:space="preserve"> PAGEREF _Toc242052600 \h </w:instrText>
+          <w:instrText xml:space="preserve"> PAGEREF _Toc242096441 \h </w:instrText>
         </w:r>
         <w:r>
           <w:rPr>
@@ -6760,7 +6760,7 @@
       <w:r>
         <w:fldChar w:fldCharType="separate"/>
       </w:r>
-      <w:hyperlink w:anchor="_Toc242052601" w:history="1">
+      <w:hyperlink w:anchor="_Toc242096442" w:history="1">
         <w:r>
           <w:rPr>
             <w:rStyle w:val="Hyperlink"/>
@@ -6787,7 +6787,7 @@
             <w:noProof/>
             <w:webHidden/>
           </w:rPr>
-          <w:instrText xml:space="preserve"> PAGEREF _Toc242052601 \h </w:instrText>
+          <w:instrText xml:space="preserve"> PAGEREF _Toc242096442 \h </w:instrText>
         </w:r>
         <w:r>
           <w:rPr>
@@ -6833,7 +6833,7 @@
           <w14:ligatures w14:val="standardContextual"/>
         </w:rPr>
       </w:pPr>
-      <w:hyperlink w:anchor="_Toc242052602" w:history="1">
+      <w:hyperlink w:anchor="_Toc242096443" w:history="1">
         <w:r>
           <w:rPr>
             <w:rStyle w:val="Hyperlink"/>
@@ -6860,7 +6860,7 @@
             <w:noProof/>
             <w:webHidden/>
           </w:rPr>
-          <w:instrText xml:space="preserve"> PAGEREF _Toc242052602 \h </w:instrText>
+          <w:instrText xml:space="preserve"> PAGEREF _Toc242096443 \h </w:instrText>
         </w:r>
         <w:r>
           <w:rPr>
@@ -6906,7 +6906,7 @@
           <w14:ligatures w14:val="standardContextual"/>
         </w:rPr>
       </w:pPr>
-      <w:hyperlink w:anchor="_Toc242052603" w:history="1">
+      <w:hyperlink w:anchor="_Toc242096444" w:history="1">
         <w:r>
           <w:rPr>
             <w:rStyle w:val="Hyperlink"/>
@@ -6933,7 +6933,7 @@
             <w:noProof/>
             <w:webHidden/>
           </w:rPr>
-          <w:instrText xml:space="preserve"> PAGEREF _Toc242052603 \h </w:instrText>
+          <w:instrText xml:space="preserve"> PAGEREF _Toc242096444 \h </w:instrText>
         </w:r>
         <w:r>
           <w:rPr>
@@ -6979,7 +6979,7 @@
           <w14:ligatures w14:val="standardContextual"/>
         </w:rPr>
       </w:pPr>
-      <w:hyperlink w:anchor="_Toc242052604" w:history="1">
+      <w:hyperlink w:anchor="_Toc242096445" w:history="1">
         <w:r>
           <w:rPr>
             <w:rStyle w:val="Hyperlink"/>
@@ -7006,7 +7006,7 @@
             <w:noProof/>
             <w:webHidden/>
           </w:rPr>
-          <w:instrText xml:space="preserve"> PAGEREF _Toc242052604 \h </w:instrText>
+          <w:instrText xml:space="preserve"> PAGEREF _Toc242096445 \h </w:instrText>
         </w:r>
         <w:r>
           <w:rPr>
@@ -7052,7 +7052,7 @@
           <w14:ligatures w14:val="standardContextual"/>
         </w:rPr>
       </w:pPr>
-      <w:hyperlink w:anchor="_Toc242052605" w:history="1">
+      <w:hyperlink w:anchor="_Toc242096446" w:history="1">
         <w:r>
           <w:rPr>
             <w:rStyle w:val="Hyperlink"/>
@@ -7079,7 +7079,7 @@
             <w:noProof/>
             <w:webHidden/>
           </w:rPr>
-          <w:instrText xml:space="preserve"> PAGEREF _Toc242052605 \h </w:instrText>
+          <w:instrText xml:space="preserve"> PAGEREF _Toc242096446 \h </w:instrText>
         </w:r>
         <w:r>
           <w:rPr>
@@ -7125,7 +7125,7 @@
           <w14:ligatures w14:val="standardContextual"/>
         </w:rPr>
       </w:pPr>
-      <w:hyperlink w:anchor="_Toc242052606" w:history="1">
+      <w:hyperlink w:anchor="_Toc242096447" w:history="1">
         <w:r>
           <w:rPr>
             <w:rStyle w:val="Hyperlink"/>
@@ -7152,7 +7152,7 @@
             <w:noProof/>
             <w:webHidden/>
           </w:rPr>
-          <w:instrText xml:space="preserve"> PAGEREF _Toc242052606 \h </w:instrText>
+          <w:instrText xml:space="preserve"> PAGEREF _Toc242096447 \h </w:instrText>
         </w:r>
         <w:r>
           <w:rPr>
@@ -7198,7 +7198,7 @@
           <w14:ligatures w14:val="standardContextual"/>
         </w:rPr>
       </w:pPr>
-      <w:hyperlink w:anchor="_Toc242052607" w:history="1">
+      <w:hyperlink w:anchor="_Toc242096448" w:history="1">
         <w:r>
           <w:rPr>
             <w:rStyle w:val="Hyperlink"/>
@@ -7225,7 +7225,7 @@
             <w:noProof/>
             <w:webHidden/>
           </w:rPr>
-          <w:instrText xml:space="preserve"> PAGEREF _Toc242052607 \h </w:instrText>
+          <w:instrText xml:space="preserve"> PAGEREF _Toc242096448 \h </w:instrText>
         </w:r>
         <w:r>
           <w:rPr>
@@ -7271,7 +7271,7 @@
           <w14:ligatures w14:val="standardContextual"/>
         </w:rPr>
       </w:pPr>
-      <w:hyperlink w:anchor="_Toc242052608" w:history="1">
+      <w:hyperlink w:anchor="_Toc242096449" w:history="1">
         <w:r>
           <w:rPr>
             <w:rStyle w:val="Hyperlink"/>
@@ -7298,7 +7298,7 @@
             <w:noProof/>
             <w:webHidden/>
           </w:rPr>
-          <w:instrText xml:space="preserve"> PAGEREF _Toc242052608 \h </w:instrText>
+          <w:instrText xml:space="preserve"> PAGEREF _Toc242096449 \h </w:instrText>
         </w:r>
         <w:r>
           <w:rPr>
@@ -7344,7 +7344,7 @@
           <w14:ligatures w14:val="standardContextual"/>
         </w:rPr>
       </w:pPr>
-      <w:hyperlink w:anchor="_Toc242052609" w:history="1">
+      <w:hyperlink w:anchor="_Toc242096450" w:history="1">
         <w:r>
           <w:rPr>
             <w:rStyle w:val="Hyperlink"/>
@@ -7371,7 +7371,7 @@
             <w:noProof/>
             <w:webHidden/>
           </w:rPr>
-          <w:instrText xml:space="preserve"> PAGEREF _Toc242052609 \h </w:instrText>
+          <w:instrText xml:space="preserve"> PAGEREF _Toc242096450 \h </w:instrText>
         </w:r>
         <w:r>
           <w:rPr>
@@ -7417,7 +7417,7 @@
           <w14:ligatures w14:val="standardContextual"/>
         </w:rPr>
       </w:pPr>
-      <w:hyperlink w:anchor="_Toc242052610" w:history="1">
+      <w:hyperlink w:anchor="_Toc242096451" w:history="1">
         <w:r>
           <w:rPr>
             <w:rStyle w:val="Hyperlink"/>
@@ -7444,7 +7444,7 @@
             <w:noProof/>
             <w:webHidden/>
           </w:rPr>
-          <w:instrText xml:space="preserve"> PAGEREF _Toc242052610 \h </w:instrText>
+          <w:instrText xml:space="preserve"> PAGEREF _Toc242096451 \h </w:instrText>
         </w:r>
         <w:r>
           <w:rPr>
@@ -7490,7 +7490,7 @@
           <w14:ligatures w14:val="standardContextual"/>
         </w:rPr>
       </w:pPr>
-      <w:hyperlink w:anchor="_Toc242052611" w:history="1">
+      <w:hyperlink w:anchor="_Toc242096452" w:history="1">
         <w:r>
           <w:rPr>
             <w:rStyle w:val="Hyperlink"/>
@@ -7517,7 +7517,7 @@
             <w:noProof/>
             <w:webHidden/>
           </w:rPr>
-          <w:instrText xml:space="preserve"> PAGEREF _Toc242052611 \h </w:instrText>
+          <w:instrText xml:space="preserve"> PAGEREF _Toc242096452 \h </w:instrText>
         </w:r>
         <w:r>
           <w:rPr>
@@ -7563,7 +7563,7 @@
           <w14:ligatures w14:val="standardContextual"/>
         </w:rPr>
       </w:pPr>
-      <w:hyperlink w:anchor="_Toc242052612" w:history="1">
+      <w:hyperlink w:anchor="_Toc242096453" w:history="1">
         <w:r>
           <w:rPr>
             <w:rStyle w:val="Hyperlink"/>
@@ -7590,7 +7590,7 @@
             <w:noProof/>
             <w:webHidden/>
           </w:rPr>
-          <w:instrText xml:space="preserve"> PAGEREF _Toc242052612 \h </w:instrText>
+          <w:instrText xml:space="preserve"> PAGEREF _Toc242096453 \h </w:instrText>
         </w:r>
         <w:r>
           <w:rPr>
@@ -7636,7 +7636,7 @@
           <w14:ligatures w14:val="standardContextual"/>
         </w:rPr>
       </w:pPr>
-      <w:hyperlink w:anchor="_Toc242052613" w:history="1">
+      <w:hyperlink w:anchor="_Toc242096454" w:history="1">
         <w:r>
           <w:rPr>
             <w:rStyle w:val="Hyperlink"/>
@@ -7663,7 +7663,7 @@
             <w:noProof/>
             <w:webHidden/>
           </w:rPr>
-          <w:instrText xml:space="preserve"> PAGEREF _Toc242052613 \h </w:instrText>
+          <w:instrText xml:space="preserve"> PAGEREF _Toc242096454 \h </w:instrText>
         </w:r>
         <w:r>
           <w:rPr>
@@ -7683,7 +7683,7 @@
             <w:noProof/>
             <w:webHidden/>
           </w:rPr>
-          <w:t>36</w:t>
+          <w:t>37</w:t>
         </w:r>
         <w:r>
           <w:rPr>
@@ -7709,7 +7709,7 @@
           <w14:ligatures w14:val="standardContextual"/>
         </w:rPr>
       </w:pPr>
-      <w:hyperlink w:anchor="_Toc242052614" w:history="1">
+      <w:hyperlink w:anchor="_Toc242096455" w:history="1">
         <w:r>
           <w:rPr>
             <w:rStyle w:val="Hyperlink"/>
@@ -7736,7 +7736,7 @@
             <w:noProof/>
             <w:webHidden/>
           </w:rPr>
-          <w:instrText xml:space="preserve"> PAGEREF _Toc242052614 \h </w:instrText>
+          <w:instrText xml:space="preserve"> PAGEREF _Toc242096455 \h </w:instrText>
         </w:r>
         <w:r>
           <w:rPr>
@@ -7782,7 +7782,7 @@
           <w14:ligatures w14:val="standardContextual"/>
         </w:rPr>
       </w:pPr>
-      <w:hyperlink w:anchor="_Toc242052615" w:history="1">
+      <w:hyperlink w:anchor="_Toc242096456" w:history="1">
         <w:r>
           <w:rPr>
             <w:rStyle w:val="Hyperlink"/>
@@ -7809,7 +7809,7 @@
             <w:noProof/>
             <w:webHidden/>
           </w:rPr>
-          <w:instrText xml:space="preserve"> PAGEREF _Toc242052615 \h </w:instrText>
+          <w:instrText xml:space="preserve"> PAGEREF _Toc242096456 \h </w:instrText>
         </w:r>
         <w:r>
           <w:rPr>
@@ -7855,7 +7855,7 @@
           <w14:ligatures w14:val="standardContextual"/>
         </w:rPr>
       </w:pPr>
-      <w:hyperlink w:anchor="_Toc242052616" w:history="1">
+      <w:hyperlink w:anchor="_Toc242096457" w:history="1">
         <w:r>
           <w:rPr>
             <w:rStyle w:val="Hyperlink"/>
@@ -7882,7 +7882,7 @@
             <w:noProof/>
             <w:webHidden/>
           </w:rPr>
-          <w:instrText xml:space="preserve"> PAGEREF _Toc242052616 \h </w:instrText>
+          <w:instrText xml:space="preserve"> PAGEREF _Toc242096457 \h </w:instrText>
         </w:r>
         <w:r>
           <w:rPr>
@@ -7928,7 +7928,7 @@
           <w14:ligatures w14:val="standardContextual"/>
         </w:rPr>
       </w:pPr>
-      <w:hyperlink w:anchor="_Toc242052617" w:history="1">
+      <w:hyperlink w:anchor="_Toc242096458" w:history="1">
         <w:r>
           <w:rPr>
             <w:rStyle w:val="Hyperlink"/>
@@ -7955,7 +7955,7 @@
             <w:noProof/>
             <w:webHidden/>
           </w:rPr>
-          <w:instrText xml:space="preserve"> PAGEREF _Toc242052617 \h </w:instrText>
+          <w:instrText xml:space="preserve"> PAGEREF _Toc242096458 \h </w:instrText>
         </w:r>
         <w:r>
           <w:rPr>
@@ -8001,7 +8001,7 @@
           <w14:ligatures w14:val="standardContextual"/>
         </w:rPr>
       </w:pPr>
-      <w:hyperlink w:anchor="_Toc242052618" w:history="1">
+      <w:hyperlink w:anchor="_Toc242096459" w:history="1">
         <w:r>
           <w:rPr>
             <w:rStyle w:val="Hyperlink"/>
@@ -8028,7 +8028,7 @@
             <w:noProof/>
             <w:webHidden/>
           </w:rPr>
-          <w:instrText xml:space="preserve"> PAGEREF _Toc242052618 \h </w:instrText>
+          <w:instrText xml:space="preserve"> PAGEREF _Toc242096459 \h </w:instrText>
         </w:r>
         <w:r>
           <w:rPr>
@@ -8074,7 +8074,7 @@
           <w14:ligatures w14:val="standardContextual"/>
         </w:rPr>
       </w:pPr>
-      <w:hyperlink w:anchor="_Toc242052619" w:history="1">
+      <w:hyperlink w:anchor="_Toc242096460" w:history="1">
         <w:r>
           <w:rPr>
             <w:rStyle w:val="Hyperlink"/>
@@ -8101,7 +8101,7 @@
             <w:noProof/>
             <w:webHidden/>
           </w:rPr>
-          <w:instrText xml:space="preserve"> PAGEREF _Toc242052619 \h </w:instrText>
+          <w:instrText xml:space="preserve"> PAGEREF _Toc242096460 \h </w:instrText>
         </w:r>
         <w:r>
           <w:rPr>
@@ -8147,7 +8147,7 @@
           <w14:ligatures w14:val="standardContextual"/>
         </w:rPr>
       </w:pPr>
-      <w:hyperlink w:anchor="_Toc242052620" w:history="1">
+      <w:hyperlink w:anchor="_Toc242096461" w:history="1">
         <w:r>
           <w:rPr>
             <w:rStyle w:val="Hyperlink"/>
@@ -8174,7 +8174,7 @@
             <w:noProof/>
             <w:webHidden/>
           </w:rPr>
-          <w:instrText xml:space="preserve"> PAGEREF _Toc242052620 \h </w:instrText>
+          <w:instrText xml:space="preserve"> PAGEREF _Toc242096461 \h </w:instrText>
         </w:r>
         <w:r>
           <w:rPr>
@@ -8220,7 +8220,7 @@
           <w14:ligatures w14:val="standardContextual"/>
         </w:rPr>
       </w:pPr>
-      <w:hyperlink w:anchor="_Toc242052621" w:history="1">
+      <w:hyperlink w:anchor="_Toc242096462" w:history="1">
         <w:r>
           <w:rPr>
             <w:rStyle w:val="Hyperlink"/>
@@ -8247,7 +8247,7 @@
             <w:noProof/>
             <w:webHidden/>
           </w:rPr>
-          <w:instrText xml:space="preserve"> PAGEREF _Toc242052621 \h </w:instrText>
+          <w:instrText xml:space="preserve"> PAGEREF _Toc242096462 \h </w:instrText>
         </w:r>
         <w:r>
           <w:rPr>
@@ -8293,7 +8293,7 @@
           <w14:ligatures w14:val="standardContextual"/>
         </w:rPr>
       </w:pPr>
-      <w:hyperlink w:anchor="_Toc242052622" w:history="1">
+      <w:hyperlink w:anchor="_Toc242096463" w:history="1">
         <w:r>
           <w:rPr>
             <w:rStyle w:val="Hyperlink"/>
@@ -8320,7 +8320,7 @@
             <w:noProof/>
             <w:webHidden/>
           </w:rPr>
-          <w:instrText xml:space="preserve"> PAGEREF _Toc242052622 \h </w:instrText>
+          <w:instrText xml:space="preserve"> PAGEREF _Toc242096463 \h </w:instrText>
         </w:r>
         <w:r>
           <w:rPr>
@@ -8366,7 +8366,7 @@
           <w14:ligatures w14:val="standardContextual"/>
         </w:rPr>
       </w:pPr>
-      <w:hyperlink w:anchor="_Toc242052623" w:history="1">
+      <w:hyperlink w:anchor="_Toc242096464" w:history="1">
         <w:r>
           <w:rPr>
             <w:rStyle w:val="Hyperlink"/>
@@ -8393,7 +8393,7 @@
             <w:noProof/>
             <w:webHidden/>
           </w:rPr>
-          <w:instrText xml:space="preserve"> PAGEREF _Toc242052623 \h </w:instrText>
+          <w:instrText xml:space="preserve"> PAGEREF _Toc242096464 \h </w:instrText>
         </w:r>
         <w:r>
           <w:rPr>
@@ -8439,7 +8439,7 @@
           <w14:ligatures w14:val="standardContextual"/>
         </w:rPr>
       </w:pPr>
-      <w:hyperlink w:anchor="_Toc242052624" w:history="1">
+      <w:hyperlink w:anchor="_Toc242096465" w:history="1">
         <w:r>
           <w:rPr>
             <w:rStyle w:val="Hyperlink"/>
@@ -8466,7 +8466,7 @@
             <w:noProof/>
             <w:webHidden/>
           </w:rPr>
-          <w:instrText xml:space="preserve"> PAGEREF _Toc242052624 \h </w:instrText>
+          <w:instrText xml:space="preserve"> PAGEREF _Toc242096465 \h </w:instrText>
         </w:r>
         <w:r>
           <w:rPr>
@@ -8512,7 +8512,7 @@
           <w14:ligatures w14:val="standardContextual"/>
         </w:rPr>
       </w:pPr>
-      <w:hyperlink w:anchor="_Toc242052625" w:history="1">
+      <w:hyperlink w:anchor="_Toc242096466" w:history="1">
         <w:r>
           <w:rPr>
             <w:rStyle w:val="Hyperlink"/>
@@ -8539,7 +8539,7 @@
             <w:noProof/>
             <w:webHidden/>
           </w:rPr>
-          <w:instrText xml:space="preserve"> PAGEREF _Toc242052625 \h </w:instrText>
+          <w:instrText xml:space="preserve"> PAGEREF _Toc242096466 \h </w:instrText>
         </w:r>
         <w:r>
           <w:rPr>
@@ -8613,7 +8613,7 @@
       <w:r>
         <w:fldChar w:fldCharType="separate"/>
       </w:r>
-      <w:hyperlink w:anchor="_Toc242052626" w:history="1">
+      <w:hyperlink w:anchor="_Toc242096467" w:history="1">
         <w:r>
           <w:rPr>
             <w:rStyle w:val="Hyperlink"/>
@@ -8640,7 +8640,7 @@
             <w:noProof/>
             <w:webHidden/>
           </w:rPr>
-          <w:instrText xml:space="preserve"> PAGEREF _Toc242052626 \h </w:instrText>
+          <w:instrText xml:space="preserve"> PAGEREF _Toc242096467 \h </w:instrText>
         </w:r>
         <w:r>
           <w:rPr>
@@ -8686,7 +8686,7 @@
           <w14:ligatures w14:val="standardContextual"/>
         </w:rPr>
       </w:pPr>
-      <w:hyperlink w:anchor="_Toc242052627" w:history="1">
+      <w:hyperlink w:anchor="_Toc242096468" w:history="1">
         <w:r>
           <w:rPr>
             <w:rStyle w:val="Hyperlink"/>
@@ -8713,7 +8713,7 @@
             <w:noProof/>
             <w:webHidden/>
           </w:rPr>
-          <w:instrText xml:space="preserve"> PAGEREF _Toc242052627 \h </w:instrText>
+          <w:instrText xml:space="preserve"> PAGEREF _Toc242096468 \h </w:instrText>
         </w:r>
         <w:r>
           <w:rPr>
@@ -8759,7 +8759,7 @@
           <w14:ligatures w14:val="standardContextual"/>
         </w:rPr>
       </w:pPr>
-      <w:hyperlink w:anchor="_Toc242052628" w:history="1">
+      <w:hyperlink w:anchor="_Toc242096469" w:history="1">
         <w:r>
           <w:rPr>
             <w:rStyle w:val="Hyperlink"/>
@@ -8786,7 +8786,7 @@
             <w:noProof/>
             <w:webHidden/>
           </w:rPr>
-          <w:instrText xml:space="preserve"> PAGEREF _Toc242052628 \h </w:instrText>
+          <w:instrText xml:space="preserve"> PAGEREF _Toc242096469 \h </w:instrText>
         </w:r>
         <w:r>
           <w:rPr>
@@ -8832,7 +8832,7 @@
           <w14:ligatures w14:val="standardContextual"/>
         </w:rPr>
       </w:pPr>
-      <w:hyperlink w:anchor="_Toc242052629" w:history="1">
+      <w:hyperlink w:anchor="_Toc242096470" w:history="1">
         <w:r>
           <w:rPr>
             <w:rStyle w:val="Hyperlink"/>
@@ -8859,7 +8859,7 @@
             <w:noProof/>
             <w:webHidden/>
           </w:rPr>
-          <w:instrText xml:space="preserve"> PAGEREF _Toc242052629 \h </w:instrText>
+          <w:instrText xml:space="preserve"> PAGEREF _Toc242096470 \h </w:instrText>
         </w:r>
         <w:r>
           <w:rPr>
@@ -8905,7 +8905,7 @@
           <w14:ligatures w14:val="standardContextual"/>
         </w:rPr>
       </w:pPr>
-      <w:hyperlink w:anchor="_Toc242052630" w:history="1">
+      <w:hyperlink w:anchor="_Toc242096471" w:history="1">
         <w:r>
           <w:rPr>
             <w:rStyle w:val="Hyperlink"/>
@@ -8932,7 +8932,7 @@
             <w:noProof/>
             <w:webHidden/>
           </w:rPr>
-          <w:instrText xml:space="preserve"> PAGEREF _Toc242052630 \h </w:instrText>
+          <w:instrText xml:space="preserve"> PAGEREF _Toc242096471 \h </w:instrText>
         </w:r>
         <w:r>
           <w:rPr>
@@ -8978,7 +8978,7 @@
           <w14:ligatures w14:val="standardContextual"/>
         </w:rPr>
       </w:pPr>
-      <w:hyperlink w:anchor="_Toc242052631" w:history="1">
+      <w:hyperlink w:anchor="_Toc242096472" w:history="1">
         <w:r>
           <w:rPr>
             <w:rStyle w:val="Hyperlink"/>
@@ -9013,7 +9013,7 @@
             <w:noProof/>
             <w:webHidden/>
           </w:rPr>
-          <w:instrText xml:space="preserve"> PAGEREF _Toc242052631 \h </w:instrText>
+          <w:instrText xml:space="preserve"> PAGEREF _Toc242096472 \h </w:instrText>
         </w:r>
         <w:r>
           <w:rPr>
@@ -9059,7 +9059,7 @@
           <w14:ligatures w14:val="standardContextual"/>
         </w:rPr>
       </w:pPr>
-      <w:hyperlink w:anchor="_Toc242052632" w:history="1">
+      <w:hyperlink w:anchor="_Toc242096473" w:history="1">
         <w:r>
           <w:rPr>
             <w:rStyle w:val="Hyperlink"/>
@@ -9086,7 +9086,7 @@
             <w:noProof/>
             <w:webHidden/>
           </w:rPr>
-          <w:instrText xml:space="preserve"> PAGEREF _Toc242052632 \h </w:instrText>
+          <w:instrText xml:space="preserve"> PAGEREF _Toc242096473 \h </w:instrText>
         </w:r>
         <w:r>
           <w:rPr>
@@ -9132,7 +9132,7 @@
           <w14:ligatures w14:val="standardContextual"/>
         </w:rPr>
       </w:pPr>
-      <w:hyperlink w:anchor="_Toc242052633" w:history="1">
+      <w:hyperlink w:anchor="_Toc242096474" w:history="1">
         <w:r>
           <w:rPr>
             <w:rStyle w:val="Hyperlink"/>
@@ -9159,7 +9159,7 @@
             <w:noProof/>
             <w:webHidden/>
           </w:rPr>
-          <w:instrText xml:space="preserve"> PAGEREF _Toc242052633 \h </w:instrText>
+          <w:instrText xml:space="preserve"> PAGEREF _Toc242096474 \h </w:instrText>
         </w:r>
         <w:r>
           <w:rPr>
@@ -9205,7 +9205,7 @@
           <w14:ligatures w14:val="standardContextual"/>
         </w:rPr>
       </w:pPr>
-      <w:hyperlink w:anchor="_Toc242052634" w:history="1">
+      <w:hyperlink w:anchor="_Toc242096475" w:history="1">
         <w:r>
           <w:rPr>
             <w:rStyle w:val="Hyperlink"/>
@@ -9232,7 +9232,7 @@
             <w:noProof/>
             <w:webHidden/>
           </w:rPr>
-          <w:instrText xml:space="preserve"> PAGEREF _Toc242052634 \h </w:instrText>
+          <w:instrText xml:space="preserve"> PAGEREF _Toc242096475 \h </w:instrText>
         </w:r>
         <w:r>
           <w:rPr>
@@ -9278,7 +9278,7 @@
           <w14:ligatures w14:val="standardContextual"/>
         </w:rPr>
       </w:pPr>
-      <w:hyperlink w:anchor="_Toc242052635" w:history="1">
+      <w:hyperlink w:anchor="_Toc242096476" w:history="1">
         <w:r>
           <w:rPr>
             <w:rStyle w:val="Hyperlink"/>
@@ -9305,7 +9305,7 @@
             <w:noProof/>
             <w:webHidden/>
           </w:rPr>
-          <w:instrText xml:space="preserve"> PAGEREF _Toc242052635 \h </w:instrText>
+          <w:instrText xml:space="preserve"> PAGEREF _Toc242096476 \h </w:instrText>
         </w:r>
         <w:r>
           <w:rPr>
@@ -9351,7 +9351,7 @@
           <w14:ligatures w14:val="standardContextual"/>
         </w:rPr>
       </w:pPr>
-      <w:hyperlink w:anchor="_Toc242052636" w:history="1">
+      <w:hyperlink w:anchor="_Toc242096477" w:history="1">
         <w:r>
           <w:rPr>
             <w:rStyle w:val="Hyperlink"/>
@@ -9378,7 +9378,7 @@
             <w:noProof/>
             <w:webHidden/>
           </w:rPr>
-          <w:instrText xml:space="preserve"> PAGEREF _Toc242052636 \h </w:instrText>
+          <w:instrText xml:space="preserve"> PAGEREF _Toc242096477 \h </w:instrText>
         </w:r>
         <w:r>
           <w:rPr>
@@ -9424,7 +9424,7 @@
           <w14:ligatures w14:val="standardContextual"/>
         </w:rPr>
       </w:pPr>
-      <w:hyperlink w:anchor="_Toc242052637" w:history="1">
+      <w:hyperlink w:anchor="_Toc242096478" w:history="1">
         <w:r>
           <w:rPr>
             <w:rStyle w:val="Hyperlink"/>
@@ -9451,7 +9451,7 @@
             <w:noProof/>
             <w:webHidden/>
           </w:rPr>
-          <w:instrText xml:space="preserve"> PAGEREF _Toc242052637 \h </w:instrText>
+          <w:instrText xml:space="preserve"> PAGEREF _Toc242096478 \h </w:instrText>
         </w:r>
         <w:r>
           <w:rPr>
@@ -9497,7 +9497,7 @@
           <w14:ligatures w14:val="standardContextual"/>
         </w:rPr>
       </w:pPr>
-      <w:hyperlink w:anchor="_Toc242052638" w:history="1">
+      <w:hyperlink w:anchor="_Toc242096479" w:history="1">
         <w:r>
           <w:rPr>
             <w:rStyle w:val="Hyperlink"/>
@@ -9524,7 +9524,7 @@
             <w:noProof/>
             <w:webHidden/>
           </w:rPr>
-          <w:instrText xml:space="preserve"> PAGEREF _Toc242052638 \h </w:instrText>
+          <w:instrText xml:space="preserve"> PAGEREF _Toc242096479 \h </w:instrText>
         </w:r>
         <w:r>
           <w:rPr>
@@ -9570,7 +9570,7 @@
           <w14:ligatures w14:val="standardContextual"/>
         </w:rPr>
       </w:pPr>
-      <w:hyperlink w:anchor="_Toc242052639" w:history="1">
+      <w:hyperlink w:anchor="_Toc242096480" w:history="1">
         <w:r>
           <w:rPr>
             <w:rStyle w:val="Hyperlink"/>
@@ -9597,7 +9597,7 @@
             <w:noProof/>
             <w:webHidden/>
           </w:rPr>
-          <w:instrText xml:space="preserve"> PAGEREF _Toc242052639 \h </w:instrText>
+          <w:instrText xml:space="preserve"> PAGEREF _Toc242096480 \h </w:instrText>
         </w:r>
         <w:r>
           <w:rPr>
@@ -9643,7 +9643,7 @@
           <w14:ligatures w14:val="standardContextual"/>
         </w:rPr>
       </w:pPr>
-      <w:hyperlink w:anchor="_Toc242052640" w:history="1">
+      <w:hyperlink w:anchor="_Toc242096481" w:history="1">
         <w:r>
           <w:rPr>
             <w:rStyle w:val="Hyperlink"/>
@@ -9670,7 +9670,7 @@
             <w:noProof/>
             <w:webHidden/>
           </w:rPr>
-          <w:instrText xml:space="preserve"> PAGEREF _Toc242052640 \h </w:instrText>
+          <w:instrText xml:space="preserve"> PAGEREF _Toc242096481 \h </w:instrText>
         </w:r>
         <w:r>
           <w:rPr>
@@ -9711,7 +9711,7 @@
         <w:pStyle w:val="Heading1"/>
         <w:pageBreakBefore/>
       </w:pPr>
-      <w:bookmarkStart w:id="0" w:name="_Toc242052528"/>
+      <w:bookmarkStart w:id="0" w:name="_Toc242096369"/>
       <w:r>
         <w:lastRenderedPageBreak/>
         <w:t>CHƯƠNG 1. GIỚI THIỆU</w:t>
@@ -9722,7 +9722,7 @@
       <w:pPr>
         <w:pStyle w:val="Heading2"/>
       </w:pPr>
-      <w:bookmarkStart w:id="1" w:name="_Toc242052529"/>
+      <w:bookmarkStart w:id="1" w:name="_Toc242096370"/>
       <w:r>
         <w:t>1.1. Mục đích của tài liệu</w:t>
       </w:r>
@@ -9769,7 +9769,7 @@
       <w:pPr>
         <w:pStyle w:val="Heading2"/>
       </w:pPr>
-      <w:bookmarkStart w:id="2" w:name="_Toc242052530"/>
+      <w:bookmarkStart w:id="2" w:name="_Toc242096371"/>
       <w:r>
         <w:t>1.2. Tổng quan phần mềm</w:t>
       </w:r>
@@ -9916,7 +9916,7 @@
       <w:pPr>
         <w:pStyle w:val="Heading2"/>
       </w:pPr>
-      <w:bookmarkStart w:id="3" w:name="_Toc242052531"/>
+      <w:bookmarkStart w:id="3" w:name="_Toc242096372"/>
       <w:r>
         <w:t>1.3. Vai trò người dùng và chức năng</w:t>
       </w:r>
@@ -9954,7 +9954,7 @@
       <w:pPr>
         <w:pStyle w:val="TableCaption"/>
       </w:pPr>
-      <w:bookmarkStart w:id="4" w:name="_Toc242052626"/>
+      <w:bookmarkStart w:id="4" w:name="_Toc242096467"/>
       <w:r>
         <w:t>Bảng 1.1. Chức năng hiển thị theo vai trò</w:t>
       </w:r>
@@ -14157,7 +14157,7 @@
       <w:pPr>
         <w:pStyle w:val="Heading2"/>
       </w:pPr>
-      <w:bookmarkStart w:id="5" w:name="_Toc242052532"/>
+      <w:bookmarkStart w:id="5" w:name="_Toc242096373"/>
       <w:r>
         <w:t>1.4. Yêu cầu hệ thống</w:t>
       </w:r>
@@ -14167,7 +14167,7 @@
       <w:pPr>
         <w:pStyle w:val="TableCaption"/>
       </w:pPr>
-      <w:bookmarkStart w:id="6" w:name="_Toc242052627"/>
+      <w:bookmarkStart w:id="6" w:name="_Toc242096468"/>
       <w:r>
         <w:t>Bảng 1.2. Yêu cầu phần cứng và phần mềm</w:t>
       </w:r>
@@ -14759,7 +14759,7 @@
       <w:pPr>
         <w:pStyle w:val="Heading2"/>
       </w:pPr>
-      <w:bookmarkStart w:id="7" w:name="_Toc242052533"/>
+      <w:bookmarkStart w:id="7" w:name="_Toc242096374"/>
       <w:r>
         <w:t>1.5. Các bước cài đặt tổng quát</w:t>
       </w:r>
@@ -14911,7 +14911,7 @@
       <w:pPr>
         <w:pStyle w:val="TableCaption"/>
       </w:pPr>
-      <w:bookmarkStart w:id="8" w:name="_Toc242052628"/>
+      <w:bookmarkStart w:id="8" w:name="_Toc242096469"/>
       <w:r>
         <w:t>Bảng 1.3. Chọn phương án SQL Server theo máy</w:t>
       </w:r>
@@ -15515,7 +15515,7 @@
       <w:pPr>
         <w:pStyle w:val="Heading2"/>
       </w:pPr>
-      <w:bookmarkStart w:id="9" w:name="_Toc242052534"/>
+      <w:bookmarkStart w:id="9" w:name="_Toc242096375"/>
       <w:r>
         <w:t>1.6. Quy ước trình bày</w:t>
       </w:r>
@@ -15764,7 +15764,7 @@
         <w:pStyle w:val="Heading1"/>
         <w:pageBreakBefore/>
       </w:pPr>
-      <w:bookmarkStart w:id="10" w:name="_Toc242052535"/>
+      <w:bookmarkStart w:id="10" w:name="_Toc242096376"/>
       <w:r>
         <w:lastRenderedPageBreak/>
         <w:t>CHƯƠNG 2. CÀI ĐẶT SQL SERVER VÀ KHỞI TẠO CƠ SỞ DỮ LIỆU</w:t>
@@ -15821,7 +15821,7 @@
       <w:pPr>
         <w:pStyle w:val="Heading2"/>
       </w:pPr>
-      <w:bookmarkStart w:id="11" w:name="_Toc242052536"/>
+      <w:bookmarkStart w:id="11" w:name="_Toc242096377"/>
       <w:r>
         <w:t>2.1. Tải mã nguồn</w:t>
       </w:r>
@@ -15942,7 +15942,7 @@
       <w:pPr>
         <w:pStyle w:val="Heading2"/>
       </w:pPr>
-      <w:bookmarkStart w:id="12" w:name="_Toc242052537"/>
+      <w:bookmarkStart w:id="12" w:name="_Toc242096378"/>
       <w:r>
         <w:t>2.2. Phương án A - SQL Server trong Docker</w:t>
       </w:r>
@@ -15952,7 +15952,7 @@
       <w:pPr>
         <w:pStyle w:val="Heading3"/>
       </w:pPr>
-      <w:bookmarkStart w:id="13" w:name="_Toc242052538"/>
+      <w:bookmarkStart w:id="13" w:name="_Toc242096379"/>
       <w:r>
         <w:t>2.2.1. Cài Docker Desktop</w:t>
       </w:r>
@@ -16294,7 +16294,7 @@
       <w:pPr>
         <w:pStyle w:val="Heading3"/>
       </w:pPr>
-      <w:bookmarkStart w:id="14" w:name="_Toc242052539"/>
+      <w:bookmarkStart w:id="14" w:name="_Toc242096380"/>
       <w:r>
         <w:t>2.2.2. Khởi động SQL Server</w:t>
       </w:r>
@@ -16722,7 +16722,7 @@
       <w:pPr>
         <w:pStyle w:val="Heading3"/>
       </w:pPr>
-      <w:bookmarkStart w:id="15" w:name="_Toc242052540"/>
+      <w:bookmarkStart w:id="15" w:name="_Toc242096381"/>
       <w:r>
         <w:t>2.2.3. Khởi tạo CSDL</w:t>
       </w:r>
@@ -17154,7 +17154,7 @@
       <w:pPr>
         <w:pStyle w:val="Heading3"/>
       </w:pPr>
-      <w:bookmarkStart w:id="16" w:name="_Toc242052541"/>
+      <w:bookmarkStart w:id="16" w:name="_Toc242096382"/>
       <w:r>
         <w:t>2.2.4. Bật, tắt SQL Server hằng ngày</w:t>
       </w:r>
@@ -17164,7 +17164,7 @@
       <w:pPr>
         <w:pStyle w:val="TableCaption"/>
       </w:pPr>
-      <w:bookmarkStart w:id="17" w:name="_Toc242052629"/>
+      <w:bookmarkStart w:id="17" w:name="_Toc242096470"/>
       <w:r>
         <w:t>Bảng 2.1. Các lệnh Docker thường dùng</w:t>
       </w:r>
@@ -17581,7 +17581,7 @@
       <w:pPr>
         <w:pStyle w:val="Heading2"/>
       </w:pPr>
-      <w:bookmarkStart w:id="18" w:name="_Toc242052542"/>
+      <w:bookmarkStart w:id="18" w:name="_Toc242096383"/>
       <w:r>
         <w:t>2.3. Phương án B - SQL Server cài trực tiếp trên Windows</w:t>
       </w:r>
@@ -17591,7 +17591,7 @@
       <w:pPr>
         <w:pStyle w:val="Heading3"/>
       </w:pPr>
-      <w:bookmarkStart w:id="19" w:name="_Toc242052543"/>
+      <w:bookmarkStart w:id="19" w:name="_Toc242096384"/>
       <w:r>
         <w:t>2.3.1. Cài SQL Server</w:t>
       </w:r>
@@ -18372,7 +18372,7 @@
       <w:pPr>
         <w:pStyle w:val="Heading3"/>
       </w:pPr>
-      <w:bookmarkStart w:id="20" w:name="_Toc242052544"/>
+      <w:bookmarkStart w:id="20" w:name="_Toc242096385"/>
       <w:r>
         <w:lastRenderedPageBreak/>
         <w:t>2.3.2. Cài công cụ quản trị và driver</w:t>
@@ -18563,7 +18563,7 @@
       <w:pPr>
         <w:pStyle w:val="Heading3"/>
       </w:pPr>
-      <w:bookmarkStart w:id="21" w:name="_Toc242052545"/>
+      <w:bookmarkStart w:id="21" w:name="_Toc242096386"/>
       <w:r>
         <w:t>2.3.3. Bật kết nối TCP/IP</w:t>
       </w:r>
@@ -18964,7 +18964,7 @@
       <w:pPr>
         <w:pStyle w:val="Heading3"/>
       </w:pPr>
-      <w:bookmarkStart w:id="22" w:name="_Toc242052546"/>
+      <w:bookmarkStart w:id="22" w:name="_Toc242096387"/>
       <w:r>
         <w:t>2.3.4. Khởi tạo CSDL</w:t>
       </w:r>
@@ -19514,7 +19514,7 @@
       <w:pPr>
         <w:pStyle w:val="Heading3"/>
       </w:pPr>
-      <w:bookmarkStart w:id="23" w:name="_Toc242052547"/>
+      <w:bookmarkStart w:id="23" w:name="_Toc242096388"/>
       <w:r>
         <w:lastRenderedPageBreak/>
         <w:t>2.3.5. Cho máy khác kết nối tới (không bắt buộc)</w:t>
@@ -19607,7 +19607,7 @@
       <w:pPr>
         <w:pStyle w:val="Heading2"/>
       </w:pPr>
-      <w:bookmarkStart w:id="24" w:name="_Toc242052548"/>
+      <w:bookmarkStart w:id="24" w:name="_Toc242096389"/>
       <w:r>
         <w:t>2.4. Nạp lại dữ liệu mẫu trước buổi demo</w:t>
       </w:r>
@@ -19719,7 +19719,7 @@
         <w:pStyle w:val="Heading1"/>
         <w:pageBreakBefore/>
       </w:pPr>
-      <w:bookmarkStart w:id="25" w:name="_Toc242052549"/>
+      <w:bookmarkStart w:id="25" w:name="_Toc242096390"/>
       <w:r>
         <w:lastRenderedPageBreak/>
         <w:t>CHƯƠNG 3. CÀI ĐẶT ỨNG DỤNG</w:t>
@@ -19730,7 +19730,7 @@
       <w:pPr>
         <w:pStyle w:val="Heading2"/>
       </w:pPr>
-      <w:bookmarkStart w:id="26" w:name="_Toc242052550"/>
+      <w:bookmarkStart w:id="26" w:name="_Toc242096391"/>
       <w:r>
         <w:t>3.1. Tải bộ cài</w:t>
       </w:r>
@@ -19768,7 +19768,7 @@
       <w:pPr>
         <w:pStyle w:val="TableCaption"/>
       </w:pPr>
-      <w:bookmarkStart w:id="27" w:name="_Toc242052630"/>
+      <w:bookmarkStart w:id="27" w:name="_Toc242096471"/>
       <w:r>
         <w:t>Bảng 3.1. Các file cài đặt</w:t>
       </w:r>
@@ -20211,7 +20211,7 @@
       <w:pPr>
         <w:pStyle w:val="Heading2"/>
       </w:pPr>
-      <w:bookmarkStart w:id="28" w:name="_Toc242052551"/>
+      <w:bookmarkStart w:id="28" w:name="_Toc242096392"/>
       <w:r>
         <w:t>3.2. Cài đặt trên macOS</w:t>
       </w:r>
@@ -20603,7 +20603,7 @@
       <w:pPr>
         <w:pStyle w:val="Heading2"/>
       </w:pPr>
-      <w:bookmarkStart w:id="29" w:name="_Toc242052552"/>
+      <w:bookmarkStart w:id="29" w:name="_Toc242096393"/>
       <w:r>
         <w:t>3.3. Cài đặt trên Windows</w:t>
       </w:r>
@@ -20613,7 +20613,7 @@
       <w:pPr>
         <w:pStyle w:val="Heading3"/>
       </w:pPr>
-      <w:bookmarkStart w:id="30" w:name="_Toc242052553"/>
+      <w:bookmarkStart w:id="30" w:name="_Toc242096394"/>
       <w:r>
         <w:t>3.3.1. Dùng bộ cài setup.exe</w:t>
       </w:r>
@@ -21059,7 +21059,7 @@
         </w:rPr>
         <w:lastRenderedPageBreak/>
         <w:drawing>
-          <wp:inline distT="0" distB="0" distL="0" distR="0" wp14:anchorId="108D15FC" wp14:editId="0F9115EE">
+          <wp:inline distT="0" distB="0" distL="0" distR="0" wp14:anchorId="7734EE67" wp14:editId="44AAD1D7">
             <wp:extent cx="3420000" cy="3198254"/>
             <wp:effectExtent l="0" t="0" r="0" b="0"/>
             <wp:docPr id="522444761" name="Picture 522444761"/>
@@ -21099,7 +21099,7 @@
       <w:pPr>
         <w:pStyle w:val="FigureCaption"/>
       </w:pPr>
-      <w:bookmarkStart w:id="31" w:name="_Toc242052601"/>
+      <w:bookmarkStart w:id="31" w:name="_Toc242096442"/>
       <w:r>
         <w:t>Hình 3.1. Cảnh báo SmartScreen khi chạy bộ cài</w:t>
       </w:r>
@@ -21116,7 +21116,7 @@
           <w:noProof/>
         </w:rPr>
         <w:drawing>
-          <wp:inline distT="0" distB="0" distL="0" distR="0" wp14:anchorId="4C02F379" wp14:editId="284342A6">
+          <wp:inline distT="0" distB="0" distL="0" distR="0" wp14:anchorId="6840F8A6" wp14:editId="1F8FE674">
             <wp:extent cx="4500000" cy="3458417"/>
             <wp:effectExtent l="0" t="0" r="0" b="0"/>
             <wp:docPr id="522444762" name="Picture 522444762"/>
@@ -21156,7 +21156,7 @@
       <w:pPr>
         <w:pStyle w:val="FigureCaption"/>
       </w:pPr>
-      <w:bookmarkStart w:id="32" w:name="_Toc242052602"/>
+      <w:bookmarkStart w:id="32" w:name="_Toc242096443"/>
       <w:r>
         <w:t>Hình 3.2. Bước cuối của bộ cài QLTTTA trên Windows</w:t>
       </w:r>
@@ -21166,7 +21166,7 @@
       <w:pPr>
         <w:pStyle w:val="Heading3"/>
       </w:pPr>
-      <w:bookmarkStart w:id="33" w:name="_Toc242052554"/>
+      <w:bookmarkStart w:id="33" w:name="_Toc242096395"/>
       <w:r>
         <w:t>3.3.2. Dùng bản portable</w:t>
       </w:r>
@@ -21213,7 +21213,7 @@
       <w:pPr>
         <w:pStyle w:val="Heading3"/>
       </w:pPr>
-      <w:bookmarkStart w:id="34" w:name="_Toc242052555"/>
+      <w:bookmarkStart w:id="34" w:name="_Toc242096396"/>
       <w:r>
         <w:lastRenderedPageBreak/>
         <w:t>3.3.3. Driver kết nối</w:t>
@@ -21270,7 +21270,7 @@
       <w:pPr>
         <w:pStyle w:val="Heading2"/>
       </w:pPr>
-      <w:bookmarkStart w:id="35" w:name="_Toc242052556"/>
+      <w:bookmarkStart w:id="35" w:name="_Toc242096397"/>
       <w:r>
         <w:t>3.4. Nơi lưu cấu hình và gỡ cài đặt</w:t>
       </w:r>
@@ -21290,7 +21290,7 @@
       <w:pPr>
         <w:pStyle w:val="TableCaption"/>
       </w:pPr>
-      <w:bookmarkStart w:id="36" w:name="_Toc242052631"/>
+      <w:bookmarkStart w:id="36" w:name="_Toc242096472"/>
       <w:r>
         <w:t>Bảng 3.2. Cấu hình đã lưu và cách gỡ ứng dụng</w:t>
       </w:r>
@@ -21859,7 +21859,7 @@
       <w:pPr>
         <w:pStyle w:val="Heading2"/>
       </w:pPr>
-      <w:bookmarkStart w:id="37" w:name="_Toc242052557"/>
+      <w:bookmarkStart w:id="37" w:name="_Toc242096398"/>
       <w:r>
         <w:t>3.5. Chạy từ mã nguồn (dành cho nhóm phát triển)</w:t>
       </w:r>
@@ -22392,7 +22392,7 @@
         <w:pStyle w:val="Heading1"/>
         <w:pageBreakBefore/>
       </w:pPr>
-      <w:bookmarkStart w:id="38" w:name="_Toc242052558"/>
+      <w:bookmarkStart w:id="38" w:name="_Toc242096399"/>
       <w:r>
         <w:lastRenderedPageBreak/>
         <w:t>CHƯƠNG 4. ĐĂNG NHẬP VÀ GIAO DIỆN CHUNG</w:t>
@@ -22403,7 +22403,7 @@
       <w:pPr>
         <w:pStyle w:val="Heading2"/>
       </w:pPr>
-      <w:bookmarkStart w:id="39" w:name="_Toc242052559"/>
+      <w:bookmarkStart w:id="39" w:name="_Toc242096400"/>
       <w:r>
         <w:t>4.1. Mở ứng dụng</w:t>
       </w:r>
@@ -22560,7 +22560,7 @@
           <w:noProof/>
         </w:rPr>
         <w:drawing>
-          <wp:inline distT="0" distB="0" distL="0" distR="0" wp14:anchorId="37609E0A" wp14:editId="109BC745">
+          <wp:inline distT="0" distB="0" distL="0" distR="0" wp14:anchorId="6E88A410" wp14:editId="0B0AF54C">
             <wp:extent cx="4860000" cy="2938605"/>
             <wp:effectExtent l="0" t="0" r="0" b="0"/>
             <wp:docPr id="522444763" name="Picture 522444763"/>
@@ -22600,7 +22600,7 @@
       <w:pPr>
         <w:pStyle w:val="FigureCaption"/>
       </w:pPr>
-      <w:bookmarkStart w:id="40" w:name="_Toc242052603"/>
+      <w:bookmarkStart w:id="40" w:name="_Toc242096444"/>
       <w:r>
         <w:t>Hình 4.1. Màn hình đăng nhập</w:t>
       </w:r>
@@ -22610,7 +22610,7 @@
       <w:pPr>
         <w:pStyle w:val="Heading2"/>
       </w:pPr>
-      <w:bookmarkStart w:id="41" w:name="_Toc242052560"/>
+      <w:bookmarkStart w:id="41" w:name="_Toc242096401"/>
       <w:r>
         <w:t>4.2. Cấu hình máy chủ (lần chạy đầu tiên)</w:t>
       </w:r>
@@ -22761,7 +22761,7 @@
         </w:rPr>
         <w:lastRenderedPageBreak/>
         <w:drawing>
-          <wp:inline distT="0" distB="0" distL="0" distR="0" wp14:anchorId="4338492E" wp14:editId="615C3C81">
+          <wp:inline distT="0" distB="0" distL="0" distR="0" wp14:anchorId="3E712546" wp14:editId="15AFBEE8">
             <wp:extent cx="5040000" cy="3360000"/>
             <wp:effectExtent l="0" t="0" r="0" b="0"/>
             <wp:docPr id="522444764" name="Picture 522444764"/>
@@ -22801,7 +22801,7 @@
       <w:pPr>
         <w:pStyle w:val="FigureCaption"/>
       </w:pPr>
-      <w:bookmarkStart w:id="42" w:name="_Toc242052604"/>
+      <w:bookmarkStart w:id="42" w:name="_Toc242096445"/>
       <w:r>
         <w:t>Hình 4.2. Khung cấu hình máy chủ SQL Server</w:t>
       </w:r>
@@ -22811,7 +22811,7 @@
       <w:pPr>
         <w:pStyle w:val="TableCaption"/>
       </w:pPr>
-      <w:bookmarkStart w:id="43" w:name="_Toc242052632"/>
+      <w:bookmarkStart w:id="43" w:name="_Toc242096473"/>
       <w:r>
         <w:t>Bảng 4.1. Giá trị ô Máy chủ theo cách cài SQL Server</w:t>
       </w:r>
@@ -23251,7 +23251,7 @@
       <w:pPr>
         <w:pStyle w:val="Heading2"/>
       </w:pPr>
-      <w:bookmarkStart w:id="44" w:name="_Toc242052561"/>
+      <w:bookmarkStart w:id="44" w:name="_Toc242096402"/>
       <w:r>
         <w:t>4.3. Đăng nhập</w:t>
       </w:r>
@@ -23325,7 +23325,7 @@
       <w:pPr>
         <w:pStyle w:val="TableCaption"/>
       </w:pPr>
-      <w:bookmarkStart w:id="45" w:name="_Toc242052633"/>
+      <w:bookmarkStart w:id="45" w:name="_Toc242096474"/>
       <w:r>
         <w:t>Bảng 4.2. Tài khoản demo trong dữ liệu mẫu</w:t>
       </w:r>
@@ -24651,7 +24651,7 @@
       <w:pPr>
         <w:pStyle w:val="TableCaption"/>
       </w:pPr>
-      <w:bookmarkStart w:id="46" w:name="_Toc242052634"/>
+      <w:bookmarkStart w:id="46" w:name="_Toc242096475"/>
       <w:r>
         <w:t>Bảng 4.3. Thông báo lỗi khi đăng nhập</w:t>
       </w:r>
@@ -25075,7 +25075,7 @@
       <w:pPr>
         <w:pStyle w:val="Heading2"/>
       </w:pPr>
-      <w:bookmarkStart w:id="47" w:name="_Toc242052562"/>
+      <w:bookmarkStart w:id="47" w:name="_Toc242096403"/>
       <w:r>
         <w:t>4.4. Màn hình chính</w:t>
       </w:r>
@@ -25235,7 +25235,7 @@
           <w:noProof/>
         </w:rPr>
         <w:drawing>
-          <wp:inline distT="0" distB="0" distL="0" distR="0" wp14:anchorId="2A8A160E" wp14:editId="0E7CCDDD">
+          <wp:inline distT="0" distB="0" distL="0" distR="0" wp14:anchorId="123B80E8" wp14:editId="0FCD07B8">
             <wp:extent cx="5580000" cy="3332500"/>
             <wp:effectExtent l="0" t="0" r="0" b="0"/>
             <wp:docPr id="522444765" name="Picture 522444765"/>
@@ -25275,7 +25275,7 @@
       <w:pPr>
         <w:pStyle w:val="FigureCaption"/>
       </w:pPr>
-      <w:bookmarkStart w:id="48" w:name="_Toc242052605"/>
+      <w:bookmarkStart w:id="48" w:name="_Toc242096446"/>
       <w:r>
         <w:t>Hình 4.3. Màn hình chính của vai trò Quản lý (trang Tổng quan)</w:t>
       </w:r>
@@ -25285,7 +25285,7 @@
       <w:pPr>
         <w:pStyle w:val="Heading2"/>
       </w:pPr>
-      <w:bookmarkStart w:id="49" w:name="_Toc242052563"/>
+      <w:bookmarkStart w:id="49" w:name="_Toc242096404"/>
       <w:r>
         <w:t>4.5. Đổi ngôn ngữ giao diện</w:t>
       </w:r>
@@ -25323,7 +25323,7 @@
       <w:pPr>
         <w:pStyle w:val="Heading2"/>
       </w:pPr>
-      <w:bookmarkStart w:id="50" w:name="_Toc242052564"/>
+      <w:bookmarkStart w:id="50" w:name="_Toc242096405"/>
       <w:r>
         <w:t>4.6. Đổi mật khẩu</w:t>
       </w:r>
@@ -25439,7 +25439,7 @@
           <w:noProof/>
         </w:rPr>
         <w:drawing>
-          <wp:inline distT="0" distB="0" distL="0" distR="0" wp14:anchorId="64F2424B" wp14:editId="3CE61B20">
+          <wp:inline distT="0" distB="0" distL="0" distR="0" wp14:anchorId="47ADE39A" wp14:editId="750168E7">
             <wp:extent cx="3420000" cy="1368000"/>
             <wp:effectExtent l="0" t="0" r="0" b="0"/>
             <wp:docPr id="522444766" name="Picture 522444766"/>
@@ -25479,7 +25479,7 @@
       <w:pPr>
         <w:pStyle w:val="FigureCaption"/>
       </w:pPr>
-      <w:bookmarkStart w:id="51" w:name="_Toc242052606"/>
+      <w:bookmarkStart w:id="51" w:name="_Toc242096447"/>
       <w:r>
         <w:t>Hình 4.4. Hộp thoại đổi mật khẩu</w:t>
       </w:r>
@@ -25521,7 +25521,7 @@
       <w:pPr>
         <w:pStyle w:val="Heading2"/>
       </w:pPr>
-      <w:bookmarkStart w:id="52" w:name="_Toc242052565"/>
+      <w:bookmarkStart w:id="52" w:name="_Toc242096406"/>
       <w:r>
         <w:t>4.7. Đăng xuất và thoát</w:t>
       </w:r>
@@ -25568,7 +25568,7 @@
       <w:pPr>
         <w:pStyle w:val="Heading2"/>
       </w:pPr>
-      <w:bookmarkStart w:id="53" w:name="_Toc242052566"/>
+      <w:bookmarkStart w:id="53" w:name="_Toc242096407"/>
       <w:r>
         <w:t>4.8. Thao tác chung trên các màn hình danh sách</w:t>
       </w:r>
@@ -25595,7 +25595,7 @@
           <w:noProof/>
         </w:rPr>
         <w:drawing>
-          <wp:inline distT="0" distB="0" distL="0" distR="0" wp14:anchorId="62AB7955" wp14:editId="675AA27E">
+          <wp:inline distT="0" distB="0" distL="0" distR="0" wp14:anchorId="52225D94" wp14:editId="0B6CD3C1">
             <wp:extent cx="5580000" cy="3332500"/>
             <wp:effectExtent l="0" t="0" r="0" b="0"/>
             <wp:docPr id="522444767" name="Picture 522444767"/>
@@ -25635,7 +25635,7 @@
       <w:pPr>
         <w:pStyle w:val="FigureCaption"/>
       </w:pPr>
-      <w:bookmarkStart w:id="54" w:name="_Toc242052607"/>
+      <w:bookmarkStart w:id="54" w:name="_Toc242096448"/>
       <w:r>
         <w:t>Hình 4.5. Một màn hình danh sách: Công nợ học phí</w:t>
       </w:r>
@@ -25645,7 +25645,7 @@
       <w:pPr>
         <w:pStyle w:val="TableCaption"/>
       </w:pPr>
-      <w:bookmarkStart w:id="55" w:name="_Toc242052635"/>
+      <w:bookmarkStart w:id="55" w:name="_Toc242096476"/>
       <w:r>
         <w:t>Bảng 4.4. Các thành phần của màn hình danh sách</w:t>
       </w:r>
@@ -26267,7 +26267,20 @@
               <w:rPr>
                 <w:sz w:val="21"/>
               </w:rPr>
-              <w:t xml:space="preserve"> (mặc định trong thư mục Documents/Tài liệu) rồi mở bằng Excel hoặc ứng dụng bảng tính mặc định. File dùng mã UTF-8 nên Excel hiển thị đúng tiếng Việt. Ô bắt đầu bằng </w:t>
+              <w:t xml:space="preserve"> (mặc định trong thư mục Documents/Tài liệu) rồi mở bằng Excel hoặc ứng dụng bảng tính mặc định. File dùng mã UTF-8 nên Excel hiển thị đúng tiếng Việt. Số tiền và các số khác được ghi dạng số thuần (ví dụ </w:t>
+            </w:r>
+            <w:r>
+              <w:rPr>
+                <w:color w:val="C7254E"/>
+                <w:sz w:val="21"/>
+              </w:rPr>
+              <w:t>1500000</w:t>
+            </w:r>
+            <w:r>
+              <w:rPr>
+                <w:sz w:val="21"/>
+              </w:rPr>
+              <w:t xml:space="preserve">, không có dấu chấm và chữ ₫) để Excel cộng, lọc được. Ô bắt đầu bằng </w:t>
             </w:r>
             <w:r>
               <w:rPr>
@@ -26487,7 +26500,7 @@
       <w:pPr>
         <w:pStyle w:val="Heading2"/>
       </w:pPr>
-      <w:bookmarkStart w:id="56" w:name="_Toc242052567"/>
+      <w:bookmarkStart w:id="56" w:name="_Toc242096408"/>
       <w:r>
         <w:t>4.9. Form nhập liệu và hộp xác nhận</w:t>
       </w:r>
@@ -26650,7 +26663,7 @@
         <w:pStyle w:val="Heading1"/>
         <w:pageBreakBefore/>
       </w:pPr>
-      <w:bookmarkStart w:id="57" w:name="_Toc242052568"/>
+      <w:bookmarkStart w:id="57" w:name="_Toc242096409"/>
       <w:r>
         <w:lastRenderedPageBreak/>
         <w:t>CHƯƠNG 5. HƯỚNG DẪN THEO CHỨC NĂNG</w:t>
@@ -26671,7 +26684,7 @@
       <w:pPr>
         <w:pStyle w:val="Heading2"/>
       </w:pPr>
-      <w:bookmarkStart w:id="58" w:name="_Toc242052569"/>
+      <w:bookmarkStart w:id="58" w:name="_Toc242096410"/>
       <w:r>
         <w:t>5.1. Tổng quan</w:t>
       </w:r>
@@ -26715,7 +26728,7 @@
       <w:pPr>
         <w:pStyle w:val="TableCaption"/>
       </w:pPr>
-      <w:bookmarkStart w:id="59" w:name="_Toc242052636"/>
+      <w:bookmarkStart w:id="59" w:name="_Toc242096477"/>
       <w:r>
         <w:t>Bảng 5.1. Các thẻ số liệu trên trang Tổng quan</w:t>
       </w:r>
@@ -27197,7 +27210,7 @@
           <w:noProof/>
         </w:rPr>
         <w:drawing>
-          <wp:inline distT="0" distB="0" distL="0" distR="0" wp14:anchorId="1B18BC34" wp14:editId="1EF8D71B">
+          <wp:inline distT="0" distB="0" distL="0" distR="0" wp14:anchorId="6904568C" wp14:editId="667924FB">
             <wp:extent cx="5580000" cy="3332500"/>
             <wp:effectExtent l="0" t="0" r="0" b="0"/>
             <wp:docPr id="522444768" name="Picture 522444768"/>
@@ -27237,7 +27250,7 @@
       <w:pPr>
         <w:pStyle w:val="FigureCaption"/>
       </w:pPr>
-      <w:bookmarkStart w:id="60" w:name="_Toc242052608"/>
+      <w:bookmarkStart w:id="60" w:name="_Toc242096449"/>
       <w:r>
         <w:t>Hình 5.1. Trang Tổng quan của Giáo vụ: không có quyền xem doanh thu</w:t>
       </w:r>
@@ -27247,7 +27260,7 @@
       <w:pPr>
         <w:pStyle w:val="Heading2"/>
       </w:pPr>
-      <w:bookmarkStart w:id="61" w:name="_Toc242052570"/>
+      <w:bookmarkStart w:id="61" w:name="_Toc242096411"/>
       <w:r>
         <w:lastRenderedPageBreak/>
         <w:t>5.2. Học viên</w:t>
@@ -27281,7 +27294,7 @@
           <w:noProof/>
         </w:rPr>
         <w:drawing>
-          <wp:inline distT="0" distB="0" distL="0" distR="0" wp14:anchorId="4B60F3D6" wp14:editId="61772817">
+          <wp:inline distT="0" distB="0" distL="0" distR="0" wp14:anchorId="508C8F25" wp14:editId="3B5C4FBD">
             <wp:extent cx="5580000" cy="3332500"/>
             <wp:effectExtent l="0" t="0" r="0" b="0"/>
             <wp:docPr id="522444769" name="Picture 522444769"/>
@@ -27321,7 +27334,7 @@
       <w:pPr>
         <w:pStyle w:val="FigureCaption"/>
       </w:pPr>
-      <w:bookmarkStart w:id="62" w:name="_Toc242052609"/>
+      <w:bookmarkStart w:id="62" w:name="_Toc242096450"/>
       <w:r>
         <w:t>Hình 5.2. Danh sách học viên</w:t>
       </w:r>
@@ -27331,7 +27344,7 @@
       <w:pPr>
         <w:pStyle w:val="Heading3"/>
       </w:pPr>
-      <w:bookmarkStart w:id="63" w:name="_Toc242052571"/>
+      <w:bookmarkStart w:id="63" w:name="_Toc242096412"/>
       <w:r>
         <w:t>5.2.1. Tìm kiếm</w:t>
       </w:r>
@@ -27428,7 +27441,7 @@
       <w:pPr>
         <w:pStyle w:val="Heading3"/>
       </w:pPr>
-      <w:bookmarkStart w:id="64" w:name="_Toc242052572"/>
+      <w:bookmarkStart w:id="64" w:name="_Toc242096413"/>
       <w:r>
         <w:t>5.2.2. Thêm học viên</w:t>
       </w:r>
@@ -27633,7 +27646,7 @@
       <w:pPr>
         <w:pStyle w:val="Heading3"/>
       </w:pPr>
-      <w:bookmarkStart w:id="65" w:name="_Toc242052573"/>
+      <w:bookmarkStart w:id="65" w:name="_Toc242096414"/>
       <w:r>
         <w:t>5.2.3. Sửa thông tin</w:t>
       </w:r>
@@ -27754,7 +27767,7 @@
           <w:noProof/>
         </w:rPr>
         <w:drawing>
-          <wp:inline distT="0" distB="0" distL="0" distR="0" wp14:anchorId="3349E1E8" wp14:editId="346C5C2C">
+          <wp:inline distT="0" distB="0" distL="0" distR="0" wp14:anchorId="5F6BE292" wp14:editId="48DFDDDF">
             <wp:extent cx="3780000" cy="5048129"/>
             <wp:effectExtent l="0" t="0" r="0" b="0"/>
             <wp:docPr id="522444770" name="Picture 522444770"/>
@@ -27794,7 +27807,7 @@
       <w:pPr>
         <w:pStyle w:val="FigureCaption"/>
       </w:pPr>
-      <w:bookmarkStart w:id="66" w:name="_Toc242052610"/>
+      <w:bookmarkStart w:id="66" w:name="_Toc242096451"/>
       <w:r>
         <w:t>Hình 5.3. Hộp thoại sửa thông tin học viên</w:t>
       </w:r>
@@ -27814,7 +27827,7 @@
       <w:pPr>
         <w:pStyle w:val="TableCaption"/>
       </w:pPr>
-      <w:bookmarkStart w:id="67" w:name="_Toc242052637"/>
+      <w:bookmarkStart w:id="67" w:name="_Toc242096478"/>
       <w:r>
         <w:t>Bảng 5.2. Quy tắc kiểm tra thông tin học viên</w:t>
       </w:r>
@@ -28478,7 +28491,7 @@
       <w:pPr>
         <w:pStyle w:val="Heading3"/>
       </w:pPr>
-      <w:bookmarkStart w:id="68" w:name="_Toc242052574"/>
+      <w:bookmarkStart w:id="68" w:name="_Toc242096415"/>
       <w:r>
         <w:t>5.2.4. Xóa học viên</w:t>
       </w:r>
@@ -28599,7 +28612,7 @@
       <w:pPr>
         <w:pStyle w:val="Heading3"/>
       </w:pPr>
-      <w:bookmarkStart w:id="69" w:name="_Toc242052575"/>
+      <w:bookmarkStart w:id="69" w:name="_Toc242096416"/>
       <w:r>
         <w:t>5.2.5. Hồ sơ, ghi danh và kiểm tra xếp lớp từ danh sách học viên</w:t>
       </w:r>
@@ -28667,9 +28680,37 @@
     </w:p>
     <w:p>
       <w:pPr>
+        <w:spacing w:after="120" w:line="276" w:lineRule="auto"/>
+        <w:ind w:firstLine="284"/>
+        <w:jc w:val="both"/>
+      </w:pPr>
+      <w:r>
+        <w:t xml:space="preserve">Nút </w:t>
+      </w:r>
+      <w:r>
+        <w:rPr>
+          <w:b/>
+        </w:rPr>
+        <w:t>Ghi danh</w:t>
+      </w:r>
+      <w:r>
+        <w:t xml:space="preserve"> chỉ hiện với vai trò được ghi danh (mục 5.5), nút </w:t>
+      </w:r>
+      <w:r>
+        <w:rPr>
+          <w:b/>
+        </w:rPr>
+        <w:t>Kiểm tra xếp lớp</w:t>
+      </w:r>
+      <w:r>
+        <w:t xml:space="preserve"> chỉ hiện với vai trò được nhập điểm kiểm tra (mục 5.3); hiện nay đó là Quản lý và Giáo vụ.</w:t>
+      </w:r>
+    </w:p>
+    <w:p>
+      <w:pPr>
         <w:pStyle w:val="Heading3"/>
       </w:pPr>
-      <w:bookmarkStart w:id="70" w:name="_Toc242052576"/>
+      <w:bookmarkStart w:id="70" w:name="_Toc242096417"/>
       <w:r>
         <w:t>5.2.6. Xuất, nhập danh sách bằng XML</w:t>
       </w:r>
@@ -28755,7 +28796,7 @@
       <w:pPr>
         <w:pStyle w:val="Heading2"/>
       </w:pPr>
-      <w:bookmarkStart w:id="71" w:name="_Toc242052577"/>
+      <w:bookmarkStart w:id="71" w:name="_Toc242096418"/>
       <w:r>
         <w:t>5.3. Kiểm tra xếp lớp</w:t>
       </w:r>
@@ -28843,7 +28884,7 @@
         </w:rPr>
         <w:lastRenderedPageBreak/>
         <w:drawing>
-          <wp:inline distT="0" distB="0" distL="0" distR="0" wp14:anchorId="3C18C420" wp14:editId="1D28C5AF">
+          <wp:inline distT="0" distB="0" distL="0" distR="0" wp14:anchorId="4F4F7DE4" wp14:editId="379D716A">
             <wp:extent cx="5580000" cy="3332500"/>
             <wp:effectExtent l="0" t="0" r="0" b="0"/>
             <wp:docPr id="522444771" name="Picture 522444771"/>
@@ -28883,7 +28924,7 @@
       <w:pPr>
         <w:pStyle w:val="FigureCaption"/>
       </w:pPr>
-      <w:bookmarkStart w:id="72" w:name="_Toc242052611"/>
+      <w:bookmarkStart w:id="72" w:name="_Toc242096452"/>
       <w:r>
         <w:t>Hình 5.4. Danh sách bài kiểm tra xếp lớp</w:t>
       </w:r>
@@ -29148,7 +29189,7 @@
       <w:pPr>
         <w:pStyle w:val="Heading2"/>
       </w:pPr>
-      <w:bookmarkStart w:id="73" w:name="_Toc242052578"/>
+      <w:bookmarkStart w:id="73" w:name="_Toc242096419"/>
       <w:r>
         <w:t>5.4. Lớp học</w:t>
       </w:r>
@@ -29200,7 +29241,7 @@
         </w:rPr>
         <w:lastRenderedPageBreak/>
         <w:drawing>
-          <wp:inline distT="0" distB="0" distL="0" distR="0" wp14:anchorId="40349E0B" wp14:editId="3D9FF32C">
+          <wp:inline distT="0" distB="0" distL="0" distR="0" wp14:anchorId="2E14C454" wp14:editId="6DBC95AB">
             <wp:extent cx="5580000" cy="3332500"/>
             <wp:effectExtent l="0" t="0" r="0" b="0"/>
             <wp:docPr id="522444772" name="Picture 522444772"/>
@@ -29240,7 +29281,7 @@
       <w:pPr>
         <w:pStyle w:val="FigureCaption"/>
       </w:pPr>
-      <w:bookmarkStart w:id="74" w:name="_Toc242052612"/>
+      <w:bookmarkStart w:id="74" w:name="_Toc242096453"/>
       <w:r>
         <w:t>Hình 5.5. Màn hình Lớp học và các nút quản lý vòng đời lớp</w:t>
       </w:r>
@@ -29367,7 +29408,16 @@
         <w:t>Đang tuyển sinh</w:t>
       </w:r>
       <w:r>
-        <w:t xml:space="preserve"> và ứng dụng nhắc bước tiếp theo.</w:t>
+        <w:t xml:space="preserve"> và ứng dụng nhắc bước tiếp theo. Chi nhánh phải đang hoạt động và phòng không được ở trạng thái </w:t>
+      </w:r>
+      <w:r>
+        <w:rPr>
+          <w:b/>
+        </w:rPr>
+        <w:t>Bảo trì</w:t>
+      </w:r>
+      <w:r>
+        <w:t>.</w:t>
       </w:r>
     </w:p>
     <w:p>
@@ -29436,7 +29486,34 @@
         <w:t>Xóa khung giờ</w:t>
       </w:r>
       <w:r>
-        <w:t xml:space="preserve"> để bỏ.</w:t>
+        <w:t xml:space="preserve"> để bỏ. Mỗi thay đổi xóa các buổi học đã sinh; khi đóng cửa sổ, ứng dụng hỏi </w:t>
+      </w:r>
+      <w:r>
+        <w:rPr>
+          <w:b/>
+        </w:rPr>
+        <w:t>Sinh các buổi học của lớp ... theo lịch tuần?</w:t>
+      </w:r>
+      <w:r>
+        <w:t xml:space="preserve"> để sinh lại theo lịch mới. Khi lớp đã có buổi </w:t>
+      </w:r>
+      <w:r>
+        <w:rPr>
+          <w:b/>
+        </w:rPr>
+        <w:t>Đã dạy</w:t>
+      </w:r>
+      <w:r>
+        <w:t xml:space="preserve"> hoặc </w:t>
+      </w:r>
+      <w:r>
+        <w:rPr>
+          <w:b/>
+        </w:rPr>
+        <w:t>Đã hủy</w:t>
+      </w:r>
+      <w:r>
+        <w:t xml:space="preserve"> thì lịch tuần không đổi được nữa.</w:t>
       </w:r>
     </w:p>
     <w:p>
@@ -29460,7 +29537,25 @@
         <w:t>Sinh buổi học</w:t>
       </w:r>
       <w:r>
-        <w:t>: tạo đủ số buổi của khóa học theo lịch tuần, bắt đầu từ ngày khai giảng; ứng dụng báo số buổi đã tạo và ngày của buổi cuối (cũng là ngày kết thúc lớp). Chạy lại thì các buổi cũ được thay thế.</w:t>
+        <w:t xml:space="preserve">: tạo đủ số buổi của khóa học theo lịch tuần, bắt đầu từ ngày khai giảng; ứng dụng báo số buổi đã tạo và ngày của buổi cuối (cũng là ngày kết thúc lớp). Chạy lại thì các buổi cũ được thay thế, nên chỉ chạy lại được khi chưa có buổi nào </w:t>
+      </w:r>
+      <w:r>
+        <w:rPr>
+          <w:b/>
+        </w:rPr>
+        <w:t>Đã dạy</w:t>
+      </w:r>
+      <w:r>
+        <w:t xml:space="preserve"> hoặc </w:t>
+      </w:r>
+      <w:r>
+        <w:rPr>
+          <w:b/>
+        </w:rPr>
+        <w:t>Đã hủy</w:t>
+      </w:r>
+      <w:r>
+        <w:t>.</w:t>
       </w:r>
     </w:p>
     <w:p>
@@ -29570,6 +29665,7 @@
         <w:rPr>
           <w:b/>
         </w:rPr>
+        <w:lastRenderedPageBreak/>
         <w:t>Sửa</w:t>
       </w:r>
       <w:r>
@@ -29582,7 +29678,7 @@
         <w:t>Chưa dạy</w:t>
       </w:r>
       <w:r>
-        <w:t xml:space="preserve"> đi theo giáo viên và phòng mới. Đổi ngày khai giảng thì các buổi đã sinh bị xóa và ứng dụng sinh lại từ ngày mới. Học phí mới chỉ áp dụng cho các lần ghi danh sau.</w:t>
+        <w:t xml:space="preserve"> từ hôm nay trở đi theo giáo viên và phòng mới; buổi đã qua giữ giáo viên đã dạy buổi đó. Đổi ngày khai giảng thì các buổi đã sinh bị xóa và ứng dụng sinh lại từ ngày mới. Học phí mới chỉ áp dụng cho các lần ghi danh sau.</w:t>
       </w:r>
     </w:p>
     <w:p>
@@ -29599,7 +29695,6 @@
         <w:rPr>
           <w:b/>
         </w:rPr>
-        <w:lastRenderedPageBreak/>
         <w:t>Hủy lớp</w:t>
       </w:r>
       <w:r>
@@ -29666,7 +29761,7 @@
       <w:pPr>
         <w:pStyle w:val="TableCaption"/>
       </w:pPr>
-      <w:bookmarkStart w:id="75" w:name="_Toc242052638"/>
+      <w:bookmarkStart w:id="75" w:name="_Toc242096479"/>
       <w:r>
         <w:t>Bảng 5.3. Quy tắc CSDL kiểm tra khi quản lý lớp học</w:t>
       </w:r>
@@ -29836,20 +29931,59 @@
               <w:rPr>
                 <w:sz w:val="20"/>
               </w:rPr>
-              <w:t xml:space="preserve">; phòng thuộc chi nhánh của lớp và đủ chỗ cho sĩ số tối đa; sĩ số tối đa không nhỏ hơn số học viên đang học; chỉ đổi ngày khai giảng khi lớp </w:t>
+              <w:t>, chi nhánh đang hoạt động (</w:t>
             </w:r>
             <w:r>
               <w:rPr>
                 <w:b/>
                 <w:sz w:val="20"/>
               </w:rPr>
+              <w:t>Chi nhánh không tồn tại hoặc đang tạm ngừng</w:t>
+            </w:r>
+            <w:r>
+              <w:rPr>
+                <w:sz w:val="20"/>
+              </w:rPr>
+              <w:t xml:space="preserve">); phòng thuộc chi nhánh của lớp, không </w:t>
+            </w:r>
+            <w:r>
+              <w:rPr>
+                <w:b/>
+                <w:sz w:val="20"/>
+              </w:rPr>
+              <w:t>Bảo trì</w:t>
+            </w:r>
+            <w:r>
+              <w:rPr>
+                <w:sz w:val="20"/>
+              </w:rPr>
+              <w:t xml:space="preserve"> (</w:t>
+            </w:r>
+            <w:r>
+              <w:rPr>
+                <w:b/>
+                <w:sz w:val="20"/>
+              </w:rPr>
+              <w:t>Phòng đang bảo trì; hãy chọn phòng khác</w:t>
+            </w:r>
+            <w:r>
+              <w:rPr>
+                <w:sz w:val="20"/>
+              </w:rPr>
+              <w:t xml:space="preserve">) và đủ chỗ cho sĩ số tối đa; sĩ số tối đa không nhỏ hơn số học viên đang học; chỉ đổi ngày khai giảng khi lớp </w:t>
+            </w:r>
+            <w:r>
+              <w:rPr>
+                <w:b/>
+                <w:sz w:val="20"/>
+              </w:rPr>
               <w:t>Đang tuyển sinh</w:t>
             </w:r>
             <w:r>
               <w:rPr>
                 <w:sz w:val="20"/>
               </w:rPr>
-              <w:t xml:space="preserve"> và chưa có buổi nào đã dạy hoặc đã hủy.</w:t>
+              <w:t xml:space="preserve"> và chưa có buổi nào đã dạy hoặc đã hủy; ngày khai giảng mới không làm học viên của lớp bị trùng lịch với lớp khác của họ.</w:t>
             </w:r>
           </w:p>
         </w:tc>
@@ -29939,7 +30073,20 @@
               <w:rPr>
                 <w:sz w:val="20"/>
               </w:rPr>
-              <w:t>; giờ học trong khoảng 07:00-22:00; không trùng phòng, không trùng giáo viên với lớp khác cùng thứ và cùng giờ.</w:t>
+              <w:t xml:space="preserve"> và chưa có buổi đã dạy hoặc đã hủy (</w:t>
+            </w:r>
+            <w:r>
+              <w:rPr>
+                <w:b/>
+                <w:sz w:val="20"/>
+              </w:rPr>
+              <w:t>Lịch tuần của lớp đã có buổi đã dạy hoặc đã hủy thì không thể thay đổi nữa</w:t>
+            </w:r>
+            <w:r>
+              <w:rPr>
+                <w:sz w:val="20"/>
+              </w:rPr>
+              <w:t>); giờ học trong khoảng 07:00-22:00; không trùng phòng, không trùng giáo viên với lớp khác cùng thứ và cùng giờ; không làm học viên của lớp bị trùng lịch với lớp khác của họ.</w:t>
             </w:r>
           </w:p>
         </w:tc>
@@ -30145,7 +30292,7 @@
       <w:pPr>
         <w:pStyle w:val="Heading2"/>
       </w:pPr>
-      <w:bookmarkStart w:id="76" w:name="_Toc242052579"/>
+      <w:bookmarkStart w:id="76" w:name="_Toc242096420"/>
       <w:r>
         <w:t>5.5. Ghi danh</w:t>
       </w:r>
@@ -30204,8 +30351,9 @@
         <w:rPr>
           <w:noProof/>
         </w:rPr>
+        <w:lastRenderedPageBreak/>
         <w:drawing>
-          <wp:inline distT="0" distB="0" distL="0" distR="0" wp14:anchorId="3C40BD65" wp14:editId="1AAEA070">
+          <wp:inline distT="0" distB="0" distL="0" distR="0" wp14:anchorId="76C6A213" wp14:editId="3D44B4E7">
             <wp:extent cx="5580000" cy="3332500"/>
             <wp:effectExtent l="0" t="0" r="0" b="0"/>
             <wp:docPr id="522444773" name="Picture 522444773"/>
@@ -30245,7 +30393,7 @@
       <w:pPr>
         <w:pStyle w:val="FigureCaption"/>
       </w:pPr>
-      <w:bookmarkStart w:id="77" w:name="_Toc242052613"/>
+      <w:bookmarkStart w:id="77" w:name="_Toc242096454"/>
       <w:r>
         <w:t>Hình 5.6. Danh sách ghi danh</w:t>
       </w:r>
@@ -30326,7 +30474,6 @@
         <w:rPr>
           <w:b/>
         </w:rPr>
-        <w:lastRenderedPageBreak/>
         <w:t>Bước 3.</w:t>
       </w:r>
       <w:r>
@@ -30381,7 +30528,7 @@
         <w:t>Ngày ghi danh</w:t>
       </w:r>
       <w:r>
-        <w:t xml:space="preserve">, chọn </w:t>
+        <w:t xml:space="preserve"> (hôm nay hoặc một ngày đã qua khi nhập lại phiếu giấy, không chọn được ngày trong tương lai), chọn </w:t>
       </w:r>
       <w:r>
         <w:rPr>
@@ -30518,7 +30665,7 @@
       <w:pPr>
         <w:pStyle w:val="TableCaption"/>
       </w:pPr>
-      <w:bookmarkStart w:id="78" w:name="_Toc242052639"/>
+      <w:bookmarkStart w:id="78" w:name="_Toc242096480"/>
       <w:r>
         <w:t>Bảng 5.4. Quy tắc CSDL kiểm tra khi ghi danh và chuyển lớp</w:t>
       </w:r>
@@ -30851,6 +30998,7 @@
               <w:rPr>
                 <w:sz w:val="20"/>
               </w:rPr>
+              <w:lastRenderedPageBreak/>
               <w:t>Bảo lưu, học lại, nghỉ học</w:t>
             </w:r>
           </w:p>
@@ -30907,7 +31055,7 @@
       <w:pPr>
         <w:pStyle w:val="Heading2"/>
       </w:pPr>
-      <w:bookmarkStart w:id="79" w:name="_Toc242052580"/>
+      <w:bookmarkStart w:id="79" w:name="_Toc242096421"/>
       <w:r>
         <w:t>5.6. Lịch học - điểm danh</w:t>
       </w:r>
@@ -30993,9 +31141,8 @@
         <w:rPr>
           <w:noProof/>
         </w:rPr>
-        <w:lastRenderedPageBreak/>
         <w:drawing>
-          <wp:inline distT="0" distB="0" distL="0" distR="0" wp14:anchorId="384DACDF" wp14:editId="16EDCC18">
+          <wp:inline distT="0" distB="0" distL="0" distR="0" wp14:anchorId="0FDCE174" wp14:editId="27C1E952">
             <wp:extent cx="5580000" cy="3332500"/>
             <wp:effectExtent l="0" t="0" r="0" b="0"/>
             <wp:docPr id="522444774" name="Picture 522444774"/>
@@ -31035,7 +31182,7 @@
       <w:pPr>
         <w:pStyle w:val="FigureCaption"/>
       </w:pPr>
-      <w:bookmarkStart w:id="80" w:name="_Toc242052614"/>
+      <w:bookmarkStart w:id="80" w:name="_Toc242096455"/>
       <w:r>
         <w:t>Hình 5.7. Lịch học - điểm danh của một tuần</w:t>
       </w:r>
@@ -31275,8 +31422,9 @@
       <w:pPr>
         <w:pStyle w:val="Heading2"/>
       </w:pPr>
-      <w:bookmarkStart w:id="81" w:name="_Toc242052581"/>
-      <w:r>
+      <w:bookmarkStart w:id="81" w:name="_Toc242096422"/>
+      <w:r>
+        <w:lastRenderedPageBreak/>
         <w:t>5.7. Sổ điểm</w:t>
       </w:r>
       <w:bookmarkEnd w:id="81"/>
@@ -31316,9 +31464,8 @@
         <w:rPr>
           <w:noProof/>
         </w:rPr>
-        <w:lastRenderedPageBreak/>
         <w:drawing>
-          <wp:inline distT="0" distB="0" distL="0" distR="0" wp14:anchorId="3BBB6978" wp14:editId="1FC9F5A4">
+          <wp:inline distT="0" distB="0" distL="0" distR="0" wp14:anchorId="5520C1E2" wp14:editId="64BAE5CC">
             <wp:extent cx="5580000" cy="3332500"/>
             <wp:effectExtent l="0" t="0" r="0" b="0"/>
             <wp:docPr id="522444775" name="Picture 522444775"/>
@@ -31358,7 +31505,7 @@
       <w:pPr>
         <w:pStyle w:val="FigureCaption"/>
       </w:pPr>
-      <w:bookmarkStart w:id="82" w:name="_Toc242052615"/>
+      <w:bookmarkStart w:id="82" w:name="_Toc242096456"/>
       <w:r>
         <w:t>Hình 5.8. Sổ điểm của một lớp</w:t>
       </w:r>
@@ -31400,7 +31547,7 @@
         <w:t>Bước 2.</w:t>
       </w:r>
       <w:r>
-        <w:t xml:space="preserve"> Nhấp đúp vào ô điểm, nhập điểm từ 0 đến 10 rồi Enter; làm tiếp với các ô khác. Dòng cuối cho biết số điểm chưa lưu.</w:t>
+        <w:t xml:space="preserve"> Nhấp đúp vào ô điểm, nhập điểm từ 0 đến 10 (tối đa 2 chữ số thập phân) rồi Enter; làm tiếp với các ô khác. Dòng cuối cho biết số điểm chưa lưu; điểm ngoài khoảng 0-10 không được nhận và dòng cuối báo lý do.</w:t>
       </w:r>
     </w:p>
     <w:p>
@@ -31424,7 +31571,16 @@
         <w:t>Lưu điểm</w:t>
       </w:r>
       <w:r>
-        <w:t>: mọi điểm vừa nhập được lưu cùng lúc (lỗi một điểm thì không điểm nào được lưu). Đổi sang lớp khác khi còn điểm chưa lưu thì ứng dụng hỏi có lưu không.</w:t>
+        <w:t xml:space="preserve">: mọi điểm vừa nhập được lưu cùng lúc (lỗi một điểm thì không điểm nào được lưu). Đổi sang lớp khác khi còn điểm chưa lưu thì ứng dụng hỏi có lưu không; nếu lưu không được, sổ điểm ở lại lớp cũ và giữ nguyên các điểm vừa nhập. Bấm </w:t>
+      </w:r>
+      <w:r>
+        <w:rPr>
+          <w:b/>
+        </w:rPr>
+        <w:t>Làm mới</w:t>
+      </w:r>
+      <w:r>
+        <w:t xml:space="preserve"> để đọc lại cả danh sách lớp (lớp vừa mở hoặc vừa kết thúc ở màn hình khác).</w:t>
       </w:r>
     </w:p>
     <w:p>
@@ -31447,7 +31603,16 @@
         <w:t>Đã kết thúc</w:t>
       </w:r>
       <w:r>
-        <w:t xml:space="preserve"> thì điểm đã chốt: bảng chỉ để xem.</w:t>
+        <w:t xml:space="preserve"> thì điểm đã chốt: bảng chỉ để xem. Điểm tổng kết dưới 5 hiện màu đỏ; từ 5 trở lên chưa chắc </w:t>
+      </w:r>
+      <w:r>
+        <w:rPr>
+          <w:b/>
+        </w:rPr>
+        <w:t>Đạt</w:t>
+      </w:r>
+      <w:r>
+        <w:t xml:space="preserve"> vì còn cần chuyên cần từ 80%.Khi tổng trọng số các cột điểm khác 100%, màn hình hiện cảnh báo: lớp chưa thể đánh giá kết quả cho đến khi quản lý sửa cột điểm của khóa học (mục 5.13).</w:t>
       </w:r>
     </w:p>
     <w:p>
@@ -31461,20 +31626,6 @@
         <w:jc w:val="both"/>
       </w:pPr>
       <w:r>
-        <w:t>Khi tổng trọng số các cột điểm khác 100%, màn hình hiện cảnh báo: lớp chưa thể đánh giá kết quả cho đến khi quản lý sửa cột điểm của khóa học (mục 5.13).</w:t>
-      </w:r>
-    </w:p>
-    <w:p>
-      <w:pPr>
-        <w:pStyle w:val="ListParagraph"/>
-        <w:numPr>
-          <w:ilvl w:val="0"/>
-          <w:numId w:val="2"/>
-        </w:numPr>
-        <w:spacing w:after="60" w:line="276" w:lineRule="auto"/>
-        <w:jc w:val="both"/>
-      </w:pPr>
-      <w:r>
         <w:t>Mọi lần sửa điểm được CSDL ghi vào nhật ký (điểm cũ, điểm mới, người sửa, thời điểm).</w:t>
       </w:r>
     </w:p>
@@ -31482,7 +31633,7 @@
       <w:pPr>
         <w:pStyle w:val="Heading2"/>
       </w:pPr>
-      <w:bookmarkStart w:id="83" w:name="_Toc242052582"/>
+      <w:bookmarkStart w:id="83" w:name="_Toc242096423"/>
       <w:r>
         <w:t>5.8. Kết quả học tập</w:t>
       </w:r>
@@ -31510,7 +31661,11 @@
         <w:t>Điểm TK</w:t>
       </w:r>
       <w:r>
-        <w:t>), xếp loại (Xuất sắc, Giỏi, Khá, Trung bình), tỷ lệ chuyên cần (%), kết quả (</w:t>
+        <w:t xml:space="preserve">), xếp loại (Xuất sắc, Giỏi, Khá, Trung bình), tỷ lệ chuyên cần (%), kết quả </w:t>
+      </w:r>
+      <w:r>
+        <w:lastRenderedPageBreak/>
+        <w:t>(</w:t>
       </w:r>
       <w:r>
         <w:rPr>
@@ -31541,9 +31696,8 @@
         <w:rPr>
           <w:noProof/>
         </w:rPr>
-        <w:lastRenderedPageBreak/>
         <w:drawing>
-          <wp:inline distT="0" distB="0" distL="0" distR="0" wp14:anchorId="21E14E46" wp14:editId="5B84A806">
+          <wp:inline distT="0" distB="0" distL="0" distR="0" wp14:anchorId="710EB61F" wp14:editId="5C6DBC7F">
             <wp:extent cx="5580000" cy="3332500"/>
             <wp:effectExtent l="0" t="0" r="0" b="0"/>
             <wp:docPr id="522444776" name="Picture 522444776"/>
@@ -31583,7 +31737,7 @@
       <w:pPr>
         <w:pStyle w:val="FigureCaption"/>
       </w:pPr>
-      <w:bookmarkStart w:id="84" w:name="_Toc242052616"/>
+      <w:bookmarkStart w:id="84" w:name="_Toc242096457"/>
       <w:r>
         <w:t>Hình 5.9. Kết quả học tập</w:t>
       </w:r>
@@ -31593,7 +31747,7 @@
       <w:pPr>
         <w:pStyle w:val="Heading2"/>
       </w:pPr>
-      <w:bookmarkStart w:id="85" w:name="_Toc242052583"/>
+      <w:bookmarkStart w:id="85" w:name="_Toc242096424"/>
       <w:r>
         <w:t>5.9. Thu học phí</w:t>
       </w:r>
@@ -31662,7 +31816,7 @@
           <w:noProof/>
         </w:rPr>
         <w:drawing>
-          <wp:inline distT="0" distB="0" distL="0" distR="0" wp14:anchorId="0B2ECACB" wp14:editId="1D2694B5">
+          <wp:inline distT="0" distB="0" distL="0" distR="0" wp14:anchorId="78E52A14" wp14:editId="0A8C2838">
             <wp:extent cx="5580000" cy="3332500"/>
             <wp:effectExtent l="0" t="0" r="0" b="0"/>
             <wp:docPr id="522444777" name="Picture 522444777"/>
@@ -31702,7 +31856,7 @@
       <w:pPr>
         <w:pStyle w:val="FigureCaption"/>
       </w:pPr>
-      <w:bookmarkStart w:id="86" w:name="_Toc242052617"/>
+      <w:bookmarkStart w:id="86" w:name="_Toc242096458"/>
       <w:r>
         <w:t>Hình 5.10. Danh sách phiếu thu (Kế toán)</w:t>
       </w:r>
@@ -31717,6 +31871,7 @@
         <w:rPr>
           <w:b/>
         </w:rPr>
+        <w:lastRenderedPageBreak/>
         <w:t>Bước 1.</w:t>
       </w:r>
       <w:r>
@@ -31759,7 +31914,6 @@
         <w:rPr>
           <w:b/>
         </w:rPr>
-        <w:lastRenderedPageBreak/>
         <w:t>Bước 2.</w:t>
       </w:r>
       <w:r>
@@ -32013,7 +32167,7 @@
       <w:pPr>
         <w:pStyle w:val="Heading2"/>
       </w:pPr>
-      <w:bookmarkStart w:id="87" w:name="_Toc242052584"/>
+      <w:bookmarkStart w:id="87" w:name="_Toc242096425"/>
       <w:r>
         <w:t>5.10. Công nợ học phí</w:t>
       </w:r>
@@ -32066,7 +32220,7 @@
       <w:pPr>
         <w:pStyle w:val="Heading2"/>
       </w:pPr>
-      <w:bookmarkStart w:id="88" w:name="_Toc242052585"/>
+      <w:bookmarkStart w:id="88" w:name="_Toc242096426"/>
       <w:r>
         <w:t>5.11. Doanh thu</w:t>
       </w:r>
@@ -32168,7 +32322,7 @@
         </w:rPr>
         <w:lastRenderedPageBreak/>
         <w:drawing>
-          <wp:inline distT="0" distB="0" distL="0" distR="0" wp14:anchorId="6C2397C0" wp14:editId="2C81A334">
+          <wp:inline distT="0" distB="0" distL="0" distR="0" wp14:anchorId="3DEFB600" wp14:editId="3025E6AF">
             <wp:extent cx="5580000" cy="3332500"/>
             <wp:effectExtent l="0" t="0" r="0" b="0"/>
             <wp:docPr id="522444778" name="Picture 522444778"/>
@@ -32208,7 +32362,7 @@
       <w:pPr>
         <w:pStyle w:val="FigureCaption"/>
       </w:pPr>
-      <w:bookmarkStart w:id="89" w:name="_Toc242052618"/>
+      <w:bookmarkStart w:id="89" w:name="_Toc242096459"/>
       <w:r>
         <w:t>Hình 5.11. Doanh thu theo tháng và chi nhánh (Kế toán)</w:t>
       </w:r>
@@ -32218,7 +32372,7 @@
       <w:pPr>
         <w:pStyle w:val="Heading2"/>
       </w:pPr>
-      <w:bookmarkStart w:id="90" w:name="_Toc242052586"/>
+      <w:bookmarkStart w:id="90" w:name="_Toc242096427"/>
       <w:r>
         <w:t>5.12. Lương giáo viên</w:t>
       </w:r>
@@ -32269,7 +32423,7 @@
           <w:noProof/>
         </w:rPr>
         <w:drawing>
-          <wp:inline distT="0" distB="0" distL="0" distR="0" wp14:anchorId="045EBE83" wp14:editId="41BF590B">
+          <wp:inline distT="0" distB="0" distL="0" distR="0" wp14:anchorId="390F8265" wp14:editId="230A26B9">
             <wp:extent cx="5580000" cy="3332500"/>
             <wp:effectExtent l="0" t="0" r="0" b="0"/>
             <wp:docPr id="522444779" name="Picture 522444779"/>
@@ -32309,7 +32463,7 @@
       <w:pPr>
         <w:pStyle w:val="FigureCaption"/>
       </w:pPr>
-      <w:bookmarkStart w:id="91" w:name="_Toc242052619"/>
+      <w:bookmarkStart w:id="91" w:name="_Toc242096460"/>
       <w:r>
         <w:t>Hình 5.12. Bảng lương giáo viên (Kế toán)</w:t>
       </w:r>
@@ -32369,7 +32523,7 @@
         <w:t>Đã dạy</w:t>
       </w:r>
       <w:r>
-        <w:t xml:space="preserve"> của từng giáo viên trong tháng, tính số giờ, thưởng 500.000 đ khi dạy từ 20 buổi. Có thể chốt lại một tháng (ví dụ khi vừa cập nhật buổi dạy); các dòng đã chi trả không bị thay đổi. Không chốt được tháng chưa tới.</w:t>
+        <w:t xml:space="preserve"> của từng giáo viên trong tháng, tính số giờ, thưởng 500.000 đ khi dạy từ 20 buổi. Có thể chốt lại một tháng (ví dụ khi vừa cập nhật buổi dạy, hoặc chốt tạm tháng đang chạy để xem trước); các dòng đã chi trả không bị thay đổi, khoản khấu trừ đã nhập được giữ (lương không được thấp hơn khoản khấu trừ). Không chốt được tháng chưa tới.</w:t>
       </w:r>
     </w:p>
     <w:p>
@@ -32409,14 +32563,14 @@
         <w:t>Đã chi trả</w:t>
       </w:r>
       <w:r>
-        <w:t>: ghi nhận đã trả lương sau khi xác nhận. Dòng đã chi trả không thể thay đổi nữa.</w:t>
+        <w:t>: ghi nhận đã trả lương sau khi xác nhận, chỉ khi tháng đó đã kết thúc (các buổi dạy cuối tháng còn được tính). Dòng đã chi trả không thể thay đổi nữa.</w:t>
       </w:r>
     </w:p>
     <w:p>
       <w:pPr>
         <w:pStyle w:val="Heading2"/>
       </w:pPr>
-      <w:bookmarkStart w:id="92" w:name="_Toc242052587"/>
+      <w:bookmarkStart w:id="92" w:name="_Toc242096428"/>
       <w:r>
         <w:t>5.13. Danh mục</w:t>
       </w:r>
@@ -32469,7 +32623,7 @@
       <w:pPr>
         <w:pStyle w:val="Heading3"/>
       </w:pPr>
-      <w:bookmarkStart w:id="93" w:name="_Toc242052588"/>
+      <w:bookmarkStart w:id="93" w:name="_Toc242096429"/>
       <w:r>
         <w:t>5.13.1. Khóa học</w:t>
       </w:r>
@@ -32505,7 +32659,7 @@
           <w:noProof/>
         </w:rPr>
         <w:drawing>
-          <wp:inline distT="0" distB="0" distL="0" distR="0" wp14:anchorId="64C7D056" wp14:editId="60906F2C">
+          <wp:inline distT="0" distB="0" distL="0" distR="0" wp14:anchorId="577C4C5D" wp14:editId="568A7EB9">
             <wp:extent cx="5580000" cy="3332500"/>
             <wp:effectExtent l="0" t="0" r="0" b="0"/>
             <wp:docPr id="522444780" name="Picture 522444780"/>
@@ -32545,7 +32699,7 @@
       <w:pPr>
         <w:pStyle w:val="FigureCaption"/>
       </w:pPr>
-      <w:bookmarkStart w:id="94" w:name="_Toc242052620"/>
+      <w:bookmarkStart w:id="94" w:name="_Toc242096461"/>
       <w:r>
         <w:t>Hình 5.13. Danh mục khóa học và cột điểm của khóa đang chọn</w:t>
       </w:r>
@@ -32749,7 +32903,7 @@
       <w:pPr>
         <w:pStyle w:val="Heading3"/>
       </w:pPr>
-      <w:bookmarkStart w:id="95" w:name="_Toc242052589"/>
+      <w:bookmarkStart w:id="95" w:name="_Toc242096430"/>
       <w:r>
         <w:t>5.13.2. Giáo viên, Nhân viên</w:t>
       </w:r>
@@ -32876,7 +33030,7 @@
       <w:pPr>
         <w:pStyle w:val="Heading3"/>
       </w:pPr>
-      <w:bookmarkStart w:id="96" w:name="_Toc242052590"/>
+      <w:bookmarkStart w:id="96" w:name="_Toc242096431"/>
       <w:r>
         <w:t>5.13.3. Chi nhánh - phòng học, Khuyến mãi</w:t>
       </w:r>
@@ -33059,7 +33213,7 @@
         <w:t>Hiệu lực đến</w:t>
       </w:r>
       <w:r>
-        <w:t>. Muốn ngừng sớm thì sửa ngày hết hiệu lực; các lượt ghi danh trước đó giữ nguyên số tiền đã giảm.</w:t>
+        <w:t>. Muốn ngừng sớm thì sửa ngày hết hiệu lực; các lượt ghi danh trước đó giữ nguyên số tiền đã giảm. Khi đã có học viên dùng khuyến mãi thì không đổi được loại giảm giá, mức giảm và ngày bắt đầu (chuyển lớp sẽ áp lại khuyến mãi), và ngày hết hiệu lực không được trước lần ghi danh cuối cùng đã dùng nó; tên thì vẫn đổi được.</w:t>
       </w:r>
     </w:p>
     <w:p>
@@ -33074,7 +33228,7 @@
         </w:rPr>
         <w:lastRenderedPageBreak/>
         <w:drawing>
-          <wp:inline distT="0" distB="0" distL="0" distR="0" wp14:anchorId="2005D576" wp14:editId="1ADAC79E">
+          <wp:inline distT="0" distB="0" distL="0" distR="0" wp14:anchorId="1A2C717A" wp14:editId="360A08DF">
             <wp:extent cx="5580000" cy="3332500"/>
             <wp:effectExtent l="0" t="0" r="0" b="0"/>
             <wp:docPr id="522444781" name="Picture 522444781"/>
@@ -33114,7 +33268,7 @@
       <w:pPr>
         <w:pStyle w:val="FigureCaption"/>
       </w:pPr>
-      <w:bookmarkStart w:id="97" w:name="_Toc242052621"/>
+      <w:bookmarkStart w:id="97" w:name="_Toc242096462"/>
       <w:r>
         <w:t>Hình 5.14. Chi nhánh và phòng học của chi nhánh đang chọn</w:t>
       </w:r>
@@ -33124,7 +33278,7 @@
       <w:pPr>
         <w:pStyle w:val="Heading2"/>
       </w:pPr>
-      <w:bookmarkStart w:id="98" w:name="_Toc242052591"/>
+      <w:bookmarkStart w:id="98" w:name="_Toc242096432"/>
       <w:r>
         <w:t>5.14. Tài khoản</w:t>
       </w:r>
@@ -33175,7 +33329,7 @@
           <w:noProof/>
         </w:rPr>
         <w:drawing>
-          <wp:inline distT="0" distB="0" distL="0" distR="0" wp14:anchorId="5628B145" wp14:editId="722578BC">
+          <wp:inline distT="0" distB="0" distL="0" distR="0" wp14:anchorId="3A032BA7" wp14:editId="26AE7AF0">
             <wp:extent cx="5580000" cy="3332500"/>
             <wp:effectExtent l="0" t="0" r="0" b="0"/>
             <wp:docPr id="522444782" name="Picture 522444782"/>
@@ -33215,7 +33369,7 @@
       <w:pPr>
         <w:pStyle w:val="FigureCaption"/>
       </w:pPr>
-      <w:bookmarkStart w:id="99" w:name="_Toc242052622"/>
+      <w:bookmarkStart w:id="99" w:name="_Toc242096463"/>
       <w:r>
         <w:t>Hình 5.15. Danh sách tài khoản (Quản lý)</w:t>
       </w:r>
@@ -33375,7 +33529,7 @@
       <w:pPr>
         <w:pStyle w:val="Heading2"/>
       </w:pPr>
-      <w:bookmarkStart w:id="100" w:name="_Toc242052592"/>
+      <w:bookmarkStart w:id="100" w:name="_Toc242096433"/>
       <w:r>
         <w:t>5.15. Sao lưu</w:t>
       </w:r>
@@ -33525,7 +33679,7 @@
           <w:noProof/>
         </w:rPr>
         <w:drawing>
-          <wp:inline distT="0" distB="0" distL="0" distR="0" wp14:anchorId="2295A7E1" wp14:editId="625625A6">
+          <wp:inline distT="0" distB="0" distL="0" distR="0" wp14:anchorId="0EAF17CA" wp14:editId="6E30689C">
             <wp:extent cx="5580000" cy="3332500"/>
             <wp:effectExtent l="0" t="0" r="0" b="0"/>
             <wp:docPr id="522444783" name="Picture 522444783"/>
@@ -33565,7 +33719,7 @@
       <w:pPr>
         <w:pStyle w:val="FigureCaption"/>
       </w:pPr>
-      <w:bookmarkStart w:id="101" w:name="_Toc242052623"/>
+      <w:bookmarkStart w:id="101" w:name="_Toc242096464"/>
       <w:r>
         <w:t>Hình 5.16. Màn hình sao lưu cơ sở dữ liệu</w:t>
       </w:r>
@@ -33594,7 +33748,7 @@
       <w:pPr>
         <w:pStyle w:val="Heading2"/>
       </w:pPr>
-      <w:bookmarkStart w:id="102" w:name="_Toc242052593"/>
+      <w:bookmarkStart w:id="102" w:name="_Toc242096434"/>
       <w:r>
         <w:lastRenderedPageBreak/>
         <w:t>5.16. Chức năng dành cho giáo viên</w:t>
@@ -33744,7 +33898,7 @@
           <w:noProof/>
         </w:rPr>
         <w:drawing>
-          <wp:inline distT="0" distB="0" distL="0" distR="0" wp14:anchorId="1DEF3303" wp14:editId="7C84CE88">
+          <wp:inline distT="0" distB="0" distL="0" distR="0" wp14:anchorId="522A2CC5" wp14:editId="37046466">
             <wp:extent cx="5580000" cy="3332500"/>
             <wp:effectExtent l="0" t="0" r="0" b="0"/>
             <wp:docPr id="522444784" name="Picture 522444784"/>
@@ -33784,7 +33938,7 @@
       <w:pPr>
         <w:pStyle w:val="FigureCaption"/>
       </w:pPr>
-      <w:bookmarkStart w:id="103" w:name="_Toc242052624"/>
+      <w:bookmarkStart w:id="103" w:name="_Toc242096465"/>
       <w:r>
         <w:t>Hình 5.17. Lịch dạy của giáo viên</w:t>
       </w:r>
@@ -33802,7 +33956,7 @@
         </w:rPr>
         <w:lastRenderedPageBreak/>
         <w:drawing>
-          <wp:inline distT="0" distB="0" distL="0" distR="0" wp14:anchorId="0DF42C73" wp14:editId="6B59E0C3">
+          <wp:inline distT="0" distB="0" distL="0" distR="0" wp14:anchorId="3E8C66EF" wp14:editId="2B55BC69">
             <wp:extent cx="5580000" cy="3332500"/>
             <wp:effectExtent l="0" t="0" r="0" b="0"/>
             <wp:docPr id="522444785" name="Picture 522444785"/>
@@ -33842,7 +33996,7 @@
       <w:pPr>
         <w:pStyle w:val="FigureCaption"/>
       </w:pPr>
-      <w:bookmarkStart w:id="104" w:name="_Toc242052625"/>
+      <w:bookmarkStart w:id="104" w:name="_Toc242096466"/>
       <w:r>
         <w:t>Hình 5.18. Sổ điểm của giáo viên</w:t>
       </w:r>
@@ -33852,7 +34006,7 @@
       <w:pPr>
         <w:pStyle w:val="Heading2"/>
       </w:pPr>
-      <w:bookmarkStart w:id="105" w:name="_Toc242052594"/>
+      <w:bookmarkStart w:id="105" w:name="_Toc242096435"/>
       <w:r>
         <w:t>5.17. Việc vẫn làm trong SSMS</w:t>
       </w:r>
@@ -33865,7 +34019,7 @@
         <w:jc w:val="both"/>
       </w:pPr>
       <w:r>
-        <w:t xml:space="preserve">Mọi nghiệp vụ hằng ngày đã có trên ứng dụng. Một số việc quản trị ít dùng vẫn làm trong SSMS hoặc VS Code (đăng nhập bằng tài khoản quản lý, chọn CSDL </w:t>
+        <w:t xml:space="preserve">Mọi nghiệp vụ hằng ngày đã có trên ứng dụng. Một số việc quản trị ít dùng vẫn làm trong SSMS hoặc VS Code, chọn CSDL </w:t>
       </w:r>
       <w:r>
         <w:rPr>
@@ -33874,7 +34028,7 @@
         <w:t>QLTTTA</w:t>
       </w:r>
       <w:r>
-        <w:t>):</w:t>
+        <w:t>:</w:t>
       </w:r>
     </w:p>
     <w:p>
@@ -33888,7 +34042,16 @@
         <w:jc w:val="both"/>
       </w:pPr>
       <w:r>
-        <w:t>Khôi phục CSDL từ các bản sao lưu (mục 5.15).</w:t>
+        <w:t xml:space="preserve">Xem nhật ký thay đổi điểm và phiếu thu: bảng </w:t>
+      </w:r>
+      <w:r>
+        <w:rPr>
+          <w:color w:val="C7254E"/>
+        </w:rPr>
+        <w:t>AUDIT_LOG</w:t>
+      </w:r>
+      <w:r>
+        <w:t xml:space="preserve"> (chỉ đọc, không ai sửa hay xóa được). Tài khoản quản lý đọc được bảng này.</w:t>
       </w:r>
     </w:p>
     <w:p>
@@ -33902,16 +34065,25 @@
         <w:jc w:val="both"/>
       </w:pPr>
       <w:r>
-        <w:t xml:space="preserve">Xem nhật ký thay đổi điểm và phiếu thu: bảng </w:t>
+        <w:t xml:space="preserve">Khôi phục CSDL từ các bản sao lưu (mục 5.15): cần quản trị viên SQL Server (tài khoản </w:t>
       </w:r>
       <w:r>
         <w:rPr>
           <w:color w:val="C7254E"/>
         </w:rPr>
-        <w:t>AUDIT_LOG</w:t>
-      </w:r>
-      <w:r>
-        <w:t xml:space="preserve"> (chỉ đọc, không ai sửa hay xóa được).</w:t>
+        <w:t>sa</w:t>
+      </w:r>
+      <w:r>
+        <w:t xml:space="preserve"> hoặc đăng nhập Windows như mục 2.3.4), vì lệnh </w:t>
+      </w:r>
+      <w:r>
+        <w:rPr>
+          <w:color w:val="C7254E"/>
+        </w:rPr>
+        <w:t>RESTORE</w:t>
+      </w:r>
+      <w:r>
+        <w:t xml:space="preserve"> tạo lại cả CSDL; tài khoản quản lý của ứng dụng không có quyền này.</w:t>
       </w:r>
     </w:p>
     <w:p>
@@ -33925,7 +34097,7 @@
         <w:jc w:val="both"/>
       </w:pPr>
       <w:r>
-        <w:t>Xóa hẳn chi nhánh, khóa học, giáo viên, nhân viên: ứng dụng chỉ chuyển sang trạng thái ngừng để giữ lịch sử.</w:t>
+        <w:t>Xóa hẳn chi nhánh, khóa học, giáo viên, nhân viên: ứng dụng chỉ chuyển sang trạng thái ngừng để giữ lịch sử. Việc xóa hẳn cũng cần quản trị viên SQL Server (tài khoản quản lý không có quyền DELETE trên các bảng này), và CSDL vẫn từ chối xóa dòng đã có lịch sử (lớp, ghi danh, phiếu thu...).</w:t>
       </w:r>
     </w:p>
     <w:p>
@@ -33952,7 +34124,7 @@
         <w:pStyle w:val="Heading1"/>
         <w:pageBreakBefore/>
       </w:pPr>
-      <w:bookmarkStart w:id="106" w:name="_Toc242052595"/>
+      <w:bookmarkStart w:id="106" w:name="_Toc242096436"/>
       <w:r>
         <w:lastRenderedPageBreak/>
         <w:t>CHƯƠNG 6. XỬ LÝ SỰ CỐ</w:t>
@@ -33963,7 +34135,7 @@
       <w:pPr>
         <w:pStyle w:val="Heading2"/>
       </w:pPr>
-      <w:bookmarkStart w:id="107" w:name="_Toc242052596"/>
+      <w:bookmarkStart w:id="107" w:name="_Toc242096437"/>
       <w:r>
         <w:t>6.1. Kiểm tra kết nối không cần giao diện</w:t>
       </w:r>
@@ -34370,7 +34542,7 @@
       <w:pPr>
         <w:pStyle w:val="Heading2"/>
       </w:pPr>
-      <w:bookmarkStart w:id="108" w:name="_Toc242052597"/>
+      <w:bookmarkStart w:id="108" w:name="_Toc242096438"/>
       <w:r>
         <w:t>6.2. Lỗi thường gặp</w:t>
       </w:r>
@@ -34380,7 +34552,7 @@
       <w:pPr>
         <w:pStyle w:val="TableCaption"/>
       </w:pPr>
-      <w:bookmarkStart w:id="109" w:name="_Toc242052640"/>
+      <w:bookmarkStart w:id="109" w:name="_Toc242096481"/>
       <w:r>
         <w:t>Bảng 6.1. Lỗi thường gặp và cách xử lý</w:t>
       </w:r>
@@ -37064,7 +37236,7 @@
       <w:pPr>
         <w:pStyle w:val="Heading2"/>
       </w:pPr>
-      <w:bookmarkStart w:id="110" w:name="_Toc242052598"/>
+      <w:bookmarkStart w:id="110" w:name="_Toc242096439"/>
       <w:r>
         <w:t>6.3. Khi cần hỗ trợ thêm</w:t>
       </w:r>
@@ -37112,7 +37284,7 @@
         <w:pStyle w:val="Heading1"/>
         <w:pageBreakBefore/>
       </w:pPr>
-      <w:bookmarkStart w:id="111" w:name="_Toc242052599"/>
+      <w:bookmarkStart w:id="111" w:name="_Toc242096440"/>
       <w:r>
         <w:lastRenderedPageBreak/>
         <w:t>PHỤ LỤC A. TÓM TẮT LỆNH</w:t>
@@ -37863,7 +38035,7 @@
         <w:pStyle w:val="Heading1"/>
         <w:pageBreakBefore/>
       </w:pPr>
-      <w:bookmarkStart w:id="112" w:name="_Toc242052600"/>
+      <w:bookmarkStart w:id="112" w:name="_Toc242096441"/>
       <w:r>
         <w:lastRenderedPageBreak/>
         <w:t>PHỤ LỤC B. CÁC MỤC CẦN BỔ SUNG</w:t>

</xml_diff>

<commit_message>
docs: regenerate the report and the user guide for the public 1.0.0
Generated with build_report.py / build_user_guide.py and exported with
export_pdf.ps1 (Word on Windows, no field errors).
</commit_message>
<xml_diff>
--- a/docs/user-guide/QLTTTA_User_Guide.docx
+++ b/docs/user-guide/QLTTTA_User_Guide.docx
@@ -923,7 +923,7 @@
               <w:rPr>
                 <w:sz w:val="22"/>
               </w:rPr>
-              <w:t>QLTTTA - Quản lý Trung tâm Tiếng Anh, phiên bản 0.1.0</w:t>
+              <w:t>QLTTTA - Quản lý Trung tâm Tiếng Anh, phiên bản 1.0.0</w:t>
             </w:r>
           </w:p>
         </w:tc>
@@ -1401,7 +1401,7 @@
       <w:r>
         <w:fldChar w:fldCharType="separate"/>
       </w:r>
-      <w:hyperlink w:anchor="_Toc242096369" w:history="1">
+      <w:hyperlink w:anchor="_Toc242133592" w:history="1">
         <w:r>
           <w:rPr>
             <w:rStyle w:val="Hyperlink"/>
@@ -1428,7 +1428,7 @@
             <w:noProof/>
             <w:webHidden/>
           </w:rPr>
-          <w:instrText xml:space="preserve"> PAGEREF _Toc242096369 \h </w:instrText>
+          <w:instrText xml:space="preserve"> PAGEREF _Toc242133592 \h </w:instrText>
         </w:r>
         <w:r>
           <w:rPr>
@@ -1474,7 +1474,7 @@
           <w14:ligatures w14:val="standardContextual"/>
         </w:rPr>
       </w:pPr>
-      <w:hyperlink w:anchor="_Toc242096370" w:history="1">
+      <w:hyperlink w:anchor="_Toc242133593" w:history="1">
         <w:r>
           <w:rPr>
             <w:rStyle w:val="Hyperlink"/>
@@ -1501,7 +1501,7 @@
             <w:noProof/>
             <w:webHidden/>
           </w:rPr>
-          <w:instrText xml:space="preserve"> PAGEREF _Toc242096370 \h </w:instrText>
+          <w:instrText xml:space="preserve"> PAGEREF _Toc242133593 \h </w:instrText>
         </w:r>
         <w:r>
           <w:rPr>
@@ -1547,7 +1547,7 @@
           <w14:ligatures w14:val="standardContextual"/>
         </w:rPr>
       </w:pPr>
-      <w:hyperlink w:anchor="_Toc242096371" w:history="1">
+      <w:hyperlink w:anchor="_Toc242133594" w:history="1">
         <w:r>
           <w:rPr>
             <w:rStyle w:val="Hyperlink"/>
@@ -1574,7 +1574,7 @@
             <w:noProof/>
             <w:webHidden/>
           </w:rPr>
-          <w:instrText xml:space="preserve"> PAGEREF _Toc242096371 \h </w:instrText>
+          <w:instrText xml:space="preserve"> PAGEREF _Toc242133594 \h </w:instrText>
         </w:r>
         <w:r>
           <w:rPr>
@@ -1620,7 +1620,7 @@
           <w14:ligatures w14:val="standardContextual"/>
         </w:rPr>
       </w:pPr>
-      <w:hyperlink w:anchor="_Toc242096372" w:history="1">
+      <w:hyperlink w:anchor="_Toc242133595" w:history="1">
         <w:r>
           <w:rPr>
             <w:rStyle w:val="Hyperlink"/>
@@ -1647,7 +1647,7 @@
             <w:noProof/>
             <w:webHidden/>
           </w:rPr>
-          <w:instrText xml:space="preserve"> PAGEREF _Toc242096372 \h </w:instrText>
+          <w:instrText xml:space="preserve"> PAGEREF _Toc242133595 \h </w:instrText>
         </w:r>
         <w:r>
           <w:rPr>
@@ -1693,7 +1693,7 @@
           <w14:ligatures w14:val="standardContextual"/>
         </w:rPr>
       </w:pPr>
-      <w:hyperlink w:anchor="_Toc242096373" w:history="1">
+      <w:hyperlink w:anchor="_Toc242133596" w:history="1">
         <w:r>
           <w:rPr>
             <w:rStyle w:val="Hyperlink"/>
@@ -1720,7 +1720,7 @@
             <w:noProof/>
             <w:webHidden/>
           </w:rPr>
-          <w:instrText xml:space="preserve"> PAGEREF _Toc242096373 \h </w:instrText>
+          <w:instrText xml:space="preserve"> PAGEREF _Toc242133596 \h </w:instrText>
         </w:r>
         <w:r>
           <w:rPr>
@@ -1766,7 +1766,7 @@
           <w14:ligatures w14:val="standardContextual"/>
         </w:rPr>
       </w:pPr>
-      <w:hyperlink w:anchor="_Toc242096374" w:history="1">
+      <w:hyperlink w:anchor="_Toc242133597" w:history="1">
         <w:r>
           <w:rPr>
             <w:rStyle w:val="Hyperlink"/>
@@ -1793,7 +1793,7 @@
             <w:noProof/>
             <w:webHidden/>
           </w:rPr>
-          <w:instrText xml:space="preserve"> PAGEREF _Toc242096374 \h </w:instrText>
+          <w:instrText xml:space="preserve"> PAGEREF _Toc242133597 \h </w:instrText>
         </w:r>
         <w:r>
           <w:rPr>
@@ -1839,7 +1839,7 @@
           <w14:ligatures w14:val="standardContextual"/>
         </w:rPr>
       </w:pPr>
-      <w:hyperlink w:anchor="_Toc242096375" w:history="1">
+      <w:hyperlink w:anchor="_Toc242133598" w:history="1">
         <w:r>
           <w:rPr>
             <w:rStyle w:val="Hyperlink"/>
@@ -1866,7 +1866,7 @@
             <w:noProof/>
             <w:webHidden/>
           </w:rPr>
-          <w:instrText xml:space="preserve"> PAGEREF _Toc242096375 \h </w:instrText>
+          <w:instrText xml:space="preserve"> PAGEREF _Toc242133598 \h </w:instrText>
         </w:r>
         <w:r>
           <w:rPr>
@@ -1912,7 +1912,7 @@
           <w14:ligatures w14:val="standardContextual"/>
         </w:rPr>
       </w:pPr>
-      <w:hyperlink w:anchor="_Toc242096376" w:history="1">
+      <w:hyperlink w:anchor="_Toc242133599" w:history="1">
         <w:r>
           <w:rPr>
             <w:rStyle w:val="Hyperlink"/>
@@ -1939,7 +1939,7 @@
             <w:noProof/>
             <w:webHidden/>
           </w:rPr>
-          <w:instrText xml:space="preserve"> PAGEREF _Toc242096376 \h </w:instrText>
+          <w:instrText xml:space="preserve"> PAGEREF _Toc242133599 \h </w:instrText>
         </w:r>
         <w:r>
           <w:rPr>
@@ -1985,7 +1985,7 @@
           <w14:ligatures w14:val="standardContextual"/>
         </w:rPr>
       </w:pPr>
-      <w:hyperlink w:anchor="_Toc242096377" w:history="1">
+      <w:hyperlink w:anchor="_Toc242133600" w:history="1">
         <w:r>
           <w:rPr>
             <w:rStyle w:val="Hyperlink"/>
@@ -2012,7 +2012,7 @@
             <w:noProof/>
             <w:webHidden/>
           </w:rPr>
-          <w:instrText xml:space="preserve"> PAGEREF _Toc242096377 \h </w:instrText>
+          <w:instrText xml:space="preserve"> PAGEREF _Toc242133600 \h </w:instrText>
         </w:r>
         <w:r>
           <w:rPr>
@@ -2058,7 +2058,7 @@
           <w14:ligatures w14:val="standardContextual"/>
         </w:rPr>
       </w:pPr>
-      <w:hyperlink w:anchor="_Toc242096378" w:history="1">
+      <w:hyperlink w:anchor="_Toc242133601" w:history="1">
         <w:r>
           <w:rPr>
             <w:rStyle w:val="Hyperlink"/>
@@ -2085,7 +2085,7 @@
             <w:noProof/>
             <w:webHidden/>
           </w:rPr>
-          <w:instrText xml:space="preserve"> PAGEREF _Toc242096378 \h </w:instrText>
+          <w:instrText xml:space="preserve"> PAGEREF _Toc242133601 \h </w:instrText>
         </w:r>
         <w:r>
           <w:rPr>
@@ -2131,7 +2131,7 @@
           <w14:ligatures w14:val="standardContextual"/>
         </w:rPr>
       </w:pPr>
-      <w:hyperlink w:anchor="_Toc242096379" w:history="1">
+      <w:hyperlink w:anchor="_Toc242133602" w:history="1">
         <w:r>
           <w:rPr>
             <w:rStyle w:val="Hyperlink"/>
@@ -2158,7 +2158,7 @@
             <w:noProof/>
             <w:webHidden/>
           </w:rPr>
-          <w:instrText xml:space="preserve"> PAGEREF _Toc242096379 \h </w:instrText>
+          <w:instrText xml:space="preserve"> PAGEREF _Toc242133602 \h </w:instrText>
         </w:r>
         <w:r>
           <w:rPr>
@@ -2204,7 +2204,7 @@
           <w14:ligatures w14:val="standardContextual"/>
         </w:rPr>
       </w:pPr>
-      <w:hyperlink w:anchor="_Toc242096380" w:history="1">
+      <w:hyperlink w:anchor="_Toc242133603" w:history="1">
         <w:r>
           <w:rPr>
             <w:rStyle w:val="Hyperlink"/>
@@ -2231,7 +2231,7 @@
             <w:noProof/>
             <w:webHidden/>
           </w:rPr>
-          <w:instrText xml:space="preserve"> PAGEREF _Toc242096380 \h </w:instrText>
+          <w:instrText xml:space="preserve"> PAGEREF _Toc242133603 \h </w:instrText>
         </w:r>
         <w:r>
           <w:rPr>
@@ -2277,7 +2277,7 @@
           <w14:ligatures w14:val="standardContextual"/>
         </w:rPr>
       </w:pPr>
-      <w:hyperlink w:anchor="_Toc242096381" w:history="1">
+      <w:hyperlink w:anchor="_Toc242133604" w:history="1">
         <w:r>
           <w:rPr>
             <w:rStyle w:val="Hyperlink"/>
@@ -2304,7 +2304,7 @@
             <w:noProof/>
             <w:webHidden/>
           </w:rPr>
-          <w:instrText xml:space="preserve"> PAGEREF _Toc242096381 \h </w:instrText>
+          <w:instrText xml:space="preserve"> PAGEREF _Toc242133604 \h </w:instrText>
         </w:r>
         <w:r>
           <w:rPr>
@@ -2350,7 +2350,7 @@
           <w14:ligatures w14:val="standardContextual"/>
         </w:rPr>
       </w:pPr>
-      <w:hyperlink w:anchor="_Toc242096382" w:history="1">
+      <w:hyperlink w:anchor="_Toc242133605" w:history="1">
         <w:r>
           <w:rPr>
             <w:rStyle w:val="Hyperlink"/>
@@ -2377,7 +2377,7 @@
             <w:noProof/>
             <w:webHidden/>
           </w:rPr>
-          <w:instrText xml:space="preserve"> PAGEREF _Toc242096382 \h </w:instrText>
+          <w:instrText xml:space="preserve"> PAGEREF _Toc242133605 \h </w:instrText>
         </w:r>
         <w:r>
           <w:rPr>
@@ -2423,7 +2423,7 @@
           <w14:ligatures w14:val="standardContextual"/>
         </w:rPr>
       </w:pPr>
-      <w:hyperlink w:anchor="_Toc242096383" w:history="1">
+      <w:hyperlink w:anchor="_Toc242133606" w:history="1">
         <w:r>
           <w:rPr>
             <w:rStyle w:val="Hyperlink"/>
@@ -2450,7 +2450,7 @@
             <w:noProof/>
             <w:webHidden/>
           </w:rPr>
-          <w:instrText xml:space="preserve"> PAGEREF _Toc242096383 \h </w:instrText>
+          <w:instrText xml:space="preserve"> PAGEREF _Toc242133606 \h </w:instrText>
         </w:r>
         <w:r>
           <w:rPr>
@@ -2496,7 +2496,7 @@
           <w14:ligatures w14:val="standardContextual"/>
         </w:rPr>
       </w:pPr>
-      <w:hyperlink w:anchor="_Toc242096384" w:history="1">
+      <w:hyperlink w:anchor="_Toc242133607" w:history="1">
         <w:r>
           <w:rPr>
             <w:rStyle w:val="Hyperlink"/>
@@ -2523,7 +2523,7 @@
             <w:noProof/>
             <w:webHidden/>
           </w:rPr>
-          <w:instrText xml:space="preserve"> PAGEREF _Toc242096384 \h </w:instrText>
+          <w:instrText xml:space="preserve"> PAGEREF _Toc242133607 \h </w:instrText>
         </w:r>
         <w:r>
           <w:rPr>
@@ -2569,7 +2569,7 @@
           <w14:ligatures w14:val="standardContextual"/>
         </w:rPr>
       </w:pPr>
-      <w:hyperlink w:anchor="_Toc242096385" w:history="1">
+      <w:hyperlink w:anchor="_Toc242133608" w:history="1">
         <w:r>
           <w:rPr>
             <w:rStyle w:val="Hyperlink"/>
@@ -2596,7 +2596,7 @@
             <w:noProof/>
             <w:webHidden/>
           </w:rPr>
-          <w:instrText xml:space="preserve"> PAGEREF _Toc242096385 \h </w:instrText>
+          <w:instrText xml:space="preserve"> PAGEREF _Toc242133608 \h </w:instrText>
         </w:r>
         <w:r>
           <w:rPr>
@@ -2642,7 +2642,7 @@
           <w14:ligatures w14:val="standardContextual"/>
         </w:rPr>
       </w:pPr>
-      <w:hyperlink w:anchor="_Toc242096386" w:history="1">
+      <w:hyperlink w:anchor="_Toc242133609" w:history="1">
         <w:r>
           <w:rPr>
             <w:rStyle w:val="Hyperlink"/>
@@ -2669,7 +2669,7 @@
             <w:noProof/>
             <w:webHidden/>
           </w:rPr>
-          <w:instrText xml:space="preserve"> PAGEREF _Toc242096386 \h </w:instrText>
+          <w:instrText xml:space="preserve"> PAGEREF _Toc242133609 \h </w:instrText>
         </w:r>
         <w:r>
           <w:rPr>
@@ -2715,7 +2715,7 @@
           <w14:ligatures w14:val="standardContextual"/>
         </w:rPr>
       </w:pPr>
-      <w:hyperlink w:anchor="_Toc242096387" w:history="1">
+      <w:hyperlink w:anchor="_Toc242133610" w:history="1">
         <w:r>
           <w:rPr>
             <w:rStyle w:val="Hyperlink"/>
@@ -2742,7 +2742,7 @@
             <w:noProof/>
             <w:webHidden/>
           </w:rPr>
-          <w:instrText xml:space="preserve"> PAGEREF _Toc242096387 \h </w:instrText>
+          <w:instrText xml:space="preserve"> PAGEREF _Toc242133610 \h </w:instrText>
         </w:r>
         <w:r>
           <w:rPr>
@@ -2788,7 +2788,7 @@
           <w14:ligatures w14:val="standardContextual"/>
         </w:rPr>
       </w:pPr>
-      <w:hyperlink w:anchor="_Toc242096388" w:history="1">
+      <w:hyperlink w:anchor="_Toc242133611" w:history="1">
         <w:r>
           <w:rPr>
             <w:rStyle w:val="Hyperlink"/>
@@ -2815,7 +2815,7 @@
             <w:noProof/>
             <w:webHidden/>
           </w:rPr>
-          <w:instrText xml:space="preserve"> PAGEREF _Toc242096388 \h </w:instrText>
+          <w:instrText xml:space="preserve"> PAGEREF _Toc242133611 \h </w:instrText>
         </w:r>
         <w:r>
           <w:rPr>
@@ -2861,7 +2861,7 @@
           <w14:ligatures w14:val="standardContextual"/>
         </w:rPr>
       </w:pPr>
-      <w:hyperlink w:anchor="_Toc242096389" w:history="1">
+      <w:hyperlink w:anchor="_Toc242133612" w:history="1">
         <w:r>
           <w:rPr>
             <w:rStyle w:val="Hyperlink"/>
@@ -2888,7 +2888,7 @@
             <w:noProof/>
             <w:webHidden/>
           </w:rPr>
-          <w:instrText xml:space="preserve"> PAGEREF _Toc242096389 \h </w:instrText>
+          <w:instrText xml:space="preserve"> PAGEREF _Toc242133612 \h </w:instrText>
         </w:r>
         <w:r>
           <w:rPr>
@@ -2934,7 +2934,7 @@
           <w14:ligatures w14:val="standardContextual"/>
         </w:rPr>
       </w:pPr>
-      <w:hyperlink w:anchor="_Toc242096390" w:history="1">
+      <w:hyperlink w:anchor="_Toc242133613" w:history="1">
         <w:r>
           <w:rPr>
             <w:rStyle w:val="Hyperlink"/>
@@ -2961,7 +2961,7 @@
             <w:noProof/>
             <w:webHidden/>
           </w:rPr>
-          <w:instrText xml:space="preserve"> PAGEREF _Toc242096390 \h </w:instrText>
+          <w:instrText xml:space="preserve"> PAGEREF _Toc242133613 \h </w:instrText>
         </w:r>
         <w:r>
           <w:rPr>
@@ -3007,7 +3007,7 @@
           <w14:ligatures w14:val="standardContextual"/>
         </w:rPr>
       </w:pPr>
-      <w:hyperlink w:anchor="_Toc242096391" w:history="1">
+      <w:hyperlink w:anchor="_Toc242133614" w:history="1">
         <w:r>
           <w:rPr>
             <w:rStyle w:val="Hyperlink"/>
@@ -3034,7 +3034,7 @@
             <w:noProof/>
             <w:webHidden/>
           </w:rPr>
-          <w:instrText xml:space="preserve"> PAGEREF _Toc242096391 \h </w:instrText>
+          <w:instrText xml:space="preserve"> PAGEREF _Toc242133614 \h </w:instrText>
         </w:r>
         <w:r>
           <w:rPr>
@@ -3080,7 +3080,7 @@
           <w14:ligatures w14:val="standardContextual"/>
         </w:rPr>
       </w:pPr>
-      <w:hyperlink w:anchor="_Toc242096392" w:history="1">
+      <w:hyperlink w:anchor="_Toc242133615" w:history="1">
         <w:r>
           <w:rPr>
             <w:rStyle w:val="Hyperlink"/>
@@ -3107,7 +3107,7 @@
             <w:noProof/>
             <w:webHidden/>
           </w:rPr>
-          <w:instrText xml:space="preserve"> PAGEREF _Toc242096392 \h </w:instrText>
+          <w:instrText xml:space="preserve"> PAGEREF _Toc242133615 \h </w:instrText>
         </w:r>
         <w:r>
           <w:rPr>
@@ -3153,7 +3153,7 @@
           <w14:ligatures w14:val="standardContextual"/>
         </w:rPr>
       </w:pPr>
-      <w:hyperlink w:anchor="_Toc242096393" w:history="1">
+      <w:hyperlink w:anchor="_Toc242133616" w:history="1">
         <w:r>
           <w:rPr>
             <w:rStyle w:val="Hyperlink"/>
@@ -3180,7 +3180,7 @@
             <w:noProof/>
             <w:webHidden/>
           </w:rPr>
-          <w:instrText xml:space="preserve"> PAGEREF _Toc242096393 \h </w:instrText>
+          <w:instrText xml:space="preserve"> PAGEREF _Toc242133616 \h </w:instrText>
         </w:r>
         <w:r>
           <w:rPr>
@@ -3226,7 +3226,7 @@
           <w14:ligatures w14:val="standardContextual"/>
         </w:rPr>
       </w:pPr>
-      <w:hyperlink w:anchor="_Toc242096394" w:history="1">
+      <w:hyperlink w:anchor="_Toc242133617" w:history="1">
         <w:r>
           <w:rPr>
             <w:rStyle w:val="Hyperlink"/>
@@ -3253,7 +3253,7 @@
             <w:noProof/>
             <w:webHidden/>
           </w:rPr>
-          <w:instrText xml:space="preserve"> PAGEREF _Toc242096394 \h </w:instrText>
+          <w:instrText xml:space="preserve"> PAGEREF _Toc242133617 \h </w:instrText>
         </w:r>
         <w:r>
           <w:rPr>
@@ -3299,7 +3299,7 @@
           <w14:ligatures w14:val="standardContextual"/>
         </w:rPr>
       </w:pPr>
-      <w:hyperlink w:anchor="_Toc242096395" w:history="1">
+      <w:hyperlink w:anchor="_Toc242133618" w:history="1">
         <w:r>
           <w:rPr>
             <w:rStyle w:val="Hyperlink"/>
@@ -3326,7 +3326,7 @@
             <w:noProof/>
             <w:webHidden/>
           </w:rPr>
-          <w:instrText xml:space="preserve"> PAGEREF _Toc242096395 \h </w:instrText>
+          <w:instrText xml:space="preserve"> PAGEREF _Toc242133618 \h </w:instrText>
         </w:r>
         <w:r>
           <w:rPr>
@@ -3372,7 +3372,7 @@
           <w14:ligatures w14:val="standardContextual"/>
         </w:rPr>
       </w:pPr>
-      <w:hyperlink w:anchor="_Toc242096396" w:history="1">
+      <w:hyperlink w:anchor="_Toc242133619" w:history="1">
         <w:r>
           <w:rPr>
             <w:rStyle w:val="Hyperlink"/>
@@ -3399,7 +3399,7 @@
             <w:noProof/>
             <w:webHidden/>
           </w:rPr>
-          <w:instrText xml:space="preserve"> PAGEREF _Toc242096396 \h </w:instrText>
+          <w:instrText xml:space="preserve"> PAGEREF _Toc242133619 \h </w:instrText>
         </w:r>
         <w:r>
           <w:rPr>
@@ -3445,7 +3445,7 @@
           <w14:ligatures w14:val="standardContextual"/>
         </w:rPr>
       </w:pPr>
-      <w:hyperlink w:anchor="_Toc242096397" w:history="1">
+      <w:hyperlink w:anchor="_Toc242133620" w:history="1">
         <w:r>
           <w:rPr>
             <w:rStyle w:val="Hyperlink"/>
@@ -3472,7 +3472,7 @@
             <w:noProof/>
             <w:webHidden/>
           </w:rPr>
-          <w:instrText xml:space="preserve"> PAGEREF _Toc242096397 \h </w:instrText>
+          <w:instrText xml:space="preserve"> PAGEREF _Toc242133620 \h </w:instrText>
         </w:r>
         <w:r>
           <w:rPr>
@@ -3518,7 +3518,7 @@
           <w14:ligatures w14:val="standardContextual"/>
         </w:rPr>
       </w:pPr>
-      <w:hyperlink w:anchor="_Toc242096398" w:history="1">
+      <w:hyperlink w:anchor="_Toc242133621" w:history="1">
         <w:r>
           <w:rPr>
             <w:rStyle w:val="Hyperlink"/>
@@ -3545,7 +3545,7 @@
             <w:noProof/>
             <w:webHidden/>
           </w:rPr>
-          <w:instrText xml:space="preserve"> PAGEREF _Toc242096398 \h </w:instrText>
+          <w:instrText xml:space="preserve"> PAGEREF _Toc242133621 \h </w:instrText>
         </w:r>
         <w:r>
           <w:rPr>
@@ -3591,7 +3591,7 @@
           <w14:ligatures w14:val="standardContextual"/>
         </w:rPr>
       </w:pPr>
-      <w:hyperlink w:anchor="_Toc242096399" w:history="1">
+      <w:hyperlink w:anchor="_Toc242133622" w:history="1">
         <w:r>
           <w:rPr>
             <w:rStyle w:val="Hyperlink"/>
@@ -3618,7 +3618,7 @@
             <w:noProof/>
             <w:webHidden/>
           </w:rPr>
-          <w:instrText xml:space="preserve"> PAGEREF _Toc242096399 \h </w:instrText>
+          <w:instrText xml:space="preserve"> PAGEREF _Toc242133622 \h </w:instrText>
         </w:r>
         <w:r>
           <w:rPr>
@@ -3664,7 +3664,7 @@
           <w14:ligatures w14:val="standardContextual"/>
         </w:rPr>
       </w:pPr>
-      <w:hyperlink w:anchor="_Toc242096400" w:history="1">
+      <w:hyperlink w:anchor="_Toc242133623" w:history="1">
         <w:r>
           <w:rPr>
             <w:rStyle w:val="Hyperlink"/>
@@ -3691,7 +3691,7 @@
             <w:noProof/>
             <w:webHidden/>
           </w:rPr>
-          <w:instrText xml:space="preserve"> PAGEREF _Toc242096400 \h </w:instrText>
+          <w:instrText xml:space="preserve"> PAGEREF _Toc242133623 \h </w:instrText>
         </w:r>
         <w:r>
           <w:rPr>
@@ -3737,7 +3737,7 @@
           <w14:ligatures w14:val="standardContextual"/>
         </w:rPr>
       </w:pPr>
-      <w:hyperlink w:anchor="_Toc242096401" w:history="1">
+      <w:hyperlink w:anchor="_Toc242133624" w:history="1">
         <w:r>
           <w:rPr>
             <w:rStyle w:val="Hyperlink"/>
@@ -3764,7 +3764,7 @@
             <w:noProof/>
             <w:webHidden/>
           </w:rPr>
-          <w:instrText xml:space="preserve"> PAGEREF _Toc242096401 \h </w:instrText>
+          <w:instrText xml:space="preserve"> PAGEREF _Toc242133624 \h </w:instrText>
         </w:r>
         <w:r>
           <w:rPr>
@@ -3810,7 +3810,7 @@
           <w14:ligatures w14:val="standardContextual"/>
         </w:rPr>
       </w:pPr>
-      <w:hyperlink w:anchor="_Toc242096402" w:history="1">
+      <w:hyperlink w:anchor="_Toc242133625" w:history="1">
         <w:r>
           <w:rPr>
             <w:rStyle w:val="Hyperlink"/>
@@ -3837,7 +3837,7 @@
             <w:noProof/>
             <w:webHidden/>
           </w:rPr>
-          <w:instrText xml:space="preserve"> PAGEREF _Toc242096402 \h </w:instrText>
+          <w:instrText xml:space="preserve"> PAGEREF _Toc242133625 \h </w:instrText>
         </w:r>
         <w:r>
           <w:rPr>
@@ -3883,7 +3883,7 @@
           <w14:ligatures w14:val="standardContextual"/>
         </w:rPr>
       </w:pPr>
-      <w:hyperlink w:anchor="_Toc242096403" w:history="1">
+      <w:hyperlink w:anchor="_Toc242133626" w:history="1">
         <w:r>
           <w:rPr>
             <w:rStyle w:val="Hyperlink"/>
@@ -3910,7 +3910,7 @@
             <w:noProof/>
             <w:webHidden/>
           </w:rPr>
-          <w:instrText xml:space="preserve"> PAGEREF _Toc242096403 \h </w:instrText>
+          <w:instrText xml:space="preserve"> PAGEREF _Toc242133626 \h </w:instrText>
         </w:r>
         <w:r>
           <w:rPr>
@@ -3956,7 +3956,7 @@
           <w14:ligatures w14:val="standardContextual"/>
         </w:rPr>
       </w:pPr>
-      <w:hyperlink w:anchor="_Toc242096404" w:history="1">
+      <w:hyperlink w:anchor="_Toc242133627" w:history="1">
         <w:r>
           <w:rPr>
             <w:rStyle w:val="Hyperlink"/>
@@ -3983,7 +3983,7 @@
             <w:noProof/>
             <w:webHidden/>
           </w:rPr>
-          <w:instrText xml:space="preserve"> PAGEREF _Toc242096404 \h </w:instrText>
+          <w:instrText xml:space="preserve"> PAGEREF _Toc242133627 \h </w:instrText>
         </w:r>
         <w:r>
           <w:rPr>
@@ -4029,7 +4029,7 @@
           <w14:ligatures w14:val="standardContextual"/>
         </w:rPr>
       </w:pPr>
-      <w:hyperlink w:anchor="_Toc242096405" w:history="1">
+      <w:hyperlink w:anchor="_Toc242133628" w:history="1">
         <w:r>
           <w:rPr>
             <w:rStyle w:val="Hyperlink"/>
@@ -4056,7 +4056,7 @@
             <w:noProof/>
             <w:webHidden/>
           </w:rPr>
-          <w:instrText xml:space="preserve"> PAGEREF _Toc242096405 \h </w:instrText>
+          <w:instrText xml:space="preserve"> PAGEREF _Toc242133628 \h </w:instrText>
         </w:r>
         <w:r>
           <w:rPr>
@@ -4102,7 +4102,7 @@
           <w14:ligatures w14:val="standardContextual"/>
         </w:rPr>
       </w:pPr>
-      <w:hyperlink w:anchor="_Toc242096406" w:history="1">
+      <w:hyperlink w:anchor="_Toc242133629" w:history="1">
         <w:r>
           <w:rPr>
             <w:rStyle w:val="Hyperlink"/>
@@ -4129,7 +4129,7 @@
             <w:noProof/>
             <w:webHidden/>
           </w:rPr>
-          <w:instrText xml:space="preserve"> PAGEREF _Toc242096406 \h </w:instrText>
+          <w:instrText xml:space="preserve"> PAGEREF _Toc242133629 \h </w:instrText>
         </w:r>
         <w:r>
           <w:rPr>
@@ -4175,7 +4175,7 @@
           <w14:ligatures w14:val="standardContextual"/>
         </w:rPr>
       </w:pPr>
-      <w:hyperlink w:anchor="_Toc242096407" w:history="1">
+      <w:hyperlink w:anchor="_Toc242133630" w:history="1">
         <w:r>
           <w:rPr>
             <w:rStyle w:val="Hyperlink"/>
@@ -4202,7 +4202,7 @@
             <w:noProof/>
             <w:webHidden/>
           </w:rPr>
-          <w:instrText xml:space="preserve"> PAGEREF _Toc242096407 \h </w:instrText>
+          <w:instrText xml:space="preserve"> PAGEREF _Toc242133630 \h </w:instrText>
         </w:r>
         <w:r>
           <w:rPr>
@@ -4248,7 +4248,7 @@
           <w14:ligatures w14:val="standardContextual"/>
         </w:rPr>
       </w:pPr>
-      <w:hyperlink w:anchor="_Toc242096408" w:history="1">
+      <w:hyperlink w:anchor="_Toc242133631" w:history="1">
         <w:r>
           <w:rPr>
             <w:rStyle w:val="Hyperlink"/>
@@ -4275,7 +4275,7 @@
             <w:noProof/>
             <w:webHidden/>
           </w:rPr>
-          <w:instrText xml:space="preserve"> PAGEREF _Toc242096408 \h </w:instrText>
+          <w:instrText xml:space="preserve"> PAGEREF _Toc242133631 \h </w:instrText>
         </w:r>
         <w:r>
           <w:rPr>
@@ -4321,7 +4321,7 @@
           <w14:ligatures w14:val="standardContextual"/>
         </w:rPr>
       </w:pPr>
-      <w:hyperlink w:anchor="_Toc242096409" w:history="1">
+      <w:hyperlink w:anchor="_Toc242133632" w:history="1">
         <w:r>
           <w:rPr>
             <w:rStyle w:val="Hyperlink"/>
@@ -4348,7 +4348,7 @@
             <w:noProof/>
             <w:webHidden/>
           </w:rPr>
-          <w:instrText xml:space="preserve"> PAGEREF _Toc242096409 \h </w:instrText>
+          <w:instrText xml:space="preserve"> PAGEREF _Toc242133632 \h </w:instrText>
         </w:r>
         <w:r>
           <w:rPr>
@@ -4394,7 +4394,7 @@
           <w14:ligatures w14:val="standardContextual"/>
         </w:rPr>
       </w:pPr>
-      <w:hyperlink w:anchor="_Toc242096410" w:history="1">
+      <w:hyperlink w:anchor="_Toc242133633" w:history="1">
         <w:r>
           <w:rPr>
             <w:rStyle w:val="Hyperlink"/>
@@ -4421,7 +4421,7 @@
             <w:noProof/>
             <w:webHidden/>
           </w:rPr>
-          <w:instrText xml:space="preserve"> PAGEREF _Toc242096410 \h </w:instrText>
+          <w:instrText xml:space="preserve"> PAGEREF _Toc242133633 \h </w:instrText>
         </w:r>
         <w:r>
           <w:rPr>
@@ -4467,7 +4467,7 @@
           <w14:ligatures w14:val="standardContextual"/>
         </w:rPr>
       </w:pPr>
-      <w:hyperlink w:anchor="_Toc242096411" w:history="1">
+      <w:hyperlink w:anchor="_Toc242133634" w:history="1">
         <w:r>
           <w:rPr>
             <w:rStyle w:val="Hyperlink"/>
@@ -4494,7 +4494,7 @@
             <w:noProof/>
             <w:webHidden/>
           </w:rPr>
-          <w:instrText xml:space="preserve"> PAGEREF _Toc242096411 \h </w:instrText>
+          <w:instrText xml:space="preserve"> PAGEREF _Toc242133634 \h </w:instrText>
         </w:r>
         <w:r>
           <w:rPr>
@@ -4540,7 +4540,7 @@
           <w14:ligatures w14:val="standardContextual"/>
         </w:rPr>
       </w:pPr>
-      <w:hyperlink w:anchor="_Toc242096412" w:history="1">
+      <w:hyperlink w:anchor="_Toc242133635" w:history="1">
         <w:r>
           <w:rPr>
             <w:rStyle w:val="Hyperlink"/>
@@ -4567,7 +4567,7 @@
             <w:noProof/>
             <w:webHidden/>
           </w:rPr>
-          <w:instrText xml:space="preserve"> PAGEREF _Toc242096412 \h </w:instrText>
+          <w:instrText xml:space="preserve"> PAGEREF _Toc242133635 \h </w:instrText>
         </w:r>
         <w:r>
           <w:rPr>
@@ -4613,7 +4613,7 @@
           <w14:ligatures w14:val="standardContextual"/>
         </w:rPr>
       </w:pPr>
-      <w:hyperlink w:anchor="_Toc242096413" w:history="1">
+      <w:hyperlink w:anchor="_Toc242133636" w:history="1">
         <w:r>
           <w:rPr>
             <w:rStyle w:val="Hyperlink"/>
@@ -4640,7 +4640,7 @@
             <w:noProof/>
             <w:webHidden/>
           </w:rPr>
-          <w:instrText xml:space="preserve"> PAGEREF _Toc242096413 \h </w:instrText>
+          <w:instrText xml:space="preserve"> PAGEREF _Toc242133636 \h </w:instrText>
         </w:r>
         <w:r>
           <w:rPr>
@@ -4686,7 +4686,7 @@
           <w14:ligatures w14:val="standardContextual"/>
         </w:rPr>
       </w:pPr>
-      <w:hyperlink w:anchor="_Toc242096414" w:history="1">
+      <w:hyperlink w:anchor="_Toc242133637" w:history="1">
         <w:r>
           <w:rPr>
             <w:rStyle w:val="Hyperlink"/>
@@ -4713,7 +4713,7 @@
             <w:noProof/>
             <w:webHidden/>
           </w:rPr>
-          <w:instrText xml:space="preserve"> PAGEREF _Toc242096414 \h </w:instrText>
+          <w:instrText xml:space="preserve"> PAGEREF _Toc242133637 \h </w:instrText>
         </w:r>
         <w:r>
           <w:rPr>
@@ -4759,7 +4759,7 @@
           <w14:ligatures w14:val="standardContextual"/>
         </w:rPr>
       </w:pPr>
-      <w:hyperlink w:anchor="_Toc242096415" w:history="1">
+      <w:hyperlink w:anchor="_Toc242133638" w:history="1">
         <w:r>
           <w:rPr>
             <w:rStyle w:val="Hyperlink"/>
@@ -4786,7 +4786,7 @@
             <w:noProof/>
             <w:webHidden/>
           </w:rPr>
-          <w:instrText xml:space="preserve"> PAGEREF _Toc242096415 \h </w:instrText>
+          <w:instrText xml:space="preserve"> PAGEREF _Toc242133638 \h </w:instrText>
         </w:r>
         <w:r>
           <w:rPr>
@@ -4832,7 +4832,7 @@
           <w14:ligatures w14:val="standardContextual"/>
         </w:rPr>
       </w:pPr>
-      <w:hyperlink w:anchor="_Toc242096416" w:history="1">
+      <w:hyperlink w:anchor="_Toc242133639" w:history="1">
         <w:r>
           <w:rPr>
             <w:rStyle w:val="Hyperlink"/>
@@ -4859,7 +4859,7 @@
             <w:noProof/>
             <w:webHidden/>
           </w:rPr>
-          <w:instrText xml:space="preserve"> PAGEREF _Toc242096416 \h </w:instrText>
+          <w:instrText xml:space="preserve"> PAGEREF _Toc242133639 \h </w:instrText>
         </w:r>
         <w:r>
           <w:rPr>
@@ -4905,7 +4905,7 @@
           <w14:ligatures w14:val="standardContextual"/>
         </w:rPr>
       </w:pPr>
-      <w:hyperlink w:anchor="_Toc242096417" w:history="1">
+      <w:hyperlink w:anchor="_Toc242133640" w:history="1">
         <w:r>
           <w:rPr>
             <w:rStyle w:val="Hyperlink"/>
@@ -4932,7 +4932,7 @@
             <w:noProof/>
             <w:webHidden/>
           </w:rPr>
-          <w:instrText xml:space="preserve"> PAGEREF _Toc242096417 \h </w:instrText>
+          <w:instrText xml:space="preserve"> PAGEREF _Toc242133640 \h </w:instrText>
         </w:r>
         <w:r>
           <w:rPr>
@@ -4978,7 +4978,7 @@
           <w14:ligatures w14:val="standardContextual"/>
         </w:rPr>
       </w:pPr>
-      <w:hyperlink w:anchor="_Toc242096418" w:history="1">
+      <w:hyperlink w:anchor="_Toc242133641" w:history="1">
         <w:r>
           <w:rPr>
             <w:rStyle w:val="Hyperlink"/>
@@ -5005,7 +5005,7 @@
             <w:noProof/>
             <w:webHidden/>
           </w:rPr>
-          <w:instrText xml:space="preserve"> PAGEREF _Toc242096418 \h </w:instrText>
+          <w:instrText xml:space="preserve"> PAGEREF _Toc242133641 \h </w:instrText>
         </w:r>
         <w:r>
           <w:rPr>
@@ -5051,7 +5051,7 @@
           <w14:ligatures w14:val="standardContextual"/>
         </w:rPr>
       </w:pPr>
-      <w:hyperlink w:anchor="_Toc242096419" w:history="1">
+      <w:hyperlink w:anchor="_Toc242133642" w:history="1">
         <w:r>
           <w:rPr>
             <w:rStyle w:val="Hyperlink"/>
@@ -5078,7 +5078,7 @@
             <w:noProof/>
             <w:webHidden/>
           </w:rPr>
-          <w:instrText xml:space="preserve"> PAGEREF _Toc242096419 \h </w:instrText>
+          <w:instrText xml:space="preserve"> PAGEREF _Toc242133642 \h </w:instrText>
         </w:r>
         <w:r>
           <w:rPr>
@@ -5124,7 +5124,7 @@
           <w14:ligatures w14:val="standardContextual"/>
         </w:rPr>
       </w:pPr>
-      <w:hyperlink w:anchor="_Toc242096420" w:history="1">
+      <w:hyperlink w:anchor="_Toc242133643" w:history="1">
         <w:r>
           <w:rPr>
             <w:rStyle w:val="Hyperlink"/>
@@ -5151,7 +5151,7 @@
             <w:noProof/>
             <w:webHidden/>
           </w:rPr>
-          <w:instrText xml:space="preserve"> PAGEREF _Toc242096420 \h </w:instrText>
+          <w:instrText xml:space="preserve"> PAGEREF _Toc242133643 \h </w:instrText>
         </w:r>
         <w:r>
           <w:rPr>
@@ -5197,7 +5197,7 @@
           <w14:ligatures w14:val="standardContextual"/>
         </w:rPr>
       </w:pPr>
-      <w:hyperlink w:anchor="_Toc242096421" w:history="1">
+      <w:hyperlink w:anchor="_Toc242133644" w:history="1">
         <w:r>
           <w:rPr>
             <w:rStyle w:val="Hyperlink"/>
@@ -5224,7 +5224,7 @@
             <w:noProof/>
             <w:webHidden/>
           </w:rPr>
-          <w:instrText xml:space="preserve"> PAGEREF _Toc242096421 \h </w:instrText>
+          <w:instrText xml:space="preserve"> PAGEREF _Toc242133644 \h </w:instrText>
         </w:r>
         <w:r>
           <w:rPr>
@@ -5270,7 +5270,7 @@
           <w14:ligatures w14:val="standardContextual"/>
         </w:rPr>
       </w:pPr>
-      <w:hyperlink w:anchor="_Toc242096422" w:history="1">
+      <w:hyperlink w:anchor="_Toc242133645" w:history="1">
         <w:r>
           <w:rPr>
             <w:rStyle w:val="Hyperlink"/>
@@ -5297,7 +5297,7 @@
             <w:noProof/>
             <w:webHidden/>
           </w:rPr>
-          <w:instrText xml:space="preserve"> PAGEREF _Toc242096422 \h </w:instrText>
+          <w:instrText xml:space="preserve"> PAGEREF _Toc242133645 \h </w:instrText>
         </w:r>
         <w:r>
           <w:rPr>
@@ -5343,7 +5343,7 @@
           <w14:ligatures w14:val="standardContextual"/>
         </w:rPr>
       </w:pPr>
-      <w:hyperlink w:anchor="_Toc242096423" w:history="1">
+      <w:hyperlink w:anchor="_Toc242133646" w:history="1">
         <w:r>
           <w:rPr>
             <w:rStyle w:val="Hyperlink"/>
@@ -5370,7 +5370,7 @@
             <w:noProof/>
             <w:webHidden/>
           </w:rPr>
-          <w:instrText xml:space="preserve"> PAGEREF _Toc242096423 \h </w:instrText>
+          <w:instrText xml:space="preserve"> PAGEREF _Toc242133646 \h </w:instrText>
         </w:r>
         <w:r>
           <w:rPr>
@@ -5416,7 +5416,7 @@
           <w14:ligatures w14:val="standardContextual"/>
         </w:rPr>
       </w:pPr>
-      <w:hyperlink w:anchor="_Toc242096424" w:history="1">
+      <w:hyperlink w:anchor="_Toc242133647" w:history="1">
         <w:r>
           <w:rPr>
             <w:rStyle w:val="Hyperlink"/>
@@ -5443,7 +5443,7 @@
             <w:noProof/>
             <w:webHidden/>
           </w:rPr>
-          <w:instrText xml:space="preserve"> PAGEREF _Toc242096424 \h </w:instrText>
+          <w:instrText xml:space="preserve"> PAGEREF _Toc242133647 \h </w:instrText>
         </w:r>
         <w:r>
           <w:rPr>
@@ -5489,7 +5489,7 @@
           <w14:ligatures w14:val="standardContextual"/>
         </w:rPr>
       </w:pPr>
-      <w:hyperlink w:anchor="_Toc242096425" w:history="1">
+      <w:hyperlink w:anchor="_Toc242133648" w:history="1">
         <w:r>
           <w:rPr>
             <w:rStyle w:val="Hyperlink"/>
@@ -5516,7 +5516,7 @@
             <w:noProof/>
             <w:webHidden/>
           </w:rPr>
-          <w:instrText xml:space="preserve"> PAGEREF _Toc242096425 \h </w:instrText>
+          <w:instrText xml:space="preserve"> PAGEREF _Toc242133648 \h </w:instrText>
         </w:r>
         <w:r>
           <w:rPr>
@@ -5562,7 +5562,7 @@
           <w14:ligatures w14:val="standardContextual"/>
         </w:rPr>
       </w:pPr>
-      <w:hyperlink w:anchor="_Toc242096426" w:history="1">
+      <w:hyperlink w:anchor="_Toc242133649" w:history="1">
         <w:r>
           <w:rPr>
             <w:rStyle w:val="Hyperlink"/>
@@ -5589,7 +5589,7 @@
             <w:noProof/>
             <w:webHidden/>
           </w:rPr>
-          <w:instrText xml:space="preserve"> PAGEREF _Toc242096426 \h </w:instrText>
+          <w:instrText xml:space="preserve"> PAGEREF _Toc242133649 \h </w:instrText>
         </w:r>
         <w:r>
           <w:rPr>
@@ -5635,7 +5635,7 @@
           <w14:ligatures w14:val="standardContextual"/>
         </w:rPr>
       </w:pPr>
-      <w:hyperlink w:anchor="_Toc242096427" w:history="1">
+      <w:hyperlink w:anchor="_Toc242133650" w:history="1">
         <w:r>
           <w:rPr>
             <w:rStyle w:val="Hyperlink"/>
@@ -5662,7 +5662,7 @@
             <w:noProof/>
             <w:webHidden/>
           </w:rPr>
-          <w:instrText xml:space="preserve"> PAGEREF _Toc242096427 \h </w:instrText>
+          <w:instrText xml:space="preserve"> PAGEREF _Toc242133650 \h </w:instrText>
         </w:r>
         <w:r>
           <w:rPr>
@@ -5708,7 +5708,7 @@
           <w14:ligatures w14:val="standardContextual"/>
         </w:rPr>
       </w:pPr>
-      <w:hyperlink w:anchor="_Toc242096428" w:history="1">
+      <w:hyperlink w:anchor="_Toc242133651" w:history="1">
         <w:r>
           <w:rPr>
             <w:rStyle w:val="Hyperlink"/>
@@ -5735,7 +5735,7 @@
             <w:noProof/>
             <w:webHidden/>
           </w:rPr>
-          <w:instrText xml:space="preserve"> PAGEREF _Toc242096428 \h </w:instrText>
+          <w:instrText xml:space="preserve"> PAGEREF _Toc242133651 \h </w:instrText>
         </w:r>
         <w:r>
           <w:rPr>
@@ -5781,7 +5781,7 @@
           <w14:ligatures w14:val="standardContextual"/>
         </w:rPr>
       </w:pPr>
-      <w:hyperlink w:anchor="_Toc242096429" w:history="1">
+      <w:hyperlink w:anchor="_Toc242133652" w:history="1">
         <w:r>
           <w:rPr>
             <w:rStyle w:val="Hyperlink"/>
@@ -5808,7 +5808,7 @@
             <w:noProof/>
             <w:webHidden/>
           </w:rPr>
-          <w:instrText xml:space="preserve"> PAGEREF _Toc242096429 \h </w:instrText>
+          <w:instrText xml:space="preserve"> PAGEREF _Toc242133652 \h </w:instrText>
         </w:r>
         <w:r>
           <w:rPr>
@@ -5854,7 +5854,7 @@
           <w14:ligatures w14:val="standardContextual"/>
         </w:rPr>
       </w:pPr>
-      <w:hyperlink w:anchor="_Toc242096430" w:history="1">
+      <w:hyperlink w:anchor="_Toc242133653" w:history="1">
         <w:r>
           <w:rPr>
             <w:rStyle w:val="Hyperlink"/>
@@ -5881,7 +5881,7 @@
             <w:noProof/>
             <w:webHidden/>
           </w:rPr>
-          <w:instrText xml:space="preserve"> PAGEREF _Toc242096430 \h </w:instrText>
+          <w:instrText xml:space="preserve"> PAGEREF _Toc242133653 \h </w:instrText>
         </w:r>
         <w:r>
           <w:rPr>
@@ -5927,7 +5927,7 @@
           <w14:ligatures w14:val="standardContextual"/>
         </w:rPr>
       </w:pPr>
-      <w:hyperlink w:anchor="_Toc242096431" w:history="1">
+      <w:hyperlink w:anchor="_Toc242133654" w:history="1">
         <w:r>
           <w:rPr>
             <w:rStyle w:val="Hyperlink"/>
@@ -5954,7 +5954,7 @@
             <w:noProof/>
             <w:webHidden/>
           </w:rPr>
-          <w:instrText xml:space="preserve"> PAGEREF _Toc242096431 \h </w:instrText>
+          <w:instrText xml:space="preserve"> PAGEREF _Toc242133654 \h </w:instrText>
         </w:r>
         <w:r>
           <w:rPr>
@@ -6000,7 +6000,7 @@
           <w14:ligatures w14:val="standardContextual"/>
         </w:rPr>
       </w:pPr>
-      <w:hyperlink w:anchor="_Toc242096432" w:history="1">
+      <w:hyperlink w:anchor="_Toc242133655" w:history="1">
         <w:r>
           <w:rPr>
             <w:rStyle w:val="Hyperlink"/>
@@ -6027,7 +6027,7 @@
             <w:noProof/>
             <w:webHidden/>
           </w:rPr>
-          <w:instrText xml:space="preserve"> PAGEREF _Toc242096432 \h </w:instrText>
+          <w:instrText xml:space="preserve"> PAGEREF _Toc242133655 \h </w:instrText>
         </w:r>
         <w:r>
           <w:rPr>
@@ -6073,7 +6073,7 @@
           <w14:ligatures w14:val="standardContextual"/>
         </w:rPr>
       </w:pPr>
-      <w:hyperlink w:anchor="_Toc242096433" w:history="1">
+      <w:hyperlink w:anchor="_Toc242133656" w:history="1">
         <w:r>
           <w:rPr>
             <w:rStyle w:val="Hyperlink"/>
@@ -6100,7 +6100,7 @@
             <w:noProof/>
             <w:webHidden/>
           </w:rPr>
-          <w:instrText xml:space="preserve"> PAGEREF _Toc242096433 \h </w:instrText>
+          <w:instrText xml:space="preserve"> PAGEREF _Toc242133656 \h </w:instrText>
         </w:r>
         <w:r>
           <w:rPr>
@@ -6146,7 +6146,7 @@
           <w14:ligatures w14:val="standardContextual"/>
         </w:rPr>
       </w:pPr>
-      <w:hyperlink w:anchor="_Toc242096434" w:history="1">
+      <w:hyperlink w:anchor="_Toc242133657" w:history="1">
         <w:r>
           <w:rPr>
             <w:rStyle w:val="Hyperlink"/>
@@ -6173,7 +6173,7 @@
             <w:noProof/>
             <w:webHidden/>
           </w:rPr>
-          <w:instrText xml:space="preserve"> PAGEREF _Toc242096434 \h </w:instrText>
+          <w:instrText xml:space="preserve"> PAGEREF _Toc242133657 \h </w:instrText>
         </w:r>
         <w:r>
           <w:rPr>
@@ -6219,7 +6219,7 @@
           <w14:ligatures w14:val="standardContextual"/>
         </w:rPr>
       </w:pPr>
-      <w:hyperlink w:anchor="_Toc242096435" w:history="1">
+      <w:hyperlink w:anchor="_Toc242133658" w:history="1">
         <w:r>
           <w:rPr>
             <w:rStyle w:val="Hyperlink"/>
@@ -6246,7 +6246,7 @@
             <w:noProof/>
             <w:webHidden/>
           </w:rPr>
-          <w:instrText xml:space="preserve"> PAGEREF _Toc242096435 \h </w:instrText>
+          <w:instrText xml:space="preserve"> PAGEREF _Toc242133658 \h </w:instrText>
         </w:r>
         <w:r>
           <w:rPr>
@@ -6292,7 +6292,7 @@
           <w14:ligatures w14:val="standardContextual"/>
         </w:rPr>
       </w:pPr>
-      <w:hyperlink w:anchor="_Toc242096436" w:history="1">
+      <w:hyperlink w:anchor="_Toc242133659" w:history="1">
         <w:r>
           <w:rPr>
             <w:rStyle w:val="Hyperlink"/>
@@ -6319,7 +6319,7 @@
             <w:noProof/>
             <w:webHidden/>
           </w:rPr>
-          <w:instrText xml:space="preserve"> PAGEREF _Toc242096436 \h </w:instrText>
+          <w:instrText xml:space="preserve"> PAGEREF _Toc242133659 \h </w:instrText>
         </w:r>
         <w:r>
           <w:rPr>
@@ -6365,7 +6365,7 @@
           <w14:ligatures w14:val="standardContextual"/>
         </w:rPr>
       </w:pPr>
-      <w:hyperlink w:anchor="_Toc242096437" w:history="1">
+      <w:hyperlink w:anchor="_Toc242133660" w:history="1">
         <w:r>
           <w:rPr>
             <w:rStyle w:val="Hyperlink"/>
@@ -6392,7 +6392,7 @@
             <w:noProof/>
             <w:webHidden/>
           </w:rPr>
-          <w:instrText xml:space="preserve"> PAGEREF _Toc242096437 \h </w:instrText>
+          <w:instrText xml:space="preserve"> PAGEREF _Toc242133660 \h </w:instrText>
         </w:r>
         <w:r>
           <w:rPr>
@@ -6438,7 +6438,7 @@
           <w14:ligatures w14:val="standardContextual"/>
         </w:rPr>
       </w:pPr>
-      <w:hyperlink w:anchor="_Toc242096438" w:history="1">
+      <w:hyperlink w:anchor="_Toc242133661" w:history="1">
         <w:r>
           <w:rPr>
             <w:rStyle w:val="Hyperlink"/>
@@ -6465,7 +6465,7 @@
             <w:noProof/>
             <w:webHidden/>
           </w:rPr>
-          <w:instrText xml:space="preserve"> PAGEREF _Toc242096438 \h </w:instrText>
+          <w:instrText xml:space="preserve"> PAGEREF _Toc242133661 \h </w:instrText>
         </w:r>
         <w:r>
           <w:rPr>
@@ -6511,7 +6511,7 @@
           <w14:ligatures w14:val="standardContextual"/>
         </w:rPr>
       </w:pPr>
-      <w:hyperlink w:anchor="_Toc242096439" w:history="1">
+      <w:hyperlink w:anchor="_Toc242133662" w:history="1">
         <w:r>
           <w:rPr>
             <w:rStyle w:val="Hyperlink"/>
@@ -6538,7 +6538,7 @@
             <w:noProof/>
             <w:webHidden/>
           </w:rPr>
-          <w:instrText xml:space="preserve"> PAGEREF _Toc242096439 \h </w:instrText>
+          <w:instrText xml:space="preserve"> PAGEREF _Toc242133662 \h </w:instrText>
         </w:r>
         <w:r>
           <w:rPr>
@@ -6584,7 +6584,7 @@
           <w14:ligatures w14:val="standardContextual"/>
         </w:rPr>
       </w:pPr>
-      <w:hyperlink w:anchor="_Toc242096440" w:history="1">
+      <w:hyperlink w:anchor="_Toc242133663" w:history="1">
         <w:r>
           <w:rPr>
             <w:rStyle w:val="Hyperlink"/>
@@ -6611,7 +6611,7 @@
             <w:noProof/>
             <w:webHidden/>
           </w:rPr>
-          <w:instrText xml:space="preserve"> PAGEREF _Toc242096440 \h </w:instrText>
+          <w:instrText xml:space="preserve"> PAGEREF _Toc242133663 \h </w:instrText>
         </w:r>
         <w:r>
           <w:rPr>
@@ -6657,7 +6657,7 @@
           <w14:ligatures w14:val="standardContextual"/>
         </w:rPr>
       </w:pPr>
-      <w:hyperlink w:anchor="_Toc242096441" w:history="1">
+      <w:hyperlink w:anchor="_Toc242133664" w:history="1">
         <w:r>
           <w:rPr>
             <w:rStyle w:val="Hyperlink"/>
@@ -6684,7 +6684,7 @@
             <w:noProof/>
             <w:webHidden/>
           </w:rPr>
-          <w:instrText xml:space="preserve"> PAGEREF _Toc242096441 \h </w:instrText>
+          <w:instrText xml:space="preserve"> PAGEREF _Toc242133664 \h </w:instrText>
         </w:r>
         <w:r>
           <w:rPr>
@@ -6760,7 +6760,7 @@
       <w:r>
         <w:fldChar w:fldCharType="separate"/>
       </w:r>
-      <w:hyperlink w:anchor="_Toc242096442" w:history="1">
+      <w:hyperlink w:anchor="_Toc242133665" w:history="1">
         <w:r>
           <w:rPr>
             <w:rStyle w:val="Hyperlink"/>
@@ -6787,7 +6787,7 @@
             <w:noProof/>
             <w:webHidden/>
           </w:rPr>
-          <w:instrText xml:space="preserve"> PAGEREF _Toc242096442 \h </w:instrText>
+          <w:instrText xml:space="preserve"> PAGEREF _Toc242133665 \h </w:instrText>
         </w:r>
         <w:r>
           <w:rPr>
@@ -6833,7 +6833,7 @@
           <w14:ligatures w14:val="standardContextual"/>
         </w:rPr>
       </w:pPr>
-      <w:hyperlink w:anchor="_Toc242096443" w:history="1">
+      <w:hyperlink w:anchor="_Toc242133666" w:history="1">
         <w:r>
           <w:rPr>
             <w:rStyle w:val="Hyperlink"/>
@@ -6860,7 +6860,7 @@
             <w:noProof/>
             <w:webHidden/>
           </w:rPr>
-          <w:instrText xml:space="preserve"> PAGEREF _Toc242096443 \h </w:instrText>
+          <w:instrText xml:space="preserve"> PAGEREF _Toc242133666 \h </w:instrText>
         </w:r>
         <w:r>
           <w:rPr>
@@ -6906,7 +6906,7 @@
           <w14:ligatures w14:val="standardContextual"/>
         </w:rPr>
       </w:pPr>
-      <w:hyperlink w:anchor="_Toc242096444" w:history="1">
+      <w:hyperlink w:anchor="_Toc242133667" w:history="1">
         <w:r>
           <w:rPr>
             <w:rStyle w:val="Hyperlink"/>
@@ -6933,7 +6933,7 @@
             <w:noProof/>
             <w:webHidden/>
           </w:rPr>
-          <w:instrText xml:space="preserve"> PAGEREF _Toc242096444 \h </w:instrText>
+          <w:instrText xml:space="preserve"> PAGEREF _Toc242133667 \h </w:instrText>
         </w:r>
         <w:r>
           <w:rPr>
@@ -6979,7 +6979,7 @@
           <w14:ligatures w14:val="standardContextual"/>
         </w:rPr>
       </w:pPr>
-      <w:hyperlink w:anchor="_Toc242096445" w:history="1">
+      <w:hyperlink w:anchor="_Toc242133668" w:history="1">
         <w:r>
           <w:rPr>
             <w:rStyle w:val="Hyperlink"/>
@@ -7006,7 +7006,7 @@
             <w:noProof/>
             <w:webHidden/>
           </w:rPr>
-          <w:instrText xml:space="preserve"> PAGEREF _Toc242096445 \h </w:instrText>
+          <w:instrText xml:space="preserve"> PAGEREF _Toc242133668 \h </w:instrText>
         </w:r>
         <w:r>
           <w:rPr>
@@ -7052,7 +7052,7 @@
           <w14:ligatures w14:val="standardContextual"/>
         </w:rPr>
       </w:pPr>
-      <w:hyperlink w:anchor="_Toc242096446" w:history="1">
+      <w:hyperlink w:anchor="_Toc242133669" w:history="1">
         <w:r>
           <w:rPr>
             <w:rStyle w:val="Hyperlink"/>
@@ -7079,7 +7079,7 @@
             <w:noProof/>
             <w:webHidden/>
           </w:rPr>
-          <w:instrText xml:space="preserve"> PAGEREF _Toc242096446 \h </w:instrText>
+          <w:instrText xml:space="preserve"> PAGEREF _Toc242133669 \h </w:instrText>
         </w:r>
         <w:r>
           <w:rPr>
@@ -7125,7 +7125,7 @@
           <w14:ligatures w14:val="standardContextual"/>
         </w:rPr>
       </w:pPr>
-      <w:hyperlink w:anchor="_Toc242096447" w:history="1">
+      <w:hyperlink w:anchor="_Toc242133670" w:history="1">
         <w:r>
           <w:rPr>
             <w:rStyle w:val="Hyperlink"/>
@@ -7152,7 +7152,7 @@
             <w:noProof/>
             <w:webHidden/>
           </w:rPr>
-          <w:instrText xml:space="preserve"> PAGEREF _Toc242096447 \h </w:instrText>
+          <w:instrText xml:space="preserve"> PAGEREF _Toc242133670 \h </w:instrText>
         </w:r>
         <w:r>
           <w:rPr>
@@ -7198,7 +7198,7 @@
           <w14:ligatures w14:val="standardContextual"/>
         </w:rPr>
       </w:pPr>
-      <w:hyperlink w:anchor="_Toc242096448" w:history="1">
+      <w:hyperlink w:anchor="_Toc242133671" w:history="1">
         <w:r>
           <w:rPr>
             <w:rStyle w:val="Hyperlink"/>
@@ -7225,7 +7225,7 @@
             <w:noProof/>
             <w:webHidden/>
           </w:rPr>
-          <w:instrText xml:space="preserve"> PAGEREF _Toc242096448 \h </w:instrText>
+          <w:instrText xml:space="preserve"> PAGEREF _Toc242133671 \h </w:instrText>
         </w:r>
         <w:r>
           <w:rPr>
@@ -7271,7 +7271,7 @@
           <w14:ligatures w14:val="standardContextual"/>
         </w:rPr>
       </w:pPr>
-      <w:hyperlink w:anchor="_Toc242096449" w:history="1">
+      <w:hyperlink w:anchor="_Toc242133672" w:history="1">
         <w:r>
           <w:rPr>
             <w:rStyle w:val="Hyperlink"/>
@@ -7298,7 +7298,7 @@
             <w:noProof/>
             <w:webHidden/>
           </w:rPr>
-          <w:instrText xml:space="preserve"> PAGEREF _Toc242096449 \h </w:instrText>
+          <w:instrText xml:space="preserve"> PAGEREF _Toc242133672 \h </w:instrText>
         </w:r>
         <w:r>
           <w:rPr>
@@ -7344,7 +7344,7 @@
           <w14:ligatures w14:val="standardContextual"/>
         </w:rPr>
       </w:pPr>
-      <w:hyperlink w:anchor="_Toc242096450" w:history="1">
+      <w:hyperlink w:anchor="_Toc242133673" w:history="1">
         <w:r>
           <w:rPr>
             <w:rStyle w:val="Hyperlink"/>
@@ -7371,7 +7371,7 @@
             <w:noProof/>
             <w:webHidden/>
           </w:rPr>
-          <w:instrText xml:space="preserve"> PAGEREF _Toc242096450 \h </w:instrText>
+          <w:instrText xml:space="preserve"> PAGEREF _Toc242133673 \h </w:instrText>
         </w:r>
         <w:r>
           <w:rPr>
@@ -7417,7 +7417,7 @@
           <w14:ligatures w14:val="standardContextual"/>
         </w:rPr>
       </w:pPr>
-      <w:hyperlink w:anchor="_Toc242096451" w:history="1">
+      <w:hyperlink w:anchor="_Toc242133674" w:history="1">
         <w:r>
           <w:rPr>
             <w:rStyle w:val="Hyperlink"/>
@@ -7444,7 +7444,7 @@
             <w:noProof/>
             <w:webHidden/>
           </w:rPr>
-          <w:instrText xml:space="preserve"> PAGEREF _Toc242096451 \h </w:instrText>
+          <w:instrText xml:space="preserve"> PAGEREF _Toc242133674 \h </w:instrText>
         </w:r>
         <w:r>
           <w:rPr>
@@ -7490,7 +7490,7 @@
           <w14:ligatures w14:val="standardContextual"/>
         </w:rPr>
       </w:pPr>
-      <w:hyperlink w:anchor="_Toc242096452" w:history="1">
+      <w:hyperlink w:anchor="_Toc242133675" w:history="1">
         <w:r>
           <w:rPr>
             <w:rStyle w:val="Hyperlink"/>
@@ -7517,7 +7517,7 @@
             <w:noProof/>
             <w:webHidden/>
           </w:rPr>
-          <w:instrText xml:space="preserve"> PAGEREF _Toc242096452 \h </w:instrText>
+          <w:instrText xml:space="preserve"> PAGEREF _Toc242133675 \h </w:instrText>
         </w:r>
         <w:r>
           <w:rPr>
@@ -7563,7 +7563,7 @@
           <w14:ligatures w14:val="standardContextual"/>
         </w:rPr>
       </w:pPr>
-      <w:hyperlink w:anchor="_Toc242096453" w:history="1">
+      <w:hyperlink w:anchor="_Toc242133676" w:history="1">
         <w:r>
           <w:rPr>
             <w:rStyle w:val="Hyperlink"/>
@@ -7590,7 +7590,7 @@
             <w:noProof/>
             <w:webHidden/>
           </w:rPr>
-          <w:instrText xml:space="preserve"> PAGEREF _Toc242096453 \h </w:instrText>
+          <w:instrText xml:space="preserve"> PAGEREF _Toc242133676 \h </w:instrText>
         </w:r>
         <w:r>
           <w:rPr>
@@ -7636,7 +7636,7 @@
           <w14:ligatures w14:val="standardContextual"/>
         </w:rPr>
       </w:pPr>
-      <w:hyperlink w:anchor="_Toc242096454" w:history="1">
+      <w:hyperlink w:anchor="_Toc242133677" w:history="1">
         <w:r>
           <w:rPr>
             <w:rStyle w:val="Hyperlink"/>
@@ -7663,7 +7663,7 @@
             <w:noProof/>
             <w:webHidden/>
           </w:rPr>
-          <w:instrText xml:space="preserve"> PAGEREF _Toc242096454 \h </w:instrText>
+          <w:instrText xml:space="preserve"> PAGEREF _Toc242133677 \h </w:instrText>
         </w:r>
         <w:r>
           <w:rPr>
@@ -7709,7 +7709,7 @@
           <w14:ligatures w14:val="standardContextual"/>
         </w:rPr>
       </w:pPr>
-      <w:hyperlink w:anchor="_Toc242096455" w:history="1">
+      <w:hyperlink w:anchor="_Toc242133678" w:history="1">
         <w:r>
           <w:rPr>
             <w:rStyle w:val="Hyperlink"/>
@@ -7736,7 +7736,7 @@
             <w:noProof/>
             <w:webHidden/>
           </w:rPr>
-          <w:instrText xml:space="preserve"> PAGEREF _Toc242096455 \h </w:instrText>
+          <w:instrText xml:space="preserve"> PAGEREF _Toc242133678 \h </w:instrText>
         </w:r>
         <w:r>
           <w:rPr>
@@ -7782,7 +7782,7 @@
           <w14:ligatures w14:val="standardContextual"/>
         </w:rPr>
       </w:pPr>
-      <w:hyperlink w:anchor="_Toc242096456" w:history="1">
+      <w:hyperlink w:anchor="_Toc242133679" w:history="1">
         <w:r>
           <w:rPr>
             <w:rStyle w:val="Hyperlink"/>
@@ -7809,7 +7809,7 @@
             <w:noProof/>
             <w:webHidden/>
           </w:rPr>
-          <w:instrText xml:space="preserve"> PAGEREF _Toc242096456 \h </w:instrText>
+          <w:instrText xml:space="preserve"> PAGEREF _Toc242133679 \h </w:instrText>
         </w:r>
         <w:r>
           <w:rPr>
@@ -7855,7 +7855,7 @@
           <w14:ligatures w14:val="standardContextual"/>
         </w:rPr>
       </w:pPr>
-      <w:hyperlink w:anchor="_Toc242096457" w:history="1">
+      <w:hyperlink w:anchor="_Toc242133680" w:history="1">
         <w:r>
           <w:rPr>
             <w:rStyle w:val="Hyperlink"/>
@@ -7882,7 +7882,7 @@
             <w:noProof/>
             <w:webHidden/>
           </w:rPr>
-          <w:instrText xml:space="preserve"> PAGEREF _Toc242096457 \h </w:instrText>
+          <w:instrText xml:space="preserve"> PAGEREF _Toc242133680 \h </w:instrText>
         </w:r>
         <w:r>
           <w:rPr>
@@ -7928,7 +7928,7 @@
           <w14:ligatures w14:val="standardContextual"/>
         </w:rPr>
       </w:pPr>
-      <w:hyperlink w:anchor="_Toc242096458" w:history="1">
+      <w:hyperlink w:anchor="_Toc242133681" w:history="1">
         <w:r>
           <w:rPr>
             <w:rStyle w:val="Hyperlink"/>
@@ -7955,7 +7955,7 @@
             <w:noProof/>
             <w:webHidden/>
           </w:rPr>
-          <w:instrText xml:space="preserve"> PAGEREF _Toc242096458 \h </w:instrText>
+          <w:instrText xml:space="preserve"> PAGEREF _Toc242133681 \h </w:instrText>
         </w:r>
         <w:r>
           <w:rPr>
@@ -8001,7 +8001,7 @@
           <w14:ligatures w14:val="standardContextual"/>
         </w:rPr>
       </w:pPr>
-      <w:hyperlink w:anchor="_Toc242096459" w:history="1">
+      <w:hyperlink w:anchor="_Toc242133682" w:history="1">
         <w:r>
           <w:rPr>
             <w:rStyle w:val="Hyperlink"/>
@@ -8028,7 +8028,7 @@
             <w:noProof/>
             <w:webHidden/>
           </w:rPr>
-          <w:instrText xml:space="preserve"> PAGEREF _Toc242096459 \h </w:instrText>
+          <w:instrText xml:space="preserve"> PAGEREF _Toc242133682 \h </w:instrText>
         </w:r>
         <w:r>
           <w:rPr>
@@ -8074,7 +8074,7 @@
           <w14:ligatures w14:val="standardContextual"/>
         </w:rPr>
       </w:pPr>
-      <w:hyperlink w:anchor="_Toc242096460" w:history="1">
+      <w:hyperlink w:anchor="_Toc242133683" w:history="1">
         <w:r>
           <w:rPr>
             <w:rStyle w:val="Hyperlink"/>
@@ -8101,7 +8101,7 @@
             <w:noProof/>
             <w:webHidden/>
           </w:rPr>
-          <w:instrText xml:space="preserve"> PAGEREF _Toc242096460 \h </w:instrText>
+          <w:instrText xml:space="preserve"> PAGEREF _Toc242133683 \h </w:instrText>
         </w:r>
         <w:r>
           <w:rPr>
@@ -8147,7 +8147,7 @@
           <w14:ligatures w14:val="standardContextual"/>
         </w:rPr>
       </w:pPr>
-      <w:hyperlink w:anchor="_Toc242096461" w:history="1">
+      <w:hyperlink w:anchor="_Toc242133684" w:history="1">
         <w:r>
           <w:rPr>
             <w:rStyle w:val="Hyperlink"/>
@@ -8174,7 +8174,7 @@
             <w:noProof/>
             <w:webHidden/>
           </w:rPr>
-          <w:instrText xml:space="preserve"> PAGEREF _Toc242096461 \h </w:instrText>
+          <w:instrText xml:space="preserve"> PAGEREF _Toc242133684 \h </w:instrText>
         </w:r>
         <w:r>
           <w:rPr>
@@ -8220,7 +8220,7 @@
           <w14:ligatures w14:val="standardContextual"/>
         </w:rPr>
       </w:pPr>
-      <w:hyperlink w:anchor="_Toc242096462" w:history="1">
+      <w:hyperlink w:anchor="_Toc242133685" w:history="1">
         <w:r>
           <w:rPr>
             <w:rStyle w:val="Hyperlink"/>
@@ -8247,7 +8247,7 @@
             <w:noProof/>
             <w:webHidden/>
           </w:rPr>
-          <w:instrText xml:space="preserve"> PAGEREF _Toc242096462 \h </w:instrText>
+          <w:instrText xml:space="preserve"> PAGEREF _Toc242133685 \h </w:instrText>
         </w:r>
         <w:r>
           <w:rPr>
@@ -8293,7 +8293,7 @@
           <w14:ligatures w14:val="standardContextual"/>
         </w:rPr>
       </w:pPr>
-      <w:hyperlink w:anchor="_Toc242096463" w:history="1">
+      <w:hyperlink w:anchor="_Toc242133686" w:history="1">
         <w:r>
           <w:rPr>
             <w:rStyle w:val="Hyperlink"/>
@@ -8320,7 +8320,7 @@
             <w:noProof/>
             <w:webHidden/>
           </w:rPr>
-          <w:instrText xml:space="preserve"> PAGEREF _Toc242096463 \h </w:instrText>
+          <w:instrText xml:space="preserve"> PAGEREF _Toc242133686 \h </w:instrText>
         </w:r>
         <w:r>
           <w:rPr>
@@ -8366,7 +8366,7 @@
           <w14:ligatures w14:val="standardContextual"/>
         </w:rPr>
       </w:pPr>
-      <w:hyperlink w:anchor="_Toc242096464" w:history="1">
+      <w:hyperlink w:anchor="_Toc242133687" w:history="1">
         <w:r>
           <w:rPr>
             <w:rStyle w:val="Hyperlink"/>
@@ -8393,7 +8393,7 @@
             <w:noProof/>
             <w:webHidden/>
           </w:rPr>
-          <w:instrText xml:space="preserve"> PAGEREF _Toc242096464 \h </w:instrText>
+          <w:instrText xml:space="preserve"> PAGEREF _Toc242133687 \h </w:instrText>
         </w:r>
         <w:r>
           <w:rPr>
@@ -8439,7 +8439,7 @@
           <w14:ligatures w14:val="standardContextual"/>
         </w:rPr>
       </w:pPr>
-      <w:hyperlink w:anchor="_Toc242096465" w:history="1">
+      <w:hyperlink w:anchor="_Toc242133688" w:history="1">
         <w:r>
           <w:rPr>
             <w:rStyle w:val="Hyperlink"/>
@@ -8466,7 +8466,7 @@
             <w:noProof/>
             <w:webHidden/>
           </w:rPr>
-          <w:instrText xml:space="preserve"> PAGEREF _Toc242096465 \h </w:instrText>
+          <w:instrText xml:space="preserve"> PAGEREF _Toc242133688 \h </w:instrText>
         </w:r>
         <w:r>
           <w:rPr>
@@ -8512,7 +8512,7 @@
           <w14:ligatures w14:val="standardContextual"/>
         </w:rPr>
       </w:pPr>
-      <w:hyperlink w:anchor="_Toc242096466" w:history="1">
+      <w:hyperlink w:anchor="_Toc242133689" w:history="1">
         <w:r>
           <w:rPr>
             <w:rStyle w:val="Hyperlink"/>
@@ -8539,7 +8539,7 @@
             <w:noProof/>
             <w:webHidden/>
           </w:rPr>
-          <w:instrText xml:space="preserve"> PAGEREF _Toc242096466 \h </w:instrText>
+          <w:instrText xml:space="preserve"> PAGEREF _Toc242133689 \h </w:instrText>
         </w:r>
         <w:r>
           <w:rPr>
@@ -8613,7 +8613,7 @@
       <w:r>
         <w:fldChar w:fldCharType="separate"/>
       </w:r>
-      <w:hyperlink w:anchor="_Toc242096467" w:history="1">
+      <w:hyperlink w:anchor="_Toc242133690" w:history="1">
         <w:r>
           <w:rPr>
             <w:rStyle w:val="Hyperlink"/>
@@ -8640,7 +8640,7 @@
             <w:noProof/>
             <w:webHidden/>
           </w:rPr>
-          <w:instrText xml:space="preserve"> PAGEREF _Toc242096467 \h </w:instrText>
+          <w:instrText xml:space="preserve"> PAGEREF _Toc242133690 \h </w:instrText>
         </w:r>
         <w:r>
           <w:rPr>
@@ -8686,7 +8686,7 @@
           <w14:ligatures w14:val="standardContextual"/>
         </w:rPr>
       </w:pPr>
-      <w:hyperlink w:anchor="_Toc242096468" w:history="1">
+      <w:hyperlink w:anchor="_Toc242133691" w:history="1">
         <w:r>
           <w:rPr>
             <w:rStyle w:val="Hyperlink"/>
@@ -8713,7 +8713,7 @@
             <w:noProof/>
             <w:webHidden/>
           </w:rPr>
-          <w:instrText xml:space="preserve"> PAGEREF _Toc242096468 \h </w:instrText>
+          <w:instrText xml:space="preserve"> PAGEREF _Toc242133691 \h </w:instrText>
         </w:r>
         <w:r>
           <w:rPr>
@@ -8759,7 +8759,7 @@
           <w14:ligatures w14:val="standardContextual"/>
         </w:rPr>
       </w:pPr>
-      <w:hyperlink w:anchor="_Toc242096469" w:history="1">
+      <w:hyperlink w:anchor="_Toc242133692" w:history="1">
         <w:r>
           <w:rPr>
             <w:rStyle w:val="Hyperlink"/>
@@ -8786,7 +8786,7 @@
             <w:noProof/>
             <w:webHidden/>
           </w:rPr>
-          <w:instrText xml:space="preserve"> PAGEREF _Toc242096469 \h </w:instrText>
+          <w:instrText xml:space="preserve"> PAGEREF _Toc242133692 \h </w:instrText>
         </w:r>
         <w:r>
           <w:rPr>
@@ -8832,7 +8832,7 @@
           <w14:ligatures w14:val="standardContextual"/>
         </w:rPr>
       </w:pPr>
-      <w:hyperlink w:anchor="_Toc242096470" w:history="1">
+      <w:hyperlink w:anchor="_Toc242133693" w:history="1">
         <w:r>
           <w:rPr>
             <w:rStyle w:val="Hyperlink"/>
@@ -8859,7 +8859,7 @@
             <w:noProof/>
             <w:webHidden/>
           </w:rPr>
-          <w:instrText xml:space="preserve"> PAGEREF _Toc242096470 \h </w:instrText>
+          <w:instrText xml:space="preserve"> PAGEREF _Toc242133693 \h </w:instrText>
         </w:r>
         <w:r>
           <w:rPr>
@@ -8905,7 +8905,7 @@
           <w14:ligatures w14:val="standardContextual"/>
         </w:rPr>
       </w:pPr>
-      <w:hyperlink w:anchor="_Toc242096471" w:history="1">
+      <w:hyperlink w:anchor="_Toc242133694" w:history="1">
         <w:r>
           <w:rPr>
             <w:rStyle w:val="Hyperlink"/>
@@ -8932,7 +8932,7 @@
             <w:noProof/>
             <w:webHidden/>
           </w:rPr>
-          <w:instrText xml:space="preserve"> PAGEREF _Toc242096471 \h </w:instrText>
+          <w:instrText xml:space="preserve"> PAGEREF _Toc242133694 \h </w:instrText>
         </w:r>
         <w:r>
           <w:rPr>
@@ -8978,7 +8978,7 @@
           <w14:ligatures w14:val="standardContextual"/>
         </w:rPr>
       </w:pPr>
-      <w:hyperlink w:anchor="_Toc242096472" w:history="1">
+      <w:hyperlink w:anchor="_Toc242133695" w:history="1">
         <w:r>
           <w:rPr>
             <w:rStyle w:val="Hyperlink"/>
@@ -9013,7 +9013,7 @@
             <w:noProof/>
             <w:webHidden/>
           </w:rPr>
-          <w:instrText xml:space="preserve"> PAGEREF _Toc242096472 \h </w:instrText>
+          <w:instrText xml:space="preserve"> PAGEREF _Toc242133695 \h </w:instrText>
         </w:r>
         <w:r>
           <w:rPr>
@@ -9059,7 +9059,7 @@
           <w14:ligatures w14:val="standardContextual"/>
         </w:rPr>
       </w:pPr>
-      <w:hyperlink w:anchor="_Toc242096473" w:history="1">
+      <w:hyperlink w:anchor="_Toc242133696" w:history="1">
         <w:r>
           <w:rPr>
             <w:rStyle w:val="Hyperlink"/>
@@ -9086,7 +9086,7 @@
             <w:noProof/>
             <w:webHidden/>
           </w:rPr>
-          <w:instrText xml:space="preserve"> PAGEREF _Toc242096473 \h </w:instrText>
+          <w:instrText xml:space="preserve"> PAGEREF _Toc242133696 \h </w:instrText>
         </w:r>
         <w:r>
           <w:rPr>
@@ -9132,7 +9132,7 @@
           <w14:ligatures w14:val="standardContextual"/>
         </w:rPr>
       </w:pPr>
-      <w:hyperlink w:anchor="_Toc242096474" w:history="1">
+      <w:hyperlink w:anchor="_Toc242133697" w:history="1">
         <w:r>
           <w:rPr>
             <w:rStyle w:val="Hyperlink"/>
@@ -9159,7 +9159,7 @@
             <w:noProof/>
             <w:webHidden/>
           </w:rPr>
-          <w:instrText xml:space="preserve"> PAGEREF _Toc242096474 \h </w:instrText>
+          <w:instrText xml:space="preserve"> PAGEREF _Toc242133697 \h </w:instrText>
         </w:r>
         <w:r>
           <w:rPr>
@@ -9205,7 +9205,7 @@
           <w14:ligatures w14:val="standardContextual"/>
         </w:rPr>
       </w:pPr>
-      <w:hyperlink w:anchor="_Toc242096475" w:history="1">
+      <w:hyperlink w:anchor="_Toc242133698" w:history="1">
         <w:r>
           <w:rPr>
             <w:rStyle w:val="Hyperlink"/>
@@ -9232,7 +9232,7 @@
             <w:noProof/>
             <w:webHidden/>
           </w:rPr>
-          <w:instrText xml:space="preserve"> PAGEREF _Toc242096475 \h </w:instrText>
+          <w:instrText xml:space="preserve"> PAGEREF _Toc242133698 \h </w:instrText>
         </w:r>
         <w:r>
           <w:rPr>
@@ -9278,7 +9278,7 @@
           <w14:ligatures w14:val="standardContextual"/>
         </w:rPr>
       </w:pPr>
-      <w:hyperlink w:anchor="_Toc242096476" w:history="1">
+      <w:hyperlink w:anchor="_Toc242133699" w:history="1">
         <w:r>
           <w:rPr>
             <w:rStyle w:val="Hyperlink"/>
@@ -9305,7 +9305,7 @@
             <w:noProof/>
             <w:webHidden/>
           </w:rPr>
-          <w:instrText xml:space="preserve"> PAGEREF _Toc242096476 \h </w:instrText>
+          <w:instrText xml:space="preserve"> PAGEREF _Toc242133699 \h </w:instrText>
         </w:r>
         <w:r>
           <w:rPr>
@@ -9351,7 +9351,7 @@
           <w14:ligatures w14:val="standardContextual"/>
         </w:rPr>
       </w:pPr>
-      <w:hyperlink w:anchor="_Toc242096477" w:history="1">
+      <w:hyperlink w:anchor="_Toc242133700" w:history="1">
         <w:r>
           <w:rPr>
             <w:rStyle w:val="Hyperlink"/>
@@ -9378,7 +9378,7 @@
             <w:noProof/>
             <w:webHidden/>
           </w:rPr>
-          <w:instrText xml:space="preserve"> PAGEREF _Toc242096477 \h </w:instrText>
+          <w:instrText xml:space="preserve"> PAGEREF _Toc242133700 \h </w:instrText>
         </w:r>
         <w:r>
           <w:rPr>
@@ -9424,7 +9424,7 @@
           <w14:ligatures w14:val="standardContextual"/>
         </w:rPr>
       </w:pPr>
-      <w:hyperlink w:anchor="_Toc242096478" w:history="1">
+      <w:hyperlink w:anchor="_Toc242133701" w:history="1">
         <w:r>
           <w:rPr>
             <w:rStyle w:val="Hyperlink"/>
@@ -9451,7 +9451,7 @@
             <w:noProof/>
             <w:webHidden/>
           </w:rPr>
-          <w:instrText xml:space="preserve"> PAGEREF _Toc242096478 \h </w:instrText>
+          <w:instrText xml:space="preserve"> PAGEREF _Toc242133701 \h </w:instrText>
         </w:r>
         <w:r>
           <w:rPr>
@@ -9497,7 +9497,7 @@
           <w14:ligatures w14:val="standardContextual"/>
         </w:rPr>
       </w:pPr>
-      <w:hyperlink w:anchor="_Toc242096479" w:history="1">
+      <w:hyperlink w:anchor="_Toc242133702" w:history="1">
         <w:r>
           <w:rPr>
             <w:rStyle w:val="Hyperlink"/>
@@ -9524,7 +9524,7 @@
             <w:noProof/>
             <w:webHidden/>
           </w:rPr>
-          <w:instrText xml:space="preserve"> PAGEREF _Toc242096479 \h </w:instrText>
+          <w:instrText xml:space="preserve"> PAGEREF _Toc242133702 \h </w:instrText>
         </w:r>
         <w:r>
           <w:rPr>
@@ -9570,7 +9570,7 @@
           <w14:ligatures w14:val="standardContextual"/>
         </w:rPr>
       </w:pPr>
-      <w:hyperlink w:anchor="_Toc242096480" w:history="1">
+      <w:hyperlink w:anchor="_Toc242133703" w:history="1">
         <w:r>
           <w:rPr>
             <w:rStyle w:val="Hyperlink"/>
@@ -9597,7 +9597,7 @@
             <w:noProof/>
             <w:webHidden/>
           </w:rPr>
-          <w:instrText xml:space="preserve"> PAGEREF _Toc242096480 \h </w:instrText>
+          <w:instrText xml:space="preserve"> PAGEREF _Toc242133703 \h </w:instrText>
         </w:r>
         <w:r>
           <w:rPr>
@@ -9643,7 +9643,7 @@
           <w14:ligatures w14:val="standardContextual"/>
         </w:rPr>
       </w:pPr>
-      <w:hyperlink w:anchor="_Toc242096481" w:history="1">
+      <w:hyperlink w:anchor="_Toc242133704" w:history="1">
         <w:r>
           <w:rPr>
             <w:rStyle w:val="Hyperlink"/>
@@ -9670,7 +9670,7 @@
             <w:noProof/>
             <w:webHidden/>
           </w:rPr>
-          <w:instrText xml:space="preserve"> PAGEREF _Toc242096481 \h </w:instrText>
+          <w:instrText xml:space="preserve"> PAGEREF _Toc242133704 \h </w:instrText>
         </w:r>
         <w:r>
           <w:rPr>
@@ -9711,7 +9711,7 @@
         <w:pStyle w:val="Heading1"/>
         <w:pageBreakBefore/>
       </w:pPr>
-      <w:bookmarkStart w:id="0" w:name="_Toc242096369"/>
+      <w:bookmarkStart w:id="0" w:name="_Toc242133592"/>
       <w:r>
         <w:lastRenderedPageBreak/>
         <w:t>CHƯƠNG 1. GIỚI THIỆU</w:t>
@@ -9722,7 +9722,7 @@
       <w:pPr>
         <w:pStyle w:val="Heading2"/>
       </w:pPr>
-      <w:bookmarkStart w:id="1" w:name="_Toc242096370"/>
+      <w:bookmarkStart w:id="1" w:name="_Toc242133593"/>
       <w:r>
         <w:t>1.1. Mục đích của tài liệu</w:t>
       </w:r>
@@ -9769,7 +9769,7 @@
       <w:pPr>
         <w:pStyle w:val="Heading2"/>
       </w:pPr>
-      <w:bookmarkStart w:id="2" w:name="_Toc242096371"/>
+      <w:bookmarkStart w:id="2" w:name="_Toc242133594"/>
       <w:r>
         <w:t>1.2. Tổng quan phần mềm</w:t>
       </w:r>
@@ -9916,7 +9916,7 @@
       <w:pPr>
         <w:pStyle w:val="Heading2"/>
       </w:pPr>
-      <w:bookmarkStart w:id="3" w:name="_Toc242096372"/>
+      <w:bookmarkStart w:id="3" w:name="_Toc242133595"/>
       <w:r>
         <w:t>1.3. Vai trò người dùng và chức năng</w:t>
       </w:r>
@@ -9954,7 +9954,7 @@
       <w:pPr>
         <w:pStyle w:val="TableCaption"/>
       </w:pPr>
-      <w:bookmarkStart w:id="4" w:name="_Toc242096467"/>
+      <w:bookmarkStart w:id="4" w:name="_Toc242133690"/>
       <w:r>
         <w:t>Bảng 1.1. Chức năng hiển thị theo vai trò</w:t>
       </w:r>
@@ -14157,7 +14157,7 @@
       <w:pPr>
         <w:pStyle w:val="Heading2"/>
       </w:pPr>
-      <w:bookmarkStart w:id="5" w:name="_Toc242096373"/>
+      <w:bookmarkStart w:id="5" w:name="_Toc242133596"/>
       <w:r>
         <w:t>1.4. Yêu cầu hệ thống</w:t>
       </w:r>
@@ -14167,7 +14167,7 @@
       <w:pPr>
         <w:pStyle w:val="TableCaption"/>
       </w:pPr>
-      <w:bookmarkStart w:id="6" w:name="_Toc242096468"/>
+      <w:bookmarkStart w:id="6" w:name="_Toc242133691"/>
       <w:r>
         <w:t>Bảng 1.2. Yêu cầu phần cứng và phần mềm</w:t>
       </w:r>
@@ -14759,7 +14759,7 @@
       <w:pPr>
         <w:pStyle w:val="Heading2"/>
       </w:pPr>
-      <w:bookmarkStart w:id="7" w:name="_Toc242096374"/>
+      <w:bookmarkStart w:id="7" w:name="_Toc242133597"/>
       <w:r>
         <w:t>1.5. Các bước cài đặt tổng quát</w:t>
       </w:r>
@@ -14911,7 +14911,7 @@
       <w:pPr>
         <w:pStyle w:val="TableCaption"/>
       </w:pPr>
-      <w:bookmarkStart w:id="8" w:name="_Toc242096469"/>
+      <w:bookmarkStart w:id="8" w:name="_Toc242133692"/>
       <w:r>
         <w:t>Bảng 1.3. Chọn phương án SQL Server theo máy</w:t>
       </w:r>
@@ -15515,7 +15515,7 @@
       <w:pPr>
         <w:pStyle w:val="Heading2"/>
       </w:pPr>
-      <w:bookmarkStart w:id="9" w:name="_Toc242096375"/>
+      <w:bookmarkStart w:id="9" w:name="_Toc242133598"/>
       <w:r>
         <w:t>1.6. Quy ước trình bày</w:t>
       </w:r>
@@ -15764,7 +15764,7 @@
         <w:pStyle w:val="Heading1"/>
         <w:pageBreakBefore/>
       </w:pPr>
-      <w:bookmarkStart w:id="10" w:name="_Toc242096376"/>
+      <w:bookmarkStart w:id="10" w:name="_Toc242133599"/>
       <w:r>
         <w:lastRenderedPageBreak/>
         <w:t>CHƯƠNG 2. CÀI ĐẶT SQL SERVER VÀ KHỞI TẠO CƠ SỞ DỮ LIỆU</w:t>
@@ -15821,7 +15821,7 @@
       <w:pPr>
         <w:pStyle w:val="Heading2"/>
       </w:pPr>
-      <w:bookmarkStart w:id="11" w:name="_Toc242096377"/>
+      <w:bookmarkStart w:id="11" w:name="_Toc242133600"/>
       <w:r>
         <w:t>2.1. Tải mã nguồn</w:t>
       </w:r>
@@ -15852,7 +15852,7 @@
         <w:t>https://github.com/nhutruong-uit/imcp</w:t>
       </w:r>
       <w:r>
-        <w:t xml:space="preserve"> (kho riêng tư: giảng viên được mời làm cộng tác viên). Có hai cách tải:</w:t>
+        <w:t xml:space="preserve"> (kho công khai, không cần tài khoản GitHub). Có hai cách tải:</w:t>
       </w:r>
     </w:p>
     <w:p>
@@ -15942,7 +15942,7 @@
       <w:pPr>
         <w:pStyle w:val="Heading2"/>
       </w:pPr>
-      <w:bookmarkStart w:id="12" w:name="_Toc242096378"/>
+      <w:bookmarkStart w:id="12" w:name="_Toc242133601"/>
       <w:r>
         <w:t>2.2. Phương án A - SQL Server trong Docker</w:t>
       </w:r>
@@ -15952,7 +15952,7 @@
       <w:pPr>
         <w:pStyle w:val="Heading3"/>
       </w:pPr>
-      <w:bookmarkStart w:id="13" w:name="_Toc242096379"/>
+      <w:bookmarkStart w:id="13" w:name="_Toc242133602"/>
       <w:r>
         <w:t>2.2.1. Cài Docker Desktop</w:t>
       </w:r>
@@ -16294,7 +16294,7 @@
       <w:pPr>
         <w:pStyle w:val="Heading3"/>
       </w:pPr>
-      <w:bookmarkStart w:id="14" w:name="_Toc242096380"/>
+      <w:bookmarkStart w:id="14" w:name="_Toc242133603"/>
       <w:r>
         <w:t>2.2.2. Khởi động SQL Server</w:t>
       </w:r>
@@ -16722,7 +16722,7 @@
       <w:pPr>
         <w:pStyle w:val="Heading3"/>
       </w:pPr>
-      <w:bookmarkStart w:id="15" w:name="_Toc242096381"/>
+      <w:bookmarkStart w:id="15" w:name="_Toc242133604"/>
       <w:r>
         <w:t>2.2.3. Khởi tạo CSDL</w:t>
       </w:r>
@@ -17154,7 +17154,7 @@
       <w:pPr>
         <w:pStyle w:val="Heading3"/>
       </w:pPr>
-      <w:bookmarkStart w:id="16" w:name="_Toc242096382"/>
+      <w:bookmarkStart w:id="16" w:name="_Toc242133605"/>
       <w:r>
         <w:t>2.2.4. Bật, tắt SQL Server hằng ngày</w:t>
       </w:r>
@@ -17164,7 +17164,7 @@
       <w:pPr>
         <w:pStyle w:val="TableCaption"/>
       </w:pPr>
-      <w:bookmarkStart w:id="17" w:name="_Toc242096470"/>
+      <w:bookmarkStart w:id="17" w:name="_Toc242133693"/>
       <w:r>
         <w:t>Bảng 2.1. Các lệnh Docker thường dùng</w:t>
       </w:r>
@@ -17581,7 +17581,7 @@
       <w:pPr>
         <w:pStyle w:val="Heading2"/>
       </w:pPr>
-      <w:bookmarkStart w:id="18" w:name="_Toc242096383"/>
+      <w:bookmarkStart w:id="18" w:name="_Toc242133606"/>
       <w:r>
         <w:t>2.3. Phương án B - SQL Server cài trực tiếp trên Windows</w:t>
       </w:r>
@@ -17591,7 +17591,7 @@
       <w:pPr>
         <w:pStyle w:val="Heading3"/>
       </w:pPr>
-      <w:bookmarkStart w:id="19" w:name="_Toc242096384"/>
+      <w:bookmarkStart w:id="19" w:name="_Toc242133607"/>
       <w:r>
         <w:t>2.3.1. Cài SQL Server</w:t>
       </w:r>
@@ -18372,7 +18372,7 @@
       <w:pPr>
         <w:pStyle w:val="Heading3"/>
       </w:pPr>
-      <w:bookmarkStart w:id="20" w:name="_Toc242096385"/>
+      <w:bookmarkStart w:id="20" w:name="_Toc242133608"/>
       <w:r>
         <w:lastRenderedPageBreak/>
         <w:t>2.3.2. Cài công cụ quản trị và driver</w:t>
@@ -18563,7 +18563,7 @@
       <w:pPr>
         <w:pStyle w:val="Heading3"/>
       </w:pPr>
-      <w:bookmarkStart w:id="21" w:name="_Toc242096386"/>
+      <w:bookmarkStart w:id="21" w:name="_Toc242133609"/>
       <w:r>
         <w:t>2.3.3. Bật kết nối TCP/IP</w:t>
       </w:r>
@@ -18964,7 +18964,7 @@
       <w:pPr>
         <w:pStyle w:val="Heading3"/>
       </w:pPr>
-      <w:bookmarkStart w:id="22" w:name="_Toc242096387"/>
+      <w:bookmarkStart w:id="22" w:name="_Toc242133610"/>
       <w:r>
         <w:t>2.3.4. Khởi tạo CSDL</w:t>
       </w:r>
@@ -19514,7 +19514,7 @@
       <w:pPr>
         <w:pStyle w:val="Heading3"/>
       </w:pPr>
-      <w:bookmarkStart w:id="23" w:name="_Toc242096388"/>
+      <w:bookmarkStart w:id="23" w:name="_Toc242133611"/>
       <w:r>
         <w:lastRenderedPageBreak/>
         <w:t>2.3.5. Cho máy khác kết nối tới (không bắt buộc)</w:t>
@@ -19607,7 +19607,7 @@
       <w:pPr>
         <w:pStyle w:val="Heading2"/>
       </w:pPr>
-      <w:bookmarkStart w:id="24" w:name="_Toc242096389"/>
+      <w:bookmarkStart w:id="24" w:name="_Toc242133612"/>
       <w:r>
         <w:t>2.4. Nạp lại dữ liệu mẫu trước buổi demo</w:t>
       </w:r>
@@ -19719,7 +19719,7 @@
         <w:pStyle w:val="Heading1"/>
         <w:pageBreakBefore/>
       </w:pPr>
-      <w:bookmarkStart w:id="25" w:name="_Toc242096390"/>
+      <w:bookmarkStart w:id="25" w:name="_Toc242133613"/>
       <w:r>
         <w:lastRenderedPageBreak/>
         <w:t>CHƯƠNG 3. CÀI ĐẶT ỨNG DỤNG</w:t>
@@ -19730,7 +19730,7 @@
       <w:pPr>
         <w:pStyle w:val="Heading2"/>
       </w:pPr>
-      <w:bookmarkStart w:id="26" w:name="_Toc242096391"/>
+      <w:bookmarkStart w:id="26" w:name="_Toc242133614"/>
       <w:r>
         <w:t>3.1. Tải bộ cài</w:t>
       </w:r>
@@ -19761,14 +19761,14 @@
         <w:t>https://github.com/nhutruong-uit/imcp/releases</w:t>
       </w:r>
       <w:r>
-        <w:t>). Với phiên bản 0.1.0, tên các file là:</w:t>
+        <w:t>). Với phiên bản 1.0.0, tên các file là:</w:t>
       </w:r>
     </w:p>
     <w:p>
       <w:pPr>
         <w:pStyle w:val="TableCaption"/>
       </w:pPr>
-      <w:bookmarkStart w:id="27" w:name="_Toc242096471"/>
+      <w:bookmarkStart w:id="27" w:name="_Toc242133694"/>
       <w:r>
         <w:t>Bảng 3.1. Các file cài đặt</w:t>
       </w:r>
@@ -19946,7 +19946,7 @@
                 <w:color w:val="C7254E"/>
                 <w:sz w:val="21"/>
               </w:rPr>
-              <w:t>QLTTTA-0.1.0-macos-arm64.dmg</w:t>
+              <w:t>QLTTTA-1.0.0-macos-arm64.dmg</w:t>
             </w:r>
           </w:p>
         </w:tc>
@@ -20039,7 +20039,7 @@
                 <w:color w:val="C7254E"/>
                 <w:sz w:val="21"/>
               </w:rPr>
-              <w:t>QLTTTA-0.1.0-windows-x64-setup.exe</w:t>
+              <w:t>QLTTTA-1.0.0-windows-x64-setup.exe</w:t>
             </w:r>
           </w:p>
         </w:tc>
@@ -20131,7 +20131,7 @@
                 <w:color w:val="C7254E"/>
                 <w:sz w:val="21"/>
               </w:rPr>
-              <w:t>QLTTTA-0.1.0-windows-x64-portable.zip</w:t>
+              <w:t>QLTTTA-1.0.0-windows-x64-portable.zip</w:t>
             </w:r>
           </w:p>
         </w:tc>
@@ -20211,7 +20211,7 @@
       <w:pPr>
         <w:pStyle w:val="Heading2"/>
       </w:pPr>
-      <w:bookmarkStart w:id="28" w:name="_Toc242096392"/>
+      <w:bookmarkStart w:id="28" w:name="_Toc242133615"/>
       <w:r>
         <w:t>3.2. Cài đặt trên macOS</w:t>
       </w:r>
@@ -20473,12 +20473,21 @@
         <w:t>gh</w:t>
       </w:r>
       <w:r>
-        <w:t xml:space="preserve">) và đăng nhập tài khoản có quyền vào kho mã nguồn, tải file </w:t>
+        <w:t>) và đã đăng nhập (</w:t>
       </w:r>
       <w:r>
         <w:rPr>
           <w:color w:val="C7254E"/>
         </w:rPr>
+        <w:t>gh auth login</w:t>
+      </w:r>
+      <w:r>
+        <w:t xml:space="preserve">, tài khoản GitHub nào cũng được), tải file </w:t>
+      </w:r>
+      <w:r>
+        <w:rPr>
+          <w:color w:val="C7254E"/>
+        </w:rPr>
         <w:t>.dmg</w:t>
       </w:r>
       <w:r>
@@ -20491,13 +20500,13 @@
         <w:t>&lt;tag&gt;</w:t>
       </w:r>
       <w:r>
-        <w:t xml:space="preserve"> bằng tên phiên bản ở trang Releases, ví dụ </w:t>
+        <w:t xml:space="preserve"> bằng tên phiên bản ở trang Releases, có dạng </w:t>
       </w:r>
       <w:r>
         <w:rPr>
           <w:color w:val="C7254E"/>
         </w:rPr>
-        <w:t>v0.1.0-build.1</w:t>
+        <w:t>v1.0.0-build.&lt;số&gt;</w:t>
       </w:r>
       <w:r>
         <w:t>):</w:t>
@@ -20603,7 +20612,7 @@
       <w:pPr>
         <w:pStyle w:val="Heading2"/>
       </w:pPr>
-      <w:bookmarkStart w:id="29" w:name="_Toc242096393"/>
+      <w:bookmarkStart w:id="29" w:name="_Toc242133616"/>
       <w:r>
         <w:t>3.3. Cài đặt trên Windows</w:t>
       </w:r>
@@ -20613,7 +20622,7 @@
       <w:pPr>
         <w:pStyle w:val="Heading3"/>
       </w:pPr>
-      <w:bookmarkStart w:id="30" w:name="_Toc242096394"/>
+      <w:bookmarkStart w:id="30" w:name="_Toc242133617"/>
       <w:r>
         <w:t>3.3.1. Dùng bộ cài setup.exe</w:t>
       </w:r>
@@ -20637,7 +20646,7 @@
         <w:rPr>
           <w:color w:val="C7254E"/>
         </w:rPr>
-        <w:t>QLTTTA-0.1.0-windows-x64-setup.exe</w:t>
+        <w:t>QLTTTA-1.0.0-windows-x64-setup.exe</w:t>
       </w:r>
       <w:r>
         <w:t xml:space="preserve">. Nếu Windows hiện </w:t>
@@ -20991,7 +21000,7 @@
                 <w:color w:val="C7254E"/>
                 <w:sz w:val="23"/>
               </w:rPr>
-              <w:t>QLTTTA-0.1.0-windows-x64-setup.exe /VERYSILENT /CURRENTUSER /MERGETASKS="!desktopicon"</w:t>
+              <w:t>QLTTTA-1.0.0-windows-x64-setup.exe /VERYSILENT /CURRENTUSER /MERGETASKS="!desktopicon"</w:t>
             </w:r>
             <w:r>
               <w:rPr>
@@ -21059,7 +21068,7 @@
         </w:rPr>
         <w:lastRenderedPageBreak/>
         <w:drawing>
-          <wp:inline distT="0" distB="0" distL="0" distR="0" wp14:anchorId="7734EE67" wp14:editId="44AAD1D7">
+          <wp:inline distT="0" distB="0" distL="0" distR="0" wp14:anchorId="07B29011" wp14:editId="684D9C50">
             <wp:extent cx="3420000" cy="3198254"/>
             <wp:effectExtent l="0" t="0" r="0" b="0"/>
             <wp:docPr id="522444761" name="Picture 522444761"/>
@@ -21099,7 +21108,7 @@
       <w:pPr>
         <w:pStyle w:val="FigureCaption"/>
       </w:pPr>
-      <w:bookmarkStart w:id="31" w:name="_Toc242096442"/>
+      <w:bookmarkStart w:id="31" w:name="_Toc242133665"/>
       <w:r>
         <w:t>Hình 3.1. Cảnh báo SmartScreen khi chạy bộ cài</w:t>
       </w:r>
@@ -21116,7 +21125,7 @@
           <w:noProof/>
         </w:rPr>
         <w:drawing>
-          <wp:inline distT="0" distB="0" distL="0" distR="0" wp14:anchorId="6840F8A6" wp14:editId="1F8FE674">
+          <wp:inline distT="0" distB="0" distL="0" distR="0" wp14:anchorId="0472957D" wp14:editId="3ADD8985">
             <wp:extent cx="4500000" cy="3458417"/>
             <wp:effectExtent l="0" t="0" r="0" b="0"/>
             <wp:docPr id="522444762" name="Picture 522444762"/>
@@ -21156,7 +21165,7 @@
       <w:pPr>
         <w:pStyle w:val="FigureCaption"/>
       </w:pPr>
-      <w:bookmarkStart w:id="32" w:name="_Toc242096443"/>
+      <w:bookmarkStart w:id="32" w:name="_Toc242133666"/>
       <w:r>
         <w:t>Hình 3.2. Bước cuối của bộ cài QLTTTA trên Windows</w:t>
       </w:r>
@@ -21166,7 +21175,7 @@
       <w:pPr>
         <w:pStyle w:val="Heading3"/>
       </w:pPr>
-      <w:bookmarkStart w:id="33" w:name="_Toc242096395"/>
+      <w:bookmarkStart w:id="33" w:name="_Toc242133618"/>
       <w:r>
         <w:t>3.3.2. Dùng bản portable</w:t>
       </w:r>
@@ -21185,7 +21194,7 @@
         <w:rPr>
           <w:color w:val="C7254E"/>
         </w:rPr>
-        <w:t>QLTTTA-0.1.0-windows-x64-portable.zip</w:t>
+        <w:t>QLTTTA-1.0.0-windows-x64-portable.zip</w:t>
       </w:r>
       <w:r>
         <w:t xml:space="preserve"> vào một thư mục bất kỳ (ví dụ </w:t>
@@ -21213,7 +21222,7 @@
       <w:pPr>
         <w:pStyle w:val="Heading3"/>
       </w:pPr>
-      <w:bookmarkStart w:id="34" w:name="_Toc242096396"/>
+      <w:bookmarkStart w:id="34" w:name="_Toc242133619"/>
       <w:r>
         <w:lastRenderedPageBreak/>
         <w:t>3.3.3. Driver kết nối</w:t>
@@ -21270,7 +21279,7 @@
       <w:pPr>
         <w:pStyle w:val="Heading2"/>
       </w:pPr>
-      <w:bookmarkStart w:id="35" w:name="_Toc242096397"/>
+      <w:bookmarkStart w:id="35" w:name="_Toc242133620"/>
       <w:r>
         <w:t>3.4. Nơi lưu cấu hình và gỡ cài đặt</w:t>
       </w:r>
@@ -21290,7 +21299,7 @@
       <w:pPr>
         <w:pStyle w:val="TableCaption"/>
       </w:pPr>
-      <w:bookmarkStart w:id="36" w:name="_Toc242096472"/>
+      <w:bookmarkStart w:id="36" w:name="_Toc242133695"/>
       <w:r>
         <w:t>Bảng 3.2. Cấu hình đã lưu và cách gỡ ứng dụng</w:t>
       </w:r>
@@ -21859,7 +21868,7 @@
       <w:pPr>
         <w:pStyle w:val="Heading2"/>
       </w:pPr>
-      <w:bookmarkStart w:id="37" w:name="_Toc242096398"/>
+      <w:bookmarkStart w:id="37" w:name="_Toc242133621"/>
       <w:r>
         <w:t>3.5. Chạy từ mã nguồn (dành cho nhóm phát triển)</w:t>
       </w:r>
@@ -22392,7 +22401,7 @@
         <w:pStyle w:val="Heading1"/>
         <w:pageBreakBefore/>
       </w:pPr>
-      <w:bookmarkStart w:id="38" w:name="_Toc242096399"/>
+      <w:bookmarkStart w:id="38" w:name="_Toc242133622"/>
       <w:r>
         <w:lastRenderedPageBreak/>
         <w:t>CHƯƠNG 4. ĐĂNG NHẬP VÀ GIAO DIỆN CHUNG</w:t>
@@ -22403,7 +22412,7 @@
       <w:pPr>
         <w:pStyle w:val="Heading2"/>
       </w:pPr>
-      <w:bookmarkStart w:id="39" w:name="_Toc242096400"/>
+      <w:bookmarkStart w:id="39" w:name="_Toc242133623"/>
       <w:r>
         <w:t>4.1. Mở ứng dụng</w:t>
       </w:r>
@@ -22560,7 +22569,7 @@
           <w:noProof/>
         </w:rPr>
         <w:drawing>
-          <wp:inline distT="0" distB="0" distL="0" distR="0" wp14:anchorId="6E88A410" wp14:editId="0B0AF54C">
+          <wp:inline distT="0" distB="0" distL="0" distR="0" wp14:anchorId="5FF17421" wp14:editId="4D00F466">
             <wp:extent cx="4860000" cy="2938605"/>
             <wp:effectExtent l="0" t="0" r="0" b="0"/>
             <wp:docPr id="522444763" name="Picture 522444763"/>
@@ -22600,7 +22609,7 @@
       <w:pPr>
         <w:pStyle w:val="FigureCaption"/>
       </w:pPr>
-      <w:bookmarkStart w:id="40" w:name="_Toc242096444"/>
+      <w:bookmarkStart w:id="40" w:name="_Toc242133667"/>
       <w:r>
         <w:t>Hình 4.1. Màn hình đăng nhập</w:t>
       </w:r>
@@ -22610,7 +22619,7 @@
       <w:pPr>
         <w:pStyle w:val="Heading2"/>
       </w:pPr>
-      <w:bookmarkStart w:id="41" w:name="_Toc242096401"/>
+      <w:bookmarkStart w:id="41" w:name="_Toc242133624"/>
       <w:r>
         <w:t>4.2. Cấu hình máy chủ (lần chạy đầu tiên)</w:t>
       </w:r>
@@ -22761,7 +22770,7 @@
         </w:rPr>
         <w:lastRenderedPageBreak/>
         <w:drawing>
-          <wp:inline distT="0" distB="0" distL="0" distR="0" wp14:anchorId="3E712546" wp14:editId="15AFBEE8">
+          <wp:inline distT="0" distB="0" distL="0" distR="0" wp14:anchorId="38ACC1CD" wp14:editId="569399A8">
             <wp:extent cx="5040000" cy="3360000"/>
             <wp:effectExtent l="0" t="0" r="0" b="0"/>
             <wp:docPr id="522444764" name="Picture 522444764"/>
@@ -22801,7 +22810,7 @@
       <w:pPr>
         <w:pStyle w:val="FigureCaption"/>
       </w:pPr>
-      <w:bookmarkStart w:id="42" w:name="_Toc242096445"/>
+      <w:bookmarkStart w:id="42" w:name="_Toc242133668"/>
       <w:r>
         <w:t>Hình 4.2. Khung cấu hình máy chủ SQL Server</w:t>
       </w:r>
@@ -22811,7 +22820,7 @@
       <w:pPr>
         <w:pStyle w:val="TableCaption"/>
       </w:pPr>
-      <w:bookmarkStart w:id="43" w:name="_Toc242096473"/>
+      <w:bookmarkStart w:id="43" w:name="_Toc242133696"/>
       <w:r>
         <w:t>Bảng 4.1. Giá trị ô Máy chủ theo cách cài SQL Server</w:t>
       </w:r>
@@ -23251,7 +23260,7 @@
       <w:pPr>
         <w:pStyle w:val="Heading2"/>
       </w:pPr>
-      <w:bookmarkStart w:id="44" w:name="_Toc242096402"/>
+      <w:bookmarkStart w:id="44" w:name="_Toc242133625"/>
       <w:r>
         <w:t>4.3. Đăng nhập</w:t>
       </w:r>
@@ -23325,7 +23334,7 @@
       <w:pPr>
         <w:pStyle w:val="TableCaption"/>
       </w:pPr>
-      <w:bookmarkStart w:id="45" w:name="_Toc242096474"/>
+      <w:bookmarkStart w:id="45" w:name="_Toc242133697"/>
       <w:r>
         <w:t>Bảng 4.2. Tài khoản demo trong dữ liệu mẫu</w:t>
       </w:r>
@@ -24651,7 +24660,7 @@
       <w:pPr>
         <w:pStyle w:val="TableCaption"/>
       </w:pPr>
-      <w:bookmarkStart w:id="46" w:name="_Toc242096475"/>
+      <w:bookmarkStart w:id="46" w:name="_Toc242133698"/>
       <w:r>
         <w:t>Bảng 4.3. Thông báo lỗi khi đăng nhập</w:t>
       </w:r>
@@ -25075,7 +25084,7 @@
       <w:pPr>
         <w:pStyle w:val="Heading2"/>
       </w:pPr>
-      <w:bookmarkStart w:id="47" w:name="_Toc242096403"/>
+      <w:bookmarkStart w:id="47" w:name="_Toc242133626"/>
       <w:r>
         <w:t>4.4. Màn hình chính</w:t>
       </w:r>
@@ -25235,7 +25244,7 @@
           <w:noProof/>
         </w:rPr>
         <w:drawing>
-          <wp:inline distT="0" distB="0" distL="0" distR="0" wp14:anchorId="123B80E8" wp14:editId="0FCD07B8">
+          <wp:inline distT="0" distB="0" distL="0" distR="0" wp14:anchorId="777AA71B" wp14:editId="3769B849">
             <wp:extent cx="5580000" cy="3332500"/>
             <wp:effectExtent l="0" t="0" r="0" b="0"/>
             <wp:docPr id="522444765" name="Picture 522444765"/>
@@ -25275,7 +25284,7 @@
       <w:pPr>
         <w:pStyle w:val="FigureCaption"/>
       </w:pPr>
-      <w:bookmarkStart w:id="48" w:name="_Toc242096446"/>
+      <w:bookmarkStart w:id="48" w:name="_Toc242133669"/>
       <w:r>
         <w:t>Hình 4.3. Màn hình chính của vai trò Quản lý (trang Tổng quan)</w:t>
       </w:r>
@@ -25285,7 +25294,7 @@
       <w:pPr>
         <w:pStyle w:val="Heading2"/>
       </w:pPr>
-      <w:bookmarkStart w:id="49" w:name="_Toc242096404"/>
+      <w:bookmarkStart w:id="49" w:name="_Toc242133627"/>
       <w:r>
         <w:t>4.5. Đổi ngôn ngữ giao diện</w:t>
       </w:r>
@@ -25323,7 +25332,7 @@
       <w:pPr>
         <w:pStyle w:val="Heading2"/>
       </w:pPr>
-      <w:bookmarkStart w:id="50" w:name="_Toc242096405"/>
+      <w:bookmarkStart w:id="50" w:name="_Toc242133628"/>
       <w:r>
         <w:t>4.6. Đổi mật khẩu</w:t>
       </w:r>
@@ -25439,7 +25448,7 @@
           <w:noProof/>
         </w:rPr>
         <w:drawing>
-          <wp:inline distT="0" distB="0" distL="0" distR="0" wp14:anchorId="47ADE39A" wp14:editId="750168E7">
+          <wp:inline distT="0" distB="0" distL="0" distR="0" wp14:anchorId="6DCF9D90" wp14:editId="50DC7D5F">
             <wp:extent cx="3420000" cy="1368000"/>
             <wp:effectExtent l="0" t="0" r="0" b="0"/>
             <wp:docPr id="522444766" name="Picture 522444766"/>
@@ -25479,7 +25488,7 @@
       <w:pPr>
         <w:pStyle w:val="FigureCaption"/>
       </w:pPr>
-      <w:bookmarkStart w:id="51" w:name="_Toc242096447"/>
+      <w:bookmarkStart w:id="51" w:name="_Toc242133670"/>
       <w:r>
         <w:t>Hình 4.4. Hộp thoại đổi mật khẩu</w:t>
       </w:r>
@@ -25521,7 +25530,7 @@
       <w:pPr>
         <w:pStyle w:val="Heading2"/>
       </w:pPr>
-      <w:bookmarkStart w:id="52" w:name="_Toc242096406"/>
+      <w:bookmarkStart w:id="52" w:name="_Toc242133629"/>
       <w:r>
         <w:t>4.7. Đăng xuất và thoát</w:t>
       </w:r>
@@ -25568,7 +25577,7 @@
       <w:pPr>
         <w:pStyle w:val="Heading2"/>
       </w:pPr>
-      <w:bookmarkStart w:id="53" w:name="_Toc242096407"/>
+      <w:bookmarkStart w:id="53" w:name="_Toc242133630"/>
       <w:r>
         <w:t>4.8. Thao tác chung trên các màn hình danh sách</w:t>
       </w:r>
@@ -25595,7 +25604,7 @@
           <w:noProof/>
         </w:rPr>
         <w:drawing>
-          <wp:inline distT="0" distB="0" distL="0" distR="0" wp14:anchorId="52225D94" wp14:editId="0B6CD3C1">
+          <wp:inline distT="0" distB="0" distL="0" distR="0" wp14:anchorId="35C27A42" wp14:editId="00D8FA2A">
             <wp:extent cx="5580000" cy="3332500"/>
             <wp:effectExtent l="0" t="0" r="0" b="0"/>
             <wp:docPr id="522444767" name="Picture 522444767"/>
@@ -25635,7 +25644,7 @@
       <w:pPr>
         <w:pStyle w:val="FigureCaption"/>
       </w:pPr>
-      <w:bookmarkStart w:id="54" w:name="_Toc242096448"/>
+      <w:bookmarkStart w:id="54" w:name="_Toc242133671"/>
       <w:r>
         <w:t>Hình 4.5. Một màn hình danh sách: Công nợ học phí</w:t>
       </w:r>
@@ -25645,7 +25654,7 @@
       <w:pPr>
         <w:pStyle w:val="TableCaption"/>
       </w:pPr>
-      <w:bookmarkStart w:id="55" w:name="_Toc242096476"/>
+      <w:bookmarkStart w:id="55" w:name="_Toc242133699"/>
       <w:r>
         <w:t>Bảng 4.4. Các thành phần của màn hình danh sách</w:t>
       </w:r>
@@ -26500,7 +26509,7 @@
       <w:pPr>
         <w:pStyle w:val="Heading2"/>
       </w:pPr>
-      <w:bookmarkStart w:id="56" w:name="_Toc242096408"/>
+      <w:bookmarkStart w:id="56" w:name="_Toc242133631"/>
       <w:r>
         <w:t>4.9. Form nhập liệu và hộp xác nhận</w:t>
       </w:r>
@@ -26663,7 +26672,7 @@
         <w:pStyle w:val="Heading1"/>
         <w:pageBreakBefore/>
       </w:pPr>
-      <w:bookmarkStart w:id="57" w:name="_Toc242096409"/>
+      <w:bookmarkStart w:id="57" w:name="_Toc242133632"/>
       <w:r>
         <w:lastRenderedPageBreak/>
         <w:t>CHƯƠNG 5. HƯỚNG DẪN THEO CHỨC NĂNG</w:t>
@@ -26684,7 +26693,7 @@
       <w:pPr>
         <w:pStyle w:val="Heading2"/>
       </w:pPr>
-      <w:bookmarkStart w:id="58" w:name="_Toc242096410"/>
+      <w:bookmarkStart w:id="58" w:name="_Toc242133633"/>
       <w:r>
         <w:t>5.1. Tổng quan</w:t>
       </w:r>
@@ -26728,7 +26737,7 @@
       <w:pPr>
         <w:pStyle w:val="TableCaption"/>
       </w:pPr>
-      <w:bookmarkStart w:id="59" w:name="_Toc242096477"/>
+      <w:bookmarkStart w:id="59" w:name="_Toc242133700"/>
       <w:r>
         <w:t>Bảng 5.1. Các thẻ số liệu trên trang Tổng quan</w:t>
       </w:r>
@@ -27210,7 +27219,7 @@
           <w:noProof/>
         </w:rPr>
         <w:drawing>
-          <wp:inline distT="0" distB="0" distL="0" distR="0" wp14:anchorId="6904568C" wp14:editId="667924FB">
+          <wp:inline distT="0" distB="0" distL="0" distR="0" wp14:anchorId="1F01DBFA" wp14:editId="2560BA93">
             <wp:extent cx="5580000" cy="3332500"/>
             <wp:effectExtent l="0" t="0" r="0" b="0"/>
             <wp:docPr id="522444768" name="Picture 522444768"/>
@@ -27250,7 +27259,7 @@
       <w:pPr>
         <w:pStyle w:val="FigureCaption"/>
       </w:pPr>
-      <w:bookmarkStart w:id="60" w:name="_Toc242096449"/>
+      <w:bookmarkStart w:id="60" w:name="_Toc242133672"/>
       <w:r>
         <w:t>Hình 5.1. Trang Tổng quan của Giáo vụ: không có quyền xem doanh thu</w:t>
       </w:r>
@@ -27260,7 +27269,7 @@
       <w:pPr>
         <w:pStyle w:val="Heading2"/>
       </w:pPr>
-      <w:bookmarkStart w:id="61" w:name="_Toc242096411"/>
+      <w:bookmarkStart w:id="61" w:name="_Toc242133634"/>
       <w:r>
         <w:lastRenderedPageBreak/>
         <w:t>5.2. Học viên</w:t>
@@ -27294,7 +27303,7 @@
           <w:noProof/>
         </w:rPr>
         <w:drawing>
-          <wp:inline distT="0" distB="0" distL="0" distR="0" wp14:anchorId="508C8F25" wp14:editId="3B5C4FBD">
+          <wp:inline distT="0" distB="0" distL="0" distR="0" wp14:anchorId="0AE25396" wp14:editId="27AD69D6">
             <wp:extent cx="5580000" cy="3332500"/>
             <wp:effectExtent l="0" t="0" r="0" b="0"/>
             <wp:docPr id="522444769" name="Picture 522444769"/>
@@ -27334,7 +27343,7 @@
       <w:pPr>
         <w:pStyle w:val="FigureCaption"/>
       </w:pPr>
-      <w:bookmarkStart w:id="62" w:name="_Toc242096450"/>
+      <w:bookmarkStart w:id="62" w:name="_Toc242133673"/>
       <w:r>
         <w:t>Hình 5.2. Danh sách học viên</w:t>
       </w:r>
@@ -27344,7 +27353,7 @@
       <w:pPr>
         <w:pStyle w:val="Heading3"/>
       </w:pPr>
-      <w:bookmarkStart w:id="63" w:name="_Toc242096412"/>
+      <w:bookmarkStart w:id="63" w:name="_Toc242133635"/>
       <w:r>
         <w:t>5.2.1. Tìm kiếm</w:t>
       </w:r>
@@ -27441,7 +27450,7 @@
       <w:pPr>
         <w:pStyle w:val="Heading3"/>
       </w:pPr>
-      <w:bookmarkStart w:id="64" w:name="_Toc242096413"/>
+      <w:bookmarkStart w:id="64" w:name="_Toc242133636"/>
       <w:r>
         <w:t>5.2.2. Thêm học viên</w:t>
       </w:r>
@@ -27646,7 +27655,7 @@
       <w:pPr>
         <w:pStyle w:val="Heading3"/>
       </w:pPr>
-      <w:bookmarkStart w:id="65" w:name="_Toc242096414"/>
+      <w:bookmarkStart w:id="65" w:name="_Toc242133637"/>
       <w:r>
         <w:t>5.2.3. Sửa thông tin</w:t>
       </w:r>
@@ -27767,7 +27776,7 @@
           <w:noProof/>
         </w:rPr>
         <w:drawing>
-          <wp:inline distT="0" distB="0" distL="0" distR="0" wp14:anchorId="5F6BE292" wp14:editId="48DFDDDF">
+          <wp:inline distT="0" distB="0" distL="0" distR="0" wp14:anchorId="42C20BC0" wp14:editId="29498E25">
             <wp:extent cx="3780000" cy="5048129"/>
             <wp:effectExtent l="0" t="0" r="0" b="0"/>
             <wp:docPr id="522444770" name="Picture 522444770"/>
@@ -27807,7 +27816,7 @@
       <w:pPr>
         <w:pStyle w:val="FigureCaption"/>
       </w:pPr>
-      <w:bookmarkStart w:id="66" w:name="_Toc242096451"/>
+      <w:bookmarkStart w:id="66" w:name="_Toc242133674"/>
       <w:r>
         <w:t>Hình 5.3. Hộp thoại sửa thông tin học viên</w:t>
       </w:r>
@@ -27827,7 +27836,7 @@
       <w:pPr>
         <w:pStyle w:val="TableCaption"/>
       </w:pPr>
-      <w:bookmarkStart w:id="67" w:name="_Toc242096478"/>
+      <w:bookmarkStart w:id="67" w:name="_Toc242133701"/>
       <w:r>
         <w:t>Bảng 5.2. Quy tắc kiểm tra thông tin học viên</w:t>
       </w:r>
@@ -28491,7 +28500,7 @@
       <w:pPr>
         <w:pStyle w:val="Heading3"/>
       </w:pPr>
-      <w:bookmarkStart w:id="68" w:name="_Toc242096415"/>
+      <w:bookmarkStart w:id="68" w:name="_Toc242133638"/>
       <w:r>
         <w:t>5.2.4. Xóa học viên</w:t>
       </w:r>
@@ -28612,7 +28621,7 @@
       <w:pPr>
         <w:pStyle w:val="Heading3"/>
       </w:pPr>
-      <w:bookmarkStart w:id="69" w:name="_Toc242096416"/>
+      <w:bookmarkStart w:id="69" w:name="_Toc242133639"/>
       <w:r>
         <w:t>5.2.5. Hồ sơ, ghi danh và kiểm tra xếp lớp từ danh sách học viên</w:t>
       </w:r>
@@ -28710,7 +28719,7 @@
       <w:pPr>
         <w:pStyle w:val="Heading3"/>
       </w:pPr>
-      <w:bookmarkStart w:id="70" w:name="_Toc242096417"/>
+      <w:bookmarkStart w:id="70" w:name="_Toc242133640"/>
       <w:r>
         <w:t>5.2.6. Xuất, nhập danh sách bằng XML</w:t>
       </w:r>
@@ -28796,7 +28805,7 @@
       <w:pPr>
         <w:pStyle w:val="Heading2"/>
       </w:pPr>
-      <w:bookmarkStart w:id="71" w:name="_Toc242096418"/>
+      <w:bookmarkStart w:id="71" w:name="_Toc242133641"/>
       <w:r>
         <w:t>5.3. Kiểm tra xếp lớp</w:t>
       </w:r>
@@ -28884,7 +28893,7 @@
         </w:rPr>
         <w:lastRenderedPageBreak/>
         <w:drawing>
-          <wp:inline distT="0" distB="0" distL="0" distR="0" wp14:anchorId="4F4F7DE4" wp14:editId="379D716A">
+          <wp:inline distT="0" distB="0" distL="0" distR="0" wp14:anchorId="05DEE4E1" wp14:editId="52FF517F">
             <wp:extent cx="5580000" cy="3332500"/>
             <wp:effectExtent l="0" t="0" r="0" b="0"/>
             <wp:docPr id="522444771" name="Picture 522444771"/>
@@ -28924,7 +28933,7 @@
       <w:pPr>
         <w:pStyle w:val="FigureCaption"/>
       </w:pPr>
-      <w:bookmarkStart w:id="72" w:name="_Toc242096452"/>
+      <w:bookmarkStart w:id="72" w:name="_Toc242133675"/>
       <w:r>
         <w:t>Hình 5.4. Danh sách bài kiểm tra xếp lớp</w:t>
       </w:r>
@@ -29189,7 +29198,7 @@
       <w:pPr>
         <w:pStyle w:val="Heading2"/>
       </w:pPr>
-      <w:bookmarkStart w:id="73" w:name="_Toc242096419"/>
+      <w:bookmarkStart w:id="73" w:name="_Toc242133642"/>
       <w:r>
         <w:t>5.4. Lớp học</w:t>
       </w:r>
@@ -29241,7 +29250,7 @@
         </w:rPr>
         <w:lastRenderedPageBreak/>
         <w:drawing>
-          <wp:inline distT="0" distB="0" distL="0" distR="0" wp14:anchorId="2E14C454" wp14:editId="6DBC95AB">
+          <wp:inline distT="0" distB="0" distL="0" distR="0" wp14:anchorId="27E65319" wp14:editId="4A0EB761">
             <wp:extent cx="5580000" cy="3332500"/>
             <wp:effectExtent l="0" t="0" r="0" b="0"/>
             <wp:docPr id="522444772" name="Picture 522444772"/>
@@ -29281,7 +29290,7 @@
       <w:pPr>
         <w:pStyle w:val="FigureCaption"/>
       </w:pPr>
-      <w:bookmarkStart w:id="74" w:name="_Toc242096453"/>
+      <w:bookmarkStart w:id="74" w:name="_Toc242133676"/>
       <w:r>
         <w:t>Hình 5.5. Màn hình Lớp học và các nút quản lý vòng đời lớp</w:t>
       </w:r>
@@ -29761,7 +29770,7 @@
       <w:pPr>
         <w:pStyle w:val="TableCaption"/>
       </w:pPr>
-      <w:bookmarkStart w:id="75" w:name="_Toc242096479"/>
+      <w:bookmarkStart w:id="75" w:name="_Toc242133702"/>
       <w:r>
         <w:t>Bảng 5.3. Quy tắc CSDL kiểm tra khi quản lý lớp học</w:t>
       </w:r>
@@ -30292,7 +30301,7 @@
       <w:pPr>
         <w:pStyle w:val="Heading2"/>
       </w:pPr>
-      <w:bookmarkStart w:id="76" w:name="_Toc242096420"/>
+      <w:bookmarkStart w:id="76" w:name="_Toc242133643"/>
       <w:r>
         <w:t>5.5. Ghi danh</w:t>
       </w:r>
@@ -30353,7 +30362,7 @@
         </w:rPr>
         <w:lastRenderedPageBreak/>
         <w:drawing>
-          <wp:inline distT="0" distB="0" distL="0" distR="0" wp14:anchorId="76C6A213" wp14:editId="3D44B4E7">
+          <wp:inline distT="0" distB="0" distL="0" distR="0" wp14:anchorId="319DE127" wp14:editId="10D351A3">
             <wp:extent cx="5580000" cy="3332500"/>
             <wp:effectExtent l="0" t="0" r="0" b="0"/>
             <wp:docPr id="522444773" name="Picture 522444773"/>
@@ -30393,7 +30402,7 @@
       <w:pPr>
         <w:pStyle w:val="FigureCaption"/>
       </w:pPr>
-      <w:bookmarkStart w:id="77" w:name="_Toc242096454"/>
+      <w:bookmarkStart w:id="77" w:name="_Toc242133677"/>
       <w:r>
         <w:t>Hình 5.6. Danh sách ghi danh</w:t>
       </w:r>
@@ -30665,7 +30674,7 @@
       <w:pPr>
         <w:pStyle w:val="TableCaption"/>
       </w:pPr>
-      <w:bookmarkStart w:id="78" w:name="_Toc242096480"/>
+      <w:bookmarkStart w:id="78" w:name="_Toc242133703"/>
       <w:r>
         <w:t>Bảng 5.4. Quy tắc CSDL kiểm tra khi ghi danh và chuyển lớp</w:t>
       </w:r>
@@ -31055,7 +31064,7 @@
       <w:pPr>
         <w:pStyle w:val="Heading2"/>
       </w:pPr>
-      <w:bookmarkStart w:id="79" w:name="_Toc242096421"/>
+      <w:bookmarkStart w:id="79" w:name="_Toc242133644"/>
       <w:r>
         <w:t>5.6. Lịch học - điểm danh</w:t>
       </w:r>
@@ -31142,7 +31151,7 @@
           <w:noProof/>
         </w:rPr>
         <w:drawing>
-          <wp:inline distT="0" distB="0" distL="0" distR="0" wp14:anchorId="0FDCE174" wp14:editId="27C1E952">
+          <wp:inline distT="0" distB="0" distL="0" distR="0" wp14:anchorId="15EFA419" wp14:editId="25770A4E">
             <wp:extent cx="5580000" cy="3332500"/>
             <wp:effectExtent l="0" t="0" r="0" b="0"/>
             <wp:docPr id="522444774" name="Picture 522444774"/>
@@ -31182,7 +31191,7 @@
       <w:pPr>
         <w:pStyle w:val="FigureCaption"/>
       </w:pPr>
-      <w:bookmarkStart w:id="80" w:name="_Toc242096455"/>
+      <w:bookmarkStart w:id="80" w:name="_Toc242133678"/>
       <w:r>
         <w:t>Hình 5.7. Lịch học - điểm danh của một tuần</w:t>
       </w:r>
@@ -31422,7 +31431,7 @@
       <w:pPr>
         <w:pStyle w:val="Heading2"/>
       </w:pPr>
-      <w:bookmarkStart w:id="81" w:name="_Toc242096422"/>
+      <w:bookmarkStart w:id="81" w:name="_Toc242133645"/>
       <w:r>
         <w:lastRenderedPageBreak/>
         <w:t>5.7. Sổ điểm</w:t>
@@ -31465,7 +31474,7 @@
           <w:noProof/>
         </w:rPr>
         <w:drawing>
-          <wp:inline distT="0" distB="0" distL="0" distR="0" wp14:anchorId="5520C1E2" wp14:editId="64BAE5CC">
+          <wp:inline distT="0" distB="0" distL="0" distR="0" wp14:anchorId="62D32727" wp14:editId="5991F4AF">
             <wp:extent cx="5580000" cy="3332500"/>
             <wp:effectExtent l="0" t="0" r="0" b="0"/>
             <wp:docPr id="522444775" name="Picture 522444775"/>
@@ -31505,7 +31514,7 @@
       <w:pPr>
         <w:pStyle w:val="FigureCaption"/>
       </w:pPr>
-      <w:bookmarkStart w:id="82" w:name="_Toc242096456"/>
+      <w:bookmarkStart w:id="82" w:name="_Toc242133679"/>
       <w:r>
         <w:t>Hình 5.8. Sổ điểm của một lớp</w:t>
       </w:r>
@@ -31633,7 +31642,7 @@
       <w:pPr>
         <w:pStyle w:val="Heading2"/>
       </w:pPr>
-      <w:bookmarkStart w:id="83" w:name="_Toc242096423"/>
+      <w:bookmarkStart w:id="83" w:name="_Toc242133646"/>
       <w:r>
         <w:t>5.8. Kết quả học tập</w:t>
       </w:r>
@@ -31697,7 +31706,7 @@
           <w:noProof/>
         </w:rPr>
         <w:drawing>
-          <wp:inline distT="0" distB="0" distL="0" distR="0" wp14:anchorId="710EB61F" wp14:editId="5C6DBC7F">
+          <wp:inline distT="0" distB="0" distL="0" distR="0" wp14:anchorId="4F64BE88" wp14:editId="66EE42E4">
             <wp:extent cx="5580000" cy="3332500"/>
             <wp:effectExtent l="0" t="0" r="0" b="0"/>
             <wp:docPr id="522444776" name="Picture 522444776"/>
@@ -31737,7 +31746,7 @@
       <w:pPr>
         <w:pStyle w:val="FigureCaption"/>
       </w:pPr>
-      <w:bookmarkStart w:id="84" w:name="_Toc242096457"/>
+      <w:bookmarkStart w:id="84" w:name="_Toc242133680"/>
       <w:r>
         <w:t>Hình 5.9. Kết quả học tập</w:t>
       </w:r>
@@ -31747,7 +31756,7 @@
       <w:pPr>
         <w:pStyle w:val="Heading2"/>
       </w:pPr>
-      <w:bookmarkStart w:id="85" w:name="_Toc242096424"/>
+      <w:bookmarkStart w:id="85" w:name="_Toc242133647"/>
       <w:r>
         <w:t>5.9. Thu học phí</w:t>
       </w:r>
@@ -31816,7 +31825,7 @@
           <w:noProof/>
         </w:rPr>
         <w:drawing>
-          <wp:inline distT="0" distB="0" distL="0" distR="0" wp14:anchorId="78E52A14" wp14:editId="0A8C2838">
+          <wp:inline distT="0" distB="0" distL="0" distR="0" wp14:anchorId="5D891CB6" wp14:editId="701F63EE">
             <wp:extent cx="5580000" cy="3332500"/>
             <wp:effectExtent l="0" t="0" r="0" b="0"/>
             <wp:docPr id="522444777" name="Picture 522444777"/>
@@ -31856,7 +31865,7 @@
       <w:pPr>
         <w:pStyle w:val="FigureCaption"/>
       </w:pPr>
-      <w:bookmarkStart w:id="86" w:name="_Toc242096458"/>
+      <w:bookmarkStart w:id="86" w:name="_Toc242133681"/>
       <w:r>
         <w:t>Hình 5.10. Danh sách phiếu thu (Kế toán)</w:t>
       </w:r>
@@ -32167,7 +32176,7 @@
       <w:pPr>
         <w:pStyle w:val="Heading2"/>
       </w:pPr>
-      <w:bookmarkStart w:id="87" w:name="_Toc242096425"/>
+      <w:bookmarkStart w:id="87" w:name="_Toc242133648"/>
       <w:r>
         <w:t>5.10. Công nợ học phí</w:t>
       </w:r>
@@ -32220,7 +32229,7 @@
       <w:pPr>
         <w:pStyle w:val="Heading2"/>
       </w:pPr>
-      <w:bookmarkStart w:id="88" w:name="_Toc242096426"/>
+      <w:bookmarkStart w:id="88" w:name="_Toc242133649"/>
       <w:r>
         <w:t>5.11. Doanh thu</w:t>
       </w:r>
@@ -32322,7 +32331,7 @@
         </w:rPr>
         <w:lastRenderedPageBreak/>
         <w:drawing>
-          <wp:inline distT="0" distB="0" distL="0" distR="0" wp14:anchorId="3DEFB600" wp14:editId="3025E6AF">
+          <wp:inline distT="0" distB="0" distL="0" distR="0" wp14:anchorId="7F499E4A" wp14:editId="464A6E66">
             <wp:extent cx="5580000" cy="3332500"/>
             <wp:effectExtent l="0" t="0" r="0" b="0"/>
             <wp:docPr id="522444778" name="Picture 522444778"/>
@@ -32362,7 +32371,7 @@
       <w:pPr>
         <w:pStyle w:val="FigureCaption"/>
       </w:pPr>
-      <w:bookmarkStart w:id="89" w:name="_Toc242096459"/>
+      <w:bookmarkStart w:id="89" w:name="_Toc242133682"/>
       <w:r>
         <w:t>Hình 5.11. Doanh thu theo tháng và chi nhánh (Kế toán)</w:t>
       </w:r>
@@ -32372,7 +32381,7 @@
       <w:pPr>
         <w:pStyle w:val="Heading2"/>
       </w:pPr>
-      <w:bookmarkStart w:id="90" w:name="_Toc242096427"/>
+      <w:bookmarkStart w:id="90" w:name="_Toc242133650"/>
       <w:r>
         <w:t>5.12. Lương giáo viên</w:t>
       </w:r>
@@ -32423,7 +32432,7 @@
           <w:noProof/>
         </w:rPr>
         <w:drawing>
-          <wp:inline distT="0" distB="0" distL="0" distR="0" wp14:anchorId="390F8265" wp14:editId="230A26B9">
+          <wp:inline distT="0" distB="0" distL="0" distR="0" wp14:anchorId="307A2017" wp14:editId="582DCE72">
             <wp:extent cx="5580000" cy="3332500"/>
             <wp:effectExtent l="0" t="0" r="0" b="0"/>
             <wp:docPr id="522444779" name="Picture 522444779"/>
@@ -32463,7 +32472,7 @@
       <w:pPr>
         <w:pStyle w:val="FigureCaption"/>
       </w:pPr>
-      <w:bookmarkStart w:id="91" w:name="_Toc242096460"/>
+      <w:bookmarkStart w:id="91" w:name="_Toc242133683"/>
       <w:r>
         <w:t>Hình 5.12. Bảng lương giáo viên (Kế toán)</w:t>
       </w:r>
@@ -32570,7 +32579,7 @@
       <w:pPr>
         <w:pStyle w:val="Heading2"/>
       </w:pPr>
-      <w:bookmarkStart w:id="92" w:name="_Toc242096428"/>
+      <w:bookmarkStart w:id="92" w:name="_Toc242133651"/>
       <w:r>
         <w:t>5.13. Danh mục</w:t>
       </w:r>
@@ -32623,7 +32632,7 @@
       <w:pPr>
         <w:pStyle w:val="Heading3"/>
       </w:pPr>
-      <w:bookmarkStart w:id="93" w:name="_Toc242096429"/>
+      <w:bookmarkStart w:id="93" w:name="_Toc242133652"/>
       <w:r>
         <w:t>5.13.1. Khóa học</w:t>
       </w:r>
@@ -32659,7 +32668,7 @@
           <w:noProof/>
         </w:rPr>
         <w:drawing>
-          <wp:inline distT="0" distB="0" distL="0" distR="0" wp14:anchorId="577C4C5D" wp14:editId="568A7EB9">
+          <wp:inline distT="0" distB="0" distL="0" distR="0" wp14:anchorId="7055DF2D" wp14:editId="295FB38A">
             <wp:extent cx="5580000" cy="3332500"/>
             <wp:effectExtent l="0" t="0" r="0" b="0"/>
             <wp:docPr id="522444780" name="Picture 522444780"/>
@@ -32699,7 +32708,7 @@
       <w:pPr>
         <w:pStyle w:val="FigureCaption"/>
       </w:pPr>
-      <w:bookmarkStart w:id="94" w:name="_Toc242096461"/>
+      <w:bookmarkStart w:id="94" w:name="_Toc242133684"/>
       <w:r>
         <w:t>Hình 5.13. Danh mục khóa học và cột điểm của khóa đang chọn</w:t>
       </w:r>
@@ -32903,7 +32912,7 @@
       <w:pPr>
         <w:pStyle w:val="Heading3"/>
       </w:pPr>
-      <w:bookmarkStart w:id="95" w:name="_Toc242096430"/>
+      <w:bookmarkStart w:id="95" w:name="_Toc242133653"/>
       <w:r>
         <w:t>5.13.2. Giáo viên, Nhân viên</w:t>
       </w:r>
@@ -33030,7 +33039,7 @@
       <w:pPr>
         <w:pStyle w:val="Heading3"/>
       </w:pPr>
-      <w:bookmarkStart w:id="96" w:name="_Toc242096431"/>
+      <w:bookmarkStart w:id="96" w:name="_Toc242133654"/>
       <w:r>
         <w:t>5.13.3. Chi nhánh - phòng học, Khuyến mãi</w:t>
       </w:r>
@@ -33228,7 +33237,7 @@
         </w:rPr>
         <w:lastRenderedPageBreak/>
         <w:drawing>
-          <wp:inline distT="0" distB="0" distL="0" distR="0" wp14:anchorId="1A2C717A" wp14:editId="360A08DF">
+          <wp:inline distT="0" distB="0" distL="0" distR="0" wp14:anchorId="57778814" wp14:editId="1FAC4407">
             <wp:extent cx="5580000" cy="3332500"/>
             <wp:effectExtent l="0" t="0" r="0" b="0"/>
             <wp:docPr id="522444781" name="Picture 522444781"/>
@@ -33268,7 +33277,7 @@
       <w:pPr>
         <w:pStyle w:val="FigureCaption"/>
       </w:pPr>
-      <w:bookmarkStart w:id="97" w:name="_Toc242096462"/>
+      <w:bookmarkStart w:id="97" w:name="_Toc242133685"/>
       <w:r>
         <w:t>Hình 5.14. Chi nhánh và phòng học của chi nhánh đang chọn</w:t>
       </w:r>
@@ -33278,7 +33287,7 @@
       <w:pPr>
         <w:pStyle w:val="Heading2"/>
       </w:pPr>
-      <w:bookmarkStart w:id="98" w:name="_Toc242096432"/>
+      <w:bookmarkStart w:id="98" w:name="_Toc242133655"/>
       <w:r>
         <w:t>5.14. Tài khoản</w:t>
       </w:r>
@@ -33329,7 +33338,7 @@
           <w:noProof/>
         </w:rPr>
         <w:drawing>
-          <wp:inline distT="0" distB="0" distL="0" distR="0" wp14:anchorId="3A032BA7" wp14:editId="26AE7AF0">
+          <wp:inline distT="0" distB="0" distL="0" distR="0" wp14:anchorId="2EBA9570" wp14:editId="4703BBCF">
             <wp:extent cx="5580000" cy="3332500"/>
             <wp:effectExtent l="0" t="0" r="0" b="0"/>
             <wp:docPr id="522444782" name="Picture 522444782"/>
@@ -33369,7 +33378,7 @@
       <w:pPr>
         <w:pStyle w:val="FigureCaption"/>
       </w:pPr>
-      <w:bookmarkStart w:id="99" w:name="_Toc242096463"/>
+      <w:bookmarkStart w:id="99" w:name="_Toc242133686"/>
       <w:r>
         <w:t>Hình 5.15. Danh sách tài khoản (Quản lý)</w:t>
       </w:r>
@@ -33529,7 +33538,7 @@
       <w:pPr>
         <w:pStyle w:val="Heading2"/>
       </w:pPr>
-      <w:bookmarkStart w:id="100" w:name="_Toc242096433"/>
+      <w:bookmarkStart w:id="100" w:name="_Toc242133656"/>
       <w:r>
         <w:t>5.15. Sao lưu</w:t>
       </w:r>
@@ -33679,7 +33688,7 @@
           <w:noProof/>
         </w:rPr>
         <w:drawing>
-          <wp:inline distT="0" distB="0" distL="0" distR="0" wp14:anchorId="0EAF17CA" wp14:editId="6E30689C">
+          <wp:inline distT="0" distB="0" distL="0" distR="0" wp14:anchorId="7548D108" wp14:editId="05882223">
             <wp:extent cx="5580000" cy="3332500"/>
             <wp:effectExtent l="0" t="0" r="0" b="0"/>
             <wp:docPr id="522444783" name="Picture 522444783"/>
@@ -33719,7 +33728,7 @@
       <w:pPr>
         <w:pStyle w:val="FigureCaption"/>
       </w:pPr>
-      <w:bookmarkStart w:id="101" w:name="_Toc242096464"/>
+      <w:bookmarkStart w:id="101" w:name="_Toc242133687"/>
       <w:r>
         <w:t>Hình 5.16. Màn hình sao lưu cơ sở dữ liệu</w:t>
       </w:r>
@@ -33748,7 +33757,7 @@
       <w:pPr>
         <w:pStyle w:val="Heading2"/>
       </w:pPr>
-      <w:bookmarkStart w:id="102" w:name="_Toc242096434"/>
+      <w:bookmarkStart w:id="102" w:name="_Toc242133657"/>
       <w:r>
         <w:lastRenderedPageBreak/>
         <w:t>5.16. Chức năng dành cho giáo viên</w:t>
@@ -33898,7 +33907,7 @@
           <w:noProof/>
         </w:rPr>
         <w:drawing>
-          <wp:inline distT="0" distB="0" distL="0" distR="0" wp14:anchorId="522A2CC5" wp14:editId="37046466">
+          <wp:inline distT="0" distB="0" distL="0" distR="0" wp14:anchorId="52924080" wp14:editId="4FC159A6">
             <wp:extent cx="5580000" cy="3332500"/>
             <wp:effectExtent l="0" t="0" r="0" b="0"/>
             <wp:docPr id="522444784" name="Picture 522444784"/>
@@ -33938,7 +33947,7 @@
       <w:pPr>
         <w:pStyle w:val="FigureCaption"/>
       </w:pPr>
-      <w:bookmarkStart w:id="103" w:name="_Toc242096465"/>
+      <w:bookmarkStart w:id="103" w:name="_Toc242133688"/>
       <w:r>
         <w:t>Hình 5.17. Lịch dạy của giáo viên</w:t>
       </w:r>
@@ -33956,7 +33965,7 @@
         </w:rPr>
         <w:lastRenderedPageBreak/>
         <w:drawing>
-          <wp:inline distT="0" distB="0" distL="0" distR="0" wp14:anchorId="3E8C66EF" wp14:editId="2B55BC69">
+          <wp:inline distT="0" distB="0" distL="0" distR="0" wp14:anchorId="47990567" wp14:editId="547120ED">
             <wp:extent cx="5580000" cy="3332500"/>
             <wp:effectExtent l="0" t="0" r="0" b="0"/>
             <wp:docPr id="522444785" name="Picture 522444785"/>
@@ -33996,7 +34005,7 @@
       <w:pPr>
         <w:pStyle w:val="FigureCaption"/>
       </w:pPr>
-      <w:bookmarkStart w:id="104" w:name="_Toc242096466"/>
+      <w:bookmarkStart w:id="104" w:name="_Toc242133689"/>
       <w:r>
         <w:t>Hình 5.18. Sổ điểm của giáo viên</w:t>
       </w:r>
@@ -34006,7 +34015,7 @@
       <w:pPr>
         <w:pStyle w:val="Heading2"/>
       </w:pPr>
-      <w:bookmarkStart w:id="105" w:name="_Toc242096435"/>
+      <w:bookmarkStart w:id="105" w:name="_Toc242133658"/>
       <w:r>
         <w:t>5.17. Việc vẫn làm trong SSMS</w:t>
       </w:r>
@@ -34124,7 +34133,7 @@
         <w:pStyle w:val="Heading1"/>
         <w:pageBreakBefore/>
       </w:pPr>
-      <w:bookmarkStart w:id="106" w:name="_Toc242096436"/>
+      <w:bookmarkStart w:id="106" w:name="_Toc242133659"/>
       <w:r>
         <w:lastRenderedPageBreak/>
         <w:t>CHƯƠNG 6. XỬ LÝ SỰ CỐ</w:t>
@@ -34135,7 +34144,7 @@
       <w:pPr>
         <w:pStyle w:val="Heading2"/>
       </w:pPr>
-      <w:bookmarkStart w:id="107" w:name="_Toc242096437"/>
+      <w:bookmarkStart w:id="107" w:name="_Toc242133660"/>
       <w:r>
         <w:t>6.1. Kiểm tra kết nối không cần giao diện</w:t>
       </w:r>
@@ -34542,7 +34551,7 @@
       <w:pPr>
         <w:pStyle w:val="Heading2"/>
       </w:pPr>
-      <w:bookmarkStart w:id="108" w:name="_Toc242096438"/>
+      <w:bookmarkStart w:id="108" w:name="_Toc242133661"/>
       <w:r>
         <w:t>6.2. Lỗi thường gặp</w:t>
       </w:r>
@@ -34552,7 +34561,7 @@
       <w:pPr>
         <w:pStyle w:val="TableCaption"/>
       </w:pPr>
-      <w:bookmarkStart w:id="109" w:name="_Toc242096481"/>
+      <w:bookmarkStart w:id="109" w:name="_Toc242133704"/>
       <w:r>
         <w:t>Bảng 6.1. Lỗi thường gặp và cách xử lý</w:t>
       </w:r>
@@ -37236,7 +37245,7 @@
       <w:pPr>
         <w:pStyle w:val="Heading2"/>
       </w:pPr>
-      <w:bookmarkStart w:id="110" w:name="_Toc242096439"/>
+      <w:bookmarkStart w:id="110" w:name="_Toc242133662"/>
       <w:r>
         <w:t>6.3. Khi cần hỗ trợ thêm</w:t>
       </w:r>
@@ -37284,7 +37293,7 @@
         <w:pStyle w:val="Heading1"/>
         <w:pageBreakBefore/>
       </w:pPr>
-      <w:bookmarkStart w:id="111" w:name="_Toc242096440"/>
+      <w:bookmarkStart w:id="111" w:name="_Toc242133663"/>
       <w:r>
         <w:lastRenderedPageBreak/>
         <w:t>PHỤ LỤC A. TÓM TẮT LỆNH</w:t>
@@ -38035,7 +38044,7 @@
         <w:pStyle w:val="Heading1"/>
         <w:pageBreakBefore/>
       </w:pPr>
-      <w:bookmarkStart w:id="112" w:name="_Toc242096441"/>
+      <w:bookmarkStart w:id="112" w:name="_Toc242133664"/>
       <w:r>
         <w:lastRenderedPageBreak/>
         <w:t>PHỤ LỤC B. CÁC MỤC CẦN BỔ SUNG</w:t>

</xml_diff>

<commit_message>
docs: refresh the screenshots on macOS and regenerate the report and guide
The Qt offscreen platform renders no text on Windows, so the last
report update (#32) kept the screenshots taken on macOS before the
review fixes of 2026-10-05. Take them again on macOS with
tools/qlttta_screenshots from a database initialized today, so every
picture shows the current screens and the same seed data as the
report.

- 30 of the 45 screenshots changed (new seed dates, version 1.0.0 on
  the login screen); the other 15 are identical
- report data re-exported (161/161 database cases; only the dates and
  row counts that follow the seed date moved)
- report (99 pages) and user guide (53 pages, 8 placeholders)
  regenerated and exported to PDF through Word, no field errors
</commit_message>
<xml_diff>
--- a/docs/user-guide/QLTTTA_User_Guide.docx
+++ b/docs/user-guide/QLTTTA_User_Guide.docx
@@ -1255,7 +1255,7 @@
               <w:rPr>
                 <w:sz w:val="22"/>
               </w:rPr>
-              <w:t>05/10/2026</w:t>
+              <w:t>06/10/2026</w:t>
             </w:r>
           </w:p>
         </w:tc>
@@ -1389,6 +1389,7 @@
           <w:kern w:val="2"/>
           <w:sz w:val="24"/>
           <w:szCs w:val="24"/>
+          <w:lang w:val="en-VN" w:eastAsia="en-US"/>
           <w14:ligatures w14:val="standardContextual"/>
         </w:rPr>
       </w:pPr>
@@ -1401,7 +1402,7 @@
       <w:r>
         <w:fldChar w:fldCharType="separate"/>
       </w:r>
-      <w:hyperlink w:anchor="_Toc242133592" w:history="1">
+      <w:hyperlink w:anchor="_Toc242175021" w:history="1">
         <w:r>
           <w:rPr>
             <w:rStyle w:val="Hyperlink"/>
@@ -1428,7 +1429,7 @@
             <w:noProof/>
             <w:webHidden/>
           </w:rPr>
-          <w:instrText xml:space="preserve"> PAGEREF _Toc242133592 \h </w:instrText>
+          <w:instrText xml:space="preserve"> PAGEREF _Toc242175021 \h </w:instrText>
         </w:r>
         <w:r>
           <w:rPr>
@@ -1448,7 +1449,7 @@
             <w:noProof/>
             <w:webHidden/>
           </w:rPr>
-          <w:t>8</w:t>
+          <w:t>7</w:t>
         </w:r>
         <w:r>
           <w:rPr>
@@ -1471,10 +1472,11 @@
           <w:kern w:val="2"/>
           <w:sz w:val="24"/>
           <w:szCs w:val="24"/>
+          <w:lang w:val="en-VN" w:eastAsia="en-US"/>
           <w14:ligatures w14:val="standardContextual"/>
         </w:rPr>
       </w:pPr>
-      <w:hyperlink w:anchor="_Toc242133593" w:history="1">
+      <w:hyperlink w:anchor="_Toc242175022" w:history="1">
         <w:r>
           <w:rPr>
             <w:rStyle w:val="Hyperlink"/>
@@ -1501,7 +1503,7 @@
             <w:noProof/>
             <w:webHidden/>
           </w:rPr>
-          <w:instrText xml:space="preserve"> PAGEREF _Toc242133593 \h </w:instrText>
+          <w:instrText xml:space="preserve"> PAGEREF _Toc242175022 \h </w:instrText>
         </w:r>
         <w:r>
           <w:rPr>
@@ -1521,7 +1523,7 @@
             <w:noProof/>
             <w:webHidden/>
           </w:rPr>
-          <w:t>8</w:t>
+          <w:t>7</w:t>
         </w:r>
         <w:r>
           <w:rPr>
@@ -1544,10 +1546,11 @@
           <w:kern w:val="2"/>
           <w:sz w:val="24"/>
           <w:szCs w:val="24"/>
+          <w:lang w:val="en-VN" w:eastAsia="en-US"/>
           <w14:ligatures w14:val="standardContextual"/>
         </w:rPr>
       </w:pPr>
-      <w:hyperlink w:anchor="_Toc242133594" w:history="1">
+      <w:hyperlink w:anchor="_Toc242175023" w:history="1">
         <w:r>
           <w:rPr>
             <w:rStyle w:val="Hyperlink"/>
@@ -1574,7 +1577,7 @@
             <w:noProof/>
             <w:webHidden/>
           </w:rPr>
-          <w:instrText xml:space="preserve"> PAGEREF _Toc242133594 \h </w:instrText>
+          <w:instrText xml:space="preserve"> PAGEREF _Toc242175023 \h </w:instrText>
         </w:r>
         <w:r>
           <w:rPr>
@@ -1594,7 +1597,7 @@
             <w:noProof/>
             <w:webHidden/>
           </w:rPr>
-          <w:t>8</w:t>
+          <w:t>7</w:t>
         </w:r>
         <w:r>
           <w:rPr>
@@ -1617,10 +1620,11 @@
           <w:kern w:val="2"/>
           <w:sz w:val="24"/>
           <w:szCs w:val="24"/>
+          <w:lang w:val="en-VN" w:eastAsia="en-US"/>
           <w14:ligatures w14:val="standardContextual"/>
         </w:rPr>
       </w:pPr>
-      <w:hyperlink w:anchor="_Toc242133595" w:history="1">
+      <w:hyperlink w:anchor="_Toc242175024" w:history="1">
         <w:r>
           <w:rPr>
             <w:rStyle w:val="Hyperlink"/>
@@ -1647,7 +1651,7 @@
             <w:noProof/>
             <w:webHidden/>
           </w:rPr>
-          <w:instrText xml:space="preserve"> PAGEREF _Toc242133595 \h </w:instrText>
+          <w:instrText xml:space="preserve"> PAGEREF _Toc242175024 \h </w:instrText>
         </w:r>
         <w:r>
           <w:rPr>
@@ -1667,7 +1671,7 @@
             <w:noProof/>
             <w:webHidden/>
           </w:rPr>
-          <w:t>8</w:t>
+          <w:t>7</w:t>
         </w:r>
         <w:r>
           <w:rPr>
@@ -1690,10 +1694,11 @@
           <w:kern w:val="2"/>
           <w:sz w:val="24"/>
           <w:szCs w:val="24"/>
+          <w:lang w:val="en-VN" w:eastAsia="en-US"/>
           <w14:ligatures w14:val="standardContextual"/>
         </w:rPr>
       </w:pPr>
-      <w:hyperlink w:anchor="_Toc242133596" w:history="1">
+      <w:hyperlink w:anchor="_Toc242175025" w:history="1">
         <w:r>
           <w:rPr>
             <w:rStyle w:val="Hyperlink"/>
@@ -1720,7 +1725,7 @@
             <w:noProof/>
             <w:webHidden/>
           </w:rPr>
-          <w:instrText xml:space="preserve"> PAGEREF _Toc242133596 \h </w:instrText>
+          <w:instrText xml:space="preserve"> PAGEREF _Toc242175025 \h </w:instrText>
         </w:r>
         <w:r>
           <w:rPr>
@@ -1740,7 +1745,7 @@
             <w:noProof/>
             <w:webHidden/>
           </w:rPr>
-          <w:t>9</w:t>
+          <w:t>8</w:t>
         </w:r>
         <w:r>
           <w:rPr>
@@ -1763,10 +1768,11 @@
           <w:kern w:val="2"/>
           <w:sz w:val="24"/>
           <w:szCs w:val="24"/>
+          <w:lang w:val="en-VN" w:eastAsia="en-US"/>
           <w14:ligatures w14:val="standardContextual"/>
         </w:rPr>
       </w:pPr>
-      <w:hyperlink w:anchor="_Toc242133597" w:history="1">
+      <w:hyperlink w:anchor="_Toc242175026" w:history="1">
         <w:r>
           <w:rPr>
             <w:rStyle w:val="Hyperlink"/>
@@ -1793,7 +1799,7 @@
             <w:noProof/>
             <w:webHidden/>
           </w:rPr>
-          <w:instrText xml:space="preserve"> PAGEREF _Toc242133597 \h </w:instrText>
+          <w:instrText xml:space="preserve"> PAGEREF _Toc242175026 \h </w:instrText>
         </w:r>
         <w:r>
           <w:rPr>
@@ -1813,7 +1819,7 @@
             <w:noProof/>
             <w:webHidden/>
           </w:rPr>
-          <w:t>10</w:t>
+          <w:t>9</w:t>
         </w:r>
         <w:r>
           <w:rPr>
@@ -1836,10 +1842,11 @@
           <w:kern w:val="2"/>
           <w:sz w:val="24"/>
           <w:szCs w:val="24"/>
+          <w:lang w:val="en-VN" w:eastAsia="en-US"/>
           <w14:ligatures w14:val="standardContextual"/>
         </w:rPr>
       </w:pPr>
-      <w:hyperlink w:anchor="_Toc242133598" w:history="1">
+      <w:hyperlink w:anchor="_Toc242175027" w:history="1">
         <w:r>
           <w:rPr>
             <w:rStyle w:val="Hyperlink"/>
@@ -1866,7 +1873,7 @@
             <w:noProof/>
             <w:webHidden/>
           </w:rPr>
-          <w:instrText xml:space="preserve"> PAGEREF _Toc242133598 \h </w:instrText>
+          <w:instrText xml:space="preserve"> PAGEREF _Toc242175027 \h </w:instrText>
         </w:r>
         <w:r>
           <w:rPr>
@@ -1886,7 +1893,7 @@
             <w:noProof/>
             <w:webHidden/>
           </w:rPr>
-          <w:t>10</w:t>
+          <w:t>9</w:t>
         </w:r>
         <w:r>
           <w:rPr>
@@ -1909,10 +1916,11 @@
           <w:kern w:val="2"/>
           <w:sz w:val="24"/>
           <w:szCs w:val="24"/>
+          <w:lang w:val="en-VN" w:eastAsia="en-US"/>
           <w14:ligatures w14:val="standardContextual"/>
         </w:rPr>
       </w:pPr>
-      <w:hyperlink w:anchor="_Toc242133599" w:history="1">
+      <w:hyperlink w:anchor="_Toc242175028" w:history="1">
         <w:r>
           <w:rPr>
             <w:rStyle w:val="Hyperlink"/>
@@ -1939,7 +1947,7 @@
             <w:noProof/>
             <w:webHidden/>
           </w:rPr>
-          <w:instrText xml:space="preserve"> PAGEREF _Toc242133599 \h </w:instrText>
+          <w:instrText xml:space="preserve"> PAGEREF _Toc242175028 \h </w:instrText>
         </w:r>
         <w:r>
           <w:rPr>
@@ -1959,7 +1967,7 @@
             <w:noProof/>
             <w:webHidden/>
           </w:rPr>
-          <w:t>12</w:t>
+          <w:t>11</w:t>
         </w:r>
         <w:r>
           <w:rPr>
@@ -1982,10 +1990,11 @@
           <w:kern w:val="2"/>
           <w:sz w:val="24"/>
           <w:szCs w:val="24"/>
+          <w:lang w:val="en-VN" w:eastAsia="en-US"/>
           <w14:ligatures w14:val="standardContextual"/>
         </w:rPr>
       </w:pPr>
-      <w:hyperlink w:anchor="_Toc242133600" w:history="1">
+      <w:hyperlink w:anchor="_Toc242175029" w:history="1">
         <w:r>
           <w:rPr>
             <w:rStyle w:val="Hyperlink"/>
@@ -2012,7 +2021,7 @@
             <w:noProof/>
             <w:webHidden/>
           </w:rPr>
-          <w:instrText xml:space="preserve"> PAGEREF _Toc242133600 \h </w:instrText>
+          <w:instrText xml:space="preserve"> PAGEREF _Toc242175029 \h </w:instrText>
         </w:r>
         <w:r>
           <w:rPr>
@@ -2032,7 +2041,7 @@
             <w:noProof/>
             <w:webHidden/>
           </w:rPr>
-          <w:t>12</w:t>
+          <w:t>11</w:t>
         </w:r>
         <w:r>
           <w:rPr>
@@ -2055,10 +2064,11 @@
           <w:kern w:val="2"/>
           <w:sz w:val="24"/>
           <w:szCs w:val="24"/>
+          <w:lang w:val="en-VN" w:eastAsia="en-US"/>
           <w14:ligatures w14:val="standardContextual"/>
         </w:rPr>
       </w:pPr>
-      <w:hyperlink w:anchor="_Toc242133601" w:history="1">
+      <w:hyperlink w:anchor="_Toc242175030" w:history="1">
         <w:r>
           <w:rPr>
             <w:rStyle w:val="Hyperlink"/>
@@ -2085,7 +2095,7 @@
             <w:noProof/>
             <w:webHidden/>
           </w:rPr>
-          <w:instrText xml:space="preserve"> PAGEREF _Toc242133601 \h </w:instrText>
+          <w:instrText xml:space="preserve"> PAGEREF _Toc242175030 \h </w:instrText>
         </w:r>
         <w:r>
           <w:rPr>
@@ -2105,7 +2115,7 @@
             <w:noProof/>
             <w:webHidden/>
           </w:rPr>
-          <w:t>12</w:t>
+          <w:t>11</w:t>
         </w:r>
         <w:r>
           <w:rPr>
@@ -2128,10 +2138,11 @@
           <w:kern w:val="2"/>
           <w:sz w:val="24"/>
           <w:szCs w:val="24"/>
+          <w:lang w:val="en-VN" w:eastAsia="en-US"/>
           <w14:ligatures w14:val="standardContextual"/>
         </w:rPr>
       </w:pPr>
-      <w:hyperlink w:anchor="_Toc242133602" w:history="1">
+      <w:hyperlink w:anchor="_Toc242175031" w:history="1">
         <w:r>
           <w:rPr>
             <w:rStyle w:val="Hyperlink"/>
@@ -2158,7 +2169,7 @@
             <w:noProof/>
             <w:webHidden/>
           </w:rPr>
-          <w:instrText xml:space="preserve"> PAGEREF _Toc242133602 \h </w:instrText>
+          <w:instrText xml:space="preserve"> PAGEREF _Toc242175031 \h </w:instrText>
         </w:r>
         <w:r>
           <w:rPr>
@@ -2178,7 +2189,7 @@
             <w:noProof/>
             <w:webHidden/>
           </w:rPr>
-          <w:t>12</w:t>
+          <w:t>11</w:t>
         </w:r>
         <w:r>
           <w:rPr>
@@ -2201,10 +2212,11 @@
           <w:kern w:val="2"/>
           <w:sz w:val="24"/>
           <w:szCs w:val="24"/>
+          <w:lang w:val="en-VN" w:eastAsia="en-US"/>
           <w14:ligatures w14:val="standardContextual"/>
         </w:rPr>
       </w:pPr>
-      <w:hyperlink w:anchor="_Toc242133603" w:history="1">
+      <w:hyperlink w:anchor="_Toc242175032" w:history="1">
         <w:r>
           <w:rPr>
             <w:rStyle w:val="Hyperlink"/>
@@ -2231,7 +2243,7 @@
             <w:noProof/>
             <w:webHidden/>
           </w:rPr>
-          <w:instrText xml:space="preserve"> PAGEREF _Toc242133603 \h </w:instrText>
+          <w:instrText xml:space="preserve"> PAGEREF _Toc242175032 \h </w:instrText>
         </w:r>
         <w:r>
           <w:rPr>
@@ -2251,7 +2263,7 @@
             <w:noProof/>
             <w:webHidden/>
           </w:rPr>
-          <w:t>13</w:t>
+          <w:t>12</w:t>
         </w:r>
         <w:r>
           <w:rPr>
@@ -2274,10 +2286,11 @@
           <w:kern w:val="2"/>
           <w:sz w:val="24"/>
           <w:szCs w:val="24"/>
+          <w:lang w:val="en-VN" w:eastAsia="en-US"/>
           <w14:ligatures w14:val="standardContextual"/>
         </w:rPr>
       </w:pPr>
-      <w:hyperlink w:anchor="_Toc242133604" w:history="1">
+      <w:hyperlink w:anchor="_Toc242175033" w:history="1">
         <w:r>
           <w:rPr>
             <w:rStyle w:val="Hyperlink"/>
@@ -2304,7 +2317,7 @@
             <w:noProof/>
             <w:webHidden/>
           </w:rPr>
-          <w:instrText xml:space="preserve"> PAGEREF _Toc242133604 \h </w:instrText>
+          <w:instrText xml:space="preserve"> PAGEREF _Toc242175033 \h </w:instrText>
         </w:r>
         <w:r>
           <w:rPr>
@@ -2324,7 +2337,7 @@
             <w:noProof/>
             <w:webHidden/>
           </w:rPr>
-          <w:t>13</w:t>
+          <w:t>12</w:t>
         </w:r>
         <w:r>
           <w:rPr>
@@ -2347,10 +2360,11 @@
           <w:kern w:val="2"/>
           <w:sz w:val="24"/>
           <w:szCs w:val="24"/>
+          <w:lang w:val="en-VN" w:eastAsia="en-US"/>
           <w14:ligatures w14:val="standardContextual"/>
         </w:rPr>
       </w:pPr>
-      <w:hyperlink w:anchor="_Toc242133605" w:history="1">
+      <w:hyperlink w:anchor="_Toc242175034" w:history="1">
         <w:r>
           <w:rPr>
             <w:rStyle w:val="Hyperlink"/>
@@ -2377,7 +2391,7 @@
             <w:noProof/>
             <w:webHidden/>
           </w:rPr>
-          <w:instrText xml:space="preserve"> PAGEREF _Toc242133605 \h </w:instrText>
+          <w:instrText xml:space="preserve"> PAGEREF _Toc242175034 \h </w:instrText>
         </w:r>
         <w:r>
           <w:rPr>
@@ -2397,7 +2411,7 @@
             <w:noProof/>
             <w:webHidden/>
           </w:rPr>
-          <w:t>14</w:t>
+          <w:t>13</w:t>
         </w:r>
         <w:r>
           <w:rPr>
@@ -2420,10 +2434,11 @@
           <w:kern w:val="2"/>
           <w:sz w:val="24"/>
           <w:szCs w:val="24"/>
+          <w:lang w:val="en-VN" w:eastAsia="en-US"/>
           <w14:ligatures w14:val="standardContextual"/>
         </w:rPr>
       </w:pPr>
-      <w:hyperlink w:anchor="_Toc242133606" w:history="1">
+      <w:hyperlink w:anchor="_Toc242175035" w:history="1">
         <w:r>
           <w:rPr>
             <w:rStyle w:val="Hyperlink"/>
@@ -2450,7 +2465,7 @@
             <w:noProof/>
             <w:webHidden/>
           </w:rPr>
-          <w:instrText xml:space="preserve"> PAGEREF _Toc242133606 \h </w:instrText>
+          <w:instrText xml:space="preserve"> PAGEREF _Toc242175035 \h </w:instrText>
         </w:r>
         <w:r>
           <w:rPr>
@@ -2470,7 +2485,7 @@
             <w:noProof/>
             <w:webHidden/>
           </w:rPr>
-          <w:t>14</w:t>
+          <w:t>13</w:t>
         </w:r>
         <w:r>
           <w:rPr>
@@ -2493,10 +2508,11 @@
           <w:kern w:val="2"/>
           <w:sz w:val="24"/>
           <w:szCs w:val="24"/>
+          <w:lang w:val="en-VN" w:eastAsia="en-US"/>
           <w14:ligatures w14:val="standardContextual"/>
         </w:rPr>
       </w:pPr>
-      <w:hyperlink w:anchor="_Toc242133607" w:history="1">
+      <w:hyperlink w:anchor="_Toc242175036" w:history="1">
         <w:r>
           <w:rPr>
             <w:rStyle w:val="Hyperlink"/>
@@ -2523,7 +2539,7 @@
             <w:noProof/>
             <w:webHidden/>
           </w:rPr>
-          <w:instrText xml:space="preserve"> PAGEREF _Toc242133607 \h </w:instrText>
+          <w:instrText xml:space="preserve"> PAGEREF _Toc242175036 \h </w:instrText>
         </w:r>
         <w:r>
           <w:rPr>
@@ -2543,7 +2559,7 @@
             <w:noProof/>
             <w:webHidden/>
           </w:rPr>
-          <w:t>14</w:t>
+          <w:t>13</w:t>
         </w:r>
         <w:r>
           <w:rPr>
@@ -2566,10 +2582,11 @@
           <w:kern w:val="2"/>
           <w:sz w:val="24"/>
           <w:szCs w:val="24"/>
+          <w:lang w:val="en-VN" w:eastAsia="en-US"/>
           <w14:ligatures w14:val="standardContextual"/>
         </w:rPr>
       </w:pPr>
-      <w:hyperlink w:anchor="_Toc242133608" w:history="1">
+      <w:hyperlink w:anchor="_Toc242175037" w:history="1">
         <w:r>
           <w:rPr>
             <w:rStyle w:val="Hyperlink"/>
@@ -2596,7 +2613,7 @@
             <w:noProof/>
             <w:webHidden/>
           </w:rPr>
-          <w:instrText xml:space="preserve"> PAGEREF _Toc242133608 \h </w:instrText>
+          <w:instrText xml:space="preserve"> PAGEREF _Toc242175037 \h </w:instrText>
         </w:r>
         <w:r>
           <w:rPr>
@@ -2616,7 +2633,7 @@
             <w:noProof/>
             <w:webHidden/>
           </w:rPr>
-          <w:t>16</w:t>
+          <w:t>15</w:t>
         </w:r>
         <w:r>
           <w:rPr>
@@ -2639,10 +2656,11 @@
           <w:kern w:val="2"/>
           <w:sz w:val="24"/>
           <w:szCs w:val="24"/>
+          <w:lang w:val="en-VN" w:eastAsia="en-US"/>
           <w14:ligatures w14:val="standardContextual"/>
         </w:rPr>
       </w:pPr>
-      <w:hyperlink w:anchor="_Toc242133609" w:history="1">
+      <w:hyperlink w:anchor="_Toc242175038" w:history="1">
         <w:r>
           <w:rPr>
             <w:rStyle w:val="Hyperlink"/>
@@ -2669,7 +2687,7 @@
             <w:noProof/>
             <w:webHidden/>
           </w:rPr>
-          <w:instrText xml:space="preserve"> PAGEREF _Toc242133609 \h </w:instrText>
+          <w:instrText xml:space="preserve"> PAGEREF _Toc242175038 \h </w:instrText>
         </w:r>
         <w:r>
           <w:rPr>
@@ -2689,7 +2707,7 @@
             <w:noProof/>
             <w:webHidden/>
           </w:rPr>
-          <w:t>16</w:t>
+          <w:t>15</w:t>
         </w:r>
         <w:r>
           <w:rPr>
@@ -2712,10 +2730,11 @@
           <w:kern w:val="2"/>
           <w:sz w:val="24"/>
           <w:szCs w:val="24"/>
+          <w:lang w:val="en-VN" w:eastAsia="en-US"/>
           <w14:ligatures w14:val="standardContextual"/>
         </w:rPr>
       </w:pPr>
-      <w:hyperlink w:anchor="_Toc242133610" w:history="1">
+      <w:hyperlink w:anchor="_Toc242175039" w:history="1">
         <w:r>
           <w:rPr>
             <w:rStyle w:val="Hyperlink"/>
@@ -2742,7 +2761,7 @@
             <w:noProof/>
             <w:webHidden/>
           </w:rPr>
-          <w:instrText xml:space="preserve"> PAGEREF _Toc242133610 \h </w:instrText>
+          <w:instrText xml:space="preserve"> PAGEREF _Toc242175039 \h </w:instrText>
         </w:r>
         <w:r>
           <w:rPr>
@@ -2762,7 +2781,7 @@
             <w:noProof/>
             <w:webHidden/>
           </w:rPr>
-          <w:t>17</w:t>
+          <w:t>16</w:t>
         </w:r>
         <w:r>
           <w:rPr>
@@ -2785,10 +2804,11 @@
           <w:kern w:val="2"/>
           <w:sz w:val="24"/>
           <w:szCs w:val="24"/>
+          <w:lang w:val="en-VN" w:eastAsia="en-US"/>
           <w14:ligatures w14:val="standardContextual"/>
         </w:rPr>
       </w:pPr>
-      <w:hyperlink w:anchor="_Toc242133611" w:history="1">
+      <w:hyperlink w:anchor="_Toc242175040" w:history="1">
         <w:r>
           <w:rPr>
             <w:rStyle w:val="Hyperlink"/>
@@ -2815,7 +2835,7 @@
             <w:noProof/>
             <w:webHidden/>
           </w:rPr>
-          <w:instrText xml:space="preserve"> PAGEREF _Toc242133611 \h </w:instrText>
+          <w:instrText xml:space="preserve"> PAGEREF _Toc242175040 \h </w:instrText>
         </w:r>
         <w:r>
           <w:rPr>
@@ -2835,7 +2855,7 @@
             <w:noProof/>
             <w:webHidden/>
           </w:rPr>
-          <w:t>18</w:t>
+          <w:t>17</w:t>
         </w:r>
         <w:r>
           <w:rPr>
@@ -2858,10 +2878,11 @@
           <w:kern w:val="2"/>
           <w:sz w:val="24"/>
           <w:szCs w:val="24"/>
+          <w:lang w:val="en-VN" w:eastAsia="en-US"/>
           <w14:ligatures w14:val="standardContextual"/>
         </w:rPr>
       </w:pPr>
-      <w:hyperlink w:anchor="_Toc242133612" w:history="1">
+      <w:hyperlink w:anchor="_Toc242175041" w:history="1">
         <w:r>
           <w:rPr>
             <w:rStyle w:val="Hyperlink"/>
@@ -2888,7 +2909,7 @@
             <w:noProof/>
             <w:webHidden/>
           </w:rPr>
-          <w:instrText xml:space="preserve"> PAGEREF _Toc242133612 \h </w:instrText>
+          <w:instrText xml:space="preserve"> PAGEREF _Toc242175041 \h </w:instrText>
         </w:r>
         <w:r>
           <w:rPr>
@@ -2908,7 +2929,7 @@
             <w:noProof/>
             <w:webHidden/>
           </w:rPr>
-          <w:t>18</w:t>
+          <w:t>17</w:t>
         </w:r>
         <w:r>
           <w:rPr>
@@ -2931,10 +2952,11 @@
           <w:kern w:val="2"/>
           <w:sz w:val="24"/>
           <w:szCs w:val="24"/>
+          <w:lang w:val="en-VN" w:eastAsia="en-US"/>
           <w14:ligatures w14:val="standardContextual"/>
         </w:rPr>
       </w:pPr>
-      <w:hyperlink w:anchor="_Toc242133613" w:history="1">
+      <w:hyperlink w:anchor="_Toc242175042" w:history="1">
         <w:r>
           <w:rPr>
             <w:rStyle w:val="Hyperlink"/>
@@ -2961,7 +2983,7 @@
             <w:noProof/>
             <w:webHidden/>
           </w:rPr>
-          <w:instrText xml:space="preserve"> PAGEREF _Toc242133613 \h </w:instrText>
+          <w:instrText xml:space="preserve"> PAGEREF _Toc242175042 \h </w:instrText>
         </w:r>
         <w:r>
           <w:rPr>
@@ -2981,7 +3003,7 @@
             <w:noProof/>
             <w:webHidden/>
           </w:rPr>
-          <w:t>19</w:t>
+          <w:t>18</w:t>
         </w:r>
         <w:r>
           <w:rPr>
@@ -3004,10 +3026,11 @@
           <w:kern w:val="2"/>
           <w:sz w:val="24"/>
           <w:szCs w:val="24"/>
+          <w:lang w:val="en-VN" w:eastAsia="en-US"/>
           <w14:ligatures w14:val="standardContextual"/>
         </w:rPr>
       </w:pPr>
-      <w:hyperlink w:anchor="_Toc242133614" w:history="1">
+      <w:hyperlink w:anchor="_Toc242175043" w:history="1">
         <w:r>
           <w:rPr>
             <w:rStyle w:val="Hyperlink"/>
@@ -3034,7 +3057,7 @@
             <w:noProof/>
             <w:webHidden/>
           </w:rPr>
-          <w:instrText xml:space="preserve"> PAGEREF _Toc242133614 \h </w:instrText>
+          <w:instrText xml:space="preserve"> PAGEREF _Toc242175043 \h </w:instrText>
         </w:r>
         <w:r>
           <w:rPr>
@@ -3054,7 +3077,7 @@
             <w:noProof/>
             <w:webHidden/>
           </w:rPr>
-          <w:t>19</w:t>
+          <w:t>18</w:t>
         </w:r>
         <w:r>
           <w:rPr>
@@ -3077,10 +3100,11 @@
           <w:kern w:val="2"/>
           <w:sz w:val="24"/>
           <w:szCs w:val="24"/>
+          <w:lang w:val="en-VN" w:eastAsia="en-US"/>
           <w14:ligatures w14:val="standardContextual"/>
         </w:rPr>
       </w:pPr>
-      <w:hyperlink w:anchor="_Toc242133615" w:history="1">
+      <w:hyperlink w:anchor="_Toc242175044" w:history="1">
         <w:r>
           <w:rPr>
             <w:rStyle w:val="Hyperlink"/>
@@ -3107,7 +3131,7 @@
             <w:noProof/>
             <w:webHidden/>
           </w:rPr>
-          <w:instrText xml:space="preserve"> PAGEREF _Toc242133615 \h </w:instrText>
+          <w:instrText xml:space="preserve"> PAGEREF _Toc242175044 \h </w:instrText>
         </w:r>
         <w:r>
           <w:rPr>
@@ -3127,7 +3151,7 @@
             <w:noProof/>
             <w:webHidden/>
           </w:rPr>
-          <w:t>19</w:t>
+          <w:t>18</w:t>
         </w:r>
         <w:r>
           <w:rPr>
@@ -3150,10 +3174,11 @@
           <w:kern w:val="2"/>
           <w:sz w:val="24"/>
           <w:szCs w:val="24"/>
+          <w:lang w:val="en-VN" w:eastAsia="en-US"/>
           <w14:ligatures w14:val="standardContextual"/>
         </w:rPr>
       </w:pPr>
-      <w:hyperlink w:anchor="_Toc242133616" w:history="1">
+      <w:hyperlink w:anchor="_Toc242175045" w:history="1">
         <w:r>
           <w:rPr>
             <w:rStyle w:val="Hyperlink"/>
@@ -3180,7 +3205,7 @@
             <w:noProof/>
             <w:webHidden/>
           </w:rPr>
-          <w:instrText xml:space="preserve"> PAGEREF _Toc242133616 \h </w:instrText>
+          <w:instrText xml:space="preserve"> PAGEREF _Toc242175045 \h </w:instrText>
         </w:r>
         <w:r>
           <w:rPr>
@@ -3200,7 +3225,7 @@
             <w:noProof/>
             <w:webHidden/>
           </w:rPr>
-          <w:t>20</w:t>
+          <w:t>19</w:t>
         </w:r>
         <w:r>
           <w:rPr>
@@ -3223,10 +3248,11 @@
           <w:kern w:val="2"/>
           <w:sz w:val="24"/>
           <w:szCs w:val="24"/>
+          <w:lang w:val="en-VN" w:eastAsia="en-US"/>
           <w14:ligatures w14:val="standardContextual"/>
         </w:rPr>
       </w:pPr>
-      <w:hyperlink w:anchor="_Toc242133617" w:history="1">
+      <w:hyperlink w:anchor="_Toc242175046" w:history="1">
         <w:r>
           <w:rPr>
             <w:rStyle w:val="Hyperlink"/>
@@ -3253,7 +3279,7 @@
             <w:noProof/>
             <w:webHidden/>
           </w:rPr>
-          <w:instrText xml:space="preserve"> PAGEREF _Toc242133617 \h </w:instrText>
+          <w:instrText xml:space="preserve"> PAGEREF _Toc242175046 \h </w:instrText>
         </w:r>
         <w:r>
           <w:rPr>
@@ -3273,7 +3299,7 @@
             <w:noProof/>
             <w:webHidden/>
           </w:rPr>
-          <w:t>20</w:t>
+          <w:t>19</w:t>
         </w:r>
         <w:r>
           <w:rPr>
@@ -3296,10 +3322,11 @@
           <w:kern w:val="2"/>
           <w:sz w:val="24"/>
           <w:szCs w:val="24"/>
+          <w:lang w:val="en-VN" w:eastAsia="en-US"/>
           <w14:ligatures w14:val="standardContextual"/>
         </w:rPr>
       </w:pPr>
-      <w:hyperlink w:anchor="_Toc242133618" w:history="1">
+      <w:hyperlink w:anchor="_Toc242175047" w:history="1">
         <w:r>
           <w:rPr>
             <w:rStyle w:val="Hyperlink"/>
@@ -3326,7 +3353,7 @@
             <w:noProof/>
             <w:webHidden/>
           </w:rPr>
-          <w:instrText xml:space="preserve"> PAGEREF _Toc242133618 \h </w:instrText>
+          <w:instrText xml:space="preserve"> PAGEREF _Toc242175047 \h </w:instrText>
         </w:r>
         <w:r>
           <w:rPr>
@@ -3346,7 +3373,7 @@
             <w:noProof/>
             <w:webHidden/>
           </w:rPr>
-          <w:t>21</w:t>
+          <w:t>20</w:t>
         </w:r>
         <w:r>
           <w:rPr>
@@ -3369,10 +3396,11 @@
           <w:kern w:val="2"/>
           <w:sz w:val="24"/>
           <w:szCs w:val="24"/>
+          <w:lang w:val="en-VN" w:eastAsia="en-US"/>
           <w14:ligatures w14:val="standardContextual"/>
         </w:rPr>
       </w:pPr>
-      <w:hyperlink w:anchor="_Toc242133619" w:history="1">
+      <w:hyperlink w:anchor="_Toc242175048" w:history="1">
         <w:r>
           <w:rPr>
             <w:rStyle w:val="Hyperlink"/>
@@ -3399,7 +3427,7 @@
             <w:noProof/>
             <w:webHidden/>
           </w:rPr>
-          <w:instrText xml:space="preserve"> PAGEREF _Toc242133619 \h </w:instrText>
+          <w:instrText xml:space="preserve"> PAGEREF _Toc242175048 \h </w:instrText>
         </w:r>
         <w:r>
           <w:rPr>
@@ -3419,7 +3447,7 @@
             <w:noProof/>
             <w:webHidden/>
           </w:rPr>
-          <w:t>22</w:t>
+          <w:t>21</w:t>
         </w:r>
         <w:r>
           <w:rPr>
@@ -3442,10 +3470,11 @@
           <w:kern w:val="2"/>
           <w:sz w:val="24"/>
           <w:szCs w:val="24"/>
+          <w:lang w:val="en-VN" w:eastAsia="en-US"/>
           <w14:ligatures w14:val="standardContextual"/>
         </w:rPr>
       </w:pPr>
-      <w:hyperlink w:anchor="_Toc242133620" w:history="1">
+      <w:hyperlink w:anchor="_Toc242175049" w:history="1">
         <w:r>
           <w:rPr>
             <w:rStyle w:val="Hyperlink"/>
@@ -3472,7 +3501,7 @@
             <w:noProof/>
             <w:webHidden/>
           </w:rPr>
-          <w:instrText xml:space="preserve"> PAGEREF _Toc242133620 \h </w:instrText>
+          <w:instrText xml:space="preserve"> PAGEREF _Toc242175049 \h </w:instrText>
         </w:r>
         <w:r>
           <w:rPr>
@@ -3492,7 +3521,7 @@
             <w:noProof/>
             <w:webHidden/>
           </w:rPr>
-          <w:t>22</w:t>
+          <w:t>21</w:t>
         </w:r>
         <w:r>
           <w:rPr>
@@ -3515,10 +3544,11 @@
           <w:kern w:val="2"/>
           <w:sz w:val="24"/>
           <w:szCs w:val="24"/>
+          <w:lang w:val="en-VN" w:eastAsia="en-US"/>
           <w14:ligatures w14:val="standardContextual"/>
         </w:rPr>
       </w:pPr>
-      <w:hyperlink w:anchor="_Toc242133621" w:history="1">
+      <w:hyperlink w:anchor="_Toc242175050" w:history="1">
         <w:r>
           <w:rPr>
             <w:rStyle w:val="Hyperlink"/>
@@ -3545,7 +3575,7 @@
             <w:noProof/>
             <w:webHidden/>
           </w:rPr>
-          <w:instrText xml:space="preserve"> PAGEREF _Toc242133621 \h </w:instrText>
+          <w:instrText xml:space="preserve"> PAGEREF _Toc242175050 \h </w:instrText>
         </w:r>
         <w:r>
           <w:rPr>
@@ -3565,7 +3595,7 @@
             <w:noProof/>
             <w:webHidden/>
           </w:rPr>
-          <w:t>22</w:t>
+          <w:t>21</w:t>
         </w:r>
         <w:r>
           <w:rPr>
@@ -3588,10 +3618,11 @@
           <w:kern w:val="2"/>
           <w:sz w:val="24"/>
           <w:szCs w:val="24"/>
+          <w:lang w:val="en-VN" w:eastAsia="en-US"/>
           <w14:ligatures w14:val="standardContextual"/>
         </w:rPr>
       </w:pPr>
-      <w:hyperlink w:anchor="_Toc242133622" w:history="1">
+      <w:hyperlink w:anchor="_Toc242175051" w:history="1">
         <w:r>
           <w:rPr>
             <w:rStyle w:val="Hyperlink"/>
@@ -3618,7 +3649,7 @@
             <w:noProof/>
             <w:webHidden/>
           </w:rPr>
-          <w:instrText xml:space="preserve"> PAGEREF _Toc242133622 \h </w:instrText>
+          <w:instrText xml:space="preserve"> PAGEREF _Toc242175051 \h </w:instrText>
         </w:r>
         <w:r>
           <w:rPr>
@@ -3638,7 +3669,7 @@
             <w:noProof/>
             <w:webHidden/>
           </w:rPr>
-          <w:t>24</w:t>
+          <w:t>23</w:t>
         </w:r>
         <w:r>
           <w:rPr>
@@ -3661,10 +3692,11 @@
           <w:kern w:val="2"/>
           <w:sz w:val="24"/>
           <w:szCs w:val="24"/>
+          <w:lang w:val="en-VN" w:eastAsia="en-US"/>
           <w14:ligatures w14:val="standardContextual"/>
         </w:rPr>
       </w:pPr>
-      <w:hyperlink w:anchor="_Toc242133623" w:history="1">
+      <w:hyperlink w:anchor="_Toc242175052" w:history="1">
         <w:r>
           <w:rPr>
             <w:rStyle w:val="Hyperlink"/>
@@ -3691,7 +3723,7 @@
             <w:noProof/>
             <w:webHidden/>
           </w:rPr>
-          <w:instrText xml:space="preserve"> PAGEREF _Toc242133623 \h </w:instrText>
+          <w:instrText xml:space="preserve"> PAGEREF _Toc242175052 \h </w:instrText>
         </w:r>
         <w:r>
           <w:rPr>
@@ -3711,7 +3743,7 @@
             <w:noProof/>
             <w:webHidden/>
           </w:rPr>
-          <w:t>24</w:t>
+          <w:t>23</w:t>
         </w:r>
         <w:r>
           <w:rPr>
@@ -3734,10 +3766,11 @@
           <w:kern w:val="2"/>
           <w:sz w:val="24"/>
           <w:szCs w:val="24"/>
+          <w:lang w:val="en-VN" w:eastAsia="en-US"/>
           <w14:ligatures w14:val="standardContextual"/>
         </w:rPr>
       </w:pPr>
-      <w:hyperlink w:anchor="_Toc242133624" w:history="1">
+      <w:hyperlink w:anchor="_Toc242175053" w:history="1">
         <w:r>
           <w:rPr>
             <w:rStyle w:val="Hyperlink"/>
@@ -3764,7 +3797,7 @@
             <w:noProof/>
             <w:webHidden/>
           </w:rPr>
-          <w:instrText xml:space="preserve"> PAGEREF _Toc242133624 \h </w:instrText>
+          <w:instrText xml:space="preserve"> PAGEREF _Toc242175053 \h </w:instrText>
         </w:r>
         <w:r>
           <w:rPr>
@@ -3784,7 +3817,7 @@
             <w:noProof/>
             <w:webHidden/>
           </w:rPr>
-          <w:t>24</w:t>
+          <w:t>23</w:t>
         </w:r>
         <w:r>
           <w:rPr>
@@ -3807,10 +3840,11 @@
           <w:kern w:val="2"/>
           <w:sz w:val="24"/>
           <w:szCs w:val="24"/>
+          <w:lang w:val="en-VN" w:eastAsia="en-US"/>
           <w14:ligatures w14:val="standardContextual"/>
         </w:rPr>
       </w:pPr>
-      <w:hyperlink w:anchor="_Toc242133625" w:history="1">
+      <w:hyperlink w:anchor="_Toc242175054" w:history="1">
         <w:r>
           <w:rPr>
             <w:rStyle w:val="Hyperlink"/>
@@ -3837,7 +3871,7 @@
             <w:noProof/>
             <w:webHidden/>
           </w:rPr>
-          <w:instrText xml:space="preserve"> PAGEREF _Toc242133625 \h </w:instrText>
+          <w:instrText xml:space="preserve"> PAGEREF _Toc242175054 \h </w:instrText>
         </w:r>
         <w:r>
           <w:rPr>
@@ -3857,7 +3891,7 @@
             <w:noProof/>
             <w:webHidden/>
           </w:rPr>
-          <w:t>25</w:t>
+          <w:t>24</w:t>
         </w:r>
         <w:r>
           <w:rPr>
@@ -3880,10 +3914,11 @@
           <w:kern w:val="2"/>
           <w:sz w:val="24"/>
           <w:szCs w:val="24"/>
+          <w:lang w:val="en-VN" w:eastAsia="en-US"/>
           <w14:ligatures w14:val="standardContextual"/>
         </w:rPr>
       </w:pPr>
-      <w:hyperlink w:anchor="_Toc242133626" w:history="1">
+      <w:hyperlink w:anchor="_Toc242175055" w:history="1">
         <w:r>
           <w:rPr>
             <w:rStyle w:val="Hyperlink"/>
@@ -3910,7 +3945,7 @@
             <w:noProof/>
             <w:webHidden/>
           </w:rPr>
-          <w:instrText xml:space="preserve"> PAGEREF _Toc242133626 \h </w:instrText>
+          <w:instrText xml:space="preserve"> PAGEREF _Toc242175055 \h </w:instrText>
         </w:r>
         <w:r>
           <w:rPr>
@@ -3930,7 +3965,7 @@
             <w:noProof/>
             <w:webHidden/>
           </w:rPr>
-          <w:t>26</w:t>
+          <w:t>25</w:t>
         </w:r>
         <w:r>
           <w:rPr>
@@ -3953,10 +3988,11 @@
           <w:kern w:val="2"/>
           <w:sz w:val="24"/>
           <w:szCs w:val="24"/>
+          <w:lang w:val="en-VN" w:eastAsia="en-US"/>
           <w14:ligatures w14:val="standardContextual"/>
         </w:rPr>
       </w:pPr>
-      <w:hyperlink w:anchor="_Toc242133627" w:history="1">
+      <w:hyperlink w:anchor="_Toc242175056" w:history="1">
         <w:r>
           <w:rPr>
             <w:rStyle w:val="Hyperlink"/>
@@ -3983,7 +4019,7 @@
             <w:noProof/>
             <w:webHidden/>
           </w:rPr>
-          <w:instrText xml:space="preserve"> PAGEREF _Toc242133627 \h </w:instrText>
+          <w:instrText xml:space="preserve"> PAGEREF _Toc242175056 \h </w:instrText>
         </w:r>
         <w:r>
           <w:rPr>
@@ -4003,7 +4039,7 @@
             <w:noProof/>
             <w:webHidden/>
           </w:rPr>
-          <w:t>27</w:t>
+          <w:t>26</w:t>
         </w:r>
         <w:r>
           <w:rPr>
@@ -4026,10 +4062,11 @@
           <w:kern w:val="2"/>
           <w:sz w:val="24"/>
           <w:szCs w:val="24"/>
+          <w:lang w:val="en-VN" w:eastAsia="en-US"/>
           <w14:ligatures w14:val="standardContextual"/>
         </w:rPr>
       </w:pPr>
-      <w:hyperlink w:anchor="_Toc242133628" w:history="1">
+      <w:hyperlink w:anchor="_Toc242175057" w:history="1">
         <w:r>
           <w:rPr>
             <w:rStyle w:val="Hyperlink"/>
@@ -4056,7 +4093,7 @@
             <w:noProof/>
             <w:webHidden/>
           </w:rPr>
-          <w:instrText xml:space="preserve"> PAGEREF _Toc242133628 \h </w:instrText>
+          <w:instrText xml:space="preserve"> PAGEREF _Toc242175057 \h </w:instrText>
         </w:r>
         <w:r>
           <w:rPr>
@@ -4076,7 +4113,7 @@
             <w:noProof/>
             <w:webHidden/>
           </w:rPr>
-          <w:t>27</w:t>
+          <w:t>26</w:t>
         </w:r>
         <w:r>
           <w:rPr>
@@ -4099,10 +4136,11 @@
           <w:kern w:val="2"/>
           <w:sz w:val="24"/>
           <w:szCs w:val="24"/>
+          <w:lang w:val="en-VN" w:eastAsia="en-US"/>
           <w14:ligatures w14:val="standardContextual"/>
         </w:rPr>
       </w:pPr>
-      <w:hyperlink w:anchor="_Toc242133629" w:history="1">
+      <w:hyperlink w:anchor="_Toc242175058" w:history="1">
         <w:r>
           <w:rPr>
             <w:rStyle w:val="Hyperlink"/>
@@ -4129,7 +4167,7 @@
             <w:noProof/>
             <w:webHidden/>
           </w:rPr>
-          <w:instrText xml:space="preserve"> PAGEREF _Toc242133629 \h </w:instrText>
+          <w:instrText xml:space="preserve"> PAGEREF _Toc242175058 \h </w:instrText>
         </w:r>
         <w:r>
           <w:rPr>
@@ -4149,7 +4187,7 @@
             <w:noProof/>
             <w:webHidden/>
           </w:rPr>
-          <w:t>28</w:t>
+          <w:t>27</w:t>
         </w:r>
         <w:r>
           <w:rPr>
@@ -4172,10 +4210,11 @@
           <w:kern w:val="2"/>
           <w:sz w:val="24"/>
           <w:szCs w:val="24"/>
+          <w:lang w:val="en-VN" w:eastAsia="en-US"/>
           <w14:ligatures w14:val="standardContextual"/>
         </w:rPr>
       </w:pPr>
-      <w:hyperlink w:anchor="_Toc242133630" w:history="1">
+      <w:hyperlink w:anchor="_Toc242175059" w:history="1">
         <w:r>
           <w:rPr>
             <w:rStyle w:val="Hyperlink"/>
@@ -4202,7 +4241,7 @@
             <w:noProof/>
             <w:webHidden/>
           </w:rPr>
-          <w:instrText xml:space="preserve"> PAGEREF _Toc242133630 \h </w:instrText>
+          <w:instrText xml:space="preserve"> PAGEREF _Toc242175059 \h </w:instrText>
         </w:r>
         <w:r>
           <w:rPr>
@@ -4222,7 +4261,7 @@
             <w:noProof/>
             <w:webHidden/>
           </w:rPr>
-          <w:t>28</w:t>
+          <w:t>27</w:t>
         </w:r>
         <w:r>
           <w:rPr>
@@ -4245,10 +4284,11 @@
           <w:kern w:val="2"/>
           <w:sz w:val="24"/>
           <w:szCs w:val="24"/>
+          <w:lang w:val="en-VN" w:eastAsia="en-US"/>
           <w14:ligatures w14:val="standardContextual"/>
         </w:rPr>
       </w:pPr>
-      <w:hyperlink w:anchor="_Toc242133631" w:history="1">
+      <w:hyperlink w:anchor="_Toc242175060" w:history="1">
         <w:r>
           <w:rPr>
             <w:rStyle w:val="Hyperlink"/>
@@ -4275,7 +4315,7 @@
             <w:noProof/>
             <w:webHidden/>
           </w:rPr>
-          <w:instrText xml:space="preserve"> PAGEREF _Toc242133631 \h </w:instrText>
+          <w:instrText xml:space="preserve"> PAGEREF _Toc242175060 \h </w:instrText>
         </w:r>
         <w:r>
           <w:rPr>
@@ -4295,7 +4335,7 @@
             <w:noProof/>
             <w:webHidden/>
           </w:rPr>
-          <w:t>29</w:t>
+          <w:t>28</w:t>
         </w:r>
         <w:r>
           <w:rPr>
@@ -4318,10 +4358,11 @@
           <w:kern w:val="2"/>
           <w:sz w:val="24"/>
           <w:szCs w:val="24"/>
+          <w:lang w:val="en-VN" w:eastAsia="en-US"/>
           <w14:ligatures w14:val="standardContextual"/>
         </w:rPr>
       </w:pPr>
-      <w:hyperlink w:anchor="_Toc242133632" w:history="1">
+      <w:hyperlink w:anchor="_Toc242175061" w:history="1">
         <w:r>
           <w:rPr>
             <w:rStyle w:val="Hyperlink"/>
@@ -4348,7 +4389,7 @@
             <w:noProof/>
             <w:webHidden/>
           </w:rPr>
-          <w:instrText xml:space="preserve"> PAGEREF _Toc242133632 \h </w:instrText>
+          <w:instrText xml:space="preserve"> PAGEREF _Toc242175061 \h </w:instrText>
         </w:r>
         <w:r>
           <w:rPr>
@@ -4368,7 +4409,7 @@
             <w:noProof/>
             <w:webHidden/>
           </w:rPr>
-          <w:t>30</w:t>
+          <w:t>29</w:t>
         </w:r>
         <w:r>
           <w:rPr>
@@ -4391,10 +4432,11 @@
           <w:kern w:val="2"/>
           <w:sz w:val="24"/>
           <w:szCs w:val="24"/>
+          <w:lang w:val="en-VN" w:eastAsia="en-US"/>
           <w14:ligatures w14:val="standardContextual"/>
         </w:rPr>
       </w:pPr>
-      <w:hyperlink w:anchor="_Toc242133633" w:history="1">
+      <w:hyperlink w:anchor="_Toc242175062" w:history="1">
         <w:r>
           <w:rPr>
             <w:rStyle w:val="Hyperlink"/>
@@ -4421,7 +4463,7 @@
             <w:noProof/>
             <w:webHidden/>
           </w:rPr>
-          <w:instrText xml:space="preserve"> PAGEREF _Toc242133633 \h </w:instrText>
+          <w:instrText xml:space="preserve"> PAGEREF _Toc242175062 \h </w:instrText>
         </w:r>
         <w:r>
           <w:rPr>
@@ -4441,7 +4483,7 @@
             <w:noProof/>
             <w:webHidden/>
           </w:rPr>
-          <w:t>30</w:t>
+          <w:t>29</w:t>
         </w:r>
         <w:r>
           <w:rPr>
@@ -4464,10 +4506,11 @@
           <w:kern w:val="2"/>
           <w:sz w:val="24"/>
           <w:szCs w:val="24"/>
+          <w:lang w:val="en-VN" w:eastAsia="en-US"/>
           <w14:ligatures w14:val="standardContextual"/>
         </w:rPr>
       </w:pPr>
-      <w:hyperlink w:anchor="_Toc242133634" w:history="1">
+      <w:hyperlink w:anchor="_Toc242175063" w:history="1">
         <w:r>
           <w:rPr>
             <w:rStyle w:val="Hyperlink"/>
@@ -4494,7 +4537,7 @@
             <w:noProof/>
             <w:webHidden/>
           </w:rPr>
-          <w:instrText xml:space="preserve"> PAGEREF _Toc242133634 \h </w:instrText>
+          <w:instrText xml:space="preserve"> PAGEREF _Toc242175063 \h </w:instrText>
         </w:r>
         <w:r>
           <w:rPr>
@@ -4514,7 +4557,7 @@
             <w:noProof/>
             <w:webHidden/>
           </w:rPr>
-          <w:t>31</w:t>
+          <w:t>30</w:t>
         </w:r>
         <w:r>
           <w:rPr>
@@ -4537,10 +4580,11 @@
           <w:kern w:val="2"/>
           <w:sz w:val="24"/>
           <w:szCs w:val="24"/>
+          <w:lang w:val="en-VN" w:eastAsia="en-US"/>
           <w14:ligatures w14:val="standardContextual"/>
         </w:rPr>
       </w:pPr>
-      <w:hyperlink w:anchor="_Toc242133635" w:history="1">
+      <w:hyperlink w:anchor="_Toc242175064" w:history="1">
         <w:r>
           <w:rPr>
             <w:rStyle w:val="Hyperlink"/>
@@ -4567,7 +4611,7 @@
             <w:noProof/>
             <w:webHidden/>
           </w:rPr>
-          <w:instrText xml:space="preserve"> PAGEREF _Toc242133635 \h </w:instrText>
+          <w:instrText xml:space="preserve"> PAGEREF _Toc242175064 \h </w:instrText>
         </w:r>
         <w:r>
           <w:rPr>
@@ -4587,7 +4631,7 @@
             <w:noProof/>
             <w:webHidden/>
           </w:rPr>
-          <w:t>31</w:t>
+          <w:t>30</w:t>
         </w:r>
         <w:r>
           <w:rPr>
@@ -4610,10 +4654,11 @@
           <w:kern w:val="2"/>
           <w:sz w:val="24"/>
           <w:szCs w:val="24"/>
+          <w:lang w:val="en-VN" w:eastAsia="en-US"/>
           <w14:ligatures w14:val="standardContextual"/>
         </w:rPr>
       </w:pPr>
-      <w:hyperlink w:anchor="_Toc242133636" w:history="1">
+      <w:hyperlink w:anchor="_Toc242175065" w:history="1">
         <w:r>
           <w:rPr>
             <w:rStyle w:val="Hyperlink"/>
@@ -4640,7 +4685,7 @@
             <w:noProof/>
             <w:webHidden/>
           </w:rPr>
-          <w:instrText xml:space="preserve"> PAGEREF _Toc242133636 \h </w:instrText>
+          <w:instrText xml:space="preserve"> PAGEREF _Toc242175065 \h </w:instrText>
         </w:r>
         <w:r>
           <w:rPr>
@@ -4660,7 +4705,7 @@
             <w:noProof/>
             <w:webHidden/>
           </w:rPr>
-          <w:t>31</w:t>
+          <w:t>30</w:t>
         </w:r>
         <w:r>
           <w:rPr>
@@ -4683,10 +4728,11 @@
           <w:kern w:val="2"/>
           <w:sz w:val="24"/>
           <w:szCs w:val="24"/>
+          <w:lang w:val="en-VN" w:eastAsia="en-US"/>
           <w14:ligatures w14:val="standardContextual"/>
         </w:rPr>
       </w:pPr>
-      <w:hyperlink w:anchor="_Toc242133637" w:history="1">
+      <w:hyperlink w:anchor="_Toc242175066" w:history="1">
         <w:r>
           <w:rPr>
             <w:rStyle w:val="Hyperlink"/>
@@ -4713,7 +4759,7 @@
             <w:noProof/>
             <w:webHidden/>
           </w:rPr>
-          <w:instrText xml:space="preserve"> PAGEREF _Toc242133637 \h </w:instrText>
+          <w:instrText xml:space="preserve"> PAGEREF _Toc242175066 \h </w:instrText>
         </w:r>
         <w:r>
           <w:rPr>
@@ -4733,7 +4779,7 @@
             <w:noProof/>
             <w:webHidden/>
           </w:rPr>
-          <w:t>31</w:t>
+          <w:t>30</w:t>
         </w:r>
         <w:r>
           <w:rPr>
@@ -4756,10 +4802,11 @@
           <w:kern w:val="2"/>
           <w:sz w:val="24"/>
           <w:szCs w:val="24"/>
+          <w:lang w:val="en-VN" w:eastAsia="en-US"/>
           <w14:ligatures w14:val="standardContextual"/>
         </w:rPr>
       </w:pPr>
-      <w:hyperlink w:anchor="_Toc242133638" w:history="1">
+      <w:hyperlink w:anchor="_Toc242175067" w:history="1">
         <w:r>
           <w:rPr>
             <w:rStyle w:val="Hyperlink"/>
@@ -4786,7 +4833,7 @@
             <w:noProof/>
             <w:webHidden/>
           </w:rPr>
-          <w:instrText xml:space="preserve"> PAGEREF _Toc242133638 \h </w:instrText>
+          <w:instrText xml:space="preserve"> PAGEREF _Toc242175067 \h </w:instrText>
         </w:r>
         <w:r>
           <w:rPr>
@@ -4806,7 +4853,7 @@
             <w:noProof/>
             <w:webHidden/>
           </w:rPr>
-          <w:t>33</w:t>
+          <w:t>32</w:t>
         </w:r>
         <w:r>
           <w:rPr>
@@ -4829,10 +4876,11 @@
           <w:kern w:val="2"/>
           <w:sz w:val="24"/>
           <w:szCs w:val="24"/>
+          <w:lang w:val="en-VN" w:eastAsia="en-US"/>
           <w14:ligatures w14:val="standardContextual"/>
         </w:rPr>
       </w:pPr>
-      <w:hyperlink w:anchor="_Toc242133639" w:history="1">
+      <w:hyperlink w:anchor="_Toc242175068" w:history="1">
         <w:r>
           <w:rPr>
             <w:rStyle w:val="Hyperlink"/>
@@ -4859,7 +4907,7 @@
             <w:noProof/>
             <w:webHidden/>
           </w:rPr>
-          <w:instrText xml:space="preserve"> PAGEREF _Toc242133639 \h </w:instrText>
+          <w:instrText xml:space="preserve"> PAGEREF _Toc242175068 \h </w:instrText>
         </w:r>
         <w:r>
           <w:rPr>
@@ -4879,7 +4927,7 @@
             <w:noProof/>
             <w:webHidden/>
           </w:rPr>
-          <w:t>33</w:t>
+          <w:t>32</w:t>
         </w:r>
         <w:r>
           <w:rPr>
@@ -4902,10 +4950,11 @@
           <w:kern w:val="2"/>
           <w:sz w:val="24"/>
           <w:szCs w:val="24"/>
+          <w:lang w:val="en-VN" w:eastAsia="en-US"/>
           <w14:ligatures w14:val="standardContextual"/>
         </w:rPr>
       </w:pPr>
-      <w:hyperlink w:anchor="_Toc242133640" w:history="1">
+      <w:hyperlink w:anchor="_Toc242175069" w:history="1">
         <w:r>
           <w:rPr>
             <w:rStyle w:val="Hyperlink"/>
@@ -4932,7 +4981,7 @@
             <w:noProof/>
             <w:webHidden/>
           </w:rPr>
-          <w:instrText xml:space="preserve"> PAGEREF _Toc242133640 \h </w:instrText>
+          <w:instrText xml:space="preserve"> PAGEREF _Toc242175069 \h </w:instrText>
         </w:r>
         <w:r>
           <w:rPr>
@@ -4952,7 +5001,7 @@
             <w:noProof/>
             <w:webHidden/>
           </w:rPr>
-          <w:t>33</w:t>
+          <w:t>32</w:t>
         </w:r>
         <w:r>
           <w:rPr>
@@ -4975,10 +5024,11 @@
           <w:kern w:val="2"/>
           <w:sz w:val="24"/>
           <w:szCs w:val="24"/>
+          <w:lang w:val="en-VN" w:eastAsia="en-US"/>
           <w14:ligatures w14:val="standardContextual"/>
         </w:rPr>
       </w:pPr>
-      <w:hyperlink w:anchor="_Toc242133641" w:history="1">
+      <w:hyperlink w:anchor="_Toc242175070" w:history="1">
         <w:r>
           <w:rPr>
             <w:rStyle w:val="Hyperlink"/>
@@ -5005,7 +5055,7 @@
             <w:noProof/>
             <w:webHidden/>
           </w:rPr>
-          <w:instrText xml:space="preserve"> PAGEREF _Toc242133641 \h </w:instrText>
+          <w:instrText xml:space="preserve"> PAGEREF _Toc242175070 \h </w:instrText>
         </w:r>
         <w:r>
           <w:rPr>
@@ -5025,7 +5075,7 @@
             <w:noProof/>
             <w:webHidden/>
           </w:rPr>
-          <w:t>33</w:t>
+          <w:t>32</w:t>
         </w:r>
         <w:r>
           <w:rPr>
@@ -5048,10 +5098,11 @@
           <w:kern w:val="2"/>
           <w:sz w:val="24"/>
           <w:szCs w:val="24"/>
+          <w:lang w:val="en-VN" w:eastAsia="en-US"/>
           <w14:ligatures w14:val="standardContextual"/>
         </w:rPr>
       </w:pPr>
-      <w:hyperlink w:anchor="_Toc242133642" w:history="1">
+      <w:hyperlink w:anchor="_Toc242175071" w:history="1">
         <w:r>
           <w:rPr>
             <w:rStyle w:val="Hyperlink"/>
@@ -5078,7 +5129,7 @@
             <w:noProof/>
             <w:webHidden/>
           </w:rPr>
-          <w:instrText xml:space="preserve"> PAGEREF _Toc242133642 \h </w:instrText>
+          <w:instrText xml:space="preserve"> PAGEREF _Toc242175071 \h </w:instrText>
         </w:r>
         <w:r>
           <w:rPr>
@@ -5098,7 +5149,7 @@
             <w:noProof/>
             <w:webHidden/>
           </w:rPr>
-          <w:t>34</w:t>
+          <w:t>33</w:t>
         </w:r>
         <w:r>
           <w:rPr>
@@ -5121,10 +5172,11 @@
           <w:kern w:val="2"/>
           <w:sz w:val="24"/>
           <w:szCs w:val="24"/>
+          <w:lang w:val="en-VN" w:eastAsia="en-US"/>
           <w14:ligatures w14:val="standardContextual"/>
         </w:rPr>
       </w:pPr>
-      <w:hyperlink w:anchor="_Toc242133643" w:history="1">
+      <w:hyperlink w:anchor="_Toc242175072" w:history="1">
         <w:r>
           <w:rPr>
             <w:rStyle w:val="Hyperlink"/>
@@ -5151,7 +5203,7 @@
             <w:noProof/>
             <w:webHidden/>
           </w:rPr>
-          <w:instrText xml:space="preserve"> PAGEREF _Toc242133643 \h </w:instrText>
+          <w:instrText xml:space="preserve"> PAGEREF _Toc242175072 \h </w:instrText>
         </w:r>
         <w:r>
           <w:rPr>
@@ -5171,7 +5223,7 @@
             <w:noProof/>
             <w:webHidden/>
           </w:rPr>
-          <w:t>36</w:t>
+          <w:t>35</w:t>
         </w:r>
         <w:r>
           <w:rPr>
@@ -5194,10 +5246,11 @@
           <w:kern w:val="2"/>
           <w:sz w:val="24"/>
           <w:szCs w:val="24"/>
+          <w:lang w:val="en-VN" w:eastAsia="en-US"/>
           <w14:ligatures w14:val="standardContextual"/>
         </w:rPr>
       </w:pPr>
-      <w:hyperlink w:anchor="_Toc242133644" w:history="1">
+      <w:hyperlink w:anchor="_Toc242175073" w:history="1">
         <w:r>
           <w:rPr>
             <w:rStyle w:val="Hyperlink"/>
@@ -5224,7 +5277,7 @@
             <w:noProof/>
             <w:webHidden/>
           </w:rPr>
-          <w:instrText xml:space="preserve"> PAGEREF _Toc242133644 \h </w:instrText>
+          <w:instrText xml:space="preserve"> PAGEREF _Toc242175073 \h </w:instrText>
         </w:r>
         <w:r>
           <w:rPr>
@@ -5244,7 +5297,7 @@
             <w:noProof/>
             <w:webHidden/>
           </w:rPr>
-          <w:t>38</w:t>
+          <w:t>37</w:t>
         </w:r>
         <w:r>
           <w:rPr>
@@ -5267,10 +5320,11 @@
           <w:kern w:val="2"/>
           <w:sz w:val="24"/>
           <w:szCs w:val="24"/>
+          <w:lang w:val="en-VN" w:eastAsia="en-US"/>
           <w14:ligatures w14:val="standardContextual"/>
         </w:rPr>
       </w:pPr>
-      <w:hyperlink w:anchor="_Toc242133645" w:history="1">
+      <w:hyperlink w:anchor="_Toc242175074" w:history="1">
         <w:r>
           <w:rPr>
             <w:rStyle w:val="Hyperlink"/>
@@ -5297,7 +5351,7 @@
             <w:noProof/>
             <w:webHidden/>
           </w:rPr>
-          <w:instrText xml:space="preserve"> PAGEREF _Toc242133645 \h </w:instrText>
+          <w:instrText xml:space="preserve"> PAGEREF _Toc242175074 \h </w:instrText>
         </w:r>
         <w:r>
           <w:rPr>
@@ -5317,7 +5371,7 @@
             <w:noProof/>
             <w:webHidden/>
           </w:rPr>
-          <w:t>39</w:t>
+          <w:t>38</w:t>
         </w:r>
         <w:r>
           <w:rPr>
@@ -5340,10 +5394,11 @@
           <w:kern w:val="2"/>
           <w:sz w:val="24"/>
           <w:szCs w:val="24"/>
+          <w:lang w:val="en-VN" w:eastAsia="en-US"/>
           <w14:ligatures w14:val="standardContextual"/>
         </w:rPr>
       </w:pPr>
-      <w:hyperlink w:anchor="_Toc242133646" w:history="1">
+      <w:hyperlink w:anchor="_Toc242175075" w:history="1">
         <w:r>
           <w:rPr>
             <w:rStyle w:val="Hyperlink"/>
@@ -5370,7 +5425,7 @@
             <w:noProof/>
             <w:webHidden/>
           </w:rPr>
-          <w:instrText xml:space="preserve"> PAGEREF _Toc242133646 \h </w:instrText>
+          <w:instrText xml:space="preserve"> PAGEREF _Toc242175075 \h </w:instrText>
         </w:r>
         <w:r>
           <w:rPr>
@@ -5390,7 +5445,7 @@
             <w:noProof/>
             <w:webHidden/>
           </w:rPr>
-          <w:t>39</w:t>
+          <w:t>38</w:t>
         </w:r>
         <w:r>
           <w:rPr>
@@ -5413,10 +5468,11 @@
           <w:kern w:val="2"/>
           <w:sz w:val="24"/>
           <w:szCs w:val="24"/>
+          <w:lang w:val="en-VN" w:eastAsia="en-US"/>
           <w14:ligatures w14:val="standardContextual"/>
         </w:rPr>
       </w:pPr>
-      <w:hyperlink w:anchor="_Toc242133647" w:history="1">
+      <w:hyperlink w:anchor="_Toc242175076" w:history="1">
         <w:r>
           <w:rPr>
             <w:rStyle w:val="Hyperlink"/>
@@ -5443,7 +5499,7 @@
             <w:noProof/>
             <w:webHidden/>
           </w:rPr>
-          <w:instrText xml:space="preserve"> PAGEREF _Toc242133647 \h </w:instrText>
+          <w:instrText xml:space="preserve"> PAGEREF _Toc242175076 \h </w:instrText>
         </w:r>
         <w:r>
           <w:rPr>
@@ -5463,7 +5519,7 @@
             <w:noProof/>
             <w:webHidden/>
           </w:rPr>
-          <w:t>40</w:t>
+          <w:t>39</w:t>
         </w:r>
         <w:r>
           <w:rPr>
@@ -5486,10 +5542,11 @@
           <w:kern w:val="2"/>
           <w:sz w:val="24"/>
           <w:szCs w:val="24"/>
+          <w:lang w:val="en-VN" w:eastAsia="en-US"/>
           <w14:ligatures w14:val="standardContextual"/>
         </w:rPr>
       </w:pPr>
-      <w:hyperlink w:anchor="_Toc242133648" w:history="1">
+      <w:hyperlink w:anchor="_Toc242175077" w:history="1">
         <w:r>
           <w:rPr>
             <w:rStyle w:val="Hyperlink"/>
@@ -5516,7 +5573,7 @@
             <w:noProof/>
             <w:webHidden/>
           </w:rPr>
-          <w:instrText xml:space="preserve"> PAGEREF _Toc242133648 \h </w:instrText>
+          <w:instrText xml:space="preserve"> PAGEREF _Toc242175077 \h </w:instrText>
         </w:r>
         <w:r>
           <w:rPr>
@@ -5536,7 +5593,7 @@
             <w:noProof/>
             <w:webHidden/>
           </w:rPr>
-          <w:t>41</w:t>
+          <w:t>40</w:t>
         </w:r>
         <w:r>
           <w:rPr>
@@ -5559,10 +5616,11 @@
           <w:kern w:val="2"/>
           <w:sz w:val="24"/>
           <w:szCs w:val="24"/>
+          <w:lang w:val="en-VN" w:eastAsia="en-US"/>
           <w14:ligatures w14:val="standardContextual"/>
         </w:rPr>
       </w:pPr>
-      <w:hyperlink w:anchor="_Toc242133649" w:history="1">
+      <w:hyperlink w:anchor="_Toc242175078" w:history="1">
         <w:r>
           <w:rPr>
             <w:rStyle w:val="Hyperlink"/>
@@ -5589,7 +5647,7 @@
             <w:noProof/>
             <w:webHidden/>
           </w:rPr>
-          <w:instrText xml:space="preserve"> PAGEREF _Toc242133649 \h </w:instrText>
+          <w:instrText xml:space="preserve"> PAGEREF _Toc242175078 \h </w:instrText>
         </w:r>
         <w:r>
           <w:rPr>
@@ -5609,7 +5667,7 @@
             <w:noProof/>
             <w:webHidden/>
           </w:rPr>
-          <w:t>41</w:t>
+          <w:t>40</w:t>
         </w:r>
         <w:r>
           <w:rPr>
@@ -5632,10 +5690,11 @@
           <w:kern w:val="2"/>
           <w:sz w:val="24"/>
           <w:szCs w:val="24"/>
+          <w:lang w:val="en-VN" w:eastAsia="en-US"/>
           <w14:ligatures w14:val="standardContextual"/>
         </w:rPr>
       </w:pPr>
-      <w:hyperlink w:anchor="_Toc242133650" w:history="1">
+      <w:hyperlink w:anchor="_Toc242175079" w:history="1">
         <w:r>
           <w:rPr>
             <w:rStyle w:val="Hyperlink"/>
@@ -5662,7 +5721,7 @@
             <w:noProof/>
             <w:webHidden/>
           </w:rPr>
-          <w:instrText xml:space="preserve"> PAGEREF _Toc242133650 \h </w:instrText>
+          <w:instrText xml:space="preserve"> PAGEREF _Toc242175079 \h </w:instrText>
         </w:r>
         <w:r>
           <w:rPr>
@@ -5682,7 +5741,7 @@
             <w:noProof/>
             <w:webHidden/>
           </w:rPr>
-          <w:t>42</w:t>
+          <w:t>41</w:t>
         </w:r>
         <w:r>
           <w:rPr>
@@ -5705,10 +5764,11 @@
           <w:kern w:val="2"/>
           <w:sz w:val="24"/>
           <w:szCs w:val="24"/>
+          <w:lang w:val="en-VN" w:eastAsia="en-US"/>
           <w14:ligatures w14:val="standardContextual"/>
         </w:rPr>
       </w:pPr>
-      <w:hyperlink w:anchor="_Toc242133651" w:history="1">
+      <w:hyperlink w:anchor="_Toc242175080" w:history="1">
         <w:r>
           <w:rPr>
             <w:rStyle w:val="Hyperlink"/>
@@ -5735,7 +5795,7 @@
             <w:noProof/>
             <w:webHidden/>
           </w:rPr>
-          <w:instrText xml:space="preserve"> PAGEREF _Toc242133651 \h </w:instrText>
+          <w:instrText xml:space="preserve"> PAGEREF _Toc242175080 \h </w:instrText>
         </w:r>
         <w:r>
           <w:rPr>
@@ -5755,7 +5815,7 @@
             <w:noProof/>
             <w:webHidden/>
           </w:rPr>
-          <w:t>43</w:t>
+          <w:t>42</w:t>
         </w:r>
         <w:r>
           <w:rPr>
@@ -5778,10 +5838,11 @@
           <w:kern w:val="2"/>
           <w:sz w:val="24"/>
           <w:szCs w:val="24"/>
+          <w:lang w:val="en-VN" w:eastAsia="en-US"/>
           <w14:ligatures w14:val="standardContextual"/>
         </w:rPr>
       </w:pPr>
-      <w:hyperlink w:anchor="_Toc242133652" w:history="1">
+      <w:hyperlink w:anchor="_Toc242175081" w:history="1">
         <w:r>
           <w:rPr>
             <w:rStyle w:val="Hyperlink"/>
@@ -5808,7 +5869,7 @@
             <w:noProof/>
             <w:webHidden/>
           </w:rPr>
-          <w:instrText xml:space="preserve"> PAGEREF _Toc242133652 \h </w:instrText>
+          <w:instrText xml:space="preserve"> PAGEREF _Toc242175081 \h </w:instrText>
         </w:r>
         <w:r>
           <w:rPr>
@@ -5828,7 +5889,7 @@
             <w:noProof/>
             <w:webHidden/>
           </w:rPr>
-          <w:t>43</w:t>
+          <w:t>42</w:t>
         </w:r>
         <w:r>
           <w:rPr>
@@ -5851,10 +5912,11 @@
           <w:kern w:val="2"/>
           <w:sz w:val="24"/>
           <w:szCs w:val="24"/>
+          <w:lang w:val="en-VN" w:eastAsia="en-US"/>
           <w14:ligatures w14:val="standardContextual"/>
         </w:rPr>
       </w:pPr>
-      <w:hyperlink w:anchor="_Toc242133653" w:history="1">
+      <w:hyperlink w:anchor="_Toc242175082" w:history="1">
         <w:r>
           <w:rPr>
             <w:rStyle w:val="Hyperlink"/>
@@ -5881,7 +5943,7 @@
             <w:noProof/>
             <w:webHidden/>
           </w:rPr>
-          <w:instrText xml:space="preserve"> PAGEREF _Toc242133653 \h </w:instrText>
+          <w:instrText xml:space="preserve"> PAGEREF _Toc242175082 \h </w:instrText>
         </w:r>
         <w:r>
           <w:rPr>
@@ -5901,7 +5963,7 @@
             <w:noProof/>
             <w:webHidden/>
           </w:rPr>
-          <w:t>44</w:t>
+          <w:t>43</w:t>
         </w:r>
         <w:r>
           <w:rPr>
@@ -5924,10 +5986,11 @@
           <w:kern w:val="2"/>
           <w:sz w:val="24"/>
           <w:szCs w:val="24"/>
+          <w:lang w:val="en-VN" w:eastAsia="en-US"/>
           <w14:ligatures w14:val="standardContextual"/>
         </w:rPr>
       </w:pPr>
-      <w:hyperlink w:anchor="_Toc242133654" w:history="1">
+      <w:hyperlink w:anchor="_Toc242175083" w:history="1">
         <w:r>
           <w:rPr>
             <w:rStyle w:val="Hyperlink"/>
@@ -5954,7 +6017,7 @@
             <w:noProof/>
             <w:webHidden/>
           </w:rPr>
-          <w:instrText xml:space="preserve"> PAGEREF _Toc242133654 \h </w:instrText>
+          <w:instrText xml:space="preserve"> PAGEREF _Toc242175083 \h </w:instrText>
         </w:r>
         <w:r>
           <w:rPr>
@@ -5974,7 +6037,7 @@
             <w:noProof/>
             <w:webHidden/>
           </w:rPr>
-          <w:t>44</w:t>
+          <w:t>43</w:t>
         </w:r>
         <w:r>
           <w:rPr>
@@ -5997,10 +6060,11 @@
           <w:kern w:val="2"/>
           <w:sz w:val="24"/>
           <w:szCs w:val="24"/>
+          <w:lang w:val="en-VN" w:eastAsia="en-US"/>
           <w14:ligatures w14:val="standardContextual"/>
         </w:rPr>
       </w:pPr>
-      <w:hyperlink w:anchor="_Toc242133655" w:history="1">
+      <w:hyperlink w:anchor="_Toc242175084" w:history="1">
         <w:r>
           <w:rPr>
             <w:rStyle w:val="Hyperlink"/>
@@ -6027,7 +6091,7 @@
             <w:noProof/>
             <w:webHidden/>
           </w:rPr>
-          <w:instrText xml:space="preserve"> PAGEREF _Toc242133655 \h </w:instrText>
+          <w:instrText xml:space="preserve"> PAGEREF _Toc242175084 \h </w:instrText>
         </w:r>
         <w:r>
           <w:rPr>
@@ -6047,7 +6111,7 @@
             <w:noProof/>
             <w:webHidden/>
           </w:rPr>
-          <w:t>45</w:t>
+          <w:t>44</w:t>
         </w:r>
         <w:r>
           <w:rPr>
@@ -6070,10 +6134,11 @@
           <w:kern w:val="2"/>
           <w:sz w:val="24"/>
           <w:szCs w:val="24"/>
+          <w:lang w:val="en-VN" w:eastAsia="en-US"/>
           <w14:ligatures w14:val="standardContextual"/>
         </w:rPr>
       </w:pPr>
-      <w:hyperlink w:anchor="_Toc242133656" w:history="1">
+      <w:hyperlink w:anchor="_Toc242175085" w:history="1">
         <w:r>
           <w:rPr>
             <w:rStyle w:val="Hyperlink"/>
@@ -6100,7 +6165,7 @@
             <w:noProof/>
             <w:webHidden/>
           </w:rPr>
-          <w:instrText xml:space="preserve"> PAGEREF _Toc242133656 \h </w:instrText>
+          <w:instrText xml:space="preserve"> PAGEREF _Toc242175085 \h </w:instrText>
         </w:r>
         <w:r>
           <w:rPr>
@@ -6120,7 +6185,7 @@
             <w:noProof/>
             <w:webHidden/>
           </w:rPr>
-          <w:t>46</w:t>
+          <w:t>45</w:t>
         </w:r>
         <w:r>
           <w:rPr>
@@ -6143,10 +6208,11 @@
           <w:kern w:val="2"/>
           <w:sz w:val="24"/>
           <w:szCs w:val="24"/>
+          <w:lang w:val="en-VN" w:eastAsia="en-US"/>
           <w14:ligatures w14:val="standardContextual"/>
         </w:rPr>
       </w:pPr>
-      <w:hyperlink w:anchor="_Toc242133657" w:history="1">
+      <w:hyperlink w:anchor="_Toc242175086" w:history="1">
         <w:r>
           <w:rPr>
             <w:rStyle w:val="Hyperlink"/>
@@ -6173,7 +6239,7 @@
             <w:noProof/>
             <w:webHidden/>
           </w:rPr>
-          <w:instrText xml:space="preserve"> PAGEREF _Toc242133657 \h </w:instrText>
+          <w:instrText xml:space="preserve"> PAGEREF _Toc242175086 \h </w:instrText>
         </w:r>
         <w:r>
           <w:rPr>
@@ -6193,7 +6259,7 @@
             <w:noProof/>
             <w:webHidden/>
           </w:rPr>
-          <w:t>47</w:t>
+          <w:t>46</w:t>
         </w:r>
         <w:r>
           <w:rPr>
@@ -6216,10 +6282,11 @@
           <w:kern w:val="2"/>
           <w:sz w:val="24"/>
           <w:szCs w:val="24"/>
+          <w:lang w:val="en-VN" w:eastAsia="en-US"/>
           <w14:ligatures w14:val="standardContextual"/>
         </w:rPr>
       </w:pPr>
-      <w:hyperlink w:anchor="_Toc242133658" w:history="1">
+      <w:hyperlink w:anchor="_Toc242175087" w:history="1">
         <w:r>
           <w:rPr>
             <w:rStyle w:val="Hyperlink"/>
@@ -6246,7 +6313,7 @@
             <w:noProof/>
             <w:webHidden/>
           </w:rPr>
-          <w:instrText xml:space="preserve"> PAGEREF _Toc242133658 \h </w:instrText>
+          <w:instrText xml:space="preserve"> PAGEREF _Toc242175087 \h </w:instrText>
         </w:r>
         <w:r>
           <w:rPr>
@@ -6266,7 +6333,7 @@
             <w:noProof/>
             <w:webHidden/>
           </w:rPr>
-          <w:t>48</w:t>
+          <w:t>47</w:t>
         </w:r>
         <w:r>
           <w:rPr>
@@ -6289,10 +6356,11 @@
           <w:kern w:val="2"/>
           <w:sz w:val="24"/>
           <w:szCs w:val="24"/>
+          <w:lang w:val="en-VN" w:eastAsia="en-US"/>
           <w14:ligatures w14:val="standardContextual"/>
         </w:rPr>
       </w:pPr>
-      <w:hyperlink w:anchor="_Toc242133659" w:history="1">
+      <w:hyperlink w:anchor="_Toc242175088" w:history="1">
         <w:r>
           <w:rPr>
             <w:rStyle w:val="Hyperlink"/>
@@ -6319,7 +6387,7 @@
             <w:noProof/>
             <w:webHidden/>
           </w:rPr>
-          <w:instrText xml:space="preserve"> PAGEREF _Toc242133659 \h </w:instrText>
+          <w:instrText xml:space="preserve"> PAGEREF _Toc242175088 \h </w:instrText>
         </w:r>
         <w:r>
           <w:rPr>
@@ -6339,7 +6407,7 @@
             <w:noProof/>
             <w:webHidden/>
           </w:rPr>
-          <w:t>49</w:t>
+          <w:t>48</w:t>
         </w:r>
         <w:r>
           <w:rPr>
@@ -6362,10 +6430,11 @@
           <w:kern w:val="2"/>
           <w:sz w:val="24"/>
           <w:szCs w:val="24"/>
+          <w:lang w:val="en-VN" w:eastAsia="en-US"/>
           <w14:ligatures w14:val="standardContextual"/>
         </w:rPr>
       </w:pPr>
-      <w:hyperlink w:anchor="_Toc242133660" w:history="1">
+      <w:hyperlink w:anchor="_Toc242175089" w:history="1">
         <w:r>
           <w:rPr>
             <w:rStyle w:val="Hyperlink"/>
@@ -6392,7 +6461,7 @@
             <w:noProof/>
             <w:webHidden/>
           </w:rPr>
-          <w:instrText xml:space="preserve"> PAGEREF _Toc242133660 \h </w:instrText>
+          <w:instrText xml:space="preserve"> PAGEREF _Toc242175089 \h </w:instrText>
         </w:r>
         <w:r>
           <w:rPr>
@@ -6412,7 +6481,7 @@
             <w:noProof/>
             <w:webHidden/>
           </w:rPr>
-          <w:t>49</w:t>
+          <w:t>48</w:t>
         </w:r>
         <w:r>
           <w:rPr>
@@ -6435,10 +6504,11 @@
           <w:kern w:val="2"/>
           <w:sz w:val="24"/>
           <w:szCs w:val="24"/>
+          <w:lang w:val="en-VN" w:eastAsia="en-US"/>
           <w14:ligatures w14:val="standardContextual"/>
         </w:rPr>
       </w:pPr>
-      <w:hyperlink w:anchor="_Toc242133661" w:history="1">
+      <w:hyperlink w:anchor="_Toc242175090" w:history="1">
         <w:r>
           <w:rPr>
             <w:rStyle w:val="Hyperlink"/>
@@ -6465,7 +6535,7 @@
             <w:noProof/>
             <w:webHidden/>
           </w:rPr>
-          <w:instrText xml:space="preserve"> PAGEREF _Toc242133661 \h </w:instrText>
+          <w:instrText xml:space="preserve"> PAGEREF _Toc242175090 \h </w:instrText>
         </w:r>
         <w:r>
           <w:rPr>
@@ -6485,7 +6555,7 @@
             <w:noProof/>
             <w:webHidden/>
           </w:rPr>
-          <w:t>49</w:t>
+          <w:t>48</w:t>
         </w:r>
         <w:r>
           <w:rPr>
@@ -6508,10 +6578,11 @@
           <w:kern w:val="2"/>
           <w:sz w:val="24"/>
           <w:szCs w:val="24"/>
+          <w:lang w:val="en-VN" w:eastAsia="en-US"/>
           <w14:ligatures w14:val="standardContextual"/>
         </w:rPr>
       </w:pPr>
-      <w:hyperlink w:anchor="_Toc242133662" w:history="1">
+      <w:hyperlink w:anchor="_Toc242175091" w:history="1">
         <w:r>
           <w:rPr>
             <w:rStyle w:val="Hyperlink"/>
@@ -6538,7 +6609,7 @@
             <w:noProof/>
             <w:webHidden/>
           </w:rPr>
-          <w:instrText xml:space="preserve"> PAGEREF _Toc242133662 \h </w:instrText>
+          <w:instrText xml:space="preserve"> PAGEREF _Toc242175091 \h </w:instrText>
         </w:r>
         <w:r>
           <w:rPr>
@@ -6558,7 +6629,7 @@
             <w:noProof/>
             <w:webHidden/>
           </w:rPr>
-          <w:t>51</w:t>
+          <w:t>50</w:t>
         </w:r>
         <w:r>
           <w:rPr>
@@ -6581,10 +6652,11 @@
           <w:kern w:val="2"/>
           <w:sz w:val="24"/>
           <w:szCs w:val="24"/>
+          <w:lang w:val="en-VN" w:eastAsia="en-US"/>
           <w14:ligatures w14:val="standardContextual"/>
         </w:rPr>
       </w:pPr>
-      <w:hyperlink w:anchor="_Toc242133663" w:history="1">
+      <w:hyperlink w:anchor="_Toc242175092" w:history="1">
         <w:r>
           <w:rPr>
             <w:rStyle w:val="Hyperlink"/>
@@ -6611,7 +6683,7 @@
             <w:noProof/>
             <w:webHidden/>
           </w:rPr>
-          <w:instrText xml:space="preserve"> PAGEREF _Toc242133663 \h </w:instrText>
+          <w:instrText xml:space="preserve"> PAGEREF _Toc242175092 \h </w:instrText>
         </w:r>
         <w:r>
           <w:rPr>
@@ -6631,7 +6703,7 @@
             <w:noProof/>
             <w:webHidden/>
           </w:rPr>
-          <w:t>52</w:t>
+          <w:t>51</w:t>
         </w:r>
         <w:r>
           <w:rPr>
@@ -6654,10 +6726,11 @@
           <w:kern w:val="2"/>
           <w:sz w:val="24"/>
           <w:szCs w:val="24"/>
+          <w:lang w:val="en-VN" w:eastAsia="en-US"/>
           <w14:ligatures w14:val="standardContextual"/>
         </w:rPr>
       </w:pPr>
-      <w:hyperlink w:anchor="_Toc242133664" w:history="1">
+      <w:hyperlink w:anchor="_Toc242175093" w:history="1">
         <w:r>
           <w:rPr>
             <w:rStyle w:val="Hyperlink"/>
@@ -6684,7 +6757,7 @@
             <w:noProof/>
             <w:webHidden/>
           </w:rPr>
-          <w:instrText xml:space="preserve"> PAGEREF _Toc242133664 \h </w:instrText>
+          <w:instrText xml:space="preserve"> PAGEREF _Toc242175093 \h </w:instrText>
         </w:r>
         <w:r>
           <w:rPr>
@@ -6704,7 +6777,7 @@
             <w:noProof/>
             <w:webHidden/>
           </w:rPr>
-          <w:t>53</w:t>
+          <w:t>52</w:t>
         </w:r>
         <w:r>
           <w:rPr>
@@ -6748,6 +6821,7 @@
           <w:kern w:val="2"/>
           <w:sz w:val="24"/>
           <w:szCs w:val="24"/>
+          <w:lang w:val="en-VN" w:eastAsia="en-US"/>
           <w14:ligatures w14:val="standardContextual"/>
         </w:rPr>
       </w:pPr>
@@ -6760,7 +6834,7 @@
       <w:r>
         <w:fldChar w:fldCharType="separate"/>
       </w:r>
-      <w:hyperlink w:anchor="_Toc242133665" w:history="1">
+      <w:hyperlink w:anchor="_Toc242175094" w:history="1">
         <w:r>
           <w:rPr>
             <w:rStyle w:val="Hyperlink"/>
@@ -6787,7 +6861,7 @@
             <w:noProof/>
             <w:webHidden/>
           </w:rPr>
-          <w:instrText xml:space="preserve"> PAGEREF _Toc242133665 \h </w:instrText>
+          <w:instrText xml:space="preserve"> PAGEREF _Toc242175094 \h </w:instrText>
         </w:r>
         <w:r>
           <w:rPr>
@@ -6807,7 +6881,7 @@
             <w:noProof/>
             <w:webHidden/>
           </w:rPr>
-          <w:t>21</w:t>
+          <w:t>20</w:t>
         </w:r>
         <w:r>
           <w:rPr>
@@ -6830,10 +6904,11 @@
           <w:kern w:val="2"/>
           <w:sz w:val="24"/>
           <w:szCs w:val="24"/>
+          <w:lang w:val="en-VN" w:eastAsia="en-US"/>
           <w14:ligatures w14:val="standardContextual"/>
         </w:rPr>
       </w:pPr>
-      <w:hyperlink w:anchor="_Toc242133666" w:history="1">
+      <w:hyperlink w:anchor="_Toc242175095" w:history="1">
         <w:r>
           <w:rPr>
             <w:rStyle w:val="Hyperlink"/>
@@ -6860,7 +6935,7 @@
             <w:noProof/>
             <w:webHidden/>
           </w:rPr>
-          <w:instrText xml:space="preserve"> PAGEREF _Toc242133666 \h </w:instrText>
+          <w:instrText xml:space="preserve"> PAGEREF _Toc242175095 \h </w:instrText>
         </w:r>
         <w:r>
           <w:rPr>
@@ -6880,7 +6955,7 @@
             <w:noProof/>
             <w:webHidden/>
           </w:rPr>
-          <w:t>21</w:t>
+          <w:t>20</w:t>
         </w:r>
         <w:r>
           <w:rPr>
@@ -6903,10 +6978,11 @@
           <w:kern w:val="2"/>
           <w:sz w:val="24"/>
           <w:szCs w:val="24"/>
+          <w:lang w:val="en-VN" w:eastAsia="en-US"/>
           <w14:ligatures w14:val="standardContextual"/>
         </w:rPr>
       </w:pPr>
-      <w:hyperlink w:anchor="_Toc242133667" w:history="1">
+      <w:hyperlink w:anchor="_Toc242175096" w:history="1">
         <w:r>
           <w:rPr>
             <w:rStyle w:val="Hyperlink"/>
@@ -6933,7 +7009,7 @@
             <w:noProof/>
             <w:webHidden/>
           </w:rPr>
-          <w:instrText xml:space="preserve"> PAGEREF _Toc242133667 \h </w:instrText>
+          <w:instrText xml:space="preserve"> PAGEREF _Toc242175096 \h </w:instrText>
         </w:r>
         <w:r>
           <w:rPr>
@@ -6953,7 +7029,7 @@
             <w:noProof/>
             <w:webHidden/>
           </w:rPr>
-          <w:t>24</w:t>
+          <w:t>23</w:t>
         </w:r>
         <w:r>
           <w:rPr>
@@ -6976,10 +7052,11 @@
           <w:kern w:val="2"/>
           <w:sz w:val="24"/>
           <w:szCs w:val="24"/>
+          <w:lang w:val="en-VN" w:eastAsia="en-US"/>
           <w14:ligatures w14:val="standardContextual"/>
         </w:rPr>
       </w:pPr>
-      <w:hyperlink w:anchor="_Toc242133668" w:history="1">
+      <w:hyperlink w:anchor="_Toc242175097" w:history="1">
         <w:r>
           <w:rPr>
             <w:rStyle w:val="Hyperlink"/>
@@ -7006,7 +7083,7 @@
             <w:noProof/>
             <w:webHidden/>
           </w:rPr>
-          <w:instrText xml:space="preserve"> PAGEREF _Toc242133668 \h </w:instrText>
+          <w:instrText xml:space="preserve"> PAGEREF _Toc242175097 \h </w:instrText>
         </w:r>
         <w:r>
           <w:rPr>
@@ -7026,7 +7103,7 @@
             <w:noProof/>
             <w:webHidden/>
           </w:rPr>
-          <w:t>25</w:t>
+          <w:t>24</w:t>
         </w:r>
         <w:r>
           <w:rPr>
@@ -7049,10 +7126,11 @@
           <w:kern w:val="2"/>
           <w:sz w:val="24"/>
           <w:szCs w:val="24"/>
+          <w:lang w:val="en-VN" w:eastAsia="en-US"/>
           <w14:ligatures w14:val="standardContextual"/>
         </w:rPr>
       </w:pPr>
-      <w:hyperlink w:anchor="_Toc242133669" w:history="1">
+      <w:hyperlink w:anchor="_Toc242175098" w:history="1">
         <w:r>
           <w:rPr>
             <w:rStyle w:val="Hyperlink"/>
@@ -7079,7 +7157,7 @@
             <w:noProof/>
             <w:webHidden/>
           </w:rPr>
-          <w:instrText xml:space="preserve"> PAGEREF _Toc242133669 \h </w:instrText>
+          <w:instrText xml:space="preserve"> PAGEREF _Toc242175098 \h </w:instrText>
         </w:r>
         <w:r>
           <w:rPr>
@@ -7099,7 +7177,7 @@
             <w:noProof/>
             <w:webHidden/>
           </w:rPr>
-          <w:t>27</w:t>
+          <w:t>26</w:t>
         </w:r>
         <w:r>
           <w:rPr>
@@ -7122,10 +7200,11 @@
           <w:kern w:val="2"/>
           <w:sz w:val="24"/>
           <w:szCs w:val="24"/>
+          <w:lang w:val="en-VN" w:eastAsia="en-US"/>
           <w14:ligatures w14:val="standardContextual"/>
         </w:rPr>
       </w:pPr>
-      <w:hyperlink w:anchor="_Toc242133670" w:history="1">
+      <w:hyperlink w:anchor="_Toc242175099" w:history="1">
         <w:r>
           <w:rPr>
             <w:rStyle w:val="Hyperlink"/>
@@ -7152,7 +7231,7 @@
             <w:noProof/>
             <w:webHidden/>
           </w:rPr>
-          <w:instrText xml:space="preserve"> PAGEREF _Toc242133670 \h </w:instrText>
+          <w:instrText xml:space="preserve"> PAGEREF _Toc242175099 \h </w:instrText>
         </w:r>
         <w:r>
           <w:rPr>
@@ -7172,7 +7251,7 @@
             <w:noProof/>
             <w:webHidden/>
           </w:rPr>
-          <w:t>27</w:t>
+          <w:t>26</w:t>
         </w:r>
         <w:r>
           <w:rPr>
@@ -7195,10 +7274,11 @@
           <w:kern w:val="2"/>
           <w:sz w:val="24"/>
           <w:szCs w:val="24"/>
+          <w:lang w:val="en-VN" w:eastAsia="en-US"/>
           <w14:ligatures w14:val="standardContextual"/>
         </w:rPr>
       </w:pPr>
-      <w:hyperlink w:anchor="_Toc242133671" w:history="1">
+      <w:hyperlink w:anchor="_Toc242175100" w:history="1">
         <w:r>
           <w:rPr>
             <w:rStyle w:val="Hyperlink"/>
@@ -7225,7 +7305,7 @@
             <w:noProof/>
             <w:webHidden/>
           </w:rPr>
-          <w:instrText xml:space="preserve"> PAGEREF _Toc242133671 \h </w:instrText>
+          <w:instrText xml:space="preserve"> PAGEREF _Toc242175100 \h </w:instrText>
         </w:r>
         <w:r>
           <w:rPr>
@@ -7245,7 +7325,7 @@
             <w:noProof/>
             <w:webHidden/>
           </w:rPr>
-          <w:t>28</w:t>
+          <w:t>27</w:t>
         </w:r>
         <w:r>
           <w:rPr>
@@ -7268,10 +7348,11 @@
           <w:kern w:val="2"/>
           <w:sz w:val="24"/>
           <w:szCs w:val="24"/>
+          <w:lang w:val="en-VN" w:eastAsia="en-US"/>
           <w14:ligatures w14:val="standardContextual"/>
         </w:rPr>
       </w:pPr>
-      <w:hyperlink w:anchor="_Toc242133672" w:history="1">
+      <w:hyperlink w:anchor="_Toc242175101" w:history="1">
         <w:r>
           <w:rPr>
             <w:rStyle w:val="Hyperlink"/>
@@ -7298,7 +7379,7 @@
             <w:noProof/>
             <w:webHidden/>
           </w:rPr>
-          <w:instrText xml:space="preserve"> PAGEREF _Toc242133672 \h </w:instrText>
+          <w:instrText xml:space="preserve"> PAGEREF _Toc242175101 \h </w:instrText>
         </w:r>
         <w:r>
           <w:rPr>
@@ -7318,7 +7399,7 @@
             <w:noProof/>
             <w:webHidden/>
           </w:rPr>
-          <w:t>30</w:t>
+          <w:t>29</w:t>
         </w:r>
         <w:r>
           <w:rPr>
@@ -7341,10 +7422,11 @@
           <w:kern w:val="2"/>
           <w:sz w:val="24"/>
           <w:szCs w:val="24"/>
+          <w:lang w:val="en-VN" w:eastAsia="en-US"/>
           <w14:ligatures w14:val="standardContextual"/>
         </w:rPr>
       </w:pPr>
-      <w:hyperlink w:anchor="_Toc242133673" w:history="1">
+      <w:hyperlink w:anchor="_Toc242175102" w:history="1">
         <w:r>
           <w:rPr>
             <w:rStyle w:val="Hyperlink"/>
@@ -7371,7 +7453,7 @@
             <w:noProof/>
             <w:webHidden/>
           </w:rPr>
-          <w:instrText xml:space="preserve"> PAGEREF _Toc242133673 \h </w:instrText>
+          <w:instrText xml:space="preserve"> PAGEREF _Toc242175102 \h </w:instrText>
         </w:r>
         <w:r>
           <w:rPr>
@@ -7391,7 +7473,7 @@
             <w:noProof/>
             <w:webHidden/>
           </w:rPr>
-          <w:t>31</w:t>
+          <w:t>30</w:t>
         </w:r>
         <w:r>
           <w:rPr>
@@ -7414,10 +7496,11 @@
           <w:kern w:val="2"/>
           <w:sz w:val="24"/>
           <w:szCs w:val="24"/>
+          <w:lang w:val="en-VN" w:eastAsia="en-US"/>
           <w14:ligatures w14:val="standardContextual"/>
         </w:rPr>
       </w:pPr>
-      <w:hyperlink w:anchor="_Toc242133674" w:history="1">
+      <w:hyperlink w:anchor="_Toc242175103" w:history="1">
         <w:r>
           <w:rPr>
             <w:rStyle w:val="Hyperlink"/>
@@ -7444,7 +7527,7 @@
             <w:noProof/>
             <w:webHidden/>
           </w:rPr>
-          <w:instrText xml:space="preserve"> PAGEREF _Toc242133674 \h </w:instrText>
+          <w:instrText xml:space="preserve"> PAGEREF _Toc242175103 \h </w:instrText>
         </w:r>
         <w:r>
           <w:rPr>
@@ -7464,7 +7547,7 @@
             <w:noProof/>
             <w:webHidden/>
           </w:rPr>
-          <w:t>32</w:t>
+          <w:t>31</w:t>
         </w:r>
         <w:r>
           <w:rPr>
@@ -7487,10 +7570,11 @@
           <w:kern w:val="2"/>
           <w:sz w:val="24"/>
           <w:szCs w:val="24"/>
+          <w:lang w:val="en-VN" w:eastAsia="en-US"/>
           <w14:ligatures w14:val="standardContextual"/>
         </w:rPr>
       </w:pPr>
-      <w:hyperlink w:anchor="_Toc242133675" w:history="1">
+      <w:hyperlink w:anchor="_Toc242175104" w:history="1">
         <w:r>
           <w:rPr>
             <w:rStyle w:val="Hyperlink"/>
@@ -7517,7 +7601,7 @@
             <w:noProof/>
             <w:webHidden/>
           </w:rPr>
-          <w:instrText xml:space="preserve"> PAGEREF _Toc242133675 \h </w:instrText>
+          <w:instrText xml:space="preserve"> PAGEREF _Toc242175104 \h </w:instrText>
         </w:r>
         <w:r>
           <w:rPr>
@@ -7537,7 +7621,7 @@
             <w:noProof/>
             <w:webHidden/>
           </w:rPr>
-          <w:t>34</w:t>
+          <w:t>33</w:t>
         </w:r>
         <w:r>
           <w:rPr>
@@ -7560,10 +7644,11 @@
           <w:kern w:val="2"/>
           <w:sz w:val="24"/>
           <w:szCs w:val="24"/>
+          <w:lang w:val="en-VN" w:eastAsia="en-US"/>
           <w14:ligatures w14:val="standardContextual"/>
         </w:rPr>
       </w:pPr>
-      <w:hyperlink w:anchor="_Toc242133676" w:history="1">
+      <w:hyperlink w:anchor="_Toc242175105" w:history="1">
         <w:r>
           <w:rPr>
             <w:rStyle w:val="Hyperlink"/>
@@ -7590,7 +7675,7 @@
             <w:noProof/>
             <w:webHidden/>
           </w:rPr>
-          <w:instrText xml:space="preserve"> PAGEREF _Toc242133676 \h </w:instrText>
+          <w:instrText xml:space="preserve"> PAGEREF _Toc242175105 \h </w:instrText>
         </w:r>
         <w:r>
           <w:rPr>
@@ -7610,7 +7695,7 @@
             <w:noProof/>
             <w:webHidden/>
           </w:rPr>
-          <w:t>35</w:t>
+          <w:t>34</w:t>
         </w:r>
         <w:r>
           <w:rPr>
@@ -7633,10 +7718,11 @@
           <w:kern w:val="2"/>
           <w:sz w:val="24"/>
           <w:szCs w:val="24"/>
+          <w:lang w:val="en-VN" w:eastAsia="en-US"/>
           <w14:ligatures w14:val="standardContextual"/>
         </w:rPr>
       </w:pPr>
-      <w:hyperlink w:anchor="_Toc242133677" w:history="1">
+      <w:hyperlink w:anchor="_Toc242175106" w:history="1">
         <w:r>
           <w:rPr>
             <w:rStyle w:val="Hyperlink"/>
@@ -7663,7 +7749,7 @@
             <w:noProof/>
             <w:webHidden/>
           </w:rPr>
-          <w:instrText xml:space="preserve"> PAGEREF _Toc242133677 \h </w:instrText>
+          <w:instrText xml:space="preserve"> PAGEREF _Toc242175106 \h </w:instrText>
         </w:r>
         <w:r>
           <w:rPr>
@@ -7683,7 +7769,7 @@
             <w:noProof/>
             <w:webHidden/>
           </w:rPr>
-          <w:t>37</w:t>
+          <w:t>36</w:t>
         </w:r>
         <w:r>
           <w:rPr>
@@ -7706,10 +7792,11 @@
           <w:kern w:val="2"/>
           <w:sz w:val="24"/>
           <w:szCs w:val="24"/>
+          <w:lang w:val="en-VN" w:eastAsia="en-US"/>
           <w14:ligatures w14:val="standardContextual"/>
         </w:rPr>
       </w:pPr>
-      <w:hyperlink w:anchor="_Toc242133678" w:history="1">
+      <w:hyperlink w:anchor="_Toc242175107" w:history="1">
         <w:r>
           <w:rPr>
             <w:rStyle w:val="Hyperlink"/>
@@ -7736,7 +7823,7 @@
             <w:noProof/>
             <w:webHidden/>
           </w:rPr>
-          <w:instrText xml:space="preserve"> PAGEREF _Toc242133678 \h </w:instrText>
+          <w:instrText xml:space="preserve"> PAGEREF _Toc242175107 \h </w:instrText>
         </w:r>
         <w:r>
           <w:rPr>
@@ -7756,7 +7843,7 @@
             <w:noProof/>
             <w:webHidden/>
           </w:rPr>
-          <w:t>38</w:t>
+          <w:t>37</w:t>
         </w:r>
         <w:r>
           <w:rPr>
@@ -7779,10 +7866,11 @@
           <w:kern w:val="2"/>
           <w:sz w:val="24"/>
           <w:szCs w:val="24"/>
+          <w:lang w:val="en-VN" w:eastAsia="en-US"/>
           <w14:ligatures w14:val="standardContextual"/>
         </w:rPr>
       </w:pPr>
-      <w:hyperlink w:anchor="_Toc242133679" w:history="1">
+      <w:hyperlink w:anchor="_Toc242175108" w:history="1">
         <w:r>
           <w:rPr>
             <w:rStyle w:val="Hyperlink"/>
@@ -7809,7 +7897,7 @@
             <w:noProof/>
             <w:webHidden/>
           </w:rPr>
-          <w:instrText xml:space="preserve"> PAGEREF _Toc242133679 \h </w:instrText>
+          <w:instrText xml:space="preserve"> PAGEREF _Toc242175108 \h </w:instrText>
         </w:r>
         <w:r>
           <w:rPr>
@@ -7829,7 +7917,7 @@
             <w:noProof/>
             <w:webHidden/>
           </w:rPr>
-          <w:t>39</w:t>
+          <w:t>38</w:t>
         </w:r>
         <w:r>
           <w:rPr>
@@ -7852,10 +7940,11 @@
           <w:kern w:val="2"/>
           <w:sz w:val="24"/>
           <w:szCs w:val="24"/>
+          <w:lang w:val="en-VN" w:eastAsia="en-US"/>
           <w14:ligatures w14:val="standardContextual"/>
         </w:rPr>
       </w:pPr>
-      <w:hyperlink w:anchor="_Toc242133680" w:history="1">
+      <w:hyperlink w:anchor="_Toc242175109" w:history="1">
         <w:r>
           <w:rPr>
             <w:rStyle w:val="Hyperlink"/>
@@ -7882,7 +7971,7 @@
             <w:noProof/>
             <w:webHidden/>
           </w:rPr>
-          <w:instrText xml:space="preserve"> PAGEREF _Toc242133680 \h </w:instrText>
+          <w:instrText xml:space="preserve"> PAGEREF _Toc242175109 \h </w:instrText>
         </w:r>
         <w:r>
           <w:rPr>
@@ -7902,7 +7991,7 @@
             <w:noProof/>
             <w:webHidden/>
           </w:rPr>
-          <w:t>40</w:t>
+          <w:t>39</w:t>
         </w:r>
         <w:r>
           <w:rPr>
@@ -7925,10 +8014,11 @@
           <w:kern w:val="2"/>
           <w:sz w:val="24"/>
           <w:szCs w:val="24"/>
+          <w:lang w:val="en-VN" w:eastAsia="en-US"/>
           <w14:ligatures w14:val="standardContextual"/>
         </w:rPr>
       </w:pPr>
-      <w:hyperlink w:anchor="_Toc242133681" w:history="1">
+      <w:hyperlink w:anchor="_Toc242175110" w:history="1">
         <w:r>
           <w:rPr>
             <w:rStyle w:val="Hyperlink"/>
@@ -7955,7 +8045,7 @@
             <w:noProof/>
             <w:webHidden/>
           </w:rPr>
-          <w:instrText xml:space="preserve"> PAGEREF _Toc242133681 \h </w:instrText>
+          <w:instrText xml:space="preserve"> PAGEREF _Toc242175110 \h </w:instrText>
         </w:r>
         <w:r>
           <w:rPr>
@@ -7975,7 +8065,7 @@
             <w:noProof/>
             <w:webHidden/>
           </w:rPr>
-          <w:t>40</w:t>
+          <w:t>39</w:t>
         </w:r>
         <w:r>
           <w:rPr>
@@ -7998,10 +8088,11 @@
           <w:kern w:val="2"/>
           <w:sz w:val="24"/>
           <w:szCs w:val="24"/>
+          <w:lang w:val="en-VN" w:eastAsia="en-US"/>
           <w14:ligatures w14:val="standardContextual"/>
         </w:rPr>
       </w:pPr>
-      <w:hyperlink w:anchor="_Toc242133682" w:history="1">
+      <w:hyperlink w:anchor="_Toc242175111" w:history="1">
         <w:r>
           <w:rPr>
             <w:rStyle w:val="Hyperlink"/>
@@ -8028,7 +8119,7 @@
             <w:noProof/>
             <w:webHidden/>
           </w:rPr>
-          <w:instrText xml:space="preserve"> PAGEREF _Toc242133682 \h </w:instrText>
+          <w:instrText xml:space="preserve"> PAGEREF _Toc242175111 \h </w:instrText>
         </w:r>
         <w:r>
           <w:rPr>
@@ -8048,7 +8139,7 @@
             <w:noProof/>
             <w:webHidden/>
           </w:rPr>
-          <w:t>42</w:t>
+          <w:t>41</w:t>
         </w:r>
         <w:r>
           <w:rPr>
@@ -8071,10 +8162,11 @@
           <w:kern w:val="2"/>
           <w:sz w:val="24"/>
           <w:szCs w:val="24"/>
+          <w:lang w:val="en-VN" w:eastAsia="en-US"/>
           <w14:ligatures w14:val="standardContextual"/>
         </w:rPr>
       </w:pPr>
-      <w:hyperlink w:anchor="_Toc242133683" w:history="1">
+      <w:hyperlink w:anchor="_Toc242175112" w:history="1">
         <w:r>
           <w:rPr>
             <w:rStyle w:val="Hyperlink"/>
@@ -8101,7 +8193,7 @@
             <w:noProof/>
             <w:webHidden/>
           </w:rPr>
-          <w:instrText xml:space="preserve"> PAGEREF _Toc242133683 \h </w:instrText>
+          <w:instrText xml:space="preserve"> PAGEREF _Toc242175112 \h </w:instrText>
         </w:r>
         <w:r>
           <w:rPr>
@@ -8121,7 +8213,7 @@
             <w:noProof/>
             <w:webHidden/>
           </w:rPr>
-          <w:t>42</w:t>
+          <w:t>41</w:t>
         </w:r>
         <w:r>
           <w:rPr>
@@ -8144,10 +8236,11 @@
           <w:kern w:val="2"/>
           <w:sz w:val="24"/>
           <w:szCs w:val="24"/>
+          <w:lang w:val="en-VN" w:eastAsia="en-US"/>
           <w14:ligatures w14:val="standardContextual"/>
         </w:rPr>
       </w:pPr>
-      <w:hyperlink w:anchor="_Toc242133684" w:history="1">
+      <w:hyperlink w:anchor="_Toc242175113" w:history="1">
         <w:r>
           <w:rPr>
             <w:rStyle w:val="Hyperlink"/>
@@ -8174,7 +8267,7 @@
             <w:noProof/>
             <w:webHidden/>
           </w:rPr>
-          <w:instrText xml:space="preserve"> PAGEREF _Toc242133684 \h </w:instrText>
+          <w:instrText xml:space="preserve"> PAGEREF _Toc242175113 \h </w:instrText>
         </w:r>
         <w:r>
           <w:rPr>
@@ -8194,7 +8287,7 @@
             <w:noProof/>
             <w:webHidden/>
           </w:rPr>
-          <w:t>43</w:t>
+          <w:t>42</w:t>
         </w:r>
         <w:r>
           <w:rPr>
@@ -8217,10 +8310,11 @@
           <w:kern w:val="2"/>
           <w:sz w:val="24"/>
           <w:szCs w:val="24"/>
+          <w:lang w:val="en-VN" w:eastAsia="en-US"/>
           <w14:ligatures w14:val="standardContextual"/>
         </w:rPr>
       </w:pPr>
-      <w:hyperlink w:anchor="_Toc242133685" w:history="1">
+      <w:hyperlink w:anchor="_Toc242175114" w:history="1">
         <w:r>
           <w:rPr>
             <w:rStyle w:val="Hyperlink"/>
@@ -8247,7 +8341,7 @@
             <w:noProof/>
             <w:webHidden/>
           </w:rPr>
-          <w:instrText xml:space="preserve"> PAGEREF _Toc242133685 \h </w:instrText>
+          <w:instrText xml:space="preserve"> PAGEREF _Toc242175114 \h </w:instrText>
         </w:r>
         <w:r>
           <w:rPr>
@@ -8267,7 +8361,7 @@
             <w:noProof/>
             <w:webHidden/>
           </w:rPr>
-          <w:t>45</w:t>
+          <w:t>44</w:t>
         </w:r>
         <w:r>
           <w:rPr>
@@ -8290,10 +8384,11 @@
           <w:kern w:val="2"/>
           <w:sz w:val="24"/>
           <w:szCs w:val="24"/>
+          <w:lang w:val="en-VN" w:eastAsia="en-US"/>
           <w14:ligatures w14:val="standardContextual"/>
         </w:rPr>
       </w:pPr>
-      <w:hyperlink w:anchor="_Toc242133686" w:history="1">
+      <w:hyperlink w:anchor="_Toc242175115" w:history="1">
         <w:r>
           <w:rPr>
             <w:rStyle w:val="Hyperlink"/>
@@ -8320,7 +8415,7 @@
             <w:noProof/>
             <w:webHidden/>
           </w:rPr>
-          <w:instrText xml:space="preserve"> PAGEREF _Toc242133686 \h </w:instrText>
+          <w:instrText xml:space="preserve"> PAGEREF _Toc242175115 \h </w:instrText>
         </w:r>
         <w:r>
           <w:rPr>
@@ -8340,7 +8435,7 @@
             <w:noProof/>
             <w:webHidden/>
           </w:rPr>
-          <w:t>45</w:t>
+          <w:t>44</w:t>
         </w:r>
         <w:r>
           <w:rPr>
@@ -8363,10 +8458,11 @@
           <w:kern w:val="2"/>
           <w:sz w:val="24"/>
           <w:szCs w:val="24"/>
+          <w:lang w:val="en-VN" w:eastAsia="en-US"/>
           <w14:ligatures w14:val="standardContextual"/>
         </w:rPr>
       </w:pPr>
-      <w:hyperlink w:anchor="_Toc242133687" w:history="1">
+      <w:hyperlink w:anchor="_Toc242175116" w:history="1">
         <w:r>
           <w:rPr>
             <w:rStyle w:val="Hyperlink"/>
@@ -8393,7 +8489,7 @@
             <w:noProof/>
             <w:webHidden/>
           </w:rPr>
-          <w:instrText xml:space="preserve"> PAGEREF _Toc242133687 \h </w:instrText>
+          <w:instrText xml:space="preserve"> PAGEREF _Toc242175116 \h </w:instrText>
         </w:r>
         <w:r>
           <w:rPr>
@@ -8413,7 +8509,7 @@
             <w:noProof/>
             <w:webHidden/>
           </w:rPr>
-          <w:t>46</w:t>
+          <w:t>45</w:t>
         </w:r>
         <w:r>
           <w:rPr>
@@ -8436,10 +8532,11 @@
           <w:kern w:val="2"/>
           <w:sz w:val="24"/>
           <w:szCs w:val="24"/>
+          <w:lang w:val="en-VN" w:eastAsia="en-US"/>
           <w14:ligatures w14:val="standardContextual"/>
         </w:rPr>
       </w:pPr>
-      <w:hyperlink w:anchor="_Toc242133688" w:history="1">
+      <w:hyperlink w:anchor="_Toc242175117" w:history="1">
         <w:r>
           <w:rPr>
             <w:rStyle w:val="Hyperlink"/>
@@ -8466,7 +8563,7 @@
             <w:noProof/>
             <w:webHidden/>
           </w:rPr>
-          <w:instrText xml:space="preserve"> PAGEREF _Toc242133688 \h </w:instrText>
+          <w:instrText xml:space="preserve"> PAGEREF _Toc242175117 \h </w:instrText>
         </w:r>
         <w:r>
           <w:rPr>
@@ -8486,7 +8583,7 @@
             <w:noProof/>
             <w:webHidden/>
           </w:rPr>
-          <w:t>47</w:t>
+          <w:t>46</w:t>
         </w:r>
         <w:r>
           <w:rPr>
@@ -8509,10 +8606,11 @@
           <w:kern w:val="2"/>
           <w:sz w:val="24"/>
           <w:szCs w:val="24"/>
+          <w:lang w:val="en-VN" w:eastAsia="en-US"/>
           <w14:ligatures w14:val="standardContextual"/>
         </w:rPr>
       </w:pPr>
-      <w:hyperlink w:anchor="_Toc242133689" w:history="1">
+      <w:hyperlink w:anchor="_Toc242175118" w:history="1">
         <w:r>
           <w:rPr>
             <w:rStyle w:val="Hyperlink"/>
@@ -8539,7 +8637,7 @@
             <w:noProof/>
             <w:webHidden/>
           </w:rPr>
-          <w:instrText xml:space="preserve"> PAGEREF _Toc242133689 \h </w:instrText>
+          <w:instrText xml:space="preserve"> PAGEREF _Toc242175118 \h </w:instrText>
         </w:r>
         <w:r>
           <w:rPr>
@@ -8559,7 +8657,7 @@
             <w:noProof/>
             <w:webHidden/>
           </w:rPr>
-          <w:t>48</w:t>
+          <w:t>47</w:t>
         </w:r>
         <w:r>
           <w:rPr>
@@ -8601,6 +8699,7 @@
           <w:kern w:val="2"/>
           <w:sz w:val="24"/>
           <w:szCs w:val="24"/>
+          <w:lang w:val="en-VN" w:eastAsia="en-US"/>
           <w14:ligatures w14:val="standardContextual"/>
         </w:rPr>
       </w:pPr>
@@ -8613,7 +8712,7 @@
       <w:r>
         <w:fldChar w:fldCharType="separate"/>
       </w:r>
-      <w:hyperlink w:anchor="_Toc242133690" w:history="1">
+      <w:hyperlink w:anchor="_Toc242175119" w:history="1">
         <w:r>
           <w:rPr>
             <w:rStyle w:val="Hyperlink"/>
@@ -8640,7 +8739,7 @@
             <w:noProof/>
             <w:webHidden/>
           </w:rPr>
-          <w:instrText xml:space="preserve"> PAGEREF _Toc242133690 \h </w:instrText>
+          <w:instrText xml:space="preserve"> PAGEREF _Toc242175119 \h </w:instrText>
         </w:r>
         <w:r>
           <w:rPr>
@@ -8683,10 +8782,11 @@
           <w:kern w:val="2"/>
           <w:sz w:val="24"/>
           <w:szCs w:val="24"/>
+          <w:lang w:val="en-VN" w:eastAsia="en-US"/>
           <w14:ligatures w14:val="standardContextual"/>
         </w:rPr>
       </w:pPr>
-      <w:hyperlink w:anchor="_Toc242133691" w:history="1">
+      <w:hyperlink w:anchor="_Toc242175120" w:history="1">
         <w:r>
           <w:rPr>
             <w:rStyle w:val="Hyperlink"/>
@@ -8713,7 +8813,7 @@
             <w:noProof/>
             <w:webHidden/>
           </w:rPr>
-          <w:instrText xml:space="preserve"> PAGEREF _Toc242133691 \h </w:instrText>
+          <w:instrText xml:space="preserve"> PAGEREF _Toc242175120 \h </w:instrText>
         </w:r>
         <w:r>
           <w:rPr>
@@ -8756,10 +8856,11 @@
           <w:kern w:val="2"/>
           <w:sz w:val="24"/>
           <w:szCs w:val="24"/>
+          <w:lang w:val="en-VN" w:eastAsia="en-US"/>
           <w14:ligatures w14:val="standardContextual"/>
         </w:rPr>
       </w:pPr>
-      <w:hyperlink w:anchor="_Toc242133692" w:history="1">
+      <w:hyperlink w:anchor="_Toc242175121" w:history="1">
         <w:r>
           <w:rPr>
             <w:rStyle w:val="Hyperlink"/>
@@ -8786,7 +8887,7 @@
             <w:noProof/>
             <w:webHidden/>
           </w:rPr>
-          <w:instrText xml:space="preserve"> PAGEREF _Toc242133692 \h </w:instrText>
+          <w:instrText xml:space="preserve"> PAGEREF _Toc242175121 \h </w:instrText>
         </w:r>
         <w:r>
           <w:rPr>
@@ -8829,10 +8930,11 @@
           <w:kern w:val="2"/>
           <w:sz w:val="24"/>
           <w:szCs w:val="24"/>
+          <w:lang w:val="en-VN" w:eastAsia="en-US"/>
           <w14:ligatures w14:val="standardContextual"/>
         </w:rPr>
       </w:pPr>
-      <w:hyperlink w:anchor="_Toc242133693" w:history="1">
+      <w:hyperlink w:anchor="_Toc242175122" w:history="1">
         <w:r>
           <w:rPr>
             <w:rStyle w:val="Hyperlink"/>
@@ -8859,7 +8961,7 @@
             <w:noProof/>
             <w:webHidden/>
           </w:rPr>
-          <w:instrText xml:space="preserve"> PAGEREF _Toc242133693 \h </w:instrText>
+          <w:instrText xml:space="preserve"> PAGEREF _Toc242175122 \h </w:instrText>
         </w:r>
         <w:r>
           <w:rPr>
@@ -8902,10 +9004,11 @@
           <w:kern w:val="2"/>
           <w:sz w:val="24"/>
           <w:szCs w:val="24"/>
+          <w:lang w:val="en-VN" w:eastAsia="en-US"/>
           <w14:ligatures w14:val="standardContextual"/>
         </w:rPr>
       </w:pPr>
-      <w:hyperlink w:anchor="_Toc242133694" w:history="1">
+      <w:hyperlink w:anchor="_Toc242175123" w:history="1">
         <w:r>
           <w:rPr>
             <w:rStyle w:val="Hyperlink"/>
@@ -8932,7 +9035,7 @@
             <w:noProof/>
             <w:webHidden/>
           </w:rPr>
-          <w:instrText xml:space="preserve"> PAGEREF _Toc242133694 \h </w:instrText>
+          <w:instrText xml:space="preserve"> PAGEREF _Toc242175123 \h </w:instrText>
         </w:r>
         <w:r>
           <w:rPr>
@@ -8975,24 +9078,17 @@
           <w:kern w:val="2"/>
           <w:sz w:val="24"/>
           <w:szCs w:val="24"/>
+          <w:lang w:val="en-VN" w:eastAsia="en-US"/>
           <w14:ligatures w14:val="standardContextual"/>
         </w:rPr>
       </w:pPr>
-      <w:hyperlink w:anchor="_Toc242133695" w:history="1">
+      <w:hyperlink w:anchor="_Toc242175124" w:history="1">
         <w:r>
           <w:rPr>
             <w:rStyle w:val="Hyperlink"/>
             <w:noProof/>
           </w:rPr>
-          <w:t>Bảng 3.2. Cấu hình đã lưu và cách g</w:t>
-        </w:r>
-        <w:r>
-          <w:rPr>
-            <w:rStyle w:val="Hyperlink"/>
-            <w:noProof/>
-          </w:rPr>
-          <w:lastRenderedPageBreak/>
-          <w:t>ỡ ứng dụng</w:t>
+          <w:t>Bảng 3.2. Cấu hình đã lưu và cách gỡ ứng dụng</w:t>
         </w:r>
         <w:r>
           <w:rPr>
@@ -9013,7 +9109,7 @@
             <w:noProof/>
             <w:webHidden/>
           </w:rPr>
-          <w:instrText xml:space="preserve"> PAGEREF _Toc242133695 \h </w:instrText>
+          <w:instrText xml:space="preserve"> PAGEREF _Toc242175124 \h </w:instrText>
         </w:r>
         <w:r>
           <w:rPr>
@@ -9056,10 +9152,11 @@
           <w:kern w:val="2"/>
           <w:sz w:val="24"/>
           <w:szCs w:val="24"/>
+          <w:lang w:val="en-VN" w:eastAsia="en-US"/>
           <w14:ligatures w14:val="standardContextual"/>
         </w:rPr>
       </w:pPr>
-      <w:hyperlink w:anchor="_Toc242133696" w:history="1">
+      <w:hyperlink w:anchor="_Toc242175125" w:history="1">
         <w:r>
           <w:rPr>
             <w:rStyle w:val="Hyperlink"/>
@@ -9086,7 +9183,7 @@
             <w:noProof/>
             <w:webHidden/>
           </w:rPr>
-          <w:instrText xml:space="preserve"> PAGEREF _Toc242133696 \h </w:instrText>
+          <w:instrText xml:space="preserve"> PAGEREF _Toc242175125 \h </w:instrText>
         </w:r>
         <w:r>
           <w:rPr>
@@ -9129,10 +9226,11 @@
           <w:kern w:val="2"/>
           <w:sz w:val="24"/>
           <w:szCs w:val="24"/>
+          <w:lang w:val="en-VN" w:eastAsia="en-US"/>
           <w14:ligatures w14:val="standardContextual"/>
         </w:rPr>
       </w:pPr>
-      <w:hyperlink w:anchor="_Toc242133697" w:history="1">
+      <w:hyperlink w:anchor="_Toc242175126" w:history="1">
         <w:r>
           <w:rPr>
             <w:rStyle w:val="Hyperlink"/>
@@ -9159,7 +9257,7 @@
             <w:noProof/>
             <w:webHidden/>
           </w:rPr>
-          <w:instrText xml:space="preserve"> PAGEREF _Toc242133697 \h </w:instrText>
+          <w:instrText xml:space="preserve"> PAGEREF _Toc242175126 \h </w:instrText>
         </w:r>
         <w:r>
           <w:rPr>
@@ -9202,10 +9300,11 @@
           <w:kern w:val="2"/>
           <w:sz w:val="24"/>
           <w:szCs w:val="24"/>
+          <w:lang w:val="en-VN" w:eastAsia="en-US"/>
           <w14:ligatures w14:val="standardContextual"/>
         </w:rPr>
       </w:pPr>
-      <w:hyperlink w:anchor="_Toc242133698" w:history="1">
+      <w:hyperlink w:anchor="_Toc242175127" w:history="1">
         <w:r>
           <w:rPr>
             <w:rStyle w:val="Hyperlink"/>
@@ -9232,7 +9331,7 @@
             <w:noProof/>
             <w:webHidden/>
           </w:rPr>
-          <w:instrText xml:space="preserve"> PAGEREF _Toc242133698 \h </w:instrText>
+          <w:instrText xml:space="preserve"> PAGEREF _Toc242175127 \h </w:instrText>
         </w:r>
         <w:r>
           <w:rPr>
@@ -9275,10 +9374,11 @@
           <w:kern w:val="2"/>
           <w:sz w:val="24"/>
           <w:szCs w:val="24"/>
+          <w:lang w:val="en-VN" w:eastAsia="en-US"/>
           <w14:ligatures w14:val="standardContextual"/>
         </w:rPr>
       </w:pPr>
-      <w:hyperlink w:anchor="_Toc242133699" w:history="1">
+      <w:hyperlink w:anchor="_Toc242175128" w:history="1">
         <w:r>
           <w:rPr>
             <w:rStyle w:val="Hyperlink"/>
@@ -9305,7 +9405,7 @@
             <w:noProof/>
             <w:webHidden/>
           </w:rPr>
-          <w:instrText xml:space="preserve"> PAGEREF _Toc242133699 \h </w:instrText>
+          <w:instrText xml:space="preserve"> PAGEREF _Toc242175128 \h </w:instrText>
         </w:r>
         <w:r>
           <w:rPr>
@@ -9348,10 +9448,11 @@
           <w:kern w:val="2"/>
           <w:sz w:val="24"/>
           <w:szCs w:val="24"/>
+          <w:lang w:val="en-VN" w:eastAsia="en-US"/>
           <w14:ligatures w14:val="standardContextual"/>
         </w:rPr>
       </w:pPr>
-      <w:hyperlink w:anchor="_Toc242133700" w:history="1">
+      <w:hyperlink w:anchor="_Toc242175129" w:history="1">
         <w:r>
           <w:rPr>
             <w:rStyle w:val="Hyperlink"/>
@@ -9378,7 +9479,7 @@
             <w:noProof/>
             <w:webHidden/>
           </w:rPr>
-          <w:instrText xml:space="preserve"> PAGEREF _Toc242133700 \h </w:instrText>
+          <w:instrText xml:space="preserve"> PAGEREF _Toc242175129 \h </w:instrText>
         </w:r>
         <w:r>
           <w:rPr>
@@ -9421,10 +9522,11 @@
           <w:kern w:val="2"/>
           <w:sz w:val="24"/>
           <w:szCs w:val="24"/>
+          <w:lang w:val="en-VN" w:eastAsia="en-US"/>
           <w14:ligatures w14:val="standardContextual"/>
         </w:rPr>
       </w:pPr>
-      <w:hyperlink w:anchor="_Toc242133701" w:history="1">
+      <w:hyperlink w:anchor="_Toc242175130" w:history="1">
         <w:r>
           <w:rPr>
             <w:rStyle w:val="Hyperlink"/>
@@ -9451,7 +9553,7 @@
             <w:noProof/>
             <w:webHidden/>
           </w:rPr>
-          <w:instrText xml:space="preserve"> PAGEREF _Toc242133701 \h </w:instrText>
+          <w:instrText xml:space="preserve"> PAGEREF _Toc242175130 \h </w:instrText>
         </w:r>
         <w:r>
           <w:rPr>
@@ -9494,10 +9596,11 @@
           <w:kern w:val="2"/>
           <w:sz w:val="24"/>
           <w:szCs w:val="24"/>
+          <w:lang w:val="en-VN" w:eastAsia="en-US"/>
           <w14:ligatures w14:val="standardContextual"/>
         </w:rPr>
       </w:pPr>
-      <w:hyperlink w:anchor="_Toc242133702" w:history="1">
+      <w:hyperlink w:anchor="_Toc242175131" w:history="1">
         <w:r>
           <w:rPr>
             <w:rStyle w:val="Hyperlink"/>
@@ -9524,7 +9627,7 @@
             <w:noProof/>
             <w:webHidden/>
           </w:rPr>
-          <w:instrText xml:space="preserve"> PAGEREF _Toc242133702 \h </w:instrText>
+          <w:instrText xml:space="preserve"> PAGEREF _Toc242175131 \h </w:instrText>
         </w:r>
         <w:r>
           <w:rPr>
@@ -9567,10 +9670,11 @@
           <w:kern w:val="2"/>
           <w:sz w:val="24"/>
           <w:szCs w:val="24"/>
+          <w:lang w:val="en-VN" w:eastAsia="en-US"/>
           <w14:ligatures w14:val="standardContextual"/>
         </w:rPr>
       </w:pPr>
-      <w:hyperlink w:anchor="_Toc242133703" w:history="1">
+      <w:hyperlink w:anchor="_Toc242175132" w:history="1">
         <w:r>
           <w:rPr>
             <w:rStyle w:val="Hyperlink"/>
@@ -9597,7 +9701,7 @@
             <w:noProof/>
             <w:webHidden/>
           </w:rPr>
-          <w:instrText xml:space="preserve"> PAGEREF _Toc242133703 \h </w:instrText>
+          <w:instrText xml:space="preserve"> PAGEREF _Toc242175132 \h </w:instrText>
         </w:r>
         <w:r>
           <w:rPr>
@@ -9640,10 +9744,11 @@
           <w:kern w:val="2"/>
           <w:sz w:val="24"/>
           <w:szCs w:val="24"/>
+          <w:lang w:val="en-VN" w:eastAsia="en-US"/>
           <w14:ligatures w14:val="standardContextual"/>
         </w:rPr>
       </w:pPr>
-      <w:hyperlink w:anchor="_Toc242133704" w:history="1">
+      <w:hyperlink w:anchor="_Toc242175133" w:history="1">
         <w:r>
           <w:rPr>
             <w:rStyle w:val="Hyperlink"/>
@@ -9670,7 +9775,7 @@
             <w:noProof/>
             <w:webHidden/>
           </w:rPr>
-          <w:instrText xml:space="preserve"> PAGEREF _Toc242133704 \h </w:instrText>
+          <w:instrText xml:space="preserve"> PAGEREF _Toc242175133 \h </w:instrText>
         </w:r>
         <w:r>
           <w:rPr>
@@ -9711,7 +9816,7 @@
         <w:pStyle w:val="Heading1"/>
         <w:pageBreakBefore/>
       </w:pPr>
-      <w:bookmarkStart w:id="0" w:name="_Toc242133592"/>
+      <w:bookmarkStart w:id="0" w:name="_Toc242175021"/>
       <w:r>
         <w:lastRenderedPageBreak/>
         <w:t>CHƯƠNG 1. GIỚI THIỆU</w:t>
@@ -9722,7 +9827,7 @@
       <w:pPr>
         <w:pStyle w:val="Heading2"/>
       </w:pPr>
-      <w:bookmarkStart w:id="1" w:name="_Toc242133593"/>
+      <w:bookmarkStart w:id="1" w:name="_Toc242175022"/>
       <w:r>
         <w:t>1.1. Mục đích của tài liệu</w:t>
       </w:r>
@@ -9769,7 +9874,7 @@
       <w:pPr>
         <w:pStyle w:val="Heading2"/>
       </w:pPr>
-      <w:bookmarkStart w:id="2" w:name="_Toc242133594"/>
+      <w:bookmarkStart w:id="2" w:name="_Toc242175023"/>
       <w:r>
         <w:t>1.2. Tổng quan phần mềm</w:t>
       </w:r>
@@ -9916,7 +10021,7 @@
       <w:pPr>
         <w:pStyle w:val="Heading2"/>
       </w:pPr>
-      <w:bookmarkStart w:id="3" w:name="_Toc242133595"/>
+      <w:bookmarkStart w:id="3" w:name="_Toc242175024"/>
       <w:r>
         <w:t>1.3. Vai trò người dùng và chức năng</w:t>
       </w:r>
@@ -9954,7 +10059,7 @@
       <w:pPr>
         <w:pStyle w:val="TableCaption"/>
       </w:pPr>
-      <w:bookmarkStart w:id="4" w:name="_Toc242133690"/>
+      <w:bookmarkStart w:id="4" w:name="_Toc242175119"/>
       <w:r>
         <w:t>Bảng 1.1. Chức năng hiển thị theo vai trò</w:t>
       </w:r>
@@ -14157,7 +14262,7 @@
       <w:pPr>
         <w:pStyle w:val="Heading2"/>
       </w:pPr>
-      <w:bookmarkStart w:id="5" w:name="_Toc242133596"/>
+      <w:bookmarkStart w:id="5" w:name="_Toc242175025"/>
       <w:r>
         <w:t>1.4. Yêu cầu hệ thống</w:t>
       </w:r>
@@ -14167,7 +14272,7 @@
       <w:pPr>
         <w:pStyle w:val="TableCaption"/>
       </w:pPr>
-      <w:bookmarkStart w:id="6" w:name="_Toc242133691"/>
+      <w:bookmarkStart w:id="6" w:name="_Toc242175120"/>
       <w:r>
         <w:t>Bảng 1.2. Yêu cầu phần cứng và phần mềm</w:t>
       </w:r>
@@ -14759,7 +14864,7 @@
       <w:pPr>
         <w:pStyle w:val="Heading2"/>
       </w:pPr>
-      <w:bookmarkStart w:id="7" w:name="_Toc242133597"/>
+      <w:bookmarkStart w:id="7" w:name="_Toc242175026"/>
       <w:r>
         <w:t>1.5. Các bước cài đặt tổng quát</w:t>
       </w:r>
@@ -14911,7 +15016,7 @@
       <w:pPr>
         <w:pStyle w:val="TableCaption"/>
       </w:pPr>
-      <w:bookmarkStart w:id="8" w:name="_Toc242133692"/>
+      <w:bookmarkStart w:id="8" w:name="_Toc242175121"/>
       <w:r>
         <w:t>Bảng 1.3. Chọn phương án SQL Server theo máy</w:t>
       </w:r>
@@ -15515,7 +15620,7 @@
       <w:pPr>
         <w:pStyle w:val="Heading2"/>
       </w:pPr>
-      <w:bookmarkStart w:id="9" w:name="_Toc242133598"/>
+      <w:bookmarkStart w:id="9" w:name="_Toc242175027"/>
       <w:r>
         <w:t>1.6. Quy ước trình bày</w:t>
       </w:r>
@@ -15764,7 +15869,7 @@
         <w:pStyle w:val="Heading1"/>
         <w:pageBreakBefore/>
       </w:pPr>
-      <w:bookmarkStart w:id="10" w:name="_Toc242133599"/>
+      <w:bookmarkStart w:id="10" w:name="_Toc242175028"/>
       <w:r>
         <w:lastRenderedPageBreak/>
         <w:t>CHƯƠNG 2. CÀI ĐẶT SQL SERVER VÀ KHỞI TẠO CƠ SỞ DỮ LIỆU</w:t>
@@ -15821,7 +15926,7 @@
       <w:pPr>
         <w:pStyle w:val="Heading2"/>
       </w:pPr>
-      <w:bookmarkStart w:id="11" w:name="_Toc242133600"/>
+      <w:bookmarkStart w:id="11" w:name="_Toc242175029"/>
       <w:r>
         <w:t>2.1. Tải mã nguồn</w:t>
       </w:r>
@@ -15942,7 +16047,7 @@
       <w:pPr>
         <w:pStyle w:val="Heading2"/>
       </w:pPr>
-      <w:bookmarkStart w:id="12" w:name="_Toc242133601"/>
+      <w:bookmarkStart w:id="12" w:name="_Toc242175030"/>
       <w:r>
         <w:t>2.2. Phương án A - SQL Server trong Docker</w:t>
       </w:r>
@@ -15952,7 +16057,7 @@
       <w:pPr>
         <w:pStyle w:val="Heading3"/>
       </w:pPr>
-      <w:bookmarkStart w:id="13" w:name="_Toc242133602"/>
+      <w:bookmarkStart w:id="13" w:name="_Toc242175031"/>
       <w:r>
         <w:t>2.2.1. Cài Docker Desktop</w:t>
       </w:r>
@@ -16294,7 +16399,7 @@
       <w:pPr>
         <w:pStyle w:val="Heading3"/>
       </w:pPr>
-      <w:bookmarkStart w:id="14" w:name="_Toc242133603"/>
+      <w:bookmarkStart w:id="14" w:name="_Toc242175032"/>
       <w:r>
         <w:t>2.2.2. Khởi động SQL Server</w:t>
       </w:r>
@@ -16722,7 +16827,7 @@
       <w:pPr>
         <w:pStyle w:val="Heading3"/>
       </w:pPr>
-      <w:bookmarkStart w:id="15" w:name="_Toc242133604"/>
+      <w:bookmarkStart w:id="15" w:name="_Toc242175033"/>
       <w:r>
         <w:t>2.2.3. Khởi tạo CSDL</w:t>
       </w:r>
@@ -17154,7 +17259,7 @@
       <w:pPr>
         <w:pStyle w:val="Heading3"/>
       </w:pPr>
-      <w:bookmarkStart w:id="16" w:name="_Toc242133605"/>
+      <w:bookmarkStart w:id="16" w:name="_Toc242175034"/>
       <w:r>
         <w:t>2.2.4. Bật, tắt SQL Server hằng ngày</w:t>
       </w:r>
@@ -17164,7 +17269,7 @@
       <w:pPr>
         <w:pStyle w:val="TableCaption"/>
       </w:pPr>
-      <w:bookmarkStart w:id="17" w:name="_Toc242133693"/>
+      <w:bookmarkStart w:id="17" w:name="_Toc242175122"/>
       <w:r>
         <w:t>Bảng 2.1. Các lệnh Docker thường dùng</w:t>
       </w:r>
@@ -17581,7 +17686,7 @@
       <w:pPr>
         <w:pStyle w:val="Heading2"/>
       </w:pPr>
-      <w:bookmarkStart w:id="18" w:name="_Toc242133606"/>
+      <w:bookmarkStart w:id="18" w:name="_Toc242175035"/>
       <w:r>
         <w:t>2.3. Phương án B - SQL Server cài trực tiếp trên Windows</w:t>
       </w:r>
@@ -17591,7 +17696,7 @@
       <w:pPr>
         <w:pStyle w:val="Heading3"/>
       </w:pPr>
-      <w:bookmarkStart w:id="19" w:name="_Toc242133607"/>
+      <w:bookmarkStart w:id="19" w:name="_Toc242175036"/>
       <w:r>
         <w:t>2.3.1. Cài SQL Server</w:t>
       </w:r>
@@ -17874,7 +17979,10 @@
         <w:t>Azure Extension for SQL Server</w:t>
       </w:r>
       <w:r>
-        <w:t xml:space="preserve">: ô này được tick sẵn và bắt nhập thông tin Azure, để nguyên thì </w:t>
+        <w:t xml:space="preserve">: ô này được tick sẵn và bắt nhập thông tin Azure, để </w:t>
+      </w:r>
+      <w:r>
+        <w:t xml:space="preserve">nguyên thì </w:t>
       </w:r>
       <w:r>
         <w:rPr>
@@ -18066,7 +18174,10 @@
         <w:t>Terminal (Admin)</w:t>
       </w:r>
       <w:r>
-        <w:t>). Lệnh thứ hai khởi động lại dịch vụ SQL Server để áp dụng.</w:t>
+        <w:t xml:space="preserve">). Lệnh thứ hai khởi </w:t>
+      </w:r>
+      <w:r>
+        <w:t>động lại dịch vụ SQL Server để áp dụng.</w:t>
       </w:r>
     </w:p>
     <w:tbl>
@@ -18372,7 +18483,7 @@
       <w:pPr>
         <w:pStyle w:val="Heading3"/>
       </w:pPr>
-      <w:bookmarkStart w:id="20" w:name="_Toc242133608"/>
+      <w:bookmarkStart w:id="20" w:name="_Toc242175037"/>
       <w:r>
         <w:lastRenderedPageBreak/>
         <w:t>2.3.2. Cài công cụ quản trị và driver</w:t>
@@ -18563,7 +18674,7 @@
       <w:pPr>
         <w:pStyle w:val="Heading3"/>
       </w:pPr>
-      <w:bookmarkStart w:id="21" w:name="_Toc242133609"/>
+      <w:bookmarkStart w:id="21" w:name="_Toc242175038"/>
       <w:r>
         <w:t>2.3.3. Bật kết nối TCP/IP</w:t>
       </w:r>
@@ -18964,7 +19075,7 @@
       <w:pPr>
         <w:pStyle w:val="Heading3"/>
       </w:pPr>
-      <w:bookmarkStart w:id="22" w:name="_Toc242133610"/>
+      <w:bookmarkStart w:id="22" w:name="_Toc242175039"/>
       <w:r>
         <w:t>2.3.4. Khởi tạo CSDL</w:t>
       </w:r>
@@ -19514,7 +19625,7 @@
       <w:pPr>
         <w:pStyle w:val="Heading3"/>
       </w:pPr>
-      <w:bookmarkStart w:id="23" w:name="_Toc242133611"/>
+      <w:bookmarkStart w:id="23" w:name="_Toc242175040"/>
       <w:r>
         <w:lastRenderedPageBreak/>
         <w:t>2.3.5. Cho máy khác kết nối tới (không bắt buộc)</w:t>
@@ -19607,7 +19718,7 @@
       <w:pPr>
         <w:pStyle w:val="Heading2"/>
       </w:pPr>
-      <w:bookmarkStart w:id="24" w:name="_Toc242133612"/>
+      <w:bookmarkStart w:id="24" w:name="_Toc242175041"/>
       <w:r>
         <w:t>2.4. Nạp lại dữ liệu mẫu trước buổi demo</w:t>
       </w:r>
@@ -19719,7 +19830,7 @@
         <w:pStyle w:val="Heading1"/>
         <w:pageBreakBefore/>
       </w:pPr>
-      <w:bookmarkStart w:id="25" w:name="_Toc242133613"/>
+      <w:bookmarkStart w:id="25" w:name="_Toc242175042"/>
       <w:r>
         <w:lastRenderedPageBreak/>
         <w:t>CHƯƠNG 3. CÀI ĐẶT ỨNG DỤNG</w:t>
@@ -19730,7 +19841,7 @@
       <w:pPr>
         <w:pStyle w:val="Heading2"/>
       </w:pPr>
-      <w:bookmarkStart w:id="26" w:name="_Toc242133614"/>
+      <w:bookmarkStart w:id="26" w:name="_Toc242175043"/>
       <w:r>
         <w:t>3.1. Tải bộ cài</w:t>
       </w:r>
@@ -19768,7 +19879,7 @@
       <w:pPr>
         <w:pStyle w:val="TableCaption"/>
       </w:pPr>
-      <w:bookmarkStart w:id="27" w:name="_Toc242133694"/>
+      <w:bookmarkStart w:id="27" w:name="_Toc242175123"/>
       <w:r>
         <w:t>Bảng 3.1. Các file cài đặt</w:t>
       </w:r>
@@ -20211,7 +20322,7 @@
       <w:pPr>
         <w:pStyle w:val="Heading2"/>
       </w:pPr>
-      <w:bookmarkStart w:id="28" w:name="_Toc242133615"/>
+      <w:bookmarkStart w:id="28" w:name="_Toc242175044"/>
       <w:r>
         <w:t>3.2. Cài đặt trên macOS</w:t>
       </w:r>
@@ -20612,7 +20723,7 @@
       <w:pPr>
         <w:pStyle w:val="Heading2"/>
       </w:pPr>
-      <w:bookmarkStart w:id="29" w:name="_Toc242133616"/>
+      <w:bookmarkStart w:id="29" w:name="_Toc242175045"/>
       <w:r>
         <w:t>3.3. Cài đặt trên Windows</w:t>
       </w:r>
@@ -20622,7 +20733,7 @@
       <w:pPr>
         <w:pStyle w:val="Heading3"/>
       </w:pPr>
-      <w:bookmarkStart w:id="30" w:name="_Toc242133617"/>
+      <w:bookmarkStart w:id="30" w:name="_Toc242175046"/>
       <w:r>
         <w:t>3.3.1. Dùng bộ cài setup.exe</w:t>
       </w:r>
@@ -21068,7 +21179,7 @@
         </w:rPr>
         <w:lastRenderedPageBreak/>
         <w:drawing>
-          <wp:inline distT="0" distB="0" distL="0" distR="0" wp14:anchorId="07B29011" wp14:editId="684D9C50">
+          <wp:inline distT="0" distB="0" distL="0" distR="0" wp14:anchorId="28FC8A46" wp14:editId="7B517512">
             <wp:extent cx="3420000" cy="3198254"/>
             <wp:effectExtent l="0" t="0" r="0" b="0"/>
             <wp:docPr id="522444761" name="Picture 522444761"/>
@@ -21108,7 +21219,7 @@
       <w:pPr>
         <w:pStyle w:val="FigureCaption"/>
       </w:pPr>
-      <w:bookmarkStart w:id="31" w:name="_Toc242133665"/>
+      <w:bookmarkStart w:id="31" w:name="_Toc242175094"/>
       <w:r>
         <w:t>Hình 3.1. Cảnh báo SmartScreen khi chạy bộ cài</w:t>
       </w:r>
@@ -21125,7 +21236,7 @@
           <w:noProof/>
         </w:rPr>
         <w:drawing>
-          <wp:inline distT="0" distB="0" distL="0" distR="0" wp14:anchorId="0472957D" wp14:editId="3ADD8985">
+          <wp:inline distT="0" distB="0" distL="0" distR="0" wp14:anchorId="7F0524FA" wp14:editId="03688B2D">
             <wp:extent cx="4500000" cy="3458417"/>
             <wp:effectExtent l="0" t="0" r="0" b="0"/>
             <wp:docPr id="522444762" name="Picture 522444762"/>
@@ -21165,7 +21276,7 @@
       <w:pPr>
         <w:pStyle w:val="FigureCaption"/>
       </w:pPr>
-      <w:bookmarkStart w:id="32" w:name="_Toc242133666"/>
+      <w:bookmarkStart w:id="32" w:name="_Toc242175095"/>
       <w:r>
         <w:t>Hình 3.2. Bước cuối của bộ cài QLTTTA trên Windows</w:t>
       </w:r>
@@ -21175,7 +21286,7 @@
       <w:pPr>
         <w:pStyle w:val="Heading3"/>
       </w:pPr>
-      <w:bookmarkStart w:id="33" w:name="_Toc242133618"/>
+      <w:bookmarkStart w:id="33" w:name="_Toc242175047"/>
       <w:r>
         <w:t>3.3.2. Dùng bản portable</w:t>
       </w:r>
@@ -21222,7 +21333,7 @@
       <w:pPr>
         <w:pStyle w:val="Heading3"/>
       </w:pPr>
-      <w:bookmarkStart w:id="34" w:name="_Toc242133619"/>
+      <w:bookmarkStart w:id="34" w:name="_Toc242175048"/>
       <w:r>
         <w:lastRenderedPageBreak/>
         <w:t>3.3.3. Driver kết nối</w:t>
@@ -21279,7 +21390,7 @@
       <w:pPr>
         <w:pStyle w:val="Heading2"/>
       </w:pPr>
-      <w:bookmarkStart w:id="35" w:name="_Toc242133620"/>
+      <w:bookmarkStart w:id="35" w:name="_Toc242175049"/>
       <w:r>
         <w:t>3.4. Nơi lưu cấu hình và gỡ cài đặt</w:t>
       </w:r>
@@ -21299,7 +21410,7 @@
       <w:pPr>
         <w:pStyle w:val="TableCaption"/>
       </w:pPr>
-      <w:bookmarkStart w:id="36" w:name="_Toc242133695"/>
+      <w:bookmarkStart w:id="36" w:name="_Toc242175124"/>
       <w:r>
         <w:t>Bảng 3.2. Cấu hình đã lưu và cách gỡ ứng dụng</w:t>
       </w:r>
@@ -21868,7 +21979,7 @@
       <w:pPr>
         <w:pStyle w:val="Heading2"/>
       </w:pPr>
-      <w:bookmarkStart w:id="37" w:name="_Toc242133621"/>
+      <w:bookmarkStart w:id="37" w:name="_Toc242175050"/>
       <w:r>
         <w:t>3.5. Chạy từ mã nguồn (dành cho nhóm phát triển)</w:t>
       </w:r>
@@ -22401,7 +22512,7 @@
         <w:pStyle w:val="Heading1"/>
         <w:pageBreakBefore/>
       </w:pPr>
-      <w:bookmarkStart w:id="38" w:name="_Toc242133622"/>
+      <w:bookmarkStart w:id="38" w:name="_Toc242175051"/>
       <w:r>
         <w:lastRenderedPageBreak/>
         <w:t>CHƯƠNG 4. ĐĂNG NHẬP VÀ GIAO DIỆN CHUNG</w:t>
@@ -22412,7 +22523,7 @@
       <w:pPr>
         <w:pStyle w:val="Heading2"/>
       </w:pPr>
-      <w:bookmarkStart w:id="39" w:name="_Toc242133623"/>
+      <w:bookmarkStart w:id="39" w:name="_Toc242175052"/>
       <w:r>
         <w:t>4.1. Mở ứng dụng</w:t>
       </w:r>
@@ -22569,7 +22680,7 @@
           <w:noProof/>
         </w:rPr>
         <w:drawing>
-          <wp:inline distT="0" distB="0" distL="0" distR="0" wp14:anchorId="5FF17421" wp14:editId="4D00F466">
+          <wp:inline distT="0" distB="0" distL="0" distR="0" wp14:anchorId="5CAFF6AB" wp14:editId="6596D63C">
             <wp:extent cx="4860000" cy="2938605"/>
             <wp:effectExtent l="0" t="0" r="0" b="0"/>
             <wp:docPr id="522444763" name="Picture 522444763"/>
@@ -22609,7 +22720,7 @@
       <w:pPr>
         <w:pStyle w:val="FigureCaption"/>
       </w:pPr>
-      <w:bookmarkStart w:id="40" w:name="_Toc242133667"/>
+      <w:bookmarkStart w:id="40" w:name="_Toc242175096"/>
       <w:r>
         <w:t>Hình 4.1. Màn hình đăng nhập</w:t>
       </w:r>
@@ -22619,7 +22730,7 @@
       <w:pPr>
         <w:pStyle w:val="Heading2"/>
       </w:pPr>
-      <w:bookmarkStart w:id="41" w:name="_Toc242133624"/>
+      <w:bookmarkStart w:id="41" w:name="_Toc242175053"/>
       <w:r>
         <w:t>4.2. Cấu hình máy chủ (lần chạy đầu tiên)</w:t>
       </w:r>
@@ -22770,7 +22881,7 @@
         </w:rPr>
         <w:lastRenderedPageBreak/>
         <w:drawing>
-          <wp:inline distT="0" distB="0" distL="0" distR="0" wp14:anchorId="38ACC1CD" wp14:editId="569399A8">
+          <wp:inline distT="0" distB="0" distL="0" distR="0" wp14:anchorId="66A5AD03" wp14:editId="7CEB3789">
             <wp:extent cx="5040000" cy="3360000"/>
             <wp:effectExtent l="0" t="0" r="0" b="0"/>
             <wp:docPr id="522444764" name="Picture 522444764"/>
@@ -22810,7 +22921,7 @@
       <w:pPr>
         <w:pStyle w:val="FigureCaption"/>
       </w:pPr>
-      <w:bookmarkStart w:id="42" w:name="_Toc242133668"/>
+      <w:bookmarkStart w:id="42" w:name="_Toc242175097"/>
       <w:r>
         <w:t>Hình 4.2. Khung cấu hình máy chủ SQL Server</w:t>
       </w:r>
@@ -22820,7 +22931,7 @@
       <w:pPr>
         <w:pStyle w:val="TableCaption"/>
       </w:pPr>
-      <w:bookmarkStart w:id="43" w:name="_Toc242133696"/>
+      <w:bookmarkStart w:id="43" w:name="_Toc242175125"/>
       <w:r>
         <w:t>Bảng 4.1. Giá trị ô Máy chủ theo cách cài SQL Server</w:t>
       </w:r>
@@ -23260,7 +23371,7 @@
       <w:pPr>
         <w:pStyle w:val="Heading2"/>
       </w:pPr>
-      <w:bookmarkStart w:id="44" w:name="_Toc242133625"/>
+      <w:bookmarkStart w:id="44" w:name="_Toc242175054"/>
       <w:r>
         <w:t>4.3. Đăng nhập</w:t>
       </w:r>
@@ -23334,7 +23445,7 @@
       <w:pPr>
         <w:pStyle w:val="TableCaption"/>
       </w:pPr>
-      <w:bookmarkStart w:id="45" w:name="_Toc242133697"/>
+      <w:bookmarkStart w:id="45" w:name="_Toc242175126"/>
       <w:r>
         <w:t>Bảng 4.2. Tài khoản demo trong dữ liệu mẫu</w:t>
       </w:r>
@@ -24660,7 +24771,7 @@
       <w:pPr>
         <w:pStyle w:val="TableCaption"/>
       </w:pPr>
-      <w:bookmarkStart w:id="46" w:name="_Toc242133698"/>
+      <w:bookmarkStart w:id="46" w:name="_Toc242175127"/>
       <w:r>
         <w:t>Bảng 4.3. Thông báo lỗi khi đăng nhập</w:t>
       </w:r>
@@ -25084,7 +25195,7 @@
       <w:pPr>
         <w:pStyle w:val="Heading2"/>
       </w:pPr>
-      <w:bookmarkStart w:id="47" w:name="_Toc242133626"/>
+      <w:bookmarkStart w:id="47" w:name="_Toc242175055"/>
       <w:r>
         <w:t>4.4. Màn hình chính</w:t>
       </w:r>
@@ -25244,7 +25355,7 @@
           <w:noProof/>
         </w:rPr>
         <w:drawing>
-          <wp:inline distT="0" distB="0" distL="0" distR="0" wp14:anchorId="777AA71B" wp14:editId="3769B849">
+          <wp:inline distT="0" distB="0" distL="0" distR="0" wp14:anchorId="66BE6EBD" wp14:editId="32AB3F1F">
             <wp:extent cx="5580000" cy="3332500"/>
             <wp:effectExtent l="0" t="0" r="0" b="0"/>
             <wp:docPr id="522444765" name="Picture 522444765"/>
@@ -25284,7 +25395,7 @@
       <w:pPr>
         <w:pStyle w:val="FigureCaption"/>
       </w:pPr>
-      <w:bookmarkStart w:id="48" w:name="_Toc242133669"/>
+      <w:bookmarkStart w:id="48" w:name="_Toc242175098"/>
       <w:r>
         <w:t>Hình 4.3. Màn hình chính của vai trò Quản lý (trang Tổng quan)</w:t>
       </w:r>
@@ -25294,7 +25405,7 @@
       <w:pPr>
         <w:pStyle w:val="Heading2"/>
       </w:pPr>
-      <w:bookmarkStart w:id="49" w:name="_Toc242133627"/>
+      <w:bookmarkStart w:id="49" w:name="_Toc242175056"/>
       <w:r>
         <w:t>4.5. Đổi ngôn ngữ giao diện</w:t>
       </w:r>
@@ -25332,7 +25443,7 @@
       <w:pPr>
         <w:pStyle w:val="Heading2"/>
       </w:pPr>
-      <w:bookmarkStart w:id="50" w:name="_Toc242133628"/>
+      <w:bookmarkStart w:id="50" w:name="_Toc242175057"/>
       <w:r>
         <w:t>4.6. Đổi mật khẩu</w:t>
       </w:r>
@@ -25448,7 +25559,7 @@
           <w:noProof/>
         </w:rPr>
         <w:drawing>
-          <wp:inline distT="0" distB="0" distL="0" distR="0" wp14:anchorId="6DCF9D90" wp14:editId="50DC7D5F">
+          <wp:inline distT="0" distB="0" distL="0" distR="0" wp14:anchorId="6EA168C4" wp14:editId="413D259B">
             <wp:extent cx="3420000" cy="1368000"/>
             <wp:effectExtent l="0" t="0" r="0" b="0"/>
             <wp:docPr id="522444766" name="Picture 522444766"/>
@@ -25488,7 +25599,7 @@
       <w:pPr>
         <w:pStyle w:val="FigureCaption"/>
       </w:pPr>
-      <w:bookmarkStart w:id="51" w:name="_Toc242133670"/>
+      <w:bookmarkStart w:id="51" w:name="_Toc242175099"/>
       <w:r>
         <w:t>Hình 4.4. Hộp thoại đổi mật khẩu</w:t>
       </w:r>
@@ -25530,7 +25641,7 @@
       <w:pPr>
         <w:pStyle w:val="Heading2"/>
       </w:pPr>
-      <w:bookmarkStart w:id="52" w:name="_Toc242133629"/>
+      <w:bookmarkStart w:id="52" w:name="_Toc242175058"/>
       <w:r>
         <w:t>4.7. Đăng xuất và thoát</w:t>
       </w:r>
@@ -25577,7 +25688,7 @@
       <w:pPr>
         <w:pStyle w:val="Heading2"/>
       </w:pPr>
-      <w:bookmarkStart w:id="53" w:name="_Toc242133630"/>
+      <w:bookmarkStart w:id="53" w:name="_Toc242175059"/>
       <w:r>
         <w:t>4.8. Thao tác chung trên các màn hình danh sách</w:t>
       </w:r>
@@ -25604,7 +25715,7 @@
           <w:noProof/>
         </w:rPr>
         <w:drawing>
-          <wp:inline distT="0" distB="0" distL="0" distR="0" wp14:anchorId="35C27A42" wp14:editId="00D8FA2A">
+          <wp:inline distT="0" distB="0" distL="0" distR="0" wp14:anchorId="61D895A1" wp14:editId="4CF13806">
             <wp:extent cx="5580000" cy="3332500"/>
             <wp:effectExtent l="0" t="0" r="0" b="0"/>
             <wp:docPr id="522444767" name="Picture 522444767"/>
@@ -25644,7 +25755,7 @@
       <w:pPr>
         <w:pStyle w:val="FigureCaption"/>
       </w:pPr>
-      <w:bookmarkStart w:id="54" w:name="_Toc242133671"/>
+      <w:bookmarkStart w:id="54" w:name="_Toc242175100"/>
       <w:r>
         <w:t>Hình 4.5. Một màn hình danh sách: Công nợ học phí</w:t>
       </w:r>
@@ -25654,7 +25765,7 @@
       <w:pPr>
         <w:pStyle w:val="TableCaption"/>
       </w:pPr>
-      <w:bookmarkStart w:id="55" w:name="_Toc242133699"/>
+      <w:bookmarkStart w:id="55" w:name="_Toc242175128"/>
       <w:r>
         <w:t>Bảng 4.4. Các thành phần của màn hình danh sách</w:t>
       </w:r>
@@ -26509,7 +26620,7 @@
       <w:pPr>
         <w:pStyle w:val="Heading2"/>
       </w:pPr>
-      <w:bookmarkStart w:id="56" w:name="_Toc242133631"/>
+      <w:bookmarkStart w:id="56" w:name="_Toc242175060"/>
       <w:r>
         <w:t>4.9. Form nhập liệu và hộp xác nhận</w:t>
       </w:r>
@@ -26672,7 +26783,7 @@
         <w:pStyle w:val="Heading1"/>
         <w:pageBreakBefore/>
       </w:pPr>
-      <w:bookmarkStart w:id="57" w:name="_Toc242133632"/>
+      <w:bookmarkStart w:id="57" w:name="_Toc242175061"/>
       <w:r>
         <w:lastRenderedPageBreak/>
         <w:t>CHƯƠNG 5. HƯỚNG DẪN THEO CHỨC NĂNG</w:t>
@@ -26693,7 +26804,7 @@
       <w:pPr>
         <w:pStyle w:val="Heading2"/>
       </w:pPr>
-      <w:bookmarkStart w:id="58" w:name="_Toc242133633"/>
+      <w:bookmarkStart w:id="58" w:name="_Toc242175062"/>
       <w:r>
         <w:t>5.1. Tổng quan</w:t>
       </w:r>
@@ -26737,7 +26848,7 @@
       <w:pPr>
         <w:pStyle w:val="TableCaption"/>
       </w:pPr>
-      <w:bookmarkStart w:id="59" w:name="_Toc242133700"/>
+      <w:bookmarkStart w:id="59" w:name="_Toc242175129"/>
       <w:r>
         <w:t>Bảng 5.1. Các thẻ số liệu trên trang Tổng quan</w:t>
       </w:r>
@@ -27219,7 +27330,7 @@
           <w:noProof/>
         </w:rPr>
         <w:drawing>
-          <wp:inline distT="0" distB="0" distL="0" distR="0" wp14:anchorId="1F01DBFA" wp14:editId="2560BA93">
+          <wp:inline distT="0" distB="0" distL="0" distR="0" wp14:anchorId="5CFF25A7" wp14:editId="435471F3">
             <wp:extent cx="5580000" cy="3332500"/>
             <wp:effectExtent l="0" t="0" r="0" b="0"/>
             <wp:docPr id="522444768" name="Picture 522444768"/>
@@ -27259,7 +27370,7 @@
       <w:pPr>
         <w:pStyle w:val="FigureCaption"/>
       </w:pPr>
-      <w:bookmarkStart w:id="60" w:name="_Toc242133672"/>
+      <w:bookmarkStart w:id="60" w:name="_Toc242175101"/>
       <w:r>
         <w:t>Hình 5.1. Trang Tổng quan của Giáo vụ: không có quyền xem doanh thu</w:t>
       </w:r>
@@ -27269,7 +27380,7 @@
       <w:pPr>
         <w:pStyle w:val="Heading2"/>
       </w:pPr>
-      <w:bookmarkStart w:id="61" w:name="_Toc242133634"/>
+      <w:bookmarkStart w:id="61" w:name="_Toc242175063"/>
       <w:r>
         <w:lastRenderedPageBreak/>
         <w:t>5.2. Học viên</w:t>
@@ -27303,7 +27414,7 @@
           <w:noProof/>
         </w:rPr>
         <w:drawing>
-          <wp:inline distT="0" distB="0" distL="0" distR="0" wp14:anchorId="0AE25396" wp14:editId="27AD69D6">
+          <wp:inline distT="0" distB="0" distL="0" distR="0" wp14:anchorId="19A461E7" wp14:editId="524CA09A">
             <wp:extent cx="5580000" cy="3332500"/>
             <wp:effectExtent l="0" t="0" r="0" b="0"/>
             <wp:docPr id="522444769" name="Picture 522444769"/>
@@ -27343,7 +27454,7 @@
       <w:pPr>
         <w:pStyle w:val="FigureCaption"/>
       </w:pPr>
-      <w:bookmarkStart w:id="62" w:name="_Toc242133673"/>
+      <w:bookmarkStart w:id="62" w:name="_Toc242175102"/>
       <w:r>
         <w:t>Hình 5.2. Danh sách học viên</w:t>
       </w:r>
@@ -27353,7 +27464,7 @@
       <w:pPr>
         <w:pStyle w:val="Heading3"/>
       </w:pPr>
-      <w:bookmarkStart w:id="63" w:name="_Toc242133635"/>
+      <w:bookmarkStart w:id="63" w:name="_Toc242175064"/>
       <w:r>
         <w:t>5.2.1. Tìm kiếm</w:t>
       </w:r>
@@ -27450,7 +27561,7 @@
       <w:pPr>
         <w:pStyle w:val="Heading3"/>
       </w:pPr>
-      <w:bookmarkStart w:id="64" w:name="_Toc242133636"/>
+      <w:bookmarkStart w:id="64" w:name="_Toc242175065"/>
       <w:r>
         <w:t>5.2.2. Thêm học viên</w:t>
       </w:r>
@@ -27655,7 +27766,7 @@
       <w:pPr>
         <w:pStyle w:val="Heading3"/>
       </w:pPr>
-      <w:bookmarkStart w:id="65" w:name="_Toc242133637"/>
+      <w:bookmarkStart w:id="65" w:name="_Toc242175066"/>
       <w:r>
         <w:t>5.2.3. Sửa thông tin</w:t>
       </w:r>
@@ -27776,7 +27887,7 @@
           <w:noProof/>
         </w:rPr>
         <w:drawing>
-          <wp:inline distT="0" distB="0" distL="0" distR="0" wp14:anchorId="42C20BC0" wp14:editId="29498E25">
+          <wp:inline distT="0" distB="0" distL="0" distR="0" wp14:anchorId="60BA0AEF" wp14:editId="5C426E9B">
             <wp:extent cx="3780000" cy="5048129"/>
             <wp:effectExtent l="0" t="0" r="0" b="0"/>
             <wp:docPr id="522444770" name="Picture 522444770"/>
@@ -27816,7 +27927,7 @@
       <w:pPr>
         <w:pStyle w:val="FigureCaption"/>
       </w:pPr>
-      <w:bookmarkStart w:id="66" w:name="_Toc242133674"/>
+      <w:bookmarkStart w:id="66" w:name="_Toc242175103"/>
       <w:r>
         <w:t>Hình 5.3. Hộp thoại sửa thông tin học viên</w:t>
       </w:r>
@@ -27836,7 +27947,7 @@
       <w:pPr>
         <w:pStyle w:val="TableCaption"/>
       </w:pPr>
-      <w:bookmarkStart w:id="67" w:name="_Toc242133701"/>
+      <w:bookmarkStart w:id="67" w:name="_Toc242175130"/>
       <w:r>
         <w:t>Bảng 5.2. Quy tắc kiểm tra thông tin học viên</w:t>
       </w:r>
@@ -28500,7 +28611,7 @@
       <w:pPr>
         <w:pStyle w:val="Heading3"/>
       </w:pPr>
-      <w:bookmarkStart w:id="68" w:name="_Toc242133638"/>
+      <w:bookmarkStart w:id="68" w:name="_Toc242175067"/>
       <w:r>
         <w:t>5.2.4. Xóa học viên</w:t>
       </w:r>
@@ -28621,7 +28732,7 @@
       <w:pPr>
         <w:pStyle w:val="Heading3"/>
       </w:pPr>
-      <w:bookmarkStart w:id="69" w:name="_Toc242133639"/>
+      <w:bookmarkStart w:id="69" w:name="_Toc242175068"/>
       <w:r>
         <w:t>5.2.5. Hồ sơ, ghi danh và kiểm tra xếp lớp từ danh sách học viên</w:t>
       </w:r>
@@ -28719,7 +28830,7 @@
       <w:pPr>
         <w:pStyle w:val="Heading3"/>
       </w:pPr>
-      <w:bookmarkStart w:id="70" w:name="_Toc242133640"/>
+      <w:bookmarkStart w:id="70" w:name="_Toc242175069"/>
       <w:r>
         <w:t>5.2.6. Xuất, nhập danh sách bằng XML</w:t>
       </w:r>
@@ -28805,7 +28916,7 @@
       <w:pPr>
         <w:pStyle w:val="Heading2"/>
       </w:pPr>
-      <w:bookmarkStart w:id="71" w:name="_Toc242133641"/>
+      <w:bookmarkStart w:id="71" w:name="_Toc242175070"/>
       <w:r>
         <w:t>5.3. Kiểm tra xếp lớp</w:t>
       </w:r>
@@ -28893,7 +29004,7 @@
         </w:rPr>
         <w:lastRenderedPageBreak/>
         <w:drawing>
-          <wp:inline distT="0" distB="0" distL="0" distR="0" wp14:anchorId="05DEE4E1" wp14:editId="52FF517F">
+          <wp:inline distT="0" distB="0" distL="0" distR="0" wp14:anchorId="7B9A0CD7" wp14:editId="5FEBA0D2">
             <wp:extent cx="5580000" cy="3332500"/>
             <wp:effectExtent l="0" t="0" r="0" b="0"/>
             <wp:docPr id="522444771" name="Picture 522444771"/>
@@ -28933,7 +29044,7 @@
       <w:pPr>
         <w:pStyle w:val="FigureCaption"/>
       </w:pPr>
-      <w:bookmarkStart w:id="72" w:name="_Toc242133675"/>
+      <w:bookmarkStart w:id="72" w:name="_Toc242175104"/>
       <w:r>
         <w:t>Hình 5.4. Danh sách bài kiểm tra xếp lớp</w:t>
       </w:r>
@@ -29198,7 +29309,7 @@
       <w:pPr>
         <w:pStyle w:val="Heading2"/>
       </w:pPr>
-      <w:bookmarkStart w:id="73" w:name="_Toc242133642"/>
+      <w:bookmarkStart w:id="73" w:name="_Toc242175071"/>
       <w:r>
         <w:t>5.4. Lớp học</w:t>
       </w:r>
@@ -29250,7 +29361,7 @@
         </w:rPr>
         <w:lastRenderedPageBreak/>
         <w:drawing>
-          <wp:inline distT="0" distB="0" distL="0" distR="0" wp14:anchorId="27E65319" wp14:editId="4A0EB761">
+          <wp:inline distT="0" distB="0" distL="0" distR="0" wp14:anchorId="6D8576C5" wp14:editId="342A65A5">
             <wp:extent cx="5580000" cy="3332500"/>
             <wp:effectExtent l="0" t="0" r="0" b="0"/>
             <wp:docPr id="522444772" name="Picture 522444772"/>
@@ -29290,7 +29401,7 @@
       <w:pPr>
         <w:pStyle w:val="FigureCaption"/>
       </w:pPr>
-      <w:bookmarkStart w:id="74" w:name="_Toc242133676"/>
+      <w:bookmarkStart w:id="74" w:name="_Toc242175105"/>
       <w:r>
         <w:t>Hình 5.5. Màn hình Lớp học và các nút quản lý vòng đời lớp</w:t>
       </w:r>
@@ -29770,7 +29881,7 @@
       <w:pPr>
         <w:pStyle w:val="TableCaption"/>
       </w:pPr>
-      <w:bookmarkStart w:id="75" w:name="_Toc242133702"/>
+      <w:bookmarkStart w:id="75" w:name="_Toc242175131"/>
       <w:r>
         <w:t>Bảng 5.3. Quy tắc CSDL kiểm tra khi quản lý lớp học</w:t>
       </w:r>
@@ -30301,7 +30412,7 @@
       <w:pPr>
         <w:pStyle w:val="Heading2"/>
       </w:pPr>
-      <w:bookmarkStart w:id="76" w:name="_Toc242133643"/>
+      <w:bookmarkStart w:id="76" w:name="_Toc242175072"/>
       <w:r>
         <w:t>5.5. Ghi danh</w:t>
       </w:r>
@@ -30362,7 +30473,7 @@
         </w:rPr>
         <w:lastRenderedPageBreak/>
         <w:drawing>
-          <wp:inline distT="0" distB="0" distL="0" distR="0" wp14:anchorId="319DE127" wp14:editId="10D351A3">
+          <wp:inline distT="0" distB="0" distL="0" distR="0" wp14:anchorId="598A2B01" wp14:editId="24A0AAD1">
             <wp:extent cx="5580000" cy="3332500"/>
             <wp:effectExtent l="0" t="0" r="0" b="0"/>
             <wp:docPr id="522444773" name="Picture 522444773"/>
@@ -30402,7 +30513,7 @@
       <w:pPr>
         <w:pStyle w:val="FigureCaption"/>
       </w:pPr>
-      <w:bookmarkStart w:id="77" w:name="_Toc242133677"/>
+      <w:bookmarkStart w:id="77" w:name="_Toc242175106"/>
       <w:r>
         <w:t>Hình 5.6. Danh sách ghi danh</w:t>
       </w:r>
@@ -30674,7 +30785,7 @@
       <w:pPr>
         <w:pStyle w:val="TableCaption"/>
       </w:pPr>
-      <w:bookmarkStart w:id="78" w:name="_Toc242133703"/>
+      <w:bookmarkStart w:id="78" w:name="_Toc242175132"/>
       <w:r>
         <w:t>Bảng 5.4. Quy tắc CSDL kiểm tra khi ghi danh và chuyển lớp</w:t>
       </w:r>
@@ -31064,7 +31175,7 @@
       <w:pPr>
         <w:pStyle w:val="Heading2"/>
       </w:pPr>
-      <w:bookmarkStart w:id="79" w:name="_Toc242133644"/>
+      <w:bookmarkStart w:id="79" w:name="_Toc242175073"/>
       <w:r>
         <w:t>5.6. Lịch học - điểm danh</w:t>
       </w:r>
@@ -31151,7 +31262,7 @@
           <w:noProof/>
         </w:rPr>
         <w:drawing>
-          <wp:inline distT="0" distB="0" distL="0" distR="0" wp14:anchorId="15EFA419" wp14:editId="25770A4E">
+          <wp:inline distT="0" distB="0" distL="0" distR="0" wp14:anchorId="42C5EB84" wp14:editId="3DE90DC1">
             <wp:extent cx="5580000" cy="3332500"/>
             <wp:effectExtent l="0" t="0" r="0" b="0"/>
             <wp:docPr id="522444774" name="Picture 522444774"/>
@@ -31191,7 +31302,7 @@
       <w:pPr>
         <w:pStyle w:val="FigureCaption"/>
       </w:pPr>
-      <w:bookmarkStart w:id="80" w:name="_Toc242133678"/>
+      <w:bookmarkStart w:id="80" w:name="_Toc242175107"/>
       <w:r>
         <w:t>Hình 5.7. Lịch học - điểm danh của một tuần</w:t>
       </w:r>
@@ -31431,7 +31542,7 @@
       <w:pPr>
         <w:pStyle w:val="Heading2"/>
       </w:pPr>
-      <w:bookmarkStart w:id="81" w:name="_Toc242133645"/>
+      <w:bookmarkStart w:id="81" w:name="_Toc242175074"/>
       <w:r>
         <w:lastRenderedPageBreak/>
         <w:t>5.7. Sổ điểm</w:t>
@@ -31474,7 +31585,7 @@
           <w:noProof/>
         </w:rPr>
         <w:drawing>
-          <wp:inline distT="0" distB="0" distL="0" distR="0" wp14:anchorId="62D32727" wp14:editId="5991F4AF">
+          <wp:inline distT="0" distB="0" distL="0" distR="0" wp14:anchorId="30C1870C" wp14:editId="0B669A59">
             <wp:extent cx="5580000" cy="3332500"/>
             <wp:effectExtent l="0" t="0" r="0" b="0"/>
             <wp:docPr id="522444775" name="Picture 522444775"/>
@@ -31514,7 +31625,7 @@
       <w:pPr>
         <w:pStyle w:val="FigureCaption"/>
       </w:pPr>
-      <w:bookmarkStart w:id="82" w:name="_Toc242133679"/>
+      <w:bookmarkStart w:id="82" w:name="_Toc242175108"/>
       <w:r>
         <w:t>Hình 5.8. Sổ điểm của một lớp</w:t>
       </w:r>
@@ -31642,7 +31753,7 @@
       <w:pPr>
         <w:pStyle w:val="Heading2"/>
       </w:pPr>
-      <w:bookmarkStart w:id="83" w:name="_Toc242133646"/>
+      <w:bookmarkStart w:id="83" w:name="_Toc242175075"/>
       <w:r>
         <w:t>5.8. Kết quả học tập</w:t>
       </w:r>
@@ -31706,7 +31817,7 @@
           <w:noProof/>
         </w:rPr>
         <w:drawing>
-          <wp:inline distT="0" distB="0" distL="0" distR="0" wp14:anchorId="4F64BE88" wp14:editId="66EE42E4">
+          <wp:inline distT="0" distB="0" distL="0" distR="0" wp14:anchorId="7A3C0AA4" wp14:editId="6C712C43">
             <wp:extent cx="5580000" cy="3332500"/>
             <wp:effectExtent l="0" t="0" r="0" b="0"/>
             <wp:docPr id="522444776" name="Picture 522444776"/>
@@ -31746,7 +31857,7 @@
       <w:pPr>
         <w:pStyle w:val="FigureCaption"/>
       </w:pPr>
-      <w:bookmarkStart w:id="84" w:name="_Toc242133680"/>
+      <w:bookmarkStart w:id="84" w:name="_Toc242175109"/>
       <w:r>
         <w:t>Hình 5.9. Kết quả học tập</w:t>
       </w:r>
@@ -31756,7 +31867,7 @@
       <w:pPr>
         <w:pStyle w:val="Heading2"/>
       </w:pPr>
-      <w:bookmarkStart w:id="85" w:name="_Toc242133647"/>
+      <w:bookmarkStart w:id="85" w:name="_Toc242175076"/>
       <w:r>
         <w:t>5.9. Thu học phí</w:t>
       </w:r>
@@ -31825,7 +31936,7 @@
           <w:noProof/>
         </w:rPr>
         <w:drawing>
-          <wp:inline distT="0" distB="0" distL="0" distR="0" wp14:anchorId="5D891CB6" wp14:editId="701F63EE">
+          <wp:inline distT="0" distB="0" distL="0" distR="0" wp14:anchorId="4CBBFBC1" wp14:editId="62B5E6DD">
             <wp:extent cx="5580000" cy="3332500"/>
             <wp:effectExtent l="0" t="0" r="0" b="0"/>
             <wp:docPr id="522444777" name="Picture 522444777"/>
@@ -31865,7 +31976,7 @@
       <w:pPr>
         <w:pStyle w:val="FigureCaption"/>
       </w:pPr>
-      <w:bookmarkStart w:id="86" w:name="_Toc242133681"/>
+      <w:bookmarkStart w:id="86" w:name="_Toc242175110"/>
       <w:r>
         <w:t>Hình 5.10. Danh sách phiếu thu (Kế toán)</w:t>
       </w:r>
@@ -32176,7 +32287,7 @@
       <w:pPr>
         <w:pStyle w:val="Heading2"/>
       </w:pPr>
-      <w:bookmarkStart w:id="87" w:name="_Toc242133648"/>
+      <w:bookmarkStart w:id="87" w:name="_Toc242175077"/>
       <w:r>
         <w:t>5.10. Công nợ học phí</w:t>
       </w:r>
@@ -32229,7 +32340,7 @@
       <w:pPr>
         <w:pStyle w:val="Heading2"/>
       </w:pPr>
-      <w:bookmarkStart w:id="88" w:name="_Toc242133649"/>
+      <w:bookmarkStart w:id="88" w:name="_Toc242175078"/>
       <w:r>
         <w:t>5.11. Doanh thu</w:t>
       </w:r>
@@ -32331,7 +32442,7 @@
         </w:rPr>
         <w:lastRenderedPageBreak/>
         <w:drawing>
-          <wp:inline distT="0" distB="0" distL="0" distR="0" wp14:anchorId="7F499E4A" wp14:editId="464A6E66">
+          <wp:inline distT="0" distB="0" distL="0" distR="0" wp14:anchorId="77669E9F" wp14:editId="36E04102">
             <wp:extent cx="5580000" cy="3332500"/>
             <wp:effectExtent l="0" t="0" r="0" b="0"/>
             <wp:docPr id="522444778" name="Picture 522444778"/>
@@ -32371,7 +32482,7 @@
       <w:pPr>
         <w:pStyle w:val="FigureCaption"/>
       </w:pPr>
-      <w:bookmarkStart w:id="89" w:name="_Toc242133682"/>
+      <w:bookmarkStart w:id="89" w:name="_Toc242175111"/>
       <w:r>
         <w:t>Hình 5.11. Doanh thu theo tháng và chi nhánh (Kế toán)</w:t>
       </w:r>
@@ -32381,7 +32492,7 @@
       <w:pPr>
         <w:pStyle w:val="Heading2"/>
       </w:pPr>
-      <w:bookmarkStart w:id="90" w:name="_Toc242133650"/>
+      <w:bookmarkStart w:id="90" w:name="_Toc242175079"/>
       <w:r>
         <w:t>5.12. Lương giáo viên</w:t>
       </w:r>
@@ -32432,7 +32543,7 @@
           <w:noProof/>
         </w:rPr>
         <w:drawing>
-          <wp:inline distT="0" distB="0" distL="0" distR="0" wp14:anchorId="307A2017" wp14:editId="582DCE72">
+          <wp:inline distT="0" distB="0" distL="0" distR="0" wp14:anchorId="542ABE52" wp14:editId="06D42C67">
             <wp:extent cx="5580000" cy="3332500"/>
             <wp:effectExtent l="0" t="0" r="0" b="0"/>
             <wp:docPr id="522444779" name="Picture 522444779"/>
@@ -32472,7 +32583,7 @@
       <w:pPr>
         <w:pStyle w:val="FigureCaption"/>
       </w:pPr>
-      <w:bookmarkStart w:id="91" w:name="_Toc242133683"/>
+      <w:bookmarkStart w:id="91" w:name="_Toc242175112"/>
       <w:r>
         <w:t>Hình 5.12. Bảng lương giáo viên (Kế toán)</w:t>
       </w:r>
@@ -32579,7 +32690,7 @@
       <w:pPr>
         <w:pStyle w:val="Heading2"/>
       </w:pPr>
-      <w:bookmarkStart w:id="92" w:name="_Toc242133651"/>
+      <w:bookmarkStart w:id="92" w:name="_Toc242175080"/>
       <w:r>
         <w:t>5.13. Danh mục</w:t>
       </w:r>
@@ -32632,7 +32743,7 @@
       <w:pPr>
         <w:pStyle w:val="Heading3"/>
       </w:pPr>
-      <w:bookmarkStart w:id="93" w:name="_Toc242133652"/>
+      <w:bookmarkStart w:id="93" w:name="_Toc242175081"/>
       <w:r>
         <w:t>5.13.1. Khóa học</w:t>
       </w:r>
@@ -32668,7 +32779,7 @@
           <w:noProof/>
         </w:rPr>
         <w:drawing>
-          <wp:inline distT="0" distB="0" distL="0" distR="0" wp14:anchorId="7055DF2D" wp14:editId="295FB38A">
+          <wp:inline distT="0" distB="0" distL="0" distR="0" wp14:anchorId="14B83261" wp14:editId="7971673C">
             <wp:extent cx="5580000" cy="3332500"/>
             <wp:effectExtent l="0" t="0" r="0" b="0"/>
             <wp:docPr id="522444780" name="Picture 522444780"/>
@@ -32708,7 +32819,7 @@
       <w:pPr>
         <w:pStyle w:val="FigureCaption"/>
       </w:pPr>
-      <w:bookmarkStart w:id="94" w:name="_Toc242133684"/>
+      <w:bookmarkStart w:id="94" w:name="_Toc242175113"/>
       <w:r>
         <w:t>Hình 5.13. Danh mục khóa học và cột điểm của khóa đang chọn</w:t>
       </w:r>
@@ -32912,7 +33023,7 @@
       <w:pPr>
         <w:pStyle w:val="Heading3"/>
       </w:pPr>
-      <w:bookmarkStart w:id="95" w:name="_Toc242133653"/>
+      <w:bookmarkStart w:id="95" w:name="_Toc242175082"/>
       <w:r>
         <w:t>5.13.2. Giáo viên, Nhân viên</w:t>
       </w:r>
@@ -33039,7 +33150,7 @@
       <w:pPr>
         <w:pStyle w:val="Heading3"/>
       </w:pPr>
-      <w:bookmarkStart w:id="96" w:name="_Toc242133654"/>
+      <w:bookmarkStart w:id="96" w:name="_Toc242175083"/>
       <w:r>
         <w:t>5.13.3. Chi nhánh - phòng học, Khuyến mãi</w:t>
       </w:r>
@@ -33237,7 +33348,7 @@
         </w:rPr>
         <w:lastRenderedPageBreak/>
         <w:drawing>
-          <wp:inline distT="0" distB="0" distL="0" distR="0" wp14:anchorId="57778814" wp14:editId="1FAC4407">
+          <wp:inline distT="0" distB="0" distL="0" distR="0" wp14:anchorId="0E926B40" wp14:editId="222932DE">
             <wp:extent cx="5580000" cy="3332500"/>
             <wp:effectExtent l="0" t="0" r="0" b="0"/>
             <wp:docPr id="522444781" name="Picture 522444781"/>
@@ -33277,7 +33388,7 @@
       <w:pPr>
         <w:pStyle w:val="FigureCaption"/>
       </w:pPr>
-      <w:bookmarkStart w:id="97" w:name="_Toc242133685"/>
+      <w:bookmarkStart w:id="97" w:name="_Toc242175114"/>
       <w:r>
         <w:t>Hình 5.14. Chi nhánh và phòng học của chi nhánh đang chọn</w:t>
       </w:r>
@@ -33287,7 +33398,7 @@
       <w:pPr>
         <w:pStyle w:val="Heading2"/>
       </w:pPr>
-      <w:bookmarkStart w:id="98" w:name="_Toc242133655"/>
+      <w:bookmarkStart w:id="98" w:name="_Toc242175084"/>
       <w:r>
         <w:t>5.14. Tài khoản</w:t>
       </w:r>
@@ -33338,7 +33449,7 @@
           <w:noProof/>
         </w:rPr>
         <w:drawing>
-          <wp:inline distT="0" distB="0" distL="0" distR="0" wp14:anchorId="2EBA9570" wp14:editId="4703BBCF">
+          <wp:inline distT="0" distB="0" distL="0" distR="0" wp14:anchorId="21914677" wp14:editId="5D491893">
             <wp:extent cx="5580000" cy="3332500"/>
             <wp:effectExtent l="0" t="0" r="0" b="0"/>
             <wp:docPr id="522444782" name="Picture 522444782"/>
@@ -33378,7 +33489,7 @@
       <w:pPr>
         <w:pStyle w:val="FigureCaption"/>
       </w:pPr>
-      <w:bookmarkStart w:id="99" w:name="_Toc242133686"/>
+      <w:bookmarkStart w:id="99" w:name="_Toc242175115"/>
       <w:r>
         <w:t>Hình 5.15. Danh sách tài khoản (Quản lý)</w:t>
       </w:r>
@@ -33538,7 +33649,7 @@
       <w:pPr>
         <w:pStyle w:val="Heading2"/>
       </w:pPr>
-      <w:bookmarkStart w:id="100" w:name="_Toc242133656"/>
+      <w:bookmarkStart w:id="100" w:name="_Toc242175085"/>
       <w:r>
         <w:t>5.15. Sao lưu</w:t>
       </w:r>
@@ -33688,7 +33799,7 @@
           <w:noProof/>
         </w:rPr>
         <w:drawing>
-          <wp:inline distT="0" distB="0" distL="0" distR="0" wp14:anchorId="7548D108" wp14:editId="05882223">
+          <wp:inline distT="0" distB="0" distL="0" distR="0" wp14:anchorId="584094F8" wp14:editId="409FD891">
             <wp:extent cx="5580000" cy="3332500"/>
             <wp:effectExtent l="0" t="0" r="0" b="0"/>
             <wp:docPr id="522444783" name="Picture 522444783"/>
@@ -33728,7 +33839,7 @@
       <w:pPr>
         <w:pStyle w:val="FigureCaption"/>
       </w:pPr>
-      <w:bookmarkStart w:id="101" w:name="_Toc242133687"/>
+      <w:bookmarkStart w:id="101" w:name="_Toc242175116"/>
       <w:r>
         <w:t>Hình 5.16. Màn hình sao lưu cơ sở dữ liệu</w:t>
       </w:r>
@@ -33757,7 +33868,7 @@
       <w:pPr>
         <w:pStyle w:val="Heading2"/>
       </w:pPr>
-      <w:bookmarkStart w:id="102" w:name="_Toc242133657"/>
+      <w:bookmarkStart w:id="102" w:name="_Toc242175086"/>
       <w:r>
         <w:lastRenderedPageBreak/>
         <w:t>5.16. Chức năng dành cho giáo viên</w:t>
@@ -33907,7 +34018,7 @@
           <w:noProof/>
         </w:rPr>
         <w:drawing>
-          <wp:inline distT="0" distB="0" distL="0" distR="0" wp14:anchorId="52924080" wp14:editId="4FC159A6">
+          <wp:inline distT="0" distB="0" distL="0" distR="0" wp14:anchorId="4F4410C9" wp14:editId="0144CE42">
             <wp:extent cx="5580000" cy="3332500"/>
             <wp:effectExtent l="0" t="0" r="0" b="0"/>
             <wp:docPr id="522444784" name="Picture 522444784"/>
@@ -33947,7 +34058,7 @@
       <w:pPr>
         <w:pStyle w:val="FigureCaption"/>
       </w:pPr>
-      <w:bookmarkStart w:id="103" w:name="_Toc242133688"/>
+      <w:bookmarkStart w:id="103" w:name="_Toc242175117"/>
       <w:r>
         <w:t>Hình 5.17. Lịch dạy của giáo viên</w:t>
       </w:r>
@@ -33965,7 +34076,7 @@
         </w:rPr>
         <w:lastRenderedPageBreak/>
         <w:drawing>
-          <wp:inline distT="0" distB="0" distL="0" distR="0" wp14:anchorId="47990567" wp14:editId="547120ED">
+          <wp:inline distT="0" distB="0" distL="0" distR="0" wp14:anchorId="47A96848" wp14:editId="491275BD">
             <wp:extent cx="5580000" cy="3332500"/>
             <wp:effectExtent l="0" t="0" r="0" b="0"/>
             <wp:docPr id="522444785" name="Picture 522444785"/>
@@ -34005,7 +34116,7 @@
       <w:pPr>
         <w:pStyle w:val="FigureCaption"/>
       </w:pPr>
-      <w:bookmarkStart w:id="104" w:name="_Toc242133689"/>
+      <w:bookmarkStart w:id="104" w:name="_Toc242175118"/>
       <w:r>
         <w:t>Hình 5.18. Sổ điểm của giáo viên</w:t>
       </w:r>
@@ -34015,7 +34126,7 @@
       <w:pPr>
         <w:pStyle w:val="Heading2"/>
       </w:pPr>
-      <w:bookmarkStart w:id="105" w:name="_Toc242133658"/>
+      <w:bookmarkStart w:id="105" w:name="_Toc242175087"/>
       <w:r>
         <w:t>5.17. Việc vẫn làm trong SSMS</w:t>
       </w:r>
@@ -34133,7 +34244,7 @@
         <w:pStyle w:val="Heading1"/>
         <w:pageBreakBefore/>
       </w:pPr>
-      <w:bookmarkStart w:id="106" w:name="_Toc242133659"/>
+      <w:bookmarkStart w:id="106" w:name="_Toc242175088"/>
       <w:r>
         <w:lastRenderedPageBreak/>
         <w:t>CHƯƠNG 6. XỬ LÝ SỰ CỐ</w:t>
@@ -34144,7 +34255,7 @@
       <w:pPr>
         <w:pStyle w:val="Heading2"/>
       </w:pPr>
-      <w:bookmarkStart w:id="107" w:name="_Toc242133660"/>
+      <w:bookmarkStart w:id="107" w:name="_Toc242175089"/>
       <w:r>
         <w:t>6.1. Kiểm tra kết nối không cần giao diện</w:t>
       </w:r>
@@ -34551,7 +34662,7 @@
       <w:pPr>
         <w:pStyle w:val="Heading2"/>
       </w:pPr>
-      <w:bookmarkStart w:id="108" w:name="_Toc242133661"/>
+      <w:bookmarkStart w:id="108" w:name="_Toc242175090"/>
       <w:r>
         <w:t>6.2. Lỗi thường gặp</w:t>
       </w:r>
@@ -34561,7 +34672,7 @@
       <w:pPr>
         <w:pStyle w:val="TableCaption"/>
       </w:pPr>
-      <w:bookmarkStart w:id="109" w:name="_Toc242133704"/>
+      <w:bookmarkStart w:id="109" w:name="_Toc242175133"/>
       <w:r>
         <w:t>Bảng 6.1. Lỗi thường gặp và cách xử lý</w:t>
       </w:r>
@@ -37245,7 +37356,7 @@
       <w:pPr>
         <w:pStyle w:val="Heading2"/>
       </w:pPr>
-      <w:bookmarkStart w:id="110" w:name="_Toc242133662"/>
+      <w:bookmarkStart w:id="110" w:name="_Toc242175091"/>
       <w:r>
         <w:t>6.3. Khi cần hỗ trợ thêm</w:t>
       </w:r>
@@ -37293,7 +37404,7 @@
         <w:pStyle w:val="Heading1"/>
         <w:pageBreakBefore/>
       </w:pPr>
-      <w:bookmarkStart w:id="111" w:name="_Toc242133663"/>
+      <w:bookmarkStart w:id="111" w:name="_Toc242175092"/>
       <w:r>
         <w:lastRenderedPageBreak/>
         <w:t>PHỤ LỤC A. TÓM TẮT LỆNH</w:t>
@@ -38044,7 +38155,7 @@
         <w:pStyle w:val="Heading1"/>
         <w:pageBreakBefore/>
       </w:pPr>
-      <w:bookmarkStart w:id="112" w:name="_Toc242133664"/>
+      <w:bookmarkStart w:id="112" w:name="_Toc242175093"/>
       <w:r>
         <w:lastRenderedPageBreak/>
         <w:t>PHỤ LỤC B. CÁC MỤC CẦN BỔ SUNG</w:t>

</xml_diff>

<commit_message>
chore: run SQL Server 2025 in Docker on macOS and in CI
The Windows machines run SQL Server 2025 (Microsoft retired the 2022
installer), while docker-compose.yml and the Linux CI job still ran
2022. Use the 2025 image everywhere, so every member and CI test the
database scripts on the same major version.

- docker-compose.yml and the "Full tests (Linux + SQL Server)" job of
  ci.yml use mcr.microsoft.com/mssql/server:2025-latest; sqlcmd stays
  at /opt/mssql-tools18/bin, so no script changes
- 04-scripts-ci.md records that the repository owner accepted the
  SQL Server 2025 Developer license for CI on 2026-10-06
- README, SETUP.md, the project site, the setup scripts' comments and
  the imcp-setup skill say 2025
- report (table 1.3) and user guide (requirements table, 2.2.2) say SQL
  Server 2025; both regenerated and exported to PDF (99 and 53 pages)
- report data re-exported from SQL Server 2025: identical apart from
  three creation times
</commit_message>
<xml_diff>
--- a/docs/user-guide/QLTTTA_User_Guide.docx
+++ b/docs/user-guide/QLTTTA_User_Guide.docx
@@ -1402,7 +1402,7 @@
       <w:r>
         <w:fldChar w:fldCharType="separate"/>
       </w:r>
-      <w:hyperlink w:anchor="_Toc242175021" w:history="1">
+      <w:hyperlink w:anchor="_Toc242176301" w:history="1">
         <w:r>
           <w:rPr>
             <w:rStyle w:val="Hyperlink"/>
@@ -1429,7 +1429,7 @@
             <w:noProof/>
             <w:webHidden/>
           </w:rPr>
-          <w:instrText xml:space="preserve"> PAGEREF _Toc242175021 \h </w:instrText>
+          <w:instrText xml:space="preserve"> PAGEREF _Toc242176301 \h </w:instrText>
         </w:r>
         <w:r>
           <w:rPr>
@@ -1476,7 +1476,7 @@
           <w14:ligatures w14:val="standardContextual"/>
         </w:rPr>
       </w:pPr>
-      <w:hyperlink w:anchor="_Toc242175022" w:history="1">
+      <w:hyperlink w:anchor="_Toc242176302" w:history="1">
         <w:r>
           <w:rPr>
             <w:rStyle w:val="Hyperlink"/>
@@ -1503,7 +1503,7 @@
             <w:noProof/>
             <w:webHidden/>
           </w:rPr>
-          <w:instrText xml:space="preserve"> PAGEREF _Toc242175022 \h </w:instrText>
+          <w:instrText xml:space="preserve"> PAGEREF _Toc242176302 \h </w:instrText>
         </w:r>
         <w:r>
           <w:rPr>
@@ -1550,7 +1550,7 @@
           <w14:ligatures w14:val="standardContextual"/>
         </w:rPr>
       </w:pPr>
-      <w:hyperlink w:anchor="_Toc242175023" w:history="1">
+      <w:hyperlink w:anchor="_Toc242176303" w:history="1">
         <w:r>
           <w:rPr>
             <w:rStyle w:val="Hyperlink"/>
@@ -1577,7 +1577,7 @@
             <w:noProof/>
             <w:webHidden/>
           </w:rPr>
-          <w:instrText xml:space="preserve"> PAGEREF _Toc242175023 \h </w:instrText>
+          <w:instrText xml:space="preserve"> PAGEREF _Toc242176303 \h </w:instrText>
         </w:r>
         <w:r>
           <w:rPr>
@@ -1624,7 +1624,7 @@
           <w14:ligatures w14:val="standardContextual"/>
         </w:rPr>
       </w:pPr>
-      <w:hyperlink w:anchor="_Toc242175024" w:history="1">
+      <w:hyperlink w:anchor="_Toc242176304" w:history="1">
         <w:r>
           <w:rPr>
             <w:rStyle w:val="Hyperlink"/>
@@ -1651,7 +1651,7 @@
             <w:noProof/>
             <w:webHidden/>
           </w:rPr>
-          <w:instrText xml:space="preserve"> PAGEREF _Toc242175024 \h </w:instrText>
+          <w:instrText xml:space="preserve"> PAGEREF _Toc242176304 \h </w:instrText>
         </w:r>
         <w:r>
           <w:rPr>
@@ -1698,7 +1698,7 @@
           <w14:ligatures w14:val="standardContextual"/>
         </w:rPr>
       </w:pPr>
-      <w:hyperlink w:anchor="_Toc242175025" w:history="1">
+      <w:hyperlink w:anchor="_Toc242176305" w:history="1">
         <w:r>
           <w:rPr>
             <w:rStyle w:val="Hyperlink"/>
@@ -1725,7 +1725,7 @@
             <w:noProof/>
             <w:webHidden/>
           </w:rPr>
-          <w:instrText xml:space="preserve"> PAGEREF _Toc242175025 \h </w:instrText>
+          <w:instrText xml:space="preserve"> PAGEREF _Toc242176305 \h </w:instrText>
         </w:r>
         <w:r>
           <w:rPr>
@@ -1772,7 +1772,7 @@
           <w14:ligatures w14:val="standardContextual"/>
         </w:rPr>
       </w:pPr>
-      <w:hyperlink w:anchor="_Toc242175026" w:history="1">
+      <w:hyperlink w:anchor="_Toc242176306" w:history="1">
         <w:r>
           <w:rPr>
             <w:rStyle w:val="Hyperlink"/>
@@ -1799,7 +1799,7 @@
             <w:noProof/>
             <w:webHidden/>
           </w:rPr>
-          <w:instrText xml:space="preserve"> PAGEREF _Toc242175026 \h </w:instrText>
+          <w:instrText xml:space="preserve"> PAGEREF _Toc242176306 \h </w:instrText>
         </w:r>
         <w:r>
           <w:rPr>
@@ -1846,7 +1846,7 @@
           <w14:ligatures w14:val="standardContextual"/>
         </w:rPr>
       </w:pPr>
-      <w:hyperlink w:anchor="_Toc242175027" w:history="1">
+      <w:hyperlink w:anchor="_Toc242176307" w:history="1">
         <w:r>
           <w:rPr>
             <w:rStyle w:val="Hyperlink"/>
@@ -1873,7 +1873,7 @@
             <w:noProof/>
             <w:webHidden/>
           </w:rPr>
-          <w:instrText xml:space="preserve"> PAGEREF _Toc242175027 \h </w:instrText>
+          <w:instrText xml:space="preserve"> PAGEREF _Toc242176307 \h </w:instrText>
         </w:r>
         <w:r>
           <w:rPr>
@@ -1920,7 +1920,7 @@
           <w14:ligatures w14:val="standardContextual"/>
         </w:rPr>
       </w:pPr>
-      <w:hyperlink w:anchor="_Toc242175028" w:history="1">
+      <w:hyperlink w:anchor="_Toc242176308" w:history="1">
         <w:r>
           <w:rPr>
             <w:rStyle w:val="Hyperlink"/>
@@ -1947,7 +1947,7 @@
             <w:noProof/>
             <w:webHidden/>
           </w:rPr>
-          <w:instrText xml:space="preserve"> PAGEREF _Toc242175028 \h </w:instrText>
+          <w:instrText xml:space="preserve"> PAGEREF _Toc242176308 \h </w:instrText>
         </w:r>
         <w:r>
           <w:rPr>
@@ -1994,7 +1994,7 @@
           <w14:ligatures w14:val="standardContextual"/>
         </w:rPr>
       </w:pPr>
-      <w:hyperlink w:anchor="_Toc242175029" w:history="1">
+      <w:hyperlink w:anchor="_Toc242176309" w:history="1">
         <w:r>
           <w:rPr>
             <w:rStyle w:val="Hyperlink"/>
@@ -2021,7 +2021,7 @@
             <w:noProof/>
             <w:webHidden/>
           </w:rPr>
-          <w:instrText xml:space="preserve"> PAGEREF _Toc242175029 \h </w:instrText>
+          <w:instrText xml:space="preserve"> PAGEREF _Toc242176309 \h </w:instrText>
         </w:r>
         <w:r>
           <w:rPr>
@@ -2068,7 +2068,7 @@
           <w14:ligatures w14:val="standardContextual"/>
         </w:rPr>
       </w:pPr>
-      <w:hyperlink w:anchor="_Toc242175030" w:history="1">
+      <w:hyperlink w:anchor="_Toc242176310" w:history="1">
         <w:r>
           <w:rPr>
             <w:rStyle w:val="Hyperlink"/>
@@ -2095,7 +2095,7 @@
             <w:noProof/>
             <w:webHidden/>
           </w:rPr>
-          <w:instrText xml:space="preserve"> PAGEREF _Toc242175030 \h </w:instrText>
+          <w:instrText xml:space="preserve"> PAGEREF _Toc242176310 \h </w:instrText>
         </w:r>
         <w:r>
           <w:rPr>
@@ -2142,7 +2142,7 @@
           <w14:ligatures w14:val="standardContextual"/>
         </w:rPr>
       </w:pPr>
-      <w:hyperlink w:anchor="_Toc242175031" w:history="1">
+      <w:hyperlink w:anchor="_Toc242176311" w:history="1">
         <w:r>
           <w:rPr>
             <w:rStyle w:val="Hyperlink"/>
@@ -2169,7 +2169,7 @@
             <w:noProof/>
             <w:webHidden/>
           </w:rPr>
-          <w:instrText xml:space="preserve"> PAGEREF _Toc242175031 \h </w:instrText>
+          <w:instrText xml:space="preserve"> PAGEREF _Toc242176311 \h </w:instrText>
         </w:r>
         <w:r>
           <w:rPr>
@@ -2216,7 +2216,7 @@
           <w14:ligatures w14:val="standardContextual"/>
         </w:rPr>
       </w:pPr>
-      <w:hyperlink w:anchor="_Toc242175032" w:history="1">
+      <w:hyperlink w:anchor="_Toc242176312" w:history="1">
         <w:r>
           <w:rPr>
             <w:rStyle w:val="Hyperlink"/>
@@ -2243,7 +2243,7 @@
             <w:noProof/>
             <w:webHidden/>
           </w:rPr>
-          <w:instrText xml:space="preserve"> PAGEREF _Toc242175032 \h </w:instrText>
+          <w:instrText xml:space="preserve"> PAGEREF _Toc242176312 \h </w:instrText>
         </w:r>
         <w:r>
           <w:rPr>
@@ -2290,7 +2290,7 @@
           <w14:ligatures w14:val="standardContextual"/>
         </w:rPr>
       </w:pPr>
-      <w:hyperlink w:anchor="_Toc242175033" w:history="1">
+      <w:hyperlink w:anchor="_Toc242176313" w:history="1">
         <w:r>
           <w:rPr>
             <w:rStyle w:val="Hyperlink"/>
@@ -2317,7 +2317,7 @@
             <w:noProof/>
             <w:webHidden/>
           </w:rPr>
-          <w:instrText xml:space="preserve"> PAGEREF _Toc242175033 \h </w:instrText>
+          <w:instrText xml:space="preserve"> PAGEREF _Toc242176313 \h </w:instrText>
         </w:r>
         <w:r>
           <w:rPr>
@@ -2364,7 +2364,7 @@
           <w14:ligatures w14:val="standardContextual"/>
         </w:rPr>
       </w:pPr>
-      <w:hyperlink w:anchor="_Toc242175034" w:history="1">
+      <w:hyperlink w:anchor="_Toc242176314" w:history="1">
         <w:r>
           <w:rPr>
             <w:rStyle w:val="Hyperlink"/>
@@ -2391,7 +2391,7 @@
             <w:noProof/>
             <w:webHidden/>
           </w:rPr>
-          <w:instrText xml:space="preserve"> PAGEREF _Toc242175034 \h </w:instrText>
+          <w:instrText xml:space="preserve"> PAGEREF _Toc242176314 \h </w:instrText>
         </w:r>
         <w:r>
           <w:rPr>
@@ -2438,7 +2438,7 @@
           <w14:ligatures w14:val="standardContextual"/>
         </w:rPr>
       </w:pPr>
-      <w:hyperlink w:anchor="_Toc242175035" w:history="1">
+      <w:hyperlink w:anchor="_Toc242176315" w:history="1">
         <w:r>
           <w:rPr>
             <w:rStyle w:val="Hyperlink"/>
@@ -2465,7 +2465,7 @@
             <w:noProof/>
             <w:webHidden/>
           </w:rPr>
-          <w:instrText xml:space="preserve"> PAGEREF _Toc242175035 \h </w:instrText>
+          <w:instrText xml:space="preserve"> PAGEREF _Toc242176315 \h </w:instrText>
         </w:r>
         <w:r>
           <w:rPr>
@@ -2512,7 +2512,7 @@
           <w14:ligatures w14:val="standardContextual"/>
         </w:rPr>
       </w:pPr>
-      <w:hyperlink w:anchor="_Toc242175036" w:history="1">
+      <w:hyperlink w:anchor="_Toc242176316" w:history="1">
         <w:r>
           <w:rPr>
             <w:rStyle w:val="Hyperlink"/>
@@ -2539,7 +2539,7 @@
             <w:noProof/>
             <w:webHidden/>
           </w:rPr>
-          <w:instrText xml:space="preserve"> PAGEREF _Toc242175036 \h </w:instrText>
+          <w:instrText xml:space="preserve"> PAGEREF _Toc242176316 \h </w:instrText>
         </w:r>
         <w:r>
           <w:rPr>
@@ -2586,7 +2586,7 @@
           <w14:ligatures w14:val="standardContextual"/>
         </w:rPr>
       </w:pPr>
-      <w:hyperlink w:anchor="_Toc242175037" w:history="1">
+      <w:hyperlink w:anchor="_Toc242176317" w:history="1">
         <w:r>
           <w:rPr>
             <w:rStyle w:val="Hyperlink"/>
@@ -2613,7 +2613,7 @@
             <w:noProof/>
             <w:webHidden/>
           </w:rPr>
-          <w:instrText xml:space="preserve"> PAGEREF _Toc242175037 \h </w:instrText>
+          <w:instrText xml:space="preserve"> PAGEREF _Toc242176317 \h </w:instrText>
         </w:r>
         <w:r>
           <w:rPr>
@@ -2660,7 +2660,7 @@
           <w14:ligatures w14:val="standardContextual"/>
         </w:rPr>
       </w:pPr>
-      <w:hyperlink w:anchor="_Toc242175038" w:history="1">
+      <w:hyperlink w:anchor="_Toc242176318" w:history="1">
         <w:r>
           <w:rPr>
             <w:rStyle w:val="Hyperlink"/>
@@ -2687,7 +2687,7 @@
             <w:noProof/>
             <w:webHidden/>
           </w:rPr>
-          <w:instrText xml:space="preserve"> PAGEREF _Toc242175038 \h </w:instrText>
+          <w:instrText xml:space="preserve"> PAGEREF _Toc242176318 \h </w:instrText>
         </w:r>
         <w:r>
           <w:rPr>
@@ -2734,7 +2734,7 @@
           <w14:ligatures w14:val="standardContextual"/>
         </w:rPr>
       </w:pPr>
-      <w:hyperlink w:anchor="_Toc242175039" w:history="1">
+      <w:hyperlink w:anchor="_Toc242176319" w:history="1">
         <w:r>
           <w:rPr>
             <w:rStyle w:val="Hyperlink"/>
@@ -2761,7 +2761,7 @@
             <w:noProof/>
             <w:webHidden/>
           </w:rPr>
-          <w:instrText xml:space="preserve"> PAGEREF _Toc242175039 \h </w:instrText>
+          <w:instrText xml:space="preserve"> PAGEREF _Toc242176319 \h </w:instrText>
         </w:r>
         <w:r>
           <w:rPr>
@@ -2808,7 +2808,7 @@
           <w14:ligatures w14:val="standardContextual"/>
         </w:rPr>
       </w:pPr>
-      <w:hyperlink w:anchor="_Toc242175040" w:history="1">
+      <w:hyperlink w:anchor="_Toc242176320" w:history="1">
         <w:r>
           <w:rPr>
             <w:rStyle w:val="Hyperlink"/>
@@ -2835,7 +2835,7 @@
             <w:noProof/>
             <w:webHidden/>
           </w:rPr>
-          <w:instrText xml:space="preserve"> PAGEREF _Toc242175040 \h </w:instrText>
+          <w:instrText xml:space="preserve"> PAGEREF _Toc242176320 \h </w:instrText>
         </w:r>
         <w:r>
           <w:rPr>
@@ -2882,7 +2882,7 @@
           <w14:ligatures w14:val="standardContextual"/>
         </w:rPr>
       </w:pPr>
-      <w:hyperlink w:anchor="_Toc242175041" w:history="1">
+      <w:hyperlink w:anchor="_Toc242176321" w:history="1">
         <w:r>
           <w:rPr>
             <w:rStyle w:val="Hyperlink"/>
@@ -2909,7 +2909,7 @@
             <w:noProof/>
             <w:webHidden/>
           </w:rPr>
-          <w:instrText xml:space="preserve"> PAGEREF _Toc242175041 \h </w:instrText>
+          <w:instrText xml:space="preserve"> PAGEREF _Toc242176321 \h </w:instrText>
         </w:r>
         <w:r>
           <w:rPr>
@@ -2956,7 +2956,7 @@
           <w14:ligatures w14:val="standardContextual"/>
         </w:rPr>
       </w:pPr>
-      <w:hyperlink w:anchor="_Toc242175042" w:history="1">
+      <w:hyperlink w:anchor="_Toc242176322" w:history="1">
         <w:r>
           <w:rPr>
             <w:rStyle w:val="Hyperlink"/>
@@ -2983,7 +2983,7 @@
             <w:noProof/>
             <w:webHidden/>
           </w:rPr>
-          <w:instrText xml:space="preserve"> PAGEREF _Toc242175042 \h </w:instrText>
+          <w:instrText xml:space="preserve"> PAGEREF _Toc242176322 \h </w:instrText>
         </w:r>
         <w:r>
           <w:rPr>
@@ -3030,7 +3030,7 @@
           <w14:ligatures w14:val="standardContextual"/>
         </w:rPr>
       </w:pPr>
-      <w:hyperlink w:anchor="_Toc242175043" w:history="1">
+      <w:hyperlink w:anchor="_Toc242176323" w:history="1">
         <w:r>
           <w:rPr>
             <w:rStyle w:val="Hyperlink"/>
@@ -3057,7 +3057,7 @@
             <w:noProof/>
             <w:webHidden/>
           </w:rPr>
-          <w:instrText xml:space="preserve"> PAGEREF _Toc242175043 \h </w:instrText>
+          <w:instrText xml:space="preserve"> PAGEREF _Toc242176323 \h </w:instrText>
         </w:r>
         <w:r>
           <w:rPr>
@@ -3104,7 +3104,7 @@
           <w14:ligatures w14:val="standardContextual"/>
         </w:rPr>
       </w:pPr>
-      <w:hyperlink w:anchor="_Toc242175044" w:history="1">
+      <w:hyperlink w:anchor="_Toc242176324" w:history="1">
         <w:r>
           <w:rPr>
             <w:rStyle w:val="Hyperlink"/>
@@ -3131,7 +3131,7 @@
             <w:noProof/>
             <w:webHidden/>
           </w:rPr>
-          <w:instrText xml:space="preserve"> PAGEREF _Toc242175044 \h </w:instrText>
+          <w:instrText xml:space="preserve"> PAGEREF _Toc242176324 \h </w:instrText>
         </w:r>
         <w:r>
           <w:rPr>
@@ -3178,7 +3178,7 @@
           <w14:ligatures w14:val="standardContextual"/>
         </w:rPr>
       </w:pPr>
-      <w:hyperlink w:anchor="_Toc242175045" w:history="1">
+      <w:hyperlink w:anchor="_Toc242176325" w:history="1">
         <w:r>
           <w:rPr>
             <w:rStyle w:val="Hyperlink"/>
@@ -3205,7 +3205,7 @@
             <w:noProof/>
             <w:webHidden/>
           </w:rPr>
-          <w:instrText xml:space="preserve"> PAGEREF _Toc242175045 \h </w:instrText>
+          <w:instrText xml:space="preserve"> PAGEREF _Toc242176325 \h </w:instrText>
         </w:r>
         <w:r>
           <w:rPr>
@@ -3252,7 +3252,7 @@
           <w14:ligatures w14:val="standardContextual"/>
         </w:rPr>
       </w:pPr>
-      <w:hyperlink w:anchor="_Toc242175046" w:history="1">
+      <w:hyperlink w:anchor="_Toc242176326" w:history="1">
         <w:r>
           <w:rPr>
             <w:rStyle w:val="Hyperlink"/>
@@ -3279,7 +3279,7 @@
             <w:noProof/>
             <w:webHidden/>
           </w:rPr>
-          <w:instrText xml:space="preserve"> PAGEREF _Toc242175046 \h </w:instrText>
+          <w:instrText xml:space="preserve"> PAGEREF _Toc242176326 \h </w:instrText>
         </w:r>
         <w:r>
           <w:rPr>
@@ -3326,7 +3326,7 @@
           <w14:ligatures w14:val="standardContextual"/>
         </w:rPr>
       </w:pPr>
-      <w:hyperlink w:anchor="_Toc242175047" w:history="1">
+      <w:hyperlink w:anchor="_Toc242176327" w:history="1">
         <w:r>
           <w:rPr>
             <w:rStyle w:val="Hyperlink"/>
@@ -3353,7 +3353,7 @@
             <w:noProof/>
             <w:webHidden/>
           </w:rPr>
-          <w:instrText xml:space="preserve"> PAGEREF _Toc242175047 \h </w:instrText>
+          <w:instrText xml:space="preserve"> PAGEREF _Toc242176327 \h </w:instrText>
         </w:r>
         <w:r>
           <w:rPr>
@@ -3400,7 +3400,7 @@
           <w14:ligatures w14:val="standardContextual"/>
         </w:rPr>
       </w:pPr>
-      <w:hyperlink w:anchor="_Toc242175048" w:history="1">
+      <w:hyperlink w:anchor="_Toc242176328" w:history="1">
         <w:r>
           <w:rPr>
             <w:rStyle w:val="Hyperlink"/>
@@ -3427,7 +3427,7 @@
             <w:noProof/>
             <w:webHidden/>
           </w:rPr>
-          <w:instrText xml:space="preserve"> PAGEREF _Toc242175048 \h </w:instrText>
+          <w:instrText xml:space="preserve"> PAGEREF _Toc242176328 \h </w:instrText>
         </w:r>
         <w:r>
           <w:rPr>
@@ -3474,7 +3474,7 @@
           <w14:ligatures w14:val="standardContextual"/>
         </w:rPr>
       </w:pPr>
-      <w:hyperlink w:anchor="_Toc242175049" w:history="1">
+      <w:hyperlink w:anchor="_Toc242176329" w:history="1">
         <w:r>
           <w:rPr>
             <w:rStyle w:val="Hyperlink"/>
@@ -3501,7 +3501,7 @@
             <w:noProof/>
             <w:webHidden/>
           </w:rPr>
-          <w:instrText xml:space="preserve"> PAGEREF _Toc242175049 \h </w:instrText>
+          <w:instrText xml:space="preserve"> PAGEREF _Toc242176329 \h </w:instrText>
         </w:r>
         <w:r>
           <w:rPr>
@@ -3548,7 +3548,7 @@
           <w14:ligatures w14:val="standardContextual"/>
         </w:rPr>
       </w:pPr>
-      <w:hyperlink w:anchor="_Toc242175050" w:history="1">
+      <w:hyperlink w:anchor="_Toc242176330" w:history="1">
         <w:r>
           <w:rPr>
             <w:rStyle w:val="Hyperlink"/>
@@ -3575,7 +3575,7 @@
             <w:noProof/>
             <w:webHidden/>
           </w:rPr>
-          <w:instrText xml:space="preserve"> PAGEREF _Toc242175050 \h </w:instrText>
+          <w:instrText xml:space="preserve"> PAGEREF _Toc242176330 \h </w:instrText>
         </w:r>
         <w:r>
           <w:rPr>
@@ -3622,7 +3622,7 @@
           <w14:ligatures w14:val="standardContextual"/>
         </w:rPr>
       </w:pPr>
-      <w:hyperlink w:anchor="_Toc242175051" w:history="1">
+      <w:hyperlink w:anchor="_Toc242176331" w:history="1">
         <w:r>
           <w:rPr>
             <w:rStyle w:val="Hyperlink"/>
@@ -3649,7 +3649,7 @@
             <w:noProof/>
             <w:webHidden/>
           </w:rPr>
-          <w:instrText xml:space="preserve"> PAGEREF _Toc242175051 \h </w:instrText>
+          <w:instrText xml:space="preserve"> PAGEREF _Toc242176331 \h </w:instrText>
         </w:r>
         <w:r>
           <w:rPr>
@@ -3696,7 +3696,7 @@
           <w14:ligatures w14:val="standardContextual"/>
         </w:rPr>
       </w:pPr>
-      <w:hyperlink w:anchor="_Toc242175052" w:history="1">
+      <w:hyperlink w:anchor="_Toc242176332" w:history="1">
         <w:r>
           <w:rPr>
             <w:rStyle w:val="Hyperlink"/>
@@ -3723,7 +3723,7 @@
             <w:noProof/>
             <w:webHidden/>
           </w:rPr>
-          <w:instrText xml:space="preserve"> PAGEREF _Toc242175052 \h </w:instrText>
+          <w:instrText xml:space="preserve"> PAGEREF _Toc242176332 \h </w:instrText>
         </w:r>
         <w:r>
           <w:rPr>
@@ -3770,7 +3770,7 @@
           <w14:ligatures w14:val="standardContextual"/>
         </w:rPr>
       </w:pPr>
-      <w:hyperlink w:anchor="_Toc242175053" w:history="1">
+      <w:hyperlink w:anchor="_Toc242176333" w:history="1">
         <w:r>
           <w:rPr>
             <w:rStyle w:val="Hyperlink"/>
@@ -3797,7 +3797,7 @@
             <w:noProof/>
             <w:webHidden/>
           </w:rPr>
-          <w:instrText xml:space="preserve"> PAGEREF _Toc242175053 \h </w:instrText>
+          <w:instrText xml:space="preserve"> PAGEREF _Toc242176333 \h </w:instrText>
         </w:r>
         <w:r>
           <w:rPr>
@@ -3844,7 +3844,7 @@
           <w14:ligatures w14:val="standardContextual"/>
         </w:rPr>
       </w:pPr>
-      <w:hyperlink w:anchor="_Toc242175054" w:history="1">
+      <w:hyperlink w:anchor="_Toc242176334" w:history="1">
         <w:r>
           <w:rPr>
             <w:rStyle w:val="Hyperlink"/>
@@ -3871,7 +3871,7 @@
             <w:noProof/>
             <w:webHidden/>
           </w:rPr>
-          <w:instrText xml:space="preserve"> PAGEREF _Toc242175054 \h </w:instrText>
+          <w:instrText xml:space="preserve"> PAGEREF _Toc242176334 \h </w:instrText>
         </w:r>
         <w:r>
           <w:rPr>
@@ -3918,7 +3918,7 @@
           <w14:ligatures w14:val="standardContextual"/>
         </w:rPr>
       </w:pPr>
-      <w:hyperlink w:anchor="_Toc242175055" w:history="1">
+      <w:hyperlink w:anchor="_Toc242176335" w:history="1">
         <w:r>
           <w:rPr>
             <w:rStyle w:val="Hyperlink"/>
@@ -3945,7 +3945,7 @@
             <w:noProof/>
             <w:webHidden/>
           </w:rPr>
-          <w:instrText xml:space="preserve"> PAGEREF _Toc242175055 \h </w:instrText>
+          <w:instrText xml:space="preserve"> PAGEREF _Toc242176335 \h </w:instrText>
         </w:r>
         <w:r>
           <w:rPr>
@@ -3992,7 +3992,7 @@
           <w14:ligatures w14:val="standardContextual"/>
         </w:rPr>
       </w:pPr>
-      <w:hyperlink w:anchor="_Toc242175056" w:history="1">
+      <w:hyperlink w:anchor="_Toc242176336" w:history="1">
         <w:r>
           <w:rPr>
             <w:rStyle w:val="Hyperlink"/>
@@ -4019,7 +4019,7 @@
             <w:noProof/>
             <w:webHidden/>
           </w:rPr>
-          <w:instrText xml:space="preserve"> PAGEREF _Toc242175056 \h </w:instrText>
+          <w:instrText xml:space="preserve"> PAGEREF _Toc242176336 \h </w:instrText>
         </w:r>
         <w:r>
           <w:rPr>
@@ -4066,7 +4066,7 @@
           <w14:ligatures w14:val="standardContextual"/>
         </w:rPr>
       </w:pPr>
-      <w:hyperlink w:anchor="_Toc242175057" w:history="1">
+      <w:hyperlink w:anchor="_Toc242176337" w:history="1">
         <w:r>
           <w:rPr>
             <w:rStyle w:val="Hyperlink"/>
@@ -4093,7 +4093,7 @@
             <w:noProof/>
             <w:webHidden/>
           </w:rPr>
-          <w:instrText xml:space="preserve"> PAGEREF _Toc242175057 \h </w:instrText>
+          <w:instrText xml:space="preserve"> PAGEREF _Toc242176337 \h </w:instrText>
         </w:r>
         <w:r>
           <w:rPr>
@@ -4140,7 +4140,7 @@
           <w14:ligatures w14:val="standardContextual"/>
         </w:rPr>
       </w:pPr>
-      <w:hyperlink w:anchor="_Toc242175058" w:history="1">
+      <w:hyperlink w:anchor="_Toc242176338" w:history="1">
         <w:r>
           <w:rPr>
             <w:rStyle w:val="Hyperlink"/>
@@ -4167,7 +4167,7 @@
             <w:noProof/>
             <w:webHidden/>
           </w:rPr>
-          <w:instrText xml:space="preserve"> PAGEREF _Toc242175058 \h </w:instrText>
+          <w:instrText xml:space="preserve"> PAGEREF _Toc242176338 \h </w:instrText>
         </w:r>
         <w:r>
           <w:rPr>
@@ -4214,7 +4214,7 @@
           <w14:ligatures w14:val="standardContextual"/>
         </w:rPr>
       </w:pPr>
-      <w:hyperlink w:anchor="_Toc242175059" w:history="1">
+      <w:hyperlink w:anchor="_Toc242176339" w:history="1">
         <w:r>
           <w:rPr>
             <w:rStyle w:val="Hyperlink"/>
@@ -4241,7 +4241,7 @@
             <w:noProof/>
             <w:webHidden/>
           </w:rPr>
-          <w:instrText xml:space="preserve"> PAGEREF _Toc242175059 \h </w:instrText>
+          <w:instrText xml:space="preserve"> PAGEREF _Toc242176339 \h </w:instrText>
         </w:r>
         <w:r>
           <w:rPr>
@@ -4288,7 +4288,7 @@
           <w14:ligatures w14:val="standardContextual"/>
         </w:rPr>
       </w:pPr>
-      <w:hyperlink w:anchor="_Toc242175060" w:history="1">
+      <w:hyperlink w:anchor="_Toc242176340" w:history="1">
         <w:r>
           <w:rPr>
             <w:rStyle w:val="Hyperlink"/>
@@ -4315,7 +4315,7 @@
             <w:noProof/>
             <w:webHidden/>
           </w:rPr>
-          <w:instrText xml:space="preserve"> PAGEREF _Toc242175060 \h </w:instrText>
+          <w:instrText xml:space="preserve"> PAGEREF _Toc242176340 \h </w:instrText>
         </w:r>
         <w:r>
           <w:rPr>
@@ -4362,7 +4362,7 @@
           <w14:ligatures w14:val="standardContextual"/>
         </w:rPr>
       </w:pPr>
-      <w:hyperlink w:anchor="_Toc242175061" w:history="1">
+      <w:hyperlink w:anchor="_Toc242176341" w:history="1">
         <w:r>
           <w:rPr>
             <w:rStyle w:val="Hyperlink"/>
@@ -4389,7 +4389,7 @@
             <w:noProof/>
             <w:webHidden/>
           </w:rPr>
-          <w:instrText xml:space="preserve"> PAGEREF _Toc242175061 \h </w:instrText>
+          <w:instrText xml:space="preserve"> PAGEREF _Toc242176341 \h </w:instrText>
         </w:r>
         <w:r>
           <w:rPr>
@@ -4436,7 +4436,7 @@
           <w14:ligatures w14:val="standardContextual"/>
         </w:rPr>
       </w:pPr>
-      <w:hyperlink w:anchor="_Toc242175062" w:history="1">
+      <w:hyperlink w:anchor="_Toc242176342" w:history="1">
         <w:r>
           <w:rPr>
             <w:rStyle w:val="Hyperlink"/>
@@ -4463,7 +4463,7 @@
             <w:noProof/>
             <w:webHidden/>
           </w:rPr>
-          <w:instrText xml:space="preserve"> PAGEREF _Toc242175062 \h </w:instrText>
+          <w:instrText xml:space="preserve"> PAGEREF _Toc242176342 \h </w:instrText>
         </w:r>
         <w:r>
           <w:rPr>
@@ -4510,7 +4510,7 @@
           <w14:ligatures w14:val="standardContextual"/>
         </w:rPr>
       </w:pPr>
-      <w:hyperlink w:anchor="_Toc242175063" w:history="1">
+      <w:hyperlink w:anchor="_Toc242176343" w:history="1">
         <w:r>
           <w:rPr>
             <w:rStyle w:val="Hyperlink"/>
@@ -4537,7 +4537,7 @@
             <w:noProof/>
             <w:webHidden/>
           </w:rPr>
-          <w:instrText xml:space="preserve"> PAGEREF _Toc242175063 \h </w:instrText>
+          <w:instrText xml:space="preserve"> PAGEREF _Toc242176343 \h </w:instrText>
         </w:r>
         <w:r>
           <w:rPr>
@@ -4584,7 +4584,7 @@
           <w14:ligatures w14:val="standardContextual"/>
         </w:rPr>
       </w:pPr>
-      <w:hyperlink w:anchor="_Toc242175064" w:history="1">
+      <w:hyperlink w:anchor="_Toc242176344" w:history="1">
         <w:r>
           <w:rPr>
             <w:rStyle w:val="Hyperlink"/>
@@ -4611,7 +4611,7 @@
             <w:noProof/>
             <w:webHidden/>
           </w:rPr>
-          <w:instrText xml:space="preserve"> PAGEREF _Toc242175064 \h </w:instrText>
+          <w:instrText xml:space="preserve"> PAGEREF _Toc242176344 \h </w:instrText>
         </w:r>
         <w:r>
           <w:rPr>
@@ -4658,7 +4658,7 @@
           <w14:ligatures w14:val="standardContextual"/>
         </w:rPr>
       </w:pPr>
-      <w:hyperlink w:anchor="_Toc242175065" w:history="1">
+      <w:hyperlink w:anchor="_Toc242176345" w:history="1">
         <w:r>
           <w:rPr>
             <w:rStyle w:val="Hyperlink"/>
@@ -4685,7 +4685,7 @@
             <w:noProof/>
             <w:webHidden/>
           </w:rPr>
-          <w:instrText xml:space="preserve"> PAGEREF _Toc242175065 \h </w:instrText>
+          <w:instrText xml:space="preserve"> PAGEREF _Toc242176345 \h </w:instrText>
         </w:r>
         <w:r>
           <w:rPr>
@@ -4732,7 +4732,7 @@
           <w14:ligatures w14:val="standardContextual"/>
         </w:rPr>
       </w:pPr>
-      <w:hyperlink w:anchor="_Toc242175066" w:history="1">
+      <w:hyperlink w:anchor="_Toc242176346" w:history="1">
         <w:r>
           <w:rPr>
             <w:rStyle w:val="Hyperlink"/>
@@ -4759,7 +4759,7 @@
             <w:noProof/>
             <w:webHidden/>
           </w:rPr>
-          <w:instrText xml:space="preserve"> PAGEREF _Toc242175066 \h </w:instrText>
+          <w:instrText xml:space="preserve"> PAGEREF _Toc242176346 \h </w:instrText>
         </w:r>
         <w:r>
           <w:rPr>
@@ -4806,7 +4806,7 @@
           <w14:ligatures w14:val="standardContextual"/>
         </w:rPr>
       </w:pPr>
-      <w:hyperlink w:anchor="_Toc242175067" w:history="1">
+      <w:hyperlink w:anchor="_Toc242176347" w:history="1">
         <w:r>
           <w:rPr>
             <w:rStyle w:val="Hyperlink"/>
@@ -4833,7 +4833,7 @@
             <w:noProof/>
             <w:webHidden/>
           </w:rPr>
-          <w:instrText xml:space="preserve"> PAGEREF _Toc242175067 \h </w:instrText>
+          <w:instrText xml:space="preserve"> PAGEREF _Toc242176347 \h </w:instrText>
         </w:r>
         <w:r>
           <w:rPr>
@@ -4880,7 +4880,7 @@
           <w14:ligatures w14:val="standardContextual"/>
         </w:rPr>
       </w:pPr>
-      <w:hyperlink w:anchor="_Toc242175068" w:history="1">
+      <w:hyperlink w:anchor="_Toc242176348" w:history="1">
         <w:r>
           <w:rPr>
             <w:rStyle w:val="Hyperlink"/>
@@ -4907,7 +4907,7 @@
             <w:noProof/>
             <w:webHidden/>
           </w:rPr>
-          <w:instrText xml:space="preserve"> PAGEREF _Toc242175068 \h </w:instrText>
+          <w:instrText xml:space="preserve"> PAGEREF _Toc242176348 \h </w:instrText>
         </w:r>
         <w:r>
           <w:rPr>
@@ -4954,7 +4954,7 @@
           <w14:ligatures w14:val="standardContextual"/>
         </w:rPr>
       </w:pPr>
-      <w:hyperlink w:anchor="_Toc242175069" w:history="1">
+      <w:hyperlink w:anchor="_Toc242176349" w:history="1">
         <w:r>
           <w:rPr>
             <w:rStyle w:val="Hyperlink"/>
@@ -4981,7 +4981,7 @@
             <w:noProof/>
             <w:webHidden/>
           </w:rPr>
-          <w:instrText xml:space="preserve"> PAGEREF _Toc242175069 \h </w:instrText>
+          <w:instrText xml:space="preserve"> PAGEREF _Toc242176349 \h </w:instrText>
         </w:r>
         <w:r>
           <w:rPr>
@@ -5028,7 +5028,7 @@
           <w14:ligatures w14:val="standardContextual"/>
         </w:rPr>
       </w:pPr>
-      <w:hyperlink w:anchor="_Toc242175070" w:history="1">
+      <w:hyperlink w:anchor="_Toc242176350" w:history="1">
         <w:r>
           <w:rPr>
             <w:rStyle w:val="Hyperlink"/>
@@ -5055,7 +5055,7 @@
             <w:noProof/>
             <w:webHidden/>
           </w:rPr>
-          <w:instrText xml:space="preserve"> PAGEREF _Toc242175070 \h </w:instrText>
+          <w:instrText xml:space="preserve"> PAGEREF _Toc242176350 \h </w:instrText>
         </w:r>
         <w:r>
           <w:rPr>
@@ -5102,7 +5102,7 @@
           <w14:ligatures w14:val="standardContextual"/>
         </w:rPr>
       </w:pPr>
-      <w:hyperlink w:anchor="_Toc242175071" w:history="1">
+      <w:hyperlink w:anchor="_Toc242176351" w:history="1">
         <w:r>
           <w:rPr>
             <w:rStyle w:val="Hyperlink"/>
@@ -5129,7 +5129,7 @@
             <w:noProof/>
             <w:webHidden/>
           </w:rPr>
-          <w:instrText xml:space="preserve"> PAGEREF _Toc242175071 \h </w:instrText>
+          <w:instrText xml:space="preserve"> PAGEREF _Toc242176351 \h </w:instrText>
         </w:r>
         <w:r>
           <w:rPr>
@@ -5176,7 +5176,7 @@
           <w14:ligatures w14:val="standardContextual"/>
         </w:rPr>
       </w:pPr>
-      <w:hyperlink w:anchor="_Toc242175072" w:history="1">
+      <w:hyperlink w:anchor="_Toc242176352" w:history="1">
         <w:r>
           <w:rPr>
             <w:rStyle w:val="Hyperlink"/>
@@ -5203,7 +5203,7 @@
             <w:noProof/>
             <w:webHidden/>
           </w:rPr>
-          <w:instrText xml:space="preserve"> PAGEREF _Toc242175072 \h </w:instrText>
+          <w:instrText xml:space="preserve"> PAGEREF _Toc242176352 \h </w:instrText>
         </w:r>
         <w:r>
           <w:rPr>
@@ -5250,7 +5250,7 @@
           <w14:ligatures w14:val="standardContextual"/>
         </w:rPr>
       </w:pPr>
-      <w:hyperlink w:anchor="_Toc242175073" w:history="1">
+      <w:hyperlink w:anchor="_Toc242176353" w:history="1">
         <w:r>
           <w:rPr>
             <w:rStyle w:val="Hyperlink"/>
@@ -5277,7 +5277,7 @@
             <w:noProof/>
             <w:webHidden/>
           </w:rPr>
-          <w:instrText xml:space="preserve"> PAGEREF _Toc242175073 \h </w:instrText>
+          <w:instrText xml:space="preserve"> PAGEREF _Toc242176353 \h </w:instrText>
         </w:r>
         <w:r>
           <w:rPr>
@@ -5324,7 +5324,7 @@
           <w14:ligatures w14:val="standardContextual"/>
         </w:rPr>
       </w:pPr>
-      <w:hyperlink w:anchor="_Toc242175074" w:history="1">
+      <w:hyperlink w:anchor="_Toc242176354" w:history="1">
         <w:r>
           <w:rPr>
             <w:rStyle w:val="Hyperlink"/>
@@ -5351,7 +5351,7 @@
             <w:noProof/>
             <w:webHidden/>
           </w:rPr>
-          <w:instrText xml:space="preserve"> PAGEREF _Toc242175074 \h </w:instrText>
+          <w:instrText xml:space="preserve"> PAGEREF _Toc242176354 \h </w:instrText>
         </w:r>
         <w:r>
           <w:rPr>
@@ -5398,7 +5398,7 @@
           <w14:ligatures w14:val="standardContextual"/>
         </w:rPr>
       </w:pPr>
-      <w:hyperlink w:anchor="_Toc242175075" w:history="1">
+      <w:hyperlink w:anchor="_Toc242176355" w:history="1">
         <w:r>
           <w:rPr>
             <w:rStyle w:val="Hyperlink"/>
@@ -5425,7 +5425,7 @@
             <w:noProof/>
             <w:webHidden/>
           </w:rPr>
-          <w:instrText xml:space="preserve"> PAGEREF _Toc242175075 \h </w:instrText>
+          <w:instrText xml:space="preserve"> PAGEREF _Toc242176355 \h </w:instrText>
         </w:r>
         <w:r>
           <w:rPr>
@@ -5472,7 +5472,7 @@
           <w14:ligatures w14:val="standardContextual"/>
         </w:rPr>
       </w:pPr>
-      <w:hyperlink w:anchor="_Toc242175076" w:history="1">
+      <w:hyperlink w:anchor="_Toc242176356" w:history="1">
         <w:r>
           <w:rPr>
             <w:rStyle w:val="Hyperlink"/>
@@ -5499,7 +5499,7 @@
             <w:noProof/>
             <w:webHidden/>
           </w:rPr>
-          <w:instrText xml:space="preserve"> PAGEREF _Toc242175076 \h </w:instrText>
+          <w:instrText xml:space="preserve"> PAGEREF _Toc242176356 \h </w:instrText>
         </w:r>
         <w:r>
           <w:rPr>
@@ -5546,7 +5546,7 @@
           <w14:ligatures w14:val="standardContextual"/>
         </w:rPr>
       </w:pPr>
-      <w:hyperlink w:anchor="_Toc242175077" w:history="1">
+      <w:hyperlink w:anchor="_Toc242176357" w:history="1">
         <w:r>
           <w:rPr>
             <w:rStyle w:val="Hyperlink"/>
@@ -5573,7 +5573,7 @@
             <w:noProof/>
             <w:webHidden/>
           </w:rPr>
-          <w:instrText xml:space="preserve"> PAGEREF _Toc242175077 \h </w:instrText>
+          <w:instrText xml:space="preserve"> PAGEREF _Toc242176357 \h </w:instrText>
         </w:r>
         <w:r>
           <w:rPr>
@@ -5620,7 +5620,7 @@
           <w14:ligatures w14:val="standardContextual"/>
         </w:rPr>
       </w:pPr>
-      <w:hyperlink w:anchor="_Toc242175078" w:history="1">
+      <w:hyperlink w:anchor="_Toc242176358" w:history="1">
         <w:r>
           <w:rPr>
             <w:rStyle w:val="Hyperlink"/>
@@ -5647,7 +5647,7 @@
             <w:noProof/>
             <w:webHidden/>
           </w:rPr>
-          <w:instrText xml:space="preserve"> PAGEREF _Toc242175078 \h </w:instrText>
+          <w:instrText xml:space="preserve"> PAGEREF _Toc242176358 \h </w:instrText>
         </w:r>
         <w:r>
           <w:rPr>
@@ -5694,7 +5694,7 @@
           <w14:ligatures w14:val="standardContextual"/>
         </w:rPr>
       </w:pPr>
-      <w:hyperlink w:anchor="_Toc242175079" w:history="1">
+      <w:hyperlink w:anchor="_Toc242176359" w:history="1">
         <w:r>
           <w:rPr>
             <w:rStyle w:val="Hyperlink"/>
@@ -5721,7 +5721,7 @@
             <w:noProof/>
             <w:webHidden/>
           </w:rPr>
-          <w:instrText xml:space="preserve"> PAGEREF _Toc242175079 \h </w:instrText>
+          <w:instrText xml:space="preserve"> PAGEREF _Toc242176359 \h </w:instrText>
         </w:r>
         <w:r>
           <w:rPr>
@@ -5768,7 +5768,7 @@
           <w14:ligatures w14:val="standardContextual"/>
         </w:rPr>
       </w:pPr>
-      <w:hyperlink w:anchor="_Toc242175080" w:history="1">
+      <w:hyperlink w:anchor="_Toc242176360" w:history="1">
         <w:r>
           <w:rPr>
             <w:rStyle w:val="Hyperlink"/>
@@ -5795,7 +5795,7 @@
             <w:noProof/>
             <w:webHidden/>
           </w:rPr>
-          <w:instrText xml:space="preserve"> PAGEREF _Toc242175080 \h </w:instrText>
+          <w:instrText xml:space="preserve"> PAGEREF _Toc242176360 \h </w:instrText>
         </w:r>
         <w:r>
           <w:rPr>
@@ -5842,7 +5842,7 @@
           <w14:ligatures w14:val="standardContextual"/>
         </w:rPr>
       </w:pPr>
-      <w:hyperlink w:anchor="_Toc242175081" w:history="1">
+      <w:hyperlink w:anchor="_Toc242176361" w:history="1">
         <w:r>
           <w:rPr>
             <w:rStyle w:val="Hyperlink"/>
@@ -5869,7 +5869,7 @@
             <w:noProof/>
             <w:webHidden/>
           </w:rPr>
-          <w:instrText xml:space="preserve"> PAGEREF _Toc242175081 \h </w:instrText>
+          <w:instrText xml:space="preserve"> PAGEREF _Toc242176361 \h </w:instrText>
         </w:r>
         <w:r>
           <w:rPr>
@@ -5916,7 +5916,7 @@
           <w14:ligatures w14:val="standardContextual"/>
         </w:rPr>
       </w:pPr>
-      <w:hyperlink w:anchor="_Toc242175082" w:history="1">
+      <w:hyperlink w:anchor="_Toc242176362" w:history="1">
         <w:r>
           <w:rPr>
             <w:rStyle w:val="Hyperlink"/>
@@ -5943,7 +5943,7 @@
             <w:noProof/>
             <w:webHidden/>
           </w:rPr>
-          <w:instrText xml:space="preserve"> PAGEREF _Toc242175082 \h </w:instrText>
+          <w:instrText xml:space="preserve"> PAGEREF _Toc242176362 \h </w:instrText>
         </w:r>
         <w:r>
           <w:rPr>
@@ -5990,7 +5990,7 @@
           <w14:ligatures w14:val="standardContextual"/>
         </w:rPr>
       </w:pPr>
-      <w:hyperlink w:anchor="_Toc242175083" w:history="1">
+      <w:hyperlink w:anchor="_Toc242176363" w:history="1">
         <w:r>
           <w:rPr>
             <w:rStyle w:val="Hyperlink"/>
@@ -6017,7 +6017,7 @@
             <w:noProof/>
             <w:webHidden/>
           </w:rPr>
-          <w:instrText xml:space="preserve"> PAGEREF _Toc242175083 \h </w:instrText>
+          <w:instrText xml:space="preserve"> PAGEREF _Toc242176363 \h </w:instrText>
         </w:r>
         <w:r>
           <w:rPr>
@@ -6064,7 +6064,7 @@
           <w14:ligatures w14:val="standardContextual"/>
         </w:rPr>
       </w:pPr>
-      <w:hyperlink w:anchor="_Toc242175084" w:history="1">
+      <w:hyperlink w:anchor="_Toc242176364" w:history="1">
         <w:r>
           <w:rPr>
             <w:rStyle w:val="Hyperlink"/>
@@ -6091,7 +6091,7 @@
             <w:noProof/>
             <w:webHidden/>
           </w:rPr>
-          <w:instrText xml:space="preserve"> PAGEREF _Toc242175084 \h </w:instrText>
+          <w:instrText xml:space="preserve"> PAGEREF _Toc242176364 \h </w:instrText>
         </w:r>
         <w:r>
           <w:rPr>
@@ -6138,7 +6138,7 @@
           <w14:ligatures w14:val="standardContextual"/>
         </w:rPr>
       </w:pPr>
-      <w:hyperlink w:anchor="_Toc242175085" w:history="1">
+      <w:hyperlink w:anchor="_Toc242176365" w:history="1">
         <w:r>
           <w:rPr>
             <w:rStyle w:val="Hyperlink"/>
@@ -6165,7 +6165,7 @@
             <w:noProof/>
             <w:webHidden/>
           </w:rPr>
-          <w:instrText xml:space="preserve"> PAGEREF _Toc242175085 \h </w:instrText>
+          <w:instrText xml:space="preserve"> PAGEREF _Toc242176365 \h </w:instrText>
         </w:r>
         <w:r>
           <w:rPr>
@@ -6212,7 +6212,7 @@
           <w14:ligatures w14:val="standardContextual"/>
         </w:rPr>
       </w:pPr>
-      <w:hyperlink w:anchor="_Toc242175086" w:history="1">
+      <w:hyperlink w:anchor="_Toc242176366" w:history="1">
         <w:r>
           <w:rPr>
             <w:rStyle w:val="Hyperlink"/>
@@ -6239,7 +6239,7 @@
             <w:noProof/>
             <w:webHidden/>
           </w:rPr>
-          <w:instrText xml:space="preserve"> PAGEREF _Toc242175086 \h </w:instrText>
+          <w:instrText xml:space="preserve"> PAGEREF _Toc242176366 \h </w:instrText>
         </w:r>
         <w:r>
           <w:rPr>
@@ -6286,7 +6286,7 @@
           <w14:ligatures w14:val="standardContextual"/>
         </w:rPr>
       </w:pPr>
-      <w:hyperlink w:anchor="_Toc242175087" w:history="1">
+      <w:hyperlink w:anchor="_Toc242176367" w:history="1">
         <w:r>
           <w:rPr>
             <w:rStyle w:val="Hyperlink"/>
@@ -6313,7 +6313,7 @@
             <w:noProof/>
             <w:webHidden/>
           </w:rPr>
-          <w:instrText xml:space="preserve"> PAGEREF _Toc242175087 \h </w:instrText>
+          <w:instrText xml:space="preserve"> PAGEREF _Toc242176367 \h </w:instrText>
         </w:r>
         <w:r>
           <w:rPr>
@@ -6360,7 +6360,7 @@
           <w14:ligatures w14:val="standardContextual"/>
         </w:rPr>
       </w:pPr>
-      <w:hyperlink w:anchor="_Toc242175088" w:history="1">
+      <w:hyperlink w:anchor="_Toc242176368" w:history="1">
         <w:r>
           <w:rPr>
             <w:rStyle w:val="Hyperlink"/>
@@ -6387,7 +6387,7 @@
             <w:noProof/>
             <w:webHidden/>
           </w:rPr>
-          <w:instrText xml:space="preserve"> PAGEREF _Toc242175088 \h </w:instrText>
+          <w:instrText xml:space="preserve"> PAGEREF _Toc242176368 \h </w:instrText>
         </w:r>
         <w:r>
           <w:rPr>
@@ -6434,7 +6434,7 @@
           <w14:ligatures w14:val="standardContextual"/>
         </w:rPr>
       </w:pPr>
-      <w:hyperlink w:anchor="_Toc242175089" w:history="1">
+      <w:hyperlink w:anchor="_Toc242176369" w:history="1">
         <w:r>
           <w:rPr>
             <w:rStyle w:val="Hyperlink"/>
@@ -6461,7 +6461,7 @@
             <w:noProof/>
             <w:webHidden/>
           </w:rPr>
-          <w:instrText xml:space="preserve"> PAGEREF _Toc242175089 \h </w:instrText>
+          <w:instrText xml:space="preserve"> PAGEREF _Toc242176369 \h </w:instrText>
         </w:r>
         <w:r>
           <w:rPr>
@@ -6508,7 +6508,7 @@
           <w14:ligatures w14:val="standardContextual"/>
         </w:rPr>
       </w:pPr>
-      <w:hyperlink w:anchor="_Toc242175090" w:history="1">
+      <w:hyperlink w:anchor="_Toc242176370" w:history="1">
         <w:r>
           <w:rPr>
             <w:rStyle w:val="Hyperlink"/>
@@ -6535,7 +6535,7 @@
             <w:noProof/>
             <w:webHidden/>
           </w:rPr>
-          <w:instrText xml:space="preserve"> PAGEREF _Toc242175090 \h </w:instrText>
+          <w:instrText xml:space="preserve"> PAGEREF _Toc242176370 \h </w:instrText>
         </w:r>
         <w:r>
           <w:rPr>
@@ -6582,7 +6582,7 @@
           <w14:ligatures w14:val="standardContextual"/>
         </w:rPr>
       </w:pPr>
-      <w:hyperlink w:anchor="_Toc242175091" w:history="1">
+      <w:hyperlink w:anchor="_Toc242176371" w:history="1">
         <w:r>
           <w:rPr>
             <w:rStyle w:val="Hyperlink"/>
@@ -6609,7 +6609,7 @@
             <w:noProof/>
             <w:webHidden/>
           </w:rPr>
-          <w:instrText xml:space="preserve"> PAGEREF _Toc242175091 \h </w:instrText>
+          <w:instrText xml:space="preserve"> PAGEREF _Toc242176371 \h </w:instrText>
         </w:r>
         <w:r>
           <w:rPr>
@@ -6656,7 +6656,7 @@
           <w14:ligatures w14:val="standardContextual"/>
         </w:rPr>
       </w:pPr>
-      <w:hyperlink w:anchor="_Toc242175092" w:history="1">
+      <w:hyperlink w:anchor="_Toc242176372" w:history="1">
         <w:r>
           <w:rPr>
             <w:rStyle w:val="Hyperlink"/>
@@ -6683,7 +6683,7 @@
             <w:noProof/>
             <w:webHidden/>
           </w:rPr>
-          <w:instrText xml:space="preserve"> PAGEREF _Toc242175092 \h </w:instrText>
+          <w:instrText xml:space="preserve"> PAGEREF _Toc242176372 \h </w:instrText>
         </w:r>
         <w:r>
           <w:rPr>
@@ -6730,7 +6730,7 @@
           <w14:ligatures w14:val="standardContextual"/>
         </w:rPr>
       </w:pPr>
-      <w:hyperlink w:anchor="_Toc242175093" w:history="1">
+      <w:hyperlink w:anchor="_Toc242176373" w:history="1">
         <w:r>
           <w:rPr>
             <w:rStyle w:val="Hyperlink"/>
@@ -6757,7 +6757,7 @@
             <w:noProof/>
             <w:webHidden/>
           </w:rPr>
-          <w:instrText xml:space="preserve"> PAGEREF _Toc242175093 \h </w:instrText>
+          <w:instrText xml:space="preserve"> PAGEREF _Toc242176373 \h </w:instrText>
         </w:r>
         <w:r>
           <w:rPr>
@@ -6834,7 +6834,7 @@
       <w:r>
         <w:fldChar w:fldCharType="separate"/>
       </w:r>
-      <w:hyperlink w:anchor="_Toc242175094" w:history="1">
+      <w:hyperlink w:anchor="_Toc242176374" w:history="1">
         <w:r>
           <w:rPr>
             <w:rStyle w:val="Hyperlink"/>
@@ -6861,7 +6861,7 @@
             <w:noProof/>
             <w:webHidden/>
           </w:rPr>
-          <w:instrText xml:space="preserve"> PAGEREF _Toc242175094 \h </w:instrText>
+          <w:instrText xml:space="preserve"> PAGEREF _Toc242176374 \h </w:instrText>
         </w:r>
         <w:r>
           <w:rPr>
@@ -6908,7 +6908,7 @@
           <w14:ligatures w14:val="standardContextual"/>
         </w:rPr>
       </w:pPr>
-      <w:hyperlink w:anchor="_Toc242175095" w:history="1">
+      <w:hyperlink w:anchor="_Toc242176375" w:history="1">
         <w:r>
           <w:rPr>
             <w:rStyle w:val="Hyperlink"/>
@@ -6935,7 +6935,7 @@
             <w:noProof/>
             <w:webHidden/>
           </w:rPr>
-          <w:instrText xml:space="preserve"> PAGEREF _Toc242175095 \h </w:instrText>
+          <w:instrText xml:space="preserve"> PAGEREF _Toc242176375 \h </w:instrText>
         </w:r>
         <w:r>
           <w:rPr>
@@ -6982,7 +6982,7 @@
           <w14:ligatures w14:val="standardContextual"/>
         </w:rPr>
       </w:pPr>
-      <w:hyperlink w:anchor="_Toc242175096" w:history="1">
+      <w:hyperlink w:anchor="_Toc242176376" w:history="1">
         <w:r>
           <w:rPr>
             <w:rStyle w:val="Hyperlink"/>
@@ -7009,7 +7009,7 @@
             <w:noProof/>
             <w:webHidden/>
           </w:rPr>
-          <w:instrText xml:space="preserve"> PAGEREF _Toc242175096 \h </w:instrText>
+          <w:instrText xml:space="preserve"> PAGEREF _Toc242176376 \h </w:instrText>
         </w:r>
         <w:r>
           <w:rPr>
@@ -7056,7 +7056,7 @@
           <w14:ligatures w14:val="standardContextual"/>
         </w:rPr>
       </w:pPr>
-      <w:hyperlink w:anchor="_Toc242175097" w:history="1">
+      <w:hyperlink w:anchor="_Toc242176377" w:history="1">
         <w:r>
           <w:rPr>
             <w:rStyle w:val="Hyperlink"/>
@@ -7083,7 +7083,7 @@
             <w:noProof/>
             <w:webHidden/>
           </w:rPr>
-          <w:instrText xml:space="preserve"> PAGEREF _Toc242175097 \h </w:instrText>
+          <w:instrText xml:space="preserve"> PAGEREF _Toc242176377 \h </w:instrText>
         </w:r>
         <w:r>
           <w:rPr>
@@ -7130,7 +7130,7 @@
           <w14:ligatures w14:val="standardContextual"/>
         </w:rPr>
       </w:pPr>
-      <w:hyperlink w:anchor="_Toc242175098" w:history="1">
+      <w:hyperlink w:anchor="_Toc242176378" w:history="1">
         <w:r>
           <w:rPr>
             <w:rStyle w:val="Hyperlink"/>
@@ -7157,7 +7157,7 @@
             <w:noProof/>
             <w:webHidden/>
           </w:rPr>
-          <w:instrText xml:space="preserve"> PAGEREF _Toc242175098 \h </w:instrText>
+          <w:instrText xml:space="preserve"> PAGEREF _Toc242176378 \h </w:instrText>
         </w:r>
         <w:r>
           <w:rPr>
@@ -7204,7 +7204,7 @@
           <w14:ligatures w14:val="standardContextual"/>
         </w:rPr>
       </w:pPr>
-      <w:hyperlink w:anchor="_Toc242175099" w:history="1">
+      <w:hyperlink w:anchor="_Toc242176379" w:history="1">
         <w:r>
           <w:rPr>
             <w:rStyle w:val="Hyperlink"/>
@@ -7231,7 +7231,7 @@
             <w:noProof/>
             <w:webHidden/>
           </w:rPr>
-          <w:instrText xml:space="preserve"> PAGEREF _Toc242175099 \h </w:instrText>
+          <w:instrText xml:space="preserve"> PAGEREF _Toc242176379 \h </w:instrText>
         </w:r>
         <w:r>
           <w:rPr>
@@ -7278,7 +7278,7 @@
           <w14:ligatures w14:val="standardContextual"/>
         </w:rPr>
       </w:pPr>
-      <w:hyperlink w:anchor="_Toc242175100" w:history="1">
+      <w:hyperlink w:anchor="_Toc242176380" w:history="1">
         <w:r>
           <w:rPr>
             <w:rStyle w:val="Hyperlink"/>
@@ -7305,7 +7305,7 @@
             <w:noProof/>
             <w:webHidden/>
           </w:rPr>
-          <w:instrText xml:space="preserve"> PAGEREF _Toc242175100 \h </w:instrText>
+          <w:instrText xml:space="preserve"> PAGEREF _Toc242176380 \h </w:instrText>
         </w:r>
         <w:r>
           <w:rPr>
@@ -7352,7 +7352,7 @@
           <w14:ligatures w14:val="standardContextual"/>
         </w:rPr>
       </w:pPr>
-      <w:hyperlink w:anchor="_Toc242175101" w:history="1">
+      <w:hyperlink w:anchor="_Toc242176381" w:history="1">
         <w:r>
           <w:rPr>
             <w:rStyle w:val="Hyperlink"/>
@@ -7379,7 +7379,7 @@
             <w:noProof/>
             <w:webHidden/>
           </w:rPr>
-          <w:instrText xml:space="preserve"> PAGEREF _Toc242175101 \h </w:instrText>
+          <w:instrText xml:space="preserve"> PAGEREF _Toc242176381 \h </w:instrText>
         </w:r>
         <w:r>
           <w:rPr>
@@ -7426,7 +7426,7 @@
           <w14:ligatures w14:val="standardContextual"/>
         </w:rPr>
       </w:pPr>
-      <w:hyperlink w:anchor="_Toc242175102" w:history="1">
+      <w:hyperlink w:anchor="_Toc242176382" w:history="1">
         <w:r>
           <w:rPr>
             <w:rStyle w:val="Hyperlink"/>
@@ -7453,7 +7453,7 @@
             <w:noProof/>
             <w:webHidden/>
           </w:rPr>
-          <w:instrText xml:space="preserve"> PAGEREF _Toc242175102 \h </w:instrText>
+          <w:instrText xml:space="preserve"> PAGEREF _Toc242176382 \h </w:instrText>
         </w:r>
         <w:r>
           <w:rPr>
@@ -7500,7 +7500,7 @@
           <w14:ligatures w14:val="standardContextual"/>
         </w:rPr>
       </w:pPr>
-      <w:hyperlink w:anchor="_Toc242175103" w:history="1">
+      <w:hyperlink w:anchor="_Toc242176383" w:history="1">
         <w:r>
           <w:rPr>
             <w:rStyle w:val="Hyperlink"/>
@@ -7527,7 +7527,7 @@
             <w:noProof/>
             <w:webHidden/>
           </w:rPr>
-          <w:instrText xml:space="preserve"> PAGEREF _Toc242175103 \h </w:instrText>
+          <w:instrText xml:space="preserve"> PAGEREF _Toc242176383 \h </w:instrText>
         </w:r>
         <w:r>
           <w:rPr>
@@ -7574,7 +7574,7 @@
           <w14:ligatures w14:val="standardContextual"/>
         </w:rPr>
       </w:pPr>
-      <w:hyperlink w:anchor="_Toc242175104" w:history="1">
+      <w:hyperlink w:anchor="_Toc242176384" w:history="1">
         <w:r>
           <w:rPr>
             <w:rStyle w:val="Hyperlink"/>
@@ -7601,7 +7601,7 @@
             <w:noProof/>
             <w:webHidden/>
           </w:rPr>
-          <w:instrText xml:space="preserve"> PAGEREF _Toc242175104 \h </w:instrText>
+          <w:instrText xml:space="preserve"> PAGEREF _Toc242176384 \h </w:instrText>
         </w:r>
         <w:r>
           <w:rPr>
@@ -7648,7 +7648,7 @@
           <w14:ligatures w14:val="standardContextual"/>
         </w:rPr>
       </w:pPr>
-      <w:hyperlink w:anchor="_Toc242175105" w:history="1">
+      <w:hyperlink w:anchor="_Toc242176385" w:history="1">
         <w:r>
           <w:rPr>
             <w:rStyle w:val="Hyperlink"/>
@@ -7675,7 +7675,7 @@
             <w:noProof/>
             <w:webHidden/>
           </w:rPr>
-          <w:instrText xml:space="preserve"> PAGEREF _Toc242175105 \h </w:instrText>
+          <w:instrText xml:space="preserve"> PAGEREF _Toc242176385 \h </w:instrText>
         </w:r>
         <w:r>
           <w:rPr>
@@ -7722,7 +7722,7 @@
           <w14:ligatures w14:val="standardContextual"/>
         </w:rPr>
       </w:pPr>
-      <w:hyperlink w:anchor="_Toc242175106" w:history="1">
+      <w:hyperlink w:anchor="_Toc242176386" w:history="1">
         <w:r>
           <w:rPr>
             <w:rStyle w:val="Hyperlink"/>
@@ -7749,7 +7749,7 @@
             <w:noProof/>
             <w:webHidden/>
           </w:rPr>
-          <w:instrText xml:space="preserve"> PAGEREF _Toc242175106 \h </w:instrText>
+          <w:instrText xml:space="preserve"> PAGEREF _Toc242176386 \h </w:instrText>
         </w:r>
         <w:r>
           <w:rPr>
@@ -7796,7 +7796,7 @@
           <w14:ligatures w14:val="standardContextual"/>
         </w:rPr>
       </w:pPr>
-      <w:hyperlink w:anchor="_Toc242175107" w:history="1">
+      <w:hyperlink w:anchor="_Toc242176387" w:history="1">
         <w:r>
           <w:rPr>
             <w:rStyle w:val="Hyperlink"/>
@@ -7823,7 +7823,7 @@
             <w:noProof/>
             <w:webHidden/>
           </w:rPr>
-          <w:instrText xml:space="preserve"> PAGEREF _Toc242175107 \h </w:instrText>
+          <w:instrText xml:space="preserve"> PAGEREF _Toc242176387 \h </w:instrText>
         </w:r>
         <w:r>
           <w:rPr>
@@ -7870,7 +7870,7 @@
           <w14:ligatures w14:val="standardContextual"/>
         </w:rPr>
       </w:pPr>
-      <w:hyperlink w:anchor="_Toc242175108" w:history="1">
+      <w:hyperlink w:anchor="_Toc242176388" w:history="1">
         <w:r>
           <w:rPr>
             <w:rStyle w:val="Hyperlink"/>
@@ -7897,7 +7897,7 @@
             <w:noProof/>
             <w:webHidden/>
           </w:rPr>
-          <w:instrText xml:space="preserve"> PAGEREF _Toc242175108 \h </w:instrText>
+          <w:instrText xml:space="preserve"> PAGEREF _Toc242176388 \h </w:instrText>
         </w:r>
         <w:r>
           <w:rPr>
@@ -7944,7 +7944,7 @@
           <w14:ligatures w14:val="standardContextual"/>
         </w:rPr>
       </w:pPr>
-      <w:hyperlink w:anchor="_Toc242175109" w:history="1">
+      <w:hyperlink w:anchor="_Toc242176389" w:history="1">
         <w:r>
           <w:rPr>
             <w:rStyle w:val="Hyperlink"/>
@@ -7971,7 +7971,7 @@
             <w:noProof/>
             <w:webHidden/>
           </w:rPr>
-          <w:instrText xml:space="preserve"> PAGEREF _Toc242175109 \h </w:instrText>
+          <w:instrText xml:space="preserve"> PAGEREF _Toc242176389 \h </w:instrText>
         </w:r>
         <w:r>
           <w:rPr>
@@ -8018,7 +8018,7 @@
           <w14:ligatures w14:val="standardContextual"/>
         </w:rPr>
       </w:pPr>
-      <w:hyperlink w:anchor="_Toc242175110" w:history="1">
+      <w:hyperlink w:anchor="_Toc242176390" w:history="1">
         <w:r>
           <w:rPr>
             <w:rStyle w:val="Hyperlink"/>
@@ -8045,7 +8045,7 @@
             <w:noProof/>
             <w:webHidden/>
           </w:rPr>
-          <w:instrText xml:space="preserve"> PAGEREF _Toc242175110 \h </w:instrText>
+          <w:instrText xml:space="preserve"> PAGEREF _Toc242176390 \h </w:instrText>
         </w:r>
         <w:r>
           <w:rPr>
@@ -8092,7 +8092,7 @@
           <w14:ligatures w14:val="standardContextual"/>
         </w:rPr>
       </w:pPr>
-      <w:hyperlink w:anchor="_Toc242175111" w:history="1">
+      <w:hyperlink w:anchor="_Toc242176391" w:history="1">
         <w:r>
           <w:rPr>
             <w:rStyle w:val="Hyperlink"/>
@@ -8119,7 +8119,7 @@
             <w:noProof/>
             <w:webHidden/>
           </w:rPr>
-          <w:instrText xml:space="preserve"> PAGEREF _Toc242175111 \h </w:instrText>
+          <w:instrText xml:space="preserve"> PAGEREF _Toc242176391 \h </w:instrText>
         </w:r>
         <w:r>
           <w:rPr>
@@ -8166,7 +8166,7 @@
           <w14:ligatures w14:val="standardContextual"/>
         </w:rPr>
       </w:pPr>
-      <w:hyperlink w:anchor="_Toc242175112" w:history="1">
+      <w:hyperlink w:anchor="_Toc242176392" w:history="1">
         <w:r>
           <w:rPr>
             <w:rStyle w:val="Hyperlink"/>
@@ -8193,7 +8193,7 @@
             <w:noProof/>
             <w:webHidden/>
           </w:rPr>
-          <w:instrText xml:space="preserve"> PAGEREF _Toc242175112 \h </w:instrText>
+          <w:instrText xml:space="preserve"> PAGEREF _Toc242176392 \h </w:instrText>
         </w:r>
         <w:r>
           <w:rPr>
@@ -8240,7 +8240,7 @@
           <w14:ligatures w14:val="standardContextual"/>
         </w:rPr>
       </w:pPr>
-      <w:hyperlink w:anchor="_Toc242175113" w:history="1">
+      <w:hyperlink w:anchor="_Toc242176393" w:history="1">
         <w:r>
           <w:rPr>
             <w:rStyle w:val="Hyperlink"/>
@@ -8267,7 +8267,7 @@
             <w:noProof/>
             <w:webHidden/>
           </w:rPr>
-          <w:instrText xml:space="preserve"> PAGEREF _Toc242175113 \h </w:instrText>
+          <w:instrText xml:space="preserve"> PAGEREF _Toc242176393 \h </w:instrText>
         </w:r>
         <w:r>
           <w:rPr>
@@ -8314,7 +8314,7 @@
           <w14:ligatures w14:val="standardContextual"/>
         </w:rPr>
       </w:pPr>
-      <w:hyperlink w:anchor="_Toc242175114" w:history="1">
+      <w:hyperlink w:anchor="_Toc242176394" w:history="1">
         <w:r>
           <w:rPr>
             <w:rStyle w:val="Hyperlink"/>
@@ -8341,7 +8341,7 @@
             <w:noProof/>
             <w:webHidden/>
           </w:rPr>
-          <w:instrText xml:space="preserve"> PAGEREF _Toc242175114 \h </w:instrText>
+          <w:instrText xml:space="preserve"> PAGEREF _Toc242176394 \h </w:instrText>
         </w:r>
         <w:r>
           <w:rPr>
@@ -8388,7 +8388,7 @@
           <w14:ligatures w14:val="standardContextual"/>
         </w:rPr>
       </w:pPr>
-      <w:hyperlink w:anchor="_Toc242175115" w:history="1">
+      <w:hyperlink w:anchor="_Toc242176395" w:history="1">
         <w:r>
           <w:rPr>
             <w:rStyle w:val="Hyperlink"/>
@@ -8415,7 +8415,7 @@
             <w:noProof/>
             <w:webHidden/>
           </w:rPr>
-          <w:instrText xml:space="preserve"> PAGEREF _Toc242175115 \h </w:instrText>
+          <w:instrText xml:space="preserve"> PAGEREF _Toc242176395 \h </w:instrText>
         </w:r>
         <w:r>
           <w:rPr>
@@ -8462,7 +8462,7 @@
           <w14:ligatures w14:val="standardContextual"/>
         </w:rPr>
       </w:pPr>
-      <w:hyperlink w:anchor="_Toc242175116" w:history="1">
+      <w:hyperlink w:anchor="_Toc242176396" w:history="1">
         <w:r>
           <w:rPr>
             <w:rStyle w:val="Hyperlink"/>
@@ -8489,7 +8489,7 @@
             <w:noProof/>
             <w:webHidden/>
           </w:rPr>
-          <w:instrText xml:space="preserve"> PAGEREF _Toc242175116 \h </w:instrText>
+          <w:instrText xml:space="preserve"> PAGEREF _Toc242176396 \h </w:instrText>
         </w:r>
         <w:r>
           <w:rPr>
@@ -8536,7 +8536,7 @@
           <w14:ligatures w14:val="standardContextual"/>
         </w:rPr>
       </w:pPr>
-      <w:hyperlink w:anchor="_Toc242175117" w:history="1">
+      <w:hyperlink w:anchor="_Toc242176397" w:history="1">
         <w:r>
           <w:rPr>
             <w:rStyle w:val="Hyperlink"/>
@@ -8563,7 +8563,7 @@
             <w:noProof/>
             <w:webHidden/>
           </w:rPr>
-          <w:instrText xml:space="preserve"> PAGEREF _Toc242175117 \h </w:instrText>
+          <w:instrText xml:space="preserve"> PAGEREF _Toc242176397 \h </w:instrText>
         </w:r>
         <w:r>
           <w:rPr>
@@ -8610,7 +8610,7 @@
           <w14:ligatures w14:val="standardContextual"/>
         </w:rPr>
       </w:pPr>
-      <w:hyperlink w:anchor="_Toc242175118" w:history="1">
+      <w:hyperlink w:anchor="_Toc242176398" w:history="1">
         <w:r>
           <w:rPr>
             <w:rStyle w:val="Hyperlink"/>
@@ -8637,7 +8637,7 @@
             <w:noProof/>
             <w:webHidden/>
           </w:rPr>
-          <w:instrText xml:space="preserve"> PAGEREF _Toc242175118 \h </w:instrText>
+          <w:instrText xml:space="preserve"> PAGEREF _Toc242176398 \h </w:instrText>
         </w:r>
         <w:r>
           <w:rPr>
@@ -8712,7 +8712,7 @@
       <w:r>
         <w:fldChar w:fldCharType="separate"/>
       </w:r>
-      <w:hyperlink w:anchor="_Toc242175119" w:history="1">
+      <w:hyperlink w:anchor="_Toc242176399" w:history="1">
         <w:r>
           <w:rPr>
             <w:rStyle w:val="Hyperlink"/>
@@ -8739,7 +8739,7 @@
             <w:noProof/>
             <w:webHidden/>
           </w:rPr>
-          <w:instrText xml:space="preserve"> PAGEREF _Toc242175119 \h </w:instrText>
+          <w:instrText xml:space="preserve"> PAGEREF _Toc242176399 \h </w:instrText>
         </w:r>
         <w:r>
           <w:rPr>
@@ -8786,7 +8786,7 @@
           <w14:ligatures w14:val="standardContextual"/>
         </w:rPr>
       </w:pPr>
-      <w:hyperlink w:anchor="_Toc242175120" w:history="1">
+      <w:hyperlink w:anchor="_Toc242176400" w:history="1">
         <w:r>
           <w:rPr>
             <w:rStyle w:val="Hyperlink"/>
@@ -8813,7 +8813,7 @@
             <w:noProof/>
             <w:webHidden/>
           </w:rPr>
-          <w:instrText xml:space="preserve"> PAGEREF _Toc242175120 \h </w:instrText>
+          <w:instrText xml:space="preserve"> PAGEREF _Toc242176400 \h </w:instrText>
         </w:r>
         <w:r>
           <w:rPr>
@@ -8860,7 +8860,7 @@
           <w14:ligatures w14:val="standardContextual"/>
         </w:rPr>
       </w:pPr>
-      <w:hyperlink w:anchor="_Toc242175121" w:history="1">
+      <w:hyperlink w:anchor="_Toc242176401" w:history="1">
         <w:r>
           <w:rPr>
             <w:rStyle w:val="Hyperlink"/>
@@ -8887,7 +8887,7 @@
             <w:noProof/>
             <w:webHidden/>
           </w:rPr>
-          <w:instrText xml:space="preserve"> PAGEREF _Toc242175121 \h </w:instrText>
+          <w:instrText xml:space="preserve"> PAGEREF _Toc242176401 \h </w:instrText>
         </w:r>
         <w:r>
           <w:rPr>
@@ -8934,7 +8934,7 @@
           <w14:ligatures w14:val="standardContextual"/>
         </w:rPr>
       </w:pPr>
-      <w:hyperlink w:anchor="_Toc242175122" w:history="1">
+      <w:hyperlink w:anchor="_Toc242176402" w:history="1">
         <w:r>
           <w:rPr>
             <w:rStyle w:val="Hyperlink"/>
@@ -8961,7 +8961,7 @@
             <w:noProof/>
             <w:webHidden/>
           </w:rPr>
-          <w:instrText xml:space="preserve"> PAGEREF _Toc242175122 \h </w:instrText>
+          <w:instrText xml:space="preserve"> PAGEREF _Toc242176402 \h </w:instrText>
         </w:r>
         <w:r>
           <w:rPr>
@@ -9008,7 +9008,7 @@
           <w14:ligatures w14:val="standardContextual"/>
         </w:rPr>
       </w:pPr>
-      <w:hyperlink w:anchor="_Toc242175123" w:history="1">
+      <w:hyperlink w:anchor="_Toc242176403" w:history="1">
         <w:r>
           <w:rPr>
             <w:rStyle w:val="Hyperlink"/>
@@ -9035,7 +9035,7 @@
             <w:noProof/>
             <w:webHidden/>
           </w:rPr>
-          <w:instrText xml:space="preserve"> PAGEREF _Toc242175123 \h </w:instrText>
+          <w:instrText xml:space="preserve"> PAGEREF _Toc242176403 \h </w:instrText>
         </w:r>
         <w:r>
           <w:rPr>
@@ -9082,7 +9082,7 @@
           <w14:ligatures w14:val="standardContextual"/>
         </w:rPr>
       </w:pPr>
-      <w:hyperlink w:anchor="_Toc242175124" w:history="1">
+      <w:hyperlink w:anchor="_Toc242176404" w:history="1">
         <w:r>
           <w:rPr>
             <w:rStyle w:val="Hyperlink"/>
@@ -9109,7 +9109,7 @@
             <w:noProof/>
             <w:webHidden/>
           </w:rPr>
-          <w:instrText xml:space="preserve"> PAGEREF _Toc242175124 \h </w:instrText>
+          <w:instrText xml:space="preserve"> PAGEREF _Toc242176404 \h </w:instrText>
         </w:r>
         <w:r>
           <w:rPr>
@@ -9156,7 +9156,7 @@
           <w14:ligatures w14:val="standardContextual"/>
         </w:rPr>
       </w:pPr>
-      <w:hyperlink w:anchor="_Toc242175125" w:history="1">
+      <w:hyperlink w:anchor="_Toc242176405" w:history="1">
         <w:r>
           <w:rPr>
             <w:rStyle w:val="Hyperlink"/>
@@ -9183,7 +9183,7 @@
             <w:noProof/>
             <w:webHidden/>
           </w:rPr>
-          <w:instrText xml:space="preserve"> PAGEREF _Toc242175125 \h </w:instrText>
+          <w:instrText xml:space="preserve"> PAGEREF _Toc242176405 \h </w:instrText>
         </w:r>
         <w:r>
           <w:rPr>
@@ -9230,7 +9230,7 @@
           <w14:ligatures w14:val="standardContextual"/>
         </w:rPr>
       </w:pPr>
-      <w:hyperlink w:anchor="_Toc242175126" w:history="1">
+      <w:hyperlink w:anchor="_Toc242176406" w:history="1">
         <w:r>
           <w:rPr>
             <w:rStyle w:val="Hyperlink"/>
@@ -9257,7 +9257,7 @@
             <w:noProof/>
             <w:webHidden/>
           </w:rPr>
-          <w:instrText xml:space="preserve"> PAGEREF _Toc242175126 \h </w:instrText>
+          <w:instrText xml:space="preserve"> PAGEREF _Toc242176406 \h </w:instrText>
         </w:r>
         <w:r>
           <w:rPr>
@@ -9304,7 +9304,7 @@
           <w14:ligatures w14:val="standardContextual"/>
         </w:rPr>
       </w:pPr>
-      <w:hyperlink w:anchor="_Toc242175127" w:history="1">
+      <w:hyperlink w:anchor="_Toc242176407" w:history="1">
         <w:r>
           <w:rPr>
             <w:rStyle w:val="Hyperlink"/>
@@ -9331,7 +9331,7 @@
             <w:noProof/>
             <w:webHidden/>
           </w:rPr>
-          <w:instrText xml:space="preserve"> PAGEREF _Toc242175127 \h </w:instrText>
+          <w:instrText xml:space="preserve"> PAGEREF _Toc242176407 \h </w:instrText>
         </w:r>
         <w:r>
           <w:rPr>
@@ -9378,7 +9378,7 @@
           <w14:ligatures w14:val="standardContextual"/>
         </w:rPr>
       </w:pPr>
-      <w:hyperlink w:anchor="_Toc242175128" w:history="1">
+      <w:hyperlink w:anchor="_Toc242176408" w:history="1">
         <w:r>
           <w:rPr>
             <w:rStyle w:val="Hyperlink"/>
@@ -9405,7 +9405,7 @@
             <w:noProof/>
             <w:webHidden/>
           </w:rPr>
-          <w:instrText xml:space="preserve"> PAGEREF _Toc242175128 \h </w:instrText>
+          <w:instrText xml:space="preserve"> PAGEREF _Toc242176408 \h </w:instrText>
         </w:r>
         <w:r>
           <w:rPr>
@@ -9452,7 +9452,7 @@
           <w14:ligatures w14:val="standardContextual"/>
         </w:rPr>
       </w:pPr>
-      <w:hyperlink w:anchor="_Toc242175129" w:history="1">
+      <w:hyperlink w:anchor="_Toc242176409" w:history="1">
         <w:r>
           <w:rPr>
             <w:rStyle w:val="Hyperlink"/>
@@ -9479,7 +9479,7 @@
             <w:noProof/>
             <w:webHidden/>
           </w:rPr>
-          <w:instrText xml:space="preserve"> PAGEREF _Toc242175129 \h </w:instrText>
+          <w:instrText xml:space="preserve"> PAGEREF _Toc242176409 \h </w:instrText>
         </w:r>
         <w:r>
           <w:rPr>
@@ -9526,7 +9526,7 @@
           <w14:ligatures w14:val="standardContextual"/>
         </w:rPr>
       </w:pPr>
-      <w:hyperlink w:anchor="_Toc242175130" w:history="1">
+      <w:hyperlink w:anchor="_Toc242176410" w:history="1">
         <w:r>
           <w:rPr>
             <w:rStyle w:val="Hyperlink"/>
@@ -9553,7 +9553,7 @@
             <w:noProof/>
             <w:webHidden/>
           </w:rPr>
-          <w:instrText xml:space="preserve"> PAGEREF _Toc242175130 \h </w:instrText>
+          <w:instrText xml:space="preserve"> PAGEREF _Toc242176410 \h </w:instrText>
         </w:r>
         <w:r>
           <w:rPr>
@@ -9600,7 +9600,7 @@
           <w14:ligatures w14:val="standardContextual"/>
         </w:rPr>
       </w:pPr>
-      <w:hyperlink w:anchor="_Toc242175131" w:history="1">
+      <w:hyperlink w:anchor="_Toc242176411" w:history="1">
         <w:r>
           <w:rPr>
             <w:rStyle w:val="Hyperlink"/>
@@ -9627,7 +9627,7 @@
             <w:noProof/>
             <w:webHidden/>
           </w:rPr>
-          <w:instrText xml:space="preserve"> PAGEREF _Toc242175131 \h </w:instrText>
+          <w:instrText xml:space="preserve"> PAGEREF _Toc242176411 \h </w:instrText>
         </w:r>
         <w:r>
           <w:rPr>
@@ -9674,7 +9674,7 @@
           <w14:ligatures w14:val="standardContextual"/>
         </w:rPr>
       </w:pPr>
-      <w:hyperlink w:anchor="_Toc242175132" w:history="1">
+      <w:hyperlink w:anchor="_Toc242176412" w:history="1">
         <w:r>
           <w:rPr>
             <w:rStyle w:val="Hyperlink"/>
@@ -9701,7 +9701,7 @@
             <w:noProof/>
             <w:webHidden/>
           </w:rPr>
-          <w:instrText xml:space="preserve"> PAGEREF _Toc242175132 \h </w:instrText>
+          <w:instrText xml:space="preserve"> PAGEREF _Toc242176412 \h </w:instrText>
         </w:r>
         <w:r>
           <w:rPr>
@@ -9748,7 +9748,7 @@
           <w14:ligatures w14:val="standardContextual"/>
         </w:rPr>
       </w:pPr>
-      <w:hyperlink w:anchor="_Toc242175133" w:history="1">
+      <w:hyperlink w:anchor="_Toc242176413" w:history="1">
         <w:r>
           <w:rPr>
             <w:rStyle w:val="Hyperlink"/>
@@ -9775,7 +9775,7 @@
             <w:noProof/>
             <w:webHidden/>
           </w:rPr>
-          <w:instrText xml:space="preserve"> PAGEREF _Toc242175133 \h </w:instrText>
+          <w:instrText xml:space="preserve"> PAGEREF _Toc242176413 \h </w:instrText>
         </w:r>
         <w:r>
           <w:rPr>
@@ -9816,7 +9816,7 @@
         <w:pStyle w:val="Heading1"/>
         <w:pageBreakBefore/>
       </w:pPr>
-      <w:bookmarkStart w:id="0" w:name="_Toc242175021"/>
+      <w:bookmarkStart w:id="0" w:name="_Toc242176301"/>
       <w:r>
         <w:lastRenderedPageBreak/>
         <w:t>CHƯƠNG 1. GIỚI THIỆU</w:t>
@@ -9827,7 +9827,7 @@
       <w:pPr>
         <w:pStyle w:val="Heading2"/>
       </w:pPr>
-      <w:bookmarkStart w:id="1" w:name="_Toc242175022"/>
+      <w:bookmarkStart w:id="1" w:name="_Toc242176302"/>
       <w:r>
         <w:t>1.1. Mục đích của tài liệu</w:t>
       </w:r>
@@ -9874,7 +9874,7 @@
       <w:pPr>
         <w:pStyle w:val="Heading2"/>
       </w:pPr>
-      <w:bookmarkStart w:id="2" w:name="_Toc242175023"/>
+      <w:bookmarkStart w:id="2" w:name="_Toc242176303"/>
       <w:r>
         <w:t>1.2. Tổng quan phần mềm</w:t>
       </w:r>
@@ -10021,7 +10021,7 @@
       <w:pPr>
         <w:pStyle w:val="Heading2"/>
       </w:pPr>
-      <w:bookmarkStart w:id="3" w:name="_Toc242175024"/>
+      <w:bookmarkStart w:id="3" w:name="_Toc242176304"/>
       <w:r>
         <w:t>1.3. Vai trò người dùng và chức năng</w:t>
       </w:r>
@@ -10059,7 +10059,7 @@
       <w:pPr>
         <w:pStyle w:val="TableCaption"/>
       </w:pPr>
-      <w:bookmarkStart w:id="4" w:name="_Toc242175119"/>
+      <w:bookmarkStart w:id="4" w:name="_Toc242176399"/>
       <w:r>
         <w:t>Bảng 1.1. Chức năng hiển thị theo vai trò</w:t>
       </w:r>
@@ -14262,7 +14262,7 @@
       <w:pPr>
         <w:pStyle w:val="Heading2"/>
       </w:pPr>
-      <w:bookmarkStart w:id="5" w:name="_Toc242175025"/>
+      <w:bookmarkStart w:id="5" w:name="_Toc242176305"/>
       <w:r>
         <w:t>1.4. Yêu cầu hệ thống</w:t>
       </w:r>
@@ -14272,7 +14272,7 @@
       <w:pPr>
         <w:pStyle w:val="TableCaption"/>
       </w:pPr>
-      <w:bookmarkStart w:id="6" w:name="_Toc242175120"/>
+      <w:bookmarkStart w:id="6" w:name="_Toc242176400"/>
       <w:r>
         <w:t>Bảng 1.2. Yêu cầu phần cứng và phần mềm</w:t>
       </w:r>
@@ -14544,7 +14544,7 @@
               <w:rPr>
                 <w:sz w:val="21"/>
               </w:rPr>
-              <w:t>SQL Server 2022 chạy trong Docker Desktop</w:t>
+              <w:t>SQL Server 2025 chạy trong Docker Desktop</w:t>
             </w:r>
           </w:p>
         </w:tc>
@@ -14864,7 +14864,7 @@
       <w:pPr>
         <w:pStyle w:val="Heading2"/>
       </w:pPr>
-      <w:bookmarkStart w:id="7" w:name="_Toc242175026"/>
+      <w:bookmarkStart w:id="7" w:name="_Toc242176306"/>
       <w:r>
         <w:t>1.5. Các bước cài đặt tổng quát</w:t>
       </w:r>
@@ -15016,7 +15016,7 @@
       <w:pPr>
         <w:pStyle w:val="TableCaption"/>
       </w:pPr>
-      <w:bookmarkStart w:id="8" w:name="_Toc242175121"/>
+      <w:bookmarkStart w:id="8" w:name="_Toc242176401"/>
       <w:r>
         <w:t>Bảng 1.3. Chọn phương án SQL Server theo máy</w:t>
       </w:r>
@@ -15620,7 +15620,7 @@
       <w:pPr>
         <w:pStyle w:val="Heading2"/>
       </w:pPr>
-      <w:bookmarkStart w:id="9" w:name="_Toc242175027"/>
+      <w:bookmarkStart w:id="9" w:name="_Toc242176307"/>
       <w:r>
         <w:t>1.6. Quy ước trình bày</w:t>
       </w:r>
@@ -15869,7 +15869,7 @@
         <w:pStyle w:val="Heading1"/>
         <w:pageBreakBefore/>
       </w:pPr>
-      <w:bookmarkStart w:id="10" w:name="_Toc242175028"/>
+      <w:bookmarkStart w:id="10" w:name="_Toc242176308"/>
       <w:r>
         <w:lastRenderedPageBreak/>
         <w:t>CHƯƠNG 2. CÀI ĐẶT SQL SERVER VÀ KHỞI TẠO CƠ SỞ DỮ LIỆU</w:t>
@@ -15926,7 +15926,7 @@
       <w:pPr>
         <w:pStyle w:val="Heading2"/>
       </w:pPr>
-      <w:bookmarkStart w:id="11" w:name="_Toc242175029"/>
+      <w:bookmarkStart w:id="11" w:name="_Toc242176309"/>
       <w:r>
         <w:t>2.1. Tải mã nguồn</w:t>
       </w:r>
@@ -16047,7 +16047,7 @@
       <w:pPr>
         <w:pStyle w:val="Heading2"/>
       </w:pPr>
-      <w:bookmarkStart w:id="12" w:name="_Toc242175030"/>
+      <w:bookmarkStart w:id="12" w:name="_Toc242176310"/>
       <w:r>
         <w:t>2.2. Phương án A - SQL Server trong Docker</w:t>
       </w:r>
@@ -16057,7 +16057,7 @@
       <w:pPr>
         <w:pStyle w:val="Heading3"/>
       </w:pPr>
-      <w:bookmarkStart w:id="13" w:name="_Toc242175031"/>
+      <w:bookmarkStart w:id="13" w:name="_Toc242176311"/>
       <w:r>
         <w:t>2.2.1. Cài Docker Desktop</w:t>
       </w:r>
@@ -16399,7 +16399,7 @@
       <w:pPr>
         <w:pStyle w:val="Heading3"/>
       </w:pPr>
-      <w:bookmarkStart w:id="14" w:name="_Toc242175032"/>
+      <w:bookmarkStart w:id="14" w:name="_Toc242176312"/>
       <w:r>
         <w:t>2.2.2. Khởi động SQL Server</w:t>
       </w:r>
@@ -16421,7 +16421,7 @@
         <w:t>docker-compose.yml</w:t>
       </w:r>
       <w:r>
-        <w:t xml:space="preserve"> mô tả container SQL Server 2022 tên </w:t>
+        <w:t xml:space="preserve"> mô tả container SQL Server 2025 tên </w:t>
       </w:r>
       <w:r>
         <w:rPr>
@@ -16827,7 +16827,7 @@
       <w:pPr>
         <w:pStyle w:val="Heading3"/>
       </w:pPr>
-      <w:bookmarkStart w:id="15" w:name="_Toc242175033"/>
+      <w:bookmarkStart w:id="15" w:name="_Toc242176313"/>
       <w:r>
         <w:t>2.2.3. Khởi tạo CSDL</w:t>
       </w:r>
@@ -17259,7 +17259,7 @@
       <w:pPr>
         <w:pStyle w:val="Heading3"/>
       </w:pPr>
-      <w:bookmarkStart w:id="16" w:name="_Toc242175034"/>
+      <w:bookmarkStart w:id="16" w:name="_Toc242176314"/>
       <w:r>
         <w:t>2.2.4. Bật, tắt SQL Server hằng ngày</w:t>
       </w:r>
@@ -17269,7 +17269,7 @@
       <w:pPr>
         <w:pStyle w:val="TableCaption"/>
       </w:pPr>
-      <w:bookmarkStart w:id="17" w:name="_Toc242175122"/>
+      <w:bookmarkStart w:id="17" w:name="_Toc242176402"/>
       <w:r>
         <w:t>Bảng 2.1. Các lệnh Docker thường dùng</w:t>
       </w:r>
@@ -17686,7 +17686,7 @@
       <w:pPr>
         <w:pStyle w:val="Heading2"/>
       </w:pPr>
-      <w:bookmarkStart w:id="18" w:name="_Toc242175035"/>
+      <w:bookmarkStart w:id="18" w:name="_Toc242176315"/>
       <w:r>
         <w:t>2.3. Phương án B - SQL Server cài trực tiếp trên Windows</w:t>
       </w:r>
@@ -17696,7 +17696,7 @@
       <w:pPr>
         <w:pStyle w:val="Heading3"/>
       </w:pPr>
-      <w:bookmarkStart w:id="19" w:name="_Toc242175036"/>
+      <w:bookmarkStart w:id="19" w:name="_Toc242176316"/>
       <w:r>
         <w:t>2.3.1. Cài SQL Server</w:t>
       </w:r>
@@ -18483,7 +18483,7 @@
       <w:pPr>
         <w:pStyle w:val="Heading3"/>
       </w:pPr>
-      <w:bookmarkStart w:id="20" w:name="_Toc242175037"/>
+      <w:bookmarkStart w:id="20" w:name="_Toc242176317"/>
       <w:r>
         <w:lastRenderedPageBreak/>
         <w:t>2.3.2. Cài công cụ quản trị và driver</w:t>
@@ -18674,7 +18674,7 @@
       <w:pPr>
         <w:pStyle w:val="Heading3"/>
       </w:pPr>
-      <w:bookmarkStart w:id="21" w:name="_Toc242175038"/>
+      <w:bookmarkStart w:id="21" w:name="_Toc242176318"/>
       <w:r>
         <w:t>2.3.3. Bật kết nối TCP/IP</w:t>
       </w:r>
@@ -19075,7 +19075,7 @@
       <w:pPr>
         <w:pStyle w:val="Heading3"/>
       </w:pPr>
-      <w:bookmarkStart w:id="22" w:name="_Toc242175039"/>
+      <w:bookmarkStart w:id="22" w:name="_Toc242176319"/>
       <w:r>
         <w:t>2.3.4. Khởi tạo CSDL</w:t>
       </w:r>
@@ -19625,7 +19625,7 @@
       <w:pPr>
         <w:pStyle w:val="Heading3"/>
       </w:pPr>
-      <w:bookmarkStart w:id="23" w:name="_Toc242175040"/>
+      <w:bookmarkStart w:id="23" w:name="_Toc242176320"/>
       <w:r>
         <w:lastRenderedPageBreak/>
         <w:t>2.3.5. Cho máy khác kết nối tới (không bắt buộc)</w:t>
@@ -19718,7 +19718,7 @@
       <w:pPr>
         <w:pStyle w:val="Heading2"/>
       </w:pPr>
-      <w:bookmarkStart w:id="24" w:name="_Toc242175041"/>
+      <w:bookmarkStart w:id="24" w:name="_Toc242176321"/>
       <w:r>
         <w:t>2.4. Nạp lại dữ liệu mẫu trước buổi demo</w:t>
       </w:r>
@@ -19830,7 +19830,7 @@
         <w:pStyle w:val="Heading1"/>
         <w:pageBreakBefore/>
       </w:pPr>
-      <w:bookmarkStart w:id="25" w:name="_Toc242175042"/>
+      <w:bookmarkStart w:id="25" w:name="_Toc242176322"/>
       <w:r>
         <w:lastRenderedPageBreak/>
         <w:t>CHƯƠNG 3. CÀI ĐẶT ỨNG DỤNG</w:t>
@@ -19841,7 +19841,7 @@
       <w:pPr>
         <w:pStyle w:val="Heading2"/>
       </w:pPr>
-      <w:bookmarkStart w:id="26" w:name="_Toc242175043"/>
+      <w:bookmarkStart w:id="26" w:name="_Toc242176323"/>
       <w:r>
         <w:t>3.1. Tải bộ cài</w:t>
       </w:r>
@@ -19879,7 +19879,7 @@
       <w:pPr>
         <w:pStyle w:val="TableCaption"/>
       </w:pPr>
-      <w:bookmarkStart w:id="27" w:name="_Toc242175123"/>
+      <w:bookmarkStart w:id="27" w:name="_Toc242176403"/>
       <w:r>
         <w:t>Bảng 3.1. Các file cài đặt</w:t>
       </w:r>
@@ -20322,7 +20322,7 @@
       <w:pPr>
         <w:pStyle w:val="Heading2"/>
       </w:pPr>
-      <w:bookmarkStart w:id="28" w:name="_Toc242175044"/>
+      <w:bookmarkStart w:id="28" w:name="_Toc242176324"/>
       <w:r>
         <w:t>3.2. Cài đặt trên macOS</w:t>
       </w:r>
@@ -20723,7 +20723,7 @@
       <w:pPr>
         <w:pStyle w:val="Heading2"/>
       </w:pPr>
-      <w:bookmarkStart w:id="29" w:name="_Toc242175045"/>
+      <w:bookmarkStart w:id="29" w:name="_Toc242176325"/>
       <w:r>
         <w:t>3.3. Cài đặt trên Windows</w:t>
       </w:r>
@@ -20733,7 +20733,7 @@
       <w:pPr>
         <w:pStyle w:val="Heading3"/>
       </w:pPr>
-      <w:bookmarkStart w:id="30" w:name="_Toc242175046"/>
+      <w:bookmarkStart w:id="30" w:name="_Toc242176326"/>
       <w:r>
         <w:t>3.3.1. Dùng bộ cài setup.exe</w:t>
       </w:r>
@@ -21179,7 +21179,7 @@
         </w:rPr>
         <w:lastRenderedPageBreak/>
         <w:drawing>
-          <wp:inline distT="0" distB="0" distL="0" distR="0" wp14:anchorId="28FC8A46" wp14:editId="7B517512">
+          <wp:inline distT="0" distB="0" distL="0" distR="0" wp14:anchorId="44A71E29" wp14:editId="5A3CE39C">
             <wp:extent cx="3420000" cy="3198254"/>
             <wp:effectExtent l="0" t="0" r="0" b="0"/>
             <wp:docPr id="522444761" name="Picture 522444761"/>
@@ -21219,7 +21219,7 @@
       <w:pPr>
         <w:pStyle w:val="FigureCaption"/>
       </w:pPr>
-      <w:bookmarkStart w:id="31" w:name="_Toc242175094"/>
+      <w:bookmarkStart w:id="31" w:name="_Toc242176374"/>
       <w:r>
         <w:t>Hình 3.1. Cảnh báo SmartScreen khi chạy bộ cài</w:t>
       </w:r>
@@ -21236,7 +21236,7 @@
           <w:noProof/>
         </w:rPr>
         <w:drawing>
-          <wp:inline distT="0" distB="0" distL="0" distR="0" wp14:anchorId="7F0524FA" wp14:editId="03688B2D">
+          <wp:inline distT="0" distB="0" distL="0" distR="0" wp14:anchorId="6CF4B3E8" wp14:editId="02A6BC21">
             <wp:extent cx="4500000" cy="3458417"/>
             <wp:effectExtent l="0" t="0" r="0" b="0"/>
             <wp:docPr id="522444762" name="Picture 522444762"/>
@@ -21276,7 +21276,7 @@
       <w:pPr>
         <w:pStyle w:val="FigureCaption"/>
       </w:pPr>
-      <w:bookmarkStart w:id="32" w:name="_Toc242175095"/>
+      <w:bookmarkStart w:id="32" w:name="_Toc242176375"/>
       <w:r>
         <w:t>Hình 3.2. Bước cuối của bộ cài QLTTTA trên Windows</w:t>
       </w:r>
@@ -21286,7 +21286,7 @@
       <w:pPr>
         <w:pStyle w:val="Heading3"/>
       </w:pPr>
-      <w:bookmarkStart w:id="33" w:name="_Toc242175047"/>
+      <w:bookmarkStart w:id="33" w:name="_Toc242176327"/>
       <w:r>
         <w:t>3.3.2. Dùng bản portable</w:t>
       </w:r>
@@ -21333,7 +21333,7 @@
       <w:pPr>
         <w:pStyle w:val="Heading3"/>
       </w:pPr>
-      <w:bookmarkStart w:id="34" w:name="_Toc242175048"/>
+      <w:bookmarkStart w:id="34" w:name="_Toc242176328"/>
       <w:r>
         <w:lastRenderedPageBreak/>
         <w:t>3.3.3. Driver kết nối</w:t>
@@ -21390,7 +21390,7 @@
       <w:pPr>
         <w:pStyle w:val="Heading2"/>
       </w:pPr>
-      <w:bookmarkStart w:id="35" w:name="_Toc242175049"/>
+      <w:bookmarkStart w:id="35" w:name="_Toc242176329"/>
       <w:r>
         <w:t>3.4. Nơi lưu cấu hình và gỡ cài đặt</w:t>
       </w:r>
@@ -21410,7 +21410,7 @@
       <w:pPr>
         <w:pStyle w:val="TableCaption"/>
       </w:pPr>
-      <w:bookmarkStart w:id="36" w:name="_Toc242175124"/>
+      <w:bookmarkStart w:id="36" w:name="_Toc242176404"/>
       <w:r>
         <w:t>Bảng 3.2. Cấu hình đã lưu và cách gỡ ứng dụng</w:t>
       </w:r>
@@ -21979,7 +21979,7 @@
       <w:pPr>
         <w:pStyle w:val="Heading2"/>
       </w:pPr>
-      <w:bookmarkStart w:id="37" w:name="_Toc242175050"/>
+      <w:bookmarkStart w:id="37" w:name="_Toc242176330"/>
       <w:r>
         <w:t>3.5. Chạy từ mã nguồn (dành cho nhóm phát triển)</w:t>
       </w:r>
@@ -22512,7 +22512,7 @@
         <w:pStyle w:val="Heading1"/>
         <w:pageBreakBefore/>
       </w:pPr>
-      <w:bookmarkStart w:id="38" w:name="_Toc242175051"/>
+      <w:bookmarkStart w:id="38" w:name="_Toc242176331"/>
       <w:r>
         <w:lastRenderedPageBreak/>
         <w:t>CHƯƠNG 4. ĐĂNG NHẬP VÀ GIAO DIỆN CHUNG</w:t>
@@ -22523,7 +22523,7 @@
       <w:pPr>
         <w:pStyle w:val="Heading2"/>
       </w:pPr>
-      <w:bookmarkStart w:id="39" w:name="_Toc242175052"/>
+      <w:bookmarkStart w:id="39" w:name="_Toc242176332"/>
       <w:r>
         <w:t>4.1. Mở ứng dụng</w:t>
       </w:r>
@@ -22680,7 +22680,7 @@
           <w:noProof/>
         </w:rPr>
         <w:drawing>
-          <wp:inline distT="0" distB="0" distL="0" distR="0" wp14:anchorId="5CAFF6AB" wp14:editId="6596D63C">
+          <wp:inline distT="0" distB="0" distL="0" distR="0" wp14:anchorId="518BE03B" wp14:editId="7E2611A5">
             <wp:extent cx="4860000" cy="2938605"/>
             <wp:effectExtent l="0" t="0" r="0" b="0"/>
             <wp:docPr id="522444763" name="Picture 522444763"/>
@@ -22720,7 +22720,7 @@
       <w:pPr>
         <w:pStyle w:val="FigureCaption"/>
       </w:pPr>
-      <w:bookmarkStart w:id="40" w:name="_Toc242175096"/>
+      <w:bookmarkStart w:id="40" w:name="_Toc242176376"/>
       <w:r>
         <w:t>Hình 4.1. Màn hình đăng nhập</w:t>
       </w:r>
@@ -22730,7 +22730,7 @@
       <w:pPr>
         <w:pStyle w:val="Heading2"/>
       </w:pPr>
-      <w:bookmarkStart w:id="41" w:name="_Toc242175053"/>
+      <w:bookmarkStart w:id="41" w:name="_Toc242176333"/>
       <w:r>
         <w:t>4.2. Cấu hình máy chủ (lần chạy đầu tiên)</w:t>
       </w:r>
@@ -22881,7 +22881,7 @@
         </w:rPr>
         <w:lastRenderedPageBreak/>
         <w:drawing>
-          <wp:inline distT="0" distB="0" distL="0" distR="0" wp14:anchorId="66A5AD03" wp14:editId="7CEB3789">
+          <wp:inline distT="0" distB="0" distL="0" distR="0" wp14:anchorId="157FF276" wp14:editId="68855495">
             <wp:extent cx="5040000" cy="3360000"/>
             <wp:effectExtent l="0" t="0" r="0" b="0"/>
             <wp:docPr id="522444764" name="Picture 522444764"/>
@@ -22921,7 +22921,7 @@
       <w:pPr>
         <w:pStyle w:val="FigureCaption"/>
       </w:pPr>
-      <w:bookmarkStart w:id="42" w:name="_Toc242175097"/>
+      <w:bookmarkStart w:id="42" w:name="_Toc242176377"/>
       <w:r>
         <w:t>Hình 4.2. Khung cấu hình máy chủ SQL Server</w:t>
       </w:r>
@@ -22931,7 +22931,7 @@
       <w:pPr>
         <w:pStyle w:val="TableCaption"/>
       </w:pPr>
-      <w:bookmarkStart w:id="43" w:name="_Toc242175125"/>
+      <w:bookmarkStart w:id="43" w:name="_Toc242176405"/>
       <w:r>
         <w:t>Bảng 4.1. Giá trị ô Máy chủ theo cách cài SQL Server</w:t>
       </w:r>
@@ -23371,7 +23371,7 @@
       <w:pPr>
         <w:pStyle w:val="Heading2"/>
       </w:pPr>
-      <w:bookmarkStart w:id="44" w:name="_Toc242175054"/>
+      <w:bookmarkStart w:id="44" w:name="_Toc242176334"/>
       <w:r>
         <w:t>4.3. Đăng nhập</w:t>
       </w:r>
@@ -23445,7 +23445,7 @@
       <w:pPr>
         <w:pStyle w:val="TableCaption"/>
       </w:pPr>
-      <w:bookmarkStart w:id="45" w:name="_Toc242175126"/>
+      <w:bookmarkStart w:id="45" w:name="_Toc242176406"/>
       <w:r>
         <w:t>Bảng 4.2. Tài khoản demo trong dữ liệu mẫu</w:t>
       </w:r>
@@ -24771,7 +24771,7 @@
       <w:pPr>
         <w:pStyle w:val="TableCaption"/>
       </w:pPr>
-      <w:bookmarkStart w:id="46" w:name="_Toc242175127"/>
+      <w:bookmarkStart w:id="46" w:name="_Toc242176407"/>
       <w:r>
         <w:t>Bảng 4.3. Thông báo lỗi khi đăng nhập</w:t>
       </w:r>
@@ -25195,7 +25195,7 @@
       <w:pPr>
         <w:pStyle w:val="Heading2"/>
       </w:pPr>
-      <w:bookmarkStart w:id="47" w:name="_Toc242175055"/>
+      <w:bookmarkStart w:id="47" w:name="_Toc242176335"/>
       <w:r>
         <w:t>4.4. Màn hình chính</w:t>
       </w:r>
@@ -25355,7 +25355,7 @@
           <w:noProof/>
         </w:rPr>
         <w:drawing>
-          <wp:inline distT="0" distB="0" distL="0" distR="0" wp14:anchorId="66BE6EBD" wp14:editId="32AB3F1F">
+          <wp:inline distT="0" distB="0" distL="0" distR="0" wp14:anchorId="5E0ACF6A" wp14:editId="5FC3F5F0">
             <wp:extent cx="5580000" cy="3332500"/>
             <wp:effectExtent l="0" t="0" r="0" b="0"/>
             <wp:docPr id="522444765" name="Picture 522444765"/>
@@ -25395,7 +25395,7 @@
       <w:pPr>
         <w:pStyle w:val="FigureCaption"/>
       </w:pPr>
-      <w:bookmarkStart w:id="48" w:name="_Toc242175098"/>
+      <w:bookmarkStart w:id="48" w:name="_Toc242176378"/>
       <w:r>
         <w:t>Hình 4.3. Màn hình chính của vai trò Quản lý (trang Tổng quan)</w:t>
       </w:r>
@@ -25405,7 +25405,7 @@
       <w:pPr>
         <w:pStyle w:val="Heading2"/>
       </w:pPr>
-      <w:bookmarkStart w:id="49" w:name="_Toc242175056"/>
+      <w:bookmarkStart w:id="49" w:name="_Toc242176336"/>
       <w:r>
         <w:t>4.5. Đổi ngôn ngữ giao diện</w:t>
       </w:r>
@@ -25443,7 +25443,7 @@
       <w:pPr>
         <w:pStyle w:val="Heading2"/>
       </w:pPr>
-      <w:bookmarkStart w:id="50" w:name="_Toc242175057"/>
+      <w:bookmarkStart w:id="50" w:name="_Toc242176337"/>
       <w:r>
         <w:t>4.6. Đổi mật khẩu</w:t>
       </w:r>
@@ -25559,7 +25559,7 @@
           <w:noProof/>
         </w:rPr>
         <w:drawing>
-          <wp:inline distT="0" distB="0" distL="0" distR="0" wp14:anchorId="6EA168C4" wp14:editId="413D259B">
+          <wp:inline distT="0" distB="0" distL="0" distR="0" wp14:anchorId="7BBEEF9F" wp14:editId="66FB9521">
             <wp:extent cx="3420000" cy="1368000"/>
             <wp:effectExtent l="0" t="0" r="0" b="0"/>
             <wp:docPr id="522444766" name="Picture 522444766"/>
@@ -25599,7 +25599,7 @@
       <w:pPr>
         <w:pStyle w:val="FigureCaption"/>
       </w:pPr>
-      <w:bookmarkStart w:id="51" w:name="_Toc242175099"/>
+      <w:bookmarkStart w:id="51" w:name="_Toc242176379"/>
       <w:r>
         <w:t>Hình 4.4. Hộp thoại đổi mật khẩu</w:t>
       </w:r>
@@ -25641,7 +25641,7 @@
       <w:pPr>
         <w:pStyle w:val="Heading2"/>
       </w:pPr>
-      <w:bookmarkStart w:id="52" w:name="_Toc242175058"/>
+      <w:bookmarkStart w:id="52" w:name="_Toc242176338"/>
       <w:r>
         <w:t>4.7. Đăng xuất và thoát</w:t>
       </w:r>
@@ -25688,7 +25688,7 @@
       <w:pPr>
         <w:pStyle w:val="Heading2"/>
       </w:pPr>
-      <w:bookmarkStart w:id="53" w:name="_Toc242175059"/>
+      <w:bookmarkStart w:id="53" w:name="_Toc242176339"/>
       <w:r>
         <w:t>4.8. Thao tác chung trên các màn hình danh sách</w:t>
       </w:r>
@@ -25715,7 +25715,7 @@
           <w:noProof/>
         </w:rPr>
         <w:drawing>
-          <wp:inline distT="0" distB="0" distL="0" distR="0" wp14:anchorId="61D895A1" wp14:editId="4CF13806">
+          <wp:inline distT="0" distB="0" distL="0" distR="0" wp14:anchorId="5C950241" wp14:editId="5B846DB3">
             <wp:extent cx="5580000" cy="3332500"/>
             <wp:effectExtent l="0" t="0" r="0" b="0"/>
             <wp:docPr id="522444767" name="Picture 522444767"/>
@@ -25755,7 +25755,7 @@
       <w:pPr>
         <w:pStyle w:val="FigureCaption"/>
       </w:pPr>
-      <w:bookmarkStart w:id="54" w:name="_Toc242175100"/>
+      <w:bookmarkStart w:id="54" w:name="_Toc242176380"/>
       <w:r>
         <w:t>Hình 4.5. Một màn hình danh sách: Công nợ học phí</w:t>
       </w:r>
@@ -25765,7 +25765,7 @@
       <w:pPr>
         <w:pStyle w:val="TableCaption"/>
       </w:pPr>
-      <w:bookmarkStart w:id="55" w:name="_Toc242175128"/>
+      <w:bookmarkStart w:id="55" w:name="_Toc242176408"/>
       <w:r>
         <w:t>Bảng 4.4. Các thành phần của màn hình danh sách</w:t>
       </w:r>
@@ -26620,7 +26620,7 @@
       <w:pPr>
         <w:pStyle w:val="Heading2"/>
       </w:pPr>
-      <w:bookmarkStart w:id="56" w:name="_Toc242175060"/>
+      <w:bookmarkStart w:id="56" w:name="_Toc242176340"/>
       <w:r>
         <w:t>4.9. Form nhập liệu và hộp xác nhận</w:t>
       </w:r>
@@ -26783,7 +26783,7 @@
         <w:pStyle w:val="Heading1"/>
         <w:pageBreakBefore/>
       </w:pPr>
-      <w:bookmarkStart w:id="57" w:name="_Toc242175061"/>
+      <w:bookmarkStart w:id="57" w:name="_Toc242176341"/>
       <w:r>
         <w:lastRenderedPageBreak/>
         <w:t>CHƯƠNG 5. HƯỚNG DẪN THEO CHỨC NĂNG</w:t>
@@ -26804,7 +26804,7 @@
       <w:pPr>
         <w:pStyle w:val="Heading2"/>
       </w:pPr>
-      <w:bookmarkStart w:id="58" w:name="_Toc242175062"/>
+      <w:bookmarkStart w:id="58" w:name="_Toc242176342"/>
       <w:r>
         <w:t>5.1. Tổng quan</w:t>
       </w:r>
@@ -26848,7 +26848,7 @@
       <w:pPr>
         <w:pStyle w:val="TableCaption"/>
       </w:pPr>
-      <w:bookmarkStart w:id="59" w:name="_Toc242175129"/>
+      <w:bookmarkStart w:id="59" w:name="_Toc242176409"/>
       <w:r>
         <w:t>Bảng 5.1. Các thẻ số liệu trên trang Tổng quan</w:t>
       </w:r>
@@ -27330,7 +27330,7 @@
           <w:noProof/>
         </w:rPr>
         <w:drawing>
-          <wp:inline distT="0" distB="0" distL="0" distR="0" wp14:anchorId="5CFF25A7" wp14:editId="435471F3">
+          <wp:inline distT="0" distB="0" distL="0" distR="0" wp14:anchorId="02715010" wp14:editId="501915BB">
             <wp:extent cx="5580000" cy="3332500"/>
             <wp:effectExtent l="0" t="0" r="0" b="0"/>
             <wp:docPr id="522444768" name="Picture 522444768"/>
@@ -27370,7 +27370,7 @@
       <w:pPr>
         <w:pStyle w:val="FigureCaption"/>
       </w:pPr>
-      <w:bookmarkStart w:id="60" w:name="_Toc242175101"/>
+      <w:bookmarkStart w:id="60" w:name="_Toc242176381"/>
       <w:r>
         <w:t>Hình 5.1. Trang Tổng quan của Giáo vụ: không có quyền xem doanh thu</w:t>
       </w:r>
@@ -27380,7 +27380,7 @@
       <w:pPr>
         <w:pStyle w:val="Heading2"/>
       </w:pPr>
-      <w:bookmarkStart w:id="61" w:name="_Toc242175063"/>
+      <w:bookmarkStart w:id="61" w:name="_Toc242176343"/>
       <w:r>
         <w:lastRenderedPageBreak/>
         <w:t>5.2. Học viên</w:t>
@@ -27414,7 +27414,7 @@
           <w:noProof/>
         </w:rPr>
         <w:drawing>
-          <wp:inline distT="0" distB="0" distL="0" distR="0" wp14:anchorId="19A461E7" wp14:editId="524CA09A">
+          <wp:inline distT="0" distB="0" distL="0" distR="0" wp14:anchorId="6D638F4F" wp14:editId="1F7DBB85">
             <wp:extent cx="5580000" cy="3332500"/>
             <wp:effectExtent l="0" t="0" r="0" b="0"/>
             <wp:docPr id="522444769" name="Picture 522444769"/>
@@ -27454,7 +27454,7 @@
       <w:pPr>
         <w:pStyle w:val="FigureCaption"/>
       </w:pPr>
-      <w:bookmarkStart w:id="62" w:name="_Toc242175102"/>
+      <w:bookmarkStart w:id="62" w:name="_Toc242176382"/>
       <w:r>
         <w:t>Hình 5.2. Danh sách học viên</w:t>
       </w:r>
@@ -27464,7 +27464,7 @@
       <w:pPr>
         <w:pStyle w:val="Heading3"/>
       </w:pPr>
-      <w:bookmarkStart w:id="63" w:name="_Toc242175064"/>
+      <w:bookmarkStart w:id="63" w:name="_Toc242176344"/>
       <w:r>
         <w:t>5.2.1. Tìm kiếm</w:t>
       </w:r>
@@ -27561,7 +27561,7 @@
       <w:pPr>
         <w:pStyle w:val="Heading3"/>
       </w:pPr>
-      <w:bookmarkStart w:id="64" w:name="_Toc242175065"/>
+      <w:bookmarkStart w:id="64" w:name="_Toc242176345"/>
       <w:r>
         <w:t>5.2.2. Thêm học viên</w:t>
       </w:r>
@@ -27766,7 +27766,7 @@
       <w:pPr>
         <w:pStyle w:val="Heading3"/>
       </w:pPr>
-      <w:bookmarkStart w:id="65" w:name="_Toc242175066"/>
+      <w:bookmarkStart w:id="65" w:name="_Toc242176346"/>
       <w:r>
         <w:t>5.2.3. Sửa thông tin</w:t>
       </w:r>
@@ -27887,7 +27887,7 @@
           <w:noProof/>
         </w:rPr>
         <w:drawing>
-          <wp:inline distT="0" distB="0" distL="0" distR="0" wp14:anchorId="60BA0AEF" wp14:editId="5C426E9B">
+          <wp:inline distT="0" distB="0" distL="0" distR="0" wp14:anchorId="358F8D7F" wp14:editId="5F34131B">
             <wp:extent cx="3780000" cy="5048129"/>
             <wp:effectExtent l="0" t="0" r="0" b="0"/>
             <wp:docPr id="522444770" name="Picture 522444770"/>
@@ -27927,7 +27927,7 @@
       <w:pPr>
         <w:pStyle w:val="FigureCaption"/>
       </w:pPr>
-      <w:bookmarkStart w:id="66" w:name="_Toc242175103"/>
+      <w:bookmarkStart w:id="66" w:name="_Toc242176383"/>
       <w:r>
         <w:t>Hình 5.3. Hộp thoại sửa thông tin học viên</w:t>
       </w:r>
@@ -27947,7 +27947,7 @@
       <w:pPr>
         <w:pStyle w:val="TableCaption"/>
       </w:pPr>
-      <w:bookmarkStart w:id="67" w:name="_Toc242175130"/>
+      <w:bookmarkStart w:id="67" w:name="_Toc242176410"/>
       <w:r>
         <w:t>Bảng 5.2. Quy tắc kiểm tra thông tin học viên</w:t>
       </w:r>
@@ -28611,7 +28611,7 @@
       <w:pPr>
         <w:pStyle w:val="Heading3"/>
       </w:pPr>
-      <w:bookmarkStart w:id="68" w:name="_Toc242175067"/>
+      <w:bookmarkStart w:id="68" w:name="_Toc242176347"/>
       <w:r>
         <w:t>5.2.4. Xóa học viên</w:t>
       </w:r>
@@ -28732,7 +28732,7 @@
       <w:pPr>
         <w:pStyle w:val="Heading3"/>
       </w:pPr>
-      <w:bookmarkStart w:id="69" w:name="_Toc242175068"/>
+      <w:bookmarkStart w:id="69" w:name="_Toc242176348"/>
       <w:r>
         <w:t>5.2.5. Hồ sơ, ghi danh và kiểm tra xếp lớp từ danh sách học viên</w:t>
       </w:r>
@@ -28830,7 +28830,7 @@
       <w:pPr>
         <w:pStyle w:val="Heading3"/>
       </w:pPr>
-      <w:bookmarkStart w:id="70" w:name="_Toc242175069"/>
+      <w:bookmarkStart w:id="70" w:name="_Toc242176349"/>
       <w:r>
         <w:t>5.2.6. Xuất, nhập danh sách bằng XML</w:t>
       </w:r>
@@ -28916,7 +28916,7 @@
       <w:pPr>
         <w:pStyle w:val="Heading2"/>
       </w:pPr>
-      <w:bookmarkStart w:id="71" w:name="_Toc242175070"/>
+      <w:bookmarkStart w:id="71" w:name="_Toc242176350"/>
       <w:r>
         <w:t>5.3. Kiểm tra xếp lớp</w:t>
       </w:r>
@@ -29004,7 +29004,7 @@
         </w:rPr>
         <w:lastRenderedPageBreak/>
         <w:drawing>
-          <wp:inline distT="0" distB="0" distL="0" distR="0" wp14:anchorId="7B9A0CD7" wp14:editId="5FEBA0D2">
+          <wp:inline distT="0" distB="0" distL="0" distR="0" wp14:anchorId="6BCDE812" wp14:editId="554CDEA4">
             <wp:extent cx="5580000" cy="3332500"/>
             <wp:effectExtent l="0" t="0" r="0" b="0"/>
             <wp:docPr id="522444771" name="Picture 522444771"/>
@@ -29044,7 +29044,7 @@
       <w:pPr>
         <w:pStyle w:val="FigureCaption"/>
       </w:pPr>
-      <w:bookmarkStart w:id="72" w:name="_Toc242175104"/>
+      <w:bookmarkStart w:id="72" w:name="_Toc242176384"/>
       <w:r>
         <w:t>Hình 5.4. Danh sách bài kiểm tra xếp lớp</w:t>
       </w:r>
@@ -29309,7 +29309,7 @@
       <w:pPr>
         <w:pStyle w:val="Heading2"/>
       </w:pPr>
-      <w:bookmarkStart w:id="73" w:name="_Toc242175071"/>
+      <w:bookmarkStart w:id="73" w:name="_Toc242176351"/>
       <w:r>
         <w:t>5.4. Lớp học</w:t>
       </w:r>
@@ -29361,7 +29361,7 @@
         </w:rPr>
         <w:lastRenderedPageBreak/>
         <w:drawing>
-          <wp:inline distT="0" distB="0" distL="0" distR="0" wp14:anchorId="6D8576C5" wp14:editId="342A65A5">
+          <wp:inline distT="0" distB="0" distL="0" distR="0" wp14:anchorId="01062D32" wp14:editId="6500950E">
             <wp:extent cx="5580000" cy="3332500"/>
             <wp:effectExtent l="0" t="0" r="0" b="0"/>
             <wp:docPr id="522444772" name="Picture 522444772"/>
@@ -29401,7 +29401,7 @@
       <w:pPr>
         <w:pStyle w:val="FigureCaption"/>
       </w:pPr>
-      <w:bookmarkStart w:id="74" w:name="_Toc242175105"/>
+      <w:bookmarkStart w:id="74" w:name="_Toc242176385"/>
       <w:r>
         <w:t>Hình 5.5. Màn hình Lớp học và các nút quản lý vòng đời lớp</w:t>
       </w:r>
@@ -29881,7 +29881,7 @@
       <w:pPr>
         <w:pStyle w:val="TableCaption"/>
       </w:pPr>
-      <w:bookmarkStart w:id="75" w:name="_Toc242175131"/>
+      <w:bookmarkStart w:id="75" w:name="_Toc242176411"/>
       <w:r>
         <w:t>Bảng 5.3. Quy tắc CSDL kiểm tra khi quản lý lớp học</w:t>
       </w:r>
@@ -30412,7 +30412,7 @@
       <w:pPr>
         <w:pStyle w:val="Heading2"/>
       </w:pPr>
-      <w:bookmarkStart w:id="76" w:name="_Toc242175072"/>
+      <w:bookmarkStart w:id="76" w:name="_Toc242176352"/>
       <w:r>
         <w:t>5.5. Ghi danh</w:t>
       </w:r>
@@ -30473,7 +30473,7 @@
         </w:rPr>
         <w:lastRenderedPageBreak/>
         <w:drawing>
-          <wp:inline distT="0" distB="0" distL="0" distR="0" wp14:anchorId="598A2B01" wp14:editId="24A0AAD1">
+          <wp:inline distT="0" distB="0" distL="0" distR="0" wp14:anchorId="62631546" wp14:editId="0E3405E9">
             <wp:extent cx="5580000" cy="3332500"/>
             <wp:effectExtent l="0" t="0" r="0" b="0"/>
             <wp:docPr id="522444773" name="Picture 522444773"/>
@@ -30513,7 +30513,7 @@
       <w:pPr>
         <w:pStyle w:val="FigureCaption"/>
       </w:pPr>
-      <w:bookmarkStart w:id="77" w:name="_Toc242175106"/>
+      <w:bookmarkStart w:id="77" w:name="_Toc242176386"/>
       <w:r>
         <w:t>Hình 5.6. Danh sách ghi danh</w:t>
       </w:r>
@@ -30785,7 +30785,7 @@
       <w:pPr>
         <w:pStyle w:val="TableCaption"/>
       </w:pPr>
-      <w:bookmarkStart w:id="78" w:name="_Toc242175132"/>
+      <w:bookmarkStart w:id="78" w:name="_Toc242176412"/>
       <w:r>
         <w:t>Bảng 5.4. Quy tắc CSDL kiểm tra khi ghi danh và chuyển lớp</w:t>
       </w:r>
@@ -31175,7 +31175,7 @@
       <w:pPr>
         <w:pStyle w:val="Heading2"/>
       </w:pPr>
-      <w:bookmarkStart w:id="79" w:name="_Toc242175073"/>
+      <w:bookmarkStart w:id="79" w:name="_Toc242176353"/>
       <w:r>
         <w:t>5.6. Lịch học - điểm danh</w:t>
       </w:r>
@@ -31262,7 +31262,7 @@
           <w:noProof/>
         </w:rPr>
         <w:drawing>
-          <wp:inline distT="0" distB="0" distL="0" distR="0" wp14:anchorId="42C5EB84" wp14:editId="3DE90DC1">
+          <wp:inline distT="0" distB="0" distL="0" distR="0" wp14:anchorId="7CD36933" wp14:editId="5577B426">
             <wp:extent cx="5580000" cy="3332500"/>
             <wp:effectExtent l="0" t="0" r="0" b="0"/>
             <wp:docPr id="522444774" name="Picture 522444774"/>
@@ -31302,7 +31302,7 @@
       <w:pPr>
         <w:pStyle w:val="FigureCaption"/>
       </w:pPr>
-      <w:bookmarkStart w:id="80" w:name="_Toc242175107"/>
+      <w:bookmarkStart w:id="80" w:name="_Toc242176387"/>
       <w:r>
         <w:t>Hình 5.7. Lịch học - điểm danh của một tuần</w:t>
       </w:r>
@@ -31542,7 +31542,7 @@
       <w:pPr>
         <w:pStyle w:val="Heading2"/>
       </w:pPr>
-      <w:bookmarkStart w:id="81" w:name="_Toc242175074"/>
+      <w:bookmarkStart w:id="81" w:name="_Toc242176354"/>
       <w:r>
         <w:lastRenderedPageBreak/>
         <w:t>5.7. Sổ điểm</w:t>
@@ -31585,7 +31585,7 @@
           <w:noProof/>
         </w:rPr>
         <w:drawing>
-          <wp:inline distT="0" distB="0" distL="0" distR="0" wp14:anchorId="30C1870C" wp14:editId="0B669A59">
+          <wp:inline distT="0" distB="0" distL="0" distR="0" wp14:anchorId="6C4701ED" wp14:editId="7B21BF0E">
             <wp:extent cx="5580000" cy="3332500"/>
             <wp:effectExtent l="0" t="0" r="0" b="0"/>
             <wp:docPr id="522444775" name="Picture 522444775"/>
@@ -31625,7 +31625,7 @@
       <w:pPr>
         <w:pStyle w:val="FigureCaption"/>
       </w:pPr>
-      <w:bookmarkStart w:id="82" w:name="_Toc242175108"/>
+      <w:bookmarkStart w:id="82" w:name="_Toc242176388"/>
       <w:r>
         <w:t>Hình 5.8. Sổ điểm của một lớp</w:t>
       </w:r>
@@ -31753,7 +31753,7 @@
       <w:pPr>
         <w:pStyle w:val="Heading2"/>
       </w:pPr>
-      <w:bookmarkStart w:id="83" w:name="_Toc242175075"/>
+      <w:bookmarkStart w:id="83" w:name="_Toc242176355"/>
       <w:r>
         <w:t>5.8. Kết quả học tập</w:t>
       </w:r>
@@ -31817,7 +31817,7 @@
           <w:noProof/>
         </w:rPr>
         <w:drawing>
-          <wp:inline distT="0" distB="0" distL="0" distR="0" wp14:anchorId="7A3C0AA4" wp14:editId="6C712C43">
+          <wp:inline distT="0" distB="0" distL="0" distR="0" wp14:anchorId="58AB73BF" wp14:editId="4484435F">
             <wp:extent cx="5580000" cy="3332500"/>
             <wp:effectExtent l="0" t="0" r="0" b="0"/>
             <wp:docPr id="522444776" name="Picture 522444776"/>
@@ -31857,7 +31857,7 @@
       <w:pPr>
         <w:pStyle w:val="FigureCaption"/>
       </w:pPr>
-      <w:bookmarkStart w:id="84" w:name="_Toc242175109"/>
+      <w:bookmarkStart w:id="84" w:name="_Toc242176389"/>
       <w:r>
         <w:t>Hình 5.9. Kết quả học tập</w:t>
       </w:r>
@@ -31867,7 +31867,7 @@
       <w:pPr>
         <w:pStyle w:val="Heading2"/>
       </w:pPr>
-      <w:bookmarkStart w:id="85" w:name="_Toc242175076"/>
+      <w:bookmarkStart w:id="85" w:name="_Toc242176356"/>
       <w:r>
         <w:t>5.9. Thu học phí</w:t>
       </w:r>
@@ -31936,7 +31936,7 @@
           <w:noProof/>
         </w:rPr>
         <w:drawing>
-          <wp:inline distT="0" distB="0" distL="0" distR="0" wp14:anchorId="4CBBFBC1" wp14:editId="62B5E6DD">
+          <wp:inline distT="0" distB="0" distL="0" distR="0" wp14:anchorId="21197D50" wp14:editId="69E92BD2">
             <wp:extent cx="5580000" cy="3332500"/>
             <wp:effectExtent l="0" t="0" r="0" b="0"/>
             <wp:docPr id="522444777" name="Picture 522444777"/>
@@ -31976,7 +31976,7 @@
       <w:pPr>
         <w:pStyle w:val="FigureCaption"/>
       </w:pPr>
-      <w:bookmarkStart w:id="86" w:name="_Toc242175110"/>
+      <w:bookmarkStart w:id="86" w:name="_Toc242176390"/>
       <w:r>
         <w:t>Hình 5.10. Danh sách phiếu thu (Kế toán)</w:t>
       </w:r>
@@ -32287,7 +32287,7 @@
       <w:pPr>
         <w:pStyle w:val="Heading2"/>
       </w:pPr>
-      <w:bookmarkStart w:id="87" w:name="_Toc242175077"/>
+      <w:bookmarkStart w:id="87" w:name="_Toc242176357"/>
       <w:r>
         <w:t>5.10. Công nợ học phí</w:t>
       </w:r>
@@ -32340,7 +32340,7 @@
       <w:pPr>
         <w:pStyle w:val="Heading2"/>
       </w:pPr>
-      <w:bookmarkStart w:id="88" w:name="_Toc242175078"/>
+      <w:bookmarkStart w:id="88" w:name="_Toc242176358"/>
       <w:r>
         <w:t>5.11. Doanh thu</w:t>
       </w:r>
@@ -32442,7 +32442,7 @@
         </w:rPr>
         <w:lastRenderedPageBreak/>
         <w:drawing>
-          <wp:inline distT="0" distB="0" distL="0" distR="0" wp14:anchorId="77669E9F" wp14:editId="36E04102">
+          <wp:inline distT="0" distB="0" distL="0" distR="0" wp14:anchorId="3142F540" wp14:editId="70C7698B">
             <wp:extent cx="5580000" cy="3332500"/>
             <wp:effectExtent l="0" t="0" r="0" b="0"/>
             <wp:docPr id="522444778" name="Picture 522444778"/>
@@ -32482,7 +32482,7 @@
       <w:pPr>
         <w:pStyle w:val="FigureCaption"/>
       </w:pPr>
-      <w:bookmarkStart w:id="89" w:name="_Toc242175111"/>
+      <w:bookmarkStart w:id="89" w:name="_Toc242176391"/>
       <w:r>
         <w:t>Hình 5.11. Doanh thu theo tháng và chi nhánh (Kế toán)</w:t>
       </w:r>
@@ -32492,7 +32492,7 @@
       <w:pPr>
         <w:pStyle w:val="Heading2"/>
       </w:pPr>
-      <w:bookmarkStart w:id="90" w:name="_Toc242175079"/>
+      <w:bookmarkStart w:id="90" w:name="_Toc242176359"/>
       <w:r>
         <w:t>5.12. Lương giáo viên</w:t>
       </w:r>
@@ -32543,7 +32543,7 @@
           <w:noProof/>
         </w:rPr>
         <w:drawing>
-          <wp:inline distT="0" distB="0" distL="0" distR="0" wp14:anchorId="542ABE52" wp14:editId="06D42C67">
+          <wp:inline distT="0" distB="0" distL="0" distR="0" wp14:anchorId="2D28FCC6" wp14:editId="1875F466">
             <wp:extent cx="5580000" cy="3332500"/>
             <wp:effectExtent l="0" t="0" r="0" b="0"/>
             <wp:docPr id="522444779" name="Picture 522444779"/>
@@ -32583,7 +32583,7 @@
       <w:pPr>
         <w:pStyle w:val="FigureCaption"/>
       </w:pPr>
-      <w:bookmarkStart w:id="91" w:name="_Toc242175112"/>
+      <w:bookmarkStart w:id="91" w:name="_Toc242176392"/>
       <w:r>
         <w:t>Hình 5.12. Bảng lương giáo viên (Kế toán)</w:t>
       </w:r>
@@ -32690,7 +32690,7 @@
       <w:pPr>
         <w:pStyle w:val="Heading2"/>
       </w:pPr>
-      <w:bookmarkStart w:id="92" w:name="_Toc242175080"/>
+      <w:bookmarkStart w:id="92" w:name="_Toc242176360"/>
       <w:r>
         <w:t>5.13. Danh mục</w:t>
       </w:r>
@@ -32743,7 +32743,7 @@
       <w:pPr>
         <w:pStyle w:val="Heading3"/>
       </w:pPr>
-      <w:bookmarkStart w:id="93" w:name="_Toc242175081"/>
+      <w:bookmarkStart w:id="93" w:name="_Toc242176361"/>
       <w:r>
         <w:t>5.13.1. Khóa học</w:t>
       </w:r>
@@ -32779,7 +32779,7 @@
           <w:noProof/>
         </w:rPr>
         <w:drawing>
-          <wp:inline distT="0" distB="0" distL="0" distR="0" wp14:anchorId="14B83261" wp14:editId="7971673C">
+          <wp:inline distT="0" distB="0" distL="0" distR="0" wp14:anchorId="002DB6F0" wp14:editId="74CFCC68">
             <wp:extent cx="5580000" cy="3332500"/>
             <wp:effectExtent l="0" t="0" r="0" b="0"/>
             <wp:docPr id="522444780" name="Picture 522444780"/>
@@ -32819,7 +32819,7 @@
       <w:pPr>
         <w:pStyle w:val="FigureCaption"/>
       </w:pPr>
-      <w:bookmarkStart w:id="94" w:name="_Toc242175113"/>
+      <w:bookmarkStart w:id="94" w:name="_Toc242176393"/>
       <w:r>
         <w:t>Hình 5.13. Danh mục khóa học và cột điểm của khóa đang chọn</w:t>
       </w:r>
@@ -33023,7 +33023,7 @@
       <w:pPr>
         <w:pStyle w:val="Heading3"/>
       </w:pPr>
-      <w:bookmarkStart w:id="95" w:name="_Toc242175082"/>
+      <w:bookmarkStart w:id="95" w:name="_Toc242176362"/>
       <w:r>
         <w:t>5.13.2. Giáo viên, Nhân viên</w:t>
       </w:r>
@@ -33150,7 +33150,7 @@
       <w:pPr>
         <w:pStyle w:val="Heading3"/>
       </w:pPr>
-      <w:bookmarkStart w:id="96" w:name="_Toc242175083"/>
+      <w:bookmarkStart w:id="96" w:name="_Toc242176363"/>
       <w:r>
         <w:t>5.13.3. Chi nhánh - phòng học, Khuyến mãi</w:t>
       </w:r>
@@ -33348,7 +33348,7 @@
         </w:rPr>
         <w:lastRenderedPageBreak/>
         <w:drawing>
-          <wp:inline distT="0" distB="0" distL="0" distR="0" wp14:anchorId="0E926B40" wp14:editId="222932DE">
+          <wp:inline distT="0" distB="0" distL="0" distR="0" wp14:anchorId="62E1ACF7" wp14:editId="06B55946">
             <wp:extent cx="5580000" cy="3332500"/>
             <wp:effectExtent l="0" t="0" r="0" b="0"/>
             <wp:docPr id="522444781" name="Picture 522444781"/>
@@ -33388,7 +33388,7 @@
       <w:pPr>
         <w:pStyle w:val="FigureCaption"/>
       </w:pPr>
-      <w:bookmarkStart w:id="97" w:name="_Toc242175114"/>
+      <w:bookmarkStart w:id="97" w:name="_Toc242176394"/>
       <w:r>
         <w:t>Hình 5.14. Chi nhánh và phòng học của chi nhánh đang chọn</w:t>
       </w:r>
@@ -33398,7 +33398,7 @@
       <w:pPr>
         <w:pStyle w:val="Heading2"/>
       </w:pPr>
-      <w:bookmarkStart w:id="98" w:name="_Toc242175084"/>
+      <w:bookmarkStart w:id="98" w:name="_Toc242176364"/>
       <w:r>
         <w:t>5.14. Tài khoản</w:t>
       </w:r>
@@ -33449,7 +33449,7 @@
           <w:noProof/>
         </w:rPr>
         <w:drawing>
-          <wp:inline distT="0" distB="0" distL="0" distR="0" wp14:anchorId="21914677" wp14:editId="5D491893">
+          <wp:inline distT="0" distB="0" distL="0" distR="0" wp14:anchorId="762E883A" wp14:editId="722D02F1">
             <wp:extent cx="5580000" cy="3332500"/>
             <wp:effectExtent l="0" t="0" r="0" b="0"/>
             <wp:docPr id="522444782" name="Picture 522444782"/>
@@ -33489,7 +33489,7 @@
       <w:pPr>
         <w:pStyle w:val="FigureCaption"/>
       </w:pPr>
-      <w:bookmarkStart w:id="99" w:name="_Toc242175115"/>
+      <w:bookmarkStart w:id="99" w:name="_Toc242176395"/>
       <w:r>
         <w:t>Hình 5.15. Danh sách tài khoản (Quản lý)</w:t>
       </w:r>
@@ -33649,7 +33649,7 @@
       <w:pPr>
         <w:pStyle w:val="Heading2"/>
       </w:pPr>
-      <w:bookmarkStart w:id="100" w:name="_Toc242175085"/>
+      <w:bookmarkStart w:id="100" w:name="_Toc242176365"/>
       <w:r>
         <w:t>5.15. Sao lưu</w:t>
       </w:r>
@@ -33799,7 +33799,7 @@
           <w:noProof/>
         </w:rPr>
         <w:drawing>
-          <wp:inline distT="0" distB="0" distL="0" distR="0" wp14:anchorId="584094F8" wp14:editId="409FD891">
+          <wp:inline distT="0" distB="0" distL="0" distR="0" wp14:anchorId="43D6CAB7" wp14:editId="222BAF5D">
             <wp:extent cx="5580000" cy="3332500"/>
             <wp:effectExtent l="0" t="0" r="0" b="0"/>
             <wp:docPr id="522444783" name="Picture 522444783"/>
@@ -33839,7 +33839,7 @@
       <w:pPr>
         <w:pStyle w:val="FigureCaption"/>
       </w:pPr>
-      <w:bookmarkStart w:id="101" w:name="_Toc242175116"/>
+      <w:bookmarkStart w:id="101" w:name="_Toc242176396"/>
       <w:r>
         <w:t>Hình 5.16. Màn hình sao lưu cơ sở dữ liệu</w:t>
       </w:r>
@@ -33868,7 +33868,7 @@
       <w:pPr>
         <w:pStyle w:val="Heading2"/>
       </w:pPr>
-      <w:bookmarkStart w:id="102" w:name="_Toc242175086"/>
+      <w:bookmarkStart w:id="102" w:name="_Toc242176366"/>
       <w:r>
         <w:lastRenderedPageBreak/>
         <w:t>5.16. Chức năng dành cho giáo viên</w:t>
@@ -34018,7 +34018,7 @@
           <w:noProof/>
         </w:rPr>
         <w:drawing>
-          <wp:inline distT="0" distB="0" distL="0" distR="0" wp14:anchorId="4F4410C9" wp14:editId="0144CE42">
+          <wp:inline distT="0" distB="0" distL="0" distR="0" wp14:anchorId="00F3574F" wp14:editId="126920FB">
             <wp:extent cx="5580000" cy="3332500"/>
             <wp:effectExtent l="0" t="0" r="0" b="0"/>
             <wp:docPr id="522444784" name="Picture 522444784"/>
@@ -34058,7 +34058,7 @@
       <w:pPr>
         <w:pStyle w:val="FigureCaption"/>
       </w:pPr>
-      <w:bookmarkStart w:id="103" w:name="_Toc242175117"/>
+      <w:bookmarkStart w:id="103" w:name="_Toc242176397"/>
       <w:r>
         <w:t>Hình 5.17. Lịch dạy của giáo viên</w:t>
       </w:r>
@@ -34076,7 +34076,7 @@
         </w:rPr>
         <w:lastRenderedPageBreak/>
         <w:drawing>
-          <wp:inline distT="0" distB="0" distL="0" distR="0" wp14:anchorId="47A96848" wp14:editId="491275BD">
+          <wp:inline distT="0" distB="0" distL="0" distR="0" wp14:anchorId="66230843" wp14:editId="6900D7D4">
             <wp:extent cx="5580000" cy="3332500"/>
             <wp:effectExtent l="0" t="0" r="0" b="0"/>
             <wp:docPr id="522444785" name="Picture 522444785"/>
@@ -34116,7 +34116,7 @@
       <w:pPr>
         <w:pStyle w:val="FigureCaption"/>
       </w:pPr>
-      <w:bookmarkStart w:id="104" w:name="_Toc242175118"/>
+      <w:bookmarkStart w:id="104" w:name="_Toc242176398"/>
       <w:r>
         <w:t>Hình 5.18. Sổ điểm của giáo viên</w:t>
       </w:r>
@@ -34126,7 +34126,7 @@
       <w:pPr>
         <w:pStyle w:val="Heading2"/>
       </w:pPr>
-      <w:bookmarkStart w:id="105" w:name="_Toc242175087"/>
+      <w:bookmarkStart w:id="105" w:name="_Toc242176367"/>
       <w:r>
         <w:t>5.17. Việc vẫn làm trong SSMS</w:t>
       </w:r>
@@ -34244,7 +34244,7 @@
         <w:pStyle w:val="Heading1"/>
         <w:pageBreakBefore/>
       </w:pPr>
-      <w:bookmarkStart w:id="106" w:name="_Toc242175088"/>
+      <w:bookmarkStart w:id="106" w:name="_Toc242176368"/>
       <w:r>
         <w:lastRenderedPageBreak/>
         <w:t>CHƯƠNG 6. XỬ LÝ SỰ CỐ</w:t>
@@ -34255,7 +34255,7 @@
       <w:pPr>
         <w:pStyle w:val="Heading2"/>
       </w:pPr>
-      <w:bookmarkStart w:id="107" w:name="_Toc242175089"/>
+      <w:bookmarkStart w:id="107" w:name="_Toc242176369"/>
       <w:r>
         <w:t>6.1. Kiểm tra kết nối không cần giao diện</w:t>
       </w:r>
@@ -34662,7 +34662,7 @@
       <w:pPr>
         <w:pStyle w:val="Heading2"/>
       </w:pPr>
-      <w:bookmarkStart w:id="108" w:name="_Toc242175090"/>
+      <w:bookmarkStart w:id="108" w:name="_Toc242176370"/>
       <w:r>
         <w:t>6.2. Lỗi thường gặp</w:t>
       </w:r>
@@ -34672,7 +34672,7 @@
       <w:pPr>
         <w:pStyle w:val="TableCaption"/>
       </w:pPr>
-      <w:bookmarkStart w:id="109" w:name="_Toc242175133"/>
+      <w:bookmarkStart w:id="109" w:name="_Toc242176413"/>
       <w:r>
         <w:t>Bảng 6.1. Lỗi thường gặp và cách xử lý</w:t>
       </w:r>
@@ -37356,7 +37356,7 @@
       <w:pPr>
         <w:pStyle w:val="Heading2"/>
       </w:pPr>
-      <w:bookmarkStart w:id="110" w:name="_Toc242175091"/>
+      <w:bookmarkStart w:id="110" w:name="_Toc242176371"/>
       <w:r>
         <w:t>6.3. Khi cần hỗ trợ thêm</w:t>
       </w:r>
@@ -37404,7 +37404,7 @@
         <w:pStyle w:val="Heading1"/>
         <w:pageBreakBefore/>
       </w:pPr>
-      <w:bookmarkStart w:id="111" w:name="_Toc242175092"/>
+      <w:bookmarkStart w:id="111" w:name="_Toc242176372"/>
       <w:r>
         <w:lastRenderedPageBreak/>
         <w:t>PHỤ LỤC A. TÓM TẮT LỆNH</w:t>
@@ -38155,7 +38155,7 @@
         <w:pStyle w:val="Heading1"/>
         <w:pageBreakBefore/>
       </w:pPr>
-      <w:bookmarkStart w:id="112" w:name="_Toc242175093"/>
+      <w:bookmarkStart w:id="112" w:name="_Toc242176373"/>
       <w:r>
         <w:lastRenderedPageBreak/>
         <w:t>PHỤ LỤC B. CÁC MỤC CẦN BỔ SUNG</w:t>

</xml_diff>

<commit_message>
docs: show version 1.0.1 in the report and the user guide
The 1.0.1 release bumped project(VERSION), but the generated documents
still printed 1.0.0. Take the two login screenshots again (they show
"Phiên bản 1.0.1") and regenerate both documents: the user guide reads
the version from CMakeLists.txt for its information page and the
installer file names.

The other screenshots are unchanged; the Windows installer pictures
(installer_finish.png, installer_smartscreen.png) still show older
versions and can only be taken again on Windows.
</commit_message>
<xml_diff>
--- a/docs/user-guide/QLTTTA_User_Guide.docx
+++ b/docs/user-guide/QLTTTA_User_Guide.docx
@@ -923,7 +923,7 @@
               <w:rPr>
                 <w:sz w:val="22"/>
               </w:rPr>
-              <w:t>QLTTTA - Quản lý Trung tâm Tiếng Anh, phiên bản 1.0.0</w:t>
+              <w:t>QLTTTA - Quản lý Trung tâm Tiếng Anh, phiên bản 1.0.1</w:t>
             </w:r>
           </w:p>
         </w:tc>
@@ -1402,7 +1402,7 @@
       <w:r>
         <w:fldChar w:fldCharType="separate"/>
       </w:r>
-      <w:hyperlink w:anchor="_Toc242176301" w:history="1">
+      <w:hyperlink w:anchor="_Toc242178839" w:history="1">
         <w:r>
           <w:rPr>
             <w:rStyle w:val="Hyperlink"/>
@@ -1429,7 +1429,7 @@
             <w:noProof/>
             <w:webHidden/>
           </w:rPr>
-          <w:instrText xml:space="preserve"> PAGEREF _Toc242176301 \h </w:instrText>
+          <w:instrText xml:space="preserve"> PAGEREF _Toc242178839 \h </w:instrText>
         </w:r>
         <w:r>
           <w:rPr>
@@ -1476,7 +1476,7 @@
           <w14:ligatures w14:val="standardContextual"/>
         </w:rPr>
       </w:pPr>
-      <w:hyperlink w:anchor="_Toc242176302" w:history="1">
+      <w:hyperlink w:anchor="_Toc242178840" w:history="1">
         <w:r>
           <w:rPr>
             <w:rStyle w:val="Hyperlink"/>
@@ -1503,7 +1503,7 @@
             <w:noProof/>
             <w:webHidden/>
           </w:rPr>
-          <w:instrText xml:space="preserve"> PAGEREF _Toc242176302 \h </w:instrText>
+          <w:instrText xml:space="preserve"> PAGEREF _Toc242178840 \h </w:instrText>
         </w:r>
         <w:r>
           <w:rPr>
@@ -1550,7 +1550,7 @@
           <w14:ligatures w14:val="standardContextual"/>
         </w:rPr>
       </w:pPr>
-      <w:hyperlink w:anchor="_Toc242176303" w:history="1">
+      <w:hyperlink w:anchor="_Toc242178841" w:history="1">
         <w:r>
           <w:rPr>
             <w:rStyle w:val="Hyperlink"/>
@@ -1577,7 +1577,7 @@
             <w:noProof/>
             <w:webHidden/>
           </w:rPr>
-          <w:instrText xml:space="preserve"> PAGEREF _Toc242176303 \h </w:instrText>
+          <w:instrText xml:space="preserve"> PAGEREF _Toc242178841 \h </w:instrText>
         </w:r>
         <w:r>
           <w:rPr>
@@ -1624,7 +1624,7 @@
           <w14:ligatures w14:val="standardContextual"/>
         </w:rPr>
       </w:pPr>
-      <w:hyperlink w:anchor="_Toc242176304" w:history="1">
+      <w:hyperlink w:anchor="_Toc242178842" w:history="1">
         <w:r>
           <w:rPr>
             <w:rStyle w:val="Hyperlink"/>
@@ -1651,7 +1651,7 @@
             <w:noProof/>
             <w:webHidden/>
           </w:rPr>
-          <w:instrText xml:space="preserve"> PAGEREF _Toc242176304 \h </w:instrText>
+          <w:instrText xml:space="preserve"> PAGEREF _Toc242178842 \h </w:instrText>
         </w:r>
         <w:r>
           <w:rPr>
@@ -1698,7 +1698,7 @@
           <w14:ligatures w14:val="standardContextual"/>
         </w:rPr>
       </w:pPr>
-      <w:hyperlink w:anchor="_Toc242176305" w:history="1">
+      <w:hyperlink w:anchor="_Toc242178843" w:history="1">
         <w:r>
           <w:rPr>
             <w:rStyle w:val="Hyperlink"/>
@@ -1725,7 +1725,7 @@
             <w:noProof/>
             <w:webHidden/>
           </w:rPr>
-          <w:instrText xml:space="preserve"> PAGEREF _Toc242176305 \h </w:instrText>
+          <w:instrText xml:space="preserve"> PAGEREF _Toc242178843 \h </w:instrText>
         </w:r>
         <w:r>
           <w:rPr>
@@ -1772,7 +1772,7 @@
           <w14:ligatures w14:val="standardContextual"/>
         </w:rPr>
       </w:pPr>
-      <w:hyperlink w:anchor="_Toc242176306" w:history="1">
+      <w:hyperlink w:anchor="_Toc242178844" w:history="1">
         <w:r>
           <w:rPr>
             <w:rStyle w:val="Hyperlink"/>
@@ -1799,7 +1799,7 @@
             <w:noProof/>
             <w:webHidden/>
           </w:rPr>
-          <w:instrText xml:space="preserve"> PAGEREF _Toc242176306 \h </w:instrText>
+          <w:instrText xml:space="preserve"> PAGEREF _Toc242178844 \h </w:instrText>
         </w:r>
         <w:r>
           <w:rPr>
@@ -1846,7 +1846,7 @@
           <w14:ligatures w14:val="standardContextual"/>
         </w:rPr>
       </w:pPr>
-      <w:hyperlink w:anchor="_Toc242176307" w:history="1">
+      <w:hyperlink w:anchor="_Toc242178845" w:history="1">
         <w:r>
           <w:rPr>
             <w:rStyle w:val="Hyperlink"/>
@@ -1873,7 +1873,7 @@
             <w:noProof/>
             <w:webHidden/>
           </w:rPr>
-          <w:instrText xml:space="preserve"> PAGEREF _Toc242176307 \h </w:instrText>
+          <w:instrText xml:space="preserve"> PAGEREF _Toc242178845 \h </w:instrText>
         </w:r>
         <w:r>
           <w:rPr>
@@ -1920,7 +1920,7 @@
           <w14:ligatures w14:val="standardContextual"/>
         </w:rPr>
       </w:pPr>
-      <w:hyperlink w:anchor="_Toc242176308" w:history="1">
+      <w:hyperlink w:anchor="_Toc242178846" w:history="1">
         <w:r>
           <w:rPr>
             <w:rStyle w:val="Hyperlink"/>
@@ -1947,7 +1947,7 @@
             <w:noProof/>
             <w:webHidden/>
           </w:rPr>
-          <w:instrText xml:space="preserve"> PAGEREF _Toc242176308 \h </w:instrText>
+          <w:instrText xml:space="preserve"> PAGEREF _Toc242178846 \h </w:instrText>
         </w:r>
         <w:r>
           <w:rPr>
@@ -1994,7 +1994,7 @@
           <w14:ligatures w14:val="standardContextual"/>
         </w:rPr>
       </w:pPr>
-      <w:hyperlink w:anchor="_Toc242176309" w:history="1">
+      <w:hyperlink w:anchor="_Toc242178847" w:history="1">
         <w:r>
           <w:rPr>
             <w:rStyle w:val="Hyperlink"/>
@@ -2021,7 +2021,7 @@
             <w:noProof/>
             <w:webHidden/>
           </w:rPr>
-          <w:instrText xml:space="preserve"> PAGEREF _Toc242176309 \h </w:instrText>
+          <w:instrText xml:space="preserve"> PAGEREF _Toc242178847 \h </w:instrText>
         </w:r>
         <w:r>
           <w:rPr>
@@ -2068,7 +2068,7 @@
           <w14:ligatures w14:val="standardContextual"/>
         </w:rPr>
       </w:pPr>
-      <w:hyperlink w:anchor="_Toc242176310" w:history="1">
+      <w:hyperlink w:anchor="_Toc242178848" w:history="1">
         <w:r>
           <w:rPr>
             <w:rStyle w:val="Hyperlink"/>
@@ -2095,7 +2095,7 @@
             <w:noProof/>
             <w:webHidden/>
           </w:rPr>
-          <w:instrText xml:space="preserve"> PAGEREF _Toc242176310 \h </w:instrText>
+          <w:instrText xml:space="preserve"> PAGEREF _Toc242178848 \h </w:instrText>
         </w:r>
         <w:r>
           <w:rPr>
@@ -2142,7 +2142,7 @@
           <w14:ligatures w14:val="standardContextual"/>
         </w:rPr>
       </w:pPr>
-      <w:hyperlink w:anchor="_Toc242176311" w:history="1">
+      <w:hyperlink w:anchor="_Toc242178849" w:history="1">
         <w:r>
           <w:rPr>
             <w:rStyle w:val="Hyperlink"/>
@@ -2169,7 +2169,7 @@
             <w:noProof/>
             <w:webHidden/>
           </w:rPr>
-          <w:instrText xml:space="preserve"> PAGEREF _Toc242176311 \h </w:instrText>
+          <w:instrText xml:space="preserve"> PAGEREF _Toc242178849 \h </w:instrText>
         </w:r>
         <w:r>
           <w:rPr>
@@ -2216,7 +2216,7 @@
           <w14:ligatures w14:val="standardContextual"/>
         </w:rPr>
       </w:pPr>
-      <w:hyperlink w:anchor="_Toc242176312" w:history="1">
+      <w:hyperlink w:anchor="_Toc242178850" w:history="1">
         <w:r>
           <w:rPr>
             <w:rStyle w:val="Hyperlink"/>
@@ -2243,7 +2243,7 @@
             <w:noProof/>
             <w:webHidden/>
           </w:rPr>
-          <w:instrText xml:space="preserve"> PAGEREF _Toc242176312 \h </w:instrText>
+          <w:instrText xml:space="preserve"> PAGEREF _Toc242178850 \h </w:instrText>
         </w:r>
         <w:r>
           <w:rPr>
@@ -2290,7 +2290,7 @@
           <w14:ligatures w14:val="standardContextual"/>
         </w:rPr>
       </w:pPr>
-      <w:hyperlink w:anchor="_Toc242176313" w:history="1">
+      <w:hyperlink w:anchor="_Toc242178851" w:history="1">
         <w:r>
           <w:rPr>
             <w:rStyle w:val="Hyperlink"/>
@@ -2317,7 +2317,7 @@
             <w:noProof/>
             <w:webHidden/>
           </w:rPr>
-          <w:instrText xml:space="preserve"> PAGEREF _Toc242176313 \h </w:instrText>
+          <w:instrText xml:space="preserve"> PAGEREF _Toc242178851 \h </w:instrText>
         </w:r>
         <w:r>
           <w:rPr>
@@ -2364,7 +2364,7 @@
           <w14:ligatures w14:val="standardContextual"/>
         </w:rPr>
       </w:pPr>
-      <w:hyperlink w:anchor="_Toc242176314" w:history="1">
+      <w:hyperlink w:anchor="_Toc242178852" w:history="1">
         <w:r>
           <w:rPr>
             <w:rStyle w:val="Hyperlink"/>
@@ -2391,7 +2391,7 @@
             <w:noProof/>
             <w:webHidden/>
           </w:rPr>
-          <w:instrText xml:space="preserve"> PAGEREF _Toc242176314 \h </w:instrText>
+          <w:instrText xml:space="preserve"> PAGEREF _Toc242178852 \h </w:instrText>
         </w:r>
         <w:r>
           <w:rPr>
@@ -2438,7 +2438,7 @@
           <w14:ligatures w14:val="standardContextual"/>
         </w:rPr>
       </w:pPr>
-      <w:hyperlink w:anchor="_Toc242176315" w:history="1">
+      <w:hyperlink w:anchor="_Toc242178853" w:history="1">
         <w:r>
           <w:rPr>
             <w:rStyle w:val="Hyperlink"/>
@@ -2465,7 +2465,7 @@
             <w:noProof/>
             <w:webHidden/>
           </w:rPr>
-          <w:instrText xml:space="preserve"> PAGEREF _Toc242176315 \h </w:instrText>
+          <w:instrText xml:space="preserve"> PAGEREF _Toc242178853 \h </w:instrText>
         </w:r>
         <w:r>
           <w:rPr>
@@ -2512,7 +2512,7 @@
           <w14:ligatures w14:val="standardContextual"/>
         </w:rPr>
       </w:pPr>
-      <w:hyperlink w:anchor="_Toc242176316" w:history="1">
+      <w:hyperlink w:anchor="_Toc242178854" w:history="1">
         <w:r>
           <w:rPr>
             <w:rStyle w:val="Hyperlink"/>
@@ -2539,7 +2539,7 @@
             <w:noProof/>
             <w:webHidden/>
           </w:rPr>
-          <w:instrText xml:space="preserve"> PAGEREF _Toc242176316 \h </w:instrText>
+          <w:instrText xml:space="preserve"> PAGEREF _Toc242178854 \h </w:instrText>
         </w:r>
         <w:r>
           <w:rPr>
@@ -2586,7 +2586,7 @@
           <w14:ligatures w14:val="standardContextual"/>
         </w:rPr>
       </w:pPr>
-      <w:hyperlink w:anchor="_Toc242176317" w:history="1">
+      <w:hyperlink w:anchor="_Toc242178855" w:history="1">
         <w:r>
           <w:rPr>
             <w:rStyle w:val="Hyperlink"/>
@@ -2613,7 +2613,7 @@
             <w:noProof/>
             <w:webHidden/>
           </w:rPr>
-          <w:instrText xml:space="preserve"> PAGEREF _Toc242176317 \h </w:instrText>
+          <w:instrText xml:space="preserve"> PAGEREF _Toc242178855 \h </w:instrText>
         </w:r>
         <w:r>
           <w:rPr>
@@ -2660,7 +2660,7 @@
           <w14:ligatures w14:val="standardContextual"/>
         </w:rPr>
       </w:pPr>
-      <w:hyperlink w:anchor="_Toc242176318" w:history="1">
+      <w:hyperlink w:anchor="_Toc242178856" w:history="1">
         <w:r>
           <w:rPr>
             <w:rStyle w:val="Hyperlink"/>
@@ -2687,7 +2687,7 @@
             <w:noProof/>
             <w:webHidden/>
           </w:rPr>
-          <w:instrText xml:space="preserve"> PAGEREF _Toc242176318 \h </w:instrText>
+          <w:instrText xml:space="preserve"> PAGEREF _Toc242178856 \h </w:instrText>
         </w:r>
         <w:r>
           <w:rPr>
@@ -2734,7 +2734,7 @@
           <w14:ligatures w14:val="standardContextual"/>
         </w:rPr>
       </w:pPr>
-      <w:hyperlink w:anchor="_Toc242176319" w:history="1">
+      <w:hyperlink w:anchor="_Toc242178857" w:history="1">
         <w:r>
           <w:rPr>
             <w:rStyle w:val="Hyperlink"/>
@@ -2761,7 +2761,7 @@
             <w:noProof/>
             <w:webHidden/>
           </w:rPr>
-          <w:instrText xml:space="preserve"> PAGEREF _Toc242176319 \h </w:instrText>
+          <w:instrText xml:space="preserve"> PAGEREF _Toc242178857 \h </w:instrText>
         </w:r>
         <w:r>
           <w:rPr>
@@ -2808,7 +2808,7 @@
           <w14:ligatures w14:val="standardContextual"/>
         </w:rPr>
       </w:pPr>
-      <w:hyperlink w:anchor="_Toc242176320" w:history="1">
+      <w:hyperlink w:anchor="_Toc242178858" w:history="1">
         <w:r>
           <w:rPr>
             <w:rStyle w:val="Hyperlink"/>
@@ -2835,7 +2835,7 @@
             <w:noProof/>
             <w:webHidden/>
           </w:rPr>
-          <w:instrText xml:space="preserve"> PAGEREF _Toc242176320 \h </w:instrText>
+          <w:instrText xml:space="preserve"> PAGEREF _Toc242178858 \h </w:instrText>
         </w:r>
         <w:r>
           <w:rPr>
@@ -2882,7 +2882,7 @@
           <w14:ligatures w14:val="standardContextual"/>
         </w:rPr>
       </w:pPr>
-      <w:hyperlink w:anchor="_Toc242176321" w:history="1">
+      <w:hyperlink w:anchor="_Toc242178859" w:history="1">
         <w:r>
           <w:rPr>
             <w:rStyle w:val="Hyperlink"/>
@@ -2909,7 +2909,7 @@
             <w:noProof/>
             <w:webHidden/>
           </w:rPr>
-          <w:instrText xml:space="preserve"> PAGEREF _Toc242176321 \h </w:instrText>
+          <w:instrText xml:space="preserve"> PAGEREF _Toc242178859 \h </w:instrText>
         </w:r>
         <w:r>
           <w:rPr>
@@ -2956,7 +2956,7 @@
           <w14:ligatures w14:val="standardContextual"/>
         </w:rPr>
       </w:pPr>
-      <w:hyperlink w:anchor="_Toc242176322" w:history="1">
+      <w:hyperlink w:anchor="_Toc242178860" w:history="1">
         <w:r>
           <w:rPr>
             <w:rStyle w:val="Hyperlink"/>
@@ -2983,7 +2983,7 @@
             <w:noProof/>
             <w:webHidden/>
           </w:rPr>
-          <w:instrText xml:space="preserve"> PAGEREF _Toc242176322 \h </w:instrText>
+          <w:instrText xml:space="preserve"> PAGEREF _Toc242178860 \h </w:instrText>
         </w:r>
         <w:r>
           <w:rPr>
@@ -3030,7 +3030,7 @@
           <w14:ligatures w14:val="standardContextual"/>
         </w:rPr>
       </w:pPr>
-      <w:hyperlink w:anchor="_Toc242176323" w:history="1">
+      <w:hyperlink w:anchor="_Toc242178861" w:history="1">
         <w:r>
           <w:rPr>
             <w:rStyle w:val="Hyperlink"/>
@@ -3057,7 +3057,7 @@
             <w:noProof/>
             <w:webHidden/>
           </w:rPr>
-          <w:instrText xml:space="preserve"> PAGEREF _Toc242176323 \h </w:instrText>
+          <w:instrText xml:space="preserve"> PAGEREF _Toc242178861 \h </w:instrText>
         </w:r>
         <w:r>
           <w:rPr>
@@ -3104,7 +3104,7 @@
           <w14:ligatures w14:val="standardContextual"/>
         </w:rPr>
       </w:pPr>
-      <w:hyperlink w:anchor="_Toc242176324" w:history="1">
+      <w:hyperlink w:anchor="_Toc242178862" w:history="1">
         <w:r>
           <w:rPr>
             <w:rStyle w:val="Hyperlink"/>
@@ -3131,7 +3131,7 @@
             <w:noProof/>
             <w:webHidden/>
           </w:rPr>
-          <w:instrText xml:space="preserve"> PAGEREF _Toc242176324 \h </w:instrText>
+          <w:instrText xml:space="preserve"> PAGEREF _Toc242178862 \h </w:instrText>
         </w:r>
         <w:r>
           <w:rPr>
@@ -3178,7 +3178,7 @@
           <w14:ligatures w14:val="standardContextual"/>
         </w:rPr>
       </w:pPr>
-      <w:hyperlink w:anchor="_Toc242176325" w:history="1">
+      <w:hyperlink w:anchor="_Toc242178863" w:history="1">
         <w:r>
           <w:rPr>
             <w:rStyle w:val="Hyperlink"/>
@@ -3205,7 +3205,7 @@
             <w:noProof/>
             <w:webHidden/>
           </w:rPr>
-          <w:instrText xml:space="preserve"> PAGEREF _Toc242176325 \h </w:instrText>
+          <w:instrText xml:space="preserve"> PAGEREF _Toc242178863 \h </w:instrText>
         </w:r>
         <w:r>
           <w:rPr>
@@ -3252,7 +3252,7 @@
           <w14:ligatures w14:val="standardContextual"/>
         </w:rPr>
       </w:pPr>
-      <w:hyperlink w:anchor="_Toc242176326" w:history="1">
+      <w:hyperlink w:anchor="_Toc242178864" w:history="1">
         <w:r>
           <w:rPr>
             <w:rStyle w:val="Hyperlink"/>
@@ -3279,7 +3279,7 @@
             <w:noProof/>
             <w:webHidden/>
           </w:rPr>
-          <w:instrText xml:space="preserve"> PAGEREF _Toc242176326 \h </w:instrText>
+          <w:instrText xml:space="preserve"> PAGEREF _Toc242178864 \h </w:instrText>
         </w:r>
         <w:r>
           <w:rPr>
@@ -3326,7 +3326,7 @@
           <w14:ligatures w14:val="standardContextual"/>
         </w:rPr>
       </w:pPr>
-      <w:hyperlink w:anchor="_Toc242176327" w:history="1">
+      <w:hyperlink w:anchor="_Toc242178865" w:history="1">
         <w:r>
           <w:rPr>
             <w:rStyle w:val="Hyperlink"/>
@@ -3353,7 +3353,7 @@
             <w:noProof/>
             <w:webHidden/>
           </w:rPr>
-          <w:instrText xml:space="preserve"> PAGEREF _Toc242176327 \h </w:instrText>
+          <w:instrText xml:space="preserve"> PAGEREF _Toc242178865 \h </w:instrText>
         </w:r>
         <w:r>
           <w:rPr>
@@ -3400,7 +3400,7 @@
           <w14:ligatures w14:val="standardContextual"/>
         </w:rPr>
       </w:pPr>
-      <w:hyperlink w:anchor="_Toc242176328" w:history="1">
+      <w:hyperlink w:anchor="_Toc242178866" w:history="1">
         <w:r>
           <w:rPr>
             <w:rStyle w:val="Hyperlink"/>
@@ -3427,7 +3427,7 @@
             <w:noProof/>
             <w:webHidden/>
           </w:rPr>
-          <w:instrText xml:space="preserve"> PAGEREF _Toc242176328 \h </w:instrText>
+          <w:instrText xml:space="preserve"> PAGEREF _Toc242178866 \h </w:instrText>
         </w:r>
         <w:r>
           <w:rPr>
@@ -3474,7 +3474,7 @@
           <w14:ligatures w14:val="standardContextual"/>
         </w:rPr>
       </w:pPr>
-      <w:hyperlink w:anchor="_Toc242176329" w:history="1">
+      <w:hyperlink w:anchor="_Toc242178867" w:history="1">
         <w:r>
           <w:rPr>
             <w:rStyle w:val="Hyperlink"/>
@@ -3501,7 +3501,7 @@
             <w:noProof/>
             <w:webHidden/>
           </w:rPr>
-          <w:instrText xml:space="preserve"> PAGEREF _Toc242176329 \h </w:instrText>
+          <w:instrText xml:space="preserve"> PAGEREF _Toc242178867 \h </w:instrText>
         </w:r>
         <w:r>
           <w:rPr>
@@ -3548,7 +3548,7 @@
           <w14:ligatures w14:val="standardContextual"/>
         </w:rPr>
       </w:pPr>
-      <w:hyperlink w:anchor="_Toc242176330" w:history="1">
+      <w:hyperlink w:anchor="_Toc242178868" w:history="1">
         <w:r>
           <w:rPr>
             <w:rStyle w:val="Hyperlink"/>
@@ -3575,7 +3575,7 @@
             <w:noProof/>
             <w:webHidden/>
           </w:rPr>
-          <w:instrText xml:space="preserve"> PAGEREF _Toc242176330 \h </w:instrText>
+          <w:instrText xml:space="preserve"> PAGEREF _Toc242178868 \h </w:instrText>
         </w:r>
         <w:r>
           <w:rPr>
@@ -3622,7 +3622,7 @@
           <w14:ligatures w14:val="standardContextual"/>
         </w:rPr>
       </w:pPr>
-      <w:hyperlink w:anchor="_Toc242176331" w:history="1">
+      <w:hyperlink w:anchor="_Toc242178869" w:history="1">
         <w:r>
           <w:rPr>
             <w:rStyle w:val="Hyperlink"/>
@@ -3649,7 +3649,7 @@
             <w:noProof/>
             <w:webHidden/>
           </w:rPr>
-          <w:instrText xml:space="preserve"> PAGEREF _Toc242176331 \h </w:instrText>
+          <w:instrText xml:space="preserve"> PAGEREF _Toc242178869 \h </w:instrText>
         </w:r>
         <w:r>
           <w:rPr>
@@ -3696,7 +3696,7 @@
           <w14:ligatures w14:val="standardContextual"/>
         </w:rPr>
       </w:pPr>
-      <w:hyperlink w:anchor="_Toc242176332" w:history="1">
+      <w:hyperlink w:anchor="_Toc242178870" w:history="1">
         <w:r>
           <w:rPr>
             <w:rStyle w:val="Hyperlink"/>
@@ -3723,7 +3723,7 @@
             <w:noProof/>
             <w:webHidden/>
           </w:rPr>
-          <w:instrText xml:space="preserve"> PAGEREF _Toc242176332 \h </w:instrText>
+          <w:instrText xml:space="preserve"> PAGEREF _Toc242178870 \h </w:instrText>
         </w:r>
         <w:r>
           <w:rPr>
@@ -3770,7 +3770,7 @@
           <w14:ligatures w14:val="standardContextual"/>
         </w:rPr>
       </w:pPr>
-      <w:hyperlink w:anchor="_Toc242176333" w:history="1">
+      <w:hyperlink w:anchor="_Toc242178871" w:history="1">
         <w:r>
           <w:rPr>
             <w:rStyle w:val="Hyperlink"/>
@@ -3797,7 +3797,7 @@
             <w:noProof/>
             <w:webHidden/>
           </w:rPr>
-          <w:instrText xml:space="preserve"> PAGEREF _Toc242176333 \h </w:instrText>
+          <w:instrText xml:space="preserve"> PAGEREF _Toc242178871 \h </w:instrText>
         </w:r>
         <w:r>
           <w:rPr>
@@ -3844,7 +3844,7 @@
           <w14:ligatures w14:val="standardContextual"/>
         </w:rPr>
       </w:pPr>
-      <w:hyperlink w:anchor="_Toc242176334" w:history="1">
+      <w:hyperlink w:anchor="_Toc242178872" w:history="1">
         <w:r>
           <w:rPr>
             <w:rStyle w:val="Hyperlink"/>
@@ -3871,7 +3871,7 @@
             <w:noProof/>
             <w:webHidden/>
           </w:rPr>
-          <w:instrText xml:space="preserve"> PAGEREF _Toc242176334 \h </w:instrText>
+          <w:instrText xml:space="preserve"> PAGEREF _Toc242178872 \h </w:instrText>
         </w:r>
         <w:r>
           <w:rPr>
@@ -3918,7 +3918,7 @@
           <w14:ligatures w14:val="standardContextual"/>
         </w:rPr>
       </w:pPr>
-      <w:hyperlink w:anchor="_Toc242176335" w:history="1">
+      <w:hyperlink w:anchor="_Toc242178873" w:history="1">
         <w:r>
           <w:rPr>
             <w:rStyle w:val="Hyperlink"/>
@@ -3945,7 +3945,7 @@
             <w:noProof/>
             <w:webHidden/>
           </w:rPr>
-          <w:instrText xml:space="preserve"> PAGEREF _Toc242176335 \h </w:instrText>
+          <w:instrText xml:space="preserve"> PAGEREF _Toc242178873 \h </w:instrText>
         </w:r>
         <w:r>
           <w:rPr>
@@ -3992,7 +3992,7 @@
           <w14:ligatures w14:val="standardContextual"/>
         </w:rPr>
       </w:pPr>
-      <w:hyperlink w:anchor="_Toc242176336" w:history="1">
+      <w:hyperlink w:anchor="_Toc242178874" w:history="1">
         <w:r>
           <w:rPr>
             <w:rStyle w:val="Hyperlink"/>
@@ -4019,7 +4019,7 @@
             <w:noProof/>
             <w:webHidden/>
           </w:rPr>
-          <w:instrText xml:space="preserve"> PAGEREF _Toc242176336 \h </w:instrText>
+          <w:instrText xml:space="preserve"> PAGEREF _Toc242178874 \h </w:instrText>
         </w:r>
         <w:r>
           <w:rPr>
@@ -4066,7 +4066,7 @@
           <w14:ligatures w14:val="standardContextual"/>
         </w:rPr>
       </w:pPr>
-      <w:hyperlink w:anchor="_Toc242176337" w:history="1">
+      <w:hyperlink w:anchor="_Toc242178875" w:history="1">
         <w:r>
           <w:rPr>
             <w:rStyle w:val="Hyperlink"/>
@@ -4093,7 +4093,7 @@
             <w:noProof/>
             <w:webHidden/>
           </w:rPr>
-          <w:instrText xml:space="preserve"> PAGEREF _Toc242176337 \h </w:instrText>
+          <w:instrText xml:space="preserve"> PAGEREF _Toc242178875 \h </w:instrText>
         </w:r>
         <w:r>
           <w:rPr>
@@ -4140,7 +4140,7 @@
           <w14:ligatures w14:val="standardContextual"/>
         </w:rPr>
       </w:pPr>
-      <w:hyperlink w:anchor="_Toc242176338" w:history="1">
+      <w:hyperlink w:anchor="_Toc242178876" w:history="1">
         <w:r>
           <w:rPr>
             <w:rStyle w:val="Hyperlink"/>
@@ -4167,7 +4167,7 @@
             <w:noProof/>
             <w:webHidden/>
           </w:rPr>
-          <w:instrText xml:space="preserve"> PAGEREF _Toc242176338 \h </w:instrText>
+          <w:instrText xml:space="preserve"> PAGEREF _Toc242178876 \h </w:instrText>
         </w:r>
         <w:r>
           <w:rPr>
@@ -4214,7 +4214,7 @@
           <w14:ligatures w14:val="standardContextual"/>
         </w:rPr>
       </w:pPr>
-      <w:hyperlink w:anchor="_Toc242176339" w:history="1">
+      <w:hyperlink w:anchor="_Toc242178877" w:history="1">
         <w:r>
           <w:rPr>
             <w:rStyle w:val="Hyperlink"/>
@@ -4241,7 +4241,7 @@
             <w:noProof/>
             <w:webHidden/>
           </w:rPr>
-          <w:instrText xml:space="preserve"> PAGEREF _Toc242176339 \h </w:instrText>
+          <w:instrText xml:space="preserve"> PAGEREF _Toc242178877 \h </w:instrText>
         </w:r>
         <w:r>
           <w:rPr>
@@ -4288,7 +4288,7 @@
           <w14:ligatures w14:val="standardContextual"/>
         </w:rPr>
       </w:pPr>
-      <w:hyperlink w:anchor="_Toc242176340" w:history="1">
+      <w:hyperlink w:anchor="_Toc242178878" w:history="1">
         <w:r>
           <w:rPr>
             <w:rStyle w:val="Hyperlink"/>
@@ -4315,7 +4315,7 @@
             <w:noProof/>
             <w:webHidden/>
           </w:rPr>
-          <w:instrText xml:space="preserve"> PAGEREF _Toc242176340 \h </w:instrText>
+          <w:instrText xml:space="preserve"> PAGEREF _Toc242178878 \h </w:instrText>
         </w:r>
         <w:r>
           <w:rPr>
@@ -4362,7 +4362,7 @@
           <w14:ligatures w14:val="standardContextual"/>
         </w:rPr>
       </w:pPr>
-      <w:hyperlink w:anchor="_Toc242176341" w:history="1">
+      <w:hyperlink w:anchor="_Toc242178879" w:history="1">
         <w:r>
           <w:rPr>
             <w:rStyle w:val="Hyperlink"/>
@@ -4389,7 +4389,7 @@
             <w:noProof/>
             <w:webHidden/>
           </w:rPr>
-          <w:instrText xml:space="preserve"> PAGEREF _Toc242176341 \h </w:instrText>
+          <w:instrText xml:space="preserve"> PAGEREF _Toc242178879 \h </w:instrText>
         </w:r>
         <w:r>
           <w:rPr>
@@ -4436,7 +4436,7 @@
           <w14:ligatures w14:val="standardContextual"/>
         </w:rPr>
       </w:pPr>
-      <w:hyperlink w:anchor="_Toc242176342" w:history="1">
+      <w:hyperlink w:anchor="_Toc242178880" w:history="1">
         <w:r>
           <w:rPr>
             <w:rStyle w:val="Hyperlink"/>
@@ -4463,7 +4463,7 @@
             <w:noProof/>
             <w:webHidden/>
           </w:rPr>
-          <w:instrText xml:space="preserve"> PAGEREF _Toc242176342 \h </w:instrText>
+          <w:instrText xml:space="preserve"> PAGEREF _Toc242178880 \h </w:instrText>
         </w:r>
         <w:r>
           <w:rPr>
@@ -4510,7 +4510,7 @@
           <w14:ligatures w14:val="standardContextual"/>
         </w:rPr>
       </w:pPr>
-      <w:hyperlink w:anchor="_Toc242176343" w:history="1">
+      <w:hyperlink w:anchor="_Toc242178881" w:history="1">
         <w:r>
           <w:rPr>
             <w:rStyle w:val="Hyperlink"/>
@@ -4537,7 +4537,7 @@
             <w:noProof/>
             <w:webHidden/>
           </w:rPr>
-          <w:instrText xml:space="preserve"> PAGEREF _Toc242176343 \h </w:instrText>
+          <w:instrText xml:space="preserve"> PAGEREF _Toc242178881 \h </w:instrText>
         </w:r>
         <w:r>
           <w:rPr>
@@ -4584,7 +4584,7 @@
           <w14:ligatures w14:val="standardContextual"/>
         </w:rPr>
       </w:pPr>
-      <w:hyperlink w:anchor="_Toc242176344" w:history="1">
+      <w:hyperlink w:anchor="_Toc242178882" w:history="1">
         <w:r>
           <w:rPr>
             <w:rStyle w:val="Hyperlink"/>
@@ -4611,7 +4611,7 @@
             <w:noProof/>
             <w:webHidden/>
           </w:rPr>
-          <w:instrText xml:space="preserve"> PAGEREF _Toc242176344 \h </w:instrText>
+          <w:instrText xml:space="preserve"> PAGEREF _Toc242178882 \h </w:instrText>
         </w:r>
         <w:r>
           <w:rPr>
@@ -4658,7 +4658,7 @@
           <w14:ligatures w14:val="standardContextual"/>
         </w:rPr>
       </w:pPr>
-      <w:hyperlink w:anchor="_Toc242176345" w:history="1">
+      <w:hyperlink w:anchor="_Toc242178883" w:history="1">
         <w:r>
           <w:rPr>
             <w:rStyle w:val="Hyperlink"/>
@@ -4685,7 +4685,7 @@
             <w:noProof/>
             <w:webHidden/>
           </w:rPr>
-          <w:instrText xml:space="preserve"> PAGEREF _Toc242176345 \h </w:instrText>
+          <w:instrText xml:space="preserve"> PAGEREF _Toc242178883 \h </w:instrText>
         </w:r>
         <w:r>
           <w:rPr>
@@ -4732,7 +4732,7 @@
           <w14:ligatures w14:val="standardContextual"/>
         </w:rPr>
       </w:pPr>
-      <w:hyperlink w:anchor="_Toc242176346" w:history="1">
+      <w:hyperlink w:anchor="_Toc242178884" w:history="1">
         <w:r>
           <w:rPr>
             <w:rStyle w:val="Hyperlink"/>
@@ -4759,7 +4759,7 @@
             <w:noProof/>
             <w:webHidden/>
           </w:rPr>
-          <w:instrText xml:space="preserve"> PAGEREF _Toc242176346 \h </w:instrText>
+          <w:instrText xml:space="preserve"> PAGEREF _Toc242178884 \h </w:instrText>
         </w:r>
         <w:r>
           <w:rPr>
@@ -4806,7 +4806,7 @@
           <w14:ligatures w14:val="standardContextual"/>
         </w:rPr>
       </w:pPr>
-      <w:hyperlink w:anchor="_Toc242176347" w:history="1">
+      <w:hyperlink w:anchor="_Toc242178885" w:history="1">
         <w:r>
           <w:rPr>
             <w:rStyle w:val="Hyperlink"/>
@@ -4833,7 +4833,7 @@
             <w:noProof/>
             <w:webHidden/>
           </w:rPr>
-          <w:instrText xml:space="preserve"> PAGEREF _Toc242176347 \h </w:instrText>
+          <w:instrText xml:space="preserve"> PAGEREF _Toc242178885 \h </w:instrText>
         </w:r>
         <w:r>
           <w:rPr>
@@ -4880,7 +4880,7 @@
           <w14:ligatures w14:val="standardContextual"/>
         </w:rPr>
       </w:pPr>
-      <w:hyperlink w:anchor="_Toc242176348" w:history="1">
+      <w:hyperlink w:anchor="_Toc242178886" w:history="1">
         <w:r>
           <w:rPr>
             <w:rStyle w:val="Hyperlink"/>
@@ -4907,7 +4907,7 @@
             <w:noProof/>
             <w:webHidden/>
           </w:rPr>
-          <w:instrText xml:space="preserve"> PAGEREF _Toc242176348 \h </w:instrText>
+          <w:instrText xml:space="preserve"> PAGEREF _Toc242178886 \h </w:instrText>
         </w:r>
         <w:r>
           <w:rPr>
@@ -4954,7 +4954,7 @@
           <w14:ligatures w14:val="standardContextual"/>
         </w:rPr>
       </w:pPr>
-      <w:hyperlink w:anchor="_Toc242176349" w:history="1">
+      <w:hyperlink w:anchor="_Toc242178887" w:history="1">
         <w:r>
           <w:rPr>
             <w:rStyle w:val="Hyperlink"/>
@@ -4981,7 +4981,7 @@
             <w:noProof/>
             <w:webHidden/>
           </w:rPr>
-          <w:instrText xml:space="preserve"> PAGEREF _Toc242176349 \h </w:instrText>
+          <w:instrText xml:space="preserve"> PAGEREF _Toc242178887 \h </w:instrText>
         </w:r>
         <w:r>
           <w:rPr>
@@ -5028,7 +5028,7 @@
           <w14:ligatures w14:val="standardContextual"/>
         </w:rPr>
       </w:pPr>
-      <w:hyperlink w:anchor="_Toc242176350" w:history="1">
+      <w:hyperlink w:anchor="_Toc242178888" w:history="1">
         <w:r>
           <w:rPr>
             <w:rStyle w:val="Hyperlink"/>
@@ -5055,7 +5055,7 @@
             <w:noProof/>
             <w:webHidden/>
           </w:rPr>
-          <w:instrText xml:space="preserve"> PAGEREF _Toc242176350 \h </w:instrText>
+          <w:instrText xml:space="preserve"> PAGEREF _Toc242178888 \h </w:instrText>
         </w:r>
         <w:r>
           <w:rPr>
@@ -5102,7 +5102,7 @@
           <w14:ligatures w14:val="standardContextual"/>
         </w:rPr>
       </w:pPr>
-      <w:hyperlink w:anchor="_Toc242176351" w:history="1">
+      <w:hyperlink w:anchor="_Toc242178889" w:history="1">
         <w:r>
           <w:rPr>
             <w:rStyle w:val="Hyperlink"/>
@@ -5129,7 +5129,7 @@
             <w:noProof/>
             <w:webHidden/>
           </w:rPr>
-          <w:instrText xml:space="preserve"> PAGEREF _Toc242176351 \h </w:instrText>
+          <w:instrText xml:space="preserve"> PAGEREF _Toc242178889 \h </w:instrText>
         </w:r>
         <w:r>
           <w:rPr>
@@ -5176,7 +5176,7 @@
           <w14:ligatures w14:val="standardContextual"/>
         </w:rPr>
       </w:pPr>
-      <w:hyperlink w:anchor="_Toc242176352" w:history="1">
+      <w:hyperlink w:anchor="_Toc242178890" w:history="1">
         <w:r>
           <w:rPr>
             <w:rStyle w:val="Hyperlink"/>
@@ -5203,7 +5203,7 @@
             <w:noProof/>
             <w:webHidden/>
           </w:rPr>
-          <w:instrText xml:space="preserve"> PAGEREF _Toc242176352 \h </w:instrText>
+          <w:instrText xml:space="preserve"> PAGEREF _Toc242178890 \h </w:instrText>
         </w:r>
         <w:r>
           <w:rPr>
@@ -5250,7 +5250,7 @@
           <w14:ligatures w14:val="standardContextual"/>
         </w:rPr>
       </w:pPr>
-      <w:hyperlink w:anchor="_Toc242176353" w:history="1">
+      <w:hyperlink w:anchor="_Toc242178891" w:history="1">
         <w:r>
           <w:rPr>
             <w:rStyle w:val="Hyperlink"/>
@@ -5277,7 +5277,7 @@
             <w:noProof/>
             <w:webHidden/>
           </w:rPr>
-          <w:instrText xml:space="preserve"> PAGEREF _Toc242176353 \h </w:instrText>
+          <w:instrText xml:space="preserve"> PAGEREF _Toc242178891 \h </w:instrText>
         </w:r>
         <w:r>
           <w:rPr>
@@ -5324,7 +5324,7 @@
           <w14:ligatures w14:val="standardContextual"/>
         </w:rPr>
       </w:pPr>
-      <w:hyperlink w:anchor="_Toc242176354" w:history="1">
+      <w:hyperlink w:anchor="_Toc242178892" w:history="1">
         <w:r>
           <w:rPr>
             <w:rStyle w:val="Hyperlink"/>
@@ -5351,7 +5351,7 @@
             <w:noProof/>
             <w:webHidden/>
           </w:rPr>
-          <w:instrText xml:space="preserve"> PAGEREF _Toc242176354 \h </w:instrText>
+          <w:instrText xml:space="preserve"> PAGEREF _Toc242178892 \h </w:instrText>
         </w:r>
         <w:r>
           <w:rPr>
@@ -5398,7 +5398,7 @@
           <w14:ligatures w14:val="standardContextual"/>
         </w:rPr>
       </w:pPr>
-      <w:hyperlink w:anchor="_Toc242176355" w:history="1">
+      <w:hyperlink w:anchor="_Toc242178893" w:history="1">
         <w:r>
           <w:rPr>
             <w:rStyle w:val="Hyperlink"/>
@@ -5425,7 +5425,7 @@
             <w:noProof/>
             <w:webHidden/>
           </w:rPr>
-          <w:instrText xml:space="preserve"> PAGEREF _Toc242176355 \h </w:instrText>
+          <w:instrText xml:space="preserve"> PAGEREF _Toc242178893 \h </w:instrText>
         </w:r>
         <w:r>
           <w:rPr>
@@ -5472,7 +5472,7 @@
           <w14:ligatures w14:val="standardContextual"/>
         </w:rPr>
       </w:pPr>
-      <w:hyperlink w:anchor="_Toc242176356" w:history="1">
+      <w:hyperlink w:anchor="_Toc242178894" w:history="1">
         <w:r>
           <w:rPr>
             <w:rStyle w:val="Hyperlink"/>
@@ -5499,7 +5499,7 @@
             <w:noProof/>
             <w:webHidden/>
           </w:rPr>
-          <w:instrText xml:space="preserve"> PAGEREF _Toc242176356 \h </w:instrText>
+          <w:instrText xml:space="preserve"> PAGEREF _Toc242178894 \h </w:instrText>
         </w:r>
         <w:r>
           <w:rPr>
@@ -5546,7 +5546,7 @@
           <w14:ligatures w14:val="standardContextual"/>
         </w:rPr>
       </w:pPr>
-      <w:hyperlink w:anchor="_Toc242176357" w:history="1">
+      <w:hyperlink w:anchor="_Toc242178895" w:history="1">
         <w:r>
           <w:rPr>
             <w:rStyle w:val="Hyperlink"/>
@@ -5573,7 +5573,7 @@
             <w:noProof/>
             <w:webHidden/>
           </w:rPr>
-          <w:instrText xml:space="preserve"> PAGEREF _Toc242176357 \h </w:instrText>
+          <w:instrText xml:space="preserve"> PAGEREF _Toc242178895 \h </w:instrText>
         </w:r>
         <w:r>
           <w:rPr>
@@ -5620,7 +5620,7 @@
           <w14:ligatures w14:val="standardContextual"/>
         </w:rPr>
       </w:pPr>
-      <w:hyperlink w:anchor="_Toc242176358" w:history="1">
+      <w:hyperlink w:anchor="_Toc242178896" w:history="1">
         <w:r>
           <w:rPr>
             <w:rStyle w:val="Hyperlink"/>
@@ -5647,7 +5647,7 @@
             <w:noProof/>
             <w:webHidden/>
           </w:rPr>
-          <w:instrText xml:space="preserve"> PAGEREF _Toc242176358 \h </w:instrText>
+          <w:instrText xml:space="preserve"> PAGEREF _Toc242178896 \h </w:instrText>
         </w:r>
         <w:r>
           <w:rPr>
@@ -5694,7 +5694,7 @@
           <w14:ligatures w14:val="standardContextual"/>
         </w:rPr>
       </w:pPr>
-      <w:hyperlink w:anchor="_Toc242176359" w:history="1">
+      <w:hyperlink w:anchor="_Toc242178897" w:history="1">
         <w:r>
           <w:rPr>
             <w:rStyle w:val="Hyperlink"/>
@@ -5721,7 +5721,7 @@
             <w:noProof/>
             <w:webHidden/>
           </w:rPr>
-          <w:instrText xml:space="preserve"> PAGEREF _Toc242176359 \h </w:instrText>
+          <w:instrText xml:space="preserve"> PAGEREF _Toc242178897 \h </w:instrText>
         </w:r>
         <w:r>
           <w:rPr>
@@ -5768,7 +5768,7 @@
           <w14:ligatures w14:val="standardContextual"/>
         </w:rPr>
       </w:pPr>
-      <w:hyperlink w:anchor="_Toc242176360" w:history="1">
+      <w:hyperlink w:anchor="_Toc242178898" w:history="1">
         <w:r>
           <w:rPr>
             <w:rStyle w:val="Hyperlink"/>
@@ -5795,7 +5795,7 @@
             <w:noProof/>
             <w:webHidden/>
           </w:rPr>
-          <w:instrText xml:space="preserve"> PAGEREF _Toc242176360 \h </w:instrText>
+          <w:instrText xml:space="preserve"> PAGEREF _Toc242178898 \h </w:instrText>
         </w:r>
         <w:r>
           <w:rPr>
@@ -5842,7 +5842,7 @@
           <w14:ligatures w14:val="standardContextual"/>
         </w:rPr>
       </w:pPr>
-      <w:hyperlink w:anchor="_Toc242176361" w:history="1">
+      <w:hyperlink w:anchor="_Toc242178899" w:history="1">
         <w:r>
           <w:rPr>
             <w:rStyle w:val="Hyperlink"/>
@@ -5869,7 +5869,7 @@
             <w:noProof/>
             <w:webHidden/>
           </w:rPr>
-          <w:instrText xml:space="preserve"> PAGEREF _Toc242176361 \h </w:instrText>
+          <w:instrText xml:space="preserve"> PAGEREF _Toc242178899 \h </w:instrText>
         </w:r>
         <w:r>
           <w:rPr>
@@ -5916,7 +5916,7 @@
           <w14:ligatures w14:val="standardContextual"/>
         </w:rPr>
       </w:pPr>
-      <w:hyperlink w:anchor="_Toc242176362" w:history="1">
+      <w:hyperlink w:anchor="_Toc242178900" w:history="1">
         <w:r>
           <w:rPr>
             <w:rStyle w:val="Hyperlink"/>
@@ -5943,7 +5943,7 @@
             <w:noProof/>
             <w:webHidden/>
           </w:rPr>
-          <w:instrText xml:space="preserve"> PAGEREF _Toc242176362 \h </w:instrText>
+          <w:instrText xml:space="preserve"> PAGEREF _Toc242178900 \h </w:instrText>
         </w:r>
         <w:r>
           <w:rPr>
@@ -5990,7 +5990,7 @@
           <w14:ligatures w14:val="standardContextual"/>
         </w:rPr>
       </w:pPr>
-      <w:hyperlink w:anchor="_Toc242176363" w:history="1">
+      <w:hyperlink w:anchor="_Toc242178901" w:history="1">
         <w:r>
           <w:rPr>
             <w:rStyle w:val="Hyperlink"/>
@@ -6017,7 +6017,7 @@
             <w:noProof/>
             <w:webHidden/>
           </w:rPr>
-          <w:instrText xml:space="preserve"> PAGEREF _Toc242176363 \h </w:instrText>
+          <w:instrText xml:space="preserve"> PAGEREF _Toc242178901 \h </w:instrText>
         </w:r>
         <w:r>
           <w:rPr>
@@ -6064,7 +6064,7 @@
           <w14:ligatures w14:val="standardContextual"/>
         </w:rPr>
       </w:pPr>
-      <w:hyperlink w:anchor="_Toc242176364" w:history="1">
+      <w:hyperlink w:anchor="_Toc242178902" w:history="1">
         <w:r>
           <w:rPr>
             <w:rStyle w:val="Hyperlink"/>
@@ -6091,7 +6091,7 @@
             <w:noProof/>
             <w:webHidden/>
           </w:rPr>
-          <w:instrText xml:space="preserve"> PAGEREF _Toc242176364 \h </w:instrText>
+          <w:instrText xml:space="preserve"> PAGEREF _Toc242178902 \h </w:instrText>
         </w:r>
         <w:r>
           <w:rPr>
@@ -6138,7 +6138,7 @@
           <w14:ligatures w14:val="standardContextual"/>
         </w:rPr>
       </w:pPr>
-      <w:hyperlink w:anchor="_Toc242176365" w:history="1">
+      <w:hyperlink w:anchor="_Toc242178903" w:history="1">
         <w:r>
           <w:rPr>
             <w:rStyle w:val="Hyperlink"/>
@@ -6165,7 +6165,7 @@
             <w:noProof/>
             <w:webHidden/>
           </w:rPr>
-          <w:instrText xml:space="preserve"> PAGEREF _Toc242176365 \h </w:instrText>
+          <w:instrText xml:space="preserve"> PAGEREF _Toc242178903 \h </w:instrText>
         </w:r>
         <w:r>
           <w:rPr>
@@ -6212,7 +6212,7 @@
           <w14:ligatures w14:val="standardContextual"/>
         </w:rPr>
       </w:pPr>
-      <w:hyperlink w:anchor="_Toc242176366" w:history="1">
+      <w:hyperlink w:anchor="_Toc242178904" w:history="1">
         <w:r>
           <w:rPr>
             <w:rStyle w:val="Hyperlink"/>
@@ -6239,7 +6239,7 @@
             <w:noProof/>
             <w:webHidden/>
           </w:rPr>
-          <w:instrText xml:space="preserve"> PAGEREF _Toc242176366 \h </w:instrText>
+          <w:instrText xml:space="preserve"> PAGEREF _Toc242178904 \h </w:instrText>
         </w:r>
         <w:r>
           <w:rPr>
@@ -6286,7 +6286,7 @@
           <w14:ligatures w14:val="standardContextual"/>
         </w:rPr>
       </w:pPr>
-      <w:hyperlink w:anchor="_Toc242176367" w:history="1">
+      <w:hyperlink w:anchor="_Toc242178905" w:history="1">
         <w:r>
           <w:rPr>
             <w:rStyle w:val="Hyperlink"/>
@@ -6313,7 +6313,7 @@
             <w:noProof/>
             <w:webHidden/>
           </w:rPr>
-          <w:instrText xml:space="preserve"> PAGEREF _Toc242176367 \h </w:instrText>
+          <w:instrText xml:space="preserve"> PAGEREF _Toc242178905 \h </w:instrText>
         </w:r>
         <w:r>
           <w:rPr>
@@ -6360,7 +6360,7 @@
           <w14:ligatures w14:val="standardContextual"/>
         </w:rPr>
       </w:pPr>
-      <w:hyperlink w:anchor="_Toc242176368" w:history="1">
+      <w:hyperlink w:anchor="_Toc242178906" w:history="1">
         <w:r>
           <w:rPr>
             <w:rStyle w:val="Hyperlink"/>
@@ -6387,7 +6387,7 @@
             <w:noProof/>
             <w:webHidden/>
           </w:rPr>
-          <w:instrText xml:space="preserve"> PAGEREF _Toc242176368 \h </w:instrText>
+          <w:instrText xml:space="preserve"> PAGEREF _Toc242178906 \h </w:instrText>
         </w:r>
         <w:r>
           <w:rPr>
@@ -6434,7 +6434,7 @@
           <w14:ligatures w14:val="standardContextual"/>
         </w:rPr>
       </w:pPr>
-      <w:hyperlink w:anchor="_Toc242176369" w:history="1">
+      <w:hyperlink w:anchor="_Toc242178907" w:history="1">
         <w:r>
           <w:rPr>
             <w:rStyle w:val="Hyperlink"/>
@@ -6461,7 +6461,7 @@
             <w:noProof/>
             <w:webHidden/>
           </w:rPr>
-          <w:instrText xml:space="preserve"> PAGEREF _Toc242176369 \h </w:instrText>
+          <w:instrText xml:space="preserve"> PAGEREF _Toc242178907 \h </w:instrText>
         </w:r>
         <w:r>
           <w:rPr>
@@ -6508,7 +6508,7 @@
           <w14:ligatures w14:val="standardContextual"/>
         </w:rPr>
       </w:pPr>
-      <w:hyperlink w:anchor="_Toc242176370" w:history="1">
+      <w:hyperlink w:anchor="_Toc242178908" w:history="1">
         <w:r>
           <w:rPr>
             <w:rStyle w:val="Hyperlink"/>
@@ -6535,7 +6535,7 @@
             <w:noProof/>
             <w:webHidden/>
           </w:rPr>
-          <w:instrText xml:space="preserve"> PAGEREF _Toc242176370 \h </w:instrText>
+          <w:instrText xml:space="preserve"> PAGEREF _Toc242178908 \h </w:instrText>
         </w:r>
         <w:r>
           <w:rPr>
@@ -6582,7 +6582,7 @@
           <w14:ligatures w14:val="standardContextual"/>
         </w:rPr>
       </w:pPr>
-      <w:hyperlink w:anchor="_Toc242176371" w:history="1">
+      <w:hyperlink w:anchor="_Toc242178909" w:history="1">
         <w:r>
           <w:rPr>
             <w:rStyle w:val="Hyperlink"/>
@@ -6609,7 +6609,7 @@
             <w:noProof/>
             <w:webHidden/>
           </w:rPr>
-          <w:instrText xml:space="preserve"> PAGEREF _Toc242176371 \h </w:instrText>
+          <w:instrText xml:space="preserve"> PAGEREF _Toc242178909 \h </w:instrText>
         </w:r>
         <w:r>
           <w:rPr>
@@ -6656,7 +6656,7 @@
           <w14:ligatures w14:val="standardContextual"/>
         </w:rPr>
       </w:pPr>
-      <w:hyperlink w:anchor="_Toc242176372" w:history="1">
+      <w:hyperlink w:anchor="_Toc242178910" w:history="1">
         <w:r>
           <w:rPr>
             <w:rStyle w:val="Hyperlink"/>
@@ -6683,7 +6683,7 @@
             <w:noProof/>
             <w:webHidden/>
           </w:rPr>
-          <w:instrText xml:space="preserve"> PAGEREF _Toc242176372 \h </w:instrText>
+          <w:instrText xml:space="preserve"> PAGEREF _Toc242178910 \h </w:instrText>
         </w:r>
         <w:r>
           <w:rPr>
@@ -6730,7 +6730,7 @@
           <w14:ligatures w14:val="standardContextual"/>
         </w:rPr>
       </w:pPr>
-      <w:hyperlink w:anchor="_Toc242176373" w:history="1">
+      <w:hyperlink w:anchor="_Toc242178911" w:history="1">
         <w:r>
           <w:rPr>
             <w:rStyle w:val="Hyperlink"/>
@@ -6757,7 +6757,7 @@
             <w:noProof/>
             <w:webHidden/>
           </w:rPr>
-          <w:instrText xml:space="preserve"> PAGEREF _Toc242176373 \h </w:instrText>
+          <w:instrText xml:space="preserve"> PAGEREF _Toc242178911 \h </w:instrText>
         </w:r>
         <w:r>
           <w:rPr>
@@ -6834,7 +6834,7 @@
       <w:r>
         <w:fldChar w:fldCharType="separate"/>
       </w:r>
-      <w:hyperlink w:anchor="_Toc242176374" w:history="1">
+      <w:hyperlink w:anchor="_Toc242178912" w:history="1">
         <w:r>
           <w:rPr>
             <w:rStyle w:val="Hyperlink"/>
@@ -6861,7 +6861,7 @@
             <w:noProof/>
             <w:webHidden/>
           </w:rPr>
-          <w:instrText xml:space="preserve"> PAGEREF _Toc242176374 \h </w:instrText>
+          <w:instrText xml:space="preserve"> PAGEREF _Toc242178912 \h </w:instrText>
         </w:r>
         <w:r>
           <w:rPr>
@@ -6908,7 +6908,7 @@
           <w14:ligatures w14:val="standardContextual"/>
         </w:rPr>
       </w:pPr>
-      <w:hyperlink w:anchor="_Toc242176375" w:history="1">
+      <w:hyperlink w:anchor="_Toc242178913" w:history="1">
         <w:r>
           <w:rPr>
             <w:rStyle w:val="Hyperlink"/>
@@ -6935,7 +6935,7 @@
             <w:noProof/>
             <w:webHidden/>
           </w:rPr>
-          <w:instrText xml:space="preserve"> PAGEREF _Toc242176375 \h </w:instrText>
+          <w:instrText xml:space="preserve"> PAGEREF _Toc242178913 \h </w:instrText>
         </w:r>
         <w:r>
           <w:rPr>
@@ -6982,7 +6982,7 @@
           <w14:ligatures w14:val="standardContextual"/>
         </w:rPr>
       </w:pPr>
-      <w:hyperlink w:anchor="_Toc242176376" w:history="1">
+      <w:hyperlink w:anchor="_Toc242178914" w:history="1">
         <w:r>
           <w:rPr>
             <w:rStyle w:val="Hyperlink"/>
@@ -7009,7 +7009,7 @@
             <w:noProof/>
             <w:webHidden/>
           </w:rPr>
-          <w:instrText xml:space="preserve"> PAGEREF _Toc242176376 \h </w:instrText>
+          <w:instrText xml:space="preserve"> PAGEREF _Toc242178914 \h </w:instrText>
         </w:r>
         <w:r>
           <w:rPr>
@@ -7056,7 +7056,7 @@
           <w14:ligatures w14:val="standardContextual"/>
         </w:rPr>
       </w:pPr>
-      <w:hyperlink w:anchor="_Toc242176377" w:history="1">
+      <w:hyperlink w:anchor="_Toc242178915" w:history="1">
         <w:r>
           <w:rPr>
             <w:rStyle w:val="Hyperlink"/>
@@ -7083,7 +7083,7 @@
             <w:noProof/>
             <w:webHidden/>
           </w:rPr>
-          <w:instrText xml:space="preserve"> PAGEREF _Toc242176377 \h </w:instrText>
+          <w:instrText xml:space="preserve"> PAGEREF _Toc242178915 \h </w:instrText>
         </w:r>
         <w:r>
           <w:rPr>
@@ -7130,7 +7130,7 @@
           <w14:ligatures w14:val="standardContextual"/>
         </w:rPr>
       </w:pPr>
-      <w:hyperlink w:anchor="_Toc242176378" w:history="1">
+      <w:hyperlink w:anchor="_Toc242178916" w:history="1">
         <w:r>
           <w:rPr>
             <w:rStyle w:val="Hyperlink"/>
@@ -7157,7 +7157,7 @@
             <w:noProof/>
             <w:webHidden/>
           </w:rPr>
-          <w:instrText xml:space="preserve"> PAGEREF _Toc242176378 \h </w:instrText>
+          <w:instrText xml:space="preserve"> PAGEREF _Toc242178916 \h </w:instrText>
         </w:r>
         <w:r>
           <w:rPr>
@@ -7204,7 +7204,7 @@
           <w14:ligatures w14:val="standardContextual"/>
         </w:rPr>
       </w:pPr>
-      <w:hyperlink w:anchor="_Toc242176379" w:history="1">
+      <w:hyperlink w:anchor="_Toc242178917" w:history="1">
         <w:r>
           <w:rPr>
             <w:rStyle w:val="Hyperlink"/>
@@ -7231,7 +7231,7 @@
             <w:noProof/>
             <w:webHidden/>
           </w:rPr>
-          <w:instrText xml:space="preserve"> PAGEREF _Toc242176379 \h </w:instrText>
+          <w:instrText xml:space="preserve"> PAGEREF _Toc242178917 \h </w:instrText>
         </w:r>
         <w:r>
           <w:rPr>
@@ -7278,7 +7278,7 @@
           <w14:ligatures w14:val="standardContextual"/>
         </w:rPr>
       </w:pPr>
-      <w:hyperlink w:anchor="_Toc242176380" w:history="1">
+      <w:hyperlink w:anchor="_Toc242178918" w:history="1">
         <w:r>
           <w:rPr>
             <w:rStyle w:val="Hyperlink"/>
@@ -7305,7 +7305,7 @@
             <w:noProof/>
             <w:webHidden/>
           </w:rPr>
-          <w:instrText xml:space="preserve"> PAGEREF _Toc242176380 \h </w:instrText>
+          <w:instrText xml:space="preserve"> PAGEREF _Toc242178918 \h </w:instrText>
         </w:r>
         <w:r>
           <w:rPr>
@@ -7352,7 +7352,7 @@
           <w14:ligatures w14:val="standardContextual"/>
         </w:rPr>
       </w:pPr>
-      <w:hyperlink w:anchor="_Toc242176381" w:history="1">
+      <w:hyperlink w:anchor="_Toc242178919" w:history="1">
         <w:r>
           <w:rPr>
             <w:rStyle w:val="Hyperlink"/>
@@ -7379,7 +7379,7 @@
             <w:noProof/>
             <w:webHidden/>
           </w:rPr>
-          <w:instrText xml:space="preserve"> PAGEREF _Toc242176381 \h </w:instrText>
+          <w:instrText xml:space="preserve"> PAGEREF _Toc242178919 \h </w:instrText>
         </w:r>
         <w:r>
           <w:rPr>
@@ -7426,7 +7426,7 @@
           <w14:ligatures w14:val="standardContextual"/>
         </w:rPr>
       </w:pPr>
-      <w:hyperlink w:anchor="_Toc242176382" w:history="1">
+      <w:hyperlink w:anchor="_Toc242178920" w:history="1">
         <w:r>
           <w:rPr>
             <w:rStyle w:val="Hyperlink"/>
@@ -7453,7 +7453,7 @@
             <w:noProof/>
             <w:webHidden/>
           </w:rPr>
-          <w:instrText xml:space="preserve"> PAGEREF _Toc242176382 \h </w:instrText>
+          <w:instrText xml:space="preserve"> PAGEREF _Toc242178920 \h </w:instrText>
         </w:r>
         <w:r>
           <w:rPr>
@@ -7500,7 +7500,7 @@
           <w14:ligatures w14:val="standardContextual"/>
         </w:rPr>
       </w:pPr>
-      <w:hyperlink w:anchor="_Toc242176383" w:history="1">
+      <w:hyperlink w:anchor="_Toc242178921" w:history="1">
         <w:r>
           <w:rPr>
             <w:rStyle w:val="Hyperlink"/>
@@ -7527,7 +7527,7 @@
             <w:noProof/>
             <w:webHidden/>
           </w:rPr>
-          <w:instrText xml:space="preserve"> PAGEREF _Toc242176383 \h </w:instrText>
+          <w:instrText xml:space="preserve"> PAGEREF _Toc242178921 \h </w:instrText>
         </w:r>
         <w:r>
           <w:rPr>
@@ -7574,7 +7574,7 @@
           <w14:ligatures w14:val="standardContextual"/>
         </w:rPr>
       </w:pPr>
-      <w:hyperlink w:anchor="_Toc242176384" w:history="1">
+      <w:hyperlink w:anchor="_Toc242178922" w:history="1">
         <w:r>
           <w:rPr>
             <w:rStyle w:val="Hyperlink"/>
@@ -7601,7 +7601,7 @@
             <w:noProof/>
             <w:webHidden/>
           </w:rPr>
-          <w:instrText xml:space="preserve"> PAGEREF _Toc242176384 \h </w:instrText>
+          <w:instrText xml:space="preserve"> PAGEREF _Toc242178922 \h </w:instrText>
         </w:r>
         <w:r>
           <w:rPr>
@@ -7648,7 +7648,7 @@
           <w14:ligatures w14:val="standardContextual"/>
         </w:rPr>
       </w:pPr>
-      <w:hyperlink w:anchor="_Toc242176385" w:history="1">
+      <w:hyperlink w:anchor="_Toc242178923" w:history="1">
         <w:r>
           <w:rPr>
             <w:rStyle w:val="Hyperlink"/>
@@ -7675,7 +7675,7 @@
             <w:noProof/>
             <w:webHidden/>
           </w:rPr>
-          <w:instrText xml:space="preserve"> PAGEREF _Toc242176385 \h </w:instrText>
+          <w:instrText xml:space="preserve"> PAGEREF _Toc242178923 \h </w:instrText>
         </w:r>
         <w:r>
           <w:rPr>
@@ -7722,7 +7722,7 @@
           <w14:ligatures w14:val="standardContextual"/>
         </w:rPr>
       </w:pPr>
-      <w:hyperlink w:anchor="_Toc242176386" w:history="1">
+      <w:hyperlink w:anchor="_Toc242178924" w:history="1">
         <w:r>
           <w:rPr>
             <w:rStyle w:val="Hyperlink"/>
@@ -7749,7 +7749,7 @@
             <w:noProof/>
             <w:webHidden/>
           </w:rPr>
-          <w:instrText xml:space="preserve"> PAGEREF _Toc242176386 \h </w:instrText>
+          <w:instrText xml:space="preserve"> PAGEREF _Toc242178924 \h </w:instrText>
         </w:r>
         <w:r>
           <w:rPr>
@@ -7796,7 +7796,7 @@
           <w14:ligatures w14:val="standardContextual"/>
         </w:rPr>
       </w:pPr>
-      <w:hyperlink w:anchor="_Toc242176387" w:history="1">
+      <w:hyperlink w:anchor="_Toc242178925" w:history="1">
         <w:r>
           <w:rPr>
             <w:rStyle w:val="Hyperlink"/>
@@ -7823,7 +7823,7 @@
             <w:noProof/>
             <w:webHidden/>
           </w:rPr>
-          <w:instrText xml:space="preserve"> PAGEREF _Toc242176387 \h </w:instrText>
+          <w:instrText xml:space="preserve"> PAGEREF _Toc242178925 \h </w:instrText>
         </w:r>
         <w:r>
           <w:rPr>
@@ -7870,7 +7870,7 @@
           <w14:ligatures w14:val="standardContextual"/>
         </w:rPr>
       </w:pPr>
-      <w:hyperlink w:anchor="_Toc242176388" w:history="1">
+      <w:hyperlink w:anchor="_Toc242178926" w:history="1">
         <w:r>
           <w:rPr>
             <w:rStyle w:val="Hyperlink"/>
@@ -7897,7 +7897,7 @@
             <w:noProof/>
             <w:webHidden/>
           </w:rPr>
-          <w:instrText xml:space="preserve"> PAGEREF _Toc242176388 \h </w:instrText>
+          <w:instrText xml:space="preserve"> PAGEREF _Toc242178926 \h </w:instrText>
         </w:r>
         <w:r>
           <w:rPr>
@@ -7944,7 +7944,7 @@
           <w14:ligatures w14:val="standardContextual"/>
         </w:rPr>
       </w:pPr>
-      <w:hyperlink w:anchor="_Toc242176389" w:history="1">
+      <w:hyperlink w:anchor="_Toc242178927" w:history="1">
         <w:r>
           <w:rPr>
             <w:rStyle w:val="Hyperlink"/>
@@ -7971,7 +7971,7 @@
             <w:noProof/>
             <w:webHidden/>
           </w:rPr>
-          <w:instrText xml:space="preserve"> PAGEREF _Toc242176389 \h </w:instrText>
+          <w:instrText xml:space="preserve"> PAGEREF _Toc242178927 \h </w:instrText>
         </w:r>
         <w:r>
           <w:rPr>
@@ -8018,7 +8018,7 @@
           <w14:ligatures w14:val="standardContextual"/>
         </w:rPr>
       </w:pPr>
-      <w:hyperlink w:anchor="_Toc242176390" w:history="1">
+      <w:hyperlink w:anchor="_Toc242178928" w:history="1">
         <w:r>
           <w:rPr>
             <w:rStyle w:val="Hyperlink"/>
@@ -8045,7 +8045,7 @@
             <w:noProof/>
             <w:webHidden/>
           </w:rPr>
-          <w:instrText xml:space="preserve"> PAGEREF _Toc242176390 \h </w:instrText>
+          <w:instrText xml:space="preserve"> PAGEREF _Toc242178928 \h </w:instrText>
         </w:r>
         <w:r>
           <w:rPr>
@@ -8092,7 +8092,7 @@
           <w14:ligatures w14:val="standardContextual"/>
         </w:rPr>
       </w:pPr>
-      <w:hyperlink w:anchor="_Toc242176391" w:history="1">
+      <w:hyperlink w:anchor="_Toc242178929" w:history="1">
         <w:r>
           <w:rPr>
             <w:rStyle w:val="Hyperlink"/>
@@ -8119,7 +8119,7 @@
             <w:noProof/>
             <w:webHidden/>
           </w:rPr>
-          <w:instrText xml:space="preserve"> PAGEREF _Toc242176391 \h </w:instrText>
+          <w:instrText xml:space="preserve"> PAGEREF _Toc242178929 \h </w:instrText>
         </w:r>
         <w:r>
           <w:rPr>
@@ -8166,7 +8166,7 @@
           <w14:ligatures w14:val="standardContextual"/>
         </w:rPr>
       </w:pPr>
-      <w:hyperlink w:anchor="_Toc242176392" w:history="1">
+      <w:hyperlink w:anchor="_Toc242178930" w:history="1">
         <w:r>
           <w:rPr>
             <w:rStyle w:val="Hyperlink"/>
@@ -8193,7 +8193,7 @@
             <w:noProof/>
             <w:webHidden/>
           </w:rPr>
-          <w:instrText xml:space="preserve"> PAGEREF _Toc242176392 \h </w:instrText>
+          <w:instrText xml:space="preserve"> PAGEREF _Toc242178930 \h </w:instrText>
         </w:r>
         <w:r>
           <w:rPr>
@@ -8240,7 +8240,7 @@
           <w14:ligatures w14:val="standardContextual"/>
         </w:rPr>
       </w:pPr>
-      <w:hyperlink w:anchor="_Toc242176393" w:history="1">
+      <w:hyperlink w:anchor="_Toc242178931" w:history="1">
         <w:r>
           <w:rPr>
             <w:rStyle w:val="Hyperlink"/>
@@ -8267,7 +8267,7 @@
             <w:noProof/>
             <w:webHidden/>
           </w:rPr>
-          <w:instrText xml:space="preserve"> PAGEREF _Toc242176393 \h </w:instrText>
+          <w:instrText xml:space="preserve"> PAGEREF _Toc242178931 \h </w:instrText>
         </w:r>
         <w:r>
           <w:rPr>
@@ -8314,7 +8314,7 @@
           <w14:ligatures w14:val="standardContextual"/>
         </w:rPr>
       </w:pPr>
-      <w:hyperlink w:anchor="_Toc242176394" w:history="1">
+      <w:hyperlink w:anchor="_Toc242178932" w:history="1">
         <w:r>
           <w:rPr>
             <w:rStyle w:val="Hyperlink"/>
@@ -8341,7 +8341,7 @@
             <w:noProof/>
             <w:webHidden/>
           </w:rPr>
-          <w:instrText xml:space="preserve"> PAGEREF _Toc242176394 \h </w:instrText>
+          <w:instrText xml:space="preserve"> PAGEREF _Toc242178932 \h </w:instrText>
         </w:r>
         <w:r>
           <w:rPr>
@@ -8388,7 +8388,7 @@
           <w14:ligatures w14:val="standardContextual"/>
         </w:rPr>
       </w:pPr>
-      <w:hyperlink w:anchor="_Toc242176395" w:history="1">
+      <w:hyperlink w:anchor="_Toc242178933" w:history="1">
         <w:r>
           <w:rPr>
             <w:rStyle w:val="Hyperlink"/>
@@ -8415,7 +8415,7 @@
             <w:noProof/>
             <w:webHidden/>
           </w:rPr>
-          <w:instrText xml:space="preserve"> PAGEREF _Toc242176395 \h </w:instrText>
+          <w:instrText xml:space="preserve"> PAGEREF _Toc242178933 \h </w:instrText>
         </w:r>
         <w:r>
           <w:rPr>
@@ -8462,7 +8462,7 @@
           <w14:ligatures w14:val="standardContextual"/>
         </w:rPr>
       </w:pPr>
-      <w:hyperlink w:anchor="_Toc242176396" w:history="1">
+      <w:hyperlink w:anchor="_Toc242178934" w:history="1">
         <w:r>
           <w:rPr>
             <w:rStyle w:val="Hyperlink"/>
@@ -8489,7 +8489,7 @@
             <w:noProof/>
             <w:webHidden/>
           </w:rPr>
-          <w:instrText xml:space="preserve"> PAGEREF _Toc242176396 \h </w:instrText>
+          <w:instrText xml:space="preserve"> PAGEREF _Toc242178934 \h </w:instrText>
         </w:r>
         <w:r>
           <w:rPr>
@@ -8536,7 +8536,7 @@
           <w14:ligatures w14:val="standardContextual"/>
         </w:rPr>
       </w:pPr>
-      <w:hyperlink w:anchor="_Toc242176397" w:history="1">
+      <w:hyperlink w:anchor="_Toc242178935" w:history="1">
         <w:r>
           <w:rPr>
             <w:rStyle w:val="Hyperlink"/>
@@ -8563,7 +8563,7 @@
             <w:noProof/>
             <w:webHidden/>
           </w:rPr>
-          <w:instrText xml:space="preserve"> PAGEREF _Toc242176397 \h </w:instrText>
+          <w:instrText xml:space="preserve"> PAGEREF _Toc242178935 \h </w:instrText>
         </w:r>
         <w:r>
           <w:rPr>
@@ -8610,7 +8610,7 @@
           <w14:ligatures w14:val="standardContextual"/>
         </w:rPr>
       </w:pPr>
-      <w:hyperlink w:anchor="_Toc242176398" w:history="1">
+      <w:hyperlink w:anchor="_Toc242178936" w:history="1">
         <w:r>
           <w:rPr>
             <w:rStyle w:val="Hyperlink"/>
@@ -8637,7 +8637,7 @@
             <w:noProof/>
             <w:webHidden/>
           </w:rPr>
-          <w:instrText xml:space="preserve"> PAGEREF _Toc242176398 \h </w:instrText>
+          <w:instrText xml:space="preserve"> PAGEREF _Toc242178936 \h </w:instrText>
         </w:r>
         <w:r>
           <w:rPr>
@@ -8712,7 +8712,7 @@
       <w:r>
         <w:fldChar w:fldCharType="separate"/>
       </w:r>
-      <w:hyperlink w:anchor="_Toc242176399" w:history="1">
+      <w:hyperlink w:anchor="_Toc242178937" w:history="1">
         <w:r>
           <w:rPr>
             <w:rStyle w:val="Hyperlink"/>
@@ -8739,7 +8739,7 @@
             <w:noProof/>
             <w:webHidden/>
           </w:rPr>
-          <w:instrText xml:space="preserve"> PAGEREF _Toc242176399 \h </w:instrText>
+          <w:instrText xml:space="preserve"> PAGEREF _Toc242178937 \h </w:instrText>
         </w:r>
         <w:r>
           <w:rPr>
@@ -8786,7 +8786,7 @@
           <w14:ligatures w14:val="standardContextual"/>
         </w:rPr>
       </w:pPr>
-      <w:hyperlink w:anchor="_Toc242176400" w:history="1">
+      <w:hyperlink w:anchor="_Toc242178938" w:history="1">
         <w:r>
           <w:rPr>
             <w:rStyle w:val="Hyperlink"/>
@@ -8813,7 +8813,7 @@
             <w:noProof/>
             <w:webHidden/>
           </w:rPr>
-          <w:instrText xml:space="preserve"> PAGEREF _Toc242176400 \h </w:instrText>
+          <w:instrText xml:space="preserve"> PAGEREF _Toc242178938 \h </w:instrText>
         </w:r>
         <w:r>
           <w:rPr>
@@ -8860,7 +8860,7 @@
           <w14:ligatures w14:val="standardContextual"/>
         </w:rPr>
       </w:pPr>
-      <w:hyperlink w:anchor="_Toc242176401" w:history="1">
+      <w:hyperlink w:anchor="_Toc242178939" w:history="1">
         <w:r>
           <w:rPr>
             <w:rStyle w:val="Hyperlink"/>
@@ -8887,7 +8887,7 @@
             <w:noProof/>
             <w:webHidden/>
           </w:rPr>
-          <w:instrText xml:space="preserve"> PAGEREF _Toc242176401 \h </w:instrText>
+          <w:instrText xml:space="preserve"> PAGEREF _Toc242178939 \h </w:instrText>
         </w:r>
         <w:r>
           <w:rPr>
@@ -8934,7 +8934,7 @@
           <w14:ligatures w14:val="standardContextual"/>
         </w:rPr>
       </w:pPr>
-      <w:hyperlink w:anchor="_Toc242176402" w:history="1">
+      <w:hyperlink w:anchor="_Toc242178940" w:history="1">
         <w:r>
           <w:rPr>
             <w:rStyle w:val="Hyperlink"/>
@@ -8961,7 +8961,7 @@
             <w:noProof/>
             <w:webHidden/>
           </w:rPr>
-          <w:instrText xml:space="preserve"> PAGEREF _Toc242176402 \h </w:instrText>
+          <w:instrText xml:space="preserve"> PAGEREF _Toc242178940 \h </w:instrText>
         </w:r>
         <w:r>
           <w:rPr>
@@ -9008,7 +9008,7 @@
           <w14:ligatures w14:val="standardContextual"/>
         </w:rPr>
       </w:pPr>
-      <w:hyperlink w:anchor="_Toc242176403" w:history="1">
+      <w:hyperlink w:anchor="_Toc242178941" w:history="1">
         <w:r>
           <w:rPr>
             <w:rStyle w:val="Hyperlink"/>
@@ -9035,7 +9035,7 @@
             <w:noProof/>
             <w:webHidden/>
           </w:rPr>
-          <w:instrText xml:space="preserve"> PAGEREF _Toc242176403 \h </w:instrText>
+          <w:instrText xml:space="preserve"> PAGEREF _Toc242178941 \h </w:instrText>
         </w:r>
         <w:r>
           <w:rPr>
@@ -9082,7 +9082,7 @@
           <w14:ligatures w14:val="standardContextual"/>
         </w:rPr>
       </w:pPr>
-      <w:hyperlink w:anchor="_Toc242176404" w:history="1">
+      <w:hyperlink w:anchor="_Toc242178942" w:history="1">
         <w:r>
           <w:rPr>
             <w:rStyle w:val="Hyperlink"/>
@@ -9109,7 +9109,7 @@
             <w:noProof/>
             <w:webHidden/>
           </w:rPr>
-          <w:instrText xml:space="preserve"> PAGEREF _Toc242176404 \h </w:instrText>
+          <w:instrText xml:space="preserve"> PAGEREF _Toc242178942 \h </w:instrText>
         </w:r>
         <w:r>
           <w:rPr>
@@ -9156,7 +9156,7 @@
           <w14:ligatures w14:val="standardContextual"/>
         </w:rPr>
       </w:pPr>
-      <w:hyperlink w:anchor="_Toc242176405" w:history="1">
+      <w:hyperlink w:anchor="_Toc242178943" w:history="1">
         <w:r>
           <w:rPr>
             <w:rStyle w:val="Hyperlink"/>
@@ -9183,7 +9183,7 @@
             <w:noProof/>
             <w:webHidden/>
           </w:rPr>
-          <w:instrText xml:space="preserve"> PAGEREF _Toc242176405 \h </w:instrText>
+          <w:instrText xml:space="preserve"> PAGEREF _Toc242178943 \h </w:instrText>
         </w:r>
         <w:r>
           <w:rPr>
@@ -9230,7 +9230,7 @@
           <w14:ligatures w14:val="standardContextual"/>
         </w:rPr>
       </w:pPr>
-      <w:hyperlink w:anchor="_Toc242176406" w:history="1">
+      <w:hyperlink w:anchor="_Toc242178944" w:history="1">
         <w:r>
           <w:rPr>
             <w:rStyle w:val="Hyperlink"/>
@@ -9257,7 +9257,7 @@
             <w:noProof/>
             <w:webHidden/>
           </w:rPr>
-          <w:instrText xml:space="preserve"> PAGEREF _Toc242176406 \h </w:instrText>
+          <w:instrText xml:space="preserve"> PAGEREF _Toc242178944 \h </w:instrText>
         </w:r>
         <w:r>
           <w:rPr>
@@ -9304,7 +9304,7 @@
           <w14:ligatures w14:val="standardContextual"/>
         </w:rPr>
       </w:pPr>
-      <w:hyperlink w:anchor="_Toc242176407" w:history="1">
+      <w:hyperlink w:anchor="_Toc242178945" w:history="1">
         <w:r>
           <w:rPr>
             <w:rStyle w:val="Hyperlink"/>
@@ -9331,7 +9331,7 @@
             <w:noProof/>
             <w:webHidden/>
           </w:rPr>
-          <w:instrText xml:space="preserve"> PAGEREF _Toc242176407 \h </w:instrText>
+          <w:instrText xml:space="preserve"> PAGEREF _Toc242178945 \h </w:instrText>
         </w:r>
         <w:r>
           <w:rPr>
@@ -9378,7 +9378,7 @@
           <w14:ligatures w14:val="standardContextual"/>
         </w:rPr>
       </w:pPr>
-      <w:hyperlink w:anchor="_Toc242176408" w:history="1">
+      <w:hyperlink w:anchor="_Toc242178946" w:history="1">
         <w:r>
           <w:rPr>
             <w:rStyle w:val="Hyperlink"/>
@@ -9405,7 +9405,7 @@
             <w:noProof/>
             <w:webHidden/>
           </w:rPr>
-          <w:instrText xml:space="preserve"> PAGEREF _Toc242176408 \h </w:instrText>
+          <w:instrText xml:space="preserve"> PAGEREF _Toc242178946 \h </w:instrText>
         </w:r>
         <w:r>
           <w:rPr>
@@ -9452,7 +9452,7 @@
           <w14:ligatures w14:val="standardContextual"/>
         </w:rPr>
       </w:pPr>
-      <w:hyperlink w:anchor="_Toc242176409" w:history="1">
+      <w:hyperlink w:anchor="_Toc242178947" w:history="1">
         <w:r>
           <w:rPr>
             <w:rStyle w:val="Hyperlink"/>
@@ -9479,7 +9479,7 @@
             <w:noProof/>
             <w:webHidden/>
           </w:rPr>
-          <w:instrText xml:space="preserve"> PAGEREF _Toc242176409 \h </w:instrText>
+          <w:instrText xml:space="preserve"> PAGEREF _Toc242178947 \h </w:instrText>
         </w:r>
         <w:r>
           <w:rPr>
@@ -9526,7 +9526,7 @@
           <w14:ligatures w14:val="standardContextual"/>
         </w:rPr>
       </w:pPr>
-      <w:hyperlink w:anchor="_Toc242176410" w:history="1">
+      <w:hyperlink w:anchor="_Toc242178948" w:history="1">
         <w:r>
           <w:rPr>
             <w:rStyle w:val="Hyperlink"/>
@@ -9553,7 +9553,7 @@
             <w:noProof/>
             <w:webHidden/>
           </w:rPr>
-          <w:instrText xml:space="preserve"> PAGEREF _Toc242176410 \h </w:instrText>
+          <w:instrText xml:space="preserve"> PAGEREF _Toc242178948 \h </w:instrText>
         </w:r>
         <w:r>
           <w:rPr>
@@ -9600,7 +9600,7 @@
           <w14:ligatures w14:val="standardContextual"/>
         </w:rPr>
       </w:pPr>
-      <w:hyperlink w:anchor="_Toc242176411" w:history="1">
+      <w:hyperlink w:anchor="_Toc242178949" w:history="1">
         <w:r>
           <w:rPr>
             <w:rStyle w:val="Hyperlink"/>
@@ -9627,7 +9627,7 @@
             <w:noProof/>
             <w:webHidden/>
           </w:rPr>
-          <w:instrText xml:space="preserve"> PAGEREF _Toc242176411 \h </w:instrText>
+          <w:instrText xml:space="preserve"> PAGEREF _Toc242178949 \h </w:instrText>
         </w:r>
         <w:r>
           <w:rPr>
@@ -9674,7 +9674,7 @@
           <w14:ligatures w14:val="standardContextual"/>
         </w:rPr>
       </w:pPr>
-      <w:hyperlink w:anchor="_Toc242176412" w:history="1">
+      <w:hyperlink w:anchor="_Toc242178950" w:history="1">
         <w:r>
           <w:rPr>
             <w:rStyle w:val="Hyperlink"/>
@@ -9701,7 +9701,7 @@
             <w:noProof/>
             <w:webHidden/>
           </w:rPr>
-          <w:instrText xml:space="preserve"> PAGEREF _Toc242176412 \h </w:instrText>
+          <w:instrText xml:space="preserve"> PAGEREF _Toc242178950 \h </w:instrText>
         </w:r>
         <w:r>
           <w:rPr>
@@ -9748,7 +9748,7 @@
           <w14:ligatures w14:val="standardContextual"/>
         </w:rPr>
       </w:pPr>
-      <w:hyperlink w:anchor="_Toc242176413" w:history="1">
+      <w:hyperlink w:anchor="_Toc242178951" w:history="1">
         <w:r>
           <w:rPr>
             <w:rStyle w:val="Hyperlink"/>
@@ -9775,7 +9775,7 @@
             <w:noProof/>
             <w:webHidden/>
           </w:rPr>
-          <w:instrText xml:space="preserve"> PAGEREF _Toc242176413 \h </w:instrText>
+          <w:instrText xml:space="preserve"> PAGEREF _Toc242178951 \h </w:instrText>
         </w:r>
         <w:r>
           <w:rPr>
@@ -9816,7 +9816,7 @@
         <w:pStyle w:val="Heading1"/>
         <w:pageBreakBefore/>
       </w:pPr>
-      <w:bookmarkStart w:id="0" w:name="_Toc242176301"/>
+      <w:bookmarkStart w:id="0" w:name="_Toc242178839"/>
       <w:r>
         <w:lastRenderedPageBreak/>
         <w:t>CHƯƠNG 1. GIỚI THIỆU</w:t>
@@ -9827,7 +9827,7 @@
       <w:pPr>
         <w:pStyle w:val="Heading2"/>
       </w:pPr>
-      <w:bookmarkStart w:id="1" w:name="_Toc242176302"/>
+      <w:bookmarkStart w:id="1" w:name="_Toc242178840"/>
       <w:r>
         <w:t>1.1. Mục đích của tài liệu</w:t>
       </w:r>
@@ -9874,7 +9874,7 @@
       <w:pPr>
         <w:pStyle w:val="Heading2"/>
       </w:pPr>
-      <w:bookmarkStart w:id="2" w:name="_Toc242176303"/>
+      <w:bookmarkStart w:id="2" w:name="_Toc242178841"/>
       <w:r>
         <w:t>1.2. Tổng quan phần mềm</w:t>
       </w:r>
@@ -10021,7 +10021,7 @@
       <w:pPr>
         <w:pStyle w:val="Heading2"/>
       </w:pPr>
-      <w:bookmarkStart w:id="3" w:name="_Toc242176304"/>
+      <w:bookmarkStart w:id="3" w:name="_Toc242178842"/>
       <w:r>
         <w:t>1.3. Vai trò người dùng và chức năng</w:t>
       </w:r>
@@ -10059,7 +10059,7 @@
       <w:pPr>
         <w:pStyle w:val="TableCaption"/>
       </w:pPr>
-      <w:bookmarkStart w:id="4" w:name="_Toc242176399"/>
+      <w:bookmarkStart w:id="4" w:name="_Toc242178937"/>
       <w:r>
         <w:t>Bảng 1.1. Chức năng hiển thị theo vai trò</w:t>
       </w:r>
@@ -14262,7 +14262,7 @@
       <w:pPr>
         <w:pStyle w:val="Heading2"/>
       </w:pPr>
-      <w:bookmarkStart w:id="5" w:name="_Toc242176305"/>
+      <w:bookmarkStart w:id="5" w:name="_Toc242178843"/>
       <w:r>
         <w:t>1.4. Yêu cầu hệ thống</w:t>
       </w:r>
@@ -14272,7 +14272,7 @@
       <w:pPr>
         <w:pStyle w:val="TableCaption"/>
       </w:pPr>
-      <w:bookmarkStart w:id="6" w:name="_Toc242176400"/>
+      <w:bookmarkStart w:id="6" w:name="_Toc242178938"/>
       <w:r>
         <w:t>Bảng 1.2. Yêu cầu phần cứng và phần mềm</w:t>
       </w:r>
@@ -14864,7 +14864,7 @@
       <w:pPr>
         <w:pStyle w:val="Heading2"/>
       </w:pPr>
-      <w:bookmarkStart w:id="7" w:name="_Toc242176306"/>
+      <w:bookmarkStart w:id="7" w:name="_Toc242178844"/>
       <w:r>
         <w:t>1.5. Các bước cài đặt tổng quát</w:t>
       </w:r>
@@ -15016,7 +15016,7 @@
       <w:pPr>
         <w:pStyle w:val="TableCaption"/>
       </w:pPr>
-      <w:bookmarkStart w:id="8" w:name="_Toc242176401"/>
+      <w:bookmarkStart w:id="8" w:name="_Toc242178939"/>
       <w:r>
         <w:t>Bảng 1.3. Chọn phương án SQL Server theo máy</w:t>
       </w:r>
@@ -15620,7 +15620,7 @@
       <w:pPr>
         <w:pStyle w:val="Heading2"/>
       </w:pPr>
-      <w:bookmarkStart w:id="9" w:name="_Toc242176307"/>
+      <w:bookmarkStart w:id="9" w:name="_Toc242178845"/>
       <w:r>
         <w:t>1.6. Quy ước trình bày</w:t>
       </w:r>
@@ -15869,7 +15869,7 @@
         <w:pStyle w:val="Heading1"/>
         <w:pageBreakBefore/>
       </w:pPr>
-      <w:bookmarkStart w:id="10" w:name="_Toc242176308"/>
+      <w:bookmarkStart w:id="10" w:name="_Toc242178846"/>
       <w:r>
         <w:lastRenderedPageBreak/>
         <w:t>CHƯƠNG 2. CÀI ĐẶT SQL SERVER VÀ KHỞI TẠO CƠ SỞ DỮ LIỆU</w:t>
@@ -15926,7 +15926,7 @@
       <w:pPr>
         <w:pStyle w:val="Heading2"/>
       </w:pPr>
-      <w:bookmarkStart w:id="11" w:name="_Toc242176309"/>
+      <w:bookmarkStart w:id="11" w:name="_Toc242178847"/>
       <w:r>
         <w:t>2.1. Tải mã nguồn</w:t>
       </w:r>
@@ -16047,7 +16047,7 @@
       <w:pPr>
         <w:pStyle w:val="Heading2"/>
       </w:pPr>
-      <w:bookmarkStart w:id="12" w:name="_Toc242176310"/>
+      <w:bookmarkStart w:id="12" w:name="_Toc242178848"/>
       <w:r>
         <w:t>2.2. Phương án A - SQL Server trong Docker</w:t>
       </w:r>
@@ -16057,7 +16057,7 @@
       <w:pPr>
         <w:pStyle w:val="Heading3"/>
       </w:pPr>
-      <w:bookmarkStart w:id="13" w:name="_Toc242176311"/>
+      <w:bookmarkStart w:id="13" w:name="_Toc242178849"/>
       <w:r>
         <w:t>2.2.1. Cài Docker Desktop</w:t>
       </w:r>
@@ -16399,7 +16399,7 @@
       <w:pPr>
         <w:pStyle w:val="Heading3"/>
       </w:pPr>
-      <w:bookmarkStart w:id="14" w:name="_Toc242176312"/>
+      <w:bookmarkStart w:id="14" w:name="_Toc242178850"/>
       <w:r>
         <w:t>2.2.2. Khởi động SQL Server</w:t>
       </w:r>
@@ -16827,7 +16827,7 @@
       <w:pPr>
         <w:pStyle w:val="Heading3"/>
       </w:pPr>
-      <w:bookmarkStart w:id="15" w:name="_Toc242176313"/>
+      <w:bookmarkStart w:id="15" w:name="_Toc242178851"/>
       <w:r>
         <w:t>2.2.3. Khởi tạo CSDL</w:t>
       </w:r>
@@ -17259,7 +17259,7 @@
       <w:pPr>
         <w:pStyle w:val="Heading3"/>
       </w:pPr>
-      <w:bookmarkStart w:id="16" w:name="_Toc242176314"/>
+      <w:bookmarkStart w:id="16" w:name="_Toc242178852"/>
       <w:r>
         <w:t>2.2.4. Bật, tắt SQL Server hằng ngày</w:t>
       </w:r>
@@ -17269,7 +17269,7 @@
       <w:pPr>
         <w:pStyle w:val="TableCaption"/>
       </w:pPr>
-      <w:bookmarkStart w:id="17" w:name="_Toc242176402"/>
+      <w:bookmarkStart w:id="17" w:name="_Toc242178940"/>
       <w:r>
         <w:t>Bảng 2.1. Các lệnh Docker thường dùng</w:t>
       </w:r>
@@ -17686,7 +17686,7 @@
       <w:pPr>
         <w:pStyle w:val="Heading2"/>
       </w:pPr>
-      <w:bookmarkStart w:id="18" w:name="_Toc242176315"/>
+      <w:bookmarkStart w:id="18" w:name="_Toc242178853"/>
       <w:r>
         <w:t>2.3. Phương án B - SQL Server cài trực tiếp trên Windows</w:t>
       </w:r>
@@ -17696,7 +17696,7 @@
       <w:pPr>
         <w:pStyle w:val="Heading3"/>
       </w:pPr>
-      <w:bookmarkStart w:id="19" w:name="_Toc242176316"/>
+      <w:bookmarkStart w:id="19" w:name="_Toc242178854"/>
       <w:r>
         <w:t>2.3.1. Cài SQL Server</w:t>
       </w:r>
@@ -18483,7 +18483,7 @@
       <w:pPr>
         <w:pStyle w:val="Heading3"/>
       </w:pPr>
-      <w:bookmarkStart w:id="20" w:name="_Toc242176317"/>
+      <w:bookmarkStart w:id="20" w:name="_Toc242178855"/>
       <w:r>
         <w:lastRenderedPageBreak/>
         <w:t>2.3.2. Cài công cụ quản trị và driver</w:t>
@@ -18674,7 +18674,7 @@
       <w:pPr>
         <w:pStyle w:val="Heading3"/>
       </w:pPr>
-      <w:bookmarkStart w:id="21" w:name="_Toc242176318"/>
+      <w:bookmarkStart w:id="21" w:name="_Toc242178856"/>
       <w:r>
         <w:t>2.3.3. Bật kết nối TCP/IP</w:t>
       </w:r>
@@ -19075,7 +19075,7 @@
       <w:pPr>
         <w:pStyle w:val="Heading3"/>
       </w:pPr>
-      <w:bookmarkStart w:id="22" w:name="_Toc242176319"/>
+      <w:bookmarkStart w:id="22" w:name="_Toc242178857"/>
       <w:r>
         <w:t>2.3.4. Khởi tạo CSDL</w:t>
       </w:r>
@@ -19625,7 +19625,7 @@
       <w:pPr>
         <w:pStyle w:val="Heading3"/>
       </w:pPr>
-      <w:bookmarkStart w:id="23" w:name="_Toc242176320"/>
+      <w:bookmarkStart w:id="23" w:name="_Toc242178858"/>
       <w:r>
         <w:lastRenderedPageBreak/>
         <w:t>2.3.5. Cho máy khác kết nối tới (không bắt buộc)</w:t>
@@ -19718,7 +19718,7 @@
       <w:pPr>
         <w:pStyle w:val="Heading2"/>
       </w:pPr>
-      <w:bookmarkStart w:id="24" w:name="_Toc242176321"/>
+      <w:bookmarkStart w:id="24" w:name="_Toc242178859"/>
       <w:r>
         <w:t>2.4. Nạp lại dữ liệu mẫu trước buổi demo</w:t>
       </w:r>
@@ -19830,7 +19830,7 @@
         <w:pStyle w:val="Heading1"/>
         <w:pageBreakBefore/>
       </w:pPr>
-      <w:bookmarkStart w:id="25" w:name="_Toc242176322"/>
+      <w:bookmarkStart w:id="25" w:name="_Toc242178860"/>
       <w:r>
         <w:lastRenderedPageBreak/>
         <w:t>CHƯƠNG 3. CÀI ĐẶT ỨNG DỤNG</w:t>
@@ -19841,7 +19841,7 @@
       <w:pPr>
         <w:pStyle w:val="Heading2"/>
       </w:pPr>
-      <w:bookmarkStart w:id="26" w:name="_Toc242176323"/>
+      <w:bookmarkStart w:id="26" w:name="_Toc242178861"/>
       <w:r>
         <w:t>3.1. Tải bộ cài</w:t>
       </w:r>
@@ -19872,14 +19872,14 @@
         <w:t>https://github.com/nhutruong-uit/imcp/releases</w:t>
       </w:r>
       <w:r>
-        <w:t>). Với phiên bản 1.0.0, tên các file là:</w:t>
+        <w:t>). Với phiên bản 1.0.1, tên các file là:</w:t>
       </w:r>
     </w:p>
     <w:p>
       <w:pPr>
         <w:pStyle w:val="TableCaption"/>
       </w:pPr>
-      <w:bookmarkStart w:id="27" w:name="_Toc242176403"/>
+      <w:bookmarkStart w:id="27" w:name="_Toc242178941"/>
       <w:r>
         <w:t>Bảng 3.1. Các file cài đặt</w:t>
       </w:r>
@@ -20057,7 +20057,7 @@
                 <w:color w:val="C7254E"/>
                 <w:sz w:val="21"/>
               </w:rPr>
-              <w:t>QLTTTA-1.0.0-macos-arm64.dmg</w:t>
+              <w:t>QLTTTA-1.0.1-macos-arm64.dmg</w:t>
             </w:r>
           </w:p>
         </w:tc>
@@ -20150,7 +20150,7 @@
                 <w:color w:val="C7254E"/>
                 <w:sz w:val="21"/>
               </w:rPr>
-              <w:t>QLTTTA-1.0.0-windows-x64-setup.exe</w:t>
+              <w:t>QLTTTA-1.0.1-windows-x64-setup.exe</w:t>
             </w:r>
           </w:p>
         </w:tc>
@@ -20242,7 +20242,7 @@
                 <w:color w:val="C7254E"/>
                 <w:sz w:val="21"/>
               </w:rPr>
-              <w:t>QLTTTA-1.0.0-windows-x64-portable.zip</w:t>
+              <w:t>QLTTTA-1.0.1-windows-x64-portable.zip</w:t>
             </w:r>
           </w:p>
         </w:tc>
@@ -20322,7 +20322,7 @@
       <w:pPr>
         <w:pStyle w:val="Heading2"/>
       </w:pPr>
-      <w:bookmarkStart w:id="28" w:name="_Toc242176324"/>
+      <w:bookmarkStart w:id="28" w:name="_Toc242178862"/>
       <w:r>
         <w:t>3.2. Cài đặt trên macOS</w:t>
       </w:r>
@@ -20617,7 +20617,7 @@
         <w:rPr>
           <w:color w:val="C7254E"/>
         </w:rPr>
-        <w:t>v1.0.0-build.&lt;số&gt;</w:t>
+        <w:t>v1.0.1-build.&lt;số&gt;</w:t>
       </w:r>
       <w:r>
         <w:t>):</w:t>
@@ -20723,7 +20723,7 @@
       <w:pPr>
         <w:pStyle w:val="Heading2"/>
       </w:pPr>
-      <w:bookmarkStart w:id="29" w:name="_Toc242176325"/>
+      <w:bookmarkStart w:id="29" w:name="_Toc242178863"/>
       <w:r>
         <w:t>3.3. Cài đặt trên Windows</w:t>
       </w:r>
@@ -20733,7 +20733,7 @@
       <w:pPr>
         <w:pStyle w:val="Heading3"/>
       </w:pPr>
-      <w:bookmarkStart w:id="30" w:name="_Toc242176326"/>
+      <w:bookmarkStart w:id="30" w:name="_Toc242178864"/>
       <w:r>
         <w:t>3.3.1. Dùng bộ cài setup.exe</w:t>
       </w:r>
@@ -20757,7 +20757,7 @@
         <w:rPr>
           <w:color w:val="C7254E"/>
         </w:rPr>
-        <w:t>QLTTTA-1.0.0-windows-x64-setup.exe</w:t>
+        <w:t>QLTTTA-1.0.1-windows-x64-setup.exe</w:t>
       </w:r>
       <w:r>
         <w:t xml:space="preserve">. Nếu Windows hiện </w:t>
@@ -21111,7 +21111,7 @@
                 <w:color w:val="C7254E"/>
                 <w:sz w:val="23"/>
               </w:rPr>
-              <w:t>QLTTTA-1.0.0-windows-x64-setup.exe /VERYSILENT /CURRENTUSER /MERGETASKS="!desktopicon"</w:t>
+              <w:t>QLTTTA-1.0.1-windows-x64-setup.exe /VERYSILENT /CURRENTUSER /MERGETASKS="!desktopicon"</w:t>
             </w:r>
             <w:r>
               <w:rPr>
@@ -21179,7 +21179,7 @@
         </w:rPr>
         <w:lastRenderedPageBreak/>
         <w:drawing>
-          <wp:inline distT="0" distB="0" distL="0" distR="0" wp14:anchorId="44A71E29" wp14:editId="5A3CE39C">
+          <wp:inline distT="0" distB="0" distL="0" distR="0" wp14:anchorId="423AE00D" wp14:editId="67B22DAF">
             <wp:extent cx="3420000" cy="3198254"/>
             <wp:effectExtent l="0" t="0" r="0" b="0"/>
             <wp:docPr id="522444761" name="Picture 522444761"/>
@@ -21219,7 +21219,7 @@
       <w:pPr>
         <w:pStyle w:val="FigureCaption"/>
       </w:pPr>
-      <w:bookmarkStart w:id="31" w:name="_Toc242176374"/>
+      <w:bookmarkStart w:id="31" w:name="_Toc242178912"/>
       <w:r>
         <w:t>Hình 3.1. Cảnh báo SmartScreen khi chạy bộ cài</w:t>
       </w:r>
@@ -21236,7 +21236,7 @@
           <w:noProof/>
         </w:rPr>
         <w:drawing>
-          <wp:inline distT="0" distB="0" distL="0" distR="0" wp14:anchorId="6CF4B3E8" wp14:editId="02A6BC21">
+          <wp:inline distT="0" distB="0" distL="0" distR="0" wp14:anchorId="398F800C" wp14:editId="51300E4C">
             <wp:extent cx="4500000" cy="3458417"/>
             <wp:effectExtent l="0" t="0" r="0" b="0"/>
             <wp:docPr id="522444762" name="Picture 522444762"/>
@@ -21276,7 +21276,7 @@
       <w:pPr>
         <w:pStyle w:val="FigureCaption"/>
       </w:pPr>
-      <w:bookmarkStart w:id="32" w:name="_Toc242176375"/>
+      <w:bookmarkStart w:id="32" w:name="_Toc242178913"/>
       <w:r>
         <w:t>Hình 3.2. Bước cuối của bộ cài QLTTTA trên Windows</w:t>
       </w:r>
@@ -21286,7 +21286,7 @@
       <w:pPr>
         <w:pStyle w:val="Heading3"/>
       </w:pPr>
-      <w:bookmarkStart w:id="33" w:name="_Toc242176327"/>
+      <w:bookmarkStart w:id="33" w:name="_Toc242178865"/>
       <w:r>
         <w:t>3.3.2. Dùng bản portable</w:t>
       </w:r>
@@ -21305,7 +21305,7 @@
         <w:rPr>
           <w:color w:val="C7254E"/>
         </w:rPr>
-        <w:t>QLTTTA-1.0.0-windows-x64-portable.zip</w:t>
+        <w:t>QLTTTA-1.0.1-windows-x64-portable.zip</w:t>
       </w:r>
       <w:r>
         <w:t xml:space="preserve"> vào một thư mục bất kỳ (ví dụ </w:t>
@@ -21333,7 +21333,7 @@
       <w:pPr>
         <w:pStyle w:val="Heading3"/>
       </w:pPr>
-      <w:bookmarkStart w:id="34" w:name="_Toc242176328"/>
+      <w:bookmarkStart w:id="34" w:name="_Toc242178866"/>
       <w:r>
         <w:lastRenderedPageBreak/>
         <w:t>3.3.3. Driver kết nối</w:t>
@@ -21390,7 +21390,7 @@
       <w:pPr>
         <w:pStyle w:val="Heading2"/>
       </w:pPr>
-      <w:bookmarkStart w:id="35" w:name="_Toc242176329"/>
+      <w:bookmarkStart w:id="35" w:name="_Toc242178867"/>
       <w:r>
         <w:t>3.4. Nơi lưu cấu hình và gỡ cài đặt</w:t>
       </w:r>
@@ -21410,7 +21410,7 @@
       <w:pPr>
         <w:pStyle w:val="TableCaption"/>
       </w:pPr>
-      <w:bookmarkStart w:id="36" w:name="_Toc242176404"/>
+      <w:bookmarkStart w:id="36" w:name="_Toc242178942"/>
       <w:r>
         <w:t>Bảng 3.2. Cấu hình đã lưu và cách gỡ ứng dụng</w:t>
       </w:r>
@@ -21979,7 +21979,7 @@
       <w:pPr>
         <w:pStyle w:val="Heading2"/>
       </w:pPr>
-      <w:bookmarkStart w:id="37" w:name="_Toc242176330"/>
+      <w:bookmarkStart w:id="37" w:name="_Toc242178868"/>
       <w:r>
         <w:t>3.5. Chạy từ mã nguồn (dành cho nhóm phát triển)</w:t>
       </w:r>
@@ -22512,7 +22512,7 @@
         <w:pStyle w:val="Heading1"/>
         <w:pageBreakBefore/>
       </w:pPr>
-      <w:bookmarkStart w:id="38" w:name="_Toc242176331"/>
+      <w:bookmarkStart w:id="38" w:name="_Toc242178869"/>
       <w:r>
         <w:lastRenderedPageBreak/>
         <w:t>CHƯƠNG 4. ĐĂNG NHẬP VÀ GIAO DIỆN CHUNG</w:t>
@@ -22523,7 +22523,7 @@
       <w:pPr>
         <w:pStyle w:val="Heading2"/>
       </w:pPr>
-      <w:bookmarkStart w:id="39" w:name="_Toc242176332"/>
+      <w:bookmarkStart w:id="39" w:name="_Toc242178870"/>
       <w:r>
         <w:t>4.1. Mở ứng dụng</w:t>
       </w:r>
@@ -22680,7 +22680,7 @@
           <w:noProof/>
         </w:rPr>
         <w:drawing>
-          <wp:inline distT="0" distB="0" distL="0" distR="0" wp14:anchorId="518BE03B" wp14:editId="7E2611A5">
+          <wp:inline distT="0" distB="0" distL="0" distR="0" wp14:anchorId="3BA14D74" wp14:editId="36253ECC">
             <wp:extent cx="4860000" cy="2938605"/>
             <wp:effectExtent l="0" t="0" r="0" b="0"/>
             <wp:docPr id="522444763" name="Picture 522444763"/>
@@ -22720,7 +22720,7 @@
       <w:pPr>
         <w:pStyle w:val="FigureCaption"/>
       </w:pPr>
-      <w:bookmarkStart w:id="40" w:name="_Toc242176376"/>
+      <w:bookmarkStart w:id="40" w:name="_Toc242178914"/>
       <w:r>
         <w:t>Hình 4.1. Màn hình đăng nhập</w:t>
       </w:r>
@@ -22730,7 +22730,7 @@
       <w:pPr>
         <w:pStyle w:val="Heading2"/>
       </w:pPr>
-      <w:bookmarkStart w:id="41" w:name="_Toc242176333"/>
+      <w:bookmarkStart w:id="41" w:name="_Toc242178871"/>
       <w:r>
         <w:t>4.2. Cấu hình máy chủ (lần chạy đầu tiên)</w:t>
       </w:r>
@@ -22881,7 +22881,7 @@
         </w:rPr>
         <w:lastRenderedPageBreak/>
         <w:drawing>
-          <wp:inline distT="0" distB="0" distL="0" distR="0" wp14:anchorId="157FF276" wp14:editId="68855495">
+          <wp:inline distT="0" distB="0" distL="0" distR="0" wp14:anchorId="4DE6E1EA" wp14:editId="2D75A4A0">
             <wp:extent cx="5040000" cy="3360000"/>
             <wp:effectExtent l="0" t="0" r="0" b="0"/>
             <wp:docPr id="522444764" name="Picture 522444764"/>
@@ -22921,7 +22921,7 @@
       <w:pPr>
         <w:pStyle w:val="FigureCaption"/>
       </w:pPr>
-      <w:bookmarkStart w:id="42" w:name="_Toc242176377"/>
+      <w:bookmarkStart w:id="42" w:name="_Toc242178915"/>
       <w:r>
         <w:t>Hình 4.2. Khung cấu hình máy chủ SQL Server</w:t>
       </w:r>
@@ -22931,7 +22931,7 @@
       <w:pPr>
         <w:pStyle w:val="TableCaption"/>
       </w:pPr>
-      <w:bookmarkStart w:id="43" w:name="_Toc242176405"/>
+      <w:bookmarkStart w:id="43" w:name="_Toc242178943"/>
       <w:r>
         <w:t>Bảng 4.1. Giá trị ô Máy chủ theo cách cài SQL Server</w:t>
       </w:r>
@@ -23371,7 +23371,7 @@
       <w:pPr>
         <w:pStyle w:val="Heading2"/>
       </w:pPr>
-      <w:bookmarkStart w:id="44" w:name="_Toc242176334"/>
+      <w:bookmarkStart w:id="44" w:name="_Toc242178872"/>
       <w:r>
         <w:t>4.3. Đăng nhập</w:t>
       </w:r>
@@ -23445,7 +23445,7 @@
       <w:pPr>
         <w:pStyle w:val="TableCaption"/>
       </w:pPr>
-      <w:bookmarkStart w:id="45" w:name="_Toc242176406"/>
+      <w:bookmarkStart w:id="45" w:name="_Toc242178944"/>
       <w:r>
         <w:t>Bảng 4.2. Tài khoản demo trong dữ liệu mẫu</w:t>
       </w:r>
@@ -24771,7 +24771,7 @@
       <w:pPr>
         <w:pStyle w:val="TableCaption"/>
       </w:pPr>
-      <w:bookmarkStart w:id="46" w:name="_Toc242176407"/>
+      <w:bookmarkStart w:id="46" w:name="_Toc242178945"/>
       <w:r>
         <w:t>Bảng 4.3. Thông báo lỗi khi đăng nhập</w:t>
       </w:r>
@@ -25195,7 +25195,7 @@
       <w:pPr>
         <w:pStyle w:val="Heading2"/>
       </w:pPr>
-      <w:bookmarkStart w:id="47" w:name="_Toc242176335"/>
+      <w:bookmarkStart w:id="47" w:name="_Toc242178873"/>
       <w:r>
         <w:t>4.4. Màn hình chính</w:t>
       </w:r>
@@ -25355,7 +25355,7 @@
           <w:noProof/>
         </w:rPr>
         <w:drawing>
-          <wp:inline distT="0" distB="0" distL="0" distR="0" wp14:anchorId="5E0ACF6A" wp14:editId="5FC3F5F0">
+          <wp:inline distT="0" distB="0" distL="0" distR="0" wp14:anchorId="15396711" wp14:editId="5633C1F4">
             <wp:extent cx="5580000" cy="3332500"/>
             <wp:effectExtent l="0" t="0" r="0" b="0"/>
             <wp:docPr id="522444765" name="Picture 522444765"/>
@@ -25395,7 +25395,7 @@
       <w:pPr>
         <w:pStyle w:val="FigureCaption"/>
       </w:pPr>
-      <w:bookmarkStart w:id="48" w:name="_Toc242176378"/>
+      <w:bookmarkStart w:id="48" w:name="_Toc242178916"/>
       <w:r>
         <w:t>Hình 4.3. Màn hình chính của vai trò Quản lý (trang Tổng quan)</w:t>
       </w:r>
@@ -25405,7 +25405,7 @@
       <w:pPr>
         <w:pStyle w:val="Heading2"/>
       </w:pPr>
-      <w:bookmarkStart w:id="49" w:name="_Toc242176336"/>
+      <w:bookmarkStart w:id="49" w:name="_Toc242178874"/>
       <w:r>
         <w:t>4.5. Đổi ngôn ngữ giao diện</w:t>
       </w:r>
@@ -25443,7 +25443,7 @@
       <w:pPr>
         <w:pStyle w:val="Heading2"/>
       </w:pPr>
-      <w:bookmarkStart w:id="50" w:name="_Toc242176337"/>
+      <w:bookmarkStart w:id="50" w:name="_Toc242178875"/>
       <w:r>
         <w:t>4.6. Đổi mật khẩu</w:t>
       </w:r>
@@ -25559,7 +25559,7 @@
           <w:noProof/>
         </w:rPr>
         <w:drawing>
-          <wp:inline distT="0" distB="0" distL="0" distR="0" wp14:anchorId="7BBEEF9F" wp14:editId="66FB9521">
+          <wp:inline distT="0" distB="0" distL="0" distR="0" wp14:anchorId="1AA4921F" wp14:editId="368678FE">
             <wp:extent cx="3420000" cy="1368000"/>
             <wp:effectExtent l="0" t="0" r="0" b="0"/>
             <wp:docPr id="522444766" name="Picture 522444766"/>
@@ -25599,7 +25599,7 @@
       <w:pPr>
         <w:pStyle w:val="FigureCaption"/>
       </w:pPr>
-      <w:bookmarkStart w:id="51" w:name="_Toc242176379"/>
+      <w:bookmarkStart w:id="51" w:name="_Toc242178917"/>
       <w:r>
         <w:t>Hình 4.4. Hộp thoại đổi mật khẩu</w:t>
       </w:r>
@@ -25641,7 +25641,7 @@
       <w:pPr>
         <w:pStyle w:val="Heading2"/>
       </w:pPr>
-      <w:bookmarkStart w:id="52" w:name="_Toc242176338"/>
+      <w:bookmarkStart w:id="52" w:name="_Toc242178876"/>
       <w:r>
         <w:t>4.7. Đăng xuất và thoát</w:t>
       </w:r>
@@ -25688,7 +25688,7 @@
       <w:pPr>
         <w:pStyle w:val="Heading2"/>
       </w:pPr>
-      <w:bookmarkStart w:id="53" w:name="_Toc242176339"/>
+      <w:bookmarkStart w:id="53" w:name="_Toc242178877"/>
       <w:r>
         <w:t>4.8. Thao tác chung trên các màn hình danh sách</w:t>
       </w:r>
@@ -25715,7 +25715,7 @@
           <w:noProof/>
         </w:rPr>
         <w:drawing>
-          <wp:inline distT="0" distB="0" distL="0" distR="0" wp14:anchorId="5C950241" wp14:editId="5B846DB3">
+          <wp:inline distT="0" distB="0" distL="0" distR="0" wp14:anchorId="5FDC77EC" wp14:editId="27F175CC">
             <wp:extent cx="5580000" cy="3332500"/>
             <wp:effectExtent l="0" t="0" r="0" b="0"/>
             <wp:docPr id="522444767" name="Picture 522444767"/>
@@ -25755,7 +25755,7 @@
       <w:pPr>
         <w:pStyle w:val="FigureCaption"/>
       </w:pPr>
-      <w:bookmarkStart w:id="54" w:name="_Toc242176380"/>
+      <w:bookmarkStart w:id="54" w:name="_Toc242178918"/>
       <w:r>
         <w:t>Hình 4.5. Một màn hình danh sách: Công nợ học phí</w:t>
       </w:r>
@@ -25765,7 +25765,7 @@
       <w:pPr>
         <w:pStyle w:val="TableCaption"/>
       </w:pPr>
-      <w:bookmarkStart w:id="55" w:name="_Toc242176408"/>
+      <w:bookmarkStart w:id="55" w:name="_Toc242178946"/>
       <w:r>
         <w:t>Bảng 4.4. Các thành phần của màn hình danh sách</w:t>
       </w:r>
@@ -26620,7 +26620,7 @@
       <w:pPr>
         <w:pStyle w:val="Heading2"/>
       </w:pPr>
-      <w:bookmarkStart w:id="56" w:name="_Toc242176340"/>
+      <w:bookmarkStart w:id="56" w:name="_Toc242178878"/>
       <w:r>
         <w:t>4.9. Form nhập liệu và hộp xác nhận</w:t>
       </w:r>
@@ -26783,7 +26783,7 @@
         <w:pStyle w:val="Heading1"/>
         <w:pageBreakBefore/>
       </w:pPr>
-      <w:bookmarkStart w:id="57" w:name="_Toc242176341"/>
+      <w:bookmarkStart w:id="57" w:name="_Toc242178879"/>
       <w:r>
         <w:lastRenderedPageBreak/>
         <w:t>CHƯƠNG 5. HƯỚNG DẪN THEO CHỨC NĂNG</w:t>
@@ -26804,7 +26804,7 @@
       <w:pPr>
         <w:pStyle w:val="Heading2"/>
       </w:pPr>
-      <w:bookmarkStart w:id="58" w:name="_Toc242176342"/>
+      <w:bookmarkStart w:id="58" w:name="_Toc242178880"/>
       <w:r>
         <w:t>5.1. Tổng quan</w:t>
       </w:r>
@@ -26848,7 +26848,7 @@
       <w:pPr>
         <w:pStyle w:val="TableCaption"/>
       </w:pPr>
-      <w:bookmarkStart w:id="59" w:name="_Toc242176409"/>
+      <w:bookmarkStart w:id="59" w:name="_Toc242178947"/>
       <w:r>
         <w:t>Bảng 5.1. Các thẻ số liệu trên trang Tổng quan</w:t>
       </w:r>
@@ -27330,7 +27330,7 @@
           <w:noProof/>
         </w:rPr>
         <w:drawing>
-          <wp:inline distT="0" distB="0" distL="0" distR="0" wp14:anchorId="02715010" wp14:editId="501915BB">
+          <wp:inline distT="0" distB="0" distL="0" distR="0" wp14:anchorId="7540DD83" wp14:editId="547ED297">
             <wp:extent cx="5580000" cy="3332500"/>
             <wp:effectExtent l="0" t="0" r="0" b="0"/>
             <wp:docPr id="522444768" name="Picture 522444768"/>
@@ -27370,7 +27370,7 @@
       <w:pPr>
         <w:pStyle w:val="FigureCaption"/>
       </w:pPr>
-      <w:bookmarkStart w:id="60" w:name="_Toc242176381"/>
+      <w:bookmarkStart w:id="60" w:name="_Toc242178919"/>
       <w:r>
         <w:t>Hình 5.1. Trang Tổng quan của Giáo vụ: không có quyền xem doanh thu</w:t>
       </w:r>
@@ -27380,7 +27380,7 @@
       <w:pPr>
         <w:pStyle w:val="Heading2"/>
       </w:pPr>
-      <w:bookmarkStart w:id="61" w:name="_Toc242176343"/>
+      <w:bookmarkStart w:id="61" w:name="_Toc242178881"/>
       <w:r>
         <w:lastRenderedPageBreak/>
         <w:t>5.2. Học viên</w:t>
@@ -27414,7 +27414,7 @@
           <w:noProof/>
         </w:rPr>
         <w:drawing>
-          <wp:inline distT="0" distB="0" distL="0" distR="0" wp14:anchorId="6D638F4F" wp14:editId="1F7DBB85">
+          <wp:inline distT="0" distB="0" distL="0" distR="0" wp14:anchorId="2061C931" wp14:editId="62702A93">
             <wp:extent cx="5580000" cy="3332500"/>
             <wp:effectExtent l="0" t="0" r="0" b="0"/>
             <wp:docPr id="522444769" name="Picture 522444769"/>
@@ -27454,7 +27454,7 @@
       <w:pPr>
         <w:pStyle w:val="FigureCaption"/>
       </w:pPr>
-      <w:bookmarkStart w:id="62" w:name="_Toc242176382"/>
+      <w:bookmarkStart w:id="62" w:name="_Toc242178920"/>
       <w:r>
         <w:t>Hình 5.2. Danh sách học viên</w:t>
       </w:r>
@@ -27464,7 +27464,7 @@
       <w:pPr>
         <w:pStyle w:val="Heading3"/>
       </w:pPr>
-      <w:bookmarkStart w:id="63" w:name="_Toc242176344"/>
+      <w:bookmarkStart w:id="63" w:name="_Toc242178882"/>
       <w:r>
         <w:t>5.2.1. Tìm kiếm</w:t>
       </w:r>
@@ -27561,7 +27561,7 @@
       <w:pPr>
         <w:pStyle w:val="Heading3"/>
       </w:pPr>
-      <w:bookmarkStart w:id="64" w:name="_Toc242176345"/>
+      <w:bookmarkStart w:id="64" w:name="_Toc242178883"/>
       <w:r>
         <w:t>5.2.2. Thêm học viên</w:t>
       </w:r>
@@ -27766,7 +27766,7 @@
       <w:pPr>
         <w:pStyle w:val="Heading3"/>
       </w:pPr>
-      <w:bookmarkStart w:id="65" w:name="_Toc242176346"/>
+      <w:bookmarkStart w:id="65" w:name="_Toc242178884"/>
       <w:r>
         <w:t>5.2.3. Sửa thông tin</w:t>
       </w:r>
@@ -27887,7 +27887,7 @@
           <w:noProof/>
         </w:rPr>
         <w:drawing>
-          <wp:inline distT="0" distB="0" distL="0" distR="0" wp14:anchorId="358F8D7F" wp14:editId="5F34131B">
+          <wp:inline distT="0" distB="0" distL="0" distR="0" wp14:anchorId="041E3813" wp14:editId="1659EF3F">
             <wp:extent cx="3780000" cy="5048129"/>
             <wp:effectExtent l="0" t="0" r="0" b="0"/>
             <wp:docPr id="522444770" name="Picture 522444770"/>
@@ -27927,7 +27927,7 @@
       <w:pPr>
         <w:pStyle w:val="FigureCaption"/>
       </w:pPr>
-      <w:bookmarkStart w:id="66" w:name="_Toc242176383"/>
+      <w:bookmarkStart w:id="66" w:name="_Toc242178921"/>
       <w:r>
         <w:t>Hình 5.3. Hộp thoại sửa thông tin học viên</w:t>
       </w:r>
@@ -27947,7 +27947,7 @@
       <w:pPr>
         <w:pStyle w:val="TableCaption"/>
       </w:pPr>
-      <w:bookmarkStart w:id="67" w:name="_Toc242176410"/>
+      <w:bookmarkStart w:id="67" w:name="_Toc242178948"/>
       <w:r>
         <w:t>Bảng 5.2. Quy tắc kiểm tra thông tin học viên</w:t>
       </w:r>
@@ -28611,7 +28611,7 @@
       <w:pPr>
         <w:pStyle w:val="Heading3"/>
       </w:pPr>
-      <w:bookmarkStart w:id="68" w:name="_Toc242176347"/>
+      <w:bookmarkStart w:id="68" w:name="_Toc242178885"/>
       <w:r>
         <w:t>5.2.4. Xóa học viên</w:t>
       </w:r>
@@ -28732,7 +28732,7 @@
       <w:pPr>
         <w:pStyle w:val="Heading3"/>
       </w:pPr>
-      <w:bookmarkStart w:id="69" w:name="_Toc242176348"/>
+      <w:bookmarkStart w:id="69" w:name="_Toc242178886"/>
       <w:r>
         <w:t>5.2.5. Hồ sơ, ghi danh và kiểm tra xếp lớp từ danh sách học viên</w:t>
       </w:r>
@@ -28830,7 +28830,7 @@
       <w:pPr>
         <w:pStyle w:val="Heading3"/>
       </w:pPr>
-      <w:bookmarkStart w:id="70" w:name="_Toc242176349"/>
+      <w:bookmarkStart w:id="70" w:name="_Toc242178887"/>
       <w:r>
         <w:t>5.2.6. Xuất, nhập danh sách bằng XML</w:t>
       </w:r>
@@ -28916,7 +28916,7 @@
       <w:pPr>
         <w:pStyle w:val="Heading2"/>
       </w:pPr>
-      <w:bookmarkStart w:id="71" w:name="_Toc242176350"/>
+      <w:bookmarkStart w:id="71" w:name="_Toc242178888"/>
       <w:r>
         <w:t>5.3. Kiểm tra xếp lớp</w:t>
       </w:r>
@@ -29004,7 +29004,7 @@
         </w:rPr>
         <w:lastRenderedPageBreak/>
         <w:drawing>
-          <wp:inline distT="0" distB="0" distL="0" distR="0" wp14:anchorId="6BCDE812" wp14:editId="554CDEA4">
+          <wp:inline distT="0" distB="0" distL="0" distR="0" wp14:anchorId="133BFC29" wp14:editId="7F45742D">
             <wp:extent cx="5580000" cy="3332500"/>
             <wp:effectExtent l="0" t="0" r="0" b="0"/>
             <wp:docPr id="522444771" name="Picture 522444771"/>
@@ -29044,7 +29044,7 @@
       <w:pPr>
         <w:pStyle w:val="FigureCaption"/>
       </w:pPr>
-      <w:bookmarkStart w:id="72" w:name="_Toc242176384"/>
+      <w:bookmarkStart w:id="72" w:name="_Toc242178922"/>
       <w:r>
         <w:t>Hình 5.4. Danh sách bài kiểm tra xếp lớp</w:t>
       </w:r>
@@ -29309,7 +29309,7 @@
       <w:pPr>
         <w:pStyle w:val="Heading2"/>
       </w:pPr>
-      <w:bookmarkStart w:id="73" w:name="_Toc242176351"/>
+      <w:bookmarkStart w:id="73" w:name="_Toc242178889"/>
       <w:r>
         <w:t>5.4. Lớp học</w:t>
       </w:r>
@@ -29361,7 +29361,7 @@
         </w:rPr>
         <w:lastRenderedPageBreak/>
         <w:drawing>
-          <wp:inline distT="0" distB="0" distL="0" distR="0" wp14:anchorId="01062D32" wp14:editId="6500950E">
+          <wp:inline distT="0" distB="0" distL="0" distR="0" wp14:anchorId="2686E6E6" wp14:editId="2054C579">
             <wp:extent cx="5580000" cy="3332500"/>
             <wp:effectExtent l="0" t="0" r="0" b="0"/>
             <wp:docPr id="522444772" name="Picture 522444772"/>
@@ -29401,7 +29401,7 @@
       <w:pPr>
         <w:pStyle w:val="FigureCaption"/>
       </w:pPr>
-      <w:bookmarkStart w:id="74" w:name="_Toc242176385"/>
+      <w:bookmarkStart w:id="74" w:name="_Toc242178923"/>
       <w:r>
         <w:t>Hình 5.5. Màn hình Lớp học và các nút quản lý vòng đời lớp</w:t>
       </w:r>
@@ -29881,7 +29881,7 @@
       <w:pPr>
         <w:pStyle w:val="TableCaption"/>
       </w:pPr>
-      <w:bookmarkStart w:id="75" w:name="_Toc242176411"/>
+      <w:bookmarkStart w:id="75" w:name="_Toc242178949"/>
       <w:r>
         <w:t>Bảng 5.3. Quy tắc CSDL kiểm tra khi quản lý lớp học</w:t>
       </w:r>
@@ -30412,7 +30412,7 @@
       <w:pPr>
         <w:pStyle w:val="Heading2"/>
       </w:pPr>
-      <w:bookmarkStart w:id="76" w:name="_Toc242176352"/>
+      <w:bookmarkStart w:id="76" w:name="_Toc242178890"/>
       <w:r>
         <w:t>5.5. Ghi danh</w:t>
       </w:r>
@@ -30473,7 +30473,7 @@
         </w:rPr>
         <w:lastRenderedPageBreak/>
         <w:drawing>
-          <wp:inline distT="0" distB="0" distL="0" distR="0" wp14:anchorId="62631546" wp14:editId="0E3405E9">
+          <wp:inline distT="0" distB="0" distL="0" distR="0" wp14:anchorId="6F28641C" wp14:editId="7B956600">
             <wp:extent cx="5580000" cy="3332500"/>
             <wp:effectExtent l="0" t="0" r="0" b="0"/>
             <wp:docPr id="522444773" name="Picture 522444773"/>
@@ -30513,7 +30513,7 @@
       <w:pPr>
         <w:pStyle w:val="FigureCaption"/>
       </w:pPr>
-      <w:bookmarkStart w:id="77" w:name="_Toc242176386"/>
+      <w:bookmarkStart w:id="77" w:name="_Toc242178924"/>
       <w:r>
         <w:t>Hình 5.6. Danh sách ghi danh</w:t>
       </w:r>
@@ -30785,7 +30785,7 @@
       <w:pPr>
         <w:pStyle w:val="TableCaption"/>
       </w:pPr>
-      <w:bookmarkStart w:id="78" w:name="_Toc242176412"/>
+      <w:bookmarkStart w:id="78" w:name="_Toc242178950"/>
       <w:r>
         <w:t>Bảng 5.4. Quy tắc CSDL kiểm tra khi ghi danh và chuyển lớp</w:t>
       </w:r>
@@ -31175,7 +31175,7 @@
       <w:pPr>
         <w:pStyle w:val="Heading2"/>
       </w:pPr>
-      <w:bookmarkStart w:id="79" w:name="_Toc242176353"/>
+      <w:bookmarkStart w:id="79" w:name="_Toc242178891"/>
       <w:r>
         <w:t>5.6. Lịch học - điểm danh</w:t>
       </w:r>
@@ -31262,7 +31262,7 @@
           <w:noProof/>
         </w:rPr>
         <w:drawing>
-          <wp:inline distT="0" distB="0" distL="0" distR="0" wp14:anchorId="7CD36933" wp14:editId="5577B426">
+          <wp:inline distT="0" distB="0" distL="0" distR="0" wp14:anchorId="2D771A7E" wp14:editId="4D401D6D">
             <wp:extent cx="5580000" cy="3332500"/>
             <wp:effectExtent l="0" t="0" r="0" b="0"/>
             <wp:docPr id="522444774" name="Picture 522444774"/>
@@ -31302,7 +31302,7 @@
       <w:pPr>
         <w:pStyle w:val="FigureCaption"/>
       </w:pPr>
-      <w:bookmarkStart w:id="80" w:name="_Toc242176387"/>
+      <w:bookmarkStart w:id="80" w:name="_Toc242178925"/>
       <w:r>
         <w:t>Hình 5.7. Lịch học - điểm danh của một tuần</w:t>
       </w:r>
@@ -31542,7 +31542,7 @@
       <w:pPr>
         <w:pStyle w:val="Heading2"/>
       </w:pPr>
-      <w:bookmarkStart w:id="81" w:name="_Toc242176354"/>
+      <w:bookmarkStart w:id="81" w:name="_Toc242178892"/>
       <w:r>
         <w:lastRenderedPageBreak/>
         <w:t>5.7. Sổ điểm</w:t>
@@ -31585,7 +31585,7 @@
           <w:noProof/>
         </w:rPr>
         <w:drawing>
-          <wp:inline distT="0" distB="0" distL="0" distR="0" wp14:anchorId="6C4701ED" wp14:editId="7B21BF0E">
+          <wp:inline distT="0" distB="0" distL="0" distR="0" wp14:anchorId="2FB5CDA5" wp14:editId="6C9EEDC2">
             <wp:extent cx="5580000" cy="3332500"/>
             <wp:effectExtent l="0" t="0" r="0" b="0"/>
             <wp:docPr id="522444775" name="Picture 522444775"/>
@@ -31625,7 +31625,7 @@
       <w:pPr>
         <w:pStyle w:val="FigureCaption"/>
       </w:pPr>
-      <w:bookmarkStart w:id="82" w:name="_Toc242176388"/>
+      <w:bookmarkStart w:id="82" w:name="_Toc242178926"/>
       <w:r>
         <w:t>Hình 5.8. Sổ điểm của một lớp</w:t>
       </w:r>
@@ -31753,7 +31753,7 @@
       <w:pPr>
         <w:pStyle w:val="Heading2"/>
       </w:pPr>
-      <w:bookmarkStart w:id="83" w:name="_Toc242176355"/>
+      <w:bookmarkStart w:id="83" w:name="_Toc242178893"/>
       <w:r>
         <w:t>5.8. Kết quả học tập</w:t>
       </w:r>
@@ -31817,7 +31817,7 @@
           <w:noProof/>
         </w:rPr>
         <w:drawing>
-          <wp:inline distT="0" distB="0" distL="0" distR="0" wp14:anchorId="58AB73BF" wp14:editId="4484435F">
+          <wp:inline distT="0" distB="0" distL="0" distR="0" wp14:anchorId="28141BDF" wp14:editId="267DFF2C">
             <wp:extent cx="5580000" cy="3332500"/>
             <wp:effectExtent l="0" t="0" r="0" b="0"/>
             <wp:docPr id="522444776" name="Picture 522444776"/>
@@ -31857,7 +31857,7 @@
       <w:pPr>
         <w:pStyle w:val="FigureCaption"/>
       </w:pPr>
-      <w:bookmarkStart w:id="84" w:name="_Toc242176389"/>
+      <w:bookmarkStart w:id="84" w:name="_Toc242178927"/>
       <w:r>
         <w:t>Hình 5.9. Kết quả học tập</w:t>
       </w:r>
@@ -31867,7 +31867,7 @@
       <w:pPr>
         <w:pStyle w:val="Heading2"/>
       </w:pPr>
-      <w:bookmarkStart w:id="85" w:name="_Toc242176356"/>
+      <w:bookmarkStart w:id="85" w:name="_Toc242178894"/>
       <w:r>
         <w:t>5.9. Thu học phí</w:t>
       </w:r>
@@ -31936,7 +31936,7 @@
           <w:noProof/>
         </w:rPr>
         <w:drawing>
-          <wp:inline distT="0" distB="0" distL="0" distR="0" wp14:anchorId="21197D50" wp14:editId="69E92BD2">
+          <wp:inline distT="0" distB="0" distL="0" distR="0" wp14:anchorId="4AB30790" wp14:editId="5135EB37">
             <wp:extent cx="5580000" cy="3332500"/>
             <wp:effectExtent l="0" t="0" r="0" b="0"/>
             <wp:docPr id="522444777" name="Picture 522444777"/>
@@ -31976,7 +31976,7 @@
       <w:pPr>
         <w:pStyle w:val="FigureCaption"/>
       </w:pPr>
-      <w:bookmarkStart w:id="86" w:name="_Toc242176390"/>
+      <w:bookmarkStart w:id="86" w:name="_Toc242178928"/>
       <w:r>
         <w:t>Hình 5.10. Danh sách phiếu thu (Kế toán)</w:t>
       </w:r>
@@ -32287,7 +32287,7 @@
       <w:pPr>
         <w:pStyle w:val="Heading2"/>
       </w:pPr>
-      <w:bookmarkStart w:id="87" w:name="_Toc242176357"/>
+      <w:bookmarkStart w:id="87" w:name="_Toc242178895"/>
       <w:r>
         <w:t>5.10. Công nợ học phí</w:t>
       </w:r>
@@ -32340,7 +32340,7 @@
       <w:pPr>
         <w:pStyle w:val="Heading2"/>
       </w:pPr>
-      <w:bookmarkStart w:id="88" w:name="_Toc242176358"/>
+      <w:bookmarkStart w:id="88" w:name="_Toc242178896"/>
       <w:r>
         <w:t>5.11. Doanh thu</w:t>
       </w:r>
@@ -32442,7 +32442,7 @@
         </w:rPr>
         <w:lastRenderedPageBreak/>
         <w:drawing>
-          <wp:inline distT="0" distB="0" distL="0" distR="0" wp14:anchorId="3142F540" wp14:editId="70C7698B">
+          <wp:inline distT="0" distB="0" distL="0" distR="0" wp14:anchorId="1C8D76E6" wp14:editId="7A1707D4">
             <wp:extent cx="5580000" cy="3332500"/>
             <wp:effectExtent l="0" t="0" r="0" b="0"/>
             <wp:docPr id="522444778" name="Picture 522444778"/>
@@ -32482,7 +32482,7 @@
       <w:pPr>
         <w:pStyle w:val="FigureCaption"/>
       </w:pPr>
-      <w:bookmarkStart w:id="89" w:name="_Toc242176391"/>
+      <w:bookmarkStart w:id="89" w:name="_Toc242178929"/>
       <w:r>
         <w:t>Hình 5.11. Doanh thu theo tháng và chi nhánh (Kế toán)</w:t>
       </w:r>
@@ -32492,7 +32492,7 @@
       <w:pPr>
         <w:pStyle w:val="Heading2"/>
       </w:pPr>
-      <w:bookmarkStart w:id="90" w:name="_Toc242176359"/>
+      <w:bookmarkStart w:id="90" w:name="_Toc242178897"/>
       <w:r>
         <w:t>5.12. Lương giáo viên</w:t>
       </w:r>
@@ -32543,7 +32543,7 @@
           <w:noProof/>
         </w:rPr>
         <w:drawing>
-          <wp:inline distT="0" distB="0" distL="0" distR="0" wp14:anchorId="2D28FCC6" wp14:editId="1875F466">
+          <wp:inline distT="0" distB="0" distL="0" distR="0" wp14:anchorId="60944BA5" wp14:editId="3426EDE8">
             <wp:extent cx="5580000" cy="3332500"/>
             <wp:effectExtent l="0" t="0" r="0" b="0"/>
             <wp:docPr id="522444779" name="Picture 522444779"/>
@@ -32583,7 +32583,7 @@
       <w:pPr>
         <w:pStyle w:val="FigureCaption"/>
       </w:pPr>
-      <w:bookmarkStart w:id="91" w:name="_Toc242176392"/>
+      <w:bookmarkStart w:id="91" w:name="_Toc242178930"/>
       <w:r>
         <w:t>Hình 5.12. Bảng lương giáo viên (Kế toán)</w:t>
       </w:r>
@@ -32690,7 +32690,7 @@
       <w:pPr>
         <w:pStyle w:val="Heading2"/>
       </w:pPr>
-      <w:bookmarkStart w:id="92" w:name="_Toc242176360"/>
+      <w:bookmarkStart w:id="92" w:name="_Toc242178898"/>
       <w:r>
         <w:t>5.13. Danh mục</w:t>
       </w:r>
@@ -32743,7 +32743,7 @@
       <w:pPr>
         <w:pStyle w:val="Heading3"/>
       </w:pPr>
-      <w:bookmarkStart w:id="93" w:name="_Toc242176361"/>
+      <w:bookmarkStart w:id="93" w:name="_Toc242178899"/>
       <w:r>
         <w:t>5.13.1. Khóa học</w:t>
       </w:r>
@@ -32779,7 +32779,7 @@
           <w:noProof/>
         </w:rPr>
         <w:drawing>
-          <wp:inline distT="0" distB="0" distL="0" distR="0" wp14:anchorId="002DB6F0" wp14:editId="74CFCC68">
+          <wp:inline distT="0" distB="0" distL="0" distR="0" wp14:anchorId="5481A583" wp14:editId="0CB77054">
             <wp:extent cx="5580000" cy="3332500"/>
             <wp:effectExtent l="0" t="0" r="0" b="0"/>
             <wp:docPr id="522444780" name="Picture 522444780"/>
@@ -32819,7 +32819,7 @@
       <w:pPr>
         <w:pStyle w:val="FigureCaption"/>
       </w:pPr>
-      <w:bookmarkStart w:id="94" w:name="_Toc242176393"/>
+      <w:bookmarkStart w:id="94" w:name="_Toc242178931"/>
       <w:r>
         <w:t>Hình 5.13. Danh mục khóa học và cột điểm của khóa đang chọn</w:t>
       </w:r>
@@ -33023,7 +33023,7 @@
       <w:pPr>
         <w:pStyle w:val="Heading3"/>
       </w:pPr>
-      <w:bookmarkStart w:id="95" w:name="_Toc242176362"/>
+      <w:bookmarkStart w:id="95" w:name="_Toc242178900"/>
       <w:r>
         <w:t>5.13.2. Giáo viên, Nhân viên</w:t>
       </w:r>
@@ -33150,7 +33150,7 @@
       <w:pPr>
         <w:pStyle w:val="Heading3"/>
       </w:pPr>
-      <w:bookmarkStart w:id="96" w:name="_Toc242176363"/>
+      <w:bookmarkStart w:id="96" w:name="_Toc242178901"/>
       <w:r>
         <w:t>5.13.3. Chi nhánh - phòng học, Khuyến mãi</w:t>
       </w:r>
@@ -33348,7 +33348,7 @@
         </w:rPr>
         <w:lastRenderedPageBreak/>
         <w:drawing>
-          <wp:inline distT="0" distB="0" distL="0" distR="0" wp14:anchorId="62E1ACF7" wp14:editId="06B55946">
+          <wp:inline distT="0" distB="0" distL="0" distR="0" wp14:anchorId="745D02E8" wp14:editId="2F45678F">
             <wp:extent cx="5580000" cy="3332500"/>
             <wp:effectExtent l="0" t="0" r="0" b="0"/>
             <wp:docPr id="522444781" name="Picture 522444781"/>
@@ -33388,7 +33388,7 @@
       <w:pPr>
         <w:pStyle w:val="FigureCaption"/>
       </w:pPr>
-      <w:bookmarkStart w:id="97" w:name="_Toc242176394"/>
+      <w:bookmarkStart w:id="97" w:name="_Toc242178932"/>
       <w:r>
         <w:t>Hình 5.14. Chi nhánh và phòng học của chi nhánh đang chọn</w:t>
       </w:r>
@@ -33398,7 +33398,7 @@
       <w:pPr>
         <w:pStyle w:val="Heading2"/>
       </w:pPr>
-      <w:bookmarkStart w:id="98" w:name="_Toc242176364"/>
+      <w:bookmarkStart w:id="98" w:name="_Toc242178902"/>
       <w:r>
         <w:t>5.14. Tài khoản</w:t>
       </w:r>
@@ -33449,7 +33449,7 @@
           <w:noProof/>
         </w:rPr>
         <w:drawing>
-          <wp:inline distT="0" distB="0" distL="0" distR="0" wp14:anchorId="762E883A" wp14:editId="722D02F1">
+          <wp:inline distT="0" distB="0" distL="0" distR="0" wp14:anchorId="14A2945F" wp14:editId="3C22B590">
             <wp:extent cx="5580000" cy="3332500"/>
             <wp:effectExtent l="0" t="0" r="0" b="0"/>
             <wp:docPr id="522444782" name="Picture 522444782"/>
@@ -33489,7 +33489,7 @@
       <w:pPr>
         <w:pStyle w:val="FigureCaption"/>
       </w:pPr>
-      <w:bookmarkStart w:id="99" w:name="_Toc242176395"/>
+      <w:bookmarkStart w:id="99" w:name="_Toc242178933"/>
       <w:r>
         <w:t>Hình 5.15. Danh sách tài khoản (Quản lý)</w:t>
       </w:r>
@@ -33649,7 +33649,7 @@
       <w:pPr>
         <w:pStyle w:val="Heading2"/>
       </w:pPr>
-      <w:bookmarkStart w:id="100" w:name="_Toc242176365"/>
+      <w:bookmarkStart w:id="100" w:name="_Toc242178903"/>
       <w:r>
         <w:t>5.15. Sao lưu</w:t>
       </w:r>
@@ -33799,7 +33799,7 @@
           <w:noProof/>
         </w:rPr>
         <w:drawing>
-          <wp:inline distT="0" distB="0" distL="0" distR="0" wp14:anchorId="43D6CAB7" wp14:editId="222BAF5D">
+          <wp:inline distT="0" distB="0" distL="0" distR="0" wp14:anchorId="1A9C1FDE" wp14:editId="727F5738">
             <wp:extent cx="5580000" cy="3332500"/>
             <wp:effectExtent l="0" t="0" r="0" b="0"/>
             <wp:docPr id="522444783" name="Picture 522444783"/>
@@ -33839,7 +33839,7 @@
       <w:pPr>
         <w:pStyle w:val="FigureCaption"/>
       </w:pPr>
-      <w:bookmarkStart w:id="101" w:name="_Toc242176396"/>
+      <w:bookmarkStart w:id="101" w:name="_Toc242178934"/>
       <w:r>
         <w:t>Hình 5.16. Màn hình sao lưu cơ sở dữ liệu</w:t>
       </w:r>
@@ -33868,7 +33868,7 @@
       <w:pPr>
         <w:pStyle w:val="Heading2"/>
       </w:pPr>
-      <w:bookmarkStart w:id="102" w:name="_Toc242176366"/>
+      <w:bookmarkStart w:id="102" w:name="_Toc242178904"/>
       <w:r>
         <w:lastRenderedPageBreak/>
         <w:t>5.16. Chức năng dành cho giáo viên</w:t>
@@ -34018,7 +34018,7 @@
           <w:noProof/>
         </w:rPr>
         <w:drawing>
-          <wp:inline distT="0" distB="0" distL="0" distR="0" wp14:anchorId="00F3574F" wp14:editId="126920FB">
+          <wp:inline distT="0" distB="0" distL="0" distR="0" wp14:anchorId="1A41FBCD" wp14:editId="7065B612">
             <wp:extent cx="5580000" cy="3332500"/>
             <wp:effectExtent l="0" t="0" r="0" b="0"/>
             <wp:docPr id="522444784" name="Picture 522444784"/>
@@ -34058,7 +34058,7 @@
       <w:pPr>
         <w:pStyle w:val="FigureCaption"/>
       </w:pPr>
-      <w:bookmarkStart w:id="103" w:name="_Toc242176397"/>
+      <w:bookmarkStart w:id="103" w:name="_Toc242178935"/>
       <w:r>
         <w:t>Hình 5.17. Lịch dạy của giáo viên</w:t>
       </w:r>
@@ -34076,7 +34076,7 @@
         </w:rPr>
         <w:lastRenderedPageBreak/>
         <w:drawing>
-          <wp:inline distT="0" distB="0" distL="0" distR="0" wp14:anchorId="66230843" wp14:editId="6900D7D4">
+          <wp:inline distT="0" distB="0" distL="0" distR="0" wp14:anchorId="0906BF23" wp14:editId="62DF5916">
             <wp:extent cx="5580000" cy="3332500"/>
             <wp:effectExtent l="0" t="0" r="0" b="0"/>
             <wp:docPr id="522444785" name="Picture 522444785"/>
@@ -34116,7 +34116,7 @@
       <w:pPr>
         <w:pStyle w:val="FigureCaption"/>
       </w:pPr>
-      <w:bookmarkStart w:id="104" w:name="_Toc242176398"/>
+      <w:bookmarkStart w:id="104" w:name="_Toc242178936"/>
       <w:r>
         <w:t>Hình 5.18. Sổ điểm của giáo viên</w:t>
       </w:r>
@@ -34126,7 +34126,7 @@
       <w:pPr>
         <w:pStyle w:val="Heading2"/>
       </w:pPr>
-      <w:bookmarkStart w:id="105" w:name="_Toc242176367"/>
+      <w:bookmarkStart w:id="105" w:name="_Toc242178905"/>
       <w:r>
         <w:t>5.17. Việc vẫn làm trong SSMS</w:t>
       </w:r>
@@ -34244,7 +34244,7 @@
         <w:pStyle w:val="Heading1"/>
         <w:pageBreakBefore/>
       </w:pPr>
-      <w:bookmarkStart w:id="106" w:name="_Toc242176368"/>
+      <w:bookmarkStart w:id="106" w:name="_Toc242178906"/>
       <w:r>
         <w:lastRenderedPageBreak/>
         <w:t>CHƯƠNG 6. XỬ LÝ SỰ CỐ</w:t>
@@ -34255,7 +34255,7 @@
       <w:pPr>
         <w:pStyle w:val="Heading2"/>
       </w:pPr>
-      <w:bookmarkStart w:id="107" w:name="_Toc242176369"/>
+      <w:bookmarkStart w:id="107" w:name="_Toc242178907"/>
       <w:r>
         <w:t>6.1. Kiểm tra kết nối không cần giao diện</w:t>
       </w:r>
@@ -34662,7 +34662,7 @@
       <w:pPr>
         <w:pStyle w:val="Heading2"/>
       </w:pPr>
-      <w:bookmarkStart w:id="108" w:name="_Toc242176370"/>
+      <w:bookmarkStart w:id="108" w:name="_Toc242178908"/>
       <w:r>
         <w:t>6.2. Lỗi thường gặp</w:t>
       </w:r>
@@ -34672,7 +34672,7 @@
       <w:pPr>
         <w:pStyle w:val="TableCaption"/>
       </w:pPr>
-      <w:bookmarkStart w:id="109" w:name="_Toc242176413"/>
+      <w:bookmarkStart w:id="109" w:name="_Toc242178951"/>
       <w:r>
         <w:t>Bảng 6.1. Lỗi thường gặp và cách xử lý</w:t>
       </w:r>
@@ -37356,7 +37356,7 @@
       <w:pPr>
         <w:pStyle w:val="Heading2"/>
       </w:pPr>
-      <w:bookmarkStart w:id="110" w:name="_Toc242176371"/>
+      <w:bookmarkStart w:id="110" w:name="_Toc242178909"/>
       <w:r>
         <w:t>6.3. Khi cần hỗ trợ thêm</w:t>
       </w:r>
@@ -37404,7 +37404,7 @@
         <w:pStyle w:val="Heading1"/>
         <w:pageBreakBefore/>
       </w:pPr>
-      <w:bookmarkStart w:id="111" w:name="_Toc242176372"/>
+      <w:bookmarkStart w:id="111" w:name="_Toc242178910"/>
       <w:r>
         <w:lastRenderedPageBreak/>
         <w:t>PHỤ LỤC A. TÓM TẮT LỆNH</w:t>
@@ -38155,7 +38155,7 @@
         <w:pStyle w:val="Heading1"/>
         <w:pageBreakBefore/>
       </w:pPr>
-      <w:bookmarkStart w:id="112" w:name="_Toc242176373"/>
+      <w:bookmarkStart w:id="112" w:name="_Toc242178911"/>
       <w:r>
         <w:lastRenderedPageBreak/>
         <w:t>PHỤ LỤC B. CÁC MỤC CẦN BỔ SUNG</w:t>

</xml_diff>

<commit_message>
docs(user-guide): show version 1.1.0 and the refreshed screenshots
The guide reads the version from CMakeLists.txt, so the information page
and the installer file names now say 1.1.0 (v1.1.0-build.<number> for the
release tag). It also uses the screenshots taken again for the report.
Regenerate the docx and the PDF: 56 pages and 8 placeholders, as before,
no Word field errors.
</commit_message>
<xml_diff>
--- a/docs/user-guide/QLTTTA_User_Guide.docx
+++ b/docs/user-guide/QLTTTA_User_Guide.docx
@@ -923,7 +923,7 @@
               <w:rPr>
                 <w:sz w:val="21"/>
               </w:rPr>
-              <w:t>QLTTTA - Quản lý Trung tâm Tiếng Anh, phiên bản 1.0.1</w:t>
+              <w:t>QLTTTA - Quản lý Trung tâm Tiếng Anh, phiên bản 1.1.0</w:t>
             </w:r>
           </w:p>
         </w:tc>
@@ -1255,7 +1255,7 @@
               <w:rPr>
                 <w:sz w:val="21"/>
               </w:rPr>
-              <w:t>07/​10/​2026</w:t>
+              <w:t>08/​10/​2026</w:t>
             </w:r>
           </w:p>
         </w:tc>
@@ -1402,7 +1402,7 @@
       <w:r>
         <w:fldChar w:fldCharType="separate"/>
       </w:r>
-      <w:hyperlink w:anchor="_Toc242309742" w:history="1">
+      <w:hyperlink w:anchor="_Toc242312188" w:history="1">
         <w:r>
           <w:rPr>
             <w:rStyle w:val="Hyperlink"/>
@@ -1429,7 +1429,7 @@
             <w:noProof/>
             <w:webHidden/>
           </w:rPr>
-          <w:instrText xml:space="preserve"> PAGEREF _Toc242309742 \h </w:instrText>
+          <w:instrText xml:space="preserve"> PAGEREF _Toc242312188 \h </w:instrText>
         </w:r>
         <w:r>
           <w:rPr>
@@ -1476,7 +1476,7 @@
           <w14:ligatures w14:val="standardContextual"/>
         </w:rPr>
       </w:pPr>
-      <w:hyperlink w:anchor="_Toc242309743" w:history="1">
+      <w:hyperlink w:anchor="_Toc242312189" w:history="1">
         <w:r>
           <w:rPr>
             <w:rStyle w:val="Hyperlink"/>
@@ -1503,7 +1503,7 @@
             <w:noProof/>
             <w:webHidden/>
           </w:rPr>
-          <w:instrText xml:space="preserve"> PAGEREF _Toc242309743 \h </w:instrText>
+          <w:instrText xml:space="preserve"> PAGEREF _Toc242312189 \h </w:instrText>
         </w:r>
         <w:r>
           <w:rPr>
@@ -1550,7 +1550,7 @@
           <w14:ligatures w14:val="standardContextual"/>
         </w:rPr>
       </w:pPr>
-      <w:hyperlink w:anchor="_Toc242309744" w:history="1">
+      <w:hyperlink w:anchor="_Toc242312190" w:history="1">
         <w:r>
           <w:rPr>
             <w:rStyle w:val="Hyperlink"/>
@@ -1577,7 +1577,7 @@
             <w:noProof/>
             <w:webHidden/>
           </w:rPr>
-          <w:instrText xml:space="preserve"> PAGEREF _Toc242309744 \h </w:instrText>
+          <w:instrText xml:space="preserve"> PAGEREF _Toc242312190 \h </w:instrText>
         </w:r>
         <w:r>
           <w:rPr>
@@ -1624,7 +1624,7 @@
           <w14:ligatures w14:val="standardContextual"/>
         </w:rPr>
       </w:pPr>
-      <w:hyperlink w:anchor="_Toc242309745" w:history="1">
+      <w:hyperlink w:anchor="_Toc242312191" w:history="1">
         <w:r>
           <w:rPr>
             <w:rStyle w:val="Hyperlink"/>
@@ -1651,7 +1651,7 @@
             <w:noProof/>
             <w:webHidden/>
           </w:rPr>
-          <w:instrText xml:space="preserve"> PAGEREF _Toc242309745 \h </w:instrText>
+          <w:instrText xml:space="preserve"> PAGEREF _Toc242312191 \h </w:instrText>
         </w:r>
         <w:r>
           <w:rPr>
@@ -1698,7 +1698,7 @@
           <w14:ligatures w14:val="standardContextual"/>
         </w:rPr>
       </w:pPr>
-      <w:hyperlink w:anchor="_Toc242309746" w:history="1">
+      <w:hyperlink w:anchor="_Toc242312192" w:history="1">
         <w:r>
           <w:rPr>
             <w:rStyle w:val="Hyperlink"/>
@@ -1725,7 +1725,7 @@
             <w:noProof/>
             <w:webHidden/>
           </w:rPr>
-          <w:instrText xml:space="preserve"> PAGEREF _Toc242309746 \h </w:instrText>
+          <w:instrText xml:space="preserve"> PAGEREF _Toc242312192 \h </w:instrText>
         </w:r>
         <w:r>
           <w:rPr>
@@ -1772,7 +1772,7 @@
           <w14:ligatures w14:val="standardContextual"/>
         </w:rPr>
       </w:pPr>
-      <w:hyperlink w:anchor="_Toc242309747" w:history="1">
+      <w:hyperlink w:anchor="_Toc242312193" w:history="1">
         <w:r>
           <w:rPr>
             <w:rStyle w:val="Hyperlink"/>
@@ -1799,7 +1799,7 @@
             <w:noProof/>
             <w:webHidden/>
           </w:rPr>
-          <w:instrText xml:space="preserve"> PAGEREF _Toc242309747 \h </w:instrText>
+          <w:instrText xml:space="preserve"> PAGEREF _Toc242312193 \h </w:instrText>
         </w:r>
         <w:r>
           <w:rPr>
@@ -1846,7 +1846,7 @@
           <w14:ligatures w14:val="standardContextual"/>
         </w:rPr>
       </w:pPr>
-      <w:hyperlink w:anchor="_Toc242309748" w:history="1">
+      <w:hyperlink w:anchor="_Toc242312194" w:history="1">
         <w:r>
           <w:rPr>
             <w:rStyle w:val="Hyperlink"/>
@@ -1873,7 +1873,7 @@
             <w:noProof/>
             <w:webHidden/>
           </w:rPr>
-          <w:instrText xml:space="preserve"> PAGEREF _Toc242309748 \h </w:instrText>
+          <w:instrText xml:space="preserve"> PAGEREF _Toc242312194 \h </w:instrText>
         </w:r>
         <w:r>
           <w:rPr>
@@ -1920,7 +1920,7 @@
           <w14:ligatures w14:val="standardContextual"/>
         </w:rPr>
       </w:pPr>
-      <w:hyperlink w:anchor="_Toc242309749" w:history="1">
+      <w:hyperlink w:anchor="_Toc242312195" w:history="1">
         <w:r>
           <w:rPr>
             <w:rStyle w:val="Hyperlink"/>
@@ -1947,7 +1947,7 @@
             <w:noProof/>
             <w:webHidden/>
           </w:rPr>
-          <w:instrText xml:space="preserve"> PAGEREF _Toc242309749 \h </w:instrText>
+          <w:instrText xml:space="preserve"> PAGEREF _Toc242312195 \h </w:instrText>
         </w:r>
         <w:r>
           <w:rPr>
@@ -1994,7 +1994,7 @@
           <w14:ligatures w14:val="standardContextual"/>
         </w:rPr>
       </w:pPr>
-      <w:hyperlink w:anchor="_Toc242309750" w:history="1">
+      <w:hyperlink w:anchor="_Toc242312196" w:history="1">
         <w:r>
           <w:rPr>
             <w:rStyle w:val="Hyperlink"/>
@@ -2021,7 +2021,7 @@
             <w:noProof/>
             <w:webHidden/>
           </w:rPr>
-          <w:instrText xml:space="preserve"> PAGEREF _Toc242309750 \h </w:instrText>
+          <w:instrText xml:space="preserve"> PAGEREF _Toc242312196 \h </w:instrText>
         </w:r>
         <w:r>
           <w:rPr>
@@ -2068,7 +2068,7 @@
           <w14:ligatures w14:val="standardContextual"/>
         </w:rPr>
       </w:pPr>
-      <w:hyperlink w:anchor="_Toc242309751" w:history="1">
+      <w:hyperlink w:anchor="_Toc242312197" w:history="1">
         <w:r>
           <w:rPr>
             <w:rStyle w:val="Hyperlink"/>
@@ -2095,7 +2095,7 @@
             <w:noProof/>
             <w:webHidden/>
           </w:rPr>
-          <w:instrText xml:space="preserve"> PAGEREF _Toc242309751 \h </w:instrText>
+          <w:instrText xml:space="preserve"> PAGEREF _Toc242312197 \h </w:instrText>
         </w:r>
         <w:r>
           <w:rPr>
@@ -2142,7 +2142,7 @@
           <w14:ligatures w14:val="standardContextual"/>
         </w:rPr>
       </w:pPr>
-      <w:hyperlink w:anchor="_Toc242309752" w:history="1">
+      <w:hyperlink w:anchor="_Toc242312198" w:history="1">
         <w:r>
           <w:rPr>
             <w:rStyle w:val="Hyperlink"/>
@@ -2169,7 +2169,7 @@
             <w:noProof/>
             <w:webHidden/>
           </w:rPr>
-          <w:instrText xml:space="preserve"> PAGEREF _Toc242309752 \h </w:instrText>
+          <w:instrText xml:space="preserve"> PAGEREF _Toc242312198 \h </w:instrText>
         </w:r>
         <w:r>
           <w:rPr>
@@ -2216,7 +2216,7 @@
           <w14:ligatures w14:val="standardContextual"/>
         </w:rPr>
       </w:pPr>
-      <w:hyperlink w:anchor="_Toc242309753" w:history="1">
+      <w:hyperlink w:anchor="_Toc242312199" w:history="1">
         <w:r>
           <w:rPr>
             <w:rStyle w:val="Hyperlink"/>
@@ -2243,7 +2243,7 @@
             <w:noProof/>
             <w:webHidden/>
           </w:rPr>
-          <w:instrText xml:space="preserve"> PAGEREF _Toc242309753 \h </w:instrText>
+          <w:instrText xml:space="preserve"> PAGEREF _Toc242312199 \h </w:instrText>
         </w:r>
         <w:r>
           <w:rPr>
@@ -2290,7 +2290,7 @@
           <w14:ligatures w14:val="standardContextual"/>
         </w:rPr>
       </w:pPr>
-      <w:hyperlink w:anchor="_Toc242309754" w:history="1">
+      <w:hyperlink w:anchor="_Toc242312200" w:history="1">
         <w:r>
           <w:rPr>
             <w:rStyle w:val="Hyperlink"/>
@@ -2317,7 +2317,7 @@
             <w:noProof/>
             <w:webHidden/>
           </w:rPr>
-          <w:instrText xml:space="preserve"> PAGEREF _Toc242309754 \h </w:instrText>
+          <w:instrText xml:space="preserve"> PAGEREF _Toc242312200 \h </w:instrText>
         </w:r>
         <w:r>
           <w:rPr>
@@ -2364,7 +2364,7 @@
           <w14:ligatures w14:val="standardContextual"/>
         </w:rPr>
       </w:pPr>
-      <w:hyperlink w:anchor="_Toc242309755" w:history="1">
+      <w:hyperlink w:anchor="_Toc242312201" w:history="1">
         <w:r>
           <w:rPr>
             <w:rStyle w:val="Hyperlink"/>
@@ -2391,7 +2391,7 @@
             <w:noProof/>
             <w:webHidden/>
           </w:rPr>
-          <w:instrText xml:space="preserve"> PAGEREF _Toc242309755 \h </w:instrText>
+          <w:instrText xml:space="preserve"> PAGEREF _Toc242312201 \h </w:instrText>
         </w:r>
         <w:r>
           <w:rPr>
@@ -2438,7 +2438,7 @@
           <w14:ligatures w14:val="standardContextual"/>
         </w:rPr>
       </w:pPr>
-      <w:hyperlink w:anchor="_Toc242309756" w:history="1">
+      <w:hyperlink w:anchor="_Toc242312202" w:history="1">
         <w:r>
           <w:rPr>
             <w:rStyle w:val="Hyperlink"/>
@@ -2465,7 +2465,7 @@
             <w:noProof/>
             <w:webHidden/>
           </w:rPr>
-          <w:instrText xml:space="preserve"> PAGEREF _Toc242309756 \h </w:instrText>
+          <w:instrText xml:space="preserve"> PAGEREF _Toc242312202 \h </w:instrText>
         </w:r>
         <w:r>
           <w:rPr>
@@ -2512,7 +2512,7 @@
           <w14:ligatures w14:val="standardContextual"/>
         </w:rPr>
       </w:pPr>
-      <w:hyperlink w:anchor="_Toc242309757" w:history="1">
+      <w:hyperlink w:anchor="_Toc242312203" w:history="1">
         <w:r>
           <w:rPr>
             <w:rStyle w:val="Hyperlink"/>
@@ -2539,7 +2539,7 @@
             <w:noProof/>
             <w:webHidden/>
           </w:rPr>
-          <w:instrText xml:space="preserve"> PAGEREF _Toc242309757 \h </w:instrText>
+          <w:instrText xml:space="preserve"> PAGEREF _Toc242312203 \h </w:instrText>
         </w:r>
         <w:r>
           <w:rPr>
@@ -2586,7 +2586,7 @@
           <w14:ligatures w14:val="standardContextual"/>
         </w:rPr>
       </w:pPr>
-      <w:hyperlink w:anchor="_Toc242309758" w:history="1">
+      <w:hyperlink w:anchor="_Toc242312204" w:history="1">
         <w:r>
           <w:rPr>
             <w:rStyle w:val="Hyperlink"/>
@@ -2613,7 +2613,7 @@
             <w:noProof/>
             <w:webHidden/>
           </w:rPr>
-          <w:instrText xml:space="preserve"> PAGEREF _Toc242309758 \h </w:instrText>
+          <w:instrText xml:space="preserve"> PAGEREF _Toc242312204 \h </w:instrText>
         </w:r>
         <w:r>
           <w:rPr>
@@ -2660,7 +2660,7 @@
           <w14:ligatures w14:val="standardContextual"/>
         </w:rPr>
       </w:pPr>
-      <w:hyperlink w:anchor="_Toc242309759" w:history="1">
+      <w:hyperlink w:anchor="_Toc242312205" w:history="1">
         <w:r>
           <w:rPr>
             <w:rStyle w:val="Hyperlink"/>
@@ -2687,7 +2687,7 @@
             <w:noProof/>
             <w:webHidden/>
           </w:rPr>
-          <w:instrText xml:space="preserve"> PAGEREF _Toc242309759 \h </w:instrText>
+          <w:instrText xml:space="preserve"> PAGEREF _Toc242312205 \h </w:instrText>
         </w:r>
         <w:r>
           <w:rPr>
@@ -2734,7 +2734,7 @@
           <w14:ligatures w14:val="standardContextual"/>
         </w:rPr>
       </w:pPr>
-      <w:hyperlink w:anchor="_Toc242309760" w:history="1">
+      <w:hyperlink w:anchor="_Toc242312206" w:history="1">
         <w:r>
           <w:rPr>
             <w:rStyle w:val="Hyperlink"/>
@@ -2761,7 +2761,7 @@
             <w:noProof/>
             <w:webHidden/>
           </w:rPr>
-          <w:instrText xml:space="preserve"> PAGEREF _Toc242309760 \h </w:instrText>
+          <w:instrText xml:space="preserve"> PAGEREF _Toc242312206 \h </w:instrText>
         </w:r>
         <w:r>
           <w:rPr>
@@ -2808,7 +2808,7 @@
           <w14:ligatures w14:val="standardContextual"/>
         </w:rPr>
       </w:pPr>
-      <w:hyperlink w:anchor="_Toc242309761" w:history="1">
+      <w:hyperlink w:anchor="_Toc242312207" w:history="1">
         <w:r>
           <w:rPr>
             <w:rStyle w:val="Hyperlink"/>
@@ -2835,7 +2835,7 @@
             <w:noProof/>
             <w:webHidden/>
           </w:rPr>
-          <w:instrText xml:space="preserve"> PAGEREF _Toc242309761 \h </w:instrText>
+          <w:instrText xml:space="preserve"> PAGEREF _Toc242312207 \h </w:instrText>
         </w:r>
         <w:r>
           <w:rPr>
@@ -2882,7 +2882,7 @@
           <w14:ligatures w14:val="standardContextual"/>
         </w:rPr>
       </w:pPr>
-      <w:hyperlink w:anchor="_Toc242309762" w:history="1">
+      <w:hyperlink w:anchor="_Toc242312208" w:history="1">
         <w:r>
           <w:rPr>
             <w:rStyle w:val="Hyperlink"/>
@@ -2909,7 +2909,7 @@
             <w:noProof/>
             <w:webHidden/>
           </w:rPr>
-          <w:instrText xml:space="preserve"> PAGEREF _Toc242309762 \h </w:instrText>
+          <w:instrText xml:space="preserve"> PAGEREF _Toc242312208 \h </w:instrText>
         </w:r>
         <w:r>
           <w:rPr>
@@ -2956,7 +2956,7 @@
           <w14:ligatures w14:val="standardContextual"/>
         </w:rPr>
       </w:pPr>
-      <w:hyperlink w:anchor="_Toc242309763" w:history="1">
+      <w:hyperlink w:anchor="_Toc242312209" w:history="1">
         <w:r>
           <w:rPr>
             <w:rStyle w:val="Hyperlink"/>
@@ -2983,7 +2983,7 @@
             <w:noProof/>
             <w:webHidden/>
           </w:rPr>
-          <w:instrText xml:space="preserve"> PAGEREF _Toc242309763 \h </w:instrText>
+          <w:instrText xml:space="preserve"> PAGEREF _Toc242312209 \h </w:instrText>
         </w:r>
         <w:r>
           <w:rPr>
@@ -3030,7 +3030,7 @@
           <w14:ligatures w14:val="standardContextual"/>
         </w:rPr>
       </w:pPr>
-      <w:hyperlink w:anchor="_Toc242309764" w:history="1">
+      <w:hyperlink w:anchor="_Toc242312210" w:history="1">
         <w:r>
           <w:rPr>
             <w:rStyle w:val="Hyperlink"/>
@@ -3057,7 +3057,7 @@
             <w:noProof/>
             <w:webHidden/>
           </w:rPr>
-          <w:instrText xml:space="preserve"> PAGEREF _Toc242309764 \h </w:instrText>
+          <w:instrText xml:space="preserve"> PAGEREF _Toc242312210 \h </w:instrText>
         </w:r>
         <w:r>
           <w:rPr>
@@ -3104,7 +3104,7 @@
           <w14:ligatures w14:val="standardContextual"/>
         </w:rPr>
       </w:pPr>
-      <w:hyperlink w:anchor="_Toc242309765" w:history="1">
+      <w:hyperlink w:anchor="_Toc242312211" w:history="1">
         <w:r>
           <w:rPr>
             <w:rStyle w:val="Hyperlink"/>
@@ -3131,7 +3131,7 @@
             <w:noProof/>
             <w:webHidden/>
           </w:rPr>
-          <w:instrText xml:space="preserve"> PAGEREF _Toc242309765 \h </w:instrText>
+          <w:instrText xml:space="preserve"> PAGEREF _Toc242312211 \h </w:instrText>
         </w:r>
         <w:r>
           <w:rPr>
@@ -3178,7 +3178,7 @@
           <w14:ligatures w14:val="standardContextual"/>
         </w:rPr>
       </w:pPr>
-      <w:hyperlink w:anchor="_Toc242309766" w:history="1">
+      <w:hyperlink w:anchor="_Toc242312212" w:history="1">
         <w:r>
           <w:rPr>
             <w:rStyle w:val="Hyperlink"/>
@@ -3205,7 +3205,7 @@
             <w:noProof/>
             <w:webHidden/>
           </w:rPr>
-          <w:instrText xml:space="preserve"> PAGEREF _Toc242309766 \h </w:instrText>
+          <w:instrText xml:space="preserve"> PAGEREF _Toc242312212 \h </w:instrText>
         </w:r>
         <w:r>
           <w:rPr>
@@ -3252,7 +3252,7 @@
           <w14:ligatures w14:val="standardContextual"/>
         </w:rPr>
       </w:pPr>
-      <w:hyperlink w:anchor="_Toc242309767" w:history="1">
+      <w:hyperlink w:anchor="_Toc242312213" w:history="1">
         <w:r>
           <w:rPr>
             <w:rStyle w:val="Hyperlink"/>
@@ -3279,7 +3279,7 @@
             <w:noProof/>
             <w:webHidden/>
           </w:rPr>
-          <w:instrText xml:space="preserve"> PAGEREF _Toc242309767 \h </w:instrText>
+          <w:instrText xml:space="preserve"> PAGEREF _Toc242312213 \h </w:instrText>
         </w:r>
         <w:r>
           <w:rPr>
@@ -3326,7 +3326,7 @@
           <w14:ligatures w14:val="standardContextual"/>
         </w:rPr>
       </w:pPr>
-      <w:hyperlink w:anchor="_Toc242309768" w:history="1">
+      <w:hyperlink w:anchor="_Toc242312214" w:history="1">
         <w:r>
           <w:rPr>
             <w:rStyle w:val="Hyperlink"/>
@@ -3353,7 +3353,7 @@
             <w:noProof/>
             <w:webHidden/>
           </w:rPr>
-          <w:instrText xml:space="preserve"> PAGEREF _Toc242309768 \h </w:instrText>
+          <w:instrText xml:space="preserve"> PAGEREF _Toc242312214 \h </w:instrText>
         </w:r>
         <w:r>
           <w:rPr>
@@ -3400,7 +3400,7 @@
           <w14:ligatures w14:val="standardContextual"/>
         </w:rPr>
       </w:pPr>
-      <w:hyperlink w:anchor="_Toc242309769" w:history="1">
+      <w:hyperlink w:anchor="_Toc242312215" w:history="1">
         <w:r>
           <w:rPr>
             <w:rStyle w:val="Hyperlink"/>
@@ -3427,7 +3427,7 @@
             <w:noProof/>
             <w:webHidden/>
           </w:rPr>
-          <w:instrText xml:space="preserve"> PAGEREF _Toc242309769 \h </w:instrText>
+          <w:instrText xml:space="preserve"> PAGEREF _Toc242312215 \h </w:instrText>
         </w:r>
         <w:r>
           <w:rPr>
@@ -3474,7 +3474,7 @@
           <w14:ligatures w14:val="standardContextual"/>
         </w:rPr>
       </w:pPr>
-      <w:hyperlink w:anchor="_Toc242309770" w:history="1">
+      <w:hyperlink w:anchor="_Toc242312216" w:history="1">
         <w:r>
           <w:rPr>
             <w:rStyle w:val="Hyperlink"/>
@@ -3501,7 +3501,7 @@
             <w:noProof/>
             <w:webHidden/>
           </w:rPr>
-          <w:instrText xml:space="preserve"> PAGEREF _Toc242309770 \h </w:instrText>
+          <w:instrText xml:space="preserve"> PAGEREF _Toc242312216 \h </w:instrText>
         </w:r>
         <w:r>
           <w:rPr>
@@ -3548,7 +3548,7 @@
           <w14:ligatures w14:val="standardContextual"/>
         </w:rPr>
       </w:pPr>
-      <w:hyperlink w:anchor="_Toc242309771" w:history="1">
+      <w:hyperlink w:anchor="_Toc242312217" w:history="1">
         <w:r>
           <w:rPr>
             <w:rStyle w:val="Hyperlink"/>
@@ -3575,7 +3575,7 @@
             <w:noProof/>
             <w:webHidden/>
           </w:rPr>
-          <w:instrText xml:space="preserve"> PAGEREF _Toc242309771 \h </w:instrText>
+          <w:instrText xml:space="preserve"> PAGEREF _Toc242312217 \h </w:instrText>
         </w:r>
         <w:r>
           <w:rPr>
@@ -3622,7 +3622,7 @@
           <w14:ligatures w14:val="standardContextual"/>
         </w:rPr>
       </w:pPr>
-      <w:hyperlink w:anchor="_Toc242309772" w:history="1">
+      <w:hyperlink w:anchor="_Toc242312218" w:history="1">
         <w:r>
           <w:rPr>
             <w:rStyle w:val="Hyperlink"/>
@@ -3649,7 +3649,7 @@
             <w:noProof/>
             <w:webHidden/>
           </w:rPr>
-          <w:instrText xml:space="preserve"> PAGEREF _Toc242309772 \h </w:instrText>
+          <w:instrText xml:space="preserve"> PAGEREF _Toc242312218 \h </w:instrText>
         </w:r>
         <w:r>
           <w:rPr>
@@ -3696,7 +3696,7 @@
           <w14:ligatures w14:val="standardContextual"/>
         </w:rPr>
       </w:pPr>
-      <w:hyperlink w:anchor="_Toc242309773" w:history="1">
+      <w:hyperlink w:anchor="_Toc242312219" w:history="1">
         <w:r>
           <w:rPr>
             <w:rStyle w:val="Hyperlink"/>
@@ -3723,7 +3723,7 @@
             <w:noProof/>
             <w:webHidden/>
           </w:rPr>
-          <w:instrText xml:space="preserve"> PAGEREF _Toc242309773 \h </w:instrText>
+          <w:instrText xml:space="preserve"> PAGEREF _Toc242312219 \h </w:instrText>
         </w:r>
         <w:r>
           <w:rPr>
@@ -3770,7 +3770,7 @@
           <w14:ligatures w14:val="standardContextual"/>
         </w:rPr>
       </w:pPr>
-      <w:hyperlink w:anchor="_Toc242309774" w:history="1">
+      <w:hyperlink w:anchor="_Toc242312220" w:history="1">
         <w:r>
           <w:rPr>
             <w:rStyle w:val="Hyperlink"/>
@@ -3797,7 +3797,7 @@
             <w:noProof/>
             <w:webHidden/>
           </w:rPr>
-          <w:instrText xml:space="preserve"> PAGEREF _Toc242309774 \h </w:instrText>
+          <w:instrText xml:space="preserve"> PAGEREF _Toc242312220 \h </w:instrText>
         </w:r>
         <w:r>
           <w:rPr>
@@ -3844,7 +3844,7 @@
           <w14:ligatures w14:val="standardContextual"/>
         </w:rPr>
       </w:pPr>
-      <w:hyperlink w:anchor="_Toc242309775" w:history="1">
+      <w:hyperlink w:anchor="_Toc242312221" w:history="1">
         <w:r>
           <w:rPr>
             <w:rStyle w:val="Hyperlink"/>
@@ -3871,7 +3871,7 @@
             <w:noProof/>
             <w:webHidden/>
           </w:rPr>
-          <w:instrText xml:space="preserve"> PAGEREF _Toc242309775 \h </w:instrText>
+          <w:instrText xml:space="preserve"> PAGEREF _Toc242312221 \h </w:instrText>
         </w:r>
         <w:r>
           <w:rPr>
@@ -3918,7 +3918,7 @@
           <w14:ligatures w14:val="standardContextual"/>
         </w:rPr>
       </w:pPr>
-      <w:hyperlink w:anchor="_Toc242309776" w:history="1">
+      <w:hyperlink w:anchor="_Toc242312222" w:history="1">
         <w:r>
           <w:rPr>
             <w:rStyle w:val="Hyperlink"/>
@@ -3945,7 +3945,7 @@
             <w:noProof/>
             <w:webHidden/>
           </w:rPr>
-          <w:instrText xml:space="preserve"> PAGEREF _Toc242309776 \h </w:instrText>
+          <w:instrText xml:space="preserve"> PAGEREF _Toc242312222 \h </w:instrText>
         </w:r>
         <w:r>
           <w:rPr>
@@ -3992,7 +3992,7 @@
           <w14:ligatures w14:val="standardContextual"/>
         </w:rPr>
       </w:pPr>
-      <w:hyperlink w:anchor="_Toc242309777" w:history="1">
+      <w:hyperlink w:anchor="_Toc242312223" w:history="1">
         <w:r>
           <w:rPr>
             <w:rStyle w:val="Hyperlink"/>
@@ -4019,7 +4019,7 @@
             <w:noProof/>
             <w:webHidden/>
           </w:rPr>
-          <w:instrText xml:space="preserve"> PAGEREF _Toc242309777 \h </w:instrText>
+          <w:instrText xml:space="preserve"> PAGEREF _Toc242312223 \h </w:instrText>
         </w:r>
         <w:r>
           <w:rPr>
@@ -4066,7 +4066,7 @@
           <w14:ligatures w14:val="standardContextual"/>
         </w:rPr>
       </w:pPr>
-      <w:hyperlink w:anchor="_Toc242309778" w:history="1">
+      <w:hyperlink w:anchor="_Toc242312224" w:history="1">
         <w:r>
           <w:rPr>
             <w:rStyle w:val="Hyperlink"/>
@@ -4093,7 +4093,7 @@
             <w:noProof/>
             <w:webHidden/>
           </w:rPr>
-          <w:instrText xml:space="preserve"> PAGEREF _Toc242309778 \h </w:instrText>
+          <w:instrText xml:space="preserve"> PAGEREF _Toc242312224 \h </w:instrText>
         </w:r>
         <w:r>
           <w:rPr>
@@ -4140,7 +4140,7 @@
           <w14:ligatures w14:val="standardContextual"/>
         </w:rPr>
       </w:pPr>
-      <w:hyperlink w:anchor="_Toc242309779" w:history="1">
+      <w:hyperlink w:anchor="_Toc242312225" w:history="1">
         <w:r>
           <w:rPr>
             <w:rStyle w:val="Hyperlink"/>
@@ -4167,7 +4167,7 @@
             <w:noProof/>
             <w:webHidden/>
           </w:rPr>
-          <w:instrText xml:space="preserve"> PAGEREF _Toc242309779 \h </w:instrText>
+          <w:instrText xml:space="preserve"> PAGEREF _Toc242312225 \h </w:instrText>
         </w:r>
         <w:r>
           <w:rPr>
@@ -4214,7 +4214,7 @@
           <w14:ligatures w14:val="standardContextual"/>
         </w:rPr>
       </w:pPr>
-      <w:hyperlink w:anchor="_Toc242309780" w:history="1">
+      <w:hyperlink w:anchor="_Toc242312226" w:history="1">
         <w:r>
           <w:rPr>
             <w:rStyle w:val="Hyperlink"/>
@@ -4241,7 +4241,7 @@
             <w:noProof/>
             <w:webHidden/>
           </w:rPr>
-          <w:instrText xml:space="preserve"> PAGEREF _Toc242309780 \h </w:instrText>
+          <w:instrText xml:space="preserve"> PAGEREF _Toc242312226 \h </w:instrText>
         </w:r>
         <w:r>
           <w:rPr>
@@ -4288,7 +4288,7 @@
           <w14:ligatures w14:val="standardContextual"/>
         </w:rPr>
       </w:pPr>
-      <w:hyperlink w:anchor="_Toc242309781" w:history="1">
+      <w:hyperlink w:anchor="_Toc242312227" w:history="1">
         <w:r>
           <w:rPr>
             <w:rStyle w:val="Hyperlink"/>
@@ -4315,7 +4315,7 @@
             <w:noProof/>
             <w:webHidden/>
           </w:rPr>
-          <w:instrText xml:space="preserve"> PAGEREF _Toc242309781 \h </w:instrText>
+          <w:instrText xml:space="preserve"> PAGEREF _Toc242312227 \h </w:instrText>
         </w:r>
         <w:r>
           <w:rPr>
@@ -4362,7 +4362,7 @@
           <w14:ligatures w14:val="standardContextual"/>
         </w:rPr>
       </w:pPr>
-      <w:hyperlink w:anchor="_Toc242309782" w:history="1">
+      <w:hyperlink w:anchor="_Toc242312228" w:history="1">
         <w:r>
           <w:rPr>
             <w:rStyle w:val="Hyperlink"/>
@@ -4389,7 +4389,7 @@
             <w:noProof/>
             <w:webHidden/>
           </w:rPr>
-          <w:instrText xml:space="preserve"> PAGEREF _Toc242309782 \h </w:instrText>
+          <w:instrText xml:space="preserve"> PAGEREF _Toc242312228 \h </w:instrText>
         </w:r>
         <w:r>
           <w:rPr>
@@ -4436,7 +4436,7 @@
           <w14:ligatures w14:val="standardContextual"/>
         </w:rPr>
       </w:pPr>
-      <w:hyperlink w:anchor="_Toc242309783" w:history="1">
+      <w:hyperlink w:anchor="_Toc242312229" w:history="1">
         <w:r>
           <w:rPr>
             <w:rStyle w:val="Hyperlink"/>
@@ -4463,7 +4463,7 @@
             <w:noProof/>
             <w:webHidden/>
           </w:rPr>
-          <w:instrText xml:space="preserve"> PAGEREF _Toc242309783 \h </w:instrText>
+          <w:instrText xml:space="preserve"> PAGEREF _Toc242312229 \h </w:instrText>
         </w:r>
         <w:r>
           <w:rPr>
@@ -4510,7 +4510,7 @@
           <w14:ligatures w14:val="standardContextual"/>
         </w:rPr>
       </w:pPr>
-      <w:hyperlink w:anchor="_Toc242309784" w:history="1">
+      <w:hyperlink w:anchor="_Toc242312230" w:history="1">
         <w:r>
           <w:rPr>
             <w:rStyle w:val="Hyperlink"/>
@@ -4537,7 +4537,7 @@
             <w:noProof/>
             <w:webHidden/>
           </w:rPr>
-          <w:instrText xml:space="preserve"> PAGEREF _Toc242309784 \h </w:instrText>
+          <w:instrText xml:space="preserve"> PAGEREF _Toc242312230 \h </w:instrText>
         </w:r>
         <w:r>
           <w:rPr>
@@ -4584,7 +4584,7 @@
           <w14:ligatures w14:val="standardContextual"/>
         </w:rPr>
       </w:pPr>
-      <w:hyperlink w:anchor="_Toc242309785" w:history="1">
+      <w:hyperlink w:anchor="_Toc242312231" w:history="1">
         <w:r>
           <w:rPr>
             <w:rStyle w:val="Hyperlink"/>
@@ -4611,7 +4611,7 @@
             <w:noProof/>
             <w:webHidden/>
           </w:rPr>
-          <w:instrText xml:space="preserve"> PAGEREF _Toc242309785 \h </w:instrText>
+          <w:instrText xml:space="preserve"> PAGEREF _Toc242312231 \h </w:instrText>
         </w:r>
         <w:r>
           <w:rPr>
@@ -4658,7 +4658,7 @@
           <w14:ligatures w14:val="standardContextual"/>
         </w:rPr>
       </w:pPr>
-      <w:hyperlink w:anchor="_Toc242309786" w:history="1">
+      <w:hyperlink w:anchor="_Toc242312232" w:history="1">
         <w:r>
           <w:rPr>
             <w:rStyle w:val="Hyperlink"/>
@@ -4685,7 +4685,7 @@
             <w:noProof/>
             <w:webHidden/>
           </w:rPr>
-          <w:instrText xml:space="preserve"> PAGEREF _Toc242309786 \h </w:instrText>
+          <w:instrText xml:space="preserve"> PAGEREF _Toc242312232 \h </w:instrText>
         </w:r>
         <w:r>
           <w:rPr>
@@ -4732,7 +4732,7 @@
           <w14:ligatures w14:val="standardContextual"/>
         </w:rPr>
       </w:pPr>
-      <w:hyperlink w:anchor="_Toc242309787" w:history="1">
+      <w:hyperlink w:anchor="_Toc242312233" w:history="1">
         <w:r>
           <w:rPr>
             <w:rStyle w:val="Hyperlink"/>
@@ -4759,7 +4759,7 @@
             <w:noProof/>
             <w:webHidden/>
           </w:rPr>
-          <w:instrText xml:space="preserve"> PAGEREF _Toc242309787 \h </w:instrText>
+          <w:instrText xml:space="preserve"> PAGEREF _Toc242312233 \h </w:instrText>
         </w:r>
         <w:r>
           <w:rPr>
@@ -4806,7 +4806,7 @@
           <w14:ligatures w14:val="standardContextual"/>
         </w:rPr>
       </w:pPr>
-      <w:hyperlink w:anchor="_Toc242309788" w:history="1">
+      <w:hyperlink w:anchor="_Toc242312234" w:history="1">
         <w:r>
           <w:rPr>
             <w:rStyle w:val="Hyperlink"/>
@@ -4833,7 +4833,7 @@
             <w:noProof/>
             <w:webHidden/>
           </w:rPr>
-          <w:instrText xml:space="preserve"> PAGEREF _Toc242309788 \h </w:instrText>
+          <w:instrText xml:space="preserve"> PAGEREF _Toc242312234 \h </w:instrText>
         </w:r>
         <w:r>
           <w:rPr>
@@ -4880,7 +4880,7 @@
           <w14:ligatures w14:val="standardContextual"/>
         </w:rPr>
       </w:pPr>
-      <w:hyperlink w:anchor="_Toc242309789" w:history="1">
+      <w:hyperlink w:anchor="_Toc242312235" w:history="1">
         <w:r>
           <w:rPr>
             <w:rStyle w:val="Hyperlink"/>
@@ -4907,7 +4907,7 @@
             <w:noProof/>
             <w:webHidden/>
           </w:rPr>
-          <w:instrText xml:space="preserve"> PAGEREF _Toc242309789 \h </w:instrText>
+          <w:instrText xml:space="preserve"> PAGEREF _Toc242312235 \h </w:instrText>
         </w:r>
         <w:r>
           <w:rPr>
@@ -4954,7 +4954,7 @@
           <w14:ligatures w14:val="standardContextual"/>
         </w:rPr>
       </w:pPr>
-      <w:hyperlink w:anchor="_Toc242309790" w:history="1">
+      <w:hyperlink w:anchor="_Toc242312236" w:history="1">
         <w:r>
           <w:rPr>
             <w:rStyle w:val="Hyperlink"/>
@@ -4981,7 +4981,7 @@
             <w:noProof/>
             <w:webHidden/>
           </w:rPr>
-          <w:instrText xml:space="preserve"> PAGEREF _Toc242309790 \h </w:instrText>
+          <w:instrText xml:space="preserve"> PAGEREF _Toc242312236 \h </w:instrText>
         </w:r>
         <w:r>
           <w:rPr>
@@ -5028,7 +5028,7 @@
           <w14:ligatures w14:val="standardContextual"/>
         </w:rPr>
       </w:pPr>
-      <w:hyperlink w:anchor="_Toc242309791" w:history="1">
+      <w:hyperlink w:anchor="_Toc242312237" w:history="1">
         <w:r>
           <w:rPr>
             <w:rStyle w:val="Hyperlink"/>
@@ -5055,7 +5055,7 @@
             <w:noProof/>
             <w:webHidden/>
           </w:rPr>
-          <w:instrText xml:space="preserve"> PAGEREF _Toc242309791 \h </w:instrText>
+          <w:instrText xml:space="preserve"> PAGEREF _Toc242312237 \h </w:instrText>
         </w:r>
         <w:r>
           <w:rPr>
@@ -5102,7 +5102,7 @@
           <w14:ligatures w14:val="standardContextual"/>
         </w:rPr>
       </w:pPr>
-      <w:hyperlink w:anchor="_Toc242309792" w:history="1">
+      <w:hyperlink w:anchor="_Toc242312238" w:history="1">
         <w:r>
           <w:rPr>
             <w:rStyle w:val="Hyperlink"/>
@@ -5129,7 +5129,7 @@
             <w:noProof/>
             <w:webHidden/>
           </w:rPr>
-          <w:instrText xml:space="preserve"> PAGEREF _Toc242309792 \h </w:instrText>
+          <w:instrText xml:space="preserve"> PAGEREF _Toc242312238 \h </w:instrText>
         </w:r>
         <w:r>
           <w:rPr>
@@ -5176,7 +5176,7 @@
           <w14:ligatures w14:val="standardContextual"/>
         </w:rPr>
       </w:pPr>
-      <w:hyperlink w:anchor="_Toc242309793" w:history="1">
+      <w:hyperlink w:anchor="_Toc242312239" w:history="1">
         <w:r>
           <w:rPr>
             <w:rStyle w:val="Hyperlink"/>
@@ -5203,7 +5203,7 @@
             <w:noProof/>
             <w:webHidden/>
           </w:rPr>
-          <w:instrText xml:space="preserve"> PAGEREF _Toc242309793 \h </w:instrText>
+          <w:instrText xml:space="preserve"> PAGEREF _Toc242312239 \h </w:instrText>
         </w:r>
         <w:r>
           <w:rPr>
@@ -5250,7 +5250,7 @@
           <w14:ligatures w14:val="standardContextual"/>
         </w:rPr>
       </w:pPr>
-      <w:hyperlink w:anchor="_Toc242309794" w:history="1">
+      <w:hyperlink w:anchor="_Toc242312240" w:history="1">
         <w:r>
           <w:rPr>
             <w:rStyle w:val="Hyperlink"/>
@@ -5277,7 +5277,7 @@
             <w:noProof/>
             <w:webHidden/>
           </w:rPr>
-          <w:instrText xml:space="preserve"> PAGEREF _Toc242309794 \h </w:instrText>
+          <w:instrText xml:space="preserve"> PAGEREF _Toc242312240 \h </w:instrText>
         </w:r>
         <w:r>
           <w:rPr>
@@ -5324,7 +5324,7 @@
           <w14:ligatures w14:val="standardContextual"/>
         </w:rPr>
       </w:pPr>
-      <w:hyperlink w:anchor="_Toc242309795" w:history="1">
+      <w:hyperlink w:anchor="_Toc242312241" w:history="1">
         <w:r>
           <w:rPr>
             <w:rStyle w:val="Hyperlink"/>
@@ -5351,7 +5351,7 @@
             <w:noProof/>
             <w:webHidden/>
           </w:rPr>
-          <w:instrText xml:space="preserve"> PAGEREF _Toc242309795 \h </w:instrText>
+          <w:instrText xml:space="preserve"> PAGEREF _Toc242312241 \h </w:instrText>
         </w:r>
         <w:r>
           <w:rPr>
@@ -5398,7 +5398,7 @@
           <w14:ligatures w14:val="standardContextual"/>
         </w:rPr>
       </w:pPr>
-      <w:hyperlink w:anchor="_Toc242309796" w:history="1">
+      <w:hyperlink w:anchor="_Toc242312242" w:history="1">
         <w:r>
           <w:rPr>
             <w:rStyle w:val="Hyperlink"/>
@@ -5425,7 +5425,7 @@
             <w:noProof/>
             <w:webHidden/>
           </w:rPr>
-          <w:instrText xml:space="preserve"> PAGEREF _Toc242309796 \h </w:instrText>
+          <w:instrText xml:space="preserve"> PAGEREF _Toc242312242 \h </w:instrText>
         </w:r>
         <w:r>
           <w:rPr>
@@ -5472,7 +5472,7 @@
           <w14:ligatures w14:val="standardContextual"/>
         </w:rPr>
       </w:pPr>
-      <w:hyperlink w:anchor="_Toc242309797" w:history="1">
+      <w:hyperlink w:anchor="_Toc242312243" w:history="1">
         <w:r>
           <w:rPr>
             <w:rStyle w:val="Hyperlink"/>
@@ -5499,7 +5499,7 @@
             <w:noProof/>
             <w:webHidden/>
           </w:rPr>
-          <w:instrText xml:space="preserve"> PAGEREF _Toc242309797 \h </w:instrText>
+          <w:instrText xml:space="preserve"> PAGEREF _Toc242312243 \h </w:instrText>
         </w:r>
         <w:r>
           <w:rPr>
@@ -5546,7 +5546,7 @@
           <w14:ligatures w14:val="standardContextual"/>
         </w:rPr>
       </w:pPr>
-      <w:hyperlink w:anchor="_Toc242309798" w:history="1">
+      <w:hyperlink w:anchor="_Toc242312244" w:history="1">
         <w:r>
           <w:rPr>
             <w:rStyle w:val="Hyperlink"/>
@@ -5573,7 +5573,7 @@
             <w:noProof/>
             <w:webHidden/>
           </w:rPr>
-          <w:instrText xml:space="preserve"> PAGEREF _Toc242309798 \h </w:instrText>
+          <w:instrText xml:space="preserve"> PAGEREF _Toc242312244 \h </w:instrText>
         </w:r>
         <w:r>
           <w:rPr>
@@ -5620,7 +5620,7 @@
           <w14:ligatures w14:val="standardContextual"/>
         </w:rPr>
       </w:pPr>
-      <w:hyperlink w:anchor="_Toc242309799" w:history="1">
+      <w:hyperlink w:anchor="_Toc242312245" w:history="1">
         <w:r>
           <w:rPr>
             <w:rStyle w:val="Hyperlink"/>
@@ -5647,7 +5647,7 @@
             <w:noProof/>
             <w:webHidden/>
           </w:rPr>
-          <w:instrText xml:space="preserve"> PAGEREF _Toc242309799 \h </w:instrText>
+          <w:instrText xml:space="preserve"> PAGEREF _Toc242312245 \h </w:instrText>
         </w:r>
         <w:r>
           <w:rPr>
@@ -5694,7 +5694,7 @@
           <w14:ligatures w14:val="standardContextual"/>
         </w:rPr>
       </w:pPr>
-      <w:hyperlink w:anchor="_Toc242309800" w:history="1">
+      <w:hyperlink w:anchor="_Toc242312246" w:history="1">
         <w:r>
           <w:rPr>
             <w:rStyle w:val="Hyperlink"/>
@@ -5721,7 +5721,7 @@
             <w:noProof/>
             <w:webHidden/>
           </w:rPr>
-          <w:instrText xml:space="preserve"> PAGEREF _Toc242309800 \h </w:instrText>
+          <w:instrText xml:space="preserve"> PAGEREF _Toc242312246 \h </w:instrText>
         </w:r>
         <w:r>
           <w:rPr>
@@ -5768,7 +5768,7 @@
           <w14:ligatures w14:val="standardContextual"/>
         </w:rPr>
       </w:pPr>
-      <w:hyperlink w:anchor="_Toc242309801" w:history="1">
+      <w:hyperlink w:anchor="_Toc242312247" w:history="1">
         <w:r>
           <w:rPr>
             <w:rStyle w:val="Hyperlink"/>
@@ -5795,7 +5795,7 @@
             <w:noProof/>
             <w:webHidden/>
           </w:rPr>
-          <w:instrText xml:space="preserve"> PAGEREF _Toc242309801 \h </w:instrText>
+          <w:instrText xml:space="preserve"> PAGEREF _Toc242312247 \h </w:instrText>
         </w:r>
         <w:r>
           <w:rPr>
@@ -5842,7 +5842,7 @@
           <w14:ligatures w14:val="standardContextual"/>
         </w:rPr>
       </w:pPr>
-      <w:hyperlink w:anchor="_Toc242309802" w:history="1">
+      <w:hyperlink w:anchor="_Toc242312248" w:history="1">
         <w:r>
           <w:rPr>
             <w:rStyle w:val="Hyperlink"/>
@@ -5869,7 +5869,7 @@
             <w:noProof/>
             <w:webHidden/>
           </w:rPr>
-          <w:instrText xml:space="preserve"> PAGEREF _Toc242309802 \h </w:instrText>
+          <w:instrText xml:space="preserve"> PAGEREF _Toc242312248 \h </w:instrText>
         </w:r>
         <w:r>
           <w:rPr>
@@ -5916,7 +5916,7 @@
           <w14:ligatures w14:val="standardContextual"/>
         </w:rPr>
       </w:pPr>
-      <w:hyperlink w:anchor="_Toc242309803" w:history="1">
+      <w:hyperlink w:anchor="_Toc242312249" w:history="1">
         <w:r>
           <w:rPr>
             <w:rStyle w:val="Hyperlink"/>
@@ -5943,7 +5943,7 @@
             <w:noProof/>
             <w:webHidden/>
           </w:rPr>
-          <w:instrText xml:space="preserve"> PAGEREF _Toc242309803 \h </w:instrText>
+          <w:instrText xml:space="preserve"> PAGEREF _Toc242312249 \h </w:instrText>
         </w:r>
         <w:r>
           <w:rPr>
@@ -5990,7 +5990,7 @@
           <w14:ligatures w14:val="standardContextual"/>
         </w:rPr>
       </w:pPr>
-      <w:hyperlink w:anchor="_Toc242309804" w:history="1">
+      <w:hyperlink w:anchor="_Toc242312250" w:history="1">
         <w:r>
           <w:rPr>
             <w:rStyle w:val="Hyperlink"/>
@@ -6017,7 +6017,7 @@
             <w:noProof/>
             <w:webHidden/>
           </w:rPr>
-          <w:instrText xml:space="preserve"> PAGEREF _Toc242309804 \h </w:instrText>
+          <w:instrText xml:space="preserve"> PAGEREF _Toc242312250 \h </w:instrText>
         </w:r>
         <w:r>
           <w:rPr>
@@ -6064,7 +6064,7 @@
           <w14:ligatures w14:val="standardContextual"/>
         </w:rPr>
       </w:pPr>
-      <w:hyperlink w:anchor="_Toc242309805" w:history="1">
+      <w:hyperlink w:anchor="_Toc242312251" w:history="1">
         <w:r>
           <w:rPr>
             <w:rStyle w:val="Hyperlink"/>
@@ -6091,7 +6091,7 @@
             <w:noProof/>
             <w:webHidden/>
           </w:rPr>
-          <w:instrText xml:space="preserve"> PAGEREF _Toc242309805 \h </w:instrText>
+          <w:instrText xml:space="preserve"> PAGEREF _Toc242312251 \h </w:instrText>
         </w:r>
         <w:r>
           <w:rPr>
@@ -6138,7 +6138,7 @@
           <w14:ligatures w14:val="standardContextual"/>
         </w:rPr>
       </w:pPr>
-      <w:hyperlink w:anchor="_Toc242309806" w:history="1">
+      <w:hyperlink w:anchor="_Toc242312252" w:history="1">
         <w:r>
           <w:rPr>
             <w:rStyle w:val="Hyperlink"/>
@@ -6165,7 +6165,7 @@
             <w:noProof/>
             <w:webHidden/>
           </w:rPr>
-          <w:instrText xml:space="preserve"> PAGEREF _Toc242309806 \h </w:instrText>
+          <w:instrText xml:space="preserve"> PAGEREF _Toc242312252 \h </w:instrText>
         </w:r>
         <w:r>
           <w:rPr>
@@ -6212,7 +6212,7 @@
           <w14:ligatures w14:val="standardContextual"/>
         </w:rPr>
       </w:pPr>
-      <w:hyperlink w:anchor="_Toc242309807" w:history="1">
+      <w:hyperlink w:anchor="_Toc242312253" w:history="1">
         <w:r>
           <w:rPr>
             <w:rStyle w:val="Hyperlink"/>
@@ -6239,7 +6239,7 @@
             <w:noProof/>
             <w:webHidden/>
           </w:rPr>
-          <w:instrText xml:space="preserve"> PAGEREF _Toc242309807 \h </w:instrText>
+          <w:instrText xml:space="preserve"> PAGEREF _Toc242312253 \h </w:instrText>
         </w:r>
         <w:r>
           <w:rPr>
@@ -6286,7 +6286,7 @@
           <w14:ligatures w14:val="standardContextual"/>
         </w:rPr>
       </w:pPr>
-      <w:hyperlink w:anchor="_Toc242309808" w:history="1">
+      <w:hyperlink w:anchor="_Toc242312254" w:history="1">
         <w:r>
           <w:rPr>
             <w:rStyle w:val="Hyperlink"/>
@@ -6313,7 +6313,7 @@
             <w:noProof/>
             <w:webHidden/>
           </w:rPr>
-          <w:instrText xml:space="preserve"> PAGEREF _Toc242309808 \h </w:instrText>
+          <w:instrText xml:space="preserve"> PAGEREF _Toc242312254 \h </w:instrText>
         </w:r>
         <w:r>
           <w:rPr>
@@ -6360,7 +6360,7 @@
           <w14:ligatures w14:val="standardContextual"/>
         </w:rPr>
       </w:pPr>
-      <w:hyperlink w:anchor="_Toc242309809" w:history="1">
+      <w:hyperlink w:anchor="_Toc242312255" w:history="1">
         <w:r>
           <w:rPr>
             <w:rStyle w:val="Hyperlink"/>
@@ -6387,7 +6387,7 @@
             <w:noProof/>
             <w:webHidden/>
           </w:rPr>
-          <w:instrText xml:space="preserve"> PAGEREF _Toc242309809 \h </w:instrText>
+          <w:instrText xml:space="preserve"> PAGEREF _Toc242312255 \h </w:instrText>
         </w:r>
         <w:r>
           <w:rPr>
@@ -6434,7 +6434,7 @@
           <w14:ligatures w14:val="standardContextual"/>
         </w:rPr>
       </w:pPr>
-      <w:hyperlink w:anchor="_Toc242309810" w:history="1">
+      <w:hyperlink w:anchor="_Toc242312256" w:history="1">
         <w:r>
           <w:rPr>
             <w:rStyle w:val="Hyperlink"/>
@@ -6461,7 +6461,7 @@
             <w:noProof/>
             <w:webHidden/>
           </w:rPr>
-          <w:instrText xml:space="preserve"> PAGEREF _Toc242309810 \h </w:instrText>
+          <w:instrText xml:space="preserve"> PAGEREF _Toc242312256 \h </w:instrText>
         </w:r>
         <w:r>
           <w:rPr>
@@ -6508,7 +6508,7 @@
           <w14:ligatures w14:val="standardContextual"/>
         </w:rPr>
       </w:pPr>
-      <w:hyperlink w:anchor="_Toc242309811" w:history="1">
+      <w:hyperlink w:anchor="_Toc242312257" w:history="1">
         <w:r>
           <w:rPr>
             <w:rStyle w:val="Hyperlink"/>
@@ -6535,7 +6535,7 @@
             <w:noProof/>
             <w:webHidden/>
           </w:rPr>
-          <w:instrText xml:space="preserve"> PAGEREF _Toc242309811 \h </w:instrText>
+          <w:instrText xml:space="preserve"> PAGEREF _Toc242312257 \h </w:instrText>
         </w:r>
         <w:r>
           <w:rPr>
@@ -6582,7 +6582,7 @@
           <w14:ligatures w14:val="standardContextual"/>
         </w:rPr>
       </w:pPr>
-      <w:hyperlink w:anchor="_Toc242309812" w:history="1">
+      <w:hyperlink w:anchor="_Toc242312258" w:history="1">
         <w:r>
           <w:rPr>
             <w:rStyle w:val="Hyperlink"/>
@@ -6609,7 +6609,7 @@
             <w:noProof/>
             <w:webHidden/>
           </w:rPr>
-          <w:instrText xml:space="preserve"> PAGEREF _Toc242309812 \h </w:instrText>
+          <w:instrText xml:space="preserve"> PAGEREF _Toc242312258 \h </w:instrText>
         </w:r>
         <w:r>
           <w:rPr>
@@ -6656,7 +6656,7 @@
           <w14:ligatures w14:val="standardContextual"/>
         </w:rPr>
       </w:pPr>
-      <w:hyperlink w:anchor="_Toc242309813" w:history="1">
+      <w:hyperlink w:anchor="_Toc242312259" w:history="1">
         <w:r>
           <w:rPr>
             <w:rStyle w:val="Hyperlink"/>
@@ -6683,7 +6683,7 @@
             <w:noProof/>
             <w:webHidden/>
           </w:rPr>
-          <w:instrText xml:space="preserve"> PAGEREF _Toc242309813 \h </w:instrText>
+          <w:instrText xml:space="preserve"> PAGEREF _Toc242312259 \h </w:instrText>
         </w:r>
         <w:r>
           <w:rPr>
@@ -6730,7 +6730,7 @@
           <w14:ligatures w14:val="standardContextual"/>
         </w:rPr>
       </w:pPr>
-      <w:hyperlink w:anchor="_Toc242309814" w:history="1">
+      <w:hyperlink w:anchor="_Toc242312260" w:history="1">
         <w:r>
           <w:rPr>
             <w:rStyle w:val="Hyperlink"/>
@@ -6757,7 +6757,7 @@
             <w:noProof/>
             <w:webHidden/>
           </w:rPr>
-          <w:instrText xml:space="preserve"> PAGEREF _Toc242309814 \h </w:instrText>
+          <w:instrText xml:space="preserve"> PAGEREF _Toc242312260 \h </w:instrText>
         </w:r>
         <w:r>
           <w:rPr>
@@ -6834,7 +6834,7 @@
       <w:r>
         <w:fldChar w:fldCharType="separate"/>
       </w:r>
-      <w:hyperlink w:anchor="_Toc242309815" w:history="1">
+      <w:hyperlink w:anchor="_Toc242312261" w:history="1">
         <w:r>
           <w:rPr>
             <w:rStyle w:val="Hyperlink"/>
@@ -6861,7 +6861,7 @@
             <w:noProof/>
             <w:webHidden/>
           </w:rPr>
-          <w:instrText xml:space="preserve"> PAGEREF _Toc242309815 \h </w:instrText>
+          <w:instrText xml:space="preserve"> PAGEREF _Toc242312261 \h </w:instrText>
         </w:r>
         <w:r>
           <w:rPr>
@@ -6908,7 +6908,7 @@
           <w14:ligatures w14:val="standardContextual"/>
         </w:rPr>
       </w:pPr>
-      <w:hyperlink w:anchor="_Toc242309816" w:history="1">
+      <w:hyperlink w:anchor="_Toc242312262" w:history="1">
         <w:r>
           <w:rPr>
             <w:rStyle w:val="Hyperlink"/>
@@ -6935,7 +6935,7 @@
             <w:noProof/>
             <w:webHidden/>
           </w:rPr>
-          <w:instrText xml:space="preserve"> PAGEREF _Toc242309816 \h </w:instrText>
+          <w:instrText xml:space="preserve"> PAGEREF _Toc242312262 \h </w:instrText>
         </w:r>
         <w:r>
           <w:rPr>
@@ -6982,7 +6982,7 @@
           <w14:ligatures w14:val="standardContextual"/>
         </w:rPr>
       </w:pPr>
-      <w:hyperlink w:anchor="_Toc242309817" w:history="1">
+      <w:hyperlink w:anchor="_Toc242312263" w:history="1">
         <w:r>
           <w:rPr>
             <w:rStyle w:val="Hyperlink"/>
@@ -7009,7 +7009,7 @@
             <w:noProof/>
             <w:webHidden/>
           </w:rPr>
-          <w:instrText xml:space="preserve"> PAGEREF _Toc242309817 \h </w:instrText>
+          <w:instrText xml:space="preserve"> PAGEREF _Toc242312263 \h </w:instrText>
         </w:r>
         <w:r>
           <w:rPr>
@@ -7056,7 +7056,7 @@
           <w14:ligatures w14:val="standardContextual"/>
         </w:rPr>
       </w:pPr>
-      <w:hyperlink w:anchor="_Toc242309818" w:history="1">
+      <w:hyperlink w:anchor="_Toc242312264" w:history="1">
         <w:r>
           <w:rPr>
             <w:rStyle w:val="Hyperlink"/>
@@ -7083,7 +7083,7 @@
             <w:noProof/>
             <w:webHidden/>
           </w:rPr>
-          <w:instrText xml:space="preserve"> PAGEREF _Toc242309818 \h </w:instrText>
+          <w:instrText xml:space="preserve"> PAGEREF _Toc242312264 \h </w:instrText>
         </w:r>
         <w:r>
           <w:rPr>
@@ -7130,7 +7130,7 @@
           <w14:ligatures w14:val="standardContextual"/>
         </w:rPr>
       </w:pPr>
-      <w:hyperlink w:anchor="_Toc242309819" w:history="1">
+      <w:hyperlink w:anchor="_Toc242312265" w:history="1">
         <w:r>
           <w:rPr>
             <w:rStyle w:val="Hyperlink"/>
@@ -7157,7 +7157,7 @@
             <w:noProof/>
             <w:webHidden/>
           </w:rPr>
-          <w:instrText xml:space="preserve"> PAGEREF _Toc242309819 \h </w:instrText>
+          <w:instrText xml:space="preserve"> PAGEREF _Toc242312265 \h </w:instrText>
         </w:r>
         <w:r>
           <w:rPr>
@@ -7204,7 +7204,7 @@
           <w14:ligatures w14:val="standardContextual"/>
         </w:rPr>
       </w:pPr>
-      <w:hyperlink w:anchor="_Toc242309820" w:history="1">
+      <w:hyperlink w:anchor="_Toc242312266" w:history="1">
         <w:r>
           <w:rPr>
             <w:rStyle w:val="Hyperlink"/>
@@ -7231,7 +7231,7 @@
             <w:noProof/>
             <w:webHidden/>
           </w:rPr>
-          <w:instrText xml:space="preserve"> PAGEREF _Toc242309820 \h </w:instrText>
+          <w:instrText xml:space="preserve"> PAGEREF _Toc242312266 \h </w:instrText>
         </w:r>
         <w:r>
           <w:rPr>
@@ -7278,7 +7278,7 @@
           <w14:ligatures w14:val="standardContextual"/>
         </w:rPr>
       </w:pPr>
-      <w:hyperlink w:anchor="_Toc242309821" w:history="1">
+      <w:hyperlink w:anchor="_Toc242312267" w:history="1">
         <w:r>
           <w:rPr>
             <w:rStyle w:val="Hyperlink"/>
@@ -7305,7 +7305,7 @@
             <w:noProof/>
             <w:webHidden/>
           </w:rPr>
-          <w:instrText xml:space="preserve"> PAGEREF _Toc242309821 \h </w:instrText>
+          <w:instrText xml:space="preserve"> PAGEREF _Toc242312267 \h </w:instrText>
         </w:r>
         <w:r>
           <w:rPr>
@@ -7352,7 +7352,7 @@
           <w14:ligatures w14:val="standardContextual"/>
         </w:rPr>
       </w:pPr>
-      <w:hyperlink w:anchor="_Toc242309822" w:history="1">
+      <w:hyperlink w:anchor="_Toc242312268" w:history="1">
         <w:r>
           <w:rPr>
             <w:rStyle w:val="Hyperlink"/>
@@ -7379,7 +7379,7 @@
             <w:noProof/>
             <w:webHidden/>
           </w:rPr>
-          <w:instrText xml:space="preserve"> PAGEREF _Toc242309822 \h </w:instrText>
+          <w:instrText xml:space="preserve"> PAGEREF _Toc242312268 \h </w:instrText>
         </w:r>
         <w:r>
           <w:rPr>
@@ -7426,7 +7426,7 @@
           <w14:ligatures w14:val="standardContextual"/>
         </w:rPr>
       </w:pPr>
-      <w:hyperlink w:anchor="_Toc242309823" w:history="1">
+      <w:hyperlink w:anchor="_Toc242312269" w:history="1">
         <w:r>
           <w:rPr>
             <w:rStyle w:val="Hyperlink"/>
@@ -7453,7 +7453,7 @@
             <w:noProof/>
             <w:webHidden/>
           </w:rPr>
-          <w:instrText xml:space="preserve"> PAGEREF _Toc242309823 \h </w:instrText>
+          <w:instrText xml:space="preserve"> PAGEREF _Toc242312269 \h </w:instrText>
         </w:r>
         <w:r>
           <w:rPr>
@@ -7500,7 +7500,7 @@
           <w14:ligatures w14:val="standardContextual"/>
         </w:rPr>
       </w:pPr>
-      <w:hyperlink w:anchor="_Toc242309824" w:history="1">
+      <w:hyperlink w:anchor="_Toc242312270" w:history="1">
         <w:r>
           <w:rPr>
             <w:rStyle w:val="Hyperlink"/>
@@ -7527,7 +7527,7 @@
             <w:noProof/>
             <w:webHidden/>
           </w:rPr>
-          <w:instrText xml:space="preserve"> PAGEREF _Toc242309824 \h </w:instrText>
+          <w:instrText xml:space="preserve"> PAGEREF _Toc242312270 \h </w:instrText>
         </w:r>
         <w:r>
           <w:rPr>
@@ -7574,7 +7574,7 @@
           <w14:ligatures w14:val="standardContextual"/>
         </w:rPr>
       </w:pPr>
-      <w:hyperlink w:anchor="_Toc242309825" w:history="1">
+      <w:hyperlink w:anchor="_Toc242312271" w:history="1">
         <w:r>
           <w:rPr>
             <w:rStyle w:val="Hyperlink"/>
@@ -7601,7 +7601,7 @@
             <w:noProof/>
             <w:webHidden/>
           </w:rPr>
-          <w:instrText xml:space="preserve"> PAGEREF _Toc242309825 \h </w:instrText>
+          <w:instrText xml:space="preserve"> PAGEREF _Toc242312271 \h </w:instrText>
         </w:r>
         <w:r>
           <w:rPr>
@@ -7648,7 +7648,7 @@
           <w14:ligatures w14:val="standardContextual"/>
         </w:rPr>
       </w:pPr>
-      <w:hyperlink w:anchor="_Toc242309826" w:history="1">
+      <w:hyperlink w:anchor="_Toc242312272" w:history="1">
         <w:r>
           <w:rPr>
             <w:rStyle w:val="Hyperlink"/>
@@ -7675,7 +7675,7 @@
             <w:noProof/>
             <w:webHidden/>
           </w:rPr>
-          <w:instrText xml:space="preserve"> PAGEREF _Toc242309826 \h </w:instrText>
+          <w:instrText xml:space="preserve"> PAGEREF _Toc242312272 \h </w:instrText>
         </w:r>
         <w:r>
           <w:rPr>
@@ -7722,7 +7722,7 @@
           <w14:ligatures w14:val="standardContextual"/>
         </w:rPr>
       </w:pPr>
-      <w:hyperlink w:anchor="_Toc242309827" w:history="1">
+      <w:hyperlink w:anchor="_Toc242312273" w:history="1">
         <w:r>
           <w:rPr>
             <w:rStyle w:val="Hyperlink"/>
@@ -7749,7 +7749,7 @@
             <w:noProof/>
             <w:webHidden/>
           </w:rPr>
-          <w:instrText xml:space="preserve"> PAGEREF _Toc242309827 \h </w:instrText>
+          <w:instrText xml:space="preserve"> PAGEREF _Toc242312273 \h </w:instrText>
         </w:r>
         <w:r>
           <w:rPr>
@@ -7796,7 +7796,7 @@
           <w14:ligatures w14:val="standardContextual"/>
         </w:rPr>
       </w:pPr>
-      <w:hyperlink w:anchor="_Toc242309828" w:history="1">
+      <w:hyperlink w:anchor="_Toc242312274" w:history="1">
         <w:r>
           <w:rPr>
             <w:rStyle w:val="Hyperlink"/>
@@ -7823,7 +7823,7 @@
             <w:noProof/>
             <w:webHidden/>
           </w:rPr>
-          <w:instrText xml:space="preserve"> PAGEREF _Toc242309828 \h </w:instrText>
+          <w:instrText xml:space="preserve"> PAGEREF _Toc242312274 \h </w:instrText>
         </w:r>
         <w:r>
           <w:rPr>
@@ -7870,7 +7870,7 @@
           <w14:ligatures w14:val="standardContextual"/>
         </w:rPr>
       </w:pPr>
-      <w:hyperlink w:anchor="_Toc242309829" w:history="1">
+      <w:hyperlink w:anchor="_Toc242312275" w:history="1">
         <w:r>
           <w:rPr>
             <w:rStyle w:val="Hyperlink"/>
@@ -7897,7 +7897,7 @@
             <w:noProof/>
             <w:webHidden/>
           </w:rPr>
-          <w:instrText xml:space="preserve"> PAGEREF _Toc242309829 \h </w:instrText>
+          <w:instrText xml:space="preserve"> PAGEREF _Toc242312275 \h </w:instrText>
         </w:r>
         <w:r>
           <w:rPr>
@@ -7944,7 +7944,7 @@
           <w14:ligatures w14:val="standardContextual"/>
         </w:rPr>
       </w:pPr>
-      <w:hyperlink w:anchor="_Toc242309830" w:history="1">
+      <w:hyperlink w:anchor="_Toc242312276" w:history="1">
         <w:r>
           <w:rPr>
             <w:rStyle w:val="Hyperlink"/>
@@ -7971,7 +7971,7 @@
             <w:noProof/>
             <w:webHidden/>
           </w:rPr>
-          <w:instrText xml:space="preserve"> PAGEREF _Toc242309830 \h </w:instrText>
+          <w:instrText xml:space="preserve"> PAGEREF _Toc242312276 \h </w:instrText>
         </w:r>
         <w:r>
           <w:rPr>
@@ -8018,7 +8018,7 @@
           <w14:ligatures w14:val="standardContextual"/>
         </w:rPr>
       </w:pPr>
-      <w:hyperlink w:anchor="_Toc242309831" w:history="1">
+      <w:hyperlink w:anchor="_Toc242312277" w:history="1">
         <w:r>
           <w:rPr>
             <w:rStyle w:val="Hyperlink"/>
@@ -8045,7 +8045,7 @@
             <w:noProof/>
             <w:webHidden/>
           </w:rPr>
-          <w:instrText xml:space="preserve"> PAGEREF _Toc242309831 \h </w:instrText>
+          <w:instrText xml:space="preserve"> PAGEREF _Toc242312277 \h </w:instrText>
         </w:r>
         <w:r>
           <w:rPr>
@@ -8092,7 +8092,7 @@
           <w14:ligatures w14:val="standardContextual"/>
         </w:rPr>
       </w:pPr>
-      <w:hyperlink w:anchor="_Toc242309832" w:history="1">
+      <w:hyperlink w:anchor="_Toc242312278" w:history="1">
         <w:r>
           <w:rPr>
             <w:rStyle w:val="Hyperlink"/>
@@ -8119,7 +8119,7 @@
             <w:noProof/>
             <w:webHidden/>
           </w:rPr>
-          <w:instrText xml:space="preserve"> PAGEREF _Toc242309832 \h </w:instrText>
+          <w:instrText xml:space="preserve"> PAGEREF _Toc242312278 \h </w:instrText>
         </w:r>
         <w:r>
           <w:rPr>
@@ -8166,7 +8166,7 @@
           <w14:ligatures w14:val="standardContextual"/>
         </w:rPr>
       </w:pPr>
-      <w:hyperlink w:anchor="_Toc242309833" w:history="1">
+      <w:hyperlink w:anchor="_Toc242312279" w:history="1">
         <w:r>
           <w:rPr>
             <w:rStyle w:val="Hyperlink"/>
@@ -8193,7 +8193,7 @@
             <w:noProof/>
             <w:webHidden/>
           </w:rPr>
-          <w:instrText xml:space="preserve"> PAGEREF _Toc242309833 \h </w:instrText>
+          <w:instrText xml:space="preserve"> PAGEREF _Toc242312279 \h </w:instrText>
         </w:r>
         <w:r>
           <w:rPr>
@@ -8240,7 +8240,7 @@
           <w14:ligatures w14:val="standardContextual"/>
         </w:rPr>
       </w:pPr>
-      <w:hyperlink w:anchor="_Toc242309834" w:history="1">
+      <w:hyperlink w:anchor="_Toc242312280" w:history="1">
         <w:r>
           <w:rPr>
             <w:rStyle w:val="Hyperlink"/>
@@ -8267,7 +8267,7 @@
             <w:noProof/>
             <w:webHidden/>
           </w:rPr>
-          <w:instrText xml:space="preserve"> PAGEREF _Toc242309834 \h </w:instrText>
+          <w:instrText xml:space="preserve"> PAGEREF _Toc242312280 \h </w:instrText>
         </w:r>
         <w:r>
           <w:rPr>
@@ -8314,7 +8314,7 @@
           <w14:ligatures w14:val="standardContextual"/>
         </w:rPr>
       </w:pPr>
-      <w:hyperlink w:anchor="_Toc242309835" w:history="1">
+      <w:hyperlink w:anchor="_Toc242312281" w:history="1">
         <w:r>
           <w:rPr>
             <w:rStyle w:val="Hyperlink"/>
@@ -8341,7 +8341,7 @@
             <w:noProof/>
             <w:webHidden/>
           </w:rPr>
-          <w:instrText xml:space="preserve"> PAGEREF _Toc242309835 \h </w:instrText>
+          <w:instrText xml:space="preserve"> PAGEREF _Toc242312281 \h </w:instrText>
         </w:r>
         <w:r>
           <w:rPr>
@@ -8388,7 +8388,7 @@
           <w14:ligatures w14:val="standardContextual"/>
         </w:rPr>
       </w:pPr>
-      <w:hyperlink w:anchor="_Toc242309836" w:history="1">
+      <w:hyperlink w:anchor="_Toc242312282" w:history="1">
         <w:r>
           <w:rPr>
             <w:rStyle w:val="Hyperlink"/>
@@ -8415,7 +8415,7 @@
             <w:noProof/>
             <w:webHidden/>
           </w:rPr>
-          <w:instrText xml:space="preserve"> PAGEREF _Toc242309836 \h </w:instrText>
+          <w:instrText xml:space="preserve"> PAGEREF _Toc242312282 \h </w:instrText>
         </w:r>
         <w:r>
           <w:rPr>
@@ -8462,7 +8462,7 @@
           <w14:ligatures w14:val="standardContextual"/>
         </w:rPr>
       </w:pPr>
-      <w:hyperlink w:anchor="_Toc242309837" w:history="1">
+      <w:hyperlink w:anchor="_Toc242312283" w:history="1">
         <w:r>
           <w:rPr>
             <w:rStyle w:val="Hyperlink"/>
@@ -8489,7 +8489,7 @@
             <w:noProof/>
             <w:webHidden/>
           </w:rPr>
-          <w:instrText xml:space="preserve"> PAGEREF _Toc242309837 \h </w:instrText>
+          <w:instrText xml:space="preserve"> PAGEREF _Toc242312283 \h </w:instrText>
         </w:r>
         <w:r>
           <w:rPr>
@@ -8536,7 +8536,7 @@
           <w14:ligatures w14:val="standardContextual"/>
         </w:rPr>
       </w:pPr>
-      <w:hyperlink w:anchor="_Toc242309838" w:history="1">
+      <w:hyperlink w:anchor="_Toc242312284" w:history="1">
         <w:r>
           <w:rPr>
             <w:rStyle w:val="Hyperlink"/>
@@ -8563,7 +8563,7 @@
             <w:noProof/>
             <w:webHidden/>
           </w:rPr>
-          <w:instrText xml:space="preserve"> PAGEREF _Toc242309838 \h </w:instrText>
+          <w:instrText xml:space="preserve"> PAGEREF _Toc242312284 \h </w:instrText>
         </w:r>
         <w:r>
           <w:rPr>
@@ -8610,7 +8610,7 @@
           <w14:ligatures w14:val="standardContextual"/>
         </w:rPr>
       </w:pPr>
-      <w:hyperlink w:anchor="_Toc242309839" w:history="1">
+      <w:hyperlink w:anchor="_Toc242312285" w:history="1">
         <w:r>
           <w:rPr>
             <w:rStyle w:val="Hyperlink"/>
@@ -8637,7 +8637,7 @@
             <w:noProof/>
             <w:webHidden/>
           </w:rPr>
-          <w:instrText xml:space="preserve"> PAGEREF _Toc242309839 \h </w:instrText>
+          <w:instrText xml:space="preserve"> PAGEREF _Toc242312285 \h </w:instrText>
         </w:r>
         <w:r>
           <w:rPr>
@@ -8684,7 +8684,7 @@
           <w14:ligatures w14:val="standardContextual"/>
         </w:rPr>
       </w:pPr>
-      <w:hyperlink w:anchor="_Toc242309840" w:history="1">
+      <w:hyperlink w:anchor="_Toc242312286" w:history="1">
         <w:r>
           <w:rPr>
             <w:rStyle w:val="Hyperlink"/>
@@ -8711,7 +8711,7 @@
             <w:noProof/>
             <w:webHidden/>
           </w:rPr>
-          <w:instrText xml:space="preserve"> PAGEREF _Toc242309840 \h </w:instrText>
+          <w:instrText xml:space="preserve"> PAGEREF _Toc242312286 \h </w:instrText>
         </w:r>
         <w:r>
           <w:rPr>
@@ -8788,7 +8788,7 @@
       <w:r>
         <w:fldChar w:fldCharType="separate"/>
       </w:r>
-      <w:hyperlink w:anchor="_Toc242309841" w:history="1">
+      <w:hyperlink w:anchor="_Toc242312287" w:history="1">
         <w:r>
           <w:rPr>
             <w:rStyle w:val="Hyperlink"/>
@@ -8815,7 +8815,7 @@
             <w:noProof/>
             <w:webHidden/>
           </w:rPr>
-          <w:instrText xml:space="preserve"> PAGEREF _Toc242309841 \h </w:instrText>
+          <w:instrText xml:space="preserve"> PAGEREF _Toc242312287 \h </w:instrText>
         </w:r>
         <w:r>
           <w:rPr>
@@ -8862,7 +8862,7 @@
           <w14:ligatures w14:val="standardContextual"/>
         </w:rPr>
       </w:pPr>
-      <w:hyperlink w:anchor="_Toc242309842" w:history="1">
+      <w:hyperlink w:anchor="_Toc242312288" w:history="1">
         <w:r>
           <w:rPr>
             <w:rStyle w:val="Hyperlink"/>
@@ -8889,7 +8889,7 @@
             <w:noProof/>
             <w:webHidden/>
           </w:rPr>
-          <w:instrText xml:space="preserve"> PAGEREF _Toc242309842 \h </w:instrText>
+          <w:instrText xml:space="preserve"> PAGEREF _Toc242312288 \h </w:instrText>
         </w:r>
         <w:r>
           <w:rPr>
@@ -8936,7 +8936,7 @@
           <w14:ligatures w14:val="standardContextual"/>
         </w:rPr>
       </w:pPr>
-      <w:hyperlink w:anchor="_Toc242309843" w:history="1">
+      <w:hyperlink w:anchor="_Toc242312289" w:history="1">
         <w:r>
           <w:rPr>
             <w:rStyle w:val="Hyperlink"/>
@@ -8963,7 +8963,7 @@
             <w:noProof/>
             <w:webHidden/>
           </w:rPr>
-          <w:instrText xml:space="preserve"> PAGEREF _Toc242309843 \h </w:instrText>
+          <w:instrText xml:space="preserve"> PAGEREF _Toc242312289 \h </w:instrText>
         </w:r>
         <w:r>
           <w:rPr>
@@ -9010,7 +9010,7 @@
           <w14:ligatures w14:val="standardContextual"/>
         </w:rPr>
       </w:pPr>
-      <w:hyperlink w:anchor="_Toc242309844" w:history="1">
+      <w:hyperlink w:anchor="_Toc242312290" w:history="1">
         <w:r>
           <w:rPr>
             <w:rStyle w:val="Hyperlink"/>
@@ -9037,7 +9037,7 @@
             <w:noProof/>
             <w:webHidden/>
           </w:rPr>
-          <w:instrText xml:space="preserve"> PAGEREF _Toc242309844 \h </w:instrText>
+          <w:instrText xml:space="preserve"> PAGEREF _Toc242312290 \h </w:instrText>
         </w:r>
         <w:r>
           <w:rPr>
@@ -9084,7 +9084,7 @@
           <w14:ligatures w14:val="standardContextual"/>
         </w:rPr>
       </w:pPr>
-      <w:hyperlink w:anchor="_Toc242309845" w:history="1">
+      <w:hyperlink w:anchor="_Toc242312291" w:history="1">
         <w:r>
           <w:rPr>
             <w:rStyle w:val="Hyperlink"/>
@@ -9111,7 +9111,7 @@
             <w:noProof/>
             <w:webHidden/>
           </w:rPr>
-          <w:instrText xml:space="preserve"> PAGEREF _Toc242309845 \h </w:instrText>
+          <w:instrText xml:space="preserve"> PAGEREF _Toc242312291 \h </w:instrText>
         </w:r>
         <w:r>
           <w:rPr>
@@ -9158,7 +9158,7 @@
           <w14:ligatures w14:val="standardContextual"/>
         </w:rPr>
       </w:pPr>
-      <w:hyperlink w:anchor="_Toc242309846" w:history="1">
+      <w:hyperlink w:anchor="_Toc242312292" w:history="1">
         <w:r>
           <w:rPr>
             <w:rStyle w:val="Hyperlink"/>
@@ -9185,7 +9185,7 @@
             <w:noProof/>
             <w:webHidden/>
           </w:rPr>
-          <w:instrText xml:space="preserve"> PAGEREF _Toc242309846 \h </w:instrText>
+          <w:instrText xml:space="preserve"> PAGEREF _Toc242312292 \h </w:instrText>
         </w:r>
         <w:r>
           <w:rPr>
@@ -9232,7 +9232,7 @@
           <w14:ligatures w14:val="standardContextual"/>
         </w:rPr>
       </w:pPr>
-      <w:hyperlink w:anchor="_Toc242309847" w:history="1">
+      <w:hyperlink w:anchor="_Toc242312293" w:history="1">
         <w:r>
           <w:rPr>
             <w:rStyle w:val="Hyperlink"/>
@@ -9259,7 +9259,7 @@
             <w:noProof/>
             <w:webHidden/>
           </w:rPr>
-          <w:instrText xml:space="preserve"> PAGEREF _Toc242309847 \h </w:instrText>
+          <w:instrText xml:space="preserve"> PAGEREF _Toc242312293 \h </w:instrText>
         </w:r>
         <w:r>
           <w:rPr>
@@ -9306,7 +9306,7 @@
           <w14:ligatures w14:val="standardContextual"/>
         </w:rPr>
       </w:pPr>
-      <w:hyperlink w:anchor="_Toc242309848" w:history="1">
+      <w:hyperlink w:anchor="_Toc242312294" w:history="1">
         <w:r>
           <w:rPr>
             <w:rStyle w:val="Hyperlink"/>
@@ -9333,7 +9333,7 @@
             <w:noProof/>
             <w:webHidden/>
           </w:rPr>
-          <w:instrText xml:space="preserve"> PAGEREF _Toc242309848 \h </w:instrText>
+          <w:instrText xml:space="preserve"> PAGEREF _Toc242312294 \h </w:instrText>
         </w:r>
         <w:r>
           <w:rPr>
@@ -9380,7 +9380,7 @@
           <w14:ligatures w14:val="standardContextual"/>
         </w:rPr>
       </w:pPr>
-      <w:hyperlink w:anchor="_Toc242309849" w:history="1">
+      <w:hyperlink w:anchor="_Toc242312295" w:history="1">
         <w:r>
           <w:rPr>
             <w:rStyle w:val="Hyperlink"/>
@@ -9407,7 +9407,7 @@
             <w:noProof/>
             <w:webHidden/>
           </w:rPr>
-          <w:instrText xml:space="preserve"> PAGEREF _Toc242309849 \h </w:instrText>
+          <w:instrText xml:space="preserve"> PAGEREF _Toc242312295 \h </w:instrText>
         </w:r>
         <w:r>
           <w:rPr>
@@ -9454,7 +9454,7 @@
           <w14:ligatures w14:val="standardContextual"/>
         </w:rPr>
       </w:pPr>
-      <w:hyperlink w:anchor="_Toc242309850" w:history="1">
+      <w:hyperlink w:anchor="_Toc242312296" w:history="1">
         <w:r>
           <w:rPr>
             <w:rStyle w:val="Hyperlink"/>
@@ -9481,7 +9481,7 @@
             <w:noProof/>
             <w:webHidden/>
           </w:rPr>
-          <w:instrText xml:space="preserve"> PAGEREF _Toc242309850 \h </w:instrText>
+          <w:instrText xml:space="preserve"> PAGEREF _Toc242312296 \h </w:instrText>
         </w:r>
         <w:r>
           <w:rPr>
@@ -9528,7 +9528,7 @@
           <w14:ligatures w14:val="standardContextual"/>
         </w:rPr>
       </w:pPr>
-      <w:hyperlink w:anchor="_Toc242309851" w:history="1">
+      <w:hyperlink w:anchor="_Toc242312297" w:history="1">
         <w:r>
           <w:rPr>
             <w:rStyle w:val="Hyperlink"/>
@@ -9555,7 +9555,7 @@
             <w:noProof/>
             <w:webHidden/>
           </w:rPr>
-          <w:instrText xml:space="preserve"> PAGEREF _Toc242309851 \h </w:instrText>
+          <w:instrText xml:space="preserve"> PAGEREF _Toc242312297 \h </w:instrText>
         </w:r>
         <w:r>
           <w:rPr>
@@ -9602,7 +9602,7 @@
           <w14:ligatures w14:val="standardContextual"/>
         </w:rPr>
       </w:pPr>
-      <w:hyperlink w:anchor="_Toc242309852" w:history="1">
+      <w:hyperlink w:anchor="_Toc242312298" w:history="1">
         <w:r>
           <w:rPr>
             <w:rStyle w:val="Hyperlink"/>
@@ -9629,7 +9629,7 @@
             <w:noProof/>
             <w:webHidden/>
           </w:rPr>
-          <w:instrText xml:space="preserve"> PAGEREF _Toc242309852 \h </w:instrText>
+          <w:instrText xml:space="preserve"> PAGEREF _Toc242312298 \h </w:instrText>
         </w:r>
         <w:r>
           <w:rPr>
@@ -9676,7 +9676,7 @@
           <w14:ligatures w14:val="standardContextual"/>
         </w:rPr>
       </w:pPr>
-      <w:hyperlink w:anchor="_Toc242309853" w:history="1">
+      <w:hyperlink w:anchor="_Toc242312299" w:history="1">
         <w:r>
           <w:rPr>
             <w:rStyle w:val="Hyperlink"/>
@@ -9703,7 +9703,7 @@
             <w:noProof/>
             <w:webHidden/>
           </w:rPr>
-          <w:instrText xml:space="preserve"> PAGEREF _Toc242309853 \h </w:instrText>
+          <w:instrText xml:space="preserve"> PAGEREF _Toc242312299 \h </w:instrText>
         </w:r>
         <w:r>
           <w:rPr>
@@ -9750,7 +9750,7 @@
           <w14:ligatures w14:val="standardContextual"/>
         </w:rPr>
       </w:pPr>
-      <w:hyperlink w:anchor="_Toc242309854" w:history="1">
+      <w:hyperlink w:anchor="_Toc242312300" w:history="1">
         <w:r>
           <w:rPr>
             <w:rStyle w:val="Hyperlink"/>
@@ -9777,7 +9777,7 @@
             <w:noProof/>
             <w:webHidden/>
           </w:rPr>
-          <w:instrText xml:space="preserve"> PAGEREF _Toc242309854 \h </w:instrText>
+          <w:instrText xml:space="preserve"> PAGEREF _Toc242312300 \h </w:instrText>
         </w:r>
         <w:r>
           <w:rPr>
@@ -9824,7 +9824,7 @@
           <w14:ligatures w14:val="standardContextual"/>
         </w:rPr>
       </w:pPr>
-      <w:hyperlink w:anchor="_Toc242309855" w:history="1">
+      <w:hyperlink w:anchor="_Toc242312301" w:history="1">
         <w:r>
           <w:rPr>
             <w:rStyle w:val="Hyperlink"/>
@@ -9851,7 +9851,7 @@
             <w:noProof/>
             <w:webHidden/>
           </w:rPr>
-          <w:instrText xml:space="preserve"> PAGEREF _Toc242309855 \h </w:instrText>
+          <w:instrText xml:space="preserve"> PAGEREF _Toc242312301 \h </w:instrText>
         </w:r>
         <w:r>
           <w:rPr>
@@ -9892,7 +9892,7 @@
         <w:pStyle w:val="Heading1"/>
         <w:pageBreakBefore/>
       </w:pPr>
-      <w:bookmarkStart w:id="0" w:name="_Toc242309742"/>
+      <w:bookmarkStart w:id="0" w:name="_Toc242312188"/>
       <w:r>
         <w:lastRenderedPageBreak/>
         <w:t>CHƯƠNG 1. GIỚI THIỆU</w:t>
@@ -9903,7 +9903,7 @@
       <w:pPr>
         <w:pStyle w:val="Heading2"/>
       </w:pPr>
-      <w:bookmarkStart w:id="1" w:name="_Toc242309743"/>
+      <w:bookmarkStart w:id="1" w:name="_Toc242312189"/>
       <w:r>
         <w:t>1.1. Mục đích của tài liệu</w:t>
       </w:r>
@@ -9950,7 +9950,7 @@
       <w:pPr>
         <w:pStyle w:val="Heading2"/>
       </w:pPr>
-      <w:bookmarkStart w:id="2" w:name="_Toc242309744"/>
+      <w:bookmarkStart w:id="2" w:name="_Toc242312190"/>
       <w:r>
         <w:t>1.2. Tổng quan phần mềm</w:t>
       </w:r>
@@ -10106,7 +10106,7 @@
       <w:pPr>
         <w:pStyle w:val="Heading2"/>
       </w:pPr>
-      <w:bookmarkStart w:id="3" w:name="_Toc242309745"/>
+      <w:bookmarkStart w:id="3" w:name="_Toc242312191"/>
       <w:r>
         <w:t>1.3. Vai trò người dùng và chức năng</w:t>
       </w:r>
@@ -10144,7 +10144,7 @@
       <w:pPr>
         <w:pStyle w:val="TableCaption"/>
       </w:pPr>
-      <w:bookmarkStart w:id="4" w:name="_Toc242309841"/>
+      <w:bookmarkStart w:id="4" w:name="_Toc242312287"/>
       <w:r>
         <w:t>Bảng 1.1. Chức năng hiển thị theo vai trò</w:t>
       </w:r>
@@ -14347,7 +14347,7 @@
       <w:pPr>
         <w:pStyle w:val="Heading2"/>
       </w:pPr>
-      <w:bookmarkStart w:id="5" w:name="_Toc242309746"/>
+      <w:bookmarkStart w:id="5" w:name="_Toc242312192"/>
       <w:r>
         <w:t>1.4. Yêu cầu hệ thống</w:t>
       </w:r>
@@ -14357,7 +14357,7 @@
       <w:pPr>
         <w:pStyle w:val="TableCaption"/>
       </w:pPr>
-      <w:bookmarkStart w:id="6" w:name="_Toc242309842"/>
+      <w:bookmarkStart w:id="6" w:name="_Toc242312288"/>
       <w:r>
         <w:t>Bảng 1.2. Yêu cầu phần cứng và phần mềm</w:t>
       </w:r>
@@ -14949,7 +14949,7 @@
       <w:pPr>
         <w:pStyle w:val="Heading2"/>
       </w:pPr>
-      <w:bookmarkStart w:id="7" w:name="_Toc242309747"/>
+      <w:bookmarkStart w:id="7" w:name="_Toc242312193"/>
       <w:r>
         <w:t>1.5. Các bước cài đặt tổng quát</w:t>
       </w:r>
@@ -15101,7 +15101,7 @@
       <w:pPr>
         <w:pStyle w:val="TableCaption"/>
       </w:pPr>
-      <w:bookmarkStart w:id="8" w:name="_Toc242309843"/>
+      <w:bookmarkStart w:id="8" w:name="_Toc242312289"/>
       <w:r>
         <w:t>Bảng 1.3. Chọn phương án SQL Server theo máy</w:t>
       </w:r>
@@ -15705,7 +15705,7 @@
       <w:pPr>
         <w:pStyle w:val="Heading2"/>
       </w:pPr>
-      <w:bookmarkStart w:id="9" w:name="_Toc242309748"/>
+      <w:bookmarkStart w:id="9" w:name="_Toc242312194"/>
       <w:r>
         <w:t>1.6. Quy ước trình bày</w:t>
       </w:r>
@@ -15946,7 +15946,7 @@
         <w:pStyle w:val="Heading1"/>
         <w:pageBreakBefore/>
       </w:pPr>
-      <w:bookmarkStart w:id="10" w:name="_Toc242309749"/>
+      <w:bookmarkStart w:id="10" w:name="_Toc242312195"/>
       <w:r>
         <w:lastRenderedPageBreak/>
         <w:t>CHƯƠNG 2. CÀI ĐẶT SQL SERVER VÀ KHỞI TẠO CƠ SỞ DỮ LIỆU</w:t>
@@ -16003,7 +16003,7 @@
       <w:pPr>
         <w:pStyle w:val="Heading2"/>
       </w:pPr>
-      <w:bookmarkStart w:id="11" w:name="_Toc242309750"/>
+      <w:bookmarkStart w:id="11" w:name="_Toc242312196"/>
       <w:r>
         <w:t>2.1. Tải mã nguồn</w:t>
       </w:r>
@@ -16124,7 +16124,7 @@
       <w:pPr>
         <w:pStyle w:val="Heading2"/>
       </w:pPr>
-      <w:bookmarkStart w:id="12" w:name="_Toc242309751"/>
+      <w:bookmarkStart w:id="12" w:name="_Toc242312197"/>
       <w:r>
         <w:t>2.2. Phương án A - SQL Server trong Docker</w:t>
       </w:r>
@@ -16134,7 +16134,7 @@
       <w:pPr>
         <w:pStyle w:val="Heading3"/>
       </w:pPr>
-      <w:bookmarkStart w:id="13" w:name="_Toc242309752"/>
+      <w:bookmarkStart w:id="13" w:name="_Toc242312198"/>
       <w:r>
         <w:t>2.2.1. Cài Docker Desktop</w:t>
       </w:r>
@@ -16445,7 +16445,7 @@
       <w:pPr>
         <w:pStyle w:val="Heading3"/>
       </w:pPr>
-      <w:bookmarkStart w:id="14" w:name="_Toc242309753"/>
+      <w:bookmarkStart w:id="14" w:name="_Toc242312199"/>
       <w:r>
         <w:t>2.2.2. Khởi động SQL Server</w:t>
       </w:r>
@@ -16853,7 +16853,7 @@
       <w:pPr>
         <w:pStyle w:val="Heading3"/>
       </w:pPr>
-      <w:bookmarkStart w:id="15" w:name="_Toc242309754"/>
+      <w:bookmarkStart w:id="15" w:name="_Toc242312200"/>
       <w:r>
         <w:t>2.2.3. Khởi tạo CSDL</w:t>
       </w:r>
@@ -17270,7 +17270,7 @@
       <w:pPr>
         <w:pStyle w:val="Heading3"/>
       </w:pPr>
-      <w:bookmarkStart w:id="16" w:name="_Toc242309755"/>
+      <w:bookmarkStart w:id="16" w:name="_Toc242312201"/>
       <w:r>
         <w:t>2.2.4. Bật, tắt SQL Server hằng ngày</w:t>
       </w:r>
@@ -17280,7 +17280,7 @@
       <w:pPr>
         <w:pStyle w:val="TableCaption"/>
       </w:pPr>
-      <w:bookmarkStart w:id="17" w:name="_Toc242309844"/>
+      <w:bookmarkStart w:id="17" w:name="_Toc242312290"/>
       <w:r>
         <w:t>Bảng 2.1. Các lệnh Docker thường dùng</w:t>
       </w:r>
@@ -17681,7 +17681,7 @@
       <w:pPr>
         <w:pStyle w:val="Heading2"/>
       </w:pPr>
-      <w:bookmarkStart w:id="18" w:name="_Toc242309756"/>
+      <w:bookmarkStart w:id="18" w:name="_Toc242312202"/>
       <w:r>
         <w:t>2.3. Phương án B - SQL Server cài trực tiếp trên Windows</w:t>
       </w:r>
@@ -17691,7 +17691,7 @@
       <w:pPr>
         <w:pStyle w:val="Heading3"/>
       </w:pPr>
-      <w:bookmarkStart w:id="19" w:name="_Toc242309757"/>
+      <w:bookmarkStart w:id="19" w:name="_Toc242312203"/>
       <w:r>
         <w:t>2.3.1. Cài SQL Server</w:t>
       </w:r>
@@ -18473,7 +18473,7 @@
       <w:pPr>
         <w:pStyle w:val="Heading3"/>
       </w:pPr>
-      <w:bookmarkStart w:id="20" w:name="_Toc242309758"/>
+      <w:bookmarkStart w:id="20" w:name="_Toc242312204"/>
       <w:r>
         <w:t>2.3.2. Cài công cụ quản trị và driver</w:t>
       </w:r>
@@ -18663,7 +18663,7 @@
       <w:pPr>
         <w:pStyle w:val="Heading3"/>
       </w:pPr>
-      <w:bookmarkStart w:id="21" w:name="_Toc242309759"/>
+      <w:bookmarkStart w:id="21" w:name="_Toc242312205"/>
       <w:r>
         <w:t>2.3.3. Bật kết nối TCP/IP</w:t>
       </w:r>
@@ -19041,7 +19041,7 @@
       <w:pPr>
         <w:pStyle w:val="Heading3"/>
       </w:pPr>
-      <w:bookmarkStart w:id="22" w:name="_Toc242309760"/>
+      <w:bookmarkStart w:id="22" w:name="_Toc242312206"/>
       <w:r>
         <w:t>2.3.4. Khởi tạo CSDL</w:t>
       </w:r>
@@ -19579,7 +19579,7 @@
       <w:pPr>
         <w:pStyle w:val="Heading3"/>
       </w:pPr>
-      <w:bookmarkStart w:id="23" w:name="_Toc242309761"/>
+      <w:bookmarkStart w:id="23" w:name="_Toc242312207"/>
       <w:r>
         <w:t>2.3.5. Cho máy khác kết nối tới (không bắt buộc)</w:t>
       </w:r>
@@ -19659,7 +19659,7 @@
       <w:pPr>
         <w:pStyle w:val="Heading2"/>
       </w:pPr>
-      <w:bookmarkStart w:id="24" w:name="_Toc242309762"/>
+      <w:bookmarkStart w:id="24" w:name="_Toc242312208"/>
       <w:r>
         <w:t>2.4. Nạp lại dữ liệu mẫu trước buổi demo</w:t>
       </w:r>
@@ -19759,7 +19759,7 @@
         <w:pStyle w:val="Heading1"/>
         <w:pageBreakBefore/>
       </w:pPr>
-      <w:bookmarkStart w:id="25" w:name="_Toc242309763"/>
+      <w:bookmarkStart w:id="25" w:name="_Toc242312209"/>
       <w:r>
         <w:lastRenderedPageBreak/>
         <w:t>CHƯƠNG 3. CÀI ĐẶT ỨNG DỤNG</w:t>
@@ -19770,7 +19770,7 @@
       <w:pPr>
         <w:pStyle w:val="Heading2"/>
       </w:pPr>
-      <w:bookmarkStart w:id="26" w:name="_Toc242309764"/>
+      <w:bookmarkStart w:id="26" w:name="_Toc242312210"/>
       <w:r>
         <w:t>3.1. Tải bộ cài</w:t>
       </w:r>
@@ -19801,14 +19801,14 @@
         <w:t>https://github.com/nhutruong-uit/imcp/releases</w:t>
       </w:r>
       <w:r>
-        <w:t>). Với phiên bản 1.0.1, tên các file là:</w:t>
+        <w:t>). Với phiên bản 1.1.0, tên các file là:</w:t>
       </w:r>
     </w:p>
     <w:p>
       <w:pPr>
         <w:pStyle w:val="TableCaption"/>
       </w:pPr>
-      <w:bookmarkStart w:id="27" w:name="_Toc242309845"/>
+      <w:bookmarkStart w:id="27" w:name="_Toc242312291"/>
       <w:r>
         <w:t>Bảng 3.1. Các file cài đặt</w:t>
       </w:r>
@@ -19986,7 +19986,7 @@
                 <w:color w:val="C7254E"/>
                 <w:sz w:val="21"/>
               </w:rPr>
-              <w:t>QLTTTA-1.0.1-macos-arm64.​dmg</w:t>
+              <w:t>QLTTTA-1.1.0-macos-arm64.​dmg</w:t>
             </w:r>
           </w:p>
         </w:tc>
@@ -20079,7 +20079,7 @@
                 <w:color w:val="C7254E"/>
                 <w:sz w:val="21"/>
               </w:rPr>
-              <w:t>QLTTTA-1.0.1-windows-x64-setup.​exe</w:t>
+              <w:t>QLTTTA-1.1.0-windows-x64-setup.​exe</w:t>
             </w:r>
           </w:p>
         </w:tc>
@@ -20171,7 +20171,7 @@
                 <w:color w:val="C7254E"/>
                 <w:sz w:val="21"/>
               </w:rPr>
-              <w:t>QLTTTA-1.0.1-windows-x64-portable.​zip</w:t>
+              <w:t>QLTTTA-1.1.0-windows-x64-portable.​zip</w:t>
             </w:r>
           </w:p>
         </w:tc>
@@ -20251,7 +20251,7 @@
       <w:pPr>
         <w:pStyle w:val="Heading2"/>
       </w:pPr>
-      <w:bookmarkStart w:id="28" w:name="_Toc242309765"/>
+      <w:bookmarkStart w:id="28" w:name="_Toc242312211"/>
       <w:r>
         <w:t>3.2. Cài đặt trên macOS</w:t>
       </w:r>
@@ -20546,7 +20546,7 @@
         <w:rPr>
           <w:color w:val="C7254E"/>
         </w:rPr>
-        <w:t>v1.0.1-build.&lt;số&gt;</w:t>
+        <w:t>v1.1.0-build.&lt;số&gt;</w:t>
       </w:r>
       <w:r>
         <w:t>):</w:t>
@@ -20652,7 +20652,7 @@
       <w:pPr>
         <w:pStyle w:val="Heading2"/>
       </w:pPr>
-      <w:bookmarkStart w:id="29" w:name="_Toc242309766"/>
+      <w:bookmarkStart w:id="29" w:name="_Toc242312212"/>
       <w:r>
         <w:t>3.3. Cài đặt trên Windows</w:t>
       </w:r>
@@ -20662,7 +20662,7 @@
       <w:pPr>
         <w:pStyle w:val="Heading3"/>
       </w:pPr>
-      <w:bookmarkStart w:id="30" w:name="_Toc242309767"/>
+      <w:bookmarkStart w:id="30" w:name="_Toc242312213"/>
       <w:r>
         <w:t>3.3.1. Dùng bộ cài setup.exe</w:t>
       </w:r>
@@ -20686,7 +20686,7 @@
         <w:rPr>
           <w:color w:val="C7254E"/>
         </w:rPr>
-        <w:t>QLTTTA-1.0.1-windows-x64-setup.exe</w:t>
+        <w:t>QLTTTA-1.1.0-windows-x64-setup.exe</w:t>
       </w:r>
       <w:r>
         <w:t xml:space="preserve">. Nếu Windows hiện </w:t>
@@ -21035,7 +21035,7 @@
               <w:rPr>
                 <w:color w:val="C7254E"/>
               </w:rPr>
-              <w:t>QLTTTA-1.0.1-windows-x64-setup.exe /VERYSILENT /CURRENTUSER /MERGETASKS="!desktopicon"</w:t>
+              <w:t>QLTTTA-1.1.0-windows-x64-setup.exe /VERYSILENT /CURRENTUSER /MERGETASKS="!desktopicon"</w:t>
             </w:r>
             <w:r>
               <w:t xml:space="preserve"> (cho mọi người dùng: thay </w:t>
@@ -21088,7 +21088,7 @@
         </w:rPr>
         <w:lastRenderedPageBreak/>
         <w:drawing>
-          <wp:inline distT="0" distB="0" distL="0" distR="0" wp14:anchorId="78BA99CA" wp14:editId="29AAE407">
+          <wp:inline distT="0" distB="0" distL="0" distR="0" wp14:anchorId="7760D30C" wp14:editId="588D65A0">
             <wp:extent cx="3420000" cy="3198254"/>
             <wp:effectExtent l="0" t="0" r="0" b="0"/>
             <wp:docPr id="522444761" name="Picture 522444761"/>
@@ -21128,7 +21128,7 @@
       <w:pPr>
         <w:pStyle w:val="FigureCaption"/>
       </w:pPr>
-      <w:bookmarkStart w:id="31" w:name="_Toc242309815"/>
+      <w:bookmarkStart w:id="31" w:name="_Toc242312261"/>
       <w:r>
         <w:t>Hình 3.1. Cảnh báo SmartScreen khi chạy bộ cài</w:t>
       </w:r>
@@ -21145,7 +21145,7 @@
           <w:noProof/>
         </w:rPr>
         <w:drawing>
-          <wp:inline distT="0" distB="0" distL="0" distR="0" wp14:anchorId="1BFAADF2" wp14:editId="7AEFE8BD">
+          <wp:inline distT="0" distB="0" distL="0" distR="0" wp14:anchorId="4380851D" wp14:editId="347F8925">
             <wp:extent cx="4500000" cy="3458417"/>
             <wp:effectExtent l="0" t="0" r="0" b="0"/>
             <wp:docPr id="522444762" name="Picture 522444762"/>
@@ -21185,7 +21185,7 @@
       <w:pPr>
         <w:pStyle w:val="FigureCaption"/>
       </w:pPr>
-      <w:bookmarkStart w:id="32" w:name="_Toc242309816"/>
+      <w:bookmarkStart w:id="32" w:name="_Toc242312262"/>
       <w:r>
         <w:t>Hình 3.2. Bước cuối của bộ cài QLTTTA trên Windows</w:t>
       </w:r>
@@ -21195,7 +21195,7 @@
       <w:pPr>
         <w:pStyle w:val="Heading3"/>
       </w:pPr>
-      <w:bookmarkStart w:id="33" w:name="_Toc242309768"/>
+      <w:bookmarkStart w:id="33" w:name="_Toc242312214"/>
       <w:r>
         <w:t>3.3.2. Dùng bản portable</w:t>
       </w:r>
@@ -21214,7 +21214,7 @@
         <w:rPr>
           <w:color w:val="C7254E"/>
         </w:rPr>
-        <w:t>QLTTTA-1.0.1-windows-x64-portable.zip</w:t>
+        <w:t>QLTTTA-1.1.0-windows-x64-portable.zip</w:t>
       </w:r>
       <w:r>
         <w:t xml:space="preserve"> vào một thư mục bất kỳ (ví dụ </w:t>
@@ -21242,7 +21242,7 @@
       <w:pPr>
         <w:pStyle w:val="Heading3"/>
       </w:pPr>
-      <w:bookmarkStart w:id="34" w:name="_Toc242309769"/>
+      <w:bookmarkStart w:id="34" w:name="_Toc242312215"/>
       <w:r>
         <w:lastRenderedPageBreak/>
         <w:t>3.3.3. Driver kết nối</w:t>
@@ -21299,7 +21299,7 @@
       <w:pPr>
         <w:pStyle w:val="Heading2"/>
       </w:pPr>
-      <w:bookmarkStart w:id="35" w:name="_Toc242309770"/>
+      <w:bookmarkStart w:id="35" w:name="_Toc242312216"/>
       <w:r>
         <w:t>3.4. Nơi lưu cấu hình và gỡ cài đặt</w:t>
       </w:r>
@@ -21319,7 +21319,7 @@
       <w:pPr>
         <w:pStyle w:val="TableCaption"/>
       </w:pPr>
-      <w:bookmarkStart w:id="36" w:name="_Toc242309846"/>
+      <w:bookmarkStart w:id="36" w:name="_Toc242312292"/>
       <w:r>
         <w:t>Bảng 3.2. Cấu hình đã lưu và cách gỡ ứng dụng</w:t>
       </w:r>
@@ -21880,7 +21880,7 @@
       <w:pPr>
         <w:pStyle w:val="Heading2"/>
       </w:pPr>
-      <w:bookmarkStart w:id="37" w:name="_Toc242309771"/>
+      <w:bookmarkStart w:id="37" w:name="_Toc242312217"/>
       <w:r>
         <w:t>3.5. Chạy từ mã nguồn (dành cho nhóm phát triển)</w:t>
       </w:r>
@@ -22413,7 +22413,7 @@
         <w:pStyle w:val="Heading1"/>
         <w:pageBreakBefore/>
       </w:pPr>
-      <w:bookmarkStart w:id="38" w:name="_Toc242309772"/>
+      <w:bookmarkStart w:id="38" w:name="_Toc242312218"/>
       <w:r>
         <w:lastRenderedPageBreak/>
         <w:t>CHƯƠNG 4. ĐĂNG NHẬP VÀ GIAO DIỆN CHUNG</w:t>
@@ -22424,7 +22424,7 @@
       <w:pPr>
         <w:pStyle w:val="Heading2"/>
       </w:pPr>
-      <w:bookmarkStart w:id="39" w:name="_Toc242309773"/>
+      <w:bookmarkStart w:id="39" w:name="_Toc242312219"/>
       <w:r>
         <w:t>4.1. Mở ứng dụng</w:t>
       </w:r>
@@ -22581,7 +22581,7 @@
           <w:noProof/>
         </w:rPr>
         <w:drawing>
-          <wp:inline distT="0" distB="0" distL="0" distR="0" wp14:anchorId="60C093F8" wp14:editId="56F96DEE">
+          <wp:inline distT="0" distB="0" distL="0" distR="0" wp14:anchorId="1BBD2197" wp14:editId="41BE6CD5">
             <wp:extent cx="4860000" cy="2938605"/>
             <wp:effectExtent l="0" t="0" r="0" b="0"/>
             <wp:docPr id="522444763" name="Picture 522444763"/>
@@ -22621,7 +22621,7 @@
       <w:pPr>
         <w:pStyle w:val="FigureCaption"/>
       </w:pPr>
-      <w:bookmarkStart w:id="40" w:name="_Toc242309817"/>
+      <w:bookmarkStart w:id="40" w:name="_Toc242312263"/>
       <w:r>
         <w:t>Hình 4.1. Màn hình đăng nhập</w:t>
       </w:r>
@@ -22631,7 +22631,7 @@
       <w:pPr>
         <w:pStyle w:val="Heading2"/>
       </w:pPr>
-      <w:bookmarkStart w:id="41" w:name="_Toc242309774"/>
+      <w:bookmarkStart w:id="41" w:name="_Toc242312220"/>
       <w:r>
         <w:t>4.2. Cấu hình máy chủ (lần chạy đầu tiên)</w:t>
       </w:r>
@@ -22806,7 +22806,7 @@
           <w:noProof/>
         </w:rPr>
         <w:drawing>
-          <wp:inline distT="0" distB="0" distL="0" distR="0" wp14:anchorId="39FB1F53" wp14:editId="71ED8126">
+          <wp:inline distT="0" distB="0" distL="0" distR="0" wp14:anchorId="4161EC17" wp14:editId="64AAF77C">
             <wp:extent cx="5040000" cy="3360000"/>
             <wp:effectExtent l="0" t="0" r="0" b="0"/>
             <wp:docPr id="522444764" name="Picture 522444764"/>
@@ -22846,7 +22846,7 @@
       <w:pPr>
         <w:pStyle w:val="FigureCaption"/>
       </w:pPr>
-      <w:bookmarkStart w:id="42" w:name="_Toc242309818"/>
+      <w:bookmarkStart w:id="42" w:name="_Toc242312264"/>
       <w:r>
         <w:t>Hình 4.2. Khung cấu hình máy chủ SQL Server</w:t>
       </w:r>
@@ -22856,7 +22856,7 @@
       <w:pPr>
         <w:pStyle w:val="TableCaption"/>
       </w:pPr>
-      <w:bookmarkStart w:id="43" w:name="_Toc242309847"/>
+      <w:bookmarkStart w:id="43" w:name="_Toc242312293"/>
       <w:r>
         <w:t>Bảng 4.1. Giá trị ô Máy chủ theo cách cài SQL Server</w:t>
       </w:r>
@@ -23296,7 +23296,7 @@
       <w:pPr>
         <w:pStyle w:val="Heading2"/>
       </w:pPr>
-      <w:bookmarkStart w:id="44" w:name="_Toc242309775"/>
+      <w:bookmarkStart w:id="44" w:name="_Toc242312221"/>
       <w:r>
         <w:t>4.3. Đăng nhập</w:t>
       </w:r>
@@ -23370,7 +23370,7 @@
       <w:pPr>
         <w:pStyle w:val="TableCaption"/>
       </w:pPr>
-      <w:bookmarkStart w:id="45" w:name="_Toc242309848"/>
+      <w:bookmarkStart w:id="45" w:name="_Toc242312294"/>
       <w:r>
         <w:t>Bảng 4.2. Tài khoản demo trong dữ liệu mẫu</w:t>
       </w:r>
@@ -24692,7 +24692,7 @@
       <w:pPr>
         <w:pStyle w:val="TableCaption"/>
       </w:pPr>
-      <w:bookmarkStart w:id="46" w:name="_Toc242309849"/>
+      <w:bookmarkStart w:id="46" w:name="_Toc242312295"/>
       <w:r>
         <w:t>Bảng 4.3. Thông báo lỗi khi đăng nhập</w:t>
       </w:r>
@@ -25116,7 +25116,7 @@
       <w:pPr>
         <w:pStyle w:val="Heading2"/>
       </w:pPr>
-      <w:bookmarkStart w:id="47" w:name="_Toc242309776"/>
+      <w:bookmarkStart w:id="47" w:name="_Toc242312222"/>
       <w:r>
         <w:t>4.4. Màn hình chính</w:t>
       </w:r>
@@ -25377,7 +25377,7 @@
           <w:noProof/>
         </w:rPr>
         <w:drawing>
-          <wp:inline distT="0" distB="0" distL="0" distR="0" wp14:anchorId="3F809261" wp14:editId="427C6B94">
+          <wp:inline distT="0" distB="0" distL="0" distR="0" wp14:anchorId="0DE534AE" wp14:editId="2D22A884">
             <wp:extent cx="5580000" cy="3332500"/>
             <wp:effectExtent l="0" t="0" r="0" b="0"/>
             <wp:docPr id="522444765" name="Picture 522444765"/>
@@ -25417,7 +25417,7 @@
       <w:pPr>
         <w:pStyle w:val="FigureCaption"/>
       </w:pPr>
-      <w:bookmarkStart w:id="48" w:name="_Toc242309819"/>
+      <w:bookmarkStart w:id="48" w:name="_Toc242312265"/>
       <w:r>
         <w:t>Hình 4.3. Màn hình chính của vai trò Quản lý (trang Tổng quan)</w:t>
       </w:r>
@@ -25427,7 +25427,7 @@
       <w:pPr>
         <w:pStyle w:val="Heading2"/>
       </w:pPr>
-      <w:bookmarkStart w:id="49" w:name="_Toc242309777"/>
+      <w:bookmarkStart w:id="49" w:name="_Toc242312223"/>
       <w:r>
         <w:t>4.5. Đổi ngôn ngữ giao diện</w:t>
       </w:r>
@@ -25483,7 +25483,7 @@
       <w:pPr>
         <w:pStyle w:val="Heading2"/>
       </w:pPr>
-      <w:bookmarkStart w:id="50" w:name="_Toc242309778"/>
+      <w:bookmarkStart w:id="50" w:name="_Toc242312224"/>
       <w:r>
         <w:lastRenderedPageBreak/>
         <w:t>4.6. Đổi mật khẩu</w:t>
@@ -25600,7 +25600,7 @@
           <w:noProof/>
         </w:rPr>
         <w:drawing>
-          <wp:inline distT="0" distB="0" distL="0" distR="0" wp14:anchorId="3A37EC86" wp14:editId="0E79AFC4">
+          <wp:inline distT="0" distB="0" distL="0" distR="0" wp14:anchorId="25A7975D" wp14:editId="2966823C">
             <wp:extent cx="3420000" cy="1368000"/>
             <wp:effectExtent l="0" t="0" r="0" b="0"/>
             <wp:docPr id="522444766" name="Picture 522444766"/>
@@ -25640,7 +25640,7 @@
       <w:pPr>
         <w:pStyle w:val="FigureCaption"/>
       </w:pPr>
-      <w:bookmarkStart w:id="51" w:name="_Toc242309820"/>
+      <w:bookmarkStart w:id="51" w:name="_Toc242312266"/>
       <w:r>
         <w:t>Hình 4.4. Hộp thoại đổi mật khẩu</w:t>
       </w:r>
@@ -25678,7 +25678,7 @@
       <w:pPr>
         <w:pStyle w:val="Heading2"/>
       </w:pPr>
-      <w:bookmarkStart w:id="52" w:name="_Toc242309779"/>
+      <w:bookmarkStart w:id="52" w:name="_Toc242312225"/>
       <w:r>
         <w:t>4.7. Đăng xuất và thoát</w:t>
       </w:r>
@@ -25761,7 +25761,7 @@
       <w:pPr>
         <w:pStyle w:val="Heading2"/>
       </w:pPr>
-      <w:bookmarkStart w:id="53" w:name="_Toc242309780"/>
+      <w:bookmarkStart w:id="53" w:name="_Toc242312226"/>
       <w:r>
         <w:t>4.8. Thao tác chung trên các màn hình danh sách</w:t>
       </w:r>
@@ -25789,7 +25789,7 @@
         </w:rPr>
         <w:lastRenderedPageBreak/>
         <w:drawing>
-          <wp:inline distT="0" distB="0" distL="0" distR="0" wp14:anchorId="6D58B8EF" wp14:editId="7FBB94A4">
+          <wp:inline distT="0" distB="0" distL="0" distR="0" wp14:anchorId="5C9EFB28" wp14:editId="5A1612AF">
             <wp:extent cx="5580000" cy="3332500"/>
             <wp:effectExtent l="0" t="0" r="0" b="0"/>
             <wp:docPr id="522444767" name="Picture 522444767"/>
@@ -25829,7 +25829,7 @@
       <w:pPr>
         <w:pStyle w:val="FigureCaption"/>
       </w:pPr>
-      <w:bookmarkStart w:id="54" w:name="_Toc242309821"/>
+      <w:bookmarkStart w:id="54" w:name="_Toc242312267"/>
       <w:r>
         <w:t>Hình 4.5. Một màn hình danh sách: Công nợ học phí</w:t>
       </w:r>
@@ -25839,7 +25839,7 @@
       <w:pPr>
         <w:pStyle w:val="TableCaption"/>
       </w:pPr>
-      <w:bookmarkStart w:id="55" w:name="_Toc242309850"/>
+      <w:bookmarkStart w:id="55" w:name="_Toc242312296"/>
       <w:r>
         <w:t>Bảng 4.4. Các thành phần của màn hình danh sách</w:t>
       </w:r>
@@ -27061,7 +27061,7 @@
           <w:noProof/>
         </w:rPr>
         <w:drawing>
-          <wp:inline distT="0" distB="0" distL="0" distR="0" wp14:anchorId="5A426677" wp14:editId="4061CC0E">
+          <wp:inline distT="0" distB="0" distL="0" distR="0" wp14:anchorId="1BD7A5A8" wp14:editId="3AFAEEF4">
             <wp:extent cx="5040000" cy="3757090"/>
             <wp:effectExtent l="0" t="0" r="0" b="0"/>
             <wp:docPr id="522444768" name="Picture 522444768"/>
@@ -27101,7 +27101,7 @@
       <w:pPr>
         <w:pStyle w:val="FigureCaption"/>
       </w:pPr>
-      <w:bookmarkStart w:id="56" w:name="_Toc242309822"/>
+      <w:bookmarkStart w:id="56" w:name="_Toc242312268"/>
       <w:r>
         <w:t>Hình 4.6. Hộp Xem trước khi in: công nợ học phí nhóm theo lớp</w:t>
       </w:r>
@@ -27181,7 +27181,7 @@
       <w:pPr>
         <w:pStyle w:val="Heading2"/>
       </w:pPr>
-      <w:bookmarkStart w:id="57" w:name="_Toc242309781"/>
+      <w:bookmarkStart w:id="57" w:name="_Toc242312227"/>
       <w:r>
         <w:t>4.9. Form nhập liệu và hộp xác nhận</w:t>
       </w:r>
@@ -27345,7 +27345,7 @@
         <w:pStyle w:val="Heading1"/>
         <w:pageBreakBefore/>
       </w:pPr>
-      <w:bookmarkStart w:id="58" w:name="_Toc242309782"/>
+      <w:bookmarkStart w:id="58" w:name="_Toc242312228"/>
       <w:r>
         <w:lastRenderedPageBreak/>
         <w:t>CHƯƠNG 5. HƯỚNG DẪN THEO CHỨC NĂNG</w:t>
@@ -27366,7 +27366,7 @@
       <w:pPr>
         <w:pStyle w:val="Heading2"/>
       </w:pPr>
-      <w:bookmarkStart w:id="59" w:name="_Toc242309783"/>
+      <w:bookmarkStart w:id="59" w:name="_Toc242312229"/>
       <w:r>
         <w:t>5.1. Tổng quan</w:t>
       </w:r>
@@ -27410,7 +27410,7 @@
       <w:pPr>
         <w:pStyle w:val="TableCaption"/>
       </w:pPr>
-      <w:bookmarkStart w:id="60" w:name="_Toc242309851"/>
+      <w:bookmarkStart w:id="60" w:name="_Toc242312297"/>
       <w:r>
         <w:t>Bảng 5.1. Các thẻ số liệu trên trang Tổng quan</w:t>
       </w:r>
@@ -27892,7 +27892,7 @@
           <w:noProof/>
         </w:rPr>
         <w:drawing>
-          <wp:inline distT="0" distB="0" distL="0" distR="0" wp14:anchorId="02DE135A" wp14:editId="1C990424">
+          <wp:inline distT="0" distB="0" distL="0" distR="0" wp14:anchorId="47ADE713" wp14:editId="758694F9">
             <wp:extent cx="5580000" cy="3332500"/>
             <wp:effectExtent l="0" t="0" r="0" b="0"/>
             <wp:docPr id="522444769" name="Picture 522444769"/>
@@ -27932,7 +27932,7 @@
       <w:pPr>
         <w:pStyle w:val="FigureCaption"/>
       </w:pPr>
-      <w:bookmarkStart w:id="61" w:name="_Toc242309823"/>
+      <w:bookmarkStart w:id="61" w:name="_Toc242312269"/>
       <w:r>
         <w:t>Hình 5.1. Trang Tổng quan của Giáo vụ: không có quyền xem doanh thu</w:t>
       </w:r>
@@ -27942,7 +27942,7 @@
       <w:pPr>
         <w:pStyle w:val="Heading2"/>
       </w:pPr>
-      <w:bookmarkStart w:id="62" w:name="_Toc242309784"/>
+      <w:bookmarkStart w:id="62" w:name="_Toc242312230"/>
       <w:r>
         <w:lastRenderedPageBreak/>
         <w:t>5.2. Học viên</w:t>
@@ -27976,7 +27976,7 @@
           <w:noProof/>
         </w:rPr>
         <w:drawing>
-          <wp:inline distT="0" distB="0" distL="0" distR="0" wp14:anchorId="3540A582" wp14:editId="0C1A4133">
+          <wp:inline distT="0" distB="0" distL="0" distR="0" wp14:anchorId="470E02D4" wp14:editId="7F8F47EB">
             <wp:extent cx="5580000" cy="3332500"/>
             <wp:effectExtent l="0" t="0" r="0" b="0"/>
             <wp:docPr id="522444770" name="Picture 522444770"/>
@@ -28016,7 +28016,7 @@
       <w:pPr>
         <w:pStyle w:val="FigureCaption"/>
       </w:pPr>
-      <w:bookmarkStart w:id="63" w:name="_Toc242309824"/>
+      <w:bookmarkStart w:id="63" w:name="_Toc242312270"/>
       <w:r>
         <w:t>Hình 5.2. Danh sách học viên</w:t>
       </w:r>
@@ -28026,7 +28026,7 @@
       <w:pPr>
         <w:pStyle w:val="Heading3"/>
       </w:pPr>
-      <w:bookmarkStart w:id="64" w:name="_Toc242309785"/>
+      <w:bookmarkStart w:id="64" w:name="_Toc242312231"/>
       <w:r>
         <w:t>5.2.1. Tìm kiếm</w:t>
       </w:r>
@@ -28123,7 +28123,7 @@
       <w:pPr>
         <w:pStyle w:val="Heading3"/>
       </w:pPr>
-      <w:bookmarkStart w:id="65" w:name="_Toc242309786"/>
+      <w:bookmarkStart w:id="65" w:name="_Toc242312232"/>
       <w:r>
         <w:t>5.2.2. Thêm học viên</w:t>
       </w:r>
@@ -28328,7 +28328,7 @@
       <w:pPr>
         <w:pStyle w:val="Heading3"/>
       </w:pPr>
-      <w:bookmarkStart w:id="66" w:name="_Toc242309787"/>
+      <w:bookmarkStart w:id="66" w:name="_Toc242312233"/>
       <w:r>
         <w:t>5.2.3. Sửa thông tin</w:t>
       </w:r>
@@ -28449,7 +28449,7 @@
           <w:noProof/>
         </w:rPr>
         <w:drawing>
-          <wp:inline distT="0" distB="0" distL="0" distR="0" wp14:anchorId="6643F440" wp14:editId="57FE3A54">
+          <wp:inline distT="0" distB="0" distL="0" distR="0" wp14:anchorId="36C6F875" wp14:editId="0A368489">
             <wp:extent cx="3780000" cy="5048129"/>
             <wp:effectExtent l="0" t="0" r="0" b="0"/>
             <wp:docPr id="522444771" name="Picture 522444771"/>
@@ -28489,7 +28489,7 @@
       <w:pPr>
         <w:pStyle w:val="FigureCaption"/>
       </w:pPr>
-      <w:bookmarkStart w:id="67" w:name="_Toc242309825"/>
+      <w:bookmarkStart w:id="67" w:name="_Toc242312271"/>
       <w:r>
         <w:t>Hình 5.3. Hộp thoại sửa thông tin học viên</w:t>
       </w:r>
@@ -28509,7 +28509,7 @@
       <w:pPr>
         <w:pStyle w:val="TableCaption"/>
       </w:pPr>
-      <w:bookmarkStart w:id="68" w:name="_Toc242309852"/>
+      <w:bookmarkStart w:id="68" w:name="_Toc242312298"/>
       <w:r>
         <w:t>Bảng 5.2. Quy tắc kiểm tra thông tin học viên</w:t>
       </w:r>
@@ -29173,7 +29173,7 @@
       <w:pPr>
         <w:pStyle w:val="Heading3"/>
       </w:pPr>
-      <w:bookmarkStart w:id="69" w:name="_Toc242309788"/>
+      <w:bookmarkStart w:id="69" w:name="_Toc242312234"/>
       <w:r>
         <w:t>5.2.4. Xóa học viên</w:t>
       </w:r>
@@ -29290,7 +29290,7 @@
       <w:pPr>
         <w:pStyle w:val="Heading3"/>
       </w:pPr>
-      <w:bookmarkStart w:id="70" w:name="_Toc242309789"/>
+      <w:bookmarkStart w:id="70" w:name="_Toc242312235"/>
       <w:r>
         <w:t>5.2.5. Hồ sơ, ghi danh và kiểm tra xếp lớp từ danh sách học viên</w:t>
       </w:r>
@@ -29388,7 +29388,7 @@
       <w:pPr>
         <w:pStyle w:val="Heading3"/>
       </w:pPr>
-      <w:bookmarkStart w:id="71" w:name="_Toc242309790"/>
+      <w:bookmarkStart w:id="71" w:name="_Toc242312236"/>
       <w:r>
         <w:t>5.2.6. Xuất, nhập danh sách bằng XML</w:t>
       </w:r>
@@ -29474,7 +29474,7 @@
       <w:pPr>
         <w:pStyle w:val="Heading2"/>
       </w:pPr>
-      <w:bookmarkStart w:id="72" w:name="_Toc242309791"/>
+      <w:bookmarkStart w:id="72" w:name="_Toc242312237"/>
       <w:r>
         <w:lastRenderedPageBreak/>
         <w:t>5.3. Kiểm tra xếp lớp</w:t>
@@ -29562,7 +29562,7 @@
           <w:noProof/>
         </w:rPr>
         <w:drawing>
-          <wp:inline distT="0" distB="0" distL="0" distR="0" wp14:anchorId="4F1084C0" wp14:editId="47C1AA98">
+          <wp:inline distT="0" distB="0" distL="0" distR="0" wp14:anchorId="6887420D" wp14:editId="27FDD519">
             <wp:extent cx="5580000" cy="3332500"/>
             <wp:effectExtent l="0" t="0" r="0" b="0"/>
             <wp:docPr id="522444772" name="Picture 522444772"/>
@@ -29602,7 +29602,7 @@
       <w:pPr>
         <w:pStyle w:val="FigureCaption"/>
       </w:pPr>
-      <w:bookmarkStart w:id="73" w:name="_Toc242309826"/>
+      <w:bookmarkStart w:id="73" w:name="_Toc242312272"/>
       <w:r>
         <w:t>Hình 5.4. Danh sách bài kiểm tra xếp lớp</w:t>
       </w:r>
@@ -29859,7 +29859,7 @@
       <w:pPr>
         <w:pStyle w:val="Heading2"/>
       </w:pPr>
-      <w:bookmarkStart w:id="74" w:name="_Toc242309792"/>
+      <w:bookmarkStart w:id="74" w:name="_Toc242312238"/>
       <w:r>
         <w:t>5.4. Lớp học</w:t>
       </w:r>
@@ -29911,7 +29911,7 @@
         </w:rPr>
         <w:lastRenderedPageBreak/>
         <w:drawing>
-          <wp:inline distT="0" distB="0" distL="0" distR="0" wp14:anchorId="6BBA51D2" wp14:editId="65E1E5DD">
+          <wp:inline distT="0" distB="0" distL="0" distR="0" wp14:anchorId="4FE4FAE5" wp14:editId="1E7A02BA">
             <wp:extent cx="5580000" cy="3332500"/>
             <wp:effectExtent l="0" t="0" r="0" b="0"/>
             <wp:docPr id="522444773" name="Picture 522444773"/>
@@ -29951,7 +29951,7 @@
       <w:pPr>
         <w:pStyle w:val="FigureCaption"/>
       </w:pPr>
-      <w:bookmarkStart w:id="75" w:name="_Toc242309827"/>
+      <w:bookmarkStart w:id="75" w:name="_Toc242312273"/>
       <w:r>
         <w:t>Hình 5.5. Màn hình Lớp học và các nút quản lý vòng đời lớp</w:t>
       </w:r>
@@ -30431,7 +30431,7 @@
       <w:pPr>
         <w:pStyle w:val="TableCaption"/>
       </w:pPr>
-      <w:bookmarkStart w:id="76" w:name="_Toc242309853"/>
+      <w:bookmarkStart w:id="76" w:name="_Toc242312299"/>
       <w:r>
         <w:t>Bảng 5.3. Quy tắc CSDL kiểm tra khi quản lý lớp học</w:t>
       </w:r>
@@ -30962,7 +30962,7 @@
       <w:pPr>
         <w:pStyle w:val="Heading2"/>
       </w:pPr>
-      <w:bookmarkStart w:id="77" w:name="_Toc242309793"/>
+      <w:bookmarkStart w:id="77" w:name="_Toc242312239"/>
       <w:r>
         <w:t>5.5. Ghi danh</w:t>
       </w:r>
@@ -31023,7 +31023,7 @@
         </w:rPr>
         <w:lastRenderedPageBreak/>
         <w:drawing>
-          <wp:inline distT="0" distB="0" distL="0" distR="0" wp14:anchorId="263C43CD" wp14:editId="7101D441">
+          <wp:inline distT="0" distB="0" distL="0" distR="0" wp14:anchorId="49C763C0" wp14:editId="014A8FDA">
             <wp:extent cx="5580000" cy="3332500"/>
             <wp:effectExtent l="0" t="0" r="0" b="0"/>
             <wp:docPr id="522444774" name="Picture 522444774"/>
@@ -31063,7 +31063,7 @@
       <w:pPr>
         <w:pStyle w:val="FigureCaption"/>
       </w:pPr>
-      <w:bookmarkStart w:id="78" w:name="_Toc242309828"/>
+      <w:bookmarkStart w:id="78" w:name="_Toc242312274"/>
       <w:r>
         <w:t>Hình 5.6. Danh sách ghi danh</w:t>
       </w:r>
@@ -31335,7 +31335,7 @@
       <w:pPr>
         <w:pStyle w:val="TableCaption"/>
       </w:pPr>
-      <w:bookmarkStart w:id="79" w:name="_Toc242309854"/>
+      <w:bookmarkStart w:id="79" w:name="_Toc242312300"/>
       <w:r>
         <w:t>Bảng 5.4. Quy tắc CSDL kiểm tra khi ghi danh và chuyển lớp</w:t>
       </w:r>
@@ -31725,7 +31725,7 @@
       <w:pPr>
         <w:pStyle w:val="Heading2"/>
       </w:pPr>
-      <w:bookmarkStart w:id="80" w:name="_Toc242309794"/>
+      <w:bookmarkStart w:id="80" w:name="_Toc242312240"/>
       <w:r>
         <w:t>5.6. Lịch học - điểm danh</w:t>
       </w:r>
@@ -31812,7 +31812,7 @@
           <w:noProof/>
         </w:rPr>
         <w:drawing>
-          <wp:inline distT="0" distB="0" distL="0" distR="0" wp14:anchorId="6E38B813" wp14:editId="10FA917D">
+          <wp:inline distT="0" distB="0" distL="0" distR="0" wp14:anchorId="247D3C2B" wp14:editId="737A0A45">
             <wp:extent cx="5580000" cy="3332500"/>
             <wp:effectExtent l="0" t="0" r="0" b="0"/>
             <wp:docPr id="522444775" name="Picture 522444775"/>
@@ -31852,7 +31852,7 @@
       <w:pPr>
         <w:pStyle w:val="FigureCaption"/>
       </w:pPr>
-      <w:bookmarkStart w:id="81" w:name="_Toc242309829"/>
+      <w:bookmarkStart w:id="81" w:name="_Toc242312275"/>
       <w:r>
         <w:t>Hình 5.7. Lịch học - điểm danh của một tuần</w:t>
       </w:r>
@@ -32081,7 +32081,7 @@
       <w:pPr>
         <w:pStyle w:val="Heading2"/>
       </w:pPr>
-      <w:bookmarkStart w:id="82" w:name="_Toc242309795"/>
+      <w:bookmarkStart w:id="82" w:name="_Toc242312241"/>
       <w:r>
         <w:t>5.7. Sổ điểm</w:t>
       </w:r>
@@ -32123,7 +32123,7 @@
           <w:noProof/>
         </w:rPr>
         <w:drawing>
-          <wp:inline distT="0" distB="0" distL="0" distR="0" wp14:anchorId="77AC2121" wp14:editId="217FDC16">
+          <wp:inline distT="0" distB="0" distL="0" distR="0" wp14:anchorId="2BE8FDCE" wp14:editId="245D85F4">
             <wp:extent cx="5580000" cy="3332500"/>
             <wp:effectExtent l="0" t="0" r="0" b="0"/>
             <wp:docPr id="522444776" name="Picture 522444776"/>
@@ -32163,7 +32163,7 @@
       <w:pPr>
         <w:pStyle w:val="FigureCaption"/>
       </w:pPr>
-      <w:bookmarkStart w:id="83" w:name="_Toc242309830"/>
+      <w:bookmarkStart w:id="83" w:name="_Toc242312276"/>
       <w:r>
         <w:t>Hình 5.8. Sổ điểm của một lớp</w:t>
       </w:r>
@@ -32292,7 +32292,7 @@
       <w:pPr>
         <w:pStyle w:val="Heading2"/>
       </w:pPr>
-      <w:bookmarkStart w:id="84" w:name="_Toc242309796"/>
+      <w:bookmarkStart w:id="84" w:name="_Toc242312242"/>
       <w:r>
         <w:t>5.8. Kết quả học tập</w:t>
       </w:r>
@@ -32352,7 +32352,7 @@
           <w:noProof/>
         </w:rPr>
         <w:drawing>
-          <wp:inline distT="0" distB="0" distL="0" distR="0" wp14:anchorId="412AFD73" wp14:editId="294A0D3B">
+          <wp:inline distT="0" distB="0" distL="0" distR="0" wp14:anchorId="32E8AB5F" wp14:editId="23032B2A">
             <wp:extent cx="5580000" cy="3332500"/>
             <wp:effectExtent l="0" t="0" r="0" b="0"/>
             <wp:docPr id="522444777" name="Picture 522444777"/>
@@ -32392,7 +32392,7 @@
       <w:pPr>
         <w:pStyle w:val="FigureCaption"/>
       </w:pPr>
-      <w:bookmarkStart w:id="85" w:name="_Toc242309831"/>
+      <w:bookmarkStart w:id="85" w:name="_Toc242312277"/>
       <w:r>
         <w:t>Hình 5.9. Kết quả học tập</w:t>
       </w:r>
@@ -32402,7 +32402,7 @@
       <w:pPr>
         <w:pStyle w:val="Heading2"/>
       </w:pPr>
-      <w:bookmarkStart w:id="86" w:name="_Toc242309797"/>
+      <w:bookmarkStart w:id="86" w:name="_Toc242312243"/>
       <w:r>
         <w:t>5.9. Thu học phí</w:t>
       </w:r>
@@ -32472,7 +32472,7 @@
         </w:rPr>
         <w:lastRenderedPageBreak/>
         <w:drawing>
-          <wp:inline distT="0" distB="0" distL="0" distR="0" wp14:anchorId="18EA4BDB" wp14:editId="6F6CC59B">
+          <wp:inline distT="0" distB="0" distL="0" distR="0" wp14:anchorId="4B9BA0F5" wp14:editId="2C7AA169">
             <wp:extent cx="5580000" cy="3332500"/>
             <wp:effectExtent l="0" t="0" r="0" b="0"/>
             <wp:docPr id="522444778" name="Picture 522444778"/>
@@ -32512,7 +32512,7 @@
       <w:pPr>
         <w:pStyle w:val="FigureCaption"/>
       </w:pPr>
-      <w:bookmarkStart w:id="87" w:name="_Toc242309832"/>
+      <w:bookmarkStart w:id="87" w:name="_Toc242312278"/>
       <w:r>
         <w:t>Hình 5.10. Danh sách phiếu thu (Kế toán)</w:t>
       </w:r>
@@ -32845,7 +32845,7 @@
       <w:pPr>
         <w:pStyle w:val="Heading2"/>
       </w:pPr>
-      <w:bookmarkStart w:id="88" w:name="_Toc242309798"/>
+      <w:bookmarkStart w:id="88" w:name="_Toc242312244"/>
       <w:r>
         <w:t>5.10. Công nợ học phí</w:t>
       </w:r>
@@ -32902,7 +32902,7 @@
       <w:pPr>
         <w:pStyle w:val="Heading2"/>
       </w:pPr>
-      <w:bookmarkStart w:id="89" w:name="_Toc242309799"/>
+      <w:bookmarkStart w:id="89" w:name="_Toc242312245"/>
       <w:r>
         <w:t>5.11. Doanh thu</w:t>
       </w:r>
@@ -33003,7 +33003,7 @@
           <w:noProof/>
         </w:rPr>
         <w:drawing>
-          <wp:inline distT="0" distB="0" distL="0" distR="0" wp14:anchorId="3AE5BC3A" wp14:editId="1A72CCB9">
+          <wp:inline distT="0" distB="0" distL="0" distR="0" wp14:anchorId="778EFAC7" wp14:editId="4337A8FE">
             <wp:extent cx="5580000" cy="3332500"/>
             <wp:effectExtent l="0" t="0" r="0" b="0"/>
             <wp:docPr id="522444779" name="Picture 522444779"/>
@@ -33043,7 +33043,7 @@
       <w:pPr>
         <w:pStyle w:val="FigureCaption"/>
       </w:pPr>
-      <w:bookmarkStart w:id="90" w:name="_Toc242309833"/>
+      <w:bookmarkStart w:id="90" w:name="_Toc242312279"/>
       <w:r>
         <w:t>Hình 5.11. Doanh thu theo tháng và chi nhánh (Kế toán)</w:t>
       </w:r>
@@ -33053,7 +33053,7 @@
       <w:pPr>
         <w:pStyle w:val="Heading2"/>
       </w:pPr>
-      <w:bookmarkStart w:id="91" w:name="_Toc242309800"/>
+      <w:bookmarkStart w:id="91" w:name="_Toc242312246"/>
       <w:r>
         <w:t>5.12. Lương giáo viên</w:t>
       </w:r>
@@ -33105,7 +33105,7 @@
         </w:rPr>
         <w:lastRenderedPageBreak/>
         <w:drawing>
-          <wp:inline distT="0" distB="0" distL="0" distR="0" wp14:anchorId="41248BE8" wp14:editId="32180DB0">
+          <wp:inline distT="0" distB="0" distL="0" distR="0" wp14:anchorId="495AE620" wp14:editId="3F3B28E6">
             <wp:extent cx="5580000" cy="3332500"/>
             <wp:effectExtent l="0" t="0" r="0" b="0"/>
             <wp:docPr id="522444780" name="Picture 522444780"/>
@@ -33145,7 +33145,7 @@
       <w:pPr>
         <w:pStyle w:val="FigureCaption"/>
       </w:pPr>
-      <w:bookmarkStart w:id="92" w:name="_Toc242309834"/>
+      <w:bookmarkStart w:id="92" w:name="_Toc242312280"/>
       <w:r>
         <w:t>Hình 5.12. Bảng lương giáo viên (Kế toán)</w:t>
       </w:r>
@@ -33251,7 +33251,7 @@
       <w:pPr>
         <w:pStyle w:val="Heading2"/>
       </w:pPr>
-      <w:bookmarkStart w:id="93" w:name="_Toc242309801"/>
+      <w:bookmarkStart w:id="93" w:name="_Toc242312247"/>
       <w:r>
         <w:t>5.13. Danh mục</w:t>
       </w:r>
@@ -33304,7 +33304,7 @@
       <w:pPr>
         <w:pStyle w:val="Heading3"/>
       </w:pPr>
-      <w:bookmarkStart w:id="94" w:name="_Toc242309802"/>
+      <w:bookmarkStart w:id="94" w:name="_Toc242312248"/>
       <w:r>
         <w:t>5.13.1. Khóa học</w:t>
       </w:r>
@@ -33341,7 +33341,7 @@
         </w:rPr>
         <w:lastRenderedPageBreak/>
         <w:drawing>
-          <wp:inline distT="0" distB="0" distL="0" distR="0" wp14:anchorId="5FD1DA93" wp14:editId="10BB17BE">
+          <wp:inline distT="0" distB="0" distL="0" distR="0" wp14:anchorId="5B9CE023" wp14:editId="2C4F7DBA">
             <wp:extent cx="5580000" cy="3332500"/>
             <wp:effectExtent l="0" t="0" r="0" b="0"/>
             <wp:docPr id="522444781" name="Picture 522444781"/>
@@ -33381,7 +33381,7 @@
       <w:pPr>
         <w:pStyle w:val="FigureCaption"/>
       </w:pPr>
-      <w:bookmarkStart w:id="95" w:name="_Toc242309835"/>
+      <w:bookmarkStart w:id="95" w:name="_Toc242312281"/>
       <w:r>
         <w:t>Hình 5.13. Danh mục khóa học và cột điểm của khóa đang chọn</w:t>
       </w:r>
@@ -33581,7 +33581,7 @@
       <w:pPr>
         <w:pStyle w:val="Heading3"/>
       </w:pPr>
-      <w:bookmarkStart w:id="96" w:name="_Toc242309803"/>
+      <w:bookmarkStart w:id="96" w:name="_Toc242312249"/>
       <w:r>
         <w:t>5.13.2. Giáo viên, Nhân viên</w:t>
       </w:r>
@@ -33709,7 +33709,7 @@
       <w:pPr>
         <w:pStyle w:val="Heading3"/>
       </w:pPr>
-      <w:bookmarkStart w:id="97" w:name="_Toc242309804"/>
+      <w:bookmarkStart w:id="97" w:name="_Toc242312250"/>
       <w:r>
         <w:t>5.13.3. Chi nhánh - phòng học, Khuyến mãi</w:t>
       </w:r>
@@ -33906,7 +33906,7 @@
           <w:noProof/>
         </w:rPr>
         <w:drawing>
-          <wp:inline distT="0" distB="0" distL="0" distR="0" wp14:anchorId="748A7B6F" wp14:editId="7FAE3FFD">
+          <wp:inline distT="0" distB="0" distL="0" distR="0" wp14:anchorId="00970857" wp14:editId="3D2794D3">
             <wp:extent cx="5580000" cy="3332500"/>
             <wp:effectExtent l="0" t="0" r="0" b="0"/>
             <wp:docPr id="522444782" name="Picture 522444782"/>
@@ -33946,7 +33946,7 @@
       <w:pPr>
         <w:pStyle w:val="FigureCaption"/>
       </w:pPr>
-      <w:bookmarkStart w:id="98" w:name="_Toc242309836"/>
+      <w:bookmarkStart w:id="98" w:name="_Toc242312282"/>
       <w:r>
         <w:t>Hình 5.14. Chi nhánh và phòng học của chi nhánh đang chọn</w:t>
       </w:r>
@@ -33956,7 +33956,7 @@
       <w:pPr>
         <w:pStyle w:val="Heading2"/>
       </w:pPr>
-      <w:bookmarkStart w:id="99" w:name="_Toc242309805"/>
+      <w:bookmarkStart w:id="99" w:name="_Toc242312251"/>
       <w:r>
         <w:lastRenderedPageBreak/>
         <w:t>5.14. Tài khoản</w:t>
@@ -34008,7 +34008,7 @@
           <w:noProof/>
         </w:rPr>
         <w:drawing>
-          <wp:inline distT="0" distB="0" distL="0" distR="0" wp14:anchorId="5AD9D80D" wp14:editId="72425066">
+          <wp:inline distT="0" distB="0" distL="0" distR="0" wp14:anchorId="3285245E" wp14:editId="38D0F48E">
             <wp:extent cx="5580000" cy="3332500"/>
             <wp:effectExtent l="0" t="0" r="0" b="0"/>
             <wp:docPr id="522444783" name="Picture 522444783"/>
@@ -34048,7 +34048,7 @@
       <w:pPr>
         <w:pStyle w:val="FigureCaption"/>
       </w:pPr>
-      <w:bookmarkStart w:id="100" w:name="_Toc242309837"/>
+      <w:bookmarkStart w:id="100" w:name="_Toc242312283"/>
       <w:r>
         <w:t>Hình 5.15. Danh sách tài khoản (Quản lý)</w:t>
       </w:r>
@@ -34204,7 +34204,7 @@
       <w:pPr>
         <w:pStyle w:val="Heading2"/>
       </w:pPr>
-      <w:bookmarkStart w:id="101" w:name="_Toc242309806"/>
+      <w:bookmarkStart w:id="101" w:name="_Toc242312252"/>
       <w:r>
         <w:t>5.15. Sao lưu</w:t>
       </w:r>
@@ -34355,7 +34355,7 @@
           <w:noProof/>
         </w:rPr>
         <w:drawing>
-          <wp:inline distT="0" distB="0" distL="0" distR="0" wp14:anchorId="7513458C" wp14:editId="7F600CA8">
+          <wp:inline distT="0" distB="0" distL="0" distR="0" wp14:anchorId="4342AD39" wp14:editId="6FFC420A">
             <wp:extent cx="5580000" cy="3332500"/>
             <wp:effectExtent l="0" t="0" r="0" b="0"/>
             <wp:docPr id="522444784" name="Picture 522444784"/>
@@ -34395,7 +34395,7 @@
       <w:pPr>
         <w:pStyle w:val="FigureCaption"/>
       </w:pPr>
-      <w:bookmarkStart w:id="102" w:name="_Toc242309838"/>
+      <w:bookmarkStart w:id="102" w:name="_Toc242312284"/>
       <w:r>
         <w:t>Hình 5.16. Màn hình sao lưu cơ sở dữ liệu</w:t>
       </w:r>
@@ -34424,7 +34424,7 @@
       <w:pPr>
         <w:pStyle w:val="Heading2"/>
       </w:pPr>
-      <w:bookmarkStart w:id="103" w:name="_Toc242309807"/>
+      <w:bookmarkStart w:id="103" w:name="_Toc242312253"/>
       <w:r>
         <w:t>5.16. Chức năng dành cho giáo viên</w:t>
       </w:r>
@@ -34574,7 +34574,7 @@
         </w:rPr>
         <w:lastRenderedPageBreak/>
         <w:drawing>
-          <wp:inline distT="0" distB="0" distL="0" distR="0" wp14:anchorId="22D29287" wp14:editId="034C0483">
+          <wp:inline distT="0" distB="0" distL="0" distR="0" wp14:anchorId="3B7E6DC6" wp14:editId="7C460D3B">
             <wp:extent cx="5580000" cy="3332500"/>
             <wp:effectExtent l="0" t="0" r="0" b="0"/>
             <wp:docPr id="522444785" name="Picture 522444785"/>
@@ -34614,7 +34614,7 @@
       <w:pPr>
         <w:pStyle w:val="FigureCaption"/>
       </w:pPr>
-      <w:bookmarkStart w:id="104" w:name="_Toc242309839"/>
+      <w:bookmarkStart w:id="104" w:name="_Toc242312285"/>
       <w:r>
         <w:t>Hình 5.17. Lịch dạy của giáo viên</w:t>
       </w:r>
@@ -34631,7 +34631,7 @@
           <w:noProof/>
         </w:rPr>
         <w:drawing>
-          <wp:inline distT="0" distB="0" distL="0" distR="0" wp14:anchorId="1655C34D" wp14:editId="73320CCE">
+          <wp:inline distT="0" distB="0" distL="0" distR="0" wp14:anchorId="26769B81" wp14:editId="2F385C23">
             <wp:extent cx="5580000" cy="3332500"/>
             <wp:effectExtent l="0" t="0" r="0" b="0"/>
             <wp:docPr id="522444786" name="Picture 522444786"/>
@@ -34671,7 +34671,7 @@
       <w:pPr>
         <w:pStyle w:val="FigureCaption"/>
       </w:pPr>
-      <w:bookmarkStart w:id="105" w:name="_Toc242309840"/>
+      <w:bookmarkStart w:id="105" w:name="_Toc242312286"/>
       <w:r>
         <w:t>Hình 5.18. Sổ điểm của giáo viên</w:t>
       </w:r>
@@ -34681,7 +34681,7 @@
       <w:pPr>
         <w:pStyle w:val="Heading2"/>
       </w:pPr>
-      <w:bookmarkStart w:id="106" w:name="_Toc242309808"/>
+      <w:bookmarkStart w:id="106" w:name="_Toc242312254"/>
       <w:r>
         <w:t>5.17. Việc vẫn làm trong SSMS</w:t>
       </w:r>
@@ -34800,7 +34800,7 @@
         <w:pStyle w:val="Heading1"/>
         <w:pageBreakBefore/>
       </w:pPr>
-      <w:bookmarkStart w:id="107" w:name="_Toc242309809"/>
+      <w:bookmarkStart w:id="107" w:name="_Toc242312255"/>
       <w:r>
         <w:lastRenderedPageBreak/>
         <w:t>CHƯƠNG 6. XỬ LÝ SỰ CỐ</w:t>
@@ -34811,7 +34811,7 @@
       <w:pPr>
         <w:pStyle w:val="Heading2"/>
       </w:pPr>
-      <w:bookmarkStart w:id="108" w:name="_Toc242309810"/>
+      <w:bookmarkStart w:id="108" w:name="_Toc242312256"/>
       <w:r>
         <w:t>6.1. Kiểm tra kết nối không cần giao diện</w:t>
       </w:r>
@@ -35376,7 +35376,7 @@
       <w:pPr>
         <w:pStyle w:val="Heading2"/>
       </w:pPr>
-      <w:bookmarkStart w:id="109" w:name="_Toc242309811"/>
+      <w:bookmarkStart w:id="109" w:name="_Toc242312257"/>
       <w:r>
         <w:t>6.2. Lỗi thường gặp</w:t>
       </w:r>
@@ -35386,7 +35386,7 @@
       <w:pPr>
         <w:pStyle w:val="TableCaption"/>
       </w:pPr>
-      <w:bookmarkStart w:id="110" w:name="_Toc242309855"/>
+      <w:bookmarkStart w:id="110" w:name="_Toc242312301"/>
       <w:r>
         <w:t>Bảng 6.1. Lỗi thường gặp và cách xử lý</w:t>
       </w:r>
@@ -38177,7 +38177,7 @@
       <w:pPr>
         <w:pStyle w:val="Heading2"/>
       </w:pPr>
-      <w:bookmarkStart w:id="111" w:name="_Toc242309812"/>
+      <w:bookmarkStart w:id="111" w:name="_Toc242312258"/>
       <w:r>
         <w:t>6.3. Khi cần hỗ trợ thêm</w:t>
       </w:r>
@@ -38225,7 +38225,7 @@
         <w:pStyle w:val="Heading1"/>
         <w:pageBreakBefore/>
       </w:pPr>
-      <w:bookmarkStart w:id="112" w:name="_Toc242309813"/>
+      <w:bookmarkStart w:id="112" w:name="_Toc242312259"/>
       <w:r>
         <w:lastRenderedPageBreak/>
         <w:t>PHỤ LỤC A. TÓM TẮT LỆNH</w:t>
@@ -38976,7 +38976,7 @@
         <w:pStyle w:val="Heading1"/>
         <w:pageBreakBefore/>
       </w:pPr>
-      <w:bookmarkStart w:id="113" w:name="_Toc242309814"/>
+      <w:bookmarkStart w:id="113" w:name="_Toc242312260"/>
       <w:r>
         <w:lastRenderedPageBreak/>
         <w:t>PHỤ LỤC B. CÁC MỤC CẦN BỔ SUNG</w:t>

</xml_diff>

<commit_message>
docs(user-guide): show version 1.2.0 and point to the demo video
</commit_message>
<xml_diff>
--- a/docs/user-guide/QLTTTA_User_Guide.docx
+++ b/docs/user-guide/QLTTTA_User_Guide.docx
@@ -923,7 +923,7 @@
               <w:rPr>
                 <w:sz w:val="21"/>
               </w:rPr>
-              <w:t>QLTTTA - Quản lý Trung tâm Tiếng Anh, phiên bản 1.1.0</w:t>
+              <w:t>QLTTTA - Quản lý Trung tâm Tiếng Anh, phiên bản 1.2.0</w:t>
             </w:r>
           </w:p>
         </w:tc>
@@ -1402,7 +1402,7 @@
       <w:r>
         <w:fldChar w:fldCharType="separate"/>
       </w:r>
-      <w:hyperlink w:anchor="_Toc242312188" w:history="1">
+      <w:hyperlink w:anchor="_Toc242317475" w:history="1">
         <w:r>
           <w:rPr>
             <w:rStyle w:val="Hyperlink"/>
@@ -1429,7 +1429,7 @@
             <w:noProof/>
             <w:webHidden/>
           </w:rPr>
-          <w:instrText xml:space="preserve"> PAGEREF _Toc242312188 \h </w:instrText>
+          <w:instrText xml:space="preserve"> PAGEREF _Toc242317475 \h </w:instrText>
         </w:r>
         <w:r>
           <w:rPr>
@@ -1476,7 +1476,7 @@
           <w14:ligatures w14:val="standardContextual"/>
         </w:rPr>
       </w:pPr>
-      <w:hyperlink w:anchor="_Toc242312189" w:history="1">
+      <w:hyperlink w:anchor="_Toc242317476" w:history="1">
         <w:r>
           <w:rPr>
             <w:rStyle w:val="Hyperlink"/>
@@ -1503,7 +1503,7 @@
             <w:noProof/>
             <w:webHidden/>
           </w:rPr>
-          <w:instrText xml:space="preserve"> PAGEREF _Toc242312189 \h </w:instrText>
+          <w:instrText xml:space="preserve"> PAGEREF _Toc242317476 \h </w:instrText>
         </w:r>
         <w:r>
           <w:rPr>
@@ -1550,7 +1550,7 @@
           <w14:ligatures w14:val="standardContextual"/>
         </w:rPr>
       </w:pPr>
-      <w:hyperlink w:anchor="_Toc242312190" w:history="1">
+      <w:hyperlink w:anchor="_Toc242317477" w:history="1">
         <w:r>
           <w:rPr>
             <w:rStyle w:val="Hyperlink"/>
@@ -1577,7 +1577,7 @@
             <w:noProof/>
             <w:webHidden/>
           </w:rPr>
-          <w:instrText xml:space="preserve"> PAGEREF _Toc242312190 \h </w:instrText>
+          <w:instrText xml:space="preserve"> PAGEREF _Toc242317477 \h </w:instrText>
         </w:r>
         <w:r>
           <w:rPr>
@@ -1624,7 +1624,7 @@
           <w14:ligatures w14:val="standardContextual"/>
         </w:rPr>
       </w:pPr>
-      <w:hyperlink w:anchor="_Toc242312191" w:history="1">
+      <w:hyperlink w:anchor="_Toc242317478" w:history="1">
         <w:r>
           <w:rPr>
             <w:rStyle w:val="Hyperlink"/>
@@ -1651,7 +1651,7 @@
             <w:noProof/>
             <w:webHidden/>
           </w:rPr>
-          <w:instrText xml:space="preserve"> PAGEREF _Toc242312191 \h </w:instrText>
+          <w:instrText xml:space="preserve"> PAGEREF _Toc242317478 \h </w:instrText>
         </w:r>
         <w:r>
           <w:rPr>
@@ -1698,7 +1698,7 @@
           <w14:ligatures w14:val="standardContextual"/>
         </w:rPr>
       </w:pPr>
-      <w:hyperlink w:anchor="_Toc242312192" w:history="1">
+      <w:hyperlink w:anchor="_Toc242317479" w:history="1">
         <w:r>
           <w:rPr>
             <w:rStyle w:val="Hyperlink"/>
@@ -1725,7 +1725,7 @@
             <w:noProof/>
             <w:webHidden/>
           </w:rPr>
-          <w:instrText xml:space="preserve"> PAGEREF _Toc242312192 \h </w:instrText>
+          <w:instrText xml:space="preserve"> PAGEREF _Toc242317479 \h </w:instrText>
         </w:r>
         <w:r>
           <w:rPr>
@@ -1745,7 +1745,7 @@
             <w:noProof/>
             <w:webHidden/>
           </w:rPr>
-          <w:t>9</w:t>
+          <w:t>10</w:t>
         </w:r>
         <w:r>
           <w:rPr>
@@ -1772,7 +1772,7 @@
           <w14:ligatures w14:val="standardContextual"/>
         </w:rPr>
       </w:pPr>
-      <w:hyperlink w:anchor="_Toc242312193" w:history="1">
+      <w:hyperlink w:anchor="_Toc242317480" w:history="1">
         <w:r>
           <w:rPr>
             <w:rStyle w:val="Hyperlink"/>
@@ -1799,7 +1799,7 @@
             <w:noProof/>
             <w:webHidden/>
           </w:rPr>
-          <w:instrText xml:space="preserve"> PAGEREF _Toc242312193 \h </w:instrText>
+          <w:instrText xml:space="preserve"> PAGEREF _Toc242317480 \h </w:instrText>
         </w:r>
         <w:r>
           <w:rPr>
@@ -1846,7 +1846,7 @@
           <w14:ligatures w14:val="standardContextual"/>
         </w:rPr>
       </w:pPr>
-      <w:hyperlink w:anchor="_Toc242312194" w:history="1">
+      <w:hyperlink w:anchor="_Toc242317481" w:history="1">
         <w:r>
           <w:rPr>
             <w:rStyle w:val="Hyperlink"/>
@@ -1873,7 +1873,7 @@
             <w:noProof/>
             <w:webHidden/>
           </w:rPr>
-          <w:instrText xml:space="preserve"> PAGEREF _Toc242312194 \h </w:instrText>
+          <w:instrText xml:space="preserve"> PAGEREF _Toc242317481 \h </w:instrText>
         </w:r>
         <w:r>
           <w:rPr>
@@ -1920,7 +1920,7 @@
           <w14:ligatures w14:val="standardContextual"/>
         </w:rPr>
       </w:pPr>
-      <w:hyperlink w:anchor="_Toc242312195" w:history="1">
+      <w:hyperlink w:anchor="_Toc242317482" w:history="1">
         <w:r>
           <w:rPr>
             <w:rStyle w:val="Hyperlink"/>
@@ -1947,7 +1947,7 @@
             <w:noProof/>
             <w:webHidden/>
           </w:rPr>
-          <w:instrText xml:space="preserve"> PAGEREF _Toc242312195 \h </w:instrText>
+          <w:instrText xml:space="preserve"> PAGEREF _Toc242317482 \h </w:instrText>
         </w:r>
         <w:r>
           <w:rPr>
@@ -1994,7 +1994,7 @@
           <w14:ligatures w14:val="standardContextual"/>
         </w:rPr>
       </w:pPr>
-      <w:hyperlink w:anchor="_Toc242312196" w:history="1">
+      <w:hyperlink w:anchor="_Toc242317483" w:history="1">
         <w:r>
           <w:rPr>
             <w:rStyle w:val="Hyperlink"/>
@@ -2021,7 +2021,7 @@
             <w:noProof/>
             <w:webHidden/>
           </w:rPr>
-          <w:instrText xml:space="preserve"> PAGEREF _Toc242312196 \h </w:instrText>
+          <w:instrText xml:space="preserve"> PAGEREF _Toc242317483 \h </w:instrText>
         </w:r>
         <w:r>
           <w:rPr>
@@ -2068,7 +2068,7 @@
           <w14:ligatures w14:val="standardContextual"/>
         </w:rPr>
       </w:pPr>
-      <w:hyperlink w:anchor="_Toc242312197" w:history="1">
+      <w:hyperlink w:anchor="_Toc242317484" w:history="1">
         <w:r>
           <w:rPr>
             <w:rStyle w:val="Hyperlink"/>
@@ -2095,7 +2095,7 @@
             <w:noProof/>
             <w:webHidden/>
           </w:rPr>
-          <w:instrText xml:space="preserve"> PAGEREF _Toc242312197 \h </w:instrText>
+          <w:instrText xml:space="preserve"> PAGEREF _Toc242317484 \h </w:instrText>
         </w:r>
         <w:r>
           <w:rPr>
@@ -2142,7 +2142,7 @@
           <w14:ligatures w14:val="standardContextual"/>
         </w:rPr>
       </w:pPr>
-      <w:hyperlink w:anchor="_Toc242312198" w:history="1">
+      <w:hyperlink w:anchor="_Toc242317485" w:history="1">
         <w:r>
           <w:rPr>
             <w:rStyle w:val="Hyperlink"/>
@@ -2169,7 +2169,7 @@
             <w:noProof/>
             <w:webHidden/>
           </w:rPr>
-          <w:instrText xml:space="preserve"> PAGEREF _Toc242312198 \h </w:instrText>
+          <w:instrText xml:space="preserve"> PAGEREF _Toc242317485 \h </w:instrText>
         </w:r>
         <w:r>
           <w:rPr>
@@ -2216,7 +2216,7 @@
           <w14:ligatures w14:val="standardContextual"/>
         </w:rPr>
       </w:pPr>
-      <w:hyperlink w:anchor="_Toc242312199" w:history="1">
+      <w:hyperlink w:anchor="_Toc242317486" w:history="1">
         <w:r>
           <w:rPr>
             <w:rStyle w:val="Hyperlink"/>
@@ -2243,7 +2243,7 @@
             <w:noProof/>
             <w:webHidden/>
           </w:rPr>
-          <w:instrText xml:space="preserve"> PAGEREF _Toc242312199 \h </w:instrText>
+          <w:instrText xml:space="preserve"> PAGEREF _Toc242317486 \h </w:instrText>
         </w:r>
         <w:r>
           <w:rPr>
@@ -2290,7 +2290,7 @@
           <w14:ligatures w14:val="standardContextual"/>
         </w:rPr>
       </w:pPr>
-      <w:hyperlink w:anchor="_Toc242312200" w:history="1">
+      <w:hyperlink w:anchor="_Toc242317487" w:history="1">
         <w:r>
           <w:rPr>
             <w:rStyle w:val="Hyperlink"/>
@@ -2317,7 +2317,7 @@
             <w:noProof/>
             <w:webHidden/>
           </w:rPr>
-          <w:instrText xml:space="preserve"> PAGEREF _Toc242312200 \h </w:instrText>
+          <w:instrText xml:space="preserve"> PAGEREF _Toc242317487 \h </w:instrText>
         </w:r>
         <w:r>
           <w:rPr>
@@ -2364,7 +2364,7 @@
           <w14:ligatures w14:val="standardContextual"/>
         </w:rPr>
       </w:pPr>
-      <w:hyperlink w:anchor="_Toc242312201" w:history="1">
+      <w:hyperlink w:anchor="_Toc242317488" w:history="1">
         <w:r>
           <w:rPr>
             <w:rStyle w:val="Hyperlink"/>
@@ -2391,7 +2391,7 @@
             <w:noProof/>
             <w:webHidden/>
           </w:rPr>
-          <w:instrText xml:space="preserve"> PAGEREF _Toc242312201 \h </w:instrText>
+          <w:instrText xml:space="preserve"> PAGEREF _Toc242317488 \h </w:instrText>
         </w:r>
         <w:r>
           <w:rPr>
@@ -2438,7 +2438,7 @@
           <w14:ligatures w14:val="standardContextual"/>
         </w:rPr>
       </w:pPr>
-      <w:hyperlink w:anchor="_Toc242312202" w:history="1">
+      <w:hyperlink w:anchor="_Toc242317489" w:history="1">
         <w:r>
           <w:rPr>
             <w:rStyle w:val="Hyperlink"/>
@@ -2465,7 +2465,7 @@
             <w:noProof/>
             <w:webHidden/>
           </w:rPr>
-          <w:instrText xml:space="preserve"> PAGEREF _Toc242312202 \h </w:instrText>
+          <w:instrText xml:space="preserve"> PAGEREF _Toc242317489 \h </w:instrText>
         </w:r>
         <w:r>
           <w:rPr>
@@ -2512,7 +2512,7 @@
           <w14:ligatures w14:val="standardContextual"/>
         </w:rPr>
       </w:pPr>
-      <w:hyperlink w:anchor="_Toc242312203" w:history="1">
+      <w:hyperlink w:anchor="_Toc242317490" w:history="1">
         <w:r>
           <w:rPr>
             <w:rStyle w:val="Hyperlink"/>
@@ -2539,7 +2539,7 @@
             <w:noProof/>
             <w:webHidden/>
           </w:rPr>
-          <w:instrText xml:space="preserve"> PAGEREF _Toc242312203 \h </w:instrText>
+          <w:instrText xml:space="preserve"> PAGEREF _Toc242317490 \h </w:instrText>
         </w:r>
         <w:r>
           <w:rPr>
@@ -2586,7 +2586,7 @@
           <w14:ligatures w14:val="standardContextual"/>
         </w:rPr>
       </w:pPr>
-      <w:hyperlink w:anchor="_Toc242312204" w:history="1">
+      <w:hyperlink w:anchor="_Toc242317491" w:history="1">
         <w:r>
           <w:rPr>
             <w:rStyle w:val="Hyperlink"/>
@@ -2613,7 +2613,7 @@
             <w:noProof/>
             <w:webHidden/>
           </w:rPr>
-          <w:instrText xml:space="preserve"> PAGEREF _Toc242312204 \h </w:instrText>
+          <w:instrText xml:space="preserve"> PAGEREF _Toc242317491 \h </w:instrText>
         </w:r>
         <w:r>
           <w:rPr>
@@ -2660,7 +2660,7 @@
           <w14:ligatures w14:val="standardContextual"/>
         </w:rPr>
       </w:pPr>
-      <w:hyperlink w:anchor="_Toc242312205" w:history="1">
+      <w:hyperlink w:anchor="_Toc242317492" w:history="1">
         <w:r>
           <w:rPr>
             <w:rStyle w:val="Hyperlink"/>
@@ -2687,7 +2687,7 @@
             <w:noProof/>
             <w:webHidden/>
           </w:rPr>
-          <w:instrText xml:space="preserve"> PAGEREF _Toc242312205 \h </w:instrText>
+          <w:instrText xml:space="preserve"> PAGEREF _Toc242317492 \h </w:instrText>
         </w:r>
         <w:r>
           <w:rPr>
@@ -2734,7 +2734,7 @@
           <w14:ligatures w14:val="standardContextual"/>
         </w:rPr>
       </w:pPr>
-      <w:hyperlink w:anchor="_Toc242312206" w:history="1">
+      <w:hyperlink w:anchor="_Toc242317493" w:history="1">
         <w:r>
           <w:rPr>
             <w:rStyle w:val="Hyperlink"/>
@@ -2761,7 +2761,7 @@
             <w:noProof/>
             <w:webHidden/>
           </w:rPr>
-          <w:instrText xml:space="preserve"> PAGEREF _Toc242312206 \h </w:instrText>
+          <w:instrText xml:space="preserve"> PAGEREF _Toc242317493 \h </w:instrText>
         </w:r>
         <w:r>
           <w:rPr>
@@ -2808,7 +2808,7 @@
           <w14:ligatures w14:val="standardContextual"/>
         </w:rPr>
       </w:pPr>
-      <w:hyperlink w:anchor="_Toc242312207" w:history="1">
+      <w:hyperlink w:anchor="_Toc242317494" w:history="1">
         <w:r>
           <w:rPr>
             <w:rStyle w:val="Hyperlink"/>
@@ -2835,7 +2835,7 @@
             <w:noProof/>
             <w:webHidden/>
           </w:rPr>
-          <w:instrText xml:space="preserve"> PAGEREF _Toc242312207 \h </w:instrText>
+          <w:instrText xml:space="preserve"> PAGEREF _Toc242317494 \h </w:instrText>
         </w:r>
         <w:r>
           <w:rPr>
@@ -2882,7 +2882,7 @@
           <w14:ligatures w14:val="standardContextual"/>
         </w:rPr>
       </w:pPr>
-      <w:hyperlink w:anchor="_Toc242312208" w:history="1">
+      <w:hyperlink w:anchor="_Toc242317495" w:history="1">
         <w:r>
           <w:rPr>
             <w:rStyle w:val="Hyperlink"/>
@@ -2909,7 +2909,7 @@
             <w:noProof/>
             <w:webHidden/>
           </w:rPr>
-          <w:instrText xml:space="preserve"> PAGEREF _Toc242312208 \h </w:instrText>
+          <w:instrText xml:space="preserve"> PAGEREF _Toc242317495 \h </w:instrText>
         </w:r>
         <w:r>
           <w:rPr>
@@ -2956,7 +2956,7 @@
           <w14:ligatures w14:val="standardContextual"/>
         </w:rPr>
       </w:pPr>
-      <w:hyperlink w:anchor="_Toc242312209" w:history="1">
+      <w:hyperlink w:anchor="_Toc242317496" w:history="1">
         <w:r>
           <w:rPr>
             <w:rStyle w:val="Hyperlink"/>
@@ -2983,7 +2983,7 @@
             <w:noProof/>
             <w:webHidden/>
           </w:rPr>
-          <w:instrText xml:space="preserve"> PAGEREF _Toc242312209 \h </w:instrText>
+          <w:instrText xml:space="preserve"> PAGEREF _Toc242317496 \h </w:instrText>
         </w:r>
         <w:r>
           <w:rPr>
@@ -3030,7 +3030,7 @@
           <w14:ligatures w14:val="standardContextual"/>
         </w:rPr>
       </w:pPr>
-      <w:hyperlink w:anchor="_Toc242312210" w:history="1">
+      <w:hyperlink w:anchor="_Toc242317497" w:history="1">
         <w:r>
           <w:rPr>
             <w:rStyle w:val="Hyperlink"/>
@@ -3057,7 +3057,7 @@
             <w:noProof/>
             <w:webHidden/>
           </w:rPr>
-          <w:instrText xml:space="preserve"> PAGEREF _Toc242312210 \h </w:instrText>
+          <w:instrText xml:space="preserve"> PAGEREF _Toc242317497 \h </w:instrText>
         </w:r>
         <w:r>
           <w:rPr>
@@ -3104,7 +3104,7 @@
           <w14:ligatures w14:val="standardContextual"/>
         </w:rPr>
       </w:pPr>
-      <w:hyperlink w:anchor="_Toc242312211" w:history="1">
+      <w:hyperlink w:anchor="_Toc242317498" w:history="1">
         <w:r>
           <w:rPr>
             <w:rStyle w:val="Hyperlink"/>
@@ -3131,7 +3131,7 @@
             <w:noProof/>
             <w:webHidden/>
           </w:rPr>
-          <w:instrText xml:space="preserve"> PAGEREF _Toc242312211 \h </w:instrText>
+          <w:instrText xml:space="preserve"> PAGEREF _Toc242317498 \h </w:instrText>
         </w:r>
         <w:r>
           <w:rPr>
@@ -3178,7 +3178,7 @@
           <w14:ligatures w14:val="standardContextual"/>
         </w:rPr>
       </w:pPr>
-      <w:hyperlink w:anchor="_Toc242312212" w:history="1">
+      <w:hyperlink w:anchor="_Toc242317499" w:history="1">
         <w:r>
           <w:rPr>
             <w:rStyle w:val="Hyperlink"/>
@@ -3205,7 +3205,7 @@
             <w:noProof/>
             <w:webHidden/>
           </w:rPr>
-          <w:instrText xml:space="preserve"> PAGEREF _Toc242312212 \h </w:instrText>
+          <w:instrText xml:space="preserve"> PAGEREF _Toc242317499 \h </w:instrText>
         </w:r>
         <w:r>
           <w:rPr>
@@ -3252,7 +3252,7 @@
           <w14:ligatures w14:val="standardContextual"/>
         </w:rPr>
       </w:pPr>
-      <w:hyperlink w:anchor="_Toc242312213" w:history="1">
+      <w:hyperlink w:anchor="_Toc242317500" w:history="1">
         <w:r>
           <w:rPr>
             <w:rStyle w:val="Hyperlink"/>
@@ -3279,7 +3279,7 @@
             <w:noProof/>
             <w:webHidden/>
           </w:rPr>
-          <w:instrText xml:space="preserve"> PAGEREF _Toc242312213 \h </w:instrText>
+          <w:instrText xml:space="preserve"> PAGEREF _Toc242317500 \h </w:instrText>
         </w:r>
         <w:r>
           <w:rPr>
@@ -3326,7 +3326,7 @@
           <w14:ligatures w14:val="standardContextual"/>
         </w:rPr>
       </w:pPr>
-      <w:hyperlink w:anchor="_Toc242312214" w:history="1">
+      <w:hyperlink w:anchor="_Toc242317501" w:history="1">
         <w:r>
           <w:rPr>
             <w:rStyle w:val="Hyperlink"/>
@@ -3353,7 +3353,7 @@
             <w:noProof/>
             <w:webHidden/>
           </w:rPr>
-          <w:instrText xml:space="preserve"> PAGEREF _Toc242312214 \h </w:instrText>
+          <w:instrText xml:space="preserve"> PAGEREF _Toc242317501 \h </w:instrText>
         </w:r>
         <w:r>
           <w:rPr>
@@ -3400,7 +3400,7 @@
           <w14:ligatures w14:val="standardContextual"/>
         </w:rPr>
       </w:pPr>
-      <w:hyperlink w:anchor="_Toc242312215" w:history="1">
+      <w:hyperlink w:anchor="_Toc242317502" w:history="1">
         <w:r>
           <w:rPr>
             <w:rStyle w:val="Hyperlink"/>
@@ -3427,7 +3427,7 @@
             <w:noProof/>
             <w:webHidden/>
           </w:rPr>
-          <w:instrText xml:space="preserve"> PAGEREF _Toc242312215 \h </w:instrText>
+          <w:instrText xml:space="preserve"> PAGEREF _Toc242317502 \h </w:instrText>
         </w:r>
         <w:r>
           <w:rPr>
@@ -3474,7 +3474,7 @@
           <w14:ligatures w14:val="standardContextual"/>
         </w:rPr>
       </w:pPr>
-      <w:hyperlink w:anchor="_Toc242312216" w:history="1">
+      <w:hyperlink w:anchor="_Toc242317503" w:history="1">
         <w:r>
           <w:rPr>
             <w:rStyle w:val="Hyperlink"/>
@@ -3501,7 +3501,7 @@
             <w:noProof/>
             <w:webHidden/>
           </w:rPr>
-          <w:instrText xml:space="preserve"> PAGEREF _Toc242312216 \h </w:instrText>
+          <w:instrText xml:space="preserve"> PAGEREF _Toc242317503 \h </w:instrText>
         </w:r>
         <w:r>
           <w:rPr>
@@ -3548,7 +3548,7 @@
           <w14:ligatures w14:val="standardContextual"/>
         </w:rPr>
       </w:pPr>
-      <w:hyperlink w:anchor="_Toc242312217" w:history="1">
+      <w:hyperlink w:anchor="_Toc242317504" w:history="1">
         <w:r>
           <w:rPr>
             <w:rStyle w:val="Hyperlink"/>
@@ -3575,7 +3575,7 @@
             <w:noProof/>
             <w:webHidden/>
           </w:rPr>
-          <w:instrText xml:space="preserve"> PAGEREF _Toc242312217 \h </w:instrText>
+          <w:instrText xml:space="preserve"> PAGEREF _Toc242317504 \h </w:instrText>
         </w:r>
         <w:r>
           <w:rPr>
@@ -3622,7 +3622,7 @@
           <w14:ligatures w14:val="standardContextual"/>
         </w:rPr>
       </w:pPr>
-      <w:hyperlink w:anchor="_Toc242312218" w:history="1">
+      <w:hyperlink w:anchor="_Toc242317505" w:history="1">
         <w:r>
           <w:rPr>
             <w:rStyle w:val="Hyperlink"/>
@@ -3649,7 +3649,7 @@
             <w:noProof/>
             <w:webHidden/>
           </w:rPr>
-          <w:instrText xml:space="preserve"> PAGEREF _Toc242312218 \h </w:instrText>
+          <w:instrText xml:space="preserve"> PAGEREF _Toc242317505 \h </w:instrText>
         </w:r>
         <w:r>
           <w:rPr>
@@ -3696,7 +3696,7 @@
           <w14:ligatures w14:val="standardContextual"/>
         </w:rPr>
       </w:pPr>
-      <w:hyperlink w:anchor="_Toc242312219" w:history="1">
+      <w:hyperlink w:anchor="_Toc242317506" w:history="1">
         <w:r>
           <w:rPr>
             <w:rStyle w:val="Hyperlink"/>
@@ -3723,7 +3723,7 @@
             <w:noProof/>
             <w:webHidden/>
           </w:rPr>
-          <w:instrText xml:space="preserve"> PAGEREF _Toc242312219 \h </w:instrText>
+          <w:instrText xml:space="preserve"> PAGEREF _Toc242317506 \h </w:instrText>
         </w:r>
         <w:r>
           <w:rPr>
@@ -3770,7 +3770,7 @@
           <w14:ligatures w14:val="standardContextual"/>
         </w:rPr>
       </w:pPr>
-      <w:hyperlink w:anchor="_Toc242312220" w:history="1">
+      <w:hyperlink w:anchor="_Toc242317507" w:history="1">
         <w:r>
           <w:rPr>
             <w:rStyle w:val="Hyperlink"/>
@@ -3797,7 +3797,7 @@
             <w:noProof/>
             <w:webHidden/>
           </w:rPr>
-          <w:instrText xml:space="preserve"> PAGEREF _Toc242312220 \h </w:instrText>
+          <w:instrText xml:space="preserve"> PAGEREF _Toc242317507 \h </w:instrText>
         </w:r>
         <w:r>
           <w:rPr>
@@ -3844,7 +3844,7 @@
           <w14:ligatures w14:val="standardContextual"/>
         </w:rPr>
       </w:pPr>
-      <w:hyperlink w:anchor="_Toc242312221" w:history="1">
+      <w:hyperlink w:anchor="_Toc242317508" w:history="1">
         <w:r>
           <w:rPr>
             <w:rStyle w:val="Hyperlink"/>
@@ -3871,7 +3871,7 @@
             <w:noProof/>
             <w:webHidden/>
           </w:rPr>
-          <w:instrText xml:space="preserve"> PAGEREF _Toc242312221 \h </w:instrText>
+          <w:instrText xml:space="preserve"> PAGEREF _Toc242317508 \h </w:instrText>
         </w:r>
         <w:r>
           <w:rPr>
@@ -3918,7 +3918,7 @@
           <w14:ligatures w14:val="standardContextual"/>
         </w:rPr>
       </w:pPr>
-      <w:hyperlink w:anchor="_Toc242312222" w:history="1">
+      <w:hyperlink w:anchor="_Toc242317509" w:history="1">
         <w:r>
           <w:rPr>
             <w:rStyle w:val="Hyperlink"/>
@@ -3945,7 +3945,7 @@
             <w:noProof/>
             <w:webHidden/>
           </w:rPr>
-          <w:instrText xml:space="preserve"> PAGEREF _Toc242312222 \h </w:instrText>
+          <w:instrText xml:space="preserve"> PAGEREF _Toc242317509 \h </w:instrText>
         </w:r>
         <w:r>
           <w:rPr>
@@ -3992,7 +3992,7 @@
           <w14:ligatures w14:val="standardContextual"/>
         </w:rPr>
       </w:pPr>
-      <w:hyperlink w:anchor="_Toc242312223" w:history="1">
+      <w:hyperlink w:anchor="_Toc242317510" w:history="1">
         <w:r>
           <w:rPr>
             <w:rStyle w:val="Hyperlink"/>
@@ -4019,7 +4019,7 @@
             <w:noProof/>
             <w:webHidden/>
           </w:rPr>
-          <w:instrText xml:space="preserve"> PAGEREF _Toc242312223 \h </w:instrText>
+          <w:instrText xml:space="preserve"> PAGEREF _Toc242317510 \h </w:instrText>
         </w:r>
         <w:r>
           <w:rPr>
@@ -4066,7 +4066,7 @@
           <w14:ligatures w14:val="standardContextual"/>
         </w:rPr>
       </w:pPr>
-      <w:hyperlink w:anchor="_Toc242312224" w:history="1">
+      <w:hyperlink w:anchor="_Toc242317511" w:history="1">
         <w:r>
           <w:rPr>
             <w:rStyle w:val="Hyperlink"/>
@@ -4093,7 +4093,7 @@
             <w:noProof/>
             <w:webHidden/>
           </w:rPr>
-          <w:instrText xml:space="preserve"> PAGEREF _Toc242312224 \h </w:instrText>
+          <w:instrText xml:space="preserve"> PAGEREF _Toc242317511 \h </w:instrText>
         </w:r>
         <w:r>
           <w:rPr>
@@ -4140,7 +4140,7 @@
           <w14:ligatures w14:val="standardContextual"/>
         </w:rPr>
       </w:pPr>
-      <w:hyperlink w:anchor="_Toc242312225" w:history="1">
+      <w:hyperlink w:anchor="_Toc242317512" w:history="1">
         <w:r>
           <w:rPr>
             <w:rStyle w:val="Hyperlink"/>
@@ -4167,7 +4167,7 @@
             <w:noProof/>
             <w:webHidden/>
           </w:rPr>
-          <w:instrText xml:space="preserve"> PAGEREF _Toc242312225 \h </w:instrText>
+          <w:instrText xml:space="preserve"> PAGEREF _Toc242317512 \h </w:instrText>
         </w:r>
         <w:r>
           <w:rPr>
@@ -4214,7 +4214,7 @@
           <w14:ligatures w14:val="standardContextual"/>
         </w:rPr>
       </w:pPr>
-      <w:hyperlink w:anchor="_Toc242312226" w:history="1">
+      <w:hyperlink w:anchor="_Toc242317513" w:history="1">
         <w:r>
           <w:rPr>
             <w:rStyle w:val="Hyperlink"/>
@@ -4241,7 +4241,7 @@
             <w:noProof/>
             <w:webHidden/>
           </w:rPr>
-          <w:instrText xml:space="preserve"> PAGEREF _Toc242312226 \h </w:instrText>
+          <w:instrText xml:space="preserve"> PAGEREF _Toc242317513 \h </w:instrText>
         </w:r>
         <w:r>
           <w:rPr>
@@ -4288,7 +4288,7 @@
           <w14:ligatures w14:val="standardContextual"/>
         </w:rPr>
       </w:pPr>
-      <w:hyperlink w:anchor="_Toc242312227" w:history="1">
+      <w:hyperlink w:anchor="_Toc242317514" w:history="1">
         <w:r>
           <w:rPr>
             <w:rStyle w:val="Hyperlink"/>
@@ -4315,7 +4315,7 @@
             <w:noProof/>
             <w:webHidden/>
           </w:rPr>
-          <w:instrText xml:space="preserve"> PAGEREF _Toc242312227 \h </w:instrText>
+          <w:instrText xml:space="preserve"> PAGEREF _Toc242317514 \h </w:instrText>
         </w:r>
         <w:r>
           <w:rPr>
@@ -4362,7 +4362,7 @@
           <w14:ligatures w14:val="standardContextual"/>
         </w:rPr>
       </w:pPr>
-      <w:hyperlink w:anchor="_Toc242312228" w:history="1">
+      <w:hyperlink w:anchor="_Toc242317515" w:history="1">
         <w:r>
           <w:rPr>
             <w:rStyle w:val="Hyperlink"/>
@@ -4389,7 +4389,7 @@
             <w:noProof/>
             <w:webHidden/>
           </w:rPr>
-          <w:instrText xml:space="preserve"> PAGEREF _Toc242312228 \h </w:instrText>
+          <w:instrText xml:space="preserve"> PAGEREF _Toc242317515 \h </w:instrText>
         </w:r>
         <w:r>
           <w:rPr>
@@ -4436,7 +4436,7 @@
           <w14:ligatures w14:val="standardContextual"/>
         </w:rPr>
       </w:pPr>
-      <w:hyperlink w:anchor="_Toc242312229" w:history="1">
+      <w:hyperlink w:anchor="_Toc242317516" w:history="1">
         <w:r>
           <w:rPr>
             <w:rStyle w:val="Hyperlink"/>
@@ -4463,7 +4463,7 @@
             <w:noProof/>
             <w:webHidden/>
           </w:rPr>
-          <w:instrText xml:space="preserve"> PAGEREF _Toc242312229 \h </w:instrText>
+          <w:instrText xml:space="preserve"> PAGEREF _Toc242317516 \h </w:instrText>
         </w:r>
         <w:r>
           <w:rPr>
@@ -4510,7 +4510,7 @@
           <w14:ligatures w14:val="standardContextual"/>
         </w:rPr>
       </w:pPr>
-      <w:hyperlink w:anchor="_Toc242312230" w:history="1">
+      <w:hyperlink w:anchor="_Toc242317517" w:history="1">
         <w:r>
           <w:rPr>
             <w:rStyle w:val="Hyperlink"/>
@@ -4537,7 +4537,7 @@
             <w:noProof/>
             <w:webHidden/>
           </w:rPr>
-          <w:instrText xml:space="preserve"> PAGEREF _Toc242312230 \h </w:instrText>
+          <w:instrText xml:space="preserve"> PAGEREF _Toc242317517 \h </w:instrText>
         </w:r>
         <w:r>
           <w:rPr>
@@ -4584,7 +4584,7 @@
           <w14:ligatures w14:val="standardContextual"/>
         </w:rPr>
       </w:pPr>
-      <w:hyperlink w:anchor="_Toc242312231" w:history="1">
+      <w:hyperlink w:anchor="_Toc242317518" w:history="1">
         <w:r>
           <w:rPr>
             <w:rStyle w:val="Hyperlink"/>
@@ -4611,7 +4611,7 @@
             <w:noProof/>
             <w:webHidden/>
           </w:rPr>
-          <w:instrText xml:space="preserve"> PAGEREF _Toc242312231 \h </w:instrText>
+          <w:instrText xml:space="preserve"> PAGEREF _Toc242317518 \h </w:instrText>
         </w:r>
         <w:r>
           <w:rPr>
@@ -4658,7 +4658,7 @@
           <w14:ligatures w14:val="standardContextual"/>
         </w:rPr>
       </w:pPr>
-      <w:hyperlink w:anchor="_Toc242312232" w:history="1">
+      <w:hyperlink w:anchor="_Toc242317519" w:history="1">
         <w:r>
           <w:rPr>
             <w:rStyle w:val="Hyperlink"/>
@@ -4685,7 +4685,7 @@
             <w:noProof/>
             <w:webHidden/>
           </w:rPr>
-          <w:instrText xml:space="preserve"> PAGEREF _Toc242312232 \h </w:instrText>
+          <w:instrText xml:space="preserve"> PAGEREF _Toc242317519 \h </w:instrText>
         </w:r>
         <w:r>
           <w:rPr>
@@ -4732,7 +4732,7 @@
           <w14:ligatures w14:val="standardContextual"/>
         </w:rPr>
       </w:pPr>
-      <w:hyperlink w:anchor="_Toc242312233" w:history="1">
+      <w:hyperlink w:anchor="_Toc242317520" w:history="1">
         <w:r>
           <w:rPr>
             <w:rStyle w:val="Hyperlink"/>
@@ -4759,7 +4759,7 @@
             <w:noProof/>
             <w:webHidden/>
           </w:rPr>
-          <w:instrText xml:space="preserve"> PAGEREF _Toc242312233 \h </w:instrText>
+          <w:instrText xml:space="preserve"> PAGEREF _Toc242317520 \h </w:instrText>
         </w:r>
         <w:r>
           <w:rPr>
@@ -4806,7 +4806,7 @@
           <w14:ligatures w14:val="standardContextual"/>
         </w:rPr>
       </w:pPr>
-      <w:hyperlink w:anchor="_Toc242312234" w:history="1">
+      <w:hyperlink w:anchor="_Toc242317521" w:history="1">
         <w:r>
           <w:rPr>
             <w:rStyle w:val="Hyperlink"/>
@@ -4833,7 +4833,7 @@
             <w:noProof/>
             <w:webHidden/>
           </w:rPr>
-          <w:instrText xml:space="preserve"> PAGEREF _Toc242312234 \h </w:instrText>
+          <w:instrText xml:space="preserve"> PAGEREF _Toc242317521 \h </w:instrText>
         </w:r>
         <w:r>
           <w:rPr>
@@ -4880,7 +4880,7 @@
           <w14:ligatures w14:val="standardContextual"/>
         </w:rPr>
       </w:pPr>
-      <w:hyperlink w:anchor="_Toc242312235" w:history="1">
+      <w:hyperlink w:anchor="_Toc242317522" w:history="1">
         <w:r>
           <w:rPr>
             <w:rStyle w:val="Hyperlink"/>
@@ -4907,7 +4907,7 @@
             <w:noProof/>
             <w:webHidden/>
           </w:rPr>
-          <w:instrText xml:space="preserve"> PAGEREF _Toc242312235 \h </w:instrText>
+          <w:instrText xml:space="preserve"> PAGEREF _Toc242317522 \h </w:instrText>
         </w:r>
         <w:r>
           <w:rPr>
@@ -4954,7 +4954,7 @@
           <w14:ligatures w14:val="standardContextual"/>
         </w:rPr>
       </w:pPr>
-      <w:hyperlink w:anchor="_Toc242312236" w:history="1">
+      <w:hyperlink w:anchor="_Toc242317523" w:history="1">
         <w:r>
           <w:rPr>
             <w:rStyle w:val="Hyperlink"/>
@@ -4981,7 +4981,7 @@
             <w:noProof/>
             <w:webHidden/>
           </w:rPr>
-          <w:instrText xml:space="preserve"> PAGEREF _Toc242312236 \h </w:instrText>
+          <w:instrText xml:space="preserve"> PAGEREF _Toc242317523 \h </w:instrText>
         </w:r>
         <w:r>
           <w:rPr>
@@ -5028,7 +5028,7 @@
           <w14:ligatures w14:val="standardContextual"/>
         </w:rPr>
       </w:pPr>
-      <w:hyperlink w:anchor="_Toc242312237" w:history="1">
+      <w:hyperlink w:anchor="_Toc242317524" w:history="1">
         <w:r>
           <w:rPr>
             <w:rStyle w:val="Hyperlink"/>
@@ -5055,7 +5055,7 @@
             <w:noProof/>
             <w:webHidden/>
           </w:rPr>
-          <w:instrText xml:space="preserve"> PAGEREF _Toc242312237 \h </w:instrText>
+          <w:instrText xml:space="preserve"> PAGEREF _Toc242317524 \h </w:instrText>
         </w:r>
         <w:r>
           <w:rPr>
@@ -5102,7 +5102,7 @@
           <w14:ligatures w14:val="standardContextual"/>
         </w:rPr>
       </w:pPr>
-      <w:hyperlink w:anchor="_Toc242312238" w:history="1">
+      <w:hyperlink w:anchor="_Toc242317525" w:history="1">
         <w:r>
           <w:rPr>
             <w:rStyle w:val="Hyperlink"/>
@@ -5129,7 +5129,7 @@
             <w:noProof/>
             <w:webHidden/>
           </w:rPr>
-          <w:instrText xml:space="preserve"> PAGEREF _Toc242312238 \h </w:instrText>
+          <w:instrText xml:space="preserve"> PAGEREF _Toc242317525 \h </w:instrText>
         </w:r>
         <w:r>
           <w:rPr>
@@ -5176,7 +5176,7 @@
           <w14:ligatures w14:val="standardContextual"/>
         </w:rPr>
       </w:pPr>
-      <w:hyperlink w:anchor="_Toc242312239" w:history="1">
+      <w:hyperlink w:anchor="_Toc242317526" w:history="1">
         <w:r>
           <w:rPr>
             <w:rStyle w:val="Hyperlink"/>
@@ -5203,7 +5203,7 @@
             <w:noProof/>
             <w:webHidden/>
           </w:rPr>
-          <w:instrText xml:space="preserve"> PAGEREF _Toc242312239 \h </w:instrText>
+          <w:instrText xml:space="preserve"> PAGEREF _Toc242317526 \h </w:instrText>
         </w:r>
         <w:r>
           <w:rPr>
@@ -5250,7 +5250,7 @@
           <w14:ligatures w14:val="standardContextual"/>
         </w:rPr>
       </w:pPr>
-      <w:hyperlink w:anchor="_Toc242312240" w:history="1">
+      <w:hyperlink w:anchor="_Toc242317527" w:history="1">
         <w:r>
           <w:rPr>
             <w:rStyle w:val="Hyperlink"/>
@@ -5277,7 +5277,7 @@
             <w:noProof/>
             <w:webHidden/>
           </w:rPr>
-          <w:instrText xml:space="preserve"> PAGEREF _Toc242312240 \h </w:instrText>
+          <w:instrText xml:space="preserve"> PAGEREF _Toc242317527 \h </w:instrText>
         </w:r>
         <w:r>
           <w:rPr>
@@ -5324,7 +5324,7 @@
           <w14:ligatures w14:val="standardContextual"/>
         </w:rPr>
       </w:pPr>
-      <w:hyperlink w:anchor="_Toc242312241" w:history="1">
+      <w:hyperlink w:anchor="_Toc242317528" w:history="1">
         <w:r>
           <w:rPr>
             <w:rStyle w:val="Hyperlink"/>
@@ -5351,7 +5351,7 @@
             <w:noProof/>
             <w:webHidden/>
           </w:rPr>
-          <w:instrText xml:space="preserve"> PAGEREF _Toc242312241 \h </w:instrText>
+          <w:instrText xml:space="preserve"> PAGEREF _Toc242317528 \h </w:instrText>
         </w:r>
         <w:r>
           <w:rPr>
@@ -5398,7 +5398,7 @@
           <w14:ligatures w14:val="standardContextual"/>
         </w:rPr>
       </w:pPr>
-      <w:hyperlink w:anchor="_Toc242312242" w:history="1">
+      <w:hyperlink w:anchor="_Toc242317529" w:history="1">
         <w:r>
           <w:rPr>
             <w:rStyle w:val="Hyperlink"/>
@@ -5425,7 +5425,7 @@
             <w:noProof/>
             <w:webHidden/>
           </w:rPr>
-          <w:instrText xml:space="preserve"> PAGEREF _Toc242312242 \h </w:instrText>
+          <w:instrText xml:space="preserve"> PAGEREF _Toc242317529 \h </w:instrText>
         </w:r>
         <w:r>
           <w:rPr>
@@ -5472,7 +5472,7 @@
           <w14:ligatures w14:val="standardContextual"/>
         </w:rPr>
       </w:pPr>
-      <w:hyperlink w:anchor="_Toc242312243" w:history="1">
+      <w:hyperlink w:anchor="_Toc242317530" w:history="1">
         <w:r>
           <w:rPr>
             <w:rStyle w:val="Hyperlink"/>
@@ -5499,7 +5499,7 @@
             <w:noProof/>
             <w:webHidden/>
           </w:rPr>
-          <w:instrText xml:space="preserve"> PAGEREF _Toc242312243 \h </w:instrText>
+          <w:instrText xml:space="preserve"> PAGEREF _Toc242317530 \h </w:instrText>
         </w:r>
         <w:r>
           <w:rPr>
@@ -5546,7 +5546,7 @@
           <w14:ligatures w14:val="standardContextual"/>
         </w:rPr>
       </w:pPr>
-      <w:hyperlink w:anchor="_Toc242312244" w:history="1">
+      <w:hyperlink w:anchor="_Toc242317531" w:history="1">
         <w:r>
           <w:rPr>
             <w:rStyle w:val="Hyperlink"/>
@@ -5573,7 +5573,7 @@
             <w:noProof/>
             <w:webHidden/>
           </w:rPr>
-          <w:instrText xml:space="preserve"> PAGEREF _Toc242312244 \h </w:instrText>
+          <w:instrText xml:space="preserve"> PAGEREF _Toc242317531 \h </w:instrText>
         </w:r>
         <w:r>
           <w:rPr>
@@ -5620,7 +5620,7 @@
           <w14:ligatures w14:val="standardContextual"/>
         </w:rPr>
       </w:pPr>
-      <w:hyperlink w:anchor="_Toc242312245" w:history="1">
+      <w:hyperlink w:anchor="_Toc242317532" w:history="1">
         <w:r>
           <w:rPr>
             <w:rStyle w:val="Hyperlink"/>
@@ -5647,7 +5647,7 @@
             <w:noProof/>
             <w:webHidden/>
           </w:rPr>
-          <w:instrText xml:space="preserve"> PAGEREF _Toc242312245 \h </w:instrText>
+          <w:instrText xml:space="preserve"> PAGEREF _Toc242317532 \h </w:instrText>
         </w:r>
         <w:r>
           <w:rPr>
@@ -5694,7 +5694,7 @@
           <w14:ligatures w14:val="standardContextual"/>
         </w:rPr>
       </w:pPr>
-      <w:hyperlink w:anchor="_Toc242312246" w:history="1">
+      <w:hyperlink w:anchor="_Toc242317533" w:history="1">
         <w:r>
           <w:rPr>
             <w:rStyle w:val="Hyperlink"/>
@@ -5721,7 +5721,7 @@
             <w:noProof/>
             <w:webHidden/>
           </w:rPr>
-          <w:instrText xml:space="preserve"> PAGEREF _Toc242312246 \h </w:instrText>
+          <w:instrText xml:space="preserve"> PAGEREF _Toc242317533 \h </w:instrText>
         </w:r>
         <w:r>
           <w:rPr>
@@ -5768,7 +5768,7 @@
           <w14:ligatures w14:val="standardContextual"/>
         </w:rPr>
       </w:pPr>
-      <w:hyperlink w:anchor="_Toc242312247" w:history="1">
+      <w:hyperlink w:anchor="_Toc242317534" w:history="1">
         <w:r>
           <w:rPr>
             <w:rStyle w:val="Hyperlink"/>
@@ -5795,7 +5795,7 @@
             <w:noProof/>
             <w:webHidden/>
           </w:rPr>
-          <w:instrText xml:space="preserve"> PAGEREF _Toc242312247 \h </w:instrText>
+          <w:instrText xml:space="preserve"> PAGEREF _Toc242317534 \h </w:instrText>
         </w:r>
         <w:r>
           <w:rPr>
@@ -5842,7 +5842,7 @@
           <w14:ligatures w14:val="standardContextual"/>
         </w:rPr>
       </w:pPr>
-      <w:hyperlink w:anchor="_Toc242312248" w:history="1">
+      <w:hyperlink w:anchor="_Toc242317535" w:history="1">
         <w:r>
           <w:rPr>
             <w:rStyle w:val="Hyperlink"/>
@@ -5869,7 +5869,7 @@
             <w:noProof/>
             <w:webHidden/>
           </w:rPr>
-          <w:instrText xml:space="preserve"> PAGEREF _Toc242312248 \h </w:instrText>
+          <w:instrText xml:space="preserve"> PAGEREF _Toc242317535 \h </w:instrText>
         </w:r>
         <w:r>
           <w:rPr>
@@ -5916,7 +5916,7 @@
           <w14:ligatures w14:val="standardContextual"/>
         </w:rPr>
       </w:pPr>
-      <w:hyperlink w:anchor="_Toc242312249" w:history="1">
+      <w:hyperlink w:anchor="_Toc242317536" w:history="1">
         <w:r>
           <w:rPr>
             <w:rStyle w:val="Hyperlink"/>
@@ -5943,7 +5943,7 @@
             <w:noProof/>
             <w:webHidden/>
           </w:rPr>
-          <w:instrText xml:space="preserve"> PAGEREF _Toc242312249 \h </w:instrText>
+          <w:instrText xml:space="preserve"> PAGEREF _Toc242317536 \h </w:instrText>
         </w:r>
         <w:r>
           <w:rPr>
@@ -5990,7 +5990,7 @@
           <w14:ligatures w14:val="standardContextual"/>
         </w:rPr>
       </w:pPr>
-      <w:hyperlink w:anchor="_Toc242312250" w:history="1">
+      <w:hyperlink w:anchor="_Toc242317537" w:history="1">
         <w:r>
           <w:rPr>
             <w:rStyle w:val="Hyperlink"/>
@@ -6017,7 +6017,7 @@
             <w:noProof/>
             <w:webHidden/>
           </w:rPr>
-          <w:instrText xml:space="preserve"> PAGEREF _Toc242312250 \h </w:instrText>
+          <w:instrText xml:space="preserve"> PAGEREF _Toc242317537 \h </w:instrText>
         </w:r>
         <w:r>
           <w:rPr>
@@ -6064,7 +6064,7 @@
           <w14:ligatures w14:val="standardContextual"/>
         </w:rPr>
       </w:pPr>
-      <w:hyperlink w:anchor="_Toc242312251" w:history="1">
+      <w:hyperlink w:anchor="_Toc242317538" w:history="1">
         <w:r>
           <w:rPr>
             <w:rStyle w:val="Hyperlink"/>
@@ -6091,7 +6091,7 @@
             <w:noProof/>
             <w:webHidden/>
           </w:rPr>
-          <w:instrText xml:space="preserve"> PAGEREF _Toc242312251 \h </w:instrText>
+          <w:instrText xml:space="preserve"> PAGEREF _Toc242317538 \h </w:instrText>
         </w:r>
         <w:r>
           <w:rPr>
@@ -6138,7 +6138,7 @@
           <w14:ligatures w14:val="standardContextual"/>
         </w:rPr>
       </w:pPr>
-      <w:hyperlink w:anchor="_Toc242312252" w:history="1">
+      <w:hyperlink w:anchor="_Toc242317539" w:history="1">
         <w:r>
           <w:rPr>
             <w:rStyle w:val="Hyperlink"/>
@@ -6165,7 +6165,7 @@
             <w:noProof/>
             <w:webHidden/>
           </w:rPr>
-          <w:instrText xml:space="preserve"> PAGEREF _Toc242312252 \h </w:instrText>
+          <w:instrText xml:space="preserve"> PAGEREF _Toc242317539 \h </w:instrText>
         </w:r>
         <w:r>
           <w:rPr>
@@ -6212,7 +6212,7 @@
           <w14:ligatures w14:val="standardContextual"/>
         </w:rPr>
       </w:pPr>
-      <w:hyperlink w:anchor="_Toc242312253" w:history="1">
+      <w:hyperlink w:anchor="_Toc242317540" w:history="1">
         <w:r>
           <w:rPr>
             <w:rStyle w:val="Hyperlink"/>
@@ -6239,7 +6239,7 @@
             <w:noProof/>
             <w:webHidden/>
           </w:rPr>
-          <w:instrText xml:space="preserve"> PAGEREF _Toc242312253 \h </w:instrText>
+          <w:instrText xml:space="preserve"> PAGEREF _Toc242317540 \h </w:instrText>
         </w:r>
         <w:r>
           <w:rPr>
@@ -6286,7 +6286,7 @@
           <w14:ligatures w14:val="standardContextual"/>
         </w:rPr>
       </w:pPr>
-      <w:hyperlink w:anchor="_Toc242312254" w:history="1">
+      <w:hyperlink w:anchor="_Toc242317541" w:history="1">
         <w:r>
           <w:rPr>
             <w:rStyle w:val="Hyperlink"/>
@@ -6313,7 +6313,7 @@
             <w:noProof/>
             <w:webHidden/>
           </w:rPr>
-          <w:instrText xml:space="preserve"> PAGEREF _Toc242312254 \h </w:instrText>
+          <w:instrText xml:space="preserve"> PAGEREF _Toc242317541 \h </w:instrText>
         </w:r>
         <w:r>
           <w:rPr>
@@ -6360,7 +6360,7 @@
           <w14:ligatures w14:val="standardContextual"/>
         </w:rPr>
       </w:pPr>
-      <w:hyperlink w:anchor="_Toc242312255" w:history="1">
+      <w:hyperlink w:anchor="_Toc242317542" w:history="1">
         <w:r>
           <w:rPr>
             <w:rStyle w:val="Hyperlink"/>
@@ -6387,7 +6387,7 @@
             <w:noProof/>
             <w:webHidden/>
           </w:rPr>
-          <w:instrText xml:space="preserve"> PAGEREF _Toc242312255 \h </w:instrText>
+          <w:instrText xml:space="preserve"> PAGEREF _Toc242317542 \h </w:instrText>
         </w:r>
         <w:r>
           <w:rPr>
@@ -6434,7 +6434,7 @@
           <w14:ligatures w14:val="standardContextual"/>
         </w:rPr>
       </w:pPr>
-      <w:hyperlink w:anchor="_Toc242312256" w:history="1">
+      <w:hyperlink w:anchor="_Toc242317543" w:history="1">
         <w:r>
           <w:rPr>
             <w:rStyle w:val="Hyperlink"/>
@@ -6461,7 +6461,7 @@
             <w:noProof/>
             <w:webHidden/>
           </w:rPr>
-          <w:instrText xml:space="preserve"> PAGEREF _Toc242312256 \h </w:instrText>
+          <w:instrText xml:space="preserve"> PAGEREF _Toc242317543 \h </w:instrText>
         </w:r>
         <w:r>
           <w:rPr>
@@ -6508,7 +6508,7 @@
           <w14:ligatures w14:val="standardContextual"/>
         </w:rPr>
       </w:pPr>
-      <w:hyperlink w:anchor="_Toc242312257" w:history="1">
+      <w:hyperlink w:anchor="_Toc242317544" w:history="1">
         <w:r>
           <w:rPr>
             <w:rStyle w:val="Hyperlink"/>
@@ -6535,7 +6535,7 @@
             <w:noProof/>
             <w:webHidden/>
           </w:rPr>
-          <w:instrText xml:space="preserve"> PAGEREF _Toc242312257 \h </w:instrText>
+          <w:instrText xml:space="preserve"> PAGEREF _Toc242317544 \h </w:instrText>
         </w:r>
         <w:r>
           <w:rPr>
@@ -6582,7 +6582,7 @@
           <w14:ligatures w14:val="standardContextual"/>
         </w:rPr>
       </w:pPr>
-      <w:hyperlink w:anchor="_Toc242312258" w:history="1">
+      <w:hyperlink w:anchor="_Toc242317545" w:history="1">
         <w:r>
           <w:rPr>
             <w:rStyle w:val="Hyperlink"/>
@@ -6609,7 +6609,7 @@
             <w:noProof/>
             <w:webHidden/>
           </w:rPr>
-          <w:instrText xml:space="preserve"> PAGEREF _Toc242312258 \h </w:instrText>
+          <w:instrText xml:space="preserve"> PAGEREF _Toc242317545 \h </w:instrText>
         </w:r>
         <w:r>
           <w:rPr>
@@ -6656,7 +6656,7 @@
           <w14:ligatures w14:val="standardContextual"/>
         </w:rPr>
       </w:pPr>
-      <w:hyperlink w:anchor="_Toc242312259" w:history="1">
+      <w:hyperlink w:anchor="_Toc242317546" w:history="1">
         <w:r>
           <w:rPr>
             <w:rStyle w:val="Hyperlink"/>
@@ -6683,7 +6683,7 @@
             <w:noProof/>
             <w:webHidden/>
           </w:rPr>
-          <w:instrText xml:space="preserve"> PAGEREF _Toc242312259 \h </w:instrText>
+          <w:instrText xml:space="preserve"> PAGEREF _Toc242317546 \h </w:instrText>
         </w:r>
         <w:r>
           <w:rPr>
@@ -6730,7 +6730,7 @@
           <w14:ligatures w14:val="standardContextual"/>
         </w:rPr>
       </w:pPr>
-      <w:hyperlink w:anchor="_Toc242312260" w:history="1">
+      <w:hyperlink w:anchor="_Toc242317547" w:history="1">
         <w:r>
           <w:rPr>
             <w:rStyle w:val="Hyperlink"/>
@@ -6757,7 +6757,7 @@
             <w:noProof/>
             <w:webHidden/>
           </w:rPr>
-          <w:instrText xml:space="preserve"> PAGEREF _Toc242312260 \h </w:instrText>
+          <w:instrText xml:space="preserve"> PAGEREF _Toc242317547 \h </w:instrText>
         </w:r>
         <w:r>
           <w:rPr>
@@ -6834,7 +6834,7 @@
       <w:r>
         <w:fldChar w:fldCharType="separate"/>
       </w:r>
-      <w:hyperlink w:anchor="_Toc242312261" w:history="1">
+      <w:hyperlink w:anchor="_Toc242317548" w:history="1">
         <w:r>
           <w:rPr>
             <w:rStyle w:val="Hyperlink"/>
@@ -6861,7 +6861,7 @@
             <w:noProof/>
             <w:webHidden/>
           </w:rPr>
-          <w:instrText xml:space="preserve"> PAGEREF _Toc242312261 \h </w:instrText>
+          <w:instrText xml:space="preserve"> PAGEREF _Toc242317548 \h </w:instrText>
         </w:r>
         <w:r>
           <w:rPr>
@@ -6908,7 +6908,7 @@
           <w14:ligatures w14:val="standardContextual"/>
         </w:rPr>
       </w:pPr>
-      <w:hyperlink w:anchor="_Toc242312262" w:history="1">
+      <w:hyperlink w:anchor="_Toc242317549" w:history="1">
         <w:r>
           <w:rPr>
             <w:rStyle w:val="Hyperlink"/>
@@ -6935,7 +6935,7 @@
             <w:noProof/>
             <w:webHidden/>
           </w:rPr>
-          <w:instrText xml:space="preserve"> PAGEREF _Toc242312262 \h </w:instrText>
+          <w:instrText xml:space="preserve"> PAGEREF _Toc242317549 \h </w:instrText>
         </w:r>
         <w:r>
           <w:rPr>
@@ -6982,7 +6982,7 @@
           <w14:ligatures w14:val="standardContextual"/>
         </w:rPr>
       </w:pPr>
-      <w:hyperlink w:anchor="_Toc242312263" w:history="1">
+      <w:hyperlink w:anchor="_Toc242317550" w:history="1">
         <w:r>
           <w:rPr>
             <w:rStyle w:val="Hyperlink"/>
@@ -7009,7 +7009,7 @@
             <w:noProof/>
             <w:webHidden/>
           </w:rPr>
-          <w:instrText xml:space="preserve"> PAGEREF _Toc242312263 \h </w:instrText>
+          <w:instrText xml:space="preserve"> PAGEREF _Toc242317550 \h </w:instrText>
         </w:r>
         <w:r>
           <w:rPr>
@@ -7056,7 +7056,7 @@
           <w14:ligatures w14:val="standardContextual"/>
         </w:rPr>
       </w:pPr>
-      <w:hyperlink w:anchor="_Toc242312264" w:history="1">
+      <w:hyperlink w:anchor="_Toc242317551" w:history="1">
         <w:r>
           <w:rPr>
             <w:rStyle w:val="Hyperlink"/>
@@ -7083,7 +7083,7 @@
             <w:noProof/>
             <w:webHidden/>
           </w:rPr>
-          <w:instrText xml:space="preserve"> PAGEREF _Toc242312264 \h </w:instrText>
+          <w:instrText xml:space="preserve"> PAGEREF _Toc242317551 \h </w:instrText>
         </w:r>
         <w:r>
           <w:rPr>
@@ -7130,7 +7130,7 @@
           <w14:ligatures w14:val="standardContextual"/>
         </w:rPr>
       </w:pPr>
-      <w:hyperlink w:anchor="_Toc242312265" w:history="1">
+      <w:hyperlink w:anchor="_Toc242317552" w:history="1">
         <w:r>
           <w:rPr>
             <w:rStyle w:val="Hyperlink"/>
@@ -7157,7 +7157,7 @@
             <w:noProof/>
             <w:webHidden/>
           </w:rPr>
-          <w:instrText xml:space="preserve"> PAGEREF _Toc242312265 \h </w:instrText>
+          <w:instrText xml:space="preserve"> PAGEREF _Toc242317552 \h </w:instrText>
         </w:r>
         <w:r>
           <w:rPr>
@@ -7204,7 +7204,7 @@
           <w14:ligatures w14:val="standardContextual"/>
         </w:rPr>
       </w:pPr>
-      <w:hyperlink w:anchor="_Toc242312266" w:history="1">
+      <w:hyperlink w:anchor="_Toc242317553" w:history="1">
         <w:r>
           <w:rPr>
             <w:rStyle w:val="Hyperlink"/>
@@ -7231,7 +7231,7 @@
             <w:noProof/>
             <w:webHidden/>
           </w:rPr>
-          <w:instrText xml:space="preserve"> PAGEREF _Toc242312266 \h </w:instrText>
+          <w:instrText xml:space="preserve"> PAGEREF _Toc242317553 \h </w:instrText>
         </w:r>
         <w:r>
           <w:rPr>
@@ -7278,7 +7278,7 @@
           <w14:ligatures w14:val="standardContextual"/>
         </w:rPr>
       </w:pPr>
-      <w:hyperlink w:anchor="_Toc242312267" w:history="1">
+      <w:hyperlink w:anchor="_Toc242317554" w:history="1">
         <w:r>
           <w:rPr>
             <w:rStyle w:val="Hyperlink"/>
@@ -7305,7 +7305,7 @@
             <w:noProof/>
             <w:webHidden/>
           </w:rPr>
-          <w:instrText xml:space="preserve"> PAGEREF _Toc242312267 \h </w:instrText>
+          <w:instrText xml:space="preserve"> PAGEREF _Toc242317554 \h </w:instrText>
         </w:r>
         <w:r>
           <w:rPr>
@@ -7352,7 +7352,7 @@
           <w14:ligatures w14:val="standardContextual"/>
         </w:rPr>
       </w:pPr>
-      <w:hyperlink w:anchor="_Toc242312268" w:history="1">
+      <w:hyperlink w:anchor="_Toc242317555" w:history="1">
         <w:r>
           <w:rPr>
             <w:rStyle w:val="Hyperlink"/>
@@ -7379,7 +7379,7 @@
             <w:noProof/>
             <w:webHidden/>
           </w:rPr>
-          <w:instrText xml:space="preserve"> PAGEREF _Toc242312268 \h </w:instrText>
+          <w:instrText xml:space="preserve"> PAGEREF _Toc242317555 \h </w:instrText>
         </w:r>
         <w:r>
           <w:rPr>
@@ -7426,7 +7426,7 @@
           <w14:ligatures w14:val="standardContextual"/>
         </w:rPr>
       </w:pPr>
-      <w:hyperlink w:anchor="_Toc242312269" w:history="1">
+      <w:hyperlink w:anchor="_Toc242317556" w:history="1">
         <w:r>
           <w:rPr>
             <w:rStyle w:val="Hyperlink"/>
@@ -7453,7 +7453,7 @@
             <w:noProof/>
             <w:webHidden/>
           </w:rPr>
-          <w:instrText xml:space="preserve"> PAGEREF _Toc242312269 \h </w:instrText>
+          <w:instrText xml:space="preserve"> PAGEREF _Toc242317556 \h </w:instrText>
         </w:r>
         <w:r>
           <w:rPr>
@@ -7500,7 +7500,7 @@
           <w14:ligatures w14:val="standardContextual"/>
         </w:rPr>
       </w:pPr>
-      <w:hyperlink w:anchor="_Toc242312270" w:history="1">
+      <w:hyperlink w:anchor="_Toc242317557" w:history="1">
         <w:r>
           <w:rPr>
             <w:rStyle w:val="Hyperlink"/>
@@ -7527,7 +7527,7 @@
             <w:noProof/>
             <w:webHidden/>
           </w:rPr>
-          <w:instrText xml:space="preserve"> PAGEREF _Toc242312270 \h </w:instrText>
+          <w:instrText xml:space="preserve"> PAGEREF _Toc242317557 \h </w:instrText>
         </w:r>
         <w:r>
           <w:rPr>
@@ -7574,7 +7574,7 @@
           <w14:ligatures w14:val="standardContextual"/>
         </w:rPr>
       </w:pPr>
-      <w:hyperlink w:anchor="_Toc242312271" w:history="1">
+      <w:hyperlink w:anchor="_Toc242317558" w:history="1">
         <w:r>
           <w:rPr>
             <w:rStyle w:val="Hyperlink"/>
@@ -7601,7 +7601,7 @@
             <w:noProof/>
             <w:webHidden/>
           </w:rPr>
-          <w:instrText xml:space="preserve"> PAGEREF _Toc242312271 \h </w:instrText>
+          <w:instrText xml:space="preserve"> PAGEREF _Toc242317558 \h </w:instrText>
         </w:r>
         <w:r>
           <w:rPr>
@@ -7648,7 +7648,7 @@
           <w14:ligatures w14:val="standardContextual"/>
         </w:rPr>
       </w:pPr>
-      <w:hyperlink w:anchor="_Toc242312272" w:history="1">
+      <w:hyperlink w:anchor="_Toc242317559" w:history="1">
         <w:r>
           <w:rPr>
             <w:rStyle w:val="Hyperlink"/>
@@ -7675,7 +7675,7 @@
             <w:noProof/>
             <w:webHidden/>
           </w:rPr>
-          <w:instrText xml:space="preserve"> PAGEREF _Toc242312272 \h </w:instrText>
+          <w:instrText xml:space="preserve"> PAGEREF _Toc242317559 \h </w:instrText>
         </w:r>
         <w:r>
           <w:rPr>
@@ -7722,7 +7722,7 @@
           <w14:ligatures w14:val="standardContextual"/>
         </w:rPr>
       </w:pPr>
-      <w:hyperlink w:anchor="_Toc242312273" w:history="1">
+      <w:hyperlink w:anchor="_Toc242317560" w:history="1">
         <w:r>
           <w:rPr>
             <w:rStyle w:val="Hyperlink"/>
@@ -7749,7 +7749,7 @@
             <w:noProof/>
             <w:webHidden/>
           </w:rPr>
-          <w:instrText xml:space="preserve"> PAGEREF _Toc242312273 \h </w:instrText>
+          <w:instrText xml:space="preserve"> PAGEREF _Toc242317560 \h </w:instrText>
         </w:r>
         <w:r>
           <w:rPr>
@@ -7796,7 +7796,7 @@
           <w14:ligatures w14:val="standardContextual"/>
         </w:rPr>
       </w:pPr>
-      <w:hyperlink w:anchor="_Toc242312274" w:history="1">
+      <w:hyperlink w:anchor="_Toc242317561" w:history="1">
         <w:r>
           <w:rPr>
             <w:rStyle w:val="Hyperlink"/>
@@ -7823,7 +7823,7 @@
             <w:noProof/>
             <w:webHidden/>
           </w:rPr>
-          <w:instrText xml:space="preserve"> PAGEREF _Toc242312274 \h </w:instrText>
+          <w:instrText xml:space="preserve"> PAGEREF _Toc242317561 \h </w:instrText>
         </w:r>
         <w:r>
           <w:rPr>
@@ -7870,7 +7870,7 @@
           <w14:ligatures w14:val="standardContextual"/>
         </w:rPr>
       </w:pPr>
-      <w:hyperlink w:anchor="_Toc242312275" w:history="1">
+      <w:hyperlink w:anchor="_Toc242317562" w:history="1">
         <w:r>
           <w:rPr>
             <w:rStyle w:val="Hyperlink"/>
@@ -7897,7 +7897,7 @@
             <w:noProof/>
             <w:webHidden/>
           </w:rPr>
-          <w:instrText xml:space="preserve"> PAGEREF _Toc242312275 \h </w:instrText>
+          <w:instrText xml:space="preserve"> PAGEREF _Toc242317562 \h </w:instrText>
         </w:r>
         <w:r>
           <w:rPr>
@@ -7944,7 +7944,7 @@
           <w14:ligatures w14:val="standardContextual"/>
         </w:rPr>
       </w:pPr>
-      <w:hyperlink w:anchor="_Toc242312276" w:history="1">
+      <w:hyperlink w:anchor="_Toc242317563" w:history="1">
         <w:r>
           <w:rPr>
             <w:rStyle w:val="Hyperlink"/>
@@ -7971,7 +7971,7 @@
             <w:noProof/>
             <w:webHidden/>
           </w:rPr>
-          <w:instrText xml:space="preserve"> PAGEREF _Toc242312276 \h </w:instrText>
+          <w:instrText xml:space="preserve"> PAGEREF _Toc242317563 \h </w:instrText>
         </w:r>
         <w:r>
           <w:rPr>
@@ -8018,7 +8018,7 @@
           <w14:ligatures w14:val="standardContextual"/>
         </w:rPr>
       </w:pPr>
-      <w:hyperlink w:anchor="_Toc242312277" w:history="1">
+      <w:hyperlink w:anchor="_Toc242317564" w:history="1">
         <w:r>
           <w:rPr>
             <w:rStyle w:val="Hyperlink"/>
@@ -8045,7 +8045,7 @@
             <w:noProof/>
             <w:webHidden/>
           </w:rPr>
-          <w:instrText xml:space="preserve"> PAGEREF _Toc242312277 \h </w:instrText>
+          <w:instrText xml:space="preserve"> PAGEREF _Toc242317564 \h </w:instrText>
         </w:r>
         <w:r>
           <w:rPr>
@@ -8092,7 +8092,7 @@
           <w14:ligatures w14:val="standardContextual"/>
         </w:rPr>
       </w:pPr>
-      <w:hyperlink w:anchor="_Toc242312278" w:history="1">
+      <w:hyperlink w:anchor="_Toc242317565" w:history="1">
         <w:r>
           <w:rPr>
             <w:rStyle w:val="Hyperlink"/>
@@ -8119,7 +8119,7 @@
             <w:noProof/>
             <w:webHidden/>
           </w:rPr>
-          <w:instrText xml:space="preserve"> PAGEREF _Toc242312278 \h </w:instrText>
+          <w:instrText xml:space="preserve"> PAGEREF _Toc242317565 \h </w:instrText>
         </w:r>
         <w:r>
           <w:rPr>
@@ -8166,7 +8166,7 @@
           <w14:ligatures w14:val="standardContextual"/>
         </w:rPr>
       </w:pPr>
-      <w:hyperlink w:anchor="_Toc242312279" w:history="1">
+      <w:hyperlink w:anchor="_Toc242317566" w:history="1">
         <w:r>
           <w:rPr>
             <w:rStyle w:val="Hyperlink"/>
@@ -8193,7 +8193,7 @@
             <w:noProof/>
             <w:webHidden/>
           </w:rPr>
-          <w:instrText xml:space="preserve"> PAGEREF _Toc242312279 \h </w:instrText>
+          <w:instrText xml:space="preserve"> PAGEREF _Toc242317566 \h </w:instrText>
         </w:r>
         <w:r>
           <w:rPr>
@@ -8240,7 +8240,7 @@
           <w14:ligatures w14:val="standardContextual"/>
         </w:rPr>
       </w:pPr>
-      <w:hyperlink w:anchor="_Toc242312280" w:history="1">
+      <w:hyperlink w:anchor="_Toc242317567" w:history="1">
         <w:r>
           <w:rPr>
             <w:rStyle w:val="Hyperlink"/>
@@ -8267,7 +8267,7 @@
             <w:noProof/>
             <w:webHidden/>
           </w:rPr>
-          <w:instrText xml:space="preserve"> PAGEREF _Toc242312280 \h </w:instrText>
+          <w:instrText xml:space="preserve"> PAGEREF _Toc242317567 \h </w:instrText>
         </w:r>
         <w:r>
           <w:rPr>
@@ -8314,7 +8314,7 @@
           <w14:ligatures w14:val="standardContextual"/>
         </w:rPr>
       </w:pPr>
-      <w:hyperlink w:anchor="_Toc242312281" w:history="1">
+      <w:hyperlink w:anchor="_Toc242317568" w:history="1">
         <w:r>
           <w:rPr>
             <w:rStyle w:val="Hyperlink"/>
@@ -8341,7 +8341,7 @@
             <w:noProof/>
             <w:webHidden/>
           </w:rPr>
-          <w:instrText xml:space="preserve"> PAGEREF _Toc242312281 \h </w:instrText>
+          <w:instrText xml:space="preserve"> PAGEREF _Toc242317568 \h </w:instrText>
         </w:r>
         <w:r>
           <w:rPr>
@@ -8388,7 +8388,7 @@
           <w14:ligatures w14:val="standardContextual"/>
         </w:rPr>
       </w:pPr>
-      <w:hyperlink w:anchor="_Toc242312282" w:history="1">
+      <w:hyperlink w:anchor="_Toc242317569" w:history="1">
         <w:r>
           <w:rPr>
             <w:rStyle w:val="Hyperlink"/>
@@ -8415,7 +8415,7 @@
             <w:noProof/>
             <w:webHidden/>
           </w:rPr>
-          <w:instrText xml:space="preserve"> PAGEREF _Toc242312282 \h </w:instrText>
+          <w:instrText xml:space="preserve"> PAGEREF _Toc242317569 \h </w:instrText>
         </w:r>
         <w:r>
           <w:rPr>
@@ -8462,7 +8462,7 @@
           <w14:ligatures w14:val="standardContextual"/>
         </w:rPr>
       </w:pPr>
-      <w:hyperlink w:anchor="_Toc242312283" w:history="1">
+      <w:hyperlink w:anchor="_Toc242317570" w:history="1">
         <w:r>
           <w:rPr>
             <w:rStyle w:val="Hyperlink"/>
@@ -8489,7 +8489,7 @@
             <w:noProof/>
             <w:webHidden/>
           </w:rPr>
-          <w:instrText xml:space="preserve"> PAGEREF _Toc242312283 \h </w:instrText>
+          <w:instrText xml:space="preserve"> PAGEREF _Toc242317570 \h </w:instrText>
         </w:r>
         <w:r>
           <w:rPr>
@@ -8536,7 +8536,7 @@
           <w14:ligatures w14:val="standardContextual"/>
         </w:rPr>
       </w:pPr>
-      <w:hyperlink w:anchor="_Toc242312284" w:history="1">
+      <w:hyperlink w:anchor="_Toc242317571" w:history="1">
         <w:r>
           <w:rPr>
             <w:rStyle w:val="Hyperlink"/>
@@ -8563,7 +8563,7 @@
             <w:noProof/>
             <w:webHidden/>
           </w:rPr>
-          <w:instrText xml:space="preserve"> PAGEREF _Toc242312284 \h </w:instrText>
+          <w:instrText xml:space="preserve"> PAGEREF _Toc242317571 \h </w:instrText>
         </w:r>
         <w:r>
           <w:rPr>
@@ -8610,7 +8610,7 @@
           <w14:ligatures w14:val="standardContextual"/>
         </w:rPr>
       </w:pPr>
-      <w:hyperlink w:anchor="_Toc242312285" w:history="1">
+      <w:hyperlink w:anchor="_Toc242317572" w:history="1">
         <w:r>
           <w:rPr>
             <w:rStyle w:val="Hyperlink"/>
@@ -8637,7 +8637,7 @@
             <w:noProof/>
             <w:webHidden/>
           </w:rPr>
-          <w:instrText xml:space="preserve"> PAGEREF _Toc242312285 \h </w:instrText>
+          <w:instrText xml:space="preserve"> PAGEREF _Toc242317572 \h </w:instrText>
         </w:r>
         <w:r>
           <w:rPr>
@@ -8684,7 +8684,7 @@
           <w14:ligatures w14:val="standardContextual"/>
         </w:rPr>
       </w:pPr>
-      <w:hyperlink w:anchor="_Toc242312286" w:history="1">
+      <w:hyperlink w:anchor="_Toc242317573" w:history="1">
         <w:r>
           <w:rPr>
             <w:rStyle w:val="Hyperlink"/>
@@ -8711,7 +8711,7 @@
             <w:noProof/>
             <w:webHidden/>
           </w:rPr>
-          <w:instrText xml:space="preserve"> PAGEREF _Toc242312286 \h </w:instrText>
+          <w:instrText xml:space="preserve"> PAGEREF _Toc242317573 \h </w:instrText>
         </w:r>
         <w:r>
           <w:rPr>
@@ -8788,7 +8788,7 @@
       <w:r>
         <w:fldChar w:fldCharType="separate"/>
       </w:r>
-      <w:hyperlink w:anchor="_Toc242312287" w:history="1">
+      <w:hyperlink w:anchor="_Toc242317574" w:history="1">
         <w:r>
           <w:rPr>
             <w:rStyle w:val="Hyperlink"/>
@@ -8815,7 +8815,7 @@
             <w:noProof/>
             <w:webHidden/>
           </w:rPr>
-          <w:instrText xml:space="preserve"> PAGEREF _Toc242312287 \h </w:instrText>
+          <w:instrText xml:space="preserve"> PAGEREF _Toc242317574 \h </w:instrText>
         </w:r>
         <w:r>
           <w:rPr>
@@ -8835,7 +8835,7 @@
             <w:noProof/>
             <w:webHidden/>
           </w:rPr>
-          <w:t>8</w:t>
+          <w:t>9</w:t>
         </w:r>
         <w:r>
           <w:rPr>
@@ -8862,7 +8862,7 @@
           <w14:ligatures w14:val="standardContextual"/>
         </w:rPr>
       </w:pPr>
-      <w:hyperlink w:anchor="_Toc242312288" w:history="1">
+      <w:hyperlink w:anchor="_Toc242317575" w:history="1">
         <w:r>
           <w:rPr>
             <w:rStyle w:val="Hyperlink"/>
@@ -8889,7 +8889,7 @@
             <w:noProof/>
             <w:webHidden/>
           </w:rPr>
-          <w:instrText xml:space="preserve"> PAGEREF _Toc242312288 \h </w:instrText>
+          <w:instrText xml:space="preserve"> PAGEREF _Toc242317575 \h </w:instrText>
         </w:r>
         <w:r>
           <w:rPr>
@@ -8909,7 +8909,7 @@
             <w:noProof/>
             <w:webHidden/>
           </w:rPr>
-          <w:t>9</w:t>
+          <w:t>10</w:t>
         </w:r>
         <w:r>
           <w:rPr>
@@ -8936,7 +8936,7 @@
           <w14:ligatures w14:val="standardContextual"/>
         </w:rPr>
       </w:pPr>
-      <w:hyperlink w:anchor="_Toc242312289" w:history="1">
+      <w:hyperlink w:anchor="_Toc242317576" w:history="1">
         <w:r>
           <w:rPr>
             <w:rStyle w:val="Hyperlink"/>
@@ -8963,7 +8963,7 @@
             <w:noProof/>
             <w:webHidden/>
           </w:rPr>
-          <w:instrText xml:space="preserve"> PAGEREF _Toc242312289 \h </w:instrText>
+          <w:instrText xml:space="preserve"> PAGEREF _Toc242317576 \h </w:instrText>
         </w:r>
         <w:r>
           <w:rPr>
@@ -9010,7 +9010,7 @@
           <w14:ligatures w14:val="standardContextual"/>
         </w:rPr>
       </w:pPr>
-      <w:hyperlink w:anchor="_Toc242312290" w:history="1">
+      <w:hyperlink w:anchor="_Toc242317577" w:history="1">
         <w:r>
           <w:rPr>
             <w:rStyle w:val="Hyperlink"/>
@@ -9037,7 +9037,7 @@
             <w:noProof/>
             <w:webHidden/>
           </w:rPr>
-          <w:instrText xml:space="preserve"> PAGEREF _Toc242312290 \h </w:instrText>
+          <w:instrText xml:space="preserve"> PAGEREF _Toc242317577 \h </w:instrText>
         </w:r>
         <w:r>
           <w:rPr>
@@ -9084,7 +9084,7 @@
           <w14:ligatures w14:val="standardContextual"/>
         </w:rPr>
       </w:pPr>
-      <w:hyperlink w:anchor="_Toc242312291" w:history="1">
+      <w:hyperlink w:anchor="_Toc242317578" w:history="1">
         <w:r>
           <w:rPr>
             <w:rStyle w:val="Hyperlink"/>
@@ -9111,7 +9111,7 @@
             <w:noProof/>
             <w:webHidden/>
           </w:rPr>
-          <w:instrText xml:space="preserve"> PAGEREF _Toc242312291 \h </w:instrText>
+          <w:instrText xml:space="preserve"> PAGEREF _Toc242317578 \h </w:instrText>
         </w:r>
         <w:r>
           <w:rPr>
@@ -9158,7 +9158,7 @@
           <w14:ligatures w14:val="standardContextual"/>
         </w:rPr>
       </w:pPr>
-      <w:hyperlink w:anchor="_Toc242312292" w:history="1">
+      <w:hyperlink w:anchor="_Toc242317579" w:history="1">
         <w:r>
           <w:rPr>
             <w:rStyle w:val="Hyperlink"/>
@@ -9185,7 +9185,7 @@
             <w:noProof/>
             <w:webHidden/>
           </w:rPr>
-          <w:instrText xml:space="preserve"> PAGEREF _Toc242312292 \h </w:instrText>
+          <w:instrText xml:space="preserve"> PAGEREF _Toc242317579 \h </w:instrText>
         </w:r>
         <w:r>
           <w:rPr>
@@ -9232,7 +9232,7 @@
           <w14:ligatures w14:val="standardContextual"/>
         </w:rPr>
       </w:pPr>
-      <w:hyperlink w:anchor="_Toc242312293" w:history="1">
+      <w:hyperlink w:anchor="_Toc242317580" w:history="1">
         <w:r>
           <w:rPr>
             <w:rStyle w:val="Hyperlink"/>
@@ -9259,7 +9259,7 @@
             <w:noProof/>
             <w:webHidden/>
           </w:rPr>
-          <w:instrText xml:space="preserve"> PAGEREF _Toc242312293 \h </w:instrText>
+          <w:instrText xml:space="preserve"> PAGEREF _Toc242317580 \h </w:instrText>
         </w:r>
         <w:r>
           <w:rPr>
@@ -9306,7 +9306,7 @@
           <w14:ligatures w14:val="standardContextual"/>
         </w:rPr>
       </w:pPr>
-      <w:hyperlink w:anchor="_Toc242312294" w:history="1">
+      <w:hyperlink w:anchor="_Toc242317581" w:history="1">
         <w:r>
           <w:rPr>
             <w:rStyle w:val="Hyperlink"/>
@@ -9333,7 +9333,7 @@
             <w:noProof/>
             <w:webHidden/>
           </w:rPr>
-          <w:instrText xml:space="preserve"> PAGEREF _Toc242312294 \h </w:instrText>
+          <w:instrText xml:space="preserve"> PAGEREF _Toc242317581 \h </w:instrText>
         </w:r>
         <w:r>
           <w:rPr>
@@ -9380,7 +9380,7 @@
           <w14:ligatures w14:val="standardContextual"/>
         </w:rPr>
       </w:pPr>
-      <w:hyperlink w:anchor="_Toc242312295" w:history="1">
+      <w:hyperlink w:anchor="_Toc242317582" w:history="1">
         <w:r>
           <w:rPr>
             <w:rStyle w:val="Hyperlink"/>
@@ -9407,7 +9407,7 @@
             <w:noProof/>
             <w:webHidden/>
           </w:rPr>
-          <w:instrText xml:space="preserve"> PAGEREF _Toc242312295 \h </w:instrText>
+          <w:instrText xml:space="preserve"> PAGEREF _Toc242317582 \h </w:instrText>
         </w:r>
         <w:r>
           <w:rPr>
@@ -9454,7 +9454,7 @@
           <w14:ligatures w14:val="standardContextual"/>
         </w:rPr>
       </w:pPr>
-      <w:hyperlink w:anchor="_Toc242312296" w:history="1">
+      <w:hyperlink w:anchor="_Toc242317583" w:history="1">
         <w:r>
           <w:rPr>
             <w:rStyle w:val="Hyperlink"/>
@@ -9481,7 +9481,7 @@
             <w:noProof/>
             <w:webHidden/>
           </w:rPr>
-          <w:instrText xml:space="preserve"> PAGEREF _Toc242312296 \h </w:instrText>
+          <w:instrText xml:space="preserve"> PAGEREF _Toc242317583 \h </w:instrText>
         </w:r>
         <w:r>
           <w:rPr>
@@ -9528,7 +9528,7 @@
           <w14:ligatures w14:val="standardContextual"/>
         </w:rPr>
       </w:pPr>
-      <w:hyperlink w:anchor="_Toc242312297" w:history="1">
+      <w:hyperlink w:anchor="_Toc242317584" w:history="1">
         <w:r>
           <w:rPr>
             <w:rStyle w:val="Hyperlink"/>
@@ -9555,7 +9555,7 @@
             <w:noProof/>
             <w:webHidden/>
           </w:rPr>
-          <w:instrText xml:space="preserve"> PAGEREF _Toc242312297 \h </w:instrText>
+          <w:instrText xml:space="preserve"> PAGEREF _Toc242317584 \h </w:instrText>
         </w:r>
         <w:r>
           <w:rPr>
@@ -9602,7 +9602,7 @@
           <w14:ligatures w14:val="standardContextual"/>
         </w:rPr>
       </w:pPr>
-      <w:hyperlink w:anchor="_Toc242312298" w:history="1">
+      <w:hyperlink w:anchor="_Toc242317585" w:history="1">
         <w:r>
           <w:rPr>
             <w:rStyle w:val="Hyperlink"/>
@@ -9629,7 +9629,7 @@
             <w:noProof/>
             <w:webHidden/>
           </w:rPr>
-          <w:instrText xml:space="preserve"> PAGEREF _Toc242312298 \h </w:instrText>
+          <w:instrText xml:space="preserve"> PAGEREF _Toc242317585 \h </w:instrText>
         </w:r>
         <w:r>
           <w:rPr>
@@ -9676,7 +9676,7 @@
           <w14:ligatures w14:val="standardContextual"/>
         </w:rPr>
       </w:pPr>
-      <w:hyperlink w:anchor="_Toc242312299" w:history="1">
+      <w:hyperlink w:anchor="_Toc242317586" w:history="1">
         <w:r>
           <w:rPr>
             <w:rStyle w:val="Hyperlink"/>
@@ -9703,7 +9703,7 @@
             <w:noProof/>
             <w:webHidden/>
           </w:rPr>
-          <w:instrText xml:space="preserve"> PAGEREF _Toc242312299 \h </w:instrText>
+          <w:instrText xml:space="preserve"> PAGEREF _Toc242317586 \h </w:instrText>
         </w:r>
         <w:r>
           <w:rPr>
@@ -9750,7 +9750,7 @@
           <w14:ligatures w14:val="standardContextual"/>
         </w:rPr>
       </w:pPr>
-      <w:hyperlink w:anchor="_Toc242312300" w:history="1">
+      <w:hyperlink w:anchor="_Toc242317587" w:history="1">
         <w:r>
           <w:rPr>
             <w:rStyle w:val="Hyperlink"/>
@@ -9777,7 +9777,7 @@
             <w:noProof/>
             <w:webHidden/>
           </w:rPr>
-          <w:instrText xml:space="preserve"> PAGEREF _Toc242312300 \h </w:instrText>
+          <w:instrText xml:space="preserve"> PAGEREF _Toc242317587 \h </w:instrText>
         </w:r>
         <w:r>
           <w:rPr>
@@ -9824,7 +9824,7 @@
           <w14:ligatures w14:val="standardContextual"/>
         </w:rPr>
       </w:pPr>
-      <w:hyperlink w:anchor="_Toc242312301" w:history="1">
+      <w:hyperlink w:anchor="_Toc242317588" w:history="1">
         <w:r>
           <w:rPr>
             <w:rStyle w:val="Hyperlink"/>
@@ -9851,7 +9851,7 @@
             <w:noProof/>
             <w:webHidden/>
           </w:rPr>
-          <w:instrText xml:space="preserve"> PAGEREF _Toc242312301 \h </w:instrText>
+          <w:instrText xml:space="preserve"> PAGEREF _Toc242317588 \h </w:instrText>
         </w:r>
         <w:r>
           <w:rPr>
@@ -9892,7 +9892,7 @@
         <w:pStyle w:val="Heading1"/>
         <w:pageBreakBefore/>
       </w:pPr>
-      <w:bookmarkStart w:id="0" w:name="_Toc242312188"/>
+      <w:bookmarkStart w:id="0" w:name="_Toc242317475"/>
       <w:r>
         <w:lastRenderedPageBreak/>
         <w:t>CHƯƠNG 1. GIỚI THIỆU</w:t>
@@ -9903,7 +9903,7 @@
       <w:pPr>
         <w:pStyle w:val="Heading2"/>
       </w:pPr>
-      <w:bookmarkStart w:id="1" w:name="_Toc242312189"/>
+      <w:bookmarkStart w:id="1" w:name="_Toc242317476"/>
       <w:r>
         <w:t>1.1. Mục đích của tài liệu</w:t>
       </w:r>
@@ -9950,7 +9950,7 @@
       <w:pPr>
         <w:pStyle w:val="Heading2"/>
       </w:pPr>
-      <w:bookmarkStart w:id="2" w:name="_Toc242312190"/>
+      <w:bookmarkStart w:id="2" w:name="_Toc242317477"/>
       <w:r>
         <w:t>1.2. Tổng quan phần mềm</w:t>
       </w:r>
@@ -10102,11 +10102,90 @@
         <w:t>, kết nối tới SQL Server trên cùng máy hoặc trên máy khác trong mạng.</w:t>
       </w:r>
     </w:p>
+    <w:tbl>
+      <w:tblPr>
+        <w:tblW w:w="0" w:type="auto"/>
+        <w:jc w:val="center"/>
+        <w:tblLook w:val="04A0" w:firstRow="1" w:lastRow="0" w:firstColumn="1" w:lastColumn="0" w:noHBand="0" w:noVBand="1"/>
+      </w:tblPr>
+      <w:tblGrid>
+        <w:gridCol w:w="9050"/>
+      </w:tblGrid>
+      <w:tr>
+        <w:trPr>
+          <w:jc w:val="center"/>
+        </w:trPr>
+        <w:tc>
+          <w:tcPr>
+            <w:tcW w:w="9070" w:type="dxa"/>
+            <w:tcBorders>
+              <w:top w:val="single" w:sz="8" w:space="0" w:color="86EFAC"/>
+              <w:left w:val="single" w:sz="8" w:space="0" w:color="86EFAC"/>
+              <w:bottom w:val="single" w:sz="8" w:space="0" w:color="86EFAC"/>
+              <w:right w:val="single" w:sz="8" w:space="0" w:color="86EFAC"/>
+            </w:tcBorders>
+            <w:shd w:val="clear" w:color="auto" w:fill="ECFDF5"/>
+            <w:tcMar>
+              <w:top w:w="80" w:type="dxa"/>
+              <w:left w:w="140" w:type="dxa"/>
+              <w:bottom w:w="80" w:type="dxa"/>
+              <w:right w:w="140" w:type="dxa"/>
+            </w:tcMar>
+          </w:tcPr>
+          <w:p>
+            <w:pPr>
+              <w:spacing w:after="40" w:line="276" w:lineRule="auto"/>
+            </w:pPr>
+            <w:r>
+              <w:rPr>
+                <w:b/>
+              </w:rPr>
+              <w:t>Mẹo:</w:t>
+            </w:r>
+            <w:r>
+              <w:t xml:space="preserve"> Muốn xem ứng dụng hoạt động trước khi cài, mở </w:t>
+            </w:r>
+            <w:r>
+              <w:rPr>
+                <w:b/>
+              </w:rPr>
+              <w:t>video demo</w:t>
+            </w:r>
+            <w:r>
+              <w:t xml:space="preserve"> (khoảng 6 phút, có phụ đề tiếng Việt, lần lượt qua bốn vai trò) trên trang giới thiệu của dự án: </w:t>
+            </w:r>
+            <w:r>
+              <w:rPr>
+                <w:color w:val="C7254E"/>
+              </w:rPr>
+              <w:t>https://nhutruong-uit.github.io/imcp/#demo</w:t>
+            </w:r>
+            <w:r>
+              <w:t xml:space="preserve">; tệp video nằm trong kho mã nguồn tại </w:t>
+            </w:r>
+            <w:r>
+              <w:rPr>
+                <w:color w:val="C7254E"/>
+              </w:rPr>
+              <w:t>docs/demo/QLTTTA_Demo_vi.mp4</w:t>
+            </w:r>
+            <w:r>
+              <w:t>.</w:t>
+            </w:r>
+          </w:p>
+        </w:tc>
+      </w:tr>
+    </w:tbl>
+    <w:p>
+      <w:pPr>
+        <w:spacing w:after="40"/>
+      </w:pPr>
+    </w:p>
     <w:p>
       <w:pPr>
         <w:pStyle w:val="Heading2"/>
       </w:pPr>
-      <w:bookmarkStart w:id="3" w:name="_Toc242312191"/>
+      <w:bookmarkStart w:id="3" w:name="_Toc242317478"/>
       <w:r>
         <w:t>1.3. Vai trò người dùng và chức năng</w:t>
       </w:r>
@@ -10144,8 +10223,9 @@
       <w:pPr>
         <w:pStyle w:val="TableCaption"/>
       </w:pPr>
-      <w:bookmarkStart w:id="4" w:name="_Toc242312287"/>
-      <w:r>
+      <w:bookmarkStart w:id="4" w:name="_Toc242317574"/>
+      <w:r>
+        <w:lastRenderedPageBreak/>
         <w:t>Bảng 1.1. Chức năng hiển thị theo vai trò</w:t>
       </w:r>
       <w:bookmarkEnd w:id="4"/>
@@ -10909,7 +10989,6 @@
               <w:rPr>
                 <w:sz w:val="21"/>
               </w:rPr>
-              <w:lastRenderedPageBreak/>
               <w:t>Đào tạo</w:t>
             </w:r>
           </w:p>
@@ -14347,8 +14426,9 @@
       <w:pPr>
         <w:pStyle w:val="Heading2"/>
       </w:pPr>
-      <w:bookmarkStart w:id="5" w:name="_Toc242312192"/>
-      <w:r>
+      <w:bookmarkStart w:id="5" w:name="_Toc242317479"/>
+      <w:r>
+        <w:lastRenderedPageBreak/>
         <w:t>1.4. Yêu cầu hệ thống</w:t>
       </w:r>
       <w:bookmarkEnd w:id="5"/>
@@ -14357,7 +14437,7 @@
       <w:pPr>
         <w:pStyle w:val="TableCaption"/>
       </w:pPr>
-      <w:bookmarkStart w:id="6" w:name="_Toc242312288"/>
+      <w:bookmarkStart w:id="6" w:name="_Toc242317575"/>
       <w:r>
         <w:t>Bảng 1.2. Yêu cầu phần cứng và phần mềm</w:t>
       </w:r>
@@ -14599,7 +14679,6 @@
                 <w:b/>
                 <w:sz w:val="21"/>
               </w:rPr>
-              <w:lastRenderedPageBreak/>
               <w:t>SQL Server</w:t>
             </w:r>
           </w:p>
@@ -14949,7 +15028,7 @@
       <w:pPr>
         <w:pStyle w:val="Heading2"/>
       </w:pPr>
-      <w:bookmarkStart w:id="7" w:name="_Toc242312193"/>
+      <w:bookmarkStart w:id="7" w:name="_Toc242317480"/>
       <w:r>
         <w:t>1.5. Các bước cài đặt tổng quát</w:t>
       </w:r>
@@ -15101,7 +15180,7 @@
       <w:pPr>
         <w:pStyle w:val="TableCaption"/>
       </w:pPr>
-      <w:bookmarkStart w:id="8" w:name="_Toc242312289"/>
+      <w:bookmarkStart w:id="8" w:name="_Toc242317576"/>
       <w:r>
         <w:t>Bảng 1.3. Chọn phương án SQL Server theo máy</w:t>
       </w:r>
@@ -15705,7 +15784,7 @@
       <w:pPr>
         <w:pStyle w:val="Heading2"/>
       </w:pPr>
-      <w:bookmarkStart w:id="9" w:name="_Toc242312194"/>
+      <w:bookmarkStart w:id="9" w:name="_Toc242317481"/>
       <w:r>
         <w:t>1.6. Quy ước trình bày</w:t>
       </w:r>
@@ -15754,6 +15833,7 @@
         <w:jc w:val="both"/>
       </w:pPr>
       <w:r>
+        <w:lastRenderedPageBreak/>
         <w:t xml:space="preserve">Chữ </w:t>
       </w:r>
       <w:r>
@@ -15874,7 +15954,6 @@
               <w:rPr>
                 <w:b/>
               </w:rPr>
-              <w:lastRenderedPageBreak/>
               <w:t>Mẹo:</w:t>
             </w:r>
             <w:r>
@@ -15946,7 +16025,7 @@
         <w:pStyle w:val="Heading1"/>
         <w:pageBreakBefore/>
       </w:pPr>
-      <w:bookmarkStart w:id="10" w:name="_Toc242312195"/>
+      <w:bookmarkStart w:id="10" w:name="_Toc242317482"/>
       <w:r>
         <w:lastRenderedPageBreak/>
         <w:t>CHƯƠNG 2. CÀI ĐẶT SQL SERVER VÀ KHỞI TẠO CƠ SỞ DỮ LIỆU</w:t>
@@ -16003,7 +16082,7 @@
       <w:pPr>
         <w:pStyle w:val="Heading2"/>
       </w:pPr>
-      <w:bookmarkStart w:id="11" w:name="_Toc242312196"/>
+      <w:bookmarkStart w:id="11" w:name="_Toc242317483"/>
       <w:r>
         <w:t>2.1. Tải mã nguồn</w:t>
       </w:r>
@@ -16124,7 +16203,7 @@
       <w:pPr>
         <w:pStyle w:val="Heading2"/>
       </w:pPr>
-      <w:bookmarkStart w:id="12" w:name="_Toc242312197"/>
+      <w:bookmarkStart w:id="12" w:name="_Toc242317484"/>
       <w:r>
         <w:t>2.2. Phương án A - SQL Server trong Docker</w:t>
       </w:r>
@@ -16134,7 +16213,7 @@
       <w:pPr>
         <w:pStyle w:val="Heading3"/>
       </w:pPr>
-      <w:bookmarkStart w:id="13" w:name="_Toc242312198"/>
+      <w:bookmarkStart w:id="13" w:name="_Toc242317485"/>
       <w:r>
         <w:t>2.2.1. Cài Docker Desktop</w:t>
       </w:r>
@@ -16445,7 +16524,7 @@
       <w:pPr>
         <w:pStyle w:val="Heading3"/>
       </w:pPr>
-      <w:bookmarkStart w:id="14" w:name="_Toc242312199"/>
+      <w:bookmarkStart w:id="14" w:name="_Toc242317486"/>
       <w:r>
         <w:t>2.2.2. Khởi động SQL Server</w:t>
       </w:r>
@@ -16853,7 +16932,7 @@
       <w:pPr>
         <w:pStyle w:val="Heading3"/>
       </w:pPr>
-      <w:bookmarkStart w:id="15" w:name="_Toc242312200"/>
+      <w:bookmarkStart w:id="15" w:name="_Toc242317487"/>
       <w:r>
         <w:t>2.2.3. Khởi tạo CSDL</w:t>
       </w:r>
@@ -17270,7 +17349,7 @@
       <w:pPr>
         <w:pStyle w:val="Heading3"/>
       </w:pPr>
-      <w:bookmarkStart w:id="16" w:name="_Toc242312201"/>
+      <w:bookmarkStart w:id="16" w:name="_Toc242317488"/>
       <w:r>
         <w:t>2.2.4. Bật, tắt SQL Server hằng ngày</w:t>
       </w:r>
@@ -17280,7 +17359,7 @@
       <w:pPr>
         <w:pStyle w:val="TableCaption"/>
       </w:pPr>
-      <w:bookmarkStart w:id="17" w:name="_Toc242312290"/>
+      <w:bookmarkStart w:id="17" w:name="_Toc242317577"/>
       <w:r>
         <w:t>Bảng 2.1. Các lệnh Docker thường dùng</w:t>
       </w:r>
@@ -17681,7 +17760,7 @@
       <w:pPr>
         <w:pStyle w:val="Heading2"/>
       </w:pPr>
-      <w:bookmarkStart w:id="18" w:name="_Toc242312202"/>
+      <w:bookmarkStart w:id="18" w:name="_Toc242317489"/>
       <w:r>
         <w:t>2.3. Phương án B - SQL Server cài trực tiếp trên Windows</w:t>
       </w:r>
@@ -17691,7 +17770,7 @@
       <w:pPr>
         <w:pStyle w:val="Heading3"/>
       </w:pPr>
-      <w:bookmarkStart w:id="19" w:name="_Toc242312203"/>
+      <w:bookmarkStart w:id="19" w:name="_Toc242317490"/>
       <w:r>
         <w:t>2.3.1. Cài SQL Server</w:t>
       </w:r>
@@ -18473,7 +18552,7 @@
       <w:pPr>
         <w:pStyle w:val="Heading3"/>
       </w:pPr>
-      <w:bookmarkStart w:id="20" w:name="_Toc242312204"/>
+      <w:bookmarkStart w:id="20" w:name="_Toc242317491"/>
       <w:r>
         <w:t>2.3.2. Cài công cụ quản trị và driver</w:t>
       </w:r>
@@ -18663,7 +18742,7 @@
       <w:pPr>
         <w:pStyle w:val="Heading3"/>
       </w:pPr>
-      <w:bookmarkStart w:id="21" w:name="_Toc242312205"/>
+      <w:bookmarkStart w:id="21" w:name="_Toc242317492"/>
       <w:r>
         <w:t>2.3.3. Bật kết nối TCP/IP</w:t>
       </w:r>
@@ -19041,7 +19120,7 @@
       <w:pPr>
         <w:pStyle w:val="Heading3"/>
       </w:pPr>
-      <w:bookmarkStart w:id="22" w:name="_Toc242312206"/>
+      <w:bookmarkStart w:id="22" w:name="_Toc242317493"/>
       <w:r>
         <w:t>2.3.4. Khởi tạo CSDL</w:t>
       </w:r>
@@ -19579,7 +19658,7 @@
       <w:pPr>
         <w:pStyle w:val="Heading3"/>
       </w:pPr>
-      <w:bookmarkStart w:id="23" w:name="_Toc242312207"/>
+      <w:bookmarkStart w:id="23" w:name="_Toc242317494"/>
       <w:r>
         <w:t>2.3.5. Cho máy khác kết nối tới (không bắt buộc)</w:t>
       </w:r>
@@ -19659,7 +19738,7 @@
       <w:pPr>
         <w:pStyle w:val="Heading2"/>
       </w:pPr>
-      <w:bookmarkStart w:id="24" w:name="_Toc242312208"/>
+      <w:bookmarkStart w:id="24" w:name="_Toc242317495"/>
       <w:r>
         <w:t>2.4. Nạp lại dữ liệu mẫu trước buổi demo</w:t>
       </w:r>
@@ -19759,7 +19838,7 @@
         <w:pStyle w:val="Heading1"/>
         <w:pageBreakBefore/>
       </w:pPr>
-      <w:bookmarkStart w:id="25" w:name="_Toc242312209"/>
+      <w:bookmarkStart w:id="25" w:name="_Toc242317496"/>
       <w:r>
         <w:lastRenderedPageBreak/>
         <w:t>CHƯƠNG 3. CÀI ĐẶT ỨNG DỤNG</w:t>
@@ -19770,7 +19849,7 @@
       <w:pPr>
         <w:pStyle w:val="Heading2"/>
       </w:pPr>
-      <w:bookmarkStart w:id="26" w:name="_Toc242312210"/>
+      <w:bookmarkStart w:id="26" w:name="_Toc242317497"/>
       <w:r>
         <w:t>3.1. Tải bộ cài</w:t>
       </w:r>
@@ -19801,14 +19880,14 @@
         <w:t>https://github.com/nhutruong-uit/imcp/releases</w:t>
       </w:r>
       <w:r>
-        <w:t>). Với phiên bản 1.1.0, tên các file là:</w:t>
+        <w:t>). Với phiên bản 1.2.0, tên các file là:</w:t>
       </w:r>
     </w:p>
     <w:p>
       <w:pPr>
         <w:pStyle w:val="TableCaption"/>
       </w:pPr>
-      <w:bookmarkStart w:id="27" w:name="_Toc242312291"/>
+      <w:bookmarkStart w:id="27" w:name="_Toc242317578"/>
       <w:r>
         <w:t>Bảng 3.1. Các file cài đặt</w:t>
       </w:r>
@@ -19986,7 +20065,7 @@
                 <w:color w:val="C7254E"/>
                 <w:sz w:val="21"/>
               </w:rPr>
-              <w:t>QLTTTA-1.1.0-macos-arm64.​dmg</w:t>
+              <w:t>QLTTTA-1.2.0-macos-arm64.​dmg</w:t>
             </w:r>
           </w:p>
         </w:tc>
@@ -20079,7 +20158,7 @@
                 <w:color w:val="C7254E"/>
                 <w:sz w:val="21"/>
               </w:rPr>
-              <w:t>QLTTTA-1.1.0-windows-x64-setup.​exe</w:t>
+              <w:t>QLTTTA-1.2.0-windows-x64-setup.​exe</w:t>
             </w:r>
           </w:p>
         </w:tc>
@@ -20171,7 +20250,7 @@
                 <w:color w:val="C7254E"/>
                 <w:sz w:val="21"/>
               </w:rPr>
-              <w:t>QLTTTA-1.1.0-windows-x64-portable.​zip</w:t>
+              <w:t>QLTTTA-1.2.0-windows-x64-portable.​zip</w:t>
             </w:r>
           </w:p>
         </w:tc>
@@ -20251,7 +20330,7 @@
       <w:pPr>
         <w:pStyle w:val="Heading2"/>
       </w:pPr>
-      <w:bookmarkStart w:id="28" w:name="_Toc242312211"/>
+      <w:bookmarkStart w:id="28" w:name="_Toc242317498"/>
       <w:r>
         <w:t>3.2. Cài đặt trên macOS</w:t>
       </w:r>
@@ -20546,7 +20625,7 @@
         <w:rPr>
           <w:color w:val="C7254E"/>
         </w:rPr>
-        <w:t>v1.1.0-build.&lt;số&gt;</w:t>
+        <w:t>v1.2.0-build.&lt;số&gt;</w:t>
       </w:r>
       <w:r>
         <w:t>):</w:t>
@@ -20652,7 +20731,7 @@
       <w:pPr>
         <w:pStyle w:val="Heading2"/>
       </w:pPr>
-      <w:bookmarkStart w:id="29" w:name="_Toc242312212"/>
+      <w:bookmarkStart w:id="29" w:name="_Toc242317499"/>
       <w:r>
         <w:t>3.3. Cài đặt trên Windows</w:t>
       </w:r>
@@ -20662,7 +20741,7 @@
       <w:pPr>
         <w:pStyle w:val="Heading3"/>
       </w:pPr>
-      <w:bookmarkStart w:id="30" w:name="_Toc242312213"/>
+      <w:bookmarkStart w:id="30" w:name="_Toc242317500"/>
       <w:r>
         <w:t>3.3.1. Dùng bộ cài setup.exe</w:t>
       </w:r>
@@ -20686,7 +20765,7 @@
         <w:rPr>
           <w:color w:val="C7254E"/>
         </w:rPr>
-        <w:t>QLTTTA-1.1.0-windows-x64-setup.exe</w:t>
+        <w:t>QLTTTA-1.2.0-windows-x64-setup.exe</w:t>
       </w:r>
       <w:r>
         <w:t xml:space="preserve">. Nếu Windows hiện </w:t>
@@ -21035,7 +21114,7 @@
               <w:rPr>
                 <w:color w:val="C7254E"/>
               </w:rPr>
-              <w:t>QLTTTA-1.1.0-windows-x64-setup.exe /VERYSILENT /CURRENTUSER /MERGETASKS="!desktopicon"</w:t>
+              <w:t>QLTTTA-1.2.0-windows-x64-setup.exe /VERYSILENT /CURRENTUSER /MERGETASKS="!desktopicon"</w:t>
             </w:r>
             <w:r>
               <w:t xml:space="preserve"> (cho mọi người dùng: thay </w:t>
@@ -21088,7 +21167,7 @@
         </w:rPr>
         <w:lastRenderedPageBreak/>
         <w:drawing>
-          <wp:inline distT="0" distB="0" distL="0" distR="0" wp14:anchorId="7760D30C" wp14:editId="588D65A0">
+          <wp:inline distT="0" distB="0" distL="0" distR="0" wp14:anchorId="3BD41122" wp14:editId="51A20C4F">
             <wp:extent cx="3420000" cy="3198254"/>
             <wp:effectExtent l="0" t="0" r="0" b="0"/>
             <wp:docPr id="522444761" name="Picture 522444761"/>
@@ -21128,7 +21207,7 @@
       <w:pPr>
         <w:pStyle w:val="FigureCaption"/>
       </w:pPr>
-      <w:bookmarkStart w:id="31" w:name="_Toc242312261"/>
+      <w:bookmarkStart w:id="31" w:name="_Toc242317548"/>
       <w:r>
         <w:t>Hình 3.1. Cảnh báo SmartScreen khi chạy bộ cài</w:t>
       </w:r>
@@ -21145,7 +21224,7 @@
           <w:noProof/>
         </w:rPr>
         <w:drawing>
-          <wp:inline distT="0" distB="0" distL="0" distR="0" wp14:anchorId="4380851D" wp14:editId="347F8925">
+          <wp:inline distT="0" distB="0" distL="0" distR="0" wp14:anchorId="50BF0D10" wp14:editId="4C64FAE6">
             <wp:extent cx="4500000" cy="3458417"/>
             <wp:effectExtent l="0" t="0" r="0" b="0"/>
             <wp:docPr id="522444762" name="Picture 522444762"/>
@@ -21185,7 +21264,7 @@
       <w:pPr>
         <w:pStyle w:val="FigureCaption"/>
       </w:pPr>
-      <w:bookmarkStart w:id="32" w:name="_Toc242312262"/>
+      <w:bookmarkStart w:id="32" w:name="_Toc242317549"/>
       <w:r>
         <w:t>Hình 3.2. Bước cuối của bộ cài QLTTTA trên Windows</w:t>
       </w:r>
@@ -21195,7 +21274,7 @@
       <w:pPr>
         <w:pStyle w:val="Heading3"/>
       </w:pPr>
-      <w:bookmarkStart w:id="33" w:name="_Toc242312214"/>
+      <w:bookmarkStart w:id="33" w:name="_Toc242317501"/>
       <w:r>
         <w:t>3.3.2. Dùng bản portable</w:t>
       </w:r>
@@ -21214,7 +21293,7 @@
         <w:rPr>
           <w:color w:val="C7254E"/>
         </w:rPr>
-        <w:t>QLTTTA-1.1.0-windows-x64-portable.zip</w:t>
+        <w:t>QLTTTA-1.2.0-windows-x64-portable.zip</w:t>
       </w:r>
       <w:r>
         <w:t xml:space="preserve"> vào một thư mục bất kỳ (ví dụ </w:t>
@@ -21242,7 +21321,7 @@
       <w:pPr>
         <w:pStyle w:val="Heading3"/>
       </w:pPr>
-      <w:bookmarkStart w:id="34" w:name="_Toc242312215"/>
+      <w:bookmarkStart w:id="34" w:name="_Toc242317502"/>
       <w:r>
         <w:lastRenderedPageBreak/>
         <w:t>3.3.3. Driver kết nối</w:t>
@@ -21299,7 +21378,7 @@
       <w:pPr>
         <w:pStyle w:val="Heading2"/>
       </w:pPr>
-      <w:bookmarkStart w:id="35" w:name="_Toc242312216"/>
+      <w:bookmarkStart w:id="35" w:name="_Toc242317503"/>
       <w:r>
         <w:t>3.4. Nơi lưu cấu hình và gỡ cài đặt</w:t>
       </w:r>
@@ -21319,7 +21398,7 @@
       <w:pPr>
         <w:pStyle w:val="TableCaption"/>
       </w:pPr>
-      <w:bookmarkStart w:id="36" w:name="_Toc242312292"/>
+      <w:bookmarkStart w:id="36" w:name="_Toc242317579"/>
       <w:r>
         <w:t>Bảng 3.2. Cấu hình đã lưu và cách gỡ ứng dụng</w:t>
       </w:r>
@@ -21880,7 +21959,7 @@
       <w:pPr>
         <w:pStyle w:val="Heading2"/>
       </w:pPr>
-      <w:bookmarkStart w:id="37" w:name="_Toc242312217"/>
+      <w:bookmarkStart w:id="37" w:name="_Toc242317504"/>
       <w:r>
         <w:t>3.5. Chạy từ mã nguồn (dành cho nhóm phát triển)</w:t>
       </w:r>
@@ -22413,7 +22492,7 @@
         <w:pStyle w:val="Heading1"/>
         <w:pageBreakBefore/>
       </w:pPr>
-      <w:bookmarkStart w:id="38" w:name="_Toc242312218"/>
+      <w:bookmarkStart w:id="38" w:name="_Toc242317505"/>
       <w:r>
         <w:lastRenderedPageBreak/>
         <w:t>CHƯƠNG 4. ĐĂNG NHẬP VÀ GIAO DIỆN CHUNG</w:t>
@@ -22424,7 +22503,7 @@
       <w:pPr>
         <w:pStyle w:val="Heading2"/>
       </w:pPr>
-      <w:bookmarkStart w:id="39" w:name="_Toc242312219"/>
+      <w:bookmarkStart w:id="39" w:name="_Toc242317506"/>
       <w:r>
         <w:t>4.1. Mở ứng dụng</w:t>
       </w:r>
@@ -22581,7 +22660,7 @@
           <w:noProof/>
         </w:rPr>
         <w:drawing>
-          <wp:inline distT="0" distB="0" distL="0" distR="0" wp14:anchorId="1BBD2197" wp14:editId="41BE6CD5">
+          <wp:inline distT="0" distB="0" distL="0" distR="0" wp14:anchorId="58FA2C75" wp14:editId="10887BB8">
             <wp:extent cx="4860000" cy="2938605"/>
             <wp:effectExtent l="0" t="0" r="0" b="0"/>
             <wp:docPr id="522444763" name="Picture 522444763"/>
@@ -22621,7 +22700,7 @@
       <w:pPr>
         <w:pStyle w:val="FigureCaption"/>
       </w:pPr>
-      <w:bookmarkStart w:id="40" w:name="_Toc242312263"/>
+      <w:bookmarkStart w:id="40" w:name="_Toc242317550"/>
       <w:r>
         <w:t>Hình 4.1. Màn hình đăng nhập</w:t>
       </w:r>
@@ -22631,7 +22710,7 @@
       <w:pPr>
         <w:pStyle w:val="Heading2"/>
       </w:pPr>
-      <w:bookmarkStart w:id="41" w:name="_Toc242312220"/>
+      <w:bookmarkStart w:id="41" w:name="_Toc242317507"/>
       <w:r>
         <w:t>4.2. Cấu hình máy chủ (lần chạy đầu tiên)</w:t>
       </w:r>
@@ -22785,10 +22864,10 @@
         <w:t>tắt</w:t>
       </w:r>
       <w:r>
-        <w:t xml:space="preserve"> với máy chủ khác; khi bạn bấm vào ô, lựa chọn của bạn được giữ lại. Bật cho máy chủ khác thì ứng dụng hiện cảnh báo, vì người khác trong mạng có thể giả mạo máy chủ và đọc mật khẩu: chỉ bật với máy chủ bạn tin cậy. Khi tắt, driver Microsoft kiểm tra chứng chỉ; driver FreeTDS của bản macOS và driver "SQL Server" cũ của Windows không kiểm tra được nên không được dùng, và ứng dụng báo lỗi: hãy cài OD</w:t>
-      </w:r>
-      <w:r>
-        <w:t xml:space="preserve">BC Driver 18 hoặc bật </w:t>
+        <w:t xml:space="preserve"> với máy chủ khác; khi bạn bấm vào ô, lựa chọn của bạn được giữ lại. Bật cho máy chủ khác thì ứng dụng hiện cảnh báo, vì người khác trong mạng có thể giả mạo máy chủ và đọc mật khẩu: chỉ bật với máy chủ bạn tin cậy. Khi tắt, driver Microsoft kiểm tra chứng chỉ; driver FreeTDS của bản macOS và driver "SQL Server" cũ của Windows không kiểm t</w:t>
+      </w:r>
+      <w:r>
+        <w:t xml:space="preserve">ra được nên không được dùng, và ứng dụng báo lỗi: hãy cài ODBC Driver 18 hoặc bật </w:t>
       </w:r>
       <w:r>
         <w:lastRenderedPageBreak/>
@@ -22806,7 +22885,7 @@
           <w:noProof/>
         </w:rPr>
         <w:drawing>
-          <wp:inline distT="0" distB="0" distL="0" distR="0" wp14:anchorId="4161EC17" wp14:editId="64AAF77C">
+          <wp:inline distT="0" distB="0" distL="0" distR="0" wp14:anchorId="5EFEF4F1" wp14:editId="7607BD1B">
             <wp:extent cx="5040000" cy="3360000"/>
             <wp:effectExtent l="0" t="0" r="0" b="0"/>
             <wp:docPr id="522444764" name="Picture 522444764"/>
@@ -22846,7 +22925,7 @@
       <w:pPr>
         <w:pStyle w:val="FigureCaption"/>
       </w:pPr>
-      <w:bookmarkStart w:id="42" w:name="_Toc242312264"/>
+      <w:bookmarkStart w:id="42" w:name="_Toc242317551"/>
       <w:r>
         <w:t>Hình 4.2. Khung cấu hình máy chủ SQL Server</w:t>
       </w:r>
@@ -22856,7 +22935,7 @@
       <w:pPr>
         <w:pStyle w:val="TableCaption"/>
       </w:pPr>
-      <w:bookmarkStart w:id="43" w:name="_Toc242312293"/>
+      <w:bookmarkStart w:id="43" w:name="_Toc242317580"/>
       <w:r>
         <w:t>Bảng 4.1. Giá trị ô Máy chủ theo cách cài SQL Server</w:t>
       </w:r>
@@ -23296,7 +23375,7 @@
       <w:pPr>
         <w:pStyle w:val="Heading2"/>
       </w:pPr>
-      <w:bookmarkStart w:id="44" w:name="_Toc242312221"/>
+      <w:bookmarkStart w:id="44" w:name="_Toc242317508"/>
       <w:r>
         <w:t>4.3. Đăng nhập</w:t>
       </w:r>
@@ -23370,7 +23449,7 @@
       <w:pPr>
         <w:pStyle w:val="TableCaption"/>
       </w:pPr>
-      <w:bookmarkStart w:id="45" w:name="_Toc242312294"/>
+      <w:bookmarkStart w:id="45" w:name="_Toc242317581"/>
       <w:r>
         <w:t>Bảng 4.2. Tài khoản demo trong dữ liệu mẫu</w:t>
       </w:r>
@@ -24692,7 +24771,7 @@
       <w:pPr>
         <w:pStyle w:val="TableCaption"/>
       </w:pPr>
-      <w:bookmarkStart w:id="46" w:name="_Toc242312295"/>
+      <w:bookmarkStart w:id="46" w:name="_Toc242317582"/>
       <w:r>
         <w:t>Bảng 4.3. Thông báo lỗi khi đăng nhập</w:t>
       </w:r>
@@ -25116,7 +25195,7 @@
       <w:pPr>
         <w:pStyle w:val="Heading2"/>
       </w:pPr>
-      <w:bookmarkStart w:id="47" w:name="_Toc242312222"/>
+      <w:bookmarkStart w:id="47" w:name="_Toc242317509"/>
       <w:r>
         <w:t>4.4. Màn hình chính</w:t>
       </w:r>
@@ -25377,7 +25456,7 @@
           <w:noProof/>
         </w:rPr>
         <w:drawing>
-          <wp:inline distT="0" distB="0" distL="0" distR="0" wp14:anchorId="0DE534AE" wp14:editId="2D22A884">
+          <wp:inline distT="0" distB="0" distL="0" distR="0" wp14:anchorId="21EEA2CE" wp14:editId="5AE88530">
             <wp:extent cx="5580000" cy="3332500"/>
             <wp:effectExtent l="0" t="0" r="0" b="0"/>
             <wp:docPr id="522444765" name="Picture 522444765"/>
@@ -25417,7 +25496,7 @@
       <w:pPr>
         <w:pStyle w:val="FigureCaption"/>
       </w:pPr>
-      <w:bookmarkStart w:id="48" w:name="_Toc242312265"/>
+      <w:bookmarkStart w:id="48" w:name="_Toc242317552"/>
       <w:r>
         <w:t>Hình 4.3. Màn hình chính của vai trò Quản lý (trang Tổng quan)</w:t>
       </w:r>
@@ -25427,7 +25506,7 @@
       <w:pPr>
         <w:pStyle w:val="Heading2"/>
       </w:pPr>
-      <w:bookmarkStart w:id="49" w:name="_Toc242312223"/>
+      <w:bookmarkStart w:id="49" w:name="_Toc242317510"/>
       <w:r>
         <w:t>4.5. Đổi ngôn ngữ giao diện</w:t>
       </w:r>
@@ -25483,7 +25562,7 @@
       <w:pPr>
         <w:pStyle w:val="Heading2"/>
       </w:pPr>
-      <w:bookmarkStart w:id="50" w:name="_Toc242312224"/>
+      <w:bookmarkStart w:id="50" w:name="_Toc242317511"/>
       <w:r>
         <w:lastRenderedPageBreak/>
         <w:t>4.6. Đổi mật khẩu</w:t>
@@ -25600,7 +25679,7 @@
           <w:noProof/>
         </w:rPr>
         <w:drawing>
-          <wp:inline distT="0" distB="0" distL="0" distR="0" wp14:anchorId="25A7975D" wp14:editId="2966823C">
+          <wp:inline distT="0" distB="0" distL="0" distR="0" wp14:anchorId="254A5FCD" wp14:editId="3149FB63">
             <wp:extent cx="3420000" cy="1368000"/>
             <wp:effectExtent l="0" t="0" r="0" b="0"/>
             <wp:docPr id="522444766" name="Picture 522444766"/>
@@ -25640,7 +25719,7 @@
       <w:pPr>
         <w:pStyle w:val="FigureCaption"/>
       </w:pPr>
-      <w:bookmarkStart w:id="51" w:name="_Toc242312266"/>
+      <w:bookmarkStart w:id="51" w:name="_Toc242317553"/>
       <w:r>
         <w:t>Hình 4.4. Hộp thoại đổi mật khẩu</w:t>
       </w:r>
@@ -25678,7 +25757,7 @@
       <w:pPr>
         <w:pStyle w:val="Heading2"/>
       </w:pPr>
-      <w:bookmarkStart w:id="52" w:name="_Toc242312225"/>
+      <w:bookmarkStart w:id="52" w:name="_Toc242317512"/>
       <w:r>
         <w:t>4.7. Đăng xuất và thoát</w:t>
       </w:r>
@@ -25761,7 +25840,7 @@
       <w:pPr>
         <w:pStyle w:val="Heading2"/>
       </w:pPr>
-      <w:bookmarkStart w:id="53" w:name="_Toc242312226"/>
+      <w:bookmarkStart w:id="53" w:name="_Toc242317513"/>
       <w:r>
         <w:t>4.8. Thao tác chung trên các màn hình danh sách</w:t>
       </w:r>
@@ -25789,7 +25868,7 @@
         </w:rPr>
         <w:lastRenderedPageBreak/>
         <w:drawing>
-          <wp:inline distT="0" distB="0" distL="0" distR="0" wp14:anchorId="5C9EFB28" wp14:editId="5A1612AF">
+          <wp:inline distT="0" distB="0" distL="0" distR="0" wp14:anchorId="7E3DDC7A" wp14:editId="26403A85">
             <wp:extent cx="5580000" cy="3332500"/>
             <wp:effectExtent l="0" t="0" r="0" b="0"/>
             <wp:docPr id="522444767" name="Picture 522444767"/>
@@ -25829,7 +25908,7 @@
       <w:pPr>
         <w:pStyle w:val="FigureCaption"/>
       </w:pPr>
-      <w:bookmarkStart w:id="54" w:name="_Toc242312267"/>
+      <w:bookmarkStart w:id="54" w:name="_Toc242317554"/>
       <w:r>
         <w:t>Hình 4.5. Một màn hình danh sách: Công nợ học phí</w:t>
       </w:r>
@@ -25839,7 +25918,7 @@
       <w:pPr>
         <w:pStyle w:val="TableCaption"/>
       </w:pPr>
-      <w:bookmarkStart w:id="55" w:name="_Toc242312296"/>
+      <w:bookmarkStart w:id="55" w:name="_Toc242317583"/>
       <w:r>
         <w:t>Bảng 4.4. Các thành phần của màn hình danh sách</w:t>
       </w:r>
@@ -27061,7 +27140,7 @@
           <w:noProof/>
         </w:rPr>
         <w:drawing>
-          <wp:inline distT="0" distB="0" distL="0" distR="0" wp14:anchorId="1BD7A5A8" wp14:editId="3AFAEEF4">
+          <wp:inline distT="0" distB="0" distL="0" distR="0" wp14:anchorId="0911C016" wp14:editId="0902AF36">
             <wp:extent cx="5040000" cy="3757090"/>
             <wp:effectExtent l="0" t="0" r="0" b="0"/>
             <wp:docPr id="522444768" name="Picture 522444768"/>
@@ -27101,7 +27180,7 @@
       <w:pPr>
         <w:pStyle w:val="FigureCaption"/>
       </w:pPr>
-      <w:bookmarkStart w:id="56" w:name="_Toc242312268"/>
+      <w:bookmarkStart w:id="56" w:name="_Toc242317555"/>
       <w:r>
         <w:t>Hình 4.6. Hộp Xem trước khi in: công nợ học phí nhóm theo lớp</w:t>
       </w:r>
@@ -27181,7 +27260,7 @@
       <w:pPr>
         <w:pStyle w:val="Heading2"/>
       </w:pPr>
-      <w:bookmarkStart w:id="57" w:name="_Toc242312227"/>
+      <w:bookmarkStart w:id="57" w:name="_Toc242317514"/>
       <w:r>
         <w:t>4.9. Form nhập liệu và hộp xác nhận</w:t>
       </w:r>
@@ -27345,7 +27424,7 @@
         <w:pStyle w:val="Heading1"/>
         <w:pageBreakBefore/>
       </w:pPr>
-      <w:bookmarkStart w:id="58" w:name="_Toc242312228"/>
+      <w:bookmarkStart w:id="58" w:name="_Toc242317515"/>
       <w:r>
         <w:lastRenderedPageBreak/>
         <w:t>CHƯƠNG 5. HƯỚNG DẪN THEO CHỨC NĂNG</w:t>
@@ -27366,7 +27445,7 @@
       <w:pPr>
         <w:pStyle w:val="Heading2"/>
       </w:pPr>
-      <w:bookmarkStart w:id="59" w:name="_Toc242312229"/>
+      <w:bookmarkStart w:id="59" w:name="_Toc242317516"/>
       <w:r>
         <w:t>5.1. Tổng quan</w:t>
       </w:r>
@@ -27410,7 +27489,7 @@
       <w:pPr>
         <w:pStyle w:val="TableCaption"/>
       </w:pPr>
-      <w:bookmarkStart w:id="60" w:name="_Toc242312297"/>
+      <w:bookmarkStart w:id="60" w:name="_Toc242317584"/>
       <w:r>
         <w:t>Bảng 5.1. Các thẻ số liệu trên trang Tổng quan</w:t>
       </w:r>
@@ -27892,7 +27971,7 @@
           <w:noProof/>
         </w:rPr>
         <w:drawing>
-          <wp:inline distT="0" distB="0" distL="0" distR="0" wp14:anchorId="47ADE713" wp14:editId="758694F9">
+          <wp:inline distT="0" distB="0" distL="0" distR="0" wp14:anchorId="47086C54" wp14:editId="2930B7D2">
             <wp:extent cx="5580000" cy="3332500"/>
             <wp:effectExtent l="0" t="0" r="0" b="0"/>
             <wp:docPr id="522444769" name="Picture 522444769"/>
@@ -27932,7 +28011,7 @@
       <w:pPr>
         <w:pStyle w:val="FigureCaption"/>
       </w:pPr>
-      <w:bookmarkStart w:id="61" w:name="_Toc242312269"/>
+      <w:bookmarkStart w:id="61" w:name="_Toc242317556"/>
       <w:r>
         <w:t>Hình 5.1. Trang Tổng quan của Giáo vụ: không có quyền xem doanh thu</w:t>
       </w:r>
@@ -27942,7 +28021,7 @@
       <w:pPr>
         <w:pStyle w:val="Heading2"/>
       </w:pPr>
-      <w:bookmarkStart w:id="62" w:name="_Toc242312230"/>
+      <w:bookmarkStart w:id="62" w:name="_Toc242317517"/>
       <w:r>
         <w:lastRenderedPageBreak/>
         <w:t>5.2. Học viên</w:t>
@@ -27976,7 +28055,7 @@
           <w:noProof/>
         </w:rPr>
         <w:drawing>
-          <wp:inline distT="0" distB="0" distL="0" distR="0" wp14:anchorId="470E02D4" wp14:editId="7F8F47EB">
+          <wp:inline distT="0" distB="0" distL="0" distR="0" wp14:anchorId="4D08BCF1" wp14:editId="63455898">
             <wp:extent cx="5580000" cy="3332500"/>
             <wp:effectExtent l="0" t="0" r="0" b="0"/>
             <wp:docPr id="522444770" name="Picture 522444770"/>
@@ -28016,7 +28095,7 @@
       <w:pPr>
         <w:pStyle w:val="FigureCaption"/>
       </w:pPr>
-      <w:bookmarkStart w:id="63" w:name="_Toc242312270"/>
+      <w:bookmarkStart w:id="63" w:name="_Toc242317557"/>
       <w:r>
         <w:t>Hình 5.2. Danh sách học viên</w:t>
       </w:r>
@@ -28026,7 +28105,7 @@
       <w:pPr>
         <w:pStyle w:val="Heading3"/>
       </w:pPr>
-      <w:bookmarkStart w:id="64" w:name="_Toc242312231"/>
+      <w:bookmarkStart w:id="64" w:name="_Toc242317518"/>
       <w:r>
         <w:t>5.2.1. Tìm kiếm</w:t>
       </w:r>
@@ -28123,7 +28202,7 @@
       <w:pPr>
         <w:pStyle w:val="Heading3"/>
       </w:pPr>
-      <w:bookmarkStart w:id="65" w:name="_Toc242312232"/>
+      <w:bookmarkStart w:id="65" w:name="_Toc242317519"/>
       <w:r>
         <w:t>5.2.2. Thêm học viên</w:t>
       </w:r>
@@ -28328,7 +28407,7 @@
       <w:pPr>
         <w:pStyle w:val="Heading3"/>
       </w:pPr>
-      <w:bookmarkStart w:id="66" w:name="_Toc242312233"/>
+      <w:bookmarkStart w:id="66" w:name="_Toc242317520"/>
       <w:r>
         <w:t>5.2.3. Sửa thông tin</w:t>
       </w:r>
@@ -28449,7 +28528,7 @@
           <w:noProof/>
         </w:rPr>
         <w:drawing>
-          <wp:inline distT="0" distB="0" distL="0" distR="0" wp14:anchorId="36C6F875" wp14:editId="0A368489">
+          <wp:inline distT="0" distB="0" distL="0" distR="0" wp14:anchorId="7664A066" wp14:editId="0D6A5973">
             <wp:extent cx="3780000" cy="5048129"/>
             <wp:effectExtent l="0" t="0" r="0" b="0"/>
             <wp:docPr id="522444771" name="Picture 522444771"/>
@@ -28489,7 +28568,7 @@
       <w:pPr>
         <w:pStyle w:val="FigureCaption"/>
       </w:pPr>
-      <w:bookmarkStart w:id="67" w:name="_Toc242312271"/>
+      <w:bookmarkStart w:id="67" w:name="_Toc242317558"/>
       <w:r>
         <w:t>Hình 5.3. Hộp thoại sửa thông tin học viên</w:t>
       </w:r>
@@ -28509,7 +28588,7 @@
       <w:pPr>
         <w:pStyle w:val="TableCaption"/>
       </w:pPr>
-      <w:bookmarkStart w:id="68" w:name="_Toc242312298"/>
+      <w:bookmarkStart w:id="68" w:name="_Toc242317585"/>
       <w:r>
         <w:t>Bảng 5.2. Quy tắc kiểm tra thông tin học viên</w:t>
       </w:r>
@@ -29173,7 +29252,7 @@
       <w:pPr>
         <w:pStyle w:val="Heading3"/>
       </w:pPr>
-      <w:bookmarkStart w:id="69" w:name="_Toc242312234"/>
+      <w:bookmarkStart w:id="69" w:name="_Toc242317521"/>
       <w:r>
         <w:t>5.2.4. Xóa học viên</w:t>
       </w:r>
@@ -29290,7 +29369,7 @@
       <w:pPr>
         <w:pStyle w:val="Heading3"/>
       </w:pPr>
-      <w:bookmarkStart w:id="70" w:name="_Toc242312235"/>
+      <w:bookmarkStart w:id="70" w:name="_Toc242317522"/>
       <w:r>
         <w:t>5.2.5. Hồ sơ, ghi danh và kiểm tra xếp lớp từ danh sách học viên</w:t>
       </w:r>
@@ -29388,7 +29467,7 @@
       <w:pPr>
         <w:pStyle w:val="Heading3"/>
       </w:pPr>
-      <w:bookmarkStart w:id="71" w:name="_Toc242312236"/>
+      <w:bookmarkStart w:id="71" w:name="_Toc242317523"/>
       <w:r>
         <w:t>5.2.6. Xuất, nhập danh sách bằng XML</w:t>
       </w:r>
@@ -29474,7 +29553,7 @@
       <w:pPr>
         <w:pStyle w:val="Heading2"/>
       </w:pPr>
-      <w:bookmarkStart w:id="72" w:name="_Toc242312237"/>
+      <w:bookmarkStart w:id="72" w:name="_Toc242317524"/>
       <w:r>
         <w:lastRenderedPageBreak/>
         <w:t>5.3. Kiểm tra xếp lớp</w:t>
@@ -29562,7 +29641,7 @@
           <w:noProof/>
         </w:rPr>
         <w:drawing>
-          <wp:inline distT="0" distB="0" distL="0" distR="0" wp14:anchorId="6887420D" wp14:editId="27FDD519">
+          <wp:inline distT="0" distB="0" distL="0" distR="0" wp14:anchorId="43F655F0" wp14:editId="5C4BA4C3">
             <wp:extent cx="5580000" cy="3332500"/>
             <wp:effectExtent l="0" t="0" r="0" b="0"/>
             <wp:docPr id="522444772" name="Picture 522444772"/>
@@ -29602,7 +29681,7 @@
       <w:pPr>
         <w:pStyle w:val="FigureCaption"/>
       </w:pPr>
-      <w:bookmarkStart w:id="73" w:name="_Toc242312272"/>
+      <w:bookmarkStart w:id="73" w:name="_Toc242317559"/>
       <w:r>
         <w:t>Hình 5.4. Danh sách bài kiểm tra xếp lớp</w:t>
       </w:r>
@@ -29859,7 +29938,7 @@
       <w:pPr>
         <w:pStyle w:val="Heading2"/>
       </w:pPr>
-      <w:bookmarkStart w:id="74" w:name="_Toc242312238"/>
+      <w:bookmarkStart w:id="74" w:name="_Toc242317525"/>
       <w:r>
         <w:t>5.4. Lớp học</w:t>
       </w:r>
@@ -29911,7 +29990,7 @@
         </w:rPr>
         <w:lastRenderedPageBreak/>
         <w:drawing>
-          <wp:inline distT="0" distB="0" distL="0" distR="0" wp14:anchorId="4FE4FAE5" wp14:editId="1E7A02BA">
+          <wp:inline distT="0" distB="0" distL="0" distR="0" wp14:anchorId="5CFCBF1B" wp14:editId="673C48B8">
             <wp:extent cx="5580000" cy="3332500"/>
             <wp:effectExtent l="0" t="0" r="0" b="0"/>
             <wp:docPr id="522444773" name="Picture 522444773"/>
@@ -29951,7 +30030,7 @@
       <w:pPr>
         <w:pStyle w:val="FigureCaption"/>
       </w:pPr>
-      <w:bookmarkStart w:id="75" w:name="_Toc242312273"/>
+      <w:bookmarkStart w:id="75" w:name="_Toc242317560"/>
       <w:r>
         <w:t>Hình 5.5. Màn hình Lớp học và các nút quản lý vòng đời lớp</w:t>
       </w:r>
@@ -30431,7 +30510,7 @@
       <w:pPr>
         <w:pStyle w:val="TableCaption"/>
       </w:pPr>
-      <w:bookmarkStart w:id="76" w:name="_Toc242312299"/>
+      <w:bookmarkStart w:id="76" w:name="_Toc242317586"/>
       <w:r>
         <w:t>Bảng 5.3. Quy tắc CSDL kiểm tra khi quản lý lớp học</w:t>
       </w:r>
@@ -30962,7 +31041,7 @@
       <w:pPr>
         <w:pStyle w:val="Heading2"/>
       </w:pPr>
-      <w:bookmarkStart w:id="77" w:name="_Toc242312239"/>
+      <w:bookmarkStart w:id="77" w:name="_Toc242317526"/>
       <w:r>
         <w:t>5.5. Ghi danh</w:t>
       </w:r>
@@ -31023,7 +31102,7 @@
         </w:rPr>
         <w:lastRenderedPageBreak/>
         <w:drawing>
-          <wp:inline distT="0" distB="0" distL="0" distR="0" wp14:anchorId="49C763C0" wp14:editId="014A8FDA">
+          <wp:inline distT="0" distB="0" distL="0" distR="0" wp14:anchorId="0EBEB9DA" wp14:editId="45EC8F1A">
             <wp:extent cx="5580000" cy="3332500"/>
             <wp:effectExtent l="0" t="0" r="0" b="0"/>
             <wp:docPr id="522444774" name="Picture 522444774"/>
@@ -31063,7 +31142,7 @@
       <w:pPr>
         <w:pStyle w:val="FigureCaption"/>
       </w:pPr>
-      <w:bookmarkStart w:id="78" w:name="_Toc242312274"/>
+      <w:bookmarkStart w:id="78" w:name="_Toc242317561"/>
       <w:r>
         <w:t>Hình 5.6. Danh sách ghi danh</w:t>
       </w:r>
@@ -31335,7 +31414,7 @@
       <w:pPr>
         <w:pStyle w:val="TableCaption"/>
       </w:pPr>
-      <w:bookmarkStart w:id="79" w:name="_Toc242312300"/>
+      <w:bookmarkStart w:id="79" w:name="_Toc242317587"/>
       <w:r>
         <w:t>Bảng 5.4. Quy tắc CSDL kiểm tra khi ghi danh và chuyển lớp</w:t>
       </w:r>
@@ -31725,7 +31804,7 @@
       <w:pPr>
         <w:pStyle w:val="Heading2"/>
       </w:pPr>
-      <w:bookmarkStart w:id="80" w:name="_Toc242312240"/>
+      <w:bookmarkStart w:id="80" w:name="_Toc242317527"/>
       <w:r>
         <w:t>5.6. Lịch học - điểm danh</w:t>
       </w:r>
@@ -31812,7 +31891,7 @@
           <w:noProof/>
         </w:rPr>
         <w:drawing>
-          <wp:inline distT="0" distB="0" distL="0" distR="0" wp14:anchorId="247D3C2B" wp14:editId="737A0A45">
+          <wp:inline distT="0" distB="0" distL="0" distR="0" wp14:anchorId="1F3AA70C" wp14:editId="28273F98">
             <wp:extent cx="5580000" cy="3332500"/>
             <wp:effectExtent l="0" t="0" r="0" b="0"/>
             <wp:docPr id="522444775" name="Picture 522444775"/>
@@ -31852,7 +31931,7 @@
       <w:pPr>
         <w:pStyle w:val="FigureCaption"/>
       </w:pPr>
-      <w:bookmarkStart w:id="81" w:name="_Toc242312275"/>
+      <w:bookmarkStart w:id="81" w:name="_Toc242317562"/>
       <w:r>
         <w:t>Hình 5.7. Lịch học - điểm danh của một tuần</w:t>
       </w:r>
@@ -32081,7 +32160,7 @@
       <w:pPr>
         <w:pStyle w:val="Heading2"/>
       </w:pPr>
-      <w:bookmarkStart w:id="82" w:name="_Toc242312241"/>
+      <w:bookmarkStart w:id="82" w:name="_Toc242317528"/>
       <w:r>
         <w:t>5.7. Sổ điểm</w:t>
       </w:r>
@@ -32123,7 +32202,7 @@
           <w:noProof/>
         </w:rPr>
         <w:drawing>
-          <wp:inline distT="0" distB="0" distL="0" distR="0" wp14:anchorId="2BE8FDCE" wp14:editId="245D85F4">
+          <wp:inline distT="0" distB="0" distL="0" distR="0" wp14:anchorId="04BF6198" wp14:editId="3D0FC09D">
             <wp:extent cx="5580000" cy="3332500"/>
             <wp:effectExtent l="0" t="0" r="0" b="0"/>
             <wp:docPr id="522444776" name="Picture 522444776"/>
@@ -32163,7 +32242,7 @@
       <w:pPr>
         <w:pStyle w:val="FigureCaption"/>
       </w:pPr>
-      <w:bookmarkStart w:id="83" w:name="_Toc242312276"/>
+      <w:bookmarkStart w:id="83" w:name="_Toc242317563"/>
       <w:r>
         <w:t>Hình 5.8. Sổ điểm của một lớp</w:t>
       </w:r>
@@ -32292,7 +32371,7 @@
       <w:pPr>
         <w:pStyle w:val="Heading2"/>
       </w:pPr>
-      <w:bookmarkStart w:id="84" w:name="_Toc242312242"/>
+      <w:bookmarkStart w:id="84" w:name="_Toc242317529"/>
       <w:r>
         <w:t>5.8. Kết quả học tập</w:t>
       </w:r>
@@ -32352,7 +32431,7 @@
           <w:noProof/>
         </w:rPr>
         <w:drawing>
-          <wp:inline distT="0" distB="0" distL="0" distR="0" wp14:anchorId="32E8AB5F" wp14:editId="23032B2A">
+          <wp:inline distT="0" distB="0" distL="0" distR="0" wp14:anchorId="205D09F3" wp14:editId="2C536A9F">
             <wp:extent cx="5580000" cy="3332500"/>
             <wp:effectExtent l="0" t="0" r="0" b="0"/>
             <wp:docPr id="522444777" name="Picture 522444777"/>
@@ -32392,7 +32471,7 @@
       <w:pPr>
         <w:pStyle w:val="FigureCaption"/>
       </w:pPr>
-      <w:bookmarkStart w:id="85" w:name="_Toc242312277"/>
+      <w:bookmarkStart w:id="85" w:name="_Toc242317564"/>
       <w:r>
         <w:t>Hình 5.9. Kết quả học tập</w:t>
       </w:r>
@@ -32402,7 +32481,7 @@
       <w:pPr>
         <w:pStyle w:val="Heading2"/>
       </w:pPr>
-      <w:bookmarkStart w:id="86" w:name="_Toc242312243"/>
+      <w:bookmarkStart w:id="86" w:name="_Toc242317530"/>
       <w:r>
         <w:t>5.9. Thu học phí</w:t>
       </w:r>
@@ -32472,7 +32551,7 @@
         </w:rPr>
         <w:lastRenderedPageBreak/>
         <w:drawing>
-          <wp:inline distT="0" distB="0" distL="0" distR="0" wp14:anchorId="4B9BA0F5" wp14:editId="2C7AA169">
+          <wp:inline distT="0" distB="0" distL="0" distR="0" wp14:anchorId="172E2A35" wp14:editId="611601ED">
             <wp:extent cx="5580000" cy="3332500"/>
             <wp:effectExtent l="0" t="0" r="0" b="0"/>
             <wp:docPr id="522444778" name="Picture 522444778"/>
@@ -32512,7 +32591,7 @@
       <w:pPr>
         <w:pStyle w:val="FigureCaption"/>
       </w:pPr>
-      <w:bookmarkStart w:id="87" w:name="_Toc242312278"/>
+      <w:bookmarkStart w:id="87" w:name="_Toc242317565"/>
       <w:r>
         <w:t>Hình 5.10. Danh sách phiếu thu (Kế toán)</w:t>
       </w:r>
@@ -32845,7 +32924,7 @@
       <w:pPr>
         <w:pStyle w:val="Heading2"/>
       </w:pPr>
-      <w:bookmarkStart w:id="88" w:name="_Toc242312244"/>
+      <w:bookmarkStart w:id="88" w:name="_Toc242317531"/>
       <w:r>
         <w:t>5.10. Công nợ học phí</w:t>
       </w:r>
@@ -32902,7 +32981,7 @@
       <w:pPr>
         <w:pStyle w:val="Heading2"/>
       </w:pPr>
-      <w:bookmarkStart w:id="89" w:name="_Toc242312245"/>
+      <w:bookmarkStart w:id="89" w:name="_Toc242317532"/>
       <w:r>
         <w:t>5.11. Doanh thu</w:t>
       </w:r>
@@ -33003,7 +33082,7 @@
           <w:noProof/>
         </w:rPr>
         <w:drawing>
-          <wp:inline distT="0" distB="0" distL="0" distR="0" wp14:anchorId="778EFAC7" wp14:editId="4337A8FE">
+          <wp:inline distT="0" distB="0" distL="0" distR="0" wp14:anchorId="2454D6AA" wp14:editId="65BBEB02">
             <wp:extent cx="5580000" cy="3332500"/>
             <wp:effectExtent l="0" t="0" r="0" b="0"/>
             <wp:docPr id="522444779" name="Picture 522444779"/>
@@ -33043,7 +33122,7 @@
       <w:pPr>
         <w:pStyle w:val="FigureCaption"/>
       </w:pPr>
-      <w:bookmarkStart w:id="90" w:name="_Toc242312279"/>
+      <w:bookmarkStart w:id="90" w:name="_Toc242317566"/>
       <w:r>
         <w:t>Hình 5.11. Doanh thu theo tháng và chi nhánh (Kế toán)</w:t>
       </w:r>
@@ -33053,7 +33132,7 @@
       <w:pPr>
         <w:pStyle w:val="Heading2"/>
       </w:pPr>
-      <w:bookmarkStart w:id="91" w:name="_Toc242312246"/>
+      <w:bookmarkStart w:id="91" w:name="_Toc242317533"/>
       <w:r>
         <w:t>5.12. Lương giáo viên</w:t>
       </w:r>
@@ -33105,7 +33184,7 @@
         </w:rPr>
         <w:lastRenderedPageBreak/>
         <w:drawing>
-          <wp:inline distT="0" distB="0" distL="0" distR="0" wp14:anchorId="495AE620" wp14:editId="3F3B28E6">
+          <wp:inline distT="0" distB="0" distL="0" distR="0" wp14:anchorId="75338EDB" wp14:editId="55FC4D4F">
             <wp:extent cx="5580000" cy="3332500"/>
             <wp:effectExtent l="0" t="0" r="0" b="0"/>
             <wp:docPr id="522444780" name="Picture 522444780"/>
@@ -33145,7 +33224,7 @@
       <w:pPr>
         <w:pStyle w:val="FigureCaption"/>
       </w:pPr>
-      <w:bookmarkStart w:id="92" w:name="_Toc242312280"/>
+      <w:bookmarkStart w:id="92" w:name="_Toc242317567"/>
       <w:r>
         <w:t>Hình 5.12. Bảng lương giáo viên (Kế toán)</w:t>
       </w:r>
@@ -33251,7 +33330,7 @@
       <w:pPr>
         <w:pStyle w:val="Heading2"/>
       </w:pPr>
-      <w:bookmarkStart w:id="93" w:name="_Toc242312247"/>
+      <w:bookmarkStart w:id="93" w:name="_Toc242317534"/>
       <w:r>
         <w:t>5.13. Danh mục</w:t>
       </w:r>
@@ -33304,7 +33383,7 @@
       <w:pPr>
         <w:pStyle w:val="Heading3"/>
       </w:pPr>
-      <w:bookmarkStart w:id="94" w:name="_Toc242312248"/>
+      <w:bookmarkStart w:id="94" w:name="_Toc242317535"/>
       <w:r>
         <w:t>5.13.1. Khóa học</w:t>
       </w:r>
@@ -33341,7 +33420,7 @@
         </w:rPr>
         <w:lastRenderedPageBreak/>
         <w:drawing>
-          <wp:inline distT="0" distB="0" distL="0" distR="0" wp14:anchorId="5B9CE023" wp14:editId="2C4F7DBA">
+          <wp:inline distT="0" distB="0" distL="0" distR="0" wp14:anchorId="4B2EC32A" wp14:editId="5C01F893">
             <wp:extent cx="5580000" cy="3332500"/>
             <wp:effectExtent l="0" t="0" r="0" b="0"/>
             <wp:docPr id="522444781" name="Picture 522444781"/>
@@ -33381,7 +33460,7 @@
       <w:pPr>
         <w:pStyle w:val="FigureCaption"/>
       </w:pPr>
-      <w:bookmarkStart w:id="95" w:name="_Toc242312281"/>
+      <w:bookmarkStart w:id="95" w:name="_Toc242317568"/>
       <w:r>
         <w:t>Hình 5.13. Danh mục khóa học và cột điểm của khóa đang chọn</w:t>
       </w:r>
@@ -33581,7 +33660,7 @@
       <w:pPr>
         <w:pStyle w:val="Heading3"/>
       </w:pPr>
-      <w:bookmarkStart w:id="96" w:name="_Toc242312249"/>
+      <w:bookmarkStart w:id="96" w:name="_Toc242317536"/>
       <w:r>
         <w:t>5.13.2. Giáo viên, Nhân viên</w:t>
       </w:r>
@@ -33709,7 +33788,7 @@
       <w:pPr>
         <w:pStyle w:val="Heading3"/>
       </w:pPr>
-      <w:bookmarkStart w:id="97" w:name="_Toc242312250"/>
+      <w:bookmarkStart w:id="97" w:name="_Toc242317537"/>
       <w:r>
         <w:t>5.13.3. Chi nhánh - phòng học, Khuyến mãi</w:t>
       </w:r>
@@ -33906,7 +33985,7 @@
           <w:noProof/>
         </w:rPr>
         <w:drawing>
-          <wp:inline distT="0" distB="0" distL="0" distR="0" wp14:anchorId="00970857" wp14:editId="3D2794D3">
+          <wp:inline distT="0" distB="0" distL="0" distR="0" wp14:anchorId="52AA02D5" wp14:editId="5F3B80A4">
             <wp:extent cx="5580000" cy="3332500"/>
             <wp:effectExtent l="0" t="0" r="0" b="0"/>
             <wp:docPr id="522444782" name="Picture 522444782"/>
@@ -33946,7 +34025,7 @@
       <w:pPr>
         <w:pStyle w:val="FigureCaption"/>
       </w:pPr>
-      <w:bookmarkStart w:id="98" w:name="_Toc242312282"/>
+      <w:bookmarkStart w:id="98" w:name="_Toc242317569"/>
       <w:r>
         <w:t>Hình 5.14. Chi nhánh và phòng học của chi nhánh đang chọn</w:t>
       </w:r>
@@ -33956,7 +34035,7 @@
       <w:pPr>
         <w:pStyle w:val="Heading2"/>
       </w:pPr>
-      <w:bookmarkStart w:id="99" w:name="_Toc242312251"/>
+      <w:bookmarkStart w:id="99" w:name="_Toc242317538"/>
       <w:r>
         <w:lastRenderedPageBreak/>
         <w:t>5.14. Tài khoản</w:t>
@@ -34008,7 +34087,7 @@
           <w:noProof/>
         </w:rPr>
         <w:drawing>
-          <wp:inline distT="0" distB="0" distL="0" distR="0" wp14:anchorId="3285245E" wp14:editId="38D0F48E">
+          <wp:inline distT="0" distB="0" distL="0" distR="0" wp14:anchorId="08C2F690" wp14:editId="3A79A3C4">
             <wp:extent cx="5580000" cy="3332500"/>
             <wp:effectExtent l="0" t="0" r="0" b="0"/>
             <wp:docPr id="522444783" name="Picture 522444783"/>
@@ -34048,7 +34127,7 @@
       <w:pPr>
         <w:pStyle w:val="FigureCaption"/>
       </w:pPr>
-      <w:bookmarkStart w:id="100" w:name="_Toc242312283"/>
+      <w:bookmarkStart w:id="100" w:name="_Toc242317570"/>
       <w:r>
         <w:t>Hình 5.15. Danh sách tài khoản (Quản lý)</w:t>
       </w:r>
@@ -34204,7 +34283,7 @@
       <w:pPr>
         <w:pStyle w:val="Heading2"/>
       </w:pPr>
-      <w:bookmarkStart w:id="101" w:name="_Toc242312252"/>
+      <w:bookmarkStart w:id="101" w:name="_Toc242317539"/>
       <w:r>
         <w:t>5.15. Sao lưu</w:t>
       </w:r>
@@ -34355,7 +34434,7 @@
           <w:noProof/>
         </w:rPr>
         <w:drawing>
-          <wp:inline distT="0" distB="0" distL="0" distR="0" wp14:anchorId="4342AD39" wp14:editId="6FFC420A">
+          <wp:inline distT="0" distB="0" distL="0" distR="0" wp14:anchorId="678C6B8B" wp14:editId="1106AF6E">
             <wp:extent cx="5580000" cy="3332500"/>
             <wp:effectExtent l="0" t="0" r="0" b="0"/>
             <wp:docPr id="522444784" name="Picture 522444784"/>
@@ -34395,7 +34474,7 @@
       <w:pPr>
         <w:pStyle w:val="FigureCaption"/>
       </w:pPr>
-      <w:bookmarkStart w:id="102" w:name="_Toc242312284"/>
+      <w:bookmarkStart w:id="102" w:name="_Toc242317571"/>
       <w:r>
         <w:t>Hình 5.16. Màn hình sao lưu cơ sở dữ liệu</w:t>
       </w:r>
@@ -34424,7 +34503,7 @@
       <w:pPr>
         <w:pStyle w:val="Heading2"/>
       </w:pPr>
-      <w:bookmarkStart w:id="103" w:name="_Toc242312253"/>
+      <w:bookmarkStart w:id="103" w:name="_Toc242317540"/>
       <w:r>
         <w:t>5.16. Chức năng dành cho giáo viên</w:t>
       </w:r>
@@ -34574,7 +34653,7 @@
         </w:rPr>
         <w:lastRenderedPageBreak/>
         <w:drawing>
-          <wp:inline distT="0" distB="0" distL="0" distR="0" wp14:anchorId="3B7E6DC6" wp14:editId="7C460D3B">
+          <wp:inline distT="0" distB="0" distL="0" distR="0" wp14:anchorId="4884D312" wp14:editId="2AA237A7">
             <wp:extent cx="5580000" cy="3332500"/>
             <wp:effectExtent l="0" t="0" r="0" b="0"/>
             <wp:docPr id="522444785" name="Picture 522444785"/>
@@ -34614,7 +34693,7 @@
       <w:pPr>
         <w:pStyle w:val="FigureCaption"/>
       </w:pPr>
-      <w:bookmarkStart w:id="104" w:name="_Toc242312285"/>
+      <w:bookmarkStart w:id="104" w:name="_Toc242317572"/>
       <w:r>
         <w:t>Hình 5.17. Lịch dạy của giáo viên</w:t>
       </w:r>
@@ -34631,7 +34710,7 @@
           <w:noProof/>
         </w:rPr>
         <w:drawing>
-          <wp:inline distT="0" distB="0" distL="0" distR="0" wp14:anchorId="26769B81" wp14:editId="2F385C23">
+          <wp:inline distT="0" distB="0" distL="0" distR="0" wp14:anchorId="2C3DBA8A" wp14:editId="572A14CD">
             <wp:extent cx="5580000" cy="3332500"/>
             <wp:effectExtent l="0" t="0" r="0" b="0"/>
             <wp:docPr id="522444786" name="Picture 522444786"/>
@@ -34671,7 +34750,7 @@
       <w:pPr>
         <w:pStyle w:val="FigureCaption"/>
       </w:pPr>
-      <w:bookmarkStart w:id="105" w:name="_Toc242312286"/>
+      <w:bookmarkStart w:id="105" w:name="_Toc242317573"/>
       <w:r>
         <w:t>Hình 5.18. Sổ điểm của giáo viên</w:t>
       </w:r>
@@ -34681,7 +34760,7 @@
       <w:pPr>
         <w:pStyle w:val="Heading2"/>
       </w:pPr>
-      <w:bookmarkStart w:id="106" w:name="_Toc242312254"/>
+      <w:bookmarkStart w:id="106" w:name="_Toc242317541"/>
       <w:r>
         <w:t>5.17. Việc vẫn làm trong SSMS</w:t>
       </w:r>
@@ -34800,7 +34879,7 @@
         <w:pStyle w:val="Heading1"/>
         <w:pageBreakBefore/>
       </w:pPr>
-      <w:bookmarkStart w:id="107" w:name="_Toc242312255"/>
+      <w:bookmarkStart w:id="107" w:name="_Toc242317542"/>
       <w:r>
         <w:lastRenderedPageBreak/>
         <w:t>CHƯƠNG 6. XỬ LÝ SỰ CỐ</w:t>
@@ -34811,7 +34890,7 @@
       <w:pPr>
         <w:pStyle w:val="Heading2"/>
       </w:pPr>
-      <w:bookmarkStart w:id="108" w:name="_Toc242312256"/>
+      <w:bookmarkStart w:id="108" w:name="_Toc242317543"/>
       <w:r>
         <w:t>6.1. Kiểm tra kết nối không cần giao diện</w:t>
       </w:r>
@@ -35376,7 +35455,7 @@
       <w:pPr>
         <w:pStyle w:val="Heading2"/>
       </w:pPr>
-      <w:bookmarkStart w:id="109" w:name="_Toc242312257"/>
+      <w:bookmarkStart w:id="109" w:name="_Toc242317544"/>
       <w:r>
         <w:t>6.2. Lỗi thường gặp</w:t>
       </w:r>
@@ -35386,7 +35465,7 @@
       <w:pPr>
         <w:pStyle w:val="TableCaption"/>
       </w:pPr>
-      <w:bookmarkStart w:id="110" w:name="_Toc242312301"/>
+      <w:bookmarkStart w:id="110" w:name="_Toc242317588"/>
       <w:r>
         <w:t>Bảng 6.1. Lỗi thường gặp và cách xử lý</w:t>
       </w:r>
@@ -38177,7 +38256,7 @@
       <w:pPr>
         <w:pStyle w:val="Heading2"/>
       </w:pPr>
-      <w:bookmarkStart w:id="111" w:name="_Toc242312258"/>
+      <w:bookmarkStart w:id="111" w:name="_Toc242317545"/>
       <w:r>
         <w:t>6.3. Khi cần hỗ trợ thêm</w:t>
       </w:r>
@@ -38225,7 +38304,7 @@
         <w:pStyle w:val="Heading1"/>
         <w:pageBreakBefore/>
       </w:pPr>
-      <w:bookmarkStart w:id="112" w:name="_Toc242312259"/>
+      <w:bookmarkStart w:id="112" w:name="_Toc242317546"/>
       <w:r>
         <w:lastRenderedPageBreak/>
         <w:t>PHỤ LỤC A. TÓM TẮT LỆNH</w:t>
@@ -38976,7 +39055,7 @@
         <w:pStyle w:val="Heading1"/>
         <w:pageBreakBefore/>
       </w:pPr>
-      <w:bookmarkStart w:id="113" w:name="_Toc242312260"/>
+      <w:bookmarkStart w:id="113" w:name="_Toc242317547"/>
       <w:r>
         <w:lastRenderedPageBreak/>
         <w:t>PHỤ LỤC B. CÁC MỤC CẦN BỔ SUNG</w:t>

</xml_diff>